<commit_message>
Testing commit & push with android studio
</commit_message>
<xml_diff>
--- a/Logboek_Dries_Fierens.docx
+++ b/Logboek_Dries_Fierens.docx
@@ -338,7 +338,21 @@
           <w:bCs/>
         </w:rPr>
         <w:lastRenderedPageBreak/>
-        <w:t>23/09/2021:</w:t>
+        <w:t>2</w:t>
+      </w:r>
+      <w:r>
+        <w:rPr>
+          <w:b/>
+          <w:bCs/>
+        </w:rPr>
+        <w:t>5</w:t>
+      </w:r>
+      <w:r>
+        <w:rPr>
+          <w:b/>
+          <w:bCs/>
+        </w:rPr>
+        <w:t>/09/2021:</w:t>
       </w:r>
     </w:p>
     <w:p>
@@ -444,6 +458,13 @@
         </w:drawing>
       </w:r>
     </w:p>
+    <w:p/>
+    <w:p>
+      <w:r>
+        <w:t>29/09/2021:</w:t>
+      </w:r>
+    </w:p>
+    <w:p/>
     <w:p/>
     <w:sectPr>
       <w:pgSz w:w="11906" w:h="16838"/>

</xml_diff>

<commit_message>
Updated my journal/logboek (29/09/2021)
</commit_message>
<xml_diff>
--- a/Logboek_Dries_Fierens.docx
+++ b/Logboek_Dries_Fierens.docx
@@ -46,47 +46,7 @@
         <w:t>applicatie</w:t>
       </w:r>
       <w:r>
-        <w:t xml:space="preserve"> die je kan maken en welke technologieën je kan gebruiken. Ik heb voor native gekozen want dat past het best bij mijn aftakking “Software </w:t>
-      </w:r>
-      <w:proofErr w:type="spellStart"/>
-      <w:r>
-        <w:t>developer</w:t>
-      </w:r>
-      <w:proofErr w:type="spellEnd"/>
-      <w:r>
-        <w:t xml:space="preserve">” sinds het </w:t>
-      </w:r>
-      <w:proofErr w:type="spellStart"/>
-      <w:r>
-        <w:t>java</w:t>
-      </w:r>
-      <w:proofErr w:type="spellEnd"/>
-      <w:r>
-        <w:t xml:space="preserve"> inhoudt. De anderen zijn </w:t>
-      </w:r>
-      <w:proofErr w:type="spellStart"/>
-      <w:r>
-        <w:t>hybrid</w:t>
-      </w:r>
-      <w:proofErr w:type="spellEnd"/>
-      <w:r>
-        <w:t xml:space="preserve"> en </w:t>
-      </w:r>
-      <w:proofErr w:type="spellStart"/>
-      <w:r>
-        <w:t>progressive</w:t>
-      </w:r>
-      <w:proofErr w:type="spellEnd"/>
-      <w:r>
-        <w:t xml:space="preserve"> web app dat dus meer te maken hebben met web &amp; mobile dus vooral HTML &amp; CSS. We moesten dan ook nog kiezen voor een project idee, waarbij ik koos voor een scanner + </w:t>
-      </w:r>
-      <w:proofErr w:type="gramStart"/>
-      <w:r>
-        <w:t>pdf converter</w:t>
-      </w:r>
-      <w:proofErr w:type="gramEnd"/>
-      <w:r>
-        <w:t xml:space="preserve"> app</w:t>
+        <w:t xml:space="preserve"> die je kan maken en welke technologieën je kan gebruiken. Ik heb voor native gekozen want dat past het best bij mijn aftakking “Software developer” sinds het java inhoudt. De anderen zijn hybrid en progressive web app dat dus meer te maken hebben met web &amp; mobile dus vooral HTML &amp; CSS. We moesten dan ook nog kiezen voor een project idee, waarbij ik koos voor een scanner + pdf converter app</w:t>
       </w:r>
       <w:r>
         <w:t xml:space="preserve"> waarbij het vooral bedoelt is o</w:t>
@@ -107,106 +67,26 @@
         <w:t>.</w:t>
       </w:r>
       <w:r>
-        <w:t xml:space="preserve"> Het was verplicht om 1 </w:t>
-      </w:r>
-      <w:proofErr w:type="gramStart"/>
-      <w:r>
-        <w:t>hardware component</w:t>
-      </w:r>
-      <w:proofErr w:type="gramEnd"/>
-      <w:r>
-        <w:t xml:space="preserve"> van de gsm te gebruiken dus koos ik natuurlijk voor de camera.</w:t>
+        <w:t xml:space="preserve"> Het was verplicht om 1 hardware component van de gsm te gebruiken dus koos ik natuurlijk voor de camera.</w:t>
       </w:r>
       <w:r>
         <w:t xml:space="preserve"> </w:t>
       </w:r>
       <w:r>
-        <w:t xml:space="preserve">Als </w:t>
-      </w:r>
-      <w:proofErr w:type="spellStart"/>
-      <w:r>
-        <w:t>back-end</w:t>
-      </w:r>
-      <w:proofErr w:type="spellEnd"/>
-      <w:r>
-        <w:t xml:space="preserve"> koos ik </w:t>
-      </w:r>
-      <w:proofErr w:type="spellStart"/>
-      <w:r>
-        <w:t>Firebase</w:t>
-      </w:r>
-      <w:proofErr w:type="spellEnd"/>
-      <w:r>
-        <w:t xml:space="preserve"> en als technologie koos ik in </w:t>
-      </w:r>
-      <w:proofErr w:type="spellStart"/>
-      <w:r>
-        <w:t>java</w:t>
-      </w:r>
-      <w:proofErr w:type="spellEnd"/>
-      <w:r>
-        <w:t xml:space="preserve"> te werken om een </w:t>
-      </w:r>
-      <w:proofErr w:type="spellStart"/>
-      <w:r>
-        <w:t>android</w:t>
-      </w:r>
-      <w:proofErr w:type="spellEnd"/>
-      <w:r>
-        <w:t xml:space="preserve"> app te maken in plaats van een IOS app.</w:t>
-      </w:r>
-      <w:r>
-        <w:t xml:space="preserve"> Want ik heb een </w:t>
-      </w:r>
-      <w:proofErr w:type="spellStart"/>
-      <w:r>
-        <w:t>huawei</w:t>
-      </w:r>
-      <w:proofErr w:type="spellEnd"/>
-      <w:r>
-        <w:t>.</w:t>
-      </w:r>
-    </w:p>
-    <w:p>
-      <w:r>
-        <w:t xml:space="preserve">Ik heb dit allemaal grondiger beschreven in mijn “app </w:t>
-      </w:r>
-      <w:proofErr w:type="spellStart"/>
-      <w:r>
-        <w:t>idee”.pdf</w:t>
-      </w:r>
-      <w:proofErr w:type="spellEnd"/>
-      <w:r>
-        <w:t xml:space="preserve">. Dit staat ondertussen op de </w:t>
-      </w:r>
-      <w:proofErr w:type="spellStart"/>
-      <w:r>
-        <w:t>repository</w:t>
-      </w:r>
-      <w:proofErr w:type="spellEnd"/>
-      <w:r>
-        <w:t xml:space="preserve"> die we moesten maken.</w:t>
-      </w:r>
-    </w:p>
-    <w:p>
-      <w:r>
-        <w:t xml:space="preserve">Om af te sluiten had ik al ondertussen een goede naam gevonden gebaseerd op de applicatie genaamd </w:t>
-      </w:r>
-      <w:proofErr w:type="spellStart"/>
-      <w:r>
-        <w:t>Scannable</w:t>
-      </w:r>
-      <w:proofErr w:type="spellEnd"/>
-      <w:r>
-        <w:t xml:space="preserve">. Ik heb dus besloten om mijn applicatie </w:t>
-      </w:r>
-      <w:proofErr w:type="spellStart"/>
-      <w:r>
-        <w:t>Notable</w:t>
-      </w:r>
-      <w:proofErr w:type="spellEnd"/>
-      <w:r>
-        <w:t xml:space="preserve"> te noemen.</w:t>
+        <w:t>Als back-end koos ik Firebase en als technologie koos ik in java te werken om een android app te maken in plaats van een IOS app.</w:t>
+      </w:r>
+      <w:r>
+        <w:t xml:space="preserve"> Want ik heb een huawei.</w:t>
+      </w:r>
+    </w:p>
+    <w:p>
+      <w:r>
+        <w:t>Ik heb dit allemaal grondiger beschreven in mijn “app idee”.pdf. Dit staat ondertussen op de repository die we moesten maken.</w:t>
+      </w:r>
+    </w:p>
+    <w:p>
+      <w:r>
+        <w:t>Om af te sluiten had ik al ondertussen een goede naam gevonden gebaseerd op de applicatie genaamd Scannable. Ik heb dus besloten om mijn applicatie Notable te noemen.</w:t>
       </w:r>
     </w:p>
     <w:p>
@@ -229,15 +109,7 @@
         <w:t xml:space="preserve">Mijn app idee werd niet goedgekeurd, want de leerkracht raadde het af door problemen die ervan kunnen komen. Ik moest dan vandaag een nieuw idee opstellen. </w:t>
       </w:r>
       <w:r>
-        <w:t xml:space="preserve">De scanner + </w:t>
-      </w:r>
-      <w:proofErr w:type="gramStart"/>
-      <w:r>
-        <w:t>pdf converter</w:t>
-      </w:r>
-      <w:proofErr w:type="gramEnd"/>
-      <w:r>
-        <w:t xml:space="preserve"> was duidelijk te moeilijk, maar ik besloot om het idee verder te zetten van een app die notities kan delen. Dus nu moet het gewoon foto’s trekken van de notities. Om nog toe te voegen kan ik ook opmerkingswolkjes toevoegen aan de foto voor bijvoorbeeld een fout</w:t>
+        <w:t>De scanner + pdf converter was duidelijk te moeilijk, maar ik besloot om het idee verder te zetten van een app die notities kan delen. Dus nu moet het gewoon foto’s trekken van de notities. Om nog toe te voegen kan ik ook opmerkingswolkjes toevoegen aan de foto voor bijvoorbeeld een fout</w:t>
       </w:r>
       <w:r>
         <w:t xml:space="preserve"> aan te duiden</w:t>
@@ -248,15 +120,7 @@
     </w:p>
     <w:p>
       <w:r>
-        <w:t xml:space="preserve">Daarna moest ik gewoon begin aan een UI/UX design voor mijn applicatie, waarbij nog niet veel had gedaan omdat les niet meer lang duurde. Ik moest toen ook tegelijkertijd zoeken naar </w:t>
-      </w:r>
-      <w:proofErr w:type="spellStart"/>
-      <w:r>
-        <w:t>tutorials</w:t>
-      </w:r>
-      <w:proofErr w:type="spellEnd"/>
-      <w:r>
-        <w:t xml:space="preserve"> dus </w:t>
+        <w:t xml:space="preserve">Daarna moest ik gewoon begin aan een UI/UX design voor mijn applicatie, waarbij nog niet veel had gedaan omdat les niet meer lang duurde. Ik moest toen ook tegelijkertijd zoeken naar tutorials dus </w:t>
       </w:r>
       <w:r>
         <w:t>duurde dat ook kort.</w:t>
@@ -279,26 +143,13 @@
     </w:p>
     <w:p>
       <w:r>
-        <w:t>Vandaag in de namiddag begonnen we met de co-</w:t>
-      </w:r>
-      <w:proofErr w:type="spellStart"/>
-      <w:r>
-        <w:t>working</w:t>
-      </w:r>
-      <w:proofErr w:type="spellEnd"/>
-      <w:r>
-        <w:t xml:space="preserve"> les waarbij we dus informatie kunnen delen met medeleerlingen. Al was het de eerste les dus kwam daar niet veel van. Ik begon gewoon verder aan mijn </w:t>
-      </w:r>
-      <w:proofErr w:type="spellStart"/>
+        <w:t xml:space="preserve">Vandaag in de namiddag begonnen we met de co-working les waarbij we dus informatie kunnen delen met medeleerlingen. Al was het de eerste les dus kwam daar niet veel van. Ik begon gewoon verder aan mijn </w:t>
+      </w:r>
       <w:r>
         <w:t>F</w:t>
       </w:r>
       <w:r>
-        <w:t>igma</w:t>
-      </w:r>
-      <w:proofErr w:type="spellEnd"/>
-      <w:r>
-        <w:t xml:space="preserve"> design.</w:t>
+        <w:t>igma design.</w:t>
       </w:r>
     </w:p>
     <w:p>
@@ -309,15 +160,7 @@
         <w:t>te veel</w:t>
       </w:r>
       <w:r>
-        <w:t xml:space="preserve"> naar voor moest leunen en dus </w:t>
-      </w:r>
-      <w:proofErr w:type="gramStart"/>
-      <w:r>
-        <w:t>nek pijn</w:t>
-      </w:r>
-      <w:proofErr w:type="gramEnd"/>
-      <w:r>
-        <w:t xml:space="preserve"> kreeg en er waren precies geen ramen om te openen. </w:t>
+        <w:t xml:space="preserve"> naar voor moest leunen en dus nek pijn kreeg en er waren precies geen ramen om te openen. </w:t>
       </w:r>
       <w:r>
         <w:t>Gelukkig kunnen we naar buiten wanneer we het willen.</w:t>
@@ -357,23 +200,7 @@
     </w:p>
     <w:p>
       <w:r>
-        <w:t xml:space="preserve">Vandaag heb ik verder gewerkt aan mijn </w:t>
-      </w:r>
-      <w:proofErr w:type="spellStart"/>
-      <w:r>
-        <w:t>Figma</w:t>
-      </w:r>
-      <w:proofErr w:type="spellEnd"/>
-      <w:r>
-        <w:t xml:space="preserve"> design en het ging redelijk vlot vooruit. Ik wou absoluut dat het vandaag af was zodat ik morgen kan werken aan een ander vak. Tijdens het maken van het design heb ik vooral ook zitten op zoeken dat sommige concepten wel haalbaar zijn om te programmeren. Dit is allemaal wel mogelijk, maar zal wel een </w:t>
-      </w:r>
-      <w:proofErr w:type="spellStart"/>
-      <w:r>
-        <w:t>challenge</w:t>
-      </w:r>
-      <w:proofErr w:type="spellEnd"/>
-      <w:r>
-        <w:t xml:space="preserve"> zijn zoals de opmerkingen plaatsen</w:t>
+        <w:t>Vandaag heb ik verder gewerkt aan mijn Figma design en het ging redelijk vlot vooruit. Ik wou absoluut dat het vandaag af was zodat ik morgen kan werken aan een ander vak. Tijdens het maken van het design heb ik vooral ook zitten op zoeken dat sommige concepten wel haalbaar zijn om te programmeren. Dit is allemaal wel mogelijk, maar zal wel een challenge zijn zoals de opmerkingen plaatsen</w:t>
       </w:r>
       <w:r>
         <w:t>. M</w:t>
@@ -460,12 +287,103 @@
     </w:p>
     <w:p/>
     <w:p>
-      <w:r>
+      <w:pPr>
+        <w:rPr>
+          <w:b/>
+          <w:bCs/>
+        </w:rPr>
+      </w:pPr>
+      <w:r>
+        <w:rPr>
+          <w:b/>
+          <w:bCs/>
+        </w:rPr>
         <w:t>29/09/2021:</w:t>
       </w:r>
     </w:p>
-    <w:p/>
-    <w:p/>
+    <w:p>
+      <w:r>
+        <w:t>Vandaag werd mijn figma prototype gecontroleerd waarbij ik moest opnieuw uitleggen wat mijn app doet door middel van accurate presentatie. Ik legde dit vrij duidelijk uit en alles ging goed vooruit. Meneer Blancquaert heeft me dan ook nog een library genaamd “</w:t>
+      </w:r>
+      <w:r>
+        <w:t>Material</w:t>
+      </w:r>
+      <w:r>
+        <w:t xml:space="preserve"> design” aangeraden om mijn applicatie te ontwerpen. </w:t>
+      </w:r>
+      <w:r>
+        <w:t xml:space="preserve">Blijkbaar </w:t>
+      </w:r>
+      <w:r>
+        <w:t>Google gebruikt</w:t>
+      </w:r>
+      <w:r>
+        <w:t xml:space="preserve"> deze library</w:t>
+      </w:r>
+      <w:r>
+        <w:t xml:space="preserve"> om hun apps te maken.</w:t>
+      </w:r>
+    </w:p>
+    <w:p>
+      <w:pPr>
+        <w:rPr>
+          <w:lang w:val="en-US"/>
+        </w:rPr>
+      </w:pPr>
+      <w:hyperlink r:id="rId5" w:history="1">
+        <w:r>
+          <w:rPr>
+            <w:rStyle w:val="Hyperlink"/>
+            <w:lang w:val="en-US"/>
+          </w:rPr>
+          <w:t>https://material.io/</w:t>
+        </w:r>
+      </w:hyperlink>
+    </w:p>
+    <w:p>
+      <w:r>
+        <w:t>I</w:t>
+      </w:r>
+      <w:r>
+        <w:t>k heb dan ook tijdens de les de tutorial van Android Studio geprobeerd om mijn eerste applicatie te maken. Dit was zeer</w:t>
+      </w:r>
+      <w:r>
+        <w:t xml:space="preserve"> interessant uitgelegd en ik vond het vooral interessant dat je een </w:t>
+      </w:r>
+      <w:r>
+        <w:t>“</w:t>
+      </w:r>
+      <w:r>
+        <w:t>virtual device</w:t>
+      </w:r>
+      <w:r>
+        <w:t xml:space="preserve">” oftewel virtuele telefoon </w:t>
+      </w:r>
+      <w:r>
+        <w:t xml:space="preserve">kunt maken </w:t>
+      </w:r>
+      <w:r>
+        <w:t>om je app te testen. Als je developer modus in de settings van je gsm</w:t>
+      </w:r>
+      <w:r>
+        <w:t xml:space="preserve"> aanzet, kan je je gsm verbinden met de pc en dus je applicatie daarop testen.</w:t>
+      </w:r>
+    </w:p>
+    <w:p>
+      <w:hyperlink r:id="rId6" w:history="1">
+        <w:r>
+          <w:rPr>
+            <w:rStyle w:val="Hyperlink"/>
+          </w:rPr>
+          <w:t>https://developer.android.com/codelabs/build-your-first-android-app#0</w:t>
+        </w:r>
+      </w:hyperlink>
+    </w:p>
+    <w:p>
+      <w:r>
+        <w:t>Tijdens lange downloads heb ik ook mijn google account toegevoegd op Firebase. Volgens de presentatie die we kregen van een medestudent.</w:t>
+      </w:r>
+    </w:p>
     <w:sectPr>
       <w:pgSz w:w="11906" w:h="16838"/>
       <w:pgMar w:top="1417" w:right="1417" w:bottom="1417" w:left="1417" w:header="708" w:footer="708" w:gutter="0"/>
@@ -971,6 +889,29 @@
       <w:szCs w:val="26"/>
     </w:rPr>
   </w:style>
+  <w:style w:type="character" w:styleId="Hyperlink">
+    <w:name w:val="Hyperlink"/>
+    <w:basedOn w:val="Standaardalinea-lettertype"/>
+    <w:uiPriority w:val="99"/>
+    <w:unhideWhenUsed/>
+    <w:rsid w:val="00F610FD"/>
+    <w:rPr>
+      <w:color w:val="0563C1" w:themeColor="hyperlink"/>
+      <w:u w:val="single"/>
+    </w:rPr>
+  </w:style>
+  <w:style w:type="character" w:styleId="Onopgelostemelding">
+    <w:name w:val="Unresolved Mention"/>
+    <w:basedOn w:val="Standaardalinea-lettertype"/>
+    <w:uiPriority w:val="99"/>
+    <w:semiHidden/>
+    <w:unhideWhenUsed/>
+    <w:rsid w:val="00F610FD"/>
+    <w:rPr>
+      <w:color w:val="605E5C"/>
+      <w:shd w:val="clear" w:color="auto" w:fill="E1DFDD"/>
+    </w:rPr>
+  </w:style>
 </w:styles>
 </file>
 

</xml_diff>

<commit_message>
Updated logboek(5/10/2021) + followed andriod studio tutorial
</commit_message>
<xml_diff>
--- a/Logboek_Dries_Fierens.docx
+++ b/Logboek_Dries_Fierens.docx
@@ -46,7 +46,39 @@
         <w:t>applicatie</w:t>
       </w:r>
       <w:r>
-        <w:t xml:space="preserve"> die je kan maken en welke technologieën je kan gebruiken. Ik heb voor native gekozen want dat past het best bij mijn aftakking “Software developer” sinds het java inhoudt. De anderen zijn hybrid en progressive web app dat dus meer te maken hebben met web &amp; mobile dus vooral HTML &amp; CSS. We moesten dan ook nog kiezen voor een project idee, waarbij ik koos voor een scanner + pdf converter app</w:t>
+        <w:t xml:space="preserve"> die je kan maken en welke technologieën je kan gebruiken. Ik heb voor native gekozen want dat past het best bij mijn aftakking “Software </w:t>
+      </w:r>
+      <w:proofErr w:type="spellStart"/>
+      <w:r>
+        <w:t>developer</w:t>
+      </w:r>
+      <w:proofErr w:type="spellEnd"/>
+      <w:r>
+        <w:t xml:space="preserve">” sinds het </w:t>
+      </w:r>
+      <w:proofErr w:type="spellStart"/>
+      <w:r>
+        <w:t>java</w:t>
+      </w:r>
+      <w:proofErr w:type="spellEnd"/>
+      <w:r>
+        <w:t xml:space="preserve"> inhoudt. De anderen zijn </w:t>
+      </w:r>
+      <w:proofErr w:type="spellStart"/>
+      <w:r>
+        <w:t>hybrid</w:t>
+      </w:r>
+      <w:proofErr w:type="spellEnd"/>
+      <w:r>
+        <w:t xml:space="preserve"> en </w:t>
+      </w:r>
+      <w:proofErr w:type="spellStart"/>
+      <w:r>
+        <w:t>progressive</w:t>
+      </w:r>
+      <w:proofErr w:type="spellEnd"/>
+      <w:r>
+        <w:t xml:space="preserve"> web app dat dus meer te maken hebben met web &amp; mobile dus vooral HTML &amp; CSS. We moesten dan ook nog kiezen voor een project idee, waarbij ik koos voor een scanner + pdf converter app</w:t>
       </w:r>
       <w:r>
         <w:t xml:space="preserve"> waarbij het vooral bedoelt is o</w:t>
@@ -73,20 +105,92 @@
         <w:t xml:space="preserve"> </w:t>
       </w:r>
       <w:r>
-        <w:t>Als back-end koos ik Firebase en als technologie koos ik in java te werken om een android app te maken in plaats van een IOS app.</w:t>
-      </w:r>
-      <w:r>
-        <w:t xml:space="preserve"> Want ik heb een huawei.</w:t>
-      </w:r>
-    </w:p>
-    <w:p>
-      <w:r>
-        <w:t>Ik heb dit allemaal grondiger beschreven in mijn “app idee”.pdf. Dit staat ondertussen op de repository die we moesten maken.</w:t>
-      </w:r>
-    </w:p>
-    <w:p>
-      <w:r>
-        <w:t>Om af te sluiten had ik al ondertussen een goede naam gevonden gebaseerd op de applicatie genaamd Scannable. Ik heb dus besloten om mijn applicatie Notable te noemen.</w:t>
+        <w:t xml:space="preserve">Als </w:t>
+      </w:r>
+      <w:proofErr w:type="spellStart"/>
+      <w:r>
+        <w:t>back-end</w:t>
+      </w:r>
+      <w:proofErr w:type="spellEnd"/>
+      <w:r>
+        <w:t xml:space="preserve"> koos ik </w:t>
+      </w:r>
+      <w:proofErr w:type="spellStart"/>
+      <w:r>
+        <w:t>Firebase</w:t>
+      </w:r>
+      <w:proofErr w:type="spellEnd"/>
+      <w:r>
+        <w:t xml:space="preserve"> en als technologie koos ik in </w:t>
+      </w:r>
+      <w:proofErr w:type="spellStart"/>
+      <w:r>
+        <w:t>java</w:t>
+      </w:r>
+      <w:proofErr w:type="spellEnd"/>
+      <w:r>
+        <w:t xml:space="preserve"> te werken om een </w:t>
+      </w:r>
+      <w:proofErr w:type="spellStart"/>
+      <w:r>
+        <w:t>android</w:t>
+      </w:r>
+      <w:proofErr w:type="spellEnd"/>
+      <w:r>
+        <w:t xml:space="preserve"> app te maken in plaats van een IOS app.</w:t>
+      </w:r>
+      <w:r>
+        <w:t xml:space="preserve"> Want ik heb een </w:t>
+      </w:r>
+      <w:proofErr w:type="spellStart"/>
+      <w:r>
+        <w:t>huawei</w:t>
+      </w:r>
+      <w:proofErr w:type="spellEnd"/>
+      <w:r>
+        <w:t>.</w:t>
+      </w:r>
+    </w:p>
+    <w:p>
+      <w:r>
+        <w:t xml:space="preserve">Ik heb dit allemaal grondiger beschreven in mijn “app </w:t>
+      </w:r>
+      <w:proofErr w:type="spellStart"/>
+      <w:r>
+        <w:t>idee”.pdf</w:t>
+      </w:r>
+      <w:proofErr w:type="spellEnd"/>
+      <w:r>
+        <w:t xml:space="preserve">. Dit staat ondertussen op de </w:t>
+      </w:r>
+      <w:proofErr w:type="spellStart"/>
+      <w:r>
+        <w:t>repository</w:t>
+      </w:r>
+      <w:proofErr w:type="spellEnd"/>
+      <w:r>
+        <w:t xml:space="preserve"> die we moesten maken.</w:t>
+      </w:r>
+    </w:p>
+    <w:p>
+      <w:r>
+        <w:t xml:space="preserve">Om af te sluiten had ik al ondertussen een goede naam gevonden gebaseerd op de applicatie genaamd </w:t>
+      </w:r>
+      <w:proofErr w:type="spellStart"/>
+      <w:r>
+        <w:t>Scannable</w:t>
+      </w:r>
+      <w:proofErr w:type="spellEnd"/>
+      <w:r>
+        <w:t xml:space="preserve">. Ik heb dus besloten om mijn applicatie </w:t>
+      </w:r>
+      <w:proofErr w:type="spellStart"/>
+      <w:r>
+        <w:t>Notable</w:t>
+      </w:r>
+      <w:proofErr w:type="spellEnd"/>
+      <w:r>
+        <w:t xml:space="preserve"> te noemen.</w:t>
       </w:r>
     </w:p>
     <w:p>
@@ -120,7 +224,15 @@
     </w:p>
     <w:p>
       <w:r>
-        <w:t xml:space="preserve">Daarna moest ik gewoon begin aan een UI/UX design voor mijn applicatie, waarbij nog niet veel had gedaan omdat les niet meer lang duurde. Ik moest toen ook tegelijkertijd zoeken naar tutorials dus </w:t>
+        <w:t xml:space="preserve">Daarna moest ik gewoon begin aan een UI/UX design voor mijn applicatie, waarbij nog niet veel had gedaan omdat les niet meer lang duurde. Ik moest toen ook tegelijkertijd zoeken naar </w:t>
+      </w:r>
+      <w:proofErr w:type="spellStart"/>
+      <w:r>
+        <w:t>tutorials</w:t>
+      </w:r>
+      <w:proofErr w:type="spellEnd"/>
+      <w:r>
+        <w:t xml:space="preserve"> dus </w:t>
       </w:r>
       <w:r>
         <w:t>duurde dat ook kort.</w:t>
@@ -143,13 +255,26 @@
     </w:p>
     <w:p>
       <w:r>
-        <w:t xml:space="preserve">Vandaag in de namiddag begonnen we met de co-working les waarbij we dus informatie kunnen delen met medeleerlingen. Al was het de eerste les dus kwam daar niet veel van. Ik begon gewoon verder aan mijn </w:t>
-      </w:r>
+        <w:t>Vandaag in de namiddag begonnen we met de co-</w:t>
+      </w:r>
+      <w:proofErr w:type="spellStart"/>
+      <w:r>
+        <w:t>working</w:t>
+      </w:r>
+      <w:proofErr w:type="spellEnd"/>
+      <w:r>
+        <w:t xml:space="preserve"> les waarbij we dus informatie kunnen delen met medeleerlingen. Al was het de eerste les dus kwam daar niet veel van. Ik begon gewoon verder aan mijn </w:t>
+      </w:r>
+      <w:proofErr w:type="spellStart"/>
       <w:r>
         <w:t>F</w:t>
       </w:r>
       <w:r>
-        <w:t>igma design.</w:t>
+        <w:t>igma</w:t>
+      </w:r>
+      <w:proofErr w:type="spellEnd"/>
+      <w:r>
+        <w:t xml:space="preserve"> design.</w:t>
       </w:r>
     </w:p>
     <w:p>
@@ -200,7 +325,23 @@
     </w:p>
     <w:p>
       <w:r>
-        <w:t>Vandaag heb ik verder gewerkt aan mijn Figma design en het ging redelijk vlot vooruit. Ik wou absoluut dat het vandaag af was zodat ik morgen kan werken aan een ander vak. Tijdens het maken van het design heb ik vooral ook zitten op zoeken dat sommige concepten wel haalbaar zijn om te programmeren. Dit is allemaal wel mogelijk, maar zal wel een challenge zijn zoals de opmerkingen plaatsen</w:t>
+        <w:t xml:space="preserve">Vandaag heb ik verder gewerkt aan mijn </w:t>
+      </w:r>
+      <w:proofErr w:type="spellStart"/>
+      <w:r>
+        <w:t>Figma</w:t>
+      </w:r>
+      <w:proofErr w:type="spellEnd"/>
+      <w:r>
+        <w:t xml:space="preserve"> design en het ging redelijk vlot vooruit. Ik wou absoluut dat het vandaag af was zodat ik morgen kan werken aan een ander vak. Tijdens het maken van het design heb ik vooral ook zitten op zoeken dat sommige concepten wel haalbaar zijn om te programmeren. Dit is allemaal wel mogelijk, maar zal wel een </w:t>
+      </w:r>
+      <w:proofErr w:type="spellStart"/>
+      <w:r>
+        <w:t>challenge</w:t>
+      </w:r>
+      <w:proofErr w:type="spellEnd"/>
+      <w:r>
+        <w:t xml:space="preserve"> zijn zoals de opmerkingen plaatsen</w:t>
       </w:r>
       <w:r>
         <w:t>. M</w:t>
@@ -288,6 +429,15 @@
     <w:p/>
     <w:p>
       <w:pPr>
+        <w:pStyle w:val="Kop2"/>
+      </w:pPr>
+      <w:r>
+        <w:t>Week 2</w:t>
+      </w:r>
+    </w:p>
+    <w:p/>
+    <w:p>
+      <w:pPr>
         <w:rPr>
           <w:b/>
           <w:bCs/>
@@ -303,38 +453,57 @@
     </w:p>
     <w:p>
       <w:r>
-        <w:t>Vandaag werd mijn figma prototype gecontroleerd waarbij ik moest opnieuw uitleggen wat mijn app doet door middel van accurate presentatie. Ik legde dit vrij duidelijk uit en alles ging goed vooruit. Meneer Blancquaert heeft me dan ook nog een library genaamd “</w:t>
-      </w:r>
+        <w:t xml:space="preserve">Vandaag werd mijn </w:t>
+      </w:r>
+      <w:proofErr w:type="spellStart"/>
+      <w:r>
+        <w:t>figma</w:t>
+      </w:r>
+      <w:proofErr w:type="spellEnd"/>
+      <w:r>
+        <w:t xml:space="preserve"> prototype gecontroleerd waarbij ik moest opnieuw uitleggen wat mijn app doet door middel van accurate presentatie. Ik legde dit vrij duidelijk uit en alles ging goed vooruit. Meneer </w:t>
+      </w:r>
+      <w:proofErr w:type="spellStart"/>
+      <w:r>
+        <w:t>Blancquaert</w:t>
+      </w:r>
+      <w:proofErr w:type="spellEnd"/>
+      <w:r>
+        <w:t xml:space="preserve"> heeft me dan ook nog een </w:t>
+      </w:r>
+      <w:proofErr w:type="spellStart"/>
+      <w:r>
+        <w:t>library</w:t>
+      </w:r>
+      <w:proofErr w:type="spellEnd"/>
+      <w:r>
+        <w:t xml:space="preserve"> genaamd “</w:t>
+      </w:r>
+      <w:proofErr w:type="spellStart"/>
       <w:r>
         <w:t>Material</w:t>
       </w:r>
+      <w:proofErr w:type="spellEnd"/>
       <w:r>
         <w:t xml:space="preserve"> design” aangeraden om mijn applicatie te ontwerpen. </w:t>
       </w:r>
       <w:r>
-        <w:t xml:space="preserve">Blijkbaar </w:t>
-      </w:r>
-      <w:r>
-        <w:t>Google gebruikt</w:t>
-      </w:r>
-      <w:r>
-        <w:t xml:space="preserve"> deze library</w:t>
-      </w:r>
+        <w:t xml:space="preserve">Blijkbaar Google gebruikt deze </w:t>
+      </w:r>
+      <w:proofErr w:type="spellStart"/>
+      <w:r>
+        <w:t>library</w:t>
+      </w:r>
+      <w:proofErr w:type="spellEnd"/>
       <w:r>
         <w:t xml:space="preserve"> om hun apps te maken.</w:t>
       </w:r>
     </w:p>
     <w:p>
-      <w:pPr>
-        <w:rPr>
-          <w:lang w:val="en-US"/>
-        </w:rPr>
-      </w:pPr>
       <w:hyperlink r:id="rId5" w:history="1">
         <w:r>
           <w:rPr>
             <w:rStyle w:val="Hyperlink"/>
-            <w:lang w:val="en-US"/>
           </w:rPr>
           <w:t>https://material.io/</w:t>
         </w:r>
@@ -363,14 +532,30 @@
         <w:t xml:space="preserve">kunt maken </w:t>
       </w:r>
       <w:r>
-        <w:t>om je app te testen. Als je developer modus in de settings van je gsm</w:t>
+        <w:t xml:space="preserve">om je app te testen. Als je </w:t>
+      </w:r>
+      <w:proofErr w:type="spellStart"/>
+      <w:r>
+        <w:t>developer</w:t>
+      </w:r>
+      <w:proofErr w:type="spellEnd"/>
+      <w:r>
+        <w:t xml:space="preserve"> modus in de </w:t>
+      </w:r>
+      <w:proofErr w:type="spellStart"/>
+      <w:r>
+        <w:t>settings</w:t>
+      </w:r>
+      <w:proofErr w:type="spellEnd"/>
+      <w:r>
+        <w:t xml:space="preserve"> van je gsm</w:t>
       </w:r>
       <w:r>
         <w:t xml:space="preserve"> aanzet, kan je je gsm verbinden met de pc en dus je applicatie daarop testen.</w:t>
       </w:r>
     </w:p>
     <w:p>
-      <w:hyperlink r:id="rId6" w:history="1">
+      <w:hyperlink r:id="rId6" w:anchor="0" w:history="1">
         <w:r>
           <w:rPr>
             <w:rStyle w:val="Hyperlink"/>
@@ -381,7 +566,239 @@
     </w:p>
     <w:p>
       <w:r>
-        <w:t>Tijdens lange downloads heb ik ook mijn google account toegevoegd op Firebase. Volgens de presentatie die we kregen van een medestudent.</w:t>
+        <w:t xml:space="preserve">Tijdens lange downloads heb ik ook mijn google account toegevoegd op </w:t>
+      </w:r>
+      <w:proofErr w:type="spellStart"/>
+      <w:r>
+        <w:t>Firebase</w:t>
+      </w:r>
+      <w:proofErr w:type="spellEnd"/>
+      <w:r>
+        <w:t>. Volgens de presentatie die we kregen van een medestudent.</w:t>
+      </w:r>
+    </w:p>
+    <w:p>
+      <w:pPr>
+        <w:pStyle w:val="Kop2"/>
+      </w:pPr>
+      <w:r>
+        <w:t xml:space="preserve">Week </w:t>
+      </w:r>
+      <w:r>
+        <w:t>3</w:t>
+      </w:r>
+    </w:p>
+    <w:p/>
+    <w:p>
+      <w:pPr>
+        <w:rPr>
+          <w:b/>
+          <w:bCs/>
+        </w:rPr>
+      </w:pPr>
+      <w:r>
+        <w:rPr>
+          <w:b/>
+          <w:bCs/>
+        </w:rPr>
+        <w:t>05/10/2021</w:t>
+      </w:r>
+      <w:r>
+        <w:rPr>
+          <w:b/>
+          <w:bCs/>
+        </w:rPr>
+        <w:t>:</w:t>
+      </w:r>
+    </w:p>
+    <w:p>
+      <w:r>
+        <w:t xml:space="preserve">Vandaag moest </w:t>
+      </w:r>
+      <w:r>
+        <w:t>ik</w:t>
+      </w:r>
+      <w:r>
+        <w:t xml:space="preserve"> </w:t>
+      </w:r>
+      <w:r>
+        <w:t>mijn</w:t>
+      </w:r>
+      <w:r>
+        <w:t xml:space="preserve"> </w:t>
+      </w:r>
+      <w:proofErr w:type="spellStart"/>
+      <w:r>
+        <w:t>figma</w:t>
+      </w:r>
+      <w:proofErr w:type="spellEnd"/>
+      <w:r>
+        <w:t xml:space="preserve"> design delen met meneer </w:t>
+      </w:r>
+      <w:proofErr w:type="spellStart"/>
+      <w:r>
+        <w:t>Blancquaert</w:t>
+      </w:r>
+      <w:proofErr w:type="spellEnd"/>
+      <w:r>
+        <w:t>, toen hij vroeg dat mijn design klaar was</w:t>
+      </w:r>
+      <w:r>
+        <w:t xml:space="preserve"> of niet</w:t>
+      </w:r>
+      <w:r>
+        <w:t>.</w:t>
+      </w:r>
+    </w:p>
+    <w:p>
+      <w:r>
+        <w:t>Ik heb daarna gewoon verder begonnen aan de tutorial die ik vorige week gebruikt had.</w:t>
+      </w:r>
+      <w:r>
+        <w:t xml:space="preserve"> Hierbij leerde ik meer over hoe ik Android studio beter kon gebruiken om mijn app te </w:t>
+      </w:r>
+      <w:proofErr w:type="spellStart"/>
+      <w:r>
+        <w:t>designen</w:t>
+      </w:r>
+      <w:proofErr w:type="spellEnd"/>
+      <w:r>
+        <w:t xml:space="preserve"> zoals hoe je </w:t>
+      </w:r>
+      <w:r>
+        <w:lastRenderedPageBreak/>
+        <w:t xml:space="preserve">attributen kunt aanpassen (bv. </w:t>
+      </w:r>
+      <w:proofErr w:type="spellStart"/>
+      <w:r>
+        <w:t>color</w:t>
+      </w:r>
+      <w:proofErr w:type="spellEnd"/>
+      <w:r>
+        <w:t>)</w:t>
+      </w:r>
+      <w:r>
+        <w:t xml:space="preserve">. Android studio is zeer gelijkaardig als bijvoorbeeld </w:t>
+      </w:r>
+      <w:proofErr w:type="spellStart"/>
+      <w:r>
+        <w:t>Webstorm</w:t>
+      </w:r>
+      <w:proofErr w:type="spellEnd"/>
+      <w:r>
+        <w:t xml:space="preserve">, maar bij het design van een mobile app is het zeer </w:t>
+      </w:r>
+      <w:r>
+        <w:t>verschillend</w:t>
+      </w:r>
+      <w:r>
+        <w:t>.</w:t>
+      </w:r>
+      <w:r>
+        <w:t xml:space="preserve"> Bij </w:t>
+      </w:r>
+      <w:proofErr w:type="spellStart"/>
+      <w:r>
+        <w:t>Webstorm</w:t>
+      </w:r>
+      <w:proofErr w:type="spellEnd"/>
+      <w:r>
+        <w:t xml:space="preserve"> kan je je website </w:t>
+      </w:r>
+      <w:r>
+        <w:t>bekijken</w:t>
+      </w:r>
+      <w:r>
+        <w:t xml:space="preserve"> in een gekozen browser, maar je kan in Android studio</w:t>
+      </w:r>
+      <w:r>
+        <w:t xml:space="preserve"> je app</w:t>
+      </w:r>
+      <w:r>
+        <w:t xml:space="preserve"> daar</w:t>
+      </w:r>
+      <w:r>
+        <w:t xml:space="preserve"> het</w:t>
+      </w:r>
+      <w:r>
+        <w:t xml:space="preserve"> zelf </w:t>
+      </w:r>
+      <w:r>
+        <w:t>bekijken</w:t>
+      </w:r>
+      <w:r>
+        <w:t>.</w:t>
+      </w:r>
+      <w:r>
+        <w:t xml:space="preserve"> Als ik </w:t>
+      </w:r>
+      <w:r>
+        <w:t xml:space="preserve">de </w:t>
+      </w:r>
+      <w:proofErr w:type="spellStart"/>
+      <w:r>
+        <w:t>Jetbrains</w:t>
+      </w:r>
+      <w:proofErr w:type="spellEnd"/>
+      <w:r>
+        <w:t xml:space="preserve"> applicaties</w:t>
+      </w:r>
+      <w:r>
+        <w:t xml:space="preserve"> vergelijk met Visual studio 2019, </w:t>
+      </w:r>
+      <w:r>
+        <w:t>heb ik er altijd moeite mee om de lay</w:t>
+      </w:r>
+      <w:r>
+        <w:t>-</w:t>
+      </w:r>
+      <w:r>
+        <w:t>out ervan te begrijpen</w:t>
+      </w:r>
+      <w:r>
+        <w:t>.</w:t>
+      </w:r>
+    </w:p>
+    <w:p>
+      <w:r>
+        <w:rPr>
+          <w:noProof/>
+        </w:rPr>
+        <w:drawing>
+          <wp:inline distT="0" distB="0" distL="0" distR="0" wp14:anchorId="4206B093" wp14:editId="4960B9BD">
+            <wp:extent cx="5760720" cy="3902710"/>
+            <wp:effectExtent l="0" t="0" r="0" b="2540"/>
+            <wp:docPr id="2" name="Afbeelding 2"/>
+            <wp:cNvGraphicFramePr>
+              <a:graphicFrameLocks xmlns:a="http://schemas.openxmlformats.org/drawingml/2006/main" noChangeAspect="1"/>
+            </wp:cNvGraphicFramePr>
+            <a:graphic xmlns:a="http://schemas.openxmlformats.org/drawingml/2006/main">
+              <a:graphicData uri="http://schemas.openxmlformats.org/drawingml/2006/picture">
+                <pic:pic xmlns:pic="http://schemas.openxmlformats.org/drawingml/2006/picture">
+                  <pic:nvPicPr>
+                    <pic:cNvPr id="1" name=""/>
+                    <pic:cNvPicPr/>
+                  </pic:nvPicPr>
+                  <pic:blipFill>
+                    <a:blip r:embed="rId7"/>
+                    <a:stretch>
+                      <a:fillRect/>
+                    </a:stretch>
+                  </pic:blipFill>
+                  <pic:spPr>
+                    <a:xfrm>
+                      <a:off x="0" y="0"/>
+                      <a:ext cx="5760720" cy="3902710"/>
+                    </a:xfrm>
+                    <a:prstGeom prst="rect">
+                      <a:avLst/>
+                    </a:prstGeom>
+                  </pic:spPr>
+                </pic:pic>
+              </a:graphicData>
+            </a:graphic>
+          </wp:inline>
+        </w:drawing>
       </w:r>
     </w:p>
     <w:sectPr>

</xml_diff>

<commit_message>
Added "User tests opmerkingen".text
</commit_message>
<xml_diff>
--- a/Logboek_Dries_Fierens.docx
+++ b/Logboek_Dries_Fierens.docx
@@ -78,7 +78,15 @@
       </w:r>
       <w:proofErr w:type="spellEnd"/>
       <w:r>
-        <w:t xml:space="preserve"> web app dat dus meer te maken hebben met web &amp; mobile dus vooral HTML &amp; CSS. We moesten dan ook nog kiezen voor een project idee, waarbij ik koos voor een scanner + pdf converter app</w:t>
+        <w:t xml:space="preserve"> web app dat dus meer te maken hebben met web &amp; mobile dus vooral HTML &amp; CSS. We moesten dan ook nog kiezen voor een project idee, waarbij ik koos voor een scanner + </w:t>
+      </w:r>
+      <w:proofErr w:type="gramStart"/>
+      <w:r>
+        <w:t>pdf converter</w:t>
+      </w:r>
+      <w:proofErr w:type="gramEnd"/>
+      <w:r>
+        <w:t xml:space="preserve"> app</w:t>
       </w:r>
       <w:r>
         <w:t xml:space="preserve"> waarbij het vooral bedoelt is o</w:t>
@@ -99,7 +107,15 @@
         <w:t>.</w:t>
       </w:r>
       <w:r>
-        <w:t xml:space="preserve"> Het was verplicht om 1 hardware component van de gsm te gebruiken dus koos ik natuurlijk voor de camera.</w:t>
+        <w:t xml:space="preserve"> Het was verplicht om 1 </w:t>
+      </w:r>
+      <w:proofErr w:type="gramStart"/>
+      <w:r>
+        <w:t>hardware component</w:t>
+      </w:r>
+      <w:proofErr w:type="gramEnd"/>
+      <w:r>
+        <w:t xml:space="preserve"> van de gsm te gebruiken dus koos ik natuurlijk voor de camera.</w:t>
       </w:r>
       <w:r>
         <w:t xml:space="preserve"> </w:t>
@@ -213,7 +229,15 @@
         <w:t xml:space="preserve">Mijn app idee werd niet goedgekeurd, want de leerkracht raadde het af door problemen die ervan kunnen komen. Ik moest dan vandaag een nieuw idee opstellen. </w:t>
       </w:r>
       <w:r>
-        <w:t>De scanner + pdf converter was duidelijk te moeilijk, maar ik besloot om het idee verder te zetten van een app die notities kan delen. Dus nu moet het gewoon foto’s trekken van de notities. Om nog toe te voegen kan ik ook opmerkingswolkjes toevoegen aan de foto voor bijvoorbeeld een fout</w:t>
+        <w:t xml:space="preserve">De scanner + </w:t>
+      </w:r>
+      <w:proofErr w:type="gramStart"/>
+      <w:r>
+        <w:t>pdf converter</w:t>
+      </w:r>
+      <w:proofErr w:type="gramEnd"/>
+      <w:r>
+        <w:t xml:space="preserve"> was duidelijk te moeilijk, maar ik besloot om het idee verder te zetten van een app die notities kan delen. Dus nu moet het gewoon foto’s trekken van de notities. Om nog toe te voegen kan ik ook opmerkingswolkjes toevoegen aan de foto voor bijvoorbeeld een fout</w:t>
       </w:r>
       <w:r>
         <w:t xml:space="preserve"> aan te duiden</w:t>
@@ -285,7 +309,15 @@
         <w:t>te veel</w:t>
       </w:r>
       <w:r>
-        <w:t xml:space="preserve"> naar voor moest leunen en dus nek pijn kreeg en er waren precies geen ramen om te openen. </w:t>
+        <w:t xml:space="preserve"> naar voor moest leunen en dus </w:t>
+      </w:r>
+      <w:proofErr w:type="gramStart"/>
+      <w:r>
+        <w:t>nek pijn</w:t>
+      </w:r>
+      <w:proofErr w:type="gramEnd"/>
+      <w:r>
+        <w:t xml:space="preserve"> kreeg en er waren precies geen ramen om te openen. </w:t>
       </w:r>
       <w:r>
         <w:t>Gelukkig kunnen we naar buiten wanneer we het willen.</w:t>
@@ -566,7 +598,15 @@
     </w:p>
     <w:p>
       <w:r>
-        <w:t xml:space="preserve">Tijdens lange downloads heb ik ook mijn google account toegevoegd op </w:t>
+        <w:t xml:space="preserve">Tijdens lange downloads heb ik ook mijn </w:t>
+      </w:r>
+      <w:proofErr w:type="gramStart"/>
+      <w:r>
+        <w:t>google account</w:t>
+      </w:r>
+      <w:proofErr w:type="gramEnd"/>
+      <w:r>
+        <w:t xml:space="preserve"> toegevoegd op </w:t>
       </w:r>
       <w:proofErr w:type="spellStart"/>
       <w:r>
@@ -655,7 +695,15 @@
         <w:t>Ik heb daarna gewoon verder begonnen aan de tutorial die ik vorige week gebruikt had.</w:t>
       </w:r>
       <w:r>
-        <w:t xml:space="preserve"> Hierbij leerde ik meer over hoe ik Android studio beter kon gebruiken om mijn app te </w:t>
+        <w:t xml:space="preserve"> Hierbij leerde ik meer over hoe ik </w:t>
+      </w:r>
+      <w:proofErr w:type="gramStart"/>
+      <w:r>
+        <w:t>Android studio</w:t>
+      </w:r>
+      <w:proofErr w:type="gramEnd"/>
+      <w:r>
+        <w:t xml:space="preserve"> beter kon gebruiken om mijn app te </w:t>
       </w:r>
       <w:proofErr w:type="spellStart"/>
       <w:r>
@@ -678,7 +726,15 @@
         <w:t>)</w:t>
       </w:r>
       <w:r>
-        <w:t xml:space="preserve">. Android studio is zeer gelijkaardig als bijvoorbeeld </w:t>
+        <w:t xml:space="preserve">. </w:t>
+      </w:r>
+      <w:proofErr w:type="gramStart"/>
+      <w:r>
+        <w:t>Android studio</w:t>
+      </w:r>
+      <w:proofErr w:type="gramEnd"/>
+      <w:r>
+        <w:t xml:space="preserve"> is zeer gelijkaardig als bijvoorbeeld </w:t>
       </w:r>
       <w:proofErr w:type="spellStart"/>
       <w:r>
@@ -709,8 +765,13 @@
         <w:t>bekijken</w:t>
       </w:r>
       <w:r>
-        <w:t xml:space="preserve"> in een gekozen browser, maar je kan in Android studio</w:t>
-      </w:r>
+        <w:t xml:space="preserve"> in een gekozen browser, maar je kan in </w:t>
+      </w:r>
+      <w:proofErr w:type="gramStart"/>
+      <w:r>
+        <w:t>Android studio</w:t>
+      </w:r>
+      <w:proofErr w:type="gramEnd"/>
       <w:r>
         <w:t xml:space="preserve"> je app</w:t>
       </w:r>
@@ -730,10 +791,7 @@
         <w:t>.</w:t>
       </w:r>
       <w:r>
-        <w:t xml:space="preserve"> Als ik </w:t>
-      </w:r>
-      <w:r>
-        <w:t xml:space="preserve">de </w:t>
+        <w:t xml:space="preserve"> Als ik de </w:t>
       </w:r>
       <w:proofErr w:type="spellStart"/>
       <w:r>
@@ -741,10 +799,7 @@
       </w:r>
       <w:proofErr w:type="spellEnd"/>
       <w:r>
-        <w:t xml:space="preserve"> applicaties</w:t>
-      </w:r>
-      <w:r>
-        <w:t xml:space="preserve"> vergelijk met Visual studio 2019, </w:t>
+        <w:t xml:space="preserve"> applicaties vergelijk met Visual studio 2019, </w:t>
       </w:r>
       <w:r>
         <w:t>heb ik er altijd moeite mee om de lay</w:t>
@@ -801,6 +856,33 @@
         </w:drawing>
       </w:r>
     </w:p>
+    <w:p/>
+    <w:p>
+      <w:r>
+        <w:t>06/10/2021:</w:t>
+      </w:r>
+    </w:p>
+    <w:p>
+      <w:r>
+        <w:t>Usertesten</w:t>
+      </w:r>
+    </w:p>
+    <w:p>
+      <w:r>
+        <w:t>Tutorial voor inlog pagina te maken</w:t>
+      </w:r>
+    </w:p>
+    <w:p>
+      <w:hyperlink r:id="rId8" w:history="1">
+        <w:r>
+          <w:rPr>
+            <w:rStyle w:val="Hyperlink"/>
+          </w:rPr>
+          <w:t>https://codelabs.developers.google.com/codelabs/mdc-101-java#0</w:t>
+        </w:r>
+      </w:hyperlink>
+    </w:p>
+    <w:p/>
     <w:sectPr>
       <w:pgSz w:w="11906" w:h="16838"/>
       <w:pgMar w:top="1417" w:right="1417" w:bottom="1417" w:left="1417" w:header="708" w:footer="708" w:gutter="0"/>

</xml_diff>

<commit_message>
Removed starting app and replaced it with a empty activity because I'm going to use Material Design
</commit_message>
<xml_diff>
--- a/Logboek_Dries_Fierens.docx
+++ b/Logboek_Dries_Fierens.docx
@@ -46,47 +46,7 @@
         <w:t>applicatie</w:t>
       </w:r>
       <w:r>
-        <w:t xml:space="preserve"> die je kan maken en welke technologieën je kan gebruiken. Ik heb voor native gekozen want dat past het best bij mijn aftakking “Software </w:t>
-      </w:r>
-      <w:proofErr w:type="spellStart"/>
-      <w:r>
-        <w:t>developer</w:t>
-      </w:r>
-      <w:proofErr w:type="spellEnd"/>
-      <w:r>
-        <w:t xml:space="preserve">” sinds het </w:t>
-      </w:r>
-      <w:proofErr w:type="spellStart"/>
-      <w:r>
-        <w:t>java</w:t>
-      </w:r>
-      <w:proofErr w:type="spellEnd"/>
-      <w:r>
-        <w:t xml:space="preserve"> inhoudt. De anderen zijn </w:t>
-      </w:r>
-      <w:proofErr w:type="spellStart"/>
-      <w:r>
-        <w:t>hybrid</w:t>
-      </w:r>
-      <w:proofErr w:type="spellEnd"/>
-      <w:r>
-        <w:t xml:space="preserve"> en </w:t>
-      </w:r>
-      <w:proofErr w:type="spellStart"/>
-      <w:r>
-        <w:t>progressive</w:t>
-      </w:r>
-      <w:proofErr w:type="spellEnd"/>
-      <w:r>
-        <w:t xml:space="preserve"> web app dat dus meer te maken hebben met web &amp; mobile dus vooral HTML &amp; CSS. We moesten dan ook nog kiezen voor een project idee, waarbij ik koos voor een scanner + </w:t>
-      </w:r>
-      <w:proofErr w:type="gramStart"/>
-      <w:r>
-        <w:t>pdf converter</w:t>
-      </w:r>
-      <w:proofErr w:type="gramEnd"/>
-      <w:r>
-        <w:t xml:space="preserve"> app</w:t>
+        <w:t xml:space="preserve"> die je kan maken en welke technologieën je kan gebruiken. Ik heb voor native gekozen want dat past het best bij mijn aftakking “Software developer” sinds het java inhoudt. De anderen zijn hybrid en progressive web app dat dus meer te maken hebben met web &amp; mobile dus vooral HTML &amp; CSS. We moesten dan ook nog kiezen voor een project idee, waarbij ik koos voor een scanner + pdf converter app</w:t>
       </w:r>
       <w:r>
         <w:t xml:space="preserve"> waarbij het vooral bedoelt is o</w:t>
@@ -107,106 +67,26 @@
         <w:t>.</w:t>
       </w:r>
       <w:r>
-        <w:t xml:space="preserve"> Het was verplicht om 1 </w:t>
-      </w:r>
-      <w:proofErr w:type="gramStart"/>
-      <w:r>
-        <w:t>hardware component</w:t>
-      </w:r>
-      <w:proofErr w:type="gramEnd"/>
-      <w:r>
-        <w:t xml:space="preserve"> van de gsm te gebruiken dus koos ik natuurlijk voor de camera.</w:t>
+        <w:t xml:space="preserve"> Het was verplicht om 1 hardware component van de gsm te gebruiken dus koos ik natuurlijk voor de camera.</w:t>
       </w:r>
       <w:r>
         <w:t xml:space="preserve"> </w:t>
       </w:r>
       <w:r>
-        <w:t xml:space="preserve">Als </w:t>
-      </w:r>
-      <w:proofErr w:type="spellStart"/>
-      <w:r>
-        <w:t>back-end</w:t>
-      </w:r>
-      <w:proofErr w:type="spellEnd"/>
-      <w:r>
-        <w:t xml:space="preserve"> koos ik </w:t>
-      </w:r>
-      <w:proofErr w:type="spellStart"/>
-      <w:r>
-        <w:t>Firebase</w:t>
-      </w:r>
-      <w:proofErr w:type="spellEnd"/>
-      <w:r>
-        <w:t xml:space="preserve"> en als technologie koos ik in </w:t>
-      </w:r>
-      <w:proofErr w:type="spellStart"/>
-      <w:r>
-        <w:t>java</w:t>
-      </w:r>
-      <w:proofErr w:type="spellEnd"/>
-      <w:r>
-        <w:t xml:space="preserve"> te werken om een </w:t>
-      </w:r>
-      <w:proofErr w:type="spellStart"/>
-      <w:r>
-        <w:t>android</w:t>
-      </w:r>
-      <w:proofErr w:type="spellEnd"/>
-      <w:r>
-        <w:t xml:space="preserve"> app te maken in plaats van een IOS app.</w:t>
-      </w:r>
-      <w:r>
-        <w:t xml:space="preserve"> Want ik heb een </w:t>
-      </w:r>
-      <w:proofErr w:type="spellStart"/>
-      <w:r>
-        <w:t>huawei</w:t>
-      </w:r>
-      <w:proofErr w:type="spellEnd"/>
-      <w:r>
-        <w:t>.</w:t>
-      </w:r>
-    </w:p>
-    <w:p>
-      <w:r>
-        <w:t xml:space="preserve">Ik heb dit allemaal grondiger beschreven in mijn “app </w:t>
-      </w:r>
-      <w:proofErr w:type="spellStart"/>
-      <w:r>
-        <w:t>idee”.pdf</w:t>
-      </w:r>
-      <w:proofErr w:type="spellEnd"/>
-      <w:r>
-        <w:t xml:space="preserve">. Dit staat ondertussen op de </w:t>
-      </w:r>
-      <w:proofErr w:type="spellStart"/>
-      <w:r>
-        <w:t>repository</w:t>
-      </w:r>
-      <w:proofErr w:type="spellEnd"/>
-      <w:r>
-        <w:t xml:space="preserve"> die we moesten maken.</w:t>
-      </w:r>
-    </w:p>
-    <w:p>
-      <w:r>
-        <w:t xml:space="preserve">Om af te sluiten had ik al ondertussen een goede naam gevonden gebaseerd op de applicatie genaamd </w:t>
-      </w:r>
-      <w:proofErr w:type="spellStart"/>
-      <w:r>
-        <w:t>Scannable</w:t>
-      </w:r>
-      <w:proofErr w:type="spellEnd"/>
-      <w:r>
-        <w:t xml:space="preserve">. Ik heb dus besloten om mijn applicatie </w:t>
-      </w:r>
-      <w:proofErr w:type="spellStart"/>
-      <w:r>
-        <w:t>Notable</w:t>
-      </w:r>
-      <w:proofErr w:type="spellEnd"/>
-      <w:r>
-        <w:t xml:space="preserve"> te noemen.</w:t>
+        <w:t>Als back-end koos ik Firebase en als technologie koos ik in java te werken om een android app te maken in plaats van een IOS app.</w:t>
+      </w:r>
+      <w:r>
+        <w:t xml:space="preserve"> Want ik heb een huawei.</w:t>
+      </w:r>
+    </w:p>
+    <w:p>
+      <w:r>
+        <w:t>Ik heb dit allemaal grondiger beschreven in mijn “app idee”.pdf. Dit staat ondertussen op de repository die we moesten maken.</w:t>
+      </w:r>
+    </w:p>
+    <w:p>
+      <w:r>
+        <w:t>Om af te sluiten had ik al ondertussen een goede naam gevonden gebaseerd op de applicatie genaamd Scannable. Ik heb dus besloten om mijn applicatie Notable te noemen.</w:t>
       </w:r>
     </w:p>
     <w:p>
@@ -229,15 +109,7 @@
         <w:t xml:space="preserve">Mijn app idee werd niet goedgekeurd, want de leerkracht raadde het af door problemen die ervan kunnen komen. Ik moest dan vandaag een nieuw idee opstellen. </w:t>
       </w:r>
       <w:r>
-        <w:t xml:space="preserve">De scanner + </w:t>
-      </w:r>
-      <w:proofErr w:type="gramStart"/>
-      <w:r>
-        <w:t>pdf converter</w:t>
-      </w:r>
-      <w:proofErr w:type="gramEnd"/>
-      <w:r>
-        <w:t xml:space="preserve"> was duidelijk te moeilijk, maar ik besloot om het idee verder te zetten van een app die notities kan delen. Dus nu moet het gewoon foto’s trekken van de notities. Om nog toe te voegen kan ik ook opmerkingswolkjes toevoegen aan de foto voor bijvoorbeeld een fout</w:t>
+        <w:t>De scanner + pdf converter was duidelijk te moeilijk, maar ik besloot om het idee verder te zetten van een app die notities kan delen. Dus nu moet het gewoon foto’s trekken van de notities. Om nog toe te voegen kan ik ook opmerkingswolkjes toevoegen aan de foto voor bijvoorbeeld een fout</w:t>
       </w:r>
       <w:r>
         <w:t xml:space="preserve"> aan te duiden</w:t>
@@ -248,15 +120,7 @@
     </w:p>
     <w:p>
       <w:r>
-        <w:t xml:space="preserve">Daarna moest ik gewoon begin aan een UI/UX design voor mijn applicatie, waarbij nog niet veel had gedaan omdat les niet meer lang duurde. Ik moest toen ook tegelijkertijd zoeken naar </w:t>
-      </w:r>
-      <w:proofErr w:type="spellStart"/>
-      <w:r>
-        <w:t>tutorials</w:t>
-      </w:r>
-      <w:proofErr w:type="spellEnd"/>
-      <w:r>
-        <w:t xml:space="preserve"> dus </w:t>
+        <w:t xml:space="preserve">Daarna moest ik gewoon begin aan een UI/UX design voor mijn applicatie, waarbij nog niet veel had gedaan omdat les niet meer lang duurde. Ik moest toen ook tegelijkertijd zoeken naar tutorials dus </w:t>
       </w:r>
       <w:r>
         <w:t>duurde dat ook kort.</w:t>
@@ -279,26 +143,13 @@
     </w:p>
     <w:p>
       <w:r>
-        <w:t>Vandaag in de namiddag begonnen we met de co-</w:t>
-      </w:r>
-      <w:proofErr w:type="spellStart"/>
-      <w:r>
-        <w:t>working</w:t>
-      </w:r>
-      <w:proofErr w:type="spellEnd"/>
-      <w:r>
-        <w:t xml:space="preserve"> les waarbij we dus informatie kunnen delen met medeleerlingen. Al was het de eerste les dus kwam daar niet veel van. Ik begon gewoon verder aan mijn </w:t>
-      </w:r>
-      <w:proofErr w:type="spellStart"/>
+        <w:t xml:space="preserve">Vandaag in de namiddag begonnen we met de co-working les waarbij we dus informatie kunnen delen met medeleerlingen. Al was het de eerste les dus kwam daar niet veel van. Ik begon gewoon verder aan mijn </w:t>
+      </w:r>
       <w:r>
         <w:t>F</w:t>
       </w:r>
       <w:r>
-        <w:t>igma</w:t>
-      </w:r>
-      <w:proofErr w:type="spellEnd"/>
-      <w:r>
-        <w:t xml:space="preserve"> design.</w:t>
+        <w:t>igma design.</w:t>
       </w:r>
     </w:p>
     <w:p>
@@ -309,15 +160,7 @@
         <w:t>te veel</w:t>
       </w:r>
       <w:r>
-        <w:t xml:space="preserve"> naar voor moest leunen en dus </w:t>
-      </w:r>
-      <w:proofErr w:type="gramStart"/>
-      <w:r>
-        <w:t>nek pijn</w:t>
-      </w:r>
-      <w:proofErr w:type="gramEnd"/>
-      <w:r>
-        <w:t xml:space="preserve"> kreeg en er waren precies geen ramen om te openen. </w:t>
+        <w:t xml:space="preserve"> naar voor moest leunen en dus nek pijn kreeg en er waren precies geen ramen om te openen. </w:t>
       </w:r>
       <w:r>
         <w:t>Gelukkig kunnen we naar buiten wanneer we het willen.</w:t>
@@ -357,23 +200,7 @@
     </w:p>
     <w:p>
       <w:r>
-        <w:t xml:space="preserve">Vandaag heb ik verder gewerkt aan mijn </w:t>
-      </w:r>
-      <w:proofErr w:type="spellStart"/>
-      <w:r>
-        <w:t>Figma</w:t>
-      </w:r>
-      <w:proofErr w:type="spellEnd"/>
-      <w:r>
-        <w:t xml:space="preserve"> design en het ging redelijk vlot vooruit. Ik wou absoluut dat het vandaag af was zodat ik morgen kan werken aan een ander vak. Tijdens het maken van het design heb ik vooral ook zitten op zoeken dat sommige concepten wel haalbaar zijn om te programmeren. Dit is allemaal wel mogelijk, maar zal wel een </w:t>
-      </w:r>
-      <w:proofErr w:type="spellStart"/>
-      <w:r>
-        <w:t>challenge</w:t>
-      </w:r>
-      <w:proofErr w:type="spellEnd"/>
-      <w:r>
-        <w:t xml:space="preserve"> zijn zoals de opmerkingen plaatsen</w:t>
+        <w:t>Vandaag heb ik verder gewerkt aan mijn Figma design en het ging redelijk vlot vooruit. Ik wou absoluut dat het vandaag af was zodat ik morgen kan werken aan een ander vak. Tijdens het maken van het design heb ik vooral ook zitten op zoeken dat sommige concepten wel haalbaar zijn om te programmeren. Dit is allemaal wel mogelijk, maar zal wel een challenge zijn zoals de opmerkingen plaatsen</w:t>
       </w:r>
       <w:r>
         <w:t>. M</w:t>
@@ -485,48 +312,11 @@
     </w:p>
     <w:p>
       <w:r>
-        <w:t xml:space="preserve">Vandaag werd mijn </w:t>
-      </w:r>
-      <w:proofErr w:type="spellStart"/>
-      <w:r>
-        <w:t>figma</w:t>
-      </w:r>
-      <w:proofErr w:type="spellEnd"/>
-      <w:r>
-        <w:t xml:space="preserve"> prototype gecontroleerd waarbij ik moest opnieuw uitleggen wat mijn app doet door middel van accurate presentatie. Ik legde dit vrij duidelijk uit en alles ging goed vooruit. Meneer </w:t>
-      </w:r>
-      <w:proofErr w:type="spellStart"/>
-      <w:r>
-        <w:t>Blancquaert</w:t>
-      </w:r>
-      <w:proofErr w:type="spellEnd"/>
-      <w:r>
-        <w:t xml:space="preserve"> heeft me dan ook nog een </w:t>
-      </w:r>
-      <w:proofErr w:type="spellStart"/>
-      <w:r>
-        <w:t>library</w:t>
-      </w:r>
-      <w:proofErr w:type="spellEnd"/>
-      <w:r>
-        <w:t xml:space="preserve"> genaamd “</w:t>
-      </w:r>
-      <w:proofErr w:type="spellStart"/>
-      <w:r>
-        <w:t>Material</w:t>
-      </w:r>
-      <w:proofErr w:type="spellEnd"/>
-      <w:r>
-        <w:t xml:space="preserve"> design” aangeraden om mijn applicatie te ontwerpen. </w:t>
-      </w:r>
-      <w:r>
-        <w:t xml:space="preserve">Blijkbaar Google gebruikt deze </w:t>
-      </w:r>
-      <w:proofErr w:type="spellStart"/>
-      <w:r>
-        <w:t>library</w:t>
-      </w:r>
-      <w:proofErr w:type="spellEnd"/>
+        <w:t xml:space="preserve">Vandaag werd mijn figma prototype gecontroleerd waarbij ik moest opnieuw uitleggen wat mijn app doet door middel van accurate presentatie. Ik legde dit vrij duidelijk uit en alles ging goed vooruit. Meneer Blancquaert heeft me dan ook nog een library genaamd “Material design” aangeraden om mijn applicatie te ontwerpen. </w:t>
+      </w:r>
+      <w:r>
+        <w:t>Blijkbaar Google gebruikt deze library</w:t>
+      </w:r>
       <w:r>
         <w:t xml:space="preserve"> om hun apps te maken.</w:t>
       </w:r>
@@ -564,23 +354,7 @@
         <w:t xml:space="preserve">kunt maken </w:t>
       </w:r>
       <w:r>
-        <w:t xml:space="preserve">om je app te testen. Als je </w:t>
-      </w:r>
-      <w:proofErr w:type="spellStart"/>
-      <w:r>
-        <w:t>developer</w:t>
-      </w:r>
-      <w:proofErr w:type="spellEnd"/>
-      <w:r>
-        <w:t xml:space="preserve"> modus in de </w:t>
-      </w:r>
-      <w:proofErr w:type="spellStart"/>
-      <w:r>
-        <w:t>settings</w:t>
-      </w:r>
-      <w:proofErr w:type="spellEnd"/>
-      <w:r>
-        <w:t xml:space="preserve"> van je gsm</w:t>
+        <w:t>om je app te testen. Als je developer modus in de settings van je gsm</w:t>
       </w:r>
       <w:r>
         <w:t xml:space="preserve"> aanzet, kan je je gsm verbinden met de pc en dus je applicatie daarop testen.</w:t>
@@ -598,23 +372,7 @@
     </w:p>
     <w:p>
       <w:r>
-        <w:t xml:space="preserve">Tijdens lange downloads heb ik ook mijn </w:t>
-      </w:r>
-      <w:proofErr w:type="gramStart"/>
-      <w:r>
-        <w:t>google account</w:t>
-      </w:r>
-      <w:proofErr w:type="gramEnd"/>
-      <w:r>
-        <w:t xml:space="preserve"> toegevoegd op </w:t>
-      </w:r>
-      <w:proofErr w:type="spellStart"/>
-      <w:r>
-        <w:t>Firebase</w:t>
-      </w:r>
-      <w:proofErr w:type="spellEnd"/>
-      <w:r>
-        <w:t>. Volgens de presentatie die we kregen van een medestudent.</w:t>
+        <w:t>Tijdens lange downloads heb ik ook mijn google account toegevoegd op Firebase. Volgens de presentatie die we kregen van een medestudent.</w:t>
       </w:r>
     </w:p>
     <w:p>
@@ -665,23 +423,7 @@
         <w:t>mijn</w:t>
       </w:r>
       <w:r>
-        <w:t xml:space="preserve"> </w:t>
-      </w:r>
-      <w:proofErr w:type="spellStart"/>
-      <w:r>
-        <w:t>figma</w:t>
-      </w:r>
-      <w:proofErr w:type="spellEnd"/>
-      <w:r>
-        <w:t xml:space="preserve"> design delen met meneer </w:t>
-      </w:r>
-      <w:proofErr w:type="spellStart"/>
-      <w:r>
-        <w:t>Blancquaert</w:t>
-      </w:r>
-      <w:proofErr w:type="spellEnd"/>
-      <w:r>
-        <w:t>, toen hij vroeg dat mijn design klaar was</w:t>
+        <w:t xml:space="preserve"> figma design delen met meneer Blancquaert, toen hij vroeg dat mijn design klaar was</w:t>
       </w:r>
       <w:r>
         <w:t xml:space="preserve"> of niet</w:t>
@@ -695,54 +437,14 @@
         <w:t>Ik heb daarna gewoon verder begonnen aan de tutorial die ik vorige week gebruikt had.</w:t>
       </w:r>
       <w:r>
-        <w:t xml:space="preserve"> Hierbij leerde ik meer over hoe ik </w:t>
-      </w:r>
-      <w:proofErr w:type="gramStart"/>
-      <w:r>
-        <w:t>Android studio</w:t>
-      </w:r>
-      <w:proofErr w:type="gramEnd"/>
-      <w:r>
-        <w:t xml:space="preserve"> beter kon gebruiken om mijn app te </w:t>
-      </w:r>
-      <w:proofErr w:type="spellStart"/>
-      <w:r>
-        <w:t>designen</w:t>
-      </w:r>
-      <w:proofErr w:type="spellEnd"/>
-      <w:r>
-        <w:t xml:space="preserve"> zoals hoe je </w:t>
+        <w:t xml:space="preserve"> Hierbij leerde ik meer over hoe ik Android studio beter kon gebruiken om mijn app te designen zoals hoe je </w:t>
       </w:r>
       <w:r>
         <w:lastRenderedPageBreak/>
-        <w:t xml:space="preserve">attributen kunt aanpassen (bv. </w:t>
-      </w:r>
-      <w:proofErr w:type="spellStart"/>
-      <w:r>
-        <w:t>color</w:t>
-      </w:r>
-      <w:proofErr w:type="spellEnd"/>
-      <w:r>
-        <w:t>)</w:t>
-      </w:r>
-      <w:r>
-        <w:t xml:space="preserve">. </w:t>
-      </w:r>
-      <w:proofErr w:type="gramStart"/>
-      <w:r>
-        <w:t>Android studio</w:t>
-      </w:r>
-      <w:proofErr w:type="gramEnd"/>
-      <w:r>
-        <w:t xml:space="preserve"> is zeer gelijkaardig als bijvoorbeeld </w:t>
-      </w:r>
-      <w:proofErr w:type="spellStart"/>
-      <w:r>
-        <w:t>Webstorm</w:t>
-      </w:r>
-      <w:proofErr w:type="spellEnd"/>
-      <w:r>
-        <w:t xml:space="preserve">, maar bij het design van een mobile app is het zeer </w:t>
+        <w:t>attributen kunt aanpassen (bv. color)</w:t>
+      </w:r>
+      <w:r>
+        <w:t xml:space="preserve">. Android studio is zeer gelijkaardig als bijvoorbeeld Webstorm, maar bij het design van een mobile app is het zeer </w:t>
       </w:r>
       <w:r>
         <w:t>verschillend</w:t>
@@ -751,27 +453,14 @@
         <w:t>.</w:t>
       </w:r>
       <w:r>
-        <w:t xml:space="preserve"> Bij </w:t>
-      </w:r>
-      <w:proofErr w:type="spellStart"/>
-      <w:r>
-        <w:t>Webstorm</w:t>
-      </w:r>
-      <w:proofErr w:type="spellEnd"/>
-      <w:r>
-        <w:t xml:space="preserve"> kan je je website </w:t>
+        <w:t xml:space="preserve"> Bij Webstorm kan je je website </w:t>
       </w:r>
       <w:r>
         <w:t>bekijken</w:t>
       </w:r>
       <w:r>
-        <w:t xml:space="preserve"> in een gekozen browser, maar je kan in </w:t>
-      </w:r>
-      <w:proofErr w:type="gramStart"/>
-      <w:r>
-        <w:t>Android studio</w:t>
-      </w:r>
-      <w:proofErr w:type="gramEnd"/>
+        <w:t xml:space="preserve"> in een gekozen browser, maar je kan in Android studio</w:t>
+      </w:r>
       <w:r>
         <w:t xml:space="preserve"> je app</w:t>
       </w:r>
@@ -791,15 +480,7 @@
         <w:t>.</w:t>
       </w:r>
       <w:r>
-        <w:t xml:space="preserve"> Als ik de </w:t>
-      </w:r>
-      <w:proofErr w:type="spellStart"/>
-      <w:r>
-        <w:t>Jetbrains</w:t>
-      </w:r>
-      <w:proofErr w:type="spellEnd"/>
-      <w:r>
-        <w:t xml:space="preserve"> applicaties vergelijk met Visual studio 2019, </w:t>
+        <w:t xml:space="preserve"> Als ik de Jetbrains applicaties vergelijk met Visual studio 2019, </w:t>
       </w:r>
       <w:r>
         <w:t>heb ik er altijd moeite mee om de lay</w:t>
@@ -858,22 +539,37 @@
     </w:p>
     <w:p/>
     <w:p>
-      <w:r>
+      <w:pPr>
+        <w:rPr>
+          <w:b/>
+          <w:bCs/>
+        </w:rPr>
+      </w:pPr>
+      <w:r>
+        <w:rPr>
+          <w:b/>
+          <w:bCs/>
+        </w:rPr>
         <w:t>06/10/2021:</w:t>
       </w:r>
     </w:p>
     <w:p>
       <w:r>
-        <w:t>Usertesten</w:t>
-      </w:r>
-    </w:p>
-    <w:p>
-      <w:r>
-        <w:t>Tutorial voor inlog pagina te maken</w:t>
-      </w:r>
-    </w:p>
-    <w:p>
-      <w:hyperlink r:id="rId8" w:history="1">
+        <w:t>We konden vandaag de user tests al gedaan hebben in aparte lokalen, maar mijn groep had besloten omdat morgen in een teams call online te doen.</w:t>
+      </w:r>
+    </w:p>
+    <w:p>
+      <w:r>
+        <w:t>Ik heb dan ondertussen de tutorial van Material design gevolgd in plaats van die van Android studio. Ze leerde me dan hoe ik er mee kon werken maar niet hoe een hele nieuwe app kon maken. Ik kreeg een voorbeeld app om erin te kunnen werken voor de tutorial.</w:t>
+      </w:r>
+    </w:p>
+    <w:p>
+      <w:pPr>
+        <w:rPr>
+          <w:rStyle w:val="Hyperlink"/>
+        </w:rPr>
+      </w:pPr>
+      <w:hyperlink r:id="rId8" w:anchor="0" w:history="1">
         <w:r>
           <w:rPr>
             <w:rStyle w:val="Hyperlink"/>
@@ -881,6 +577,43 @@
           <w:t>https://codelabs.developers.google.com/codelabs/mdc-101-java#0</w:t>
         </w:r>
       </w:hyperlink>
+    </w:p>
+    <w:p>
+      <w:pPr>
+        <w:rPr>
+          <w:color w:val="0563C1" w:themeColor="hyperlink"/>
+          <w:u w:val="single"/>
+        </w:rPr>
+      </w:pPr>
+    </w:p>
+    <w:p>
+      <w:pPr>
+        <w:rPr>
+          <w:b/>
+          <w:bCs/>
+        </w:rPr>
+      </w:pPr>
+      <w:r>
+        <w:rPr>
+          <w:b/>
+          <w:bCs/>
+        </w:rPr>
+        <w:t>07/10/2021:</w:t>
+      </w:r>
+    </w:p>
+    <w:p>
+      <w:r>
+        <w:t>Vandaag heb ik de usertests afgelegd met Louis D’hondt en Jasper Wauters. Dit ging heel gemakkelijk en duurde niet lang. Ik had niet echt serieuze opmerkingen, behalve dat ik geen persoonlijke info pagina gemaakt had.</w:t>
+      </w:r>
+      <w:r>
+        <w:t xml:space="preserve"> Daarna heb ik onmiddellijk die opmerkingen van </w:t>
+      </w:r>
+      <w:r>
+        <w:t xml:space="preserve">mijn figma design </w:t>
+      </w:r>
+      <w:r>
+        <w:t>verbetert en op mijn repository gezet.</w:t>
+      </w:r>
     </w:p>
     <w:p/>
     <w:sectPr>

</xml_diff>

<commit_message>
Finally recreated my login page of figma
</commit_message>
<xml_diff>
--- a/Logboek_Dries_Fierens.docx
+++ b/Logboek_Dries_Fierens.docx
@@ -606,16 +606,137 @@
         <w:t>Vandaag heb ik de usertests afgelegd met Louis D’hondt en Jasper Wauters. Dit ging heel gemakkelijk en duurde niet lang. Ik had niet echt serieuze opmerkingen, behalve dat ik geen persoonlijke info pagina gemaakt had.</w:t>
       </w:r>
       <w:r>
-        <w:t xml:space="preserve"> Daarna heb ik onmiddellijk die opmerkingen van </w:t>
-      </w:r>
-      <w:r>
-        <w:t xml:space="preserve">mijn figma design </w:t>
-      </w:r>
-      <w:r>
-        <w:t>verbetert en op mijn repository gezet.</w:t>
+        <w:t xml:space="preserve"> Daarna heb ik onmiddellijk die opmerkingen van mijn figma design verbetert en op mijn repository gezet.</w:t>
       </w:r>
     </w:p>
     <w:p/>
+    <w:p/>
+    <w:p>
+      <w:pPr>
+        <w:rPr>
+          <w:b/>
+          <w:bCs/>
+        </w:rPr>
+      </w:pPr>
+      <w:r>
+        <w:rPr>
+          <w:b/>
+          <w:bCs/>
+        </w:rPr>
+        <w:lastRenderedPageBreak/>
+        <w:t>10/10/2021:</w:t>
+      </w:r>
+    </w:p>
+    <w:p>
+      <w:r>
+        <w:t xml:space="preserve">Vandaag begon ik eindelijk met Material Design. Ik besloot mijn oude app te verwijderen en te vervangen met een empty activity zodat ik echt van scratch begin. Zo kan ik alles beter begrijpen. Ik had dan ontdekt dat android studio al automatisch Material Design van Google had toegevoegd bij de dependencies, dus eigenlijk ben ik </w:t>
+      </w:r>
+      <w:r>
+        <w:t>onmiddellijk</w:t>
+      </w:r>
+      <w:r>
+        <w:t xml:space="preserve"> goed op weg.</w:t>
+      </w:r>
+    </w:p>
+    <w:p>
+      <w:hyperlink r:id="rId9" w:history="1">
+        <w:r>
+          <w:rPr>
+            <w:rStyle w:val="Hyperlink"/>
+          </w:rPr>
+          <w:t>https://material.io/develop/android/docs/getting-started</w:t>
+        </w:r>
+      </w:hyperlink>
+    </w:p>
+    <w:p>
+      <w:r>
+        <w:rPr>
+          <w:noProof/>
+        </w:rPr>
+        <w:drawing>
+          <wp:inline distT="0" distB="0" distL="0" distR="0" wp14:anchorId="7ABF37CA" wp14:editId="14CC4648">
+            <wp:extent cx="5724525" cy="2171700"/>
+            <wp:effectExtent l="0" t="0" r="9525" b="0"/>
+            <wp:docPr id="3" name="Afbeelding 3"/>
+            <wp:cNvGraphicFramePr>
+              <a:graphicFrameLocks xmlns:a="http://schemas.openxmlformats.org/drawingml/2006/main" noChangeAspect="1"/>
+            </wp:cNvGraphicFramePr>
+            <a:graphic xmlns:a="http://schemas.openxmlformats.org/drawingml/2006/main">
+              <a:graphicData uri="http://schemas.openxmlformats.org/drawingml/2006/picture">
+                <pic:pic xmlns:pic="http://schemas.openxmlformats.org/drawingml/2006/picture">
+                  <pic:nvPicPr>
+                    <pic:cNvPr id="1" name=""/>
+                    <pic:cNvPicPr/>
+                  </pic:nvPicPr>
+                  <pic:blipFill>
+                    <a:blip r:embed="rId10"/>
+                    <a:stretch>
+                      <a:fillRect/>
+                    </a:stretch>
+                  </pic:blipFill>
+                  <pic:spPr>
+                    <a:xfrm>
+                      <a:off x="0" y="0"/>
+                      <a:ext cx="5724525" cy="2171700"/>
+                    </a:xfrm>
+                    <a:prstGeom prst="rect">
+                      <a:avLst/>
+                    </a:prstGeom>
+                  </pic:spPr>
+                </pic:pic>
+              </a:graphicData>
+            </a:graphic>
+          </wp:inline>
+        </w:drawing>
+      </w:r>
+    </w:p>
+    <w:p>
+      <w:r>
+        <w:t>Ik heb dan ondertussen de login pagina eindelijk gemaakt.</w:t>
+      </w:r>
+    </w:p>
+    <w:p>
+      <w:r>
+        <w:rPr>
+          <w:noProof/>
+        </w:rPr>
+        <w:drawing>
+          <wp:inline distT="0" distB="0" distL="0" distR="0" wp14:anchorId="56FADCD9" wp14:editId="76DCB4CE">
+            <wp:extent cx="2133849" cy="3916393"/>
+            <wp:effectExtent l="0" t="0" r="0" b="8255"/>
+            <wp:docPr id="5" name="Afbeelding 5"/>
+            <wp:cNvGraphicFramePr>
+              <a:graphicFrameLocks xmlns:a="http://schemas.openxmlformats.org/drawingml/2006/main" noChangeAspect="1"/>
+            </wp:cNvGraphicFramePr>
+            <a:graphic xmlns:a="http://schemas.openxmlformats.org/drawingml/2006/main">
+              <a:graphicData uri="http://schemas.openxmlformats.org/drawingml/2006/picture">
+                <pic:pic xmlns:pic="http://schemas.openxmlformats.org/drawingml/2006/picture">
+                  <pic:nvPicPr>
+                    <pic:cNvPr id="1" name=""/>
+                    <pic:cNvPicPr/>
+                  </pic:nvPicPr>
+                  <pic:blipFill>
+                    <a:blip r:embed="rId11"/>
+                    <a:stretch>
+                      <a:fillRect/>
+                    </a:stretch>
+                  </pic:blipFill>
+                  <pic:spPr>
+                    <a:xfrm>
+                      <a:off x="0" y="0"/>
+                      <a:ext cx="2136499" cy="3921257"/>
+                    </a:xfrm>
+                    <a:prstGeom prst="rect">
+                      <a:avLst/>
+                    </a:prstGeom>
+                  </pic:spPr>
+                </pic:pic>
+              </a:graphicData>
+            </a:graphic>
+          </wp:inline>
+        </w:drawing>
+      </w:r>
+    </w:p>
     <w:sectPr>
       <w:pgSz w:w="11906" w:h="16838"/>
       <w:pgMar w:top="1417" w:right="1417" w:bottom="1417" w:left="1417" w:header="708" w:footer="708" w:gutter="0"/>

</xml_diff>

<commit_message>
Fixed app running issue
</commit_message>
<xml_diff>
--- a/Logboek_Dries_Fierens.docx
+++ b/Logboek_Dries_Fierens.docx
@@ -46,7 +46,39 @@
         <w:t>applicatie</w:t>
       </w:r>
       <w:r>
-        <w:t xml:space="preserve"> die je kan maken en welke technologieën je kan gebruiken. Ik heb voor native gekozen want dat past het best bij mijn aftakking “Software developer” sinds het java inhoudt. De anderen zijn hybrid en progressive web app dat dus meer te maken hebben met web &amp; mobile dus vooral HTML &amp; CSS. We moesten dan ook nog kiezen voor een project idee, waarbij ik koos voor een scanner + pdf converter app</w:t>
+        <w:t xml:space="preserve"> die je kan maken en welke technologieën je kan gebruiken. Ik heb voor native gekozen want dat past het best bij mijn aftakking “Software </w:t>
+      </w:r>
+      <w:proofErr w:type="spellStart"/>
+      <w:r>
+        <w:t>developer</w:t>
+      </w:r>
+      <w:proofErr w:type="spellEnd"/>
+      <w:r>
+        <w:t xml:space="preserve">” sinds het </w:t>
+      </w:r>
+      <w:proofErr w:type="spellStart"/>
+      <w:r>
+        <w:t>java</w:t>
+      </w:r>
+      <w:proofErr w:type="spellEnd"/>
+      <w:r>
+        <w:t xml:space="preserve"> inhoudt. De anderen zijn </w:t>
+      </w:r>
+      <w:proofErr w:type="spellStart"/>
+      <w:r>
+        <w:t>hybrid</w:t>
+      </w:r>
+      <w:proofErr w:type="spellEnd"/>
+      <w:r>
+        <w:t xml:space="preserve"> en </w:t>
+      </w:r>
+      <w:proofErr w:type="spellStart"/>
+      <w:r>
+        <w:t>progressive</w:t>
+      </w:r>
+      <w:proofErr w:type="spellEnd"/>
+      <w:r>
+        <w:t xml:space="preserve"> web app dat dus meer te maken hebben met web &amp; mobile dus vooral HTML &amp; CSS. We moesten dan ook nog kiezen voor een project idee, waarbij ik koos voor een scanner + pdf converter app</w:t>
       </w:r>
       <w:r>
         <w:t xml:space="preserve"> waarbij het vooral bedoelt is o</w:t>
@@ -73,20 +105,92 @@
         <w:t xml:space="preserve"> </w:t>
       </w:r>
       <w:r>
-        <w:t>Als back-end koos ik Firebase en als technologie koos ik in java te werken om een android app te maken in plaats van een IOS app.</w:t>
-      </w:r>
-      <w:r>
-        <w:t xml:space="preserve"> Want ik heb een huawei.</w:t>
-      </w:r>
-    </w:p>
-    <w:p>
-      <w:r>
-        <w:t>Ik heb dit allemaal grondiger beschreven in mijn “app idee”.pdf. Dit staat ondertussen op de repository die we moesten maken.</w:t>
-      </w:r>
-    </w:p>
-    <w:p>
-      <w:r>
-        <w:t>Om af te sluiten had ik al ondertussen een goede naam gevonden gebaseerd op de applicatie genaamd Scannable. Ik heb dus besloten om mijn applicatie Notable te noemen.</w:t>
+        <w:t xml:space="preserve">Als </w:t>
+      </w:r>
+      <w:proofErr w:type="spellStart"/>
+      <w:r>
+        <w:t>back-end</w:t>
+      </w:r>
+      <w:proofErr w:type="spellEnd"/>
+      <w:r>
+        <w:t xml:space="preserve"> koos ik </w:t>
+      </w:r>
+      <w:proofErr w:type="spellStart"/>
+      <w:r>
+        <w:t>Firebase</w:t>
+      </w:r>
+      <w:proofErr w:type="spellEnd"/>
+      <w:r>
+        <w:t xml:space="preserve"> en als technologie koos ik in </w:t>
+      </w:r>
+      <w:proofErr w:type="spellStart"/>
+      <w:r>
+        <w:t>java</w:t>
+      </w:r>
+      <w:proofErr w:type="spellEnd"/>
+      <w:r>
+        <w:t xml:space="preserve"> te werken om een </w:t>
+      </w:r>
+      <w:proofErr w:type="spellStart"/>
+      <w:r>
+        <w:t>android</w:t>
+      </w:r>
+      <w:proofErr w:type="spellEnd"/>
+      <w:r>
+        <w:t xml:space="preserve"> app te maken in plaats van een IOS app.</w:t>
+      </w:r>
+      <w:r>
+        <w:t xml:space="preserve"> Want ik heb een </w:t>
+      </w:r>
+      <w:proofErr w:type="spellStart"/>
+      <w:r>
+        <w:t>huawei</w:t>
+      </w:r>
+      <w:proofErr w:type="spellEnd"/>
+      <w:r>
+        <w:t>.</w:t>
+      </w:r>
+    </w:p>
+    <w:p>
+      <w:r>
+        <w:t xml:space="preserve">Ik heb dit allemaal grondiger beschreven in mijn “app </w:t>
+      </w:r>
+      <w:proofErr w:type="spellStart"/>
+      <w:r>
+        <w:t>idee”.pdf</w:t>
+      </w:r>
+      <w:proofErr w:type="spellEnd"/>
+      <w:r>
+        <w:t xml:space="preserve">. Dit staat ondertussen op de </w:t>
+      </w:r>
+      <w:proofErr w:type="spellStart"/>
+      <w:r>
+        <w:t>repository</w:t>
+      </w:r>
+      <w:proofErr w:type="spellEnd"/>
+      <w:r>
+        <w:t xml:space="preserve"> die we moesten maken.</w:t>
+      </w:r>
+    </w:p>
+    <w:p>
+      <w:r>
+        <w:t xml:space="preserve">Om af te sluiten had ik al ondertussen een goede naam gevonden gebaseerd op de applicatie genaamd </w:t>
+      </w:r>
+      <w:proofErr w:type="spellStart"/>
+      <w:r>
+        <w:t>Scannable</w:t>
+      </w:r>
+      <w:proofErr w:type="spellEnd"/>
+      <w:r>
+        <w:t xml:space="preserve">. Ik heb dus besloten om mijn applicatie </w:t>
+      </w:r>
+      <w:proofErr w:type="spellStart"/>
+      <w:r>
+        <w:t>Notable</w:t>
+      </w:r>
+      <w:proofErr w:type="spellEnd"/>
+      <w:r>
+        <w:t xml:space="preserve"> te noemen.</w:t>
       </w:r>
     </w:p>
     <w:p>
@@ -120,7 +224,15 @@
     </w:p>
     <w:p>
       <w:r>
-        <w:t xml:space="preserve">Daarna moest ik gewoon begin aan een UI/UX design voor mijn applicatie, waarbij nog niet veel had gedaan omdat les niet meer lang duurde. Ik moest toen ook tegelijkertijd zoeken naar tutorials dus </w:t>
+        <w:t xml:space="preserve">Daarna moest ik gewoon begin aan een UI/UX design voor mijn applicatie, waarbij nog niet veel had gedaan omdat les niet meer lang duurde. Ik moest toen ook tegelijkertijd zoeken naar </w:t>
+      </w:r>
+      <w:proofErr w:type="spellStart"/>
+      <w:r>
+        <w:t>tutorials</w:t>
+      </w:r>
+      <w:proofErr w:type="spellEnd"/>
+      <w:r>
+        <w:t xml:space="preserve"> dus </w:t>
       </w:r>
       <w:r>
         <w:t>duurde dat ook kort.</w:t>
@@ -143,13 +255,26 @@
     </w:p>
     <w:p>
       <w:r>
-        <w:t xml:space="preserve">Vandaag in de namiddag begonnen we met de co-working les waarbij we dus informatie kunnen delen met medeleerlingen. Al was het de eerste les dus kwam daar niet veel van. Ik begon gewoon verder aan mijn </w:t>
-      </w:r>
+        <w:t>Vandaag in de namiddag begonnen we met de co-</w:t>
+      </w:r>
+      <w:proofErr w:type="spellStart"/>
+      <w:r>
+        <w:t>working</w:t>
+      </w:r>
+      <w:proofErr w:type="spellEnd"/>
+      <w:r>
+        <w:t xml:space="preserve"> les waarbij we dus informatie kunnen delen met medeleerlingen. Al was het de eerste les dus kwam daar niet veel van. Ik begon gewoon verder aan mijn </w:t>
+      </w:r>
+      <w:proofErr w:type="spellStart"/>
       <w:r>
         <w:t>F</w:t>
       </w:r>
       <w:r>
-        <w:t>igma design.</w:t>
+        <w:t>igma</w:t>
+      </w:r>
+      <w:proofErr w:type="spellEnd"/>
+      <w:r>
+        <w:t xml:space="preserve"> design.</w:t>
       </w:r>
     </w:p>
     <w:p>
@@ -200,7 +325,23 @@
     </w:p>
     <w:p>
       <w:r>
-        <w:t>Vandaag heb ik verder gewerkt aan mijn Figma design en het ging redelijk vlot vooruit. Ik wou absoluut dat het vandaag af was zodat ik morgen kan werken aan een ander vak. Tijdens het maken van het design heb ik vooral ook zitten op zoeken dat sommige concepten wel haalbaar zijn om te programmeren. Dit is allemaal wel mogelijk, maar zal wel een challenge zijn zoals de opmerkingen plaatsen</w:t>
+        <w:t xml:space="preserve">Vandaag heb ik verder gewerkt aan mijn </w:t>
+      </w:r>
+      <w:proofErr w:type="spellStart"/>
+      <w:r>
+        <w:t>Figma</w:t>
+      </w:r>
+      <w:proofErr w:type="spellEnd"/>
+      <w:r>
+        <w:t xml:space="preserve"> design en het ging redelijk vlot vooruit. Ik wou absoluut dat het vandaag af was zodat ik morgen kan werken aan een ander vak. Tijdens het maken van het design heb ik vooral ook zitten op zoeken dat sommige concepten wel haalbaar zijn om te programmeren. Dit is allemaal wel mogelijk, maar zal wel een </w:t>
+      </w:r>
+      <w:proofErr w:type="spellStart"/>
+      <w:r>
+        <w:t>challenge</w:t>
+      </w:r>
+      <w:proofErr w:type="spellEnd"/>
+      <w:r>
+        <w:t xml:space="preserve"> zijn zoals de opmerkingen plaatsen</w:t>
       </w:r>
       <w:r>
         <w:t>. M</w:t>
@@ -253,7 +394,7 @@
                     </pic:cNvPicPr>
                   </pic:nvPicPr>
                   <pic:blipFill>
-                    <a:blip r:embed="rId4" cstate="print">
+                    <a:blip r:embed="rId5" cstate="print">
                       <a:extLst>
                         <a:ext uri="{28A0092B-C50C-407E-A947-70E740481C1C}">
                           <a14:useLocalDpi xmlns:a14="http://schemas.microsoft.com/office/drawing/2010/main" val="0"/>
@@ -312,17 +453,54 @@
     </w:p>
     <w:p>
       <w:r>
-        <w:t xml:space="preserve">Vandaag werd mijn figma prototype gecontroleerd waarbij ik moest opnieuw uitleggen wat mijn app doet door middel van accurate presentatie. Ik legde dit vrij duidelijk uit en alles ging goed vooruit. Meneer Blancquaert heeft me dan ook nog een library genaamd “Material design” aangeraden om mijn applicatie te ontwerpen. </w:t>
-      </w:r>
-      <w:r>
-        <w:t>Blijkbaar Google gebruikt deze library</w:t>
-      </w:r>
+        <w:t xml:space="preserve">Vandaag werd mijn </w:t>
+      </w:r>
+      <w:proofErr w:type="spellStart"/>
+      <w:r>
+        <w:t>figma</w:t>
+      </w:r>
+      <w:proofErr w:type="spellEnd"/>
+      <w:r>
+        <w:t xml:space="preserve"> prototype gecontroleerd waarbij ik moest opnieuw uitleggen wat mijn app doet door middel van accurate presentatie. Ik legde dit vrij duidelijk uit en alles ging goed vooruit. Meneer </w:t>
+      </w:r>
+      <w:proofErr w:type="spellStart"/>
+      <w:r>
+        <w:t>Blancquaert</w:t>
+      </w:r>
+      <w:proofErr w:type="spellEnd"/>
+      <w:r>
+        <w:t xml:space="preserve"> heeft me dan ook nog een </w:t>
+      </w:r>
+      <w:proofErr w:type="spellStart"/>
+      <w:r>
+        <w:t>library</w:t>
+      </w:r>
+      <w:proofErr w:type="spellEnd"/>
+      <w:r>
+        <w:t xml:space="preserve"> genaamd “</w:t>
+      </w:r>
+      <w:proofErr w:type="spellStart"/>
+      <w:r>
+        <w:t>Material</w:t>
+      </w:r>
+      <w:proofErr w:type="spellEnd"/>
+      <w:r>
+        <w:t xml:space="preserve"> design” aangeraden om mijn applicatie te ontwerpen. </w:t>
+      </w:r>
+      <w:r>
+        <w:t xml:space="preserve">Blijkbaar Google gebruikt deze </w:t>
+      </w:r>
+      <w:proofErr w:type="spellStart"/>
+      <w:r>
+        <w:t>library</w:t>
+      </w:r>
+      <w:proofErr w:type="spellEnd"/>
       <w:r>
         <w:t xml:space="preserve"> om hun apps te maken.</w:t>
       </w:r>
     </w:p>
     <w:p>
-      <w:hyperlink r:id="rId5" w:history="1">
+      <w:hyperlink r:id="rId6" w:history="1">
         <w:r>
           <w:rPr>
             <w:rStyle w:val="Hyperlink"/>
@@ -354,14 +532,30 @@
         <w:t xml:space="preserve">kunt maken </w:t>
       </w:r>
       <w:r>
-        <w:t>om je app te testen. Als je developer modus in de settings van je gsm</w:t>
+        <w:t xml:space="preserve">om je app te testen. Als je </w:t>
+      </w:r>
+      <w:proofErr w:type="spellStart"/>
+      <w:r>
+        <w:t>developer</w:t>
+      </w:r>
+      <w:proofErr w:type="spellEnd"/>
+      <w:r>
+        <w:t xml:space="preserve"> modus in de </w:t>
+      </w:r>
+      <w:proofErr w:type="spellStart"/>
+      <w:r>
+        <w:t>settings</w:t>
+      </w:r>
+      <w:proofErr w:type="spellEnd"/>
+      <w:r>
+        <w:t xml:space="preserve"> van je gsm</w:t>
       </w:r>
       <w:r>
         <w:t xml:space="preserve"> aanzet, kan je je gsm verbinden met de pc en dus je applicatie daarop testen.</w:t>
       </w:r>
     </w:p>
     <w:p>
-      <w:hyperlink r:id="rId6" w:anchor="0" w:history="1">
+      <w:hyperlink r:id="rId7" w:anchor="0" w:history="1">
         <w:r>
           <w:rPr>
             <w:rStyle w:val="Hyperlink"/>
@@ -372,7 +566,15 @@
     </w:p>
     <w:p>
       <w:r>
-        <w:t>Tijdens lange downloads heb ik ook mijn google account toegevoegd op Firebase. Volgens de presentatie die we kregen van een medestudent.</w:t>
+        <w:t xml:space="preserve">Tijdens lange downloads heb ik ook mijn google account toegevoegd op </w:t>
+      </w:r>
+      <w:proofErr w:type="spellStart"/>
+      <w:r>
+        <w:t>Firebase</w:t>
+      </w:r>
+      <w:proofErr w:type="spellEnd"/>
+      <w:r>
+        <w:t>. Volgens de presentatie die we kregen van een medestudent.</w:t>
       </w:r>
     </w:p>
     <w:p>
@@ -423,7 +625,23 @@
         <w:t>mijn</w:t>
       </w:r>
       <w:r>
-        <w:t xml:space="preserve"> figma design delen met meneer Blancquaert, toen hij vroeg dat mijn design klaar was</w:t>
+        <w:t xml:space="preserve"> </w:t>
+      </w:r>
+      <w:proofErr w:type="spellStart"/>
+      <w:r>
+        <w:t>figma</w:t>
+      </w:r>
+      <w:proofErr w:type="spellEnd"/>
+      <w:r>
+        <w:t xml:space="preserve"> design delen met meneer </w:t>
+      </w:r>
+      <w:proofErr w:type="spellStart"/>
+      <w:r>
+        <w:t>Blancquaert</w:t>
+      </w:r>
+      <w:proofErr w:type="spellEnd"/>
+      <w:r>
+        <w:t>, toen hij vroeg dat mijn design klaar was</w:t>
       </w:r>
       <w:r>
         <w:t xml:space="preserve"> of niet</w:t>
@@ -437,14 +655,38 @@
         <w:t>Ik heb daarna gewoon verder begonnen aan de tutorial die ik vorige week gebruikt had.</w:t>
       </w:r>
       <w:r>
-        <w:t xml:space="preserve"> Hierbij leerde ik meer over hoe ik Android studio beter kon gebruiken om mijn app te designen zoals hoe je </w:t>
+        <w:t xml:space="preserve"> Hierbij leerde ik meer over hoe ik Android studio beter kon gebruiken om mijn app te </w:t>
+      </w:r>
+      <w:proofErr w:type="spellStart"/>
+      <w:r>
+        <w:t>designen</w:t>
+      </w:r>
+      <w:proofErr w:type="spellEnd"/>
+      <w:r>
+        <w:t xml:space="preserve"> zoals hoe je </w:t>
       </w:r>
       <w:r>
         <w:lastRenderedPageBreak/>
-        <w:t>attributen kunt aanpassen (bv. color)</w:t>
-      </w:r>
-      <w:r>
-        <w:t xml:space="preserve">. Android studio is zeer gelijkaardig als bijvoorbeeld Webstorm, maar bij het design van een mobile app is het zeer </w:t>
+        <w:t xml:space="preserve">attributen kunt aanpassen (bv. </w:t>
+      </w:r>
+      <w:proofErr w:type="spellStart"/>
+      <w:r>
+        <w:t>color</w:t>
+      </w:r>
+      <w:proofErr w:type="spellEnd"/>
+      <w:r>
+        <w:t>)</w:t>
+      </w:r>
+      <w:r>
+        <w:t xml:space="preserve">. Android studio is zeer gelijkaardig als bijvoorbeeld </w:t>
+      </w:r>
+      <w:proofErr w:type="spellStart"/>
+      <w:r>
+        <w:t>Webstorm</w:t>
+      </w:r>
+      <w:proofErr w:type="spellEnd"/>
+      <w:r>
+        <w:t xml:space="preserve">, maar bij het design van een mobile app is het zeer </w:t>
       </w:r>
       <w:r>
         <w:t>verschillend</w:t>
@@ -453,7 +695,15 @@
         <w:t>.</w:t>
       </w:r>
       <w:r>
-        <w:t xml:space="preserve"> Bij Webstorm kan je je website </w:t>
+        <w:t xml:space="preserve"> Bij </w:t>
+      </w:r>
+      <w:proofErr w:type="spellStart"/>
+      <w:r>
+        <w:t>Webstorm</w:t>
+      </w:r>
+      <w:proofErr w:type="spellEnd"/>
+      <w:r>
+        <w:t xml:space="preserve"> kan je je website </w:t>
       </w:r>
       <w:r>
         <w:t>bekijken</w:t>
@@ -480,7 +730,15 @@
         <w:t>.</w:t>
       </w:r>
       <w:r>
-        <w:t xml:space="preserve"> Als ik de Jetbrains applicaties vergelijk met Visual studio 2019, </w:t>
+        <w:t xml:space="preserve"> Als ik de </w:t>
+      </w:r>
+      <w:proofErr w:type="spellStart"/>
+      <w:r>
+        <w:t>Jetbrains</w:t>
+      </w:r>
+      <w:proofErr w:type="spellEnd"/>
+      <w:r>
+        <w:t xml:space="preserve"> applicaties vergelijk met Visual studio 2019, </w:t>
       </w:r>
       <w:r>
         <w:t>heb ik er altijd moeite mee om de lay</w:t>
@@ -516,7 +774,7 @@
                     <pic:cNvPicPr/>
                   </pic:nvPicPr>
                   <pic:blipFill>
-                    <a:blip r:embed="rId7"/>
+                    <a:blip r:embed="rId8"/>
                     <a:stretch>
                       <a:fillRect/>
                     </a:stretch>
@@ -560,7 +818,15 @@
     </w:p>
     <w:p>
       <w:r>
-        <w:t>Ik heb dan ondertussen de tutorial van Material design gevolgd in plaats van die van Android studio. Ze leerde me dan hoe ik er mee kon werken maar niet hoe een hele nieuwe app kon maken. Ik kreeg een voorbeeld app om erin te kunnen werken voor de tutorial.</w:t>
+        <w:t xml:space="preserve">Ik heb dan ondertussen de tutorial van </w:t>
+      </w:r>
+      <w:proofErr w:type="spellStart"/>
+      <w:r>
+        <w:t>Material</w:t>
+      </w:r>
+      <w:proofErr w:type="spellEnd"/>
+      <w:r>
+        <w:t xml:space="preserve"> design gevolgd in plaats van die van Android studio. Ze leerde me dan hoe ik er mee kon werken maar niet hoe een hele nieuwe app kon maken. Ik kreeg een voorbeeld app om erin te kunnen werken voor de tutorial.</w:t>
       </w:r>
     </w:p>
     <w:p>
@@ -569,7 +835,7 @@
           <w:rStyle w:val="Hyperlink"/>
         </w:rPr>
       </w:pPr>
-      <w:hyperlink r:id="rId8" w:anchor="0" w:history="1">
+      <w:hyperlink r:id="rId9" w:anchor="0" w:history="1">
         <w:r>
           <w:rPr>
             <w:rStyle w:val="Hyperlink"/>
@@ -603,10 +869,34 @@
     </w:p>
     <w:p>
       <w:r>
-        <w:t>Vandaag heb ik de usertests afgelegd met Louis D’hondt en Jasper Wauters. Dit ging heel gemakkelijk en duurde niet lang. Ik had niet echt serieuze opmerkingen, behalve dat ik geen persoonlijke info pagina gemaakt had.</w:t>
-      </w:r>
-      <w:r>
-        <w:t xml:space="preserve"> Daarna heb ik onmiddellijk die opmerkingen van mijn figma design verbetert en op mijn repository gezet.</w:t>
+        <w:t xml:space="preserve">Vandaag heb ik de usertests afgelegd met Louis </w:t>
+      </w:r>
+      <w:proofErr w:type="spellStart"/>
+      <w:r>
+        <w:t>D’hondt</w:t>
+      </w:r>
+      <w:proofErr w:type="spellEnd"/>
+      <w:r>
+        <w:t xml:space="preserve"> en Jasper Wauters. Dit ging heel gemakkelijk en duurde niet lang. Ik had niet echt serieuze opmerkingen, behalve dat ik geen persoonlijke info pagina gemaakt had.</w:t>
+      </w:r>
+      <w:r>
+        <w:t xml:space="preserve"> Daarna heb ik onmiddellijk die opmerkingen van mijn </w:t>
+      </w:r>
+      <w:proofErr w:type="spellStart"/>
+      <w:r>
+        <w:t>figma</w:t>
+      </w:r>
+      <w:proofErr w:type="spellEnd"/>
+      <w:r>
+        <w:t xml:space="preserve"> design verbetert en op mijn </w:t>
+      </w:r>
+      <w:proofErr w:type="spellStart"/>
+      <w:r>
+        <w:t>repository</w:t>
+      </w:r>
+      <w:proofErr w:type="spellEnd"/>
+      <w:r>
+        <w:t xml:space="preserve"> gezet.</w:t>
       </w:r>
     </w:p>
     <w:p/>
@@ -629,7 +919,47 @@
     </w:p>
     <w:p>
       <w:r>
-        <w:t xml:space="preserve">Vandaag begon ik eindelijk met Material Design. Ik besloot mijn oude app te verwijderen en te vervangen met een empty activity zodat ik echt van scratch begin. Zo kan ik alles beter begrijpen. Ik had dan ontdekt dat android studio al automatisch Material Design van Google had toegevoegd bij de dependencies, dus eigenlijk ben ik </w:t>
+        <w:t xml:space="preserve">Vandaag begon ik eindelijk met </w:t>
+      </w:r>
+      <w:proofErr w:type="spellStart"/>
+      <w:r>
+        <w:t>Material</w:t>
+      </w:r>
+      <w:proofErr w:type="spellEnd"/>
+      <w:r>
+        <w:t xml:space="preserve"> Design. Ik besloot mijn oude app te verwijderen en te vervangen met een empty </w:t>
+      </w:r>
+      <w:proofErr w:type="spellStart"/>
+      <w:r>
+        <w:t>activity</w:t>
+      </w:r>
+      <w:proofErr w:type="spellEnd"/>
+      <w:r>
+        <w:t xml:space="preserve"> zodat ik echt van scratch begin. Zo kan ik alles beter begrijpen. Ik had dan ontdekt dat </w:t>
+      </w:r>
+      <w:proofErr w:type="spellStart"/>
+      <w:r>
+        <w:t>android</w:t>
+      </w:r>
+      <w:proofErr w:type="spellEnd"/>
+      <w:r>
+        <w:t xml:space="preserve"> studio al automatisch </w:t>
+      </w:r>
+      <w:proofErr w:type="spellStart"/>
+      <w:r>
+        <w:t>Material</w:t>
+      </w:r>
+      <w:proofErr w:type="spellEnd"/>
+      <w:r>
+        <w:t xml:space="preserve"> Design van Google had toegevoegd bij de </w:t>
+      </w:r>
+      <w:proofErr w:type="spellStart"/>
+      <w:r>
+        <w:t>dependencies</w:t>
+      </w:r>
+      <w:proofErr w:type="spellEnd"/>
+      <w:r>
+        <w:t xml:space="preserve">, dus eigenlijk ben ik </w:t>
       </w:r>
       <w:r>
         <w:t>onmiddellijk</w:t>
@@ -639,7 +969,7 @@
       </w:r>
     </w:p>
     <w:p>
-      <w:hyperlink r:id="rId9" w:history="1">
+      <w:hyperlink r:id="rId10" w:history="1">
         <w:r>
           <w:rPr>
             <w:rStyle w:val="Hyperlink"/>
@@ -658,53 +988,6 @@
             <wp:extent cx="5724525" cy="2171700"/>
             <wp:effectExtent l="0" t="0" r="9525" b="0"/>
             <wp:docPr id="3" name="Afbeelding 3"/>
-            <wp:cNvGraphicFramePr>
-              <a:graphicFrameLocks xmlns:a="http://schemas.openxmlformats.org/drawingml/2006/main" noChangeAspect="1"/>
-            </wp:cNvGraphicFramePr>
-            <a:graphic xmlns:a="http://schemas.openxmlformats.org/drawingml/2006/main">
-              <a:graphicData uri="http://schemas.openxmlformats.org/drawingml/2006/picture">
-                <pic:pic xmlns:pic="http://schemas.openxmlformats.org/drawingml/2006/picture">
-                  <pic:nvPicPr>
-                    <pic:cNvPr id="1" name=""/>
-                    <pic:cNvPicPr/>
-                  </pic:nvPicPr>
-                  <pic:blipFill>
-                    <a:blip r:embed="rId10"/>
-                    <a:stretch>
-                      <a:fillRect/>
-                    </a:stretch>
-                  </pic:blipFill>
-                  <pic:spPr>
-                    <a:xfrm>
-                      <a:off x="0" y="0"/>
-                      <a:ext cx="5724525" cy="2171700"/>
-                    </a:xfrm>
-                    <a:prstGeom prst="rect">
-                      <a:avLst/>
-                    </a:prstGeom>
-                  </pic:spPr>
-                </pic:pic>
-              </a:graphicData>
-            </a:graphic>
-          </wp:inline>
-        </w:drawing>
-      </w:r>
-    </w:p>
-    <w:p>
-      <w:r>
-        <w:t>Ik heb dan ondertussen de login pagina eindelijk gemaakt.</w:t>
-      </w:r>
-    </w:p>
-    <w:p>
-      <w:r>
-        <w:rPr>
-          <w:noProof/>
-        </w:rPr>
-        <w:drawing>
-          <wp:inline distT="0" distB="0" distL="0" distR="0" wp14:anchorId="56FADCD9" wp14:editId="76DCB4CE">
-            <wp:extent cx="2133849" cy="3916393"/>
-            <wp:effectExtent l="0" t="0" r="0" b="8255"/>
-            <wp:docPr id="5" name="Afbeelding 5"/>
             <wp:cNvGraphicFramePr>
               <a:graphicFrameLocks xmlns:a="http://schemas.openxmlformats.org/drawingml/2006/main" noChangeAspect="1"/>
             </wp:cNvGraphicFramePr>
@@ -724,7 +1007,7 @@
                   <pic:spPr>
                     <a:xfrm>
                       <a:off x="0" y="0"/>
-                      <a:ext cx="2136499" cy="3921257"/>
+                      <a:ext cx="5724525" cy="2171700"/>
                     </a:xfrm>
                     <a:prstGeom prst="rect">
                       <a:avLst/>
@@ -737,6 +1020,146 @@
         </w:drawing>
       </w:r>
     </w:p>
+    <w:p>
+      <w:r>
+        <w:t>Ik heb dan ondertussen de login pagina eindelijk gemaakt.</w:t>
+      </w:r>
+      <w:r>
+        <w:t xml:space="preserve"> Ik heb daarna een probleem gekregen waarbij ik dus de app niet kan runnen.</w:t>
+      </w:r>
+    </w:p>
+    <w:p>
+      <w:r>
+        <w:rPr>
+          <w:noProof/>
+        </w:rPr>
+        <w:drawing>
+          <wp:inline distT="0" distB="0" distL="0" distR="0" wp14:anchorId="277B721E" wp14:editId="024DA216">
+            <wp:extent cx="2129535" cy="4270076"/>
+            <wp:effectExtent l="0" t="0" r="4445" b="0"/>
+            <wp:docPr id="4" name="Afbeelding 4"/>
+            <wp:cNvGraphicFramePr>
+              <a:graphicFrameLocks xmlns:a="http://schemas.openxmlformats.org/drawingml/2006/main" noChangeAspect="1"/>
+            </wp:cNvGraphicFramePr>
+            <a:graphic xmlns:a="http://schemas.openxmlformats.org/drawingml/2006/main">
+              <a:graphicData uri="http://schemas.openxmlformats.org/drawingml/2006/picture">
+                <pic:pic xmlns:pic="http://schemas.openxmlformats.org/drawingml/2006/picture">
+                  <pic:nvPicPr>
+                    <pic:cNvPr id="1" name=""/>
+                    <pic:cNvPicPr/>
+                  </pic:nvPicPr>
+                  <pic:blipFill>
+                    <a:blip r:embed="rId12"/>
+                    <a:stretch>
+                      <a:fillRect/>
+                    </a:stretch>
+                  </pic:blipFill>
+                  <pic:spPr>
+                    <a:xfrm>
+                      <a:off x="0" y="0"/>
+                      <a:ext cx="2131506" cy="4274029"/>
+                    </a:xfrm>
+                    <a:prstGeom prst="rect">
+                      <a:avLst/>
+                    </a:prstGeom>
+                  </pic:spPr>
+                </pic:pic>
+              </a:graphicData>
+            </a:graphic>
+          </wp:inline>
+        </w:drawing>
+      </w:r>
+    </w:p>
+    <w:p/>
+    <w:p/>
+    <w:p>
+      <w:pPr>
+        <w:pStyle w:val="Kop2"/>
+      </w:pPr>
+      <w:r>
+        <w:t>Week 4</w:t>
+      </w:r>
+    </w:p>
+    <w:p/>
+    <w:p>
+      <w:pPr>
+        <w:rPr>
+          <w:b/>
+          <w:bCs/>
+        </w:rPr>
+      </w:pPr>
+      <w:r>
+        <w:rPr>
+          <w:b/>
+          <w:bCs/>
+        </w:rPr>
+        <w:t>11/10/2021:</w:t>
+      </w:r>
+    </w:p>
+    <w:p>
+      <w:r>
+        <w:t>Vandaag heb ik het probleem waarbij ik de app niet kon runnen opgelost:</w:t>
+      </w:r>
+    </w:p>
+    <w:p>
+      <w:r>
+        <w:t xml:space="preserve">Eerst had ik geprobeerd om gewoon een heel nieuw project te maken die bestond uit een login </w:t>
+      </w:r>
+      <w:proofErr w:type="spellStart"/>
+      <w:r>
+        <w:t>activity</w:t>
+      </w:r>
+      <w:proofErr w:type="spellEnd"/>
+      <w:r>
+        <w:t xml:space="preserve">. Deze </w:t>
+      </w:r>
+      <w:proofErr w:type="spellStart"/>
+      <w:r>
+        <w:t>activity</w:t>
+      </w:r>
+      <w:proofErr w:type="spellEnd"/>
+      <w:r>
+        <w:t xml:space="preserve"> heb ik dan gewoon aangepast naar mijn wens. Maar dit wou ook niet echt werken, want blijkbaar is het best dat je van een </w:t>
+      </w:r>
+      <w:proofErr w:type="spellStart"/>
+      <w:r>
+        <w:t>main</w:t>
+      </w:r>
+      <w:r>
+        <w:t>_</w:t>
+      </w:r>
+      <w:r>
+        <w:t>activity</w:t>
+      </w:r>
+      <w:proofErr w:type="spellEnd"/>
+      <w:r>
+        <w:t xml:space="preserve"> start en dan de login page daarmee opent.</w:t>
+      </w:r>
+    </w:p>
+    <w:p>
+      <w:r>
+        <w:t xml:space="preserve">Ik ben dan gewoon terug begonnen aan het oude project en heb dan de error op stack overflow gezocht en daar had ik de oplossing gevonden. Ik moest gewoon mijn “device” zijn data </w:t>
+      </w:r>
+      <w:proofErr w:type="spellStart"/>
+      <w:r>
+        <w:t>wipen</w:t>
+      </w:r>
+      <w:proofErr w:type="spellEnd"/>
+      <w:r>
+        <w:t xml:space="preserve"> en dan kon het opnieuw installeren want mijn oude projecten stond er nog op.</w:t>
+      </w:r>
+    </w:p>
+    <w:p>
+      <w:hyperlink r:id="rId13" w:history="1">
+        <w:r>
+          <w:rPr>
+            <w:rStyle w:val="Hyperlink"/>
+          </w:rPr>
+          <w:t>https://stackoverflow.com/questions/57374314/installation-failed-with-message-failed-to-create-install-session-with-cmd-pack/58335194#58335194</w:t>
+        </w:r>
+      </w:hyperlink>
+    </w:p>
+    <w:p/>
     <w:sectPr>
       <w:pgSz w:w="11906" w:h="16838"/>
       <w:pgMar w:top="1417" w:right="1417" w:bottom="1417" w:left="1417" w:header="708" w:footer="708" w:gutter="0"/>
@@ -1561,4 +1984,16 @@
     </a:ext>
   </a:extLst>
 </a:theme>
+</file>
+
+<file path=customXml/item1.xml><?xml version="1.0" encoding="utf-8"?>
+<b:Sources xmlns:b="http://schemas.openxmlformats.org/officeDocument/2006/bibliography" xmlns="http://schemas.openxmlformats.org/officeDocument/2006/bibliography" SelectedStyle="\APASixthEditionOfficeOnline.xsl" StyleName="APA" Version="6"/>
+</file>
+
+<file path=customXml/itemProps1.xml><?xml version="1.0" encoding="utf-8"?>
+<ds:datastoreItem xmlns:ds="http://schemas.openxmlformats.org/officeDocument/2006/customXml" ds:itemID="{64D055F3-7882-4107-8AF2-18494EF2A475}">
+  <ds:schemaRefs>
+    <ds:schemaRef ds:uri="http://schemas.openxmlformats.org/officeDocument/2006/bibliography"/>
+  </ds:schemaRefs>
+</ds:datastoreItem>
 </file>
</xml_diff>

<commit_message>
Added a registration fragment (forgot to commit this yesterday)
</commit_message>
<xml_diff>
--- a/Logboek_Dries_Fierens.docx
+++ b/Logboek_Dries_Fierens.docx
@@ -78,7 +78,15 @@
       </w:r>
       <w:proofErr w:type="spellEnd"/>
       <w:r>
-        <w:t xml:space="preserve"> web app dat dus meer te maken hebben met web &amp; mobile dus vooral HTML &amp; CSS. We moesten dan ook nog kiezen voor een project idee, waarbij ik koos voor een scanner + pdf converter app</w:t>
+        <w:t xml:space="preserve"> web app dat dus meer te maken hebben met web &amp; mobile dus vooral HTML &amp; CSS. We moesten dan ook nog kiezen voor een project idee, waarbij ik koos voor een scanner + </w:t>
+      </w:r>
+      <w:proofErr w:type="gramStart"/>
+      <w:r>
+        <w:t>pdf converter</w:t>
+      </w:r>
+      <w:proofErr w:type="gramEnd"/>
+      <w:r>
+        <w:t xml:space="preserve"> app</w:t>
       </w:r>
       <w:r>
         <w:t xml:space="preserve"> waarbij het vooral bedoelt is o</w:t>
@@ -99,7 +107,15 @@
         <w:t>.</w:t>
       </w:r>
       <w:r>
-        <w:t xml:space="preserve"> Het was verplicht om 1 hardware component van de gsm te gebruiken dus koos ik natuurlijk voor de camera.</w:t>
+        <w:t xml:space="preserve"> Het was verplicht om 1 </w:t>
+      </w:r>
+      <w:proofErr w:type="gramStart"/>
+      <w:r>
+        <w:t>hardware component</w:t>
+      </w:r>
+      <w:proofErr w:type="gramEnd"/>
+      <w:r>
+        <w:t xml:space="preserve"> van de gsm te gebruiken dus koos ik natuurlijk voor de camera.</w:t>
       </w:r>
       <w:r>
         <w:t xml:space="preserve"> </w:t>
@@ -213,7 +229,15 @@
         <w:t xml:space="preserve">Mijn app idee werd niet goedgekeurd, want de leerkracht raadde het af door problemen die ervan kunnen komen. Ik moest dan vandaag een nieuw idee opstellen. </w:t>
       </w:r>
       <w:r>
-        <w:t>De scanner + pdf converter was duidelijk te moeilijk, maar ik besloot om het idee verder te zetten van een app die notities kan delen. Dus nu moet het gewoon foto’s trekken van de notities. Om nog toe te voegen kan ik ook opmerkingswolkjes toevoegen aan de foto voor bijvoorbeeld een fout</w:t>
+        <w:t xml:space="preserve">De scanner + </w:t>
+      </w:r>
+      <w:proofErr w:type="gramStart"/>
+      <w:r>
+        <w:t>pdf converter</w:t>
+      </w:r>
+      <w:proofErr w:type="gramEnd"/>
+      <w:r>
+        <w:t xml:space="preserve"> was duidelijk te moeilijk, maar ik besloot om het idee verder te zetten van een app die notities kan delen. Dus nu moet het gewoon foto’s trekken van de notities. Om nog toe te voegen kan ik ook opmerkingswolkjes toevoegen aan de foto voor bijvoorbeeld een fout</w:t>
       </w:r>
       <w:r>
         <w:t xml:space="preserve"> aan te duiden</w:t>
@@ -285,7 +309,15 @@
         <w:t>te veel</w:t>
       </w:r>
       <w:r>
-        <w:t xml:space="preserve"> naar voor moest leunen en dus nek pijn kreeg en er waren precies geen ramen om te openen. </w:t>
+        <w:t xml:space="preserve"> naar voor moest leunen en dus </w:t>
+      </w:r>
+      <w:proofErr w:type="gramStart"/>
+      <w:r>
+        <w:t>nek pijn</w:t>
+      </w:r>
+      <w:proofErr w:type="gramEnd"/>
+      <w:r>
+        <w:t xml:space="preserve"> kreeg en er waren precies geen ramen om te openen. </w:t>
       </w:r>
       <w:r>
         <w:t>Gelukkig kunnen we naar buiten wanneer we het willen.</w:t>
@@ -566,7 +598,15 @@
     </w:p>
     <w:p>
       <w:r>
-        <w:t xml:space="preserve">Tijdens lange downloads heb ik ook mijn google account toegevoegd op </w:t>
+        <w:t xml:space="preserve">Tijdens lange downloads heb ik ook mijn </w:t>
+      </w:r>
+      <w:proofErr w:type="gramStart"/>
+      <w:r>
+        <w:t>google account</w:t>
+      </w:r>
+      <w:proofErr w:type="gramEnd"/>
+      <w:r>
+        <w:t xml:space="preserve"> toegevoegd op </w:t>
       </w:r>
       <w:proofErr w:type="spellStart"/>
       <w:r>
@@ -655,7 +695,15 @@
         <w:t>Ik heb daarna gewoon verder begonnen aan de tutorial die ik vorige week gebruikt had.</w:t>
       </w:r>
       <w:r>
-        <w:t xml:space="preserve"> Hierbij leerde ik meer over hoe ik Android studio beter kon gebruiken om mijn app te </w:t>
+        <w:t xml:space="preserve"> Hierbij leerde ik meer over hoe ik </w:t>
+      </w:r>
+      <w:proofErr w:type="gramStart"/>
+      <w:r>
+        <w:t>Android studio</w:t>
+      </w:r>
+      <w:proofErr w:type="gramEnd"/>
+      <w:r>
+        <w:t xml:space="preserve"> beter kon gebruiken om mijn app te </w:t>
       </w:r>
       <w:proofErr w:type="spellStart"/>
       <w:r>
@@ -678,7 +726,15 @@
         <w:t>)</w:t>
       </w:r>
       <w:r>
-        <w:t xml:space="preserve">. Android studio is zeer gelijkaardig als bijvoorbeeld </w:t>
+        <w:t xml:space="preserve">. </w:t>
+      </w:r>
+      <w:proofErr w:type="gramStart"/>
+      <w:r>
+        <w:t>Android studio</w:t>
+      </w:r>
+      <w:proofErr w:type="gramEnd"/>
+      <w:r>
+        <w:t xml:space="preserve"> is zeer gelijkaardig als bijvoorbeeld </w:t>
       </w:r>
       <w:proofErr w:type="spellStart"/>
       <w:r>
@@ -709,8 +765,13 @@
         <w:t>bekijken</w:t>
       </w:r>
       <w:r>
-        <w:t xml:space="preserve"> in een gekozen browser, maar je kan in Android studio</w:t>
-      </w:r>
+        <w:t xml:space="preserve"> in een gekozen browser, maar je kan in </w:t>
+      </w:r>
+      <w:proofErr w:type="gramStart"/>
+      <w:r>
+        <w:t>Android studio</w:t>
+      </w:r>
+      <w:proofErr w:type="gramEnd"/>
       <w:r>
         <w:t xml:space="preserve"> je app</w:t>
       </w:r>
@@ -826,7 +887,15 @@
       </w:r>
       <w:proofErr w:type="spellEnd"/>
       <w:r>
-        <w:t xml:space="preserve"> design gevolgd in plaats van die van Android studio. Ze leerde me dan hoe ik er mee kon werken maar niet hoe een hele nieuwe app kon maken. Ik kreeg een voorbeeld app om erin te kunnen werken voor de tutorial.</w:t>
+        <w:t xml:space="preserve"> design gevolgd in plaats van die van </w:t>
+      </w:r>
+      <w:proofErr w:type="gramStart"/>
+      <w:r>
+        <w:t>Android studio</w:t>
+      </w:r>
+      <w:proofErr w:type="gramEnd"/>
+      <w:r>
+        <w:t>. Ze leerde me dan hoe ik er mee kon werken maar niet hoe een hele nieuwe app kon maken. Ik kreeg een voorbeeld app om erin te kunnen werken voor de tutorial.</w:t>
       </w:r>
     </w:p>
     <w:p>
@@ -1150,7 +1219,12 @@
       </w:r>
     </w:p>
     <w:p>
-      <w:hyperlink r:id="rId13" w:history="1">
+      <w:pPr>
+        <w:rPr>
+          <w:rStyle w:val="Hyperlink"/>
+        </w:rPr>
+      </w:pPr>
+      <w:hyperlink r:id="rId13" w:anchor="58335194" w:history="1">
         <w:r>
           <w:rPr>
             <w:rStyle w:val="Hyperlink"/>
@@ -1159,6 +1233,34 @@
         </w:r>
       </w:hyperlink>
     </w:p>
+    <w:p>
+      <w:r>
+        <w:t>Ik heb daarna de registratie pagina aangemaakt, maar nog geen navigatie om terug te keren. Het is natuurlijk ook nog niet mogelijk om ernaartoe te gaan via de Login pagina.</w:t>
+      </w:r>
+    </w:p>
+    <w:p/>
+    <w:p>
+      <w:pPr>
+        <w:rPr>
+          <w:b/>
+          <w:bCs/>
+        </w:rPr>
+      </w:pPr>
+      <w:r>
+        <w:rPr>
+          <w:b/>
+          <w:bCs/>
+        </w:rPr>
+        <w:t>12/10/2021:</w:t>
+      </w:r>
+    </w:p>
+    <w:p>
+      <w:r>
+        <w:t>Vandaag wou de wifi niet werken op de campus dus had ik niet veel vooruitgang geboekt.</w:t>
+      </w:r>
+    </w:p>
+    <w:p/>
+    <w:p/>
     <w:p/>
     <w:sectPr>
       <w:pgSz w:w="11906" w:h="16838"/>

</xml_diff>

<commit_message>
Added Homepage and link text for going to the registration page
</commit_message>
<xml_diff>
--- a/Logboek_Dries_Fierens.docx
+++ b/Logboek_Dries_Fierens.docx
@@ -46,47 +46,7 @@
         <w:t>applicatie</w:t>
       </w:r>
       <w:r>
-        <w:t xml:space="preserve"> die je kan maken en welke technologieën je kan gebruiken. Ik heb voor native gekozen want dat past het best bij mijn aftakking “Software </w:t>
-      </w:r>
-      <w:proofErr w:type="spellStart"/>
-      <w:r>
-        <w:t>developer</w:t>
-      </w:r>
-      <w:proofErr w:type="spellEnd"/>
-      <w:r>
-        <w:t xml:space="preserve">” sinds het </w:t>
-      </w:r>
-      <w:proofErr w:type="spellStart"/>
-      <w:r>
-        <w:t>java</w:t>
-      </w:r>
-      <w:proofErr w:type="spellEnd"/>
-      <w:r>
-        <w:t xml:space="preserve"> inhoudt. De anderen zijn </w:t>
-      </w:r>
-      <w:proofErr w:type="spellStart"/>
-      <w:r>
-        <w:t>hybrid</w:t>
-      </w:r>
-      <w:proofErr w:type="spellEnd"/>
-      <w:r>
-        <w:t xml:space="preserve"> en </w:t>
-      </w:r>
-      <w:proofErr w:type="spellStart"/>
-      <w:r>
-        <w:t>progressive</w:t>
-      </w:r>
-      <w:proofErr w:type="spellEnd"/>
-      <w:r>
-        <w:t xml:space="preserve"> web app dat dus meer te maken hebben met web &amp; mobile dus vooral HTML &amp; CSS. We moesten dan ook nog kiezen voor een project idee, waarbij ik koos voor een scanner + </w:t>
-      </w:r>
-      <w:proofErr w:type="gramStart"/>
-      <w:r>
-        <w:t>pdf converter</w:t>
-      </w:r>
-      <w:proofErr w:type="gramEnd"/>
-      <w:r>
-        <w:t xml:space="preserve"> app</w:t>
+        <w:t xml:space="preserve"> die je kan maken en welke technologieën je kan gebruiken. Ik heb voor native gekozen want dat past het best bij mijn aftakking “Software developer” sinds het java inhoudt. De anderen zijn hybrid en progressive web app dat dus meer te maken hebben met web &amp; mobile dus vooral HTML &amp; CSS. We moesten dan ook nog kiezen voor een project idee, waarbij ik koos voor een scanner + pdf converter app</w:t>
       </w:r>
       <w:r>
         <w:t xml:space="preserve"> waarbij het vooral bedoelt is o</w:t>
@@ -107,106 +67,26 @@
         <w:t>.</w:t>
       </w:r>
       <w:r>
-        <w:t xml:space="preserve"> Het was verplicht om 1 </w:t>
-      </w:r>
-      <w:proofErr w:type="gramStart"/>
-      <w:r>
-        <w:t>hardware component</w:t>
-      </w:r>
-      <w:proofErr w:type="gramEnd"/>
-      <w:r>
-        <w:t xml:space="preserve"> van de gsm te gebruiken dus koos ik natuurlijk voor de camera.</w:t>
+        <w:t xml:space="preserve"> Het was verplicht om 1 hardware component van de gsm te gebruiken dus koos ik natuurlijk voor de camera.</w:t>
       </w:r>
       <w:r>
         <w:t xml:space="preserve"> </w:t>
       </w:r>
       <w:r>
-        <w:t xml:space="preserve">Als </w:t>
-      </w:r>
-      <w:proofErr w:type="spellStart"/>
-      <w:r>
-        <w:t>back-end</w:t>
-      </w:r>
-      <w:proofErr w:type="spellEnd"/>
-      <w:r>
-        <w:t xml:space="preserve"> koos ik </w:t>
-      </w:r>
-      <w:proofErr w:type="spellStart"/>
-      <w:r>
-        <w:t>Firebase</w:t>
-      </w:r>
-      <w:proofErr w:type="spellEnd"/>
-      <w:r>
-        <w:t xml:space="preserve"> en als technologie koos ik in </w:t>
-      </w:r>
-      <w:proofErr w:type="spellStart"/>
-      <w:r>
-        <w:t>java</w:t>
-      </w:r>
-      <w:proofErr w:type="spellEnd"/>
-      <w:r>
-        <w:t xml:space="preserve"> te werken om een </w:t>
-      </w:r>
-      <w:proofErr w:type="spellStart"/>
-      <w:r>
-        <w:t>android</w:t>
-      </w:r>
-      <w:proofErr w:type="spellEnd"/>
-      <w:r>
-        <w:t xml:space="preserve"> app te maken in plaats van een IOS app.</w:t>
-      </w:r>
-      <w:r>
-        <w:t xml:space="preserve"> Want ik heb een </w:t>
-      </w:r>
-      <w:proofErr w:type="spellStart"/>
-      <w:r>
-        <w:t>huawei</w:t>
-      </w:r>
-      <w:proofErr w:type="spellEnd"/>
-      <w:r>
-        <w:t>.</w:t>
-      </w:r>
-    </w:p>
-    <w:p>
-      <w:r>
-        <w:t xml:space="preserve">Ik heb dit allemaal grondiger beschreven in mijn “app </w:t>
-      </w:r>
-      <w:proofErr w:type="spellStart"/>
-      <w:r>
-        <w:t>idee”.pdf</w:t>
-      </w:r>
-      <w:proofErr w:type="spellEnd"/>
-      <w:r>
-        <w:t xml:space="preserve">. Dit staat ondertussen op de </w:t>
-      </w:r>
-      <w:proofErr w:type="spellStart"/>
-      <w:r>
-        <w:t>repository</w:t>
-      </w:r>
-      <w:proofErr w:type="spellEnd"/>
-      <w:r>
-        <w:t xml:space="preserve"> die we moesten maken.</w:t>
-      </w:r>
-    </w:p>
-    <w:p>
-      <w:r>
-        <w:t xml:space="preserve">Om af te sluiten had ik al ondertussen een goede naam gevonden gebaseerd op de applicatie genaamd </w:t>
-      </w:r>
-      <w:proofErr w:type="spellStart"/>
-      <w:r>
-        <w:t>Scannable</w:t>
-      </w:r>
-      <w:proofErr w:type="spellEnd"/>
-      <w:r>
-        <w:t xml:space="preserve">. Ik heb dus besloten om mijn applicatie </w:t>
-      </w:r>
-      <w:proofErr w:type="spellStart"/>
-      <w:r>
-        <w:t>Notable</w:t>
-      </w:r>
-      <w:proofErr w:type="spellEnd"/>
-      <w:r>
-        <w:t xml:space="preserve"> te noemen.</w:t>
+        <w:t>Als back-end koos ik Firebase en als technologie koos ik in java te werken om een android app te maken in plaats van een IOS app.</w:t>
+      </w:r>
+      <w:r>
+        <w:t xml:space="preserve"> Want ik heb een huawei.</w:t>
+      </w:r>
+    </w:p>
+    <w:p>
+      <w:r>
+        <w:t>Ik heb dit allemaal grondiger beschreven in mijn “app idee”.pdf. Dit staat ondertussen op de repository die we moesten maken.</w:t>
+      </w:r>
+    </w:p>
+    <w:p>
+      <w:r>
+        <w:t>Om af te sluiten had ik al ondertussen een goede naam gevonden gebaseerd op de applicatie genaamd Scannable. Ik heb dus besloten om mijn applicatie Notable te noemen.</w:t>
       </w:r>
     </w:p>
     <w:p>
@@ -229,15 +109,7 @@
         <w:t xml:space="preserve">Mijn app idee werd niet goedgekeurd, want de leerkracht raadde het af door problemen die ervan kunnen komen. Ik moest dan vandaag een nieuw idee opstellen. </w:t>
       </w:r>
       <w:r>
-        <w:t xml:space="preserve">De scanner + </w:t>
-      </w:r>
-      <w:proofErr w:type="gramStart"/>
-      <w:r>
-        <w:t>pdf converter</w:t>
-      </w:r>
-      <w:proofErr w:type="gramEnd"/>
-      <w:r>
-        <w:t xml:space="preserve"> was duidelijk te moeilijk, maar ik besloot om het idee verder te zetten van een app die notities kan delen. Dus nu moet het gewoon foto’s trekken van de notities. Om nog toe te voegen kan ik ook opmerkingswolkjes toevoegen aan de foto voor bijvoorbeeld een fout</w:t>
+        <w:t>De scanner + pdf converter was duidelijk te moeilijk, maar ik besloot om het idee verder te zetten van een app die notities kan delen. Dus nu moet het gewoon foto’s trekken van de notities. Om nog toe te voegen kan ik ook opmerkingswolkjes toevoegen aan de foto voor bijvoorbeeld een fout</w:t>
       </w:r>
       <w:r>
         <w:t xml:space="preserve"> aan te duiden</w:t>
@@ -248,15 +120,7 @@
     </w:p>
     <w:p>
       <w:r>
-        <w:t xml:space="preserve">Daarna moest ik gewoon begin aan een UI/UX design voor mijn applicatie, waarbij nog niet veel had gedaan omdat les niet meer lang duurde. Ik moest toen ook tegelijkertijd zoeken naar </w:t>
-      </w:r>
-      <w:proofErr w:type="spellStart"/>
-      <w:r>
-        <w:t>tutorials</w:t>
-      </w:r>
-      <w:proofErr w:type="spellEnd"/>
-      <w:r>
-        <w:t xml:space="preserve"> dus </w:t>
+        <w:t xml:space="preserve">Daarna moest ik gewoon begin aan een UI/UX design voor mijn applicatie, waarbij nog niet veel had gedaan omdat les niet meer lang duurde. Ik moest toen ook tegelijkertijd zoeken naar tutorials dus </w:t>
       </w:r>
       <w:r>
         <w:t>duurde dat ook kort.</w:t>
@@ -279,26 +143,13 @@
     </w:p>
     <w:p>
       <w:r>
-        <w:t>Vandaag in de namiddag begonnen we met de co-</w:t>
-      </w:r>
-      <w:proofErr w:type="spellStart"/>
-      <w:r>
-        <w:t>working</w:t>
-      </w:r>
-      <w:proofErr w:type="spellEnd"/>
-      <w:r>
-        <w:t xml:space="preserve"> les waarbij we dus informatie kunnen delen met medeleerlingen. Al was het de eerste les dus kwam daar niet veel van. Ik begon gewoon verder aan mijn </w:t>
-      </w:r>
-      <w:proofErr w:type="spellStart"/>
+        <w:t xml:space="preserve">Vandaag in de namiddag begonnen we met de co-working les waarbij we dus informatie kunnen delen met medeleerlingen. Al was het de eerste les dus kwam daar niet veel van. Ik begon gewoon verder aan mijn </w:t>
+      </w:r>
       <w:r>
         <w:t>F</w:t>
       </w:r>
       <w:r>
-        <w:t>igma</w:t>
-      </w:r>
-      <w:proofErr w:type="spellEnd"/>
-      <w:r>
-        <w:t xml:space="preserve"> design.</w:t>
+        <w:t>igma design.</w:t>
       </w:r>
     </w:p>
     <w:p>
@@ -309,15 +160,7 @@
         <w:t>te veel</w:t>
       </w:r>
       <w:r>
-        <w:t xml:space="preserve"> naar voor moest leunen en dus </w:t>
-      </w:r>
-      <w:proofErr w:type="gramStart"/>
-      <w:r>
-        <w:t>nek pijn</w:t>
-      </w:r>
-      <w:proofErr w:type="gramEnd"/>
-      <w:r>
-        <w:t xml:space="preserve"> kreeg en er waren precies geen ramen om te openen. </w:t>
+        <w:t xml:space="preserve"> naar voor moest leunen en dus nek pijn kreeg en er waren precies geen ramen om te openen. </w:t>
       </w:r>
       <w:r>
         <w:t>Gelukkig kunnen we naar buiten wanneer we het willen.</w:t>
@@ -357,23 +200,7 @@
     </w:p>
     <w:p>
       <w:r>
-        <w:t xml:space="preserve">Vandaag heb ik verder gewerkt aan mijn </w:t>
-      </w:r>
-      <w:proofErr w:type="spellStart"/>
-      <w:r>
-        <w:t>Figma</w:t>
-      </w:r>
-      <w:proofErr w:type="spellEnd"/>
-      <w:r>
-        <w:t xml:space="preserve"> design en het ging redelijk vlot vooruit. Ik wou absoluut dat het vandaag af was zodat ik morgen kan werken aan een ander vak. Tijdens het maken van het design heb ik vooral ook zitten op zoeken dat sommige concepten wel haalbaar zijn om te programmeren. Dit is allemaal wel mogelijk, maar zal wel een </w:t>
-      </w:r>
-      <w:proofErr w:type="spellStart"/>
-      <w:r>
-        <w:t>challenge</w:t>
-      </w:r>
-      <w:proofErr w:type="spellEnd"/>
-      <w:r>
-        <w:t xml:space="preserve"> zijn zoals de opmerkingen plaatsen</w:t>
+        <w:t>Vandaag heb ik verder gewerkt aan mijn Figma design en het ging redelijk vlot vooruit. Ik wou absoluut dat het vandaag af was zodat ik morgen kan werken aan een ander vak. Tijdens het maken van het design heb ik vooral ook zitten op zoeken dat sommige concepten wel haalbaar zijn om te programmeren. Dit is allemaal wel mogelijk, maar zal wel een challenge zijn zoals de opmerkingen plaatsen</w:t>
       </w:r>
       <w:r>
         <w:t>. M</w:t>
@@ -485,48 +312,11 @@
     </w:p>
     <w:p>
       <w:r>
-        <w:t xml:space="preserve">Vandaag werd mijn </w:t>
-      </w:r>
-      <w:proofErr w:type="spellStart"/>
-      <w:r>
-        <w:t>figma</w:t>
-      </w:r>
-      <w:proofErr w:type="spellEnd"/>
-      <w:r>
-        <w:t xml:space="preserve"> prototype gecontroleerd waarbij ik moest opnieuw uitleggen wat mijn app doet door middel van accurate presentatie. Ik legde dit vrij duidelijk uit en alles ging goed vooruit. Meneer </w:t>
-      </w:r>
-      <w:proofErr w:type="spellStart"/>
-      <w:r>
-        <w:t>Blancquaert</w:t>
-      </w:r>
-      <w:proofErr w:type="spellEnd"/>
-      <w:r>
-        <w:t xml:space="preserve"> heeft me dan ook nog een </w:t>
-      </w:r>
-      <w:proofErr w:type="spellStart"/>
-      <w:r>
-        <w:t>library</w:t>
-      </w:r>
-      <w:proofErr w:type="spellEnd"/>
-      <w:r>
-        <w:t xml:space="preserve"> genaamd “</w:t>
-      </w:r>
-      <w:proofErr w:type="spellStart"/>
-      <w:r>
-        <w:t>Material</w:t>
-      </w:r>
-      <w:proofErr w:type="spellEnd"/>
-      <w:r>
-        <w:t xml:space="preserve"> design” aangeraden om mijn applicatie te ontwerpen. </w:t>
-      </w:r>
-      <w:r>
-        <w:t xml:space="preserve">Blijkbaar Google gebruikt deze </w:t>
-      </w:r>
-      <w:proofErr w:type="spellStart"/>
-      <w:r>
-        <w:t>library</w:t>
-      </w:r>
-      <w:proofErr w:type="spellEnd"/>
+        <w:t xml:space="preserve">Vandaag werd mijn figma prototype gecontroleerd waarbij ik moest opnieuw uitleggen wat mijn app doet door middel van accurate presentatie. Ik legde dit vrij duidelijk uit en alles ging goed vooruit. Meneer Blancquaert heeft me dan ook nog een library genaamd “Material design” aangeraden om mijn applicatie te ontwerpen. </w:t>
+      </w:r>
+      <w:r>
+        <w:t>Blijkbaar Google gebruikt deze library</w:t>
+      </w:r>
       <w:r>
         <w:t xml:space="preserve"> om hun apps te maken.</w:t>
       </w:r>
@@ -564,23 +354,7 @@
         <w:t xml:space="preserve">kunt maken </w:t>
       </w:r>
       <w:r>
-        <w:t xml:space="preserve">om je app te testen. Als je </w:t>
-      </w:r>
-      <w:proofErr w:type="spellStart"/>
-      <w:r>
-        <w:t>developer</w:t>
-      </w:r>
-      <w:proofErr w:type="spellEnd"/>
-      <w:r>
-        <w:t xml:space="preserve"> modus in de </w:t>
-      </w:r>
-      <w:proofErr w:type="spellStart"/>
-      <w:r>
-        <w:t>settings</w:t>
-      </w:r>
-      <w:proofErr w:type="spellEnd"/>
-      <w:r>
-        <w:t xml:space="preserve"> van je gsm</w:t>
+        <w:t>om je app te testen. Als je developer modus in de settings van je gsm</w:t>
       </w:r>
       <w:r>
         <w:t xml:space="preserve"> aanzet, kan je je gsm verbinden met de pc en dus je applicatie daarop testen.</w:t>
@@ -598,23 +372,7 @@
     </w:p>
     <w:p>
       <w:r>
-        <w:t xml:space="preserve">Tijdens lange downloads heb ik ook mijn </w:t>
-      </w:r>
-      <w:proofErr w:type="gramStart"/>
-      <w:r>
-        <w:t>google account</w:t>
-      </w:r>
-      <w:proofErr w:type="gramEnd"/>
-      <w:r>
-        <w:t xml:space="preserve"> toegevoegd op </w:t>
-      </w:r>
-      <w:proofErr w:type="spellStart"/>
-      <w:r>
-        <w:t>Firebase</w:t>
-      </w:r>
-      <w:proofErr w:type="spellEnd"/>
-      <w:r>
-        <w:t>. Volgens de presentatie die we kregen van een medestudent.</w:t>
+        <w:t>Tijdens lange downloads heb ik ook mijn google account toegevoegd op Firebase. Volgens de presentatie die we kregen van een medestudent.</w:t>
       </w:r>
     </w:p>
     <w:p>
@@ -665,23 +423,7 @@
         <w:t>mijn</w:t>
       </w:r>
       <w:r>
-        <w:t xml:space="preserve"> </w:t>
-      </w:r>
-      <w:proofErr w:type="spellStart"/>
-      <w:r>
-        <w:t>figma</w:t>
-      </w:r>
-      <w:proofErr w:type="spellEnd"/>
-      <w:r>
-        <w:t xml:space="preserve"> design delen met meneer </w:t>
-      </w:r>
-      <w:proofErr w:type="spellStart"/>
-      <w:r>
-        <w:t>Blancquaert</w:t>
-      </w:r>
-      <w:proofErr w:type="spellEnd"/>
-      <w:r>
-        <w:t>, toen hij vroeg dat mijn design klaar was</w:t>
+        <w:t xml:space="preserve"> figma design delen met meneer Blancquaert, toen hij vroeg dat mijn design klaar was</w:t>
       </w:r>
       <w:r>
         <w:t xml:space="preserve"> of niet</w:t>
@@ -695,54 +437,14 @@
         <w:t>Ik heb daarna gewoon verder begonnen aan de tutorial die ik vorige week gebruikt had.</w:t>
       </w:r>
       <w:r>
-        <w:t xml:space="preserve"> Hierbij leerde ik meer over hoe ik </w:t>
-      </w:r>
-      <w:proofErr w:type="gramStart"/>
-      <w:r>
-        <w:t>Android studio</w:t>
-      </w:r>
-      <w:proofErr w:type="gramEnd"/>
-      <w:r>
-        <w:t xml:space="preserve"> beter kon gebruiken om mijn app te </w:t>
-      </w:r>
-      <w:proofErr w:type="spellStart"/>
-      <w:r>
-        <w:t>designen</w:t>
-      </w:r>
-      <w:proofErr w:type="spellEnd"/>
-      <w:r>
-        <w:t xml:space="preserve"> zoals hoe je </w:t>
+        <w:t xml:space="preserve"> Hierbij leerde ik meer over hoe ik Android studio beter kon gebruiken om mijn app te designen zoals hoe je </w:t>
       </w:r>
       <w:r>
         <w:lastRenderedPageBreak/>
-        <w:t xml:space="preserve">attributen kunt aanpassen (bv. </w:t>
-      </w:r>
-      <w:proofErr w:type="spellStart"/>
-      <w:r>
-        <w:t>color</w:t>
-      </w:r>
-      <w:proofErr w:type="spellEnd"/>
-      <w:r>
-        <w:t>)</w:t>
-      </w:r>
-      <w:r>
-        <w:t xml:space="preserve">. </w:t>
-      </w:r>
-      <w:proofErr w:type="gramStart"/>
-      <w:r>
-        <w:t>Android studio</w:t>
-      </w:r>
-      <w:proofErr w:type="gramEnd"/>
-      <w:r>
-        <w:t xml:space="preserve"> is zeer gelijkaardig als bijvoorbeeld </w:t>
-      </w:r>
-      <w:proofErr w:type="spellStart"/>
-      <w:r>
-        <w:t>Webstorm</w:t>
-      </w:r>
-      <w:proofErr w:type="spellEnd"/>
-      <w:r>
-        <w:t xml:space="preserve">, maar bij het design van een mobile app is het zeer </w:t>
+        <w:t>attributen kunt aanpassen (bv. color)</w:t>
+      </w:r>
+      <w:r>
+        <w:t xml:space="preserve">. Android studio is zeer gelijkaardig als bijvoorbeeld Webstorm, maar bij het design van een mobile app is het zeer </w:t>
       </w:r>
       <w:r>
         <w:t>verschillend</w:t>
@@ -751,27 +453,14 @@
         <w:t>.</w:t>
       </w:r>
       <w:r>
-        <w:t xml:space="preserve"> Bij </w:t>
-      </w:r>
-      <w:proofErr w:type="spellStart"/>
-      <w:r>
-        <w:t>Webstorm</w:t>
-      </w:r>
-      <w:proofErr w:type="spellEnd"/>
-      <w:r>
-        <w:t xml:space="preserve"> kan je je website </w:t>
+        <w:t xml:space="preserve"> Bij Webstorm kan je je website </w:t>
       </w:r>
       <w:r>
         <w:t>bekijken</w:t>
       </w:r>
       <w:r>
-        <w:t xml:space="preserve"> in een gekozen browser, maar je kan in </w:t>
-      </w:r>
-      <w:proofErr w:type="gramStart"/>
-      <w:r>
-        <w:t>Android studio</w:t>
-      </w:r>
-      <w:proofErr w:type="gramEnd"/>
+        <w:t xml:space="preserve"> in een gekozen browser, maar je kan in Android studio</w:t>
+      </w:r>
       <w:r>
         <w:t xml:space="preserve"> je app</w:t>
       </w:r>
@@ -791,15 +480,7 @@
         <w:t>.</w:t>
       </w:r>
       <w:r>
-        <w:t xml:space="preserve"> Als ik de </w:t>
-      </w:r>
-      <w:proofErr w:type="spellStart"/>
-      <w:r>
-        <w:t>Jetbrains</w:t>
-      </w:r>
-      <w:proofErr w:type="spellEnd"/>
-      <w:r>
-        <w:t xml:space="preserve"> applicaties vergelijk met Visual studio 2019, </w:t>
+        <w:t xml:space="preserve"> Als ik de Jetbrains applicaties vergelijk met Visual studio 2019, </w:t>
       </w:r>
       <w:r>
         <w:t>heb ik er altijd moeite mee om de lay</w:t>
@@ -879,23 +560,7 @@
     </w:p>
     <w:p>
       <w:r>
-        <w:t xml:space="preserve">Ik heb dan ondertussen de tutorial van </w:t>
-      </w:r>
-      <w:proofErr w:type="spellStart"/>
-      <w:r>
-        <w:t>Material</w:t>
-      </w:r>
-      <w:proofErr w:type="spellEnd"/>
-      <w:r>
-        <w:t xml:space="preserve"> design gevolgd in plaats van die van </w:t>
-      </w:r>
-      <w:proofErr w:type="gramStart"/>
-      <w:r>
-        <w:t>Android studio</w:t>
-      </w:r>
-      <w:proofErr w:type="gramEnd"/>
-      <w:r>
-        <w:t>. Ze leerde me dan hoe ik er mee kon werken maar niet hoe een hele nieuwe app kon maken. Ik kreeg een voorbeeld app om erin te kunnen werken voor de tutorial.</w:t>
+        <w:t>Ik heb dan ondertussen de tutorial van Material design gevolgd in plaats van die van Android studio. Ze leerde me dan hoe ik er mee kon werken maar niet hoe een hele nieuwe app kon maken. Ik kreeg een voorbeeld app om erin te kunnen werken voor de tutorial.</w:t>
       </w:r>
     </w:p>
     <w:p>
@@ -938,34 +603,10 @@
     </w:p>
     <w:p>
       <w:r>
-        <w:t xml:space="preserve">Vandaag heb ik de usertests afgelegd met Louis </w:t>
-      </w:r>
-      <w:proofErr w:type="spellStart"/>
-      <w:r>
-        <w:t>D’hondt</w:t>
-      </w:r>
-      <w:proofErr w:type="spellEnd"/>
-      <w:r>
-        <w:t xml:space="preserve"> en Jasper Wauters. Dit ging heel gemakkelijk en duurde niet lang. Ik had niet echt serieuze opmerkingen, behalve dat ik geen persoonlijke info pagina gemaakt had.</w:t>
-      </w:r>
-      <w:r>
-        <w:t xml:space="preserve"> Daarna heb ik onmiddellijk die opmerkingen van mijn </w:t>
-      </w:r>
-      <w:proofErr w:type="spellStart"/>
-      <w:r>
-        <w:t>figma</w:t>
-      </w:r>
-      <w:proofErr w:type="spellEnd"/>
-      <w:r>
-        <w:t xml:space="preserve"> design verbetert en op mijn </w:t>
-      </w:r>
-      <w:proofErr w:type="spellStart"/>
-      <w:r>
-        <w:t>repository</w:t>
-      </w:r>
-      <w:proofErr w:type="spellEnd"/>
-      <w:r>
-        <w:t xml:space="preserve"> gezet.</w:t>
+        <w:t>Vandaag heb ik de usertests afgelegd met Louis D’hondt en Jasper Wauters. Dit ging heel gemakkelijk en duurde niet lang. Ik had niet echt serieuze opmerkingen, behalve dat ik geen persoonlijke info pagina gemaakt had.</w:t>
+      </w:r>
+      <w:r>
+        <w:t xml:space="preserve"> Daarna heb ik onmiddellijk die opmerkingen van mijn figma design verbetert en op mijn repository gezet.</w:t>
       </w:r>
     </w:p>
     <w:p/>
@@ -988,47 +629,7 @@
     </w:p>
     <w:p>
       <w:r>
-        <w:t xml:space="preserve">Vandaag begon ik eindelijk met </w:t>
-      </w:r>
-      <w:proofErr w:type="spellStart"/>
-      <w:r>
-        <w:t>Material</w:t>
-      </w:r>
-      <w:proofErr w:type="spellEnd"/>
-      <w:r>
-        <w:t xml:space="preserve"> Design. Ik besloot mijn oude app te verwijderen en te vervangen met een empty </w:t>
-      </w:r>
-      <w:proofErr w:type="spellStart"/>
-      <w:r>
-        <w:t>activity</w:t>
-      </w:r>
-      <w:proofErr w:type="spellEnd"/>
-      <w:r>
-        <w:t xml:space="preserve"> zodat ik echt van scratch begin. Zo kan ik alles beter begrijpen. Ik had dan ontdekt dat </w:t>
-      </w:r>
-      <w:proofErr w:type="spellStart"/>
-      <w:r>
-        <w:t>android</w:t>
-      </w:r>
-      <w:proofErr w:type="spellEnd"/>
-      <w:r>
-        <w:t xml:space="preserve"> studio al automatisch </w:t>
-      </w:r>
-      <w:proofErr w:type="spellStart"/>
-      <w:r>
-        <w:t>Material</w:t>
-      </w:r>
-      <w:proofErr w:type="spellEnd"/>
-      <w:r>
-        <w:t xml:space="preserve"> Design van Google had toegevoegd bij de </w:t>
-      </w:r>
-      <w:proofErr w:type="spellStart"/>
-      <w:r>
-        <w:t>dependencies</w:t>
-      </w:r>
-      <w:proofErr w:type="spellEnd"/>
-      <w:r>
-        <w:t xml:space="preserve">, dus eigenlijk ben ik </w:t>
+        <w:t xml:space="preserve">Vandaag begon ik eindelijk met Material Design. Ik besloot mijn oude app te verwijderen en te vervangen met een empty activity zodat ik echt van scratch begin. Zo kan ik alles beter begrijpen. Ik had dan ontdekt dat android studio al automatisch Material Design van Google had toegevoegd bij de dependencies, dus eigenlijk ben ik </w:t>
       </w:r>
       <w:r>
         <w:t>onmiddellijk</w:t>
@@ -1172,50 +773,18 @@
     </w:p>
     <w:p>
       <w:r>
-        <w:t xml:space="preserve">Eerst had ik geprobeerd om gewoon een heel nieuw project te maken die bestond uit een login </w:t>
-      </w:r>
-      <w:proofErr w:type="spellStart"/>
-      <w:r>
-        <w:t>activity</w:t>
-      </w:r>
-      <w:proofErr w:type="spellEnd"/>
-      <w:r>
-        <w:t xml:space="preserve">. Deze </w:t>
-      </w:r>
-      <w:proofErr w:type="spellStart"/>
-      <w:r>
-        <w:t>activity</w:t>
-      </w:r>
-      <w:proofErr w:type="spellEnd"/>
-      <w:r>
-        <w:t xml:space="preserve"> heb ik dan gewoon aangepast naar mijn wens. Maar dit wou ook niet echt werken, want blijkbaar is het best dat je van een </w:t>
-      </w:r>
-      <w:proofErr w:type="spellStart"/>
-      <w:r>
-        <w:t>main</w:t>
+        <w:t>Eerst had ik geprobeerd om gewoon een heel nieuw project te maken die bestond uit een login activity. Deze activity heb ik dan gewoon aangepast naar mijn wens. Maar dit wou ook niet echt werken, want blijkbaar is het best dat je van een main</w:t>
       </w:r>
       <w:r>
         <w:t>_</w:t>
       </w:r>
       <w:r>
-        <w:t>activity</w:t>
-      </w:r>
-      <w:proofErr w:type="spellEnd"/>
-      <w:r>
-        <w:t xml:space="preserve"> start en dan de login page daarmee opent.</w:t>
-      </w:r>
-    </w:p>
-    <w:p>
-      <w:r>
-        <w:t xml:space="preserve">Ik ben dan gewoon terug begonnen aan het oude project en heb dan de error op stack overflow gezocht en daar had ik de oplossing gevonden. Ik moest gewoon mijn “device” zijn data </w:t>
-      </w:r>
-      <w:proofErr w:type="spellStart"/>
-      <w:r>
-        <w:t>wipen</w:t>
-      </w:r>
-      <w:proofErr w:type="spellEnd"/>
-      <w:r>
-        <w:t xml:space="preserve"> en dan kon het opnieuw installeren want mijn oude projecten stond er nog op.</w:t>
+        <w:t>activity start en dan de login page daarmee opent.</w:t>
+      </w:r>
+    </w:p>
+    <w:p>
+      <w:r>
+        <w:t>Ik ben dan gewoon terug begonnen aan het oude project en heb dan de error op stack overflow gezocht en daar had ik de oplossing gevonden. Ik moest gewoon mijn “device” zijn data wipen en dan kon het opnieuw installeren want mijn oude projecten stond er nog op.</w:t>
       </w:r>
     </w:p>
     <w:p>
@@ -1257,6 +826,17 @@
     <w:p>
       <w:r>
         <w:t>Vandaag wou de wifi niet werken op de campus dus had ik niet veel vooruitgang geboekt.</w:t>
+      </w:r>
+      <w:r>
+        <w:t xml:space="preserve"> Ik was ook gisteren vergeten om de registratie pagina te committen, dus da had ik alleszins gedaan door met mijn hotspot van mijn gsm te verbinden en de 4G aan te zetten.</w:t>
+      </w:r>
+    </w:p>
+    <w:p>
+      <w:r>
+        <w:t>Ik heb dan de link naar de registratie pagina toegevoegd onder de login button.</w:t>
+      </w:r>
+      <w:r>
+        <w:t xml:space="preserve"> Om ik anders niks te doen had heb ik ook nog de startpagina aangemaakt voor later.</w:t>
       </w:r>
     </w:p>
     <w:p/>

</xml_diff>

<commit_message>
Login page can now go to the registration page
</commit_message>
<xml_diff>
--- a/Logboek_Dries_Fierens.docx
+++ b/Logboek_Dries_Fierens.docx
@@ -46,7 +46,47 @@
         <w:t>applicatie</w:t>
       </w:r>
       <w:r>
-        <w:t xml:space="preserve"> die je kan maken en welke technologieën je kan gebruiken. Ik heb voor native gekozen want dat past het best bij mijn aftakking “Software developer” sinds het java inhoudt. De anderen zijn hybrid en progressive web app dat dus meer te maken hebben met web &amp; mobile dus vooral HTML &amp; CSS. We moesten dan ook nog kiezen voor een project idee, waarbij ik koos voor een scanner + pdf converter app</w:t>
+        <w:t xml:space="preserve"> die je kan maken en welke technologieën je kan gebruiken. Ik heb voor native gekozen want dat past het best bij mijn aftakking “Software </w:t>
+      </w:r>
+      <w:proofErr w:type="spellStart"/>
+      <w:r>
+        <w:t>developer</w:t>
+      </w:r>
+      <w:proofErr w:type="spellEnd"/>
+      <w:r>
+        <w:t xml:space="preserve">” sinds het </w:t>
+      </w:r>
+      <w:proofErr w:type="spellStart"/>
+      <w:r>
+        <w:t>java</w:t>
+      </w:r>
+      <w:proofErr w:type="spellEnd"/>
+      <w:r>
+        <w:t xml:space="preserve"> inhoudt. De anderen zijn </w:t>
+      </w:r>
+      <w:proofErr w:type="spellStart"/>
+      <w:r>
+        <w:t>hybrid</w:t>
+      </w:r>
+      <w:proofErr w:type="spellEnd"/>
+      <w:r>
+        <w:t xml:space="preserve"> en </w:t>
+      </w:r>
+      <w:proofErr w:type="spellStart"/>
+      <w:r>
+        <w:t>progressive</w:t>
+      </w:r>
+      <w:proofErr w:type="spellEnd"/>
+      <w:r>
+        <w:t xml:space="preserve"> web app dat dus meer te maken hebben met web &amp; mobile dus vooral HTML &amp; CSS. We moesten dan ook nog kiezen voor een project idee, waarbij ik koos voor een scanner + </w:t>
+      </w:r>
+      <w:proofErr w:type="gramStart"/>
+      <w:r>
+        <w:t>pdf converter</w:t>
+      </w:r>
+      <w:proofErr w:type="gramEnd"/>
+      <w:r>
+        <w:t xml:space="preserve"> app</w:t>
       </w:r>
       <w:r>
         <w:t xml:space="preserve"> waarbij het vooral bedoelt is o</w:t>
@@ -67,26 +107,106 @@
         <w:t>.</w:t>
       </w:r>
       <w:r>
-        <w:t xml:space="preserve"> Het was verplicht om 1 hardware component van de gsm te gebruiken dus koos ik natuurlijk voor de camera.</w:t>
+        <w:t xml:space="preserve"> Het was verplicht om 1 </w:t>
+      </w:r>
+      <w:proofErr w:type="gramStart"/>
+      <w:r>
+        <w:t>hardware component</w:t>
+      </w:r>
+      <w:proofErr w:type="gramEnd"/>
+      <w:r>
+        <w:t xml:space="preserve"> van de gsm te gebruiken dus koos ik natuurlijk voor de camera.</w:t>
       </w:r>
       <w:r>
         <w:t xml:space="preserve"> </w:t>
       </w:r>
       <w:r>
-        <w:t>Als back-end koos ik Firebase en als technologie koos ik in java te werken om een android app te maken in plaats van een IOS app.</w:t>
-      </w:r>
-      <w:r>
-        <w:t xml:space="preserve"> Want ik heb een huawei.</w:t>
-      </w:r>
-    </w:p>
-    <w:p>
-      <w:r>
-        <w:t>Ik heb dit allemaal grondiger beschreven in mijn “app idee”.pdf. Dit staat ondertussen op de repository die we moesten maken.</w:t>
-      </w:r>
-    </w:p>
-    <w:p>
-      <w:r>
-        <w:t>Om af te sluiten had ik al ondertussen een goede naam gevonden gebaseerd op de applicatie genaamd Scannable. Ik heb dus besloten om mijn applicatie Notable te noemen.</w:t>
+        <w:t xml:space="preserve">Als </w:t>
+      </w:r>
+      <w:proofErr w:type="spellStart"/>
+      <w:r>
+        <w:t>back-end</w:t>
+      </w:r>
+      <w:proofErr w:type="spellEnd"/>
+      <w:r>
+        <w:t xml:space="preserve"> koos ik </w:t>
+      </w:r>
+      <w:proofErr w:type="spellStart"/>
+      <w:r>
+        <w:t>Firebase</w:t>
+      </w:r>
+      <w:proofErr w:type="spellEnd"/>
+      <w:r>
+        <w:t xml:space="preserve"> en als technologie koos ik in </w:t>
+      </w:r>
+      <w:proofErr w:type="spellStart"/>
+      <w:r>
+        <w:t>java</w:t>
+      </w:r>
+      <w:proofErr w:type="spellEnd"/>
+      <w:r>
+        <w:t xml:space="preserve"> te werken om een </w:t>
+      </w:r>
+      <w:proofErr w:type="spellStart"/>
+      <w:r>
+        <w:t>android</w:t>
+      </w:r>
+      <w:proofErr w:type="spellEnd"/>
+      <w:r>
+        <w:t xml:space="preserve"> app te maken in plaats van een IOS app.</w:t>
+      </w:r>
+      <w:r>
+        <w:t xml:space="preserve"> Want ik heb een </w:t>
+      </w:r>
+      <w:proofErr w:type="spellStart"/>
+      <w:r>
+        <w:t>huawei</w:t>
+      </w:r>
+      <w:proofErr w:type="spellEnd"/>
+      <w:r>
+        <w:t>.</w:t>
+      </w:r>
+    </w:p>
+    <w:p>
+      <w:r>
+        <w:t xml:space="preserve">Ik heb dit allemaal grondiger beschreven in mijn “app </w:t>
+      </w:r>
+      <w:proofErr w:type="spellStart"/>
+      <w:r>
+        <w:t>idee”.pdf</w:t>
+      </w:r>
+      <w:proofErr w:type="spellEnd"/>
+      <w:r>
+        <w:t xml:space="preserve">. Dit staat ondertussen op de </w:t>
+      </w:r>
+      <w:proofErr w:type="spellStart"/>
+      <w:r>
+        <w:t>repository</w:t>
+      </w:r>
+      <w:proofErr w:type="spellEnd"/>
+      <w:r>
+        <w:t xml:space="preserve"> die we moesten maken.</w:t>
+      </w:r>
+    </w:p>
+    <w:p>
+      <w:r>
+        <w:t xml:space="preserve">Om af te sluiten had ik al ondertussen een goede naam gevonden gebaseerd op de applicatie genaamd </w:t>
+      </w:r>
+      <w:proofErr w:type="spellStart"/>
+      <w:r>
+        <w:t>Scannable</w:t>
+      </w:r>
+      <w:proofErr w:type="spellEnd"/>
+      <w:r>
+        <w:t xml:space="preserve">. Ik heb dus besloten om mijn applicatie </w:t>
+      </w:r>
+      <w:proofErr w:type="spellStart"/>
+      <w:r>
+        <w:t>Notable</w:t>
+      </w:r>
+      <w:proofErr w:type="spellEnd"/>
+      <w:r>
+        <w:t xml:space="preserve"> te noemen.</w:t>
       </w:r>
     </w:p>
     <w:p>
@@ -109,7 +229,15 @@
         <w:t xml:space="preserve">Mijn app idee werd niet goedgekeurd, want de leerkracht raadde het af door problemen die ervan kunnen komen. Ik moest dan vandaag een nieuw idee opstellen. </w:t>
       </w:r>
       <w:r>
-        <w:t>De scanner + pdf converter was duidelijk te moeilijk, maar ik besloot om het idee verder te zetten van een app die notities kan delen. Dus nu moet het gewoon foto’s trekken van de notities. Om nog toe te voegen kan ik ook opmerkingswolkjes toevoegen aan de foto voor bijvoorbeeld een fout</w:t>
+        <w:t xml:space="preserve">De scanner + </w:t>
+      </w:r>
+      <w:proofErr w:type="gramStart"/>
+      <w:r>
+        <w:t>pdf converter</w:t>
+      </w:r>
+      <w:proofErr w:type="gramEnd"/>
+      <w:r>
+        <w:t xml:space="preserve"> was duidelijk te moeilijk, maar ik besloot om het idee verder te zetten van een app die notities kan delen. Dus nu moet het gewoon foto’s trekken van de notities. Om nog toe te voegen kan ik ook opmerkingswolkjes toevoegen aan de foto voor bijvoorbeeld een fout</w:t>
       </w:r>
       <w:r>
         <w:t xml:space="preserve"> aan te duiden</w:t>
@@ -120,7 +248,15 @@
     </w:p>
     <w:p>
       <w:r>
-        <w:t xml:space="preserve">Daarna moest ik gewoon begin aan een UI/UX design voor mijn applicatie, waarbij nog niet veel had gedaan omdat les niet meer lang duurde. Ik moest toen ook tegelijkertijd zoeken naar tutorials dus </w:t>
+        <w:t xml:space="preserve">Daarna moest ik gewoon begin aan een UI/UX design voor mijn applicatie, waarbij nog niet veel had gedaan omdat les niet meer lang duurde. Ik moest toen ook tegelijkertijd zoeken naar </w:t>
+      </w:r>
+      <w:proofErr w:type="spellStart"/>
+      <w:r>
+        <w:t>tutorials</w:t>
+      </w:r>
+      <w:proofErr w:type="spellEnd"/>
+      <w:r>
+        <w:t xml:space="preserve"> dus </w:t>
       </w:r>
       <w:r>
         <w:t>duurde dat ook kort.</w:t>
@@ -143,13 +279,26 @@
     </w:p>
     <w:p>
       <w:r>
-        <w:t xml:space="preserve">Vandaag in de namiddag begonnen we met de co-working les waarbij we dus informatie kunnen delen met medeleerlingen. Al was het de eerste les dus kwam daar niet veel van. Ik begon gewoon verder aan mijn </w:t>
-      </w:r>
+        <w:t>Vandaag in de namiddag begonnen we met de co-</w:t>
+      </w:r>
+      <w:proofErr w:type="spellStart"/>
+      <w:r>
+        <w:t>working</w:t>
+      </w:r>
+      <w:proofErr w:type="spellEnd"/>
+      <w:r>
+        <w:t xml:space="preserve"> les waarbij we dus informatie kunnen delen met medeleerlingen. Al was het de eerste les dus kwam daar niet veel van. Ik begon gewoon verder aan mijn </w:t>
+      </w:r>
+      <w:proofErr w:type="spellStart"/>
       <w:r>
         <w:t>F</w:t>
       </w:r>
       <w:r>
-        <w:t>igma design.</w:t>
+        <w:t>igma</w:t>
+      </w:r>
+      <w:proofErr w:type="spellEnd"/>
+      <w:r>
+        <w:t xml:space="preserve"> design.</w:t>
       </w:r>
     </w:p>
     <w:p>
@@ -160,7 +309,15 @@
         <w:t>te veel</w:t>
       </w:r>
       <w:r>
-        <w:t xml:space="preserve"> naar voor moest leunen en dus nek pijn kreeg en er waren precies geen ramen om te openen. </w:t>
+        <w:t xml:space="preserve"> naar voor moest leunen en dus </w:t>
+      </w:r>
+      <w:proofErr w:type="gramStart"/>
+      <w:r>
+        <w:t>nek pijn</w:t>
+      </w:r>
+      <w:proofErr w:type="gramEnd"/>
+      <w:r>
+        <w:t xml:space="preserve"> kreeg en er waren precies geen ramen om te openen. </w:t>
       </w:r>
       <w:r>
         <w:t>Gelukkig kunnen we naar buiten wanneer we het willen.</w:t>
@@ -200,7 +357,23 @@
     </w:p>
     <w:p>
       <w:r>
-        <w:t>Vandaag heb ik verder gewerkt aan mijn Figma design en het ging redelijk vlot vooruit. Ik wou absoluut dat het vandaag af was zodat ik morgen kan werken aan een ander vak. Tijdens het maken van het design heb ik vooral ook zitten op zoeken dat sommige concepten wel haalbaar zijn om te programmeren. Dit is allemaal wel mogelijk, maar zal wel een challenge zijn zoals de opmerkingen plaatsen</w:t>
+        <w:t xml:space="preserve">Vandaag heb ik verder gewerkt aan mijn </w:t>
+      </w:r>
+      <w:proofErr w:type="spellStart"/>
+      <w:r>
+        <w:t>Figma</w:t>
+      </w:r>
+      <w:proofErr w:type="spellEnd"/>
+      <w:r>
+        <w:t xml:space="preserve"> design en het ging redelijk vlot vooruit. Ik wou absoluut dat het vandaag af was zodat ik morgen kan werken aan een ander vak. Tijdens het maken van het design heb ik vooral ook zitten op zoeken dat sommige concepten wel haalbaar zijn om te programmeren. Dit is allemaal wel mogelijk, maar zal wel een </w:t>
+      </w:r>
+      <w:proofErr w:type="spellStart"/>
+      <w:r>
+        <w:t>challenge</w:t>
+      </w:r>
+      <w:proofErr w:type="spellEnd"/>
+      <w:r>
+        <w:t xml:space="preserve"> zijn zoals de opmerkingen plaatsen</w:t>
       </w:r>
       <w:r>
         <w:t>. M</w:t>
@@ -312,11 +485,48 @@
     </w:p>
     <w:p>
       <w:r>
-        <w:t xml:space="preserve">Vandaag werd mijn figma prototype gecontroleerd waarbij ik moest opnieuw uitleggen wat mijn app doet door middel van accurate presentatie. Ik legde dit vrij duidelijk uit en alles ging goed vooruit. Meneer Blancquaert heeft me dan ook nog een library genaamd “Material design” aangeraden om mijn applicatie te ontwerpen. </w:t>
-      </w:r>
-      <w:r>
-        <w:t>Blijkbaar Google gebruikt deze library</w:t>
-      </w:r>
+        <w:t xml:space="preserve">Vandaag werd mijn </w:t>
+      </w:r>
+      <w:proofErr w:type="spellStart"/>
+      <w:r>
+        <w:t>figma</w:t>
+      </w:r>
+      <w:proofErr w:type="spellEnd"/>
+      <w:r>
+        <w:t xml:space="preserve"> prototype gecontroleerd waarbij ik moest opnieuw uitleggen wat mijn app doet door middel van accurate presentatie. Ik legde dit vrij duidelijk uit en alles ging goed vooruit. Meneer </w:t>
+      </w:r>
+      <w:proofErr w:type="spellStart"/>
+      <w:r>
+        <w:t>Blancquaert</w:t>
+      </w:r>
+      <w:proofErr w:type="spellEnd"/>
+      <w:r>
+        <w:t xml:space="preserve"> heeft me dan ook nog een </w:t>
+      </w:r>
+      <w:proofErr w:type="spellStart"/>
+      <w:r>
+        <w:t>library</w:t>
+      </w:r>
+      <w:proofErr w:type="spellEnd"/>
+      <w:r>
+        <w:t xml:space="preserve"> genaamd “</w:t>
+      </w:r>
+      <w:proofErr w:type="spellStart"/>
+      <w:r>
+        <w:t>Material</w:t>
+      </w:r>
+      <w:proofErr w:type="spellEnd"/>
+      <w:r>
+        <w:t xml:space="preserve"> design” aangeraden om mijn applicatie te ontwerpen. </w:t>
+      </w:r>
+      <w:r>
+        <w:t xml:space="preserve">Blijkbaar Google gebruikt deze </w:t>
+      </w:r>
+      <w:proofErr w:type="spellStart"/>
+      <w:r>
+        <w:t>library</w:t>
+      </w:r>
+      <w:proofErr w:type="spellEnd"/>
       <w:r>
         <w:t xml:space="preserve"> om hun apps te maken.</w:t>
       </w:r>
@@ -354,7 +564,23 @@
         <w:t xml:space="preserve">kunt maken </w:t>
       </w:r>
       <w:r>
-        <w:t>om je app te testen. Als je developer modus in de settings van je gsm</w:t>
+        <w:t xml:space="preserve">om je app te testen. Als je </w:t>
+      </w:r>
+      <w:proofErr w:type="spellStart"/>
+      <w:r>
+        <w:t>developer</w:t>
+      </w:r>
+      <w:proofErr w:type="spellEnd"/>
+      <w:r>
+        <w:t xml:space="preserve"> modus in de </w:t>
+      </w:r>
+      <w:proofErr w:type="spellStart"/>
+      <w:r>
+        <w:t>settings</w:t>
+      </w:r>
+      <w:proofErr w:type="spellEnd"/>
+      <w:r>
+        <w:t xml:space="preserve"> van je gsm</w:t>
       </w:r>
       <w:r>
         <w:t xml:space="preserve"> aanzet, kan je je gsm verbinden met de pc en dus je applicatie daarop testen.</w:t>
@@ -372,7 +598,23 @@
     </w:p>
     <w:p>
       <w:r>
-        <w:t>Tijdens lange downloads heb ik ook mijn google account toegevoegd op Firebase. Volgens de presentatie die we kregen van een medestudent.</w:t>
+        <w:t xml:space="preserve">Tijdens lange downloads heb ik ook mijn </w:t>
+      </w:r>
+      <w:proofErr w:type="gramStart"/>
+      <w:r>
+        <w:t>google account</w:t>
+      </w:r>
+      <w:proofErr w:type="gramEnd"/>
+      <w:r>
+        <w:t xml:space="preserve"> toegevoegd op </w:t>
+      </w:r>
+      <w:proofErr w:type="spellStart"/>
+      <w:r>
+        <w:t>Firebase</w:t>
+      </w:r>
+      <w:proofErr w:type="spellEnd"/>
+      <w:r>
+        <w:t>. Volgens de presentatie die we kregen van een medestudent.</w:t>
       </w:r>
     </w:p>
     <w:p>
@@ -423,7 +665,23 @@
         <w:t>mijn</w:t>
       </w:r>
       <w:r>
-        <w:t xml:space="preserve"> figma design delen met meneer Blancquaert, toen hij vroeg dat mijn design klaar was</w:t>
+        <w:t xml:space="preserve"> </w:t>
+      </w:r>
+      <w:proofErr w:type="spellStart"/>
+      <w:r>
+        <w:t>figma</w:t>
+      </w:r>
+      <w:proofErr w:type="spellEnd"/>
+      <w:r>
+        <w:t xml:space="preserve"> design delen met meneer </w:t>
+      </w:r>
+      <w:proofErr w:type="spellStart"/>
+      <w:r>
+        <w:t>Blancquaert</w:t>
+      </w:r>
+      <w:proofErr w:type="spellEnd"/>
+      <w:r>
+        <w:t>, toen hij vroeg dat mijn design klaar was</w:t>
       </w:r>
       <w:r>
         <w:t xml:space="preserve"> of niet</w:t>
@@ -437,14 +695,54 @@
         <w:t>Ik heb daarna gewoon verder begonnen aan de tutorial die ik vorige week gebruikt had.</w:t>
       </w:r>
       <w:r>
-        <w:t xml:space="preserve"> Hierbij leerde ik meer over hoe ik Android studio beter kon gebruiken om mijn app te designen zoals hoe je </w:t>
+        <w:t xml:space="preserve"> Hierbij leerde ik meer over hoe ik </w:t>
+      </w:r>
+      <w:proofErr w:type="gramStart"/>
+      <w:r>
+        <w:t>Android studio</w:t>
+      </w:r>
+      <w:proofErr w:type="gramEnd"/>
+      <w:r>
+        <w:t xml:space="preserve"> beter kon gebruiken om mijn app te </w:t>
+      </w:r>
+      <w:proofErr w:type="spellStart"/>
+      <w:r>
+        <w:t>designen</w:t>
+      </w:r>
+      <w:proofErr w:type="spellEnd"/>
+      <w:r>
+        <w:t xml:space="preserve"> zoals hoe je </w:t>
       </w:r>
       <w:r>
         <w:lastRenderedPageBreak/>
-        <w:t>attributen kunt aanpassen (bv. color)</w:t>
-      </w:r>
-      <w:r>
-        <w:t xml:space="preserve">. Android studio is zeer gelijkaardig als bijvoorbeeld Webstorm, maar bij het design van een mobile app is het zeer </w:t>
+        <w:t xml:space="preserve">attributen kunt aanpassen (bv. </w:t>
+      </w:r>
+      <w:proofErr w:type="spellStart"/>
+      <w:r>
+        <w:t>color</w:t>
+      </w:r>
+      <w:proofErr w:type="spellEnd"/>
+      <w:r>
+        <w:t>)</w:t>
+      </w:r>
+      <w:r>
+        <w:t xml:space="preserve">. </w:t>
+      </w:r>
+      <w:proofErr w:type="gramStart"/>
+      <w:r>
+        <w:t>Android studio</w:t>
+      </w:r>
+      <w:proofErr w:type="gramEnd"/>
+      <w:r>
+        <w:t xml:space="preserve"> is zeer gelijkaardig als bijvoorbeeld </w:t>
+      </w:r>
+      <w:proofErr w:type="spellStart"/>
+      <w:r>
+        <w:t>Webstorm</w:t>
+      </w:r>
+      <w:proofErr w:type="spellEnd"/>
+      <w:r>
+        <w:t xml:space="preserve">, maar bij het design van een mobile app is het zeer </w:t>
       </w:r>
       <w:r>
         <w:t>verschillend</w:t>
@@ -453,14 +751,27 @@
         <w:t>.</w:t>
       </w:r>
       <w:r>
-        <w:t xml:space="preserve"> Bij Webstorm kan je je website </w:t>
+        <w:t xml:space="preserve"> Bij </w:t>
+      </w:r>
+      <w:proofErr w:type="spellStart"/>
+      <w:r>
+        <w:t>Webstorm</w:t>
+      </w:r>
+      <w:proofErr w:type="spellEnd"/>
+      <w:r>
+        <w:t xml:space="preserve"> kan je je website </w:t>
       </w:r>
       <w:r>
         <w:t>bekijken</w:t>
       </w:r>
       <w:r>
-        <w:t xml:space="preserve"> in een gekozen browser, maar je kan in Android studio</w:t>
-      </w:r>
+        <w:t xml:space="preserve"> in een gekozen browser, maar je kan in </w:t>
+      </w:r>
+      <w:proofErr w:type="gramStart"/>
+      <w:r>
+        <w:t>Android studio</w:t>
+      </w:r>
+      <w:proofErr w:type="gramEnd"/>
       <w:r>
         <w:t xml:space="preserve"> je app</w:t>
       </w:r>
@@ -480,7 +791,15 @@
         <w:t>.</w:t>
       </w:r>
       <w:r>
-        <w:t xml:space="preserve"> Als ik de Jetbrains applicaties vergelijk met Visual studio 2019, </w:t>
+        <w:t xml:space="preserve"> Als ik de </w:t>
+      </w:r>
+      <w:proofErr w:type="spellStart"/>
+      <w:r>
+        <w:t>Jetbrains</w:t>
+      </w:r>
+      <w:proofErr w:type="spellEnd"/>
+      <w:r>
+        <w:t xml:space="preserve"> applicaties vergelijk met Visual studio 2019, </w:t>
       </w:r>
       <w:r>
         <w:t>heb ik er altijd moeite mee om de lay</w:t>
@@ -560,7 +879,23 @@
     </w:p>
     <w:p>
       <w:r>
-        <w:t>Ik heb dan ondertussen de tutorial van Material design gevolgd in plaats van die van Android studio. Ze leerde me dan hoe ik er mee kon werken maar niet hoe een hele nieuwe app kon maken. Ik kreeg een voorbeeld app om erin te kunnen werken voor de tutorial.</w:t>
+        <w:t xml:space="preserve">Ik heb dan ondertussen de tutorial van </w:t>
+      </w:r>
+      <w:proofErr w:type="spellStart"/>
+      <w:r>
+        <w:t>Material</w:t>
+      </w:r>
+      <w:proofErr w:type="spellEnd"/>
+      <w:r>
+        <w:t xml:space="preserve"> design gevolgd in plaats van die van </w:t>
+      </w:r>
+      <w:proofErr w:type="gramStart"/>
+      <w:r>
+        <w:t>Android studio</w:t>
+      </w:r>
+      <w:proofErr w:type="gramEnd"/>
+      <w:r>
+        <w:t>. Ze leerde me dan hoe ik er mee kon werken maar niet hoe een hele nieuwe app kon maken. Ik kreeg een voorbeeld app om erin te kunnen werken voor de tutorial.</w:t>
       </w:r>
     </w:p>
     <w:p>
@@ -603,10 +938,34 @@
     </w:p>
     <w:p>
       <w:r>
-        <w:t>Vandaag heb ik de usertests afgelegd met Louis D’hondt en Jasper Wauters. Dit ging heel gemakkelijk en duurde niet lang. Ik had niet echt serieuze opmerkingen, behalve dat ik geen persoonlijke info pagina gemaakt had.</w:t>
-      </w:r>
-      <w:r>
-        <w:t xml:space="preserve"> Daarna heb ik onmiddellijk die opmerkingen van mijn figma design verbetert en op mijn repository gezet.</w:t>
+        <w:t xml:space="preserve">Vandaag heb ik de usertests afgelegd met Louis </w:t>
+      </w:r>
+      <w:proofErr w:type="spellStart"/>
+      <w:r>
+        <w:t>D’hondt</w:t>
+      </w:r>
+      <w:proofErr w:type="spellEnd"/>
+      <w:r>
+        <w:t xml:space="preserve"> en Jasper Wauters. Dit ging heel gemakkelijk en duurde niet lang. Ik had niet echt serieuze opmerkingen, behalve dat ik geen persoonlijke info pagina gemaakt had.</w:t>
+      </w:r>
+      <w:r>
+        <w:t xml:space="preserve"> Daarna heb ik onmiddellijk die opmerkingen van mijn </w:t>
+      </w:r>
+      <w:proofErr w:type="spellStart"/>
+      <w:r>
+        <w:t>figma</w:t>
+      </w:r>
+      <w:proofErr w:type="spellEnd"/>
+      <w:r>
+        <w:t xml:space="preserve"> design verbetert en op mijn </w:t>
+      </w:r>
+      <w:proofErr w:type="spellStart"/>
+      <w:r>
+        <w:t>repository</w:t>
+      </w:r>
+      <w:proofErr w:type="spellEnd"/>
+      <w:r>
+        <w:t xml:space="preserve"> gezet.</w:t>
       </w:r>
     </w:p>
     <w:p/>
@@ -629,7 +988,47 @@
     </w:p>
     <w:p>
       <w:r>
-        <w:t xml:space="preserve">Vandaag begon ik eindelijk met Material Design. Ik besloot mijn oude app te verwijderen en te vervangen met een empty activity zodat ik echt van scratch begin. Zo kan ik alles beter begrijpen. Ik had dan ontdekt dat android studio al automatisch Material Design van Google had toegevoegd bij de dependencies, dus eigenlijk ben ik </w:t>
+        <w:t xml:space="preserve">Vandaag begon ik eindelijk met </w:t>
+      </w:r>
+      <w:proofErr w:type="spellStart"/>
+      <w:r>
+        <w:t>Material</w:t>
+      </w:r>
+      <w:proofErr w:type="spellEnd"/>
+      <w:r>
+        <w:t xml:space="preserve"> Design. Ik besloot mijn oude app te verwijderen en te vervangen met een empty </w:t>
+      </w:r>
+      <w:proofErr w:type="spellStart"/>
+      <w:r>
+        <w:t>activity</w:t>
+      </w:r>
+      <w:proofErr w:type="spellEnd"/>
+      <w:r>
+        <w:t xml:space="preserve"> zodat ik echt van scratch begin. Zo kan ik alles beter begrijpen. Ik had dan ontdekt dat </w:t>
+      </w:r>
+      <w:proofErr w:type="spellStart"/>
+      <w:r>
+        <w:t>android</w:t>
+      </w:r>
+      <w:proofErr w:type="spellEnd"/>
+      <w:r>
+        <w:t xml:space="preserve"> studio al automatisch </w:t>
+      </w:r>
+      <w:proofErr w:type="spellStart"/>
+      <w:r>
+        <w:t>Material</w:t>
+      </w:r>
+      <w:proofErr w:type="spellEnd"/>
+      <w:r>
+        <w:t xml:space="preserve"> Design van Google had toegevoegd bij de </w:t>
+      </w:r>
+      <w:proofErr w:type="spellStart"/>
+      <w:r>
+        <w:t>dependencies</w:t>
+      </w:r>
+      <w:proofErr w:type="spellEnd"/>
+      <w:r>
+        <w:t xml:space="preserve">, dus eigenlijk ben ik </w:t>
       </w:r>
       <w:r>
         <w:t>onmiddellijk</w:t>
@@ -773,18 +1172,50 @@
     </w:p>
     <w:p>
       <w:r>
-        <w:t>Eerst had ik geprobeerd om gewoon een heel nieuw project te maken die bestond uit een login activity. Deze activity heb ik dan gewoon aangepast naar mijn wens. Maar dit wou ook niet echt werken, want blijkbaar is het best dat je van een main</w:t>
+        <w:t xml:space="preserve">Eerst had ik geprobeerd om gewoon een heel nieuw project te maken die bestond uit een login </w:t>
+      </w:r>
+      <w:proofErr w:type="spellStart"/>
+      <w:r>
+        <w:t>activity</w:t>
+      </w:r>
+      <w:proofErr w:type="spellEnd"/>
+      <w:r>
+        <w:t xml:space="preserve">. Deze </w:t>
+      </w:r>
+      <w:proofErr w:type="spellStart"/>
+      <w:r>
+        <w:t>activity</w:t>
+      </w:r>
+      <w:proofErr w:type="spellEnd"/>
+      <w:r>
+        <w:t xml:space="preserve"> heb ik dan gewoon aangepast naar mijn wens. Maar dit wou ook niet echt werken, want blijkbaar is het best dat je van een </w:t>
+      </w:r>
+      <w:proofErr w:type="spellStart"/>
+      <w:r>
+        <w:t>main</w:t>
       </w:r>
       <w:r>
         <w:t>_</w:t>
       </w:r>
       <w:r>
-        <w:t>activity start en dan de login page daarmee opent.</w:t>
-      </w:r>
-    </w:p>
-    <w:p>
-      <w:r>
-        <w:t>Ik ben dan gewoon terug begonnen aan het oude project en heb dan de error op stack overflow gezocht en daar had ik de oplossing gevonden. Ik moest gewoon mijn “device” zijn data wipen en dan kon het opnieuw installeren want mijn oude projecten stond er nog op.</w:t>
+        <w:t>activity</w:t>
+      </w:r>
+      <w:proofErr w:type="spellEnd"/>
+      <w:r>
+        <w:t xml:space="preserve"> start en dan de login page daarmee opent.</w:t>
+      </w:r>
+    </w:p>
+    <w:p>
+      <w:r>
+        <w:t xml:space="preserve">Ik ben dan gewoon terug begonnen aan het oude project en heb dan de error op stack overflow gezocht en daar had ik de oplossing gevonden. Ik moest gewoon mijn “device” zijn data </w:t>
+      </w:r>
+      <w:proofErr w:type="spellStart"/>
+      <w:r>
+        <w:t>wipen</w:t>
+      </w:r>
+      <w:proofErr w:type="spellEnd"/>
+      <w:r>
+        <w:t xml:space="preserve"> en dan kon het opnieuw installeren want mijn oude projecten stond er nog op.</w:t>
       </w:r>
     </w:p>
     <w:p>
@@ -828,7 +1259,23 @@
         <w:t>Vandaag wou de wifi niet werken op de campus dus had ik niet veel vooruitgang geboekt.</w:t>
       </w:r>
       <w:r>
-        <w:t xml:space="preserve"> Ik was ook gisteren vergeten om de registratie pagina te committen, dus da had ik alleszins gedaan door met mijn hotspot van mijn gsm te verbinden en de 4G aan te zetten.</w:t>
+        <w:t xml:space="preserve"> Ik was ook gisteren vergeten om de registratie pagina te </w:t>
+      </w:r>
+      <w:proofErr w:type="spellStart"/>
+      <w:r>
+        <w:t>committen</w:t>
+      </w:r>
+      <w:proofErr w:type="spellEnd"/>
+      <w:r>
+        <w:t xml:space="preserve">, dus da had ik alleszins gedaan door met mijn </w:t>
+      </w:r>
+      <w:proofErr w:type="spellStart"/>
+      <w:r>
+        <w:t>hotspot</w:t>
+      </w:r>
+      <w:proofErr w:type="spellEnd"/>
+      <w:r>
+        <w:t xml:space="preserve"> van mijn gsm te verbinden en de 4G aan te zetten.</w:t>
       </w:r>
     </w:p>
     <w:p>
@@ -837,6 +1284,46 @@
       </w:r>
       <w:r>
         <w:t xml:space="preserve"> Om ik anders niks te doen had heb ik ook nog de startpagina aangemaakt voor later.</w:t>
+      </w:r>
+    </w:p>
+    <w:p/>
+    <w:p>
+      <w:pPr>
+        <w:rPr>
+          <w:b/>
+          <w:bCs/>
+        </w:rPr>
+      </w:pPr>
+      <w:r>
+        <w:rPr>
+          <w:b/>
+          <w:bCs/>
+        </w:rPr>
+        <w:t>13/10/2021:</w:t>
+      </w:r>
+    </w:p>
+    <w:p>
+      <w:r>
+        <w:t>Vandaag wou de wifi op school nog steeds niet zo goed werken</w:t>
+      </w:r>
+      <w:r>
+        <w:t xml:space="preserve">, maar dankzij de wifi </w:t>
+      </w:r>
+      <w:proofErr w:type="spellStart"/>
+      <w:r>
+        <w:t>hotspot</w:t>
+      </w:r>
+      <w:proofErr w:type="spellEnd"/>
+      <w:r>
+        <w:t xml:space="preserve"> heb ik toch nog de navigatie van login naar registratie kunnen </w:t>
+      </w:r>
+      <w:proofErr w:type="spellStart"/>
+      <w:r>
+        <w:t>commiten</w:t>
+      </w:r>
+      <w:proofErr w:type="spellEnd"/>
+      <w:r>
+        <w:t>.</w:t>
       </w:r>
     </w:p>
     <w:p/>

</xml_diff>

<commit_message>
Trying to fix bottom bar and updated my logboek
</commit_message>
<xml_diff>
--- a/Logboek_Dries_Fierens.docx
+++ b/Logboek_Dries_Fierens.docx
@@ -46,47 +46,7 @@
         <w:t>applicatie</w:t>
       </w:r>
       <w:r>
-        <w:t xml:space="preserve"> die je kan maken en welke technologieën je kan gebruiken. Ik heb voor native gekozen want dat past het best bij mijn aftakking “Software </w:t>
-      </w:r>
-      <w:proofErr w:type="spellStart"/>
-      <w:r>
-        <w:t>developer</w:t>
-      </w:r>
-      <w:proofErr w:type="spellEnd"/>
-      <w:r>
-        <w:t xml:space="preserve">” sinds het </w:t>
-      </w:r>
-      <w:proofErr w:type="spellStart"/>
-      <w:r>
-        <w:t>java</w:t>
-      </w:r>
-      <w:proofErr w:type="spellEnd"/>
-      <w:r>
-        <w:t xml:space="preserve"> inhoudt. De anderen zijn </w:t>
-      </w:r>
-      <w:proofErr w:type="spellStart"/>
-      <w:r>
-        <w:t>hybrid</w:t>
-      </w:r>
-      <w:proofErr w:type="spellEnd"/>
-      <w:r>
-        <w:t xml:space="preserve"> en </w:t>
-      </w:r>
-      <w:proofErr w:type="spellStart"/>
-      <w:r>
-        <w:t>progressive</w:t>
-      </w:r>
-      <w:proofErr w:type="spellEnd"/>
-      <w:r>
-        <w:t xml:space="preserve"> web app dat dus meer te maken hebben met web &amp; mobile dus vooral HTML &amp; CSS. We moesten dan ook nog kiezen voor een project idee, waarbij ik koos voor een scanner + </w:t>
-      </w:r>
-      <w:proofErr w:type="gramStart"/>
-      <w:r>
-        <w:t>pdf converter</w:t>
-      </w:r>
-      <w:proofErr w:type="gramEnd"/>
-      <w:r>
-        <w:t xml:space="preserve"> app</w:t>
+        <w:t xml:space="preserve"> die je kan maken en welke technologieën je kan gebruiken. Ik heb voor native gekozen want dat past het best bij mijn aftakking “Software developer” sinds het java inhoudt. De anderen zijn hybrid en progressive web app dat dus meer te maken hebben met web &amp; mobile dus vooral HTML &amp; CSS. We moesten dan ook nog kiezen voor een project idee, waarbij ik koos voor een scanner + pdf converter app</w:t>
       </w:r>
       <w:r>
         <w:t xml:space="preserve"> waarbij het vooral bedoelt is o</w:t>
@@ -107,106 +67,26 @@
         <w:t>.</w:t>
       </w:r>
       <w:r>
-        <w:t xml:space="preserve"> Het was verplicht om 1 </w:t>
-      </w:r>
-      <w:proofErr w:type="gramStart"/>
-      <w:r>
-        <w:t>hardware component</w:t>
-      </w:r>
-      <w:proofErr w:type="gramEnd"/>
-      <w:r>
-        <w:t xml:space="preserve"> van de gsm te gebruiken dus koos ik natuurlijk voor de camera.</w:t>
+        <w:t xml:space="preserve"> Het was verplicht om 1 hardware component van de gsm te gebruiken dus koos ik natuurlijk voor de camera.</w:t>
       </w:r>
       <w:r>
         <w:t xml:space="preserve"> </w:t>
       </w:r>
       <w:r>
-        <w:t xml:space="preserve">Als </w:t>
-      </w:r>
-      <w:proofErr w:type="spellStart"/>
-      <w:r>
-        <w:t>back-end</w:t>
-      </w:r>
-      <w:proofErr w:type="spellEnd"/>
-      <w:r>
-        <w:t xml:space="preserve"> koos ik </w:t>
-      </w:r>
-      <w:proofErr w:type="spellStart"/>
-      <w:r>
-        <w:t>Firebase</w:t>
-      </w:r>
-      <w:proofErr w:type="spellEnd"/>
-      <w:r>
-        <w:t xml:space="preserve"> en als technologie koos ik in </w:t>
-      </w:r>
-      <w:proofErr w:type="spellStart"/>
-      <w:r>
-        <w:t>java</w:t>
-      </w:r>
-      <w:proofErr w:type="spellEnd"/>
-      <w:r>
-        <w:t xml:space="preserve"> te werken om een </w:t>
-      </w:r>
-      <w:proofErr w:type="spellStart"/>
-      <w:r>
-        <w:t>android</w:t>
-      </w:r>
-      <w:proofErr w:type="spellEnd"/>
-      <w:r>
-        <w:t xml:space="preserve"> app te maken in plaats van een IOS app.</w:t>
-      </w:r>
-      <w:r>
-        <w:t xml:space="preserve"> Want ik heb een </w:t>
-      </w:r>
-      <w:proofErr w:type="spellStart"/>
-      <w:r>
-        <w:t>huawei</w:t>
-      </w:r>
-      <w:proofErr w:type="spellEnd"/>
-      <w:r>
-        <w:t>.</w:t>
-      </w:r>
-    </w:p>
-    <w:p>
-      <w:r>
-        <w:t xml:space="preserve">Ik heb dit allemaal grondiger beschreven in mijn “app </w:t>
-      </w:r>
-      <w:proofErr w:type="spellStart"/>
-      <w:r>
-        <w:t>idee”.pdf</w:t>
-      </w:r>
-      <w:proofErr w:type="spellEnd"/>
-      <w:r>
-        <w:t xml:space="preserve">. Dit staat ondertussen op de </w:t>
-      </w:r>
-      <w:proofErr w:type="spellStart"/>
-      <w:r>
-        <w:t>repository</w:t>
-      </w:r>
-      <w:proofErr w:type="spellEnd"/>
-      <w:r>
-        <w:t xml:space="preserve"> die we moesten maken.</w:t>
-      </w:r>
-    </w:p>
-    <w:p>
-      <w:r>
-        <w:t xml:space="preserve">Om af te sluiten had ik al ondertussen een goede naam gevonden gebaseerd op de applicatie genaamd </w:t>
-      </w:r>
-      <w:proofErr w:type="spellStart"/>
-      <w:r>
-        <w:t>Scannable</w:t>
-      </w:r>
-      <w:proofErr w:type="spellEnd"/>
-      <w:r>
-        <w:t xml:space="preserve">. Ik heb dus besloten om mijn applicatie </w:t>
-      </w:r>
-      <w:proofErr w:type="spellStart"/>
-      <w:r>
-        <w:t>Notable</w:t>
-      </w:r>
-      <w:proofErr w:type="spellEnd"/>
-      <w:r>
-        <w:t xml:space="preserve"> te noemen.</w:t>
+        <w:t>Als back-end koos ik Firebase en als technologie koos ik in java te werken om een android app te maken in plaats van een IOS app.</w:t>
+      </w:r>
+      <w:r>
+        <w:t xml:space="preserve"> Want ik heb een huawei.</w:t>
+      </w:r>
+    </w:p>
+    <w:p>
+      <w:r>
+        <w:t>Ik heb dit allemaal grondiger beschreven in mijn “app idee”.pdf. Dit staat ondertussen op de repository die we moesten maken.</w:t>
+      </w:r>
+    </w:p>
+    <w:p>
+      <w:r>
+        <w:t>Om af te sluiten had ik al ondertussen een goede naam gevonden gebaseerd op de applicatie genaamd Scannable. Ik heb dus besloten om mijn applicatie Notable te noemen.</w:t>
       </w:r>
     </w:p>
     <w:p>
@@ -229,15 +109,7 @@
         <w:t xml:space="preserve">Mijn app idee werd niet goedgekeurd, want de leerkracht raadde het af door problemen die ervan kunnen komen. Ik moest dan vandaag een nieuw idee opstellen. </w:t>
       </w:r>
       <w:r>
-        <w:t xml:space="preserve">De scanner + </w:t>
-      </w:r>
-      <w:proofErr w:type="gramStart"/>
-      <w:r>
-        <w:t>pdf converter</w:t>
-      </w:r>
-      <w:proofErr w:type="gramEnd"/>
-      <w:r>
-        <w:t xml:space="preserve"> was duidelijk te moeilijk, maar ik besloot om het idee verder te zetten van een app die notities kan delen. Dus nu moet het gewoon foto’s trekken van de notities. Om nog toe te voegen kan ik ook opmerkingswolkjes toevoegen aan de foto voor bijvoorbeeld een fout</w:t>
+        <w:t>De scanner + pdf converter was duidelijk te moeilijk, maar ik besloot om het idee verder te zetten van een app die notities kan delen. Dus nu moet het gewoon foto’s trekken van de notities. Om nog toe te voegen kan ik ook opmerkingswolkjes toevoegen aan de foto voor bijvoorbeeld een fout</w:t>
       </w:r>
       <w:r>
         <w:t xml:space="preserve"> aan te duiden</w:t>
@@ -248,15 +120,7 @@
     </w:p>
     <w:p>
       <w:r>
-        <w:t xml:space="preserve">Daarna moest ik gewoon begin aan een UI/UX design voor mijn applicatie, waarbij nog niet veel had gedaan omdat les niet meer lang duurde. Ik moest toen ook tegelijkertijd zoeken naar </w:t>
-      </w:r>
-      <w:proofErr w:type="spellStart"/>
-      <w:r>
-        <w:t>tutorials</w:t>
-      </w:r>
-      <w:proofErr w:type="spellEnd"/>
-      <w:r>
-        <w:t xml:space="preserve"> dus </w:t>
+        <w:t xml:space="preserve">Daarna moest ik gewoon begin aan een UI/UX design voor mijn applicatie, waarbij nog niet veel had gedaan omdat les niet meer lang duurde. Ik moest toen ook tegelijkertijd zoeken naar tutorials dus </w:t>
       </w:r>
       <w:r>
         <w:t>duurde dat ook kort.</w:t>
@@ -279,26 +143,13 @@
     </w:p>
     <w:p>
       <w:r>
-        <w:t>Vandaag in de namiddag begonnen we met de co-</w:t>
-      </w:r>
-      <w:proofErr w:type="spellStart"/>
-      <w:r>
-        <w:t>working</w:t>
-      </w:r>
-      <w:proofErr w:type="spellEnd"/>
-      <w:r>
-        <w:t xml:space="preserve"> les waarbij we dus informatie kunnen delen met medeleerlingen. Al was het de eerste les dus kwam daar niet veel van. Ik begon gewoon verder aan mijn </w:t>
-      </w:r>
-      <w:proofErr w:type="spellStart"/>
+        <w:t xml:space="preserve">Vandaag in de namiddag begonnen we met de co-working les waarbij we dus informatie kunnen delen met medeleerlingen. Al was het de eerste les dus kwam daar niet veel van. Ik begon gewoon verder aan mijn </w:t>
+      </w:r>
       <w:r>
         <w:t>F</w:t>
       </w:r>
       <w:r>
-        <w:t>igma</w:t>
-      </w:r>
-      <w:proofErr w:type="spellEnd"/>
-      <w:r>
-        <w:t xml:space="preserve"> design.</w:t>
+        <w:t>igma design.</w:t>
       </w:r>
     </w:p>
     <w:p>
@@ -309,15 +160,7 @@
         <w:t>te veel</w:t>
       </w:r>
       <w:r>
-        <w:t xml:space="preserve"> naar voor moest leunen en dus </w:t>
-      </w:r>
-      <w:proofErr w:type="gramStart"/>
-      <w:r>
-        <w:t>nek pijn</w:t>
-      </w:r>
-      <w:proofErr w:type="gramEnd"/>
-      <w:r>
-        <w:t xml:space="preserve"> kreeg en er waren precies geen ramen om te openen. </w:t>
+        <w:t xml:space="preserve"> naar voor moest leunen en dus nek pijn kreeg en er waren precies geen ramen om te openen. </w:t>
       </w:r>
       <w:r>
         <w:t>Gelukkig kunnen we naar buiten wanneer we het willen.</w:t>
@@ -357,23 +200,7 @@
     </w:p>
     <w:p>
       <w:r>
-        <w:t xml:space="preserve">Vandaag heb ik verder gewerkt aan mijn </w:t>
-      </w:r>
-      <w:proofErr w:type="spellStart"/>
-      <w:r>
-        <w:t>Figma</w:t>
-      </w:r>
-      <w:proofErr w:type="spellEnd"/>
-      <w:r>
-        <w:t xml:space="preserve"> design en het ging redelijk vlot vooruit. Ik wou absoluut dat het vandaag af was zodat ik morgen kan werken aan een ander vak. Tijdens het maken van het design heb ik vooral ook zitten op zoeken dat sommige concepten wel haalbaar zijn om te programmeren. Dit is allemaal wel mogelijk, maar zal wel een </w:t>
-      </w:r>
-      <w:proofErr w:type="spellStart"/>
-      <w:r>
-        <w:t>challenge</w:t>
-      </w:r>
-      <w:proofErr w:type="spellEnd"/>
-      <w:r>
-        <w:t xml:space="preserve"> zijn zoals de opmerkingen plaatsen</w:t>
+        <w:t>Vandaag heb ik verder gewerkt aan mijn Figma design en het ging redelijk vlot vooruit. Ik wou absoluut dat het vandaag af was zodat ik morgen kan werken aan een ander vak. Tijdens het maken van het design heb ik vooral ook zitten op zoeken dat sommige concepten wel haalbaar zijn om te programmeren. Dit is allemaal wel mogelijk, maar zal wel een challenge zijn zoals de opmerkingen plaatsen</w:t>
       </w:r>
       <w:r>
         <w:t>. M</w:t>
@@ -485,48 +312,11 @@
     </w:p>
     <w:p>
       <w:r>
-        <w:t xml:space="preserve">Vandaag werd mijn </w:t>
-      </w:r>
-      <w:proofErr w:type="spellStart"/>
-      <w:r>
-        <w:t>figma</w:t>
-      </w:r>
-      <w:proofErr w:type="spellEnd"/>
-      <w:r>
-        <w:t xml:space="preserve"> prototype gecontroleerd waarbij ik moest opnieuw uitleggen wat mijn app doet door middel van accurate presentatie. Ik legde dit vrij duidelijk uit en alles ging goed vooruit. Meneer </w:t>
-      </w:r>
-      <w:proofErr w:type="spellStart"/>
-      <w:r>
-        <w:t>Blancquaert</w:t>
-      </w:r>
-      <w:proofErr w:type="spellEnd"/>
-      <w:r>
-        <w:t xml:space="preserve"> heeft me dan ook nog een </w:t>
-      </w:r>
-      <w:proofErr w:type="spellStart"/>
-      <w:r>
-        <w:t>library</w:t>
-      </w:r>
-      <w:proofErr w:type="spellEnd"/>
-      <w:r>
-        <w:t xml:space="preserve"> genaamd “</w:t>
-      </w:r>
-      <w:proofErr w:type="spellStart"/>
-      <w:r>
-        <w:t>Material</w:t>
-      </w:r>
-      <w:proofErr w:type="spellEnd"/>
-      <w:r>
-        <w:t xml:space="preserve"> design” aangeraden om mijn applicatie te ontwerpen. </w:t>
-      </w:r>
-      <w:r>
-        <w:t xml:space="preserve">Blijkbaar Google gebruikt deze </w:t>
-      </w:r>
-      <w:proofErr w:type="spellStart"/>
-      <w:r>
-        <w:t>library</w:t>
-      </w:r>
-      <w:proofErr w:type="spellEnd"/>
+        <w:t xml:space="preserve">Vandaag werd mijn figma prototype gecontroleerd waarbij ik moest opnieuw uitleggen wat mijn app doet door middel van accurate presentatie. Ik legde dit vrij duidelijk uit en alles ging goed vooruit. Meneer Blancquaert heeft me dan ook nog een library genaamd “Material design” aangeraden om mijn applicatie te ontwerpen. </w:t>
+      </w:r>
+      <w:r>
+        <w:t>Blijkbaar Google gebruikt deze library</w:t>
+      </w:r>
       <w:r>
         <w:t xml:space="preserve"> om hun apps te maken.</w:t>
       </w:r>
@@ -564,23 +354,7 @@
         <w:t xml:space="preserve">kunt maken </w:t>
       </w:r>
       <w:r>
-        <w:t xml:space="preserve">om je app te testen. Als je </w:t>
-      </w:r>
-      <w:proofErr w:type="spellStart"/>
-      <w:r>
-        <w:t>developer</w:t>
-      </w:r>
-      <w:proofErr w:type="spellEnd"/>
-      <w:r>
-        <w:t xml:space="preserve"> modus in de </w:t>
-      </w:r>
-      <w:proofErr w:type="spellStart"/>
-      <w:r>
-        <w:t>settings</w:t>
-      </w:r>
-      <w:proofErr w:type="spellEnd"/>
-      <w:r>
-        <w:t xml:space="preserve"> van je gsm</w:t>
+        <w:t>om je app te testen. Als je developer modus in de settings van je gsm</w:t>
       </w:r>
       <w:r>
         <w:t xml:space="preserve"> aanzet, kan je je gsm verbinden met de pc en dus je applicatie daarop testen.</w:t>
@@ -598,23 +372,7 @@
     </w:p>
     <w:p>
       <w:r>
-        <w:t xml:space="preserve">Tijdens lange downloads heb ik ook mijn </w:t>
-      </w:r>
-      <w:proofErr w:type="gramStart"/>
-      <w:r>
-        <w:t>google account</w:t>
-      </w:r>
-      <w:proofErr w:type="gramEnd"/>
-      <w:r>
-        <w:t xml:space="preserve"> toegevoegd op </w:t>
-      </w:r>
-      <w:proofErr w:type="spellStart"/>
-      <w:r>
-        <w:t>Firebase</w:t>
-      </w:r>
-      <w:proofErr w:type="spellEnd"/>
-      <w:r>
-        <w:t>. Volgens de presentatie die we kregen van een medestudent.</w:t>
+        <w:t>Tijdens lange downloads heb ik ook mijn google account toegevoegd op Firebase. Volgens de presentatie die we kregen van een medestudent.</w:t>
       </w:r>
     </w:p>
     <w:p>
@@ -665,23 +423,7 @@
         <w:t>mijn</w:t>
       </w:r>
       <w:r>
-        <w:t xml:space="preserve"> </w:t>
-      </w:r>
-      <w:proofErr w:type="spellStart"/>
-      <w:r>
-        <w:t>figma</w:t>
-      </w:r>
-      <w:proofErr w:type="spellEnd"/>
-      <w:r>
-        <w:t xml:space="preserve"> design delen met meneer </w:t>
-      </w:r>
-      <w:proofErr w:type="spellStart"/>
-      <w:r>
-        <w:t>Blancquaert</w:t>
-      </w:r>
-      <w:proofErr w:type="spellEnd"/>
-      <w:r>
-        <w:t>, toen hij vroeg dat mijn design klaar was</w:t>
+        <w:t xml:space="preserve"> figma design delen met meneer Blancquaert, toen hij vroeg dat mijn design klaar was</w:t>
       </w:r>
       <w:r>
         <w:t xml:space="preserve"> of niet</w:t>
@@ -695,54 +437,14 @@
         <w:t>Ik heb daarna gewoon verder begonnen aan de tutorial die ik vorige week gebruikt had.</w:t>
       </w:r>
       <w:r>
-        <w:t xml:space="preserve"> Hierbij leerde ik meer over hoe ik </w:t>
-      </w:r>
-      <w:proofErr w:type="gramStart"/>
-      <w:r>
-        <w:t>Android studio</w:t>
-      </w:r>
-      <w:proofErr w:type="gramEnd"/>
-      <w:r>
-        <w:t xml:space="preserve"> beter kon gebruiken om mijn app te </w:t>
-      </w:r>
-      <w:proofErr w:type="spellStart"/>
-      <w:r>
-        <w:t>designen</w:t>
-      </w:r>
-      <w:proofErr w:type="spellEnd"/>
-      <w:r>
-        <w:t xml:space="preserve"> zoals hoe je </w:t>
+        <w:t xml:space="preserve"> Hierbij leerde ik meer over hoe ik Android studio beter kon gebruiken om mijn app te designen zoals hoe je </w:t>
       </w:r>
       <w:r>
         <w:lastRenderedPageBreak/>
-        <w:t xml:space="preserve">attributen kunt aanpassen (bv. </w:t>
-      </w:r>
-      <w:proofErr w:type="spellStart"/>
-      <w:r>
-        <w:t>color</w:t>
-      </w:r>
-      <w:proofErr w:type="spellEnd"/>
-      <w:r>
-        <w:t>)</w:t>
-      </w:r>
-      <w:r>
-        <w:t xml:space="preserve">. </w:t>
-      </w:r>
-      <w:proofErr w:type="gramStart"/>
-      <w:r>
-        <w:t>Android studio</w:t>
-      </w:r>
-      <w:proofErr w:type="gramEnd"/>
-      <w:r>
-        <w:t xml:space="preserve"> is zeer gelijkaardig als bijvoorbeeld </w:t>
-      </w:r>
-      <w:proofErr w:type="spellStart"/>
-      <w:r>
-        <w:t>Webstorm</w:t>
-      </w:r>
-      <w:proofErr w:type="spellEnd"/>
-      <w:r>
-        <w:t xml:space="preserve">, maar bij het design van een mobile app is het zeer </w:t>
+        <w:t>attributen kunt aanpassen (bv. color)</w:t>
+      </w:r>
+      <w:r>
+        <w:t xml:space="preserve">. Android studio is zeer gelijkaardig als bijvoorbeeld Webstorm, maar bij het design van een mobile app is het zeer </w:t>
       </w:r>
       <w:r>
         <w:t>verschillend</w:t>
@@ -751,27 +453,14 @@
         <w:t>.</w:t>
       </w:r>
       <w:r>
-        <w:t xml:space="preserve"> Bij </w:t>
-      </w:r>
-      <w:proofErr w:type="spellStart"/>
-      <w:r>
-        <w:t>Webstorm</w:t>
-      </w:r>
-      <w:proofErr w:type="spellEnd"/>
-      <w:r>
-        <w:t xml:space="preserve"> kan je je website </w:t>
+        <w:t xml:space="preserve"> Bij Webstorm kan je je website </w:t>
       </w:r>
       <w:r>
         <w:t>bekijken</w:t>
       </w:r>
       <w:r>
-        <w:t xml:space="preserve"> in een gekozen browser, maar je kan in </w:t>
-      </w:r>
-      <w:proofErr w:type="gramStart"/>
-      <w:r>
-        <w:t>Android studio</w:t>
-      </w:r>
-      <w:proofErr w:type="gramEnd"/>
+        <w:t xml:space="preserve"> in een gekozen browser, maar je kan in Android studio</w:t>
+      </w:r>
       <w:r>
         <w:t xml:space="preserve"> je app</w:t>
       </w:r>
@@ -791,15 +480,7 @@
         <w:t>.</w:t>
       </w:r>
       <w:r>
-        <w:t xml:space="preserve"> Als ik de </w:t>
-      </w:r>
-      <w:proofErr w:type="spellStart"/>
-      <w:r>
-        <w:t>Jetbrains</w:t>
-      </w:r>
-      <w:proofErr w:type="spellEnd"/>
-      <w:r>
-        <w:t xml:space="preserve"> applicaties vergelijk met Visual studio 2019, </w:t>
+        <w:t xml:space="preserve"> Als ik de Jetbrains applicaties vergelijk met Visual studio 2019, </w:t>
       </w:r>
       <w:r>
         <w:t>heb ik er altijd moeite mee om de lay</w:t>
@@ -879,23 +560,7 @@
     </w:p>
     <w:p>
       <w:r>
-        <w:t xml:space="preserve">Ik heb dan ondertussen de tutorial van </w:t>
-      </w:r>
-      <w:proofErr w:type="spellStart"/>
-      <w:r>
-        <w:t>Material</w:t>
-      </w:r>
-      <w:proofErr w:type="spellEnd"/>
-      <w:r>
-        <w:t xml:space="preserve"> design gevolgd in plaats van die van </w:t>
-      </w:r>
-      <w:proofErr w:type="gramStart"/>
-      <w:r>
-        <w:t>Android studio</w:t>
-      </w:r>
-      <w:proofErr w:type="gramEnd"/>
-      <w:r>
-        <w:t>. Ze leerde me dan hoe ik er mee kon werken maar niet hoe een hele nieuwe app kon maken. Ik kreeg een voorbeeld app om erin te kunnen werken voor de tutorial.</w:t>
+        <w:t>Ik heb dan ondertussen de tutorial van Material design gevolgd in plaats van die van Android studio. Ze leerde me dan hoe ik er mee kon werken maar niet hoe een hele nieuwe app kon maken. Ik kreeg een voorbeeld app om erin te kunnen werken voor de tutorial.</w:t>
       </w:r>
     </w:p>
     <w:p>
@@ -938,34 +603,10 @@
     </w:p>
     <w:p>
       <w:r>
-        <w:t xml:space="preserve">Vandaag heb ik de usertests afgelegd met Louis </w:t>
-      </w:r>
-      <w:proofErr w:type="spellStart"/>
-      <w:r>
-        <w:t>D’hondt</w:t>
-      </w:r>
-      <w:proofErr w:type="spellEnd"/>
-      <w:r>
-        <w:t xml:space="preserve"> en Jasper Wauters. Dit ging heel gemakkelijk en duurde niet lang. Ik had niet echt serieuze opmerkingen, behalve dat ik geen persoonlijke info pagina gemaakt had.</w:t>
-      </w:r>
-      <w:r>
-        <w:t xml:space="preserve"> Daarna heb ik onmiddellijk die opmerkingen van mijn </w:t>
-      </w:r>
-      <w:proofErr w:type="spellStart"/>
-      <w:r>
-        <w:t>figma</w:t>
-      </w:r>
-      <w:proofErr w:type="spellEnd"/>
-      <w:r>
-        <w:t xml:space="preserve"> design verbetert en op mijn </w:t>
-      </w:r>
-      <w:proofErr w:type="spellStart"/>
-      <w:r>
-        <w:t>repository</w:t>
-      </w:r>
-      <w:proofErr w:type="spellEnd"/>
-      <w:r>
-        <w:t xml:space="preserve"> gezet.</w:t>
+        <w:t>Vandaag heb ik de usertests afgelegd met Louis D’hondt en Jasper Wauters. Dit ging heel gemakkelijk en duurde niet lang. Ik had niet echt serieuze opmerkingen, behalve dat ik geen persoonlijke info pagina gemaakt had.</w:t>
+      </w:r>
+      <w:r>
+        <w:t xml:space="preserve"> Daarna heb ik onmiddellijk die opmerkingen van mijn figma design verbetert en op mijn repository gezet.</w:t>
       </w:r>
     </w:p>
     <w:p/>
@@ -988,47 +629,7 @@
     </w:p>
     <w:p>
       <w:r>
-        <w:t xml:space="preserve">Vandaag begon ik eindelijk met </w:t>
-      </w:r>
-      <w:proofErr w:type="spellStart"/>
-      <w:r>
-        <w:t>Material</w:t>
-      </w:r>
-      <w:proofErr w:type="spellEnd"/>
-      <w:r>
-        <w:t xml:space="preserve"> Design. Ik besloot mijn oude app te verwijderen en te vervangen met een empty </w:t>
-      </w:r>
-      <w:proofErr w:type="spellStart"/>
-      <w:r>
-        <w:t>activity</w:t>
-      </w:r>
-      <w:proofErr w:type="spellEnd"/>
-      <w:r>
-        <w:t xml:space="preserve"> zodat ik echt van scratch begin. Zo kan ik alles beter begrijpen. Ik had dan ontdekt dat </w:t>
-      </w:r>
-      <w:proofErr w:type="spellStart"/>
-      <w:r>
-        <w:t>android</w:t>
-      </w:r>
-      <w:proofErr w:type="spellEnd"/>
-      <w:r>
-        <w:t xml:space="preserve"> studio al automatisch </w:t>
-      </w:r>
-      <w:proofErr w:type="spellStart"/>
-      <w:r>
-        <w:t>Material</w:t>
-      </w:r>
-      <w:proofErr w:type="spellEnd"/>
-      <w:r>
-        <w:t xml:space="preserve"> Design van Google had toegevoegd bij de </w:t>
-      </w:r>
-      <w:proofErr w:type="spellStart"/>
-      <w:r>
-        <w:t>dependencies</w:t>
-      </w:r>
-      <w:proofErr w:type="spellEnd"/>
-      <w:r>
-        <w:t xml:space="preserve">, dus eigenlijk ben ik </w:t>
+        <w:t xml:space="preserve">Vandaag begon ik eindelijk met Material Design. Ik besloot mijn oude app te verwijderen en te vervangen met een empty activity zodat ik echt van scratch begin. Zo kan ik alles beter begrijpen. Ik had dan ontdekt dat android studio al automatisch Material Design van Google had toegevoegd bij de dependencies, dus eigenlijk ben ik </w:t>
       </w:r>
       <w:r>
         <w:t>onmiddellijk</w:t>
@@ -1172,50 +773,18 @@
     </w:p>
     <w:p>
       <w:r>
-        <w:t xml:space="preserve">Eerst had ik geprobeerd om gewoon een heel nieuw project te maken die bestond uit een login </w:t>
-      </w:r>
-      <w:proofErr w:type="spellStart"/>
-      <w:r>
-        <w:t>activity</w:t>
-      </w:r>
-      <w:proofErr w:type="spellEnd"/>
-      <w:r>
-        <w:t xml:space="preserve">. Deze </w:t>
-      </w:r>
-      <w:proofErr w:type="spellStart"/>
-      <w:r>
-        <w:t>activity</w:t>
-      </w:r>
-      <w:proofErr w:type="spellEnd"/>
-      <w:r>
-        <w:t xml:space="preserve"> heb ik dan gewoon aangepast naar mijn wens. Maar dit wou ook niet echt werken, want blijkbaar is het best dat je van een </w:t>
-      </w:r>
-      <w:proofErr w:type="spellStart"/>
-      <w:r>
-        <w:t>main</w:t>
+        <w:t>Eerst had ik geprobeerd om gewoon een heel nieuw project te maken die bestond uit een login activity. Deze activity heb ik dan gewoon aangepast naar mijn wens. Maar dit wou ook niet echt werken, want blijkbaar is het best dat je van een main</w:t>
       </w:r>
       <w:r>
         <w:t>_</w:t>
       </w:r>
       <w:r>
-        <w:t>activity</w:t>
-      </w:r>
-      <w:proofErr w:type="spellEnd"/>
-      <w:r>
-        <w:t xml:space="preserve"> start en dan de login page daarmee opent.</w:t>
-      </w:r>
-    </w:p>
-    <w:p>
-      <w:r>
-        <w:t xml:space="preserve">Ik ben dan gewoon terug begonnen aan het oude project en heb dan de error op stack overflow gezocht en daar had ik de oplossing gevonden. Ik moest gewoon mijn “device” zijn data </w:t>
-      </w:r>
-      <w:proofErr w:type="spellStart"/>
-      <w:r>
-        <w:t>wipen</w:t>
-      </w:r>
-      <w:proofErr w:type="spellEnd"/>
-      <w:r>
-        <w:t xml:space="preserve"> en dan kon het opnieuw installeren want mijn oude projecten stond er nog op.</w:t>
+        <w:t>activity start en dan de login page daarmee opent.</w:t>
+      </w:r>
+    </w:p>
+    <w:p>
+      <w:r>
+        <w:t>Ik ben dan gewoon terug begonnen aan het oude project en heb dan de error op stack overflow gezocht en daar had ik de oplossing gevonden. Ik moest gewoon mijn “device” zijn data wipen en dan kon het opnieuw installeren want mijn oude projecten stond er nog op.</w:t>
       </w:r>
     </w:p>
     <w:p>
@@ -1259,23 +828,7 @@
         <w:t>Vandaag wou de wifi niet werken op de campus dus had ik niet veel vooruitgang geboekt.</w:t>
       </w:r>
       <w:r>
-        <w:t xml:space="preserve"> Ik was ook gisteren vergeten om de registratie pagina te </w:t>
-      </w:r>
-      <w:proofErr w:type="spellStart"/>
-      <w:r>
-        <w:t>committen</w:t>
-      </w:r>
-      <w:proofErr w:type="spellEnd"/>
-      <w:r>
-        <w:t xml:space="preserve">, dus da had ik alleszins gedaan door met mijn </w:t>
-      </w:r>
-      <w:proofErr w:type="spellStart"/>
-      <w:r>
-        <w:t>hotspot</w:t>
-      </w:r>
-      <w:proofErr w:type="spellEnd"/>
-      <w:r>
-        <w:t xml:space="preserve"> van mijn gsm te verbinden en de 4G aan te zetten.</w:t>
+        <w:t xml:space="preserve"> Ik was ook gisteren vergeten om de registratie pagina te committen, dus da had ik alleszins gedaan door met mijn hotspot van mijn gsm te verbinden en de 4G aan te zetten.</w:t>
       </w:r>
     </w:p>
     <w:p>
@@ -1307,23 +860,21 @@
         <w:t>Vandaag wou de wifi op school nog steeds niet zo goed werken</w:t>
       </w:r>
       <w:r>
-        <w:t xml:space="preserve">, maar dankzij de wifi </w:t>
-      </w:r>
-      <w:proofErr w:type="spellStart"/>
-      <w:r>
-        <w:t>hotspot</w:t>
-      </w:r>
-      <w:proofErr w:type="spellEnd"/>
-      <w:r>
-        <w:t xml:space="preserve"> heb ik toch nog de navigatie van login naar registratie kunnen </w:t>
-      </w:r>
-      <w:proofErr w:type="spellStart"/>
+        <w:t xml:space="preserve">, maar dankzij de wifi hotspot heb ik toch nog de navigatie van login naar registratie kunnen </w:t>
+      </w:r>
       <w:r>
         <w:t>commiten</w:t>
       </w:r>
-      <w:proofErr w:type="spellEnd"/>
       <w:r>
         <w:t>.</w:t>
+      </w:r>
+      <w:r>
+        <w:t xml:space="preserve"> </w:t>
+      </w:r>
+    </w:p>
+    <w:p>
+      <w:r>
+        <w:t>De wifi wou uiteindelijk werken dus kon eindelijk heel vlot vooruit gaan. Ik heb daarbij de navigatie tussen de login en registratie kunnen afwerken. Daarna heb ik ook de startpagina bijna afgewerkt, maar de bottom bar wou niet helemaal mee werken dus dat laat ik voor later.</w:t>
       </w:r>
     </w:p>
     <w:p/>

</xml_diff>

<commit_message>
Updated logboek and connected firebase to my app
</commit_message>
<xml_diff>
--- a/Logboek_Dries_Fierens.docx
+++ b/Logboek_Dries_Fierens.docx
@@ -614,15 +614,7 @@
       </w:r>
       <w:proofErr w:type="spellEnd"/>
       <w:r>
-        <w:t xml:space="preserve">. Volgens de </w:t>
-      </w:r>
-      <w:proofErr w:type="gramStart"/>
-      <w:r>
-        <w:t>presentatie</w:t>
-      </w:r>
-      <w:proofErr w:type="gramEnd"/>
-      <w:r>
-        <w:t xml:space="preserve"> die we kregen van een medestudent.</w:t>
+        <w:t>. Volgens de presentatie die we kregen van een medestudent.</w:t>
       </w:r>
     </w:p>
     <w:p>
@@ -1415,6 +1407,182 @@
         </w:r>
       </w:hyperlink>
     </w:p>
+    <w:p/>
+    <w:p>
+      <w:pPr>
+        <w:rPr>
+          <w:b/>
+          <w:bCs/>
+        </w:rPr>
+      </w:pPr>
+      <w:r>
+        <w:rPr>
+          <w:b/>
+          <w:bCs/>
+        </w:rPr>
+        <w:t>17/10/2021:</w:t>
+      </w:r>
+    </w:p>
+    <w:p>
+      <w:r>
+        <w:t>Ik heb vandaag nu kort de instellingen pagina gemaakt zodat je kan uitloggen. Ik heb vooral geleerd om te kunnen werken met backstack dat dus betekent dat ik kan terugkeren naar de vorige pagina. Dit is belangrijk omdat ik van de instellingen pagina dan kan terugkeren naar oftewel de notities pagina of de chatgroepen pagina afhangend van waar ik naar de instellingen pagina ben gekomen.</w:t>
+      </w:r>
+    </w:p>
+    <w:p>
+      <w:r>
+        <w:t xml:space="preserve">Ik heb dan ook nog voor gezorgd dat mijn </w:t>
+      </w:r>
+      <w:proofErr w:type="spellStart"/>
+      <w:r>
+        <w:t>firebase</w:t>
+      </w:r>
+      <w:proofErr w:type="spellEnd"/>
+      <w:r>
+        <w:t xml:space="preserve"> account verbonden is met </w:t>
+      </w:r>
+      <w:proofErr w:type="spellStart"/>
+      <w:r>
+        <w:t>android</w:t>
+      </w:r>
+      <w:proofErr w:type="spellEnd"/>
+      <w:r>
+        <w:t xml:space="preserve"> studio app.</w:t>
+      </w:r>
+    </w:p>
+    <w:p>
+      <w:hyperlink r:id="rId16" w:history="1">
+        <w:r>
+          <w:rPr>
+            <w:rStyle w:val="Hyperlink"/>
+          </w:rPr>
+          <w:t>https://www.c-sharpcorner.com/article/insert-data-into-the-firebase-database-in-android-apps2/</w:t>
+        </w:r>
+        <w:r>
+          <w:rPr>
+            <w:rStyle w:val="Hyperlink"/>
+            <w:noProof/>
+          </w:rPr>
+          <w:drawing>
+            <wp:inline distT="0" distB="0" distL="0" distR="0" wp14:anchorId="40295ECD" wp14:editId="0E26C80D">
+              <wp:extent cx="3733800" cy="2552582"/>
+              <wp:effectExtent l="133350" t="114300" r="152400" b="172085"/>
+              <wp:docPr id="5" name="Afbeelding 5"/>
+              <wp:cNvGraphicFramePr>
+                <a:graphicFrameLocks xmlns:a="http://schemas.openxmlformats.org/drawingml/2006/main" noChangeAspect="1"/>
+              </wp:cNvGraphicFramePr>
+              <a:graphic xmlns:a="http://schemas.openxmlformats.org/drawingml/2006/main">
+                <a:graphicData uri="http://schemas.openxmlformats.org/drawingml/2006/picture">
+                  <pic:pic xmlns:pic="http://schemas.openxmlformats.org/drawingml/2006/picture">
+                    <pic:nvPicPr>
+                      <pic:cNvPr id="1" name=""/>
+                      <pic:cNvPicPr/>
+                    </pic:nvPicPr>
+                    <pic:blipFill>
+                      <a:blip r:embed="rId17"/>
+                      <a:stretch>
+                        <a:fillRect/>
+                      </a:stretch>
+                    </pic:blipFill>
+                    <pic:spPr>
+                      <a:xfrm>
+                        <a:off x="0" y="0"/>
+                        <a:ext cx="3733800" cy="2552582"/>
+                      </a:xfrm>
+                      <a:prstGeom prst="rect">
+                        <a:avLst/>
+                      </a:prstGeom>
+                      <a:solidFill>
+                        <a:srgbClr val="FFFFFF">
+                          <a:shade val="85000"/>
+                        </a:srgbClr>
+                      </a:solidFill>
+                      <a:ln w="88900" cap="sq">
+                        <a:solidFill>
+                          <a:srgbClr val="FFFFFF"/>
+                        </a:solidFill>
+                        <a:miter lim="800000"/>
+                      </a:ln>
+                      <a:effectLst>
+                        <a:outerShdw blurRad="55000" dist="18000" dir="5400000" algn="tl" rotWithShape="0">
+                          <a:srgbClr val="000000">
+                            <a:alpha val="40000"/>
+                          </a:srgbClr>
+                        </a:outerShdw>
+                      </a:effectLst>
+                      <a:scene3d>
+                        <a:camera prst="orthographicFront"/>
+                        <a:lightRig rig="twoPt" dir="t">
+                          <a:rot lat="0" lon="0" rev="7200000"/>
+                        </a:lightRig>
+                      </a:scene3d>
+                      <a:sp3d>
+                        <a:bevelT w="25400" h="19050"/>
+                        <a:contourClr>
+                          <a:srgbClr val="FFFFFF"/>
+                        </a:contourClr>
+                      </a:sp3d>
+                    </pic:spPr>
+                  </pic:pic>
+                </a:graphicData>
+              </a:graphic>
+            </wp:inline>
+          </w:drawing>
+        </w:r>
+        <w:r>
+          <w:rPr>
+            <w:rStyle w:val="Hyperlink"/>
+            <w:noProof/>
+          </w:rPr>
+          <w:drawing>
+            <wp:inline distT="0" distB="0" distL="0" distR="0" wp14:anchorId="00D54B95" wp14:editId="11C130BB">
+              <wp:extent cx="2740728" cy="2809875"/>
+              <wp:effectExtent l="0" t="0" r="2540" b="0"/>
+              <wp:docPr id="7" name="Afbeelding 7"/>
+              <wp:cNvGraphicFramePr>
+                <a:graphicFrameLocks xmlns:a="http://schemas.openxmlformats.org/drawingml/2006/main" noChangeAspect="1"/>
+              </wp:cNvGraphicFramePr>
+              <a:graphic xmlns:a="http://schemas.openxmlformats.org/drawingml/2006/main">
+                <a:graphicData uri="http://schemas.openxmlformats.org/drawingml/2006/picture">
+                  <pic:pic xmlns:pic="http://schemas.openxmlformats.org/drawingml/2006/picture">
+                    <pic:nvPicPr>
+                      <pic:cNvPr id="1" name=""/>
+                      <pic:cNvPicPr/>
+                    </pic:nvPicPr>
+                    <pic:blipFill>
+                      <a:blip r:embed="rId18"/>
+                      <a:stretch>
+                        <a:fillRect/>
+                      </a:stretch>
+                    </pic:blipFill>
+                    <pic:spPr>
+                      <a:xfrm>
+                        <a:off x="0" y="0"/>
+                        <a:ext cx="2741929" cy="2811106"/>
+                      </a:xfrm>
+                      <a:prstGeom prst="rect">
+                        <a:avLst/>
+                      </a:prstGeom>
+                    </pic:spPr>
+                  </pic:pic>
+                </a:graphicData>
+              </a:graphic>
+            </wp:inline>
+          </w:drawing>
+        </w:r>
+      </w:hyperlink>
+    </w:p>
+    <w:p/>
+    <w:p/>
+    <w:p>
+      <w:pPr>
+        <w:pStyle w:val="Kop2"/>
+      </w:pPr>
+      <w:r>
+        <w:lastRenderedPageBreak/>
+        <w:t>Week 5</w:t>
+      </w:r>
+    </w:p>
+    <w:p/>
     <w:p/>
     <w:p/>
     <w:p/>

</xml_diff>

<commit_message>
Updated logboek and added firebase authentication
</commit_message>
<xml_diff>
--- a/Logboek_Dries_Fierens.docx
+++ b/Logboek_Dries_Fierens.docx
@@ -1438,7 +1438,13 @@
       </w:r>
       <w:proofErr w:type="spellEnd"/>
       <w:r>
-        <w:t xml:space="preserve"> account verbonden is met </w:t>
+        <w:t xml:space="preserve"> account verbonden is met</w:t>
+      </w:r>
+      <w:r>
+        <w:t xml:space="preserve"> mijn</w:t>
+      </w:r>
+      <w:r>
+        <w:t xml:space="preserve"> </w:t>
       </w:r>
       <w:proofErr w:type="spellStart"/>
       <w:r>
@@ -1463,7 +1469,7 @@
             <w:noProof/>
           </w:rPr>
           <w:drawing>
-            <wp:inline distT="0" distB="0" distL="0" distR="0" wp14:anchorId="40295ECD" wp14:editId="0E26C80D">
+            <wp:inline distT="0" distB="0" distL="0" distR="0" wp14:anchorId="46165815" wp14:editId="623DFE82">
               <wp:extent cx="3733800" cy="2552582"/>
               <wp:effectExtent l="133350" t="114300" r="152400" b="172085"/>
               <wp:docPr id="5" name="Afbeelding 5"/>
@@ -1534,10 +1540,10 @@
             <w:noProof/>
           </w:rPr>
           <w:drawing>
-            <wp:inline distT="0" distB="0" distL="0" distR="0" wp14:anchorId="00D54B95" wp14:editId="11C130BB">
-              <wp:extent cx="2740728" cy="2809875"/>
-              <wp:effectExtent l="0" t="0" r="2540" b="0"/>
-              <wp:docPr id="7" name="Afbeelding 7"/>
+            <wp:inline distT="0" distB="0" distL="0" distR="0" wp14:anchorId="7F59BC1B" wp14:editId="309253D1">
+              <wp:extent cx="3314700" cy="3590560"/>
+              <wp:effectExtent l="0" t="0" r="0" b="0"/>
+              <wp:docPr id="6" name="Afbeelding 6"/>
               <wp:cNvGraphicFramePr>
                 <a:graphicFrameLocks xmlns:a="http://schemas.openxmlformats.org/drawingml/2006/main" noChangeAspect="1"/>
               </wp:cNvGraphicFramePr>
@@ -1557,7 +1563,7 @@
                     <pic:spPr>
                       <a:xfrm>
                         <a:off x="0" y="0"/>
-                        <a:ext cx="2741929" cy="2811106"/>
+                        <a:ext cx="3320842" cy="3597214"/>
                       </a:xfrm>
                       <a:prstGeom prst="rect">
                         <a:avLst/>
@@ -1571,8 +1577,6 @@
         </w:r>
       </w:hyperlink>
     </w:p>
-    <w:p/>
-    <w:p/>
     <w:p>
       <w:pPr>
         <w:pStyle w:val="Kop2"/>
@@ -1582,6 +1586,7 @@
         <w:t>Week 5</w:t>
       </w:r>
     </w:p>
+    <w:p/>
     <w:p/>
     <w:p/>
     <w:p/>

</xml_diff>

<commit_message>
Updated my logboek, described what I am going to do this week!
</commit_message>
<xml_diff>
--- a/Logboek_Dries_Fierens.docx
+++ b/Logboek_Dries_Fierens.docx
@@ -46,47 +46,7 @@
         <w:t>applicatie</w:t>
       </w:r>
       <w:r>
-        <w:t xml:space="preserve"> die je kan maken en welke technologieën je kan gebruiken. Ik heb voor native gekozen want dat past het best bij mijn aftakking “Software </w:t>
-      </w:r>
-      <w:proofErr w:type="spellStart"/>
-      <w:r>
-        <w:t>developer</w:t>
-      </w:r>
-      <w:proofErr w:type="spellEnd"/>
-      <w:r>
-        <w:t xml:space="preserve">” sinds het </w:t>
-      </w:r>
-      <w:proofErr w:type="spellStart"/>
-      <w:r>
-        <w:t>java</w:t>
-      </w:r>
-      <w:proofErr w:type="spellEnd"/>
-      <w:r>
-        <w:t xml:space="preserve"> inhoudt. De anderen zijn </w:t>
-      </w:r>
-      <w:proofErr w:type="spellStart"/>
-      <w:r>
-        <w:t>hybrid</w:t>
-      </w:r>
-      <w:proofErr w:type="spellEnd"/>
-      <w:r>
-        <w:t xml:space="preserve"> en </w:t>
-      </w:r>
-      <w:proofErr w:type="spellStart"/>
-      <w:r>
-        <w:t>progressive</w:t>
-      </w:r>
-      <w:proofErr w:type="spellEnd"/>
-      <w:r>
-        <w:t xml:space="preserve"> web app dat dus meer te maken hebben met web &amp; mobile dus vooral HTML &amp; CSS. We moesten dan ook nog kiezen voor een project idee, waarbij ik koos voor een scanner + </w:t>
-      </w:r>
-      <w:proofErr w:type="gramStart"/>
-      <w:r>
-        <w:t>pdf converter</w:t>
-      </w:r>
-      <w:proofErr w:type="gramEnd"/>
-      <w:r>
-        <w:t xml:space="preserve"> app</w:t>
+        <w:t xml:space="preserve"> die je kan maken en welke technologieën je kan gebruiken. Ik heb voor native gekozen want dat past het best bij mijn aftakking “Software developer” sinds het java inhoudt. De anderen zijn hybrid en progressive web app dat dus meer te maken hebben met web &amp; mobile dus vooral HTML &amp; CSS. We moesten dan ook nog kiezen voor een project idee, waarbij ik koos voor een scanner + pdf converter app</w:t>
       </w:r>
       <w:r>
         <w:t xml:space="preserve"> waarbij het vooral bedoelt is o</w:t>
@@ -107,106 +67,26 @@
         <w:t>.</w:t>
       </w:r>
       <w:r>
-        <w:t xml:space="preserve"> Het was verplicht om 1 </w:t>
-      </w:r>
-      <w:proofErr w:type="gramStart"/>
-      <w:r>
-        <w:t>hardware component</w:t>
-      </w:r>
-      <w:proofErr w:type="gramEnd"/>
-      <w:r>
-        <w:t xml:space="preserve"> van de gsm te gebruiken dus koos ik natuurlijk voor de camera.</w:t>
+        <w:t xml:space="preserve"> Het was verplicht om 1 hardware component van de gsm te gebruiken dus koos ik natuurlijk voor de camera.</w:t>
       </w:r>
       <w:r>
         <w:t xml:space="preserve"> </w:t>
       </w:r>
       <w:r>
-        <w:t xml:space="preserve">Als </w:t>
-      </w:r>
-      <w:proofErr w:type="spellStart"/>
-      <w:r>
-        <w:t>back-end</w:t>
-      </w:r>
-      <w:proofErr w:type="spellEnd"/>
-      <w:r>
-        <w:t xml:space="preserve"> koos ik </w:t>
-      </w:r>
-      <w:proofErr w:type="spellStart"/>
-      <w:r>
-        <w:t>Firebase</w:t>
-      </w:r>
-      <w:proofErr w:type="spellEnd"/>
-      <w:r>
-        <w:t xml:space="preserve"> en als technologie koos ik in </w:t>
-      </w:r>
-      <w:proofErr w:type="spellStart"/>
-      <w:r>
-        <w:t>java</w:t>
-      </w:r>
-      <w:proofErr w:type="spellEnd"/>
-      <w:r>
-        <w:t xml:space="preserve"> te werken om een </w:t>
-      </w:r>
-      <w:proofErr w:type="spellStart"/>
-      <w:r>
-        <w:t>android</w:t>
-      </w:r>
-      <w:proofErr w:type="spellEnd"/>
-      <w:r>
-        <w:t xml:space="preserve"> app te maken in plaats van een IOS app.</w:t>
-      </w:r>
-      <w:r>
-        <w:t xml:space="preserve"> Want ik heb een </w:t>
-      </w:r>
-      <w:proofErr w:type="spellStart"/>
-      <w:r>
-        <w:t>huawei</w:t>
-      </w:r>
-      <w:proofErr w:type="spellEnd"/>
-      <w:r>
-        <w:t>.</w:t>
-      </w:r>
-    </w:p>
-    <w:p>
-      <w:r>
-        <w:t xml:space="preserve">Ik heb dit allemaal grondiger beschreven in mijn “app </w:t>
-      </w:r>
-      <w:proofErr w:type="spellStart"/>
-      <w:r>
-        <w:t>idee”.pdf</w:t>
-      </w:r>
-      <w:proofErr w:type="spellEnd"/>
-      <w:r>
-        <w:t xml:space="preserve">. Dit staat ondertussen op de </w:t>
-      </w:r>
-      <w:proofErr w:type="spellStart"/>
-      <w:r>
-        <w:t>repository</w:t>
-      </w:r>
-      <w:proofErr w:type="spellEnd"/>
-      <w:r>
-        <w:t xml:space="preserve"> die we moesten maken.</w:t>
-      </w:r>
-    </w:p>
-    <w:p>
-      <w:r>
-        <w:t xml:space="preserve">Om af te sluiten had ik al ondertussen een goede naam gevonden gebaseerd op de applicatie genaamd </w:t>
-      </w:r>
-      <w:proofErr w:type="spellStart"/>
-      <w:r>
-        <w:t>Scannable</w:t>
-      </w:r>
-      <w:proofErr w:type="spellEnd"/>
-      <w:r>
-        <w:t xml:space="preserve">. Ik heb dus besloten om mijn applicatie </w:t>
-      </w:r>
-      <w:proofErr w:type="spellStart"/>
-      <w:r>
-        <w:t>Notable</w:t>
-      </w:r>
-      <w:proofErr w:type="spellEnd"/>
-      <w:r>
-        <w:t xml:space="preserve"> te noemen.</w:t>
+        <w:t>Als back-end koos ik Firebase en als technologie koos ik in java te werken om een android app te maken in plaats van een IOS app.</w:t>
+      </w:r>
+      <w:r>
+        <w:t xml:space="preserve"> Want ik heb een huawei.</w:t>
+      </w:r>
+    </w:p>
+    <w:p>
+      <w:r>
+        <w:t>Ik heb dit allemaal grondiger beschreven in mijn “app idee”.pdf. Dit staat ondertussen op de repository die we moesten maken.</w:t>
+      </w:r>
+    </w:p>
+    <w:p>
+      <w:r>
+        <w:t>Om af te sluiten had ik al ondertussen een goede naam gevonden gebaseerd op de applicatie genaamd Scannable. Ik heb dus besloten om mijn applicatie Notable te noemen.</w:t>
       </w:r>
     </w:p>
     <w:p>
@@ -229,15 +109,7 @@
         <w:t xml:space="preserve">Mijn app idee werd niet goedgekeurd, want de leerkracht raadde het af door problemen die ervan kunnen komen. Ik moest dan vandaag een nieuw idee opstellen. </w:t>
       </w:r>
       <w:r>
-        <w:t xml:space="preserve">De scanner + </w:t>
-      </w:r>
-      <w:proofErr w:type="gramStart"/>
-      <w:r>
-        <w:t>pdf converter</w:t>
-      </w:r>
-      <w:proofErr w:type="gramEnd"/>
-      <w:r>
-        <w:t xml:space="preserve"> was duidelijk te moeilijk, maar ik besloot om het idee verder te zetten van een app die notities kan delen. Dus nu moet het gewoon foto’s trekken van de notities. Om nog toe te voegen kan ik ook opmerkingswolkjes toevoegen aan de foto voor bijvoorbeeld een fout</w:t>
+        <w:t>De scanner + pdf converter was duidelijk te moeilijk, maar ik besloot om het idee verder te zetten van een app die notities kan delen. Dus nu moet het gewoon foto’s trekken van de notities. Om nog toe te voegen kan ik ook opmerkingswolkjes toevoegen aan de foto voor bijvoorbeeld een fout</w:t>
       </w:r>
       <w:r>
         <w:t xml:space="preserve"> aan te duiden</w:t>
@@ -248,15 +120,7 @@
     </w:p>
     <w:p>
       <w:r>
-        <w:t xml:space="preserve">Daarna moest ik gewoon begin aan een UI/UX design voor mijn applicatie, waarbij nog niet veel had gedaan omdat les niet meer lang duurde. Ik moest toen ook tegelijkertijd zoeken naar </w:t>
-      </w:r>
-      <w:proofErr w:type="spellStart"/>
-      <w:r>
-        <w:t>tutorials</w:t>
-      </w:r>
-      <w:proofErr w:type="spellEnd"/>
-      <w:r>
-        <w:t xml:space="preserve"> dus </w:t>
+        <w:t xml:space="preserve">Daarna moest ik gewoon begin aan een UI/UX design voor mijn applicatie, waarbij nog niet veel had gedaan omdat les niet meer lang duurde. Ik moest toen ook tegelijkertijd zoeken naar tutorials dus </w:t>
       </w:r>
       <w:r>
         <w:t>duurde dat ook kort.</w:t>
@@ -279,26 +143,13 @@
     </w:p>
     <w:p>
       <w:r>
-        <w:t>Vandaag in de namiddag begonnen we met de co-</w:t>
-      </w:r>
-      <w:proofErr w:type="spellStart"/>
-      <w:r>
-        <w:t>working</w:t>
-      </w:r>
-      <w:proofErr w:type="spellEnd"/>
-      <w:r>
-        <w:t xml:space="preserve"> les waarbij we dus informatie kunnen delen met medeleerlingen. Al was het de eerste les dus kwam daar niet veel van. Ik begon gewoon verder aan mijn </w:t>
-      </w:r>
-      <w:proofErr w:type="spellStart"/>
+        <w:t xml:space="preserve">Vandaag in de namiddag begonnen we met de co-working les waarbij we dus informatie kunnen delen met medeleerlingen. Al was het de eerste les dus kwam daar niet veel van. Ik begon gewoon verder aan mijn </w:t>
+      </w:r>
       <w:r>
         <w:t>F</w:t>
       </w:r>
       <w:r>
-        <w:t>igma</w:t>
-      </w:r>
-      <w:proofErr w:type="spellEnd"/>
-      <w:r>
-        <w:t xml:space="preserve"> design.</w:t>
+        <w:t>igma design.</w:t>
       </w:r>
     </w:p>
     <w:p>
@@ -309,15 +160,7 @@
         <w:t>te veel</w:t>
       </w:r>
       <w:r>
-        <w:t xml:space="preserve"> naar voor moest leunen en dus </w:t>
-      </w:r>
-      <w:proofErr w:type="gramStart"/>
-      <w:r>
-        <w:t>nek pijn</w:t>
-      </w:r>
-      <w:proofErr w:type="gramEnd"/>
-      <w:r>
-        <w:t xml:space="preserve"> kreeg en er waren precies geen ramen om te openen. </w:t>
+        <w:t xml:space="preserve"> naar voor moest leunen en dus nek pijn kreeg en er waren precies geen ramen om te openen. </w:t>
       </w:r>
       <w:r>
         <w:t>Gelukkig kunnen we naar buiten wanneer we het willen.</w:t>
@@ -357,23 +200,7 @@
     </w:p>
     <w:p>
       <w:r>
-        <w:t xml:space="preserve">Vandaag heb ik verder gewerkt aan mijn </w:t>
-      </w:r>
-      <w:proofErr w:type="spellStart"/>
-      <w:r>
-        <w:t>Figma</w:t>
-      </w:r>
-      <w:proofErr w:type="spellEnd"/>
-      <w:r>
-        <w:t xml:space="preserve"> design en het ging redelijk vlot vooruit. Ik wou absoluut dat het vandaag af was zodat ik morgen kan werken aan een ander vak. Tijdens het maken van het design heb ik vooral ook zitten op zoeken dat sommige concepten wel haalbaar zijn om te programmeren. Dit is allemaal wel mogelijk, maar zal wel een </w:t>
-      </w:r>
-      <w:proofErr w:type="spellStart"/>
-      <w:r>
-        <w:t>challenge</w:t>
-      </w:r>
-      <w:proofErr w:type="spellEnd"/>
-      <w:r>
-        <w:t xml:space="preserve"> zijn zoals de opmerkingen plaatsen</w:t>
+        <w:t>Vandaag heb ik verder gewerkt aan mijn Figma design en het ging redelijk vlot vooruit. Ik wou absoluut dat het vandaag af was zodat ik morgen kan werken aan een ander vak. Tijdens het maken van het design heb ik vooral ook zitten op zoeken dat sommige concepten wel haalbaar zijn om te programmeren. Dit is allemaal wel mogelijk, maar zal wel een challenge zijn zoals de opmerkingen plaatsen</w:t>
       </w:r>
       <w:r>
         <w:t>. M</w:t>
@@ -426,7 +253,7 @@
                     </pic:cNvPicPr>
                   </pic:nvPicPr>
                   <pic:blipFill>
-                    <a:blip r:embed="rId5" cstate="print">
+                    <a:blip r:embed="rId6" cstate="print">
                       <a:extLst>
                         <a:ext uri="{28A0092B-C50C-407E-A947-70E740481C1C}">
                           <a14:useLocalDpi xmlns:a14="http://schemas.microsoft.com/office/drawing/2010/main" val="0"/>
@@ -485,54 +312,17 @@
     </w:p>
     <w:p>
       <w:r>
-        <w:t xml:space="preserve">Vandaag werd mijn </w:t>
-      </w:r>
-      <w:proofErr w:type="spellStart"/>
-      <w:r>
-        <w:t>figma</w:t>
-      </w:r>
-      <w:proofErr w:type="spellEnd"/>
-      <w:r>
-        <w:t xml:space="preserve"> prototype gecontroleerd waarbij ik moest opnieuw uitleggen wat mijn app doet door middel van accurate presentatie. Ik legde dit vrij duidelijk uit en alles ging goed vooruit. Meneer </w:t>
-      </w:r>
-      <w:proofErr w:type="spellStart"/>
-      <w:r>
-        <w:t>Blancquaert</w:t>
-      </w:r>
-      <w:proofErr w:type="spellEnd"/>
-      <w:r>
-        <w:t xml:space="preserve"> heeft me dan ook nog een </w:t>
-      </w:r>
-      <w:proofErr w:type="spellStart"/>
-      <w:r>
-        <w:t>library</w:t>
-      </w:r>
-      <w:proofErr w:type="spellEnd"/>
-      <w:r>
-        <w:t xml:space="preserve"> genaamd “</w:t>
-      </w:r>
-      <w:proofErr w:type="spellStart"/>
-      <w:r>
-        <w:t>Material</w:t>
-      </w:r>
-      <w:proofErr w:type="spellEnd"/>
-      <w:r>
-        <w:t xml:space="preserve"> design” aangeraden om mijn applicatie te ontwerpen. </w:t>
-      </w:r>
-      <w:r>
-        <w:t xml:space="preserve">Blijkbaar Google gebruikt deze </w:t>
-      </w:r>
-      <w:proofErr w:type="spellStart"/>
-      <w:r>
-        <w:t>library</w:t>
-      </w:r>
-      <w:proofErr w:type="spellEnd"/>
+        <w:t xml:space="preserve">Vandaag werd mijn figma prototype gecontroleerd waarbij ik moest opnieuw uitleggen wat mijn app doet door middel van accurate presentatie. Ik legde dit vrij duidelijk uit en alles ging goed vooruit. Meneer Blancquaert heeft me dan ook nog een library genaamd “Material design” aangeraden om mijn applicatie te ontwerpen. </w:t>
+      </w:r>
+      <w:r>
+        <w:t>Blijkbaar Google gebruikt deze library</w:t>
+      </w:r>
       <w:r>
         <w:t xml:space="preserve"> om hun apps te maken.</w:t>
       </w:r>
     </w:p>
     <w:p>
-      <w:hyperlink r:id="rId6" w:history="1">
+      <w:hyperlink r:id="rId7" w:history="1">
         <w:r>
           <w:rPr>
             <w:rStyle w:val="Hyperlink"/>
@@ -564,30 +354,14 @@
         <w:t xml:space="preserve">kunt maken </w:t>
       </w:r>
       <w:r>
-        <w:t xml:space="preserve">om je app te testen. Als je </w:t>
-      </w:r>
-      <w:proofErr w:type="spellStart"/>
-      <w:r>
-        <w:t>developer</w:t>
-      </w:r>
-      <w:proofErr w:type="spellEnd"/>
-      <w:r>
-        <w:t xml:space="preserve"> modus in de </w:t>
-      </w:r>
-      <w:proofErr w:type="spellStart"/>
-      <w:r>
-        <w:t>settings</w:t>
-      </w:r>
-      <w:proofErr w:type="spellEnd"/>
-      <w:r>
-        <w:t xml:space="preserve"> van je gsm</w:t>
+        <w:t>om je app te testen. Als je developer modus in de settings van je gsm</w:t>
       </w:r>
       <w:r>
         <w:t xml:space="preserve"> aanzet, kan je je gsm verbinden met de pc en dus je applicatie daarop testen.</w:t>
       </w:r>
     </w:p>
     <w:p>
-      <w:hyperlink r:id="rId7" w:anchor="0" w:history="1">
+      <w:hyperlink r:id="rId8" w:anchor="0" w:history="1">
         <w:r>
           <w:rPr>
             <w:rStyle w:val="Hyperlink"/>
@@ -598,23 +372,7 @@
     </w:p>
     <w:p>
       <w:r>
-        <w:t xml:space="preserve">Tijdens lange downloads heb ik ook mijn </w:t>
-      </w:r>
-      <w:proofErr w:type="gramStart"/>
-      <w:r>
-        <w:t>google account</w:t>
-      </w:r>
-      <w:proofErr w:type="gramEnd"/>
-      <w:r>
-        <w:t xml:space="preserve"> toegevoegd op </w:t>
-      </w:r>
-      <w:proofErr w:type="spellStart"/>
-      <w:r>
-        <w:t>Firebase</w:t>
-      </w:r>
-      <w:proofErr w:type="spellEnd"/>
-      <w:r>
-        <w:t>. Volgens de presentatie die we kregen van een medestudent.</w:t>
+        <w:t>Tijdens lange downloads heb ik ook mijn google account toegevoegd op Firebase. Volgens de presentatie die we kregen van een medestudent.</w:t>
       </w:r>
     </w:p>
     <w:p>
@@ -665,23 +423,7 @@
         <w:t>mijn</w:t>
       </w:r>
       <w:r>
-        <w:t xml:space="preserve"> </w:t>
-      </w:r>
-      <w:proofErr w:type="spellStart"/>
-      <w:r>
-        <w:t>figma</w:t>
-      </w:r>
-      <w:proofErr w:type="spellEnd"/>
-      <w:r>
-        <w:t xml:space="preserve"> design delen met meneer </w:t>
-      </w:r>
-      <w:proofErr w:type="spellStart"/>
-      <w:r>
-        <w:t>Blancquaert</w:t>
-      </w:r>
-      <w:proofErr w:type="spellEnd"/>
-      <w:r>
-        <w:t>, toen hij vroeg dat mijn design klaar was</w:t>
+        <w:t xml:space="preserve"> figma design delen met meneer Blancquaert, toen hij vroeg dat mijn design klaar was</w:t>
       </w:r>
       <w:r>
         <w:t xml:space="preserve"> of niet</w:t>
@@ -695,54 +437,14 @@
         <w:t>Ik heb daarna gewoon verder begonnen aan de tutorial die ik vorige week gebruikt had.</w:t>
       </w:r>
       <w:r>
-        <w:t xml:space="preserve"> Hierbij leerde ik meer over hoe ik </w:t>
-      </w:r>
-      <w:proofErr w:type="gramStart"/>
-      <w:r>
-        <w:t>Android studio</w:t>
-      </w:r>
-      <w:proofErr w:type="gramEnd"/>
-      <w:r>
-        <w:t xml:space="preserve"> beter kon gebruiken om mijn app te </w:t>
-      </w:r>
-      <w:proofErr w:type="spellStart"/>
-      <w:r>
-        <w:t>designen</w:t>
-      </w:r>
-      <w:proofErr w:type="spellEnd"/>
-      <w:r>
-        <w:t xml:space="preserve"> zoals hoe je </w:t>
+        <w:t xml:space="preserve"> Hierbij leerde ik meer over hoe ik Android studio beter kon gebruiken om mijn app te designen zoals hoe je </w:t>
       </w:r>
       <w:r>
         <w:lastRenderedPageBreak/>
-        <w:t xml:space="preserve">attributen kunt aanpassen (bv. </w:t>
-      </w:r>
-      <w:proofErr w:type="spellStart"/>
-      <w:r>
-        <w:t>color</w:t>
-      </w:r>
-      <w:proofErr w:type="spellEnd"/>
-      <w:r>
-        <w:t>)</w:t>
-      </w:r>
-      <w:r>
-        <w:t xml:space="preserve">. </w:t>
-      </w:r>
-      <w:proofErr w:type="gramStart"/>
-      <w:r>
-        <w:t>Android studio</w:t>
-      </w:r>
-      <w:proofErr w:type="gramEnd"/>
-      <w:r>
-        <w:t xml:space="preserve"> is zeer gelijkaardig als bijvoorbeeld </w:t>
-      </w:r>
-      <w:proofErr w:type="spellStart"/>
-      <w:r>
-        <w:t>Webstorm</w:t>
-      </w:r>
-      <w:proofErr w:type="spellEnd"/>
-      <w:r>
-        <w:t xml:space="preserve">, maar bij het design van een mobile app is het zeer </w:t>
+        <w:t>attributen kunt aanpassen (bv. color)</w:t>
+      </w:r>
+      <w:r>
+        <w:t xml:space="preserve">. Android studio is zeer gelijkaardig als bijvoorbeeld Webstorm, maar bij het design van een mobile app is het zeer </w:t>
       </w:r>
       <w:r>
         <w:t>verschillend</w:t>
@@ -751,27 +453,14 @@
         <w:t>.</w:t>
       </w:r>
       <w:r>
-        <w:t xml:space="preserve"> Bij </w:t>
-      </w:r>
-      <w:proofErr w:type="spellStart"/>
-      <w:r>
-        <w:t>Webstorm</w:t>
-      </w:r>
-      <w:proofErr w:type="spellEnd"/>
-      <w:r>
-        <w:t xml:space="preserve"> kan je je website </w:t>
+        <w:t xml:space="preserve"> Bij Webstorm kan je je website </w:t>
       </w:r>
       <w:r>
         <w:t>bekijken</w:t>
       </w:r>
       <w:r>
-        <w:t xml:space="preserve"> in een gekozen browser, maar je kan in </w:t>
-      </w:r>
-      <w:proofErr w:type="gramStart"/>
-      <w:r>
-        <w:t>Android studio</w:t>
-      </w:r>
-      <w:proofErr w:type="gramEnd"/>
+        <w:t xml:space="preserve"> in een gekozen browser, maar je kan in Android studio</w:t>
+      </w:r>
       <w:r>
         <w:t xml:space="preserve"> je app</w:t>
       </w:r>
@@ -791,15 +480,7 @@
         <w:t>.</w:t>
       </w:r>
       <w:r>
-        <w:t xml:space="preserve"> Als ik de </w:t>
-      </w:r>
-      <w:proofErr w:type="spellStart"/>
-      <w:r>
-        <w:t>Jetbrains</w:t>
-      </w:r>
-      <w:proofErr w:type="spellEnd"/>
-      <w:r>
-        <w:t xml:space="preserve"> applicaties vergelijk met Visual studio 2019, </w:t>
+        <w:t xml:space="preserve"> Als ik de Jetbrains applicaties vergelijk met Visual studio 2019, </w:t>
       </w:r>
       <w:r>
         <w:t>heb ik er altijd moeite mee om de lay</w:t>
@@ -835,7 +516,7 @@
                     <pic:cNvPicPr/>
                   </pic:nvPicPr>
                   <pic:blipFill>
-                    <a:blip r:embed="rId8"/>
+                    <a:blip r:embed="rId9"/>
                     <a:stretch>
                       <a:fillRect/>
                     </a:stretch>
@@ -879,23 +560,7 @@
     </w:p>
     <w:p>
       <w:r>
-        <w:t xml:space="preserve">Ik heb dan ondertussen de tutorial van </w:t>
-      </w:r>
-      <w:proofErr w:type="spellStart"/>
-      <w:r>
-        <w:t>Material</w:t>
-      </w:r>
-      <w:proofErr w:type="spellEnd"/>
-      <w:r>
-        <w:t xml:space="preserve"> design gevolgd in plaats van die van </w:t>
-      </w:r>
-      <w:proofErr w:type="gramStart"/>
-      <w:r>
-        <w:t>Android studio</w:t>
-      </w:r>
-      <w:proofErr w:type="gramEnd"/>
-      <w:r>
-        <w:t>. Ze leerde me dan hoe ik er mee kon werken maar niet hoe een hele nieuwe app kon maken. Ik kreeg een voorbeeld app om erin te kunnen werken voor de tutorial.</w:t>
+        <w:t>Ik heb dan ondertussen de tutorial van Material design gevolgd in plaats van die van Android studio. Ze leerde me dan hoe ik er mee kon werken maar niet hoe een hele nieuwe app kon maken. Ik kreeg een voorbeeld app om erin te kunnen werken voor de tutorial.</w:t>
       </w:r>
     </w:p>
     <w:p>
@@ -904,7 +569,7 @@
           <w:rStyle w:val="Hyperlink"/>
         </w:rPr>
       </w:pPr>
-      <w:hyperlink r:id="rId9" w:anchor="0" w:history="1">
+      <w:hyperlink r:id="rId10" w:anchor="0" w:history="1">
         <w:r>
           <w:rPr>
             <w:rStyle w:val="Hyperlink"/>
@@ -938,34 +603,10 @@
     </w:p>
     <w:p>
       <w:r>
-        <w:t xml:space="preserve">Vandaag heb ik de usertests afgelegd met Louis </w:t>
-      </w:r>
-      <w:proofErr w:type="spellStart"/>
-      <w:r>
-        <w:t>D’hondt</w:t>
-      </w:r>
-      <w:proofErr w:type="spellEnd"/>
-      <w:r>
-        <w:t xml:space="preserve"> en Jasper Wauters. Dit ging heel gemakkelijk en duurde niet lang. Ik had niet echt serieuze opmerkingen, behalve dat ik geen persoonlijke info pagina gemaakt had.</w:t>
-      </w:r>
-      <w:r>
-        <w:t xml:space="preserve"> Daarna heb ik onmiddellijk die opmerkingen van mijn </w:t>
-      </w:r>
-      <w:proofErr w:type="spellStart"/>
-      <w:r>
-        <w:t>figma</w:t>
-      </w:r>
-      <w:proofErr w:type="spellEnd"/>
-      <w:r>
-        <w:t xml:space="preserve"> design verbetert en op mijn </w:t>
-      </w:r>
-      <w:proofErr w:type="spellStart"/>
-      <w:r>
-        <w:t>repository</w:t>
-      </w:r>
-      <w:proofErr w:type="spellEnd"/>
-      <w:r>
-        <w:t xml:space="preserve"> gezet.</w:t>
+        <w:t>Vandaag heb ik de usertests afgelegd met Louis D’hondt en Jasper Wauters. Dit ging heel gemakkelijk en duurde niet lang. Ik had niet echt serieuze opmerkingen, behalve dat ik geen persoonlijke info pagina gemaakt had.</w:t>
+      </w:r>
+      <w:r>
+        <w:t xml:space="preserve"> Daarna heb ik onmiddellijk die opmerkingen van mijn figma design verbetert en op mijn repository gezet.</w:t>
       </w:r>
     </w:p>
     <w:p/>
@@ -988,47 +629,7 @@
     </w:p>
     <w:p>
       <w:r>
-        <w:t xml:space="preserve">Vandaag begon ik eindelijk met </w:t>
-      </w:r>
-      <w:proofErr w:type="spellStart"/>
-      <w:r>
-        <w:t>Material</w:t>
-      </w:r>
-      <w:proofErr w:type="spellEnd"/>
-      <w:r>
-        <w:t xml:space="preserve"> Design. Ik besloot mijn oude app te verwijderen en te vervangen met een empty </w:t>
-      </w:r>
-      <w:proofErr w:type="spellStart"/>
-      <w:r>
-        <w:t>activity</w:t>
-      </w:r>
-      <w:proofErr w:type="spellEnd"/>
-      <w:r>
-        <w:t xml:space="preserve"> zodat ik echt van scratch begin. Zo kan ik alles beter begrijpen. Ik had dan ontdekt dat </w:t>
-      </w:r>
-      <w:proofErr w:type="spellStart"/>
-      <w:r>
-        <w:t>android</w:t>
-      </w:r>
-      <w:proofErr w:type="spellEnd"/>
-      <w:r>
-        <w:t xml:space="preserve"> studio al automatisch </w:t>
-      </w:r>
-      <w:proofErr w:type="spellStart"/>
-      <w:r>
-        <w:t>Material</w:t>
-      </w:r>
-      <w:proofErr w:type="spellEnd"/>
-      <w:r>
-        <w:t xml:space="preserve"> Design van Google had toegevoegd bij de </w:t>
-      </w:r>
-      <w:proofErr w:type="spellStart"/>
-      <w:r>
-        <w:t>dependencies</w:t>
-      </w:r>
-      <w:proofErr w:type="spellEnd"/>
-      <w:r>
-        <w:t xml:space="preserve">, dus eigenlijk ben ik </w:t>
+        <w:t xml:space="preserve">Vandaag begon ik eindelijk met Material Design. Ik besloot mijn oude app te verwijderen en te vervangen met een empty activity zodat ik echt van scratch begin. Zo kan ik alles beter begrijpen. Ik had dan ontdekt dat android studio al automatisch Material Design van Google had toegevoegd bij de dependencies, dus eigenlijk ben ik </w:t>
       </w:r>
       <w:r>
         <w:t>onmiddellijk</w:t>
@@ -1038,7 +639,7 @@
       </w:r>
     </w:p>
     <w:p>
-      <w:hyperlink r:id="rId10" w:history="1">
+      <w:hyperlink r:id="rId11" w:history="1">
         <w:r>
           <w:rPr>
             <w:rStyle w:val="Hyperlink"/>
@@ -1057,56 +658,6 @@
             <wp:extent cx="5724525" cy="2171700"/>
             <wp:effectExtent l="0" t="0" r="9525" b="0"/>
             <wp:docPr id="3" name="Afbeelding 3"/>
-            <wp:cNvGraphicFramePr>
-              <a:graphicFrameLocks xmlns:a="http://schemas.openxmlformats.org/drawingml/2006/main" noChangeAspect="1"/>
-            </wp:cNvGraphicFramePr>
-            <a:graphic xmlns:a="http://schemas.openxmlformats.org/drawingml/2006/main">
-              <a:graphicData uri="http://schemas.openxmlformats.org/drawingml/2006/picture">
-                <pic:pic xmlns:pic="http://schemas.openxmlformats.org/drawingml/2006/picture">
-                  <pic:nvPicPr>
-                    <pic:cNvPr id="1" name=""/>
-                    <pic:cNvPicPr/>
-                  </pic:nvPicPr>
-                  <pic:blipFill>
-                    <a:blip r:embed="rId11"/>
-                    <a:stretch>
-                      <a:fillRect/>
-                    </a:stretch>
-                  </pic:blipFill>
-                  <pic:spPr>
-                    <a:xfrm>
-                      <a:off x="0" y="0"/>
-                      <a:ext cx="5724525" cy="2171700"/>
-                    </a:xfrm>
-                    <a:prstGeom prst="rect">
-                      <a:avLst/>
-                    </a:prstGeom>
-                  </pic:spPr>
-                </pic:pic>
-              </a:graphicData>
-            </a:graphic>
-          </wp:inline>
-        </w:drawing>
-      </w:r>
-    </w:p>
-    <w:p>
-      <w:r>
-        <w:t>Ik heb dan ondertussen de login pagina eindelijk gemaakt.</w:t>
-      </w:r>
-      <w:r>
-        <w:t xml:space="preserve"> Ik heb daarna een probleem gekregen waarbij ik dus de app niet kan runnen.</w:t>
-      </w:r>
-    </w:p>
-    <w:p>
-      <w:r>
-        <w:rPr>
-          <w:noProof/>
-        </w:rPr>
-        <w:drawing>
-          <wp:inline distT="0" distB="0" distL="0" distR="0" wp14:anchorId="277B721E" wp14:editId="024DA216">
-            <wp:extent cx="2129535" cy="4270076"/>
-            <wp:effectExtent l="0" t="0" r="4445" b="0"/>
-            <wp:docPr id="4" name="Afbeelding 4"/>
             <wp:cNvGraphicFramePr>
               <a:graphicFrameLocks xmlns:a="http://schemas.openxmlformats.org/drawingml/2006/main" noChangeAspect="1"/>
             </wp:cNvGraphicFramePr>
@@ -1126,6 +677,56 @@
                   <pic:spPr>
                     <a:xfrm>
                       <a:off x="0" y="0"/>
+                      <a:ext cx="5724525" cy="2171700"/>
+                    </a:xfrm>
+                    <a:prstGeom prst="rect">
+                      <a:avLst/>
+                    </a:prstGeom>
+                  </pic:spPr>
+                </pic:pic>
+              </a:graphicData>
+            </a:graphic>
+          </wp:inline>
+        </w:drawing>
+      </w:r>
+    </w:p>
+    <w:p>
+      <w:r>
+        <w:t>Ik heb dan ondertussen de login pagina eindelijk gemaakt.</w:t>
+      </w:r>
+      <w:r>
+        <w:t xml:space="preserve"> Ik heb daarna een probleem gekregen waarbij ik dus de app niet kan runnen.</w:t>
+      </w:r>
+    </w:p>
+    <w:p>
+      <w:r>
+        <w:rPr>
+          <w:noProof/>
+        </w:rPr>
+        <w:drawing>
+          <wp:inline distT="0" distB="0" distL="0" distR="0" wp14:anchorId="277B721E" wp14:editId="024DA216">
+            <wp:extent cx="2129535" cy="4270076"/>
+            <wp:effectExtent l="0" t="0" r="4445" b="0"/>
+            <wp:docPr id="4" name="Afbeelding 4"/>
+            <wp:cNvGraphicFramePr>
+              <a:graphicFrameLocks xmlns:a="http://schemas.openxmlformats.org/drawingml/2006/main" noChangeAspect="1"/>
+            </wp:cNvGraphicFramePr>
+            <a:graphic xmlns:a="http://schemas.openxmlformats.org/drawingml/2006/main">
+              <a:graphicData uri="http://schemas.openxmlformats.org/drawingml/2006/picture">
+                <pic:pic xmlns:pic="http://schemas.openxmlformats.org/drawingml/2006/picture">
+                  <pic:nvPicPr>
+                    <pic:cNvPr id="1" name=""/>
+                    <pic:cNvPicPr/>
+                  </pic:nvPicPr>
+                  <pic:blipFill>
+                    <a:blip r:embed="rId13"/>
+                    <a:stretch>
+                      <a:fillRect/>
+                    </a:stretch>
+                  </pic:blipFill>
+                  <pic:spPr>
+                    <a:xfrm>
+                      <a:off x="0" y="0"/>
                       <a:ext cx="2131506" cy="4274029"/>
                     </a:xfrm>
                     <a:prstGeom prst="rect">
@@ -1172,50 +773,18 @@
     </w:p>
     <w:p>
       <w:r>
-        <w:t xml:space="preserve">Eerst had ik geprobeerd om gewoon een heel nieuw project te maken die bestond uit een login </w:t>
-      </w:r>
-      <w:proofErr w:type="spellStart"/>
-      <w:r>
-        <w:t>activity</w:t>
-      </w:r>
-      <w:proofErr w:type="spellEnd"/>
-      <w:r>
-        <w:t xml:space="preserve">. Deze </w:t>
-      </w:r>
-      <w:proofErr w:type="spellStart"/>
-      <w:r>
-        <w:t>activity</w:t>
-      </w:r>
-      <w:proofErr w:type="spellEnd"/>
-      <w:r>
-        <w:t xml:space="preserve"> heb ik dan gewoon aangepast naar mijn wens. Maar dit wou ook niet echt werken, want blijkbaar is het best dat je van een </w:t>
-      </w:r>
-      <w:proofErr w:type="spellStart"/>
-      <w:r>
-        <w:t>main</w:t>
+        <w:t>Eerst had ik geprobeerd om gewoon een heel nieuw project te maken die bestond uit een login activity. Deze activity heb ik dan gewoon aangepast naar mijn wens. Maar dit wou ook niet echt werken, want blijkbaar is het best dat je van een main</w:t>
       </w:r>
       <w:r>
         <w:t>_</w:t>
       </w:r>
       <w:r>
-        <w:t>activity</w:t>
-      </w:r>
-      <w:proofErr w:type="spellEnd"/>
-      <w:r>
-        <w:t xml:space="preserve"> start en dan de login page daarmee opent.</w:t>
-      </w:r>
-    </w:p>
-    <w:p>
-      <w:r>
-        <w:t xml:space="preserve">Ik ben dan gewoon terug begonnen aan het oude project en heb dan de error op stack overflow gezocht en daar had ik de oplossing gevonden. Ik moest gewoon mijn “device” zijn data </w:t>
-      </w:r>
-      <w:proofErr w:type="spellStart"/>
-      <w:r>
-        <w:t>wipen</w:t>
-      </w:r>
-      <w:proofErr w:type="spellEnd"/>
-      <w:r>
-        <w:t xml:space="preserve"> en dan kon het opnieuw installeren want mijn oude projecten stond er nog op.</w:t>
+        <w:t>activity start en dan de login page daarmee opent.</w:t>
+      </w:r>
+    </w:p>
+    <w:p>
+      <w:r>
+        <w:t>Ik ben dan gewoon terug begonnen aan het oude project en heb dan de error op stack overflow gezocht en daar had ik de oplossing gevonden. Ik moest gewoon mijn “device” zijn data wipen en dan kon het opnieuw installeren want mijn oude projecten stond er nog op.</w:t>
       </w:r>
     </w:p>
     <w:p>
@@ -1224,7 +793,7 @@
           <w:rStyle w:val="Hyperlink"/>
         </w:rPr>
       </w:pPr>
-      <w:hyperlink r:id="rId13" w:anchor="58335194" w:history="1">
+      <w:hyperlink r:id="rId14" w:anchor="58335194" w:history="1">
         <w:r>
           <w:rPr>
             <w:rStyle w:val="Hyperlink"/>
@@ -1259,23 +828,7 @@
         <w:t>Vandaag wou de wifi niet werken op de campus dus had ik niet veel vooruitgang geboekt.</w:t>
       </w:r>
       <w:r>
-        <w:t xml:space="preserve"> Ik was ook gisteren vergeten om de registratie pagina te </w:t>
-      </w:r>
-      <w:proofErr w:type="spellStart"/>
-      <w:r>
-        <w:t>committen</w:t>
-      </w:r>
-      <w:proofErr w:type="spellEnd"/>
-      <w:r>
-        <w:t xml:space="preserve">, dus da had ik alleszins gedaan door met mijn </w:t>
-      </w:r>
-      <w:proofErr w:type="spellStart"/>
-      <w:r>
-        <w:t>hotspot</w:t>
-      </w:r>
-      <w:proofErr w:type="spellEnd"/>
-      <w:r>
-        <w:t xml:space="preserve"> van mijn gsm te verbinden en de 4G aan te zetten.</w:t>
+        <w:t xml:space="preserve"> Ik was ook gisteren vergeten om de registratie pagina te committen, dus da had ik alleszins gedaan door met mijn hotspot van mijn gsm te verbinden en de 4G aan te zetten.</w:t>
       </w:r>
     </w:p>
     <w:p>
@@ -1307,21 +860,11 @@
         <w:t>Vandaag wou de wifi op school nog steeds niet zo goed werken</w:t>
       </w:r>
       <w:r>
-        <w:t xml:space="preserve">, maar dankzij de wifi </w:t>
-      </w:r>
-      <w:proofErr w:type="spellStart"/>
-      <w:r>
-        <w:t>hotspot</w:t>
-      </w:r>
-      <w:proofErr w:type="spellEnd"/>
-      <w:r>
-        <w:t xml:space="preserve"> heb ik toch nog de navigatie van login naar registratie kunnen </w:t>
-      </w:r>
-      <w:proofErr w:type="spellStart"/>
+        <w:t xml:space="preserve">, maar dankzij de wifi hotspot heb ik toch nog de navigatie van login naar registratie kunnen </w:t>
+      </w:r>
       <w:r>
         <w:t>commiten</w:t>
       </w:r>
-      <w:proofErr w:type="spellEnd"/>
       <w:r>
         <w:t>.</w:t>
       </w:r>
@@ -1331,15 +874,7 @@
     </w:p>
     <w:p>
       <w:r>
-        <w:t xml:space="preserve">De wifi wou uiteindelijk werken dus kon eindelijk heel vlot vooruitgaan. Ik heb daarbij de navigatie tussen de login en registratie kunnen afwerken. Daarna heb ik ook de startpagina bijna afgewerkt, maar de </w:t>
-      </w:r>
-      <w:proofErr w:type="spellStart"/>
-      <w:r>
-        <w:t>bottom</w:t>
-      </w:r>
-      <w:proofErr w:type="spellEnd"/>
-      <w:r>
-        <w:t xml:space="preserve"> bar wou niet helemaal meewerken dus dat laat ik voor later.</w:t>
+        <w:t>De wifi wou uiteindelijk werken dus kon eindelijk heel vlot vooruitgaan. Ik heb daarbij de navigatie tussen de login en registratie kunnen afwerken. Daarna heb ik ook de startpagina bijna afgewerkt, maar de bottom bar wou niet helemaal meewerken dus dat laat ik voor later.</w:t>
       </w:r>
     </w:p>
     <w:p/>
@@ -1360,35 +895,11 @@
     </w:p>
     <w:p>
       <w:r>
-        <w:t xml:space="preserve">Vandaag heb ik de bodem navigatie afgewerkt waarbij je dan naar je groepen kunt gaan oftewel naar je notities die je hebt gefotografeerd. Dit was eerste wel een </w:t>
-      </w:r>
-      <w:proofErr w:type="spellStart"/>
-      <w:r>
-        <w:t>challenge</w:t>
-      </w:r>
-      <w:proofErr w:type="spellEnd"/>
-      <w:r>
-        <w:t xml:space="preserve"> zoals de </w:t>
-      </w:r>
-      <w:proofErr w:type="spellStart"/>
-      <w:r>
-        <w:t>active</w:t>
-      </w:r>
-      <w:proofErr w:type="spellEnd"/>
-      <w:r>
-        <w:t xml:space="preserve"> pagina weergegeven of de juiste </w:t>
-      </w:r>
-      <w:proofErr w:type="spellStart"/>
-      <w:r>
-        <w:t>eventlistener</w:t>
-      </w:r>
-      <w:proofErr w:type="spellEnd"/>
-      <w:r>
-        <w:t xml:space="preserve"> gebruiken om te kunnen navigeren. Maar deze links hebben daarbij geholpen:</w:t>
-      </w:r>
-    </w:p>
-    <w:p>
-      <w:hyperlink r:id="rId14" w:history="1">
+        <w:t>Vandaag heb ik de bodem navigatie afgewerkt waarbij je dan naar je groepen kunt gaan oftewel naar je notities die je hebt gefotografeerd. Dit was eerste wel een challenge zoals de active pagina weergegeven of de juiste eventlistener gebruiken om te kunnen navigeren. Maar deze links hebben daarbij geholpen:</w:t>
+      </w:r>
+    </w:p>
+    <w:p>
+      <w:hyperlink r:id="rId15" w:history="1">
         <w:r>
           <w:rPr>
             <w:rStyle w:val="Hyperlink"/>
@@ -1398,7 +909,7 @@
       </w:hyperlink>
     </w:p>
     <w:p>
-      <w:hyperlink r:id="rId15" w:history="1">
+      <w:hyperlink r:id="rId16" w:history="1">
         <w:r>
           <w:rPr>
             <w:rStyle w:val="Hyperlink"/>
@@ -1430,33 +941,17 @@
     </w:p>
     <w:p>
       <w:r>
-        <w:t xml:space="preserve">Ik heb dan ook nog voor gezorgd dat mijn </w:t>
-      </w:r>
-      <w:proofErr w:type="spellStart"/>
-      <w:r>
-        <w:t>firebase</w:t>
-      </w:r>
-      <w:proofErr w:type="spellEnd"/>
-      <w:r>
-        <w:t xml:space="preserve"> account verbonden is met</w:t>
+        <w:t>Ik heb dan ook nog voor gezorgd dat mijn firebase account verbonden is met</w:t>
       </w:r>
       <w:r>
         <w:t xml:space="preserve"> mijn</w:t>
       </w:r>
       <w:r>
-        <w:t xml:space="preserve"> </w:t>
-      </w:r>
-      <w:proofErr w:type="spellStart"/>
-      <w:r>
-        <w:t>android</w:t>
-      </w:r>
-      <w:proofErr w:type="spellEnd"/>
-      <w:r>
-        <w:t xml:space="preserve"> studio app.</w:t>
-      </w:r>
-    </w:p>
-    <w:p>
-      <w:hyperlink r:id="rId16" w:history="1">
+        <w:t xml:space="preserve"> android studio app.</w:t>
+      </w:r>
+    </w:p>
+    <w:p>
+      <w:hyperlink r:id="rId17" w:history="1">
         <w:r>
           <w:rPr>
             <w:rStyle w:val="Hyperlink"/>
@@ -1484,7 +979,7 @@
                       <pic:cNvPicPr/>
                     </pic:nvPicPr>
                     <pic:blipFill>
-                      <a:blip r:embed="rId17"/>
+                      <a:blip r:embed="rId18"/>
                       <a:stretch>
                         <a:fillRect/>
                       </a:stretch>
@@ -1555,7 +1050,7 @@
                       <pic:cNvPicPr/>
                     </pic:nvPicPr>
                     <pic:blipFill>
-                      <a:blip r:embed="rId18"/>
+                      <a:blip r:embed="rId19"/>
                       <a:stretch>
                         <a:fillRect/>
                       </a:stretch>
@@ -1587,6 +1082,50 @@
       </w:r>
     </w:p>
     <w:p/>
+    <w:p>
+      <w:pPr>
+        <w:pStyle w:val="Kop3"/>
+      </w:pPr>
+      <w:r>
+        <w:t>Wat ik wil realiseren:</w:t>
+      </w:r>
+    </w:p>
+    <w:p>
+      <w:pPr>
+        <w:pStyle w:val="Lijstalinea"/>
+        <w:numPr>
+          <w:ilvl w:val="0"/>
+          <w:numId w:val="1"/>
+        </w:numPr>
+      </w:pPr>
+      <w:r>
+        <w:t>Firebase implementeren</w:t>
+      </w:r>
+    </w:p>
+    <w:p>
+      <w:pPr>
+        <w:pStyle w:val="Lijstalinea"/>
+        <w:numPr>
+          <w:ilvl w:val="0"/>
+          <w:numId w:val="1"/>
+        </w:numPr>
+      </w:pPr>
+      <w:r>
+        <w:t>Login en registratie mogelijk maken via firebase</w:t>
+      </w:r>
+    </w:p>
+    <w:p>
+      <w:pPr>
+        <w:pStyle w:val="Lijstalinea"/>
+        <w:numPr>
+          <w:ilvl w:val="0"/>
+          <w:numId w:val="1"/>
+        </w:numPr>
+      </w:pPr>
+      <w:r>
+        <w:t>Camera functionaliteit bekijken voor android</w:t>
+      </w:r>
+    </w:p>
     <w:p/>
     <w:p/>
     <w:p/>
@@ -1600,6 +1139,103 @@
     </w:sectPr>
   </w:body>
 </w:document>
+</file>
+
+<file path=word/numbering.xml><?xml version="1.0" encoding="utf-8"?>
+<w:numbering xmlns:wpc="http://schemas.microsoft.com/office/word/2010/wordprocessingCanvas" xmlns:cx="http://schemas.microsoft.com/office/drawing/2014/chartex" xmlns:cx1="http://schemas.microsoft.com/office/drawing/2015/9/8/chartex" xmlns:cx2="http://schemas.microsoft.com/office/drawing/2015/10/21/chartex" xmlns:cx3="http://schemas.microsoft.com/office/drawing/2016/5/9/chartex" xmlns:cx4="http://schemas.microsoft.com/office/drawing/2016/5/10/chartex" xmlns:cx5="http://schemas.microsoft.com/office/drawing/2016/5/11/chartex" xmlns:cx6="http://schemas.microsoft.com/office/drawing/2016/5/12/chartex" xmlns:cx7="http://schemas.microsoft.com/office/drawing/2016/5/13/chartex" xmlns:cx8="http://schemas.microsoft.com/office/drawing/2016/5/14/chartex" xmlns:mc="http://schemas.openxmlformats.org/markup-compatibility/2006" xmlns:aink="http://schemas.microsoft.com/office/drawing/2016/ink" xmlns:am3d="http://schemas.microsoft.com/office/drawing/2017/model3d" xmlns:o="urn:schemas-microsoft-com:office:office" xmlns:r="http://schemas.openxmlformats.org/officeDocument/2006/relationships" xmlns:m="http://schemas.openxmlformats.org/officeDocument/2006/math" xmlns:v="urn:schemas-microsoft-com:vml" xmlns:wp14="http://schemas.microsoft.com/office/word/2010/wordprocessingDrawing" xmlns:wp="http://schemas.openxmlformats.org/drawingml/2006/wordprocessingDrawing" xmlns:w10="urn:schemas-microsoft-com:office:word" xmlns:w="http://schemas.openxmlformats.org/wordprocessingml/2006/main" xmlns:w14="http://schemas.microsoft.com/office/word/2010/wordml" xmlns:w15="http://schemas.microsoft.com/office/word/2012/wordml" xmlns:w16cex="http://schemas.microsoft.com/office/word/2018/wordml/cex" xmlns:w16cid="http://schemas.microsoft.com/office/word/2016/wordml/cid" xmlns:w16="http://schemas.microsoft.com/office/word/2018/wordml" xmlns:w16sdtdh="http://schemas.microsoft.com/office/word/2020/wordml/sdtdatahash" xmlns:w16se="http://schemas.microsoft.com/office/word/2015/wordml/symex" xmlns:wpg="http://schemas.microsoft.com/office/word/2010/wordprocessingGroup" xmlns:wpi="http://schemas.microsoft.com/office/word/2010/wordprocessingInk" xmlns:wne="http://schemas.microsoft.com/office/word/2006/wordml" xmlns:wps="http://schemas.microsoft.com/office/word/2010/wordprocessingShape" mc:Ignorable="w14 w15 w16se w16cid w16 w16cex w16sdtdh wp14">
+  <w:abstractNum w:abstractNumId="0" w15:restartNumberingAfterBreak="0">
+    <w:nsid w:val="7F790B1D"/>
+    <w:multiLevelType w:val="hybridMultilevel"/>
+    <w:tmpl w:val="76A286F0"/>
+    <w:lvl w:ilvl="0" w:tplc="08130011">
+      <w:start w:val="1"/>
+      <w:numFmt w:val="decimal"/>
+      <w:lvlText w:val="%1)"/>
+      <w:lvlJc w:val="left"/>
+      <w:pPr>
+        <w:ind w:left="720" w:hanging="360"/>
+      </w:pPr>
+      <w:rPr>
+        <w:rFonts w:hint="default"/>
+      </w:rPr>
+    </w:lvl>
+    <w:lvl w:ilvl="1" w:tplc="08130019" w:tentative="1">
+      <w:start w:val="1"/>
+      <w:numFmt w:val="lowerLetter"/>
+      <w:lvlText w:val="%2."/>
+      <w:lvlJc w:val="left"/>
+      <w:pPr>
+        <w:ind w:left="1440" w:hanging="360"/>
+      </w:pPr>
+    </w:lvl>
+    <w:lvl w:ilvl="2" w:tplc="0813001B" w:tentative="1">
+      <w:start w:val="1"/>
+      <w:numFmt w:val="lowerRoman"/>
+      <w:lvlText w:val="%3."/>
+      <w:lvlJc w:val="right"/>
+      <w:pPr>
+        <w:ind w:left="2160" w:hanging="180"/>
+      </w:pPr>
+    </w:lvl>
+    <w:lvl w:ilvl="3" w:tplc="0813000F" w:tentative="1">
+      <w:start w:val="1"/>
+      <w:numFmt w:val="decimal"/>
+      <w:lvlText w:val="%4."/>
+      <w:lvlJc w:val="left"/>
+      <w:pPr>
+        <w:ind w:left="2880" w:hanging="360"/>
+      </w:pPr>
+    </w:lvl>
+    <w:lvl w:ilvl="4" w:tplc="08130019" w:tentative="1">
+      <w:start w:val="1"/>
+      <w:numFmt w:val="lowerLetter"/>
+      <w:lvlText w:val="%5."/>
+      <w:lvlJc w:val="left"/>
+      <w:pPr>
+        <w:ind w:left="3600" w:hanging="360"/>
+      </w:pPr>
+    </w:lvl>
+    <w:lvl w:ilvl="5" w:tplc="0813001B" w:tentative="1">
+      <w:start w:val="1"/>
+      <w:numFmt w:val="lowerRoman"/>
+      <w:lvlText w:val="%6."/>
+      <w:lvlJc w:val="right"/>
+      <w:pPr>
+        <w:ind w:left="4320" w:hanging="180"/>
+      </w:pPr>
+    </w:lvl>
+    <w:lvl w:ilvl="6" w:tplc="0813000F" w:tentative="1">
+      <w:start w:val="1"/>
+      <w:numFmt w:val="decimal"/>
+      <w:lvlText w:val="%7."/>
+      <w:lvlJc w:val="left"/>
+      <w:pPr>
+        <w:ind w:left="5040" w:hanging="360"/>
+      </w:pPr>
+    </w:lvl>
+    <w:lvl w:ilvl="7" w:tplc="08130019" w:tentative="1">
+      <w:start w:val="1"/>
+      <w:numFmt w:val="lowerLetter"/>
+      <w:lvlText w:val="%8."/>
+      <w:lvlJc w:val="left"/>
+      <w:pPr>
+        <w:ind w:left="5760" w:hanging="360"/>
+      </w:pPr>
+    </w:lvl>
+    <w:lvl w:ilvl="8" w:tplc="0813001B" w:tentative="1">
+      <w:start w:val="1"/>
+      <w:numFmt w:val="lowerRoman"/>
+      <w:lvlText w:val="%9."/>
+      <w:lvlJc w:val="right"/>
+      <w:pPr>
+        <w:ind w:left="6480" w:hanging="180"/>
+      </w:pPr>
+    </w:lvl>
+  </w:abstractNum>
+  <w:num w:numId="1">
+    <w:abstractNumId w:val="0"/>
+  </w:num>
+</w:numbering>
 </file>
 
 <file path=word/styles.xml><?xml version="1.0" encoding="utf-8"?>
@@ -2044,6 +1680,28 @@
       <w:szCs w:val="26"/>
     </w:rPr>
   </w:style>
+  <w:style w:type="paragraph" w:styleId="Kop3">
+    <w:name w:val="heading 3"/>
+    <w:basedOn w:val="Standaard"/>
+    <w:next w:val="Standaard"/>
+    <w:link w:val="Kop3Char"/>
+    <w:uiPriority w:val="9"/>
+    <w:unhideWhenUsed/>
+    <w:qFormat/>
+    <w:rsid w:val="00EB1AF4"/>
+    <w:pPr>
+      <w:keepNext/>
+      <w:keepLines/>
+      <w:spacing w:before="40" w:after="0"/>
+      <w:outlineLvl w:val="2"/>
+    </w:pPr>
+    <w:rPr>
+      <w:rFonts w:asciiTheme="majorHAnsi" w:eastAsiaTheme="majorEastAsia" w:hAnsiTheme="majorHAnsi" w:cstheme="majorBidi"/>
+      <w:color w:val="1F3763" w:themeColor="accent1" w:themeShade="7F"/>
+      <w:sz w:val="24"/>
+      <w:szCs w:val="24"/>
+    </w:rPr>
+  </w:style>
   <w:style w:type="character" w:default="1" w:styleId="Standaardalinea-lettertype">
     <w:name w:val="Default Paragraph Font"/>
     <w:uiPriority w:val="1"/>
@@ -2119,6 +1777,30 @@
       <w:color w:val="605E5C"/>
       <w:shd w:val="clear" w:color="auto" w:fill="E1DFDD"/>
     </w:rPr>
+  </w:style>
+  <w:style w:type="character" w:customStyle="1" w:styleId="Kop3Char">
+    <w:name w:val="Kop 3 Char"/>
+    <w:basedOn w:val="Standaardalinea-lettertype"/>
+    <w:link w:val="Kop3"/>
+    <w:uiPriority w:val="9"/>
+    <w:rsid w:val="00EB1AF4"/>
+    <w:rPr>
+      <w:rFonts w:asciiTheme="majorHAnsi" w:eastAsiaTheme="majorEastAsia" w:hAnsiTheme="majorHAnsi" w:cstheme="majorBidi"/>
+      <w:color w:val="1F3763" w:themeColor="accent1" w:themeShade="7F"/>
+      <w:sz w:val="24"/>
+      <w:szCs w:val="24"/>
+    </w:rPr>
+  </w:style>
+  <w:style w:type="paragraph" w:styleId="Lijstalinea">
+    <w:name w:val="List Paragraph"/>
+    <w:basedOn w:val="Standaard"/>
+    <w:uiPriority w:val="34"/>
+    <w:qFormat/>
+    <w:rsid w:val="00EB1AF4"/>
+    <w:pPr>
+      <w:ind w:left="720"/>
+      <w:contextualSpacing/>
+    </w:pPr>
   </w:style>
 </w:styles>
 </file>

</xml_diff>

<commit_message>
updated logboek and added a sha-1 fingerprint to Firebase
</commit_message>
<xml_diff>
--- a/Logboek_Dries_Fierens.docx
+++ b/Logboek_Dries_Fierens.docx
@@ -1087,7 +1087,13 @@
         <w:pStyle w:val="Kop3"/>
       </w:pPr>
       <w:r>
-        <w:t>Wat ik wil realiseren:</w:t>
+        <w:t>Wat ik wil realiseren</w:t>
+      </w:r>
+      <w:r>
+        <w:t xml:space="preserve"> deze week</w:t>
+      </w:r>
+      <w:r>
+        <w:t>:</w:t>
       </w:r>
     </w:p>
     <w:p>
@@ -1123,9 +1129,151 @@
         </w:numPr>
       </w:pPr>
       <w:r>
-        <w:t>Camera functionaliteit bekijken voor android</w:t>
-      </w:r>
-    </w:p>
+        <w:t>Camera functionaliteit bekijken voor andr</w:t>
+      </w:r>
+      <w:r>
+        <w:t>oi</w:t>
+      </w:r>
+      <w:r>
+        <w:t>d</w:t>
+      </w:r>
+    </w:p>
+    <w:p/>
+    <w:p>
+      <w:r>
+        <w:t>18/10/2021:</w:t>
+      </w:r>
+    </w:p>
+    <w:p>
+      <w:r>
+        <w:t>Hier kan je ondertussen zien dat mijn app verbonden is met Firebase. Nu vragen ze voor google sign-in om een sha-1 fingerprint toe te voegen.</w:t>
+      </w:r>
+      <w:r>
+        <w:t xml:space="preserve"> Ik wou dan google play signing pakken om het te genereren ipv self-signing, maar ik moet dan 25 euro eerst betalen voor een </w:t>
+      </w:r>
+      <w:r>
+        <w:t>ontwikkelaar</w:t>
+      </w:r>
+      <w:r>
+        <w:t>s</w:t>
+      </w:r>
+      <w:r>
+        <w:t>account</w:t>
+      </w:r>
+      <w:r>
+        <w:t>. Hierbij zit ik dus effe vast. Deze vraag heb ik dan gesteld op teams.</w:t>
+      </w:r>
+    </w:p>
+    <w:p>
+      <w:hyperlink r:id="rId20" w:history="1">
+        <w:r>
+          <w:rPr>
+            <w:rStyle w:val="Hyperlink"/>
+          </w:rPr>
+          <w:t>https://developers.google.com/android/guides/client-auth?utm_source=studio</w:t>
+        </w:r>
+      </w:hyperlink>
+    </w:p>
+    <w:p>
+      <w:r>
+        <w:rPr>
+          <w:noProof/>
+        </w:rPr>
+        <w:drawing>
+          <wp:inline distT="0" distB="0" distL="0" distR="0" wp14:anchorId="3CFEBF42" wp14:editId="07DAA828">
+            <wp:extent cx="5760720" cy="4100195"/>
+            <wp:effectExtent l="0" t="0" r="0" b="0"/>
+            <wp:docPr id="7" name="Afbeelding 7"/>
+            <wp:cNvGraphicFramePr>
+              <a:graphicFrameLocks xmlns:a="http://schemas.openxmlformats.org/drawingml/2006/main" noChangeAspect="1"/>
+            </wp:cNvGraphicFramePr>
+            <a:graphic xmlns:a="http://schemas.openxmlformats.org/drawingml/2006/main">
+              <a:graphicData uri="http://schemas.openxmlformats.org/drawingml/2006/picture">
+                <pic:pic xmlns:pic="http://schemas.openxmlformats.org/drawingml/2006/picture">
+                  <pic:nvPicPr>
+                    <pic:cNvPr id="1" name=""/>
+                    <pic:cNvPicPr/>
+                  </pic:nvPicPr>
+                  <pic:blipFill>
+                    <a:blip r:embed="rId21"/>
+                    <a:stretch>
+                      <a:fillRect/>
+                    </a:stretch>
+                  </pic:blipFill>
+                  <pic:spPr>
+                    <a:xfrm>
+                      <a:off x="0" y="0"/>
+                      <a:ext cx="5760720" cy="4100195"/>
+                    </a:xfrm>
+                    <a:prstGeom prst="rect">
+                      <a:avLst/>
+                    </a:prstGeom>
+                  </pic:spPr>
+                </pic:pic>
+              </a:graphicData>
+            </a:graphic>
+          </wp:inline>
+        </w:drawing>
+      </w:r>
+    </w:p>
+    <w:p>
+      <w:r>
+        <w:t>Als ik wat meer naar onderging bij de “</w:t>
+      </w:r>
+      <w:r>
+        <w:t>Authenticating Your Client</w:t>
+      </w:r>
+      <w:r>
+        <w:t>” pagina (zie link) kan je ook via de terminal van android studio een command invoeren om de sha-1 fingerprint te krijgen. Hierbij moest je “gradle sigingReport” invoeren en dan ctrl + enter invoeren!!</w:t>
+      </w:r>
+      <w:r>
+        <w:t xml:space="preserve"> Deze heb ik dan toegevoegd aan Firebase.</w:t>
+      </w:r>
+    </w:p>
+    <w:p>
+      <w:r>
+        <w:rPr>
+          <w:noProof/>
+        </w:rPr>
+        <w:lastRenderedPageBreak/>
+        <w:drawing>
+          <wp:inline distT="0" distB="0" distL="0" distR="0" wp14:anchorId="2AACE74A" wp14:editId="11A7821C">
+            <wp:extent cx="5760720" cy="1592580"/>
+            <wp:effectExtent l="0" t="0" r="0" b="7620"/>
+            <wp:docPr id="9" name="Afbeelding 9"/>
+            <wp:cNvGraphicFramePr>
+              <a:graphicFrameLocks xmlns:a="http://schemas.openxmlformats.org/drawingml/2006/main" noChangeAspect="1"/>
+            </wp:cNvGraphicFramePr>
+            <a:graphic xmlns:a="http://schemas.openxmlformats.org/drawingml/2006/main">
+              <a:graphicData uri="http://schemas.openxmlformats.org/drawingml/2006/picture">
+                <pic:pic xmlns:pic="http://schemas.openxmlformats.org/drawingml/2006/picture">
+                  <pic:nvPicPr>
+                    <pic:cNvPr id="1" name=""/>
+                    <pic:cNvPicPr/>
+                  </pic:nvPicPr>
+                  <pic:blipFill>
+                    <a:blip r:embed="rId22"/>
+                    <a:stretch>
+                      <a:fillRect/>
+                    </a:stretch>
+                  </pic:blipFill>
+                  <pic:spPr>
+                    <a:xfrm>
+                      <a:off x="0" y="0"/>
+                      <a:ext cx="5760720" cy="1592580"/>
+                    </a:xfrm>
+                    <a:prstGeom prst="rect">
+                      <a:avLst/>
+                    </a:prstGeom>
+                  </pic:spPr>
+                </pic:pic>
+              </a:graphicData>
+            </a:graphic>
+          </wp:inline>
+        </w:drawing>
+      </w:r>
+    </w:p>
+    <w:p/>
     <w:p/>
     <w:p/>
     <w:p/>

</xml_diff>

<commit_message>
Added 0auth 2.0 clinet credentials (zie afbeelding)
</commit_message>
<xml_diff>
--- a/Logboek_Dries_Fierens.docx
+++ b/Logboek_Dries_Fierens.docx
@@ -1273,8 +1273,171 @@
         </w:drawing>
       </w:r>
     </w:p>
-    <w:p/>
-    <w:p/>
+    <w:p>
+      <w:r>
+        <w:t>Daarna moest ik een Oauth 2.0 client ID toevoegen voor het inloggen. Hierbij moest ik een hele configuratie begaan.</w:t>
+      </w:r>
+      <w:r>
+        <w:t xml:space="preserve"> Ik heb hierbij het meest niet ingevuld zoals een privacy policy, enzoverder.</w:t>
+      </w:r>
+    </w:p>
+    <w:p>
+      <w:r>
+        <w:rPr>
+          <w:noProof/>
+        </w:rPr>
+        <w:drawing>
+          <wp:inline distT="0" distB="0" distL="0" distR="0" wp14:anchorId="47059887" wp14:editId="102B547B">
+            <wp:extent cx="3990975" cy="3850117"/>
+            <wp:effectExtent l="0" t="0" r="0" b="0"/>
+            <wp:docPr id="8" name="Afbeelding 8"/>
+            <wp:cNvGraphicFramePr>
+              <a:graphicFrameLocks xmlns:a="http://schemas.openxmlformats.org/drawingml/2006/main" noChangeAspect="1"/>
+            </wp:cNvGraphicFramePr>
+            <a:graphic xmlns:a="http://schemas.openxmlformats.org/drawingml/2006/main">
+              <a:graphicData uri="http://schemas.openxmlformats.org/drawingml/2006/picture">
+                <pic:pic xmlns:pic="http://schemas.openxmlformats.org/drawingml/2006/picture">
+                  <pic:nvPicPr>
+                    <pic:cNvPr id="1" name=""/>
+                    <pic:cNvPicPr/>
+                  </pic:nvPicPr>
+                  <pic:blipFill>
+                    <a:blip r:embed="rId23"/>
+                    <a:stretch>
+                      <a:fillRect/>
+                    </a:stretch>
+                  </pic:blipFill>
+                  <pic:spPr>
+                    <a:xfrm>
+                      <a:off x="0" y="0"/>
+                      <a:ext cx="4006976" cy="3865553"/>
+                    </a:xfrm>
+                    <a:prstGeom prst="rect">
+                      <a:avLst/>
+                    </a:prstGeom>
+                  </pic:spPr>
+                </pic:pic>
+              </a:graphicData>
+            </a:graphic>
+          </wp:inline>
+        </w:drawing>
+      </w:r>
+    </w:p>
+    <w:p>
+      <w:r>
+        <w:rPr>
+          <w:noProof/>
+        </w:rPr>
+        <w:lastRenderedPageBreak/>
+        <w:drawing>
+          <wp:inline distT="0" distB="0" distL="0" distR="0" wp14:anchorId="0F048ACF" wp14:editId="0B1B0528">
+            <wp:extent cx="3228975" cy="3761352"/>
+            <wp:effectExtent l="133350" t="114300" r="123825" b="163195"/>
+            <wp:docPr id="11" name="Afbeelding 11"/>
+            <wp:cNvGraphicFramePr>
+              <a:graphicFrameLocks xmlns:a="http://schemas.openxmlformats.org/drawingml/2006/main" noChangeAspect="1"/>
+            </wp:cNvGraphicFramePr>
+            <a:graphic xmlns:a="http://schemas.openxmlformats.org/drawingml/2006/main">
+              <a:graphicData uri="http://schemas.openxmlformats.org/drawingml/2006/picture">
+                <pic:pic xmlns:pic="http://schemas.openxmlformats.org/drawingml/2006/picture">
+                  <pic:nvPicPr>
+                    <pic:cNvPr id="1" name=""/>
+                    <pic:cNvPicPr/>
+                  </pic:nvPicPr>
+                  <pic:blipFill>
+                    <a:blip r:embed="rId24"/>
+                    <a:stretch>
+                      <a:fillRect/>
+                    </a:stretch>
+                  </pic:blipFill>
+                  <pic:spPr>
+                    <a:xfrm>
+                      <a:off x="0" y="0"/>
+                      <a:ext cx="3232548" cy="3765514"/>
+                    </a:xfrm>
+                    <a:prstGeom prst="rect">
+                      <a:avLst/>
+                    </a:prstGeom>
+                    <a:solidFill>
+                      <a:srgbClr val="FFFFFF">
+                        <a:shade val="85000"/>
+                      </a:srgbClr>
+                    </a:solidFill>
+                    <a:ln w="88900" cap="sq">
+                      <a:solidFill>
+                        <a:srgbClr val="FFFFFF"/>
+                      </a:solidFill>
+                      <a:miter lim="800000"/>
+                    </a:ln>
+                    <a:effectLst>
+                      <a:outerShdw blurRad="55000" dist="18000" dir="5400000" algn="tl" rotWithShape="0">
+                        <a:srgbClr val="000000">
+                          <a:alpha val="40000"/>
+                        </a:srgbClr>
+                      </a:outerShdw>
+                    </a:effectLst>
+                    <a:scene3d>
+                      <a:camera prst="orthographicFront"/>
+                      <a:lightRig rig="twoPt" dir="t">
+                        <a:rot lat="0" lon="0" rev="7200000"/>
+                      </a:lightRig>
+                    </a:scene3d>
+                    <a:sp3d>
+                      <a:bevelT w="25400" h="19050"/>
+                      <a:contourClr>
+                        <a:srgbClr val="FFFFFF"/>
+                      </a:contourClr>
+                    </a:sp3d>
+                  </pic:spPr>
+                </pic:pic>
+              </a:graphicData>
+            </a:graphic>
+          </wp:inline>
+        </w:drawing>
+      </w:r>
+    </w:p>
+    <w:p>
+      <w:r>
+        <w:rPr>
+          <w:noProof/>
+        </w:rPr>
+        <w:drawing>
+          <wp:inline distT="0" distB="0" distL="0" distR="0" wp14:anchorId="2849154C" wp14:editId="0E94D92D">
+            <wp:extent cx="5760720" cy="2985135"/>
+            <wp:effectExtent l="0" t="0" r="0" b="5715"/>
+            <wp:docPr id="12" name="Afbeelding 12"/>
+            <wp:cNvGraphicFramePr>
+              <a:graphicFrameLocks xmlns:a="http://schemas.openxmlformats.org/drawingml/2006/main" noChangeAspect="1"/>
+            </wp:cNvGraphicFramePr>
+            <a:graphic xmlns:a="http://schemas.openxmlformats.org/drawingml/2006/main">
+              <a:graphicData uri="http://schemas.openxmlformats.org/drawingml/2006/picture">
+                <pic:pic xmlns:pic="http://schemas.openxmlformats.org/drawingml/2006/picture">
+                  <pic:nvPicPr>
+                    <pic:cNvPr id="1" name=""/>
+                    <pic:cNvPicPr/>
+                  </pic:nvPicPr>
+                  <pic:blipFill>
+                    <a:blip r:embed="rId25"/>
+                    <a:stretch>
+                      <a:fillRect/>
+                    </a:stretch>
+                  </pic:blipFill>
+                  <pic:spPr>
+                    <a:xfrm>
+                      <a:off x="0" y="0"/>
+                      <a:ext cx="5760720" cy="2985135"/>
+                    </a:xfrm>
+                    <a:prstGeom prst="rect">
+                      <a:avLst/>
+                    </a:prstGeom>
+                  </pic:spPr>
+                </pic:pic>
+              </a:graphicData>
+            </a:graphic>
+          </wp:inline>
+        </w:drawing>
+      </w:r>
+    </w:p>
     <w:p/>
     <w:p/>
     <w:p/>

</xml_diff>

<commit_message>
Added a test account and finnaly can know that my code works for login.
</commit_message>
<xml_diff>
--- a/Logboek_Dries_Fierens.docx
+++ b/Logboek_Dries_Fierens.docx
@@ -1439,6 +1439,48 @@
       </w:r>
     </w:p>
     <w:p/>
+    <w:p>
+      <w:pPr>
+        <w:rPr>
+          <w:b/>
+          <w:bCs/>
+        </w:rPr>
+      </w:pPr>
+      <w:r>
+        <w:rPr>
+          <w:b/>
+          <w:bCs/>
+        </w:rPr>
+        <w:t>19/10/2021:</w:t>
+      </w:r>
+    </w:p>
+    <w:p>
+      <w:r>
+        <w:t xml:space="preserve">Vandaag had ik tijdens les (in de morgen van 8u15-11u15) verder gewerkt aan de back-end van mijn app. Ik was gisteren bezig met google sign-in, maar ik besloot om eerst normale email/password authentication toe te voegen. Dit ging vrij vlot vooruit maar toen ik de button klikt sloot de app af, dus dat moet ik nog oplossen. </w:t>
+      </w:r>
+      <w:r>
+        <w:t>Er werd</w:t>
+      </w:r>
+      <w:r>
+        <w:t xml:space="preserve"> gebruik</w:t>
+      </w:r>
+      <w:r>
+        <w:t xml:space="preserve"> gemaakt van</w:t>
+      </w:r>
+      <w:r>
+        <w:t xml:space="preserve"> deze link:</w:t>
+      </w:r>
+    </w:p>
+    <w:p>
+      <w:hyperlink r:id="rId26" w:history="1">
+        <w:r>
+          <w:rPr>
+            <w:rStyle w:val="Hyperlink"/>
+          </w:rPr>
+          <w:t>https://firebase.google.com/docs/auth/android/start</w:t>
+        </w:r>
+      </w:hyperlink>
+    </w:p>
     <w:p/>
     <w:p/>
     <w:p/>

</xml_diff>

<commit_message>
Successfully able to register a account (see logboek for documentation)
</commit_message>
<xml_diff>
--- a/Logboek_Dries_Fierens.docx
+++ b/Logboek_Dries_Fierens.docx
@@ -1481,7 +1481,154 @@
         </w:r>
       </w:hyperlink>
     </w:p>
-    <w:p/>
+    <w:p>
+      <w:pPr>
+        <w:rPr>
+          <w:b/>
+          <w:bCs/>
+        </w:rPr>
+      </w:pPr>
+      <w:r>
+        <w:rPr>
+          <w:b/>
+          <w:bCs/>
+        </w:rPr>
+        <w:lastRenderedPageBreak/>
+        <w:t>20/10/2021:</w:t>
+      </w:r>
+    </w:p>
+    <w:p>
+      <w:r>
+        <w:t>Vandaag heb ik eindelijk de login en registratie kunnen afwerken. Dit had veel moeite gekost.</w:t>
+      </w:r>
+      <w:r>
+        <w:t xml:space="preserve"> Het probleem was dus dat mijn app bleef crashen als ik probeerde te registeren. Ik had veel op stackoverflow gezocht maar ik kon eerst niks vinden, maar toen zag ik dat de wifi van de device emulator op Android studio geen wifi had. Ik dacht eerst dat dit normaal was, maar begon toen twijfels te krijgen. Ik had dan eerst de info op stackoverflow pagina proberen gebruiken, maar dat was niet juist. Uiteindelijk gewoon mijn gsm hotspot 4G gebruiken werkte wel.</w:t>
+      </w:r>
+      <w:r>
+        <w:t xml:space="preserve"> Mijn app crasht dan nog steeds bij registratie maar ik kon wel inloggen door een test account aan te maken op Firebase. Dus mijn code werkte, maar toen ik zag dat ik niet gekeken had naar de error van die verscheen na de crash en dat maakte alles duidelijk</w:t>
+      </w:r>
+      <w:r>
+        <w:t xml:space="preserve"> voor mij</w:t>
+      </w:r>
+      <w:r>
+        <w:t xml:space="preserve">. </w:t>
+      </w:r>
+      <w:r>
+        <w:t>Ik moest</w:t>
+      </w:r>
+      <w:r>
+        <w:t xml:space="preserve"> gewoon</w:t>
+      </w:r>
+      <w:r>
+        <w:t xml:space="preserve"> de juiste variabelen invoeren</w:t>
+      </w:r>
+      <w:r>
+        <w:t>:</w:t>
+      </w:r>
+    </w:p>
+    <w:p>
+      <w:r>
+        <w:rPr>
+          <w:noProof/>
+        </w:rPr>
+        <w:drawing>
+          <wp:inline distT="0" distB="0" distL="0" distR="0" wp14:anchorId="48B27C26" wp14:editId="4432DFCB">
+            <wp:extent cx="5760720" cy="1753870"/>
+            <wp:effectExtent l="0" t="0" r="0" b="0"/>
+            <wp:docPr id="10" name="Afbeelding 10"/>
+            <wp:cNvGraphicFramePr>
+              <a:graphicFrameLocks xmlns:a="http://schemas.openxmlformats.org/drawingml/2006/main" noChangeAspect="1"/>
+            </wp:cNvGraphicFramePr>
+            <a:graphic xmlns:a="http://schemas.openxmlformats.org/drawingml/2006/main">
+              <a:graphicData uri="http://schemas.openxmlformats.org/drawingml/2006/picture">
+                <pic:pic xmlns:pic="http://schemas.openxmlformats.org/drawingml/2006/picture">
+                  <pic:nvPicPr>
+                    <pic:cNvPr id="1" name=""/>
+                    <pic:cNvPicPr/>
+                  </pic:nvPicPr>
+                  <pic:blipFill>
+                    <a:blip r:embed="rId27"/>
+                    <a:stretch>
+                      <a:fillRect/>
+                    </a:stretch>
+                  </pic:blipFill>
+                  <pic:spPr>
+                    <a:xfrm>
+                      <a:off x="0" y="0"/>
+                      <a:ext cx="5760720" cy="1753870"/>
+                    </a:xfrm>
+                    <a:prstGeom prst="rect">
+                      <a:avLst/>
+                    </a:prstGeom>
+                  </pic:spPr>
+                </pic:pic>
+              </a:graphicData>
+            </a:graphic>
+          </wp:inline>
+        </w:drawing>
+      </w:r>
+    </w:p>
+    <w:p>
+      <w:r>
+        <w:t>Bronnen:</w:t>
+      </w:r>
+    </w:p>
+    <w:p>
+      <w:pPr>
+        <w:rPr>
+          <w:rFonts w:ascii="Times New Roman" w:eastAsia="Times New Roman" w:hAnsi="Times New Roman" w:cs="Times New Roman"/>
+          <w:sz w:val="24"/>
+          <w:szCs w:val="24"/>
+          <w:lang w:eastAsia="nl-BE"/>
+        </w:rPr>
+      </w:pPr>
+      <w:hyperlink r:id="rId28" w:history="1">
+        <w:r>
+          <w:rPr>
+            <w:rStyle w:val="Hyperlink"/>
+            <w:rFonts w:ascii="Times New Roman" w:eastAsia="Times New Roman" w:hAnsi="Times New Roman" w:cs="Times New Roman"/>
+            <w:sz w:val="24"/>
+            <w:szCs w:val="24"/>
+            <w:lang w:eastAsia="nl-BE"/>
+          </w:rPr>
+          <w:t>https://stackoverflow.com/questions/50670547/android-studio-android-emulator-wifi-connected-with-no-internet</w:t>
+        </w:r>
+      </w:hyperlink>
+    </w:p>
+    <w:p>
+      <w:pPr>
+        <w:rPr>
+          <w:rFonts w:ascii="Times New Roman" w:eastAsia="Times New Roman" w:hAnsi="Times New Roman" w:cs="Times New Roman"/>
+          <w:sz w:val="24"/>
+          <w:szCs w:val="24"/>
+          <w:lang w:eastAsia="nl-BE"/>
+        </w:rPr>
+      </w:pPr>
+      <w:hyperlink r:id="rId29" w:history="1">
+        <w:r>
+          <w:rPr>
+            <w:rStyle w:val="Hyperlink"/>
+            <w:rFonts w:ascii="Times New Roman" w:eastAsia="Times New Roman" w:hAnsi="Times New Roman" w:cs="Times New Roman"/>
+            <w:sz w:val="24"/>
+            <w:szCs w:val="24"/>
+            <w:lang w:eastAsia="nl-BE"/>
+          </w:rPr>
+          <w:t>https://stackoverflow.com/questions/36701022/error-attempt-to-invoke-virtual-method-android-text-editable-android-widget-edi</w:t>
+        </w:r>
+      </w:hyperlink>
+    </w:p>
+    <w:p>
+      <w:pPr>
+        <w:rPr>
+          <w:rFonts w:ascii="Times New Roman" w:eastAsia="Times New Roman" w:hAnsi="Times New Roman" w:cs="Times New Roman"/>
+          <w:i/>
+          <w:iCs/>
+          <w:sz w:val="24"/>
+          <w:szCs w:val="24"/>
+          <w:lang w:eastAsia="nl-BE"/>
+        </w:rPr>
+      </w:pPr>
+    </w:p>
     <w:p/>
     <w:p/>
     <w:sectPr>
@@ -2155,6 +2302,23 @@
       <w:contextualSpacing/>
     </w:pPr>
   </w:style>
+  <w:style w:type="paragraph" w:styleId="Normaalweb">
+    <w:name w:val="Normal (Web)"/>
+    <w:basedOn w:val="Standaard"/>
+    <w:uiPriority w:val="99"/>
+    <w:semiHidden/>
+    <w:unhideWhenUsed/>
+    <w:rsid w:val="00397F5B"/>
+    <w:pPr>
+      <w:spacing w:before="100" w:beforeAutospacing="1" w:after="100" w:afterAutospacing="1" w:line="240" w:lineRule="auto"/>
+    </w:pPr>
+    <w:rPr>
+      <w:rFonts w:ascii="Times New Roman" w:eastAsia="Times New Roman" w:hAnsi="Times New Roman" w:cs="Times New Roman"/>
+      <w:sz w:val="24"/>
+      <w:szCs w:val="24"/>
+      <w:lang w:eastAsia="nl-BE"/>
+    </w:rPr>
+  </w:style>
 </w:styles>
 </file>
 
@@ -2454,11 +2618,29 @@
 </file>
 
 <file path=customXml/item1.xml><?xml version="1.0" encoding="utf-8"?>
-<b:Sources xmlns:b="http://schemas.openxmlformats.org/officeDocument/2006/bibliography" xmlns="http://schemas.openxmlformats.org/officeDocument/2006/bibliography" SelectedStyle="\APASixthEditionOfficeOnline.xsl" StyleName="APA" Version="6"/>
+<b:Sources xmlns:b="http://schemas.openxmlformats.org/officeDocument/2006/bibliography" xmlns="http://schemas.openxmlformats.org/officeDocument/2006/bibliography" SelectedStyle="\APASixthEditionOfficeOnline.xsl" StyleName="APA" Version="6">
+  <b:Source>
+    <b:Tag>Sta21</b:Tag>
+    <b:SourceType>InternetSite</b:SourceType>
+    <b:Guid>{37122473-8BB8-4311-846E-8A838984E187}</b:Guid>
+    <b:Title>Android Studio - Android Emulator Wifi Connected with No Internet</b:Title>
+    <b:Year>2021</b:Year>
+    <b:Author>
+      <b:Author>
+        <b:Corporate>Stackoverflow</b:Corporate>
+      </b:Author>
+    </b:Author>
+    <b:InternetSiteTitle>Stackoverflow</b:InternetSiteTitle>
+    <b:Month>10</b:Month>
+    <b:Day>20</b:Day>
+    <b:URL>https://stackoverflow.com/questions/50670547/android-studio-android-emulator-wifi-connected-with-no-internet</b:URL>
+    <b:RefOrder>1</b:RefOrder>
+  </b:Source>
+</b:Sources>
 </file>
 
 <file path=customXml/itemProps1.xml><?xml version="1.0" encoding="utf-8"?>
-<ds:datastoreItem xmlns:ds="http://schemas.openxmlformats.org/officeDocument/2006/customXml" ds:itemID="{64D055F3-7882-4107-8AF2-18494EF2A475}">
+<ds:datastoreItem xmlns:ds="http://schemas.openxmlformats.org/officeDocument/2006/customXml" ds:itemID="{0FF8953D-FC15-4D03-84F2-D84C7714D573}">
   <ds:schemaRefs>
     <ds:schemaRef ds:uri="http://schemas.openxmlformats.org/officeDocument/2006/bibliography"/>
   </ds:schemaRefs>

</xml_diff>

<commit_message>
Added google sign-in but account doesn't get added to firebase
</commit_message>
<xml_diff>
--- a/Logboek_Dries_Fierens.docx
+++ b/Logboek_Dries_Fierens.docx
@@ -46,7 +46,39 @@
         <w:t>applicatie</w:t>
       </w:r>
       <w:r>
-        <w:t xml:space="preserve"> die je kan maken en welke technologieën je kan gebruiken. Ik heb voor native gekozen want dat past het best bij mijn aftakking “Software developer” sinds het java inhoudt. De anderen zijn hybrid en progressive web app dat dus meer te maken hebben met web &amp; mobile dus vooral HTML &amp; CSS. We moesten dan ook nog kiezen voor een project idee, waarbij ik koos voor een scanner + pdf converter app</w:t>
+        <w:t xml:space="preserve"> die je kan maken en welke technologieën je kan gebruiken. Ik heb voor native gekozen want dat past het best bij mijn aftakking “Software </w:t>
+      </w:r>
+      <w:proofErr w:type="spellStart"/>
+      <w:r>
+        <w:t>developer</w:t>
+      </w:r>
+      <w:proofErr w:type="spellEnd"/>
+      <w:r>
+        <w:t xml:space="preserve">” sinds het </w:t>
+      </w:r>
+      <w:proofErr w:type="spellStart"/>
+      <w:r>
+        <w:t>java</w:t>
+      </w:r>
+      <w:proofErr w:type="spellEnd"/>
+      <w:r>
+        <w:t xml:space="preserve"> inhoudt. De anderen zijn </w:t>
+      </w:r>
+      <w:proofErr w:type="spellStart"/>
+      <w:r>
+        <w:t>hybrid</w:t>
+      </w:r>
+      <w:proofErr w:type="spellEnd"/>
+      <w:r>
+        <w:t xml:space="preserve"> en </w:t>
+      </w:r>
+      <w:proofErr w:type="spellStart"/>
+      <w:r>
+        <w:t>progressive</w:t>
+      </w:r>
+      <w:proofErr w:type="spellEnd"/>
+      <w:r>
+        <w:t xml:space="preserve"> web app dat dus meer te maken hebben met web &amp; mobile dus vooral HTML &amp; CSS. We moesten dan ook nog kiezen voor een project idee, waarbij ik koos voor een scanner + pdf converter app</w:t>
       </w:r>
       <w:r>
         <w:t xml:space="preserve"> waarbij het vooral bedoelt is o</w:t>
@@ -73,20 +105,92 @@
         <w:t xml:space="preserve"> </w:t>
       </w:r>
       <w:r>
-        <w:t>Als back-end koos ik Firebase en als technologie koos ik in java te werken om een android app te maken in plaats van een IOS app.</w:t>
-      </w:r>
-      <w:r>
-        <w:t xml:space="preserve"> Want ik heb een huawei.</w:t>
-      </w:r>
-    </w:p>
-    <w:p>
-      <w:r>
-        <w:t>Ik heb dit allemaal grondiger beschreven in mijn “app idee”.pdf. Dit staat ondertussen op de repository die we moesten maken.</w:t>
-      </w:r>
-    </w:p>
-    <w:p>
-      <w:r>
-        <w:t>Om af te sluiten had ik al ondertussen een goede naam gevonden gebaseerd op de applicatie genaamd Scannable. Ik heb dus besloten om mijn applicatie Notable te noemen.</w:t>
+        <w:t xml:space="preserve">Als </w:t>
+      </w:r>
+      <w:proofErr w:type="spellStart"/>
+      <w:r>
+        <w:t>back-end</w:t>
+      </w:r>
+      <w:proofErr w:type="spellEnd"/>
+      <w:r>
+        <w:t xml:space="preserve"> koos ik </w:t>
+      </w:r>
+      <w:proofErr w:type="spellStart"/>
+      <w:r>
+        <w:t>Firebase</w:t>
+      </w:r>
+      <w:proofErr w:type="spellEnd"/>
+      <w:r>
+        <w:t xml:space="preserve"> en als technologie koos ik in </w:t>
+      </w:r>
+      <w:proofErr w:type="spellStart"/>
+      <w:r>
+        <w:t>java</w:t>
+      </w:r>
+      <w:proofErr w:type="spellEnd"/>
+      <w:r>
+        <w:t xml:space="preserve"> te werken om een </w:t>
+      </w:r>
+      <w:proofErr w:type="spellStart"/>
+      <w:r>
+        <w:t>android</w:t>
+      </w:r>
+      <w:proofErr w:type="spellEnd"/>
+      <w:r>
+        <w:t xml:space="preserve"> app te maken in plaats van een IOS app.</w:t>
+      </w:r>
+      <w:r>
+        <w:t xml:space="preserve"> Want ik heb een </w:t>
+      </w:r>
+      <w:proofErr w:type="spellStart"/>
+      <w:r>
+        <w:t>huawei</w:t>
+      </w:r>
+      <w:proofErr w:type="spellEnd"/>
+      <w:r>
+        <w:t>.</w:t>
+      </w:r>
+    </w:p>
+    <w:p>
+      <w:r>
+        <w:t xml:space="preserve">Ik heb dit allemaal grondiger beschreven in mijn “app </w:t>
+      </w:r>
+      <w:proofErr w:type="spellStart"/>
+      <w:r>
+        <w:t>idee”.pdf</w:t>
+      </w:r>
+      <w:proofErr w:type="spellEnd"/>
+      <w:r>
+        <w:t xml:space="preserve">. Dit staat ondertussen op de </w:t>
+      </w:r>
+      <w:proofErr w:type="spellStart"/>
+      <w:r>
+        <w:t>repository</w:t>
+      </w:r>
+      <w:proofErr w:type="spellEnd"/>
+      <w:r>
+        <w:t xml:space="preserve"> die we moesten maken.</w:t>
+      </w:r>
+    </w:p>
+    <w:p>
+      <w:r>
+        <w:t xml:space="preserve">Om af te sluiten had ik al ondertussen een goede naam gevonden gebaseerd op de applicatie genaamd </w:t>
+      </w:r>
+      <w:proofErr w:type="spellStart"/>
+      <w:r>
+        <w:t>Scannable</w:t>
+      </w:r>
+      <w:proofErr w:type="spellEnd"/>
+      <w:r>
+        <w:t xml:space="preserve">. Ik heb dus besloten om mijn applicatie </w:t>
+      </w:r>
+      <w:proofErr w:type="spellStart"/>
+      <w:r>
+        <w:t>Notable</w:t>
+      </w:r>
+      <w:proofErr w:type="spellEnd"/>
+      <w:r>
+        <w:t xml:space="preserve"> te noemen.</w:t>
       </w:r>
     </w:p>
     <w:p>
@@ -120,7 +224,15 @@
     </w:p>
     <w:p>
       <w:r>
-        <w:t xml:space="preserve">Daarna moest ik gewoon begin aan een UI/UX design voor mijn applicatie, waarbij nog niet veel had gedaan omdat les niet meer lang duurde. Ik moest toen ook tegelijkertijd zoeken naar tutorials dus </w:t>
+        <w:t xml:space="preserve">Daarna moest ik gewoon begin aan een UI/UX design voor mijn applicatie, waarbij nog niet veel had gedaan omdat les niet meer lang duurde. Ik moest toen ook tegelijkertijd zoeken naar </w:t>
+      </w:r>
+      <w:proofErr w:type="spellStart"/>
+      <w:r>
+        <w:t>tutorials</w:t>
+      </w:r>
+      <w:proofErr w:type="spellEnd"/>
+      <w:r>
+        <w:t xml:space="preserve"> dus </w:t>
       </w:r>
       <w:r>
         <w:t>duurde dat ook kort.</w:t>
@@ -143,13 +255,26 @@
     </w:p>
     <w:p>
       <w:r>
-        <w:t xml:space="preserve">Vandaag in de namiddag begonnen we met de co-working les waarbij we dus informatie kunnen delen met medeleerlingen. Al was het de eerste les dus kwam daar niet veel van. Ik begon gewoon verder aan mijn </w:t>
-      </w:r>
+        <w:t>Vandaag in de namiddag begonnen we met de co-</w:t>
+      </w:r>
+      <w:proofErr w:type="spellStart"/>
+      <w:r>
+        <w:t>working</w:t>
+      </w:r>
+      <w:proofErr w:type="spellEnd"/>
+      <w:r>
+        <w:t xml:space="preserve"> les waarbij we dus informatie kunnen delen met medeleerlingen. Al was het de eerste les dus kwam daar niet veel van. Ik begon gewoon verder aan mijn </w:t>
+      </w:r>
+      <w:proofErr w:type="spellStart"/>
       <w:r>
         <w:t>F</w:t>
       </w:r>
       <w:r>
-        <w:t>igma design.</w:t>
+        <w:t>igma</w:t>
+      </w:r>
+      <w:proofErr w:type="spellEnd"/>
+      <w:r>
+        <w:t xml:space="preserve"> design.</w:t>
       </w:r>
     </w:p>
     <w:p>
@@ -200,7 +325,23 @@
     </w:p>
     <w:p>
       <w:r>
-        <w:t>Vandaag heb ik verder gewerkt aan mijn Figma design en het ging redelijk vlot vooruit. Ik wou absoluut dat het vandaag af was zodat ik morgen kan werken aan een ander vak. Tijdens het maken van het design heb ik vooral ook zitten op zoeken dat sommige concepten wel haalbaar zijn om te programmeren. Dit is allemaal wel mogelijk, maar zal wel een challenge zijn zoals de opmerkingen plaatsen</w:t>
+        <w:t xml:space="preserve">Vandaag heb ik verder gewerkt aan mijn </w:t>
+      </w:r>
+      <w:proofErr w:type="spellStart"/>
+      <w:r>
+        <w:t>Figma</w:t>
+      </w:r>
+      <w:proofErr w:type="spellEnd"/>
+      <w:r>
+        <w:t xml:space="preserve"> design en het ging redelijk vlot vooruit. Ik wou absoluut dat het vandaag af was zodat ik morgen kan werken aan een ander vak. Tijdens het maken van het design heb ik vooral ook zitten op zoeken dat sommige concepten wel haalbaar zijn om te programmeren. Dit is allemaal wel mogelijk, maar zal wel een </w:t>
+      </w:r>
+      <w:proofErr w:type="spellStart"/>
+      <w:r>
+        <w:t>challenge</w:t>
+      </w:r>
+      <w:proofErr w:type="spellEnd"/>
+      <w:r>
+        <w:t xml:space="preserve"> zijn zoals de opmerkingen plaatsen</w:t>
       </w:r>
       <w:r>
         <w:t>. M</w:t>
@@ -312,11 +453,48 @@
     </w:p>
     <w:p>
       <w:r>
-        <w:t xml:space="preserve">Vandaag werd mijn figma prototype gecontroleerd waarbij ik moest opnieuw uitleggen wat mijn app doet door middel van accurate presentatie. Ik legde dit vrij duidelijk uit en alles ging goed vooruit. Meneer Blancquaert heeft me dan ook nog een library genaamd “Material design” aangeraden om mijn applicatie te ontwerpen. </w:t>
-      </w:r>
-      <w:r>
-        <w:t>Blijkbaar Google gebruikt deze library</w:t>
-      </w:r>
+        <w:t xml:space="preserve">Vandaag werd mijn </w:t>
+      </w:r>
+      <w:proofErr w:type="spellStart"/>
+      <w:r>
+        <w:t>figma</w:t>
+      </w:r>
+      <w:proofErr w:type="spellEnd"/>
+      <w:r>
+        <w:t xml:space="preserve"> prototype gecontroleerd waarbij ik moest opnieuw uitleggen wat mijn app doet door middel van accurate presentatie. Ik legde dit vrij duidelijk uit en alles ging goed vooruit. Meneer </w:t>
+      </w:r>
+      <w:proofErr w:type="spellStart"/>
+      <w:r>
+        <w:t>Blancquaert</w:t>
+      </w:r>
+      <w:proofErr w:type="spellEnd"/>
+      <w:r>
+        <w:t xml:space="preserve"> heeft me dan ook nog een </w:t>
+      </w:r>
+      <w:proofErr w:type="spellStart"/>
+      <w:r>
+        <w:t>library</w:t>
+      </w:r>
+      <w:proofErr w:type="spellEnd"/>
+      <w:r>
+        <w:t xml:space="preserve"> genaamd “</w:t>
+      </w:r>
+      <w:proofErr w:type="spellStart"/>
+      <w:r>
+        <w:t>Material</w:t>
+      </w:r>
+      <w:proofErr w:type="spellEnd"/>
+      <w:r>
+        <w:t xml:space="preserve"> design” aangeraden om mijn applicatie te ontwerpen. </w:t>
+      </w:r>
+      <w:r>
+        <w:t xml:space="preserve">Blijkbaar Google gebruikt deze </w:t>
+      </w:r>
+      <w:proofErr w:type="spellStart"/>
+      <w:r>
+        <w:t>library</w:t>
+      </w:r>
+      <w:proofErr w:type="spellEnd"/>
       <w:r>
         <w:t xml:space="preserve"> om hun apps te maken.</w:t>
       </w:r>
@@ -354,7 +532,23 @@
         <w:t xml:space="preserve">kunt maken </w:t>
       </w:r>
       <w:r>
-        <w:t>om je app te testen. Als je developer modus in de settings van je gsm</w:t>
+        <w:t xml:space="preserve">om je app te testen. Als je </w:t>
+      </w:r>
+      <w:proofErr w:type="spellStart"/>
+      <w:r>
+        <w:t>developer</w:t>
+      </w:r>
+      <w:proofErr w:type="spellEnd"/>
+      <w:r>
+        <w:t xml:space="preserve"> modus in de </w:t>
+      </w:r>
+      <w:proofErr w:type="spellStart"/>
+      <w:r>
+        <w:t>settings</w:t>
+      </w:r>
+      <w:proofErr w:type="spellEnd"/>
+      <w:r>
+        <w:t xml:space="preserve"> van je gsm</w:t>
       </w:r>
       <w:r>
         <w:t xml:space="preserve"> aanzet, kan je je gsm verbinden met de pc en dus je applicatie daarop testen.</w:t>
@@ -372,7 +566,15 @@
     </w:p>
     <w:p>
       <w:r>
-        <w:t>Tijdens lange downloads heb ik ook mijn google account toegevoegd op Firebase. Volgens de presentatie die we kregen van een medestudent.</w:t>
+        <w:t xml:space="preserve">Tijdens lange downloads heb ik ook mijn google account toegevoegd op </w:t>
+      </w:r>
+      <w:proofErr w:type="spellStart"/>
+      <w:r>
+        <w:t>Firebase</w:t>
+      </w:r>
+      <w:proofErr w:type="spellEnd"/>
+      <w:r>
+        <w:t>. Volgens de presentatie die we kregen van een medestudent.</w:t>
       </w:r>
     </w:p>
     <w:p>
@@ -423,7 +625,23 @@
         <w:t>mijn</w:t>
       </w:r>
       <w:r>
-        <w:t xml:space="preserve"> figma design delen met meneer Blancquaert, toen hij vroeg dat mijn design klaar was</w:t>
+        <w:t xml:space="preserve"> </w:t>
+      </w:r>
+      <w:proofErr w:type="spellStart"/>
+      <w:r>
+        <w:t>figma</w:t>
+      </w:r>
+      <w:proofErr w:type="spellEnd"/>
+      <w:r>
+        <w:t xml:space="preserve"> design delen met meneer </w:t>
+      </w:r>
+      <w:proofErr w:type="spellStart"/>
+      <w:r>
+        <w:t>Blancquaert</w:t>
+      </w:r>
+      <w:proofErr w:type="spellEnd"/>
+      <w:r>
+        <w:t>, toen hij vroeg dat mijn design klaar was</w:t>
       </w:r>
       <w:r>
         <w:t xml:space="preserve"> of niet</w:t>
@@ -437,14 +655,38 @@
         <w:t>Ik heb daarna gewoon verder begonnen aan de tutorial die ik vorige week gebruikt had.</w:t>
       </w:r>
       <w:r>
-        <w:t xml:space="preserve"> Hierbij leerde ik meer over hoe ik Android studio beter kon gebruiken om mijn app te designen zoals hoe je </w:t>
+        <w:t xml:space="preserve"> Hierbij leerde ik meer over hoe ik Android studio beter kon gebruiken om mijn app te </w:t>
+      </w:r>
+      <w:proofErr w:type="spellStart"/>
+      <w:r>
+        <w:t>designen</w:t>
+      </w:r>
+      <w:proofErr w:type="spellEnd"/>
+      <w:r>
+        <w:t xml:space="preserve"> zoals hoe je </w:t>
       </w:r>
       <w:r>
         <w:lastRenderedPageBreak/>
-        <w:t>attributen kunt aanpassen (bv. color)</w:t>
-      </w:r>
-      <w:r>
-        <w:t xml:space="preserve">. Android studio is zeer gelijkaardig als bijvoorbeeld Webstorm, maar bij het design van een mobile app is het zeer </w:t>
+        <w:t xml:space="preserve">attributen kunt aanpassen (bv. </w:t>
+      </w:r>
+      <w:proofErr w:type="spellStart"/>
+      <w:r>
+        <w:t>color</w:t>
+      </w:r>
+      <w:proofErr w:type="spellEnd"/>
+      <w:r>
+        <w:t>)</w:t>
+      </w:r>
+      <w:r>
+        <w:t xml:space="preserve">. Android studio is zeer gelijkaardig als bijvoorbeeld </w:t>
+      </w:r>
+      <w:proofErr w:type="spellStart"/>
+      <w:r>
+        <w:t>Webstorm</w:t>
+      </w:r>
+      <w:proofErr w:type="spellEnd"/>
+      <w:r>
+        <w:t xml:space="preserve">, maar bij het design van een mobile app is het zeer </w:t>
       </w:r>
       <w:r>
         <w:t>verschillend</w:t>
@@ -453,7 +695,15 @@
         <w:t>.</w:t>
       </w:r>
       <w:r>
-        <w:t xml:space="preserve"> Bij Webstorm kan je je website </w:t>
+        <w:t xml:space="preserve"> Bij </w:t>
+      </w:r>
+      <w:proofErr w:type="spellStart"/>
+      <w:r>
+        <w:t>Webstorm</w:t>
+      </w:r>
+      <w:proofErr w:type="spellEnd"/>
+      <w:r>
+        <w:t xml:space="preserve"> kan je je website </w:t>
       </w:r>
       <w:r>
         <w:t>bekijken</w:t>
@@ -480,7 +730,15 @@
         <w:t>.</w:t>
       </w:r>
       <w:r>
-        <w:t xml:space="preserve"> Als ik de Jetbrains applicaties vergelijk met Visual studio 2019, </w:t>
+        <w:t xml:space="preserve"> Als ik de </w:t>
+      </w:r>
+      <w:proofErr w:type="spellStart"/>
+      <w:r>
+        <w:t>Jetbrains</w:t>
+      </w:r>
+      <w:proofErr w:type="spellEnd"/>
+      <w:r>
+        <w:t xml:space="preserve"> applicaties vergelijk met Visual studio 2019, </w:t>
       </w:r>
       <w:r>
         <w:t>heb ik er altijd moeite mee om de lay</w:t>
@@ -560,7 +818,15 @@
     </w:p>
     <w:p>
       <w:r>
-        <w:t>Ik heb dan ondertussen de tutorial van Material design gevolgd in plaats van die van Android studio. Ze leerde me dan hoe ik er mee kon werken maar niet hoe een hele nieuwe app kon maken. Ik kreeg een voorbeeld app om erin te kunnen werken voor de tutorial.</w:t>
+        <w:t xml:space="preserve">Ik heb dan ondertussen de tutorial van </w:t>
+      </w:r>
+      <w:proofErr w:type="spellStart"/>
+      <w:r>
+        <w:t>Material</w:t>
+      </w:r>
+      <w:proofErr w:type="spellEnd"/>
+      <w:r>
+        <w:t xml:space="preserve"> design gevolgd in plaats van die van Android studio. Ze leerde me dan hoe ik er mee kon werken maar niet hoe een hele nieuwe app kon maken. Ik kreeg een voorbeeld app om erin te kunnen werken voor de tutorial.</w:t>
       </w:r>
     </w:p>
     <w:p>
@@ -603,10 +869,34 @@
     </w:p>
     <w:p>
       <w:r>
-        <w:t>Vandaag heb ik de usertests afgelegd met Louis D’hondt en Jasper Wauters. Dit ging heel gemakkelijk en duurde niet lang. Ik had niet echt serieuze opmerkingen, behalve dat ik geen persoonlijke info pagina gemaakt had.</w:t>
-      </w:r>
-      <w:r>
-        <w:t xml:space="preserve"> Daarna heb ik onmiddellijk die opmerkingen van mijn figma design verbetert en op mijn repository gezet.</w:t>
+        <w:t xml:space="preserve">Vandaag heb ik de usertests afgelegd met Louis </w:t>
+      </w:r>
+      <w:proofErr w:type="spellStart"/>
+      <w:r>
+        <w:t>D’hondt</w:t>
+      </w:r>
+      <w:proofErr w:type="spellEnd"/>
+      <w:r>
+        <w:t xml:space="preserve"> en Jasper Wauters. Dit ging heel gemakkelijk en duurde niet lang. Ik had niet echt serieuze opmerkingen, behalve dat ik geen persoonlijke info pagina gemaakt had.</w:t>
+      </w:r>
+      <w:r>
+        <w:t xml:space="preserve"> Daarna heb ik onmiddellijk die opmerkingen van mijn </w:t>
+      </w:r>
+      <w:proofErr w:type="spellStart"/>
+      <w:r>
+        <w:t>figma</w:t>
+      </w:r>
+      <w:proofErr w:type="spellEnd"/>
+      <w:r>
+        <w:t xml:space="preserve"> design verbetert en op mijn </w:t>
+      </w:r>
+      <w:proofErr w:type="spellStart"/>
+      <w:r>
+        <w:t>repository</w:t>
+      </w:r>
+      <w:proofErr w:type="spellEnd"/>
+      <w:r>
+        <w:t xml:space="preserve"> gezet.</w:t>
       </w:r>
     </w:p>
     <w:p/>
@@ -629,7 +919,47 @@
     </w:p>
     <w:p>
       <w:r>
-        <w:t xml:space="preserve">Vandaag begon ik eindelijk met Material Design. Ik besloot mijn oude app te verwijderen en te vervangen met een empty activity zodat ik echt van scratch begin. Zo kan ik alles beter begrijpen. Ik had dan ontdekt dat android studio al automatisch Material Design van Google had toegevoegd bij de dependencies, dus eigenlijk ben ik </w:t>
+        <w:t xml:space="preserve">Vandaag begon ik eindelijk met </w:t>
+      </w:r>
+      <w:proofErr w:type="spellStart"/>
+      <w:r>
+        <w:t>Material</w:t>
+      </w:r>
+      <w:proofErr w:type="spellEnd"/>
+      <w:r>
+        <w:t xml:space="preserve"> Design. Ik besloot mijn oude app te verwijderen en te vervangen met een empty </w:t>
+      </w:r>
+      <w:proofErr w:type="spellStart"/>
+      <w:r>
+        <w:t>activity</w:t>
+      </w:r>
+      <w:proofErr w:type="spellEnd"/>
+      <w:r>
+        <w:t xml:space="preserve"> zodat ik echt van scratch begin. Zo kan ik alles beter begrijpen. Ik had dan ontdekt dat </w:t>
+      </w:r>
+      <w:proofErr w:type="spellStart"/>
+      <w:r>
+        <w:t>android</w:t>
+      </w:r>
+      <w:proofErr w:type="spellEnd"/>
+      <w:r>
+        <w:t xml:space="preserve"> studio al automatisch </w:t>
+      </w:r>
+      <w:proofErr w:type="spellStart"/>
+      <w:r>
+        <w:t>Material</w:t>
+      </w:r>
+      <w:proofErr w:type="spellEnd"/>
+      <w:r>
+        <w:t xml:space="preserve"> Design van Google had toegevoegd bij de </w:t>
+      </w:r>
+      <w:proofErr w:type="spellStart"/>
+      <w:r>
+        <w:t>dependencies</w:t>
+      </w:r>
+      <w:proofErr w:type="spellEnd"/>
+      <w:r>
+        <w:t xml:space="preserve">, dus eigenlijk ben ik </w:t>
       </w:r>
       <w:r>
         <w:t>onmiddellijk</w:t>
@@ -773,18 +1103,50 @@
     </w:p>
     <w:p>
       <w:r>
-        <w:t>Eerst had ik geprobeerd om gewoon een heel nieuw project te maken die bestond uit een login activity. Deze activity heb ik dan gewoon aangepast naar mijn wens. Maar dit wou ook niet echt werken, want blijkbaar is het best dat je van een main</w:t>
+        <w:t xml:space="preserve">Eerst had ik geprobeerd om gewoon een heel nieuw project te maken die bestond uit een login </w:t>
+      </w:r>
+      <w:proofErr w:type="spellStart"/>
+      <w:r>
+        <w:t>activity</w:t>
+      </w:r>
+      <w:proofErr w:type="spellEnd"/>
+      <w:r>
+        <w:t xml:space="preserve">. Deze </w:t>
+      </w:r>
+      <w:proofErr w:type="spellStart"/>
+      <w:r>
+        <w:t>activity</w:t>
+      </w:r>
+      <w:proofErr w:type="spellEnd"/>
+      <w:r>
+        <w:t xml:space="preserve"> heb ik dan gewoon aangepast naar mijn wens. Maar dit wou ook niet echt werken, want blijkbaar is het best dat je van een </w:t>
+      </w:r>
+      <w:proofErr w:type="spellStart"/>
+      <w:r>
+        <w:t>main</w:t>
       </w:r>
       <w:r>
         <w:t>_</w:t>
       </w:r>
       <w:r>
-        <w:t>activity start en dan de login page daarmee opent.</w:t>
-      </w:r>
-    </w:p>
-    <w:p>
-      <w:r>
-        <w:t>Ik ben dan gewoon terug begonnen aan het oude project en heb dan de error op stack overflow gezocht en daar had ik de oplossing gevonden. Ik moest gewoon mijn “device” zijn data wipen en dan kon het opnieuw installeren want mijn oude projecten stond er nog op.</w:t>
+        <w:t>activity</w:t>
+      </w:r>
+      <w:proofErr w:type="spellEnd"/>
+      <w:r>
+        <w:t xml:space="preserve"> start en dan de login page daarmee opent.</w:t>
+      </w:r>
+    </w:p>
+    <w:p>
+      <w:r>
+        <w:t xml:space="preserve">Ik ben dan gewoon terug begonnen aan het oude project en heb dan de error op stack overflow gezocht en daar had ik de oplossing gevonden. Ik moest gewoon mijn “device” zijn data </w:t>
+      </w:r>
+      <w:proofErr w:type="spellStart"/>
+      <w:r>
+        <w:t>wipen</w:t>
+      </w:r>
+      <w:proofErr w:type="spellEnd"/>
+      <w:r>
+        <w:t xml:space="preserve"> en dan kon het opnieuw installeren want mijn oude projecten stond er nog op.</w:t>
       </w:r>
     </w:p>
     <w:p>
@@ -828,7 +1190,23 @@
         <w:t>Vandaag wou de wifi niet werken op de campus dus had ik niet veel vooruitgang geboekt.</w:t>
       </w:r>
       <w:r>
-        <w:t xml:space="preserve"> Ik was ook gisteren vergeten om de registratie pagina te committen, dus da had ik alleszins gedaan door met mijn hotspot van mijn gsm te verbinden en de 4G aan te zetten.</w:t>
+        <w:t xml:space="preserve"> Ik was ook gisteren vergeten om de registratie pagina te </w:t>
+      </w:r>
+      <w:proofErr w:type="spellStart"/>
+      <w:r>
+        <w:t>committen</w:t>
+      </w:r>
+      <w:proofErr w:type="spellEnd"/>
+      <w:r>
+        <w:t xml:space="preserve">, dus da had ik alleszins gedaan door met mijn </w:t>
+      </w:r>
+      <w:proofErr w:type="spellStart"/>
+      <w:r>
+        <w:t>hotspot</w:t>
+      </w:r>
+      <w:proofErr w:type="spellEnd"/>
+      <w:r>
+        <w:t xml:space="preserve"> van mijn gsm te verbinden en de 4G aan te zetten.</w:t>
       </w:r>
     </w:p>
     <w:p>
@@ -860,11 +1238,21 @@
         <w:t>Vandaag wou de wifi op school nog steeds niet zo goed werken</w:t>
       </w:r>
       <w:r>
-        <w:t xml:space="preserve">, maar dankzij de wifi hotspot heb ik toch nog de navigatie van login naar registratie kunnen </w:t>
-      </w:r>
+        <w:t xml:space="preserve">, maar dankzij de wifi </w:t>
+      </w:r>
+      <w:proofErr w:type="spellStart"/>
+      <w:r>
+        <w:t>hotspot</w:t>
+      </w:r>
+      <w:proofErr w:type="spellEnd"/>
+      <w:r>
+        <w:t xml:space="preserve"> heb ik toch nog de navigatie van login naar registratie kunnen </w:t>
+      </w:r>
+      <w:proofErr w:type="spellStart"/>
       <w:r>
         <w:t>commiten</w:t>
       </w:r>
+      <w:proofErr w:type="spellEnd"/>
       <w:r>
         <w:t>.</w:t>
       </w:r>
@@ -874,7 +1262,15 @@
     </w:p>
     <w:p>
       <w:r>
-        <w:t>De wifi wou uiteindelijk werken dus kon eindelijk heel vlot vooruitgaan. Ik heb daarbij de navigatie tussen de login en registratie kunnen afwerken. Daarna heb ik ook de startpagina bijna afgewerkt, maar de bottom bar wou niet helemaal meewerken dus dat laat ik voor later.</w:t>
+        <w:t xml:space="preserve">De wifi wou uiteindelijk werken dus kon eindelijk heel vlot vooruitgaan. Ik heb daarbij de navigatie tussen de login en registratie kunnen afwerken. Daarna heb ik ook de startpagina bijna afgewerkt, maar de </w:t>
+      </w:r>
+      <w:proofErr w:type="spellStart"/>
+      <w:r>
+        <w:t>bottom</w:t>
+      </w:r>
+      <w:proofErr w:type="spellEnd"/>
+      <w:r>
+        <w:t xml:space="preserve"> bar wou niet helemaal meewerken dus dat laat ik voor later.</w:t>
       </w:r>
     </w:p>
     <w:p/>
@@ -895,7 +1291,31 @@
     </w:p>
     <w:p>
       <w:r>
-        <w:t>Vandaag heb ik de bodem navigatie afgewerkt waarbij je dan naar je groepen kunt gaan oftewel naar je notities die je hebt gefotografeerd. Dit was eerste wel een challenge zoals de active pagina weergegeven of de juiste eventlistener gebruiken om te kunnen navigeren. Maar deze links hebben daarbij geholpen:</w:t>
+        <w:t xml:space="preserve">Vandaag heb ik de bodem navigatie afgewerkt waarbij je dan naar je groepen kunt gaan oftewel naar je notities die je hebt gefotografeerd. Dit was eerste wel een </w:t>
+      </w:r>
+      <w:proofErr w:type="spellStart"/>
+      <w:r>
+        <w:t>challenge</w:t>
+      </w:r>
+      <w:proofErr w:type="spellEnd"/>
+      <w:r>
+        <w:t xml:space="preserve"> zoals de </w:t>
+      </w:r>
+      <w:proofErr w:type="spellStart"/>
+      <w:r>
+        <w:t>active</w:t>
+      </w:r>
+      <w:proofErr w:type="spellEnd"/>
+      <w:r>
+        <w:t xml:space="preserve"> pagina weergegeven of de juiste </w:t>
+      </w:r>
+      <w:proofErr w:type="spellStart"/>
+      <w:r>
+        <w:t>eventlistener</w:t>
+      </w:r>
+      <w:proofErr w:type="spellEnd"/>
+      <w:r>
+        <w:t xml:space="preserve"> gebruiken om te kunnen navigeren. Maar deze links hebben daarbij geholpen:</w:t>
       </w:r>
     </w:p>
     <w:p>
@@ -941,13 +1361,29 @@
     </w:p>
     <w:p>
       <w:r>
-        <w:t>Ik heb dan ook nog voor gezorgd dat mijn firebase account verbonden is met</w:t>
+        <w:t xml:space="preserve">Ik heb dan ook nog voor gezorgd dat mijn </w:t>
+      </w:r>
+      <w:proofErr w:type="spellStart"/>
+      <w:r>
+        <w:t>firebase</w:t>
+      </w:r>
+      <w:proofErr w:type="spellEnd"/>
+      <w:r>
+        <w:t xml:space="preserve"> account verbonden is met</w:t>
       </w:r>
       <w:r>
         <w:t xml:space="preserve"> mijn</w:t>
       </w:r>
       <w:r>
-        <w:t xml:space="preserve"> android studio app.</w:t>
+        <w:t xml:space="preserve"> </w:t>
+      </w:r>
+      <w:proofErr w:type="spellStart"/>
+      <w:r>
+        <w:t>android</w:t>
+      </w:r>
+      <w:proofErr w:type="spellEnd"/>
+      <w:r>
+        <w:t xml:space="preserve"> studio app.</w:t>
       </w:r>
     </w:p>
     <w:p>
@@ -1104,8 +1540,13 @@
           <w:numId w:val="1"/>
         </w:numPr>
       </w:pPr>
-      <w:r>
-        <w:t>Firebase implementeren</w:t>
+      <w:proofErr w:type="spellStart"/>
+      <w:r>
+        <w:t>Firebase</w:t>
+      </w:r>
+      <w:proofErr w:type="spellEnd"/>
+      <w:r>
+        <w:t xml:space="preserve"> implementeren</w:t>
       </w:r>
     </w:p>
     <w:p>
@@ -1117,8 +1558,13 @@
         </w:numPr>
       </w:pPr>
       <w:r>
-        <w:t>Login en registratie mogelijk maken via firebase</w:t>
-      </w:r>
+        <w:t xml:space="preserve">Login en registratie mogelijk maken via </w:t>
+      </w:r>
+      <w:proofErr w:type="spellStart"/>
+      <w:r>
+        <w:t>firebase</w:t>
+      </w:r>
+      <w:proofErr w:type="spellEnd"/>
     </w:p>
     <w:p>
       <w:pPr>
@@ -1129,7 +1575,11 @@
         </w:numPr>
       </w:pPr>
       <w:r>
-        <w:t>Camera functionaliteit bekijken voor andr</w:t>
+        <w:t xml:space="preserve">Camera functionaliteit bekijken voor </w:t>
+      </w:r>
+      <w:proofErr w:type="spellStart"/>
+      <w:r>
+        <w:t>andr</w:t>
       </w:r>
       <w:r>
         <w:t>oi</w:t>
@@ -1137,19 +1587,86 @@
       <w:r>
         <w:t>d</w:t>
       </w:r>
+      <w:proofErr w:type="spellEnd"/>
     </w:p>
     <w:p/>
     <w:p>
-      <w:r>
+      <w:pPr>
+        <w:rPr>
+          <w:b/>
+          <w:bCs/>
+        </w:rPr>
+      </w:pPr>
+      <w:r>
+        <w:rPr>
+          <w:b/>
+          <w:bCs/>
+        </w:rPr>
         <w:t>18/10/2021:</w:t>
       </w:r>
     </w:p>
     <w:p>
       <w:r>
-        <w:t>Hier kan je ondertussen zien dat mijn app verbonden is met Firebase. Nu vragen ze voor google sign-in om een sha-1 fingerprint toe te voegen.</w:t>
-      </w:r>
-      <w:r>
-        <w:t xml:space="preserve"> Ik wou dan google play signing pakken om het te genereren ipv self-signing, maar ik moet dan 25 euro eerst betalen voor een </w:t>
+        <w:t xml:space="preserve">Hier kan je ondertussen zien dat mijn app verbonden is met </w:t>
+      </w:r>
+      <w:proofErr w:type="spellStart"/>
+      <w:r>
+        <w:t>Firebase</w:t>
+      </w:r>
+      <w:proofErr w:type="spellEnd"/>
+      <w:r>
+        <w:t xml:space="preserve">. Nu vragen ze voor google </w:t>
+      </w:r>
+      <w:proofErr w:type="spellStart"/>
+      <w:r>
+        <w:t>sign</w:t>
+      </w:r>
+      <w:proofErr w:type="spellEnd"/>
+      <w:r>
+        <w:t xml:space="preserve">-in om een sha-1 </w:t>
+      </w:r>
+      <w:proofErr w:type="spellStart"/>
+      <w:r>
+        <w:t>fingerprint</w:t>
+      </w:r>
+      <w:proofErr w:type="spellEnd"/>
+      <w:r>
+        <w:t xml:space="preserve"> toe te voegen.</w:t>
+      </w:r>
+      <w:r>
+        <w:t xml:space="preserve"> Ik wou dan google </w:t>
+      </w:r>
+      <w:proofErr w:type="spellStart"/>
+      <w:r>
+        <w:t>play</w:t>
+      </w:r>
+      <w:proofErr w:type="spellEnd"/>
+      <w:r>
+        <w:t xml:space="preserve"> </w:t>
+      </w:r>
+      <w:proofErr w:type="spellStart"/>
+      <w:r>
+        <w:t>signing</w:t>
+      </w:r>
+      <w:proofErr w:type="spellEnd"/>
+      <w:r>
+        <w:t xml:space="preserve"> pakken om het te genereren </w:t>
+      </w:r>
+      <w:proofErr w:type="spellStart"/>
+      <w:r>
+        <w:t>ipv</w:t>
+      </w:r>
+      <w:proofErr w:type="spellEnd"/>
+      <w:r>
+        <w:t xml:space="preserve"> </w:t>
+      </w:r>
+      <w:proofErr w:type="spellStart"/>
+      <w:r>
+        <w:t>self-signing</w:t>
+      </w:r>
+      <w:proofErr w:type="spellEnd"/>
+      <w:r>
+        <w:t xml:space="preserve">, maar ik moet dan 25 euro eerst betalen voor een </w:t>
       </w:r>
       <w:r>
         <w:t>ontwikkelaar</w:t>
@@ -1220,14 +1737,75 @@
       <w:r>
         <w:t>Als ik wat meer naar onderging bij de “</w:t>
       </w:r>
-      <w:r>
-        <w:t>Authenticating Your Client</w:t>
-      </w:r>
-      <w:r>
-        <w:t>” pagina (zie link) kan je ook via de terminal van android studio een command invoeren om de sha-1 fingerprint te krijgen. Hierbij moest je “gradle sigingReport” invoeren en dan ctrl + enter invoeren!!</w:t>
-      </w:r>
-      <w:r>
-        <w:t xml:space="preserve"> Deze heb ik dan toegevoegd aan Firebase.</w:t>
+      <w:proofErr w:type="spellStart"/>
+      <w:r>
+        <w:t>Authenticating</w:t>
+      </w:r>
+      <w:proofErr w:type="spellEnd"/>
+      <w:r>
+        <w:t xml:space="preserve"> </w:t>
+      </w:r>
+      <w:proofErr w:type="spellStart"/>
+      <w:r>
+        <w:t>Your</w:t>
+      </w:r>
+      <w:proofErr w:type="spellEnd"/>
+      <w:r>
+        <w:t xml:space="preserve"> Client</w:t>
+      </w:r>
+      <w:r>
+        <w:t xml:space="preserve">” pagina (zie link) kan je ook via de terminal van </w:t>
+      </w:r>
+      <w:proofErr w:type="spellStart"/>
+      <w:r>
+        <w:t>android</w:t>
+      </w:r>
+      <w:proofErr w:type="spellEnd"/>
+      <w:r>
+        <w:t xml:space="preserve"> studio een </w:t>
+      </w:r>
+      <w:proofErr w:type="spellStart"/>
+      <w:r>
+        <w:t>command</w:t>
+      </w:r>
+      <w:proofErr w:type="spellEnd"/>
+      <w:r>
+        <w:t xml:space="preserve"> invoeren om de sha-1 </w:t>
+      </w:r>
+      <w:proofErr w:type="spellStart"/>
+      <w:r>
+        <w:t>fingerprint</w:t>
+      </w:r>
+      <w:proofErr w:type="spellEnd"/>
+      <w:r>
+        <w:t xml:space="preserve"> te krijgen. Hierbij moest je “</w:t>
+      </w:r>
+      <w:proofErr w:type="spellStart"/>
+      <w:r>
+        <w:t>gradle</w:t>
+      </w:r>
+      <w:proofErr w:type="spellEnd"/>
+      <w:r>
+        <w:t xml:space="preserve"> </w:t>
+      </w:r>
+      <w:proofErr w:type="spellStart"/>
+      <w:r>
+        <w:t>sigingReport</w:t>
+      </w:r>
+      <w:proofErr w:type="spellEnd"/>
+      <w:r>
+        <w:t>” invoeren en dan ctrl + enter invoeren!!</w:t>
+      </w:r>
+      <w:r>
+        <w:t xml:space="preserve"> Deze heb ik dan toegevoegd aan </w:t>
+      </w:r>
+      <w:proofErr w:type="spellStart"/>
+      <w:r>
+        <w:t>Firebase</w:t>
+      </w:r>
+      <w:proofErr w:type="spellEnd"/>
+      <w:r>
+        <w:t>.</w:t>
       </w:r>
     </w:p>
     <w:p>
@@ -1275,7 +1853,15 @@
     </w:p>
     <w:p>
       <w:r>
-        <w:t>Daarna moest ik een Oauth 2.0 client ID toevoegen voor het inloggen. Hierbij moest ik een hele configuratie begaan.</w:t>
+        <w:t xml:space="preserve">Daarna moest ik een </w:t>
+      </w:r>
+      <w:proofErr w:type="spellStart"/>
+      <w:r>
+        <w:t>Oauth</w:t>
+      </w:r>
+      <w:proofErr w:type="spellEnd"/>
+      <w:r>
+        <w:t xml:space="preserve"> 2.0 client ID toevoegen voor het inloggen. Hierbij moest ik een hele configuratie begaan.</w:t>
       </w:r>
       <w:r>
         <w:t xml:space="preserve"> Ik heb hierbij het meest niet ingevuld zoals een privacy policy, enzoverder.</w:t>
@@ -1456,7 +2042,31 @@
     </w:p>
     <w:p>
       <w:r>
-        <w:t xml:space="preserve">Vandaag had ik tijdens les (in de morgen van 8u15-11u15) verder gewerkt aan de back-end van mijn app. Ik was gisteren bezig met google sign-in, maar ik besloot om eerst normale email/password authentication toe te voegen. Dit ging vrij vlot vooruit maar toen ik de button klikt sloot de app af, dus dat moet ik nog oplossen. </w:t>
+        <w:t xml:space="preserve">Vandaag had ik tijdens les (in de morgen van 8u15-11u15) verder gewerkt aan de </w:t>
+      </w:r>
+      <w:proofErr w:type="spellStart"/>
+      <w:r>
+        <w:t>back-end</w:t>
+      </w:r>
+      <w:proofErr w:type="spellEnd"/>
+      <w:r>
+        <w:t xml:space="preserve"> van mijn app. Ik was gisteren bezig met google </w:t>
+      </w:r>
+      <w:proofErr w:type="spellStart"/>
+      <w:r>
+        <w:t>sign</w:t>
+      </w:r>
+      <w:proofErr w:type="spellEnd"/>
+      <w:r>
+        <w:t xml:space="preserve">-in, maar ik besloot om eerst normale email/password </w:t>
+      </w:r>
+      <w:proofErr w:type="spellStart"/>
+      <w:r>
+        <w:t>authentication</w:t>
+      </w:r>
+      <w:proofErr w:type="spellEnd"/>
+      <w:r>
+        <w:t xml:space="preserve"> toe te voegen. Dit ging vrij vlot vooruit maar toen ik de button klikt sloot de app af, dus dat moet ik nog oplossen. </w:t>
       </w:r>
       <w:r>
         <w:t>Er werd</w:t>
@@ -1502,10 +2112,26 @@
         <w:t>Vandaag heb ik eindelijk de login en registratie kunnen afwerken. Dit had veel moeite gekost.</w:t>
       </w:r>
       <w:r>
-        <w:t xml:space="preserve"> Het probleem was dus dat mijn app bleef crashen als ik probeerde te registeren. Ik had veel op stackoverflow gezocht maar ik kon eerst niks vinden, maar toen zag ik dat de wifi van de device emulator op Android studio geen wifi had. Ik dacht eerst dat dit normaal was, maar begon toen twijfels te krijgen. Ik had dan eerst de info op stackoverflow pagina proberen gebruiken, maar dat was niet juist. Uiteindelijk gewoon mijn gsm hotspot 4G gebruiken werkte wel.</w:t>
-      </w:r>
-      <w:r>
-        <w:t xml:space="preserve"> Mijn app crasht dan nog steeds bij registratie maar ik kon wel inloggen door een test account aan te maken op Firebase. Dus mijn code werkte, maar toen ik zag dat ik niet gekeken had naar de error van die verscheen na de crash en dat maakte alles duidelijk</w:t>
+        <w:t xml:space="preserve"> Het probleem was dus dat mijn app bleef crashen als ik probeerde te registeren. Ik had veel op stackoverflow gezocht maar ik kon eerst niks vinden, maar toen zag ik dat de wifi van de device emulator op Android studio geen wifi had. Ik dacht eerst dat dit normaal was, maar begon toen twijfels te krijgen. Ik had dan eerst de info op stackoverflow pagina proberen gebruiken, maar dat was niet juist. Uiteindelijk gewoon mijn gsm </w:t>
+      </w:r>
+      <w:proofErr w:type="spellStart"/>
+      <w:r>
+        <w:t>hotspot</w:t>
+      </w:r>
+      <w:proofErr w:type="spellEnd"/>
+      <w:r>
+        <w:t xml:space="preserve"> 4G gebruiken werkte wel.</w:t>
+      </w:r>
+      <w:r>
+        <w:t xml:space="preserve"> Mijn app crasht dan nog steeds bij registratie maar ik kon wel inloggen door een test account aan te maken op </w:t>
+      </w:r>
+      <w:proofErr w:type="spellStart"/>
+      <w:r>
+        <w:t>Firebase</w:t>
+      </w:r>
+      <w:proofErr w:type="spellEnd"/>
+      <w:r>
+        <w:t>. Dus mijn code werkte, maar toen ik zag dat ik niet gekeken had naar de error van die verscheen na de crash en dat maakte alles duidelijk</w:t>
       </w:r>
       <w:r>
         <w:t xml:space="preserve"> voor mij</w:t>
@@ -1520,7 +2146,16 @@
         <w:t xml:space="preserve"> gewoon</w:t>
       </w:r>
       <w:r>
-        <w:t xml:space="preserve"> de juiste variabelen invoeren</w:t>
+        <w:t xml:space="preserve"> de juiste </w:t>
+      </w:r>
+      <w:r>
+        <w:t>input</w:t>
+      </w:r>
+      <w:r>
+        <w:t xml:space="preserve"> </w:t>
+      </w:r>
+      <w:r>
+        <w:t>geven</w:t>
       </w:r>
       <w:r>
         <w:t>:</w:t>
@@ -1621,8 +2256,319 @@
       <w:pPr>
         <w:rPr>
           <w:rFonts w:ascii="Times New Roman" w:eastAsia="Times New Roman" w:hAnsi="Times New Roman" w:cs="Times New Roman"/>
-          <w:i/>
-          <w:iCs/>
+          <w:sz w:val="24"/>
+          <w:szCs w:val="24"/>
+          <w:lang w:eastAsia="nl-BE"/>
+        </w:rPr>
+      </w:pPr>
+    </w:p>
+    <w:p>
+      <w:pPr>
+        <w:rPr>
+          <w:rFonts w:eastAsia="Times New Roman" w:cstheme="minorHAnsi"/>
+          <w:b/>
+          <w:bCs/>
+          <w:lang w:eastAsia="nl-BE"/>
+        </w:rPr>
+      </w:pPr>
+      <w:r>
+        <w:rPr>
+          <w:rFonts w:eastAsia="Times New Roman" w:cstheme="minorHAnsi"/>
+          <w:b/>
+          <w:bCs/>
+          <w:lang w:eastAsia="nl-BE"/>
+        </w:rPr>
+        <w:t>21/10/2021:</w:t>
+      </w:r>
+    </w:p>
+    <w:p>
+      <w:pPr>
+        <w:rPr>
+          <w:rFonts w:eastAsia="Times New Roman" w:cstheme="minorHAnsi"/>
+          <w:lang w:eastAsia="nl-BE"/>
+        </w:rPr>
+      </w:pPr>
+      <w:r>
+        <w:rPr>
+          <w:rFonts w:eastAsia="Times New Roman" w:cstheme="minorHAnsi"/>
+          <w:lang w:eastAsia="nl-BE"/>
+        </w:rPr>
+        <w:t xml:space="preserve">Vandaag heb ik geprobeerd om google </w:t>
+      </w:r>
+      <w:proofErr w:type="spellStart"/>
+      <w:r>
+        <w:rPr>
+          <w:rFonts w:eastAsia="Times New Roman" w:cstheme="minorHAnsi"/>
+          <w:lang w:eastAsia="nl-BE"/>
+        </w:rPr>
+        <w:t>sign</w:t>
+      </w:r>
+      <w:proofErr w:type="spellEnd"/>
+      <w:r>
+        <w:rPr>
+          <w:rFonts w:eastAsia="Times New Roman" w:cstheme="minorHAnsi"/>
+          <w:lang w:eastAsia="nl-BE"/>
+        </w:rPr>
+        <w:t xml:space="preserve">-in te laten werken. Dit ging zeer goed, maar het enige probleem is dat de google account niet wordt toegevoegd aan </w:t>
+      </w:r>
+      <w:proofErr w:type="spellStart"/>
+      <w:r>
+        <w:rPr>
+          <w:rFonts w:eastAsia="Times New Roman" w:cstheme="minorHAnsi"/>
+          <w:lang w:eastAsia="nl-BE"/>
+        </w:rPr>
+        <w:t>Firebase</w:t>
+      </w:r>
+      <w:proofErr w:type="spellEnd"/>
+      <w:r>
+        <w:rPr>
+          <w:rFonts w:eastAsia="Times New Roman" w:cstheme="minorHAnsi"/>
+          <w:lang w:eastAsia="nl-BE"/>
+        </w:rPr>
+        <w:t xml:space="preserve"> en het wil daarna niet naar de volgende pagina gaan als ik de google </w:t>
+      </w:r>
+      <w:proofErr w:type="spellStart"/>
+      <w:r>
+        <w:rPr>
+          <w:rFonts w:eastAsia="Times New Roman" w:cstheme="minorHAnsi"/>
+          <w:lang w:eastAsia="nl-BE"/>
+        </w:rPr>
+        <w:t>sign</w:t>
+      </w:r>
+      <w:proofErr w:type="spellEnd"/>
+      <w:r>
+        <w:rPr>
+          <w:rFonts w:eastAsia="Times New Roman" w:cstheme="minorHAnsi"/>
+          <w:lang w:eastAsia="nl-BE"/>
+        </w:rPr>
+        <w:t>-</w:t>
+      </w:r>
+      <w:r>
+        <w:rPr>
+          <w:rFonts w:eastAsia="Times New Roman" w:cstheme="minorHAnsi"/>
+          <w:lang w:eastAsia="nl-BE"/>
+        </w:rPr>
+        <w:t xml:space="preserve">in button klik. Het </w:t>
+      </w:r>
+      <w:proofErr w:type="spellStart"/>
+      <w:r>
+        <w:rPr>
+          <w:rFonts w:eastAsia="Times New Roman" w:cstheme="minorHAnsi"/>
+          <w:lang w:eastAsia="nl-BE"/>
+        </w:rPr>
+        <w:t>sign</w:t>
+      </w:r>
+      <w:proofErr w:type="spellEnd"/>
+      <w:r>
+        <w:rPr>
+          <w:rFonts w:eastAsia="Times New Roman" w:cstheme="minorHAnsi"/>
+          <w:lang w:eastAsia="nl-BE"/>
+        </w:rPr>
+        <w:t xml:space="preserve">-in scherm verschijnt wel en hebben geen </w:t>
+      </w:r>
+      <w:proofErr w:type="spellStart"/>
+      <w:r>
+        <w:rPr>
+          <w:rFonts w:eastAsia="Times New Roman" w:cstheme="minorHAnsi"/>
+          <w:lang w:eastAsia="nl-BE"/>
+        </w:rPr>
+        <w:t>errors</w:t>
+      </w:r>
+      <w:proofErr w:type="spellEnd"/>
+      <w:r>
+        <w:rPr>
+          <w:rFonts w:eastAsia="Times New Roman" w:cstheme="minorHAnsi"/>
+          <w:lang w:eastAsia="nl-BE"/>
+        </w:rPr>
+        <w:t>, maar daarna gebeurt er niks. Ik heb de methode toegevoegd die iemand van teams zei dat die het probleem</w:t>
+      </w:r>
+      <w:r>
+        <w:rPr>
+          <w:rFonts w:eastAsia="Times New Roman" w:cstheme="minorHAnsi"/>
+          <w:lang w:eastAsia="nl-BE"/>
+        </w:rPr>
+        <w:t xml:space="preserve"> zou</w:t>
+      </w:r>
+      <w:r>
+        <w:rPr>
+          <w:rFonts w:eastAsia="Times New Roman" w:cstheme="minorHAnsi"/>
+          <w:lang w:eastAsia="nl-BE"/>
+        </w:rPr>
+        <w:t xml:space="preserve"> oplos</w:t>
+      </w:r>
+      <w:r>
+        <w:rPr>
+          <w:rFonts w:eastAsia="Times New Roman" w:cstheme="minorHAnsi"/>
+          <w:lang w:eastAsia="nl-BE"/>
+        </w:rPr>
+        <w:t>sen</w:t>
+      </w:r>
+      <w:r>
+        <w:rPr>
+          <w:rFonts w:eastAsia="Times New Roman" w:cstheme="minorHAnsi"/>
+          <w:lang w:eastAsia="nl-BE"/>
+        </w:rPr>
+        <w:t xml:space="preserve"> maar er zal nog ergens een fout zitten.</w:t>
+      </w:r>
+      <w:r>
+        <w:rPr>
+          <w:rFonts w:eastAsia="Times New Roman" w:cstheme="minorHAnsi"/>
+          <w:lang w:eastAsia="nl-BE"/>
+        </w:rPr>
+        <w:t xml:space="preserve"> 1 van de methodes was wel </w:t>
+      </w:r>
+      <w:proofErr w:type="spellStart"/>
+      <w:r>
+        <w:rPr>
+          <w:rFonts w:eastAsia="Times New Roman" w:cstheme="minorHAnsi"/>
+          <w:lang w:eastAsia="nl-BE"/>
+        </w:rPr>
+        <w:t>deprecated</w:t>
+      </w:r>
+      <w:proofErr w:type="spellEnd"/>
+      <w:r>
+        <w:rPr>
+          <w:rFonts w:eastAsia="Times New Roman" w:cstheme="minorHAnsi"/>
+          <w:lang w:eastAsia="nl-BE"/>
+        </w:rPr>
+        <w:t xml:space="preserve">, maar die had </w:t>
+      </w:r>
+      <w:r>
+        <w:rPr>
+          <w:rFonts w:eastAsia="Times New Roman" w:cstheme="minorHAnsi"/>
+          <w:lang w:eastAsia="nl-BE"/>
+        </w:rPr>
+        <w:t>vervangen</w:t>
+      </w:r>
+      <w:r>
+        <w:rPr>
+          <w:rFonts w:eastAsia="Times New Roman" w:cstheme="minorHAnsi"/>
+          <w:lang w:eastAsia="nl-BE"/>
+        </w:rPr>
+        <w:t xml:space="preserve"> dankzij stackoverflow.</w:t>
+      </w:r>
+    </w:p>
+    <w:p>
+      <w:pPr>
+        <w:rPr>
+          <w:rStyle w:val="Hyperlink"/>
+          <w:rFonts w:eastAsia="Times New Roman" w:cstheme="minorHAnsi"/>
+          <w:lang w:eastAsia="nl-BE"/>
+        </w:rPr>
+      </w:pPr>
+      <w:hyperlink r:id="rId30" w:history="1">
+        <w:r>
+          <w:rPr>
+            <w:rStyle w:val="Hyperlink"/>
+            <w:rFonts w:eastAsia="Times New Roman" w:cstheme="minorHAnsi"/>
+            <w:lang w:eastAsia="nl-BE"/>
+          </w:rPr>
+          <w:t>https://firebase.google.com/docs/auth/android/google-signin?hl=nl</w:t>
+        </w:r>
+      </w:hyperlink>
+    </w:p>
+    <w:p>
+      <w:pPr>
+        <w:rPr>
+          <w:rFonts w:eastAsia="Times New Roman" w:cstheme="minorHAnsi"/>
+          <w:lang w:eastAsia="nl-BE"/>
+        </w:rPr>
+      </w:pPr>
+      <w:hyperlink r:id="rId31" w:history="1">
+        <w:r>
+          <w:rPr>
+            <w:rStyle w:val="Hyperlink"/>
+            <w:rFonts w:eastAsia="Times New Roman" w:cstheme="minorHAnsi"/>
+            <w:lang w:eastAsia="nl-BE"/>
+          </w:rPr>
+          <w:t>https://stackoverflow.com/questions/62671106/onactivityresult-method-is-deprecated-what-is-the-alternative</w:t>
+        </w:r>
+      </w:hyperlink>
+    </w:p>
+    <w:p>
+      <w:pPr>
+        <w:rPr>
+          <w:rFonts w:eastAsia="Times New Roman" w:cstheme="minorHAnsi"/>
+          <w:lang w:eastAsia="nl-BE"/>
+        </w:rPr>
+      </w:pPr>
+    </w:p>
+    <w:p>
+      <w:pPr>
+        <w:rPr>
+          <w:rFonts w:eastAsia="Times New Roman" w:cstheme="minorHAnsi"/>
+          <w:lang w:eastAsia="nl-BE"/>
+        </w:rPr>
+      </w:pPr>
+    </w:p>
+    <w:p>
+      <w:pPr>
+        <w:rPr>
+          <w:rFonts w:eastAsia="Times New Roman" w:cstheme="minorHAnsi"/>
+          <w:lang w:eastAsia="nl-BE"/>
+        </w:rPr>
+      </w:pPr>
+      <w:r>
+        <w:rPr>
+          <w:noProof/>
+        </w:rPr>
+        <w:lastRenderedPageBreak/>
+        <w:drawing>
+          <wp:inline distT="0" distB="0" distL="0" distR="0" wp14:anchorId="4E80E83A" wp14:editId="51B26C15">
+            <wp:extent cx="2268986" cy="4543425"/>
+            <wp:effectExtent l="0" t="0" r="0" b="0"/>
+            <wp:docPr id="13" name="Afbeelding 13"/>
+            <wp:cNvGraphicFramePr>
+              <a:graphicFrameLocks xmlns:a="http://schemas.openxmlformats.org/drawingml/2006/main" noChangeAspect="1"/>
+            </wp:cNvGraphicFramePr>
+            <a:graphic xmlns:a="http://schemas.openxmlformats.org/drawingml/2006/main">
+              <a:graphicData uri="http://schemas.openxmlformats.org/drawingml/2006/picture">
+                <pic:pic xmlns:pic="http://schemas.openxmlformats.org/drawingml/2006/picture">
+                  <pic:nvPicPr>
+                    <pic:cNvPr id="1" name=""/>
+                    <pic:cNvPicPr/>
+                  </pic:nvPicPr>
+                  <pic:blipFill>
+                    <a:blip r:embed="rId32"/>
+                    <a:stretch>
+                      <a:fillRect/>
+                    </a:stretch>
+                  </pic:blipFill>
+                  <pic:spPr>
+                    <a:xfrm>
+                      <a:off x="0" y="0"/>
+                      <a:ext cx="2274636" cy="4554739"/>
+                    </a:xfrm>
+                    <a:prstGeom prst="rect">
+                      <a:avLst/>
+                    </a:prstGeom>
+                  </pic:spPr>
+                </pic:pic>
+              </a:graphicData>
+            </a:graphic>
+          </wp:inline>
+        </w:drawing>
+      </w:r>
+      <w:r>
+        <w:rPr>
+          <w:rFonts w:eastAsia="Times New Roman" w:cstheme="minorHAnsi"/>
+          <w:lang w:eastAsia="nl-BE"/>
+        </w:rPr>
+        <w:t xml:space="preserve"> </w:t>
+      </w:r>
+    </w:p>
+    <w:p>
+      <w:pPr>
+        <w:rPr>
+          <w:rFonts w:eastAsia="Times New Roman" w:cstheme="minorHAnsi"/>
+          <w:lang w:eastAsia="nl-BE"/>
+        </w:rPr>
+      </w:pPr>
+    </w:p>
+    <w:p>
+      <w:pPr>
+        <w:rPr>
+          <w:rFonts w:ascii="Times New Roman" w:eastAsia="Times New Roman" w:hAnsi="Times New Roman" w:cs="Times New Roman"/>
           <w:sz w:val="24"/>
           <w:szCs w:val="24"/>
           <w:lang w:eastAsia="nl-BE"/>

</xml_diff>

<commit_message>
Working on adding a camera
</commit_message>
<xml_diff>
--- a/Logboek_Dries_Fierens.docx
+++ b/Logboek_Dries_Fierens.docx
@@ -2773,14 +2773,7 @@
           <w:rFonts w:eastAsia="Times New Roman" w:cstheme="minorHAnsi"/>
           <w:lang w:eastAsia="nl-BE"/>
         </w:rPr>
-        <w:t>gelukkig</w:t>
-      </w:r>
-      <w:r>
-        <w:rPr>
-          <w:rFonts w:eastAsia="Times New Roman" w:cstheme="minorHAnsi"/>
-          <w:lang w:eastAsia="nl-BE"/>
-        </w:rPr>
-        <w:t xml:space="preserve"> </w:t>
+        <w:t xml:space="preserve">gelukkig </w:t>
       </w:r>
       <w:r>
         <w:rPr>
@@ -2945,6 +2938,210 @@
         </w:rPr>
       </w:pPr>
     </w:p>
+    <w:p>
+      <w:pPr>
+        <w:pStyle w:val="Kop2"/>
+      </w:pPr>
+      <w:r>
+        <w:t>Week 6</w:t>
+      </w:r>
+    </w:p>
+    <w:p/>
+    <w:p/>
+    <w:p>
+      <w:pPr>
+        <w:pStyle w:val="Kop3"/>
+      </w:pPr>
+      <w:r>
+        <w:lastRenderedPageBreak/>
+        <w:t xml:space="preserve">Wat ik wil </w:t>
+      </w:r>
+      <w:proofErr w:type="spellStart"/>
+      <w:r>
+        <w:t>realiseen</w:t>
+      </w:r>
+      <w:proofErr w:type="spellEnd"/>
+      <w:r>
+        <w:t xml:space="preserve"> deze week:</w:t>
+      </w:r>
+    </w:p>
+    <w:p>
+      <w:pPr>
+        <w:pStyle w:val="Lijstalinea"/>
+        <w:numPr>
+          <w:ilvl w:val="0"/>
+          <w:numId w:val="2"/>
+        </w:numPr>
+      </w:pPr>
+      <w:proofErr w:type="spellStart"/>
+      <w:r>
+        <w:t>Firebase</w:t>
+      </w:r>
+      <w:proofErr w:type="spellEnd"/>
+      <w:r>
+        <w:t xml:space="preserve"> </w:t>
+      </w:r>
+      <w:r>
+        <w:t>storage</w:t>
+      </w:r>
+      <w:r>
+        <w:t xml:space="preserve"> aanmaken</w:t>
+      </w:r>
+      <w:r>
+        <w:t xml:space="preserve"> voor images op te slaan</w:t>
+      </w:r>
+    </w:p>
+    <w:p>
+      <w:pPr>
+        <w:pStyle w:val="Lijstalinea"/>
+        <w:numPr>
+          <w:ilvl w:val="0"/>
+          <w:numId w:val="2"/>
+        </w:numPr>
+      </w:pPr>
+      <w:r>
+        <w:t>Camera functionaliteiten uitproberen</w:t>
+      </w:r>
+    </w:p>
+    <w:p/>
+    <w:p>
+      <w:pPr>
+        <w:rPr>
+          <w:b/>
+          <w:bCs/>
+        </w:rPr>
+      </w:pPr>
+      <w:r>
+        <w:rPr>
+          <w:b/>
+          <w:bCs/>
+        </w:rPr>
+        <w:t>25/10/2021:</w:t>
+      </w:r>
+    </w:p>
+    <w:p>
+      <w:r>
+        <w:t xml:space="preserve">Vandaag ben ik begonnen met aanmaken van de </w:t>
+      </w:r>
+      <w:proofErr w:type="spellStart"/>
+      <w:r>
+        <w:t>Firebase</w:t>
+      </w:r>
+      <w:proofErr w:type="spellEnd"/>
+      <w:r>
+        <w:t xml:space="preserve"> storage voor het opslaan van afbeeldingen.</w:t>
+      </w:r>
+      <w:r>
+        <w:t xml:space="preserve"> </w:t>
+      </w:r>
+      <w:r>
+        <w:t xml:space="preserve">Ik heb dan de </w:t>
+      </w:r>
+      <w:proofErr w:type="spellStart"/>
+      <w:r>
+        <w:t>dependencies</w:t>
+      </w:r>
+      <w:proofErr w:type="spellEnd"/>
+      <w:r>
+        <w:t xml:space="preserve"> toegevoegd en dan moest ik een Cloud storage bucket aanmaken. Hierbij werd er gevraagd om een locatie te kiezen waarbij Europe-west 1 (= Belgische regio) niet tussen stond, maar gelukkig is er Eur3 die eigenlijk Belgische en Nederlandse regio voorstelt. Dat werd uitgelegd </w:t>
+      </w:r>
+      <w:r>
+        <w:t xml:space="preserve">op deze </w:t>
+      </w:r>
+      <w:proofErr w:type="spellStart"/>
+      <w:r>
+        <w:t>webpagina</w:t>
+      </w:r>
+      <w:r>
+        <w:t>‘s</w:t>
+      </w:r>
+      <w:r>
+        <w:t>:</w:t>
+      </w:r>
+      <w:r>
+        <w:t>s</w:t>
+      </w:r>
+      <w:proofErr w:type="spellEnd"/>
+    </w:p>
+    <w:p>
+      <w:hyperlink r:id="rId36" w:history="1">
+        <w:r>
+          <w:rPr>
+            <w:rStyle w:val="Hyperlink"/>
+          </w:rPr>
+          <w:t>https://firebase.google.com/docs/firestore/locations</w:t>
+        </w:r>
+      </w:hyperlink>
+    </w:p>
+    <w:p>
+      <w:hyperlink r:id="rId37" w:history="1">
+        <w:r>
+          <w:rPr>
+            <w:rStyle w:val="Hyperlink"/>
+          </w:rPr>
+          <w:t>https://cloud.google.com/compute/docs/regions-zones</w:t>
+        </w:r>
+      </w:hyperlink>
+    </w:p>
+    <w:p>
+      <w:r>
+        <w:rPr>
+          <w:noProof/>
+        </w:rPr>
+        <w:drawing>
+          <wp:inline distT="0" distB="0" distL="0" distR="0" wp14:anchorId="6D3D04B7" wp14:editId="3722762B">
+            <wp:extent cx="3953864" cy="2295525"/>
+            <wp:effectExtent l="0" t="0" r="8890" b="0"/>
+            <wp:docPr id="16" name="Afbeelding 16"/>
+            <wp:cNvGraphicFramePr>
+              <a:graphicFrameLocks xmlns:a="http://schemas.openxmlformats.org/drawingml/2006/main" noChangeAspect="1"/>
+            </wp:cNvGraphicFramePr>
+            <a:graphic xmlns:a="http://schemas.openxmlformats.org/drawingml/2006/main">
+              <a:graphicData uri="http://schemas.openxmlformats.org/drawingml/2006/picture">
+                <pic:pic xmlns:pic="http://schemas.openxmlformats.org/drawingml/2006/picture">
+                  <pic:nvPicPr>
+                    <pic:cNvPr id="1" name=""/>
+                    <pic:cNvPicPr/>
+                  </pic:nvPicPr>
+                  <pic:blipFill>
+                    <a:blip r:embed="rId38"/>
+                    <a:stretch>
+                      <a:fillRect/>
+                    </a:stretch>
+                  </pic:blipFill>
+                  <pic:spPr>
+                    <a:xfrm>
+                      <a:off x="0" y="0"/>
+                      <a:ext cx="3959843" cy="2298996"/>
+                    </a:xfrm>
+                    <a:prstGeom prst="rect">
+                      <a:avLst/>
+                    </a:prstGeom>
+                  </pic:spPr>
+                </pic:pic>
+              </a:graphicData>
+            </a:graphic>
+          </wp:inline>
+        </w:drawing>
+      </w:r>
+    </w:p>
+    <w:p>
+      <w:r>
+        <w:t>Voor de camera ben ik van plan deze video’s te gebruiken:</w:t>
+      </w:r>
+    </w:p>
+    <w:p>
+      <w:hyperlink r:id="rId39" w:history="1">
+        <w:r>
+          <w:rPr>
+            <w:rStyle w:val="Hyperlink"/>
+          </w:rPr>
+          <w:t>https://www.youtube.com/watch?v=s1aOlr3vbbk</w:t>
+        </w:r>
+      </w:hyperlink>
+    </w:p>
+    <w:p/>
+    <w:p/>
     <w:p/>
     <w:p/>
     <w:sectPr>
@@ -2960,6 +3157,118 @@
 <file path=word/numbering.xml><?xml version="1.0" encoding="utf-8"?>
 <w:numbering xmlns:wpc="http://schemas.microsoft.com/office/word/2010/wordprocessingCanvas" xmlns:cx="http://schemas.microsoft.com/office/drawing/2014/chartex" xmlns:cx1="http://schemas.microsoft.com/office/drawing/2015/9/8/chartex" xmlns:cx2="http://schemas.microsoft.com/office/drawing/2015/10/21/chartex" xmlns:cx3="http://schemas.microsoft.com/office/drawing/2016/5/9/chartex" xmlns:cx4="http://schemas.microsoft.com/office/drawing/2016/5/10/chartex" xmlns:cx5="http://schemas.microsoft.com/office/drawing/2016/5/11/chartex" xmlns:cx6="http://schemas.microsoft.com/office/drawing/2016/5/12/chartex" xmlns:cx7="http://schemas.microsoft.com/office/drawing/2016/5/13/chartex" xmlns:cx8="http://schemas.microsoft.com/office/drawing/2016/5/14/chartex" xmlns:mc="http://schemas.openxmlformats.org/markup-compatibility/2006" xmlns:aink="http://schemas.microsoft.com/office/drawing/2016/ink" xmlns:am3d="http://schemas.microsoft.com/office/drawing/2017/model3d" xmlns:o="urn:schemas-microsoft-com:office:office" xmlns:r="http://schemas.openxmlformats.org/officeDocument/2006/relationships" xmlns:m="http://schemas.openxmlformats.org/officeDocument/2006/math" xmlns:v="urn:schemas-microsoft-com:vml" xmlns:wp14="http://schemas.microsoft.com/office/word/2010/wordprocessingDrawing" xmlns:wp="http://schemas.openxmlformats.org/drawingml/2006/wordprocessingDrawing" xmlns:w10="urn:schemas-microsoft-com:office:word" xmlns:w="http://schemas.openxmlformats.org/wordprocessingml/2006/main" xmlns:w14="http://schemas.microsoft.com/office/word/2010/wordml" xmlns:w15="http://schemas.microsoft.com/office/word/2012/wordml" xmlns:w16cex="http://schemas.microsoft.com/office/word/2018/wordml/cex" xmlns:w16cid="http://schemas.microsoft.com/office/word/2016/wordml/cid" xmlns:w16="http://schemas.microsoft.com/office/word/2018/wordml" xmlns:w16sdtdh="http://schemas.microsoft.com/office/word/2020/wordml/sdtdatahash" xmlns:w16se="http://schemas.microsoft.com/office/word/2015/wordml/symex" xmlns:wpg="http://schemas.microsoft.com/office/word/2010/wordprocessingGroup" xmlns:wpi="http://schemas.microsoft.com/office/word/2010/wordprocessingInk" xmlns:wne="http://schemas.microsoft.com/office/word/2006/wordml" xmlns:wps="http://schemas.microsoft.com/office/word/2010/wordprocessingShape" mc:Ignorable="w14 w15 w16se w16cid w16 w16cex w16sdtdh wp14">
   <w:abstractNum w:abstractNumId="0" w15:restartNumberingAfterBreak="0">
+    <w:nsid w:val="612B6B41"/>
+    <w:multiLevelType w:val="hybridMultilevel"/>
+    <w:tmpl w:val="68948BD6"/>
+    <w:lvl w:ilvl="0" w:tplc="0D9675DE">
+      <w:numFmt w:val="bullet"/>
+      <w:lvlText w:val="-"/>
+      <w:lvlJc w:val="left"/>
+      <w:pPr>
+        <w:ind w:left="720" w:hanging="360"/>
+      </w:pPr>
+      <w:rPr>
+        <w:rFonts w:ascii="Calibri" w:eastAsiaTheme="minorHAnsi" w:hAnsi="Calibri" w:cs="Calibri" w:hint="default"/>
+      </w:rPr>
+    </w:lvl>
+    <w:lvl w:ilvl="1" w:tplc="08130003" w:tentative="1">
+      <w:start w:val="1"/>
+      <w:numFmt w:val="bullet"/>
+      <w:lvlText w:val="o"/>
+      <w:lvlJc w:val="left"/>
+      <w:pPr>
+        <w:ind w:left="1440" w:hanging="360"/>
+      </w:pPr>
+      <w:rPr>
+        <w:rFonts w:ascii="Courier New" w:hAnsi="Courier New" w:cs="Courier New" w:hint="default"/>
+      </w:rPr>
+    </w:lvl>
+    <w:lvl w:ilvl="2" w:tplc="08130005" w:tentative="1">
+      <w:start w:val="1"/>
+      <w:numFmt w:val="bullet"/>
+      <w:lvlText w:val=""/>
+      <w:lvlJc w:val="left"/>
+      <w:pPr>
+        <w:ind w:left="2160" w:hanging="360"/>
+      </w:pPr>
+      <w:rPr>
+        <w:rFonts w:ascii="Wingdings" w:hAnsi="Wingdings" w:hint="default"/>
+      </w:rPr>
+    </w:lvl>
+    <w:lvl w:ilvl="3" w:tplc="08130001" w:tentative="1">
+      <w:start w:val="1"/>
+      <w:numFmt w:val="bullet"/>
+      <w:lvlText w:val=""/>
+      <w:lvlJc w:val="left"/>
+      <w:pPr>
+        <w:ind w:left="2880" w:hanging="360"/>
+      </w:pPr>
+      <w:rPr>
+        <w:rFonts w:ascii="Symbol" w:hAnsi="Symbol" w:hint="default"/>
+      </w:rPr>
+    </w:lvl>
+    <w:lvl w:ilvl="4" w:tplc="08130003" w:tentative="1">
+      <w:start w:val="1"/>
+      <w:numFmt w:val="bullet"/>
+      <w:lvlText w:val="o"/>
+      <w:lvlJc w:val="left"/>
+      <w:pPr>
+        <w:ind w:left="3600" w:hanging="360"/>
+      </w:pPr>
+      <w:rPr>
+        <w:rFonts w:ascii="Courier New" w:hAnsi="Courier New" w:cs="Courier New" w:hint="default"/>
+      </w:rPr>
+    </w:lvl>
+    <w:lvl w:ilvl="5" w:tplc="08130005" w:tentative="1">
+      <w:start w:val="1"/>
+      <w:numFmt w:val="bullet"/>
+      <w:lvlText w:val=""/>
+      <w:lvlJc w:val="left"/>
+      <w:pPr>
+        <w:ind w:left="4320" w:hanging="360"/>
+      </w:pPr>
+      <w:rPr>
+        <w:rFonts w:ascii="Wingdings" w:hAnsi="Wingdings" w:hint="default"/>
+      </w:rPr>
+    </w:lvl>
+    <w:lvl w:ilvl="6" w:tplc="08130001" w:tentative="1">
+      <w:start w:val="1"/>
+      <w:numFmt w:val="bullet"/>
+      <w:lvlText w:val=""/>
+      <w:lvlJc w:val="left"/>
+      <w:pPr>
+        <w:ind w:left="5040" w:hanging="360"/>
+      </w:pPr>
+      <w:rPr>
+        <w:rFonts w:ascii="Symbol" w:hAnsi="Symbol" w:hint="default"/>
+      </w:rPr>
+    </w:lvl>
+    <w:lvl w:ilvl="7" w:tplc="08130003" w:tentative="1">
+      <w:start w:val="1"/>
+      <w:numFmt w:val="bullet"/>
+      <w:lvlText w:val="o"/>
+      <w:lvlJc w:val="left"/>
+      <w:pPr>
+        <w:ind w:left="5760" w:hanging="360"/>
+      </w:pPr>
+      <w:rPr>
+        <w:rFonts w:ascii="Courier New" w:hAnsi="Courier New" w:cs="Courier New" w:hint="default"/>
+      </w:rPr>
+    </w:lvl>
+    <w:lvl w:ilvl="8" w:tplc="08130005" w:tentative="1">
+      <w:start w:val="1"/>
+      <w:numFmt w:val="bullet"/>
+      <w:lvlText w:val=""/>
+      <w:lvlJc w:val="left"/>
+      <w:pPr>
+        <w:ind w:left="6480" w:hanging="360"/>
+      </w:pPr>
+      <w:rPr>
+        <w:rFonts w:ascii="Wingdings" w:hAnsi="Wingdings" w:hint="default"/>
+      </w:rPr>
+    </w:lvl>
+  </w:abstractNum>
+  <w:abstractNum w:abstractNumId="1" w15:restartNumberingAfterBreak="0">
     <w:nsid w:val="7F790B1D"/>
     <w:multiLevelType w:val="hybridMultilevel"/>
     <w:tmpl w:val="76A286F0"/>
@@ -3049,6 +3358,9 @@
     </w:lvl>
   </w:abstractNum>
   <w:num w:numId="1">
+    <w:abstractNumId w:val="1"/>
+  </w:num>
+  <w:num w:numId="2">
     <w:abstractNumId w:val="0"/>
   </w:num>
 </w:numbering>

</xml_diff>

<commit_message>
It is now possible to open the camera and ask camera permissions
</commit_message>
<xml_diff>
--- a/Logboek_Dries_Fierens.docx
+++ b/Logboek_Dries_Fierens.docx
@@ -78,7 +78,15 @@
       </w:r>
       <w:proofErr w:type="spellEnd"/>
       <w:r>
-        <w:t xml:space="preserve"> web app dat dus meer te maken hebben met web &amp; mobile dus vooral HTML &amp; CSS. We moesten dan ook nog kiezen voor een project idee, waarbij ik koos voor een scanner + pdf converter app</w:t>
+        <w:t xml:space="preserve"> web app dat dus meer te maken hebben met web &amp; mobile dus vooral HTML &amp; CSS. We moesten dan ook nog kiezen voor een project idee, waarbij ik koos voor een scanner + </w:t>
+      </w:r>
+      <w:proofErr w:type="gramStart"/>
+      <w:r>
+        <w:t>pdf converter</w:t>
+      </w:r>
+      <w:proofErr w:type="gramEnd"/>
+      <w:r>
+        <w:t xml:space="preserve"> app</w:t>
       </w:r>
       <w:r>
         <w:t xml:space="preserve"> waarbij het vooral bedoelt is o</w:t>
@@ -99,7 +107,15 @@
         <w:t>.</w:t>
       </w:r>
       <w:r>
-        <w:t xml:space="preserve"> Het was verplicht om 1 hardware component van de gsm te gebruiken dus koos ik natuurlijk voor de camera.</w:t>
+        <w:t xml:space="preserve"> Het was verplicht om 1 </w:t>
+      </w:r>
+      <w:proofErr w:type="gramStart"/>
+      <w:r>
+        <w:t>hardware component</w:t>
+      </w:r>
+      <w:proofErr w:type="gramEnd"/>
+      <w:r>
+        <w:t xml:space="preserve"> van de gsm te gebruiken dus koos ik natuurlijk voor de camera.</w:t>
       </w:r>
       <w:r>
         <w:t xml:space="preserve"> </w:t>
@@ -213,7 +229,15 @@
         <w:t xml:space="preserve">Mijn app idee werd niet goedgekeurd, want de leerkracht raadde het af door problemen die ervan kunnen komen. Ik moest dan vandaag een nieuw idee opstellen. </w:t>
       </w:r>
       <w:r>
-        <w:t>De scanner + pdf converter was duidelijk te moeilijk, maar ik besloot om het idee verder te zetten van een app die notities kan delen. Dus nu moet het gewoon foto’s trekken van de notities. Om nog toe te voegen kan ik ook opmerkingswolkjes toevoegen aan de foto voor bijvoorbeeld een fout</w:t>
+        <w:t xml:space="preserve">De scanner + </w:t>
+      </w:r>
+      <w:proofErr w:type="gramStart"/>
+      <w:r>
+        <w:t>pdf converter</w:t>
+      </w:r>
+      <w:proofErr w:type="gramEnd"/>
+      <w:r>
+        <w:t xml:space="preserve"> was duidelijk te moeilijk, maar ik besloot om het idee verder te zetten van een app die notities kan delen. Dus nu moet het gewoon foto’s trekken van de notities. Om nog toe te voegen kan ik ook opmerkingswolkjes toevoegen aan de foto voor bijvoorbeeld een fout</w:t>
       </w:r>
       <w:r>
         <w:t xml:space="preserve"> aan te duiden</w:t>
@@ -285,7 +309,15 @@
         <w:t>te veel</w:t>
       </w:r>
       <w:r>
-        <w:t xml:space="preserve"> naar voor moest leunen en dus nek pijn kreeg en er waren precies geen ramen om te openen. </w:t>
+        <w:t xml:space="preserve"> naar voor moest leunen en dus </w:t>
+      </w:r>
+      <w:proofErr w:type="gramStart"/>
+      <w:r>
+        <w:t>nek pijn</w:t>
+      </w:r>
+      <w:proofErr w:type="gramEnd"/>
+      <w:r>
+        <w:t xml:space="preserve"> kreeg en er waren precies geen ramen om te openen. </w:t>
       </w:r>
       <w:r>
         <w:t>Gelukkig kunnen we naar buiten wanneer we het willen.</w:t>
@@ -566,7 +598,15 @@
     </w:p>
     <w:p>
       <w:r>
-        <w:t xml:space="preserve">Tijdens lange downloads heb ik ook mijn google account toegevoegd op </w:t>
+        <w:t xml:space="preserve">Tijdens lange downloads heb ik ook mijn </w:t>
+      </w:r>
+      <w:proofErr w:type="gramStart"/>
+      <w:r>
+        <w:t>google account</w:t>
+      </w:r>
+      <w:proofErr w:type="gramEnd"/>
+      <w:r>
+        <w:t xml:space="preserve"> toegevoegd op </w:t>
       </w:r>
       <w:proofErr w:type="spellStart"/>
       <w:r>
@@ -655,7 +695,15 @@
         <w:t>Ik heb daarna gewoon verder begonnen aan de tutorial die ik vorige week gebruikt had.</w:t>
       </w:r>
       <w:r>
-        <w:t xml:space="preserve"> Hierbij leerde ik meer over hoe ik Android studio beter kon gebruiken om mijn app te </w:t>
+        <w:t xml:space="preserve"> Hierbij leerde ik meer over hoe ik </w:t>
+      </w:r>
+      <w:proofErr w:type="gramStart"/>
+      <w:r>
+        <w:t>Android studio</w:t>
+      </w:r>
+      <w:proofErr w:type="gramEnd"/>
+      <w:r>
+        <w:t xml:space="preserve"> beter kon gebruiken om mijn app te </w:t>
       </w:r>
       <w:proofErr w:type="spellStart"/>
       <w:r>
@@ -678,7 +726,15 @@
         <w:t>)</w:t>
       </w:r>
       <w:r>
-        <w:t xml:space="preserve">. Android studio is zeer gelijkaardig als bijvoorbeeld </w:t>
+        <w:t xml:space="preserve">. </w:t>
+      </w:r>
+      <w:proofErr w:type="gramStart"/>
+      <w:r>
+        <w:t>Android studio</w:t>
+      </w:r>
+      <w:proofErr w:type="gramEnd"/>
+      <w:r>
+        <w:t xml:space="preserve"> is zeer gelijkaardig als bijvoorbeeld </w:t>
       </w:r>
       <w:proofErr w:type="spellStart"/>
       <w:r>
@@ -709,8 +765,13 @@
         <w:t>bekijken</w:t>
       </w:r>
       <w:r>
-        <w:t xml:space="preserve"> in een gekozen browser, maar je kan in Android studio</w:t>
-      </w:r>
+        <w:t xml:space="preserve"> in een gekozen browser, maar je kan in </w:t>
+      </w:r>
+      <w:proofErr w:type="gramStart"/>
+      <w:r>
+        <w:t>Android studio</w:t>
+      </w:r>
+      <w:proofErr w:type="gramEnd"/>
       <w:r>
         <w:t xml:space="preserve"> je app</w:t>
       </w:r>
@@ -826,7 +887,15 @@
       </w:r>
       <w:proofErr w:type="spellEnd"/>
       <w:r>
-        <w:t xml:space="preserve"> design gevolgd in plaats van die van Android studio. Ze leerde me dan hoe ik er mee kon werken maar niet hoe een hele nieuwe app kon maken. Ik kreeg een voorbeeld app om erin te kunnen werken voor de tutorial.</w:t>
+        <w:t xml:space="preserve"> design gevolgd in plaats van die van </w:t>
+      </w:r>
+      <w:proofErr w:type="gramStart"/>
+      <w:r>
+        <w:t>Android studio</w:t>
+      </w:r>
+      <w:proofErr w:type="gramEnd"/>
+      <w:r>
+        <w:t>. Ze leerde me dan hoe ik er mee kon werken maar niet hoe een hele nieuwe app kon maken. Ik kreeg een voorbeeld app om erin te kunnen werken voor de tutorial.</w:t>
       </w:r>
     </w:p>
     <w:p>
@@ -2112,7 +2181,15 @@
         <w:t>Vandaag heb ik eindelijk de login en registratie kunnen afwerken. Dit had veel moeite gekost.</w:t>
       </w:r>
       <w:r>
-        <w:t xml:space="preserve"> Het probleem was dus dat mijn app bleef crashen als ik probeerde te registeren. Ik had veel op stackoverflow gezocht maar ik kon eerst niks vinden, maar toen zag ik dat de wifi van de device emulator op Android studio geen wifi had. Ik dacht eerst dat dit normaal was, maar begon toen twijfels te krijgen. Ik had dan eerst de info op stackoverflow pagina proberen gebruiken, maar dat was niet juist. Uiteindelijk gewoon mijn gsm </w:t>
+        <w:t xml:space="preserve"> Het probleem was dus dat mijn app bleef crashen als ik probeerde te registeren. Ik had veel op stackoverflow gezocht maar ik kon eerst niks vinden, maar toen zag ik dat de wifi van de device emulator op </w:t>
+      </w:r>
+      <w:proofErr w:type="gramStart"/>
+      <w:r>
+        <w:t>Android studio</w:t>
+      </w:r>
+      <w:proofErr w:type="gramEnd"/>
+      <w:r>
+        <w:t xml:space="preserve"> geen wifi had. Ik dacht eerst dat dit normaal was, maar begon toen twijfels te krijgen. Ik had dan eerst de info op stackoverflow pagina proberen gebruiken, maar dat was niet juist. Uiteindelijk gewoon mijn gsm </w:t>
       </w:r>
       <w:proofErr w:type="spellStart"/>
       <w:r>
@@ -2309,7 +2386,23 @@
           <w:rFonts w:eastAsia="Times New Roman" w:cstheme="minorHAnsi"/>
           <w:lang w:eastAsia="nl-BE"/>
         </w:rPr>
-        <w:t xml:space="preserve">-in te laten werken. Dit ging zeer goed, maar het enige probleem is dat de google account niet wordt toegevoegd aan </w:t>
+        <w:t xml:space="preserve">-in te laten werken. Dit ging zeer goed, maar het enige probleem is dat de </w:t>
+      </w:r>
+      <w:proofErr w:type="gramStart"/>
+      <w:r>
+        <w:rPr>
+          <w:rFonts w:eastAsia="Times New Roman" w:cstheme="minorHAnsi"/>
+          <w:lang w:eastAsia="nl-BE"/>
+        </w:rPr>
+        <w:t>google account</w:t>
+      </w:r>
+      <w:proofErr w:type="gramEnd"/>
+      <w:r>
+        <w:rPr>
+          <w:rFonts w:eastAsia="Times New Roman" w:cstheme="minorHAnsi"/>
+          <w:lang w:eastAsia="nl-BE"/>
+        </w:rPr>
+        <w:t xml:space="preserve"> niet wordt toegevoegd aan </w:t>
       </w:r>
       <w:proofErr w:type="spellStart"/>
       <w:r>
@@ -2723,6 +2816,7 @@
         <w:t xml:space="preserve"> was eigenlijk al klaar in een google-</w:t>
       </w:r>
       <w:proofErr w:type="spellStart"/>
+      <w:proofErr w:type="gramStart"/>
       <w:r>
         <w:rPr>
           <w:rFonts w:eastAsia="Times New Roman" w:cstheme="minorHAnsi"/>
@@ -2731,6 +2825,7 @@
         <w:t>services.json</w:t>
       </w:r>
       <w:proofErr w:type="spellEnd"/>
+      <w:proofErr w:type="gramEnd"/>
       <w:r>
         <w:rPr>
           <w:rFonts w:eastAsia="Times New Roman" w:cstheme="minorHAnsi"/>
@@ -2759,7 +2854,23 @@
           <w:rFonts w:eastAsia="Times New Roman" w:cstheme="minorHAnsi"/>
           <w:lang w:eastAsia="nl-BE"/>
         </w:rPr>
-        <w:t xml:space="preserve"> Nu kunnen google accounts succesvol worden toegevoegd.</w:t>
+        <w:t xml:space="preserve"> Nu kunnen </w:t>
+      </w:r>
+      <w:proofErr w:type="gramStart"/>
+      <w:r>
+        <w:rPr>
+          <w:rFonts w:eastAsia="Times New Roman" w:cstheme="minorHAnsi"/>
+          <w:lang w:eastAsia="nl-BE"/>
+        </w:rPr>
+        <w:t>google accounts</w:t>
+      </w:r>
+      <w:proofErr w:type="gramEnd"/>
+      <w:r>
+        <w:rPr>
+          <w:rFonts w:eastAsia="Times New Roman" w:cstheme="minorHAnsi"/>
+          <w:lang w:eastAsia="nl-BE"/>
+        </w:rPr>
+        <w:t xml:space="preserve"> succesvol worden toegevoegd.</w:t>
       </w:r>
       <w:r>
         <w:rPr>
@@ -3049,11 +3160,16 @@
         <w:t xml:space="preserve">op deze </w:t>
       </w:r>
       <w:proofErr w:type="spellStart"/>
+      <w:proofErr w:type="gramStart"/>
       <w:r>
         <w:t>webpagina</w:t>
       </w:r>
       <w:r>
-        <w:t>‘s</w:t>
+        <w:t>‘</w:t>
+      </w:r>
+      <w:proofErr w:type="gramEnd"/>
+      <w:r>
+        <w:t>s</w:t>
       </w:r>
       <w:r>
         <w:t>:</w:t>
@@ -3131,6 +3247,12 @@
       </w:r>
     </w:p>
     <w:p>
+      <w:pPr>
+        <w:rPr>
+          <w:color w:val="0563C1" w:themeColor="hyperlink"/>
+          <w:u w:val="single"/>
+        </w:rPr>
+      </w:pPr>
       <w:hyperlink r:id="rId39" w:history="1">
         <w:r>
           <w:rPr>
@@ -3142,6 +3264,124 @@
     </w:p>
     <w:p/>
     <w:p/>
+    <w:p>
+      <w:pPr>
+        <w:rPr>
+          <w:b/>
+          <w:bCs/>
+        </w:rPr>
+      </w:pPr>
+      <w:r>
+        <w:rPr>
+          <w:b/>
+          <w:bCs/>
+        </w:rPr>
+        <w:t>26/10/2021:</w:t>
+      </w:r>
+    </w:p>
+    <w:p>
+      <w:r>
+        <w:t xml:space="preserve">Vandaag heb ik de </w:t>
+      </w:r>
+      <w:proofErr w:type="spellStart"/>
+      <w:r>
+        <w:t>java</w:t>
+      </w:r>
+      <w:proofErr w:type="spellEnd"/>
+      <w:r>
+        <w:t xml:space="preserve"> code moet schrijven voor de camera te kunnen gebruiken. Eerst heb ik code toegevoegd dat ervoor zorgt dat de permissies worden aangevraagd om de camera te kunnen gebruiken. Daarna als ik </w:t>
+      </w:r>
+      <w:proofErr w:type="spellStart"/>
+      <w:r>
+        <w:t>allow</w:t>
+      </w:r>
+      <w:proofErr w:type="spellEnd"/>
+      <w:r>
+        <w:t xml:space="preserve"> klik dan opent een test camera zicht van de emulator. </w:t>
+      </w:r>
+    </w:p>
+    <w:p>
+      <w:r>
+        <w:t xml:space="preserve">Hierbij werden gelijkaardig methoden gebruikt zoals de </w:t>
+      </w:r>
+      <w:proofErr w:type="spellStart"/>
+      <w:r>
+        <w:t>firebase</w:t>
+      </w:r>
+      <w:proofErr w:type="spellEnd"/>
+      <w:r>
+        <w:t xml:space="preserve"> </w:t>
+      </w:r>
+      <w:proofErr w:type="spellStart"/>
+      <w:r>
+        <w:t>authentication</w:t>
+      </w:r>
+      <w:proofErr w:type="spellEnd"/>
+      <w:r>
+        <w:t xml:space="preserve">, maar waren ook </w:t>
+      </w:r>
+      <w:proofErr w:type="spellStart"/>
+      <w:r>
+        <w:t>deprecated</w:t>
+      </w:r>
+      <w:proofErr w:type="spellEnd"/>
+      <w:r>
+        <w:t>. Dit heb natuurlijk makkelijk opgelost.</w:t>
+      </w:r>
+    </w:p>
+    <w:p>
+      <w:hyperlink r:id="rId40" w:history="1">
+        <w:r>
+          <w:rPr>
+            <w:rStyle w:val="Hyperlink"/>
+          </w:rPr>
+          <w:t>https://stackoverflow.com/questions/66551781/android-onrequestpermissionsresult-is-deprecated-are-there-any-alternatives</w:t>
+        </w:r>
+      </w:hyperlink>
+    </w:p>
+    <w:p>
+      <w:r>
+        <w:rPr>
+          <w:noProof/>
+        </w:rPr>
+        <w:lastRenderedPageBreak/>
+        <w:drawing>
+          <wp:inline distT="0" distB="0" distL="0" distR="0" wp14:anchorId="784FEC75" wp14:editId="3906B66A">
+            <wp:extent cx="2159866" cy="3952875"/>
+            <wp:effectExtent l="0" t="0" r="0" b="0"/>
+            <wp:docPr id="17" name="Afbeelding 17"/>
+            <wp:cNvGraphicFramePr>
+              <a:graphicFrameLocks xmlns:a="http://schemas.openxmlformats.org/drawingml/2006/main" noChangeAspect="1"/>
+            </wp:cNvGraphicFramePr>
+            <a:graphic xmlns:a="http://schemas.openxmlformats.org/drawingml/2006/main">
+              <a:graphicData uri="http://schemas.openxmlformats.org/drawingml/2006/picture">
+                <pic:pic xmlns:pic="http://schemas.openxmlformats.org/drawingml/2006/picture">
+                  <pic:nvPicPr>
+                    <pic:cNvPr id="1" name=""/>
+                    <pic:cNvPicPr/>
+                  </pic:nvPicPr>
+                  <pic:blipFill>
+                    <a:blip r:embed="rId41"/>
+                    <a:stretch>
+                      <a:fillRect/>
+                    </a:stretch>
+                  </pic:blipFill>
+                  <pic:spPr>
+                    <a:xfrm>
+                      <a:off x="0" y="0"/>
+                      <a:ext cx="2168033" cy="3967822"/>
+                    </a:xfrm>
+                    <a:prstGeom prst="rect">
+                      <a:avLst/>
+                    </a:prstGeom>
+                  </pic:spPr>
+                </pic:pic>
+              </a:graphicData>
+            </a:graphic>
+          </wp:inline>
+        </w:drawing>
+      </w:r>
+    </w:p>
     <w:p/>
     <w:p/>
     <w:sectPr>

</xml_diff>

<commit_message>
Succesfully able to upload images to firebase storage
</commit_message>
<xml_diff>
--- a/Logboek_Dries_Fierens.docx
+++ b/Logboek_Dries_Fierens.docx
@@ -46,47 +46,7 @@
         <w:t>applicatie</w:t>
       </w:r>
       <w:r>
-        <w:t xml:space="preserve"> die je kan maken en welke technologieën je kan gebruiken. Ik heb voor native gekozen want dat past het best bij mijn aftakking “Software </w:t>
-      </w:r>
-      <w:proofErr w:type="spellStart"/>
-      <w:r>
-        <w:t>developer</w:t>
-      </w:r>
-      <w:proofErr w:type="spellEnd"/>
-      <w:r>
-        <w:t xml:space="preserve">” sinds het </w:t>
-      </w:r>
-      <w:proofErr w:type="spellStart"/>
-      <w:r>
-        <w:t>java</w:t>
-      </w:r>
-      <w:proofErr w:type="spellEnd"/>
-      <w:r>
-        <w:t xml:space="preserve"> inhoudt. De anderen zijn </w:t>
-      </w:r>
-      <w:proofErr w:type="spellStart"/>
-      <w:r>
-        <w:t>hybrid</w:t>
-      </w:r>
-      <w:proofErr w:type="spellEnd"/>
-      <w:r>
-        <w:t xml:space="preserve"> en </w:t>
-      </w:r>
-      <w:proofErr w:type="spellStart"/>
-      <w:r>
-        <w:t>progressive</w:t>
-      </w:r>
-      <w:proofErr w:type="spellEnd"/>
-      <w:r>
-        <w:t xml:space="preserve"> web app dat dus meer te maken hebben met web &amp; mobile dus vooral HTML &amp; CSS. We moesten dan ook nog kiezen voor een project idee, waarbij ik koos voor een scanner + </w:t>
-      </w:r>
-      <w:proofErr w:type="gramStart"/>
-      <w:r>
-        <w:t>pdf converter</w:t>
-      </w:r>
-      <w:proofErr w:type="gramEnd"/>
-      <w:r>
-        <w:t xml:space="preserve"> app</w:t>
+        <w:t xml:space="preserve"> die je kan maken en welke technologieën je kan gebruiken. Ik heb voor native gekozen want dat past het best bij mijn aftakking “Software developer” sinds het java inhoudt. De anderen zijn hybrid en progressive web app dat dus meer te maken hebben met web &amp; mobile dus vooral HTML &amp; CSS. We moesten dan ook nog kiezen voor een project idee, waarbij ik koos voor een scanner + pdf converter app</w:t>
       </w:r>
       <w:r>
         <w:t xml:space="preserve"> waarbij het vooral bedoelt is o</w:t>
@@ -107,106 +67,26 @@
         <w:t>.</w:t>
       </w:r>
       <w:r>
-        <w:t xml:space="preserve"> Het was verplicht om 1 </w:t>
-      </w:r>
-      <w:proofErr w:type="gramStart"/>
-      <w:r>
-        <w:t>hardware component</w:t>
-      </w:r>
-      <w:proofErr w:type="gramEnd"/>
-      <w:r>
-        <w:t xml:space="preserve"> van de gsm te gebruiken dus koos ik natuurlijk voor de camera.</w:t>
+        <w:t xml:space="preserve"> Het was verplicht om 1 hardware component van de gsm te gebruiken dus koos ik natuurlijk voor de camera.</w:t>
       </w:r>
       <w:r>
         <w:t xml:space="preserve"> </w:t>
       </w:r>
       <w:r>
-        <w:t xml:space="preserve">Als </w:t>
-      </w:r>
-      <w:proofErr w:type="spellStart"/>
-      <w:r>
-        <w:t>back-end</w:t>
-      </w:r>
-      <w:proofErr w:type="spellEnd"/>
-      <w:r>
-        <w:t xml:space="preserve"> koos ik </w:t>
-      </w:r>
-      <w:proofErr w:type="spellStart"/>
-      <w:r>
-        <w:t>Firebase</w:t>
-      </w:r>
-      <w:proofErr w:type="spellEnd"/>
-      <w:r>
-        <w:t xml:space="preserve"> en als technologie koos ik in </w:t>
-      </w:r>
-      <w:proofErr w:type="spellStart"/>
-      <w:r>
-        <w:t>java</w:t>
-      </w:r>
-      <w:proofErr w:type="spellEnd"/>
-      <w:r>
-        <w:t xml:space="preserve"> te werken om een </w:t>
-      </w:r>
-      <w:proofErr w:type="spellStart"/>
-      <w:r>
-        <w:t>android</w:t>
-      </w:r>
-      <w:proofErr w:type="spellEnd"/>
-      <w:r>
-        <w:t xml:space="preserve"> app te maken in plaats van een IOS app.</w:t>
-      </w:r>
-      <w:r>
-        <w:t xml:space="preserve"> Want ik heb een </w:t>
-      </w:r>
-      <w:proofErr w:type="spellStart"/>
-      <w:r>
-        <w:t>huawei</w:t>
-      </w:r>
-      <w:proofErr w:type="spellEnd"/>
-      <w:r>
-        <w:t>.</w:t>
-      </w:r>
-    </w:p>
-    <w:p>
-      <w:r>
-        <w:t xml:space="preserve">Ik heb dit allemaal grondiger beschreven in mijn “app </w:t>
-      </w:r>
-      <w:proofErr w:type="spellStart"/>
-      <w:r>
-        <w:t>idee”.pdf</w:t>
-      </w:r>
-      <w:proofErr w:type="spellEnd"/>
-      <w:r>
-        <w:t xml:space="preserve">. Dit staat ondertussen op de </w:t>
-      </w:r>
-      <w:proofErr w:type="spellStart"/>
-      <w:r>
-        <w:t>repository</w:t>
-      </w:r>
-      <w:proofErr w:type="spellEnd"/>
-      <w:r>
-        <w:t xml:space="preserve"> die we moesten maken.</w:t>
-      </w:r>
-    </w:p>
-    <w:p>
-      <w:r>
-        <w:t xml:space="preserve">Om af te sluiten had ik al ondertussen een goede naam gevonden gebaseerd op de applicatie genaamd </w:t>
-      </w:r>
-      <w:proofErr w:type="spellStart"/>
-      <w:r>
-        <w:t>Scannable</w:t>
-      </w:r>
-      <w:proofErr w:type="spellEnd"/>
-      <w:r>
-        <w:t xml:space="preserve">. Ik heb dus besloten om mijn applicatie </w:t>
-      </w:r>
-      <w:proofErr w:type="spellStart"/>
-      <w:r>
-        <w:t>Notable</w:t>
-      </w:r>
-      <w:proofErr w:type="spellEnd"/>
-      <w:r>
-        <w:t xml:space="preserve"> te noemen.</w:t>
+        <w:t>Als back-end koos ik Firebase en als technologie koos ik in java te werken om een android app te maken in plaats van een IOS app.</w:t>
+      </w:r>
+      <w:r>
+        <w:t xml:space="preserve"> Want ik heb een huawei.</w:t>
+      </w:r>
+    </w:p>
+    <w:p>
+      <w:r>
+        <w:t>Ik heb dit allemaal grondiger beschreven in mijn “app idee”.pdf. Dit staat ondertussen op de repository die we moesten maken.</w:t>
+      </w:r>
+    </w:p>
+    <w:p>
+      <w:r>
+        <w:t>Om af te sluiten had ik al ondertussen een goede naam gevonden gebaseerd op de applicatie genaamd Scannable. Ik heb dus besloten om mijn applicatie Notable te noemen.</w:t>
       </w:r>
     </w:p>
     <w:p>
@@ -229,15 +109,7 @@
         <w:t xml:space="preserve">Mijn app idee werd niet goedgekeurd, want de leerkracht raadde het af door problemen die ervan kunnen komen. Ik moest dan vandaag een nieuw idee opstellen. </w:t>
       </w:r>
       <w:r>
-        <w:t xml:space="preserve">De scanner + </w:t>
-      </w:r>
-      <w:proofErr w:type="gramStart"/>
-      <w:r>
-        <w:t>pdf converter</w:t>
-      </w:r>
-      <w:proofErr w:type="gramEnd"/>
-      <w:r>
-        <w:t xml:space="preserve"> was duidelijk te moeilijk, maar ik besloot om het idee verder te zetten van een app die notities kan delen. Dus nu moet het gewoon foto’s trekken van de notities. Om nog toe te voegen kan ik ook opmerkingswolkjes toevoegen aan de foto voor bijvoorbeeld een fout</w:t>
+        <w:t>De scanner + pdf converter was duidelijk te moeilijk, maar ik besloot om het idee verder te zetten van een app die notities kan delen. Dus nu moet het gewoon foto’s trekken van de notities. Om nog toe te voegen kan ik ook opmerkingswolkjes toevoegen aan de foto voor bijvoorbeeld een fout</w:t>
       </w:r>
       <w:r>
         <w:t xml:space="preserve"> aan te duiden</w:t>
@@ -248,15 +120,7 @@
     </w:p>
     <w:p>
       <w:r>
-        <w:t xml:space="preserve">Daarna moest ik gewoon begin aan een UI/UX design voor mijn applicatie, waarbij nog niet veel had gedaan omdat les niet meer lang duurde. Ik moest toen ook tegelijkertijd zoeken naar </w:t>
-      </w:r>
-      <w:proofErr w:type="spellStart"/>
-      <w:r>
-        <w:t>tutorials</w:t>
-      </w:r>
-      <w:proofErr w:type="spellEnd"/>
-      <w:r>
-        <w:t xml:space="preserve"> dus </w:t>
+        <w:t xml:space="preserve">Daarna moest ik gewoon begin aan een UI/UX design voor mijn applicatie, waarbij nog niet veel had gedaan omdat les niet meer lang duurde. Ik moest toen ook tegelijkertijd zoeken naar tutorials dus </w:t>
       </w:r>
       <w:r>
         <w:t>duurde dat ook kort.</w:t>
@@ -279,26 +143,13 @@
     </w:p>
     <w:p>
       <w:r>
-        <w:t>Vandaag in de namiddag begonnen we met de co-</w:t>
-      </w:r>
-      <w:proofErr w:type="spellStart"/>
-      <w:r>
-        <w:t>working</w:t>
-      </w:r>
-      <w:proofErr w:type="spellEnd"/>
-      <w:r>
-        <w:t xml:space="preserve"> les waarbij we dus informatie kunnen delen met medeleerlingen. Al was het de eerste les dus kwam daar niet veel van. Ik begon gewoon verder aan mijn </w:t>
-      </w:r>
-      <w:proofErr w:type="spellStart"/>
+        <w:t xml:space="preserve">Vandaag in de namiddag begonnen we met de co-working les waarbij we dus informatie kunnen delen met medeleerlingen. Al was het de eerste les dus kwam daar niet veel van. Ik begon gewoon verder aan mijn </w:t>
+      </w:r>
       <w:r>
         <w:t>F</w:t>
       </w:r>
       <w:r>
-        <w:t>igma</w:t>
-      </w:r>
-      <w:proofErr w:type="spellEnd"/>
-      <w:r>
-        <w:t xml:space="preserve"> design.</w:t>
+        <w:t>igma design.</w:t>
       </w:r>
     </w:p>
     <w:p>
@@ -309,15 +160,7 @@
         <w:t>te veel</w:t>
       </w:r>
       <w:r>
-        <w:t xml:space="preserve"> naar voor moest leunen en dus </w:t>
-      </w:r>
-      <w:proofErr w:type="gramStart"/>
-      <w:r>
-        <w:t>nek pijn</w:t>
-      </w:r>
-      <w:proofErr w:type="gramEnd"/>
-      <w:r>
-        <w:t xml:space="preserve"> kreeg en er waren precies geen ramen om te openen. </w:t>
+        <w:t xml:space="preserve"> naar voor moest leunen en dus nek pijn kreeg en er waren precies geen ramen om te openen. </w:t>
       </w:r>
       <w:r>
         <w:t>Gelukkig kunnen we naar buiten wanneer we het willen.</w:t>
@@ -357,23 +200,7 @@
     </w:p>
     <w:p>
       <w:r>
-        <w:t xml:space="preserve">Vandaag heb ik verder gewerkt aan mijn </w:t>
-      </w:r>
-      <w:proofErr w:type="spellStart"/>
-      <w:r>
-        <w:t>Figma</w:t>
-      </w:r>
-      <w:proofErr w:type="spellEnd"/>
-      <w:r>
-        <w:t xml:space="preserve"> design en het ging redelijk vlot vooruit. Ik wou absoluut dat het vandaag af was zodat ik morgen kan werken aan een ander vak. Tijdens het maken van het design heb ik vooral ook zitten op zoeken dat sommige concepten wel haalbaar zijn om te programmeren. Dit is allemaal wel mogelijk, maar zal wel een </w:t>
-      </w:r>
-      <w:proofErr w:type="spellStart"/>
-      <w:r>
-        <w:t>challenge</w:t>
-      </w:r>
-      <w:proofErr w:type="spellEnd"/>
-      <w:r>
-        <w:t xml:space="preserve"> zijn zoals de opmerkingen plaatsen</w:t>
+        <w:t>Vandaag heb ik verder gewerkt aan mijn Figma design en het ging redelijk vlot vooruit. Ik wou absoluut dat het vandaag af was zodat ik morgen kan werken aan een ander vak. Tijdens het maken van het design heb ik vooral ook zitten op zoeken dat sommige concepten wel haalbaar zijn om te programmeren. Dit is allemaal wel mogelijk, maar zal wel een challenge zijn zoals de opmerkingen plaatsen</w:t>
       </w:r>
       <w:r>
         <w:t>. M</w:t>
@@ -485,48 +312,11 @@
     </w:p>
     <w:p>
       <w:r>
-        <w:t xml:space="preserve">Vandaag werd mijn </w:t>
-      </w:r>
-      <w:proofErr w:type="spellStart"/>
-      <w:r>
-        <w:t>figma</w:t>
-      </w:r>
-      <w:proofErr w:type="spellEnd"/>
-      <w:r>
-        <w:t xml:space="preserve"> prototype gecontroleerd waarbij ik moest opnieuw uitleggen wat mijn app doet door middel van accurate presentatie. Ik legde dit vrij duidelijk uit en alles ging goed vooruit. Meneer </w:t>
-      </w:r>
-      <w:proofErr w:type="spellStart"/>
-      <w:r>
-        <w:t>Blancquaert</w:t>
-      </w:r>
-      <w:proofErr w:type="spellEnd"/>
-      <w:r>
-        <w:t xml:space="preserve"> heeft me dan ook nog een </w:t>
-      </w:r>
-      <w:proofErr w:type="spellStart"/>
-      <w:r>
-        <w:t>library</w:t>
-      </w:r>
-      <w:proofErr w:type="spellEnd"/>
-      <w:r>
-        <w:t xml:space="preserve"> genaamd “</w:t>
-      </w:r>
-      <w:proofErr w:type="spellStart"/>
-      <w:r>
-        <w:t>Material</w:t>
-      </w:r>
-      <w:proofErr w:type="spellEnd"/>
-      <w:r>
-        <w:t xml:space="preserve"> design” aangeraden om mijn applicatie te ontwerpen. </w:t>
-      </w:r>
-      <w:r>
-        <w:t xml:space="preserve">Blijkbaar Google gebruikt deze </w:t>
-      </w:r>
-      <w:proofErr w:type="spellStart"/>
-      <w:r>
-        <w:t>library</w:t>
-      </w:r>
-      <w:proofErr w:type="spellEnd"/>
+        <w:t xml:space="preserve">Vandaag werd mijn figma prototype gecontroleerd waarbij ik moest opnieuw uitleggen wat mijn app doet door middel van accurate presentatie. Ik legde dit vrij duidelijk uit en alles ging goed vooruit. Meneer Blancquaert heeft me dan ook nog een library genaamd “Material design” aangeraden om mijn applicatie te ontwerpen. </w:t>
+      </w:r>
+      <w:r>
+        <w:t>Blijkbaar Google gebruikt deze library</w:t>
+      </w:r>
       <w:r>
         <w:t xml:space="preserve"> om hun apps te maken.</w:t>
       </w:r>
@@ -564,23 +354,7 @@
         <w:t xml:space="preserve">kunt maken </w:t>
       </w:r>
       <w:r>
-        <w:t xml:space="preserve">om je app te testen. Als je </w:t>
-      </w:r>
-      <w:proofErr w:type="spellStart"/>
-      <w:r>
-        <w:t>developer</w:t>
-      </w:r>
-      <w:proofErr w:type="spellEnd"/>
-      <w:r>
-        <w:t xml:space="preserve"> modus in de </w:t>
-      </w:r>
-      <w:proofErr w:type="spellStart"/>
-      <w:r>
-        <w:t>settings</w:t>
-      </w:r>
-      <w:proofErr w:type="spellEnd"/>
-      <w:r>
-        <w:t xml:space="preserve"> van je gsm</w:t>
+        <w:t>om je app te testen. Als je developer modus in de settings van je gsm</w:t>
       </w:r>
       <w:r>
         <w:t xml:space="preserve"> aanzet, kan je je gsm verbinden met de pc en dus je applicatie daarop testen.</w:t>
@@ -598,23 +372,7 @@
     </w:p>
     <w:p>
       <w:r>
-        <w:t xml:space="preserve">Tijdens lange downloads heb ik ook mijn </w:t>
-      </w:r>
-      <w:proofErr w:type="gramStart"/>
-      <w:r>
-        <w:t>google account</w:t>
-      </w:r>
-      <w:proofErr w:type="gramEnd"/>
-      <w:r>
-        <w:t xml:space="preserve"> toegevoegd op </w:t>
-      </w:r>
-      <w:proofErr w:type="spellStart"/>
-      <w:r>
-        <w:t>Firebase</w:t>
-      </w:r>
-      <w:proofErr w:type="spellEnd"/>
-      <w:r>
-        <w:t>. Volgens de presentatie die we kregen van een medestudent.</w:t>
+        <w:t>Tijdens lange downloads heb ik ook mijn google account toegevoegd op Firebase. Volgens de presentatie die we kregen van een medestudent.</w:t>
       </w:r>
     </w:p>
     <w:p>
@@ -665,23 +423,7 @@
         <w:t>mijn</w:t>
       </w:r>
       <w:r>
-        <w:t xml:space="preserve"> </w:t>
-      </w:r>
-      <w:proofErr w:type="spellStart"/>
-      <w:r>
-        <w:t>figma</w:t>
-      </w:r>
-      <w:proofErr w:type="spellEnd"/>
-      <w:r>
-        <w:t xml:space="preserve"> design delen met meneer </w:t>
-      </w:r>
-      <w:proofErr w:type="spellStart"/>
-      <w:r>
-        <w:t>Blancquaert</w:t>
-      </w:r>
-      <w:proofErr w:type="spellEnd"/>
-      <w:r>
-        <w:t>, toen hij vroeg dat mijn design klaar was</w:t>
+        <w:t xml:space="preserve"> figma design delen met meneer Blancquaert, toen hij vroeg dat mijn design klaar was</w:t>
       </w:r>
       <w:r>
         <w:t xml:space="preserve"> of niet</w:t>
@@ -695,54 +437,14 @@
         <w:t>Ik heb daarna gewoon verder begonnen aan de tutorial die ik vorige week gebruikt had.</w:t>
       </w:r>
       <w:r>
-        <w:t xml:space="preserve"> Hierbij leerde ik meer over hoe ik </w:t>
-      </w:r>
-      <w:proofErr w:type="gramStart"/>
-      <w:r>
-        <w:t>Android studio</w:t>
-      </w:r>
-      <w:proofErr w:type="gramEnd"/>
-      <w:r>
-        <w:t xml:space="preserve"> beter kon gebruiken om mijn app te </w:t>
-      </w:r>
-      <w:proofErr w:type="spellStart"/>
-      <w:r>
-        <w:t>designen</w:t>
-      </w:r>
-      <w:proofErr w:type="spellEnd"/>
-      <w:r>
-        <w:t xml:space="preserve"> zoals hoe je </w:t>
+        <w:t xml:space="preserve"> Hierbij leerde ik meer over hoe ik Android studio beter kon gebruiken om mijn app te designen zoals hoe je </w:t>
       </w:r>
       <w:r>
         <w:lastRenderedPageBreak/>
-        <w:t xml:space="preserve">attributen kunt aanpassen (bv. </w:t>
-      </w:r>
-      <w:proofErr w:type="spellStart"/>
-      <w:r>
-        <w:t>color</w:t>
-      </w:r>
-      <w:proofErr w:type="spellEnd"/>
-      <w:r>
-        <w:t>)</w:t>
-      </w:r>
-      <w:r>
-        <w:t xml:space="preserve">. </w:t>
-      </w:r>
-      <w:proofErr w:type="gramStart"/>
-      <w:r>
-        <w:t>Android studio</w:t>
-      </w:r>
-      <w:proofErr w:type="gramEnd"/>
-      <w:r>
-        <w:t xml:space="preserve"> is zeer gelijkaardig als bijvoorbeeld </w:t>
-      </w:r>
-      <w:proofErr w:type="spellStart"/>
-      <w:r>
-        <w:t>Webstorm</w:t>
-      </w:r>
-      <w:proofErr w:type="spellEnd"/>
-      <w:r>
-        <w:t xml:space="preserve">, maar bij het design van een mobile app is het zeer </w:t>
+        <w:t>attributen kunt aanpassen (bv. color)</w:t>
+      </w:r>
+      <w:r>
+        <w:t xml:space="preserve">. Android studio is zeer gelijkaardig als bijvoorbeeld Webstorm, maar bij het design van een mobile app is het zeer </w:t>
       </w:r>
       <w:r>
         <w:t>verschillend</w:t>
@@ -751,27 +453,14 @@
         <w:t>.</w:t>
       </w:r>
       <w:r>
-        <w:t xml:space="preserve"> Bij </w:t>
-      </w:r>
-      <w:proofErr w:type="spellStart"/>
-      <w:r>
-        <w:t>Webstorm</w:t>
-      </w:r>
-      <w:proofErr w:type="spellEnd"/>
-      <w:r>
-        <w:t xml:space="preserve"> kan je je website </w:t>
+        <w:t xml:space="preserve"> Bij Webstorm kan je je website </w:t>
       </w:r>
       <w:r>
         <w:t>bekijken</w:t>
       </w:r>
       <w:r>
-        <w:t xml:space="preserve"> in een gekozen browser, maar je kan in </w:t>
-      </w:r>
-      <w:proofErr w:type="gramStart"/>
-      <w:r>
-        <w:t>Android studio</w:t>
-      </w:r>
-      <w:proofErr w:type="gramEnd"/>
+        <w:t xml:space="preserve"> in een gekozen browser, maar je kan in Android studio</w:t>
+      </w:r>
       <w:r>
         <w:t xml:space="preserve"> je app</w:t>
       </w:r>
@@ -791,15 +480,7 @@
         <w:t>.</w:t>
       </w:r>
       <w:r>
-        <w:t xml:space="preserve"> Als ik de </w:t>
-      </w:r>
-      <w:proofErr w:type="spellStart"/>
-      <w:r>
-        <w:t>Jetbrains</w:t>
-      </w:r>
-      <w:proofErr w:type="spellEnd"/>
-      <w:r>
-        <w:t xml:space="preserve"> applicaties vergelijk met Visual studio 2019, </w:t>
+        <w:t xml:space="preserve"> Als ik de Jetbrains applicaties vergelijk met Visual studio 2019, </w:t>
       </w:r>
       <w:r>
         <w:t>heb ik er altijd moeite mee om de lay</w:t>
@@ -879,23 +560,7 @@
     </w:p>
     <w:p>
       <w:r>
-        <w:t xml:space="preserve">Ik heb dan ondertussen de tutorial van </w:t>
-      </w:r>
-      <w:proofErr w:type="spellStart"/>
-      <w:r>
-        <w:t>Material</w:t>
-      </w:r>
-      <w:proofErr w:type="spellEnd"/>
-      <w:r>
-        <w:t xml:space="preserve"> design gevolgd in plaats van die van </w:t>
-      </w:r>
-      <w:proofErr w:type="gramStart"/>
-      <w:r>
-        <w:t>Android studio</w:t>
-      </w:r>
-      <w:proofErr w:type="gramEnd"/>
-      <w:r>
-        <w:t>. Ze leerde me dan hoe ik er mee kon werken maar niet hoe een hele nieuwe app kon maken. Ik kreeg een voorbeeld app om erin te kunnen werken voor de tutorial.</w:t>
+        <w:t>Ik heb dan ondertussen de tutorial van Material design gevolgd in plaats van die van Android studio. Ze leerde me dan hoe ik er mee kon werken maar niet hoe een hele nieuwe app kon maken. Ik kreeg een voorbeeld app om erin te kunnen werken voor de tutorial.</w:t>
       </w:r>
     </w:p>
     <w:p>
@@ -938,34 +603,10 @@
     </w:p>
     <w:p>
       <w:r>
-        <w:t xml:space="preserve">Vandaag heb ik de usertests afgelegd met Louis </w:t>
-      </w:r>
-      <w:proofErr w:type="spellStart"/>
-      <w:r>
-        <w:t>D’hondt</w:t>
-      </w:r>
-      <w:proofErr w:type="spellEnd"/>
-      <w:r>
-        <w:t xml:space="preserve"> en Jasper Wauters. Dit ging heel gemakkelijk en duurde niet lang. Ik had niet echt serieuze opmerkingen, behalve dat ik geen persoonlijke info pagina gemaakt had.</w:t>
-      </w:r>
-      <w:r>
-        <w:t xml:space="preserve"> Daarna heb ik onmiddellijk die opmerkingen van mijn </w:t>
-      </w:r>
-      <w:proofErr w:type="spellStart"/>
-      <w:r>
-        <w:t>figma</w:t>
-      </w:r>
-      <w:proofErr w:type="spellEnd"/>
-      <w:r>
-        <w:t xml:space="preserve"> design verbetert en op mijn </w:t>
-      </w:r>
-      <w:proofErr w:type="spellStart"/>
-      <w:r>
-        <w:t>repository</w:t>
-      </w:r>
-      <w:proofErr w:type="spellEnd"/>
-      <w:r>
-        <w:t xml:space="preserve"> gezet.</w:t>
+        <w:t>Vandaag heb ik de usertests afgelegd met Louis D’hondt en Jasper Wauters. Dit ging heel gemakkelijk en duurde niet lang. Ik had niet echt serieuze opmerkingen, behalve dat ik geen persoonlijke info pagina gemaakt had.</w:t>
+      </w:r>
+      <w:r>
+        <w:t xml:space="preserve"> Daarna heb ik onmiddellijk die opmerkingen van mijn figma design verbetert en op mijn repository gezet.</w:t>
       </w:r>
     </w:p>
     <w:p/>
@@ -988,47 +629,7 @@
     </w:p>
     <w:p>
       <w:r>
-        <w:t xml:space="preserve">Vandaag begon ik eindelijk met </w:t>
-      </w:r>
-      <w:proofErr w:type="spellStart"/>
-      <w:r>
-        <w:t>Material</w:t>
-      </w:r>
-      <w:proofErr w:type="spellEnd"/>
-      <w:r>
-        <w:t xml:space="preserve"> Design. Ik besloot mijn oude app te verwijderen en te vervangen met een empty </w:t>
-      </w:r>
-      <w:proofErr w:type="spellStart"/>
-      <w:r>
-        <w:t>activity</w:t>
-      </w:r>
-      <w:proofErr w:type="spellEnd"/>
-      <w:r>
-        <w:t xml:space="preserve"> zodat ik echt van scratch begin. Zo kan ik alles beter begrijpen. Ik had dan ontdekt dat </w:t>
-      </w:r>
-      <w:proofErr w:type="spellStart"/>
-      <w:r>
-        <w:t>android</w:t>
-      </w:r>
-      <w:proofErr w:type="spellEnd"/>
-      <w:r>
-        <w:t xml:space="preserve"> studio al automatisch </w:t>
-      </w:r>
-      <w:proofErr w:type="spellStart"/>
-      <w:r>
-        <w:t>Material</w:t>
-      </w:r>
-      <w:proofErr w:type="spellEnd"/>
-      <w:r>
-        <w:t xml:space="preserve"> Design van Google had toegevoegd bij de </w:t>
-      </w:r>
-      <w:proofErr w:type="spellStart"/>
-      <w:r>
-        <w:t>dependencies</w:t>
-      </w:r>
-      <w:proofErr w:type="spellEnd"/>
-      <w:r>
-        <w:t xml:space="preserve">, dus eigenlijk ben ik </w:t>
+        <w:t xml:space="preserve">Vandaag begon ik eindelijk met Material Design. Ik besloot mijn oude app te verwijderen en te vervangen met een empty activity zodat ik echt van scratch begin. Zo kan ik alles beter begrijpen. Ik had dan ontdekt dat android studio al automatisch Material Design van Google had toegevoegd bij de dependencies, dus eigenlijk ben ik </w:t>
       </w:r>
       <w:r>
         <w:t>onmiddellijk</w:t>
@@ -1172,50 +773,18 @@
     </w:p>
     <w:p>
       <w:r>
-        <w:t xml:space="preserve">Eerst had ik geprobeerd om gewoon een heel nieuw project te maken die bestond uit een login </w:t>
-      </w:r>
-      <w:proofErr w:type="spellStart"/>
-      <w:r>
-        <w:t>activity</w:t>
-      </w:r>
-      <w:proofErr w:type="spellEnd"/>
-      <w:r>
-        <w:t xml:space="preserve">. Deze </w:t>
-      </w:r>
-      <w:proofErr w:type="spellStart"/>
-      <w:r>
-        <w:t>activity</w:t>
-      </w:r>
-      <w:proofErr w:type="spellEnd"/>
-      <w:r>
-        <w:t xml:space="preserve"> heb ik dan gewoon aangepast naar mijn wens. Maar dit wou ook niet echt werken, want blijkbaar is het best dat je van een </w:t>
-      </w:r>
-      <w:proofErr w:type="spellStart"/>
-      <w:r>
-        <w:t>main</w:t>
+        <w:t>Eerst had ik geprobeerd om gewoon een heel nieuw project te maken die bestond uit een login activity. Deze activity heb ik dan gewoon aangepast naar mijn wens. Maar dit wou ook niet echt werken, want blijkbaar is het best dat je van een main</w:t>
       </w:r>
       <w:r>
         <w:t>_</w:t>
       </w:r>
       <w:r>
-        <w:t>activity</w:t>
-      </w:r>
-      <w:proofErr w:type="spellEnd"/>
-      <w:r>
-        <w:t xml:space="preserve"> start en dan de login page daarmee opent.</w:t>
-      </w:r>
-    </w:p>
-    <w:p>
-      <w:r>
-        <w:t xml:space="preserve">Ik ben dan gewoon terug begonnen aan het oude project en heb dan de error op stack overflow gezocht en daar had ik de oplossing gevonden. Ik moest gewoon mijn “device” zijn data </w:t>
-      </w:r>
-      <w:proofErr w:type="spellStart"/>
-      <w:r>
-        <w:t>wipen</w:t>
-      </w:r>
-      <w:proofErr w:type="spellEnd"/>
-      <w:r>
-        <w:t xml:space="preserve"> en dan kon het opnieuw installeren want mijn oude projecten stond er nog op.</w:t>
+        <w:t>activity start en dan de login page daarmee opent.</w:t>
+      </w:r>
+    </w:p>
+    <w:p>
+      <w:r>
+        <w:t>Ik ben dan gewoon terug begonnen aan het oude project en heb dan de error op stack overflow gezocht en daar had ik de oplossing gevonden. Ik moest gewoon mijn “device” zijn data wipen en dan kon het opnieuw installeren want mijn oude projecten stond er nog op.</w:t>
       </w:r>
     </w:p>
     <w:p>
@@ -1259,23 +828,7 @@
         <w:t>Vandaag wou de wifi niet werken op de campus dus had ik niet veel vooruitgang geboekt.</w:t>
       </w:r>
       <w:r>
-        <w:t xml:space="preserve"> Ik was ook gisteren vergeten om de registratie pagina te </w:t>
-      </w:r>
-      <w:proofErr w:type="spellStart"/>
-      <w:r>
-        <w:t>committen</w:t>
-      </w:r>
-      <w:proofErr w:type="spellEnd"/>
-      <w:r>
-        <w:t xml:space="preserve">, dus da had ik alleszins gedaan door met mijn </w:t>
-      </w:r>
-      <w:proofErr w:type="spellStart"/>
-      <w:r>
-        <w:t>hotspot</w:t>
-      </w:r>
-      <w:proofErr w:type="spellEnd"/>
-      <w:r>
-        <w:t xml:space="preserve"> van mijn gsm te verbinden en de 4G aan te zetten.</w:t>
+        <w:t xml:space="preserve"> Ik was ook gisteren vergeten om de registratie pagina te committen, dus da had ik alleszins gedaan door met mijn hotspot van mijn gsm te verbinden en de 4G aan te zetten.</w:t>
       </w:r>
     </w:p>
     <w:p>
@@ -1307,21 +860,11 @@
         <w:t>Vandaag wou de wifi op school nog steeds niet zo goed werken</w:t>
       </w:r>
       <w:r>
-        <w:t xml:space="preserve">, maar dankzij de wifi </w:t>
-      </w:r>
-      <w:proofErr w:type="spellStart"/>
-      <w:r>
-        <w:t>hotspot</w:t>
-      </w:r>
-      <w:proofErr w:type="spellEnd"/>
-      <w:r>
-        <w:t xml:space="preserve"> heb ik toch nog de navigatie van login naar registratie kunnen </w:t>
-      </w:r>
-      <w:proofErr w:type="spellStart"/>
+        <w:t xml:space="preserve">, maar dankzij de wifi hotspot heb ik toch nog de navigatie van login naar registratie kunnen </w:t>
+      </w:r>
       <w:r>
         <w:t>commiten</w:t>
       </w:r>
-      <w:proofErr w:type="spellEnd"/>
       <w:r>
         <w:t>.</w:t>
       </w:r>
@@ -1331,15 +874,7 @@
     </w:p>
     <w:p>
       <w:r>
-        <w:t xml:space="preserve">De wifi wou uiteindelijk werken dus kon eindelijk heel vlot vooruitgaan. Ik heb daarbij de navigatie tussen de login en registratie kunnen afwerken. Daarna heb ik ook de startpagina bijna afgewerkt, maar de </w:t>
-      </w:r>
-      <w:proofErr w:type="spellStart"/>
-      <w:r>
-        <w:t>bottom</w:t>
-      </w:r>
-      <w:proofErr w:type="spellEnd"/>
-      <w:r>
-        <w:t xml:space="preserve"> bar wou niet helemaal meewerken dus dat laat ik voor later.</w:t>
+        <w:t>De wifi wou uiteindelijk werken dus kon eindelijk heel vlot vooruitgaan. Ik heb daarbij de navigatie tussen de login en registratie kunnen afwerken. Daarna heb ik ook de startpagina bijna afgewerkt, maar de bottom bar wou niet helemaal meewerken dus dat laat ik voor later.</w:t>
       </w:r>
     </w:p>
     <w:p/>
@@ -1360,31 +895,7 @@
     </w:p>
     <w:p>
       <w:r>
-        <w:t xml:space="preserve">Vandaag heb ik de bodem navigatie afgewerkt waarbij je dan naar je groepen kunt gaan oftewel naar je notities die je hebt gefotografeerd. Dit was eerste wel een </w:t>
-      </w:r>
-      <w:proofErr w:type="spellStart"/>
-      <w:r>
-        <w:t>challenge</w:t>
-      </w:r>
-      <w:proofErr w:type="spellEnd"/>
-      <w:r>
-        <w:t xml:space="preserve"> zoals de </w:t>
-      </w:r>
-      <w:proofErr w:type="spellStart"/>
-      <w:r>
-        <w:t>active</w:t>
-      </w:r>
-      <w:proofErr w:type="spellEnd"/>
-      <w:r>
-        <w:t xml:space="preserve"> pagina weergegeven of de juiste </w:t>
-      </w:r>
-      <w:proofErr w:type="spellStart"/>
-      <w:r>
-        <w:t>eventlistener</w:t>
-      </w:r>
-      <w:proofErr w:type="spellEnd"/>
-      <w:r>
-        <w:t xml:space="preserve"> gebruiken om te kunnen navigeren. Maar deze links hebben daarbij geholpen:</w:t>
+        <w:t>Vandaag heb ik de bodem navigatie afgewerkt waarbij je dan naar je groepen kunt gaan oftewel naar je notities die je hebt gefotografeerd. Dit was eerste wel een challenge zoals de active pagina weergegeven of de juiste eventlistener gebruiken om te kunnen navigeren. Maar deze links hebben daarbij geholpen:</w:t>
       </w:r>
     </w:p>
     <w:p>
@@ -1430,29 +941,13 @@
     </w:p>
     <w:p>
       <w:r>
-        <w:t xml:space="preserve">Ik heb dan ook nog voor gezorgd dat mijn </w:t>
-      </w:r>
-      <w:proofErr w:type="spellStart"/>
-      <w:r>
-        <w:t>firebase</w:t>
-      </w:r>
-      <w:proofErr w:type="spellEnd"/>
-      <w:r>
-        <w:t xml:space="preserve"> account verbonden is met</w:t>
+        <w:t>Ik heb dan ook nog voor gezorgd dat mijn firebase account verbonden is met</w:t>
       </w:r>
       <w:r>
         <w:t xml:space="preserve"> mijn</w:t>
       </w:r>
       <w:r>
-        <w:t xml:space="preserve"> </w:t>
-      </w:r>
-      <w:proofErr w:type="spellStart"/>
-      <w:r>
-        <w:t>android</w:t>
-      </w:r>
-      <w:proofErr w:type="spellEnd"/>
-      <w:r>
-        <w:t xml:space="preserve"> studio app.</w:t>
+        <w:t xml:space="preserve"> android studio app.</w:t>
       </w:r>
     </w:p>
     <w:p>
@@ -1609,13 +1104,8 @@
           <w:numId w:val="1"/>
         </w:numPr>
       </w:pPr>
-      <w:proofErr w:type="spellStart"/>
-      <w:r>
-        <w:t>Firebase</w:t>
-      </w:r>
-      <w:proofErr w:type="spellEnd"/>
-      <w:r>
-        <w:t xml:space="preserve"> implementeren</w:t>
+      <w:r>
+        <w:t>Firebase implementeren</w:t>
       </w:r>
     </w:p>
     <w:p>
@@ -1627,13 +1117,8 @@
         </w:numPr>
       </w:pPr>
       <w:r>
-        <w:t xml:space="preserve">Login en registratie mogelijk maken via </w:t>
-      </w:r>
-      <w:proofErr w:type="spellStart"/>
-      <w:r>
-        <w:t>firebase</w:t>
-      </w:r>
-      <w:proofErr w:type="spellEnd"/>
+        <w:t>Login en registratie mogelijk maken via firebase</w:t>
+      </w:r>
     </w:p>
     <w:p>
       <w:pPr>
@@ -1644,11 +1129,7 @@
         </w:numPr>
       </w:pPr>
       <w:r>
-        <w:t xml:space="preserve">Camera functionaliteit bekijken voor </w:t>
-      </w:r>
-      <w:proofErr w:type="spellStart"/>
-      <w:r>
-        <w:t>andr</w:t>
+        <w:t>Camera functionaliteit bekijken voor andr</w:t>
       </w:r>
       <w:r>
         <w:t>oi</w:t>
@@ -1656,7 +1137,6 @@
       <w:r>
         <w:t>d</w:t>
       </w:r>
-      <w:proofErr w:type="spellEnd"/>
     </w:p>
     <w:p/>
     <w:p>
@@ -1676,66 +1156,10 @@
     </w:p>
     <w:p>
       <w:r>
-        <w:t xml:space="preserve">Hier kan je ondertussen zien dat mijn app verbonden is met </w:t>
-      </w:r>
-      <w:proofErr w:type="spellStart"/>
-      <w:r>
-        <w:t>Firebase</w:t>
-      </w:r>
-      <w:proofErr w:type="spellEnd"/>
-      <w:r>
-        <w:t xml:space="preserve">. Nu vragen ze voor google </w:t>
-      </w:r>
-      <w:proofErr w:type="spellStart"/>
-      <w:r>
-        <w:t>sign</w:t>
-      </w:r>
-      <w:proofErr w:type="spellEnd"/>
-      <w:r>
-        <w:t xml:space="preserve">-in om een sha-1 </w:t>
-      </w:r>
-      <w:proofErr w:type="spellStart"/>
-      <w:r>
-        <w:t>fingerprint</w:t>
-      </w:r>
-      <w:proofErr w:type="spellEnd"/>
-      <w:r>
-        <w:t xml:space="preserve"> toe te voegen.</w:t>
-      </w:r>
-      <w:r>
-        <w:t xml:space="preserve"> Ik wou dan google </w:t>
-      </w:r>
-      <w:proofErr w:type="spellStart"/>
-      <w:r>
-        <w:t>play</w:t>
-      </w:r>
-      <w:proofErr w:type="spellEnd"/>
-      <w:r>
-        <w:t xml:space="preserve"> </w:t>
-      </w:r>
-      <w:proofErr w:type="spellStart"/>
-      <w:r>
-        <w:t>signing</w:t>
-      </w:r>
-      <w:proofErr w:type="spellEnd"/>
-      <w:r>
-        <w:t xml:space="preserve"> pakken om het te genereren </w:t>
-      </w:r>
-      <w:proofErr w:type="spellStart"/>
-      <w:r>
-        <w:t>ipv</w:t>
-      </w:r>
-      <w:proofErr w:type="spellEnd"/>
-      <w:r>
-        <w:t xml:space="preserve"> </w:t>
-      </w:r>
-      <w:proofErr w:type="spellStart"/>
-      <w:r>
-        <w:t>self-signing</w:t>
-      </w:r>
-      <w:proofErr w:type="spellEnd"/>
-      <w:r>
-        <w:t xml:space="preserve">, maar ik moet dan 25 euro eerst betalen voor een </w:t>
+        <w:t>Hier kan je ondertussen zien dat mijn app verbonden is met Firebase. Nu vragen ze voor google sign-in om een sha-1 fingerprint toe te voegen.</w:t>
+      </w:r>
+      <w:r>
+        <w:t xml:space="preserve"> Ik wou dan google play signing pakken om het te genereren ipv self-signing, maar ik moet dan 25 euro eerst betalen voor een </w:t>
       </w:r>
       <w:r>
         <w:t>ontwikkelaar</w:t>
@@ -1806,75 +1230,14 @@
       <w:r>
         <w:t>Als ik wat meer naar onderging bij de “</w:t>
       </w:r>
-      <w:proofErr w:type="spellStart"/>
-      <w:r>
-        <w:t>Authenticating</w:t>
-      </w:r>
-      <w:proofErr w:type="spellEnd"/>
-      <w:r>
-        <w:t xml:space="preserve"> </w:t>
-      </w:r>
-      <w:proofErr w:type="spellStart"/>
-      <w:r>
-        <w:t>Your</w:t>
-      </w:r>
-      <w:proofErr w:type="spellEnd"/>
-      <w:r>
-        <w:t xml:space="preserve"> Client</w:t>
-      </w:r>
-      <w:r>
-        <w:t xml:space="preserve">” pagina (zie link) kan je ook via de terminal van </w:t>
-      </w:r>
-      <w:proofErr w:type="spellStart"/>
-      <w:r>
-        <w:t>android</w:t>
-      </w:r>
-      <w:proofErr w:type="spellEnd"/>
-      <w:r>
-        <w:t xml:space="preserve"> studio een </w:t>
-      </w:r>
-      <w:proofErr w:type="spellStart"/>
-      <w:r>
-        <w:t>command</w:t>
-      </w:r>
-      <w:proofErr w:type="spellEnd"/>
-      <w:r>
-        <w:t xml:space="preserve"> invoeren om de sha-1 </w:t>
-      </w:r>
-      <w:proofErr w:type="spellStart"/>
-      <w:r>
-        <w:t>fingerprint</w:t>
-      </w:r>
-      <w:proofErr w:type="spellEnd"/>
-      <w:r>
-        <w:t xml:space="preserve"> te krijgen. Hierbij moest je “</w:t>
-      </w:r>
-      <w:proofErr w:type="spellStart"/>
-      <w:r>
-        <w:t>gradle</w:t>
-      </w:r>
-      <w:proofErr w:type="spellEnd"/>
-      <w:r>
-        <w:t xml:space="preserve"> </w:t>
-      </w:r>
-      <w:proofErr w:type="spellStart"/>
-      <w:r>
-        <w:t>sigingReport</w:t>
-      </w:r>
-      <w:proofErr w:type="spellEnd"/>
-      <w:r>
-        <w:t>” invoeren en dan ctrl + enter invoeren!!</w:t>
-      </w:r>
-      <w:r>
-        <w:t xml:space="preserve"> Deze heb ik dan toegevoegd aan </w:t>
-      </w:r>
-      <w:proofErr w:type="spellStart"/>
-      <w:r>
-        <w:t>Firebase</w:t>
-      </w:r>
-      <w:proofErr w:type="spellEnd"/>
-      <w:r>
-        <w:t>.</w:t>
+      <w:r>
+        <w:t>Authenticating Your Client</w:t>
+      </w:r>
+      <w:r>
+        <w:t>” pagina (zie link) kan je ook via de terminal van android studio een command invoeren om de sha-1 fingerprint te krijgen. Hierbij moest je “gradle sigingReport” invoeren en dan ctrl + enter invoeren!!</w:t>
+      </w:r>
+      <w:r>
+        <w:t xml:space="preserve"> Deze heb ik dan toegevoegd aan Firebase.</w:t>
       </w:r>
     </w:p>
     <w:p>
@@ -1922,15 +1285,7 @@
     </w:p>
     <w:p>
       <w:r>
-        <w:t xml:space="preserve">Daarna moest ik een </w:t>
-      </w:r>
-      <w:proofErr w:type="spellStart"/>
-      <w:r>
-        <w:t>Oauth</w:t>
-      </w:r>
-      <w:proofErr w:type="spellEnd"/>
-      <w:r>
-        <w:t xml:space="preserve"> 2.0 client ID toevoegen voor het inloggen. Hierbij moest ik een hele configuratie begaan.</w:t>
+        <w:t>Daarna moest ik een Oauth 2.0 client ID toevoegen voor het inloggen. Hierbij moest ik een hele configuratie begaan.</w:t>
       </w:r>
       <w:r>
         <w:t xml:space="preserve"> Ik heb hierbij het meest niet ingevuld zoals een privacy policy, enzoverder.</w:t>
@@ -2111,31 +1466,7 @@
     </w:p>
     <w:p>
       <w:r>
-        <w:t xml:space="preserve">Vandaag had ik tijdens les (in de morgen van 8u15-11u15) verder gewerkt aan de </w:t>
-      </w:r>
-      <w:proofErr w:type="spellStart"/>
-      <w:r>
-        <w:t>back-end</w:t>
-      </w:r>
-      <w:proofErr w:type="spellEnd"/>
-      <w:r>
-        <w:t xml:space="preserve"> van mijn app. Ik was gisteren bezig met google </w:t>
-      </w:r>
-      <w:proofErr w:type="spellStart"/>
-      <w:r>
-        <w:t>sign</w:t>
-      </w:r>
-      <w:proofErr w:type="spellEnd"/>
-      <w:r>
-        <w:t xml:space="preserve">-in, maar ik besloot om eerst normale email/password </w:t>
-      </w:r>
-      <w:proofErr w:type="spellStart"/>
-      <w:r>
-        <w:t>authentication</w:t>
-      </w:r>
-      <w:proofErr w:type="spellEnd"/>
-      <w:r>
-        <w:t xml:space="preserve"> toe te voegen. Dit ging vrij vlot vooruit maar toen ik de button klikt sloot de app af, dus dat moet ik nog oplossen. </w:t>
+        <w:t xml:space="preserve">Vandaag had ik tijdens les (in de morgen van 8u15-11u15) verder gewerkt aan de back-end van mijn app. Ik was gisteren bezig met google sign-in, maar ik besloot om eerst normale email/password authentication toe te voegen. Dit ging vrij vlot vooruit maar toen ik de button klikt sloot de app af, dus dat moet ik nog oplossen. </w:t>
       </w:r>
       <w:r>
         <w:t>Er werd</w:t>
@@ -2181,34 +1512,10 @@
         <w:t>Vandaag heb ik eindelijk de login en registratie kunnen afwerken. Dit had veel moeite gekost.</w:t>
       </w:r>
       <w:r>
-        <w:t xml:space="preserve"> Het probleem was dus dat mijn app bleef crashen als ik probeerde te registeren. Ik had veel op stackoverflow gezocht maar ik kon eerst niks vinden, maar toen zag ik dat de wifi van de device emulator op </w:t>
-      </w:r>
-      <w:proofErr w:type="gramStart"/>
-      <w:r>
-        <w:t>Android studio</w:t>
-      </w:r>
-      <w:proofErr w:type="gramEnd"/>
-      <w:r>
-        <w:t xml:space="preserve"> geen wifi had. Ik dacht eerst dat dit normaal was, maar begon toen twijfels te krijgen. Ik had dan eerst de info op stackoverflow pagina proberen gebruiken, maar dat was niet juist. Uiteindelijk gewoon mijn gsm </w:t>
-      </w:r>
-      <w:proofErr w:type="spellStart"/>
-      <w:r>
-        <w:t>hotspot</w:t>
-      </w:r>
-      <w:proofErr w:type="spellEnd"/>
-      <w:r>
-        <w:t xml:space="preserve"> 4G gebruiken werkte wel.</w:t>
-      </w:r>
-      <w:r>
-        <w:t xml:space="preserve"> Mijn app crasht dan nog steeds bij registratie maar ik kon wel inloggen door een test account aan te maken op </w:t>
-      </w:r>
-      <w:proofErr w:type="spellStart"/>
-      <w:r>
-        <w:t>Firebase</w:t>
-      </w:r>
-      <w:proofErr w:type="spellEnd"/>
-      <w:r>
-        <w:t>. Dus mijn code werkte, maar toen ik zag dat ik niet gekeken had naar de error van die verscheen na de crash en dat maakte alles duidelijk</w:t>
+        <w:t xml:space="preserve"> Het probleem was dus dat mijn app bleef crashen als ik probeerde te registeren. Ik had veel op stackoverflow gezocht maar ik kon eerst niks vinden, maar toen zag ik dat de wifi van de device emulator op Android studio geen wifi had. Ik dacht eerst dat dit normaal was, maar begon toen twijfels te krijgen. Ik had dan eerst de info op stackoverflow pagina proberen gebruiken, maar dat was niet juist. Uiteindelijk gewoon mijn gsm hotspot 4G gebruiken werkte wel.</w:t>
+      </w:r>
+      <w:r>
+        <w:t xml:space="preserve"> Mijn app crasht dan nog steeds bij registratie maar ik kon wel inloggen door een test account aan te maken op Firebase. Dus mijn code werkte, maar toen ik zag dat ik niet gekeken had naar de error van die verscheen na de crash en dat maakte alles duidelijk</w:t>
       </w:r>
       <w:r>
         <w:t xml:space="preserve"> voor mij</w:t>
@@ -2370,161 +1677,56 @@
           <w:rFonts w:eastAsia="Times New Roman" w:cstheme="minorHAnsi"/>
           <w:lang w:eastAsia="nl-BE"/>
         </w:rPr>
-        <w:t xml:space="preserve">Vandaag heb ik geprobeerd om google </w:t>
-      </w:r>
-      <w:proofErr w:type="spellStart"/>
+        <w:t>Vandaag heb ik geprobeerd om google sign-in te laten werken. Dit ging zeer goed, maar het enige probleem is dat de google account niet wordt toegevoegd aan Firebase en het wil daarna niet naar de volgende pagina gaan als ik de google sign</w:t>
+      </w:r>
       <w:r>
         <w:rPr>
           <w:rFonts w:eastAsia="Times New Roman" w:cstheme="minorHAnsi"/>
           <w:lang w:eastAsia="nl-BE"/>
         </w:rPr>
-        <w:t>sign</w:t>
-      </w:r>
-      <w:proofErr w:type="spellEnd"/>
+        <w:t>-</w:t>
+      </w:r>
       <w:r>
         <w:rPr>
           <w:rFonts w:eastAsia="Times New Roman" w:cstheme="minorHAnsi"/>
           <w:lang w:eastAsia="nl-BE"/>
         </w:rPr>
-        <w:t xml:space="preserve">-in te laten werken. Dit ging zeer goed, maar het enige probleem is dat de </w:t>
-      </w:r>
-      <w:proofErr w:type="gramStart"/>
+        <w:t>in button klik. Het sign-in scherm verschijnt wel en hebben geen errors, maar daarna gebeurt er niks. Ik heb de methode toegevoegd die iemand van teams zei dat die het probleem</w:t>
+      </w:r>
       <w:r>
         <w:rPr>
           <w:rFonts w:eastAsia="Times New Roman" w:cstheme="minorHAnsi"/>
           <w:lang w:eastAsia="nl-BE"/>
         </w:rPr>
-        <w:t>google account</w:t>
-      </w:r>
-      <w:proofErr w:type="gramEnd"/>
+        <w:t xml:space="preserve"> zou</w:t>
+      </w:r>
       <w:r>
         <w:rPr>
           <w:rFonts w:eastAsia="Times New Roman" w:cstheme="minorHAnsi"/>
           <w:lang w:eastAsia="nl-BE"/>
         </w:rPr>
-        <w:t xml:space="preserve"> niet wordt toegevoegd aan </w:t>
-      </w:r>
-      <w:proofErr w:type="spellStart"/>
+        <w:t xml:space="preserve"> oplos</w:t>
+      </w:r>
       <w:r>
         <w:rPr>
           <w:rFonts w:eastAsia="Times New Roman" w:cstheme="minorHAnsi"/>
           <w:lang w:eastAsia="nl-BE"/>
         </w:rPr>
-        <w:t>Firebase</w:t>
-      </w:r>
-      <w:proofErr w:type="spellEnd"/>
+        <w:t>sen</w:t>
+      </w:r>
       <w:r>
         <w:rPr>
           <w:rFonts w:eastAsia="Times New Roman" w:cstheme="minorHAnsi"/>
           <w:lang w:eastAsia="nl-BE"/>
         </w:rPr>
-        <w:t xml:space="preserve"> en het wil daarna niet naar de volgende pagina gaan als ik de google </w:t>
-      </w:r>
-      <w:proofErr w:type="spellStart"/>
+        <w:t xml:space="preserve"> maar er zal nog ergens een fout zitten.</w:t>
+      </w:r>
       <w:r>
         <w:rPr>
           <w:rFonts w:eastAsia="Times New Roman" w:cstheme="minorHAnsi"/>
           <w:lang w:eastAsia="nl-BE"/>
         </w:rPr>
-        <w:t>sign</w:t>
-      </w:r>
-      <w:proofErr w:type="spellEnd"/>
-      <w:r>
-        <w:rPr>
-          <w:rFonts w:eastAsia="Times New Roman" w:cstheme="minorHAnsi"/>
-          <w:lang w:eastAsia="nl-BE"/>
-        </w:rPr>
-        <w:t>-</w:t>
-      </w:r>
-      <w:r>
-        <w:rPr>
-          <w:rFonts w:eastAsia="Times New Roman" w:cstheme="minorHAnsi"/>
-          <w:lang w:eastAsia="nl-BE"/>
-        </w:rPr>
-        <w:t xml:space="preserve">in button klik. Het </w:t>
-      </w:r>
-      <w:proofErr w:type="spellStart"/>
-      <w:r>
-        <w:rPr>
-          <w:rFonts w:eastAsia="Times New Roman" w:cstheme="minorHAnsi"/>
-          <w:lang w:eastAsia="nl-BE"/>
-        </w:rPr>
-        <w:t>sign</w:t>
-      </w:r>
-      <w:proofErr w:type="spellEnd"/>
-      <w:r>
-        <w:rPr>
-          <w:rFonts w:eastAsia="Times New Roman" w:cstheme="minorHAnsi"/>
-          <w:lang w:eastAsia="nl-BE"/>
-        </w:rPr>
-        <w:t xml:space="preserve">-in scherm verschijnt wel en hebben geen </w:t>
-      </w:r>
-      <w:proofErr w:type="spellStart"/>
-      <w:r>
-        <w:rPr>
-          <w:rFonts w:eastAsia="Times New Roman" w:cstheme="minorHAnsi"/>
-          <w:lang w:eastAsia="nl-BE"/>
-        </w:rPr>
-        <w:t>errors</w:t>
-      </w:r>
-      <w:proofErr w:type="spellEnd"/>
-      <w:r>
-        <w:rPr>
-          <w:rFonts w:eastAsia="Times New Roman" w:cstheme="minorHAnsi"/>
-          <w:lang w:eastAsia="nl-BE"/>
-        </w:rPr>
-        <w:t>, maar daarna gebeurt er niks. Ik heb de methode toegevoegd die iemand van teams zei dat die het probleem</w:t>
-      </w:r>
-      <w:r>
-        <w:rPr>
-          <w:rFonts w:eastAsia="Times New Roman" w:cstheme="minorHAnsi"/>
-          <w:lang w:eastAsia="nl-BE"/>
-        </w:rPr>
-        <w:t xml:space="preserve"> zou</w:t>
-      </w:r>
-      <w:r>
-        <w:rPr>
-          <w:rFonts w:eastAsia="Times New Roman" w:cstheme="minorHAnsi"/>
-          <w:lang w:eastAsia="nl-BE"/>
-        </w:rPr>
-        <w:t xml:space="preserve"> oplos</w:t>
-      </w:r>
-      <w:r>
-        <w:rPr>
-          <w:rFonts w:eastAsia="Times New Roman" w:cstheme="minorHAnsi"/>
-          <w:lang w:eastAsia="nl-BE"/>
-        </w:rPr>
-        <w:t>sen</w:t>
-      </w:r>
-      <w:r>
-        <w:rPr>
-          <w:rFonts w:eastAsia="Times New Roman" w:cstheme="minorHAnsi"/>
-          <w:lang w:eastAsia="nl-BE"/>
-        </w:rPr>
-        <w:t xml:space="preserve"> maar er zal nog ergens een fout zitten.</w:t>
-      </w:r>
-      <w:r>
-        <w:rPr>
-          <w:rFonts w:eastAsia="Times New Roman" w:cstheme="minorHAnsi"/>
-          <w:lang w:eastAsia="nl-BE"/>
-        </w:rPr>
-        <w:t xml:space="preserve"> 1 van de methodes was wel </w:t>
-      </w:r>
-      <w:proofErr w:type="spellStart"/>
-      <w:r>
-        <w:rPr>
-          <w:rFonts w:eastAsia="Times New Roman" w:cstheme="minorHAnsi"/>
-          <w:lang w:eastAsia="nl-BE"/>
-        </w:rPr>
-        <w:t>deprecated</w:t>
-      </w:r>
-      <w:proofErr w:type="spellEnd"/>
-      <w:r>
-        <w:rPr>
-          <w:rFonts w:eastAsia="Times New Roman" w:cstheme="minorHAnsi"/>
-          <w:lang w:eastAsia="nl-BE"/>
-        </w:rPr>
-        <w:t xml:space="preserve">, maar die had </w:t>
+        <w:t xml:space="preserve"> 1 van de methodes was wel deprecated, maar die had </w:t>
       </w:r>
       <w:r>
         <w:rPr>
@@ -2685,192 +1887,14 @@
           <w:rFonts w:eastAsia="Times New Roman" w:cstheme="minorHAnsi"/>
           <w:lang w:eastAsia="nl-BE"/>
         </w:rPr>
-        <w:t xml:space="preserve">Vandaag is het me gelukt om de google </w:t>
-      </w:r>
-      <w:proofErr w:type="spellStart"/>
+        <w:t>Vandaag is het me gelukt om de google sign-in te laten werken. Ik had veel opzoek werk gedaan op google maar kon niks duidelijk vinden. Ik had mijn code ook gedebugd, maar geen duidelijk error werd weergegeven. Uiteindelijk besloot ik opzoek te gaan naar een tutorial die recent was in 2021. Deze tutorial heb ik dan gebruikt om mijn project strict te controleren en toen realiseerde ik dat de SHA-1 niet op de juiste plaats stond. Ik had op google cloud een Oauth 2.0 client id moeten aanmaken toen ik de android studio firebase tutorial volgde, maar dat bleek dus helemaal fout te zijn, want de echte client_id was eigenlijk al klaar in een google-services.json file. Ik moest toen ook mijn SHA-1 fingerprint verwijderen bij de onderstaande afbeelding, maar dat mocht daar eigenlijk blijven staan.</w:t>
+      </w:r>
       <w:r>
         <w:rPr>
           <w:rFonts w:eastAsia="Times New Roman" w:cstheme="minorHAnsi"/>
           <w:lang w:eastAsia="nl-BE"/>
         </w:rPr>
-        <w:t>sign</w:t>
-      </w:r>
-      <w:proofErr w:type="spellEnd"/>
-      <w:r>
-        <w:rPr>
-          <w:rFonts w:eastAsia="Times New Roman" w:cstheme="minorHAnsi"/>
-          <w:lang w:eastAsia="nl-BE"/>
-        </w:rPr>
-        <w:t xml:space="preserve">-in te laten werken. Ik had veel opzoek werk gedaan op google maar kon niks duidelijk vinden. Ik had mijn code ook gedebugd, maar geen duidelijk error werd weergegeven. Uiteindelijk besloot ik opzoek te gaan naar een tutorial die recent was in 2021. Deze tutorial heb ik dan gebruikt om mijn project </w:t>
-      </w:r>
-      <w:proofErr w:type="spellStart"/>
-      <w:r>
-        <w:rPr>
-          <w:rFonts w:eastAsia="Times New Roman" w:cstheme="minorHAnsi"/>
-          <w:lang w:eastAsia="nl-BE"/>
-        </w:rPr>
-        <w:t>strict</w:t>
-      </w:r>
-      <w:proofErr w:type="spellEnd"/>
-      <w:r>
-        <w:rPr>
-          <w:rFonts w:eastAsia="Times New Roman" w:cstheme="minorHAnsi"/>
-          <w:lang w:eastAsia="nl-BE"/>
-        </w:rPr>
-        <w:t xml:space="preserve"> te controleren en toen realiseerde ik dat de SHA-1 niet op de juiste plaats stond. Ik had op google </w:t>
-      </w:r>
-      <w:proofErr w:type="spellStart"/>
-      <w:r>
-        <w:rPr>
-          <w:rFonts w:eastAsia="Times New Roman" w:cstheme="minorHAnsi"/>
-          <w:lang w:eastAsia="nl-BE"/>
-        </w:rPr>
-        <w:t>cloud</w:t>
-      </w:r>
-      <w:proofErr w:type="spellEnd"/>
-      <w:r>
-        <w:rPr>
-          <w:rFonts w:eastAsia="Times New Roman" w:cstheme="minorHAnsi"/>
-          <w:lang w:eastAsia="nl-BE"/>
-        </w:rPr>
-        <w:t xml:space="preserve"> een </w:t>
-      </w:r>
-      <w:proofErr w:type="spellStart"/>
-      <w:r>
-        <w:rPr>
-          <w:rFonts w:eastAsia="Times New Roman" w:cstheme="minorHAnsi"/>
-          <w:lang w:eastAsia="nl-BE"/>
-        </w:rPr>
-        <w:t>Oauth</w:t>
-      </w:r>
-      <w:proofErr w:type="spellEnd"/>
-      <w:r>
-        <w:rPr>
-          <w:rFonts w:eastAsia="Times New Roman" w:cstheme="minorHAnsi"/>
-          <w:lang w:eastAsia="nl-BE"/>
-        </w:rPr>
-        <w:t xml:space="preserve"> 2.0 client </w:t>
-      </w:r>
-      <w:proofErr w:type="spellStart"/>
-      <w:r>
-        <w:rPr>
-          <w:rFonts w:eastAsia="Times New Roman" w:cstheme="minorHAnsi"/>
-          <w:lang w:eastAsia="nl-BE"/>
-        </w:rPr>
-        <w:t>id</w:t>
-      </w:r>
-      <w:proofErr w:type="spellEnd"/>
-      <w:r>
-        <w:rPr>
-          <w:rFonts w:eastAsia="Times New Roman" w:cstheme="minorHAnsi"/>
-          <w:lang w:eastAsia="nl-BE"/>
-        </w:rPr>
-        <w:t xml:space="preserve"> moeten aanmaken toen ik de </w:t>
-      </w:r>
-      <w:proofErr w:type="spellStart"/>
-      <w:r>
-        <w:rPr>
-          <w:rFonts w:eastAsia="Times New Roman" w:cstheme="minorHAnsi"/>
-          <w:lang w:eastAsia="nl-BE"/>
-        </w:rPr>
-        <w:t>android</w:t>
-      </w:r>
-      <w:proofErr w:type="spellEnd"/>
-      <w:r>
-        <w:rPr>
-          <w:rFonts w:eastAsia="Times New Roman" w:cstheme="minorHAnsi"/>
-          <w:lang w:eastAsia="nl-BE"/>
-        </w:rPr>
-        <w:t xml:space="preserve"> studio </w:t>
-      </w:r>
-      <w:proofErr w:type="spellStart"/>
-      <w:r>
-        <w:rPr>
-          <w:rFonts w:eastAsia="Times New Roman" w:cstheme="minorHAnsi"/>
-          <w:lang w:eastAsia="nl-BE"/>
-        </w:rPr>
-        <w:t>firebase</w:t>
-      </w:r>
-      <w:proofErr w:type="spellEnd"/>
-      <w:r>
-        <w:rPr>
-          <w:rFonts w:eastAsia="Times New Roman" w:cstheme="minorHAnsi"/>
-          <w:lang w:eastAsia="nl-BE"/>
-        </w:rPr>
-        <w:t xml:space="preserve"> tutorial volgde, maar dat bleek dus helemaal fout te zijn, want de echte </w:t>
-      </w:r>
-      <w:proofErr w:type="spellStart"/>
-      <w:r>
-        <w:rPr>
-          <w:rFonts w:eastAsia="Times New Roman" w:cstheme="minorHAnsi"/>
-          <w:lang w:eastAsia="nl-BE"/>
-        </w:rPr>
-        <w:t>client_id</w:t>
-      </w:r>
-      <w:proofErr w:type="spellEnd"/>
-      <w:r>
-        <w:rPr>
-          <w:rFonts w:eastAsia="Times New Roman" w:cstheme="minorHAnsi"/>
-          <w:lang w:eastAsia="nl-BE"/>
-        </w:rPr>
-        <w:t xml:space="preserve"> was eigenlijk al klaar in een google-</w:t>
-      </w:r>
-      <w:proofErr w:type="spellStart"/>
-      <w:proofErr w:type="gramStart"/>
-      <w:r>
-        <w:rPr>
-          <w:rFonts w:eastAsia="Times New Roman" w:cstheme="minorHAnsi"/>
-          <w:lang w:eastAsia="nl-BE"/>
-        </w:rPr>
-        <w:t>services.json</w:t>
-      </w:r>
-      <w:proofErr w:type="spellEnd"/>
-      <w:proofErr w:type="gramEnd"/>
-      <w:r>
-        <w:rPr>
-          <w:rFonts w:eastAsia="Times New Roman" w:cstheme="minorHAnsi"/>
-          <w:lang w:eastAsia="nl-BE"/>
-        </w:rPr>
-        <w:t xml:space="preserve"> file. Ik moest toen ook mijn SHA-1 </w:t>
-      </w:r>
-      <w:proofErr w:type="spellStart"/>
-      <w:r>
-        <w:rPr>
-          <w:rFonts w:eastAsia="Times New Roman" w:cstheme="minorHAnsi"/>
-          <w:lang w:eastAsia="nl-BE"/>
-        </w:rPr>
-        <w:t>fingerprint</w:t>
-      </w:r>
-      <w:proofErr w:type="spellEnd"/>
-      <w:r>
-        <w:rPr>
-          <w:rFonts w:eastAsia="Times New Roman" w:cstheme="minorHAnsi"/>
-          <w:lang w:eastAsia="nl-BE"/>
-        </w:rPr>
-        <w:t xml:space="preserve"> verwijderen bij de onderstaande afbeelding, maar dat mocht daar eigenlijk blijven staan.</w:t>
-      </w:r>
-      <w:r>
-        <w:rPr>
-          <w:rFonts w:eastAsia="Times New Roman" w:cstheme="minorHAnsi"/>
-          <w:lang w:eastAsia="nl-BE"/>
-        </w:rPr>
-        <w:t xml:space="preserve"> Nu kunnen </w:t>
-      </w:r>
-      <w:proofErr w:type="gramStart"/>
-      <w:r>
-        <w:rPr>
-          <w:rFonts w:eastAsia="Times New Roman" w:cstheme="minorHAnsi"/>
-          <w:lang w:eastAsia="nl-BE"/>
-        </w:rPr>
-        <w:t>google accounts</w:t>
-      </w:r>
-      <w:proofErr w:type="gramEnd"/>
-      <w:r>
-        <w:rPr>
-          <w:rFonts w:eastAsia="Times New Roman" w:cstheme="minorHAnsi"/>
-          <w:lang w:eastAsia="nl-BE"/>
-        </w:rPr>
-        <w:t xml:space="preserve"> succesvol worden toegevoegd.</w:t>
+        <w:t xml:space="preserve"> Nu kunnen google accounts succesvol worden toegevoegd.</w:t>
       </w:r>
       <w:r>
         <w:rPr>
@@ -3065,15 +2089,7 @@
       </w:pPr>
       <w:r>
         <w:lastRenderedPageBreak/>
-        <w:t xml:space="preserve">Wat ik wil </w:t>
-      </w:r>
-      <w:proofErr w:type="spellStart"/>
-      <w:r>
-        <w:t>realiseen</w:t>
-      </w:r>
-      <w:proofErr w:type="spellEnd"/>
-      <w:r>
-        <w:t xml:space="preserve"> deze week:</w:t>
+        <w:t>Wat ik wil realiseen deze week:</w:t>
       </w:r>
     </w:p>
     <w:p>
@@ -3084,13 +2100,8 @@
           <w:numId w:val="2"/>
         </w:numPr>
       </w:pPr>
-      <w:proofErr w:type="spellStart"/>
-      <w:r>
-        <w:t>Firebase</w:t>
-      </w:r>
-      <w:proofErr w:type="spellEnd"/>
-      <w:r>
-        <w:t xml:space="preserve"> </w:t>
+      <w:r>
+        <w:t xml:space="preserve">Firebase </w:t>
       </w:r>
       <w:r>
         <w:t>storage</w:t>
@@ -3132,52 +2143,23 @@
     </w:p>
     <w:p>
       <w:r>
-        <w:t xml:space="preserve">Vandaag ben ik begonnen met aanmaken van de </w:t>
-      </w:r>
-      <w:proofErr w:type="spellStart"/>
-      <w:r>
-        <w:t>Firebase</w:t>
-      </w:r>
-      <w:proofErr w:type="spellEnd"/>
-      <w:r>
-        <w:t xml:space="preserve"> storage voor het opslaan van afbeeldingen.</w:t>
+        <w:t>Vandaag ben ik begonnen met aanmaken van de Firebase storage voor het opslaan van afbeeldingen.</w:t>
       </w:r>
       <w:r>
         <w:t xml:space="preserve"> </w:t>
       </w:r>
       <w:r>
-        <w:t xml:space="preserve">Ik heb dan de </w:t>
-      </w:r>
-      <w:proofErr w:type="spellStart"/>
-      <w:r>
-        <w:t>dependencies</w:t>
-      </w:r>
-      <w:proofErr w:type="spellEnd"/>
-      <w:r>
-        <w:t xml:space="preserve"> toegevoegd en dan moest ik een Cloud storage bucket aanmaken. Hierbij werd er gevraagd om een locatie te kiezen waarbij Europe-west 1 (= Belgische regio) niet tussen stond, maar gelukkig is er Eur3 die eigenlijk Belgische en Nederlandse regio voorstelt. Dat werd uitgelegd </w:t>
-      </w:r>
-      <w:r>
-        <w:t xml:space="preserve">op deze </w:t>
-      </w:r>
-      <w:proofErr w:type="spellStart"/>
-      <w:proofErr w:type="gramStart"/>
-      <w:r>
-        <w:t>webpagina</w:t>
-      </w:r>
-      <w:r>
-        <w:t>‘</w:t>
-      </w:r>
-      <w:proofErr w:type="gramEnd"/>
-      <w:r>
-        <w:t>s</w:t>
+        <w:t xml:space="preserve">Ik heb dan de dependencies toegevoegd en dan moest ik een Cloud storage bucket aanmaken. Hierbij werd er gevraagd om een locatie te kiezen waarbij Europe-west 1 (= Belgische regio) niet tussen stond, maar gelukkig is er Eur3 die eigenlijk Belgische en Nederlandse regio voorstelt. Dat werd uitgelegd </w:t>
+      </w:r>
+      <w:r>
+        <w:t>op deze webpagina</w:t>
+      </w:r>
+      <w:r>
+        <w:t>‘s</w:t>
       </w:r>
       <w:r>
         <w:t>:</w:t>
       </w:r>
-      <w:r>
-        <w:t>s</w:t>
-      </w:r>
-      <w:proofErr w:type="spellEnd"/>
     </w:p>
     <w:p>
       <w:hyperlink r:id="rId36" w:history="1">
@@ -3263,7 +2245,6 @@
       </w:hyperlink>
     </w:p>
     <w:p/>
-    <w:p/>
     <w:p>
       <w:pPr>
         <w:rPr>
@@ -3281,52 +2262,12 @@
     </w:p>
     <w:p>
       <w:r>
-        <w:t xml:space="preserve">Vandaag heb ik de </w:t>
-      </w:r>
-      <w:proofErr w:type="spellStart"/>
-      <w:r>
-        <w:t>java</w:t>
-      </w:r>
-      <w:proofErr w:type="spellEnd"/>
-      <w:r>
-        <w:t xml:space="preserve"> code moet schrijven voor de camera te kunnen gebruiken. Eerst heb ik code toegevoegd dat ervoor zorgt dat de permissies worden aangevraagd om de camera te kunnen gebruiken. Daarna als ik </w:t>
-      </w:r>
-      <w:proofErr w:type="spellStart"/>
-      <w:r>
-        <w:t>allow</w:t>
-      </w:r>
-      <w:proofErr w:type="spellEnd"/>
-      <w:r>
-        <w:t xml:space="preserve"> klik dan opent een test camera zicht van de emulator. </w:t>
-      </w:r>
-    </w:p>
-    <w:p>
-      <w:r>
-        <w:t xml:space="preserve">Hierbij werden gelijkaardig methoden gebruikt zoals de </w:t>
-      </w:r>
-      <w:proofErr w:type="spellStart"/>
-      <w:r>
-        <w:t>firebase</w:t>
-      </w:r>
-      <w:proofErr w:type="spellEnd"/>
-      <w:r>
-        <w:t xml:space="preserve"> </w:t>
-      </w:r>
-      <w:proofErr w:type="spellStart"/>
-      <w:r>
-        <w:t>authentication</w:t>
-      </w:r>
-      <w:proofErr w:type="spellEnd"/>
-      <w:r>
-        <w:t xml:space="preserve">, maar waren ook </w:t>
-      </w:r>
-      <w:proofErr w:type="spellStart"/>
-      <w:r>
-        <w:t>deprecated</w:t>
-      </w:r>
-      <w:proofErr w:type="spellEnd"/>
-      <w:r>
-        <w:t>. Dit heb natuurlijk makkelijk opgelost.</w:t>
+        <w:t xml:space="preserve">Vandaag heb ik de java code moet schrijven voor de camera te kunnen gebruiken. Eerst heb ik code toegevoegd dat ervoor zorgt dat de permissies worden aangevraagd om de camera te kunnen gebruiken. Daarna als ik allow klik dan opent een test camera zicht van de emulator. </w:t>
+      </w:r>
+    </w:p>
+    <w:p>
+      <w:r>
+        <w:t>Hierbij werden gelijkaardig methoden gebruikt zoals de firebase authentication, maar waren ook deprecated. Dit heb natuurlijk makkelijk opgelost.</w:t>
       </w:r>
     </w:p>
     <w:p>
@@ -3383,6 +2324,24 @@
       </w:r>
     </w:p>
     <w:p/>
+    <w:p>
+      <w:r>
+        <w:t>27/10/2021:</w:t>
+      </w:r>
+    </w:p>
+    <w:p>
+      <w:r>
+        <w:t>Vandaag heb ik geprobeerd om de image die getrokken wordt op te slaan in firebase storage</w:t>
+      </w:r>
+      <w:r>
+        <w:t>. Dit is op het einde van de les gelukt.</w:t>
+      </w:r>
+    </w:p>
+    <w:p>
+      <w:r>
+        <w:t>https://www.youtube.com/watch?v=Ey2imp7iaP8</w:t>
+      </w:r>
+    </w:p>
     <w:p/>
     <w:sectPr>
       <w:pgSz w:w="11906" w:h="16838"/>
@@ -4187,6 +3146,18 @@
       <w:lang w:eastAsia="nl-BE"/>
     </w:rPr>
   </w:style>
+  <w:style w:type="character" w:styleId="GevolgdeHyperlink">
+    <w:name w:val="FollowedHyperlink"/>
+    <w:basedOn w:val="Standaardalinea-lettertype"/>
+    <w:uiPriority w:val="99"/>
+    <w:semiHidden/>
+    <w:unhideWhenUsed/>
+    <w:rsid w:val="007C3FFD"/>
+    <w:rPr>
+      <w:color w:val="954F72" w:themeColor="followedHyperlink"/>
+      <w:u w:val="single"/>
+    </w:rPr>
+  </w:style>
 </w:styles>
 </file>
 

</xml_diff>

<commit_message>
Working on adding content to the notes fragment page (images)
</commit_message>
<xml_diff>
--- a/Logboek_Dries_Fierens.docx
+++ b/Logboek_Dries_Fierens.docx
@@ -78,15 +78,7 @@
       </w:r>
       <w:proofErr w:type="spellEnd"/>
       <w:r>
-        <w:t xml:space="preserve"> web app dat dus meer te maken hebben met web &amp; mobile dus vooral HTML &amp; CSS. We moesten dan ook nog kiezen voor een project idee, waarbij ik koos voor een scanner + </w:t>
-      </w:r>
-      <w:proofErr w:type="gramStart"/>
-      <w:r>
-        <w:t>pdf converter</w:t>
-      </w:r>
-      <w:proofErr w:type="gramEnd"/>
-      <w:r>
-        <w:t xml:space="preserve"> app</w:t>
+        <w:t xml:space="preserve"> web app dat dus meer te maken hebben met web &amp; mobile dus vooral HTML &amp; CSS. We moesten dan ook nog kiezen voor een project idee, waarbij ik koos voor een scanner + pdf converter app</w:t>
       </w:r>
       <w:r>
         <w:t xml:space="preserve"> waarbij het vooral bedoelt is o</w:t>
@@ -107,15 +99,7 @@
         <w:t>.</w:t>
       </w:r>
       <w:r>
-        <w:t xml:space="preserve"> Het was verplicht om 1 </w:t>
-      </w:r>
-      <w:proofErr w:type="gramStart"/>
-      <w:r>
-        <w:t>hardware component</w:t>
-      </w:r>
-      <w:proofErr w:type="gramEnd"/>
-      <w:r>
-        <w:t xml:space="preserve"> van de gsm te gebruiken dus koos ik natuurlijk voor de camera.</w:t>
+        <w:t xml:space="preserve"> Het was verplicht om 1 hardware component van de gsm te gebruiken dus koos ik natuurlijk voor de camera.</w:t>
       </w:r>
       <w:r>
         <w:t xml:space="preserve"> </w:t>
@@ -229,15 +213,7 @@
         <w:t xml:space="preserve">Mijn app idee werd niet goedgekeurd, want de leerkracht raadde het af door problemen die ervan kunnen komen. Ik moest dan vandaag een nieuw idee opstellen. </w:t>
       </w:r>
       <w:r>
-        <w:t xml:space="preserve">De scanner + </w:t>
-      </w:r>
-      <w:proofErr w:type="gramStart"/>
-      <w:r>
-        <w:t>pdf converter</w:t>
-      </w:r>
-      <w:proofErr w:type="gramEnd"/>
-      <w:r>
-        <w:t xml:space="preserve"> was duidelijk te moeilijk, maar ik besloot om het idee verder te zetten van een app die notities kan delen. Dus nu moet het gewoon foto’s trekken van de notities. Om nog toe te voegen kan ik ook opmerkingswolkjes toevoegen aan de foto voor bijvoorbeeld een fout</w:t>
+        <w:t>De scanner + pdf converter was duidelijk te moeilijk, maar ik besloot om het idee verder te zetten van een app die notities kan delen. Dus nu moet het gewoon foto’s trekken van de notities. Om nog toe te voegen kan ik ook opmerkingswolkjes toevoegen aan de foto voor bijvoorbeeld een fout</w:t>
       </w:r>
       <w:r>
         <w:t xml:space="preserve"> aan te duiden</w:t>
@@ -309,15 +285,7 @@
         <w:t>te veel</w:t>
       </w:r>
       <w:r>
-        <w:t xml:space="preserve"> naar voor moest leunen en dus </w:t>
-      </w:r>
-      <w:proofErr w:type="gramStart"/>
-      <w:r>
-        <w:t>nek pijn</w:t>
-      </w:r>
-      <w:proofErr w:type="gramEnd"/>
-      <w:r>
-        <w:t xml:space="preserve"> kreeg en er waren precies geen ramen om te openen. </w:t>
+        <w:t xml:space="preserve"> naar voor moest leunen en dus nek pijn kreeg en er waren precies geen ramen om te openen. </w:t>
       </w:r>
       <w:r>
         <w:t>Gelukkig kunnen we naar buiten wanneer we het willen.</w:t>
@@ -598,15 +566,7 @@
     </w:p>
     <w:p>
       <w:r>
-        <w:t xml:space="preserve">Tijdens lange downloads heb ik ook mijn </w:t>
-      </w:r>
-      <w:proofErr w:type="gramStart"/>
-      <w:r>
-        <w:t>google account</w:t>
-      </w:r>
-      <w:proofErr w:type="gramEnd"/>
-      <w:r>
-        <w:t xml:space="preserve"> toegevoegd op </w:t>
+        <w:t xml:space="preserve">Tijdens lange downloads heb ik ook mijn google account toegevoegd op </w:t>
       </w:r>
       <w:proofErr w:type="spellStart"/>
       <w:r>
@@ -695,15 +655,7 @@
         <w:t>Ik heb daarna gewoon verder begonnen aan de tutorial die ik vorige week gebruikt had.</w:t>
       </w:r>
       <w:r>
-        <w:t xml:space="preserve"> Hierbij leerde ik meer over hoe ik </w:t>
-      </w:r>
-      <w:proofErr w:type="gramStart"/>
-      <w:r>
-        <w:t>Android studio</w:t>
-      </w:r>
-      <w:proofErr w:type="gramEnd"/>
-      <w:r>
-        <w:t xml:space="preserve"> beter kon gebruiken om mijn app te </w:t>
+        <w:t xml:space="preserve"> Hierbij leerde ik meer over hoe ik Android studio beter kon gebruiken om mijn app te </w:t>
       </w:r>
       <w:proofErr w:type="spellStart"/>
       <w:r>
@@ -726,15 +678,7 @@
         <w:t>)</w:t>
       </w:r>
       <w:r>
-        <w:t xml:space="preserve">. </w:t>
-      </w:r>
-      <w:proofErr w:type="gramStart"/>
-      <w:r>
-        <w:t>Android studio</w:t>
-      </w:r>
-      <w:proofErr w:type="gramEnd"/>
-      <w:r>
-        <w:t xml:space="preserve"> is zeer gelijkaardig als bijvoorbeeld </w:t>
+        <w:t xml:space="preserve">. Android studio is zeer gelijkaardig als bijvoorbeeld </w:t>
       </w:r>
       <w:proofErr w:type="spellStart"/>
       <w:r>
@@ -765,13 +709,8 @@
         <w:t>bekijken</w:t>
       </w:r>
       <w:r>
-        <w:t xml:space="preserve"> in een gekozen browser, maar je kan in </w:t>
-      </w:r>
-      <w:proofErr w:type="gramStart"/>
-      <w:r>
-        <w:t>Android studio</w:t>
-      </w:r>
-      <w:proofErr w:type="gramEnd"/>
+        <w:t xml:space="preserve"> in een gekozen browser, maar je kan in Android studio</w:t>
+      </w:r>
       <w:r>
         <w:t xml:space="preserve"> je app</w:t>
       </w:r>
@@ -887,15 +826,7 @@
       </w:r>
       <w:proofErr w:type="spellEnd"/>
       <w:r>
-        <w:t xml:space="preserve"> design gevolgd in plaats van die van </w:t>
-      </w:r>
-      <w:proofErr w:type="gramStart"/>
-      <w:r>
-        <w:t>Android studio</w:t>
-      </w:r>
-      <w:proofErr w:type="gramEnd"/>
-      <w:r>
-        <w:t>. Ze leerde me dan hoe ik er mee kon werken maar niet hoe een hele nieuwe app kon maken. Ik kreeg een voorbeeld app om erin te kunnen werken voor de tutorial.</w:t>
+        <w:t xml:space="preserve"> design gevolgd in plaats van die van Android studio. Ze leerde me dan hoe ik er mee kon werken maar niet hoe een hele nieuwe app kon maken. Ik kreeg een voorbeeld app om erin te kunnen werken voor de tutorial.</w:t>
       </w:r>
     </w:p>
     <w:p>
@@ -2181,15 +2112,7 @@
         <w:t>Vandaag heb ik eindelijk de login en registratie kunnen afwerken. Dit had veel moeite gekost.</w:t>
       </w:r>
       <w:r>
-        <w:t xml:space="preserve"> Het probleem was dus dat mijn app bleef crashen als ik probeerde te registeren. Ik had veel op stackoverflow gezocht maar ik kon eerst niks vinden, maar toen zag ik dat de wifi van de device emulator op </w:t>
-      </w:r>
-      <w:proofErr w:type="gramStart"/>
-      <w:r>
-        <w:t>Android studio</w:t>
-      </w:r>
-      <w:proofErr w:type="gramEnd"/>
-      <w:r>
-        <w:t xml:space="preserve"> geen wifi had. Ik dacht eerst dat dit normaal was, maar begon toen twijfels te krijgen. Ik had dan eerst de info op stackoverflow pagina proberen gebruiken, maar dat was niet juist. Uiteindelijk gewoon mijn gsm </w:t>
+        <w:t xml:space="preserve"> Het probleem was dus dat mijn app bleef crashen als ik probeerde te registeren. Ik had veel op stackoverflow gezocht maar ik kon eerst niks vinden, maar toen zag ik dat de wifi van de device emulator op Android studio geen wifi had. Ik dacht eerst dat dit normaal was, maar begon toen twijfels te krijgen. Ik had dan eerst de info op stackoverflow pagina proberen gebruiken, maar dat was niet juist. Uiteindelijk gewoon mijn gsm </w:t>
       </w:r>
       <w:proofErr w:type="spellStart"/>
       <w:r>
@@ -2386,23 +2309,7 @@
           <w:rFonts w:eastAsia="Times New Roman" w:cstheme="minorHAnsi"/>
           <w:lang w:eastAsia="nl-BE"/>
         </w:rPr>
-        <w:t xml:space="preserve">-in te laten werken. Dit ging zeer goed, maar het enige probleem is dat de </w:t>
-      </w:r>
-      <w:proofErr w:type="gramStart"/>
-      <w:r>
-        <w:rPr>
-          <w:rFonts w:eastAsia="Times New Roman" w:cstheme="minorHAnsi"/>
-          <w:lang w:eastAsia="nl-BE"/>
-        </w:rPr>
-        <w:t>google account</w:t>
-      </w:r>
-      <w:proofErr w:type="gramEnd"/>
-      <w:r>
-        <w:rPr>
-          <w:rFonts w:eastAsia="Times New Roman" w:cstheme="minorHAnsi"/>
-          <w:lang w:eastAsia="nl-BE"/>
-        </w:rPr>
-        <w:t xml:space="preserve"> niet wordt toegevoegd aan </w:t>
+        <w:t xml:space="preserve">-in te laten werken. Dit ging zeer goed, maar het enige probleem is dat de google account niet wordt toegevoegd aan </w:t>
       </w:r>
       <w:proofErr w:type="spellStart"/>
       <w:r>
@@ -2662,12 +2569,16 @@
       <w:pPr>
         <w:rPr>
           <w:rFonts w:eastAsia="Times New Roman" w:cstheme="minorHAnsi"/>
-          <w:lang w:eastAsia="nl-BE"/>
-        </w:rPr>
-      </w:pPr>
-      <w:r>
-        <w:rPr>
-          <w:rFonts w:eastAsia="Times New Roman" w:cstheme="minorHAnsi"/>
+          <w:b/>
+          <w:bCs/>
+          <w:lang w:eastAsia="nl-BE"/>
+        </w:rPr>
+      </w:pPr>
+      <w:r>
+        <w:rPr>
+          <w:rFonts w:eastAsia="Times New Roman" w:cstheme="minorHAnsi"/>
+          <w:b/>
+          <w:bCs/>
           <w:lang w:eastAsia="nl-BE"/>
         </w:rPr>
         <w:t>23/10/2021:</w:t>
@@ -2816,7 +2727,6 @@
         <w:t xml:space="preserve"> was eigenlijk al klaar in een google-</w:t>
       </w:r>
       <w:proofErr w:type="spellStart"/>
-      <w:proofErr w:type="gramStart"/>
       <w:r>
         <w:rPr>
           <w:rFonts w:eastAsia="Times New Roman" w:cstheme="minorHAnsi"/>
@@ -2825,7 +2735,6 @@
         <w:t>services.json</w:t>
       </w:r>
       <w:proofErr w:type="spellEnd"/>
-      <w:proofErr w:type="gramEnd"/>
       <w:r>
         <w:rPr>
           <w:rFonts w:eastAsia="Times New Roman" w:cstheme="minorHAnsi"/>
@@ -2854,23 +2763,7 @@
           <w:rFonts w:eastAsia="Times New Roman" w:cstheme="minorHAnsi"/>
           <w:lang w:eastAsia="nl-BE"/>
         </w:rPr>
-        <w:t xml:space="preserve"> Nu kunnen </w:t>
-      </w:r>
-      <w:proofErr w:type="gramStart"/>
-      <w:r>
-        <w:rPr>
-          <w:rFonts w:eastAsia="Times New Roman" w:cstheme="minorHAnsi"/>
-          <w:lang w:eastAsia="nl-BE"/>
-        </w:rPr>
-        <w:t>google accounts</w:t>
-      </w:r>
-      <w:proofErr w:type="gramEnd"/>
-      <w:r>
-        <w:rPr>
-          <w:rFonts w:eastAsia="Times New Roman" w:cstheme="minorHAnsi"/>
-          <w:lang w:eastAsia="nl-BE"/>
-        </w:rPr>
-        <w:t xml:space="preserve"> succesvol worden toegevoegd.</w:t>
+        <w:t xml:space="preserve"> Nu kunnen google accounts succesvol worden toegevoegd.</w:t>
       </w:r>
       <w:r>
         <w:rPr>
@@ -3157,18 +3050,10 @@
         <w:t xml:space="preserve"> toegevoegd en dan moest ik een Cloud storage bucket aanmaken. Hierbij werd er gevraagd om een locatie te kiezen waarbij Europe-west 1 (= Belgische regio) niet tussen stond, maar gelukkig is er Eur3 die eigenlijk Belgische en Nederlandse regio voorstelt. Dat werd uitgelegd </w:t>
       </w:r>
       <w:r>
-        <w:t xml:space="preserve">op deze </w:t>
-      </w:r>
-      <w:proofErr w:type="gramStart"/>
-      <w:r>
-        <w:t>webpagina</w:t>
-      </w:r>
-      <w:r>
-        <w:t>‘</w:t>
-      </w:r>
-      <w:proofErr w:type="gramEnd"/>
-      <w:r>
-        <w:t>s</w:t>
+        <w:t>op deze webpagina</w:t>
+      </w:r>
+      <w:r>
+        <w:t>‘s</w:t>
       </w:r>
       <w:r>
         <w:t>:</w:t>
@@ -3556,15 +3441,7 @@
       </w:r>
       <w:proofErr w:type="spellEnd"/>
       <w:r>
-        <w:t xml:space="preserve"> oftewel de image inkomt. De map geef </w:t>
-      </w:r>
-      <w:proofErr w:type="gramStart"/>
-      <w:r>
-        <w:t>ik  het</w:t>
-      </w:r>
-      <w:proofErr w:type="gramEnd"/>
-      <w:r>
-        <w:t xml:space="preserve"> email adres van de gebruiker als naam.</w:t>
+        <w:t xml:space="preserve"> oftewel de image inkomt. De map geef ik  het email adres van de gebruiker als naam.</w:t>
       </w:r>
     </w:p>
     <w:p>
@@ -3649,6 +3526,162 @@
             </a:graphic>
           </wp:inline>
         </w:drawing>
+      </w:r>
+    </w:p>
+    <w:p/>
+    <w:p>
+      <w:pPr>
+        <w:pStyle w:val="Kop2"/>
+      </w:pPr>
+      <w:r>
+        <w:t>Week 7</w:t>
+      </w:r>
+    </w:p>
+    <w:p>
+      <w:pPr>
+        <w:pStyle w:val="Kop3"/>
+      </w:pPr>
+      <w:r>
+        <w:t xml:space="preserve">Wat ik wil </w:t>
+      </w:r>
+      <w:proofErr w:type="spellStart"/>
+      <w:r>
+        <w:t>realiseen</w:t>
+      </w:r>
+      <w:proofErr w:type="spellEnd"/>
+      <w:r>
+        <w:t xml:space="preserve"> deze week:</w:t>
+      </w:r>
+    </w:p>
+    <w:p>
+      <w:pPr>
+        <w:pStyle w:val="Lijstalinea"/>
+        <w:numPr>
+          <w:ilvl w:val="0"/>
+          <w:numId w:val="2"/>
+        </w:numPr>
+      </w:pPr>
+      <w:r>
+        <w:t>Automatische toegevoegde imageviews toevoegen afhankelijk van iemand zijn account en het aantal images die hij/zij heeft toegevoegd.</w:t>
+      </w:r>
+    </w:p>
+    <w:p>
+      <w:pPr>
+        <w:pStyle w:val="Lijstalinea"/>
+        <w:numPr>
+          <w:ilvl w:val="0"/>
+          <w:numId w:val="2"/>
+        </w:numPr>
+      </w:pPr>
+      <w:r>
+        <w:t>Gallery functionaliteiten toevoegen als dit nodig is.</w:t>
+      </w:r>
+      <w:r>
+        <w:t xml:space="preserve"> (Images van </w:t>
+      </w:r>
+      <w:r>
+        <w:t>je gsm</w:t>
+      </w:r>
+      <w:r>
+        <w:t xml:space="preserve"> </w:t>
+      </w:r>
+      <w:proofErr w:type="spellStart"/>
+      <w:r>
+        <w:t>gallery</w:t>
+      </w:r>
+      <w:proofErr w:type="spellEnd"/>
+      <w:r>
+        <w:t xml:space="preserve"> gebruiken)</w:t>
+      </w:r>
+    </w:p>
+    <w:p/>
+    <w:p>
+      <w:pPr>
+        <w:rPr>
+          <w:b/>
+          <w:bCs/>
+        </w:rPr>
+      </w:pPr>
+      <w:r>
+        <w:rPr>
+          <w:b/>
+          <w:bCs/>
+        </w:rPr>
+        <w:t>08/11/2021:</w:t>
+      </w:r>
+    </w:p>
+    <w:p>
+      <w:r>
+        <w:t xml:space="preserve">Vandaag heb ik geprobeerd om een </w:t>
+      </w:r>
+      <w:proofErr w:type="spellStart"/>
+      <w:r>
+        <w:t>gridview</w:t>
+      </w:r>
+      <w:proofErr w:type="spellEnd"/>
+      <w:r>
+        <w:t xml:space="preserve"> toe te voegen die images bevat dat dus lijkt op een image </w:t>
+      </w:r>
+      <w:proofErr w:type="spellStart"/>
+      <w:r>
+        <w:t>gallery</w:t>
+      </w:r>
+      <w:proofErr w:type="spellEnd"/>
+      <w:r>
+        <w:t xml:space="preserve"> zoals uw “foto’s” app. Hierbij heb ik de </w:t>
+      </w:r>
+      <w:r>
+        <w:t>volgende</w:t>
+      </w:r>
+      <w:r>
+        <w:t xml:space="preserve"> link</w:t>
+      </w:r>
+      <w:r>
+        <w:t>s</w:t>
+      </w:r>
+      <w:r>
+        <w:t xml:space="preserve"> voornamelijk gebruikt</w:t>
+      </w:r>
+      <w:r>
+        <w:t>:</w:t>
+      </w:r>
+    </w:p>
+    <w:p>
+      <w:r>
+        <w:br w:type="page"/>
+      </w:r>
+    </w:p>
+    <w:p>
+      <w:hyperlink r:id="rId45" w:history="1">
+        <w:r>
+          <w:rPr>
+            <w:rStyle w:val="Hyperlink"/>
+          </w:rPr>
+          <w:t>https://www.11zon.com/zon/android/display-images-in-gridview-android-example.php</w:t>
+        </w:r>
+      </w:hyperlink>
+    </w:p>
+    <w:p>
+      <w:hyperlink r:id="rId46" w:history="1">
+        <w:r>
+          <w:rPr>
+            <w:rStyle w:val="Hyperlink"/>
+          </w:rPr>
+          <w:t>https://stackoverflow.com/questions/63490176/how-to-display-firebase-storage-images-in-gridview</w:t>
+        </w:r>
+      </w:hyperlink>
+    </w:p>
+    <w:p>
+      <w:r>
+        <w:t xml:space="preserve">Dit heeft nog niet direct resultaat gegeven, maar de </w:t>
+      </w:r>
+      <w:proofErr w:type="spellStart"/>
+      <w:r>
+        <w:t>GridAdapter</w:t>
+      </w:r>
+      <w:proofErr w:type="spellEnd"/>
+      <w:r>
+        <w:t xml:space="preserve"> class geeft een gevoel dat ik wel op de goeie weg zit.</w:t>
       </w:r>
     </w:p>
     <w:p/>

</xml_diff>

<commit_message>
Fixed layout of gridview by getting the height of the header and footer programmaticaly and setting it.
</commit_message>
<xml_diff>
--- a/Logboek_Dries_Fierens.docx
+++ b/Logboek_Dries_Fierens.docx
@@ -78,7 +78,15 @@
       </w:r>
       <w:proofErr w:type="spellEnd"/>
       <w:r>
-        <w:t xml:space="preserve"> web app dat dus meer te maken hebben met web &amp; mobile dus vooral HTML &amp; CSS. We moesten dan ook nog kiezen voor een project idee, waarbij ik koos voor een scanner + pdf converter app</w:t>
+        <w:t xml:space="preserve"> web app dat dus meer te maken hebben met web &amp; mobile dus vooral HTML &amp; CSS. We moesten dan ook nog kiezen voor een project idee, waarbij ik koos voor een scanner + </w:t>
+      </w:r>
+      <w:proofErr w:type="gramStart"/>
+      <w:r>
+        <w:t>pdf converter</w:t>
+      </w:r>
+      <w:proofErr w:type="gramEnd"/>
+      <w:r>
+        <w:t xml:space="preserve"> app</w:t>
       </w:r>
       <w:r>
         <w:t xml:space="preserve"> waarbij het vooral bedoelt is o</w:t>
@@ -99,7 +107,15 @@
         <w:t>.</w:t>
       </w:r>
       <w:r>
-        <w:t xml:space="preserve"> Het was verplicht om 1 hardware component van de gsm te gebruiken dus koos ik natuurlijk voor de camera.</w:t>
+        <w:t xml:space="preserve"> Het was verplicht om 1 </w:t>
+      </w:r>
+      <w:proofErr w:type="gramStart"/>
+      <w:r>
+        <w:t>hardware component</w:t>
+      </w:r>
+      <w:proofErr w:type="gramEnd"/>
+      <w:r>
+        <w:t xml:space="preserve"> van de gsm te gebruiken dus koos ik natuurlijk voor de camera.</w:t>
       </w:r>
       <w:r>
         <w:t xml:space="preserve"> </w:t>
@@ -213,7 +229,15 @@
         <w:t xml:space="preserve">Mijn app idee werd niet goedgekeurd, want de leerkracht raadde het af door problemen die ervan kunnen komen. Ik moest dan vandaag een nieuw idee opstellen. </w:t>
       </w:r>
       <w:r>
-        <w:t>De scanner + pdf converter was duidelijk te moeilijk, maar ik besloot om het idee verder te zetten van een app die notities kan delen. Dus nu moet het gewoon foto’s trekken van de notities. Om nog toe te voegen kan ik ook opmerkingswolkjes toevoegen aan de foto voor bijvoorbeeld een fout</w:t>
+        <w:t xml:space="preserve">De scanner + </w:t>
+      </w:r>
+      <w:proofErr w:type="gramStart"/>
+      <w:r>
+        <w:t>pdf converter</w:t>
+      </w:r>
+      <w:proofErr w:type="gramEnd"/>
+      <w:r>
+        <w:t xml:space="preserve"> was duidelijk te moeilijk, maar ik besloot om het idee verder te zetten van een app die notities kan delen. Dus nu moet het gewoon foto’s trekken van de notities. Om nog toe te voegen kan ik ook opmerkingswolkjes toevoegen aan de foto voor bijvoorbeeld een fout</w:t>
       </w:r>
       <w:r>
         <w:t xml:space="preserve"> aan te duiden</w:t>
@@ -263,7 +287,15 @@
       </w:r>
       <w:proofErr w:type="spellEnd"/>
       <w:r>
-        <w:t xml:space="preserve"> les waarbij we dus informatie kunnen delen met medeleerlingen. Al was het de eerste les dus kwam daar niet veel van. Ik begon gewoon verder aan mijn </w:t>
+        <w:t xml:space="preserve"> les waarbij we dus informatie kunnen delen met medeleerlingen. Al was het de eerste les dus kwam daar niet veel van. Ik begon gewoon </w:t>
+      </w:r>
+      <w:proofErr w:type="gramStart"/>
+      <w:r>
+        <w:t>verder</w:t>
+      </w:r>
+      <w:proofErr w:type="gramEnd"/>
+      <w:r>
+        <w:t xml:space="preserve"> aan mijn </w:t>
       </w:r>
       <w:proofErr w:type="spellStart"/>
       <w:r>
@@ -285,7 +317,15 @@
         <w:t>te veel</w:t>
       </w:r>
       <w:r>
-        <w:t xml:space="preserve"> naar voor moest leunen en dus nek pijn kreeg en er waren precies geen ramen om te openen. </w:t>
+        <w:t xml:space="preserve"> naar voor moest leunen en dus </w:t>
+      </w:r>
+      <w:proofErr w:type="gramStart"/>
+      <w:r>
+        <w:t>nek pijn</w:t>
+      </w:r>
+      <w:proofErr w:type="gramEnd"/>
+      <w:r>
+        <w:t xml:space="preserve"> kreeg en er waren precies geen ramen om te openen. </w:t>
       </w:r>
       <w:r>
         <w:t>Gelukkig kunnen we naar buiten wanneer we het willen.</w:t>
@@ -566,7 +606,15 @@
     </w:p>
     <w:p>
       <w:r>
-        <w:t xml:space="preserve">Tijdens lange downloads heb ik ook mijn google account toegevoegd op </w:t>
+        <w:t xml:space="preserve">Tijdens lange downloads heb ik ook mijn </w:t>
+      </w:r>
+      <w:proofErr w:type="gramStart"/>
+      <w:r>
+        <w:t>google account</w:t>
+      </w:r>
+      <w:proofErr w:type="gramEnd"/>
+      <w:r>
+        <w:t xml:space="preserve"> toegevoegd op </w:t>
       </w:r>
       <w:proofErr w:type="spellStart"/>
       <w:r>
@@ -655,7 +703,15 @@
         <w:t>Ik heb daarna gewoon verder begonnen aan de tutorial die ik vorige week gebruikt had.</w:t>
       </w:r>
       <w:r>
-        <w:t xml:space="preserve"> Hierbij leerde ik meer over hoe ik Android studio beter kon gebruiken om mijn app te </w:t>
+        <w:t xml:space="preserve"> Hierbij leerde ik meer over hoe ik </w:t>
+      </w:r>
+      <w:proofErr w:type="gramStart"/>
+      <w:r>
+        <w:t>Android studio</w:t>
+      </w:r>
+      <w:proofErr w:type="gramEnd"/>
+      <w:r>
+        <w:t xml:space="preserve"> beter kon gebruiken om mijn app te </w:t>
       </w:r>
       <w:proofErr w:type="spellStart"/>
       <w:r>
@@ -678,7 +734,15 @@
         <w:t>)</w:t>
       </w:r>
       <w:r>
-        <w:t xml:space="preserve">. Android studio is zeer gelijkaardig als bijvoorbeeld </w:t>
+        <w:t xml:space="preserve">. </w:t>
+      </w:r>
+      <w:proofErr w:type="gramStart"/>
+      <w:r>
+        <w:t>Android studio</w:t>
+      </w:r>
+      <w:proofErr w:type="gramEnd"/>
+      <w:r>
+        <w:t xml:space="preserve"> is zeer gelijkaardig als bijvoorbeeld </w:t>
       </w:r>
       <w:proofErr w:type="spellStart"/>
       <w:r>
@@ -709,8 +773,13 @@
         <w:t>bekijken</w:t>
       </w:r>
       <w:r>
-        <w:t xml:space="preserve"> in een gekozen browser, maar je kan in Android studio</w:t>
-      </w:r>
+        <w:t xml:space="preserve"> in een gekozen browser, maar je kan in </w:t>
+      </w:r>
+      <w:proofErr w:type="gramStart"/>
+      <w:r>
+        <w:t>Android studio</w:t>
+      </w:r>
+      <w:proofErr w:type="gramEnd"/>
       <w:r>
         <w:t xml:space="preserve"> je app</w:t>
       </w:r>
@@ -826,7 +895,15 @@
       </w:r>
       <w:proofErr w:type="spellEnd"/>
       <w:r>
-        <w:t xml:space="preserve"> design gevolgd in plaats van die van Android studio. Ze leerde me dan hoe ik er mee kon werken maar niet hoe een hele nieuwe app kon maken. Ik kreeg een voorbeeld app om erin te kunnen werken voor de tutorial.</w:t>
+        <w:t xml:space="preserve"> design gevolgd in plaats van die van </w:t>
+      </w:r>
+      <w:proofErr w:type="gramStart"/>
+      <w:r>
+        <w:t>Android studio</w:t>
+      </w:r>
+      <w:proofErr w:type="gramEnd"/>
+      <w:r>
+        <w:t>. Ze leerde me dan hoe ik er mee kon werken maar niet hoe een hele nieuwe app kon maken. Ik kreeg een voorbeeld app om erin te kunnen werken voor de tutorial.</w:t>
       </w:r>
     </w:p>
     <w:p>
@@ -2112,7 +2189,15 @@
         <w:t>Vandaag heb ik eindelijk de login en registratie kunnen afwerken. Dit had veel moeite gekost.</w:t>
       </w:r>
       <w:r>
-        <w:t xml:space="preserve"> Het probleem was dus dat mijn app bleef crashen als ik probeerde te registeren. Ik had veel op stackoverflow gezocht maar ik kon eerst niks vinden, maar toen zag ik dat de wifi van de device emulator op Android studio geen wifi had. Ik dacht eerst dat dit normaal was, maar begon toen twijfels te krijgen. Ik had dan eerst de info op stackoverflow pagina proberen gebruiken, maar dat was niet juist. Uiteindelijk gewoon mijn gsm </w:t>
+        <w:t xml:space="preserve"> Het probleem was dus dat mijn app bleef crashen als ik probeerde te registeren. Ik had veel op stackoverflow gezocht maar ik kon eerst niks vinden, maar toen zag ik dat de wifi van de device emulator op </w:t>
+      </w:r>
+      <w:proofErr w:type="gramStart"/>
+      <w:r>
+        <w:t>Android studio</w:t>
+      </w:r>
+      <w:proofErr w:type="gramEnd"/>
+      <w:r>
+        <w:t xml:space="preserve"> geen wifi had. Ik dacht eerst dat dit normaal was, maar begon toen twijfels te krijgen. Ik had dan eerst de info op stackoverflow pagina proberen gebruiken, maar dat was niet juist. Uiteindelijk gewoon mijn gsm </w:t>
       </w:r>
       <w:proofErr w:type="spellStart"/>
       <w:r>
@@ -2309,7 +2394,23 @@
           <w:rFonts w:eastAsia="Times New Roman" w:cstheme="minorHAnsi"/>
           <w:lang w:eastAsia="nl-BE"/>
         </w:rPr>
-        <w:t xml:space="preserve">-in te laten werken. Dit ging zeer goed, maar het enige probleem is dat de google account niet wordt toegevoegd aan </w:t>
+        <w:t xml:space="preserve">-in te laten werken. Dit ging zeer goed, maar het enige probleem is dat de </w:t>
+      </w:r>
+      <w:proofErr w:type="gramStart"/>
+      <w:r>
+        <w:rPr>
+          <w:rFonts w:eastAsia="Times New Roman" w:cstheme="minorHAnsi"/>
+          <w:lang w:eastAsia="nl-BE"/>
+        </w:rPr>
+        <w:t>google account</w:t>
+      </w:r>
+      <w:proofErr w:type="gramEnd"/>
+      <w:r>
+        <w:rPr>
+          <w:rFonts w:eastAsia="Times New Roman" w:cstheme="minorHAnsi"/>
+          <w:lang w:eastAsia="nl-BE"/>
+        </w:rPr>
+        <w:t xml:space="preserve"> niet wordt toegevoegd aan </w:t>
       </w:r>
       <w:proofErr w:type="spellStart"/>
       <w:r>
@@ -2727,6 +2828,7 @@
         <w:t xml:space="preserve"> was eigenlijk al klaar in een google-</w:t>
       </w:r>
       <w:proofErr w:type="spellStart"/>
+      <w:proofErr w:type="gramStart"/>
       <w:r>
         <w:rPr>
           <w:rFonts w:eastAsia="Times New Roman" w:cstheme="minorHAnsi"/>
@@ -2735,6 +2837,7 @@
         <w:t>services.json</w:t>
       </w:r>
       <w:proofErr w:type="spellEnd"/>
+      <w:proofErr w:type="gramEnd"/>
       <w:r>
         <w:rPr>
           <w:rFonts w:eastAsia="Times New Roman" w:cstheme="minorHAnsi"/>
@@ -2763,7 +2866,23 @@
           <w:rFonts w:eastAsia="Times New Roman" w:cstheme="minorHAnsi"/>
           <w:lang w:eastAsia="nl-BE"/>
         </w:rPr>
-        <w:t xml:space="preserve"> Nu kunnen google accounts succesvol worden toegevoegd.</w:t>
+        <w:t xml:space="preserve"> Nu kunnen </w:t>
+      </w:r>
+      <w:proofErr w:type="gramStart"/>
+      <w:r>
+        <w:rPr>
+          <w:rFonts w:eastAsia="Times New Roman" w:cstheme="minorHAnsi"/>
+          <w:lang w:eastAsia="nl-BE"/>
+        </w:rPr>
+        <w:t>google accounts</w:t>
+      </w:r>
+      <w:proofErr w:type="gramEnd"/>
+      <w:r>
+        <w:rPr>
+          <w:rFonts w:eastAsia="Times New Roman" w:cstheme="minorHAnsi"/>
+          <w:lang w:eastAsia="nl-BE"/>
+        </w:rPr>
+        <w:t xml:space="preserve"> succesvol worden toegevoegd.</w:t>
       </w:r>
       <w:r>
         <w:rPr>
@@ -3050,10 +3169,18 @@
         <w:t xml:space="preserve"> toegevoegd en dan moest ik een Cloud storage bucket aanmaken. Hierbij werd er gevraagd om een locatie te kiezen waarbij Europe-west 1 (= Belgische regio) niet tussen stond, maar gelukkig is er Eur3 die eigenlijk Belgische en Nederlandse regio voorstelt. Dat werd uitgelegd </w:t>
       </w:r>
       <w:r>
-        <w:t>op deze webpagina</w:t>
-      </w:r>
-      <w:r>
-        <w:t>‘s</w:t>
+        <w:t xml:space="preserve">op deze </w:t>
+      </w:r>
+      <w:proofErr w:type="gramStart"/>
+      <w:r>
+        <w:t>webpagina</w:t>
+      </w:r>
+      <w:r>
+        <w:t>‘</w:t>
+      </w:r>
+      <w:proofErr w:type="gramEnd"/>
+      <w:r>
+        <w:t>s</w:t>
       </w:r>
       <w:r>
         <w:t>:</w:t>
@@ -3441,7 +3568,15 @@
       </w:r>
       <w:proofErr w:type="spellEnd"/>
       <w:r>
-        <w:t xml:space="preserve"> oftewel de image inkomt. De map geef ik  het email adres van de gebruiker als naam.</w:t>
+        <w:t xml:space="preserve"> oftewel de image inkomt. De map geef </w:t>
+      </w:r>
+      <w:proofErr w:type="gramStart"/>
+      <w:r>
+        <w:t>ik  het</w:t>
+      </w:r>
+      <w:proofErr w:type="gramEnd"/>
+      <w:r>
+        <w:t xml:space="preserve"> email adres van de gebruiker als naam.</w:t>
       </w:r>
     </w:p>
     <w:p>
@@ -3682,6 +3817,93 @@
       <w:proofErr w:type="spellEnd"/>
       <w:r>
         <w:t xml:space="preserve"> class geeft een gevoel dat ik wel op de goeie weg zit.</w:t>
+      </w:r>
+    </w:p>
+    <w:p/>
+    <w:p>
+      <w:pPr>
+        <w:rPr>
+          <w:b/>
+          <w:bCs/>
+        </w:rPr>
+      </w:pPr>
+      <w:r>
+        <w:rPr>
+          <w:b/>
+          <w:bCs/>
+        </w:rPr>
+        <w:t>09/11/2021:</w:t>
+      </w:r>
+    </w:p>
+    <w:p>
+      <w:r>
+        <w:t xml:space="preserve">Na de </w:t>
+      </w:r>
+      <w:proofErr w:type="spellStart"/>
+      <w:r>
+        <w:t>GridAdapter</w:t>
+      </w:r>
+      <w:proofErr w:type="spellEnd"/>
+      <w:r>
+        <w:t xml:space="preserve"> klasse te controleren ontdekte ik dat ik gewoon het verkeerd image </w:t>
+      </w:r>
+      <w:proofErr w:type="spellStart"/>
+      <w:r>
+        <w:t>Id</w:t>
+      </w:r>
+      <w:proofErr w:type="spellEnd"/>
+      <w:r>
+        <w:t xml:space="preserve"> doorgegeven heb. Dit heeft het probleem onmiddellijk </w:t>
+      </w:r>
+      <w:proofErr w:type="spellStart"/>
+      <w:r>
+        <w:t>gefixed</w:t>
+      </w:r>
+      <w:proofErr w:type="spellEnd"/>
+      <w:r>
+        <w:t xml:space="preserve"> als zijn de voorbeeld images niet echt mooi gepositioneerd.</w:t>
+      </w:r>
+    </w:p>
+    <w:p>
+      <w:r>
+        <w:rPr>
+          <w:noProof/>
+        </w:rPr>
+        <w:drawing>
+          <wp:inline distT="0" distB="0" distL="0" distR="0" wp14:anchorId="4FC8BCE5" wp14:editId="33DD9A1C">
+            <wp:extent cx="1948580" cy="3743325"/>
+            <wp:effectExtent l="0" t="0" r="0" b="0"/>
+            <wp:docPr id="21" name="Afbeelding 21"/>
+            <wp:cNvGraphicFramePr>
+              <a:graphicFrameLocks xmlns:a="http://schemas.openxmlformats.org/drawingml/2006/main" noChangeAspect="1"/>
+            </wp:cNvGraphicFramePr>
+            <a:graphic xmlns:a="http://schemas.openxmlformats.org/drawingml/2006/main">
+              <a:graphicData uri="http://schemas.openxmlformats.org/drawingml/2006/picture">
+                <pic:pic xmlns:pic="http://schemas.openxmlformats.org/drawingml/2006/picture">
+                  <pic:nvPicPr>
+                    <pic:cNvPr id="1" name=""/>
+                    <pic:cNvPicPr/>
+                  </pic:nvPicPr>
+                  <pic:blipFill>
+                    <a:blip r:embed="rId47"/>
+                    <a:stretch>
+                      <a:fillRect/>
+                    </a:stretch>
+                  </pic:blipFill>
+                  <pic:spPr>
+                    <a:xfrm>
+                      <a:off x="0" y="0"/>
+                      <a:ext cx="1950507" cy="3747028"/>
+                    </a:xfrm>
+                    <a:prstGeom prst="rect">
+                      <a:avLst/>
+                    </a:prstGeom>
+                  </pic:spPr>
+                </pic:pic>
+              </a:graphicData>
+            </a:graphic>
+          </wp:inline>
+        </w:drawing>
       </w:r>
     </w:p>
     <w:p/>

</xml_diff>

<commit_message>
Completed layout as stated in the figma prototype design
</commit_message>
<xml_diff>
--- a/Logboek_Dries_Fierens.docx
+++ b/Logboek_Dries_Fierens.docx
@@ -46,47 +46,7 @@
         <w:t>applicatie</w:t>
       </w:r>
       <w:r>
-        <w:t xml:space="preserve"> die je kan maken en welke technologieën je kan gebruiken. Ik heb voor native gekozen want dat past het best bij mijn aftakking “Software </w:t>
-      </w:r>
-      <w:proofErr w:type="spellStart"/>
-      <w:r>
-        <w:t>developer</w:t>
-      </w:r>
-      <w:proofErr w:type="spellEnd"/>
-      <w:r>
-        <w:t xml:space="preserve">” sinds het </w:t>
-      </w:r>
-      <w:proofErr w:type="spellStart"/>
-      <w:r>
-        <w:t>java</w:t>
-      </w:r>
-      <w:proofErr w:type="spellEnd"/>
-      <w:r>
-        <w:t xml:space="preserve"> inhoudt. De anderen zijn </w:t>
-      </w:r>
-      <w:proofErr w:type="spellStart"/>
-      <w:r>
-        <w:t>hybrid</w:t>
-      </w:r>
-      <w:proofErr w:type="spellEnd"/>
-      <w:r>
-        <w:t xml:space="preserve"> en </w:t>
-      </w:r>
-      <w:proofErr w:type="spellStart"/>
-      <w:r>
-        <w:t>progressive</w:t>
-      </w:r>
-      <w:proofErr w:type="spellEnd"/>
-      <w:r>
-        <w:t xml:space="preserve"> web app dat dus meer te maken hebben met web &amp; mobile dus vooral HTML &amp; CSS. We moesten dan ook nog kiezen voor een project idee, waarbij ik koos voor een scanner + </w:t>
-      </w:r>
-      <w:proofErr w:type="gramStart"/>
-      <w:r>
-        <w:t>pdf converter</w:t>
-      </w:r>
-      <w:proofErr w:type="gramEnd"/>
-      <w:r>
-        <w:t xml:space="preserve"> app</w:t>
+        <w:t xml:space="preserve"> die je kan maken en welke technologieën je kan gebruiken. Ik heb voor native gekozen want dat past het best bij mijn aftakking “Software developer” sinds het java inhoudt. De anderen zijn hybrid en progressive web app dat dus meer te maken hebben met web &amp; mobile dus vooral HTML &amp; CSS. We moesten dan ook nog kiezen voor een project idee, waarbij ik koos voor een scanner + pdf converter app</w:t>
       </w:r>
       <w:r>
         <w:t xml:space="preserve"> waarbij het vooral bedoelt is o</w:t>
@@ -107,106 +67,26 @@
         <w:t>.</w:t>
       </w:r>
       <w:r>
-        <w:t xml:space="preserve"> Het was verplicht om 1 </w:t>
-      </w:r>
-      <w:proofErr w:type="gramStart"/>
-      <w:r>
-        <w:t>hardware component</w:t>
-      </w:r>
-      <w:proofErr w:type="gramEnd"/>
-      <w:r>
-        <w:t xml:space="preserve"> van de gsm te gebruiken dus koos ik natuurlijk voor de camera.</w:t>
+        <w:t xml:space="preserve"> Het was verplicht om 1 hardware component van de gsm te gebruiken dus koos ik natuurlijk voor de camera.</w:t>
       </w:r>
       <w:r>
         <w:t xml:space="preserve"> </w:t>
       </w:r>
       <w:r>
-        <w:t xml:space="preserve">Als </w:t>
-      </w:r>
-      <w:proofErr w:type="spellStart"/>
-      <w:r>
-        <w:t>back-end</w:t>
-      </w:r>
-      <w:proofErr w:type="spellEnd"/>
-      <w:r>
-        <w:t xml:space="preserve"> koos ik </w:t>
-      </w:r>
-      <w:proofErr w:type="spellStart"/>
-      <w:r>
-        <w:t>Firebase</w:t>
-      </w:r>
-      <w:proofErr w:type="spellEnd"/>
-      <w:r>
-        <w:t xml:space="preserve"> en als technologie koos ik in </w:t>
-      </w:r>
-      <w:proofErr w:type="spellStart"/>
-      <w:r>
-        <w:t>java</w:t>
-      </w:r>
-      <w:proofErr w:type="spellEnd"/>
-      <w:r>
-        <w:t xml:space="preserve"> te werken om een </w:t>
-      </w:r>
-      <w:proofErr w:type="spellStart"/>
-      <w:r>
-        <w:t>android</w:t>
-      </w:r>
-      <w:proofErr w:type="spellEnd"/>
-      <w:r>
-        <w:t xml:space="preserve"> app te maken in plaats van een IOS app.</w:t>
-      </w:r>
-      <w:r>
-        <w:t xml:space="preserve"> Want ik heb een </w:t>
-      </w:r>
-      <w:proofErr w:type="spellStart"/>
-      <w:r>
-        <w:t>huawei</w:t>
-      </w:r>
-      <w:proofErr w:type="spellEnd"/>
-      <w:r>
-        <w:t>.</w:t>
-      </w:r>
-    </w:p>
-    <w:p>
-      <w:r>
-        <w:t xml:space="preserve">Ik heb dit allemaal grondiger beschreven in mijn “app </w:t>
-      </w:r>
-      <w:proofErr w:type="spellStart"/>
-      <w:r>
-        <w:t>idee”.pdf</w:t>
-      </w:r>
-      <w:proofErr w:type="spellEnd"/>
-      <w:r>
-        <w:t xml:space="preserve">. Dit staat ondertussen op de </w:t>
-      </w:r>
-      <w:proofErr w:type="spellStart"/>
-      <w:r>
-        <w:t>repository</w:t>
-      </w:r>
-      <w:proofErr w:type="spellEnd"/>
-      <w:r>
-        <w:t xml:space="preserve"> die we moesten maken.</w:t>
-      </w:r>
-    </w:p>
-    <w:p>
-      <w:r>
-        <w:t xml:space="preserve">Om af te sluiten had ik al ondertussen een goede naam gevonden gebaseerd op de applicatie genaamd </w:t>
-      </w:r>
-      <w:proofErr w:type="spellStart"/>
-      <w:r>
-        <w:t>Scannable</w:t>
-      </w:r>
-      <w:proofErr w:type="spellEnd"/>
-      <w:r>
-        <w:t xml:space="preserve">. Ik heb dus besloten om mijn applicatie </w:t>
-      </w:r>
-      <w:proofErr w:type="spellStart"/>
-      <w:r>
-        <w:t>Notable</w:t>
-      </w:r>
-      <w:proofErr w:type="spellEnd"/>
-      <w:r>
-        <w:t xml:space="preserve"> te noemen.</w:t>
+        <w:t>Als back-end koos ik Firebase en als technologie koos ik in java te werken om een android app te maken in plaats van een IOS app.</w:t>
+      </w:r>
+      <w:r>
+        <w:t xml:space="preserve"> Want ik heb een huawei.</w:t>
+      </w:r>
+    </w:p>
+    <w:p>
+      <w:r>
+        <w:t>Ik heb dit allemaal grondiger beschreven in mijn “app idee”.pdf. Dit staat ondertussen op de repository die we moesten maken.</w:t>
+      </w:r>
+    </w:p>
+    <w:p>
+      <w:r>
+        <w:t>Om af te sluiten had ik al ondertussen een goede naam gevonden gebaseerd op de applicatie genaamd Scannable. Ik heb dus besloten om mijn applicatie Notable te noemen.</w:t>
       </w:r>
     </w:p>
     <w:p>
@@ -229,15 +109,7 @@
         <w:t xml:space="preserve">Mijn app idee werd niet goedgekeurd, want de leerkracht raadde het af door problemen die ervan kunnen komen. Ik moest dan vandaag een nieuw idee opstellen. </w:t>
       </w:r>
       <w:r>
-        <w:t xml:space="preserve">De scanner + </w:t>
-      </w:r>
-      <w:proofErr w:type="gramStart"/>
-      <w:r>
-        <w:t>pdf converter</w:t>
-      </w:r>
-      <w:proofErr w:type="gramEnd"/>
-      <w:r>
-        <w:t xml:space="preserve"> was duidelijk te moeilijk, maar ik besloot om het idee verder te zetten van een app die notities kan delen. Dus nu moet het gewoon foto’s trekken van de notities. Om nog toe te voegen kan ik ook opmerkingswolkjes toevoegen aan de foto voor bijvoorbeeld een fout</w:t>
+        <w:t>De scanner + pdf converter was duidelijk te moeilijk, maar ik besloot om het idee verder te zetten van een app die notities kan delen. Dus nu moet het gewoon foto’s trekken van de notities. Om nog toe te voegen kan ik ook opmerkingswolkjes toevoegen aan de foto voor bijvoorbeeld een fout</w:t>
       </w:r>
       <w:r>
         <w:t xml:space="preserve"> aan te duiden</w:t>
@@ -248,15 +120,7 @@
     </w:p>
     <w:p>
       <w:r>
-        <w:t xml:space="preserve">Daarna moest ik gewoon begin aan een UI/UX design voor mijn applicatie, waarbij nog niet veel had gedaan omdat les niet meer lang duurde. Ik moest toen ook tegelijkertijd zoeken naar </w:t>
-      </w:r>
-      <w:proofErr w:type="spellStart"/>
-      <w:r>
-        <w:t>tutorials</w:t>
-      </w:r>
-      <w:proofErr w:type="spellEnd"/>
-      <w:r>
-        <w:t xml:space="preserve"> dus </w:t>
+        <w:t xml:space="preserve">Daarna moest ik gewoon begin aan een UI/UX design voor mijn applicatie, waarbij nog niet veel had gedaan omdat les niet meer lang duurde. Ik moest toen ook tegelijkertijd zoeken naar tutorials dus </w:t>
       </w:r>
       <w:r>
         <w:t>duurde dat ook kort.</w:t>
@@ -279,34 +143,13 @@
     </w:p>
     <w:p>
       <w:r>
-        <w:t>Vandaag in de namiddag begonnen we met de co-</w:t>
-      </w:r>
-      <w:proofErr w:type="spellStart"/>
-      <w:r>
-        <w:t>working</w:t>
-      </w:r>
-      <w:proofErr w:type="spellEnd"/>
-      <w:r>
-        <w:t xml:space="preserve"> les waarbij we dus informatie kunnen delen met medeleerlingen. Al was het de eerste les dus kwam daar niet veel van. Ik begon gewoon </w:t>
-      </w:r>
-      <w:proofErr w:type="gramStart"/>
-      <w:r>
-        <w:t>verder</w:t>
-      </w:r>
-      <w:proofErr w:type="gramEnd"/>
-      <w:r>
-        <w:t xml:space="preserve"> aan mijn </w:t>
-      </w:r>
-      <w:proofErr w:type="spellStart"/>
+        <w:t xml:space="preserve">Vandaag in de namiddag begonnen we met de co-working les waarbij we dus informatie kunnen delen met medeleerlingen. Al was het de eerste les dus kwam daar niet veel van. Ik begon gewoon verder aan mijn </w:t>
+      </w:r>
       <w:r>
         <w:t>F</w:t>
       </w:r>
       <w:r>
-        <w:t>igma</w:t>
-      </w:r>
-      <w:proofErr w:type="spellEnd"/>
-      <w:r>
-        <w:t xml:space="preserve"> design.</w:t>
+        <w:t>igma design.</w:t>
       </w:r>
     </w:p>
     <w:p>
@@ -317,15 +160,7 @@
         <w:t>te veel</w:t>
       </w:r>
       <w:r>
-        <w:t xml:space="preserve"> naar voor moest leunen en dus </w:t>
-      </w:r>
-      <w:proofErr w:type="gramStart"/>
-      <w:r>
-        <w:t>nek pijn</w:t>
-      </w:r>
-      <w:proofErr w:type="gramEnd"/>
-      <w:r>
-        <w:t xml:space="preserve"> kreeg en er waren precies geen ramen om te openen. </w:t>
+        <w:t xml:space="preserve"> naar voor moest leunen en dus nek pijn kreeg en er waren precies geen ramen om te openen. </w:t>
       </w:r>
       <w:r>
         <w:t>Gelukkig kunnen we naar buiten wanneer we het willen.</w:t>
@@ -365,23 +200,7 @@
     </w:p>
     <w:p>
       <w:r>
-        <w:t xml:space="preserve">Vandaag heb ik verder gewerkt aan mijn </w:t>
-      </w:r>
-      <w:proofErr w:type="spellStart"/>
-      <w:r>
-        <w:t>Figma</w:t>
-      </w:r>
-      <w:proofErr w:type="spellEnd"/>
-      <w:r>
-        <w:t xml:space="preserve"> design en het ging redelijk vlot vooruit. Ik wou absoluut dat het vandaag af was zodat ik morgen kan werken aan een ander vak. Tijdens het maken van het design heb ik vooral ook zitten op zoeken dat sommige concepten wel haalbaar zijn om te programmeren. Dit is allemaal wel mogelijk, maar zal wel een </w:t>
-      </w:r>
-      <w:proofErr w:type="spellStart"/>
-      <w:r>
-        <w:t>challenge</w:t>
-      </w:r>
-      <w:proofErr w:type="spellEnd"/>
-      <w:r>
-        <w:t xml:space="preserve"> zijn zoals de opmerkingen plaatsen</w:t>
+        <w:t>Vandaag heb ik verder gewerkt aan mijn Figma design en het ging redelijk vlot vooruit. Ik wou absoluut dat het vandaag af was zodat ik morgen kan werken aan een ander vak. Tijdens het maken van het design heb ik vooral ook zitten op zoeken dat sommige concepten wel haalbaar zijn om te programmeren. Dit is allemaal wel mogelijk, maar zal wel een challenge zijn zoals de opmerkingen plaatsen</w:t>
       </w:r>
       <w:r>
         <w:t>. M</w:t>
@@ -493,48 +312,11 @@
     </w:p>
     <w:p>
       <w:r>
-        <w:t xml:space="preserve">Vandaag werd mijn </w:t>
-      </w:r>
-      <w:proofErr w:type="spellStart"/>
-      <w:r>
-        <w:t>figma</w:t>
-      </w:r>
-      <w:proofErr w:type="spellEnd"/>
-      <w:r>
-        <w:t xml:space="preserve"> prototype gecontroleerd waarbij ik moest opnieuw uitleggen wat mijn app doet door middel van accurate presentatie. Ik legde dit vrij duidelijk uit en alles ging goed vooruit. Meneer </w:t>
-      </w:r>
-      <w:proofErr w:type="spellStart"/>
-      <w:r>
-        <w:t>Blancquaert</w:t>
-      </w:r>
-      <w:proofErr w:type="spellEnd"/>
-      <w:r>
-        <w:t xml:space="preserve"> heeft me dan ook nog een </w:t>
-      </w:r>
-      <w:proofErr w:type="spellStart"/>
-      <w:r>
-        <w:t>library</w:t>
-      </w:r>
-      <w:proofErr w:type="spellEnd"/>
-      <w:r>
-        <w:t xml:space="preserve"> genaamd “</w:t>
-      </w:r>
-      <w:proofErr w:type="spellStart"/>
-      <w:r>
-        <w:t>Material</w:t>
-      </w:r>
-      <w:proofErr w:type="spellEnd"/>
-      <w:r>
-        <w:t xml:space="preserve"> design” aangeraden om mijn applicatie te ontwerpen. </w:t>
-      </w:r>
-      <w:r>
-        <w:t xml:space="preserve">Blijkbaar Google gebruikt deze </w:t>
-      </w:r>
-      <w:proofErr w:type="spellStart"/>
-      <w:r>
-        <w:t>library</w:t>
-      </w:r>
-      <w:proofErr w:type="spellEnd"/>
+        <w:t xml:space="preserve">Vandaag werd mijn figma prototype gecontroleerd waarbij ik moest opnieuw uitleggen wat mijn app doet door middel van accurate presentatie. Ik legde dit vrij duidelijk uit en alles ging goed vooruit. Meneer Blancquaert heeft me dan ook nog een library genaamd “Material design” aangeraden om mijn applicatie te ontwerpen. </w:t>
+      </w:r>
+      <w:r>
+        <w:t>Blijkbaar Google gebruikt deze library</w:t>
+      </w:r>
       <w:r>
         <w:t xml:space="preserve"> om hun apps te maken.</w:t>
       </w:r>
@@ -572,23 +354,7 @@
         <w:t xml:space="preserve">kunt maken </w:t>
       </w:r>
       <w:r>
-        <w:t xml:space="preserve">om je app te testen. Als je </w:t>
-      </w:r>
-      <w:proofErr w:type="spellStart"/>
-      <w:r>
-        <w:t>developer</w:t>
-      </w:r>
-      <w:proofErr w:type="spellEnd"/>
-      <w:r>
-        <w:t xml:space="preserve"> modus in de </w:t>
-      </w:r>
-      <w:proofErr w:type="spellStart"/>
-      <w:r>
-        <w:t>settings</w:t>
-      </w:r>
-      <w:proofErr w:type="spellEnd"/>
-      <w:r>
-        <w:t xml:space="preserve"> van je gsm</w:t>
+        <w:t>om je app te testen. Als je developer modus in de settings van je gsm</w:t>
       </w:r>
       <w:r>
         <w:t xml:space="preserve"> aanzet, kan je je gsm verbinden met de pc en dus je applicatie daarop testen.</w:t>
@@ -606,23 +372,7 @@
     </w:p>
     <w:p>
       <w:r>
-        <w:t xml:space="preserve">Tijdens lange downloads heb ik ook mijn </w:t>
-      </w:r>
-      <w:proofErr w:type="gramStart"/>
-      <w:r>
-        <w:t>google account</w:t>
-      </w:r>
-      <w:proofErr w:type="gramEnd"/>
-      <w:r>
-        <w:t xml:space="preserve"> toegevoegd op </w:t>
-      </w:r>
-      <w:proofErr w:type="spellStart"/>
-      <w:r>
-        <w:t>Firebase</w:t>
-      </w:r>
-      <w:proofErr w:type="spellEnd"/>
-      <w:r>
-        <w:t>. Volgens de presentatie die we kregen van een medestudent.</w:t>
+        <w:t>Tijdens lange downloads heb ik ook mijn google account toegevoegd op Firebase. Volgens de presentatie die we kregen van een medestudent.</w:t>
       </w:r>
     </w:p>
     <w:p>
@@ -673,23 +423,7 @@
         <w:t>mijn</w:t>
       </w:r>
       <w:r>
-        <w:t xml:space="preserve"> </w:t>
-      </w:r>
-      <w:proofErr w:type="spellStart"/>
-      <w:r>
-        <w:t>figma</w:t>
-      </w:r>
-      <w:proofErr w:type="spellEnd"/>
-      <w:r>
-        <w:t xml:space="preserve"> design delen met meneer </w:t>
-      </w:r>
-      <w:proofErr w:type="spellStart"/>
-      <w:r>
-        <w:t>Blancquaert</w:t>
-      </w:r>
-      <w:proofErr w:type="spellEnd"/>
-      <w:r>
-        <w:t>, toen hij vroeg dat mijn design klaar was</w:t>
+        <w:t xml:space="preserve"> figma design delen met meneer Blancquaert, toen hij vroeg dat mijn design klaar was</w:t>
       </w:r>
       <w:r>
         <w:t xml:space="preserve"> of niet</w:t>
@@ -703,54 +437,14 @@
         <w:t>Ik heb daarna gewoon verder begonnen aan de tutorial die ik vorige week gebruikt had.</w:t>
       </w:r>
       <w:r>
-        <w:t xml:space="preserve"> Hierbij leerde ik meer over hoe ik </w:t>
-      </w:r>
-      <w:proofErr w:type="gramStart"/>
-      <w:r>
-        <w:t>Android studio</w:t>
-      </w:r>
-      <w:proofErr w:type="gramEnd"/>
-      <w:r>
-        <w:t xml:space="preserve"> beter kon gebruiken om mijn app te </w:t>
-      </w:r>
-      <w:proofErr w:type="spellStart"/>
-      <w:r>
-        <w:t>designen</w:t>
-      </w:r>
-      <w:proofErr w:type="spellEnd"/>
-      <w:r>
-        <w:t xml:space="preserve"> zoals hoe je </w:t>
+        <w:t xml:space="preserve"> Hierbij leerde ik meer over hoe ik Android studio beter kon gebruiken om mijn app te designen zoals hoe je </w:t>
       </w:r>
       <w:r>
         <w:lastRenderedPageBreak/>
-        <w:t xml:space="preserve">attributen kunt aanpassen (bv. </w:t>
-      </w:r>
-      <w:proofErr w:type="spellStart"/>
-      <w:r>
-        <w:t>color</w:t>
-      </w:r>
-      <w:proofErr w:type="spellEnd"/>
-      <w:r>
-        <w:t>)</w:t>
-      </w:r>
-      <w:r>
-        <w:t xml:space="preserve">. </w:t>
-      </w:r>
-      <w:proofErr w:type="gramStart"/>
-      <w:r>
-        <w:t>Android studio</w:t>
-      </w:r>
-      <w:proofErr w:type="gramEnd"/>
-      <w:r>
-        <w:t xml:space="preserve"> is zeer gelijkaardig als bijvoorbeeld </w:t>
-      </w:r>
-      <w:proofErr w:type="spellStart"/>
-      <w:r>
-        <w:t>Webstorm</w:t>
-      </w:r>
-      <w:proofErr w:type="spellEnd"/>
-      <w:r>
-        <w:t xml:space="preserve">, maar bij het design van een mobile app is het zeer </w:t>
+        <w:t>attributen kunt aanpassen (bv. color)</w:t>
+      </w:r>
+      <w:r>
+        <w:t xml:space="preserve">. Android studio is zeer gelijkaardig als bijvoorbeeld Webstorm, maar bij het design van een mobile app is het zeer </w:t>
       </w:r>
       <w:r>
         <w:t>verschillend</w:t>
@@ -759,27 +453,14 @@
         <w:t>.</w:t>
       </w:r>
       <w:r>
-        <w:t xml:space="preserve"> Bij </w:t>
-      </w:r>
-      <w:proofErr w:type="spellStart"/>
-      <w:r>
-        <w:t>Webstorm</w:t>
-      </w:r>
-      <w:proofErr w:type="spellEnd"/>
-      <w:r>
-        <w:t xml:space="preserve"> kan je je website </w:t>
+        <w:t xml:space="preserve"> Bij Webstorm kan je je website </w:t>
       </w:r>
       <w:r>
         <w:t>bekijken</w:t>
       </w:r>
       <w:r>
-        <w:t xml:space="preserve"> in een gekozen browser, maar je kan in </w:t>
-      </w:r>
-      <w:proofErr w:type="gramStart"/>
-      <w:r>
-        <w:t>Android studio</w:t>
-      </w:r>
-      <w:proofErr w:type="gramEnd"/>
+        <w:t xml:space="preserve"> in een gekozen browser, maar je kan in Android studio</w:t>
+      </w:r>
       <w:r>
         <w:t xml:space="preserve"> je app</w:t>
       </w:r>
@@ -799,15 +480,7 @@
         <w:t>.</w:t>
       </w:r>
       <w:r>
-        <w:t xml:space="preserve"> Als ik de </w:t>
-      </w:r>
-      <w:proofErr w:type="spellStart"/>
-      <w:r>
-        <w:t>Jetbrains</w:t>
-      </w:r>
-      <w:proofErr w:type="spellEnd"/>
-      <w:r>
-        <w:t xml:space="preserve"> applicaties vergelijk met Visual studio 2019, </w:t>
+        <w:t xml:space="preserve"> Als ik de Jetbrains applicaties vergelijk met Visual studio 2019, </w:t>
       </w:r>
       <w:r>
         <w:t>heb ik er altijd moeite mee om de lay</w:t>
@@ -887,23 +560,7 @@
     </w:p>
     <w:p>
       <w:r>
-        <w:t xml:space="preserve">Ik heb dan ondertussen de tutorial van </w:t>
-      </w:r>
-      <w:proofErr w:type="spellStart"/>
-      <w:r>
-        <w:t>Material</w:t>
-      </w:r>
-      <w:proofErr w:type="spellEnd"/>
-      <w:r>
-        <w:t xml:space="preserve"> design gevolgd in plaats van die van </w:t>
-      </w:r>
-      <w:proofErr w:type="gramStart"/>
-      <w:r>
-        <w:t>Android studio</w:t>
-      </w:r>
-      <w:proofErr w:type="gramEnd"/>
-      <w:r>
-        <w:t>. Ze leerde me dan hoe ik er mee kon werken maar niet hoe een hele nieuwe app kon maken. Ik kreeg een voorbeeld app om erin te kunnen werken voor de tutorial.</w:t>
+        <w:t>Ik heb dan ondertussen de tutorial van Material design gevolgd in plaats van die van Android studio. Ze leerde me dan hoe ik er mee kon werken maar niet hoe een hele nieuwe app kon maken. Ik kreeg een voorbeeld app om erin te kunnen werken voor de tutorial.</w:t>
       </w:r>
     </w:p>
     <w:p>
@@ -946,34 +603,10 @@
     </w:p>
     <w:p>
       <w:r>
-        <w:t xml:space="preserve">Vandaag heb ik de usertests afgelegd met Louis </w:t>
-      </w:r>
-      <w:proofErr w:type="spellStart"/>
-      <w:r>
-        <w:t>D’hondt</w:t>
-      </w:r>
-      <w:proofErr w:type="spellEnd"/>
-      <w:r>
-        <w:t xml:space="preserve"> en Jasper Wauters. Dit ging heel gemakkelijk en duurde niet lang. Ik had niet echt serieuze opmerkingen, behalve dat ik geen persoonlijke info pagina gemaakt had.</w:t>
-      </w:r>
-      <w:r>
-        <w:t xml:space="preserve"> Daarna heb ik onmiddellijk die opmerkingen van mijn </w:t>
-      </w:r>
-      <w:proofErr w:type="spellStart"/>
-      <w:r>
-        <w:t>figma</w:t>
-      </w:r>
-      <w:proofErr w:type="spellEnd"/>
-      <w:r>
-        <w:t xml:space="preserve"> design verbetert en op mijn </w:t>
-      </w:r>
-      <w:proofErr w:type="spellStart"/>
-      <w:r>
-        <w:t>repository</w:t>
-      </w:r>
-      <w:proofErr w:type="spellEnd"/>
-      <w:r>
-        <w:t xml:space="preserve"> gezet.</w:t>
+        <w:t>Vandaag heb ik de usertests afgelegd met Louis D’hondt en Jasper Wauters. Dit ging heel gemakkelijk en duurde niet lang. Ik had niet echt serieuze opmerkingen, behalve dat ik geen persoonlijke info pagina gemaakt had.</w:t>
+      </w:r>
+      <w:r>
+        <w:t xml:space="preserve"> Daarna heb ik onmiddellijk die opmerkingen van mijn figma design verbetert en op mijn repository gezet.</w:t>
       </w:r>
     </w:p>
     <w:p/>
@@ -996,47 +629,7 @@
     </w:p>
     <w:p>
       <w:r>
-        <w:t xml:space="preserve">Vandaag begon ik eindelijk met </w:t>
-      </w:r>
-      <w:proofErr w:type="spellStart"/>
-      <w:r>
-        <w:t>Material</w:t>
-      </w:r>
-      <w:proofErr w:type="spellEnd"/>
-      <w:r>
-        <w:t xml:space="preserve"> Design. Ik besloot mijn oude app te verwijderen en te vervangen met een empty </w:t>
-      </w:r>
-      <w:proofErr w:type="spellStart"/>
-      <w:r>
-        <w:t>activity</w:t>
-      </w:r>
-      <w:proofErr w:type="spellEnd"/>
-      <w:r>
-        <w:t xml:space="preserve"> zodat ik echt van scratch begin. Zo kan ik alles beter begrijpen. Ik had dan ontdekt dat </w:t>
-      </w:r>
-      <w:proofErr w:type="spellStart"/>
-      <w:r>
-        <w:t>android</w:t>
-      </w:r>
-      <w:proofErr w:type="spellEnd"/>
-      <w:r>
-        <w:t xml:space="preserve"> studio al automatisch </w:t>
-      </w:r>
-      <w:proofErr w:type="spellStart"/>
-      <w:r>
-        <w:t>Material</w:t>
-      </w:r>
-      <w:proofErr w:type="spellEnd"/>
-      <w:r>
-        <w:t xml:space="preserve"> Design van Google had toegevoegd bij de </w:t>
-      </w:r>
-      <w:proofErr w:type="spellStart"/>
-      <w:r>
-        <w:t>dependencies</w:t>
-      </w:r>
-      <w:proofErr w:type="spellEnd"/>
-      <w:r>
-        <w:t xml:space="preserve">, dus eigenlijk ben ik </w:t>
+        <w:t xml:space="preserve">Vandaag begon ik eindelijk met Material Design. Ik besloot mijn oude app te verwijderen en te vervangen met een empty activity zodat ik echt van scratch begin. Zo kan ik alles beter begrijpen. Ik had dan ontdekt dat android studio al automatisch Material Design van Google had toegevoegd bij de dependencies, dus eigenlijk ben ik </w:t>
       </w:r>
       <w:r>
         <w:t>onmiddellijk</w:t>
@@ -1180,50 +773,18 @@
     </w:p>
     <w:p>
       <w:r>
-        <w:t xml:space="preserve">Eerst had ik geprobeerd om gewoon een heel nieuw project te maken die bestond uit een login </w:t>
-      </w:r>
-      <w:proofErr w:type="spellStart"/>
-      <w:r>
-        <w:t>activity</w:t>
-      </w:r>
-      <w:proofErr w:type="spellEnd"/>
-      <w:r>
-        <w:t xml:space="preserve">. Deze </w:t>
-      </w:r>
-      <w:proofErr w:type="spellStart"/>
-      <w:r>
-        <w:t>activity</w:t>
-      </w:r>
-      <w:proofErr w:type="spellEnd"/>
-      <w:r>
-        <w:t xml:space="preserve"> heb ik dan gewoon aangepast naar mijn wens. Maar dit wou ook niet echt werken, want blijkbaar is het best dat je van een </w:t>
-      </w:r>
-      <w:proofErr w:type="spellStart"/>
-      <w:r>
-        <w:t>main</w:t>
+        <w:t>Eerst had ik geprobeerd om gewoon een heel nieuw project te maken die bestond uit een login activity. Deze activity heb ik dan gewoon aangepast naar mijn wens. Maar dit wou ook niet echt werken, want blijkbaar is het best dat je van een main</w:t>
       </w:r>
       <w:r>
         <w:t>_</w:t>
       </w:r>
       <w:r>
-        <w:t>activity</w:t>
-      </w:r>
-      <w:proofErr w:type="spellEnd"/>
-      <w:r>
-        <w:t xml:space="preserve"> start en dan de login page daarmee opent.</w:t>
-      </w:r>
-    </w:p>
-    <w:p>
-      <w:r>
-        <w:t xml:space="preserve">Ik ben dan gewoon terug begonnen aan het oude project en heb dan de error op stack overflow gezocht en daar had ik de oplossing gevonden. Ik moest gewoon mijn “device” zijn data </w:t>
-      </w:r>
-      <w:proofErr w:type="spellStart"/>
-      <w:r>
-        <w:t>wipen</w:t>
-      </w:r>
-      <w:proofErr w:type="spellEnd"/>
-      <w:r>
-        <w:t xml:space="preserve"> en dan kon het opnieuw installeren want mijn oude projecten stond er nog op.</w:t>
+        <w:t>activity start en dan de login page daarmee opent.</w:t>
+      </w:r>
+    </w:p>
+    <w:p>
+      <w:r>
+        <w:t>Ik ben dan gewoon terug begonnen aan het oude project en heb dan de error op stack overflow gezocht en daar had ik de oplossing gevonden. Ik moest gewoon mijn “device” zijn data wipen en dan kon het opnieuw installeren want mijn oude projecten stond er nog op.</w:t>
       </w:r>
     </w:p>
     <w:p>
@@ -1267,23 +828,7 @@
         <w:t>Vandaag wou de wifi niet werken op de campus dus had ik niet veel vooruitgang geboekt.</w:t>
       </w:r>
       <w:r>
-        <w:t xml:space="preserve"> Ik was ook gisteren vergeten om de registratie pagina te </w:t>
-      </w:r>
-      <w:proofErr w:type="spellStart"/>
-      <w:r>
-        <w:t>committen</w:t>
-      </w:r>
-      <w:proofErr w:type="spellEnd"/>
-      <w:r>
-        <w:t xml:space="preserve">, dus da had ik alleszins gedaan door met mijn </w:t>
-      </w:r>
-      <w:proofErr w:type="spellStart"/>
-      <w:r>
-        <w:t>hotspot</w:t>
-      </w:r>
-      <w:proofErr w:type="spellEnd"/>
-      <w:r>
-        <w:t xml:space="preserve"> van mijn gsm te verbinden en de 4G aan te zetten.</w:t>
+        <w:t xml:space="preserve"> Ik was ook gisteren vergeten om de registratie pagina te committen, dus da had ik alleszins gedaan door met mijn hotspot van mijn gsm te verbinden en de 4G aan te zetten.</w:t>
       </w:r>
     </w:p>
     <w:p>
@@ -1315,21 +860,11 @@
         <w:t>Vandaag wou de wifi op school nog steeds niet zo goed werken</w:t>
       </w:r>
       <w:r>
-        <w:t xml:space="preserve">, maar dankzij de wifi </w:t>
-      </w:r>
-      <w:proofErr w:type="spellStart"/>
-      <w:r>
-        <w:t>hotspot</w:t>
-      </w:r>
-      <w:proofErr w:type="spellEnd"/>
-      <w:r>
-        <w:t xml:space="preserve"> heb ik toch nog de navigatie van login naar registratie kunnen </w:t>
-      </w:r>
-      <w:proofErr w:type="spellStart"/>
+        <w:t xml:space="preserve">, maar dankzij de wifi hotspot heb ik toch nog de navigatie van login naar registratie kunnen </w:t>
+      </w:r>
       <w:r>
         <w:t>commiten</w:t>
       </w:r>
-      <w:proofErr w:type="spellEnd"/>
       <w:r>
         <w:t>.</w:t>
       </w:r>
@@ -1339,15 +874,7 @@
     </w:p>
     <w:p>
       <w:r>
-        <w:t xml:space="preserve">De wifi wou uiteindelijk werken dus kon eindelijk heel vlot vooruitgaan. Ik heb daarbij de navigatie tussen de login en registratie kunnen afwerken. Daarna heb ik ook de startpagina bijna afgewerkt, maar de </w:t>
-      </w:r>
-      <w:proofErr w:type="spellStart"/>
-      <w:r>
-        <w:t>bottom</w:t>
-      </w:r>
-      <w:proofErr w:type="spellEnd"/>
-      <w:r>
-        <w:t xml:space="preserve"> bar wou niet helemaal meewerken dus dat laat ik voor later.</w:t>
+        <w:t>De wifi wou uiteindelijk werken dus kon eindelijk heel vlot vooruitgaan. Ik heb daarbij de navigatie tussen de login en registratie kunnen afwerken. Daarna heb ik ook de startpagina bijna afgewerkt, maar de bottom bar wou niet helemaal meewerken dus dat laat ik voor later.</w:t>
       </w:r>
     </w:p>
     <w:p/>
@@ -1368,31 +895,7 @@
     </w:p>
     <w:p>
       <w:r>
-        <w:t xml:space="preserve">Vandaag heb ik de bodem navigatie afgewerkt waarbij je dan naar je groepen kunt gaan oftewel naar je notities die je hebt gefotografeerd. Dit was eerste wel een </w:t>
-      </w:r>
-      <w:proofErr w:type="spellStart"/>
-      <w:r>
-        <w:t>challenge</w:t>
-      </w:r>
-      <w:proofErr w:type="spellEnd"/>
-      <w:r>
-        <w:t xml:space="preserve"> zoals de </w:t>
-      </w:r>
-      <w:proofErr w:type="spellStart"/>
-      <w:r>
-        <w:t>active</w:t>
-      </w:r>
-      <w:proofErr w:type="spellEnd"/>
-      <w:r>
-        <w:t xml:space="preserve"> pagina weergegeven of de juiste </w:t>
-      </w:r>
-      <w:proofErr w:type="spellStart"/>
-      <w:r>
-        <w:t>eventlistener</w:t>
-      </w:r>
-      <w:proofErr w:type="spellEnd"/>
-      <w:r>
-        <w:t xml:space="preserve"> gebruiken om te kunnen navigeren. Maar deze links hebben daarbij geholpen:</w:t>
+        <w:t>Vandaag heb ik de bodem navigatie afgewerkt waarbij je dan naar je groepen kunt gaan oftewel naar je notities die je hebt gefotografeerd. Dit was eerste wel een challenge zoals de active pagina weergegeven of de juiste eventlistener gebruiken om te kunnen navigeren. Maar deze links hebben daarbij geholpen:</w:t>
       </w:r>
     </w:p>
     <w:p>
@@ -1438,29 +941,13 @@
     </w:p>
     <w:p>
       <w:r>
-        <w:t xml:space="preserve">Ik heb dan ook nog voor gezorgd dat mijn </w:t>
-      </w:r>
-      <w:proofErr w:type="spellStart"/>
-      <w:r>
-        <w:t>firebase</w:t>
-      </w:r>
-      <w:proofErr w:type="spellEnd"/>
-      <w:r>
-        <w:t xml:space="preserve"> account verbonden is met</w:t>
+        <w:t>Ik heb dan ook nog voor gezorgd dat mijn firebase account verbonden is met</w:t>
       </w:r>
       <w:r>
         <w:t xml:space="preserve"> mijn</w:t>
       </w:r>
       <w:r>
-        <w:t xml:space="preserve"> </w:t>
-      </w:r>
-      <w:proofErr w:type="spellStart"/>
-      <w:r>
-        <w:t>android</w:t>
-      </w:r>
-      <w:proofErr w:type="spellEnd"/>
-      <w:r>
-        <w:t xml:space="preserve"> studio app.</w:t>
+        <w:t xml:space="preserve"> android studio app.</w:t>
       </w:r>
     </w:p>
     <w:p>
@@ -1617,13 +1104,8 @@
           <w:numId w:val="1"/>
         </w:numPr>
       </w:pPr>
-      <w:proofErr w:type="spellStart"/>
-      <w:r>
-        <w:t>Firebase</w:t>
-      </w:r>
-      <w:proofErr w:type="spellEnd"/>
-      <w:r>
-        <w:t xml:space="preserve"> implementeren</w:t>
+      <w:r>
+        <w:t>Firebase implementeren</w:t>
       </w:r>
     </w:p>
     <w:p>
@@ -1635,13 +1117,8 @@
         </w:numPr>
       </w:pPr>
       <w:r>
-        <w:t xml:space="preserve">Login en registratie mogelijk maken via </w:t>
-      </w:r>
-      <w:proofErr w:type="spellStart"/>
-      <w:r>
-        <w:t>firebase</w:t>
-      </w:r>
-      <w:proofErr w:type="spellEnd"/>
+        <w:t>Login en registratie mogelijk maken via firebase</w:t>
+      </w:r>
     </w:p>
     <w:p>
       <w:pPr>
@@ -1652,11 +1129,7 @@
         </w:numPr>
       </w:pPr>
       <w:r>
-        <w:t xml:space="preserve">Camera functionaliteit bekijken voor </w:t>
-      </w:r>
-      <w:proofErr w:type="spellStart"/>
-      <w:r>
-        <w:t>andr</w:t>
+        <w:t>Camera functionaliteit bekijken voor andr</w:t>
       </w:r>
       <w:r>
         <w:t>oi</w:t>
@@ -1664,7 +1137,6 @@
       <w:r>
         <w:t>d</w:t>
       </w:r>
-      <w:proofErr w:type="spellEnd"/>
     </w:p>
     <w:p/>
     <w:p>
@@ -1684,66 +1156,10 @@
     </w:p>
     <w:p>
       <w:r>
-        <w:t xml:space="preserve">Hier kan je ondertussen zien dat mijn app verbonden is met </w:t>
-      </w:r>
-      <w:proofErr w:type="spellStart"/>
-      <w:r>
-        <w:t>Firebase</w:t>
-      </w:r>
-      <w:proofErr w:type="spellEnd"/>
-      <w:r>
-        <w:t xml:space="preserve">. Nu vragen ze voor google </w:t>
-      </w:r>
-      <w:proofErr w:type="spellStart"/>
-      <w:r>
-        <w:t>sign</w:t>
-      </w:r>
-      <w:proofErr w:type="spellEnd"/>
-      <w:r>
-        <w:t xml:space="preserve">-in om een sha-1 </w:t>
-      </w:r>
-      <w:proofErr w:type="spellStart"/>
-      <w:r>
-        <w:t>fingerprint</w:t>
-      </w:r>
-      <w:proofErr w:type="spellEnd"/>
-      <w:r>
-        <w:t xml:space="preserve"> toe te voegen.</w:t>
-      </w:r>
-      <w:r>
-        <w:t xml:space="preserve"> Ik wou dan google </w:t>
-      </w:r>
-      <w:proofErr w:type="spellStart"/>
-      <w:r>
-        <w:t>play</w:t>
-      </w:r>
-      <w:proofErr w:type="spellEnd"/>
-      <w:r>
-        <w:t xml:space="preserve"> </w:t>
-      </w:r>
-      <w:proofErr w:type="spellStart"/>
-      <w:r>
-        <w:t>signing</w:t>
-      </w:r>
-      <w:proofErr w:type="spellEnd"/>
-      <w:r>
-        <w:t xml:space="preserve"> pakken om het te genereren </w:t>
-      </w:r>
-      <w:proofErr w:type="spellStart"/>
-      <w:r>
-        <w:t>ipv</w:t>
-      </w:r>
-      <w:proofErr w:type="spellEnd"/>
-      <w:r>
-        <w:t xml:space="preserve"> </w:t>
-      </w:r>
-      <w:proofErr w:type="spellStart"/>
-      <w:r>
-        <w:t>self-signing</w:t>
-      </w:r>
-      <w:proofErr w:type="spellEnd"/>
-      <w:r>
-        <w:t xml:space="preserve">, maar ik moet dan 25 euro eerst betalen voor een </w:t>
+        <w:t>Hier kan je ondertussen zien dat mijn app verbonden is met Firebase. Nu vragen ze voor google sign-in om een sha-1 fingerprint toe te voegen.</w:t>
+      </w:r>
+      <w:r>
+        <w:t xml:space="preserve"> Ik wou dan google play signing pakken om het te genereren ipv self-signing, maar ik moet dan 25 euro eerst betalen voor een </w:t>
       </w:r>
       <w:r>
         <w:t>ontwikkelaar</w:t>
@@ -1814,75 +1230,14 @@
       <w:r>
         <w:t>Als ik wat meer naar onderging bij de “</w:t>
       </w:r>
-      <w:proofErr w:type="spellStart"/>
-      <w:r>
-        <w:t>Authenticating</w:t>
-      </w:r>
-      <w:proofErr w:type="spellEnd"/>
-      <w:r>
-        <w:t xml:space="preserve"> </w:t>
-      </w:r>
-      <w:proofErr w:type="spellStart"/>
-      <w:r>
-        <w:t>Your</w:t>
-      </w:r>
-      <w:proofErr w:type="spellEnd"/>
-      <w:r>
-        <w:t xml:space="preserve"> Client</w:t>
-      </w:r>
-      <w:r>
-        <w:t xml:space="preserve">” pagina (zie link) kan je ook via de terminal van </w:t>
-      </w:r>
-      <w:proofErr w:type="spellStart"/>
-      <w:r>
-        <w:t>android</w:t>
-      </w:r>
-      <w:proofErr w:type="spellEnd"/>
-      <w:r>
-        <w:t xml:space="preserve"> studio een </w:t>
-      </w:r>
-      <w:proofErr w:type="spellStart"/>
-      <w:r>
-        <w:t>command</w:t>
-      </w:r>
-      <w:proofErr w:type="spellEnd"/>
-      <w:r>
-        <w:t xml:space="preserve"> invoeren om de sha-1 </w:t>
-      </w:r>
-      <w:proofErr w:type="spellStart"/>
-      <w:r>
-        <w:t>fingerprint</w:t>
-      </w:r>
-      <w:proofErr w:type="spellEnd"/>
-      <w:r>
-        <w:t xml:space="preserve"> te krijgen. Hierbij moest je “</w:t>
-      </w:r>
-      <w:proofErr w:type="spellStart"/>
-      <w:r>
-        <w:t>gradle</w:t>
-      </w:r>
-      <w:proofErr w:type="spellEnd"/>
-      <w:r>
-        <w:t xml:space="preserve"> </w:t>
-      </w:r>
-      <w:proofErr w:type="spellStart"/>
-      <w:r>
-        <w:t>sigingReport</w:t>
-      </w:r>
-      <w:proofErr w:type="spellEnd"/>
-      <w:r>
-        <w:t>” invoeren en dan ctrl + enter invoeren!!</w:t>
-      </w:r>
-      <w:r>
-        <w:t xml:space="preserve"> Deze heb ik dan toegevoegd aan </w:t>
-      </w:r>
-      <w:proofErr w:type="spellStart"/>
-      <w:r>
-        <w:t>Firebase</w:t>
-      </w:r>
-      <w:proofErr w:type="spellEnd"/>
-      <w:r>
-        <w:t>.</w:t>
+      <w:r>
+        <w:t>Authenticating Your Client</w:t>
+      </w:r>
+      <w:r>
+        <w:t>” pagina (zie link) kan je ook via de terminal van android studio een command invoeren om de sha-1 fingerprint te krijgen. Hierbij moest je “gradle sigingReport” invoeren en dan ctrl + enter invoeren!!</w:t>
+      </w:r>
+      <w:r>
+        <w:t xml:space="preserve"> Deze heb ik dan toegevoegd aan Firebase.</w:t>
       </w:r>
     </w:p>
     <w:p>
@@ -1930,15 +1285,7 @@
     </w:p>
     <w:p>
       <w:r>
-        <w:t xml:space="preserve">Daarna moest ik een </w:t>
-      </w:r>
-      <w:proofErr w:type="spellStart"/>
-      <w:r>
-        <w:t>Oauth</w:t>
-      </w:r>
-      <w:proofErr w:type="spellEnd"/>
-      <w:r>
-        <w:t xml:space="preserve"> 2.0 client ID toevoegen voor het inloggen. Hierbij moest ik een hele configuratie begaan.</w:t>
+        <w:t>Daarna moest ik een Oauth 2.0 client ID toevoegen voor het inloggen. Hierbij moest ik een hele configuratie begaan.</w:t>
       </w:r>
       <w:r>
         <w:t xml:space="preserve"> Ik heb hierbij het meest niet ingevuld zoals een privacy policy, enzoverder.</w:t>
@@ -2119,31 +1466,7 @@
     </w:p>
     <w:p>
       <w:r>
-        <w:t xml:space="preserve">Vandaag had ik tijdens les (in de morgen van 8u15-11u15) verder gewerkt aan de </w:t>
-      </w:r>
-      <w:proofErr w:type="spellStart"/>
-      <w:r>
-        <w:t>back-end</w:t>
-      </w:r>
-      <w:proofErr w:type="spellEnd"/>
-      <w:r>
-        <w:t xml:space="preserve"> van mijn app. Ik was gisteren bezig met google </w:t>
-      </w:r>
-      <w:proofErr w:type="spellStart"/>
-      <w:r>
-        <w:t>sign</w:t>
-      </w:r>
-      <w:proofErr w:type="spellEnd"/>
-      <w:r>
-        <w:t xml:space="preserve">-in, maar ik besloot om eerst normale email/password </w:t>
-      </w:r>
-      <w:proofErr w:type="spellStart"/>
-      <w:r>
-        <w:t>authentication</w:t>
-      </w:r>
-      <w:proofErr w:type="spellEnd"/>
-      <w:r>
-        <w:t xml:space="preserve"> toe te voegen. Dit ging vrij vlot vooruit maar toen ik de button klikt sloot de app af, dus dat moet ik nog oplossen. </w:t>
+        <w:t xml:space="preserve">Vandaag had ik tijdens les (in de morgen van 8u15-11u15) verder gewerkt aan de back-end van mijn app. Ik was gisteren bezig met google sign-in, maar ik besloot om eerst normale email/password authentication toe te voegen. Dit ging vrij vlot vooruit maar toen ik de button klikt sloot de app af, dus dat moet ik nog oplossen. </w:t>
       </w:r>
       <w:r>
         <w:t>Er werd</w:t>
@@ -2189,34 +1512,10 @@
         <w:t>Vandaag heb ik eindelijk de login en registratie kunnen afwerken. Dit had veel moeite gekost.</w:t>
       </w:r>
       <w:r>
-        <w:t xml:space="preserve"> Het probleem was dus dat mijn app bleef crashen als ik probeerde te registeren. Ik had veel op stackoverflow gezocht maar ik kon eerst niks vinden, maar toen zag ik dat de wifi van de device emulator op </w:t>
-      </w:r>
-      <w:proofErr w:type="gramStart"/>
-      <w:r>
-        <w:t>Android studio</w:t>
-      </w:r>
-      <w:proofErr w:type="gramEnd"/>
-      <w:r>
-        <w:t xml:space="preserve"> geen wifi had. Ik dacht eerst dat dit normaal was, maar begon toen twijfels te krijgen. Ik had dan eerst de info op stackoverflow pagina proberen gebruiken, maar dat was niet juist. Uiteindelijk gewoon mijn gsm </w:t>
-      </w:r>
-      <w:proofErr w:type="spellStart"/>
-      <w:r>
-        <w:t>hotspot</w:t>
-      </w:r>
-      <w:proofErr w:type="spellEnd"/>
-      <w:r>
-        <w:t xml:space="preserve"> 4G gebruiken werkte wel.</w:t>
-      </w:r>
-      <w:r>
-        <w:t xml:space="preserve"> Mijn app crasht dan nog steeds bij registratie maar ik kon wel inloggen door een test account aan te maken op </w:t>
-      </w:r>
-      <w:proofErr w:type="spellStart"/>
-      <w:r>
-        <w:t>Firebase</w:t>
-      </w:r>
-      <w:proofErr w:type="spellEnd"/>
-      <w:r>
-        <w:t>. Dus mijn code werkte, maar toen ik zag dat ik niet gekeken had naar de error van die verscheen na de crash en dat maakte alles duidelijk</w:t>
+        <w:t xml:space="preserve"> Het probleem was dus dat mijn app bleef crashen als ik probeerde te registeren. Ik had veel op stackoverflow gezocht maar ik kon eerst niks vinden, maar toen zag ik dat de wifi van de device emulator op Android studio geen wifi had. Ik dacht eerst dat dit normaal was, maar begon toen twijfels te krijgen. Ik had dan eerst de info op stackoverflow pagina proberen gebruiken, maar dat was niet juist. Uiteindelijk gewoon mijn gsm hotspot 4G gebruiken werkte wel.</w:t>
+      </w:r>
+      <w:r>
+        <w:t xml:space="preserve"> Mijn app crasht dan nog steeds bij registratie maar ik kon wel inloggen door een test account aan te maken op Firebase. Dus mijn code werkte, maar toen ik zag dat ik niet gekeken had naar de error van die verscheen na de crash en dat maakte alles duidelijk</w:t>
       </w:r>
       <w:r>
         <w:t xml:space="preserve"> voor mij</w:t>
@@ -2378,161 +1677,56 @@
           <w:rFonts w:eastAsia="Times New Roman" w:cstheme="minorHAnsi"/>
           <w:lang w:eastAsia="nl-BE"/>
         </w:rPr>
-        <w:t xml:space="preserve">Vandaag heb ik geprobeerd om google </w:t>
-      </w:r>
-      <w:proofErr w:type="spellStart"/>
+        <w:t>Vandaag heb ik geprobeerd om google sign-in te laten werken. Dit ging zeer goed, maar het enige probleem is dat de google account niet wordt toegevoegd aan Firebase en het wil daarna niet naar de volgende pagina gaan als ik de google sign</w:t>
+      </w:r>
       <w:r>
         <w:rPr>
           <w:rFonts w:eastAsia="Times New Roman" w:cstheme="minorHAnsi"/>
           <w:lang w:eastAsia="nl-BE"/>
         </w:rPr>
-        <w:t>sign</w:t>
-      </w:r>
-      <w:proofErr w:type="spellEnd"/>
+        <w:t>-</w:t>
+      </w:r>
       <w:r>
         <w:rPr>
           <w:rFonts w:eastAsia="Times New Roman" w:cstheme="minorHAnsi"/>
           <w:lang w:eastAsia="nl-BE"/>
         </w:rPr>
-        <w:t xml:space="preserve">-in te laten werken. Dit ging zeer goed, maar het enige probleem is dat de </w:t>
-      </w:r>
-      <w:proofErr w:type="gramStart"/>
+        <w:t>in button klik. Het sign-in scherm verschijnt wel en hebben geen errors, maar daarna gebeurt er niks. Ik heb de methode toegevoegd die iemand van teams zei dat die het probleem</w:t>
+      </w:r>
       <w:r>
         <w:rPr>
           <w:rFonts w:eastAsia="Times New Roman" w:cstheme="minorHAnsi"/>
           <w:lang w:eastAsia="nl-BE"/>
         </w:rPr>
-        <w:t>google account</w:t>
-      </w:r>
-      <w:proofErr w:type="gramEnd"/>
+        <w:t xml:space="preserve"> zou</w:t>
+      </w:r>
       <w:r>
         <w:rPr>
           <w:rFonts w:eastAsia="Times New Roman" w:cstheme="minorHAnsi"/>
           <w:lang w:eastAsia="nl-BE"/>
         </w:rPr>
-        <w:t xml:space="preserve"> niet wordt toegevoegd aan </w:t>
-      </w:r>
-      <w:proofErr w:type="spellStart"/>
+        <w:t xml:space="preserve"> oplos</w:t>
+      </w:r>
       <w:r>
         <w:rPr>
           <w:rFonts w:eastAsia="Times New Roman" w:cstheme="minorHAnsi"/>
           <w:lang w:eastAsia="nl-BE"/>
         </w:rPr>
-        <w:t>Firebase</w:t>
-      </w:r>
-      <w:proofErr w:type="spellEnd"/>
+        <w:t>sen</w:t>
+      </w:r>
       <w:r>
         <w:rPr>
           <w:rFonts w:eastAsia="Times New Roman" w:cstheme="minorHAnsi"/>
           <w:lang w:eastAsia="nl-BE"/>
         </w:rPr>
-        <w:t xml:space="preserve"> en het wil daarna niet naar de volgende pagina gaan als ik de google </w:t>
-      </w:r>
-      <w:proofErr w:type="spellStart"/>
+        <w:t xml:space="preserve"> maar er zal nog ergens een fout zitten.</w:t>
+      </w:r>
       <w:r>
         <w:rPr>
           <w:rFonts w:eastAsia="Times New Roman" w:cstheme="minorHAnsi"/>
           <w:lang w:eastAsia="nl-BE"/>
         </w:rPr>
-        <w:t>sign</w:t>
-      </w:r>
-      <w:proofErr w:type="spellEnd"/>
-      <w:r>
-        <w:rPr>
-          <w:rFonts w:eastAsia="Times New Roman" w:cstheme="minorHAnsi"/>
-          <w:lang w:eastAsia="nl-BE"/>
-        </w:rPr>
-        <w:t>-</w:t>
-      </w:r>
-      <w:r>
-        <w:rPr>
-          <w:rFonts w:eastAsia="Times New Roman" w:cstheme="minorHAnsi"/>
-          <w:lang w:eastAsia="nl-BE"/>
-        </w:rPr>
-        <w:t xml:space="preserve">in button klik. Het </w:t>
-      </w:r>
-      <w:proofErr w:type="spellStart"/>
-      <w:r>
-        <w:rPr>
-          <w:rFonts w:eastAsia="Times New Roman" w:cstheme="minorHAnsi"/>
-          <w:lang w:eastAsia="nl-BE"/>
-        </w:rPr>
-        <w:t>sign</w:t>
-      </w:r>
-      <w:proofErr w:type="spellEnd"/>
-      <w:r>
-        <w:rPr>
-          <w:rFonts w:eastAsia="Times New Roman" w:cstheme="minorHAnsi"/>
-          <w:lang w:eastAsia="nl-BE"/>
-        </w:rPr>
-        <w:t xml:space="preserve">-in scherm verschijnt wel en hebben geen </w:t>
-      </w:r>
-      <w:proofErr w:type="spellStart"/>
-      <w:r>
-        <w:rPr>
-          <w:rFonts w:eastAsia="Times New Roman" w:cstheme="minorHAnsi"/>
-          <w:lang w:eastAsia="nl-BE"/>
-        </w:rPr>
-        <w:t>errors</w:t>
-      </w:r>
-      <w:proofErr w:type="spellEnd"/>
-      <w:r>
-        <w:rPr>
-          <w:rFonts w:eastAsia="Times New Roman" w:cstheme="minorHAnsi"/>
-          <w:lang w:eastAsia="nl-BE"/>
-        </w:rPr>
-        <w:t>, maar daarna gebeurt er niks. Ik heb de methode toegevoegd die iemand van teams zei dat die het probleem</w:t>
-      </w:r>
-      <w:r>
-        <w:rPr>
-          <w:rFonts w:eastAsia="Times New Roman" w:cstheme="minorHAnsi"/>
-          <w:lang w:eastAsia="nl-BE"/>
-        </w:rPr>
-        <w:t xml:space="preserve"> zou</w:t>
-      </w:r>
-      <w:r>
-        <w:rPr>
-          <w:rFonts w:eastAsia="Times New Roman" w:cstheme="minorHAnsi"/>
-          <w:lang w:eastAsia="nl-BE"/>
-        </w:rPr>
-        <w:t xml:space="preserve"> oplos</w:t>
-      </w:r>
-      <w:r>
-        <w:rPr>
-          <w:rFonts w:eastAsia="Times New Roman" w:cstheme="minorHAnsi"/>
-          <w:lang w:eastAsia="nl-BE"/>
-        </w:rPr>
-        <w:t>sen</w:t>
-      </w:r>
-      <w:r>
-        <w:rPr>
-          <w:rFonts w:eastAsia="Times New Roman" w:cstheme="minorHAnsi"/>
-          <w:lang w:eastAsia="nl-BE"/>
-        </w:rPr>
-        <w:t xml:space="preserve"> maar er zal nog ergens een fout zitten.</w:t>
-      </w:r>
-      <w:r>
-        <w:rPr>
-          <w:rFonts w:eastAsia="Times New Roman" w:cstheme="minorHAnsi"/>
-          <w:lang w:eastAsia="nl-BE"/>
-        </w:rPr>
-        <w:t xml:space="preserve"> 1 van de methodes was wel </w:t>
-      </w:r>
-      <w:proofErr w:type="spellStart"/>
-      <w:r>
-        <w:rPr>
-          <w:rFonts w:eastAsia="Times New Roman" w:cstheme="minorHAnsi"/>
-          <w:lang w:eastAsia="nl-BE"/>
-        </w:rPr>
-        <w:t>deprecated</w:t>
-      </w:r>
-      <w:proofErr w:type="spellEnd"/>
-      <w:r>
-        <w:rPr>
-          <w:rFonts w:eastAsia="Times New Roman" w:cstheme="minorHAnsi"/>
-          <w:lang w:eastAsia="nl-BE"/>
-        </w:rPr>
-        <w:t xml:space="preserve">, maar die had </w:t>
+        <w:t xml:space="preserve"> 1 van de methodes was wel deprecated, maar die had </w:t>
       </w:r>
       <w:r>
         <w:rPr>
@@ -2697,192 +1891,14 @@
           <w:rFonts w:eastAsia="Times New Roman" w:cstheme="minorHAnsi"/>
           <w:lang w:eastAsia="nl-BE"/>
         </w:rPr>
-        <w:t xml:space="preserve">Vandaag is het me gelukt om de google </w:t>
-      </w:r>
-      <w:proofErr w:type="spellStart"/>
+        <w:t>Vandaag is het me gelukt om de google sign-in te laten werken. Ik had veel opzoek werk gedaan op google maar kon niks duidelijk vinden. Ik had mijn code ook gedebugd, maar geen duidelijk error werd weergegeven. Uiteindelijk besloot ik opzoek te gaan naar een tutorial die recent was in 2021. Deze tutorial heb ik dan gebruikt om mijn project strict te controleren en toen realiseerde ik dat de SHA-1 niet op de juiste plaats stond. Ik had op google cloud een Oauth 2.0 client id moeten aanmaken toen ik de android studio firebase tutorial volgde, maar dat bleek dus helemaal fout te zijn, want de echte client_id was eigenlijk al klaar in een google-services.json file. Ik moest toen ook mijn SHA-1 fingerprint verwijderen bij de onderstaande afbeelding, maar dat mocht daar eigenlijk blijven staan.</w:t>
+      </w:r>
       <w:r>
         <w:rPr>
           <w:rFonts w:eastAsia="Times New Roman" w:cstheme="minorHAnsi"/>
           <w:lang w:eastAsia="nl-BE"/>
         </w:rPr>
-        <w:t>sign</w:t>
-      </w:r>
-      <w:proofErr w:type="spellEnd"/>
-      <w:r>
-        <w:rPr>
-          <w:rFonts w:eastAsia="Times New Roman" w:cstheme="minorHAnsi"/>
-          <w:lang w:eastAsia="nl-BE"/>
-        </w:rPr>
-        <w:t xml:space="preserve">-in te laten werken. Ik had veel opzoek werk gedaan op google maar kon niks duidelijk vinden. Ik had mijn code ook gedebugd, maar geen duidelijk error werd weergegeven. Uiteindelijk besloot ik opzoek te gaan naar een tutorial die recent was in 2021. Deze tutorial heb ik dan gebruikt om mijn project </w:t>
-      </w:r>
-      <w:proofErr w:type="spellStart"/>
-      <w:r>
-        <w:rPr>
-          <w:rFonts w:eastAsia="Times New Roman" w:cstheme="minorHAnsi"/>
-          <w:lang w:eastAsia="nl-BE"/>
-        </w:rPr>
-        <w:t>strict</w:t>
-      </w:r>
-      <w:proofErr w:type="spellEnd"/>
-      <w:r>
-        <w:rPr>
-          <w:rFonts w:eastAsia="Times New Roman" w:cstheme="minorHAnsi"/>
-          <w:lang w:eastAsia="nl-BE"/>
-        </w:rPr>
-        <w:t xml:space="preserve"> te controleren en toen realiseerde ik dat de SHA-1 niet op de juiste plaats stond. Ik had op google </w:t>
-      </w:r>
-      <w:proofErr w:type="spellStart"/>
-      <w:r>
-        <w:rPr>
-          <w:rFonts w:eastAsia="Times New Roman" w:cstheme="minorHAnsi"/>
-          <w:lang w:eastAsia="nl-BE"/>
-        </w:rPr>
-        <w:t>cloud</w:t>
-      </w:r>
-      <w:proofErr w:type="spellEnd"/>
-      <w:r>
-        <w:rPr>
-          <w:rFonts w:eastAsia="Times New Roman" w:cstheme="minorHAnsi"/>
-          <w:lang w:eastAsia="nl-BE"/>
-        </w:rPr>
-        <w:t xml:space="preserve"> een </w:t>
-      </w:r>
-      <w:proofErr w:type="spellStart"/>
-      <w:r>
-        <w:rPr>
-          <w:rFonts w:eastAsia="Times New Roman" w:cstheme="minorHAnsi"/>
-          <w:lang w:eastAsia="nl-BE"/>
-        </w:rPr>
-        <w:t>Oauth</w:t>
-      </w:r>
-      <w:proofErr w:type="spellEnd"/>
-      <w:r>
-        <w:rPr>
-          <w:rFonts w:eastAsia="Times New Roman" w:cstheme="minorHAnsi"/>
-          <w:lang w:eastAsia="nl-BE"/>
-        </w:rPr>
-        <w:t xml:space="preserve"> 2.0 client </w:t>
-      </w:r>
-      <w:proofErr w:type="spellStart"/>
-      <w:r>
-        <w:rPr>
-          <w:rFonts w:eastAsia="Times New Roman" w:cstheme="minorHAnsi"/>
-          <w:lang w:eastAsia="nl-BE"/>
-        </w:rPr>
-        <w:t>id</w:t>
-      </w:r>
-      <w:proofErr w:type="spellEnd"/>
-      <w:r>
-        <w:rPr>
-          <w:rFonts w:eastAsia="Times New Roman" w:cstheme="minorHAnsi"/>
-          <w:lang w:eastAsia="nl-BE"/>
-        </w:rPr>
-        <w:t xml:space="preserve"> moeten aanmaken toen ik de </w:t>
-      </w:r>
-      <w:proofErr w:type="spellStart"/>
-      <w:r>
-        <w:rPr>
-          <w:rFonts w:eastAsia="Times New Roman" w:cstheme="minorHAnsi"/>
-          <w:lang w:eastAsia="nl-BE"/>
-        </w:rPr>
-        <w:t>android</w:t>
-      </w:r>
-      <w:proofErr w:type="spellEnd"/>
-      <w:r>
-        <w:rPr>
-          <w:rFonts w:eastAsia="Times New Roman" w:cstheme="minorHAnsi"/>
-          <w:lang w:eastAsia="nl-BE"/>
-        </w:rPr>
-        <w:t xml:space="preserve"> studio </w:t>
-      </w:r>
-      <w:proofErr w:type="spellStart"/>
-      <w:r>
-        <w:rPr>
-          <w:rFonts w:eastAsia="Times New Roman" w:cstheme="minorHAnsi"/>
-          <w:lang w:eastAsia="nl-BE"/>
-        </w:rPr>
-        <w:t>firebase</w:t>
-      </w:r>
-      <w:proofErr w:type="spellEnd"/>
-      <w:r>
-        <w:rPr>
-          <w:rFonts w:eastAsia="Times New Roman" w:cstheme="minorHAnsi"/>
-          <w:lang w:eastAsia="nl-BE"/>
-        </w:rPr>
-        <w:t xml:space="preserve"> tutorial volgde, maar dat bleek dus helemaal fout te zijn, want de echte </w:t>
-      </w:r>
-      <w:proofErr w:type="spellStart"/>
-      <w:r>
-        <w:rPr>
-          <w:rFonts w:eastAsia="Times New Roman" w:cstheme="minorHAnsi"/>
-          <w:lang w:eastAsia="nl-BE"/>
-        </w:rPr>
-        <w:t>client_id</w:t>
-      </w:r>
-      <w:proofErr w:type="spellEnd"/>
-      <w:r>
-        <w:rPr>
-          <w:rFonts w:eastAsia="Times New Roman" w:cstheme="minorHAnsi"/>
-          <w:lang w:eastAsia="nl-BE"/>
-        </w:rPr>
-        <w:t xml:space="preserve"> was eigenlijk al klaar in een google-</w:t>
-      </w:r>
-      <w:proofErr w:type="spellStart"/>
-      <w:proofErr w:type="gramStart"/>
-      <w:r>
-        <w:rPr>
-          <w:rFonts w:eastAsia="Times New Roman" w:cstheme="minorHAnsi"/>
-          <w:lang w:eastAsia="nl-BE"/>
-        </w:rPr>
-        <w:t>services.json</w:t>
-      </w:r>
-      <w:proofErr w:type="spellEnd"/>
-      <w:proofErr w:type="gramEnd"/>
-      <w:r>
-        <w:rPr>
-          <w:rFonts w:eastAsia="Times New Roman" w:cstheme="minorHAnsi"/>
-          <w:lang w:eastAsia="nl-BE"/>
-        </w:rPr>
-        <w:t xml:space="preserve"> file. Ik moest toen ook mijn SHA-1 </w:t>
-      </w:r>
-      <w:proofErr w:type="spellStart"/>
-      <w:r>
-        <w:rPr>
-          <w:rFonts w:eastAsia="Times New Roman" w:cstheme="minorHAnsi"/>
-          <w:lang w:eastAsia="nl-BE"/>
-        </w:rPr>
-        <w:t>fingerprint</w:t>
-      </w:r>
-      <w:proofErr w:type="spellEnd"/>
-      <w:r>
-        <w:rPr>
-          <w:rFonts w:eastAsia="Times New Roman" w:cstheme="minorHAnsi"/>
-          <w:lang w:eastAsia="nl-BE"/>
-        </w:rPr>
-        <w:t xml:space="preserve"> verwijderen bij de onderstaande afbeelding, maar dat mocht daar eigenlijk blijven staan.</w:t>
-      </w:r>
-      <w:r>
-        <w:rPr>
-          <w:rFonts w:eastAsia="Times New Roman" w:cstheme="minorHAnsi"/>
-          <w:lang w:eastAsia="nl-BE"/>
-        </w:rPr>
-        <w:t xml:space="preserve"> Nu kunnen </w:t>
-      </w:r>
-      <w:proofErr w:type="gramStart"/>
-      <w:r>
-        <w:rPr>
-          <w:rFonts w:eastAsia="Times New Roman" w:cstheme="minorHAnsi"/>
-          <w:lang w:eastAsia="nl-BE"/>
-        </w:rPr>
-        <w:t>google accounts</w:t>
-      </w:r>
-      <w:proofErr w:type="gramEnd"/>
-      <w:r>
-        <w:rPr>
-          <w:rFonts w:eastAsia="Times New Roman" w:cstheme="minorHAnsi"/>
-          <w:lang w:eastAsia="nl-BE"/>
-        </w:rPr>
-        <w:t xml:space="preserve"> succesvol worden toegevoegd.</w:t>
+        <w:t xml:space="preserve"> Nu kunnen google accounts succesvol worden toegevoegd.</w:t>
       </w:r>
       <w:r>
         <w:rPr>
@@ -3077,15 +2093,7 @@
       </w:pPr>
       <w:r>
         <w:lastRenderedPageBreak/>
-        <w:t xml:space="preserve">Wat ik wil </w:t>
-      </w:r>
-      <w:proofErr w:type="spellStart"/>
-      <w:r>
-        <w:t>realiseen</w:t>
-      </w:r>
-      <w:proofErr w:type="spellEnd"/>
-      <w:r>
-        <w:t xml:space="preserve"> deze week:</w:t>
+        <w:t>Wat ik wil realiseen deze week:</w:t>
       </w:r>
     </w:p>
     <w:p>
@@ -3096,13 +2104,8 @@
           <w:numId w:val="2"/>
         </w:numPr>
       </w:pPr>
-      <w:proofErr w:type="spellStart"/>
-      <w:r>
-        <w:t>Firebase</w:t>
-      </w:r>
-      <w:proofErr w:type="spellEnd"/>
-      <w:r>
-        <w:t xml:space="preserve"> </w:t>
+      <w:r>
+        <w:t xml:space="preserve">Firebase </w:t>
       </w:r>
       <w:r>
         <w:t>storage</w:t>
@@ -3144,43 +2147,19 @@
     </w:p>
     <w:p>
       <w:r>
-        <w:t xml:space="preserve">Vandaag ben ik begonnen met aanmaken van de </w:t>
-      </w:r>
-      <w:proofErr w:type="spellStart"/>
-      <w:r>
-        <w:t>Firebase</w:t>
-      </w:r>
-      <w:proofErr w:type="spellEnd"/>
-      <w:r>
-        <w:t xml:space="preserve"> storage voor het opslaan van afbeeldingen.</w:t>
+        <w:t>Vandaag ben ik begonnen met aanmaken van de Firebase storage voor het opslaan van afbeeldingen.</w:t>
       </w:r>
       <w:r>
         <w:t xml:space="preserve"> </w:t>
       </w:r>
       <w:r>
-        <w:t xml:space="preserve">Ik heb dan de </w:t>
-      </w:r>
-      <w:proofErr w:type="spellStart"/>
-      <w:r>
-        <w:t>dependencies</w:t>
-      </w:r>
-      <w:proofErr w:type="spellEnd"/>
-      <w:r>
-        <w:t xml:space="preserve"> toegevoegd en dan moest ik een Cloud storage bucket aanmaken. Hierbij werd er gevraagd om een locatie te kiezen waarbij Europe-west 1 (= Belgische regio) niet tussen stond, maar gelukkig is er Eur3 die eigenlijk Belgische en Nederlandse regio voorstelt. Dat werd uitgelegd </w:t>
-      </w:r>
-      <w:r>
-        <w:t xml:space="preserve">op deze </w:t>
-      </w:r>
-      <w:proofErr w:type="gramStart"/>
-      <w:r>
-        <w:t>webpagina</w:t>
-      </w:r>
-      <w:r>
-        <w:t>‘</w:t>
-      </w:r>
-      <w:proofErr w:type="gramEnd"/>
-      <w:r>
-        <w:t>s</w:t>
+        <w:t xml:space="preserve">Ik heb dan de dependencies toegevoegd en dan moest ik een Cloud storage bucket aanmaken. Hierbij werd er gevraagd om een locatie te kiezen waarbij Europe-west 1 (= Belgische regio) niet tussen stond, maar gelukkig is er Eur3 die eigenlijk Belgische en Nederlandse regio voorstelt. Dat werd uitgelegd </w:t>
+      </w:r>
+      <w:r>
+        <w:t>op deze webpagina</w:t>
+      </w:r>
+      <w:r>
+        <w:t>‘s</w:t>
       </w:r>
       <w:r>
         <w:t>:</w:t>
@@ -3287,52 +2266,12 @@
     </w:p>
     <w:p>
       <w:r>
-        <w:t xml:space="preserve">Vandaag heb ik de </w:t>
-      </w:r>
-      <w:proofErr w:type="spellStart"/>
-      <w:r>
-        <w:t>java</w:t>
-      </w:r>
-      <w:proofErr w:type="spellEnd"/>
-      <w:r>
-        <w:t xml:space="preserve"> code moet schrijven voor de camera te kunnen gebruiken. Eerst heb ik code toegevoegd dat ervoor zorgt dat de permissies worden aangevraagd om de camera te kunnen gebruiken. Daarna als ik </w:t>
-      </w:r>
-      <w:proofErr w:type="spellStart"/>
-      <w:r>
-        <w:t>allow</w:t>
-      </w:r>
-      <w:proofErr w:type="spellEnd"/>
-      <w:r>
-        <w:t xml:space="preserve"> klik dan opent een test camera zicht van de emulator. </w:t>
-      </w:r>
-    </w:p>
-    <w:p>
-      <w:r>
-        <w:t xml:space="preserve">Hierbij werden gelijkaardig methoden gebruikt zoals de </w:t>
-      </w:r>
-      <w:proofErr w:type="spellStart"/>
-      <w:r>
-        <w:t>firebase</w:t>
-      </w:r>
-      <w:proofErr w:type="spellEnd"/>
-      <w:r>
-        <w:t xml:space="preserve"> </w:t>
-      </w:r>
-      <w:proofErr w:type="spellStart"/>
-      <w:r>
-        <w:t>authentication</w:t>
-      </w:r>
-      <w:proofErr w:type="spellEnd"/>
-      <w:r>
-        <w:t xml:space="preserve">, maar waren ook </w:t>
-      </w:r>
-      <w:proofErr w:type="spellStart"/>
-      <w:r>
-        <w:t>deprecated</w:t>
-      </w:r>
-      <w:proofErr w:type="spellEnd"/>
-      <w:r>
-        <w:t>. Dit heb natuurlijk makkelijk opgelost.</w:t>
+        <w:t xml:space="preserve">Vandaag heb ik de java code moet schrijven voor de camera te kunnen gebruiken. Eerst heb ik code toegevoegd dat ervoor zorgt dat de permissies worden aangevraagd om de camera te kunnen gebruiken. Daarna als ik allow klik dan opent een test camera zicht van de emulator. </w:t>
+      </w:r>
+    </w:p>
+    <w:p>
+      <w:r>
+        <w:t>Hierbij werden gelijkaardig methoden gebruikt zoals de firebase authentication, maar waren ook deprecated. Dit heb natuurlijk makkelijk opgelost.</w:t>
       </w:r>
     </w:p>
     <w:p>
@@ -3406,15 +2345,7 @@
     </w:p>
     <w:p>
       <w:r>
-        <w:t xml:space="preserve">Vandaag heb ik geprobeerd om de image die getrokken wordt op te slaan in </w:t>
-      </w:r>
-      <w:proofErr w:type="spellStart"/>
-      <w:r>
-        <w:t>firebase</w:t>
-      </w:r>
-      <w:proofErr w:type="spellEnd"/>
-      <w:r>
-        <w:t xml:space="preserve"> storage</w:t>
+        <w:t>Vandaag heb ik geprobeerd om de image die getrokken wordt op te slaan in firebase storage</w:t>
       </w:r>
       <w:r>
         <w:t>. Dit is op het einde van de les gelukt.</w:t>
@@ -3468,90 +2399,10 @@
     <w:p>
       <w:r>
         <w:lastRenderedPageBreak/>
-        <w:t xml:space="preserve">Hierbij had ik vooral problemen met de </w:t>
-      </w:r>
-      <w:proofErr w:type="spellStart"/>
-      <w:r>
-        <w:t>uri</w:t>
-      </w:r>
-      <w:proofErr w:type="spellEnd"/>
-      <w:r>
-        <w:t xml:space="preserve"> </w:t>
-      </w:r>
-      <w:proofErr w:type="spellStart"/>
-      <w:r>
-        <w:t>oftewl</w:t>
-      </w:r>
-      <w:proofErr w:type="spellEnd"/>
-      <w:r>
-        <w:t xml:space="preserve"> URL omdat </w:t>
-      </w:r>
-      <w:proofErr w:type="spellStart"/>
-      <w:r>
-        <w:t>firebase</w:t>
-      </w:r>
-      <w:proofErr w:type="spellEnd"/>
-      <w:r>
-        <w:t xml:space="preserve"> die nodig had om te kunnen uploaden. Als je naar de eerste rode streep kijkt is er een methode voor </w:t>
-      </w:r>
-      <w:r>
-        <w:t xml:space="preserve">de </w:t>
-      </w:r>
-      <w:proofErr w:type="spellStart"/>
-      <w:r>
-        <w:t>bitmap</w:t>
-      </w:r>
-      <w:proofErr w:type="spellEnd"/>
-      <w:r>
-        <w:t xml:space="preserve"> die je krijgt van de camera te gebruiken om de </w:t>
-      </w:r>
-      <w:proofErr w:type="spellStart"/>
-      <w:r>
-        <w:t>uri</w:t>
-      </w:r>
-      <w:proofErr w:type="spellEnd"/>
-      <w:r>
-        <w:t xml:space="preserve"> te bepalen. De volgende is voor de bestandextensie te krijgen om een </w:t>
-      </w:r>
-      <w:proofErr w:type="spellStart"/>
-      <w:r>
-        <w:t>filename</w:t>
-      </w:r>
-      <w:proofErr w:type="spellEnd"/>
-      <w:r>
-        <w:t xml:space="preserve"> op te stellen in de </w:t>
-      </w:r>
-      <w:proofErr w:type="spellStart"/>
-      <w:r>
-        <w:t>firebase</w:t>
-      </w:r>
-      <w:proofErr w:type="spellEnd"/>
-      <w:r>
-        <w:t xml:space="preserve"> storage. Hierbij pak ik gewoon het tijdstip met de bestandextensie, maar ik ben misschien van plan om de </w:t>
-      </w:r>
-      <w:proofErr w:type="spellStart"/>
-      <w:r>
-        <w:t>filename</w:t>
-      </w:r>
-      <w:proofErr w:type="spellEnd"/>
-      <w:r>
-        <w:t xml:space="preserve"> te kunnen aanpassen door de gebruiker. De laatste streep zijn twee </w:t>
-      </w:r>
-      <w:proofErr w:type="spellStart"/>
-      <w:r>
-        <w:t>child</w:t>
-      </w:r>
-      <w:proofErr w:type="spellEnd"/>
-      <w:r>
-        <w:t xml:space="preserve"> </w:t>
-      </w:r>
-      <w:proofErr w:type="spellStart"/>
-      <w:r>
-        <w:t>methods</w:t>
-      </w:r>
-      <w:proofErr w:type="spellEnd"/>
-      <w:r>
-        <w:t xml:space="preserve"> waarbij dus de eerste de map voorstelt waar dan de 2</w:t>
+        <w:t xml:space="preserve">Hierbij had ik vooral problemen met de uri oftewl URL omdat firebase die nodig had om te kunnen uploaden. Als je naar de eerste rode streep kijkt is er een methode voor </w:t>
+      </w:r>
+      <w:r>
+        <w:t>de bitmap die je krijgt van de camera te gebruiken om de uri te bepalen. De volgende is voor de bestandextensie te krijgen om een filename op te stellen in de firebase storage. Hierbij pak ik gewoon het tijdstip met de bestandextensie, maar ik ben misschien van plan om de filename te kunnen aanpassen door de gebruiker. De laatste streep zijn twee child methods waarbij dus de eerste de map voorstelt waar dan de 2</w:t>
       </w:r>
       <w:r>
         <w:rPr>
@@ -3560,23 +2411,7 @@
         <w:t>de</w:t>
       </w:r>
       <w:r>
-        <w:t xml:space="preserve"> </w:t>
-      </w:r>
-      <w:proofErr w:type="spellStart"/>
-      <w:r>
-        <w:t>child</w:t>
-      </w:r>
-      <w:proofErr w:type="spellEnd"/>
-      <w:r>
-        <w:t xml:space="preserve"> oftewel de image inkomt. De map geef </w:t>
-      </w:r>
-      <w:proofErr w:type="gramStart"/>
-      <w:r>
-        <w:t>ik  het</w:t>
-      </w:r>
-      <w:proofErr w:type="gramEnd"/>
-      <w:r>
-        <w:t xml:space="preserve"> email adres van de gebruiker als naam.</w:t>
+        <w:t xml:space="preserve"> child oftewel de image inkomt. De map geef ik  het email adres van de gebruiker als naam.</w:t>
       </w:r>
     </w:p>
     <w:p>
@@ -3677,15 +2512,7 @@
         <w:pStyle w:val="Kop3"/>
       </w:pPr>
       <w:r>
-        <w:t xml:space="preserve">Wat ik wil </w:t>
-      </w:r>
-      <w:proofErr w:type="spellStart"/>
-      <w:r>
-        <w:t>realiseen</w:t>
-      </w:r>
-      <w:proofErr w:type="spellEnd"/>
-      <w:r>
-        <w:t xml:space="preserve"> deze week:</w:t>
+        <w:t>Wat ik wil realiseen deze week:</w:t>
       </w:r>
     </w:p>
     <w:p>
@@ -3718,15 +2545,7 @@
         <w:t>je gsm</w:t>
       </w:r>
       <w:r>
-        <w:t xml:space="preserve"> </w:t>
-      </w:r>
-      <w:proofErr w:type="spellStart"/>
-      <w:r>
-        <w:t>gallery</w:t>
-      </w:r>
-      <w:proofErr w:type="spellEnd"/>
-      <w:r>
-        <w:t xml:space="preserve"> gebruiken)</w:t>
+        <w:t xml:space="preserve"> gallery gebruiken)</w:t>
       </w:r>
     </w:p>
     <w:p/>
@@ -3747,23 +2566,7 @@
     </w:p>
     <w:p>
       <w:r>
-        <w:t xml:space="preserve">Vandaag heb ik geprobeerd om een </w:t>
-      </w:r>
-      <w:proofErr w:type="spellStart"/>
-      <w:r>
-        <w:t>gridview</w:t>
-      </w:r>
-      <w:proofErr w:type="spellEnd"/>
-      <w:r>
-        <w:t xml:space="preserve"> toe te voegen die images bevat dat dus lijkt op een image </w:t>
-      </w:r>
-      <w:proofErr w:type="spellStart"/>
-      <w:r>
-        <w:t>gallery</w:t>
-      </w:r>
-      <w:proofErr w:type="spellEnd"/>
-      <w:r>
-        <w:t xml:space="preserve"> zoals uw “foto’s” app. Hierbij heb ik de </w:t>
+        <w:t xml:space="preserve">Vandaag heb ik geprobeerd om een gridview toe te voegen die images bevat dat dus lijkt op een image gallery zoals uw “foto’s” app. Hierbij heb ik de </w:t>
       </w:r>
       <w:r>
         <w:t>volgende</w:t>
@@ -3808,15 +2611,7 @@
     </w:p>
     <w:p>
       <w:r>
-        <w:t xml:space="preserve">Dit heeft nog niet direct resultaat gegeven, maar de </w:t>
-      </w:r>
-      <w:proofErr w:type="spellStart"/>
-      <w:r>
-        <w:t>GridAdapter</w:t>
-      </w:r>
-      <w:proofErr w:type="spellEnd"/>
-      <w:r>
-        <w:t xml:space="preserve"> class geeft een gevoel dat ik wel op de goeie weg zit.</w:t>
+        <w:t>Dit heeft nog niet direct resultaat gegeven, maar de GridAdapter class geeft een gevoel dat ik wel op de goeie weg zit.</w:t>
       </w:r>
     </w:p>
     <w:p/>
@@ -3837,31 +2632,7 @@
     </w:p>
     <w:p>
       <w:r>
-        <w:t xml:space="preserve">Na de </w:t>
-      </w:r>
-      <w:proofErr w:type="spellStart"/>
-      <w:r>
-        <w:t>GridAdapter</w:t>
-      </w:r>
-      <w:proofErr w:type="spellEnd"/>
-      <w:r>
-        <w:t xml:space="preserve"> klasse te controleren ontdekte ik dat ik gewoon het verkeerd image </w:t>
-      </w:r>
-      <w:proofErr w:type="spellStart"/>
-      <w:r>
-        <w:t>Id</w:t>
-      </w:r>
-      <w:proofErr w:type="spellEnd"/>
-      <w:r>
-        <w:t xml:space="preserve"> doorgegeven heb. Dit heeft het probleem onmiddellijk </w:t>
-      </w:r>
-      <w:proofErr w:type="spellStart"/>
-      <w:r>
-        <w:t>gefixed</w:t>
-      </w:r>
-      <w:proofErr w:type="spellEnd"/>
-      <w:r>
-        <w:t xml:space="preserve"> als zijn de voorbeeld images niet echt mooi gepositioneerd.</w:t>
+        <w:t>Na de GridAdapter klasse te controleren ontdekte ik dat ik gewoon het verkeerd image Id doorgegeven heb. Dit heeft het probleem onmiddellijk gefixed als zijn de voorbeeld images niet echt mooi gepositioneerd.</w:t>
       </w:r>
     </w:p>
     <w:p>
@@ -3894,6 +2665,135 @@
                     <a:xfrm>
                       <a:off x="0" y="0"/>
                       <a:ext cx="1950507" cy="3747028"/>
+                    </a:xfrm>
+                    <a:prstGeom prst="rect">
+                      <a:avLst/>
+                    </a:prstGeom>
+                  </pic:spPr>
+                </pic:pic>
+              </a:graphicData>
+            </a:graphic>
+          </wp:inline>
+        </w:drawing>
+      </w:r>
+    </w:p>
+    <w:p/>
+    <w:p>
+      <w:r>
+        <w:t xml:space="preserve">Om dit op te lossen heb ik een </w:t>
+      </w:r>
+      <w:r>
+        <w:t>gedetailleerd</w:t>
+      </w:r>
+      <w:r>
+        <w:t xml:space="preserve"> tutorial gevolgd hoe je met een gridview kan werken:</w:t>
+      </w:r>
+    </w:p>
+    <w:p>
+      <w:hyperlink r:id="rId48" w:history="1">
+        <w:r>
+          <w:rPr>
+            <w:rStyle w:val="Hyperlink"/>
+          </w:rPr>
+          <w:t>https://abhiandroid.com/ui/gridview</w:t>
+        </w:r>
+      </w:hyperlink>
+    </w:p>
+    <w:p>
+      <w:r>
+        <w:t xml:space="preserve">Daarna heb ik er nog voor gezorgd dat de margin top en bottom via java code worden aangepast afhankelijk van de </w:t>
+      </w:r>
+      <w:r>
+        <w:t>hoogte van de header en footer. Dit werdt gedaan in OnCreateView():</w:t>
+      </w:r>
+    </w:p>
+    <w:p>
+      <w:r>
+        <w:rPr>
+          <w:noProof/>
+        </w:rPr>
+        <w:lastRenderedPageBreak/>
+        <w:drawing>
+          <wp:inline distT="0" distB="0" distL="0" distR="0" wp14:anchorId="2F6AC18E" wp14:editId="0D240D22">
+            <wp:extent cx="5760720" cy="2391410"/>
+            <wp:effectExtent l="0" t="0" r="0" b="8890"/>
+            <wp:docPr id="23" name="Afbeelding 23"/>
+            <wp:cNvGraphicFramePr>
+              <a:graphicFrameLocks xmlns:a="http://schemas.openxmlformats.org/drawingml/2006/main" noChangeAspect="1"/>
+            </wp:cNvGraphicFramePr>
+            <a:graphic xmlns:a="http://schemas.openxmlformats.org/drawingml/2006/main">
+              <a:graphicData uri="http://schemas.openxmlformats.org/drawingml/2006/picture">
+                <pic:pic xmlns:pic="http://schemas.openxmlformats.org/drawingml/2006/picture">
+                  <pic:nvPicPr>
+                    <pic:cNvPr id="1" name=""/>
+                    <pic:cNvPicPr/>
+                  </pic:nvPicPr>
+                  <pic:blipFill>
+                    <a:blip r:embed="rId49"/>
+                    <a:stretch>
+                      <a:fillRect/>
+                    </a:stretch>
+                  </pic:blipFill>
+                  <pic:spPr>
+                    <a:xfrm>
+                      <a:off x="0" y="0"/>
+                      <a:ext cx="5760720" cy="2391410"/>
+                    </a:xfrm>
+                    <a:prstGeom prst="rect">
+                      <a:avLst/>
+                    </a:prstGeom>
+                  </pic:spPr>
+                </pic:pic>
+              </a:graphicData>
+            </a:graphic>
+          </wp:inline>
+        </w:drawing>
+      </w:r>
+    </w:p>
+    <w:p>
+      <w:r>
+        <w:t>Ik heb dan de elementen een witte achtergrond gegeven en dan een border rond gedaan dat eigenlijk vrij moeilijk en inefficiënt moet worden opgeroepen in android studio door middel van een &lt;shape&gt; xml file te maken in de res/drawable folder en die een stroke</w:t>
+      </w:r>
+      <w:r>
+        <w:t>, enzoverder</w:t>
+      </w:r>
+      <w:r>
+        <w:t xml:space="preserve"> te geven. Dan wordt deze drawable als achtergrond geplaatst van de imageview.</w:t>
+      </w:r>
+      <w:r>
+        <w:t xml:space="preserve"> De lege elementen zijn gewoon witte icoontjes die dus niet zichtbaar zijn door de witte achtergrond.</w:t>
+      </w:r>
+    </w:p>
+    <w:p>
+      <w:r>
+        <w:rPr>
+          <w:noProof/>
+        </w:rPr>
+        <w:drawing>
+          <wp:inline distT="0" distB="0" distL="0" distR="0" wp14:anchorId="30CAAB90" wp14:editId="213261B0">
+            <wp:extent cx="1896341" cy="3476625"/>
+            <wp:effectExtent l="0" t="0" r="8890" b="0"/>
+            <wp:docPr id="22" name="Afbeelding 22"/>
+            <wp:cNvGraphicFramePr>
+              <a:graphicFrameLocks xmlns:a="http://schemas.openxmlformats.org/drawingml/2006/main" noChangeAspect="1"/>
+            </wp:cNvGraphicFramePr>
+            <a:graphic xmlns:a="http://schemas.openxmlformats.org/drawingml/2006/main">
+              <a:graphicData uri="http://schemas.openxmlformats.org/drawingml/2006/picture">
+                <pic:pic xmlns:pic="http://schemas.openxmlformats.org/drawingml/2006/picture">
+                  <pic:nvPicPr>
+                    <pic:cNvPr id="1" name=""/>
+                    <pic:cNvPicPr/>
+                  </pic:nvPicPr>
+                  <pic:blipFill>
+                    <a:blip r:embed="rId50"/>
+                    <a:stretch>
+                      <a:fillRect/>
+                    </a:stretch>
+                  </pic:blipFill>
+                  <pic:spPr>
+                    <a:xfrm>
+                      <a:off x="0" y="0"/>
+                      <a:ext cx="1900294" cy="3483873"/>
                     </a:xfrm>
                     <a:prstGeom prst="rect">
                       <a:avLst/>

</xml_diff>

<commit_message>
Now all firebase images from user accounts when log-in will be shown
</commit_message>
<xml_diff>
--- a/Logboek_Dries_Fierens.docx
+++ b/Logboek_Dries_Fierens.docx
@@ -2794,6 +2794,66 @@
                     <a:xfrm>
                       <a:off x="0" y="0"/>
                       <a:ext cx="1900294" cy="3483873"/>
+                    </a:xfrm>
+                    <a:prstGeom prst="rect">
+                      <a:avLst/>
+                    </a:prstGeom>
+                  </pic:spPr>
+                </pic:pic>
+              </a:graphicData>
+            </a:graphic>
+          </wp:inline>
+        </w:drawing>
+      </w:r>
+    </w:p>
+    <w:p/>
+    <w:p>
+      <w:r>
+        <w:t>Om te eindigen, moest ik nog de images van firebase toevoegen hierbij heb ik vooral code van stackoverflow gebruikt om mijn oude klassen en methods te verbeteren.</w:t>
+      </w:r>
+    </w:p>
+    <w:p>
+      <w:hyperlink r:id="rId51" w:history="1">
+        <w:r>
+          <w:rPr>
+            <w:rStyle w:val="Hyperlink"/>
+          </w:rPr>
+          <w:t>https://stackoverflow.com/questions/63490176/how-to-display-firebase-storage-images-in-gridview</w:t>
+        </w:r>
+      </w:hyperlink>
+    </w:p>
+    <w:p/>
+    <w:p>
+      <w:r>
+        <w:rPr>
+          <w:noProof/>
+        </w:rPr>
+        <w:lastRenderedPageBreak/>
+        <w:drawing>
+          <wp:inline distT="0" distB="0" distL="0" distR="0" wp14:anchorId="25C78479" wp14:editId="2563B480">
+            <wp:extent cx="3182620" cy="6819900"/>
+            <wp:effectExtent l="0" t="0" r="0" b="0"/>
+            <wp:docPr id="24" name="Afbeelding 24"/>
+            <wp:cNvGraphicFramePr>
+              <a:graphicFrameLocks xmlns:a="http://schemas.openxmlformats.org/drawingml/2006/main" noChangeAspect="1"/>
+            </wp:cNvGraphicFramePr>
+            <a:graphic xmlns:a="http://schemas.openxmlformats.org/drawingml/2006/main">
+              <a:graphicData uri="http://schemas.openxmlformats.org/drawingml/2006/picture">
+                <pic:pic xmlns:pic="http://schemas.openxmlformats.org/drawingml/2006/picture">
+                  <pic:nvPicPr>
+                    <pic:cNvPr id="1" name=""/>
+                    <pic:cNvPicPr/>
+                  </pic:nvPicPr>
+                  <pic:blipFill>
+                    <a:blip r:embed="rId52"/>
+                    <a:stretch>
+                      <a:fillRect/>
+                    </a:stretch>
+                  </pic:blipFill>
+                  <pic:spPr>
+                    <a:xfrm>
+                      <a:off x="0" y="0"/>
+                      <a:ext cx="3182620" cy="6819900"/>
                     </a:xfrm>
                     <a:prstGeom prst="rect">
                       <a:avLst/>

</xml_diff>

<commit_message>
Updated login page logo and app logo
</commit_message>
<xml_diff>
--- a/Logboek_Dries_Fierens.docx
+++ b/Logboek_Dries_Fierens.docx
@@ -46,7 +46,39 @@
         <w:t>applicatie</w:t>
       </w:r>
       <w:r>
-        <w:t xml:space="preserve"> die je kan maken en welke technologieën je kan gebruiken. Ik heb voor native gekozen want dat past het best bij mijn aftakking “Software developer” sinds het java inhoudt. De anderen zijn hybrid en progressive web app dat dus meer te maken hebben met web &amp; mobile dus vooral HTML &amp; CSS. We moesten dan ook nog kiezen voor een project idee, waarbij ik koos voor een scanner + pdf converter app</w:t>
+        <w:t xml:space="preserve"> die je kan maken en welke technologieën je kan gebruiken. Ik heb voor native gekozen want dat past het best bij mijn aftakking “Software </w:t>
+      </w:r>
+      <w:proofErr w:type="spellStart"/>
+      <w:r>
+        <w:t>developer</w:t>
+      </w:r>
+      <w:proofErr w:type="spellEnd"/>
+      <w:r>
+        <w:t xml:space="preserve">” sinds het </w:t>
+      </w:r>
+      <w:proofErr w:type="spellStart"/>
+      <w:r>
+        <w:t>java</w:t>
+      </w:r>
+      <w:proofErr w:type="spellEnd"/>
+      <w:r>
+        <w:t xml:space="preserve"> inhoudt. De anderen zijn </w:t>
+      </w:r>
+      <w:proofErr w:type="spellStart"/>
+      <w:r>
+        <w:t>hybrid</w:t>
+      </w:r>
+      <w:proofErr w:type="spellEnd"/>
+      <w:r>
+        <w:t xml:space="preserve"> en </w:t>
+      </w:r>
+      <w:proofErr w:type="spellStart"/>
+      <w:r>
+        <w:t>progressive</w:t>
+      </w:r>
+      <w:proofErr w:type="spellEnd"/>
+      <w:r>
+        <w:t xml:space="preserve"> web app dat dus meer te maken hebben met web &amp; mobile dus vooral HTML &amp; CSS. We moesten dan ook nog kiezen voor een project idee, waarbij ik koos voor een scanner + pdf converter app</w:t>
       </w:r>
       <w:r>
         <w:t xml:space="preserve"> waarbij het vooral bedoelt is o</w:t>
@@ -73,20 +105,92 @@
         <w:t xml:space="preserve"> </w:t>
       </w:r>
       <w:r>
-        <w:t>Als back-end koos ik Firebase en als technologie koos ik in java te werken om een android app te maken in plaats van een IOS app.</w:t>
-      </w:r>
-      <w:r>
-        <w:t xml:space="preserve"> Want ik heb een huawei.</w:t>
-      </w:r>
-    </w:p>
-    <w:p>
-      <w:r>
-        <w:t>Ik heb dit allemaal grondiger beschreven in mijn “app idee”.pdf. Dit staat ondertussen op de repository die we moesten maken.</w:t>
-      </w:r>
-    </w:p>
-    <w:p>
-      <w:r>
-        <w:t>Om af te sluiten had ik al ondertussen een goede naam gevonden gebaseerd op de applicatie genaamd Scannable. Ik heb dus besloten om mijn applicatie Notable te noemen.</w:t>
+        <w:t xml:space="preserve">Als </w:t>
+      </w:r>
+      <w:proofErr w:type="spellStart"/>
+      <w:r>
+        <w:t>back-end</w:t>
+      </w:r>
+      <w:proofErr w:type="spellEnd"/>
+      <w:r>
+        <w:t xml:space="preserve"> koos ik </w:t>
+      </w:r>
+      <w:proofErr w:type="spellStart"/>
+      <w:r>
+        <w:t>Firebase</w:t>
+      </w:r>
+      <w:proofErr w:type="spellEnd"/>
+      <w:r>
+        <w:t xml:space="preserve"> en als technologie koos ik in </w:t>
+      </w:r>
+      <w:proofErr w:type="spellStart"/>
+      <w:r>
+        <w:t>java</w:t>
+      </w:r>
+      <w:proofErr w:type="spellEnd"/>
+      <w:r>
+        <w:t xml:space="preserve"> te werken om een </w:t>
+      </w:r>
+      <w:proofErr w:type="spellStart"/>
+      <w:r>
+        <w:t>android</w:t>
+      </w:r>
+      <w:proofErr w:type="spellEnd"/>
+      <w:r>
+        <w:t xml:space="preserve"> app te maken in plaats van een IOS app.</w:t>
+      </w:r>
+      <w:r>
+        <w:t xml:space="preserve"> Want ik heb een </w:t>
+      </w:r>
+      <w:proofErr w:type="spellStart"/>
+      <w:r>
+        <w:t>huawei</w:t>
+      </w:r>
+      <w:proofErr w:type="spellEnd"/>
+      <w:r>
+        <w:t>.</w:t>
+      </w:r>
+    </w:p>
+    <w:p>
+      <w:r>
+        <w:t xml:space="preserve">Ik heb dit allemaal grondiger beschreven in mijn “app </w:t>
+      </w:r>
+      <w:proofErr w:type="spellStart"/>
+      <w:r>
+        <w:t>idee”.pdf</w:t>
+      </w:r>
+      <w:proofErr w:type="spellEnd"/>
+      <w:r>
+        <w:t xml:space="preserve">. Dit staat ondertussen op de </w:t>
+      </w:r>
+      <w:proofErr w:type="spellStart"/>
+      <w:r>
+        <w:t>repository</w:t>
+      </w:r>
+      <w:proofErr w:type="spellEnd"/>
+      <w:r>
+        <w:t xml:space="preserve"> die we moesten maken.</w:t>
+      </w:r>
+    </w:p>
+    <w:p>
+      <w:r>
+        <w:t xml:space="preserve">Om af te sluiten had ik al ondertussen een goede naam gevonden gebaseerd op de applicatie genaamd </w:t>
+      </w:r>
+      <w:proofErr w:type="spellStart"/>
+      <w:r>
+        <w:t>Scannable</w:t>
+      </w:r>
+      <w:proofErr w:type="spellEnd"/>
+      <w:r>
+        <w:t xml:space="preserve">. Ik heb dus besloten om mijn applicatie </w:t>
+      </w:r>
+      <w:proofErr w:type="spellStart"/>
+      <w:r>
+        <w:t>Notable</w:t>
+      </w:r>
+      <w:proofErr w:type="spellEnd"/>
+      <w:r>
+        <w:t xml:space="preserve"> te noemen.</w:t>
       </w:r>
     </w:p>
     <w:p>
@@ -120,7 +224,15 @@
     </w:p>
     <w:p>
       <w:r>
-        <w:t xml:space="preserve">Daarna moest ik gewoon begin aan een UI/UX design voor mijn applicatie, waarbij nog niet veel had gedaan omdat les niet meer lang duurde. Ik moest toen ook tegelijkertijd zoeken naar tutorials dus </w:t>
+        <w:t xml:space="preserve">Daarna moest ik gewoon begin aan een UI/UX design voor mijn applicatie, waarbij nog niet veel had gedaan omdat les niet meer lang duurde. Ik moest toen ook tegelijkertijd zoeken naar </w:t>
+      </w:r>
+      <w:proofErr w:type="spellStart"/>
+      <w:r>
+        <w:t>tutorials</w:t>
+      </w:r>
+      <w:proofErr w:type="spellEnd"/>
+      <w:r>
+        <w:t xml:space="preserve"> dus </w:t>
       </w:r>
       <w:r>
         <w:t>duurde dat ook kort.</w:t>
@@ -143,13 +255,26 @@
     </w:p>
     <w:p>
       <w:r>
-        <w:t xml:space="preserve">Vandaag in de namiddag begonnen we met de co-working les waarbij we dus informatie kunnen delen met medeleerlingen. Al was het de eerste les dus kwam daar niet veel van. Ik begon gewoon verder aan mijn </w:t>
-      </w:r>
+        <w:t>Vandaag in de namiddag begonnen we met de co-</w:t>
+      </w:r>
+      <w:proofErr w:type="spellStart"/>
+      <w:r>
+        <w:t>working</w:t>
+      </w:r>
+      <w:proofErr w:type="spellEnd"/>
+      <w:r>
+        <w:t xml:space="preserve"> les waarbij we dus informatie kunnen delen met medeleerlingen. Al was het de eerste les dus kwam daar niet veel van. Ik begon gewoon verder aan mijn </w:t>
+      </w:r>
+      <w:proofErr w:type="spellStart"/>
       <w:r>
         <w:t>F</w:t>
       </w:r>
       <w:r>
-        <w:t>igma design.</w:t>
+        <w:t>igma</w:t>
+      </w:r>
+      <w:proofErr w:type="spellEnd"/>
+      <w:r>
+        <w:t xml:space="preserve"> design.</w:t>
       </w:r>
     </w:p>
     <w:p>
@@ -200,7 +325,23 @@
     </w:p>
     <w:p>
       <w:r>
-        <w:t>Vandaag heb ik verder gewerkt aan mijn Figma design en het ging redelijk vlot vooruit. Ik wou absoluut dat het vandaag af was zodat ik morgen kan werken aan een ander vak. Tijdens het maken van het design heb ik vooral ook zitten op zoeken dat sommige concepten wel haalbaar zijn om te programmeren. Dit is allemaal wel mogelijk, maar zal wel een challenge zijn zoals de opmerkingen plaatsen</w:t>
+        <w:t xml:space="preserve">Vandaag heb ik verder gewerkt aan mijn </w:t>
+      </w:r>
+      <w:proofErr w:type="spellStart"/>
+      <w:r>
+        <w:t>Figma</w:t>
+      </w:r>
+      <w:proofErr w:type="spellEnd"/>
+      <w:r>
+        <w:t xml:space="preserve"> design en het ging redelijk vlot vooruit. Ik wou absoluut dat het vandaag af was zodat ik morgen kan werken aan een ander vak. Tijdens het maken van het design heb ik vooral ook zitten op zoeken dat sommige concepten wel haalbaar zijn om te programmeren. Dit is allemaal wel mogelijk, maar zal wel een </w:t>
+      </w:r>
+      <w:proofErr w:type="spellStart"/>
+      <w:r>
+        <w:t>challenge</w:t>
+      </w:r>
+      <w:proofErr w:type="spellEnd"/>
+      <w:r>
+        <w:t xml:space="preserve"> zijn zoals de opmerkingen plaatsen</w:t>
       </w:r>
       <w:r>
         <w:t>. M</w:t>
@@ -312,11 +453,48 @@
     </w:p>
     <w:p>
       <w:r>
-        <w:t xml:space="preserve">Vandaag werd mijn figma prototype gecontroleerd waarbij ik moest opnieuw uitleggen wat mijn app doet door middel van accurate presentatie. Ik legde dit vrij duidelijk uit en alles ging goed vooruit. Meneer Blancquaert heeft me dan ook nog een library genaamd “Material design” aangeraden om mijn applicatie te ontwerpen. </w:t>
-      </w:r>
-      <w:r>
-        <w:t>Blijkbaar Google gebruikt deze library</w:t>
-      </w:r>
+        <w:t xml:space="preserve">Vandaag werd mijn </w:t>
+      </w:r>
+      <w:proofErr w:type="spellStart"/>
+      <w:r>
+        <w:t>figma</w:t>
+      </w:r>
+      <w:proofErr w:type="spellEnd"/>
+      <w:r>
+        <w:t xml:space="preserve"> prototype gecontroleerd waarbij ik moest opnieuw uitleggen wat mijn app doet door middel van accurate presentatie. Ik legde dit vrij duidelijk uit en alles ging goed vooruit. Meneer </w:t>
+      </w:r>
+      <w:proofErr w:type="spellStart"/>
+      <w:r>
+        <w:t>Blancquaert</w:t>
+      </w:r>
+      <w:proofErr w:type="spellEnd"/>
+      <w:r>
+        <w:t xml:space="preserve"> heeft me dan ook nog een </w:t>
+      </w:r>
+      <w:proofErr w:type="spellStart"/>
+      <w:r>
+        <w:t>library</w:t>
+      </w:r>
+      <w:proofErr w:type="spellEnd"/>
+      <w:r>
+        <w:t xml:space="preserve"> genaamd “</w:t>
+      </w:r>
+      <w:proofErr w:type="spellStart"/>
+      <w:r>
+        <w:t>Material</w:t>
+      </w:r>
+      <w:proofErr w:type="spellEnd"/>
+      <w:r>
+        <w:t xml:space="preserve"> design” aangeraden om mijn applicatie te ontwerpen. </w:t>
+      </w:r>
+      <w:r>
+        <w:t xml:space="preserve">Blijkbaar Google gebruikt deze </w:t>
+      </w:r>
+      <w:proofErr w:type="spellStart"/>
+      <w:r>
+        <w:t>library</w:t>
+      </w:r>
+      <w:proofErr w:type="spellEnd"/>
       <w:r>
         <w:t xml:space="preserve"> om hun apps te maken.</w:t>
       </w:r>
@@ -354,7 +532,23 @@
         <w:t xml:space="preserve">kunt maken </w:t>
       </w:r>
       <w:r>
-        <w:t>om je app te testen. Als je developer modus in de settings van je gsm</w:t>
+        <w:t xml:space="preserve">om je app te testen. Als je </w:t>
+      </w:r>
+      <w:proofErr w:type="spellStart"/>
+      <w:r>
+        <w:t>developer</w:t>
+      </w:r>
+      <w:proofErr w:type="spellEnd"/>
+      <w:r>
+        <w:t xml:space="preserve"> modus in de </w:t>
+      </w:r>
+      <w:proofErr w:type="spellStart"/>
+      <w:r>
+        <w:t>settings</w:t>
+      </w:r>
+      <w:proofErr w:type="spellEnd"/>
+      <w:r>
+        <w:t xml:space="preserve"> van je gsm</w:t>
       </w:r>
       <w:r>
         <w:t xml:space="preserve"> aanzet, kan je je gsm verbinden met de pc en dus je applicatie daarop testen.</w:t>
@@ -372,7 +566,15 @@
     </w:p>
     <w:p>
       <w:r>
-        <w:t>Tijdens lange downloads heb ik ook mijn google account toegevoegd op Firebase. Volgens de presentatie die we kregen van een medestudent.</w:t>
+        <w:t xml:space="preserve">Tijdens lange downloads heb ik ook mijn google account toegevoegd op </w:t>
+      </w:r>
+      <w:proofErr w:type="spellStart"/>
+      <w:r>
+        <w:t>Firebase</w:t>
+      </w:r>
+      <w:proofErr w:type="spellEnd"/>
+      <w:r>
+        <w:t>. Volgens de presentatie die we kregen van een medestudent.</w:t>
       </w:r>
     </w:p>
     <w:p>
@@ -423,7 +625,23 @@
         <w:t>mijn</w:t>
       </w:r>
       <w:r>
-        <w:t xml:space="preserve"> figma design delen met meneer Blancquaert, toen hij vroeg dat mijn design klaar was</w:t>
+        <w:t xml:space="preserve"> </w:t>
+      </w:r>
+      <w:proofErr w:type="spellStart"/>
+      <w:r>
+        <w:t>figma</w:t>
+      </w:r>
+      <w:proofErr w:type="spellEnd"/>
+      <w:r>
+        <w:t xml:space="preserve"> design delen met meneer </w:t>
+      </w:r>
+      <w:proofErr w:type="spellStart"/>
+      <w:r>
+        <w:t>Blancquaert</w:t>
+      </w:r>
+      <w:proofErr w:type="spellEnd"/>
+      <w:r>
+        <w:t>, toen hij vroeg dat mijn design klaar was</w:t>
       </w:r>
       <w:r>
         <w:t xml:space="preserve"> of niet</w:t>
@@ -437,14 +655,38 @@
         <w:t>Ik heb daarna gewoon verder begonnen aan de tutorial die ik vorige week gebruikt had.</w:t>
       </w:r>
       <w:r>
-        <w:t xml:space="preserve"> Hierbij leerde ik meer over hoe ik Android studio beter kon gebruiken om mijn app te designen zoals hoe je </w:t>
+        <w:t xml:space="preserve"> Hierbij leerde ik meer over hoe ik Android studio beter kon gebruiken om mijn app te </w:t>
+      </w:r>
+      <w:proofErr w:type="spellStart"/>
+      <w:r>
+        <w:t>designen</w:t>
+      </w:r>
+      <w:proofErr w:type="spellEnd"/>
+      <w:r>
+        <w:t xml:space="preserve"> zoals hoe je </w:t>
       </w:r>
       <w:r>
         <w:lastRenderedPageBreak/>
-        <w:t>attributen kunt aanpassen (bv. color)</w:t>
-      </w:r>
-      <w:r>
-        <w:t xml:space="preserve">. Android studio is zeer gelijkaardig als bijvoorbeeld Webstorm, maar bij het design van een mobile app is het zeer </w:t>
+        <w:t xml:space="preserve">attributen kunt aanpassen (bv. </w:t>
+      </w:r>
+      <w:proofErr w:type="spellStart"/>
+      <w:r>
+        <w:t>color</w:t>
+      </w:r>
+      <w:proofErr w:type="spellEnd"/>
+      <w:r>
+        <w:t>)</w:t>
+      </w:r>
+      <w:r>
+        <w:t xml:space="preserve">. Android studio is zeer gelijkaardig als bijvoorbeeld </w:t>
+      </w:r>
+      <w:proofErr w:type="spellStart"/>
+      <w:r>
+        <w:t>Webstorm</w:t>
+      </w:r>
+      <w:proofErr w:type="spellEnd"/>
+      <w:r>
+        <w:t xml:space="preserve">, maar bij het design van een mobile app is het zeer </w:t>
       </w:r>
       <w:r>
         <w:t>verschillend</w:t>
@@ -453,7 +695,15 @@
         <w:t>.</w:t>
       </w:r>
       <w:r>
-        <w:t xml:space="preserve"> Bij Webstorm kan je je website </w:t>
+        <w:t xml:space="preserve"> Bij </w:t>
+      </w:r>
+      <w:proofErr w:type="spellStart"/>
+      <w:r>
+        <w:t>Webstorm</w:t>
+      </w:r>
+      <w:proofErr w:type="spellEnd"/>
+      <w:r>
+        <w:t xml:space="preserve"> kan je je website </w:t>
       </w:r>
       <w:r>
         <w:t>bekijken</w:t>
@@ -480,7 +730,15 @@
         <w:t>.</w:t>
       </w:r>
       <w:r>
-        <w:t xml:space="preserve"> Als ik de Jetbrains applicaties vergelijk met Visual studio 2019, </w:t>
+        <w:t xml:space="preserve"> Als ik de </w:t>
+      </w:r>
+      <w:proofErr w:type="spellStart"/>
+      <w:r>
+        <w:t>Jetbrains</w:t>
+      </w:r>
+      <w:proofErr w:type="spellEnd"/>
+      <w:r>
+        <w:t xml:space="preserve"> applicaties vergelijk met Visual studio 2019, </w:t>
       </w:r>
       <w:r>
         <w:t>heb ik er altijd moeite mee om de lay</w:t>
@@ -560,7 +818,15 @@
     </w:p>
     <w:p>
       <w:r>
-        <w:t>Ik heb dan ondertussen de tutorial van Material design gevolgd in plaats van die van Android studio. Ze leerde me dan hoe ik er mee kon werken maar niet hoe een hele nieuwe app kon maken. Ik kreeg een voorbeeld app om erin te kunnen werken voor de tutorial.</w:t>
+        <w:t xml:space="preserve">Ik heb dan ondertussen de tutorial van </w:t>
+      </w:r>
+      <w:proofErr w:type="spellStart"/>
+      <w:r>
+        <w:t>Material</w:t>
+      </w:r>
+      <w:proofErr w:type="spellEnd"/>
+      <w:r>
+        <w:t xml:space="preserve"> design gevolgd in plaats van die van Android studio. Ze leerde me dan hoe ik er mee kon werken maar niet hoe een hele nieuwe app kon maken. Ik kreeg een voorbeeld app om erin te kunnen werken voor de tutorial.</w:t>
       </w:r>
     </w:p>
     <w:p>
@@ -603,10 +869,34 @@
     </w:p>
     <w:p>
       <w:r>
-        <w:t>Vandaag heb ik de usertests afgelegd met Louis D’hondt en Jasper Wauters. Dit ging heel gemakkelijk en duurde niet lang. Ik had niet echt serieuze opmerkingen, behalve dat ik geen persoonlijke info pagina gemaakt had.</w:t>
-      </w:r>
-      <w:r>
-        <w:t xml:space="preserve"> Daarna heb ik onmiddellijk die opmerkingen van mijn figma design verbetert en op mijn repository gezet.</w:t>
+        <w:t xml:space="preserve">Vandaag heb ik de usertests afgelegd met Louis </w:t>
+      </w:r>
+      <w:proofErr w:type="spellStart"/>
+      <w:r>
+        <w:t>D’hondt</w:t>
+      </w:r>
+      <w:proofErr w:type="spellEnd"/>
+      <w:r>
+        <w:t xml:space="preserve"> en Jasper Wauters. Dit ging heel gemakkelijk en duurde niet lang. Ik had niet echt serieuze opmerkingen, behalve dat ik geen persoonlijke info pagina gemaakt had.</w:t>
+      </w:r>
+      <w:r>
+        <w:t xml:space="preserve"> Daarna heb ik onmiddellijk die opmerkingen van mijn </w:t>
+      </w:r>
+      <w:proofErr w:type="spellStart"/>
+      <w:r>
+        <w:t>figma</w:t>
+      </w:r>
+      <w:proofErr w:type="spellEnd"/>
+      <w:r>
+        <w:t xml:space="preserve"> design verbetert en op mijn </w:t>
+      </w:r>
+      <w:proofErr w:type="spellStart"/>
+      <w:r>
+        <w:t>repository</w:t>
+      </w:r>
+      <w:proofErr w:type="spellEnd"/>
+      <w:r>
+        <w:t xml:space="preserve"> gezet.</w:t>
       </w:r>
     </w:p>
     <w:p/>
@@ -629,7 +919,47 @@
     </w:p>
     <w:p>
       <w:r>
-        <w:t xml:space="preserve">Vandaag begon ik eindelijk met Material Design. Ik besloot mijn oude app te verwijderen en te vervangen met een empty activity zodat ik echt van scratch begin. Zo kan ik alles beter begrijpen. Ik had dan ontdekt dat android studio al automatisch Material Design van Google had toegevoegd bij de dependencies, dus eigenlijk ben ik </w:t>
+        <w:t xml:space="preserve">Vandaag begon ik eindelijk met </w:t>
+      </w:r>
+      <w:proofErr w:type="spellStart"/>
+      <w:r>
+        <w:t>Material</w:t>
+      </w:r>
+      <w:proofErr w:type="spellEnd"/>
+      <w:r>
+        <w:t xml:space="preserve"> Design. Ik besloot mijn oude app te verwijderen en te vervangen met een empty </w:t>
+      </w:r>
+      <w:proofErr w:type="spellStart"/>
+      <w:r>
+        <w:t>activity</w:t>
+      </w:r>
+      <w:proofErr w:type="spellEnd"/>
+      <w:r>
+        <w:t xml:space="preserve"> zodat ik echt van scratch begin. Zo kan ik alles beter begrijpen. Ik had dan ontdekt dat </w:t>
+      </w:r>
+      <w:proofErr w:type="spellStart"/>
+      <w:r>
+        <w:t>android</w:t>
+      </w:r>
+      <w:proofErr w:type="spellEnd"/>
+      <w:r>
+        <w:t xml:space="preserve"> studio al automatisch </w:t>
+      </w:r>
+      <w:proofErr w:type="spellStart"/>
+      <w:r>
+        <w:t>Material</w:t>
+      </w:r>
+      <w:proofErr w:type="spellEnd"/>
+      <w:r>
+        <w:t xml:space="preserve"> Design van Google had toegevoegd bij de </w:t>
+      </w:r>
+      <w:proofErr w:type="spellStart"/>
+      <w:r>
+        <w:t>dependencies</w:t>
+      </w:r>
+      <w:proofErr w:type="spellEnd"/>
+      <w:r>
+        <w:t xml:space="preserve">, dus eigenlijk ben ik </w:t>
       </w:r>
       <w:r>
         <w:t>onmiddellijk</w:t>
@@ -773,18 +1103,50 @@
     </w:p>
     <w:p>
       <w:r>
-        <w:t>Eerst had ik geprobeerd om gewoon een heel nieuw project te maken die bestond uit een login activity. Deze activity heb ik dan gewoon aangepast naar mijn wens. Maar dit wou ook niet echt werken, want blijkbaar is het best dat je van een main</w:t>
+        <w:t xml:space="preserve">Eerst had ik geprobeerd om gewoon een heel nieuw project te maken die bestond uit een login </w:t>
+      </w:r>
+      <w:proofErr w:type="spellStart"/>
+      <w:r>
+        <w:t>activity</w:t>
+      </w:r>
+      <w:proofErr w:type="spellEnd"/>
+      <w:r>
+        <w:t xml:space="preserve">. Deze </w:t>
+      </w:r>
+      <w:proofErr w:type="spellStart"/>
+      <w:r>
+        <w:t>activity</w:t>
+      </w:r>
+      <w:proofErr w:type="spellEnd"/>
+      <w:r>
+        <w:t xml:space="preserve"> heb ik dan gewoon aangepast naar mijn wens. Maar dit wou ook niet echt werken, want blijkbaar is het best dat je van een </w:t>
+      </w:r>
+      <w:proofErr w:type="spellStart"/>
+      <w:r>
+        <w:t>main</w:t>
       </w:r>
       <w:r>
         <w:t>_</w:t>
       </w:r>
       <w:r>
-        <w:t>activity start en dan de login page daarmee opent.</w:t>
-      </w:r>
-    </w:p>
-    <w:p>
-      <w:r>
-        <w:t>Ik ben dan gewoon terug begonnen aan het oude project en heb dan de error op stack overflow gezocht en daar had ik de oplossing gevonden. Ik moest gewoon mijn “device” zijn data wipen en dan kon het opnieuw installeren want mijn oude projecten stond er nog op.</w:t>
+        <w:t>activity</w:t>
+      </w:r>
+      <w:proofErr w:type="spellEnd"/>
+      <w:r>
+        <w:t xml:space="preserve"> start en dan de login page daarmee opent.</w:t>
+      </w:r>
+    </w:p>
+    <w:p>
+      <w:r>
+        <w:t xml:space="preserve">Ik ben dan gewoon terug begonnen aan het oude project en heb dan de error op stack overflow gezocht en daar had ik de oplossing gevonden. Ik moest gewoon mijn “device” zijn data </w:t>
+      </w:r>
+      <w:proofErr w:type="spellStart"/>
+      <w:r>
+        <w:t>wipen</w:t>
+      </w:r>
+      <w:proofErr w:type="spellEnd"/>
+      <w:r>
+        <w:t xml:space="preserve"> en dan kon het opnieuw installeren want mijn oude projecten stond er nog op.</w:t>
       </w:r>
     </w:p>
     <w:p>
@@ -828,7 +1190,23 @@
         <w:t>Vandaag wou de wifi niet werken op de campus dus had ik niet veel vooruitgang geboekt.</w:t>
       </w:r>
       <w:r>
-        <w:t xml:space="preserve"> Ik was ook gisteren vergeten om de registratie pagina te committen, dus da had ik alleszins gedaan door met mijn hotspot van mijn gsm te verbinden en de 4G aan te zetten.</w:t>
+        <w:t xml:space="preserve"> Ik was ook gisteren vergeten om de registratie pagina te </w:t>
+      </w:r>
+      <w:proofErr w:type="spellStart"/>
+      <w:r>
+        <w:t>committen</w:t>
+      </w:r>
+      <w:proofErr w:type="spellEnd"/>
+      <w:r>
+        <w:t xml:space="preserve">, dus da had ik alleszins gedaan door met mijn </w:t>
+      </w:r>
+      <w:proofErr w:type="spellStart"/>
+      <w:r>
+        <w:t>hotspot</w:t>
+      </w:r>
+      <w:proofErr w:type="spellEnd"/>
+      <w:r>
+        <w:t xml:space="preserve"> van mijn gsm te verbinden en de 4G aan te zetten.</w:t>
       </w:r>
     </w:p>
     <w:p>
@@ -860,11 +1238,21 @@
         <w:t>Vandaag wou de wifi op school nog steeds niet zo goed werken</w:t>
       </w:r>
       <w:r>
-        <w:t xml:space="preserve">, maar dankzij de wifi hotspot heb ik toch nog de navigatie van login naar registratie kunnen </w:t>
-      </w:r>
+        <w:t xml:space="preserve">, maar dankzij de wifi </w:t>
+      </w:r>
+      <w:proofErr w:type="spellStart"/>
+      <w:r>
+        <w:t>hotspot</w:t>
+      </w:r>
+      <w:proofErr w:type="spellEnd"/>
+      <w:r>
+        <w:t xml:space="preserve"> heb ik toch nog de navigatie van login naar registratie kunnen </w:t>
+      </w:r>
+      <w:proofErr w:type="spellStart"/>
       <w:r>
         <w:t>commiten</w:t>
       </w:r>
+      <w:proofErr w:type="spellEnd"/>
       <w:r>
         <w:t>.</w:t>
       </w:r>
@@ -874,7 +1262,15 @@
     </w:p>
     <w:p>
       <w:r>
-        <w:t>De wifi wou uiteindelijk werken dus kon eindelijk heel vlot vooruitgaan. Ik heb daarbij de navigatie tussen de login en registratie kunnen afwerken. Daarna heb ik ook de startpagina bijna afgewerkt, maar de bottom bar wou niet helemaal meewerken dus dat laat ik voor later.</w:t>
+        <w:t xml:space="preserve">De wifi wou uiteindelijk werken dus kon eindelijk heel vlot vooruitgaan. Ik heb daarbij de navigatie tussen de login en registratie kunnen afwerken. Daarna heb ik ook de startpagina bijna afgewerkt, maar de </w:t>
+      </w:r>
+      <w:proofErr w:type="spellStart"/>
+      <w:r>
+        <w:t>bottom</w:t>
+      </w:r>
+      <w:proofErr w:type="spellEnd"/>
+      <w:r>
+        <w:t xml:space="preserve"> bar wou niet helemaal meewerken dus dat laat ik voor later.</w:t>
       </w:r>
     </w:p>
     <w:p/>
@@ -895,7 +1291,31 @@
     </w:p>
     <w:p>
       <w:r>
-        <w:t>Vandaag heb ik de bodem navigatie afgewerkt waarbij je dan naar je groepen kunt gaan oftewel naar je notities die je hebt gefotografeerd. Dit was eerste wel een challenge zoals de active pagina weergegeven of de juiste eventlistener gebruiken om te kunnen navigeren. Maar deze links hebben daarbij geholpen:</w:t>
+        <w:t xml:space="preserve">Vandaag heb ik de bodem navigatie afgewerkt waarbij je dan naar je groepen kunt gaan oftewel naar je notities die je hebt gefotografeerd. Dit was eerste wel een </w:t>
+      </w:r>
+      <w:proofErr w:type="spellStart"/>
+      <w:r>
+        <w:t>challenge</w:t>
+      </w:r>
+      <w:proofErr w:type="spellEnd"/>
+      <w:r>
+        <w:t xml:space="preserve"> zoals de </w:t>
+      </w:r>
+      <w:proofErr w:type="spellStart"/>
+      <w:r>
+        <w:t>active</w:t>
+      </w:r>
+      <w:proofErr w:type="spellEnd"/>
+      <w:r>
+        <w:t xml:space="preserve"> pagina weergegeven of de juiste </w:t>
+      </w:r>
+      <w:proofErr w:type="spellStart"/>
+      <w:r>
+        <w:t>eventlistener</w:t>
+      </w:r>
+      <w:proofErr w:type="spellEnd"/>
+      <w:r>
+        <w:t xml:space="preserve"> gebruiken om te kunnen navigeren. Maar deze links hebben daarbij geholpen:</w:t>
       </w:r>
     </w:p>
     <w:p>
@@ -941,13 +1361,29 @@
     </w:p>
     <w:p>
       <w:r>
-        <w:t>Ik heb dan ook nog voor gezorgd dat mijn firebase account verbonden is met</w:t>
+        <w:t xml:space="preserve">Ik heb dan ook nog voor gezorgd dat mijn </w:t>
+      </w:r>
+      <w:proofErr w:type="spellStart"/>
+      <w:r>
+        <w:t>firebase</w:t>
+      </w:r>
+      <w:proofErr w:type="spellEnd"/>
+      <w:r>
+        <w:t xml:space="preserve"> account verbonden is met</w:t>
       </w:r>
       <w:r>
         <w:t xml:space="preserve"> mijn</w:t>
       </w:r>
       <w:r>
-        <w:t xml:space="preserve"> android studio app.</w:t>
+        <w:t xml:space="preserve"> </w:t>
+      </w:r>
+      <w:proofErr w:type="spellStart"/>
+      <w:r>
+        <w:t>android</w:t>
+      </w:r>
+      <w:proofErr w:type="spellEnd"/>
+      <w:r>
+        <w:t xml:space="preserve"> studio app.</w:t>
       </w:r>
     </w:p>
     <w:p>
@@ -1104,8 +1540,13 @@
           <w:numId w:val="1"/>
         </w:numPr>
       </w:pPr>
-      <w:r>
-        <w:t>Firebase implementeren</w:t>
+      <w:proofErr w:type="spellStart"/>
+      <w:r>
+        <w:t>Firebase</w:t>
+      </w:r>
+      <w:proofErr w:type="spellEnd"/>
+      <w:r>
+        <w:t xml:space="preserve"> implementeren</w:t>
       </w:r>
     </w:p>
     <w:p>
@@ -1117,8 +1558,13 @@
         </w:numPr>
       </w:pPr>
       <w:r>
-        <w:t>Login en registratie mogelijk maken via firebase</w:t>
-      </w:r>
+        <w:t xml:space="preserve">Login en registratie mogelijk maken via </w:t>
+      </w:r>
+      <w:proofErr w:type="spellStart"/>
+      <w:r>
+        <w:t>firebase</w:t>
+      </w:r>
+      <w:proofErr w:type="spellEnd"/>
     </w:p>
     <w:p>
       <w:pPr>
@@ -1129,7 +1575,11 @@
         </w:numPr>
       </w:pPr>
       <w:r>
-        <w:t>Camera functionaliteit bekijken voor andr</w:t>
+        <w:t xml:space="preserve">Camera functionaliteit bekijken voor </w:t>
+      </w:r>
+      <w:proofErr w:type="spellStart"/>
+      <w:r>
+        <w:t>andr</w:t>
       </w:r>
       <w:r>
         <w:t>oi</w:t>
@@ -1137,6 +1587,7 @@
       <w:r>
         <w:t>d</w:t>
       </w:r>
+      <w:proofErr w:type="spellEnd"/>
     </w:p>
     <w:p/>
     <w:p>
@@ -1156,10 +1607,66 @@
     </w:p>
     <w:p>
       <w:r>
-        <w:t>Hier kan je ondertussen zien dat mijn app verbonden is met Firebase. Nu vragen ze voor google sign-in om een sha-1 fingerprint toe te voegen.</w:t>
-      </w:r>
-      <w:r>
-        <w:t xml:space="preserve"> Ik wou dan google play signing pakken om het te genereren ipv self-signing, maar ik moet dan 25 euro eerst betalen voor een </w:t>
+        <w:t xml:space="preserve">Hier kan je ondertussen zien dat mijn app verbonden is met </w:t>
+      </w:r>
+      <w:proofErr w:type="spellStart"/>
+      <w:r>
+        <w:t>Firebase</w:t>
+      </w:r>
+      <w:proofErr w:type="spellEnd"/>
+      <w:r>
+        <w:t xml:space="preserve">. Nu vragen ze voor google </w:t>
+      </w:r>
+      <w:proofErr w:type="spellStart"/>
+      <w:r>
+        <w:t>sign</w:t>
+      </w:r>
+      <w:proofErr w:type="spellEnd"/>
+      <w:r>
+        <w:t xml:space="preserve">-in om een sha-1 </w:t>
+      </w:r>
+      <w:proofErr w:type="spellStart"/>
+      <w:r>
+        <w:t>fingerprint</w:t>
+      </w:r>
+      <w:proofErr w:type="spellEnd"/>
+      <w:r>
+        <w:t xml:space="preserve"> toe te voegen.</w:t>
+      </w:r>
+      <w:r>
+        <w:t xml:space="preserve"> Ik wou dan google </w:t>
+      </w:r>
+      <w:proofErr w:type="spellStart"/>
+      <w:r>
+        <w:t>play</w:t>
+      </w:r>
+      <w:proofErr w:type="spellEnd"/>
+      <w:r>
+        <w:t xml:space="preserve"> </w:t>
+      </w:r>
+      <w:proofErr w:type="spellStart"/>
+      <w:r>
+        <w:t>signing</w:t>
+      </w:r>
+      <w:proofErr w:type="spellEnd"/>
+      <w:r>
+        <w:t xml:space="preserve"> pakken om het te genereren </w:t>
+      </w:r>
+      <w:proofErr w:type="spellStart"/>
+      <w:r>
+        <w:t>ipv</w:t>
+      </w:r>
+      <w:proofErr w:type="spellEnd"/>
+      <w:r>
+        <w:t xml:space="preserve"> </w:t>
+      </w:r>
+      <w:proofErr w:type="spellStart"/>
+      <w:r>
+        <w:t>self-signing</w:t>
+      </w:r>
+      <w:proofErr w:type="spellEnd"/>
+      <w:r>
+        <w:t xml:space="preserve">, maar ik moet dan 25 euro eerst betalen voor een </w:t>
       </w:r>
       <w:r>
         <w:t>ontwikkelaar</w:t>
@@ -1230,14 +1737,75 @@
       <w:r>
         <w:t>Als ik wat meer naar onderging bij de “</w:t>
       </w:r>
-      <w:r>
-        <w:t>Authenticating Your Client</w:t>
-      </w:r>
-      <w:r>
-        <w:t>” pagina (zie link) kan je ook via de terminal van android studio een command invoeren om de sha-1 fingerprint te krijgen. Hierbij moest je “gradle sigingReport” invoeren en dan ctrl + enter invoeren!!</w:t>
-      </w:r>
-      <w:r>
-        <w:t xml:space="preserve"> Deze heb ik dan toegevoegd aan Firebase.</w:t>
+      <w:proofErr w:type="spellStart"/>
+      <w:r>
+        <w:t>Authenticating</w:t>
+      </w:r>
+      <w:proofErr w:type="spellEnd"/>
+      <w:r>
+        <w:t xml:space="preserve"> </w:t>
+      </w:r>
+      <w:proofErr w:type="spellStart"/>
+      <w:r>
+        <w:t>Your</w:t>
+      </w:r>
+      <w:proofErr w:type="spellEnd"/>
+      <w:r>
+        <w:t xml:space="preserve"> Client</w:t>
+      </w:r>
+      <w:r>
+        <w:t xml:space="preserve">” pagina (zie link) kan je ook via de terminal van </w:t>
+      </w:r>
+      <w:proofErr w:type="spellStart"/>
+      <w:r>
+        <w:t>android</w:t>
+      </w:r>
+      <w:proofErr w:type="spellEnd"/>
+      <w:r>
+        <w:t xml:space="preserve"> studio een </w:t>
+      </w:r>
+      <w:proofErr w:type="spellStart"/>
+      <w:r>
+        <w:t>command</w:t>
+      </w:r>
+      <w:proofErr w:type="spellEnd"/>
+      <w:r>
+        <w:t xml:space="preserve"> invoeren om de sha-1 </w:t>
+      </w:r>
+      <w:proofErr w:type="spellStart"/>
+      <w:r>
+        <w:t>fingerprint</w:t>
+      </w:r>
+      <w:proofErr w:type="spellEnd"/>
+      <w:r>
+        <w:t xml:space="preserve"> te krijgen. Hierbij moest je “</w:t>
+      </w:r>
+      <w:proofErr w:type="spellStart"/>
+      <w:r>
+        <w:t>gradle</w:t>
+      </w:r>
+      <w:proofErr w:type="spellEnd"/>
+      <w:r>
+        <w:t xml:space="preserve"> </w:t>
+      </w:r>
+      <w:proofErr w:type="spellStart"/>
+      <w:r>
+        <w:t>sigingReport</w:t>
+      </w:r>
+      <w:proofErr w:type="spellEnd"/>
+      <w:r>
+        <w:t>” invoeren en dan ctrl + enter invoeren!!</w:t>
+      </w:r>
+      <w:r>
+        <w:t xml:space="preserve"> Deze heb ik dan toegevoegd aan </w:t>
+      </w:r>
+      <w:proofErr w:type="spellStart"/>
+      <w:r>
+        <w:t>Firebase</w:t>
+      </w:r>
+      <w:proofErr w:type="spellEnd"/>
+      <w:r>
+        <w:t>.</w:t>
       </w:r>
     </w:p>
     <w:p>
@@ -1285,7 +1853,15 @@
     </w:p>
     <w:p>
       <w:r>
-        <w:t>Daarna moest ik een Oauth 2.0 client ID toevoegen voor het inloggen. Hierbij moest ik een hele configuratie begaan.</w:t>
+        <w:t xml:space="preserve">Daarna moest ik een </w:t>
+      </w:r>
+      <w:proofErr w:type="spellStart"/>
+      <w:r>
+        <w:t>Oauth</w:t>
+      </w:r>
+      <w:proofErr w:type="spellEnd"/>
+      <w:r>
+        <w:t xml:space="preserve"> 2.0 client ID toevoegen voor het inloggen. Hierbij moest ik een hele configuratie begaan.</w:t>
       </w:r>
       <w:r>
         <w:t xml:space="preserve"> Ik heb hierbij het meest niet ingevuld zoals een privacy policy, enzoverder.</w:t>
@@ -1466,7 +2042,31 @@
     </w:p>
     <w:p>
       <w:r>
-        <w:t xml:space="preserve">Vandaag had ik tijdens les (in de morgen van 8u15-11u15) verder gewerkt aan de back-end van mijn app. Ik was gisteren bezig met google sign-in, maar ik besloot om eerst normale email/password authentication toe te voegen. Dit ging vrij vlot vooruit maar toen ik de button klikt sloot de app af, dus dat moet ik nog oplossen. </w:t>
+        <w:t xml:space="preserve">Vandaag had ik tijdens les (in de morgen van 8u15-11u15) verder gewerkt aan de </w:t>
+      </w:r>
+      <w:proofErr w:type="spellStart"/>
+      <w:r>
+        <w:t>back-end</w:t>
+      </w:r>
+      <w:proofErr w:type="spellEnd"/>
+      <w:r>
+        <w:t xml:space="preserve"> van mijn app. Ik was gisteren bezig met google </w:t>
+      </w:r>
+      <w:proofErr w:type="spellStart"/>
+      <w:r>
+        <w:t>sign</w:t>
+      </w:r>
+      <w:proofErr w:type="spellEnd"/>
+      <w:r>
+        <w:t xml:space="preserve">-in, maar ik besloot om eerst normale email/password </w:t>
+      </w:r>
+      <w:proofErr w:type="spellStart"/>
+      <w:r>
+        <w:t>authentication</w:t>
+      </w:r>
+      <w:proofErr w:type="spellEnd"/>
+      <w:r>
+        <w:t xml:space="preserve"> toe te voegen. Dit ging vrij vlot vooruit maar toen ik de button klikt sloot de app af, dus dat moet ik nog oplossen. </w:t>
       </w:r>
       <w:r>
         <w:t>Er werd</w:t>
@@ -1512,10 +2112,26 @@
         <w:t>Vandaag heb ik eindelijk de login en registratie kunnen afwerken. Dit had veel moeite gekost.</w:t>
       </w:r>
       <w:r>
-        <w:t xml:space="preserve"> Het probleem was dus dat mijn app bleef crashen als ik probeerde te registeren. Ik had veel op stackoverflow gezocht maar ik kon eerst niks vinden, maar toen zag ik dat de wifi van de device emulator op Android studio geen wifi had. Ik dacht eerst dat dit normaal was, maar begon toen twijfels te krijgen. Ik had dan eerst de info op stackoverflow pagina proberen gebruiken, maar dat was niet juist. Uiteindelijk gewoon mijn gsm hotspot 4G gebruiken werkte wel.</w:t>
-      </w:r>
-      <w:r>
-        <w:t xml:space="preserve"> Mijn app crasht dan nog steeds bij registratie maar ik kon wel inloggen door een test account aan te maken op Firebase. Dus mijn code werkte, maar toen ik zag dat ik niet gekeken had naar de error van die verscheen na de crash en dat maakte alles duidelijk</w:t>
+        <w:t xml:space="preserve"> Het probleem was dus dat mijn app bleef crashen als ik probeerde te registeren. Ik had veel op stackoverflow gezocht maar ik kon eerst niks vinden, maar toen zag ik dat de wifi van de device emulator op Android studio geen wifi had. Ik dacht eerst dat dit normaal was, maar begon toen twijfels te krijgen. Ik had dan eerst de info op stackoverflow pagina proberen gebruiken, maar dat was niet juist. Uiteindelijk gewoon mijn gsm </w:t>
+      </w:r>
+      <w:proofErr w:type="spellStart"/>
+      <w:r>
+        <w:t>hotspot</w:t>
+      </w:r>
+      <w:proofErr w:type="spellEnd"/>
+      <w:r>
+        <w:t xml:space="preserve"> 4G gebruiken werkte wel.</w:t>
+      </w:r>
+      <w:r>
+        <w:t xml:space="preserve"> Mijn app crasht dan nog steeds bij registratie maar ik kon wel inloggen door een test account aan te maken op </w:t>
+      </w:r>
+      <w:proofErr w:type="spellStart"/>
+      <w:r>
+        <w:t>Firebase</w:t>
+      </w:r>
+      <w:proofErr w:type="spellEnd"/>
+      <w:r>
+        <w:t>. Dus mijn code werkte, maar toen ik zag dat ik niet gekeken had naar de error van die verscheen na de crash en dat maakte alles duidelijk</w:t>
       </w:r>
       <w:r>
         <w:t xml:space="preserve"> voor mij</w:t>
@@ -1677,8 +2293,49 @@
           <w:rFonts w:eastAsia="Times New Roman" w:cstheme="minorHAnsi"/>
           <w:lang w:eastAsia="nl-BE"/>
         </w:rPr>
-        <w:t>Vandaag heb ik geprobeerd om google sign-in te laten werken. Dit ging zeer goed, maar het enige probleem is dat de google account niet wordt toegevoegd aan Firebase en het wil daarna niet naar de volgende pagina gaan als ik de google sign</w:t>
-      </w:r>
+        <w:t xml:space="preserve">Vandaag heb ik geprobeerd om google </w:t>
+      </w:r>
+      <w:proofErr w:type="spellStart"/>
+      <w:r>
+        <w:rPr>
+          <w:rFonts w:eastAsia="Times New Roman" w:cstheme="minorHAnsi"/>
+          <w:lang w:eastAsia="nl-BE"/>
+        </w:rPr>
+        <w:t>sign</w:t>
+      </w:r>
+      <w:proofErr w:type="spellEnd"/>
+      <w:r>
+        <w:rPr>
+          <w:rFonts w:eastAsia="Times New Roman" w:cstheme="minorHAnsi"/>
+          <w:lang w:eastAsia="nl-BE"/>
+        </w:rPr>
+        <w:t xml:space="preserve">-in te laten werken. Dit ging zeer goed, maar het enige probleem is dat de google account niet wordt toegevoegd aan </w:t>
+      </w:r>
+      <w:proofErr w:type="spellStart"/>
+      <w:r>
+        <w:rPr>
+          <w:rFonts w:eastAsia="Times New Roman" w:cstheme="minorHAnsi"/>
+          <w:lang w:eastAsia="nl-BE"/>
+        </w:rPr>
+        <w:t>Firebase</w:t>
+      </w:r>
+      <w:proofErr w:type="spellEnd"/>
+      <w:r>
+        <w:rPr>
+          <w:rFonts w:eastAsia="Times New Roman" w:cstheme="minorHAnsi"/>
+          <w:lang w:eastAsia="nl-BE"/>
+        </w:rPr>
+        <w:t xml:space="preserve"> en het wil daarna niet naar de volgende pagina gaan als ik de google </w:t>
+      </w:r>
+      <w:proofErr w:type="spellStart"/>
+      <w:r>
+        <w:rPr>
+          <w:rFonts w:eastAsia="Times New Roman" w:cstheme="minorHAnsi"/>
+          <w:lang w:eastAsia="nl-BE"/>
+        </w:rPr>
+        <w:t>sign</w:t>
+      </w:r>
+      <w:proofErr w:type="spellEnd"/>
       <w:r>
         <w:rPr>
           <w:rFonts w:eastAsia="Times New Roman" w:cstheme="minorHAnsi"/>
@@ -1691,7 +2348,39 @@
           <w:rFonts w:eastAsia="Times New Roman" w:cstheme="minorHAnsi"/>
           <w:lang w:eastAsia="nl-BE"/>
         </w:rPr>
-        <w:t>in button klik. Het sign-in scherm verschijnt wel en hebben geen errors, maar daarna gebeurt er niks. Ik heb de methode toegevoegd die iemand van teams zei dat die het probleem</w:t>
+        <w:t xml:space="preserve">in button klik. Het </w:t>
+      </w:r>
+      <w:proofErr w:type="spellStart"/>
+      <w:r>
+        <w:rPr>
+          <w:rFonts w:eastAsia="Times New Roman" w:cstheme="minorHAnsi"/>
+          <w:lang w:eastAsia="nl-BE"/>
+        </w:rPr>
+        <w:t>sign</w:t>
+      </w:r>
+      <w:proofErr w:type="spellEnd"/>
+      <w:r>
+        <w:rPr>
+          <w:rFonts w:eastAsia="Times New Roman" w:cstheme="minorHAnsi"/>
+          <w:lang w:eastAsia="nl-BE"/>
+        </w:rPr>
+        <w:t xml:space="preserve">-in scherm verschijnt wel en hebben geen </w:t>
+      </w:r>
+      <w:proofErr w:type="spellStart"/>
+      <w:r>
+        <w:rPr>
+          <w:rFonts w:eastAsia="Times New Roman" w:cstheme="minorHAnsi"/>
+          <w:lang w:eastAsia="nl-BE"/>
+        </w:rPr>
+        <w:t>errors</w:t>
+      </w:r>
+      <w:proofErr w:type="spellEnd"/>
+      <w:r>
+        <w:rPr>
+          <w:rFonts w:eastAsia="Times New Roman" w:cstheme="minorHAnsi"/>
+          <w:lang w:eastAsia="nl-BE"/>
+        </w:rPr>
+        <w:t>, maar daarna gebeurt er niks. Ik heb de methode toegevoegd die iemand van teams zei dat die het probleem</w:t>
       </w:r>
       <w:r>
         <w:rPr>
@@ -1726,7 +2415,23 @@
           <w:rFonts w:eastAsia="Times New Roman" w:cstheme="minorHAnsi"/>
           <w:lang w:eastAsia="nl-BE"/>
         </w:rPr>
-        <w:t xml:space="preserve"> 1 van de methodes was wel deprecated, maar die had </w:t>
+        <w:t xml:space="preserve"> 1 van de methodes was wel </w:t>
+      </w:r>
+      <w:proofErr w:type="spellStart"/>
+      <w:r>
+        <w:rPr>
+          <w:rFonts w:eastAsia="Times New Roman" w:cstheme="minorHAnsi"/>
+          <w:lang w:eastAsia="nl-BE"/>
+        </w:rPr>
+        <w:t>deprecated</w:t>
+      </w:r>
+      <w:proofErr w:type="spellEnd"/>
+      <w:r>
+        <w:rPr>
+          <w:rFonts w:eastAsia="Times New Roman" w:cstheme="minorHAnsi"/>
+          <w:lang w:eastAsia="nl-BE"/>
+        </w:rPr>
+        <w:t xml:space="preserve">, maar die had </w:t>
       </w:r>
       <w:r>
         <w:rPr>
@@ -1891,7 +2596,167 @@
           <w:rFonts w:eastAsia="Times New Roman" w:cstheme="minorHAnsi"/>
           <w:lang w:eastAsia="nl-BE"/>
         </w:rPr>
-        <w:t>Vandaag is het me gelukt om de google sign-in te laten werken. Ik had veel opzoek werk gedaan op google maar kon niks duidelijk vinden. Ik had mijn code ook gedebugd, maar geen duidelijk error werd weergegeven. Uiteindelijk besloot ik opzoek te gaan naar een tutorial die recent was in 2021. Deze tutorial heb ik dan gebruikt om mijn project strict te controleren en toen realiseerde ik dat de SHA-1 niet op de juiste plaats stond. Ik had op google cloud een Oauth 2.0 client id moeten aanmaken toen ik de android studio firebase tutorial volgde, maar dat bleek dus helemaal fout te zijn, want de echte client_id was eigenlijk al klaar in een google-services.json file. Ik moest toen ook mijn SHA-1 fingerprint verwijderen bij de onderstaande afbeelding, maar dat mocht daar eigenlijk blijven staan.</w:t>
+        <w:t xml:space="preserve">Vandaag is het me gelukt om de google </w:t>
+      </w:r>
+      <w:proofErr w:type="spellStart"/>
+      <w:r>
+        <w:rPr>
+          <w:rFonts w:eastAsia="Times New Roman" w:cstheme="minorHAnsi"/>
+          <w:lang w:eastAsia="nl-BE"/>
+        </w:rPr>
+        <w:t>sign</w:t>
+      </w:r>
+      <w:proofErr w:type="spellEnd"/>
+      <w:r>
+        <w:rPr>
+          <w:rFonts w:eastAsia="Times New Roman" w:cstheme="minorHAnsi"/>
+          <w:lang w:eastAsia="nl-BE"/>
+        </w:rPr>
+        <w:t xml:space="preserve">-in te laten werken. Ik had veel opzoek werk gedaan op google maar kon niks duidelijk vinden. Ik had mijn code ook gedebugd, maar geen duidelijk error werd weergegeven. Uiteindelijk besloot ik opzoek te gaan naar een tutorial die recent was in 2021. Deze tutorial heb ik dan gebruikt om mijn project </w:t>
+      </w:r>
+      <w:proofErr w:type="spellStart"/>
+      <w:r>
+        <w:rPr>
+          <w:rFonts w:eastAsia="Times New Roman" w:cstheme="minorHAnsi"/>
+          <w:lang w:eastAsia="nl-BE"/>
+        </w:rPr>
+        <w:t>strict</w:t>
+      </w:r>
+      <w:proofErr w:type="spellEnd"/>
+      <w:r>
+        <w:rPr>
+          <w:rFonts w:eastAsia="Times New Roman" w:cstheme="minorHAnsi"/>
+          <w:lang w:eastAsia="nl-BE"/>
+        </w:rPr>
+        <w:t xml:space="preserve"> te controleren en toen realiseerde ik dat de SHA-1 niet op de juiste plaats stond. Ik had op google </w:t>
+      </w:r>
+      <w:proofErr w:type="spellStart"/>
+      <w:r>
+        <w:rPr>
+          <w:rFonts w:eastAsia="Times New Roman" w:cstheme="minorHAnsi"/>
+          <w:lang w:eastAsia="nl-BE"/>
+        </w:rPr>
+        <w:t>cloud</w:t>
+      </w:r>
+      <w:proofErr w:type="spellEnd"/>
+      <w:r>
+        <w:rPr>
+          <w:rFonts w:eastAsia="Times New Roman" w:cstheme="minorHAnsi"/>
+          <w:lang w:eastAsia="nl-BE"/>
+        </w:rPr>
+        <w:t xml:space="preserve"> een </w:t>
+      </w:r>
+      <w:proofErr w:type="spellStart"/>
+      <w:r>
+        <w:rPr>
+          <w:rFonts w:eastAsia="Times New Roman" w:cstheme="minorHAnsi"/>
+          <w:lang w:eastAsia="nl-BE"/>
+        </w:rPr>
+        <w:t>Oauth</w:t>
+      </w:r>
+      <w:proofErr w:type="spellEnd"/>
+      <w:r>
+        <w:rPr>
+          <w:rFonts w:eastAsia="Times New Roman" w:cstheme="minorHAnsi"/>
+          <w:lang w:eastAsia="nl-BE"/>
+        </w:rPr>
+        <w:t xml:space="preserve"> 2.0 client </w:t>
+      </w:r>
+      <w:proofErr w:type="spellStart"/>
+      <w:r>
+        <w:rPr>
+          <w:rFonts w:eastAsia="Times New Roman" w:cstheme="minorHAnsi"/>
+          <w:lang w:eastAsia="nl-BE"/>
+        </w:rPr>
+        <w:t>id</w:t>
+      </w:r>
+      <w:proofErr w:type="spellEnd"/>
+      <w:r>
+        <w:rPr>
+          <w:rFonts w:eastAsia="Times New Roman" w:cstheme="minorHAnsi"/>
+          <w:lang w:eastAsia="nl-BE"/>
+        </w:rPr>
+        <w:t xml:space="preserve"> moeten aanmaken toen ik de </w:t>
+      </w:r>
+      <w:proofErr w:type="spellStart"/>
+      <w:r>
+        <w:rPr>
+          <w:rFonts w:eastAsia="Times New Roman" w:cstheme="minorHAnsi"/>
+          <w:lang w:eastAsia="nl-BE"/>
+        </w:rPr>
+        <w:t>android</w:t>
+      </w:r>
+      <w:proofErr w:type="spellEnd"/>
+      <w:r>
+        <w:rPr>
+          <w:rFonts w:eastAsia="Times New Roman" w:cstheme="minorHAnsi"/>
+          <w:lang w:eastAsia="nl-BE"/>
+        </w:rPr>
+        <w:t xml:space="preserve"> studio </w:t>
+      </w:r>
+      <w:proofErr w:type="spellStart"/>
+      <w:r>
+        <w:rPr>
+          <w:rFonts w:eastAsia="Times New Roman" w:cstheme="minorHAnsi"/>
+          <w:lang w:eastAsia="nl-BE"/>
+        </w:rPr>
+        <w:t>firebase</w:t>
+      </w:r>
+      <w:proofErr w:type="spellEnd"/>
+      <w:r>
+        <w:rPr>
+          <w:rFonts w:eastAsia="Times New Roman" w:cstheme="minorHAnsi"/>
+          <w:lang w:eastAsia="nl-BE"/>
+        </w:rPr>
+        <w:t xml:space="preserve"> tutorial volgde, maar dat bleek dus helemaal fout te zijn, want de echte </w:t>
+      </w:r>
+      <w:proofErr w:type="spellStart"/>
+      <w:r>
+        <w:rPr>
+          <w:rFonts w:eastAsia="Times New Roman" w:cstheme="minorHAnsi"/>
+          <w:lang w:eastAsia="nl-BE"/>
+        </w:rPr>
+        <w:t>client_id</w:t>
+      </w:r>
+      <w:proofErr w:type="spellEnd"/>
+      <w:r>
+        <w:rPr>
+          <w:rFonts w:eastAsia="Times New Roman" w:cstheme="minorHAnsi"/>
+          <w:lang w:eastAsia="nl-BE"/>
+        </w:rPr>
+        <w:t xml:space="preserve"> was eigenlijk al klaar in een google-</w:t>
+      </w:r>
+      <w:proofErr w:type="spellStart"/>
+      <w:r>
+        <w:rPr>
+          <w:rFonts w:eastAsia="Times New Roman" w:cstheme="minorHAnsi"/>
+          <w:lang w:eastAsia="nl-BE"/>
+        </w:rPr>
+        <w:t>services.json</w:t>
+      </w:r>
+      <w:proofErr w:type="spellEnd"/>
+      <w:r>
+        <w:rPr>
+          <w:rFonts w:eastAsia="Times New Roman" w:cstheme="minorHAnsi"/>
+          <w:lang w:eastAsia="nl-BE"/>
+        </w:rPr>
+        <w:t xml:space="preserve"> file. Ik moest toen ook mijn SHA-1 </w:t>
+      </w:r>
+      <w:proofErr w:type="spellStart"/>
+      <w:r>
+        <w:rPr>
+          <w:rFonts w:eastAsia="Times New Roman" w:cstheme="minorHAnsi"/>
+          <w:lang w:eastAsia="nl-BE"/>
+        </w:rPr>
+        <w:t>fingerprint</w:t>
+      </w:r>
+      <w:proofErr w:type="spellEnd"/>
+      <w:r>
+        <w:rPr>
+          <w:rFonts w:eastAsia="Times New Roman" w:cstheme="minorHAnsi"/>
+          <w:lang w:eastAsia="nl-BE"/>
+        </w:rPr>
+        <w:t xml:space="preserve"> verwijderen bij de onderstaande afbeelding, maar dat mocht daar eigenlijk blijven staan.</w:t>
       </w:r>
       <w:r>
         <w:rPr>
@@ -2093,7 +2958,15 @@
       </w:pPr>
       <w:r>
         <w:lastRenderedPageBreak/>
-        <w:t>Wat ik wil realiseen deze week:</w:t>
+        <w:t xml:space="preserve">Wat ik wil </w:t>
+      </w:r>
+      <w:proofErr w:type="spellStart"/>
+      <w:r>
+        <w:t>realiseen</w:t>
+      </w:r>
+      <w:proofErr w:type="spellEnd"/>
+      <w:r>
+        <w:t xml:space="preserve"> deze week:</w:t>
       </w:r>
     </w:p>
     <w:p>
@@ -2104,8 +2977,13 @@
           <w:numId w:val="2"/>
         </w:numPr>
       </w:pPr>
-      <w:r>
-        <w:t xml:space="preserve">Firebase </w:t>
+      <w:proofErr w:type="spellStart"/>
+      <w:r>
+        <w:t>Firebase</w:t>
+      </w:r>
+      <w:proofErr w:type="spellEnd"/>
+      <w:r>
+        <w:t xml:space="preserve"> </w:t>
       </w:r>
       <w:r>
         <w:t>storage</w:t>
@@ -2147,13 +3025,29 @@
     </w:p>
     <w:p>
       <w:r>
-        <w:t>Vandaag ben ik begonnen met aanmaken van de Firebase storage voor het opslaan van afbeeldingen.</w:t>
+        <w:t xml:space="preserve">Vandaag ben ik begonnen met aanmaken van de </w:t>
+      </w:r>
+      <w:proofErr w:type="spellStart"/>
+      <w:r>
+        <w:t>Firebase</w:t>
+      </w:r>
+      <w:proofErr w:type="spellEnd"/>
+      <w:r>
+        <w:t xml:space="preserve"> storage voor het opslaan van afbeeldingen.</w:t>
       </w:r>
       <w:r>
         <w:t xml:space="preserve"> </w:t>
       </w:r>
       <w:r>
-        <w:t xml:space="preserve">Ik heb dan de dependencies toegevoegd en dan moest ik een Cloud storage bucket aanmaken. Hierbij werd er gevraagd om een locatie te kiezen waarbij Europe-west 1 (= Belgische regio) niet tussen stond, maar gelukkig is er Eur3 die eigenlijk Belgische en Nederlandse regio voorstelt. Dat werd uitgelegd </w:t>
+        <w:t xml:space="preserve">Ik heb dan de </w:t>
+      </w:r>
+      <w:proofErr w:type="spellStart"/>
+      <w:r>
+        <w:t>dependencies</w:t>
+      </w:r>
+      <w:proofErr w:type="spellEnd"/>
+      <w:r>
+        <w:t xml:space="preserve"> toegevoegd en dan moest ik een Cloud storage bucket aanmaken. Hierbij werd er gevraagd om een locatie te kiezen waarbij Europe-west 1 (= Belgische regio) niet tussen stond, maar gelukkig is er Eur3 die eigenlijk Belgische en Nederlandse regio voorstelt. Dat werd uitgelegd </w:t>
       </w:r>
       <w:r>
         <w:t>op deze webpagina</w:t>
@@ -2266,12 +3160,52 @@
     </w:p>
     <w:p>
       <w:r>
-        <w:t xml:space="preserve">Vandaag heb ik de java code moet schrijven voor de camera te kunnen gebruiken. Eerst heb ik code toegevoegd dat ervoor zorgt dat de permissies worden aangevraagd om de camera te kunnen gebruiken. Daarna als ik allow klik dan opent een test camera zicht van de emulator. </w:t>
-      </w:r>
-    </w:p>
-    <w:p>
-      <w:r>
-        <w:t>Hierbij werden gelijkaardig methoden gebruikt zoals de firebase authentication, maar waren ook deprecated. Dit heb natuurlijk makkelijk opgelost.</w:t>
+        <w:t xml:space="preserve">Vandaag heb ik de </w:t>
+      </w:r>
+      <w:proofErr w:type="spellStart"/>
+      <w:r>
+        <w:t>java</w:t>
+      </w:r>
+      <w:proofErr w:type="spellEnd"/>
+      <w:r>
+        <w:t xml:space="preserve"> code moet schrijven voor de camera te kunnen gebruiken. Eerst heb ik code toegevoegd dat ervoor zorgt dat de permissies worden aangevraagd om de camera te kunnen gebruiken. Daarna als ik </w:t>
+      </w:r>
+      <w:proofErr w:type="spellStart"/>
+      <w:r>
+        <w:t>allow</w:t>
+      </w:r>
+      <w:proofErr w:type="spellEnd"/>
+      <w:r>
+        <w:t xml:space="preserve"> klik dan opent een test camera zicht van de emulator. </w:t>
+      </w:r>
+    </w:p>
+    <w:p>
+      <w:r>
+        <w:t xml:space="preserve">Hierbij werden gelijkaardig methoden gebruikt zoals de </w:t>
+      </w:r>
+      <w:proofErr w:type="spellStart"/>
+      <w:r>
+        <w:t>firebase</w:t>
+      </w:r>
+      <w:proofErr w:type="spellEnd"/>
+      <w:r>
+        <w:t xml:space="preserve"> </w:t>
+      </w:r>
+      <w:proofErr w:type="spellStart"/>
+      <w:r>
+        <w:t>authentication</w:t>
+      </w:r>
+      <w:proofErr w:type="spellEnd"/>
+      <w:r>
+        <w:t xml:space="preserve">, maar waren ook </w:t>
+      </w:r>
+      <w:proofErr w:type="spellStart"/>
+      <w:r>
+        <w:t>deprecated</w:t>
+      </w:r>
+      <w:proofErr w:type="spellEnd"/>
+      <w:r>
+        <w:t>. Dit heb natuurlijk makkelijk opgelost.</w:t>
       </w:r>
     </w:p>
     <w:p>
@@ -2345,7 +3279,15 @@
     </w:p>
     <w:p>
       <w:r>
-        <w:t>Vandaag heb ik geprobeerd om de image die getrokken wordt op te slaan in firebase storage</w:t>
+        <w:t xml:space="preserve">Vandaag heb ik geprobeerd om de image die getrokken wordt op te slaan in </w:t>
+      </w:r>
+      <w:proofErr w:type="spellStart"/>
+      <w:r>
+        <w:t>firebase</w:t>
+      </w:r>
+      <w:proofErr w:type="spellEnd"/>
+      <w:r>
+        <w:t xml:space="preserve"> storage</w:t>
       </w:r>
       <w:r>
         <w:t>. Dit is op het einde van de les gelukt.</w:t>
@@ -2399,10 +3341,90 @@
     <w:p>
       <w:r>
         <w:lastRenderedPageBreak/>
-        <w:t xml:space="preserve">Hierbij had ik vooral problemen met de uri oftewl URL omdat firebase die nodig had om te kunnen uploaden. Als je naar de eerste rode streep kijkt is er een methode voor </w:t>
-      </w:r>
-      <w:r>
-        <w:t>de bitmap die je krijgt van de camera te gebruiken om de uri te bepalen. De volgende is voor de bestandextensie te krijgen om een filename op te stellen in de firebase storage. Hierbij pak ik gewoon het tijdstip met de bestandextensie, maar ik ben misschien van plan om de filename te kunnen aanpassen door de gebruiker. De laatste streep zijn twee child methods waarbij dus de eerste de map voorstelt waar dan de 2</w:t>
+        <w:t xml:space="preserve">Hierbij had ik vooral problemen met de </w:t>
+      </w:r>
+      <w:proofErr w:type="spellStart"/>
+      <w:r>
+        <w:t>uri</w:t>
+      </w:r>
+      <w:proofErr w:type="spellEnd"/>
+      <w:r>
+        <w:t xml:space="preserve"> </w:t>
+      </w:r>
+      <w:proofErr w:type="spellStart"/>
+      <w:r>
+        <w:t>oftewl</w:t>
+      </w:r>
+      <w:proofErr w:type="spellEnd"/>
+      <w:r>
+        <w:t xml:space="preserve"> URL omdat </w:t>
+      </w:r>
+      <w:proofErr w:type="spellStart"/>
+      <w:r>
+        <w:t>firebase</w:t>
+      </w:r>
+      <w:proofErr w:type="spellEnd"/>
+      <w:r>
+        <w:t xml:space="preserve"> die nodig had om te kunnen uploaden. Als je naar de eerste rode streep kijkt is er een methode voor </w:t>
+      </w:r>
+      <w:r>
+        <w:t xml:space="preserve">de </w:t>
+      </w:r>
+      <w:proofErr w:type="spellStart"/>
+      <w:r>
+        <w:t>bitmap</w:t>
+      </w:r>
+      <w:proofErr w:type="spellEnd"/>
+      <w:r>
+        <w:t xml:space="preserve"> die je krijgt van de camera te gebruiken om de </w:t>
+      </w:r>
+      <w:proofErr w:type="spellStart"/>
+      <w:r>
+        <w:t>uri</w:t>
+      </w:r>
+      <w:proofErr w:type="spellEnd"/>
+      <w:r>
+        <w:t xml:space="preserve"> te bepalen. De volgende is voor de bestandextensie te krijgen om een </w:t>
+      </w:r>
+      <w:proofErr w:type="spellStart"/>
+      <w:r>
+        <w:t>filename</w:t>
+      </w:r>
+      <w:proofErr w:type="spellEnd"/>
+      <w:r>
+        <w:t xml:space="preserve"> op te stellen in de </w:t>
+      </w:r>
+      <w:proofErr w:type="spellStart"/>
+      <w:r>
+        <w:t>firebase</w:t>
+      </w:r>
+      <w:proofErr w:type="spellEnd"/>
+      <w:r>
+        <w:t xml:space="preserve"> storage. Hierbij pak ik gewoon het tijdstip met de bestandextensie, maar ik ben misschien van plan om de </w:t>
+      </w:r>
+      <w:proofErr w:type="spellStart"/>
+      <w:r>
+        <w:t>filename</w:t>
+      </w:r>
+      <w:proofErr w:type="spellEnd"/>
+      <w:r>
+        <w:t xml:space="preserve"> te kunnen aanpassen door de gebruiker. De laatste streep zijn twee </w:t>
+      </w:r>
+      <w:proofErr w:type="spellStart"/>
+      <w:r>
+        <w:t>child</w:t>
+      </w:r>
+      <w:proofErr w:type="spellEnd"/>
+      <w:r>
+        <w:t xml:space="preserve"> </w:t>
+      </w:r>
+      <w:proofErr w:type="spellStart"/>
+      <w:r>
+        <w:t>methods</w:t>
+      </w:r>
+      <w:proofErr w:type="spellEnd"/>
+      <w:r>
+        <w:t xml:space="preserve"> waarbij dus de eerste de map voorstelt waar dan de 2</w:t>
       </w:r>
       <w:r>
         <w:rPr>
@@ -2411,7 +3433,15 @@
         <w:t>de</w:t>
       </w:r>
       <w:r>
-        <w:t xml:space="preserve"> child oftewel de image inkomt. De map geef ik  het email adres van de gebruiker als naam.</w:t>
+        <w:t xml:space="preserve"> </w:t>
+      </w:r>
+      <w:proofErr w:type="spellStart"/>
+      <w:r>
+        <w:t>child</w:t>
+      </w:r>
+      <w:proofErr w:type="spellEnd"/>
+      <w:r>
+        <w:t xml:space="preserve"> oftewel de image inkomt. De map geef ik  het email adres van de gebruiker als naam.</w:t>
       </w:r>
     </w:p>
     <w:p>
@@ -2512,7 +3542,15 @@
         <w:pStyle w:val="Kop3"/>
       </w:pPr>
       <w:r>
-        <w:t>Wat ik wil realiseen deze week:</w:t>
+        <w:t xml:space="preserve">Wat ik wil </w:t>
+      </w:r>
+      <w:proofErr w:type="spellStart"/>
+      <w:r>
+        <w:t>realiseen</w:t>
+      </w:r>
+      <w:proofErr w:type="spellEnd"/>
+      <w:r>
+        <w:t xml:space="preserve"> deze week:</w:t>
       </w:r>
     </w:p>
     <w:p>
@@ -2545,7 +3583,15 @@
         <w:t>je gsm</w:t>
       </w:r>
       <w:r>
-        <w:t xml:space="preserve"> gallery gebruiken)</w:t>
+        <w:t xml:space="preserve"> </w:t>
+      </w:r>
+      <w:proofErr w:type="spellStart"/>
+      <w:r>
+        <w:t>gallery</w:t>
+      </w:r>
+      <w:proofErr w:type="spellEnd"/>
+      <w:r>
+        <w:t xml:space="preserve"> gebruiken)</w:t>
       </w:r>
     </w:p>
     <w:p/>
@@ -2566,7 +3612,23 @@
     </w:p>
     <w:p>
       <w:r>
-        <w:t xml:space="preserve">Vandaag heb ik geprobeerd om een gridview toe te voegen die images bevat dat dus lijkt op een image gallery zoals uw “foto’s” app. Hierbij heb ik de </w:t>
+        <w:t xml:space="preserve">Vandaag heb ik geprobeerd om een </w:t>
+      </w:r>
+      <w:proofErr w:type="spellStart"/>
+      <w:r>
+        <w:t>gridview</w:t>
+      </w:r>
+      <w:proofErr w:type="spellEnd"/>
+      <w:r>
+        <w:t xml:space="preserve"> toe te voegen die images bevat dat dus lijkt op een image </w:t>
+      </w:r>
+      <w:proofErr w:type="spellStart"/>
+      <w:r>
+        <w:t>gallery</w:t>
+      </w:r>
+      <w:proofErr w:type="spellEnd"/>
+      <w:r>
+        <w:t xml:space="preserve"> zoals uw “foto’s” app. Hierbij heb ik de </w:t>
       </w:r>
       <w:r>
         <w:t>volgende</w:t>
@@ -2611,7 +3673,15 @@
     </w:p>
     <w:p>
       <w:r>
-        <w:t>Dit heeft nog niet direct resultaat gegeven, maar de GridAdapter class geeft een gevoel dat ik wel op de goeie weg zit.</w:t>
+        <w:t xml:space="preserve">Dit heeft nog niet direct resultaat gegeven, maar de </w:t>
+      </w:r>
+      <w:proofErr w:type="spellStart"/>
+      <w:r>
+        <w:t>GridAdapter</w:t>
+      </w:r>
+      <w:proofErr w:type="spellEnd"/>
+      <w:r>
+        <w:t xml:space="preserve"> class geeft een gevoel dat ik wel op de goeie weg zit.</w:t>
       </w:r>
     </w:p>
     <w:p/>
@@ -2632,7 +3702,31 @@
     </w:p>
     <w:p>
       <w:r>
-        <w:t>Na de GridAdapter klasse te controleren ontdekte ik dat ik gewoon het verkeerd image Id doorgegeven heb. Dit heeft het probleem onmiddellijk gefixed als zijn de voorbeeld images niet echt mooi gepositioneerd.</w:t>
+        <w:t xml:space="preserve">Na de </w:t>
+      </w:r>
+      <w:proofErr w:type="spellStart"/>
+      <w:r>
+        <w:t>GridAdapter</w:t>
+      </w:r>
+      <w:proofErr w:type="spellEnd"/>
+      <w:r>
+        <w:t xml:space="preserve"> klasse te controleren ontdekte ik dat ik gewoon het verkeerd image </w:t>
+      </w:r>
+      <w:proofErr w:type="spellStart"/>
+      <w:r>
+        <w:t>Id</w:t>
+      </w:r>
+      <w:proofErr w:type="spellEnd"/>
+      <w:r>
+        <w:t xml:space="preserve"> doorgegeven heb. Dit heeft het probleem onmiddellijk </w:t>
+      </w:r>
+      <w:proofErr w:type="spellStart"/>
+      <w:r>
+        <w:t>gefixed</w:t>
+      </w:r>
+      <w:proofErr w:type="spellEnd"/>
+      <w:r>
+        <w:t xml:space="preserve"> als zijn de voorbeeld images niet echt mooi gepositioneerd.</w:t>
       </w:r>
     </w:p>
     <w:p>
@@ -2686,7 +3780,15 @@
         <w:t>gedetailleerd</w:t>
       </w:r>
       <w:r>
-        <w:t xml:space="preserve"> tutorial gevolgd hoe je met een gridview kan werken:</w:t>
+        <w:t xml:space="preserve"> tutorial gevolgd hoe je met een </w:t>
+      </w:r>
+      <w:proofErr w:type="spellStart"/>
+      <w:r>
+        <w:t>gridview</w:t>
+      </w:r>
+      <w:proofErr w:type="spellEnd"/>
+      <w:r>
+        <w:t xml:space="preserve"> kan werken:</w:t>
       </w:r>
     </w:p>
     <w:p>
@@ -2701,10 +3803,58 @@
     </w:p>
     <w:p>
       <w:r>
-        <w:t xml:space="preserve">Daarna heb ik er nog voor gezorgd dat de margin top en bottom via java code worden aangepast afhankelijk van de </w:t>
-      </w:r>
-      <w:r>
-        <w:t>hoogte van de header en footer. Dit werdt gedaan in OnCreateView():</w:t>
+        <w:t xml:space="preserve">Daarna heb ik er nog voor gezorgd dat de </w:t>
+      </w:r>
+      <w:proofErr w:type="spellStart"/>
+      <w:r>
+        <w:t>margin</w:t>
+      </w:r>
+      <w:proofErr w:type="spellEnd"/>
+      <w:r>
+        <w:t xml:space="preserve"> top en </w:t>
+      </w:r>
+      <w:proofErr w:type="spellStart"/>
+      <w:r>
+        <w:t>bottom</w:t>
+      </w:r>
+      <w:proofErr w:type="spellEnd"/>
+      <w:r>
+        <w:t xml:space="preserve"> via </w:t>
+      </w:r>
+      <w:proofErr w:type="spellStart"/>
+      <w:r>
+        <w:t>java</w:t>
+      </w:r>
+      <w:proofErr w:type="spellEnd"/>
+      <w:r>
+        <w:t xml:space="preserve"> code worden aangepast afhankelijk van de </w:t>
+      </w:r>
+      <w:r>
+        <w:t xml:space="preserve">hoogte van de header en </w:t>
+      </w:r>
+      <w:proofErr w:type="spellStart"/>
+      <w:r>
+        <w:t>footer</w:t>
+      </w:r>
+      <w:proofErr w:type="spellEnd"/>
+      <w:r>
+        <w:t xml:space="preserve">. Dit </w:t>
+      </w:r>
+      <w:proofErr w:type="spellStart"/>
+      <w:r>
+        <w:t>werdt</w:t>
+      </w:r>
+      <w:proofErr w:type="spellEnd"/>
+      <w:r>
+        <w:t xml:space="preserve"> gedaan in </w:t>
+      </w:r>
+      <w:proofErr w:type="spellStart"/>
+      <w:r>
+        <w:t>OnCreateView</w:t>
+      </w:r>
+      <w:proofErr w:type="spellEnd"/>
+      <w:r>
+        <w:t>():</w:t>
       </w:r>
     </w:p>
     <w:p>
@@ -2752,13 +3902,66 @@
     </w:p>
     <w:p>
       <w:r>
-        <w:t>Ik heb dan de elementen een witte achtergrond gegeven en dan een border rond gedaan dat eigenlijk vrij moeilijk en inefficiënt moet worden opgeroepen in android studio door middel van een &lt;shape&gt; xml file te maken in de res/drawable folder en die een stroke</w:t>
-      </w:r>
+        <w:t xml:space="preserve">Ik heb dan de elementen een witte achtergrond gegeven en dan een border rond gedaan dat eigenlijk vrij moeilijk en inefficiënt moet worden opgeroepen in </w:t>
+      </w:r>
+      <w:proofErr w:type="spellStart"/>
+      <w:r>
+        <w:t>android</w:t>
+      </w:r>
+      <w:proofErr w:type="spellEnd"/>
+      <w:r>
+        <w:t xml:space="preserve"> studio door middel van een &lt;</w:t>
+      </w:r>
+      <w:proofErr w:type="spellStart"/>
+      <w:r>
+        <w:t>shape</w:t>
+      </w:r>
+      <w:proofErr w:type="spellEnd"/>
+      <w:r>
+        <w:t xml:space="preserve">&gt; </w:t>
+      </w:r>
+      <w:proofErr w:type="spellStart"/>
+      <w:r>
+        <w:t>xml</w:t>
+      </w:r>
+      <w:proofErr w:type="spellEnd"/>
+      <w:r>
+        <w:t xml:space="preserve"> file te maken in de </w:t>
+      </w:r>
+      <w:proofErr w:type="spellStart"/>
+      <w:r>
+        <w:t>res</w:t>
+      </w:r>
+      <w:proofErr w:type="spellEnd"/>
+      <w:r>
+        <w:t>/</w:t>
+      </w:r>
+      <w:proofErr w:type="spellStart"/>
+      <w:r>
+        <w:t>drawable</w:t>
+      </w:r>
+      <w:proofErr w:type="spellEnd"/>
+      <w:r>
+        <w:t xml:space="preserve"> folder en die een </w:t>
+      </w:r>
+      <w:proofErr w:type="spellStart"/>
+      <w:r>
+        <w:t>stroke</w:t>
+      </w:r>
+      <w:proofErr w:type="spellEnd"/>
       <w:r>
         <w:t>, enzoverder</w:t>
       </w:r>
       <w:r>
-        <w:t xml:space="preserve"> te geven. Dan wordt deze drawable als achtergrond geplaatst van de imageview.</w:t>
+        <w:t xml:space="preserve"> te geven. Dan wordt deze </w:t>
+      </w:r>
+      <w:proofErr w:type="spellStart"/>
+      <w:r>
+        <w:t>drawable</w:t>
+      </w:r>
+      <w:proofErr w:type="spellEnd"/>
+      <w:r>
+        <w:t xml:space="preserve"> als achtergrond geplaatst van de imageview.</w:t>
       </w:r>
       <w:r>
         <w:t xml:space="preserve"> De lege elementen zijn gewoon witte icoontjes die dus niet zichtbaar zijn door de witte achtergrond.</w:t>
@@ -2809,7 +4012,23 @@
     <w:p/>
     <w:p>
       <w:r>
-        <w:t>Om te eindigen, moest ik nog de images van firebase toevoegen hierbij heb ik vooral code van stackoverflow gebruikt om mijn oude klassen en methods te verbeteren.</w:t>
+        <w:t xml:space="preserve">Om te eindigen, moest ik nog de images van </w:t>
+      </w:r>
+      <w:proofErr w:type="spellStart"/>
+      <w:r>
+        <w:t>firebase</w:t>
+      </w:r>
+      <w:proofErr w:type="spellEnd"/>
+      <w:r>
+        <w:t xml:space="preserve"> toevoegen hierbij heb ik vooral code van stackoverflow gebruikt om mijn oude klassen en </w:t>
+      </w:r>
+      <w:proofErr w:type="spellStart"/>
+      <w:r>
+        <w:t>methods</w:t>
+      </w:r>
+      <w:proofErr w:type="spellEnd"/>
+      <w:r>
+        <w:t xml:space="preserve"> te verbeteren.</w:t>
       </w:r>
     </w:p>
     <w:p>
@@ -2854,6 +4073,162 @@
                     <a:xfrm>
                       <a:off x="0" y="0"/>
                       <a:ext cx="3182620" cy="6819900"/>
+                    </a:xfrm>
+                    <a:prstGeom prst="rect">
+                      <a:avLst/>
+                    </a:prstGeom>
+                  </pic:spPr>
+                </pic:pic>
+              </a:graphicData>
+            </a:graphic>
+          </wp:inline>
+        </w:drawing>
+      </w:r>
+    </w:p>
+    <w:p/>
+    <w:p>
+      <w:pPr>
+        <w:rPr>
+          <w:b/>
+          <w:bCs/>
+        </w:rPr>
+      </w:pPr>
+      <w:r>
+        <w:rPr>
+          <w:b/>
+          <w:bCs/>
+        </w:rPr>
+        <w:t>10/11/</w:t>
+      </w:r>
+      <w:r>
+        <w:rPr>
+          <w:b/>
+          <w:bCs/>
+        </w:rPr>
+        <w:t>2021:</w:t>
+      </w:r>
+    </w:p>
+    <w:p>
+      <w:r>
+        <w:t>Vandaag heb ik een verbeterd logo toegevoegd aan mijn app. Hierbij had ik eerst deze link gebruikt:</w:t>
+      </w:r>
+    </w:p>
+    <w:p>
+      <w:hyperlink r:id="rId53" w:history="1">
+        <w:r>
+          <w:rPr>
+            <w:rStyle w:val="Hyperlink"/>
+          </w:rPr>
+          <w:t>https://stackoverflow.com/questions/26615889/how-do-you-change-the-launcher-logo-of-an-app-in-android-studio</w:t>
+        </w:r>
+      </w:hyperlink>
+    </w:p>
+    <w:p>
+      <w:r>
+        <w:t xml:space="preserve">Ik had een image asset toegevoegd dat dus er voor zorgde dat de oude logo files worden vervangen. Hierbij heb een logo afbeelding als </w:t>
+      </w:r>
+      <w:proofErr w:type="spellStart"/>
+      <w:r>
+        <w:t>foreground</w:t>
+      </w:r>
+      <w:proofErr w:type="spellEnd"/>
+      <w:r>
+        <w:t xml:space="preserve"> en een transparant afbeelding als background. Maar dit wou niet helemaal werken door </w:t>
+      </w:r>
+      <w:proofErr w:type="spellStart"/>
+      <w:r>
+        <w:t>adaptive</w:t>
+      </w:r>
+      <w:proofErr w:type="spellEnd"/>
+      <w:r>
+        <w:t xml:space="preserve"> icon en </w:t>
+      </w:r>
+      <w:proofErr w:type="spellStart"/>
+      <w:r>
+        <w:t>legacy</w:t>
+      </w:r>
+      <w:proofErr w:type="spellEnd"/>
+      <w:r>
+        <w:t xml:space="preserve"> optie. De app als het om mijn emulator </w:t>
+      </w:r>
+      <w:r>
+        <w:lastRenderedPageBreak/>
+        <w:t xml:space="preserve">staat kreeg een zwarte achtergrond omdat transparant niet bestaat bij </w:t>
+      </w:r>
+      <w:proofErr w:type="spellStart"/>
+      <w:r>
+        <w:t>adaptive</w:t>
+      </w:r>
+      <w:proofErr w:type="spellEnd"/>
+      <w:r>
+        <w:t xml:space="preserve"> </w:t>
+      </w:r>
+      <w:proofErr w:type="spellStart"/>
+      <w:r>
+        <w:t>icons</w:t>
+      </w:r>
+      <w:proofErr w:type="spellEnd"/>
+      <w:r>
+        <w:t xml:space="preserve">. Dus wat ik gedaan had was het gewoon op </w:t>
+      </w:r>
+      <w:proofErr w:type="spellStart"/>
+      <w:r>
+        <w:t>legacy</w:t>
+      </w:r>
+      <w:proofErr w:type="spellEnd"/>
+      <w:r>
+        <w:t xml:space="preserve"> </w:t>
+      </w:r>
+      <w:proofErr w:type="spellStart"/>
+      <w:r>
+        <w:t>only</w:t>
+      </w:r>
+      <w:proofErr w:type="spellEnd"/>
+      <w:r>
+        <w:t xml:space="preserve"> optie zetten waar ik gewoon eigenlijk de background kan weghalen door de </w:t>
+      </w:r>
+      <w:proofErr w:type="spellStart"/>
+      <w:r>
+        <w:t>shape</w:t>
+      </w:r>
+      <w:proofErr w:type="spellEnd"/>
+      <w:r>
+        <w:t xml:space="preserve"> als cirkel aan te duiden</w:t>
+      </w:r>
+      <w:r>
+        <w:t>.</w:t>
+      </w:r>
+    </w:p>
+    <w:p>
+      <w:r>
+        <w:rPr>
+          <w:noProof/>
+        </w:rPr>
+        <w:drawing>
+          <wp:inline distT="0" distB="0" distL="0" distR="0" wp14:anchorId="16BA6F58" wp14:editId="09BC3542">
+            <wp:extent cx="2272467" cy="4152900"/>
+            <wp:effectExtent l="0" t="0" r="0" b="0"/>
+            <wp:docPr id="25" name="Afbeelding 25"/>
+            <wp:cNvGraphicFramePr>
+              <a:graphicFrameLocks xmlns:a="http://schemas.openxmlformats.org/drawingml/2006/main" noChangeAspect="1"/>
+            </wp:cNvGraphicFramePr>
+            <a:graphic xmlns:a="http://schemas.openxmlformats.org/drawingml/2006/main">
+              <a:graphicData uri="http://schemas.openxmlformats.org/drawingml/2006/picture">
+                <pic:pic xmlns:pic="http://schemas.openxmlformats.org/drawingml/2006/picture">
+                  <pic:nvPicPr>
+                    <pic:cNvPr id="1" name=""/>
+                    <pic:cNvPicPr/>
+                  </pic:nvPicPr>
+                  <pic:blipFill>
+                    <a:blip r:embed="rId54"/>
+                    <a:stretch>
+                      <a:fillRect/>
+                    </a:stretch>
+                  </pic:blipFill>
+                  <pic:spPr>
+                    <a:xfrm>
+                      <a:off x="0" y="0"/>
+                      <a:ext cx="2274416" cy="4156462"/>
                     </a:xfrm>
                     <a:prstGeom prst="rect">
                       <a:avLst/>

</xml_diff>

<commit_message>
App will now open starting page when already logged in and made an android app bundle for release on google play
</commit_message>
<xml_diff>
--- a/Logboek_Dries_Fierens.docx
+++ b/Logboek_Dries_Fierens.docx
@@ -3055,10 +3055,7 @@
         <w:pStyle w:val="Kop2"/>
       </w:pPr>
       <w:r>
-        <w:t xml:space="preserve">Week </w:t>
-      </w:r>
-      <w:r>
-        <w:t>8</w:t>
+        <w:t>Week 8</w:t>
       </w:r>
     </w:p>
     <w:p>
@@ -3093,7 +3090,129 @@
         <w:t>Vragen dat het ok is om je image te compressen (quality verlies?)</w:t>
       </w:r>
     </w:p>
+    <w:p>
+      <w:pPr>
+        <w:pStyle w:val="Lijstalinea"/>
+        <w:numPr>
+          <w:ilvl w:val="0"/>
+          <w:numId w:val="2"/>
+        </w:numPr>
+      </w:pPr>
+      <w:r>
+        <w:t>Image van de gridview kunnen openen in full size</w:t>
+      </w:r>
+    </w:p>
+    <w:p>
+      <w:pPr>
+        <w:pStyle w:val="Lijstalinea"/>
+        <w:numPr>
+          <w:ilvl w:val="0"/>
+          <w:numId w:val="2"/>
+        </w:numPr>
+      </w:pPr>
+      <w:r>
+        <w:t>App op google playstore plaatsen!!</w:t>
+      </w:r>
+    </w:p>
+    <w:p>
+      <w:pPr>
+        <w:pStyle w:val="Lijstalinea"/>
+        <w:numPr>
+          <w:ilvl w:val="0"/>
+          <w:numId w:val="2"/>
+        </w:numPr>
+      </w:pPr>
+      <w:r>
+        <w:t>Offfline functionaliteiten toevoegen?</w:t>
+      </w:r>
+    </w:p>
     <w:p/>
+    <w:p>
+      <w:r>
+        <w:t xml:space="preserve">Vandaag wou ik beginnen met het uploaden van mijn app op google play maar toen ik tutorial volgde moest ik eerst mijn app package name veranderen want com.example is niet correct. Toen ik dat veranderen </w:t>
+      </w:r>
+      <w:r>
+        <w:t>werkte de google services niet meer want de package name was com.example in de google-services.json file. Dus ik moest mijn app in firebase opnieuw maken dat niet echt moeilijk was.</w:t>
+      </w:r>
+      <w:r>
+        <w:t xml:space="preserve"> Daarna heb ik een android app bundle aangemaakt want dit is nodig voor de release.</w:t>
+      </w:r>
+      <w:r>
+        <w:t xml:space="preserve"> Ze vroeg dan om developer account aan te maken waarbij ik 1 keer 25 euro moest betalen. Daarbij was ik effe gestopt want mijn ouders waren niet thuis voor een mastercard te gebruiken.</w:t>
+      </w:r>
+    </w:p>
+    <w:p>
+      <w:pPr>
+        <w:rPr>
+          <w:rStyle w:val="Hyperlink"/>
+        </w:rPr>
+      </w:pPr>
+      <w:hyperlink r:id="rId57" w:history="1">
+        <w:r>
+          <w:rPr>
+            <w:rStyle w:val="Hyperlink"/>
+          </w:rPr>
+          <w:t>https://www.youtube.com/watch?v=nHaep1HBIwM</w:t>
+        </w:r>
+      </w:hyperlink>
+    </w:p>
+    <w:p>
+      <w:r>
+        <w:t>Ik heb dan ervoor gezorgd dat de user ingelogd blijft. Dit was vrij simpel</w:t>
+      </w:r>
+      <w:r>
+        <w:t>.</w:t>
+      </w:r>
+    </w:p>
+    <w:p>
+      <w:pPr>
+        <w:rPr>
+          <w:color w:val="0563C1" w:themeColor="hyperlink"/>
+          <w:u w:val="single"/>
+        </w:rPr>
+      </w:pPr>
+      <w:r>
+        <w:rPr>
+          <w:noProof/>
+        </w:rPr>
+        <w:lastRenderedPageBreak/>
+        <w:drawing>
+          <wp:inline distT="0" distB="0" distL="0" distR="0" wp14:anchorId="6023EAD6" wp14:editId="388B85E8">
+            <wp:extent cx="5760720" cy="1306830"/>
+            <wp:effectExtent l="0" t="0" r="0" b="7620"/>
+            <wp:docPr id="27" name="Afbeelding 27"/>
+            <wp:cNvGraphicFramePr>
+              <a:graphicFrameLocks xmlns:a="http://schemas.openxmlformats.org/drawingml/2006/main" noChangeAspect="1"/>
+            </wp:cNvGraphicFramePr>
+            <a:graphic xmlns:a="http://schemas.openxmlformats.org/drawingml/2006/main">
+              <a:graphicData uri="http://schemas.openxmlformats.org/drawingml/2006/picture">
+                <pic:pic xmlns:pic="http://schemas.openxmlformats.org/drawingml/2006/picture">
+                  <pic:nvPicPr>
+                    <pic:cNvPr id="1" name=""/>
+                    <pic:cNvPicPr/>
+                  </pic:nvPicPr>
+                  <pic:blipFill>
+                    <a:blip r:embed="rId58"/>
+                    <a:stretch>
+                      <a:fillRect/>
+                    </a:stretch>
+                  </pic:blipFill>
+                  <pic:spPr>
+                    <a:xfrm>
+                      <a:off x="0" y="0"/>
+                      <a:ext cx="5760720" cy="1306830"/>
+                    </a:xfrm>
+                    <a:prstGeom prst="rect">
+                      <a:avLst/>
+                    </a:prstGeom>
+                  </pic:spPr>
+                </pic:pic>
+              </a:graphicData>
+            </a:graphic>
+          </wp:inline>
+        </w:drawing>
+      </w:r>
+    </w:p>
     <w:p/>
     <w:p/>
     <w:p/>

</xml_diff>

<commit_message>
Added password validation and toast message will now appear for an longer period of time.
</commit_message>
<xml_diff>
--- a/Logboek_Dries_Fierens.docx
+++ b/Logboek_Dries_Fierens.docx
@@ -46,7 +46,39 @@
         <w:t>applicatie</w:t>
       </w:r>
       <w:r>
-        <w:t xml:space="preserve"> die je kan maken en welke technologieën je kan gebruiken. Ik heb voor native gekozen want dat past het best bij mijn aftakking “Software developer” sinds het java inhoudt. De anderen zijn hybrid en progressive web app dat dus meer te maken hebben met web &amp; mobile dus vooral HTML &amp; CSS. We moesten dan ook nog kiezen voor een project idee, waarbij ik koos voor een scanner + pdf converter app</w:t>
+        <w:t xml:space="preserve"> die je kan maken en welke technologieën je kan gebruiken. Ik heb voor native gekozen want dat past het best bij mijn aftakking “Software </w:t>
+      </w:r>
+      <w:proofErr w:type="spellStart"/>
+      <w:r>
+        <w:t>developer</w:t>
+      </w:r>
+      <w:proofErr w:type="spellEnd"/>
+      <w:r>
+        <w:t xml:space="preserve">” sinds het </w:t>
+      </w:r>
+      <w:proofErr w:type="spellStart"/>
+      <w:r>
+        <w:t>java</w:t>
+      </w:r>
+      <w:proofErr w:type="spellEnd"/>
+      <w:r>
+        <w:t xml:space="preserve"> inhoudt. De anderen zijn </w:t>
+      </w:r>
+      <w:proofErr w:type="spellStart"/>
+      <w:r>
+        <w:t>hybrid</w:t>
+      </w:r>
+      <w:proofErr w:type="spellEnd"/>
+      <w:r>
+        <w:t xml:space="preserve"> en </w:t>
+      </w:r>
+      <w:proofErr w:type="spellStart"/>
+      <w:r>
+        <w:t>progressive</w:t>
+      </w:r>
+      <w:proofErr w:type="spellEnd"/>
+      <w:r>
+        <w:t xml:space="preserve"> web app dat dus meer te maken hebben met web &amp; mobile dus vooral HTML &amp; CSS. We moesten dan ook nog kiezen voor een project idee, waarbij ik koos voor een scanner + pdf converter app</w:t>
       </w:r>
       <w:r>
         <w:t xml:space="preserve"> waarbij het vooral bedoelt is o</w:t>
@@ -73,20 +105,92 @@
         <w:t xml:space="preserve"> </w:t>
       </w:r>
       <w:r>
-        <w:t>Als back-end koos ik Firebase en als technologie koos ik in java te werken om een android app te maken in plaats van een IOS app.</w:t>
-      </w:r>
-      <w:r>
-        <w:t xml:space="preserve"> Want ik heb een huawei.</w:t>
-      </w:r>
-    </w:p>
-    <w:p>
-      <w:r>
-        <w:t>Ik heb dit allemaal grondiger beschreven in mijn “app idee”.pdf. Dit staat ondertussen op de repository die we moesten maken.</w:t>
-      </w:r>
-    </w:p>
-    <w:p>
-      <w:r>
-        <w:t>Om af te sluiten had ik al ondertussen een goede naam gevonden gebaseerd op de applicatie genaamd Scannable. Ik heb dus besloten om mijn applicatie Notable te noemen.</w:t>
+        <w:t xml:space="preserve">Als </w:t>
+      </w:r>
+      <w:proofErr w:type="spellStart"/>
+      <w:r>
+        <w:t>back-end</w:t>
+      </w:r>
+      <w:proofErr w:type="spellEnd"/>
+      <w:r>
+        <w:t xml:space="preserve"> koos ik </w:t>
+      </w:r>
+      <w:proofErr w:type="spellStart"/>
+      <w:r>
+        <w:t>Firebase</w:t>
+      </w:r>
+      <w:proofErr w:type="spellEnd"/>
+      <w:r>
+        <w:t xml:space="preserve"> en als technologie koos ik in </w:t>
+      </w:r>
+      <w:proofErr w:type="spellStart"/>
+      <w:r>
+        <w:t>java</w:t>
+      </w:r>
+      <w:proofErr w:type="spellEnd"/>
+      <w:r>
+        <w:t xml:space="preserve"> te werken om een </w:t>
+      </w:r>
+      <w:proofErr w:type="spellStart"/>
+      <w:r>
+        <w:t>android</w:t>
+      </w:r>
+      <w:proofErr w:type="spellEnd"/>
+      <w:r>
+        <w:t xml:space="preserve"> app te maken in plaats van een IOS app.</w:t>
+      </w:r>
+      <w:r>
+        <w:t xml:space="preserve"> Want ik heb een </w:t>
+      </w:r>
+      <w:proofErr w:type="spellStart"/>
+      <w:r>
+        <w:t>huawei</w:t>
+      </w:r>
+      <w:proofErr w:type="spellEnd"/>
+      <w:r>
+        <w:t>.</w:t>
+      </w:r>
+    </w:p>
+    <w:p>
+      <w:r>
+        <w:t xml:space="preserve">Ik heb dit allemaal grondiger beschreven in mijn “app </w:t>
+      </w:r>
+      <w:proofErr w:type="spellStart"/>
+      <w:r>
+        <w:t>idee”.pdf</w:t>
+      </w:r>
+      <w:proofErr w:type="spellEnd"/>
+      <w:r>
+        <w:t xml:space="preserve">. Dit staat ondertussen op de </w:t>
+      </w:r>
+      <w:proofErr w:type="spellStart"/>
+      <w:r>
+        <w:t>repository</w:t>
+      </w:r>
+      <w:proofErr w:type="spellEnd"/>
+      <w:r>
+        <w:t xml:space="preserve"> die we moesten maken.</w:t>
+      </w:r>
+    </w:p>
+    <w:p>
+      <w:r>
+        <w:t xml:space="preserve">Om af te sluiten had ik al ondertussen een goede naam gevonden gebaseerd op de applicatie genaamd </w:t>
+      </w:r>
+      <w:proofErr w:type="spellStart"/>
+      <w:r>
+        <w:t>Scannable</w:t>
+      </w:r>
+      <w:proofErr w:type="spellEnd"/>
+      <w:r>
+        <w:t xml:space="preserve">. Ik heb dus besloten om mijn applicatie </w:t>
+      </w:r>
+      <w:proofErr w:type="spellStart"/>
+      <w:r>
+        <w:t>Notable</w:t>
+      </w:r>
+      <w:proofErr w:type="spellEnd"/>
+      <w:r>
+        <w:t xml:space="preserve"> te noemen.</w:t>
       </w:r>
     </w:p>
     <w:p>
@@ -120,7 +224,15 @@
     </w:p>
     <w:p>
       <w:r>
-        <w:t xml:space="preserve">Daarna moest ik gewoon begin aan een UI/UX design voor mijn applicatie, waarbij nog niet veel had gedaan omdat les niet meer lang duurde. Ik moest toen ook tegelijkertijd zoeken naar tutorials dus </w:t>
+        <w:t xml:space="preserve">Daarna moest ik gewoon begin aan een UI/UX design voor mijn applicatie, waarbij nog niet veel had gedaan omdat les niet meer lang duurde. Ik moest toen ook tegelijkertijd zoeken naar </w:t>
+      </w:r>
+      <w:proofErr w:type="spellStart"/>
+      <w:r>
+        <w:t>tutorials</w:t>
+      </w:r>
+      <w:proofErr w:type="spellEnd"/>
+      <w:r>
+        <w:t xml:space="preserve"> dus </w:t>
       </w:r>
       <w:r>
         <w:t>duurde dat ook kort.</w:t>
@@ -143,13 +255,26 @@
     </w:p>
     <w:p>
       <w:r>
-        <w:t xml:space="preserve">Vandaag in de namiddag begonnen we met de co-working les waarbij we dus informatie kunnen delen met medeleerlingen. Al was het de eerste les dus kwam daar niet veel van. Ik begon gewoon verder aan mijn </w:t>
-      </w:r>
+        <w:t>Vandaag in de namiddag begonnen we met de co-</w:t>
+      </w:r>
+      <w:proofErr w:type="spellStart"/>
+      <w:r>
+        <w:t>working</w:t>
+      </w:r>
+      <w:proofErr w:type="spellEnd"/>
+      <w:r>
+        <w:t xml:space="preserve"> les waarbij we dus informatie kunnen delen met medeleerlingen. Al was het de eerste les dus kwam daar niet veel van. Ik begon gewoon verder aan mijn </w:t>
+      </w:r>
+      <w:proofErr w:type="spellStart"/>
       <w:r>
         <w:t>F</w:t>
       </w:r>
       <w:r>
-        <w:t>igma design.</w:t>
+        <w:t>igma</w:t>
+      </w:r>
+      <w:proofErr w:type="spellEnd"/>
+      <w:r>
+        <w:t xml:space="preserve"> design.</w:t>
       </w:r>
     </w:p>
     <w:p>
@@ -200,7 +325,23 @@
     </w:p>
     <w:p>
       <w:r>
-        <w:t>Vandaag heb ik verder gewerkt aan mijn Figma design en het ging redelijk vlot vooruit. Ik wou absoluut dat het vandaag af was zodat ik morgen kan werken aan een ander vak. Tijdens het maken van het design heb ik vooral ook zitten op zoeken dat sommige concepten wel haalbaar zijn om te programmeren. Dit is allemaal wel mogelijk, maar zal wel een challenge zijn zoals de opmerkingen plaatsen</w:t>
+        <w:t xml:space="preserve">Vandaag heb ik verder gewerkt aan mijn </w:t>
+      </w:r>
+      <w:proofErr w:type="spellStart"/>
+      <w:r>
+        <w:t>Figma</w:t>
+      </w:r>
+      <w:proofErr w:type="spellEnd"/>
+      <w:r>
+        <w:t xml:space="preserve"> design en het ging redelijk vlot vooruit. Ik wou absoluut dat het vandaag af was zodat ik morgen kan werken aan een ander vak. Tijdens het maken van het design heb ik vooral ook zitten op zoeken dat sommige concepten wel haalbaar zijn om te programmeren. Dit is allemaal wel mogelijk, maar zal wel een </w:t>
+      </w:r>
+      <w:proofErr w:type="spellStart"/>
+      <w:r>
+        <w:t>challenge</w:t>
+      </w:r>
+      <w:proofErr w:type="spellEnd"/>
+      <w:r>
+        <w:t xml:space="preserve"> zijn zoals de opmerkingen plaatsen</w:t>
       </w:r>
       <w:r>
         <w:t>. M</w:t>
@@ -312,11 +453,48 @@
     </w:p>
     <w:p>
       <w:r>
-        <w:t xml:space="preserve">Vandaag werd mijn figma prototype gecontroleerd waarbij ik moest opnieuw uitleggen wat mijn app doet door middel van accurate presentatie. Ik legde dit vrij duidelijk uit en alles ging goed vooruit. Meneer Blancquaert heeft me dan ook nog een library genaamd “Material design” aangeraden om mijn applicatie te ontwerpen. </w:t>
-      </w:r>
-      <w:r>
-        <w:t>Blijkbaar Google gebruikt deze library</w:t>
-      </w:r>
+        <w:t xml:space="preserve">Vandaag werd mijn </w:t>
+      </w:r>
+      <w:proofErr w:type="spellStart"/>
+      <w:r>
+        <w:t>figma</w:t>
+      </w:r>
+      <w:proofErr w:type="spellEnd"/>
+      <w:r>
+        <w:t xml:space="preserve"> prototype gecontroleerd waarbij ik moest opnieuw uitleggen wat mijn app doet door middel van accurate presentatie. Ik legde dit vrij duidelijk uit en alles ging goed vooruit. Meneer </w:t>
+      </w:r>
+      <w:proofErr w:type="spellStart"/>
+      <w:r>
+        <w:t>Blancquaert</w:t>
+      </w:r>
+      <w:proofErr w:type="spellEnd"/>
+      <w:r>
+        <w:t xml:space="preserve"> heeft me dan ook nog een </w:t>
+      </w:r>
+      <w:proofErr w:type="spellStart"/>
+      <w:r>
+        <w:t>library</w:t>
+      </w:r>
+      <w:proofErr w:type="spellEnd"/>
+      <w:r>
+        <w:t xml:space="preserve"> genaamd “</w:t>
+      </w:r>
+      <w:proofErr w:type="spellStart"/>
+      <w:r>
+        <w:t>Material</w:t>
+      </w:r>
+      <w:proofErr w:type="spellEnd"/>
+      <w:r>
+        <w:t xml:space="preserve"> design” aangeraden om mijn applicatie te ontwerpen. </w:t>
+      </w:r>
+      <w:r>
+        <w:t xml:space="preserve">Blijkbaar Google gebruikt deze </w:t>
+      </w:r>
+      <w:proofErr w:type="spellStart"/>
+      <w:r>
+        <w:t>library</w:t>
+      </w:r>
+      <w:proofErr w:type="spellEnd"/>
       <w:r>
         <w:t xml:space="preserve"> om hun apps te maken.</w:t>
       </w:r>
@@ -354,7 +532,23 @@
         <w:t xml:space="preserve">kunt maken </w:t>
       </w:r>
       <w:r>
-        <w:t>om je app te testen. Als je developer modus in de settings van je gsm</w:t>
+        <w:t xml:space="preserve">om je app te testen. Als je </w:t>
+      </w:r>
+      <w:proofErr w:type="spellStart"/>
+      <w:r>
+        <w:t>developer</w:t>
+      </w:r>
+      <w:proofErr w:type="spellEnd"/>
+      <w:r>
+        <w:t xml:space="preserve"> modus in de </w:t>
+      </w:r>
+      <w:proofErr w:type="spellStart"/>
+      <w:r>
+        <w:t>settings</w:t>
+      </w:r>
+      <w:proofErr w:type="spellEnd"/>
+      <w:r>
+        <w:t xml:space="preserve"> van je gsm</w:t>
       </w:r>
       <w:r>
         <w:t xml:space="preserve"> aanzet, kan je je gsm verbinden met de pc en dus je applicatie daarop testen.</w:t>
@@ -372,7 +566,15 @@
     </w:p>
     <w:p>
       <w:r>
-        <w:t>Tijdens lange downloads heb ik ook mijn google account toegevoegd op Firebase. Volgens de presentatie die we kregen van een medestudent.</w:t>
+        <w:t xml:space="preserve">Tijdens lange downloads heb ik ook mijn google account toegevoegd op </w:t>
+      </w:r>
+      <w:proofErr w:type="spellStart"/>
+      <w:r>
+        <w:t>Firebase</w:t>
+      </w:r>
+      <w:proofErr w:type="spellEnd"/>
+      <w:r>
+        <w:t>. Volgens de presentatie die we kregen van een medestudent.</w:t>
       </w:r>
     </w:p>
     <w:p>
@@ -423,7 +625,23 @@
         <w:t>mijn</w:t>
       </w:r>
       <w:r>
-        <w:t xml:space="preserve"> figma design delen met meneer Blancquaert, toen hij vroeg dat mijn design klaar was</w:t>
+        <w:t xml:space="preserve"> </w:t>
+      </w:r>
+      <w:proofErr w:type="spellStart"/>
+      <w:r>
+        <w:t>figma</w:t>
+      </w:r>
+      <w:proofErr w:type="spellEnd"/>
+      <w:r>
+        <w:t xml:space="preserve"> design delen met meneer </w:t>
+      </w:r>
+      <w:proofErr w:type="spellStart"/>
+      <w:r>
+        <w:t>Blancquaert</w:t>
+      </w:r>
+      <w:proofErr w:type="spellEnd"/>
+      <w:r>
+        <w:t>, toen hij vroeg dat mijn design klaar was</w:t>
       </w:r>
       <w:r>
         <w:t xml:space="preserve"> of niet</w:t>
@@ -437,14 +655,38 @@
         <w:t>Ik heb daarna gewoon verder begonnen aan de tutorial die ik vorige week gebruikt had.</w:t>
       </w:r>
       <w:r>
-        <w:t xml:space="preserve"> Hierbij leerde ik meer over hoe ik Android studio beter kon gebruiken om mijn app te designen zoals hoe je </w:t>
+        <w:t xml:space="preserve"> Hierbij leerde ik meer over hoe ik Android studio beter kon gebruiken om mijn app te </w:t>
+      </w:r>
+      <w:proofErr w:type="spellStart"/>
+      <w:r>
+        <w:t>designen</w:t>
+      </w:r>
+      <w:proofErr w:type="spellEnd"/>
+      <w:r>
+        <w:t xml:space="preserve"> zoals hoe je </w:t>
       </w:r>
       <w:r>
         <w:lastRenderedPageBreak/>
-        <w:t>attributen kunt aanpassen (bv. color)</w:t>
-      </w:r>
-      <w:r>
-        <w:t xml:space="preserve">. Android studio is zeer gelijkaardig als bijvoorbeeld Webstorm, maar bij het design van een mobile app is het zeer </w:t>
+        <w:t xml:space="preserve">attributen kunt aanpassen (bv. </w:t>
+      </w:r>
+      <w:proofErr w:type="spellStart"/>
+      <w:r>
+        <w:t>color</w:t>
+      </w:r>
+      <w:proofErr w:type="spellEnd"/>
+      <w:r>
+        <w:t>)</w:t>
+      </w:r>
+      <w:r>
+        <w:t xml:space="preserve">. Android studio is zeer gelijkaardig als bijvoorbeeld </w:t>
+      </w:r>
+      <w:proofErr w:type="spellStart"/>
+      <w:r>
+        <w:t>Webstorm</w:t>
+      </w:r>
+      <w:proofErr w:type="spellEnd"/>
+      <w:r>
+        <w:t xml:space="preserve">, maar bij het design van een mobile app is het zeer </w:t>
       </w:r>
       <w:r>
         <w:t>verschillend</w:t>
@@ -453,7 +695,15 @@
         <w:t>.</w:t>
       </w:r>
       <w:r>
-        <w:t xml:space="preserve"> Bij Webstorm kan je je website </w:t>
+        <w:t xml:space="preserve"> Bij </w:t>
+      </w:r>
+      <w:proofErr w:type="spellStart"/>
+      <w:r>
+        <w:t>Webstorm</w:t>
+      </w:r>
+      <w:proofErr w:type="spellEnd"/>
+      <w:r>
+        <w:t xml:space="preserve"> kan je je website </w:t>
       </w:r>
       <w:r>
         <w:t>bekijken</w:t>
@@ -480,7 +730,15 @@
         <w:t>.</w:t>
       </w:r>
       <w:r>
-        <w:t xml:space="preserve"> Als ik de Jetbrains applicaties vergelijk met Visual studio 2019, </w:t>
+        <w:t xml:space="preserve"> Als ik de </w:t>
+      </w:r>
+      <w:proofErr w:type="spellStart"/>
+      <w:r>
+        <w:t>Jetbrains</w:t>
+      </w:r>
+      <w:proofErr w:type="spellEnd"/>
+      <w:r>
+        <w:t xml:space="preserve"> applicaties vergelijk met Visual studio 2019, </w:t>
       </w:r>
       <w:r>
         <w:t>heb ik er altijd moeite mee om de lay</w:t>
@@ -560,7 +818,15 @@
     </w:p>
     <w:p>
       <w:r>
-        <w:t>Ik heb dan ondertussen de tutorial van Material design gevolgd in plaats van die van Android studio. Ze leerde me dan hoe ik er mee kon werken maar niet hoe een hele nieuwe app kon maken. Ik kreeg een voorbeeld app om erin te kunnen werken voor de tutorial.</w:t>
+        <w:t xml:space="preserve">Ik heb dan ondertussen de tutorial van </w:t>
+      </w:r>
+      <w:proofErr w:type="spellStart"/>
+      <w:r>
+        <w:t>Material</w:t>
+      </w:r>
+      <w:proofErr w:type="spellEnd"/>
+      <w:r>
+        <w:t xml:space="preserve"> design gevolgd in plaats van die van Android studio. Ze leerde me dan hoe ik er mee kon werken maar niet hoe een hele nieuwe app kon maken. Ik kreeg een voorbeeld app om erin te kunnen werken voor de tutorial.</w:t>
       </w:r>
     </w:p>
     <w:p>
@@ -603,10 +869,34 @@
     </w:p>
     <w:p>
       <w:r>
-        <w:t>Vandaag heb ik de usertests afgelegd met Louis D’hondt en Jasper Wauters. Dit ging heel gemakkelijk en duurde niet lang. Ik had niet echt serieuze opmerkingen, behalve dat ik geen persoonlijke info pagina gemaakt had.</w:t>
-      </w:r>
-      <w:r>
-        <w:t xml:space="preserve"> Daarna heb ik onmiddellijk die opmerkingen van mijn figma design verbetert en op mijn repository gezet.</w:t>
+        <w:t xml:space="preserve">Vandaag heb ik de usertests afgelegd met Louis </w:t>
+      </w:r>
+      <w:proofErr w:type="spellStart"/>
+      <w:r>
+        <w:t>D’hondt</w:t>
+      </w:r>
+      <w:proofErr w:type="spellEnd"/>
+      <w:r>
+        <w:t xml:space="preserve"> en Jasper Wauters. Dit ging heel gemakkelijk en duurde niet lang. Ik had niet echt serieuze opmerkingen, behalve dat ik geen persoonlijke info pagina gemaakt had.</w:t>
+      </w:r>
+      <w:r>
+        <w:t xml:space="preserve"> Daarna heb ik onmiddellijk die opmerkingen van mijn </w:t>
+      </w:r>
+      <w:proofErr w:type="spellStart"/>
+      <w:r>
+        <w:t>figma</w:t>
+      </w:r>
+      <w:proofErr w:type="spellEnd"/>
+      <w:r>
+        <w:t xml:space="preserve"> design verbetert en op mijn </w:t>
+      </w:r>
+      <w:proofErr w:type="spellStart"/>
+      <w:r>
+        <w:t>repository</w:t>
+      </w:r>
+      <w:proofErr w:type="spellEnd"/>
+      <w:r>
+        <w:t xml:space="preserve"> gezet.</w:t>
       </w:r>
     </w:p>
     <w:p/>
@@ -629,7 +919,47 @@
     </w:p>
     <w:p>
       <w:r>
-        <w:t xml:space="preserve">Vandaag begon ik eindelijk met Material Design. Ik besloot mijn oude app te verwijderen en te vervangen met een empty activity zodat ik echt van scratch begin. Zo kan ik alles beter begrijpen. Ik had dan ontdekt dat android studio al automatisch Material Design van Google had toegevoegd bij de dependencies, dus eigenlijk ben ik </w:t>
+        <w:t xml:space="preserve">Vandaag begon ik eindelijk met </w:t>
+      </w:r>
+      <w:proofErr w:type="spellStart"/>
+      <w:r>
+        <w:t>Material</w:t>
+      </w:r>
+      <w:proofErr w:type="spellEnd"/>
+      <w:r>
+        <w:t xml:space="preserve"> Design. Ik besloot mijn oude app te verwijderen en te vervangen met een empty </w:t>
+      </w:r>
+      <w:proofErr w:type="spellStart"/>
+      <w:r>
+        <w:t>activity</w:t>
+      </w:r>
+      <w:proofErr w:type="spellEnd"/>
+      <w:r>
+        <w:t xml:space="preserve"> zodat ik echt van scratch begin. Zo kan ik alles beter begrijpen. Ik had dan ontdekt dat </w:t>
+      </w:r>
+      <w:proofErr w:type="spellStart"/>
+      <w:r>
+        <w:t>android</w:t>
+      </w:r>
+      <w:proofErr w:type="spellEnd"/>
+      <w:r>
+        <w:t xml:space="preserve"> studio al automatisch </w:t>
+      </w:r>
+      <w:proofErr w:type="spellStart"/>
+      <w:r>
+        <w:t>Material</w:t>
+      </w:r>
+      <w:proofErr w:type="spellEnd"/>
+      <w:r>
+        <w:t xml:space="preserve"> Design van Google had toegevoegd bij de </w:t>
+      </w:r>
+      <w:proofErr w:type="spellStart"/>
+      <w:r>
+        <w:t>dependencies</w:t>
+      </w:r>
+      <w:proofErr w:type="spellEnd"/>
+      <w:r>
+        <w:t xml:space="preserve">, dus eigenlijk ben ik </w:t>
       </w:r>
       <w:r>
         <w:t>onmiddellijk</w:t>
@@ -773,18 +1103,50 @@
     </w:p>
     <w:p>
       <w:r>
-        <w:t>Eerst had ik geprobeerd om gewoon een heel nieuw project te maken die bestond uit een login activity. Deze activity heb ik dan gewoon aangepast naar mijn wens. Maar dit wou ook niet echt werken, want blijkbaar is het best dat je van een main</w:t>
+        <w:t xml:space="preserve">Eerst had ik geprobeerd om gewoon een heel nieuw project te maken die bestond uit een login </w:t>
+      </w:r>
+      <w:proofErr w:type="spellStart"/>
+      <w:r>
+        <w:t>activity</w:t>
+      </w:r>
+      <w:proofErr w:type="spellEnd"/>
+      <w:r>
+        <w:t xml:space="preserve">. Deze </w:t>
+      </w:r>
+      <w:proofErr w:type="spellStart"/>
+      <w:r>
+        <w:t>activity</w:t>
+      </w:r>
+      <w:proofErr w:type="spellEnd"/>
+      <w:r>
+        <w:t xml:space="preserve"> heb ik dan gewoon aangepast naar mijn wens. Maar dit wou ook niet echt werken, want blijkbaar is het best dat je van een </w:t>
+      </w:r>
+      <w:proofErr w:type="spellStart"/>
+      <w:r>
+        <w:t>main</w:t>
       </w:r>
       <w:r>
         <w:t>_</w:t>
       </w:r>
       <w:r>
-        <w:t>activity start en dan de login page daarmee opent.</w:t>
-      </w:r>
-    </w:p>
-    <w:p>
-      <w:r>
-        <w:t>Ik ben dan gewoon terug begonnen aan het oude project en heb dan de error op stack overflow gezocht en daar had ik de oplossing gevonden. Ik moest gewoon mijn “device” zijn data wipen en dan kon het opnieuw installeren want mijn oude projecten stond er nog op.</w:t>
+        <w:t>activity</w:t>
+      </w:r>
+      <w:proofErr w:type="spellEnd"/>
+      <w:r>
+        <w:t xml:space="preserve"> start en dan de login page daarmee opent.</w:t>
+      </w:r>
+    </w:p>
+    <w:p>
+      <w:r>
+        <w:t xml:space="preserve">Ik ben dan gewoon terug begonnen aan het oude project en heb dan de error op stack overflow gezocht en daar had ik de oplossing gevonden. Ik moest gewoon mijn “device” zijn data </w:t>
+      </w:r>
+      <w:proofErr w:type="spellStart"/>
+      <w:r>
+        <w:t>wipen</w:t>
+      </w:r>
+      <w:proofErr w:type="spellEnd"/>
+      <w:r>
+        <w:t xml:space="preserve"> en dan kon het opnieuw installeren want mijn oude projecten stond er nog op.</w:t>
       </w:r>
     </w:p>
     <w:p>
@@ -828,7 +1190,23 @@
         <w:t>Vandaag wou de wifi niet werken op de campus dus had ik niet veel vooruitgang geboekt.</w:t>
       </w:r>
       <w:r>
-        <w:t xml:space="preserve"> Ik was ook gisteren vergeten om de registratie pagina te committen, dus da had ik alleszins gedaan door met mijn hotspot van mijn gsm te verbinden en de 4G aan te zetten.</w:t>
+        <w:t xml:space="preserve"> Ik was ook gisteren vergeten om de registratie pagina te </w:t>
+      </w:r>
+      <w:proofErr w:type="spellStart"/>
+      <w:r>
+        <w:t>committen</w:t>
+      </w:r>
+      <w:proofErr w:type="spellEnd"/>
+      <w:r>
+        <w:t xml:space="preserve">, dus da had ik alleszins gedaan door met mijn </w:t>
+      </w:r>
+      <w:proofErr w:type="spellStart"/>
+      <w:r>
+        <w:t>hotspot</w:t>
+      </w:r>
+      <w:proofErr w:type="spellEnd"/>
+      <w:r>
+        <w:t xml:space="preserve"> van mijn gsm te verbinden en de 4G aan te zetten.</w:t>
       </w:r>
     </w:p>
     <w:p>
@@ -860,11 +1238,21 @@
         <w:t>Vandaag wou de wifi op school nog steeds niet zo goed werken</w:t>
       </w:r>
       <w:r>
-        <w:t xml:space="preserve">, maar dankzij de wifi hotspot heb ik toch nog de navigatie van login naar registratie kunnen </w:t>
-      </w:r>
+        <w:t xml:space="preserve">, maar dankzij de wifi </w:t>
+      </w:r>
+      <w:proofErr w:type="spellStart"/>
+      <w:r>
+        <w:t>hotspot</w:t>
+      </w:r>
+      <w:proofErr w:type="spellEnd"/>
+      <w:r>
+        <w:t xml:space="preserve"> heb ik toch nog de navigatie van login naar registratie kunnen </w:t>
+      </w:r>
+      <w:proofErr w:type="spellStart"/>
       <w:r>
         <w:t>commiten</w:t>
       </w:r>
+      <w:proofErr w:type="spellEnd"/>
       <w:r>
         <w:t>.</w:t>
       </w:r>
@@ -874,7 +1262,15 @@
     </w:p>
     <w:p>
       <w:r>
-        <w:t>De wifi wou uiteindelijk werken dus kon eindelijk heel vlot vooruitgaan. Ik heb daarbij de navigatie tussen de login en registratie kunnen afwerken. Daarna heb ik ook de startpagina bijna afgewerkt, maar de bottom bar wou niet helemaal meewerken dus dat laat ik voor later.</w:t>
+        <w:t xml:space="preserve">De wifi wou uiteindelijk werken dus kon eindelijk heel vlot vooruitgaan. Ik heb daarbij de navigatie tussen de login en registratie kunnen afwerken. Daarna heb ik ook de startpagina bijna afgewerkt, maar de </w:t>
+      </w:r>
+      <w:proofErr w:type="spellStart"/>
+      <w:r>
+        <w:t>bottom</w:t>
+      </w:r>
+      <w:proofErr w:type="spellEnd"/>
+      <w:r>
+        <w:t xml:space="preserve"> bar wou niet helemaal meewerken dus dat laat ik voor later.</w:t>
       </w:r>
     </w:p>
     <w:p/>
@@ -895,7 +1291,31 @@
     </w:p>
     <w:p>
       <w:r>
-        <w:t>Vandaag heb ik de bodem navigatie afgewerkt waarbij je dan naar je groepen kunt gaan oftewel naar je notities die je hebt gefotografeerd. Dit was eerste wel een challenge zoals de active pagina weergegeven of de juiste eventlistener gebruiken om te kunnen navigeren. Maar deze links hebben daarbij geholpen:</w:t>
+        <w:t xml:space="preserve">Vandaag heb ik de bodem navigatie afgewerkt waarbij je dan naar je groepen kunt gaan oftewel naar je notities die je hebt gefotografeerd. Dit was eerste wel een </w:t>
+      </w:r>
+      <w:proofErr w:type="spellStart"/>
+      <w:r>
+        <w:t>challenge</w:t>
+      </w:r>
+      <w:proofErr w:type="spellEnd"/>
+      <w:r>
+        <w:t xml:space="preserve"> zoals de </w:t>
+      </w:r>
+      <w:proofErr w:type="spellStart"/>
+      <w:r>
+        <w:t>active</w:t>
+      </w:r>
+      <w:proofErr w:type="spellEnd"/>
+      <w:r>
+        <w:t xml:space="preserve"> pagina weergegeven of de juiste </w:t>
+      </w:r>
+      <w:proofErr w:type="spellStart"/>
+      <w:r>
+        <w:t>eventlistener</w:t>
+      </w:r>
+      <w:proofErr w:type="spellEnd"/>
+      <w:r>
+        <w:t xml:space="preserve"> gebruiken om te kunnen navigeren. Maar deze links hebben daarbij geholpen:</w:t>
       </w:r>
     </w:p>
     <w:p>
@@ -941,13 +1361,29 @@
     </w:p>
     <w:p>
       <w:r>
-        <w:t>Ik heb dan ook nog voor gezorgd dat mijn firebase account verbonden is met</w:t>
+        <w:t xml:space="preserve">Ik heb dan ook nog voor gezorgd dat mijn </w:t>
+      </w:r>
+      <w:proofErr w:type="spellStart"/>
+      <w:r>
+        <w:t>firebase</w:t>
+      </w:r>
+      <w:proofErr w:type="spellEnd"/>
+      <w:r>
+        <w:t xml:space="preserve"> account verbonden is met</w:t>
       </w:r>
       <w:r>
         <w:t xml:space="preserve"> mijn</w:t>
       </w:r>
       <w:r>
-        <w:t xml:space="preserve"> android studio app.</w:t>
+        <w:t xml:space="preserve"> </w:t>
+      </w:r>
+      <w:proofErr w:type="spellStart"/>
+      <w:r>
+        <w:t>android</w:t>
+      </w:r>
+      <w:proofErr w:type="spellEnd"/>
+      <w:r>
+        <w:t xml:space="preserve"> studio app.</w:t>
       </w:r>
     </w:p>
     <w:p>
@@ -1104,8 +1540,13 @@
           <w:numId w:val="1"/>
         </w:numPr>
       </w:pPr>
-      <w:r>
-        <w:t>Firebase implementeren</w:t>
+      <w:proofErr w:type="spellStart"/>
+      <w:r>
+        <w:t>Firebase</w:t>
+      </w:r>
+      <w:proofErr w:type="spellEnd"/>
+      <w:r>
+        <w:t xml:space="preserve"> implementeren</w:t>
       </w:r>
     </w:p>
     <w:p>
@@ -1117,8 +1558,13 @@
         </w:numPr>
       </w:pPr>
       <w:r>
-        <w:t>Login en registratie mogelijk maken via firebase</w:t>
-      </w:r>
+        <w:t xml:space="preserve">Login en registratie mogelijk maken via </w:t>
+      </w:r>
+      <w:proofErr w:type="spellStart"/>
+      <w:r>
+        <w:t>firebase</w:t>
+      </w:r>
+      <w:proofErr w:type="spellEnd"/>
     </w:p>
     <w:p>
       <w:pPr>
@@ -1129,7 +1575,11 @@
         </w:numPr>
       </w:pPr>
       <w:r>
-        <w:t>Camera functionaliteit bekijken voor andr</w:t>
+        <w:t xml:space="preserve">Camera functionaliteit bekijken voor </w:t>
+      </w:r>
+      <w:proofErr w:type="spellStart"/>
+      <w:r>
+        <w:t>andr</w:t>
       </w:r>
       <w:r>
         <w:t>oi</w:t>
@@ -1137,6 +1587,7 @@
       <w:r>
         <w:t>d</w:t>
       </w:r>
+      <w:proofErr w:type="spellEnd"/>
     </w:p>
     <w:p/>
     <w:p>
@@ -1156,10 +1607,66 @@
     </w:p>
     <w:p>
       <w:r>
-        <w:t>Hier kan je ondertussen zien dat mijn app verbonden is met Firebase. Nu vragen ze voor google sign-in om een sha-1 fingerprint toe te voegen.</w:t>
-      </w:r>
-      <w:r>
-        <w:t xml:space="preserve"> Ik wou dan google play signing pakken om het te genereren ipv self-signing, maar ik moet dan 25 euro eerst betalen voor een </w:t>
+        <w:t xml:space="preserve">Hier kan je ondertussen zien dat mijn app verbonden is met </w:t>
+      </w:r>
+      <w:proofErr w:type="spellStart"/>
+      <w:r>
+        <w:t>Firebase</w:t>
+      </w:r>
+      <w:proofErr w:type="spellEnd"/>
+      <w:r>
+        <w:t xml:space="preserve">. Nu vragen ze voor google </w:t>
+      </w:r>
+      <w:proofErr w:type="spellStart"/>
+      <w:r>
+        <w:t>sign</w:t>
+      </w:r>
+      <w:proofErr w:type="spellEnd"/>
+      <w:r>
+        <w:t xml:space="preserve">-in om een sha-1 </w:t>
+      </w:r>
+      <w:proofErr w:type="spellStart"/>
+      <w:r>
+        <w:t>fingerprint</w:t>
+      </w:r>
+      <w:proofErr w:type="spellEnd"/>
+      <w:r>
+        <w:t xml:space="preserve"> toe te voegen.</w:t>
+      </w:r>
+      <w:r>
+        <w:t xml:space="preserve"> Ik wou dan google </w:t>
+      </w:r>
+      <w:proofErr w:type="spellStart"/>
+      <w:r>
+        <w:t>play</w:t>
+      </w:r>
+      <w:proofErr w:type="spellEnd"/>
+      <w:r>
+        <w:t xml:space="preserve"> </w:t>
+      </w:r>
+      <w:proofErr w:type="spellStart"/>
+      <w:r>
+        <w:t>signing</w:t>
+      </w:r>
+      <w:proofErr w:type="spellEnd"/>
+      <w:r>
+        <w:t xml:space="preserve"> pakken om het te genereren </w:t>
+      </w:r>
+      <w:proofErr w:type="spellStart"/>
+      <w:r>
+        <w:t>ipv</w:t>
+      </w:r>
+      <w:proofErr w:type="spellEnd"/>
+      <w:r>
+        <w:t xml:space="preserve"> </w:t>
+      </w:r>
+      <w:proofErr w:type="spellStart"/>
+      <w:r>
+        <w:t>self-signing</w:t>
+      </w:r>
+      <w:proofErr w:type="spellEnd"/>
+      <w:r>
+        <w:t xml:space="preserve">, maar ik moet dan 25 euro eerst betalen voor een </w:t>
       </w:r>
       <w:r>
         <w:t>ontwikkelaar</w:t>
@@ -1230,14 +1737,75 @@
       <w:r>
         <w:t>Als ik wat meer naar onderging bij de “</w:t>
       </w:r>
-      <w:r>
-        <w:t>Authenticating Your Client</w:t>
-      </w:r>
-      <w:r>
-        <w:t>” pagina (zie link) kan je ook via de terminal van android studio een command invoeren om de sha-1 fingerprint te krijgen. Hierbij moest je “gradle sigingReport” invoeren en dan ctrl + enter invoeren!!</w:t>
-      </w:r>
-      <w:r>
-        <w:t xml:space="preserve"> Deze heb ik dan toegevoegd aan Firebase.</w:t>
+      <w:proofErr w:type="spellStart"/>
+      <w:r>
+        <w:t>Authenticating</w:t>
+      </w:r>
+      <w:proofErr w:type="spellEnd"/>
+      <w:r>
+        <w:t xml:space="preserve"> </w:t>
+      </w:r>
+      <w:proofErr w:type="spellStart"/>
+      <w:r>
+        <w:t>Your</w:t>
+      </w:r>
+      <w:proofErr w:type="spellEnd"/>
+      <w:r>
+        <w:t xml:space="preserve"> Client</w:t>
+      </w:r>
+      <w:r>
+        <w:t xml:space="preserve">” pagina (zie link) kan je ook via de terminal van </w:t>
+      </w:r>
+      <w:proofErr w:type="spellStart"/>
+      <w:r>
+        <w:t>android</w:t>
+      </w:r>
+      <w:proofErr w:type="spellEnd"/>
+      <w:r>
+        <w:t xml:space="preserve"> studio een </w:t>
+      </w:r>
+      <w:proofErr w:type="spellStart"/>
+      <w:r>
+        <w:t>command</w:t>
+      </w:r>
+      <w:proofErr w:type="spellEnd"/>
+      <w:r>
+        <w:t xml:space="preserve"> invoeren om de sha-1 </w:t>
+      </w:r>
+      <w:proofErr w:type="spellStart"/>
+      <w:r>
+        <w:t>fingerprint</w:t>
+      </w:r>
+      <w:proofErr w:type="spellEnd"/>
+      <w:r>
+        <w:t xml:space="preserve"> te krijgen. Hierbij moest je “</w:t>
+      </w:r>
+      <w:proofErr w:type="spellStart"/>
+      <w:r>
+        <w:t>gradle</w:t>
+      </w:r>
+      <w:proofErr w:type="spellEnd"/>
+      <w:r>
+        <w:t xml:space="preserve"> </w:t>
+      </w:r>
+      <w:proofErr w:type="spellStart"/>
+      <w:r>
+        <w:t>sigingReport</w:t>
+      </w:r>
+      <w:proofErr w:type="spellEnd"/>
+      <w:r>
+        <w:t>” invoeren en dan ctrl + enter invoeren!!</w:t>
+      </w:r>
+      <w:r>
+        <w:t xml:space="preserve"> Deze heb ik dan toegevoegd aan </w:t>
+      </w:r>
+      <w:proofErr w:type="spellStart"/>
+      <w:r>
+        <w:t>Firebase</w:t>
+      </w:r>
+      <w:proofErr w:type="spellEnd"/>
+      <w:r>
+        <w:t>.</w:t>
       </w:r>
     </w:p>
     <w:p>
@@ -1285,7 +1853,15 @@
     </w:p>
     <w:p>
       <w:r>
-        <w:t>Daarna moest ik een Oauth 2.0 client ID toevoegen voor het inloggen. Hierbij moest ik een hele configuratie begaan.</w:t>
+        <w:t xml:space="preserve">Daarna moest ik een </w:t>
+      </w:r>
+      <w:proofErr w:type="spellStart"/>
+      <w:r>
+        <w:t>Oauth</w:t>
+      </w:r>
+      <w:proofErr w:type="spellEnd"/>
+      <w:r>
+        <w:t xml:space="preserve"> 2.0 client ID toevoegen voor het inloggen. Hierbij moest ik een hele configuratie begaan.</w:t>
       </w:r>
       <w:r>
         <w:t xml:space="preserve"> Ik heb hierbij het meest niet ingevuld zoals een privacy policy, enzoverder.</w:t>
@@ -1466,7 +2042,31 @@
     </w:p>
     <w:p>
       <w:r>
-        <w:t xml:space="preserve">Vandaag had ik tijdens les (in de morgen van 8u15-11u15) verder gewerkt aan de back-end van mijn app. Ik was gisteren bezig met google sign-in, maar ik besloot om eerst normale email/password authentication toe te voegen. Dit ging vrij vlot vooruit maar toen ik de button klikt sloot de app af, dus dat moet ik nog oplossen. </w:t>
+        <w:t xml:space="preserve">Vandaag had ik tijdens les (in de morgen van 8u15-11u15) verder gewerkt aan de </w:t>
+      </w:r>
+      <w:proofErr w:type="spellStart"/>
+      <w:r>
+        <w:t>back-end</w:t>
+      </w:r>
+      <w:proofErr w:type="spellEnd"/>
+      <w:r>
+        <w:t xml:space="preserve"> van mijn app. Ik was gisteren bezig met google </w:t>
+      </w:r>
+      <w:proofErr w:type="spellStart"/>
+      <w:r>
+        <w:t>sign</w:t>
+      </w:r>
+      <w:proofErr w:type="spellEnd"/>
+      <w:r>
+        <w:t xml:space="preserve">-in, maar ik besloot om eerst normale email/password </w:t>
+      </w:r>
+      <w:proofErr w:type="spellStart"/>
+      <w:r>
+        <w:t>authentication</w:t>
+      </w:r>
+      <w:proofErr w:type="spellEnd"/>
+      <w:r>
+        <w:t xml:space="preserve"> toe te voegen. Dit ging vrij vlot vooruit maar toen ik de button klikt sloot de app af, dus dat moet ik nog oplossen. </w:t>
       </w:r>
       <w:r>
         <w:t>Er werd</w:t>
@@ -1512,10 +2112,26 @@
         <w:t>Vandaag heb ik eindelijk de login en registratie kunnen afwerken. Dit had veel moeite gekost.</w:t>
       </w:r>
       <w:r>
-        <w:t xml:space="preserve"> Het probleem was dus dat mijn app bleef crashen als ik probeerde te registeren. Ik had veel op stackoverflow gezocht maar ik kon eerst niks vinden, maar toen zag ik dat de wifi van de device emulator op Android studio geen wifi had. Ik dacht eerst dat dit normaal was, maar begon toen twijfels te krijgen. Ik had dan eerst de info op stackoverflow pagina proberen gebruiken, maar dat was niet juist. Uiteindelijk gewoon mijn gsm hotspot 4G gebruiken werkte wel.</w:t>
-      </w:r>
-      <w:r>
-        <w:t xml:space="preserve"> Mijn app crasht dan nog steeds bij registratie maar ik kon wel inloggen door een test account aan te maken op Firebase. Dus mijn code werkte, maar toen ik zag dat ik niet gekeken had naar de error van die verscheen na de crash en dat maakte alles duidelijk</w:t>
+        <w:t xml:space="preserve"> Het probleem was dus dat mijn app bleef crashen als ik probeerde te registeren. Ik had veel op stackoverflow gezocht maar ik kon eerst niks vinden, maar toen zag ik dat de wifi van de device emulator op Android studio geen wifi had. Ik dacht eerst dat dit normaal was, maar begon toen twijfels te krijgen. Ik had dan eerst de info op stackoverflow pagina proberen gebruiken, maar dat was niet juist. Uiteindelijk gewoon mijn gsm </w:t>
+      </w:r>
+      <w:proofErr w:type="spellStart"/>
+      <w:r>
+        <w:t>hotspot</w:t>
+      </w:r>
+      <w:proofErr w:type="spellEnd"/>
+      <w:r>
+        <w:t xml:space="preserve"> 4G gebruiken werkte wel.</w:t>
+      </w:r>
+      <w:r>
+        <w:t xml:space="preserve"> Mijn app crasht dan nog steeds bij registratie maar ik kon wel inloggen door een test account aan te maken op </w:t>
+      </w:r>
+      <w:proofErr w:type="spellStart"/>
+      <w:r>
+        <w:t>Firebase</w:t>
+      </w:r>
+      <w:proofErr w:type="spellEnd"/>
+      <w:r>
+        <w:t>. Dus mijn code werkte, maar toen ik zag dat ik niet gekeken had naar de error van die verscheen na de crash en dat maakte alles duidelijk</w:t>
       </w:r>
       <w:r>
         <w:t xml:space="preserve"> voor mij</w:t>
@@ -1677,8 +2293,49 @@
           <w:rFonts w:eastAsia="Times New Roman" w:cstheme="minorHAnsi"/>
           <w:lang w:eastAsia="nl-BE"/>
         </w:rPr>
-        <w:t>Vandaag heb ik geprobeerd om google sign-in te laten werken. Dit ging zeer goed, maar het enige probleem is dat de google account niet wordt toegevoegd aan Firebase en het wil daarna niet naar de volgende pagina gaan als ik de google sign</w:t>
-      </w:r>
+        <w:t xml:space="preserve">Vandaag heb ik geprobeerd om google </w:t>
+      </w:r>
+      <w:proofErr w:type="spellStart"/>
+      <w:r>
+        <w:rPr>
+          <w:rFonts w:eastAsia="Times New Roman" w:cstheme="minorHAnsi"/>
+          <w:lang w:eastAsia="nl-BE"/>
+        </w:rPr>
+        <w:t>sign</w:t>
+      </w:r>
+      <w:proofErr w:type="spellEnd"/>
+      <w:r>
+        <w:rPr>
+          <w:rFonts w:eastAsia="Times New Roman" w:cstheme="minorHAnsi"/>
+          <w:lang w:eastAsia="nl-BE"/>
+        </w:rPr>
+        <w:t xml:space="preserve">-in te laten werken. Dit ging zeer goed, maar het enige probleem is dat de google account niet wordt toegevoegd aan </w:t>
+      </w:r>
+      <w:proofErr w:type="spellStart"/>
+      <w:r>
+        <w:rPr>
+          <w:rFonts w:eastAsia="Times New Roman" w:cstheme="minorHAnsi"/>
+          <w:lang w:eastAsia="nl-BE"/>
+        </w:rPr>
+        <w:t>Firebase</w:t>
+      </w:r>
+      <w:proofErr w:type="spellEnd"/>
+      <w:r>
+        <w:rPr>
+          <w:rFonts w:eastAsia="Times New Roman" w:cstheme="minorHAnsi"/>
+          <w:lang w:eastAsia="nl-BE"/>
+        </w:rPr>
+        <w:t xml:space="preserve"> en het wil daarna niet naar de volgende pagina gaan als ik de google </w:t>
+      </w:r>
+      <w:proofErr w:type="spellStart"/>
+      <w:r>
+        <w:rPr>
+          <w:rFonts w:eastAsia="Times New Roman" w:cstheme="minorHAnsi"/>
+          <w:lang w:eastAsia="nl-BE"/>
+        </w:rPr>
+        <w:t>sign</w:t>
+      </w:r>
+      <w:proofErr w:type="spellEnd"/>
       <w:r>
         <w:rPr>
           <w:rFonts w:eastAsia="Times New Roman" w:cstheme="minorHAnsi"/>
@@ -1691,7 +2348,39 @@
           <w:rFonts w:eastAsia="Times New Roman" w:cstheme="minorHAnsi"/>
           <w:lang w:eastAsia="nl-BE"/>
         </w:rPr>
-        <w:t>in button klik. Het sign-in scherm verschijnt wel en hebben geen errors, maar daarna gebeurt er niks. Ik heb de methode toegevoegd die iemand van teams zei dat die het probleem</w:t>
+        <w:t xml:space="preserve">in button klik. Het </w:t>
+      </w:r>
+      <w:proofErr w:type="spellStart"/>
+      <w:r>
+        <w:rPr>
+          <w:rFonts w:eastAsia="Times New Roman" w:cstheme="minorHAnsi"/>
+          <w:lang w:eastAsia="nl-BE"/>
+        </w:rPr>
+        <w:t>sign</w:t>
+      </w:r>
+      <w:proofErr w:type="spellEnd"/>
+      <w:r>
+        <w:rPr>
+          <w:rFonts w:eastAsia="Times New Roman" w:cstheme="minorHAnsi"/>
+          <w:lang w:eastAsia="nl-BE"/>
+        </w:rPr>
+        <w:t xml:space="preserve">-in scherm verschijnt wel en hebben geen </w:t>
+      </w:r>
+      <w:proofErr w:type="spellStart"/>
+      <w:r>
+        <w:rPr>
+          <w:rFonts w:eastAsia="Times New Roman" w:cstheme="minorHAnsi"/>
+          <w:lang w:eastAsia="nl-BE"/>
+        </w:rPr>
+        <w:t>errors</w:t>
+      </w:r>
+      <w:proofErr w:type="spellEnd"/>
+      <w:r>
+        <w:rPr>
+          <w:rFonts w:eastAsia="Times New Roman" w:cstheme="minorHAnsi"/>
+          <w:lang w:eastAsia="nl-BE"/>
+        </w:rPr>
+        <w:t>, maar daarna gebeurt er niks. Ik heb de methode toegevoegd die iemand van teams zei dat die het probleem</w:t>
       </w:r>
       <w:r>
         <w:rPr>
@@ -1726,7 +2415,23 @@
           <w:rFonts w:eastAsia="Times New Roman" w:cstheme="minorHAnsi"/>
           <w:lang w:eastAsia="nl-BE"/>
         </w:rPr>
-        <w:t xml:space="preserve"> 1 van de methodes was wel deprecated, maar die had </w:t>
+        <w:t xml:space="preserve"> 1 van de methodes was wel </w:t>
+      </w:r>
+      <w:proofErr w:type="spellStart"/>
+      <w:r>
+        <w:rPr>
+          <w:rFonts w:eastAsia="Times New Roman" w:cstheme="minorHAnsi"/>
+          <w:lang w:eastAsia="nl-BE"/>
+        </w:rPr>
+        <w:t>deprecated</w:t>
+      </w:r>
+      <w:proofErr w:type="spellEnd"/>
+      <w:r>
+        <w:rPr>
+          <w:rFonts w:eastAsia="Times New Roman" w:cstheme="minorHAnsi"/>
+          <w:lang w:eastAsia="nl-BE"/>
+        </w:rPr>
+        <w:t xml:space="preserve">, maar die had </w:t>
       </w:r>
       <w:r>
         <w:rPr>
@@ -1891,7 +2596,167 @@
           <w:rFonts w:eastAsia="Times New Roman" w:cstheme="minorHAnsi"/>
           <w:lang w:eastAsia="nl-BE"/>
         </w:rPr>
-        <w:t>Vandaag is het me gelukt om de google sign-in te laten werken. Ik had veel opzoek werk gedaan op google maar kon niks duidelijk vinden. Ik had mijn code ook gedebugd, maar geen duidelijk error werd weergegeven. Uiteindelijk besloot ik opzoek te gaan naar een tutorial die recent was in 2021. Deze tutorial heb ik dan gebruikt om mijn project strict te controleren en toen realiseerde ik dat de SHA-1 niet op de juiste plaats stond. Ik had op google cloud een Oauth 2.0 client id moeten aanmaken toen ik de android studio firebase tutorial volgde, maar dat bleek dus helemaal fout te zijn, want de echte client_id was eigenlijk al klaar in een google-services.json file. Ik moest toen ook mijn SHA-1 fingerprint verwijderen bij de onderstaande afbeelding, maar dat mocht daar eigenlijk blijven staan.</w:t>
+        <w:t xml:space="preserve">Vandaag is het me gelukt om de google </w:t>
+      </w:r>
+      <w:proofErr w:type="spellStart"/>
+      <w:r>
+        <w:rPr>
+          <w:rFonts w:eastAsia="Times New Roman" w:cstheme="minorHAnsi"/>
+          <w:lang w:eastAsia="nl-BE"/>
+        </w:rPr>
+        <w:t>sign</w:t>
+      </w:r>
+      <w:proofErr w:type="spellEnd"/>
+      <w:r>
+        <w:rPr>
+          <w:rFonts w:eastAsia="Times New Roman" w:cstheme="minorHAnsi"/>
+          <w:lang w:eastAsia="nl-BE"/>
+        </w:rPr>
+        <w:t xml:space="preserve">-in te laten werken. Ik had veel opzoek werk gedaan op google maar kon niks duidelijk vinden. Ik had mijn code ook gedebugd, maar geen duidelijk error werd weergegeven. Uiteindelijk besloot ik opzoek te gaan naar een tutorial die recent was in 2021. Deze tutorial heb ik dan gebruikt om mijn project </w:t>
+      </w:r>
+      <w:proofErr w:type="spellStart"/>
+      <w:r>
+        <w:rPr>
+          <w:rFonts w:eastAsia="Times New Roman" w:cstheme="minorHAnsi"/>
+          <w:lang w:eastAsia="nl-BE"/>
+        </w:rPr>
+        <w:t>strict</w:t>
+      </w:r>
+      <w:proofErr w:type="spellEnd"/>
+      <w:r>
+        <w:rPr>
+          <w:rFonts w:eastAsia="Times New Roman" w:cstheme="minorHAnsi"/>
+          <w:lang w:eastAsia="nl-BE"/>
+        </w:rPr>
+        <w:t xml:space="preserve"> te controleren en toen realiseerde ik dat de SHA-1 niet op de juiste plaats stond. Ik had op google </w:t>
+      </w:r>
+      <w:proofErr w:type="spellStart"/>
+      <w:r>
+        <w:rPr>
+          <w:rFonts w:eastAsia="Times New Roman" w:cstheme="minorHAnsi"/>
+          <w:lang w:eastAsia="nl-BE"/>
+        </w:rPr>
+        <w:t>cloud</w:t>
+      </w:r>
+      <w:proofErr w:type="spellEnd"/>
+      <w:r>
+        <w:rPr>
+          <w:rFonts w:eastAsia="Times New Roman" w:cstheme="minorHAnsi"/>
+          <w:lang w:eastAsia="nl-BE"/>
+        </w:rPr>
+        <w:t xml:space="preserve"> een </w:t>
+      </w:r>
+      <w:proofErr w:type="spellStart"/>
+      <w:r>
+        <w:rPr>
+          <w:rFonts w:eastAsia="Times New Roman" w:cstheme="minorHAnsi"/>
+          <w:lang w:eastAsia="nl-BE"/>
+        </w:rPr>
+        <w:t>Oauth</w:t>
+      </w:r>
+      <w:proofErr w:type="spellEnd"/>
+      <w:r>
+        <w:rPr>
+          <w:rFonts w:eastAsia="Times New Roman" w:cstheme="minorHAnsi"/>
+          <w:lang w:eastAsia="nl-BE"/>
+        </w:rPr>
+        <w:t xml:space="preserve"> 2.0 client </w:t>
+      </w:r>
+      <w:proofErr w:type="spellStart"/>
+      <w:r>
+        <w:rPr>
+          <w:rFonts w:eastAsia="Times New Roman" w:cstheme="minorHAnsi"/>
+          <w:lang w:eastAsia="nl-BE"/>
+        </w:rPr>
+        <w:t>id</w:t>
+      </w:r>
+      <w:proofErr w:type="spellEnd"/>
+      <w:r>
+        <w:rPr>
+          <w:rFonts w:eastAsia="Times New Roman" w:cstheme="minorHAnsi"/>
+          <w:lang w:eastAsia="nl-BE"/>
+        </w:rPr>
+        <w:t xml:space="preserve"> moeten aanmaken toen ik de </w:t>
+      </w:r>
+      <w:proofErr w:type="spellStart"/>
+      <w:r>
+        <w:rPr>
+          <w:rFonts w:eastAsia="Times New Roman" w:cstheme="minorHAnsi"/>
+          <w:lang w:eastAsia="nl-BE"/>
+        </w:rPr>
+        <w:t>android</w:t>
+      </w:r>
+      <w:proofErr w:type="spellEnd"/>
+      <w:r>
+        <w:rPr>
+          <w:rFonts w:eastAsia="Times New Roman" w:cstheme="minorHAnsi"/>
+          <w:lang w:eastAsia="nl-BE"/>
+        </w:rPr>
+        <w:t xml:space="preserve"> studio </w:t>
+      </w:r>
+      <w:proofErr w:type="spellStart"/>
+      <w:r>
+        <w:rPr>
+          <w:rFonts w:eastAsia="Times New Roman" w:cstheme="minorHAnsi"/>
+          <w:lang w:eastAsia="nl-BE"/>
+        </w:rPr>
+        <w:t>firebase</w:t>
+      </w:r>
+      <w:proofErr w:type="spellEnd"/>
+      <w:r>
+        <w:rPr>
+          <w:rFonts w:eastAsia="Times New Roman" w:cstheme="minorHAnsi"/>
+          <w:lang w:eastAsia="nl-BE"/>
+        </w:rPr>
+        <w:t xml:space="preserve"> tutorial volgde, maar dat bleek dus helemaal fout te zijn, want de echte </w:t>
+      </w:r>
+      <w:proofErr w:type="spellStart"/>
+      <w:r>
+        <w:rPr>
+          <w:rFonts w:eastAsia="Times New Roman" w:cstheme="minorHAnsi"/>
+          <w:lang w:eastAsia="nl-BE"/>
+        </w:rPr>
+        <w:t>client_id</w:t>
+      </w:r>
+      <w:proofErr w:type="spellEnd"/>
+      <w:r>
+        <w:rPr>
+          <w:rFonts w:eastAsia="Times New Roman" w:cstheme="minorHAnsi"/>
+          <w:lang w:eastAsia="nl-BE"/>
+        </w:rPr>
+        <w:t xml:space="preserve"> was eigenlijk al klaar in een google-</w:t>
+      </w:r>
+      <w:proofErr w:type="spellStart"/>
+      <w:r>
+        <w:rPr>
+          <w:rFonts w:eastAsia="Times New Roman" w:cstheme="minorHAnsi"/>
+          <w:lang w:eastAsia="nl-BE"/>
+        </w:rPr>
+        <w:t>services.json</w:t>
+      </w:r>
+      <w:proofErr w:type="spellEnd"/>
+      <w:r>
+        <w:rPr>
+          <w:rFonts w:eastAsia="Times New Roman" w:cstheme="minorHAnsi"/>
+          <w:lang w:eastAsia="nl-BE"/>
+        </w:rPr>
+        <w:t xml:space="preserve"> file. Ik moest toen ook mijn SHA-1 </w:t>
+      </w:r>
+      <w:proofErr w:type="spellStart"/>
+      <w:r>
+        <w:rPr>
+          <w:rFonts w:eastAsia="Times New Roman" w:cstheme="minorHAnsi"/>
+          <w:lang w:eastAsia="nl-BE"/>
+        </w:rPr>
+        <w:t>fingerprint</w:t>
+      </w:r>
+      <w:proofErr w:type="spellEnd"/>
+      <w:r>
+        <w:rPr>
+          <w:rFonts w:eastAsia="Times New Roman" w:cstheme="minorHAnsi"/>
+          <w:lang w:eastAsia="nl-BE"/>
+        </w:rPr>
+        <w:t xml:space="preserve"> verwijderen bij de onderstaande afbeelding, maar dat mocht daar eigenlijk blijven staan.</w:t>
       </w:r>
       <w:r>
         <w:rPr>
@@ -2093,7 +2958,15 @@
       </w:pPr>
       <w:r>
         <w:lastRenderedPageBreak/>
-        <w:t>Wat ik wil realiseen deze week:</w:t>
+        <w:t xml:space="preserve">Wat ik wil </w:t>
+      </w:r>
+      <w:proofErr w:type="spellStart"/>
+      <w:r>
+        <w:t>realiseen</w:t>
+      </w:r>
+      <w:proofErr w:type="spellEnd"/>
+      <w:r>
+        <w:t xml:space="preserve"> deze week:</w:t>
       </w:r>
     </w:p>
     <w:p>
@@ -2104,8 +2977,13 @@
           <w:numId w:val="2"/>
         </w:numPr>
       </w:pPr>
-      <w:r>
-        <w:t xml:space="preserve">Firebase </w:t>
+      <w:proofErr w:type="spellStart"/>
+      <w:r>
+        <w:t>Firebase</w:t>
+      </w:r>
+      <w:proofErr w:type="spellEnd"/>
+      <w:r>
+        <w:t xml:space="preserve"> </w:t>
       </w:r>
       <w:r>
         <w:t>storage</w:t>
@@ -2147,13 +3025,29 @@
     </w:p>
     <w:p>
       <w:r>
-        <w:t>Vandaag ben ik begonnen met aanmaken van de Firebase storage voor het opslaan van afbeeldingen.</w:t>
+        <w:t xml:space="preserve">Vandaag ben ik begonnen met aanmaken van de </w:t>
+      </w:r>
+      <w:proofErr w:type="spellStart"/>
+      <w:r>
+        <w:t>Firebase</w:t>
+      </w:r>
+      <w:proofErr w:type="spellEnd"/>
+      <w:r>
+        <w:t xml:space="preserve"> storage voor het opslaan van afbeeldingen.</w:t>
       </w:r>
       <w:r>
         <w:t xml:space="preserve"> </w:t>
       </w:r>
       <w:r>
-        <w:t xml:space="preserve">Ik heb dan de dependencies toegevoegd en dan moest ik een Cloud storage bucket aanmaken. Hierbij werd er gevraagd om een locatie te kiezen waarbij Europe-west 1 (= Belgische regio) niet tussen stond, maar gelukkig is er Eur3 die eigenlijk Belgische en Nederlandse regio voorstelt. Dat werd uitgelegd </w:t>
+        <w:t xml:space="preserve">Ik heb dan de </w:t>
+      </w:r>
+      <w:proofErr w:type="spellStart"/>
+      <w:r>
+        <w:t>dependencies</w:t>
+      </w:r>
+      <w:proofErr w:type="spellEnd"/>
+      <w:r>
+        <w:t xml:space="preserve"> toegevoegd en dan moest ik een Cloud storage bucket aanmaken. Hierbij werd er gevraagd om een locatie te kiezen waarbij Europe-west 1 (= Belgische regio) niet tussen stond, maar gelukkig is er Eur3 die eigenlijk Belgische en Nederlandse regio voorstelt. Dat werd uitgelegd </w:t>
       </w:r>
       <w:r>
         <w:t>op deze webpagina</w:t>
@@ -2266,12 +3160,52 @@
     </w:p>
     <w:p>
       <w:r>
-        <w:t xml:space="preserve">Vandaag heb ik de java code moet schrijven voor de camera te kunnen gebruiken. Eerst heb ik code toegevoegd dat ervoor zorgt dat de permissies worden aangevraagd om de camera te kunnen gebruiken. Daarna als ik allow klik dan opent een test camera zicht van de emulator. </w:t>
-      </w:r>
-    </w:p>
-    <w:p>
-      <w:r>
-        <w:t>Hierbij werden gelijkaardig methoden gebruikt zoals de firebase authentication, maar waren ook deprecated. Dit heb natuurlijk makkelijk opgelost.</w:t>
+        <w:t xml:space="preserve">Vandaag heb ik de </w:t>
+      </w:r>
+      <w:proofErr w:type="spellStart"/>
+      <w:r>
+        <w:t>java</w:t>
+      </w:r>
+      <w:proofErr w:type="spellEnd"/>
+      <w:r>
+        <w:t xml:space="preserve"> code moet schrijven voor de camera te kunnen gebruiken. Eerst heb ik code toegevoegd dat ervoor zorgt dat de permissies worden aangevraagd om de camera te kunnen gebruiken. Daarna als ik </w:t>
+      </w:r>
+      <w:proofErr w:type="spellStart"/>
+      <w:r>
+        <w:t>allow</w:t>
+      </w:r>
+      <w:proofErr w:type="spellEnd"/>
+      <w:r>
+        <w:t xml:space="preserve"> klik dan opent een test camera zicht van de emulator. </w:t>
+      </w:r>
+    </w:p>
+    <w:p>
+      <w:r>
+        <w:t xml:space="preserve">Hierbij werden gelijkaardig methoden gebruikt zoals de </w:t>
+      </w:r>
+      <w:proofErr w:type="spellStart"/>
+      <w:r>
+        <w:t>firebase</w:t>
+      </w:r>
+      <w:proofErr w:type="spellEnd"/>
+      <w:r>
+        <w:t xml:space="preserve"> </w:t>
+      </w:r>
+      <w:proofErr w:type="spellStart"/>
+      <w:r>
+        <w:t>authentication</w:t>
+      </w:r>
+      <w:proofErr w:type="spellEnd"/>
+      <w:r>
+        <w:t xml:space="preserve">, maar waren ook </w:t>
+      </w:r>
+      <w:proofErr w:type="spellStart"/>
+      <w:r>
+        <w:t>deprecated</w:t>
+      </w:r>
+      <w:proofErr w:type="spellEnd"/>
+      <w:r>
+        <w:t>. Dit heb natuurlijk makkelijk opgelost.</w:t>
       </w:r>
     </w:p>
     <w:p>
@@ -2345,7 +3279,15 @@
     </w:p>
     <w:p>
       <w:r>
-        <w:t>Vandaag heb ik geprobeerd om de image die getrokken wordt op te slaan in firebase storage</w:t>
+        <w:t xml:space="preserve">Vandaag heb ik geprobeerd om de image die getrokken wordt op te slaan in </w:t>
+      </w:r>
+      <w:proofErr w:type="spellStart"/>
+      <w:r>
+        <w:t>firebase</w:t>
+      </w:r>
+      <w:proofErr w:type="spellEnd"/>
+      <w:r>
+        <w:t xml:space="preserve"> storage</w:t>
       </w:r>
       <w:r>
         <w:t>. Dit is op het einde van de les gelukt.</w:t>
@@ -2399,10 +3341,90 @@
     <w:p>
       <w:r>
         <w:lastRenderedPageBreak/>
-        <w:t xml:space="preserve">Hierbij had ik vooral problemen met de uri oftewl URL omdat firebase die nodig had om te kunnen uploaden. Als je naar de eerste rode streep kijkt is er een methode voor </w:t>
-      </w:r>
-      <w:r>
-        <w:t>de bitmap die je krijgt van de camera te gebruiken om de uri te bepalen. De volgende is voor de bestandextensie te krijgen om een filename op te stellen in de firebase storage. Hierbij pak ik gewoon het tijdstip met de bestandextensie, maar ik ben misschien van plan om de filename te kunnen aanpassen door de gebruiker. De laatste streep zijn twee child methods waarbij dus de eerste de map voorstelt waar dan de 2</w:t>
+        <w:t xml:space="preserve">Hierbij had ik vooral problemen met de </w:t>
+      </w:r>
+      <w:proofErr w:type="spellStart"/>
+      <w:r>
+        <w:t>uri</w:t>
+      </w:r>
+      <w:proofErr w:type="spellEnd"/>
+      <w:r>
+        <w:t xml:space="preserve"> </w:t>
+      </w:r>
+      <w:proofErr w:type="spellStart"/>
+      <w:r>
+        <w:t>oftewl</w:t>
+      </w:r>
+      <w:proofErr w:type="spellEnd"/>
+      <w:r>
+        <w:t xml:space="preserve"> URL omdat </w:t>
+      </w:r>
+      <w:proofErr w:type="spellStart"/>
+      <w:r>
+        <w:t>firebase</w:t>
+      </w:r>
+      <w:proofErr w:type="spellEnd"/>
+      <w:r>
+        <w:t xml:space="preserve"> die nodig had om te kunnen uploaden. Als je naar de eerste rode streep kijkt is er een methode voor </w:t>
+      </w:r>
+      <w:r>
+        <w:t xml:space="preserve">de </w:t>
+      </w:r>
+      <w:proofErr w:type="spellStart"/>
+      <w:r>
+        <w:t>bitmap</w:t>
+      </w:r>
+      <w:proofErr w:type="spellEnd"/>
+      <w:r>
+        <w:t xml:space="preserve"> die je krijgt van de camera te gebruiken om de </w:t>
+      </w:r>
+      <w:proofErr w:type="spellStart"/>
+      <w:r>
+        <w:t>uri</w:t>
+      </w:r>
+      <w:proofErr w:type="spellEnd"/>
+      <w:r>
+        <w:t xml:space="preserve"> te bepalen. De volgende is voor de bestandextensie te krijgen om een </w:t>
+      </w:r>
+      <w:proofErr w:type="spellStart"/>
+      <w:r>
+        <w:t>filename</w:t>
+      </w:r>
+      <w:proofErr w:type="spellEnd"/>
+      <w:r>
+        <w:t xml:space="preserve"> op te stellen in de </w:t>
+      </w:r>
+      <w:proofErr w:type="spellStart"/>
+      <w:r>
+        <w:t>firebase</w:t>
+      </w:r>
+      <w:proofErr w:type="spellEnd"/>
+      <w:r>
+        <w:t xml:space="preserve"> storage. Hierbij pak ik gewoon het tijdstip met de bestandextensie, maar ik ben misschien van plan om de </w:t>
+      </w:r>
+      <w:proofErr w:type="spellStart"/>
+      <w:r>
+        <w:t>filename</w:t>
+      </w:r>
+      <w:proofErr w:type="spellEnd"/>
+      <w:r>
+        <w:t xml:space="preserve"> te kunnen aanpassen door de gebruiker. De laatste streep zijn twee </w:t>
+      </w:r>
+      <w:proofErr w:type="spellStart"/>
+      <w:r>
+        <w:t>child</w:t>
+      </w:r>
+      <w:proofErr w:type="spellEnd"/>
+      <w:r>
+        <w:t xml:space="preserve"> </w:t>
+      </w:r>
+      <w:proofErr w:type="spellStart"/>
+      <w:r>
+        <w:t>methods</w:t>
+      </w:r>
+      <w:proofErr w:type="spellEnd"/>
+      <w:r>
+        <w:t xml:space="preserve"> waarbij dus de eerste de map voorstelt waar dan de 2</w:t>
       </w:r>
       <w:r>
         <w:rPr>
@@ -2411,7 +3433,15 @@
         <w:t>de</w:t>
       </w:r>
       <w:r>
-        <w:t xml:space="preserve"> child oftewel de image inkomt. De map geef ik  het email adres van de gebruiker als naam.</w:t>
+        <w:t xml:space="preserve"> </w:t>
+      </w:r>
+      <w:proofErr w:type="spellStart"/>
+      <w:r>
+        <w:t>child</w:t>
+      </w:r>
+      <w:proofErr w:type="spellEnd"/>
+      <w:r>
+        <w:t xml:space="preserve"> oftewel de image inkomt. De map geef ik  het email adres van de gebruiker als naam.</w:t>
       </w:r>
     </w:p>
     <w:p>
@@ -2512,7 +3542,15 @@
         <w:pStyle w:val="Kop3"/>
       </w:pPr>
       <w:r>
-        <w:t>Wat ik wil realiseen deze week:</w:t>
+        <w:t xml:space="preserve">Wat ik wil </w:t>
+      </w:r>
+      <w:proofErr w:type="spellStart"/>
+      <w:r>
+        <w:t>realiseen</w:t>
+      </w:r>
+      <w:proofErr w:type="spellEnd"/>
+      <w:r>
+        <w:t xml:space="preserve"> deze week:</w:t>
       </w:r>
     </w:p>
     <w:p>
@@ -2545,7 +3583,15 @@
         <w:t>je gsm</w:t>
       </w:r>
       <w:r>
-        <w:t xml:space="preserve"> gallery gebruiken)</w:t>
+        <w:t xml:space="preserve"> </w:t>
+      </w:r>
+      <w:proofErr w:type="spellStart"/>
+      <w:r>
+        <w:t>gallery</w:t>
+      </w:r>
+      <w:proofErr w:type="spellEnd"/>
+      <w:r>
+        <w:t xml:space="preserve"> gebruiken)</w:t>
       </w:r>
     </w:p>
     <w:p/>
@@ -2566,7 +3612,23 @@
     </w:p>
     <w:p>
       <w:r>
-        <w:t xml:space="preserve">Vandaag heb ik geprobeerd om een gridview toe te voegen die images bevat dat dus lijkt op een image gallery zoals uw “foto’s” app. Hierbij heb ik de </w:t>
+        <w:t xml:space="preserve">Vandaag heb ik geprobeerd om een </w:t>
+      </w:r>
+      <w:proofErr w:type="spellStart"/>
+      <w:r>
+        <w:t>gridview</w:t>
+      </w:r>
+      <w:proofErr w:type="spellEnd"/>
+      <w:r>
+        <w:t xml:space="preserve"> toe te voegen die images bevat dat dus lijkt op een image </w:t>
+      </w:r>
+      <w:proofErr w:type="spellStart"/>
+      <w:r>
+        <w:t>gallery</w:t>
+      </w:r>
+      <w:proofErr w:type="spellEnd"/>
+      <w:r>
+        <w:t xml:space="preserve"> zoals uw “foto’s” app. Hierbij heb ik de </w:t>
       </w:r>
       <w:r>
         <w:t>volgende</w:t>
@@ -2611,7 +3673,15 @@
     </w:p>
     <w:p>
       <w:r>
-        <w:t>Dit heeft nog niet direct resultaat gegeven, maar de GridAdapter class geeft een gevoel dat ik wel op de goeie weg zit.</w:t>
+        <w:t xml:space="preserve">Dit heeft nog niet direct resultaat gegeven, maar de </w:t>
+      </w:r>
+      <w:proofErr w:type="spellStart"/>
+      <w:r>
+        <w:t>GridAdapter</w:t>
+      </w:r>
+      <w:proofErr w:type="spellEnd"/>
+      <w:r>
+        <w:t xml:space="preserve"> class geeft een gevoel dat ik wel op de goeie weg zit.</w:t>
       </w:r>
     </w:p>
     <w:p/>
@@ -2632,7 +3702,31 @@
     </w:p>
     <w:p>
       <w:r>
-        <w:t>Na de GridAdapter klasse te controleren ontdekte ik dat ik gewoon het verkeerd image Id doorgegeven heb. Dit heeft het probleem onmiddellijk gefixed als zijn de voorbeeld images niet echt mooi gepositioneerd.</w:t>
+        <w:t xml:space="preserve">Na de </w:t>
+      </w:r>
+      <w:proofErr w:type="spellStart"/>
+      <w:r>
+        <w:t>GridAdapter</w:t>
+      </w:r>
+      <w:proofErr w:type="spellEnd"/>
+      <w:r>
+        <w:t xml:space="preserve"> klasse te controleren ontdekte ik dat ik gewoon het verkeerd image </w:t>
+      </w:r>
+      <w:proofErr w:type="spellStart"/>
+      <w:r>
+        <w:t>Id</w:t>
+      </w:r>
+      <w:proofErr w:type="spellEnd"/>
+      <w:r>
+        <w:t xml:space="preserve"> doorgegeven heb. Dit heeft het probleem onmiddellijk </w:t>
+      </w:r>
+      <w:proofErr w:type="spellStart"/>
+      <w:r>
+        <w:t>gefixed</w:t>
+      </w:r>
+      <w:proofErr w:type="spellEnd"/>
+      <w:r>
+        <w:t xml:space="preserve"> als zijn de voorbeeld images niet echt mooi gepositioneerd.</w:t>
       </w:r>
     </w:p>
     <w:p>
@@ -2686,7 +3780,15 @@
         <w:t>gedetailleerd</w:t>
       </w:r>
       <w:r>
-        <w:t xml:space="preserve"> tutorial gevolgd hoe je met een gridview kan werken:</w:t>
+        <w:t xml:space="preserve"> tutorial gevolgd hoe je met een </w:t>
+      </w:r>
+      <w:proofErr w:type="spellStart"/>
+      <w:r>
+        <w:t>gridview</w:t>
+      </w:r>
+      <w:proofErr w:type="spellEnd"/>
+      <w:r>
+        <w:t xml:space="preserve"> kan werken:</w:t>
       </w:r>
     </w:p>
     <w:p>
@@ -2701,10 +3803,58 @@
     </w:p>
     <w:p>
       <w:r>
-        <w:t xml:space="preserve">Daarna heb ik er nog voor gezorgd dat de margin top en bottom via java code worden aangepast afhankelijk van de </w:t>
-      </w:r>
-      <w:r>
-        <w:t>hoogte van de header en footer. Dit werdt gedaan in OnCreateView():</w:t>
+        <w:t xml:space="preserve">Daarna heb ik er nog voor gezorgd dat de </w:t>
+      </w:r>
+      <w:proofErr w:type="spellStart"/>
+      <w:r>
+        <w:t>margin</w:t>
+      </w:r>
+      <w:proofErr w:type="spellEnd"/>
+      <w:r>
+        <w:t xml:space="preserve"> top en </w:t>
+      </w:r>
+      <w:proofErr w:type="spellStart"/>
+      <w:r>
+        <w:t>bottom</w:t>
+      </w:r>
+      <w:proofErr w:type="spellEnd"/>
+      <w:r>
+        <w:t xml:space="preserve"> via </w:t>
+      </w:r>
+      <w:proofErr w:type="spellStart"/>
+      <w:r>
+        <w:t>java</w:t>
+      </w:r>
+      <w:proofErr w:type="spellEnd"/>
+      <w:r>
+        <w:t xml:space="preserve"> code worden aangepast afhankelijk van de </w:t>
+      </w:r>
+      <w:r>
+        <w:t xml:space="preserve">hoogte van de header en </w:t>
+      </w:r>
+      <w:proofErr w:type="spellStart"/>
+      <w:r>
+        <w:t>footer</w:t>
+      </w:r>
+      <w:proofErr w:type="spellEnd"/>
+      <w:r>
+        <w:t xml:space="preserve">. Dit </w:t>
+      </w:r>
+      <w:proofErr w:type="spellStart"/>
+      <w:r>
+        <w:t>werdt</w:t>
+      </w:r>
+      <w:proofErr w:type="spellEnd"/>
+      <w:r>
+        <w:t xml:space="preserve"> gedaan in </w:t>
+      </w:r>
+      <w:proofErr w:type="spellStart"/>
+      <w:r>
+        <w:t>OnCreateView</w:t>
+      </w:r>
+      <w:proofErr w:type="spellEnd"/>
+      <w:r>
+        <w:t>():</w:t>
       </w:r>
     </w:p>
     <w:p>
@@ -2752,13 +3902,66 @@
     </w:p>
     <w:p>
       <w:r>
-        <w:t>Ik heb dan de elementen een witte achtergrond gegeven en dan een border rond gedaan dat eigenlijk vrij moeilijk en inefficiënt moet worden opgeroepen in android studio door middel van een &lt;shape&gt; xml file te maken in de res/drawable folder en die een stroke</w:t>
-      </w:r>
+        <w:t xml:space="preserve">Ik heb dan de elementen een witte achtergrond gegeven en dan een border rond gedaan dat eigenlijk vrij moeilijk en inefficiënt moet worden opgeroepen in </w:t>
+      </w:r>
+      <w:proofErr w:type="spellStart"/>
+      <w:r>
+        <w:t>android</w:t>
+      </w:r>
+      <w:proofErr w:type="spellEnd"/>
+      <w:r>
+        <w:t xml:space="preserve"> studio door middel van een &lt;</w:t>
+      </w:r>
+      <w:proofErr w:type="spellStart"/>
+      <w:r>
+        <w:t>shape</w:t>
+      </w:r>
+      <w:proofErr w:type="spellEnd"/>
+      <w:r>
+        <w:t xml:space="preserve">&gt; </w:t>
+      </w:r>
+      <w:proofErr w:type="spellStart"/>
+      <w:r>
+        <w:t>xml</w:t>
+      </w:r>
+      <w:proofErr w:type="spellEnd"/>
+      <w:r>
+        <w:t xml:space="preserve"> file te maken in de </w:t>
+      </w:r>
+      <w:proofErr w:type="spellStart"/>
+      <w:r>
+        <w:t>res</w:t>
+      </w:r>
+      <w:proofErr w:type="spellEnd"/>
+      <w:r>
+        <w:t>/</w:t>
+      </w:r>
+      <w:proofErr w:type="spellStart"/>
+      <w:r>
+        <w:t>drawable</w:t>
+      </w:r>
+      <w:proofErr w:type="spellEnd"/>
+      <w:r>
+        <w:t xml:space="preserve"> folder en die een </w:t>
+      </w:r>
+      <w:proofErr w:type="spellStart"/>
+      <w:r>
+        <w:t>stroke</w:t>
+      </w:r>
+      <w:proofErr w:type="spellEnd"/>
       <w:r>
         <w:t>, enzoverder</w:t>
       </w:r>
       <w:r>
-        <w:t xml:space="preserve"> te geven. Dan wordt deze drawable als achtergrond geplaatst van de imageview.</w:t>
+        <w:t xml:space="preserve"> te geven. Dan wordt deze </w:t>
+      </w:r>
+      <w:proofErr w:type="spellStart"/>
+      <w:r>
+        <w:t>drawable</w:t>
+      </w:r>
+      <w:proofErr w:type="spellEnd"/>
+      <w:r>
+        <w:t xml:space="preserve"> als achtergrond geplaatst van de imageview.</w:t>
       </w:r>
       <w:r>
         <w:t xml:space="preserve"> De lege elementen zijn gewoon witte icoontjes die dus niet zichtbaar zijn door de witte achtergrond.</w:t>
@@ -2809,7 +4012,23 @@
     <w:p/>
     <w:p>
       <w:r>
-        <w:t>Om te eindigen, moest ik nog de images van firebase toevoegen hierbij heb ik vooral code van stackoverflow gebruikt om mijn oude klassen en methods te verbeteren.</w:t>
+        <w:t xml:space="preserve">Om te eindigen, moest ik nog de images van </w:t>
+      </w:r>
+      <w:proofErr w:type="spellStart"/>
+      <w:r>
+        <w:t>firebase</w:t>
+      </w:r>
+      <w:proofErr w:type="spellEnd"/>
+      <w:r>
+        <w:t xml:space="preserve"> toevoegen hierbij heb ik vooral code van stackoverflow gebruikt om mijn oude klassen en </w:t>
+      </w:r>
+      <w:proofErr w:type="spellStart"/>
+      <w:r>
+        <w:t>methods</w:t>
+      </w:r>
+      <w:proofErr w:type="spellEnd"/>
+      <w:r>
+        <w:t xml:space="preserve"> te verbeteren.</w:t>
       </w:r>
     </w:p>
     <w:p>
@@ -2906,14 +4125,75 @@
     </w:p>
     <w:p>
       <w:r>
-        <w:t xml:space="preserve">Ik had een image asset toegevoegd dat dus er voor zorgde dat de oude logo files worden vervangen. Hierbij heb een logo afbeelding als foreground en een transparant afbeelding als background. Maar dit wou niet helemaal werken door adaptive icon en legacy optie. De app als het om mijn emulator </w:t>
+        <w:t xml:space="preserve">Ik had een image asset toegevoegd dat dus er voor zorgde dat de oude logo files worden vervangen. Hierbij heb een logo afbeelding als </w:t>
+      </w:r>
+      <w:proofErr w:type="spellStart"/>
+      <w:r>
+        <w:t>foreground</w:t>
+      </w:r>
+      <w:proofErr w:type="spellEnd"/>
+      <w:r>
+        <w:t xml:space="preserve"> en een transparant afbeelding als background. Maar dit wou niet helemaal werken door </w:t>
+      </w:r>
+      <w:proofErr w:type="spellStart"/>
+      <w:r>
+        <w:t>adaptive</w:t>
+      </w:r>
+      <w:proofErr w:type="spellEnd"/>
+      <w:r>
+        <w:t xml:space="preserve"> icon en </w:t>
+      </w:r>
+      <w:proofErr w:type="spellStart"/>
+      <w:r>
+        <w:t>legacy</w:t>
+      </w:r>
+      <w:proofErr w:type="spellEnd"/>
+      <w:r>
+        <w:t xml:space="preserve"> optie. De app als het om mijn emulator </w:t>
       </w:r>
       <w:r>
         <w:lastRenderedPageBreak/>
-        <w:t>staat kreeg een zwarte achtergrond omdat transparant niet bestaat bij adaptive icons. Dus wat ik gedaan had was het gewoon op legacy only</w:t>
-      </w:r>
-      <w:r>
-        <w:t xml:space="preserve"> optie zetten waar ik gewoon eigenlijk de background kan weghalen door de shape als cirkel aan te duiden</w:t>
+        <w:t xml:space="preserve">staat kreeg een zwarte achtergrond omdat transparant niet bestaat bij </w:t>
+      </w:r>
+      <w:proofErr w:type="spellStart"/>
+      <w:r>
+        <w:t>adaptive</w:t>
+      </w:r>
+      <w:proofErr w:type="spellEnd"/>
+      <w:r>
+        <w:t xml:space="preserve"> </w:t>
+      </w:r>
+      <w:proofErr w:type="spellStart"/>
+      <w:r>
+        <w:t>icons</w:t>
+      </w:r>
+      <w:proofErr w:type="spellEnd"/>
+      <w:r>
+        <w:t xml:space="preserve">. Dus wat ik gedaan had was het gewoon op </w:t>
+      </w:r>
+      <w:proofErr w:type="spellStart"/>
+      <w:r>
+        <w:t>legacy</w:t>
+      </w:r>
+      <w:proofErr w:type="spellEnd"/>
+      <w:r>
+        <w:t xml:space="preserve"> </w:t>
+      </w:r>
+      <w:proofErr w:type="spellStart"/>
+      <w:r>
+        <w:t>only</w:t>
+      </w:r>
+      <w:proofErr w:type="spellEnd"/>
+      <w:r>
+        <w:t xml:space="preserve"> optie zetten waar ik gewoon eigenlijk de background kan weghalen door de </w:t>
+      </w:r>
+      <w:proofErr w:type="spellStart"/>
+      <w:r>
+        <w:t>shape</w:t>
+      </w:r>
+      <w:proofErr w:type="spellEnd"/>
+      <w:r>
+        <w:t xml:space="preserve"> als cirkel aan te duiden</w:t>
       </w:r>
       <w:r>
         <w:t>.</w:t>
@@ -2979,7 +4259,31 @@
     </w:p>
     <w:p>
       <w:r>
-        <w:t>Vandaag heb ik ervoor gezorgd dat ik image van uw gsm gallery kan uploaden. Hierbij dacht ik eerst dat automatisch de gallery die klaarstaat in de camera app kon gebruiken zoals bij facebook messenger, maar bestaat niet echt blijkbaar. Ik heb hiervoor zelfs een vraag gesteld op stackoverflow.</w:t>
+        <w:t xml:space="preserve">Vandaag heb ik ervoor gezorgd dat ik image van uw gsm </w:t>
+      </w:r>
+      <w:proofErr w:type="spellStart"/>
+      <w:r>
+        <w:t>gallery</w:t>
+      </w:r>
+      <w:proofErr w:type="spellEnd"/>
+      <w:r>
+        <w:t xml:space="preserve"> kan uploaden. Hierbij dacht ik eerst dat automatisch de </w:t>
+      </w:r>
+      <w:proofErr w:type="spellStart"/>
+      <w:r>
+        <w:t>gallery</w:t>
+      </w:r>
+      <w:proofErr w:type="spellEnd"/>
+      <w:r>
+        <w:t xml:space="preserve"> die klaarstaat in de camera app kon gebruiken zoals bij facebook </w:t>
+      </w:r>
+      <w:proofErr w:type="spellStart"/>
+      <w:r>
+        <w:t>messenger</w:t>
+      </w:r>
+      <w:proofErr w:type="spellEnd"/>
+      <w:r>
+        <w:t>, maar bestaat niet echt blijkbaar. Ik heb hiervoor zelfs een vraag gesteld op stackoverflow.</w:t>
       </w:r>
     </w:p>
     <w:p>
@@ -2994,7 +4298,31 @@
     </w:p>
     <w:p>
       <w:r>
-        <w:t xml:space="preserve">Uiteindelijk heb ik gewoon besloten om de camera en gallery op te splitsen en te kunnen openen in popup keuze menu. De code voor de gallery functionaliteiten </w:t>
+        <w:t xml:space="preserve">Uiteindelijk heb ik gewoon besloten om de camera en </w:t>
+      </w:r>
+      <w:proofErr w:type="spellStart"/>
+      <w:r>
+        <w:t>gallery</w:t>
+      </w:r>
+      <w:proofErr w:type="spellEnd"/>
+      <w:r>
+        <w:t xml:space="preserve"> op te splitsen en te kunnen openen in </w:t>
+      </w:r>
+      <w:proofErr w:type="spellStart"/>
+      <w:r>
+        <w:t>popup</w:t>
+      </w:r>
+      <w:proofErr w:type="spellEnd"/>
+      <w:r>
+        <w:t xml:space="preserve"> keuze menu. De code voor de </w:t>
+      </w:r>
+      <w:proofErr w:type="spellStart"/>
+      <w:r>
+        <w:t>gallery</w:t>
+      </w:r>
+      <w:proofErr w:type="spellEnd"/>
+      <w:r>
+        <w:t xml:space="preserve"> functionaliteiten </w:t>
       </w:r>
       <w:r>
         <w:t>is</w:t>
@@ -3063,7 +4391,15 @@
         <w:pStyle w:val="Kop3"/>
       </w:pPr>
       <w:r>
-        <w:t>Wat ik wil realiseen deze week:</w:t>
+        <w:t xml:space="preserve">Wat ik wil </w:t>
+      </w:r>
+      <w:proofErr w:type="spellStart"/>
+      <w:r>
+        <w:t>realiseen</w:t>
+      </w:r>
+      <w:proofErr w:type="spellEnd"/>
+      <w:r>
+        <w:t xml:space="preserve"> deze week:</w:t>
       </w:r>
     </w:p>
     <w:p>
@@ -3087,7 +4423,23 @@
         </w:numPr>
       </w:pPr>
       <w:r>
-        <w:t>Vragen dat het ok is om je image te compressen (quality verlies?)</w:t>
+        <w:t xml:space="preserve">Vragen dat het ok is om je image te </w:t>
+      </w:r>
+      <w:proofErr w:type="spellStart"/>
+      <w:r>
+        <w:t>compressen</w:t>
+      </w:r>
+      <w:proofErr w:type="spellEnd"/>
+      <w:r>
+        <w:t xml:space="preserve"> (</w:t>
+      </w:r>
+      <w:proofErr w:type="spellStart"/>
+      <w:r>
+        <w:t>quality</w:t>
+      </w:r>
+      <w:proofErr w:type="spellEnd"/>
+      <w:r>
+        <w:t xml:space="preserve"> verlies?)</w:t>
       </w:r>
     </w:p>
     <w:p>
@@ -3099,8 +4451,21 @@
         </w:numPr>
       </w:pPr>
       <w:r>
-        <w:t>Image van de gridview kunnen openen in full size</w:t>
-      </w:r>
+        <w:t xml:space="preserve">Image van de </w:t>
+      </w:r>
+      <w:proofErr w:type="spellStart"/>
+      <w:r>
+        <w:t>gridview</w:t>
+      </w:r>
+      <w:proofErr w:type="spellEnd"/>
+      <w:r>
+        <w:t xml:space="preserve"> kunnen openen in full </w:t>
+      </w:r>
+      <w:proofErr w:type="spellStart"/>
+      <w:r>
+        <w:t>size</w:t>
+      </w:r>
+      <w:proofErr w:type="spellEnd"/>
     </w:p>
     <w:p>
       <w:pPr>
@@ -3111,7 +4476,15 @@
         </w:numPr>
       </w:pPr>
       <w:r>
-        <w:t>App op google playstore plaatsen!!</w:t>
+        <w:t xml:space="preserve">App op google </w:t>
+      </w:r>
+      <w:proofErr w:type="spellStart"/>
+      <w:r>
+        <w:t>playstore</w:t>
+      </w:r>
+      <w:proofErr w:type="spellEnd"/>
+      <w:r>
+        <w:t xml:space="preserve"> plaatsen!!</w:t>
       </w:r>
     </w:p>
     <w:p>
@@ -3122,23 +4495,107 @@
           <w:numId w:val="2"/>
         </w:numPr>
       </w:pPr>
-      <w:r>
-        <w:t>Offfline functionaliteiten toevoegen?</w:t>
+      <w:proofErr w:type="spellStart"/>
+      <w:r>
+        <w:t>Offfline</w:t>
+      </w:r>
+      <w:proofErr w:type="spellEnd"/>
+      <w:r>
+        <w:t xml:space="preserve"> functionaliteiten toevoegen?</w:t>
       </w:r>
     </w:p>
     <w:p/>
     <w:p>
-      <w:r>
-        <w:t xml:space="preserve">Vandaag wou ik beginnen met het uploaden van mijn app op google play maar toen ik tutorial volgde moest ik eerst mijn app package name veranderen want com.example is niet correct. Toen ik dat veranderen </w:t>
-      </w:r>
-      <w:r>
-        <w:t>werkte de google services niet meer want de package name was com.example in de google-services.json file. Dus ik moest mijn app in firebase opnieuw maken dat niet echt moeilijk was.</w:t>
-      </w:r>
-      <w:r>
-        <w:t xml:space="preserve"> Daarna heb ik een android app bundle aangemaakt want dit is nodig voor de release.</w:t>
-      </w:r>
-      <w:r>
-        <w:t xml:space="preserve"> Ze vroeg dan om developer account aan te maken waarbij ik 1 keer 25 euro moest betalen. Daarbij was ik effe gestopt want mijn ouders waren niet thuis voor een mastercard te gebruiken.</w:t>
+      <w:pPr>
+        <w:rPr>
+          <w:b/>
+          <w:bCs/>
+        </w:rPr>
+      </w:pPr>
+      <w:r>
+        <w:rPr>
+          <w:b/>
+          <w:bCs/>
+        </w:rPr>
+        <w:t>23/11/2021:</w:t>
+      </w:r>
+    </w:p>
+    <w:p>
+      <w:r>
+        <w:t xml:space="preserve">Vandaag wou ik beginnen met het uploaden van mijn app op google </w:t>
+      </w:r>
+      <w:proofErr w:type="spellStart"/>
+      <w:r>
+        <w:t>play</w:t>
+      </w:r>
+      <w:proofErr w:type="spellEnd"/>
+      <w:r>
+        <w:t xml:space="preserve"> maar toen ik tutorial volgde moest ik eerst mijn app package name veranderen want </w:t>
+      </w:r>
+      <w:proofErr w:type="spellStart"/>
+      <w:r>
+        <w:t>com.example</w:t>
+      </w:r>
+      <w:proofErr w:type="spellEnd"/>
+      <w:r>
+        <w:t xml:space="preserve"> is niet correct. Toen ik dat veranderen </w:t>
+      </w:r>
+      <w:r>
+        <w:t xml:space="preserve">werkte de google services niet meer want de package name was </w:t>
+      </w:r>
+      <w:proofErr w:type="spellStart"/>
+      <w:r>
+        <w:t>com.example</w:t>
+      </w:r>
+      <w:proofErr w:type="spellEnd"/>
+      <w:r>
+        <w:t xml:space="preserve"> in de google-</w:t>
+      </w:r>
+      <w:proofErr w:type="spellStart"/>
+      <w:r>
+        <w:t>services.json</w:t>
+      </w:r>
+      <w:proofErr w:type="spellEnd"/>
+      <w:r>
+        <w:t xml:space="preserve"> file. Dus ik moest mijn app in </w:t>
+      </w:r>
+      <w:proofErr w:type="spellStart"/>
+      <w:r>
+        <w:t>firebase</w:t>
+      </w:r>
+      <w:proofErr w:type="spellEnd"/>
+      <w:r>
+        <w:t xml:space="preserve"> opnieuw maken dat niet echt moeilijk was.</w:t>
+      </w:r>
+      <w:r>
+        <w:t xml:space="preserve"> Daarna heb ik een </w:t>
+      </w:r>
+      <w:proofErr w:type="spellStart"/>
+      <w:r>
+        <w:t>android</w:t>
+      </w:r>
+      <w:proofErr w:type="spellEnd"/>
+      <w:r>
+        <w:t xml:space="preserve"> app </w:t>
+      </w:r>
+      <w:proofErr w:type="spellStart"/>
+      <w:r>
+        <w:t>bundle</w:t>
+      </w:r>
+      <w:proofErr w:type="spellEnd"/>
+      <w:r>
+        <w:t xml:space="preserve"> aangemaakt want dit is nodig voor de release.</w:t>
+      </w:r>
+      <w:r>
+        <w:t xml:space="preserve"> Ze vroeg dan om </w:t>
+      </w:r>
+      <w:proofErr w:type="spellStart"/>
+      <w:r>
+        <w:t>developer</w:t>
+      </w:r>
+      <w:proofErr w:type="spellEnd"/>
+      <w:r>
+        <w:t xml:space="preserve"> account aan te maken waarbij ik 1 keer 25 euro moest betalen. Daarbij was ik effe gestopt want mijn ouders waren niet thuis voor een mastercard te gebruiken.</w:t>
       </w:r>
     </w:p>
     <w:p>
@@ -3211,6 +4668,46 @@
             </a:graphic>
           </wp:inline>
         </w:drawing>
+      </w:r>
+    </w:p>
+    <w:p>
+      <w:pPr>
+        <w:rPr>
+          <w:color w:val="0563C1" w:themeColor="hyperlink"/>
+          <w:u w:val="single"/>
+        </w:rPr>
+      </w:pPr>
+    </w:p>
+    <w:p>
+      <w:r>
+        <w:t>24/11/2021:</w:t>
+      </w:r>
+    </w:p>
+    <w:p>
+      <w:r>
+        <w:t>Vandaag ben ik effe kort begonnen met het beter beveiligen van het wachtwoord om te registeren en in te loggen</w:t>
+      </w:r>
+      <w:r>
+        <w:t xml:space="preserve">. Hierbij vraag ik dus dat het wachtwoord een kleine letter, grote letter, geen spaties, 1 nummer en een lengte van 8 tekens heeft. Dit wordt weergegeven als een error onder de wachtwoord </w:t>
+      </w:r>
+      <w:proofErr w:type="spellStart"/>
+      <w:r>
+        <w:t>textbox</w:t>
+      </w:r>
+      <w:proofErr w:type="spellEnd"/>
+      <w:r>
+        <w:t xml:space="preserve">. Het email wordt dankzij </w:t>
+      </w:r>
+      <w:proofErr w:type="spellStart"/>
+      <w:r>
+        <w:t>firebase</w:t>
+      </w:r>
+      <w:proofErr w:type="spellEnd"/>
+      <w:r>
+        <w:t xml:space="preserve"> al gevalideerd dat het correct is, dus ik moet zelf geen error toevoegen. </w:t>
+      </w:r>
+      <w:r>
+        <w:t>Maar er wordt wel een toast bericht voor de zekerheid weergegeven vanonder als de registratie mislukt.</w:t>
       </w:r>
     </w:p>
     <w:p/>

</xml_diff>

<commit_message>
Now able to open an image in fullscreen on the notes pages.
</commit_message>
<xml_diff>
--- a/Logboek_Dries_Fierens.docx
+++ b/Logboek_Dries_Fierens.docx
@@ -46,7 +46,47 @@
         <w:t>applicatie</w:t>
       </w:r>
       <w:r>
-        <w:t xml:space="preserve"> die je kan maken en welke technologieën je kan gebruiken. Ik heb voor native gekozen want dat past het best bij mijn aftakking “Software developer” sinds het java inhoudt. De anderen zijn hybrid en progressive web app dat dus meer te maken hebben met web &amp; mobile dus vooral HTML &amp; CSS. We moesten dan ook nog kiezen voor een project idee, waarbij ik koos voor een scanner + pdf converter app</w:t>
+        <w:t xml:space="preserve"> die je kan maken en welke technologieën je kan gebruiken. Ik heb voor native gekozen want dat past het best bij mijn aftakking “Software </w:t>
+      </w:r>
+      <w:proofErr w:type="spellStart"/>
+      <w:r>
+        <w:t>developer</w:t>
+      </w:r>
+      <w:proofErr w:type="spellEnd"/>
+      <w:r>
+        <w:t xml:space="preserve">” sinds het </w:t>
+      </w:r>
+      <w:proofErr w:type="spellStart"/>
+      <w:r>
+        <w:t>java</w:t>
+      </w:r>
+      <w:proofErr w:type="spellEnd"/>
+      <w:r>
+        <w:t xml:space="preserve"> inhoudt. De anderen zijn </w:t>
+      </w:r>
+      <w:proofErr w:type="spellStart"/>
+      <w:r>
+        <w:t>hybrid</w:t>
+      </w:r>
+      <w:proofErr w:type="spellEnd"/>
+      <w:r>
+        <w:t xml:space="preserve"> en </w:t>
+      </w:r>
+      <w:proofErr w:type="spellStart"/>
+      <w:r>
+        <w:t>progressive</w:t>
+      </w:r>
+      <w:proofErr w:type="spellEnd"/>
+      <w:r>
+        <w:t xml:space="preserve"> web app dat dus meer te maken hebben met web &amp; mobile dus vooral HTML &amp; CSS. We moesten dan ook nog kiezen voor een project idee, waarbij ik koos voor een scanner + </w:t>
+      </w:r>
+      <w:proofErr w:type="gramStart"/>
+      <w:r>
+        <w:t>pdf converter</w:t>
+      </w:r>
+      <w:proofErr w:type="gramEnd"/>
+      <w:r>
+        <w:t xml:space="preserve"> app</w:t>
       </w:r>
       <w:r>
         <w:t xml:space="preserve"> waarbij het vooral bedoelt is o</w:t>
@@ -67,26 +107,106 @@
         <w:t>.</w:t>
       </w:r>
       <w:r>
-        <w:t xml:space="preserve"> Het was verplicht om 1 hardware component van de gsm te gebruiken dus koos ik natuurlijk voor de camera.</w:t>
+        <w:t xml:space="preserve"> Het was verplicht om 1 </w:t>
+      </w:r>
+      <w:proofErr w:type="gramStart"/>
+      <w:r>
+        <w:t>hardware component</w:t>
+      </w:r>
+      <w:proofErr w:type="gramEnd"/>
+      <w:r>
+        <w:t xml:space="preserve"> van de gsm te gebruiken dus koos ik natuurlijk voor de camera.</w:t>
       </w:r>
       <w:r>
         <w:t xml:space="preserve"> </w:t>
       </w:r>
       <w:r>
-        <w:t>Als back-end koos ik Firebase en als technologie koos ik in java te werken om een android app te maken in plaats van een IOS app.</w:t>
-      </w:r>
-      <w:r>
-        <w:t xml:space="preserve"> Want ik heb een huawei.</w:t>
-      </w:r>
-    </w:p>
-    <w:p>
-      <w:r>
-        <w:t>Ik heb dit allemaal grondiger beschreven in mijn “app idee”.pdf. Dit staat ondertussen op de repository die we moesten maken.</w:t>
-      </w:r>
-    </w:p>
-    <w:p>
-      <w:r>
-        <w:t>Om af te sluiten had ik al ondertussen een goede naam gevonden gebaseerd op de applicatie genaamd Scannable. Ik heb dus besloten om mijn applicatie Notable te noemen.</w:t>
+        <w:t xml:space="preserve">Als </w:t>
+      </w:r>
+      <w:proofErr w:type="spellStart"/>
+      <w:r>
+        <w:t>back-end</w:t>
+      </w:r>
+      <w:proofErr w:type="spellEnd"/>
+      <w:r>
+        <w:t xml:space="preserve"> koos ik </w:t>
+      </w:r>
+      <w:proofErr w:type="spellStart"/>
+      <w:r>
+        <w:t>Firebase</w:t>
+      </w:r>
+      <w:proofErr w:type="spellEnd"/>
+      <w:r>
+        <w:t xml:space="preserve"> en als technologie koos ik in </w:t>
+      </w:r>
+      <w:proofErr w:type="spellStart"/>
+      <w:r>
+        <w:t>java</w:t>
+      </w:r>
+      <w:proofErr w:type="spellEnd"/>
+      <w:r>
+        <w:t xml:space="preserve"> te werken om een </w:t>
+      </w:r>
+      <w:proofErr w:type="spellStart"/>
+      <w:r>
+        <w:t>android</w:t>
+      </w:r>
+      <w:proofErr w:type="spellEnd"/>
+      <w:r>
+        <w:t xml:space="preserve"> app te maken in plaats van een IOS app.</w:t>
+      </w:r>
+      <w:r>
+        <w:t xml:space="preserve"> Want ik heb een </w:t>
+      </w:r>
+      <w:proofErr w:type="spellStart"/>
+      <w:r>
+        <w:t>huawei</w:t>
+      </w:r>
+      <w:proofErr w:type="spellEnd"/>
+      <w:r>
+        <w:t>.</w:t>
+      </w:r>
+    </w:p>
+    <w:p>
+      <w:r>
+        <w:t xml:space="preserve">Ik heb dit allemaal grondiger beschreven in mijn “app </w:t>
+      </w:r>
+      <w:proofErr w:type="spellStart"/>
+      <w:r>
+        <w:t>idee”.pdf</w:t>
+      </w:r>
+      <w:proofErr w:type="spellEnd"/>
+      <w:r>
+        <w:t xml:space="preserve">. Dit staat ondertussen op de </w:t>
+      </w:r>
+      <w:proofErr w:type="spellStart"/>
+      <w:r>
+        <w:t>repository</w:t>
+      </w:r>
+      <w:proofErr w:type="spellEnd"/>
+      <w:r>
+        <w:t xml:space="preserve"> die we moesten maken.</w:t>
+      </w:r>
+    </w:p>
+    <w:p>
+      <w:r>
+        <w:t xml:space="preserve">Om af te sluiten had ik al ondertussen een goede naam gevonden gebaseerd op de applicatie genaamd </w:t>
+      </w:r>
+      <w:proofErr w:type="spellStart"/>
+      <w:r>
+        <w:t>Scannable</w:t>
+      </w:r>
+      <w:proofErr w:type="spellEnd"/>
+      <w:r>
+        <w:t xml:space="preserve">. Ik heb dus besloten om mijn applicatie </w:t>
+      </w:r>
+      <w:proofErr w:type="spellStart"/>
+      <w:r>
+        <w:t>Notable</w:t>
+      </w:r>
+      <w:proofErr w:type="spellEnd"/>
+      <w:r>
+        <w:t xml:space="preserve"> te noemen.</w:t>
       </w:r>
     </w:p>
     <w:p>
@@ -109,7 +229,15 @@
         <w:t xml:space="preserve">Mijn app idee werd niet goedgekeurd, want de leerkracht raadde het af door problemen die ervan kunnen komen. Ik moest dan vandaag een nieuw idee opstellen. </w:t>
       </w:r>
       <w:r>
-        <w:t>De scanner + pdf converter was duidelijk te moeilijk, maar ik besloot om het idee verder te zetten van een app die notities kan delen. Dus nu moet het gewoon foto’s trekken van de notities. Om nog toe te voegen kan ik ook opmerkingswolkjes toevoegen aan de foto voor bijvoorbeeld een fout</w:t>
+        <w:t xml:space="preserve">De scanner + </w:t>
+      </w:r>
+      <w:proofErr w:type="gramStart"/>
+      <w:r>
+        <w:t>pdf converter</w:t>
+      </w:r>
+      <w:proofErr w:type="gramEnd"/>
+      <w:r>
+        <w:t xml:space="preserve"> was duidelijk te moeilijk, maar ik besloot om het idee verder te zetten van een app die notities kan delen. Dus nu moet het gewoon foto’s trekken van de notities. Om nog toe te voegen kan ik ook opmerkingswolkjes toevoegen aan de foto voor bijvoorbeeld een fout</w:t>
       </w:r>
       <w:r>
         <w:t xml:space="preserve"> aan te duiden</w:t>
@@ -120,7 +248,15 @@
     </w:p>
     <w:p>
       <w:r>
-        <w:t xml:space="preserve">Daarna moest ik gewoon begin aan een UI/UX design voor mijn applicatie, waarbij nog niet veel had gedaan omdat les niet meer lang duurde. Ik moest toen ook tegelijkertijd zoeken naar tutorials dus </w:t>
+        <w:t xml:space="preserve">Daarna moest ik gewoon begin aan een UI/UX design voor mijn applicatie, waarbij nog niet veel had gedaan omdat les niet meer lang duurde. Ik moest toen ook tegelijkertijd zoeken naar </w:t>
+      </w:r>
+      <w:proofErr w:type="spellStart"/>
+      <w:r>
+        <w:t>tutorials</w:t>
+      </w:r>
+      <w:proofErr w:type="spellEnd"/>
+      <w:r>
+        <w:t xml:space="preserve"> dus </w:t>
       </w:r>
       <w:r>
         <w:t>duurde dat ook kort.</w:t>
@@ -143,13 +279,26 @@
     </w:p>
     <w:p>
       <w:r>
-        <w:t xml:space="preserve">Vandaag in de namiddag begonnen we met de co-working les waarbij we dus informatie kunnen delen met medeleerlingen. Al was het de eerste les dus kwam daar niet veel van. Ik begon gewoon verder aan mijn </w:t>
-      </w:r>
+        <w:t>Vandaag in de namiddag begonnen we met de co-</w:t>
+      </w:r>
+      <w:proofErr w:type="spellStart"/>
+      <w:r>
+        <w:t>working</w:t>
+      </w:r>
+      <w:proofErr w:type="spellEnd"/>
+      <w:r>
+        <w:t xml:space="preserve"> les waarbij we dus informatie kunnen delen met medeleerlingen. Al was het de eerste les dus kwam daar niet veel van. Ik begon gewoon verder aan mijn </w:t>
+      </w:r>
+      <w:proofErr w:type="spellStart"/>
       <w:r>
         <w:t>F</w:t>
       </w:r>
       <w:r>
-        <w:t>igma design.</w:t>
+        <w:t>igma</w:t>
+      </w:r>
+      <w:proofErr w:type="spellEnd"/>
+      <w:r>
+        <w:t xml:space="preserve"> design.</w:t>
       </w:r>
     </w:p>
     <w:p>
@@ -160,7 +309,15 @@
         <w:t>te veel</w:t>
       </w:r>
       <w:r>
-        <w:t xml:space="preserve"> naar voor moest leunen en dus nek pijn kreeg en er waren precies geen ramen om te openen. </w:t>
+        <w:t xml:space="preserve"> naar voor moest leunen en dus </w:t>
+      </w:r>
+      <w:proofErr w:type="gramStart"/>
+      <w:r>
+        <w:t>nek pijn</w:t>
+      </w:r>
+      <w:proofErr w:type="gramEnd"/>
+      <w:r>
+        <w:t xml:space="preserve"> kreeg en er waren precies geen ramen om te openen. </w:t>
       </w:r>
       <w:r>
         <w:t>Gelukkig kunnen we naar buiten wanneer we het willen.</w:t>
@@ -200,7 +357,23 @@
     </w:p>
     <w:p>
       <w:r>
-        <w:t>Vandaag heb ik verder gewerkt aan mijn Figma design en het ging redelijk vlot vooruit. Ik wou absoluut dat het vandaag af was zodat ik morgen kan werken aan een ander vak. Tijdens het maken van het design heb ik vooral ook zitten op zoeken dat sommige concepten wel haalbaar zijn om te programmeren. Dit is allemaal wel mogelijk, maar zal wel een challenge zijn zoals de opmerkingen plaatsen</w:t>
+        <w:t xml:space="preserve">Vandaag heb ik verder gewerkt aan mijn </w:t>
+      </w:r>
+      <w:proofErr w:type="spellStart"/>
+      <w:r>
+        <w:t>Figma</w:t>
+      </w:r>
+      <w:proofErr w:type="spellEnd"/>
+      <w:r>
+        <w:t xml:space="preserve"> design en het ging redelijk vlot vooruit. Ik wou absoluut dat het vandaag af was zodat ik morgen kan werken aan een ander vak. Tijdens het maken van het design heb ik vooral ook zitten op zoeken dat sommige concepten wel haalbaar zijn om te programmeren. Dit is allemaal wel mogelijk, maar zal wel een </w:t>
+      </w:r>
+      <w:proofErr w:type="spellStart"/>
+      <w:r>
+        <w:t>challenge</w:t>
+      </w:r>
+      <w:proofErr w:type="spellEnd"/>
+      <w:r>
+        <w:t xml:space="preserve"> zijn zoals de opmerkingen plaatsen</w:t>
       </w:r>
       <w:r>
         <w:t>. M</w:t>
@@ -312,11 +485,48 @@
     </w:p>
     <w:p>
       <w:r>
-        <w:t xml:space="preserve">Vandaag werd mijn figma prototype gecontroleerd waarbij ik moest opnieuw uitleggen wat mijn app doet door middel van accurate presentatie. Ik legde dit vrij duidelijk uit en alles ging goed vooruit. Meneer Blancquaert heeft me dan ook nog een library genaamd “Material design” aangeraden om mijn applicatie te ontwerpen. </w:t>
-      </w:r>
-      <w:r>
-        <w:t>Blijkbaar Google gebruikt deze library</w:t>
-      </w:r>
+        <w:t xml:space="preserve">Vandaag werd mijn </w:t>
+      </w:r>
+      <w:proofErr w:type="spellStart"/>
+      <w:r>
+        <w:t>figma</w:t>
+      </w:r>
+      <w:proofErr w:type="spellEnd"/>
+      <w:r>
+        <w:t xml:space="preserve"> prototype gecontroleerd waarbij ik moest opnieuw uitleggen wat mijn app doet door middel van accurate presentatie. Ik legde dit vrij duidelijk uit en alles ging goed vooruit. Meneer </w:t>
+      </w:r>
+      <w:proofErr w:type="spellStart"/>
+      <w:r>
+        <w:t>Blancquaert</w:t>
+      </w:r>
+      <w:proofErr w:type="spellEnd"/>
+      <w:r>
+        <w:t xml:space="preserve"> heeft me dan ook nog een </w:t>
+      </w:r>
+      <w:proofErr w:type="spellStart"/>
+      <w:r>
+        <w:t>library</w:t>
+      </w:r>
+      <w:proofErr w:type="spellEnd"/>
+      <w:r>
+        <w:t xml:space="preserve"> genaamd “</w:t>
+      </w:r>
+      <w:proofErr w:type="spellStart"/>
+      <w:r>
+        <w:t>Material</w:t>
+      </w:r>
+      <w:proofErr w:type="spellEnd"/>
+      <w:r>
+        <w:t xml:space="preserve"> design” aangeraden om mijn applicatie te ontwerpen. </w:t>
+      </w:r>
+      <w:r>
+        <w:t xml:space="preserve">Blijkbaar Google gebruikt deze </w:t>
+      </w:r>
+      <w:proofErr w:type="spellStart"/>
+      <w:r>
+        <w:t>library</w:t>
+      </w:r>
+      <w:proofErr w:type="spellEnd"/>
       <w:r>
         <w:t xml:space="preserve"> om hun apps te maken.</w:t>
       </w:r>
@@ -354,7 +564,23 @@
         <w:t xml:space="preserve">kunt maken </w:t>
       </w:r>
       <w:r>
-        <w:t>om je app te testen. Als je developer modus in de settings van je gsm</w:t>
+        <w:t xml:space="preserve">om je app te testen. Als je </w:t>
+      </w:r>
+      <w:proofErr w:type="spellStart"/>
+      <w:r>
+        <w:t>developer</w:t>
+      </w:r>
+      <w:proofErr w:type="spellEnd"/>
+      <w:r>
+        <w:t xml:space="preserve"> modus in de </w:t>
+      </w:r>
+      <w:proofErr w:type="spellStart"/>
+      <w:r>
+        <w:t>settings</w:t>
+      </w:r>
+      <w:proofErr w:type="spellEnd"/>
+      <w:r>
+        <w:t xml:space="preserve"> van je gsm</w:t>
       </w:r>
       <w:r>
         <w:t xml:space="preserve"> aanzet, kan je je gsm verbinden met de pc en dus je applicatie daarop testen.</w:t>
@@ -372,7 +598,31 @@
     </w:p>
     <w:p>
       <w:r>
-        <w:t>Tijdens lange downloads heb ik ook mijn google account toegevoegd op Firebase. Volgens de presentatie die we kregen van een medestudent.</w:t>
+        <w:t xml:space="preserve">Tijdens lange downloads heb ik ook mijn </w:t>
+      </w:r>
+      <w:proofErr w:type="gramStart"/>
+      <w:r>
+        <w:t>google account</w:t>
+      </w:r>
+      <w:proofErr w:type="gramEnd"/>
+      <w:r>
+        <w:t xml:space="preserve"> toegevoegd op </w:t>
+      </w:r>
+      <w:proofErr w:type="spellStart"/>
+      <w:r>
+        <w:t>Firebase</w:t>
+      </w:r>
+      <w:proofErr w:type="spellEnd"/>
+      <w:r>
+        <w:t xml:space="preserve">. Volgens de </w:t>
+      </w:r>
+      <w:proofErr w:type="gramStart"/>
+      <w:r>
+        <w:t>presentatie</w:t>
+      </w:r>
+      <w:proofErr w:type="gramEnd"/>
+      <w:r>
+        <w:t xml:space="preserve"> die we kregen van een medestudent.</w:t>
       </w:r>
     </w:p>
     <w:p>
@@ -423,7 +673,23 @@
         <w:t>mijn</w:t>
       </w:r>
       <w:r>
-        <w:t xml:space="preserve"> figma design delen met meneer Blancquaert, toen hij vroeg dat mijn design klaar was</w:t>
+        <w:t xml:space="preserve"> </w:t>
+      </w:r>
+      <w:proofErr w:type="spellStart"/>
+      <w:r>
+        <w:t>figma</w:t>
+      </w:r>
+      <w:proofErr w:type="spellEnd"/>
+      <w:r>
+        <w:t xml:space="preserve"> design delen met meneer </w:t>
+      </w:r>
+      <w:proofErr w:type="spellStart"/>
+      <w:r>
+        <w:t>Blancquaert</w:t>
+      </w:r>
+      <w:proofErr w:type="spellEnd"/>
+      <w:r>
+        <w:t>, toen hij vroeg dat mijn design klaar was</w:t>
       </w:r>
       <w:r>
         <w:t xml:space="preserve"> of niet</w:t>
@@ -437,14 +703,54 @@
         <w:t>Ik heb daarna gewoon verder begonnen aan de tutorial die ik vorige week gebruikt had.</w:t>
       </w:r>
       <w:r>
-        <w:t xml:space="preserve"> Hierbij leerde ik meer over hoe ik Android studio beter kon gebruiken om mijn app te designen zoals hoe je </w:t>
+        <w:t xml:space="preserve"> Hierbij leerde ik meer over hoe ik </w:t>
+      </w:r>
+      <w:proofErr w:type="gramStart"/>
+      <w:r>
+        <w:t>Android studio</w:t>
+      </w:r>
+      <w:proofErr w:type="gramEnd"/>
+      <w:r>
+        <w:t xml:space="preserve"> beter kon gebruiken om mijn app te </w:t>
+      </w:r>
+      <w:proofErr w:type="spellStart"/>
+      <w:r>
+        <w:t>designen</w:t>
+      </w:r>
+      <w:proofErr w:type="spellEnd"/>
+      <w:r>
+        <w:t xml:space="preserve"> zoals hoe je </w:t>
       </w:r>
       <w:r>
         <w:lastRenderedPageBreak/>
-        <w:t>attributen kunt aanpassen (bv. color)</w:t>
-      </w:r>
-      <w:r>
-        <w:t xml:space="preserve">. Android studio is zeer gelijkaardig als bijvoorbeeld Webstorm, maar bij het design van een mobile app is het zeer </w:t>
+        <w:t xml:space="preserve">attributen kunt aanpassen (bv. </w:t>
+      </w:r>
+      <w:proofErr w:type="spellStart"/>
+      <w:r>
+        <w:t>color</w:t>
+      </w:r>
+      <w:proofErr w:type="spellEnd"/>
+      <w:r>
+        <w:t>)</w:t>
+      </w:r>
+      <w:r>
+        <w:t xml:space="preserve">. </w:t>
+      </w:r>
+      <w:proofErr w:type="gramStart"/>
+      <w:r>
+        <w:t>Android studio</w:t>
+      </w:r>
+      <w:proofErr w:type="gramEnd"/>
+      <w:r>
+        <w:t xml:space="preserve"> is zeer gelijkaardig als bijvoorbeeld </w:t>
+      </w:r>
+      <w:proofErr w:type="spellStart"/>
+      <w:r>
+        <w:t>Webstorm</w:t>
+      </w:r>
+      <w:proofErr w:type="spellEnd"/>
+      <w:r>
+        <w:t xml:space="preserve">, maar bij het design van een mobile app is het zeer </w:t>
       </w:r>
       <w:r>
         <w:t>verschillend</w:t>
@@ -453,14 +759,27 @@
         <w:t>.</w:t>
       </w:r>
       <w:r>
-        <w:t xml:space="preserve"> Bij Webstorm kan je je website </w:t>
+        <w:t xml:space="preserve"> Bij </w:t>
+      </w:r>
+      <w:proofErr w:type="spellStart"/>
+      <w:r>
+        <w:t>Webstorm</w:t>
+      </w:r>
+      <w:proofErr w:type="spellEnd"/>
+      <w:r>
+        <w:t xml:space="preserve"> kan je je website </w:t>
       </w:r>
       <w:r>
         <w:t>bekijken</w:t>
       </w:r>
       <w:r>
-        <w:t xml:space="preserve"> in een gekozen browser, maar je kan in Android studio</w:t>
-      </w:r>
+        <w:t xml:space="preserve"> in een gekozen browser, maar je kan in </w:t>
+      </w:r>
+      <w:proofErr w:type="gramStart"/>
+      <w:r>
+        <w:t>Android studio</w:t>
+      </w:r>
+      <w:proofErr w:type="gramEnd"/>
       <w:r>
         <w:t xml:space="preserve"> je app</w:t>
       </w:r>
@@ -480,7 +799,15 @@
         <w:t>.</w:t>
       </w:r>
       <w:r>
-        <w:t xml:space="preserve"> Als ik de Jetbrains applicaties vergelijk met Visual studio 2019, </w:t>
+        <w:t xml:space="preserve"> Als ik de </w:t>
+      </w:r>
+      <w:proofErr w:type="spellStart"/>
+      <w:r>
+        <w:t>Jetbrains</w:t>
+      </w:r>
+      <w:proofErr w:type="spellEnd"/>
+      <w:r>
+        <w:t xml:space="preserve"> applicaties vergelijk met Visual studio 2019, </w:t>
       </w:r>
       <w:r>
         <w:t>heb ik er altijd moeite mee om de lay</w:t>
@@ -560,7 +887,23 @@
     </w:p>
     <w:p>
       <w:r>
-        <w:t>Ik heb dan ondertussen de tutorial van Material design gevolgd in plaats van die van Android studio. Ze leerde me dan hoe ik er mee kon werken maar niet hoe een hele nieuwe app kon maken. Ik kreeg een voorbeeld app om erin te kunnen werken voor de tutorial.</w:t>
+        <w:t xml:space="preserve">Ik heb dan ondertussen de tutorial van </w:t>
+      </w:r>
+      <w:proofErr w:type="spellStart"/>
+      <w:r>
+        <w:t>Material</w:t>
+      </w:r>
+      <w:proofErr w:type="spellEnd"/>
+      <w:r>
+        <w:t xml:space="preserve"> design gevolgd in plaats van die van </w:t>
+      </w:r>
+      <w:proofErr w:type="gramStart"/>
+      <w:r>
+        <w:t>Android studio</w:t>
+      </w:r>
+      <w:proofErr w:type="gramEnd"/>
+      <w:r>
+        <w:t>. Ze leerde me dan hoe ik er mee kon werken maar niet hoe een hele nieuwe app kon maken. Ik kreeg een voorbeeld app om erin te kunnen werken voor de tutorial.</w:t>
       </w:r>
     </w:p>
     <w:p>
@@ -603,10 +946,34 @@
     </w:p>
     <w:p>
       <w:r>
-        <w:t>Vandaag heb ik de usertests afgelegd met Louis D’hondt en Jasper Wauters. Dit ging heel gemakkelijk en duurde niet lang. Ik had niet echt serieuze opmerkingen, behalve dat ik geen persoonlijke info pagina gemaakt had.</w:t>
-      </w:r>
-      <w:r>
-        <w:t xml:space="preserve"> Daarna heb ik onmiddellijk die opmerkingen van mijn figma design verbetert en op mijn repository gezet.</w:t>
+        <w:t xml:space="preserve">Vandaag heb ik de usertests afgelegd met Louis </w:t>
+      </w:r>
+      <w:proofErr w:type="spellStart"/>
+      <w:r>
+        <w:t>D’hondt</w:t>
+      </w:r>
+      <w:proofErr w:type="spellEnd"/>
+      <w:r>
+        <w:t xml:space="preserve"> en Jasper Wauters. Dit ging heel gemakkelijk en duurde niet lang. Ik had niet echt serieuze opmerkingen, behalve dat ik geen persoonlijke info pagina gemaakt had.</w:t>
+      </w:r>
+      <w:r>
+        <w:t xml:space="preserve"> Daarna heb ik onmiddellijk die opmerkingen van mijn </w:t>
+      </w:r>
+      <w:proofErr w:type="spellStart"/>
+      <w:r>
+        <w:t>figma</w:t>
+      </w:r>
+      <w:proofErr w:type="spellEnd"/>
+      <w:r>
+        <w:t xml:space="preserve"> design verbetert en op mijn </w:t>
+      </w:r>
+      <w:proofErr w:type="spellStart"/>
+      <w:r>
+        <w:t>repository</w:t>
+      </w:r>
+      <w:proofErr w:type="spellEnd"/>
+      <w:r>
+        <w:t xml:space="preserve"> gezet.</w:t>
       </w:r>
     </w:p>
     <w:p/>
@@ -629,7 +996,47 @@
     </w:p>
     <w:p>
       <w:r>
-        <w:t xml:space="preserve">Vandaag begon ik eindelijk met Material Design. Ik besloot mijn oude app te verwijderen en te vervangen met een empty activity zodat ik echt van scratch begin. Zo kan ik alles beter begrijpen. Ik had dan ontdekt dat android studio al automatisch Material Design van Google had toegevoegd bij de dependencies, dus eigenlijk ben ik </w:t>
+        <w:t xml:space="preserve">Vandaag begon ik eindelijk met </w:t>
+      </w:r>
+      <w:proofErr w:type="spellStart"/>
+      <w:r>
+        <w:t>Material</w:t>
+      </w:r>
+      <w:proofErr w:type="spellEnd"/>
+      <w:r>
+        <w:t xml:space="preserve"> Design. Ik besloot mijn oude app te verwijderen en te vervangen met een empty </w:t>
+      </w:r>
+      <w:proofErr w:type="spellStart"/>
+      <w:r>
+        <w:t>activity</w:t>
+      </w:r>
+      <w:proofErr w:type="spellEnd"/>
+      <w:r>
+        <w:t xml:space="preserve"> zodat ik echt van scratch begin. Zo kan ik alles beter begrijpen. Ik had dan ontdekt dat </w:t>
+      </w:r>
+      <w:proofErr w:type="spellStart"/>
+      <w:r>
+        <w:t>android</w:t>
+      </w:r>
+      <w:proofErr w:type="spellEnd"/>
+      <w:r>
+        <w:t xml:space="preserve"> studio al automatisch </w:t>
+      </w:r>
+      <w:proofErr w:type="spellStart"/>
+      <w:r>
+        <w:t>Material</w:t>
+      </w:r>
+      <w:proofErr w:type="spellEnd"/>
+      <w:r>
+        <w:t xml:space="preserve"> Design van Google had toegevoegd bij de </w:t>
+      </w:r>
+      <w:proofErr w:type="spellStart"/>
+      <w:r>
+        <w:t>dependencies</w:t>
+      </w:r>
+      <w:proofErr w:type="spellEnd"/>
+      <w:r>
+        <w:t xml:space="preserve">, dus eigenlijk ben ik </w:t>
       </w:r>
       <w:r>
         <w:t>onmiddellijk</w:t>
@@ -773,18 +1180,50 @@
     </w:p>
     <w:p>
       <w:r>
-        <w:t>Eerst had ik geprobeerd om gewoon een heel nieuw project te maken die bestond uit een login activity. Deze activity heb ik dan gewoon aangepast naar mijn wens. Maar dit wou ook niet echt werken, want blijkbaar is het best dat je van een main</w:t>
+        <w:t xml:space="preserve">Eerst had ik geprobeerd om gewoon een heel nieuw project te maken die bestond uit een login </w:t>
+      </w:r>
+      <w:proofErr w:type="spellStart"/>
+      <w:r>
+        <w:t>activity</w:t>
+      </w:r>
+      <w:proofErr w:type="spellEnd"/>
+      <w:r>
+        <w:t xml:space="preserve">. Deze </w:t>
+      </w:r>
+      <w:proofErr w:type="spellStart"/>
+      <w:r>
+        <w:t>activity</w:t>
+      </w:r>
+      <w:proofErr w:type="spellEnd"/>
+      <w:r>
+        <w:t xml:space="preserve"> heb ik dan gewoon aangepast naar mijn wens. Maar dit wou ook niet echt werken, want blijkbaar is het best dat je van een </w:t>
+      </w:r>
+      <w:proofErr w:type="spellStart"/>
+      <w:r>
+        <w:t>main</w:t>
       </w:r>
       <w:r>
         <w:t>_</w:t>
       </w:r>
       <w:r>
-        <w:t>activity start en dan de login page daarmee opent.</w:t>
-      </w:r>
-    </w:p>
-    <w:p>
-      <w:r>
-        <w:t>Ik ben dan gewoon terug begonnen aan het oude project en heb dan de error op stack overflow gezocht en daar had ik de oplossing gevonden. Ik moest gewoon mijn “device” zijn data wipen en dan kon het opnieuw installeren want mijn oude projecten stond er nog op.</w:t>
+        <w:t>activity</w:t>
+      </w:r>
+      <w:proofErr w:type="spellEnd"/>
+      <w:r>
+        <w:t xml:space="preserve"> start en dan de login page daarmee opent.</w:t>
+      </w:r>
+    </w:p>
+    <w:p>
+      <w:r>
+        <w:t xml:space="preserve">Ik ben dan gewoon terug begonnen aan het oude project en heb dan de error op stack overflow gezocht en daar had ik de oplossing gevonden. Ik moest gewoon mijn “device” zijn data </w:t>
+      </w:r>
+      <w:proofErr w:type="spellStart"/>
+      <w:r>
+        <w:t>wipen</w:t>
+      </w:r>
+      <w:proofErr w:type="spellEnd"/>
+      <w:r>
+        <w:t xml:space="preserve"> en dan kon het opnieuw installeren want mijn oude projecten stond er nog op.</w:t>
       </w:r>
     </w:p>
     <w:p>
@@ -828,7 +1267,23 @@
         <w:t>Vandaag wou de wifi niet werken op de campus dus had ik niet veel vooruitgang geboekt.</w:t>
       </w:r>
       <w:r>
-        <w:t xml:space="preserve"> Ik was ook gisteren vergeten om de registratie pagina te committen, dus da had ik alleszins gedaan door met mijn hotspot van mijn gsm te verbinden en de 4G aan te zetten.</w:t>
+        <w:t xml:space="preserve"> Ik was ook gisteren vergeten om de registratie pagina te </w:t>
+      </w:r>
+      <w:proofErr w:type="spellStart"/>
+      <w:r>
+        <w:t>committen</w:t>
+      </w:r>
+      <w:proofErr w:type="spellEnd"/>
+      <w:r>
+        <w:t xml:space="preserve">, dus da had ik alleszins gedaan door met mijn </w:t>
+      </w:r>
+      <w:proofErr w:type="spellStart"/>
+      <w:r>
+        <w:t>hotspot</w:t>
+      </w:r>
+      <w:proofErr w:type="spellEnd"/>
+      <w:r>
+        <w:t xml:space="preserve"> van mijn gsm te verbinden en de 4G aan te zetten.</w:t>
       </w:r>
     </w:p>
     <w:p>
@@ -860,11 +1315,21 @@
         <w:t>Vandaag wou de wifi op school nog steeds niet zo goed werken</w:t>
       </w:r>
       <w:r>
-        <w:t xml:space="preserve">, maar dankzij de wifi hotspot heb ik toch nog de navigatie van login naar registratie kunnen </w:t>
-      </w:r>
+        <w:t xml:space="preserve">, maar dankzij de wifi </w:t>
+      </w:r>
+      <w:proofErr w:type="spellStart"/>
+      <w:r>
+        <w:t>hotspot</w:t>
+      </w:r>
+      <w:proofErr w:type="spellEnd"/>
+      <w:r>
+        <w:t xml:space="preserve"> heb ik toch nog de navigatie van login naar registratie kunnen </w:t>
+      </w:r>
+      <w:proofErr w:type="spellStart"/>
       <w:r>
         <w:t>commiten</w:t>
       </w:r>
+      <w:proofErr w:type="spellEnd"/>
       <w:r>
         <w:t>.</w:t>
       </w:r>
@@ -874,7 +1339,15 @@
     </w:p>
     <w:p>
       <w:r>
-        <w:t>De wifi wou uiteindelijk werken dus kon eindelijk heel vlot vooruitgaan. Ik heb daarbij de navigatie tussen de login en registratie kunnen afwerken. Daarna heb ik ook de startpagina bijna afgewerkt, maar de bottom bar wou niet helemaal meewerken dus dat laat ik voor later.</w:t>
+        <w:t xml:space="preserve">De wifi wou uiteindelijk werken dus kon eindelijk heel vlot vooruitgaan. Ik heb daarbij de navigatie tussen de login en registratie kunnen afwerken. Daarna heb ik ook de startpagina bijna afgewerkt, maar de </w:t>
+      </w:r>
+      <w:proofErr w:type="spellStart"/>
+      <w:r>
+        <w:t>bottom</w:t>
+      </w:r>
+      <w:proofErr w:type="spellEnd"/>
+      <w:r>
+        <w:t xml:space="preserve"> bar wou niet helemaal meewerken dus dat laat ik voor later.</w:t>
       </w:r>
     </w:p>
     <w:p/>
@@ -895,7 +1368,31 @@
     </w:p>
     <w:p>
       <w:r>
-        <w:t>Vandaag heb ik de bodem navigatie afgewerkt waarbij je dan naar je groepen kunt gaan oftewel naar je notities die je hebt gefotografeerd. Dit was eerste wel een challenge zoals de active pagina weergegeven of de juiste eventlistener gebruiken om te kunnen navigeren. Maar deze links hebben daarbij geholpen:</w:t>
+        <w:t xml:space="preserve">Vandaag heb ik de bodem navigatie afgewerkt waarbij je dan naar je groepen kunt gaan oftewel naar je notities die je hebt gefotografeerd. Dit was eerste wel een </w:t>
+      </w:r>
+      <w:proofErr w:type="spellStart"/>
+      <w:r>
+        <w:t>challenge</w:t>
+      </w:r>
+      <w:proofErr w:type="spellEnd"/>
+      <w:r>
+        <w:t xml:space="preserve"> zoals de </w:t>
+      </w:r>
+      <w:proofErr w:type="spellStart"/>
+      <w:r>
+        <w:t>active</w:t>
+      </w:r>
+      <w:proofErr w:type="spellEnd"/>
+      <w:r>
+        <w:t xml:space="preserve"> pagina weergegeven of de juiste </w:t>
+      </w:r>
+      <w:proofErr w:type="spellStart"/>
+      <w:r>
+        <w:t>eventlistener</w:t>
+      </w:r>
+      <w:proofErr w:type="spellEnd"/>
+      <w:r>
+        <w:t xml:space="preserve"> gebruiken om te kunnen navigeren. Maar deze links hebben daarbij geholpen:</w:t>
       </w:r>
     </w:p>
     <w:p>
@@ -941,13 +1438,29 @@
     </w:p>
     <w:p>
       <w:r>
-        <w:t>Ik heb dan ook nog voor gezorgd dat mijn firebase account verbonden is met</w:t>
+        <w:t xml:space="preserve">Ik heb dan ook nog voor gezorgd dat mijn </w:t>
+      </w:r>
+      <w:proofErr w:type="spellStart"/>
+      <w:r>
+        <w:t>firebase</w:t>
+      </w:r>
+      <w:proofErr w:type="spellEnd"/>
+      <w:r>
+        <w:t xml:space="preserve"> account verbonden is met</w:t>
       </w:r>
       <w:r>
         <w:t xml:space="preserve"> mijn</w:t>
       </w:r>
       <w:r>
-        <w:t xml:space="preserve"> android studio app.</w:t>
+        <w:t xml:space="preserve"> </w:t>
+      </w:r>
+      <w:proofErr w:type="spellStart"/>
+      <w:r>
+        <w:t>android</w:t>
+      </w:r>
+      <w:proofErr w:type="spellEnd"/>
+      <w:r>
+        <w:t xml:space="preserve"> studio app.</w:t>
       </w:r>
     </w:p>
     <w:p>
@@ -1104,8 +1617,13 @@
           <w:numId w:val="1"/>
         </w:numPr>
       </w:pPr>
-      <w:r>
-        <w:t>Firebase implementeren</w:t>
+      <w:proofErr w:type="spellStart"/>
+      <w:r>
+        <w:t>Firebase</w:t>
+      </w:r>
+      <w:proofErr w:type="spellEnd"/>
+      <w:r>
+        <w:t xml:space="preserve"> implementeren</w:t>
       </w:r>
     </w:p>
     <w:p>
@@ -1117,8 +1635,13 @@
         </w:numPr>
       </w:pPr>
       <w:r>
-        <w:t>Login en registratie mogelijk maken via firebase</w:t>
-      </w:r>
+        <w:t xml:space="preserve">Login en registratie mogelijk maken via </w:t>
+      </w:r>
+      <w:proofErr w:type="spellStart"/>
+      <w:r>
+        <w:t>firebase</w:t>
+      </w:r>
+      <w:proofErr w:type="spellEnd"/>
     </w:p>
     <w:p>
       <w:pPr>
@@ -1129,7 +1652,11 @@
         </w:numPr>
       </w:pPr>
       <w:r>
-        <w:t>Camera functionaliteit bekijken voor andr</w:t>
+        <w:t xml:space="preserve">Camera functionaliteit bekijken voor </w:t>
+      </w:r>
+      <w:proofErr w:type="spellStart"/>
+      <w:r>
+        <w:t>andr</w:t>
       </w:r>
       <w:r>
         <w:t>oi</w:t>
@@ -1137,6 +1664,7 @@
       <w:r>
         <w:t>d</w:t>
       </w:r>
+      <w:proofErr w:type="spellEnd"/>
     </w:p>
     <w:p/>
     <w:p>
@@ -1156,10 +1684,66 @@
     </w:p>
     <w:p>
       <w:r>
-        <w:t>Hier kan je ondertussen zien dat mijn app verbonden is met Firebase. Nu vragen ze voor google sign-in om een sha-1 fingerprint toe te voegen.</w:t>
-      </w:r>
-      <w:r>
-        <w:t xml:space="preserve"> Ik wou dan google play signing pakken om het te genereren ipv self-signing, maar ik moet dan 25 euro eerst betalen voor een </w:t>
+        <w:t xml:space="preserve">Hier kan je ondertussen zien dat mijn app verbonden is met </w:t>
+      </w:r>
+      <w:proofErr w:type="spellStart"/>
+      <w:r>
+        <w:t>Firebase</w:t>
+      </w:r>
+      <w:proofErr w:type="spellEnd"/>
+      <w:r>
+        <w:t xml:space="preserve">. Nu vragen ze voor google </w:t>
+      </w:r>
+      <w:proofErr w:type="spellStart"/>
+      <w:r>
+        <w:t>sign</w:t>
+      </w:r>
+      <w:proofErr w:type="spellEnd"/>
+      <w:r>
+        <w:t xml:space="preserve">-in om een sha-1 </w:t>
+      </w:r>
+      <w:proofErr w:type="spellStart"/>
+      <w:r>
+        <w:t>fingerprint</w:t>
+      </w:r>
+      <w:proofErr w:type="spellEnd"/>
+      <w:r>
+        <w:t xml:space="preserve"> toe te voegen.</w:t>
+      </w:r>
+      <w:r>
+        <w:t xml:space="preserve"> Ik wou dan google </w:t>
+      </w:r>
+      <w:proofErr w:type="spellStart"/>
+      <w:r>
+        <w:t>play</w:t>
+      </w:r>
+      <w:proofErr w:type="spellEnd"/>
+      <w:r>
+        <w:t xml:space="preserve"> </w:t>
+      </w:r>
+      <w:proofErr w:type="spellStart"/>
+      <w:r>
+        <w:t>signing</w:t>
+      </w:r>
+      <w:proofErr w:type="spellEnd"/>
+      <w:r>
+        <w:t xml:space="preserve"> pakken om het te genereren </w:t>
+      </w:r>
+      <w:proofErr w:type="spellStart"/>
+      <w:r>
+        <w:t>ipv</w:t>
+      </w:r>
+      <w:proofErr w:type="spellEnd"/>
+      <w:r>
+        <w:t xml:space="preserve"> </w:t>
+      </w:r>
+      <w:proofErr w:type="spellStart"/>
+      <w:r>
+        <w:t>self-signing</w:t>
+      </w:r>
+      <w:proofErr w:type="spellEnd"/>
+      <w:r>
+        <w:t xml:space="preserve">, maar ik moet dan 25 euro eerst betalen voor een </w:t>
       </w:r>
       <w:r>
         <w:t>ontwikkelaar</w:t>
@@ -1230,14 +1814,75 @@
       <w:r>
         <w:t>Als ik wat meer naar onderging bij de “</w:t>
       </w:r>
-      <w:r>
-        <w:t>Authenticating Your Client</w:t>
-      </w:r>
-      <w:r>
-        <w:t>” pagina (zie link) kan je ook via de terminal van android studio een command invoeren om de sha-1 fingerprint te krijgen. Hierbij moest je “gradle sigingReport” invoeren en dan ctrl + enter invoeren!!</w:t>
-      </w:r>
-      <w:r>
-        <w:t xml:space="preserve"> Deze heb ik dan toegevoegd aan Firebase.</w:t>
+      <w:proofErr w:type="spellStart"/>
+      <w:r>
+        <w:t>Authenticating</w:t>
+      </w:r>
+      <w:proofErr w:type="spellEnd"/>
+      <w:r>
+        <w:t xml:space="preserve"> </w:t>
+      </w:r>
+      <w:proofErr w:type="spellStart"/>
+      <w:r>
+        <w:t>Your</w:t>
+      </w:r>
+      <w:proofErr w:type="spellEnd"/>
+      <w:r>
+        <w:t xml:space="preserve"> Client</w:t>
+      </w:r>
+      <w:r>
+        <w:t xml:space="preserve">” pagina (zie link) kan je ook via de terminal van </w:t>
+      </w:r>
+      <w:proofErr w:type="spellStart"/>
+      <w:r>
+        <w:t>android</w:t>
+      </w:r>
+      <w:proofErr w:type="spellEnd"/>
+      <w:r>
+        <w:t xml:space="preserve"> studio een </w:t>
+      </w:r>
+      <w:proofErr w:type="spellStart"/>
+      <w:r>
+        <w:t>command</w:t>
+      </w:r>
+      <w:proofErr w:type="spellEnd"/>
+      <w:r>
+        <w:t xml:space="preserve"> invoeren om de sha-1 </w:t>
+      </w:r>
+      <w:proofErr w:type="spellStart"/>
+      <w:r>
+        <w:t>fingerprint</w:t>
+      </w:r>
+      <w:proofErr w:type="spellEnd"/>
+      <w:r>
+        <w:t xml:space="preserve"> te krijgen. Hierbij moest je “</w:t>
+      </w:r>
+      <w:proofErr w:type="spellStart"/>
+      <w:r>
+        <w:t>gradle</w:t>
+      </w:r>
+      <w:proofErr w:type="spellEnd"/>
+      <w:r>
+        <w:t xml:space="preserve"> </w:t>
+      </w:r>
+      <w:proofErr w:type="spellStart"/>
+      <w:r>
+        <w:t>sigingReport</w:t>
+      </w:r>
+      <w:proofErr w:type="spellEnd"/>
+      <w:r>
+        <w:t>” invoeren en dan ctrl + enter invoeren!!</w:t>
+      </w:r>
+      <w:r>
+        <w:t xml:space="preserve"> Deze heb ik dan toegevoegd aan </w:t>
+      </w:r>
+      <w:proofErr w:type="spellStart"/>
+      <w:r>
+        <w:t>Firebase</w:t>
+      </w:r>
+      <w:proofErr w:type="spellEnd"/>
+      <w:r>
+        <w:t>.</w:t>
       </w:r>
     </w:p>
     <w:p>
@@ -1285,7 +1930,15 @@
     </w:p>
     <w:p>
       <w:r>
-        <w:t>Daarna moest ik een Oauth 2.0 client ID toevoegen voor het inloggen. Hierbij moest ik een hele configuratie begaan.</w:t>
+        <w:t xml:space="preserve">Daarna moest ik een </w:t>
+      </w:r>
+      <w:proofErr w:type="spellStart"/>
+      <w:r>
+        <w:t>Oauth</w:t>
+      </w:r>
+      <w:proofErr w:type="spellEnd"/>
+      <w:r>
+        <w:t xml:space="preserve"> 2.0 client ID toevoegen voor het inloggen. Hierbij moest ik een hele configuratie begaan.</w:t>
       </w:r>
       <w:r>
         <w:t xml:space="preserve"> Ik heb hierbij het meest niet ingevuld zoals een privacy policy, enzoverder.</w:t>
@@ -1466,7 +2119,31 @@
     </w:p>
     <w:p>
       <w:r>
-        <w:t xml:space="preserve">Vandaag had ik tijdens les (in de morgen van 8u15-11u15) verder gewerkt aan de back-end van mijn app. Ik was gisteren bezig met google sign-in, maar ik besloot om eerst normale email/password authentication toe te voegen. Dit ging vrij vlot vooruit maar toen ik de button klikt sloot de app af, dus dat moet ik nog oplossen. </w:t>
+        <w:t xml:space="preserve">Vandaag had ik tijdens les (in de morgen van 8u15-11u15) verder gewerkt aan de </w:t>
+      </w:r>
+      <w:proofErr w:type="spellStart"/>
+      <w:r>
+        <w:t>back-end</w:t>
+      </w:r>
+      <w:proofErr w:type="spellEnd"/>
+      <w:r>
+        <w:t xml:space="preserve"> van mijn app. Ik was gisteren bezig met google </w:t>
+      </w:r>
+      <w:proofErr w:type="spellStart"/>
+      <w:r>
+        <w:t>sign</w:t>
+      </w:r>
+      <w:proofErr w:type="spellEnd"/>
+      <w:r>
+        <w:t xml:space="preserve">-in, maar ik besloot om eerst normale email/password </w:t>
+      </w:r>
+      <w:proofErr w:type="spellStart"/>
+      <w:r>
+        <w:t>authentication</w:t>
+      </w:r>
+      <w:proofErr w:type="spellEnd"/>
+      <w:r>
+        <w:t xml:space="preserve"> toe te voegen. Dit ging vrij vlot vooruit maar toen ik de button klikt sloot de app af, dus dat moet ik nog oplossen. </w:t>
       </w:r>
       <w:r>
         <w:t>Er werd</w:t>
@@ -1512,10 +2189,34 @@
         <w:t>Vandaag heb ik eindelijk de login en registratie kunnen afwerken. Dit had veel moeite gekost.</w:t>
       </w:r>
       <w:r>
-        <w:t xml:space="preserve"> Het probleem was dus dat mijn app bleef crashen als ik probeerde te registeren. Ik had veel op stackoverflow gezocht maar ik kon eerst niks vinden, maar toen zag ik dat de wifi van de device emulator op Android studio geen wifi had. Ik dacht eerst dat dit normaal was, maar begon toen twijfels te krijgen. Ik had dan eerst de info op stackoverflow pagina proberen gebruiken, maar dat was niet juist. Uiteindelijk gewoon mijn gsm hotspot 4G gebruiken werkte wel.</w:t>
-      </w:r>
-      <w:r>
-        <w:t xml:space="preserve"> Mijn app crasht dan nog steeds bij registratie maar ik kon wel inloggen door een test account aan te maken op Firebase. Dus mijn code werkte, maar toen ik zag dat ik niet gekeken had naar de error van die verscheen na de crash en dat maakte alles duidelijk</w:t>
+        <w:t xml:space="preserve"> Het probleem was dus dat mijn app bleef crashen als ik probeerde te registeren. Ik had veel op stackoverflow gezocht maar ik kon eerst niks vinden, maar toen zag ik dat de wifi van de device emulator op </w:t>
+      </w:r>
+      <w:proofErr w:type="gramStart"/>
+      <w:r>
+        <w:t>Android studio</w:t>
+      </w:r>
+      <w:proofErr w:type="gramEnd"/>
+      <w:r>
+        <w:t xml:space="preserve"> geen wifi had. Ik dacht eerst dat dit normaal was, maar begon toen twijfels te krijgen. Ik had dan eerst de info op stackoverflow pagina proberen gebruiken, maar dat was niet juist. Uiteindelijk gewoon mijn gsm </w:t>
+      </w:r>
+      <w:proofErr w:type="spellStart"/>
+      <w:r>
+        <w:t>hotspot</w:t>
+      </w:r>
+      <w:proofErr w:type="spellEnd"/>
+      <w:r>
+        <w:t xml:space="preserve"> 4G gebruiken werkte wel.</w:t>
+      </w:r>
+      <w:r>
+        <w:t xml:space="preserve"> Mijn app crasht dan nog steeds bij registratie maar ik kon wel inloggen door een test account aan te maken op </w:t>
+      </w:r>
+      <w:proofErr w:type="spellStart"/>
+      <w:r>
+        <w:t>Firebase</w:t>
+      </w:r>
+      <w:proofErr w:type="spellEnd"/>
+      <w:r>
+        <w:t>. Dus mijn code werkte, maar toen ik zag dat ik niet gekeken had naar de error van die verscheen na de crash en dat maakte alles duidelijk</w:t>
       </w:r>
       <w:r>
         <w:t xml:space="preserve"> voor mij</w:t>
@@ -1677,8 +2378,65 @@
           <w:rFonts w:eastAsia="Times New Roman" w:cstheme="minorHAnsi"/>
           <w:lang w:eastAsia="nl-BE"/>
         </w:rPr>
-        <w:t>Vandaag heb ik geprobeerd om google sign-in te laten werken. Dit ging zeer goed, maar het enige probleem is dat de google account niet wordt toegevoegd aan Firebase en het wil daarna niet naar de volgende pagina gaan als ik de google sign</w:t>
-      </w:r>
+        <w:t xml:space="preserve">Vandaag heb ik geprobeerd om google </w:t>
+      </w:r>
+      <w:proofErr w:type="spellStart"/>
+      <w:r>
+        <w:rPr>
+          <w:rFonts w:eastAsia="Times New Roman" w:cstheme="minorHAnsi"/>
+          <w:lang w:eastAsia="nl-BE"/>
+        </w:rPr>
+        <w:t>sign</w:t>
+      </w:r>
+      <w:proofErr w:type="spellEnd"/>
+      <w:r>
+        <w:rPr>
+          <w:rFonts w:eastAsia="Times New Roman" w:cstheme="minorHAnsi"/>
+          <w:lang w:eastAsia="nl-BE"/>
+        </w:rPr>
+        <w:t xml:space="preserve">-in te laten werken. Dit ging zeer goed, maar het enige probleem is dat de </w:t>
+      </w:r>
+      <w:proofErr w:type="gramStart"/>
+      <w:r>
+        <w:rPr>
+          <w:rFonts w:eastAsia="Times New Roman" w:cstheme="minorHAnsi"/>
+          <w:lang w:eastAsia="nl-BE"/>
+        </w:rPr>
+        <w:t>google account</w:t>
+      </w:r>
+      <w:proofErr w:type="gramEnd"/>
+      <w:r>
+        <w:rPr>
+          <w:rFonts w:eastAsia="Times New Roman" w:cstheme="minorHAnsi"/>
+          <w:lang w:eastAsia="nl-BE"/>
+        </w:rPr>
+        <w:t xml:space="preserve"> niet wordt toegevoegd aan </w:t>
+      </w:r>
+      <w:proofErr w:type="spellStart"/>
+      <w:r>
+        <w:rPr>
+          <w:rFonts w:eastAsia="Times New Roman" w:cstheme="minorHAnsi"/>
+          <w:lang w:eastAsia="nl-BE"/>
+        </w:rPr>
+        <w:t>Firebase</w:t>
+      </w:r>
+      <w:proofErr w:type="spellEnd"/>
+      <w:r>
+        <w:rPr>
+          <w:rFonts w:eastAsia="Times New Roman" w:cstheme="minorHAnsi"/>
+          <w:lang w:eastAsia="nl-BE"/>
+        </w:rPr>
+        <w:t xml:space="preserve"> en het wil daarna niet naar de volgende pagina gaan als ik de google </w:t>
+      </w:r>
+      <w:proofErr w:type="spellStart"/>
+      <w:r>
+        <w:rPr>
+          <w:rFonts w:eastAsia="Times New Roman" w:cstheme="minorHAnsi"/>
+          <w:lang w:eastAsia="nl-BE"/>
+        </w:rPr>
+        <w:t>sign</w:t>
+      </w:r>
+      <w:proofErr w:type="spellEnd"/>
       <w:r>
         <w:rPr>
           <w:rFonts w:eastAsia="Times New Roman" w:cstheme="minorHAnsi"/>
@@ -1691,7 +2449,39 @@
           <w:rFonts w:eastAsia="Times New Roman" w:cstheme="minorHAnsi"/>
           <w:lang w:eastAsia="nl-BE"/>
         </w:rPr>
-        <w:t>in button klik. Het sign-in scherm verschijnt wel en hebben geen errors, maar daarna gebeurt er niks. Ik heb de methode toegevoegd die iemand van teams zei dat die het probleem</w:t>
+        <w:t xml:space="preserve">in button klik. Het </w:t>
+      </w:r>
+      <w:proofErr w:type="spellStart"/>
+      <w:r>
+        <w:rPr>
+          <w:rFonts w:eastAsia="Times New Roman" w:cstheme="minorHAnsi"/>
+          <w:lang w:eastAsia="nl-BE"/>
+        </w:rPr>
+        <w:t>sign</w:t>
+      </w:r>
+      <w:proofErr w:type="spellEnd"/>
+      <w:r>
+        <w:rPr>
+          <w:rFonts w:eastAsia="Times New Roman" w:cstheme="minorHAnsi"/>
+          <w:lang w:eastAsia="nl-BE"/>
+        </w:rPr>
+        <w:t xml:space="preserve">-in scherm verschijnt wel en hebben geen </w:t>
+      </w:r>
+      <w:proofErr w:type="spellStart"/>
+      <w:r>
+        <w:rPr>
+          <w:rFonts w:eastAsia="Times New Roman" w:cstheme="minorHAnsi"/>
+          <w:lang w:eastAsia="nl-BE"/>
+        </w:rPr>
+        <w:t>errors</w:t>
+      </w:r>
+      <w:proofErr w:type="spellEnd"/>
+      <w:r>
+        <w:rPr>
+          <w:rFonts w:eastAsia="Times New Roman" w:cstheme="minorHAnsi"/>
+          <w:lang w:eastAsia="nl-BE"/>
+        </w:rPr>
+        <w:t>, maar daarna gebeurt er niks. Ik heb de methode toegevoegd die iemand van teams zei dat die het probleem</w:t>
       </w:r>
       <w:r>
         <w:rPr>
@@ -1726,7 +2516,23 @@
           <w:rFonts w:eastAsia="Times New Roman" w:cstheme="minorHAnsi"/>
           <w:lang w:eastAsia="nl-BE"/>
         </w:rPr>
-        <w:t xml:space="preserve"> 1 van de methodes was wel deprecated, maar die had </w:t>
+        <w:t xml:space="preserve"> 1 van de methodes was wel </w:t>
+      </w:r>
+      <w:proofErr w:type="spellStart"/>
+      <w:r>
+        <w:rPr>
+          <w:rFonts w:eastAsia="Times New Roman" w:cstheme="minorHAnsi"/>
+          <w:lang w:eastAsia="nl-BE"/>
+        </w:rPr>
+        <w:t>deprecated</w:t>
+      </w:r>
+      <w:proofErr w:type="spellEnd"/>
+      <w:r>
+        <w:rPr>
+          <w:rFonts w:eastAsia="Times New Roman" w:cstheme="minorHAnsi"/>
+          <w:lang w:eastAsia="nl-BE"/>
+        </w:rPr>
+        <w:t xml:space="preserve">, maar die had </w:t>
       </w:r>
       <w:r>
         <w:rPr>
@@ -1891,14 +2697,192 @@
           <w:rFonts w:eastAsia="Times New Roman" w:cstheme="minorHAnsi"/>
           <w:lang w:eastAsia="nl-BE"/>
         </w:rPr>
-        <w:t>Vandaag is het me gelukt om de google sign-in te laten werken. Ik had veel opzoek werk gedaan op google maar kon niks duidelijk vinden. Ik had mijn code ook gedebugd, maar geen duidelijk error werd weergegeven. Uiteindelijk besloot ik opzoek te gaan naar een tutorial die recent was in 2021. Deze tutorial heb ik dan gebruikt om mijn project strict te controleren en toen realiseerde ik dat de SHA-1 niet op de juiste plaats stond. Ik had op google cloud een Oauth 2.0 client id moeten aanmaken toen ik de android studio firebase tutorial volgde, maar dat bleek dus helemaal fout te zijn, want de echte client_id was eigenlijk al klaar in een google-services.json file. Ik moest toen ook mijn SHA-1 fingerprint verwijderen bij de onderstaande afbeelding, maar dat mocht daar eigenlijk blijven staan.</w:t>
-      </w:r>
-      <w:r>
-        <w:rPr>
-          <w:rFonts w:eastAsia="Times New Roman" w:cstheme="minorHAnsi"/>
-          <w:lang w:eastAsia="nl-BE"/>
-        </w:rPr>
-        <w:t xml:space="preserve"> Nu kunnen google accounts succesvol worden toegevoegd.</w:t>
+        <w:t xml:space="preserve">Vandaag is het me gelukt om de google </w:t>
+      </w:r>
+      <w:proofErr w:type="spellStart"/>
+      <w:r>
+        <w:rPr>
+          <w:rFonts w:eastAsia="Times New Roman" w:cstheme="minorHAnsi"/>
+          <w:lang w:eastAsia="nl-BE"/>
+        </w:rPr>
+        <w:t>sign</w:t>
+      </w:r>
+      <w:proofErr w:type="spellEnd"/>
+      <w:r>
+        <w:rPr>
+          <w:rFonts w:eastAsia="Times New Roman" w:cstheme="minorHAnsi"/>
+          <w:lang w:eastAsia="nl-BE"/>
+        </w:rPr>
+        <w:t xml:space="preserve">-in te laten werken. Ik had veel opzoek werk gedaan op google maar kon niks duidelijk vinden. Ik had mijn code ook gedebugd, maar geen duidelijk error werd weergegeven. Uiteindelijk besloot ik opzoek te gaan naar een tutorial die recent was in 2021. Deze tutorial heb ik dan gebruikt om mijn project </w:t>
+      </w:r>
+      <w:proofErr w:type="spellStart"/>
+      <w:r>
+        <w:rPr>
+          <w:rFonts w:eastAsia="Times New Roman" w:cstheme="minorHAnsi"/>
+          <w:lang w:eastAsia="nl-BE"/>
+        </w:rPr>
+        <w:t>strict</w:t>
+      </w:r>
+      <w:proofErr w:type="spellEnd"/>
+      <w:r>
+        <w:rPr>
+          <w:rFonts w:eastAsia="Times New Roman" w:cstheme="minorHAnsi"/>
+          <w:lang w:eastAsia="nl-BE"/>
+        </w:rPr>
+        <w:t xml:space="preserve"> te controleren en toen realiseerde ik dat de SHA-1 niet op de juiste plaats stond. Ik had op google </w:t>
+      </w:r>
+      <w:proofErr w:type="spellStart"/>
+      <w:r>
+        <w:rPr>
+          <w:rFonts w:eastAsia="Times New Roman" w:cstheme="minorHAnsi"/>
+          <w:lang w:eastAsia="nl-BE"/>
+        </w:rPr>
+        <w:t>cloud</w:t>
+      </w:r>
+      <w:proofErr w:type="spellEnd"/>
+      <w:r>
+        <w:rPr>
+          <w:rFonts w:eastAsia="Times New Roman" w:cstheme="minorHAnsi"/>
+          <w:lang w:eastAsia="nl-BE"/>
+        </w:rPr>
+        <w:t xml:space="preserve"> een </w:t>
+      </w:r>
+      <w:proofErr w:type="spellStart"/>
+      <w:r>
+        <w:rPr>
+          <w:rFonts w:eastAsia="Times New Roman" w:cstheme="minorHAnsi"/>
+          <w:lang w:eastAsia="nl-BE"/>
+        </w:rPr>
+        <w:t>Oauth</w:t>
+      </w:r>
+      <w:proofErr w:type="spellEnd"/>
+      <w:r>
+        <w:rPr>
+          <w:rFonts w:eastAsia="Times New Roman" w:cstheme="minorHAnsi"/>
+          <w:lang w:eastAsia="nl-BE"/>
+        </w:rPr>
+        <w:t xml:space="preserve"> 2.0 client </w:t>
+      </w:r>
+      <w:proofErr w:type="spellStart"/>
+      <w:r>
+        <w:rPr>
+          <w:rFonts w:eastAsia="Times New Roman" w:cstheme="minorHAnsi"/>
+          <w:lang w:eastAsia="nl-BE"/>
+        </w:rPr>
+        <w:t>id</w:t>
+      </w:r>
+      <w:proofErr w:type="spellEnd"/>
+      <w:r>
+        <w:rPr>
+          <w:rFonts w:eastAsia="Times New Roman" w:cstheme="minorHAnsi"/>
+          <w:lang w:eastAsia="nl-BE"/>
+        </w:rPr>
+        <w:t xml:space="preserve"> moeten aanmaken toen ik de </w:t>
+      </w:r>
+      <w:proofErr w:type="spellStart"/>
+      <w:r>
+        <w:rPr>
+          <w:rFonts w:eastAsia="Times New Roman" w:cstheme="minorHAnsi"/>
+          <w:lang w:eastAsia="nl-BE"/>
+        </w:rPr>
+        <w:t>android</w:t>
+      </w:r>
+      <w:proofErr w:type="spellEnd"/>
+      <w:r>
+        <w:rPr>
+          <w:rFonts w:eastAsia="Times New Roman" w:cstheme="minorHAnsi"/>
+          <w:lang w:eastAsia="nl-BE"/>
+        </w:rPr>
+        <w:t xml:space="preserve"> studio </w:t>
+      </w:r>
+      <w:proofErr w:type="spellStart"/>
+      <w:r>
+        <w:rPr>
+          <w:rFonts w:eastAsia="Times New Roman" w:cstheme="minorHAnsi"/>
+          <w:lang w:eastAsia="nl-BE"/>
+        </w:rPr>
+        <w:t>firebase</w:t>
+      </w:r>
+      <w:proofErr w:type="spellEnd"/>
+      <w:r>
+        <w:rPr>
+          <w:rFonts w:eastAsia="Times New Roman" w:cstheme="minorHAnsi"/>
+          <w:lang w:eastAsia="nl-BE"/>
+        </w:rPr>
+        <w:t xml:space="preserve"> tutorial volgde, maar dat bleek dus helemaal fout te zijn, want de echte </w:t>
+      </w:r>
+      <w:proofErr w:type="spellStart"/>
+      <w:r>
+        <w:rPr>
+          <w:rFonts w:eastAsia="Times New Roman" w:cstheme="minorHAnsi"/>
+          <w:lang w:eastAsia="nl-BE"/>
+        </w:rPr>
+        <w:t>client_id</w:t>
+      </w:r>
+      <w:proofErr w:type="spellEnd"/>
+      <w:r>
+        <w:rPr>
+          <w:rFonts w:eastAsia="Times New Roman" w:cstheme="minorHAnsi"/>
+          <w:lang w:eastAsia="nl-BE"/>
+        </w:rPr>
+        <w:t xml:space="preserve"> was eigenlijk al klaar in een google-</w:t>
+      </w:r>
+      <w:proofErr w:type="spellStart"/>
+      <w:proofErr w:type="gramStart"/>
+      <w:r>
+        <w:rPr>
+          <w:rFonts w:eastAsia="Times New Roman" w:cstheme="minorHAnsi"/>
+          <w:lang w:eastAsia="nl-BE"/>
+        </w:rPr>
+        <w:t>services.json</w:t>
+      </w:r>
+      <w:proofErr w:type="spellEnd"/>
+      <w:proofErr w:type="gramEnd"/>
+      <w:r>
+        <w:rPr>
+          <w:rFonts w:eastAsia="Times New Roman" w:cstheme="minorHAnsi"/>
+          <w:lang w:eastAsia="nl-BE"/>
+        </w:rPr>
+        <w:t xml:space="preserve"> file. Ik moest toen ook mijn SHA-1 </w:t>
+      </w:r>
+      <w:proofErr w:type="spellStart"/>
+      <w:r>
+        <w:rPr>
+          <w:rFonts w:eastAsia="Times New Roman" w:cstheme="minorHAnsi"/>
+          <w:lang w:eastAsia="nl-BE"/>
+        </w:rPr>
+        <w:t>fingerprint</w:t>
+      </w:r>
+      <w:proofErr w:type="spellEnd"/>
+      <w:r>
+        <w:rPr>
+          <w:rFonts w:eastAsia="Times New Roman" w:cstheme="minorHAnsi"/>
+          <w:lang w:eastAsia="nl-BE"/>
+        </w:rPr>
+        <w:t xml:space="preserve"> verwijderen bij de onderstaande afbeelding, maar dat mocht daar eigenlijk blijven staan.</w:t>
+      </w:r>
+      <w:r>
+        <w:rPr>
+          <w:rFonts w:eastAsia="Times New Roman" w:cstheme="minorHAnsi"/>
+          <w:lang w:eastAsia="nl-BE"/>
+        </w:rPr>
+        <w:t xml:space="preserve"> Nu kunnen </w:t>
+      </w:r>
+      <w:proofErr w:type="gramStart"/>
+      <w:r>
+        <w:rPr>
+          <w:rFonts w:eastAsia="Times New Roman" w:cstheme="minorHAnsi"/>
+          <w:lang w:eastAsia="nl-BE"/>
+        </w:rPr>
+        <w:t>google accounts</w:t>
+      </w:r>
+      <w:proofErr w:type="gramEnd"/>
+      <w:r>
+        <w:rPr>
+          <w:rFonts w:eastAsia="Times New Roman" w:cstheme="minorHAnsi"/>
+          <w:lang w:eastAsia="nl-BE"/>
+        </w:rPr>
+        <w:t xml:space="preserve"> succesvol worden toegevoegd.</w:t>
       </w:r>
       <w:r>
         <w:rPr>
@@ -2093,7 +3077,15 @@
       </w:pPr>
       <w:r>
         <w:lastRenderedPageBreak/>
-        <w:t>Wat ik wil realiseen deze week:</w:t>
+        <w:t xml:space="preserve">Wat ik wil </w:t>
+      </w:r>
+      <w:proofErr w:type="spellStart"/>
+      <w:r>
+        <w:t>realiseen</w:t>
+      </w:r>
+      <w:proofErr w:type="spellEnd"/>
+      <w:r>
+        <w:t xml:space="preserve"> deze week:</w:t>
       </w:r>
     </w:p>
     <w:p>
@@ -2104,8 +3096,13 @@
           <w:numId w:val="2"/>
         </w:numPr>
       </w:pPr>
-      <w:r>
-        <w:t xml:space="preserve">Firebase </w:t>
+      <w:proofErr w:type="spellStart"/>
+      <w:r>
+        <w:t>Firebase</w:t>
+      </w:r>
+      <w:proofErr w:type="spellEnd"/>
+      <w:r>
+        <w:t xml:space="preserve"> </w:t>
       </w:r>
       <w:r>
         <w:t>storage</w:t>
@@ -2147,19 +3144,43 @@
     </w:p>
     <w:p>
       <w:r>
-        <w:t>Vandaag ben ik begonnen met aanmaken van de Firebase storage voor het opslaan van afbeeldingen.</w:t>
+        <w:t xml:space="preserve">Vandaag ben ik begonnen met aanmaken van de </w:t>
+      </w:r>
+      <w:proofErr w:type="spellStart"/>
+      <w:r>
+        <w:t>Firebase</w:t>
+      </w:r>
+      <w:proofErr w:type="spellEnd"/>
+      <w:r>
+        <w:t xml:space="preserve"> storage voor het opslaan van afbeeldingen.</w:t>
       </w:r>
       <w:r>
         <w:t xml:space="preserve"> </w:t>
       </w:r>
       <w:r>
-        <w:t xml:space="preserve">Ik heb dan de dependencies toegevoegd en dan moest ik een Cloud storage bucket aanmaken. Hierbij werd er gevraagd om een locatie te kiezen waarbij Europe-west 1 (= Belgische regio) niet tussen stond, maar gelukkig is er Eur3 die eigenlijk Belgische en Nederlandse regio voorstelt. Dat werd uitgelegd </w:t>
-      </w:r>
-      <w:r>
-        <w:t>op deze webpagina</w:t>
-      </w:r>
-      <w:r>
-        <w:t>‘s</w:t>
+        <w:t xml:space="preserve">Ik heb dan de </w:t>
+      </w:r>
+      <w:proofErr w:type="spellStart"/>
+      <w:r>
+        <w:t>dependencies</w:t>
+      </w:r>
+      <w:proofErr w:type="spellEnd"/>
+      <w:r>
+        <w:t xml:space="preserve"> toegevoegd en dan moest ik een Cloud storage bucket aanmaken. Hierbij werd er gevraagd om een locatie te kiezen waarbij Europe-west 1 (= Belgische regio) niet tussen stond, maar gelukkig is er Eur3 die eigenlijk Belgische en Nederlandse regio voorstelt. Dat werd uitgelegd </w:t>
+      </w:r>
+      <w:r>
+        <w:t xml:space="preserve">op deze </w:t>
+      </w:r>
+      <w:proofErr w:type="gramStart"/>
+      <w:r>
+        <w:t>webpagina</w:t>
+      </w:r>
+      <w:r>
+        <w:t>‘</w:t>
+      </w:r>
+      <w:proofErr w:type="gramEnd"/>
+      <w:r>
+        <w:t>s</w:t>
       </w:r>
       <w:r>
         <w:t>:</w:t>
@@ -2266,12 +3287,52 @@
     </w:p>
     <w:p>
       <w:r>
-        <w:t xml:space="preserve">Vandaag heb ik de java code moet schrijven voor de camera te kunnen gebruiken. Eerst heb ik code toegevoegd dat ervoor zorgt dat de permissies worden aangevraagd om de camera te kunnen gebruiken. Daarna als ik allow klik dan opent een test camera zicht van de emulator. </w:t>
-      </w:r>
-    </w:p>
-    <w:p>
-      <w:r>
-        <w:t>Hierbij werden gelijkaardig methoden gebruikt zoals de firebase authentication, maar waren ook deprecated. Dit heb natuurlijk makkelijk opgelost.</w:t>
+        <w:t xml:space="preserve">Vandaag heb ik de </w:t>
+      </w:r>
+      <w:proofErr w:type="spellStart"/>
+      <w:r>
+        <w:t>java</w:t>
+      </w:r>
+      <w:proofErr w:type="spellEnd"/>
+      <w:r>
+        <w:t xml:space="preserve"> code moet schrijven voor de camera te kunnen gebruiken. Eerst heb ik code toegevoegd dat ervoor zorgt dat de permissies worden aangevraagd om de camera te kunnen gebruiken. Daarna als ik </w:t>
+      </w:r>
+      <w:proofErr w:type="spellStart"/>
+      <w:r>
+        <w:t>allow</w:t>
+      </w:r>
+      <w:proofErr w:type="spellEnd"/>
+      <w:r>
+        <w:t xml:space="preserve"> klik dan opent een test camera zicht van de emulator. </w:t>
+      </w:r>
+    </w:p>
+    <w:p>
+      <w:r>
+        <w:t xml:space="preserve">Hierbij werden gelijkaardig methoden gebruikt zoals de </w:t>
+      </w:r>
+      <w:proofErr w:type="spellStart"/>
+      <w:r>
+        <w:t>firebase</w:t>
+      </w:r>
+      <w:proofErr w:type="spellEnd"/>
+      <w:r>
+        <w:t xml:space="preserve"> </w:t>
+      </w:r>
+      <w:proofErr w:type="spellStart"/>
+      <w:r>
+        <w:t>authentication</w:t>
+      </w:r>
+      <w:proofErr w:type="spellEnd"/>
+      <w:r>
+        <w:t xml:space="preserve">, maar waren ook </w:t>
+      </w:r>
+      <w:proofErr w:type="spellStart"/>
+      <w:r>
+        <w:t>deprecated</w:t>
+      </w:r>
+      <w:proofErr w:type="spellEnd"/>
+      <w:r>
+        <w:t>. Dit heb natuurlijk makkelijk opgelost.</w:t>
       </w:r>
     </w:p>
     <w:p>
@@ -2345,7 +3406,15 @@
     </w:p>
     <w:p>
       <w:r>
-        <w:t>Vandaag heb ik geprobeerd om de image die getrokken wordt op te slaan in firebase storage</w:t>
+        <w:t xml:space="preserve">Vandaag heb ik geprobeerd om de image die getrokken wordt op te slaan in </w:t>
+      </w:r>
+      <w:proofErr w:type="spellStart"/>
+      <w:r>
+        <w:t>firebase</w:t>
+      </w:r>
+      <w:proofErr w:type="spellEnd"/>
+      <w:r>
+        <w:t xml:space="preserve"> storage</w:t>
       </w:r>
       <w:r>
         <w:t>. Dit is op het einde van de les gelukt.</w:t>
@@ -2399,10 +3468,90 @@
     <w:p>
       <w:r>
         <w:lastRenderedPageBreak/>
-        <w:t xml:space="preserve">Hierbij had ik vooral problemen met de uri oftewl URL omdat firebase die nodig had om te kunnen uploaden. Als je naar de eerste rode streep kijkt is er een methode voor </w:t>
-      </w:r>
-      <w:r>
-        <w:t>de bitmap die je krijgt van de camera te gebruiken om de uri te bepalen. De volgende is voor de bestandextensie te krijgen om een filename op te stellen in de firebase storage. Hierbij pak ik gewoon het tijdstip met de bestandextensie, maar ik ben misschien van plan om de filename te kunnen aanpassen door de gebruiker. De laatste streep zijn twee child methods waarbij dus de eerste de map voorstelt waar dan de 2</w:t>
+        <w:t xml:space="preserve">Hierbij had ik vooral problemen met de </w:t>
+      </w:r>
+      <w:proofErr w:type="spellStart"/>
+      <w:r>
+        <w:t>uri</w:t>
+      </w:r>
+      <w:proofErr w:type="spellEnd"/>
+      <w:r>
+        <w:t xml:space="preserve"> </w:t>
+      </w:r>
+      <w:proofErr w:type="spellStart"/>
+      <w:r>
+        <w:t>oftewl</w:t>
+      </w:r>
+      <w:proofErr w:type="spellEnd"/>
+      <w:r>
+        <w:t xml:space="preserve"> URL omdat </w:t>
+      </w:r>
+      <w:proofErr w:type="spellStart"/>
+      <w:r>
+        <w:t>firebase</w:t>
+      </w:r>
+      <w:proofErr w:type="spellEnd"/>
+      <w:r>
+        <w:t xml:space="preserve"> die nodig had om te kunnen uploaden. Als je naar de eerste rode streep kijkt is er een methode voor </w:t>
+      </w:r>
+      <w:r>
+        <w:t xml:space="preserve">de </w:t>
+      </w:r>
+      <w:proofErr w:type="spellStart"/>
+      <w:r>
+        <w:t>bitmap</w:t>
+      </w:r>
+      <w:proofErr w:type="spellEnd"/>
+      <w:r>
+        <w:t xml:space="preserve"> die je krijgt van de camera te gebruiken om de </w:t>
+      </w:r>
+      <w:proofErr w:type="spellStart"/>
+      <w:r>
+        <w:t>uri</w:t>
+      </w:r>
+      <w:proofErr w:type="spellEnd"/>
+      <w:r>
+        <w:t xml:space="preserve"> te bepalen. De volgende is voor de bestandextensie te krijgen om een </w:t>
+      </w:r>
+      <w:proofErr w:type="spellStart"/>
+      <w:r>
+        <w:t>filename</w:t>
+      </w:r>
+      <w:proofErr w:type="spellEnd"/>
+      <w:r>
+        <w:t xml:space="preserve"> op te stellen in de </w:t>
+      </w:r>
+      <w:proofErr w:type="spellStart"/>
+      <w:r>
+        <w:t>firebase</w:t>
+      </w:r>
+      <w:proofErr w:type="spellEnd"/>
+      <w:r>
+        <w:t xml:space="preserve"> storage. Hierbij pak ik gewoon het tijdstip met de bestandextensie, maar ik ben misschien van plan om de </w:t>
+      </w:r>
+      <w:proofErr w:type="spellStart"/>
+      <w:r>
+        <w:t>filename</w:t>
+      </w:r>
+      <w:proofErr w:type="spellEnd"/>
+      <w:r>
+        <w:t xml:space="preserve"> te kunnen aanpassen door de gebruiker. De laatste streep zijn twee </w:t>
+      </w:r>
+      <w:proofErr w:type="spellStart"/>
+      <w:r>
+        <w:t>child</w:t>
+      </w:r>
+      <w:proofErr w:type="spellEnd"/>
+      <w:r>
+        <w:t xml:space="preserve"> </w:t>
+      </w:r>
+      <w:proofErr w:type="spellStart"/>
+      <w:r>
+        <w:t>methods</w:t>
+      </w:r>
+      <w:proofErr w:type="spellEnd"/>
+      <w:r>
+        <w:t xml:space="preserve"> waarbij dus de eerste de map voorstelt waar dan de 2</w:t>
       </w:r>
       <w:r>
         <w:rPr>
@@ -2411,7 +3560,23 @@
         <w:t>de</w:t>
       </w:r>
       <w:r>
-        <w:t xml:space="preserve"> child oftewel de image inkomt. De map geef ik  het email adres van de gebruiker als naam.</w:t>
+        <w:t xml:space="preserve"> </w:t>
+      </w:r>
+      <w:proofErr w:type="spellStart"/>
+      <w:r>
+        <w:t>child</w:t>
+      </w:r>
+      <w:proofErr w:type="spellEnd"/>
+      <w:r>
+        <w:t xml:space="preserve"> oftewel de image inkomt. De map geef </w:t>
+      </w:r>
+      <w:proofErr w:type="gramStart"/>
+      <w:r>
+        <w:t>ik  het</w:t>
+      </w:r>
+      <w:proofErr w:type="gramEnd"/>
+      <w:r>
+        <w:t xml:space="preserve"> email adres van de gebruiker als naam.</w:t>
       </w:r>
     </w:p>
     <w:p>
@@ -2512,7 +3677,15 @@
         <w:pStyle w:val="Kop3"/>
       </w:pPr>
       <w:r>
-        <w:t>Wat ik wil realiseen deze week:</w:t>
+        <w:t xml:space="preserve">Wat ik wil </w:t>
+      </w:r>
+      <w:proofErr w:type="spellStart"/>
+      <w:r>
+        <w:t>realiseen</w:t>
+      </w:r>
+      <w:proofErr w:type="spellEnd"/>
+      <w:r>
+        <w:t xml:space="preserve"> deze week:</w:t>
       </w:r>
     </w:p>
     <w:p>
@@ -2545,7 +3718,15 @@
         <w:t>je gsm</w:t>
       </w:r>
       <w:r>
-        <w:t xml:space="preserve"> gallery gebruiken)</w:t>
+        <w:t xml:space="preserve"> </w:t>
+      </w:r>
+      <w:proofErr w:type="spellStart"/>
+      <w:r>
+        <w:t>gallery</w:t>
+      </w:r>
+      <w:proofErr w:type="spellEnd"/>
+      <w:r>
+        <w:t xml:space="preserve"> gebruiken)</w:t>
       </w:r>
     </w:p>
     <w:p/>
@@ -2566,7 +3747,23 @@
     </w:p>
     <w:p>
       <w:r>
-        <w:t xml:space="preserve">Vandaag heb ik geprobeerd om een gridview toe te voegen die images bevat dat dus lijkt op een image gallery zoals uw “foto’s” app. Hierbij heb ik de </w:t>
+        <w:t xml:space="preserve">Vandaag heb ik geprobeerd om een </w:t>
+      </w:r>
+      <w:proofErr w:type="spellStart"/>
+      <w:r>
+        <w:t>gridview</w:t>
+      </w:r>
+      <w:proofErr w:type="spellEnd"/>
+      <w:r>
+        <w:t xml:space="preserve"> toe te voegen die images bevat dat dus lijkt op een image </w:t>
+      </w:r>
+      <w:proofErr w:type="spellStart"/>
+      <w:r>
+        <w:t>gallery</w:t>
+      </w:r>
+      <w:proofErr w:type="spellEnd"/>
+      <w:r>
+        <w:t xml:space="preserve"> zoals uw “foto’s” app. Hierbij heb ik de </w:t>
       </w:r>
       <w:r>
         <w:t>volgende</w:t>
@@ -2611,7 +3808,15 @@
     </w:p>
     <w:p>
       <w:r>
-        <w:t>Dit heeft nog niet direct resultaat gegeven, maar de GridAdapter class geeft een gevoel dat ik wel op de goeie weg zit.</w:t>
+        <w:t xml:space="preserve">Dit heeft nog niet direct resultaat gegeven, maar de </w:t>
+      </w:r>
+      <w:proofErr w:type="spellStart"/>
+      <w:r>
+        <w:t>GridAdapter</w:t>
+      </w:r>
+      <w:proofErr w:type="spellEnd"/>
+      <w:r>
+        <w:t xml:space="preserve"> class geeft een gevoel dat ik wel op de goeie weg zit.</w:t>
       </w:r>
     </w:p>
     <w:p/>
@@ -2632,7 +3837,31 @@
     </w:p>
     <w:p>
       <w:r>
-        <w:t>Na de GridAdapter klasse te controleren ontdekte ik dat ik gewoon het verkeerd image Id doorgegeven heb. Dit heeft het probleem onmiddellijk gefixed als zijn de voorbeeld images niet echt mooi gepositioneerd.</w:t>
+        <w:t xml:space="preserve">Na de </w:t>
+      </w:r>
+      <w:proofErr w:type="spellStart"/>
+      <w:r>
+        <w:t>GridAdapter</w:t>
+      </w:r>
+      <w:proofErr w:type="spellEnd"/>
+      <w:r>
+        <w:t xml:space="preserve"> klasse te controleren ontdekte ik dat ik gewoon het verkeerd image </w:t>
+      </w:r>
+      <w:proofErr w:type="spellStart"/>
+      <w:r>
+        <w:t>Id</w:t>
+      </w:r>
+      <w:proofErr w:type="spellEnd"/>
+      <w:r>
+        <w:t xml:space="preserve"> doorgegeven heb. Dit heeft het probleem onmiddellijk </w:t>
+      </w:r>
+      <w:proofErr w:type="spellStart"/>
+      <w:r>
+        <w:t>gefixed</w:t>
+      </w:r>
+      <w:proofErr w:type="spellEnd"/>
+      <w:r>
+        <w:t xml:space="preserve"> als zijn de voorbeeld images niet echt mooi gepositioneerd.</w:t>
       </w:r>
     </w:p>
     <w:p>
@@ -2686,7 +3915,15 @@
         <w:t>gedetailleerd</w:t>
       </w:r>
       <w:r>
-        <w:t xml:space="preserve"> tutorial gevolgd hoe je met een gridview kan werken:</w:t>
+        <w:t xml:space="preserve"> tutorial gevolgd hoe je met een </w:t>
+      </w:r>
+      <w:proofErr w:type="spellStart"/>
+      <w:r>
+        <w:t>gridview</w:t>
+      </w:r>
+      <w:proofErr w:type="spellEnd"/>
+      <w:r>
+        <w:t xml:space="preserve"> kan werken:</w:t>
       </w:r>
     </w:p>
     <w:p>
@@ -2701,10 +3938,63 @@
     </w:p>
     <w:p>
       <w:r>
-        <w:t xml:space="preserve">Daarna heb ik er nog voor gezorgd dat de margin top en bottom via java code worden aangepast afhankelijk van de </w:t>
-      </w:r>
-      <w:r>
-        <w:t>hoogte van de header en footer. Dit werdt gedaan in OnCreateView():</w:t>
+        <w:t xml:space="preserve">Daarna heb ik er nog voor gezorgd dat de </w:t>
+      </w:r>
+      <w:proofErr w:type="spellStart"/>
+      <w:r>
+        <w:t>margin</w:t>
+      </w:r>
+      <w:proofErr w:type="spellEnd"/>
+      <w:r>
+        <w:t xml:space="preserve"> top en </w:t>
+      </w:r>
+      <w:proofErr w:type="spellStart"/>
+      <w:r>
+        <w:t>bottom</w:t>
+      </w:r>
+      <w:proofErr w:type="spellEnd"/>
+      <w:r>
+        <w:t xml:space="preserve"> via </w:t>
+      </w:r>
+      <w:proofErr w:type="spellStart"/>
+      <w:r>
+        <w:t>java</w:t>
+      </w:r>
+      <w:proofErr w:type="spellEnd"/>
+      <w:r>
+        <w:t xml:space="preserve"> code worden aangepast afhankelijk van de </w:t>
+      </w:r>
+      <w:r>
+        <w:t xml:space="preserve">hoogte van de header en </w:t>
+      </w:r>
+      <w:proofErr w:type="spellStart"/>
+      <w:r>
+        <w:t>footer</w:t>
+      </w:r>
+      <w:proofErr w:type="spellEnd"/>
+      <w:r>
+        <w:t xml:space="preserve">. Dit </w:t>
+      </w:r>
+      <w:proofErr w:type="spellStart"/>
+      <w:r>
+        <w:t>werdt</w:t>
+      </w:r>
+      <w:proofErr w:type="spellEnd"/>
+      <w:r>
+        <w:t xml:space="preserve"> gedaan in </w:t>
+      </w:r>
+      <w:proofErr w:type="spellStart"/>
+      <w:proofErr w:type="gramStart"/>
+      <w:r>
+        <w:t>OnCreateView</w:t>
+      </w:r>
+      <w:proofErr w:type="spellEnd"/>
+      <w:r>
+        <w:t>(</w:t>
+      </w:r>
+      <w:proofErr w:type="gramEnd"/>
+      <w:r>
+        <w:t>):</w:t>
       </w:r>
     </w:p>
     <w:p>
@@ -2752,13 +4042,66 @@
     </w:p>
     <w:p>
       <w:r>
-        <w:t>Ik heb dan de elementen een witte achtergrond gegeven en dan een border rond gedaan dat eigenlijk vrij moeilijk en inefficiënt moet worden opgeroepen in android studio door middel van een &lt;shape&gt; xml file te maken in de res/drawable folder en die een stroke</w:t>
-      </w:r>
+        <w:t xml:space="preserve">Ik heb dan de elementen een witte achtergrond gegeven en dan een border rond gedaan dat eigenlijk vrij moeilijk en inefficiënt moet worden opgeroepen in </w:t>
+      </w:r>
+      <w:proofErr w:type="spellStart"/>
+      <w:r>
+        <w:t>android</w:t>
+      </w:r>
+      <w:proofErr w:type="spellEnd"/>
+      <w:r>
+        <w:t xml:space="preserve"> studio door middel van een &lt;</w:t>
+      </w:r>
+      <w:proofErr w:type="spellStart"/>
+      <w:r>
+        <w:t>shape</w:t>
+      </w:r>
+      <w:proofErr w:type="spellEnd"/>
+      <w:r>
+        <w:t xml:space="preserve">&gt; </w:t>
+      </w:r>
+      <w:proofErr w:type="spellStart"/>
+      <w:r>
+        <w:t>xml</w:t>
+      </w:r>
+      <w:proofErr w:type="spellEnd"/>
+      <w:r>
+        <w:t xml:space="preserve"> file te maken in de </w:t>
+      </w:r>
+      <w:proofErr w:type="spellStart"/>
+      <w:r>
+        <w:t>res</w:t>
+      </w:r>
+      <w:proofErr w:type="spellEnd"/>
+      <w:r>
+        <w:t>/</w:t>
+      </w:r>
+      <w:proofErr w:type="spellStart"/>
+      <w:r>
+        <w:t>drawable</w:t>
+      </w:r>
+      <w:proofErr w:type="spellEnd"/>
+      <w:r>
+        <w:t xml:space="preserve"> folder en die een </w:t>
+      </w:r>
+      <w:proofErr w:type="spellStart"/>
+      <w:r>
+        <w:t>stroke</w:t>
+      </w:r>
+      <w:proofErr w:type="spellEnd"/>
       <w:r>
         <w:t>, enzoverder</w:t>
       </w:r>
       <w:r>
-        <w:t xml:space="preserve"> te geven. Dan wordt deze drawable als achtergrond geplaatst van de imageview.</w:t>
+        <w:t xml:space="preserve"> te geven. Dan wordt deze </w:t>
+      </w:r>
+      <w:proofErr w:type="spellStart"/>
+      <w:r>
+        <w:t>drawable</w:t>
+      </w:r>
+      <w:proofErr w:type="spellEnd"/>
+      <w:r>
+        <w:t xml:space="preserve"> als achtergrond geplaatst van de imageview.</w:t>
       </w:r>
       <w:r>
         <w:t xml:space="preserve"> De lege elementen zijn gewoon witte icoontjes die dus niet zichtbaar zijn door de witte achtergrond.</w:t>
@@ -2809,7 +4152,23 @@
     <w:p/>
     <w:p>
       <w:r>
-        <w:t>Om te eindigen, moest ik nog de images van firebase toevoegen hierbij heb ik vooral code van stackoverflow gebruikt om mijn oude klassen en methods te verbeteren.</w:t>
+        <w:t xml:space="preserve">Om te eindigen, moest ik nog de images van </w:t>
+      </w:r>
+      <w:proofErr w:type="spellStart"/>
+      <w:r>
+        <w:t>firebase</w:t>
+      </w:r>
+      <w:proofErr w:type="spellEnd"/>
+      <w:r>
+        <w:t xml:space="preserve"> toevoegen hierbij heb ik vooral code van stackoverflow gebruikt om mijn oude klassen en </w:t>
+      </w:r>
+      <w:proofErr w:type="spellStart"/>
+      <w:r>
+        <w:t>methods</w:t>
+      </w:r>
+      <w:proofErr w:type="spellEnd"/>
+      <w:r>
+        <w:t xml:space="preserve"> te verbeteren.</w:t>
       </w:r>
     </w:p>
     <w:p>
@@ -2906,14 +4265,83 @@
     </w:p>
     <w:p>
       <w:r>
-        <w:t xml:space="preserve">Ik had een image asset toegevoegd dat dus er voor zorgde dat de oude logo files worden vervangen. Hierbij heb een logo afbeelding als foreground en een transparant afbeelding als background. Maar dit wou niet helemaal werken door adaptive icon en legacy optie. De app als het om mijn emulator </w:t>
+        <w:t xml:space="preserve">Ik had een image asset toegevoegd dat dus </w:t>
+      </w:r>
+      <w:proofErr w:type="gramStart"/>
+      <w:r>
+        <w:t>er voor</w:t>
+      </w:r>
+      <w:proofErr w:type="gramEnd"/>
+      <w:r>
+        <w:t xml:space="preserve"> zorgde dat de oude logo files worden vervangen. Hierbij heb een logo afbeelding als </w:t>
+      </w:r>
+      <w:proofErr w:type="spellStart"/>
+      <w:r>
+        <w:t>foreground</w:t>
+      </w:r>
+      <w:proofErr w:type="spellEnd"/>
+      <w:r>
+        <w:t xml:space="preserve"> en een transparant afbeelding als background. Maar dit wou niet helemaal werken door </w:t>
+      </w:r>
+      <w:proofErr w:type="spellStart"/>
+      <w:r>
+        <w:t>adaptive</w:t>
+      </w:r>
+      <w:proofErr w:type="spellEnd"/>
+      <w:r>
+        <w:t xml:space="preserve"> icon en </w:t>
+      </w:r>
+      <w:proofErr w:type="spellStart"/>
+      <w:r>
+        <w:t>legacy</w:t>
+      </w:r>
+      <w:proofErr w:type="spellEnd"/>
+      <w:r>
+        <w:t xml:space="preserve"> optie. De app als het om mijn emulator </w:t>
       </w:r>
       <w:r>
         <w:lastRenderedPageBreak/>
-        <w:t>staat kreeg een zwarte achtergrond omdat transparant niet bestaat bij adaptive icons. Dus wat ik gedaan had was het gewoon op legacy only</w:t>
-      </w:r>
-      <w:r>
-        <w:t xml:space="preserve"> optie zetten waar ik gewoon eigenlijk de background kan weghalen door de shape als cirkel aan te duiden</w:t>
+        <w:t xml:space="preserve">staat kreeg een zwarte achtergrond omdat transparant niet bestaat bij </w:t>
+      </w:r>
+      <w:proofErr w:type="spellStart"/>
+      <w:r>
+        <w:t>adaptive</w:t>
+      </w:r>
+      <w:proofErr w:type="spellEnd"/>
+      <w:r>
+        <w:t xml:space="preserve"> </w:t>
+      </w:r>
+      <w:proofErr w:type="spellStart"/>
+      <w:r>
+        <w:t>icons</w:t>
+      </w:r>
+      <w:proofErr w:type="spellEnd"/>
+      <w:r>
+        <w:t xml:space="preserve">. Dus wat ik gedaan had was het gewoon op </w:t>
+      </w:r>
+      <w:proofErr w:type="spellStart"/>
+      <w:r>
+        <w:t>legacy</w:t>
+      </w:r>
+      <w:proofErr w:type="spellEnd"/>
+      <w:r>
+        <w:t xml:space="preserve"> </w:t>
+      </w:r>
+      <w:proofErr w:type="spellStart"/>
+      <w:r>
+        <w:t>only</w:t>
+      </w:r>
+      <w:proofErr w:type="spellEnd"/>
+      <w:r>
+        <w:t xml:space="preserve"> optie zetten waar ik gewoon eigenlijk de background kan weghalen door de </w:t>
+      </w:r>
+      <w:proofErr w:type="spellStart"/>
+      <w:r>
+        <w:t>shape</w:t>
+      </w:r>
+      <w:proofErr w:type="spellEnd"/>
+      <w:r>
+        <w:t xml:space="preserve"> als cirkel aan te duiden</w:t>
       </w:r>
       <w:r>
         <w:t>.</w:t>
@@ -2979,7 +4407,31 @@
     </w:p>
     <w:p>
       <w:r>
-        <w:t>Vandaag heb ik ervoor gezorgd dat ik image van uw gsm gallery kan uploaden. Hierbij dacht ik eerst dat automatisch de gallery die klaarstaat in de camera app kon gebruiken zoals bij facebook messenger, maar bestaat niet echt blijkbaar. Ik heb hiervoor zelfs een vraag gesteld op stackoverflow.</w:t>
+        <w:t xml:space="preserve">Vandaag heb ik ervoor gezorgd dat ik image van uw gsm </w:t>
+      </w:r>
+      <w:proofErr w:type="spellStart"/>
+      <w:r>
+        <w:t>gallery</w:t>
+      </w:r>
+      <w:proofErr w:type="spellEnd"/>
+      <w:r>
+        <w:t xml:space="preserve"> kan uploaden. Hierbij dacht ik eerst dat automatisch de </w:t>
+      </w:r>
+      <w:proofErr w:type="spellStart"/>
+      <w:r>
+        <w:t>gallery</w:t>
+      </w:r>
+      <w:proofErr w:type="spellEnd"/>
+      <w:r>
+        <w:t xml:space="preserve"> die klaarstaat in de camera app kon gebruiken zoals bij facebook </w:t>
+      </w:r>
+      <w:proofErr w:type="spellStart"/>
+      <w:r>
+        <w:t>messenger</w:t>
+      </w:r>
+      <w:proofErr w:type="spellEnd"/>
+      <w:r>
+        <w:t>, maar bestaat niet echt blijkbaar. Ik heb hiervoor zelfs een vraag gesteld op stackoverflow.</w:t>
       </w:r>
     </w:p>
     <w:p>
@@ -2994,7 +4446,39 @@
     </w:p>
     <w:p>
       <w:r>
-        <w:t xml:space="preserve">Uiteindelijk heb ik gewoon besloten om de camera en gallery op te splitsen en te kunnen openen in popup keuze menu. De code voor de gallery functionaliteiten </w:t>
+        <w:t xml:space="preserve">Uiteindelijk heb ik gewoon besloten om de camera en </w:t>
+      </w:r>
+      <w:proofErr w:type="spellStart"/>
+      <w:r>
+        <w:t>gallery</w:t>
+      </w:r>
+      <w:proofErr w:type="spellEnd"/>
+      <w:r>
+        <w:t xml:space="preserve"> op te splitsen en te kunnen openen in </w:t>
+      </w:r>
+      <w:proofErr w:type="spellStart"/>
+      <w:r>
+        <w:t>popup</w:t>
+      </w:r>
+      <w:proofErr w:type="spellEnd"/>
+      <w:r>
+        <w:t xml:space="preserve"> </w:t>
+      </w:r>
+      <w:proofErr w:type="gramStart"/>
+      <w:r>
+        <w:t>keuze menu</w:t>
+      </w:r>
+      <w:proofErr w:type="gramEnd"/>
+      <w:r>
+        <w:t xml:space="preserve">. De code voor de </w:t>
+      </w:r>
+      <w:proofErr w:type="spellStart"/>
+      <w:r>
+        <w:t>gallery</w:t>
+      </w:r>
+      <w:proofErr w:type="spellEnd"/>
+      <w:r>
+        <w:t xml:space="preserve"> functionaliteiten </w:t>
       </w:r>
       <w:r>
         <w:t>is</w:t>
@@ -3063,7 +4547,15 @@
         <w:pStyle w:val="Kop3"/>
       </w:pPr>
       <w:r>
-        <w:t>Wat ik wil realiseen deze week:</w:t>
+        <w:t xml:space="preserve">Wat ik wil </w:t>
+      </w:r>
+      <w:proofErr w:type="spellStart"/>
+      <w:r>
+        <w:t>realiseen</w:t>
+      </w:r>
+      <w:proofErr w:type="spellEnd"/>
+      <w:r>
+        <w:t xml:space="preserve"> deze week:</w:t>
       </w:r>
     </w:p>
     <w:p>
@@ -3087,7 +4579,23 @@
         </w:numPr>
       </w:pPr>
       <w:r>
-        <w:t>Vragen dat het ok is om je image te compressen (quality verlies?)</w:t>
+        <w:t xml:space="preserve">Vragen dat het ok is om je image te </w:t>
+      </w:r>
+      <w:proofErr w:type="spellStart"/>
+      <w:r>
+        <w:t>compressen</w:t>
+      </w:r>
+      <w:proofErr w:type="spellEnd"/>
+      <w:r>
+        <w:t xml:space="preserve"> (</w:t>
+      </w:r>
+      <w:proofErr w:type="spellStart"/>
+      <w:r>
+        <w:t>quality</w:t>
+      </w:r>
+      <w:proofErr w:type="spellEnd"/>
+      <w:r>
+        <w:t xml:space="preserve"> verlies?)</w:t>
       </w:r>
     </w:p>
     <w:p>
@@ -3099,8 +4607,21 @@
         </w:numPr>
       </w:pPr>
       <w:r>
-        <w:t>Image van de gridview kunnen openen in full size</w:t>
-      </w:r>
+        <w:t xml:space="preserve">Image van de </w:t>
+      </w:r>
+      <w:proofErr w:type="spellStart"/>
+      <w:r>
+        <w:t>gridview</w:t>
+      </w:r>
+      <w:proofErr w:type="spellEnd"/>
+      <w:r>
+        <w:t xml:space="preserve"> kunnen openen in full </w:t>
+      </w:r>
+      <w:proofErr w:type="spellStart"/>
+      <w:r>
+        <w:t>size</w:t>
+      </w:r>
+      <w:proofErr w:type="spellEnd"/>
     </w:p>
     <w:p>
       <w:pPr>
@@ -3111,7 +4632,15 @@
         </w:numPr>
       </w:pPr>
       <w:r>
-        <w:t>App op google playstore plaatsen!!</w:t>
+        <w:t xml:space="preserve">App op google </w:t>
+      </w:r>
+      <w:proofErr w:type="spellStart"/>
+      <w:r>
+        <w:t>playstore</w:t>
+      </w:r>
+      <w:proofErr w:type="spellEnd"/>
+      <w:r>
+        <w:t xml:space="preserve"> plaatsen!!</w:t>
       </w:r>
     </w:p>
     <w:p>
@@ -3122,8 +4651,13 @@
           <w:numId w:val="2"/>
         </w:numPr>
       </w:pPr>
-      <w:r>
-        <w:t>Offfline functionaliteiten toevoegen?</w:t>
+      <w:proofErr w:type="spellStart"/>
+      <w:r>
+        <w:t>Offfline</w:t>
+      </w:r>
+      <w:proofErr w:type="spellEnd"/>
+      <w:r>
+        <w:t xml:space="preserve"> functionaliteiten toevoegen?</w:t>
       </w:r>
     </w:p>
     <w:p/>
@@ -3144,16 +4678,82 @@
     </w:p>
     <w:p>
       <w:r>
-        <w:t xml:space="preserve">Vandaag wou ik beginnen met het uploaden van mijn app op google play maar toen ik tutorial volgde moest ik eerst mijn app package name veranderen want com.example is niet correct. Toen ik dat veranderen </w:t>
-      </w:r>
-      <w:r>
-        <w:t>werkte de google services niet meer want de package name was com.example in de google-services.json file. Dus ik moest mijn app in firebase opnieuw maken dat niet echt moeilijk was.</w:t>
-      </w:r>
-      <w:r>
-        <w:t xml:space="preserve"> Daarna heb ik een android app bundle aangemaakt want dit is nodig voor de release.</w:t>
-      </w:r>
-      <w:r>
-        <w:t xml:space="preserve"> Ze vroeg dan om developer account aan te maken waarbij ik 1 keer 25 euro moest betalen. Daarbij was ik effe gestopt want mijn ouders waren niet thuis voor een mastercard te gebruiken.</w:t>
+        <w:t xml:space="preserve">Vandaag wou ik beginnen met het uploaden van mijn app op google </w:t>
+      </w:r>
+      <w:proofErr w:type="spellStart"/>
+      <w:r>
+        <w:t>play</w:t>
+      </w:r>
+      <w:proofErr w:type="spellEnd"/>
+      <w:r>
+        <w:t xml:space="preserve"> maar toen ik tutorial volgde moest ik eerst mijn app package name veranderen want </w:t>
+      </w:r>
+      <w:proofErr w:type="spellStart"/>
+      <w:r>
+        <w:t>com.example</w:t>
+      </w:r>
+      <w:proofErr w:type="spellEnd"/>
+      <w:r>
+        <w:t xml:space="preserve"> is niet correct. Toen ik dat veranderen </w:t>
+      </w:r>
+      <w:r>
+        <w:t xml:space="preserve">werkte de google services niet meer want de package name was </w:t>
+      </w:r>
+      <w:proofErr w:type="spellStart"/>
+      <w:r>
+        <w:t>com.example</w:t>
+      </w:r>
+      <w:proofErr w:type="spellEnd"/>
+      <w:r>
+        <w:t xml:space="preserve"> in de google-</w:t>
+      </w:r>
+      <w:proofErr w:type="spellStart"/>
+      <w:proofErr w:type="gramStart"/>
+      <w:r>
+        <w:t>services.json</w:t>
+      </w:r>
+      <w:proofErr w:type="spellEnd"/>
+      <w:proofErr w:type="gramEnd"/>
+      <w:r>
+        <w:t xml:space="preserve"> file. Dus ik moest mijn app in </w:t>
+      </w:r>
+      <w:proofErr w:type="spellStart"/>
+      <w:r>
+        <w:t>firebase</w:t>
+      </w:r>
+      <w:proofErr w:type="spellEnd"/>
+      <w:r>
+        <w:t xml:space="preserve"> opnieuw maken dat niet echt moeilijk was.</w:t>
+      </w:r>
+      <w:r>
+        <w:t xml:space="preserve"> Daarna heb ik een </w:t>
+      </w:r>
+      <w:proofErr w:type="spellStart"/>
+      <w:r>
+        <w:t>android</w:t>
+      </w:r>
+      <w:proofErr w:type="spellEnd"/>
+      <w:r>
+        <w:t xml:space="preserve"> app </w:t>
+      </w:r>
+      <w:proofErr w:type="spellStart"/>
+      <w:r>
+        <w:t>bundle</w:t>
+      </w:r>
+      <w:proofErr w:type="spellEnd"/>
+      <w:r>
+        <w:t xml:space="preserve"> aangemaakt want dit is nodig voor de release.</w:t>
+      </w:r>
+      <w:r>
+        <w:t xml:space="preserve"> Ze vroeg dan om </w:t>
+      </w:r>
+      <w:proofErr w:type="spellStart"/>
+      <w:r>
+        <w:t>developer</w:t>
+      </w:r>
+      <w:proofErr w:type="spellEnd"/>
+      <w:r>
+        <w:t xml:space="preserve"> account aan te maken waarbij ik 1 keer 25 euro moest betalen. Daarbij was ik effe gestopt want mijn ouders waren niet thuis voor een mastercard te gebruiken.</w:t>
       </w:r>
     </w:p>
     <w:p>
@@ -3230,7 +4830,15 @@
     </w:p>
     <w:p>
       <w:r>
-        <w:t>In de avond heb ik dan mijn developer account aangemaakt.</w:t>
+        <w:t xml:space="preserve">In de avond heb ik dan mijn </w:t>
+      </w:r>
+      <w:proofErr w:type="spellStart"/>
+      <w:r>
+        <w:t>developer</w:t>
+      </w:r>
+      <w:proofErr w:type="spellEnd"/>
+      <w:r>
+        <w:t xml:space="preserve"> account aangemaakt.</w:t>
       </w:r>
     </w:p>
     <w:p/>
@@ -3254,7 +4862,23 @@
         <w:t>Vandaag ben ik effe kort begonnen met het beter beveiligen van het wachtwoord om te registeren en in te loggen</w:t>
       </w:r>
       <w:r>
-        <w:t xml:space="preserve">. Hierbij vraag ik dus dat het wachtwoord een kleine letter, grote letter, geen spaties, 1 nummer en een lengte van 8 tekens heeft. Dit wordt weergegeven als een error onder de wachtwoord textbox. Het email wordt dankzij firebase al gevalideerd dat het correct is, dus ik moet zelf geen error toevoegen. </w:t>
+        <w:t xml:space="preserve">. Hierbij vraag ik dus dat het wachtwoord een kleine letter, grote letter, geen spaties, 1 nummer en een lengte van 8 tekens heeft. Dit wordt weergegeven als een error onder de wachtwoord </w:t>
+      </w:r>
+      <w:proofErr w:type="spellStart"/>
+      <w:r>
+        <w:t>textbox</w:t>
+      </w:r>
+      <w:proofErr w:type="spellEnd"/>
+      <w:r>
+        <w:t xml:space="preserve">. Het email wordt dankzij </w:t>
+      </w:r>
+      <w:proofErr w:type="spellStart"/>
+      <w:r>
+        <w:t>firebase</w:t>
+      </w:r>
+      <w:proofErr w:type="spellEnd"/>
+      <w:r>
+        <w:t xml:space="preserve"> al gevalideerd dat het correct is, dus ik moet zelf geen error toevoegen. </w:t>
       </w:r>
       <w:r>
         <w:t>Maar er wordt wel een toast bericht voor de zekerheid weergegeven vanonder als de registratie mislukt</w:t>
@@ -3265,7 +4889,47 @@
     </w:p>
     <w:p>
       <w:r>
-        <w:t>Daarna heb ik de app bundle geupdated naar de volgende versie, omdat er aanpassingen waren. Deze release heb ik dan op google play console geüpload, hierbij moest ik nog in de dashboard veel taken afleggen. De belangrijksten waren bijvoorbeeld een test account meegeven zodat google dit kan gebruiken om mijn app te controleren, een privacybeleid toevoegen hi</w:t>
+        <w:t xml:space="preserve">Daarna heb ik de app </w:t>
+      </w:r>
+      <w:proofErr w:type="spellStart"/>
+      <w:r>
+        <w:t>bundle</w:t>
+      </w:r>
+      <w:proofErr w:type="spellEnd"/>
+      <w:r>
+        <w:t xml:space="preserve"> </w:t>
+      </w:r>
+      <w:proofErr w:type="spellStart"/>
+      <w:r>
+        <w:t>geupdated</w:t>
+      </w:r>
+      <w:proofErr w:type="spellEnd"/>
+      <w:r>
+        <w:t xml:space="preserve"> naar de volgende versie, omdat er aanpassingen waren. Deze release heb ik dan op google </w:t>
+      </w:r>
+      <w:proofErr w:type="spellStart"/>
+      <w:r>
+        <w:t>play</w:t>
+      </w:r>
+      <w:proofErr w:type="spellEnd"/>
+      <w:r>
+        <w:t xml:space="preserve"> console geüpload, hierbij moest ik nog in </w:t>
+      </w:r>
+      <w:proofErr w:type="gramStart"/>
+      <w:r>
+        <w:t>de dashboard</w:t>
+      </w:r>
+      <w:proofErr w:type="gramEnd"/>
+      <w:r>
+        <w:t xml:space="preserve"> veel taken afleggen. De belangrijksten waren bijvoorbeeld een test account meegeven zodat google dit kan gebruiken om mijn app te controleren, een </w:t>
+      </w:r>
+      <w:proofErr w:type="spellStart"/>
+      <w:r>
+        <w:t>privacybeleid</w:t>
+      </w:r>
+      <w:proofErr w:type="spellEnd"/>
+      <w:r>
+        <w:t xml:space="preserve"> toevoegen hi</w:t>
       </w:r>
       <w:r>
         <w:t>er</w:t>
@@ -3286,6 +4950,27 @@
       </w:hyperlink>
       <w:r>
         <w:t>) en de doelgroep.</w:t>
+      </w:r>
+    </w:p>
+    <w:p/>
+    <w:p>
+      <w:pPr>
+        <w:rPr>
+          <w:b/>
+          <w:bCs/>
+        </w:rPr>
+      </w:pPr>
+      <w:r>
+        <w:rPr>
+          <w:b/>
+          <w:bCs/>
+        </w:rPr>
+        <w:t>27/11/2021:</w:t>
+      </w:r>
+    </w:p>
+    <w:p>
+      <w:r>
+        <w:t xml:space="preserve">Vandaag wou ik </w:t>
       </w:r>
     </w:p>
     <w:p/>

</xml_diff>

<commit_message>
Starting with adding firebase realtime database for chat functionalities.
</commit_message>
<xml_diff>
--- a/Logboek_Dries_Fierens.docx
+++ b/Logboek_Dries_Fierens.docx
@@ -46,7 +46,47 @@
         <w:t>applicatie</w:t>
       </w:r>
       <w:r>
-        <w:t xml:space="preserve"> die je kan maken en welke technologieën je kan gebruiken. Ik heb voor native gekozen want dat past het best bij mijn aftakking “Software developer” sinds het java inhoudt. De anderen zijn hybrid en progressive web app dat dus meer te maken hebben met web &amp; mobile dus vooral HTML &amp; CSS. We moesten dan ook nog kiezen voor een project idee, waarbij ik koos voor een scanner + pdf converter app</w:t>
+        <w:t xml:space="preserve"> die je kan maken en welke technologieën je kan gebruiken. Ik heb voor native gekozen want dat past het best bij mijn aftakking “Software </w:t>
+      </w:r>
+      <w:proofErr w:type="spellStart"/>
+      <w:r>
+        <w:t>developer</w:t>
+      </w:r>
+      <w:proofErr w:type="spellEnd"/>
+      <w:r>
+        <w:t xml:space="preserve">” sinds het </w:t>
+      </w:r>
+      <w:proofErr w:type="spellStart"/>
+      <w:r>
+        <w:t>java</w:t>
+      </w:r>
+      <w:proofErr w:type="spellEnd"/>
+      <w:r>
+        <w:t xml:space="preserve"> inhoudt. De anderen zijn </w:t>
+      </w:r>
+      <w:proofErr w:type="spellStart"/>
+      <w:r>
+        <w:t>hybrid</w:t>
+      </w:r>
+      <w:proofErr w:type="spellEnd"/>
+      <w:r>
+        <w:t xml:space="preserve"> en </w:t>
+      </w:r>
+      <w:proofErr w:type="spellStart"/>
+      <w:r>
+        <w:t>progressive</w:t>
+      </w:r>
+      <w:proofErr w:type="spellEnd"/>
+      <w:r>
+        <w:t xml:space="preserve"> web app dat dus meer te maken hebben met web &amp; mobile dus vooral HTML &amp; CSS. We moesten dan ook nog kiezen voor een project idee, waarbij ik koos voor een scanner + </w:t>
+      </w:r>
+      <w:proofErr w:type="gramStart"/>
+      <w:r>
+        <w:t>pdf converter</w:t>
+      </w:r>
+      <w:proofErr w:type="gramEnd"/>
+      <w:r>
+        <w:t xml:space="preserve"> app</w:t>
       </w:r>
       <w:r>
         <w:t xml:space="preserve"> waarbij het vooral bedoelt is o</w:t>
@@ -67,26 +107,106 @@
         <w:t>.</w:t>
       </w:r>
       <w:r>
-        <w:t xml:space="preserve"> Het was verplicht om 1 hardware component van de gsm te gebruiken dus koos ik natuurlijk voor de camera.</w:t>
+        <w:t xml:space="preserve"> Het was verplicht om 1 </w:t>
+      </w:r>
+      <w:proofErr w:type="gramStart"/>
+      <w:r>
+        <w:t>hardware component</w:t>
+      </w:r>
+      <w:proofErr w:type="gramEnd"/>
+      <w:r>
+        <w:t xml:space="preserve"> van de gsm te gebruiken dus koos ik natuurlijk voor de camera.</w:t>
       </w:r>
       <w:r>
         <w:t xml:space="preserve"> </w:t>
       </w:r>
       <w:r>
-        <w:t>Als back-end koos ik Firebase en als technologie koos ik in java te werken om een android app te maken in plaats van een IOS app.</w:t>
-      </w:r>
-      <w:r>
-        <w:t xml:space="preserve"> Want ik heb een huawei.</w:t>
-      </w:r>
-    </w:p>
-    <w:p>
-      <w:r>
-        <w:t>Ik heb dit allemaal grondiger beschreven in mijn “app idee”.pdf. Dit staat ondertussen op de repository die we moesten maken.</w:t>
-      </w:r>
-    </w:p>
-    <w:p>
-      <w:r>
-        <w:t>Om af te sluiten had ik al ondertussen een goede naam gevonden gebaseerd op de applicatie genaamd Scannable. Ik heb dus besloten om mijn applicatie Notable te noemen.</w:t>
+        <w:t xml:space="preserve">Als </w:t>
+      </w:r>
+      <w:proofErr w:type="spellStart"/>
+      <w:r>
+        <w:t>back-end</w:t>
+      </w:r>
+      <w:proofErr w:type="spellEnd"/>
+      <w:r>
+        <w:t xml:space="preserve"> koos ik </w:t>
+      </w:r>
+      <w:proofErr w:type="spellStart"/>
+      <w:r>
+        <w:t>Firebase</w:t>
+      </w:r>
+      <w:proofErr w:type="spellEnd"/>
+      <w:r>
+        <w:t xml:space="preserve"> en als technologie koos ik in </w:t>
+      </w:r>
+      <w:proofErr w:type="spellStart"/>
+      <w:r>
+        <w:t>java</w:t>
+      </w:r>
+      <w:proofErr w:type="spellEnd"/>
+      <w:r>
+        <w:t xml:space="preserve"> te werken om een </w:t>
+      </w:r>
+      <w:proofErr w:type="spellStart"/>
+      <w:r>
+        <w:t>android</w:t>
+      </w:r>
+      <w:proofErr w:type="spellEnd"/>
+      <w:r>
+        <w:t xml:space="preserve"> app te maken in plaats van een IOS app.</w:t>
+      </w:r>
+      <w:r>
+        <w:t xml:space="preserve"> Want ik heb een </w:t>
+      </w:r>
+      <w:proofErr w:type="spellStart"/>
+      <w:r>
+        <w:t>huawei</w:t>
+      </w:r>
+      <w:proofErr w:type="spellEnd"/>
+      <w:r>
+        <w:t>.</w:t>
+      </w:r>
+    </w:p>
+    <w:p>
+      <w:r>
+        <w:t xml:space="preserve">Ik heb dit allemaal grondiger beschreven in mijn “app </w:t>
+      </w:r>
+      <w:proofErr w:type="spellStart"/>
+      <w:r>
+        <w:t>idee”.pdf</w:t>
+      </w:r>
+      <w:proofErr w:type="spellEnd"/>
+      <w:r>
+        <w:t xml:space="preserve">. Dit staat ondertussen op de </w:t>
+      </w:r>
+      <w:proofErr w:type="spellStart"/>
+      <w:r>
+        <w:t>repository</w:t>
+      </w:r>
+      <w:proofErr w:type="spellEnd"/>
+      <w:r>
+        <w:t xml:space="preserve"> die we moesten maken.</w:t>
+      </w:r>
+    </w:p>
+    <w:p>
+      <w:r>
+        <w:t xml:space="preserve">Om af te sluiten had ik al ondertussen een goede naam gevonden gebaseerd op de applicatie genaamd </w:t>
+      </w:r>
+      <w:proofErr w:type="spellStart"/>
+      <w:r>
+        <w:t>Scannable</w:t>
+      </w:r>
+      <w:proofErr w:type="spellEnd"/>
+      <w:r>
+        <w:t xml:space="preserve">. Ik heb dus besloten om mijn applicatie </w:t>
+      </w:r>
+      <w:proofErr w:type="spellStart"/>
+      <w:r>
+        <w:t>Notable</w:t>
+      </w:r>
+      <w:proofErr w:type="spellEnd"/>
+      <w:r>
+        <w:t xml:space="preserve"> te noemen.</w:t>
       </w:r>
     </w:p>
     <w:p>
@@ -109,7 +229,15 @@
         <w:t xml:space="preserve">Mijn app idee werd niet goedgekeurd, want de leerkracht raadde het af door problemen die ervan kunnen komen. Ik moest dan vandaag een nieuw idee opstellen. </w:t>
       </w:r>
       <w:r>
-        <w:t>De scanner + pdf converter was duidelijk te moeilijk, maar ik besloot om het idee verder te zetten van een app die notities kan delen. Dus nu moet het gewoon foto’s trekken van de notities. Om nog toe te voegen kan ik ook opmerkingswolkjes toevoegen aan de foto voor bijvoorbeeld een fout</w:t>
+        <w:t xml:space="preserve">De scanner + </w:t>
+      </w:r>
+      <w:proofErr w:type="gramStart"/>
+      <w:r>
+        <w:t>pdf converter</w:t>
+      </w:r>
+      <w:proofErr w:type="gramEnd"/>
+      <w:r>
+        <w:t xml:space="preserve"> was duidelijk te moeilijk, maar ik besloot om het idee verder te zetten van een app die notities kan delen. Dus nu moet het gewoon foto’s trekken van de notities. Om nog toe te voegen kan ik ook opmerkingswolkjes toevoegen aan de foto voor bijvoorbeeld een fout</w:t>
       </w:r>
       <w:r>
         <w:t xml:space="preserve"> aan te duiden</w:t>
@@ -120,7 +248,15 @@
     </w:p>
     <w:p>
       <w:r>
-        <w:t xml:space="preserve">Daarna moest ik gewoon begin aan een UI/UX design voor mijn applicatie, waarbij nog niet veel had gedaan omdat les niet meer lang duurde. Ik moest toen ook tegelijkertijd zoeken naar tutorials dus </w:t>
+        <w:t xml:space="preserve">Daarna moest ik gewoon begin aan een UI/UX design voor mijn applicatie, waarbij nog niet veel had gedaan omdat les niet meer lang duurde. Ik moest toen ook tegelijkertijd zoeken naar </w:t>
+      </w:r>
+      <w:proofErr w:type="spellStart"/>
+      <w:r>
+        <w:t>tutorials</w:t>
+      </w:r>
+      <w:proofErr w:type="spellEnd"/>
+      <w:r>
+        <w:t xml:space="preserve"> dus </w:t>
       </w:r>
       <w:r>
         <w:t>duurde dat ook kort.</w:t>
@@ -143,13 +279,26 @@
     </w:p>
     <w:p>
       <w:r>
-        <w:t xml:space="preserve">Vandaag in de namiddag begonnen we met de co-working les waarbij we dus informatie kunnen delen met medeleerlingen. Al was het de eerste les dus kwam daar niet veel van. Ik begon gewoon verder aan mijn </w:t>
-      </w:r>
+        <w:t>Vandaag in de namiddag begonnen we met de co-</w:t>
+      </w:r>
+      <w:proofErr w:type="spellStart"/>
+      <w:r>
+        <w:t>working</w:t>
+      </w:r>
+      <w:proofErr w:type="spellEnd"/>
+      <w:r>
+        <w:t xml:space="preserve"> les waarbij we dus informatie kunnen delen met medeleerlingen. Al was het de eerste les dus kwam daar niet veel van. Ik begon gewoon verder aan mijn </w:t>
+      </w:r>
+      <w:proofErr w:type="spellStart"/>
       <w:r>
         <w:t>F</w:t>
       </w:r>
       <w:r>
-        <w:t>igma design.</w:t>
+        <w:t>igma</w:t>
+      </w:r>
+      <w:proofErr w:type="spellEnd"/>
+      <w:r>
+        <w:t xml:space="preserve"> design.</w:t>
       </w:r>
     </w:p>
     <w:p>
@@ -160,7 +309,15 @@
         <w:t>te veel</w:t>
       </w:r>
       <w:r>
-        <w:t xml:space="preserve"> naar voor moest leunen en dus nek pijn kreeg en er waren precies geen ramen om te openen. </w:t>
+        <w:t xml:space="preserve"> naar voor moest leunen en dus </w:t>
+      </w:r>
+      <w:proofErr w:type="gramStart"/>
+      <w:r>
+        <w:t>nek pijn</w:t>
+      </w:r>
+      <w:proofErr w:type="gramEnd"/>
+      <w:r>
+        <w:t xml:space="preserve"> kreeg en er waren precies geen ramen om te openen. </w:t>
       </w:r>
       <w:r>
         <w:t>Gelukkig kunnen we naar buiten wanneer we het willen.</w:t>
@@ -200,7 +357,23 @@
     </w:p>
     <w:p>
       <w:r>
-        <w:t>Vandaag heb ik verder gewerkt aan mijn Figma design en het ging redelijk vlot vooruit. Ik wou absoluut dat het vandaag af was zodat ik morgen kan werken aan een ander vak. Tijdens het maken van het design heb ik vooral ook zitten op zoeken dat sommige concepten wel haalbaar zijn om te programmeren. Dit is allemaal wel mogelijk, maar zal wel een challenge zijn zoals de opmerkingen plaatsen</w:t>
+        <w:t xml:space="preserve">Vandaag heb ik verder gewerkt aan mijn </w:t>
+      </w:r>
+      <w:proofErr w:type="spellStart"/>
+      <w:r>
+        <w:t>Figma</w:t>
+      </w:r>
+      <w:proofErr w:type="spellEnd"/>
+      <w:r>
+        <w:t xml:space="preserve"> design en het ging redelijk vlot vooruit. Ik wou absoluut dat het vandaag af was zodat ik morgen kan werken aan een ander vak. Tijdens het maken van het design heb ik vooral ook zitten op zoeken dat sommige concepten wel haalbaar zijn om te programmeren. Dit is allemaal wel mogelijk, maar zal wel een </w:t>
+      </w:r>
+      <w:proofErr w:type="spellStart"/>
+      <w:r>
+        <w:t>challenge</w:t>
+      </w:r>
+      <w:proofErr w:type="spellEnd"/>
+      <w:r>
+        <w:t xml:space="preserve"> zijn zoals de opmerkingen plaatsen</w:t>
       </w:r>
       <w:r>
         <w:t>. M</w:t>
@@ -312,11 +485,48 @@
     </w:p>
     <w:p>
       <w:r>
-        <w:t xml:space="preserve">Vandaag werd mijn figma prototype gecontroleerd waarbij ik moest opnieuw uitleggen wat mijn app doet door middel van accurate presentatie. Ik legde dit vrij duidelijk uit en alles ging goed vooruit. Meneer Blancquaert heeft me dan ook nog een library genaamd “Material design” aangeraden om mijn applicatie te ontwerpen. </w:t>
-      </w:r>
-      <w:r>
-        <w:t>Blijkbaar Google gebruikt deze library</w:t>
-      </w:r>
+        <w:t xml:space="preserve">Vandaag werd mijn </w:t>
+      </w:r>
+      <w:proofErr w:type="spellStart"/>
+      <w:r>
+        <w:t>figma</w:t>
+      </w:r>
+      <w:proofErr w:type="spellEnd"/>
+      <w:r>
+        <w:t xml:space="preserve"> prototype gecontroleerd waarbij ik moest opnieuw uitleggen wat mijn app doet door middel van accurate presentatie. Ik legde dit vrij duidelijk uit en alles ging goed vooruit. Meneer </w:t>
+      </w:r>
+      <w:proofErr w:type="spellStart"/>
+      <w:r>
+        <w:t>Blancquaert</w:t>
+      </w:r>
+      <w:proofErr w:type="spellEnd"/>
+      <w:r>
+        <w:t xml:space="preserve"> heeft me dan ook nog een </w:t>
+      </w:r>
+      <w:proofErr w:type="spellStart"/>
+      <w:r>
+        <w:t>library</w:t>
+      </w:r>
+      <w:proofErr w:type="spellEnd"/>
+      <w:r>
+        <w:t xml:space="preserve"> genaamd “</w:t>
+      </w:r>
+      <w:proofErr w:type="spellStart"/>
+      <w:r>
+        <w:t>Material</w:t>
+      </w:r>
+      <w:proofErr w:type="spellEnd"/>
+      <w:r>
+        <w:t xml:space="preserve"> design” aangeraden om mijn applicatie te ontwerpen. </w:t>
+      </w:r>
+      <w:r>
+        <w:t xml:space="preserve">Blijkbaar Google gebruikt deze </w:t>
+      </w:r>
+      <w:proofErr w:type="spellStart"/>
+      <w:r>
+        <w:t>library</w:t>
+      </w:r>
+      <w:proofErr w:type="spellEnd"/>
       <w:r>
         <w:t xml:space="preserve"> om hun apps te maken.</w:t>
       </w:r>
@@ -354,7 +564,23 @@
         <w:t xml:space="preserve">kunt maken </w:t>
       </w:r>
       <w:r>
-        <w:t>om je app te testen. Als je developer modus in de settings van je gsm</w:t>
+        <w:t xml:space="preserve">om je app te testen. Als je </w:t>
+      </w:r>
+      <w:proofErr w:type="spellStart"/>
+      <w:r>
+        <w:t>developer</w:t>
+      </w:r>
+      <w:proofErr w:type="spellEnd"/>
+      <w:r>
+        <w:t xml:space="preserve"> modus in de </w:t>
+      </w:r>
+      <w:proofErr w:type="spellStart"/>
+      <w:r>
+        <w:t>settings</w:t>
+      </w:r>
+      <w:proofErr w:type="spellEnd"/>
+      <w:r>
+        <w:t xml:space="preserve"> van je gsm</w:t>
       </w:r>
       <w:r>
         <w:t xml:space="preserve"> aanzet, kan je je gsm verbinden met de pc en dus je applicatie daarop testen.</w:t>
@@ -372,7 +598,23 @@
     </w:p>
     <w:p>
       <w:r>
-        <w:t>Tijdens lange downloads heb ik ook mijn google account toegevoegd op Firebase. Volgens de presentatie die we kregen van een medestudent.</w:t>
+        <w:t xml:space="preserve">Tijdens lange downloads heb ik ook mijn </w:t>
+      </w:r>
+      <w:proofErr w:type="gramStart"/>
+      <w:r>
+        <w:t>google account</w:t>
+      </w:r>
+      <w:proofErr w:type="gramEnd"/>
+      <w:r>
+        <w:t xml:space="preserve"> toegevoegd op </w:t>
+      </w:r>
+      <w:proofErr w:type="spellStart"/>
+      <w:r>
+        <w:t>Firebase</w:t>
+      </w:r>
+      <w:proofErr w:type="spellEnd"/>
+      <w:r>
+        <w:t>. Volgens de presentatie die we kregen van een medestudent.</w:t>
       </w:r>
     </w:p>
     <w:p>
@@ -423,7 +665,23 @@
         <w:t>mijn</w:t>
       </w:r>
       <w:r>
-        <w:t xml:space="preserve"> figma design delen met meneer Blancquaert, toen hij vroeg dat mijn design klaar was</w:t>
+        <w:t xml:space="preserve"> </w:t>
+      </w:r>
+      <w:proofErr w:type="spellStart"/>
+      <w:r>
+        <w:t>figma</w:t>
+      </w:r>
+      <w:proofErr w:type="spellEnd"/>
+      <w:r>
+        <w:t xml:space="preserve"> design delen met meneer </w:t>
+      </w:r>
+      <w:proofErr w:type="spellStart"/>
+      <w:r>
+        <w:t>Blancquaert</w:t>
+      </w:r>
+      <w:proofErr w:type="spellEnd"/>
+      <w:r>
+        <w:t>, toen hij vroeg dat mijn design klaar was</w:t>
       </w:r>
       <w:r>
         <w:t xml:space="preserve"> of niet</w:t>
@@ -437,14 +695,54 @@
         <w:t>Ik heb daarna gewoon verder begonnen aan de tutorial die ik vorige week gebruikt had.</w:t>
       </w:r>
       <w:r>
-        <w:t xml:space="preserve"> Hierbij leerde ik meer over hoe ik Android studio beter kon gebruiken om mijn app te designen zoals hoe je </w:t>
+        <w:t xml:space="preserve"> Hierbij leerde ik meer over hoe ik </w:t>
+      </w:r>
+      <w:proofErr w:type="gramStart"/>
+      <w:r>
+        <w:t>Android studio</w:t>
+      </w:r>
+      <w:proofErr w:type="gramEnd"/>
+      <w:r>
+        <w:t xml:space="preserve"> beter kon gebruiken om mijn app te </w:t>
+      </w:r>
+      <w:proofErr w:type="spellStart"/>
+      <w:r>
+        <w:t>designen</w:t>
+      </w:r>
+      <w:proofErr w:type="spellEnd"/>
+      <w:r>
+        <w:t xml:space="preserve"> zoals hoe je </w:t>
       </w:r>
       <w:r>
         <w:lastRenderedPageBreak/>
-        <w:t>attributen kunt aanpassen (bv. color)</w:t>
-      </w:r>
-      <w:r>
-        <w:t xml:space="preserve">. Android studio is zeer gelijkaardig als bijvoorbeeld Webstorm, maar bij het design van een mobile app is het zeer </w:t>
+        <w:t xml:space="preserve">attributen kunt aanpassen (bv. </w:t>
+      </w:r>
+      <w:proofErr w:type="spellStart"/>
+      <w:r>
+        <w:t>color</w:t>
+      </w:r>
+      <w:proofErr w:type="spellEnd"/>
+      <w:r>
+        <w:t>)</w:t>
+      </w:r>
+      <w:r>
+        <w:t xml:space="preserve">. </w:t>
+      </w:r>
+      <w:proofErr w:type="gramStart"/>
+      <w:r>
+        <w:t>Android studio</w:t>
+      </w:r>
+      <w:proofErr w:type="gramEnd"/>
+      <w:r>
+        <w:t xml:space="preserve"> is zeer gelijkaardig als bijvoorbeeld </w:t>
+      </w:r>
+      <w:proofErr w:type="spellStart"/>
+      <w:r>
+        <w:t>Webstorm</w:t>
+      </w:r>
+      <w:proofErr w:type="spellEnd"/>
+      <w:r>
+        <w:t xml:space="preserve">, maar bij het design van een mobile app is het zeer </w:t>
       </w:r>
       <w:r>
         <w:t>verschillend</w:t>
@@ -453,14 +751,27 @@
         <w:t>.</w:t>
       </w:r>
       <w:r>
-        <w:t xml:space="preserve"> Bij Webstorm kan je je website </w:t>
+        <w:t xml:space="preserve"> Bij </w:t>
+      </w:r>
+      <w:proofErr w:type="spellStart"/>
+      <w:r>
+        <w:t>Webstorm</w:t>
+      </w:r>
+      <w:proofErr w:type="spellEnd"/>
+      <w:r>
+        <w:t xml:space="preserve"> kan je je website </w:t>
       </w:r>
       <w:r>
         <w:t>bekijken</w:t>
       </w:r>
       <w:r>
-        <w:t xml:space="preserve"> in een gekozen browser, maar je kan in Android studio</w:t>
-      </w:r>
+        <w:t xml:space="preserve"> in een gekozen browser, maar je kan in </w:t>
+      </w:r>
+      <w:proofErr w:type="gramStart"/>
+      <w:r>
+        <w:t>Android studio</w:t>
+      </w:r>
+      <w:proofErr w:type="gramEnd"/>
       <w:r>
         <w:t xml:space="preserve"> je app</w:t>
       </w:r>
@@ -480,7 +791,15 @@
         <w:t>.</w:t>
       </w:r>
       <w:r>
-        <w:t xml:space="preserve"> Als ik de Jetbrains applicaties vergelijk met Visual studio 2019, </w:t>
+        <w:t xml:space="preserve"> Als ik de </w:t>
+      </w:r>
+      <w:proofErr w:type="spellStart"/>
+      <w:r>
+        <w:t>Jetbrains</w:t>
+      </w:r>
+      <w:proofErr w:type="spellEnd"/>
+      <w:r>
+        <w:t xml:space="preserve"> applicaties vergelijk met Visual studio 2019, </w:t>
       </w:r>
       <w:r>
         <w:t>heb ik er altijd moeite mee om de lay</w:t>
@@ -560,7 +879,23 @@
     </w:p>
     <w:p>
       <w:r>
-        <w:t>Ik heb dan ondertussen de tutorial van Material design gevolgd in plaats van die van Android studio. Ze leerde me dan hoe ik er mee kon werken maar niet hoe een hele nieuwe app kon maken. Ik kreeg een voorbeeld app om erin te kunnen werken voor de tutorial.</w:t>
+        <w:t xml:space="preserve">Ik heb dan ondertussen de tutorial van </w:t>
+      </w:r>
+      <w:proofErr w:type="spellStart"/>
+      <w:r>
+        <w:t>Material</w:t>
+      </w:r>
+      <w:proofErr w:type="spellEnd"/>
+      <w:r>
+        <w:t xml:space="preserve"> design gevolgd in plaats van die van </w:t>
+      </w:r>
+      <w:proofErr w:type="gramStart"/>
+      <w:r>
+        <w:t>Android studio</w:t>
+      </w:r>
+      <w:proofErr w:type="gramEnd"/>
+      <w:r>
+        <w:t>. Ze leerde me dan hoe ik er mee kon werken maar niet hoe een hele nieuwe app kon maken. Ik kreeg een voorbeeld app om erin te kunnen werken voor de tutorial.</w:t>
       </w:r>
     </w:p>
     <w:p>
@@ -603,10 +938,34 @@
     </w:p>
     <w:p>
       <w:r>
-        <w:t>Vandaag heb ik de usertests afgelegd met Louis D’hondt en Jasper Wauters. Dit ging heel gemakkelijk en duurde niet lang. Ik had niet echt serieuze opmerkingen, behalve dat ik geen persoonlijke info pagina gemaakt had.</w:t>
-      </w:r>
-      <w:r>
-        <w:t xml:space="preserve"> Daarna heb ik onmiddellijk die opmerkingen van mijn figma design verbetert en op mijn repository gezet.</w:t>
+        <w:t xml:space="preserve">Vandaag heb ik de usertests afgelegd met Louis </w:t>
+      </w:r>
+      <w:proofErr w:type="spellStart"/>
+      <w:r>
+        <w:t>D’hondt</w:t>
+      </w:r>
+      <w:proofErr w:type="spellEnd"/>
+      <w:r>
+        <w:t xml:space="preserve"> en Jasper Wauters. Dit ging heel gemakkelijk en duurde niet lang. Ik had niet echt serieuze opmerkingen, behalve dat ik geen persoonlijke info pagina gemaakt had.</w:t>
+      </w:r>
+      <w:r>
+        <w:t xml:space="preserve"> Daarna heb ik onmiddellijk die opmerkingen van mijn </w:t>
+      </w:r>
+      <w:proofErr w:type="spellStart"/>
+      <w:r>
+        <w:t>figma</w:t>
+      </w:r>
+      <w:proofErr w:type="spellEnd"/>
+      <w:r>
+        <w:t xml:space="preserve"> design verbetert en op mijn </w:t>
+      </w:r>
+      <w:proofErr w:type="spellStart"/>
+      <w:r>
+        <w:t>repository</w:t>
+      </w:r>
+      <w:proofErr w:type="spellEnd"/>
+      <w:r>
+        <w:t xml:space="preserve"> gezet.</w:t>
       </w:r>
     </w:p>
     <w:p/>
@@ -629,7 +988,47 @@
     </w:p>
     <w:p>
       <w:r>
-        <w:t xml:space="preserve">Vandaag begon ik eindelijk met Material Design. Ik besloot mijn oude app te verwijderen en te vervangen met een empty activity zodat ik echt van scratch begin. Zo kan ik alles beter begrijpen. Ik had dan ontdekt dat android studio al automatisch Material Design van Google had toegevoegd bij de dependencies, dus eigenlijk ben ik </w:t>
+        <w:t xml:space="preserve">Vandaag begon ik eindelijk met </w:t>
+      </w:r>
+      <w:proofErr w:type="spellStart"/>
+      <w:r>
+        <w:t>Material</w:t>
+      </w:r>
+      <w:proofErr w:type="spellEnd"/>
+      <w:r>
+        <w:t xml:space="preserve"> Design. Ik besloot mijn oude app te verwijderen en te vervangen met een empty </w:t>
+      </w:r>
+      <w:proofErr w:type="spellStart"/>
+      <w:r>
+        <w:t>activity</w:t>
+      </w:r>
+      <w:proofErr w:type="spellEnd"/>
+      <w:r>
+        <w:t xml:space="preserve"> zodat ik echt van scratch begin. Zo kan ik alles beter begrijpen. Ik had dan ontdekt dat </w:t>
+      </w:r>
+      <w:proofErr w:type="spellStart"/>
+      <w:r>
+        <w:t>android</w:t>
+      </w:r>
+      <w:proofErr w:type="spellEnd"/>
+      <w:r>
+        <w:t xml:space="preserve"> studio al automatisch </w:t>
+      </w:r>
+      <w:proofErr w:type="spellStart"/>
+      <w:r>
+        <w:t>Material</w:t>
+      </w:r>
+      <w:proofErr w:type="spellEnd"/>
+      <w:r>
+        <w:t xml:space="preserve"> Design van Google had toegevoegd bij de </w:t>
+      </w:r>
+      <w:proofErr w:type="spellStart"/>
+      <w:r>
+        <w:t>dependencies</w:t>
+      </w:r>
+      <w:proofErr w:type="spellEnd"/>
+      <w:r>
+        <w:t xml:space="preserve">, dus eigenlijk ben ik </w:t>
       </w:r>
       <w:r>
         <w:t>onmiddellijk</w:t>
@@ -773,18 +1172,50 @@
     </w:p>
     <w:p>
       <w:r>
-        <w:t>Eerst had ik geprobeerd om gewoon een heel nieuw project te maken die bestond uit een login activity. Deze activity heb ik dan gewoon aangepast naar mijn wens. Maar dit wou ook niet echt werken, want blijkbaar is het best dat je van een main</w:t>
+        <w:t xml:space="preserve">Eerst had ik geprobeerd om gewoon een heel nieuw project te maken die bestond uit een login </w:t>
+      </w:r>
+      <w:proofErr w:type="spellStart"/>
+      <w:r>
+        <w:t>activity</w:t>
+      </w:r>
+      <w:proofErr w:type="spellEnd"/>
+      <w:r>
+        <w:t xml:space="preserve">. Deze </w:t>
+      </w:r>
+      <w:proofErr w:type="spellStart"/>
+      <w:r>
+        <w:t>activity</w:t>
+      </w:r>
+      <w:proofErr w:type="spellEnd"/>
+      <w:r>
+        <w:t xml:space="preserve"> heb ik dan gewoon aangepast naar mijn wens. Maar dit wou ook niet echt werken, want blijkbaar is het best dat je van een </w:t>
+      </w:r>
+      <w:proofErr w:type="spellStart"/>
+      <w:r>
+        <w:t>main</w:t>
       </w:r>
       <w:r>
         <w:t>_</w:t>
       </w:r>
       <w:r>
-        <w:t>activity start en dan de login page daarmee opent.</w:t>
-      </w:r>
-    </w:p>
-    <w:p>
-      <w:r>
-        <w:t>Ik ben dan gewoon terug begonnen aan het oude project en heb dan de error op stack overflow gezocht en daar had ik de oplossing gevonden. Ik moest gewoon mijn “device” zijn data wipen en dan kon het opnieuw installeren want mijn oude projecten stond er nog op.</w:t>
+        <w:t>activity</w:t>
+      </w:r>
+      <w:proofErr w:type="spellEnd"/>
+      <w:r>
+        <w:t xml:space="preserve"> start en dan de login page daarmee opent.</w:t>
+      </w:r>
+    </w:p>
+    <w:p>
+      <w:r>
+        <w:t xml:space="preserve">Ik ben dan gewoon terug begonnen aan het oude project en heb dan de error op stack overflow gezocht en daar had ik de oplossing gevonden. Ik moest gewoon mijn “device” zijn data </w:t>
+      </w:r>
+      <w:proofErr w:type="spellStart"/>
+      <w:r>
+        <w:t>wipen</w:t>
+      </w:r>
+      <w:proofErr w:type="spellEnd"/>
+      <w:r>
+        <w:t xml:space="preserve"> en dan kon het opnieuw installeren want mijn oude projecten stond er nog op.</w:t>
       </w:r>
     </w:p>
     <w:p>
@@ -828,7 +1259,23 @@
         <w:t>Vandaag wou de wifi niet werken op de campus dus had ik niet veel vooruitgang geboekt.</w:t>
       </w:r>
       <w:r>
-        <w:t xml:space="preserve"> Ik was ook gisteren vergeten om de registratie pagina te committen, dus da had ik alleszins gedaan door met mijn hotspot van mijn gsm te verbinden en de 4G aan te zetten.</w:t>
+        <w:t xml:space="preserve"> Ik was ook gisteren vergeten om de registratie pagina te </w:t>
+      </w:r>
+      <w:proofErr w:type="spellStart"/>
+      <w:r>
+        <w:t>committen</w:t>
+      </w:r>
+      <w:proofErr w:type="spellEnd"/>
+      <w:r>
+        <w:t xml:space="preserve">, dus da had ik alleszins gedaan door met mijn </w:t>
+      </w:r>
+      <w:proofErr w:type="spellStart"/>
+      <w:r>
+        <w:t>hotspot</w:t>
+      </w:r>
+      <w:proofErr w:type="spellEnd"/>
+      <w:r>
+        <w:t xml:space="preserve"> van mijn gsm te verbinden en de 4G aan te zetten.</w:t>
       </w:r>
     </w:p>
     <w:p>
@@ -860,11 +1307,21 @@
         <w:t>Vandaag wou de wifi op school nog steeds niet zo goed werken</w:t>
       </w:r>
       <w:r>
-        <w:t xml:space="preserve">, maar dankzij de wifi hotspot heb ik toch nog de navigatie van login naar registratie kunnen </w:t>
-      </w:r>
+        <w:t xml:space="preserve">, maar dankzij de wifi </w:t>
+      </w:r>
+      <w:proofErr w:type="spellStart"/>
+      <w:r>
+        <w:t>hotspot</w:t>
+      </w:r>
+      <w:proofErr w:type="spellEnd"/>
+      <w:r>
+        <w:t xml:space="preserve"> heb ik toch nog de navigatie van login naar registratie kunnen </w:t>
+      </w:r>
+      <w:proofErr w:type="spellStart"/>
       <w:r>
         <w:t>commiten</w:t>
       </w:r>
+      <w:proofErr w:type="spellEnd"/>
       <w:r>
         <w:t>.</w:t>
       </w:r>
@@ -874,7 +1331,15 @@
     </w:p>
     <w:p>
       <w:r>
-        <w:t>De wifi wou uiteindelijk werken dus kon eindelijk heel vlot vooruitgaan. Ik heb daarbij de navigatie tussen de login en registratie kunnen afwerken. Daarna heb ik ook de startpagina bijna afgewerkt, maar de bottom bar wou niet helemaal meewerken dus dat laat ik voor later.</w:t>
+        <w:t xml:space="preserve">De wifi wou uiteindelijk werken dus kon eindelijk heel vlot vooruitgaan. Ik heb daarbij de navigatie tussen de login en registratie kunnen afwerken. Daarna heb ik ook de startpagina bijna afgewerkt, maar de </w:t>
+      </w:r>
+      <w:proofErr w:type="spellStart"/>
+      <w:r>
+        <w:t>bottom</w:t>
+      </w:r>
+      <w:proofErr w:type="spellEnd"/>
+      <w:r>
+        <w:t xml:space="preserve"> bar wou niet helemaal meewerken dus dat laat ik voor later.</w:t>
       </w:r>
     </w:p>
     <w:p/>
@@ -895,7 +1360,31 @@
     </w:p>
     <w:p>
       <w:r>
-        <w:t>Vandaag heb ik de bodem navigatie afgewerkt waarbij je dan naar je groepen kunt gaan oftewel naar je notities die je hebt gefotografeerd. Dit was eerste wel een challenge zoals de active pagina weergegeven of de juiste eventlistener gebruiken om te kunnen navigeren. Maar deze links hebben daarbij geholpen:</w:t>
+        <w:t xml:space="preserve">Vandaag heb ik de bodem navigatie afgewerkt waarbij je dan naar je groepen kunt gaan oftewel naar je notities die je hebt gefotografeerd. Dit was eerste wel een </w:t>
+      </w:r>
+      <w:proofErr w:type="spellStart"/>
+      <w:r>
+        <w:t>challenge</w:t>
+      </w:r>
+      <w:proofErr w:type="spellEnd"/>
+      <w:r>
+        <w:t xml:space="preserve"> zoals de </w:t>
+      </w:r>
+      <w:proofErr w:type="spellStart"/>
+      <w:r>
+        <w:t>active</w:t>
+      </w:r>
+      <w:proofErr w:type="spellEnd"/>
+      <w:r>
+        <w:t xml:space="preserve"> pagina weergegeven of de juiste </w:t>
+      </w:r>
+      <w:proofErr w:type="spellStart"/>
+      <w:r>
+        <w:t>eventlistener</w:t>
+      </w:r>
+      <w:proofErr w:type="spellEnd"/>
+      <w:r>
+        <w:t xml:space="preserve"> gebruiken om te kunnen navigeren. Maar deze links hebben daarbij geholpen:</w:t>
       </w:r>
     </w:p>
     <w:p>
@@ -941,13 +1430,29 @@
     </w:p>
     <w:p>
       <w:r>
-        <w:t>Ik heb dan ook nog voor gezorgd dat mijn firebase account verbonden is met</w:t>
+        <w:t xml:space="preserve">Ik heb dan ook nog voor gezorgd dat mijn </w:t>
+      </w:r>
+      <w:proofErr w:type="spellStart"/>
+      <w:r>
+        <w:t>firebase</w:t>
+      </w:r>
+      <w:proofErr w:type="spellEnd"/>
+      <w:r>
+        <w:t xml:space="preserve"> account verbonden is met</w:t>
       </w:r>
       <w:r>
         <w:t xml:space="preserve"> mijn</w:t>
       </w:r>
       <w:r>
-        <w:t xml:space="preserve"> android studio app.</w:t>
+        <w:t xml:space="preserve"> </w:t>
+      </w:r>
+      <w:proofErr w:type="spellStart"/>
+      <w:r>
+        <w:t>android</w:t>
+      </w:r>
+      <w:proofErr w:type="spellEnd"/>
+      <w:r>
+        <w:t xml:space="preserve"> studio app.</w:t>
       </w:r>
     </w:p>
     <w:p>
@@ -1104,8 +1609,13 @@
           <w:numId w:val="1"/>
         </w:numPr>
       </w:pPr>
-      <w:r>
-        <w:t>Firebase implementeren</w:t>
+      <w:proofErr w:type="spellStart"/>
+      <w:r>
+        <w:t>Firebase</w:t>
+      </w:r>
+      <w:proofErr w:type="spellEnd"/>
+      <w:r>
+        <w:t xml:space="preserve"> implementeren</w:t>
       </w:r>
     </w:p>
     <w:p>
@@ -1117,8 +1627,13 @@
         </w:numPr>
       </w:pPr>
       <w:r>
-        <w:t>Login en registratie mogelijk maken via firebase</w:t>
-      </w:r>
+        <w:t xml:space="preserve">Login en registratie mogelijk maken via </w:t>
+      </w:r>
+      <w:proofErr w:type="spellStart"/>
+      <w:r>
+        <w:t>firebase</w:t>
+      </w:r>
+      <w:proofErr w:type="spellEnd"/>
     </w:p>
     <w:p>
       <w:pPr>
@@ -1129,7 +1644,11 @@
         </w:numPr>
       </w:pPr>
       <w:r>
-        <w:t>Camera functionaliteit bekijken voor andr</w:t>
+        <w:t xml:space="preserve">Camera functionaliteit bekijken voor </w:t>
+      </w:r>
+      <w:proofErr w:type="spellStart"/>
+      <w:r>
+        <w:t>andr</w:t>
       </w:r>
       <w:r>
         <w:t>oi</w:t>
@@ -1137,6 +1656,7 @@
       <w:r>
         <w:t>d</w:t>
       </w:r>
+      <w:proofErr w:type="spellEnd"/>
     </w:p>
     <w:p/>
     <w:p>
@@ -1156,10 +1676,66 @@
     </w:p>
     <w:p>
       <w:r>
-        <w:t>Hier kan je ondertussen zien dat mijn app verbonden is met Firebase. Nu vragen ze voor google sign-in om een sha-1 fingerprint toe te voegen.</w:t>
-      </w:r>
-      <w:r>
-        <w:t xml:space="preserve"> Ik wou dan google play signing pakken om het te genereren ipv self-signing, maar ik moet dan 25 euro eerst betalen voor een </w:t>
+        <w:t xml:space="preserve">Hier kan je ondertussen zien dat mijn app verbonden is met </w:t>
+      </w:r>
+      <w:proofErr w:type="spellStart"/>
+      <w:r>
+        <w:t>Firebase</w:t>
+      </w:r>
+      <w:proofErr w:type="spellEnd"/>
+      <w:r>
+        <w:t xml:space="preserve">. Nu vragen ze voor google </w:t>
+      </w:r>
+      <w:proofErr w:type="spellStart"/>
+      <w:r>
+        <w:t>sign</w:t>
+      </w:r>
+      <w:proofErr w:type="spellEnd"/>
+      <w:r>
+        <w:t xml:space="preserve">-in om een sha-1 </w:t>
+      </w:r>
+      <w:proofErr w:type="spellStart"/>
+      <w:r>
+        <w:t>fingerprint</w:t>
+      </w:r>
+      <w:proofErr w:type="spellEnd"/>
+      <w:r>
+        <w:t xml:space="preserve"> toe te voegen.</w:t>
+      </w:r>
+      <w:r>
+        <w:t xml:space="preserve"> Ik wou dan google </w:t>
+      </w:r>
+      <w:proofErr w:type="spellStart"/>
+      <w:r>
+        <w:t>play</w:t>
+      </w:r>
+      <w:proofErr w:type="spellEnd"/>
+      <w:r>
+        <w:t xml:space="preserve"> </w:t>
+      </w:r>
+      <w:proofErr w:type="spellStart"/>
+      <w:r>
+        <w:t>signing</w:t>
+      </w:r>
+      <w:proofErr w:type="spellEnd"/>
+      <w:r>
+        <w:t xml:space="preserve"> pakken om het te genereren </w:t>
+      </w:r>
+      <w:proofErr w:type="spellStart"/>
+      <w:r>
+        <w:t>ipv</w:t>
+      </w:r>
+      <w:proofErr w:type="spellEnd"/>
+      <w:r>
+        <w:t xml:space="preserve"> </w:t>
+      </w:r>
+      <w:proofErr w:type="spellStart"/>
+      <w:r>
+        <w:t>self-signing</w:t>
+      </w:r>
+      <w:proofErr w:type="spellEnd"/>
+      <w:r>
+        <w:t xml:space="preserve">, maar ik moet dan 25 euro eerst betalen voor een </w:t>
       </w:r>
       <w:r>
         <w:t>ontwikkelaar</w:t>
@@ -1230,14 +1806,75 @@
       <w:r>
         <w:t>Als ik wat meer naar onderging bij de “</w:t>
       </w:r>
-      <w:r>
-        <w:t>Authenticating Your Client</w:t>
-      </w:r>
-      <w:r>
-        <w:t>” pagina (zie link) kan je ook via de terminal van android studio een command invoeren om de sha-1 fingerprint te krijgen. Hierbij moest je “gradle sigingReport” invoeren en dan ctrl + enter invoeren!!</w:t>
-      </w:r>
-      <w:r>
-        <w:t xml:space="preserve"> Deze heb ik dan toegevoegd aan Firebase.</w:t>
+      <w:proofErr w:type="spellStart"/>
+      <w:r>
+        <w:t>Authenticating</w:t>
+      </w:r>
+      <w:proofErr w:type="spellEnd"/>
+      <w:r>
+        <w:t xml:space="preserve"> </w:t>
+      </w:r>
+      <w:proofErr w:type="spellStart"/>
+      <w:r>
+        <w:t>Your</w:t>
+      </w:r>
+      <w:proofErr w:type="spellEnd"/>
+      <w:r>
+        <w:t xml:space="preserve"> Client</w:t>
+      </w:r>
+      <w:r>
+        <w:t xml:space="preserve">” pagina (zie link) kan je ook via de terminal van </w:t>
+      </w:r>
+      <w:proofErr w:type="spellStart"/>
+      <w:r>
+        <w:t>android</w:t>
+      </w:r>
+      <w:proofErr w:type="spellEnd"/>
+      <w:r>
+        <w:t xml:space="preserve"> studio een </w:t>
+      </w:r>
+      <w:proofErr w:type="spellStart"/>
+      <w:r>
+        <w:t>command</w:t>
+      </w:r>
+      <w:proofErr w:type="spellEnd"/>
+      <w:r>
+        <w:t xml:space="preserve"> invoeren om de sha-1 </w:t>
+      </w:r>
+      <w:proofErr w:type="spellStart"/>
+      <w:r>
+        <w:t>fingerprint</w:t>
+      </w:r>
+      <w:proofErr w:type="spellEnd"/>
+      <w:r>
+        <w:t xml:space="preserve"> te krijgen. Hierbij moest je “</w:t>
+      </w:r>
+      <w:proofErr w:type="spellStart"/>
+      <w:r>
+        <w:t>gradle</w:t>
+      </w:r>
+      <w:proofErr w:type="spellEnd"/>
+      <w:r>
+        <w:t xml:space="preserve"> </w:t>
+      </w:r>
+      <w:proofErr w:type="spellStart"/>
+      <w:r>
+        <w:t>sigingReport</w:t>
+      </w:r>
+      <w:proofErr w:type="spellEnd"/>
+      <w:r>
+        <w:t>” invoeren en dan ctrl + enter invoeren!!</w:t>
+      </w:r>
+      <w:r>
+        <w:t xml:space="preserve"> Deze heb ik dan toegevoegd aan </w:t>
+      </w:r>
+      <w:proofErr w:type="spellStart"/>
+      <w:r>
+        <w:t>Firebase</w:t>
+      </w:r>
+      <w:proofErr w:type="spellEnd"/>
+      <w:r>
+        <w:t>.</w:t>
       </w:r>
     </w:p>
     <w:p>
@@ -1285,7 +1922,15 @@
     </w:p>
     <w:p>
       <w:r>
-        <w:t>Daarna moest ik een Oauth 2.0 client ID toevoegen voor het inloggen. Hierbij moest ik een hele configuratie begaan.</w:t>
+        <w:t xml:space="preserve">Daarna moest ik een </w:t>
+      </w:r>
+      <w:proofErr w:type="spellStart"/>
+      <w:r>
+        <w:t>Oauth</w:t>
+      </w:r>
+      <w:proofErr w:type="spellEnd"/>
+      <w:r>
+        <w:t xml:space="preserve"> 2.0 client ID toevoegen voor het inloggen. Hierbij moest ik een hele configuratie begaan.</w:t>
       </w:r>
       <w:r>
         <w:t xml:space="preserve"> Ik heb hierbij het meest niet ingevuld zoals een privacy policy, enzoverder.</w:t>
@@ -1466,7 +2111,31 @@
     </w:p>
     <w:p>
       <w:r>
-        <w:t xml:space="preserve">Vandaag had ik tijdens les (in de morgen van 8u15-11u15) verder gewerkt aan de back-end van mijn app. Ik was gisteren bezig met google sign-in, maar ik besloot om eerst normale email/password authentication toe te voegen. Dit ging vrij vlot vooruit maar toen ik de button klikt sloot de app af, dus dat moet ik nog oplossen. </w:t>
+        <w:t xml:space="preserve">Vandaag had ik tijdens les (in de morgen van 8u15-11u15) verder gewerkt aan de </w:t>
+      </w:r>
+      <w:proofErr w:type="spellStart"/>
+      <w:r>
+        <w:t>back-end</w:t>
+      </w:r>
+      <w:proofErr w:type="spellEnd"/>
+      <w:r>
+        <w:t xml:space="preserve"> van mijn app. Ik was gisteren bezig met google </w:t>
+      </w:r>
+      <w:proofErr w:type="spellStart"/>
+      <w:r>
+        <w:t>sign</w:t>
+      </w:r>
+      <w:proofErr w:type="spellEnd"/>
+      <w:r>
+        <w:t xml:space="preserve">-in, maar ik besloot om eerst normale email/password </w:t>
+      </w:r>
+      <w:proofErr w:type="spellStart"/>
+      <w:r>
+        <w:t>authentication</w:t>
+      </w:r>
+      <w:proofErr w:type="spellEnd"/>
+      <w:r>
+        <w:t xml:space="preserve"> toe te voegen. Dit ging vrij vlot vooruit maar toen ik de button klikt sloot de app af, dus dat moet ik nog oplossen. </w:t>
       </w:r>
       <w:r>
         <w:t>Er werd</w:t>
@@ -1512,10 +2181,34 @@
         <w:t>Vandaag heb ik eindelijk de login en registratie kunnen afwerken. Dit had veel moeite gekost.</w:t>
       </w:r>
       <w:r>
-        <w:t xml:space="preserve"> Het probleem was dus dat mijn app bleef crashen als ik probeerde te registeren. Ik had veel op stackoverflow gezocht maar ik kon eerst niks vinden, maar toen zag ik dat de wifi van de device emulator op Android studio geen wifi had. Ik dacht eerst dat dit normaal was, maar begon toen twijfels te krijgen. Ik had dan eerst de info op stackoverflow pagina proberen gebruiken, maar dat was niet juist. Uiteindelijk gewoon mijn gsm hotspot 4G gebruiken werkte wel.</w:t>
-      </w:r>
-      <w:r>
-        <w:t xml:space="preserve"> Mijn app crasht dan nog steeds bij registratie maar ik kon wel inloggen door een test account aan te maken op Firebase. Dus mijn code werkte, maar toen ik zag dat ik niet gekeken had naar de error van die verscheen na de crash en dat maakte alles duidelijk</w:t>
+        <w:t xml:space="preserve"> Het probleem was dus dat mijn app bleef crashen als ik probeerde te registeren. Ik had veel op stackoverflow gezocht maar ik kon eerst niks vinden, maar toen zag ik dat de wifi van de device emulator op </w:t>
+      </w:r>
+      <w:proofErr w:type="gramStart"/>
+      <w:r>
+        <w:t>Android studio</w:t>
+      </w:r>
+      <w:proofErr w:type="gramEnd"/>
+      <w:r>
+        <w:t xml:space="preserve"> geen wifi had. Ik dacht eerst dat dit normaal was, maar begon toen twijfels te krijgen. Ik had dan eerst de info op stackoverflow pagina proberen gebruiken, maar dat was niet juist. Uiteindelijk gewoon mijn gsm </w:t>
+      </w:r>
+      <w:proofErr w:type="spellStart"/>
+      <w:r>
+        <w:t>hotspot</w:t>
+      </w:r>
+      <w:proofErr w:type="spellEnd"/>
+      <w:r>
+        <w:t xml:space="preserve"> 4G gebruiken werkte wel.</w:t>
+      </w:r>
+      <w:r>
+        <w:t xml:space="preserve"> Mijn app crasht dan nog steeds bij registratie maar ik kon wel inloggen door een test account aan te maken op </w:t>
+      </w:r>
+      <w:proofErr w:type="spellStart"/>
+      <w:r>
+        <w:t>Firebase</w:t>
+      </w:r>
+      <w:proofErr w:type="spellEnd"/>
+      <w:r>
+        <w:t>. Dus mijn code werkte, maar toen ik zag dat ik niet gekeken had naar de error van die verscheen na de crash en dat maakte alles duidelijk</w:t>
       </w:r>
       <w:r>
         <w:t xml:space="preserve"> voor mij</w:t>
@@ -1677,8 +2370,65 @@
           <w:rFonts w:eastAsia="Times New Roman" w:cstheme="minorHAnsi"/>
           <w:lang w:eastAsia="nl-BE"/>
         </w:rPr>
-        <w:t>Vandaag heb ik geprobeerd om google sign-in te laten werken. Dit ging zeer goed, maar het enige probleem is dat de google account niet wordt toegevoegd aan Firebase en het wil daarna niet naar de volgende pagina gaan als ik de google sign</w:t>
-      </w:r>
+        <w:t xml:space="preserve">Vandaag heb ik geprobeerd om google </w:t>
+      </w:r>
+      <w:proofErr w:type="spellStart"/>
+      <w:r>
+        <w:rPr>
+          <w:rFonts w:eastAsia="Times New Roman" w:cstheme="minorHAnsi"/>
+          <w:lang w:eastAsia="nl-BE"/>
+        </w:rPr>
+        <w:t>sign</w:t>
+      </w:r>
+      <w:proofErr w:type="spellEnd"/>
+      <w:r>
+        <w:rPr>
+          <w:rFonts w:eastAsia="Times New Roman" w:cstheme="minorHAnsi"/>
+          <w:lang w:eastAsia="nl-BE"/>
+        </w:rPr>
+        <w:t xml:space="preserve">-in te laten werken. Dit ging zeer goed, maar het enige probleem is dat de </w:t>
+      </w:r>
+      <w:proofErr w:type="gramStart"/>
+      <w:r>
+        <w:rPr>
+          <w:rFonts w:eastAsia="Times New Roman" w:cstheme="minorHAnsi"/>
+          <w:lang w:eastAsia="nl-BE"/>
+        </w:rPr>
+        <w:t>google account</w:t>
+      </w:r>
+      <w:proofErr w:type="gramEnd"/>
+      <w:r>
+        <w:rPr>
+          <w:rFonts w:eastAsia="Times New Roman" w:cstheme="minorHAnsi"/>
+          <w:lang w:eastAsia="nl-BE"/>
+        </w:rPr>
+        <w:t xml:space="preserve"> niet wordt toegevoegd aan </w:t>
+      </w:r>
+      <w:proofErr w:type="spellStart"/>
+      <w:r>
+        <w:rPr>
+          <w:rFonts w:eastAsia="Times New Roman" w:cstheme="minorHAnsi"/>
+          <w:lang w:eastAsia="nl-BE"/>
+        </w:rPr>
+        <w:t>Firebase</w:t>
+      </w:r>
+      <w:proofErr w:type="spellEnd"/>
+      <w:r>
+        <w:rPr>
+          <w:rFonts w:eastAsia="Times New Roman" w:cstheme="minorHAnsi"/>
+          <w:lang w:eastAsia="nl-BE"/>
+        </w:rPr>
+        <w:t xml:space="preserve"> en het wil daarna niet naar de volgende pagina gaan als ik de google </w:t>
+      </w:r>
+      <w:proofErr w:type="spellStart"/>
+      <w:r>
+        <w:rPr>
+          <w:rFonts w:eastAsia="Times New Roman" w:cstheme="minorHAnsi"/>
+          <w:lang w:eastAsia="nl-BE"/>
+        </w:rPr>
+        <w:t>sign</w:t>
+      </w:r>
+      <w:proofErr w:type="spellEnd"/>
       <w:r>
         <w:rPr>
           <w:rFonts w:eastAsia="Times New Roman" w:cstheme="minorHAnsi"/>
@@ -1691,7 +2441,39 @@
           <w:rFonts w:eastAsia="Times New Roman" w:cstheme="minorHAnsi"/>
           <w:lang w:eastAsia="nl-BE"/>
         </w:rPr>
-        <w:t>in button klik. Het sign-in scherm verschijnt wel en hebben geen errors, maar daarna gebeurt er niks. Ik heb de methode toegevoegd die iemand van teams zei dat die het probleem</w:t>
+        <w:t xml:space="preserve">in button klik. Het </w:t>
+      </w:r>
+      <w:proofErr w:type="spellStart"/>
+      <w:r>
+        <w:rPr>
+          <w:rFonts w:eastAsia="Times New Roman" w:cstheme="minorHAnsi"/>
+          <w:lang w:eastAsia="nl-BE"/>
+        </w:rPr>
+        <w:t>sign</w:t>
+      </w:r>
+      <w:proofErr w:type="spellEnd"/>
+      <w:r>
+        <w:rPr>
+          <w:rFonts w:eastAsia="Times New Roman" w:cstheme="minorHAnsi"/>
+          <w:lang w:eastAsia="nl-BE"/>
+        </w:rPr>
+        <w:t xml:space="preserve">-in scherm verschijnt wel en hebben geen </w:t>
+      </w:r>
+      <w:proofErr w:type="spellStart"/>
+      <w:r>
+        <w:rPr>
+          <w:rFonts w:eastAsia="Times New Roman" w:cstheme="minorHAnsi"/>
+          <w:lang w:eastAsia="nl-BE"/>
+        </w:rPr>
+        <w:t>errors</w:t>
+      </w:r>
+      <w:proofErr w:type="spellEnd"/>
+      <w:r>
+        <w:rPr>
+          <w:rFonts w:eastAsia="Times New Roman" w:cstheme="minorHAnsi"/>
+          <w:lang w:eastAsia="nl-BE"/>
+        </w:rPr>
+        <w:t>, maar daarna gebeurt er niks. Ik heb de methode toegevoegd die iemand van teams zei dat die het probleem</w:t>
       </w:r>
       <w:r>
         <w:rPr>
@@ -1726,7 +2508,23 @@
           <w:rFonts w:eastAsia="Times New Roman" w:cstheme="minorHAnsi"/>
           <w:lang w:eastAsia="nl-BE"/>
         </w:rPr>
-        <w:t xml:space="preserve"> 1 van de methodes was wel deprecated, maar die had </w:t>
+        <w:t xml:space="preserve"> 1 van de methodes was wel </w:t>
+      </w:r>
+      <w:proofErr w:type="spellStart"/>
+      <w:r>
+        <w:rPr>
+          <w:rFonts w:eastAsia="Times New Roman" w:cstheme="minorHAnsi"/>
+          <w:lang w:eastAsia="nl-BE"/>
+        </w:rPr>
+        <w:t>deprecated</w:t>
+      </w:r>
+      <w:proofErr w:type="spellEnd"/>
+      <w:r>
+        <w:rPr>
+          <w:rFonts w:eastAsia="Times New Roman" w:cstheme="minorHAnsi"/>
+          <w:lang w:eastAsia="nl-BE"/>
+        </w:rPr>
+        <w:t xml:space="preserve">, maar die had </w:t>
       </w:r>
       <w:r>
         <w:rPr>
@@ -1891,14 +2689,192 @@
           <w:rFonts w:eastAsia="Times New Roman" w:cstheme="minorHAnsi"/>
           <w:lang w:eastAsia="nl-BE"/>
         </w:rPr>
-        <w:t>Vandaag is het me gelukt om de google sign-in te laten werken. Ik had veel opzoek werk gedaan op google maar kon niks duidelijk vinden. Ik had mijn code ook gedebugd, maar geen duidelijk error werd weergegeven. Uiteindelijk besloot ik opzoek te gaan naar een tutorial die recent was in 2021. Deze tutorial heb ik dan gebruikt om mijn project strict te controleren en toen realiseerde ik dat de SHA-1 niet op de juiste plaats stond. Ik had op google cloud een Oauth 2.0 client id moeten aanmaken toen ik de android studio firebase tutorial volgde, maar dat bleek dus helemaal fout te zijn, want de echte client_id was eigenlijk al klaar in een google-services.json file. Ik moest toen ook mijn SHA-1 fingerprint verwijderen bij de onderstaande afbeelding, maar dat mocht daar eigenlijk blijven staan.</w:t>
-      </w:r>
-      <w:r>
-        <w:rPr>
-          <w:rFonts w:eastAsia="Times New Roman" w:cstheme="minorHAnsi"/>
-          <w:lang w:eastAsia="nl-BE"/>
-        </w:rPr>
-        <w:t xml:space="preserve"> Nu kunnen google accounts succesvol worden toegevoegd.</w:t>
+        <w:t xml:space="preserve">Vandaag is het me gelukt om de google </w:t>
+      </w:r>
+      <w:proofErr w:type="spellStart"/>
+      <w:r>
+        <w:rPr>
+          <w:rFonts w:eastAsia="Times New Roman" w:cstheme="minorHAnsi"/>
+          <w:lang w:eastAsia="nl-BE"/>
+        </w:rPr>
+        <w:t>sign</w:t>
+      </w:r>
+      <w:proofErr w:type="spellEnd"/>
+      <w:r>
+        <w:rPr>
+          <w:rFonts w:eastAsia="Times New Roman" w:cstheme="minorHAnsi"/>
+          <w:lang w:eastAsia="nl-BE"/>
+        </w:rPr>
+        <w:t xml:space="preserve">-in te laten werken. Ik had veel opzoek werk gedaan op google maar kon niks duidelijk vinden. Ik had mijn code ook gedebugd, maar geen duidelijk error werd weergegeven. Uiteindelijk besloot ik opzoek te gaan naar een tutorial die recent was in 2021. Deze tutorial heb ik dan gebruikt om mijn project </w:t>
+      </w:r>
+      <w:proofErr w:type="spellStart"/>
+      <w:r>
+        <w:rPr>
+          <w:rFonts w:eastAsia="Times New Roman" w:cstheme="minorHAnsi"/>
+          <w:lang w:eastAsia="nl-BE"/>
+        </w:rPr>
+        <w:t>strict</w:t>
+      </w:r>
+      <w:proofErr w:type="spellEnd"/>
+      <w:r>
+        <w:rPr>
+          <w:rFonts w:eastAsia="Times New Roman" w:cstheme="minorHAnsi"/>
+          <w:lang w:eastAsia="nl-BE"/>
+        </w:rPr>
+        <w:t xml:space="preserve"> te controleren en toen realiseerde ik dat de SHA-1 niet op de juiste plaats stond. Ik had op google </w:t>
+      </w:r>
+      <w:proofErr w:type="spellStart"/>
+      <w:r>
+        <w:rPr>
+          <w:rFonts w:eastAsia="Times New Roman" w:cstheme="minorHAnsi"/>
+          <w:lang w:eastAsia="nl-BE"/>
+        </w:rPr>
+        <w:t>cloud</w:t>
+      </w:r>
+      <w:proofErr w:type="spellEnd"/>
+      <w:r>
+        <w:rPr>
+          <w:rFonts w:eastAsia="Times New Roman" w:cstheme="minorHAnsi"/>
+          <w:lang w:eastAsia="nl-BE"/>
+        </w:rPr>
+        <w:t xml:space="preserve"> een </w:t>
+      </w:r>
+      <w:proofErr w:type="spellStart"/>
+      <w:r>
+        <w:rPr>
+          <w:rFonts w:eastAsia="Times New Roman" w:cstheme="minorHAnsi"/>
+          <w:lang w:eastAsia="nl-BE"/>
+        </w:rPr>
+        <w:t>Oauth</w:t>
+      </w:r>
+      <w:proofErr w:type="spellEnd"/>
+      <w:r>
+        <w:rPr>
+          <w:rFonts w:eastAsia="Times New Roman" w:cstheme="minorHAnsi"/>
+          <w:lang w:eastAsia="nl-BE"/>
+        </w:rPr>
+        <w:t xml:space="preserve"> 2.0 client </w:t>
+      </w:r>
+      <w:proofErr w:type="spellStart"/>
+      <w:r>
+        <w:rPr>
+          <w:rFonts w:eastAsia="Times New Roman" w:cstheme="minorHAnsi"/>
+          <w:lang w:eastAsia="nl-BE"/>
+        </w:rPr>
+        <w:t>id</w:t>
+      </w:r>
+      <w:proofErr w:type="spellEnd"/>
+      <w:r>
+        <w:rPr>
+          <w:rFonts w:eastAsia="Times New Roman" w:cstheme="minorHAnsi"/>
+          <w:lang w:eastAsia="nl-BE"/>
+        </w:rPr>
+        <w:t xml:space="preserve"> moeten aanmaken toen ik de </w:t>
+      </w:r>
+      <w:proofErr w:type="spellStart"/>
+      <w:r>
+        <w:rPr>
+          <w:rFonts w:eastAsia="Times New Roman" w:cstheme="minorHAnsi"/>
+          <w:lang w:eastAsia="nl-BE"/>
+        </w:rPr>
+        <w:t>android</w:t>
+      </w:r>
+      <w:proofErr w:type="spellEnd"/>
+      <w:r>
+        <w:rPr>
+          <w:rFonts w:eastAsia="Times New Roman" w:cstheme="minorHAnsi"/>
+          <w:lang w:eastAsia="nl-BE"/>
+        </w:rPr>
+        <w:t xml:space="preserve"> studio </w:t>
+      </w:r>
+      <w:proofErr w:type="spellStart"/>
+      <w:r>
+        <w:rPr>
+          <w:rFonts w:eastAsia="Times New Roman" w:cstheme="minorHAnsi"/>
+          <w:lang w:eastAsia="nl-BE"/>
+        </w:rPr>
+        <w:t>firebase</w:t>
+      </w:r>
+      <w:proofErr w:type="spellEnd"/>
+      <w:r>
+        <w:rPr>
+          <w:rFonts w:eastAsia="Times New Roman" w:cstheme="minorHAnsi"/>
+          <w:lang w:eastAsia="nl-BE"/>
+        </w:rPr>
+        <w:t xml:space="preserve"> tutorial volgde, maar dat bleek dus helemaal fout te zijn, want de echte </w:t>
+      </w:r>
+      <w:proofErr w:type="spellStart"/>
+      <w:r>
+        <w:rPr>
+          <w:rFonts w:eastAsia="Times New Roman" w:cstheme="minorHAnsi"/>
+          <w:lang w:eastAsia="nl-BE"/>
+        </w:rPr>
+        <w:t>client_id</w:t>
+      </w:r>
+      <w:proofErr w:type="spellEnd"/>
+      <w:r>
+        <w:rPr>
+          <w:rFonts w:eastAsia="Times New Roman" w:cstheme="minorHAnsi"/>
+          <w:lang w:eastAsia="nl-BE"/>
+        </w:rPr>
+        <w:t xml:space="preserve"> was eigenlijk al klaar in een google-</w:t>
+      </w:r>
+      <w:proofErr w:type="spellStart"/>
+      <w:proofErr w:type="gramStart"/>
+      <w:r>
+        <w:rPr>
+          <w:rFonts w:eastAsia="Times New Roman" w:cstheme="minorHAnsi"/>
+          <w:lang w:eastAsia="nl-BE"/>
+        </w:rPr>
+        <w:t>services.json</w:t>
+      </w:r>
+      <w:proofErr w:type="spellEnd"/>
+      <w:proofErr w:type="gramEnd"/>
+      <w:r>
+        <w:rPr>
+          <w:rFonts w:eastAsia="Times New Roman" w:cstheme="minorHAnsi"/>
+          <w:lang w:eastAsia="nl-BE"/>
+        </w:rPr>
+        <w:t xml:space="preserve"> file. Ik moest toen ook mijn SHA-1 </w:t>
+      </w:r>
+      <w:proofErr w:type="spellStart"/>
+      <w:r>
+        <w:rPr>
+          <w:rFonts w:eastAsia="Times New Roman" w:cstheme="minorHAnsi"/>
+          <w:lang w:eastAsia="nl-BE"/>
+        </w:rPr>
+        <w:t>fingerprint</w:t>
+      </w:r>
+      <w:proofErr w:type="spellEnd"/>
+      <w:r>
+        <w:rPr>
+          <w:rFonts w:eastAsia="Times New Roman" w:cstheme="minorHAnsi"/>
+          <w:lang w:eastAsia="nl-BE"/>
+        </w:rPr>
+        <w:t xml:space="preserve"> verwijderen bij de onderstaande afbeelding, maar dat mocht daar eigenlijk blijven staan.</w:t>
+      </w:r>
+      <w:r>
+        <w:rPr>
+          <w:rFonts w:eastAsia="Times New Roman" w:cstheme="minorHAnsi"/>
+          <w:lang w:eastAsia="nl-BE"/>
+        </w:rPr>
+        <w:t xml:space="preserve"> Nu kunnen </w:t>
+      </w:r>
+      <w:proofErr w:type="gramStart"/>
+      <w:r>
+        <w:rPr>
+          <w:rFonts w:eastAsia="Times New Roman" w:cstheme="minorHAnsi"/>
+          <w:lang w:eastAsia="nl-BE"/>
+        </w:rPr>
+        <w:t>google accounts</w:t>
+      </w:r>
+      <w:proofErr w:type="gramEnd"/>
+      <w:r>
+        <w:rPr>
+          <w:rFonts w:eastAsia="Times New Roman" w:cstheme="minorHAnsi"/>
+          <w:lang w:eastAsia="nl-BE"/>
+        </w:rPr>
+        <w:t xml:space="preserve"> succesvol worden toegevoegd.</w:t>
       </w:r>
       <w:r>
         <w:rPr>
@@ -2093,7 +3069,13 @@
       </w:pPr>
       <w:r>
         <w:lastRenderedPageBreak/>
-        <w:t>Wat ik wil realiseen deze week:</w:t>
+        <w:t>Wat ik wil realise</w:t>
+      </w:r>
+      <w:r>
+        <w:t>r</w:t>
+      </w:r>
+      <w:r>
+        <w:t>en deze week:</w:t>
       </w:r>
     </w:p>
     <w:p>
@@ -2104,8 +3086,13 @@
           <w:numId w:val="2"/>
         </w:numPr>
       </w:pPr>
-      <w:r>
-        <w:t xml:space="preserve">Firebase </w:t>
+      <w:proofErr w:type="spellStart"/>
+      <w:r>
+        <w:t>Firebase</w:t>
+      </w:r>
+      <w:proofErr w:type="spellEnd"/>
+      <w:r>
+        <w:t xml:space="preserve"> </w:t>
       </w:r>
       <w:r>
         <w:t>storage</w:t>
@@ -2147,19 +3134,43 @@
     </w:p>
     <w:p>
       <w:r>
-        <w:t>Vandaag ben ik begonnen met aanmaken van de Firebase storage voor het opslaan van afbeeldingen.</w:t>
+        <w:t xml:space="preserve">Vandaag ben ik begonnen met aanmaken van de </w:t>
+      </w:r>
+      <w:proofErr w:type="spellStart"/>
+      <w:r>
+        <w:t>Firebase</w:t>
+      </w:r>
+      <w:proofErr w:type="spellEnd"/>
+      <w:r>
+        <w:t xml:space="preserve"> storage voor het opslaan van afbeeldingen.</w:t>
       </w:r>
       <w:r>
         <w:t xml:space="preserve"> </w:t>
       </w:r>
       <w:r>
-        <w:t xml:space="preserve">Ik heb dan de dependencies toegevoegd en dan moest ik een Cloud storage bucket aanmaken. Hierbij werd er gevraagd om een locatie te kiezen waarbij Europe-west 1 (= Belgische regio) niet tussen stond, maar gelukkig is er Eur3 die eigenlijk Belgische en Nederlandse regio voorstelt. Dat werd uitgelegd </w:t>
-      </w:r>
-      <w:r>
-        <w:t>op deze webpagina</w:t>
-      </w:r>
-      <w:r>
-        <w:t>‘s</w:t>
+        <w:t xml:space="preserve">Ik heb dan de </w:t>
+      </w:r>
+      <w:proofErr w:type="spellStart"/>
+      <w:r>
+        <w:t>dependencies</w:t>
+      </w:r>
+      <w:proofErr w:type="spellEnd"/>
+      <w:r>
+        <w:t xml:space="preserve"> toegevoegd en dan moest ik een Cloud storage bucket aanmaken. Hierbij werd er gevraagd om een locatie te kiezen waarbij Europe-west 1 (= Belgische regio) niet tussen stond, maar gelukkig is er Eur3 die eigenlijk Belgische en Nederlandse regio voorstelt. Dat werd uitgelegd </w:t>
+      </w:r>
+      <w:r>
+        <w:t xml:space="preserve">op deze </w:t>
+      </w:r>
+      <w:proofErr w:type="gramStart"/>
+      <w:r>
+        <w:t>webpagina</w:t>
+      </w:r>
+      <w:r>
+        <w:t>‘</w:t>
+      </w:r>
+      <w:proofErr w:type="gramEnd"/>
+      <w:r>
+        <w:t>s</w:t>
       </w:r>
       <w:r>
         <w:t>:</w:t>
@@ -2266,12 +3277,52 @@
     </w:p>
     <w:p>
       <w:r>
-        <w:t xml:space="preserve">Vandaag heb ik de java code moet schrijven voor de camera te kunnen gebruiken. Eerst heb ik code toegevoegd dat ervoor zorgt dat de permissies worden aangevraagd om de camera te kunnen gebruiken. Daarna als ik allow klik dan opent een test camera zicht van de emulator. </w:t>
-      </w:r>
-    </w:p>
-    <w:p>
-      <w:r>
-        <w:t>Hierbij werden gelijkaardig methoden gebruikt zoals de firebase authentication, maar waren ook deprecated. Dit heb natuurlijk makkelijk opgelost.</w:t>
+        <w:t xml:space="preserve">Vandaag heb ik de </w:t>
+      </w:r>
+      <w:proofErr w:type="spellStart"/>
+      <w:r>
+        <w:t>java</w:t>
+      </w:r>
+      <w:proofErr w:type="spellEnd"/>
+      <w:r>
+        <w:t xml:space="preserve"> code moet schrijven voor de camera te kunnen gebruiken. Eerst heb ik code toegevoegd dat ervoor zorgt dat de permissies worden aangevraagd om de camera te kunnen gebruiken. Daarna als ik </w:t>
+      </w:r>
+      <w:proofErr w:type="spellStart"/>
+      <w:r>
+        <w:t>allow</w:t>
+      </w:r>
+      <w:proofErr w:type="spellEnd"/>
+      <w:r>
+        <w:t xml:space="preserve"> klik dan opent een test camera zicht van de emulator. </w:t>
+      </w:r>
+    </w:p>
+    <w:p>
+      <w:r>
+        <w:t xml:space="preserve">Hierbij werden gelijkaardig methoden gebruikt zoals de </w:t>
+      </w:r>
+      <w:proofErr w:type="spellStart"/>
+      <w:r>
+        <w:t>firebase</w:t>
+      </w:r>
+      <w:proofErr w:type="spellEnd"/>
+      <w:r>
+        <w:t xml:space="preserve"> </w:t>
+      </w:r>
+      <w:proofErr w:type="spellStart"/>
+      <w:r>
+        <w:t>authentication</w:t>
+      </w:r>
+      <w:proofErr w:type="spellEnd"/>
+      <w:r>
+        <w:t xml:space="preserve">, maar waren ook </w:t>
+      </w:r>
+      <w:proofErr w:type="spellStart"/>
+      <w:r>
+        <w:t>deprecated</w:t>
+      </w:r>
+      <w:proofErr w:type="spellEnd"/>
+      <w:r>
+        <w:t>. Dit heb natuurlijk makkelijk opgelost.</w:t>
       </w:r>
     </w:p>
     <w:p>
@@ -2345,7 +3396,15 @@
     </w:p>
     <w:p>
       <w:r>
-        <w:t>Vandaag heb ik geprobeerd om de image die getrokken wordt op te slaan in firebase storage</w:t>
+        <w:t xml:space="preserve">Vandaag heb ik geprobeerd om de image die getrokken wordt op te slaan in </w:t>
+      </w:r>
+      <w:proofErr w:type="spellStart"/>
+      <w:r>
+        <w:t>firebase</w:t>
+      </w:r>
+      <w:proofErr w:type="spellEnd"/>
+      <w:r>
+        <w:t xml:space="preserve"> storage</w:t>
       </w:r>
       <w:r>
         <w:t>. Dit is op het einde van de les gelukt.</w:t>
@@ -2399,10 +3458,90 @@
     <w:p>
       <w:r>
         <w:lastRenderedPageBreak/>
-        <w:t xml:space="preserve">Hierbij had ik vooral problemen met de uri oftewl URL omdat firebase die nodig had om te kunnen uploaden. Als je naar de eerste rode streep kijkt is er een methode voor </w:t>
-      </w:r>
-      <w:r>
-        <w:t>de bitmap die je krijgt van de camera te gebruiken om de uri te bepalen. De volgende is voor de bestandextensie te krijgen om een filename op te stellen in de firebase storage. Hierbij pak ik gewoon het tijdstip met de bestandextensie, maar ik ben misschien van plan om de filename te kunnen aanpassen door de gebruiker. De laatste streep zijn twee child methods waarbij dus de eerste de map voorstelt waar dan de 2</w:t>
+        <w:t xml:space="preserve">Hierbij had ik vooral problemen met de </w:t>
+      </w:r>
+      <w:proofErr w:type="spellStart"/>
+      <w:r>
+        <w:t>uri</w:t>
+      </w:r>
+      <w:proofErr w:type="spellEnd"/>
+      <w:r>
+        <w:t xml:space="preserve"> </w:t>
+      </w:r>
+      <w:proofErr w:type="spellStart"/>
+      <w:r>
+        <w:t>oftewl</w:t>
+      </w:r>
+      <w:proofErr w:type="spellEnd"/>
+      <w:r>
+        <w:t xml:space="preserve"> URL omdat </w:t>
+      </w:r>
+      <w:proofErr w:type="spellStart"/>
+      <w:r>
+        <w:t>firebase</w:t>
+      </w:r>
+      <w:proofErr w:type="spellEnd"/>
+      <w:r>
+        <w:t xml:space="preserve"> die nodig had om te kunnen uploaden. Als je naar de eerste rode streep kijkt is er een methode voor </w:t>
+      </w:r>
+      <w:r>
+        <w:t xml:space="preserve">de </w:t>
+      </w:r>
+      <w:proofErr w:type="spellStart"/>
+      <w:r>
+        <w:t>bitmap</w:t>
+      </w:r>
+      <w:proofErr w:type="spellEnd"/>
+      <w:r>
+        <w:t xml:space="preserve"> die je krijgt van de camera te gebruiken om de </w:t>
+      </w:r>
+      <w:proofErr w:type="spellStart"/>
+      <w:r>
+        <w:t>uri</w:t>
+      </w:r>
+      <w:proofErr w:type="spellEnd"/>
+      <w:r>
+        <w:t xml:space="preserve"> te bepalen. De volgende is voor de bestandextensie te krijgen om een </w:t>
+      </w:r>
+      <w:proofErr w:type="spellStart"/>
+      <w:r>
+        <w:t>filename</w:t>
+      </w:r>
+      <w:proofErr w:type="spellEnd"/>
+      <w:r>
+        <w:t xml:space="preserve"> op te stellen in de </w:t>
+      </w:r>
+      <w:proofErr w:type="spellStart"/>
+      <w:r>
+        <w:t>firebase</w:t>
+      </w:r>
+      <w:proofErr w:type="spellEnd"/>
+      <w:r>
+        <w:t xml:space="preserve"> storage. Hierbij pak ik gewoon het tijdstip met de bestandextensie, maar ik ben misschien van plan om de </w:t>
+      </w:r>
+      <w:proofErr w:type="spellStart"/>
+      <w:r>
+        <w:t>filename</w:t>
+      </w:r>
+      <w:proofErr w:type="spellEnd"/>
+      <w:r>
+        <w:t xml:space="preserve"> te kunnen aanpassen door de gebruiker. De laatste streep zijn twee </w:t>
+      </w:r>
+      <w:proofErr w:type="spellStart"/>
+      <w:r>
+        <w:t>child</w:t>
+      </w:r>
+      <w:proofErr w:type="spellEnd"/>
+      <w:r>
+        <w:t xml:space="preserve"> </w:t>
+      </w:r>
+      <w:proofErr w:type="spellStart"/>
+      <w:r>
+        <w:t>methods</w:t>
+      </w:r>
+      <w:proofErr w:type="spellEnd"/>
+      <w:r>
+        <w:t xml:space="preserve"> waarbij dus de eerste de map voorstelt waar dan de 2</w:t>
       </w:r>
       <w:r>
         <w:rPr>
@@ -2411,7 +3550,23 @@
         <w:t>de</w:t>
       </w:r>
       <w:r>
-        <w:t xml:space="preserve"> child oftewel de image inkomt. De map geef ik  het email adres van de gebruiker als naam.</w:t>
+        <w:t xml:space="preserve"> </w:t>
+      </w:r>
+      <w:proofErr w:type="spellStart"/>
+      <w:r>
+        <w:t>child</w:t>
+      </w:r>
+      <w:proofErr w:type="spellEnd"/>
+      <w:r>
+        <w:t xml:space="preserve"> oftewel de image inkomt. De map geef </w:t>
+      </w:r>
+      <w:proofErr w:type="gramStart"/>
+      <w:r>
+        <w:t>ik  het</w:t>
+      </w:r>
+      <w:proofErr w:type="gramEnd"/>
+      <w:r>
+        <w:t xml:space="preserve"> email adres van de gebruiker als naam.</w:t>
       </w:r>
     </w:p>
     <w:p>
@@ -2512,7 +3667,13 @@
         <w:pStyle w:val="Kop3"/>
       </w:pPr>
       <w:r>
-        <w:t>Wat ik wil realiseen deze week:</w:t>
+        <w:t>Wat ik wil realise</w:t>
+      </w:r>
+      <w:r>
+        <w:t>r</w:t>
+      </w:r>
+      <w:r>
+        <w:t>en deze week:</w:t>
       </w:r>
     </w:p>
     <w:p>
@@ -2545,7 +3706,15 @@
         <w:t>je gsm</w:t>
       </w:r>
       <w:r>
-        <w:t xml:space="preserve"> gallery gebruiken)</w:t>
+        <w:t xml:space="preserve"> </w:t>
+      </w:r>
+      <w:proofErr w:type="spellStart"/>
+      <w:r>
+        <w:t>gallery</w:t>
+      </w:r>
+      <w:proofErr w:type="spellEnd"/>
+      <w:r>
+        <w:t xml:space="preserve"> gebruiken)</w:t>
       </w:r>
     </w:p>
     <w:p/>
@@ -2566,7 +3735,23 @@
     </w:p>
     <w:p>
       <w:r>
-        <w:t xml:space="preserve">Vandaag heb ik geprobeerd om een gridview toe te voegen die images bevat dat dus lijkt op een image gallery zoals uw “foto’s” app. Hierbij heb ik de </w:t>
+        <w:t xml:space="preserve">Vandaag heb ik geprobeerd om een </w:t>
+      </w:r>
+      <w:proofErr w:type="spellStart"/>
+      <w:r>
+        <w:t>gridview</w:t>
+      </w:r>
+      <w:proofErr w:type="spellEnd"/>
+      <w:r>
+        <w:t xml:space="preserve"> toe te voegen die images bevat dat dus lijkt op een image </w:t>
+      </w:r>
+      <w:proofErr w:type="spellStart"/>
+      <w:r>
+        <w:t>gallery</w:t>
+      </w:r>
+      <w:proofErr w:type="spellEnd"/>
+      <w:r>
+        <w:t xml:space="preserve"> zoals uw “foto’s” app. Hierbij heb ik de </w:t>
       </w:r>
       <w:r>
         <w:t>volgende</w:t>
@@ -2611,7 +3796,15 @@
     </w:p>
     <w:p>
       <w:r>
-        <w:t>Dit heeft nog niet direct resultaat gegeven, maar de GridAdapter class geeft een gevoel dat ik wel op de goeie weg zit.</w:t>
+        <w:t xml:space="preserve">Dit heeft nog niet direct resultaat gegeven, maar de </w:t>
+      </w:r>
+      <w:proofErr w:type="spellStart"/>
+      <w:r>
+        <w:t>GridAdapter</w:t>
+      </w:r>
+      <w:proofErr w:type="spellEnd"/>
+      <w:r>
+        <w:t xml:space="preserve"> class geeft een gevoel dat ik wel op de goeie weg zit.</w:t>
       </w:r>
     </w:p>
     <w:p/>
@@ -2632,7 +3825,31 @@
     </w:p>
     <w:p>
       <w:r>
-        <w:t>Na de GridAdapter klasse te controleren ontdekte ik dat ik gewoon het verkeerd image Id doorgegeven heb. Dit heeft het probleem onmiddellijk gefixed als zijn de voorbeeld images niet echt mooi gepositioneerd.</w:t>
+        <w:t xml:space="preserve">Na de </w:t>
+      </w:r>
+      <w:proofErr w:type="spellStart"/>
+      <w:r>
+        <w:t>GridAdapter</w:t>
+      </w:r>
+      <w:proofErr w:type="spellEnd"/>
+      <w:r>
+        <w:t xml:space="preserve"> klasse te controleren ontdekte ik dat ik gewoon het verkeerd image </w:t>
+      </w:r>
+      <w:proofErr w:type="spellStart"/>
+      <w:r>
+        <w:t>Id</w:t>
+      </w:r>
+      <w:proofErr w:type="spellEnd"/>
+      <w:r>
+        <w:t xml:space="preserve"> doorgegeven heb. Dit heeft het probleem onmiddellijk </w:t>
+      </w:r>
+      <w:proofErr w:type="spellStart"/>
+      <w:r>
+        <w:t>gefixed</w:t>
+      </w:r>
+      <w:proofErr w:type="spellEnd"/>
+      <w:r>
+        <w:t xml:space="preserve"> als zijn de voorbeeld images niet echt mooi gepositioneerd.</w:t>
       </w:r>
     </w:p>
     <w:p>
@@ -2686,7 +3903,15 @@
         <w:t>gedetailleerd</w:t>
       </w:r>
       <w:r>
-        <w:t xml:space="preserve"> tutorial gevolgd hoe je met een gridview kan werken:</w:t>
+        <w:t xml:space="preserve"> tutorial gevolgd hoe je met een </w:t>
+      </w:r>
+      <w:proofErr w:type="spellStart"/>
+      <w:r>
+        <w:t>gridview</w:t>
+      </w:r>
+      <w:proofErr w:type="spellEnd"/>
+      <w:r>
+        <w:t xml:space="preserve"> kan werken:</w:t>
       </w:r>
     </w:p>
     <w:p>
@@ -2701,10 +3926,63 @@
     </w:p>
     <w:p>
       <w:r>
-        <w:t xml:space="preserve">Daarna heb ik er nog voor gezorgd dat de margin top en bottom via java code worden aangepast afhankelijk van de </w:t>
-      </w:r>
-      <w:r>
-        <w:t>hoogte van de header en footer. Dit werdt gedaan in OnCreateView():</w:t>
+        <w:t xml:space="preserve">Daarna heb ik er nog voor gezorgd dat de </w:t>
+      </w:r>
+      <w:proofErr w:type="spellStart"/>
+      <w:r>
+        <w:t>margin</w:t>
+      </w:r>
+      <w:proofErr w:type="spellEnd"/>
+      <w:r>
+        <w:t xml:space="preserve"> top en </w:t>
+      </w:r>
+      <w:proofErr w:type="spellStart"/>
+      <w:r>
+        <w:t>bottom</w:t>
+      </w:r>
+      <w:proofErr w:type="spellEnd"/>
+      <w:r>
+        <w:t xml:space="preserve"> via </w:t>
+      </w:r>
+      <w:proofErr w:type="spellStart"/>
+      <w:r>
+        <w:t>java</w:t>
+      </w:r>
+      <w:proofErr w:type="spellEnd"/>
+      <w:r>
+        <w:t xml:space="preserve"> code worden aangepast afhankelijk van de </w:t>
+      </w:r>
+      <w:r>
+        <w:t xml:space="preserve">hoogte van de header en </w:t>
+      </w:r>
+      <w:proofErr w:type="spellStart"/>
+      <w:r>
+        <w:t>footer</w:t>
+      </w:r>
+      <w:proofErr w:type="spellEnd"/>
+      <w:r>
+        <w:t xml:space="preserve">. Dit </w:t>
+      </w:r>
+      <w:proofErr w:type="spellStart"/>
+      <w:r>
+        <w:t>werdt</w:t>
+      </w:r>
+      <w:proofErr w:type="spellEnd"/>
+      <w:r>
+        <w:t xml:space="preserve"> gedaan in </w:t>
+      </w:r>
+      <w:proofErr w:type="spellStart"/>
+      <w:proofErr w:type="gramStart"/>
+      <w:r>
+        <w:t>OnCreateView</w:t>
+      </w:r>
+      <w:proofErr w:type="spellEnd"/>
+      <w:r>
+        <w:t>(</w:t>
+      </w:r>
+      <w:proofErr w:type="gramEnd"/>
+      <w:r>
+        <w:t>):</w:t>
       </w:r>
     </w:p>
     <w:p>
@@ -2752,13 +4030,66 @@
     </w:p>
     <w:p>
       <w:r>
-        <w:t>Ik heb dan de elementen een witte achtergrond gegeven en dan een border rond gedaan dat eigenlijk vrij moeilijk en inefficiënt moet worden opgeroepen in android studio door middel van een &lt;shape&gt; xml file te maken in de res/drawable folder en die een stroke</w:t>
-      </w:r>
+        <w:t xml:space="preserve">Ik heb dan de elementen een witte achtergrond gegeven en dan een border rond gedaan dat eigenlijk vrij moeilijk en inefficiënt moet worden opgeroepen in </w:t>
+      </w:r>
+      <w:proofErr w:type="spellStart"/>
+      <w:r>
+        <w:t>android</w:t>
+      </w:r>
+      <w:proofErr w:type="spellEnd"/>
+      <w:r>
+        <w:t xml:space="preserve"> studio door middel van een &lt;</w:t>
+      </w:r>
+      <w:proofErr w:type="spellStart"/>
+      <w:r>
+        <w:t>shape</w:t>
+      </w:r>
+      <w:proofErr w:type="spellEnd"/>
+      <w:r>
+        <w:t xml:space="preserve">&gt; </w:t>
+      </w:r>
+      <w:proofErr w:type="spellStart"/>
+      <w:r>
+        <w:t>xml</w:t>
+      </w:r>
+      <w:proofErr w:type="spellEnd"/>
+      <w:r>
+        <w:t xml:space="preserve"> file te maken in de </w:t>
+      </w:r>
+      <w:proofErr w:type="spellStart"/>
+      <w:r>
+        <w:t>res</w:t>
+      </w:r>
+      <w:proofErr w:type="spellEnd"/>
+      <w:r>
+        <w:t>/</w:t>
+      </w:r>
+      <w:proofErr w:type="spellStart"/>
+      <w:r>
+        <w:t>drawable</w:t>
+      </w:r>
+      <w:proofErr w:type="spellEnd"/>
+      <w:r>
+        <w:t xml:space="preserve"> folder en die een </w:t>
+      </w:r>
+      <w:proofErr w:type="spellStart"/>
+      <w:r>
+        <w:t>stroke</w:t>
+      </w:r>
+      <w:proofErr w:type="spellEnd"/>
       <w:r>
         <w:t>, enzoverder</w:t>
       </w:r>
       <w:r>
-        <w:t xml:space="preserve"> te geven. Dan wordt deze drawable als achtergrond geplaatst van de imageview.</w:t>
+        <w:t xml:space="preserve"> te geven. Dan wordt deze </w:t>
+      </w:r>
+      <w:proofErr w:type="spellStart"/>
+      <w:r>
+        <w:t>drawable</w:t>
+      </w:r>
+      <w:proofErr w:type="spellEnd"/>
+      <w:r>
+        <w:t xml:space="preserve"> als achtergrond geplaatst van de imageview.</w:t>
       </w:r>
       <w:r>
         <w:t xml:space="preserve"> De lege elementen zijn gewoon witte icoontjes die dus niet zichtbaar zijn door de witte achtergrond.</w:t>
@@ -2809,7 +4140,23 @@
     <w:p/>
     <w:p>
       <w:r>
-        <w:t>Om te eindigen, moest ik nog de images van firebase toevoegen hierbij heb ik vooral code van stackoverflow gebruikt om mijn oude klassen en methods te verbeteren.</w:t>
+        <w:t xml:space="preserve">Om te eindigen, moest ik nog de images van </w:t>
+      </w:r>
+      <w:proofErr w:type="spellStart"/>
+      <w:r>
+        <w:t>firebase</w:t>
+      </w:r>
+      <w:proofErr w:type="spellEnd"/>
+      <w:r>
+        <w:t xml:space="preserve"> toevoegen hierbij heb ik vooral code van stackoverflow gebruikt om mijn oude klassen en </w:t>
+      </w:r>
+      <w:proofErr w:type="spellStart"/>
+      <w:r>
+        <w:t>methods</w:t>
+      </w:r>
+      <w:proofErr w:type="spellEnd"/>
+      <w:r>
+        <w:t xml:space="preserve"> te verbeteren.</w:t>
       </w:r>
     </w:p>
     <w:p>
@@ -2906,14 +4253,83 @@
     </w:p>
     <w:p>
       <w:r>
-        <w:t xml:space="preserve">Ik had een image asset toegevoegd dat dus er voor zorgde dat de oude logo files worden vervangen. Hierbij heb een logo afbeelding als foreground en een transparant afbeelding als background. Maar dit wou niet helemaal werken door adaptive icon en legacy optie. De app als het om mijn emulator </w:t>
+        <w:t xml:space="preserve">Ik had een image asset toegevoegd dat dus </w:t>
+      </w:r>
+      <w:proofErr w:type="gramStart"/>
+      <w:r>
+        <w:t>er voor</w:t>
+      </w:r>
+      <w:proofErr w:type="gramEnd"/>
+      <w:r>
+        <w:t xml:space="preserve"> zorgde dat de oude logo files worden vervangen. Hierbij heb een logo afbeelding als </w:t>
+      </w:r>
+      <w:proofErr w:type="spellStart"/>
+      <w:r>
+        <w:t>foreground</w:t>
+      </w:r>
+      <w:proofErr w:type="spellEnd"/>
+      <w:r>
+        <w:t xml:space="preserve"> en een transparant afbeelding als background. Maar dit wou niet helemaal werken door </w:t>
+      </w:r>
+      <w:proofErr w:type="spellStart"/>
+      <w:r>
+        <w:t>adaptive</w:t>
+      </w:r>
+      <w:proofErr w:type="spellEnd"/>
+      <w:r>
+        <w:t xml:space="preserve"> icon en </w:t>
+      </w:r>
+      <w:proofErr w:type="spellStart"/>
+      <w:r>
+        <w:t>legacy</w:t>
+      </w:r>
+      <w:proofErr w:type="spellEnd"/>
+      <w:r>
+        <w:t xml:space="preserve"> optie. De app als het om mijn emulator </w:t>
       </w:r>
       <w:r>
         <w:lastRenderedPageBreak/>
-        <w:t>staat kreeg een zwarte achtergrond omdat transparant niet bestaat bij adaptive icons. Dus wat ik gedaan had was het gewoon op legacy only</w:t>
-      </w:r>
-      <w:r>
-        <w:t xml:space="preserve"> optie zetten waar ik gewoon eigenlijk de background kan weghalen door de shape als cirkel aan te duiden</w:t>
+        <w:t xml:space="preserve">staat kreeg een zwarte achtergrond omdat transparant niet bestaat bij </w:t>
+      </w:r>
+      <w:proofErr w:type="spellStart"/>
+      <w:r>
+        <w:t>adaptive</w:t>
+      </w:r>
+      <w:proofErr w:type="spellEnd"/>
+      <w:r>
+        <w:t xml:space="preserve"> </w:t>
+      </w:r>
+      <w:proofErr w:type="spellStart"/>
+      <w:r>
+        <w:t>icons</w:t>
+      </w:r>
+      <w:proofErr w:type="spellEnd"/>
+      <w:r>
+        <w:t xml:space="preserve">. Dus wat ik gedaan had was het gewoon op </w:t>
+      </w:r>
+      <w:proofErr w:type="spellStart"/>
+      <w:r>
+        <w:t>legacy</w:t>
+      </w:r>
+      <w:proofErr w:type="spellEnd"/>
+      <w:r>
+        <w:t xml:space="preserve"> </w:t>
+      </w:r>
+      <w:proofErr w:type="spellStart"/>
+      <w:r>
+        <w:t>only</w:t>
+      </w:r>
+      <w:proofErr w:type="spellEnd"/>
+      <w:r>
+        <w:t xml:space="preserve"> optie zetten waar ik gewoon eigenlijk de background kan weghalen door de </w:t>
+      </w:r>
+      <w:proofErr w:type="spellStart"/>
+      <w:r>
+        <w:t>shape</w:t>
+      </w:r>
+      <w:proofErr w:type="spellEnd"/>
+      <w:r>
+        <w:t xml:space="preserve"> als cirkel aan te duiden</w:t>
       </w:r>
       <w:r>
         <w:t>.</w:t>
@@ -2979,7 +4395,31 @@
     </w:p>
     <w:p>
       <w:r>
-        <w:t>Vandaag heb ik ervoor gezorgd dat ik image van uw gsm gallery kan uploaden. Hierbij dacht ik eerst dat automatisch de gallery die klaarstaat in de camera app kon gebruiken zoals bij facebook messenger, maar bestaat niet echt blijkbaar. Ik heb hiervoor zelfs een vraag gesteld op stackoverflow.</w:t>
+        <w:t xml:space="preserve">Vandaag heb ik ervoor gezorgd dat ik image van uw gsm </w:t>
+      </w:r>
+      <w:proofErr w:type="spellStart"/>
+      <w:r>
+        <w:t>gallery</w:t>
+      </w:r>
+      <w:proofErr w:type="spellEnd"/>
+      <w:r>
+        <w:t xml:space="preserve"> kan uploaden. Hierbij dacht ik eerst dat automatisch de </w:t>
+      </w:r>
+      <w:proofErr w:type="spellStart"/>
+      <w:r>
+        <w:t>gallery</w:t>
+      </w:r>
+      <w:proofErr w:type="spellEnd"/>
+      <w:r>
+        <w:t xml:space="preserve"> die klaarstaat in de camera app kon gebruiken zoals bij facebook </w:t>
+      </w:r>
+      <w:proofErr w:type="spellStart"/>
+      <w:r>
+        <w:t>messenger</w:t>
+      </w:r>
+      <w:proofErr w:type="spellEnd"/>
+      <w:r>
+        <w:t>, maar bestaat niet echt blijkbaar. Ik heb hiervoor zelfs een vraag gesteld op stackoverflow.</w:t>
       </w:r>
     </w:p>
     <w:p>
@@ -2994,7 +4434,39 @@
     </w:p>
     <w:p>
       <w:r>
-        <w:t xml:space="preserve">Uiteindelijk heb ik gewoon besloten om de camera en gallery op te splitsen en te kunnen openen in popup keuze menu. De code voor de gallery functionaliteiten </w:t>
+        <w:t xml:space="preserve">Uiteindelijk heb ik gewoon besloten om de camera en </w:t>
+      </w:r>
+      <w:proofErr w:type="spellStart"/>
+      <w:r>
+        <w:t>gallery</w:t>
+      </w:r>
+      <w:proofErr w:type="spellEnd"/>
+      <w:r>
+        <w:t xml:space="preserve"> op te splitsen en te kunnen openen in </w:t>
+      </w:r>
+      <w:proofErr w:type="spellStart"/>
+      <w:r>
+        <w:t>popup</w:t>
+      </w:r>
+      <w:proofErr w:type="spellEnd"/>
+      <w:r>
+        <w:t xml:space="preserve"> </w:t>
+      </w:r>
+      <w:proofErr w:type="gramStart"/>
+      <w:r>
+        <w:t>keuze menu</w:t>
+      </w:r>
+      <w:proofErr w:type="gramEnd"/>
+      <w:r>
+        <w:t xml:space="preserve">. De code voor de </w:t>
+      </w:r>
+      <w:proofErr w:type="spellStart"/>
+      <w:r>
+        <w:t>gallery</w:t>
+      </w:r>
+      <w:proofErr w:type="spellEnd"/>
+      <w:r>
+        <w:t xml:space="preserve"> functionaliteiten </w:t>
       </w:r>
       <w:r>
         <w:t>is</w:t>
@@ -3063,7 +4535,13 @@
         <w:pStyle w:val="Kop3"/>
       </w:pPr>
       <w:r>
-        <w:t>Wat ik wil realiseen deze week:</w:t>
+        <w:t>Wat ik wil realise</w:t>
+      </w:r>
+      <w:r>
+        <w:t>r</w:t>
+      </w:r>
+      <w:r>
+        <w:t>en deze week:</w:t>
       </w:r>
     </w:p>
     <w:p>
@@ -3087,7 +4565,23 @@
         </w:numPr>
       </w:pPr>
       <w:r>
-        <w:t>Vragen dat het ok is om je image te compressen (quality verlies?)</w:t>
+        <w:t xml:space="preserve">Vragen dat het ok is om je image te </w:t>
+      </w:r>
+      <w:proofErr w:type="spellStart"/>
+      <w:r>
+        <w:t>compressen</w:t>
+      </w:r>
+      <w:proofErr w:type="spellEnd"/>
+      <w:r>
+        <w:t xml:space="preserve"> (</w:t>
+      </w:r>
+      <w:proofErr w:type="spellStart"/>
+      <w:r>
+        <w:t>quality</w:t>
+      </w:r>
+      <w:proofErr w:type="spellEnd"/>
+      <w:r>
+        <w:t xml:space="preserve"> verlies?)</w:t>
       </w:r>
     </w:p>
     <w:p>
@@ -3099,8 +4593,21 @@
         </w:numPr>
       </w:pPr>
       <w:r>
-        <w:t>Image van de gridview kunnen openen in full size</w:t>
-      </w:r>
+        <w:t xml:space="preserve">Image van de </w:t>
+      </w:r>
+      <w:proofErr w:type="spellStart"/>
+      <w:r>
+        <w:t>gridview</w:t>
+      </w:r>
+      <w:proofErr w:type="spellEnd"/>
+      <w:r>
+        <w:t xml:space="preserve"> kunnen openen in full </w:t>
+      </w:r>
+      <w:proofErr w:type="spellStart"/>
+      <w:r>
+        <w:t>size</w:t>
+      </w:r>
+      <w:proofErr w:type="spellEnd"/>
     </w:p>
     <w:p>
       <w:pPr>
@@ -3111,7 +4618,15 @@
         </w:numPr>
       </w:pPr>
       <w:r>
-        <w:t>App op google playstore plaatsen!!</w:t>
+        <w:t xml:space="preserve">App op google </w:t>
+      </w:r>
+      <w:proofErr w:type="spellStart"/>
+      <w:r>
+        <w:t>playstore</w:t>
+      </w:r>
+      <w:proofErr w:type="spellEnd"/>
+      <w:r>
+        <w:t xml:space="preserve"> plaatsen!!</w:t>
       </w:r>
     </w:p>
     <w:p>
@@ -3122,8 +4637,13 @@
           <w:numId w:val="2"/>
         </w:numPr>
       </w:pPr>
-      <w:r>
-        <w:t>Offfline functionaliteiten toevoegen?</w:t>
+      <w:proofErr w:type="spellStart"/>
+      <w:r>
+        <w:t>Offfline</w:t>
+      </w:r>
+      <w:proofErr w:type="spellEnd"/>
+      <w:r>
+        <w:t xml:space="preserve"> functionaliteiten toevoegen?</w:t>
       </w:r>
     </w:p>
     <w:p/>
@@ -3144,16 +4664,82 @@
     </w:p>
     <w:p>
       <w:r>
-        <w:t xml:space="preserve">Vandaag wou ik beginnen met het uploaden van mijn app op google play maar toen ik tutorial volgde moest ik eerst mijn app package name veranderen want com.example is niet correct. Toen ik dat veranderen </w:t>
-      </w:r>
-      <w:r>
-        <w:t>werkte de google services niet meer want de package name was com.example in de google-services.json file. Dus ik moest mijn app in firebase opnieuw maken dat niet echt moeilijk was.</w:t>
-      </w:r>
-      <w:r>
-        <w:t xml:space="preserve"> Daarna heb ik een android app bundle aangemaakt want dit is nodig voor de release.</w:t>
-      </w:r>
-      <w:r>
-        <w:t xml:space="preserve"> Ze vroeg dan om developer account aan te maken waarbij ik 1 keer 25 euro moest betalen. Daarbij was ik effe gestopt want mijn ouders waren niet thuis voor een mastercard te gebruiken.</w:t>
+        <w:t xml:space="preserve">Vandaag wou ik beginnen met het uploaden van mijn app op google </w:t>
+      </w:r>
+      <w:proofErr w:type="spellStart"/>
+      <w:r>
+        <w:t>play</w:t>
+      </w:r>
+      <w:proofErr w:type="spellEnd"/>
+      <w:r>
+        <w:t xml:space="preserve"> maar toen ik tutorial volgde moest ik eerst mijn app package name veranderen want </w:t>
+      </w:r>
+      <w:proofErr w:type="spellStart"/>
+      <w:r>
+        <w:t>com.example</w:t>
+      </w:r>
+      <w:proofErr w:type="spellEnd"/>
+      <w:r>
+        <w:t xml:space="preserve"> is niet correct. Toen ik dat veranderen </w:t>
+      </w:r>
+      <w:r>
+        <w:t xml:space="preserve">werkte de google services niet meer want de package name was </w:t>
+      </w:r>
+      <w:proofErr w:type="spellStart"/>
+      <w:r>
+        <w:t>com.example</w:t>
+      </w:r>
+      <w:proofErr w:type="spellEnd"/>
+      <w:r>
+        <w:t xml:space="preserve"> in de google-</w:t>
+      </w:r>
+      <w:proofErr w:type="spellStart"/>
+      <w:proofErr w:type="gramStart"/>
+      <w:r>
+        <w:t>services.json</w:t>
+      </w:r>
+      <w:proofErr w:type="spellEnd"/>
+      <w:proofErr w:type="gramEnd"/>
+      <w:r>
+        <w:t xml:space="preserve"> file. Dus ik moest mijn app in </w:t>
+      </w:r>
+      <w:proofErr w:type="spellStart"/>
+      <w:r>
+        <w:t>firebase</w:t>
+      </w:r>
+      <w:proofErr w:type="spellEnd"/>
+      <w:r>
+        <w:t xml:space="preserve"> opnieuw maken dat niet echt moeilijk was.</w:t>
+      </w:r>
+      <w:r>
+        <w:t xml:space="preserve"> Daarna heb ik een </w:t>
+      </w:r>
+      <w:proofErr w:type="spellStart"/>
+      <w:r>
+        <w:t>android</w:t>
+      </w:r>
+      <w:proofErr w:type="spellEnd"/>
+      <w:r>
+        <w:t xml:space="preserve"> app </w:t>
+      </w:r>
+      <w:proofErr w:type="spellStart"/>
+      <w:r>
+        <w:t>bundle</w:t>
+      </w:r>
+      <w:proofErr w:type="spellEnd"/>
+      <w:r>
+        <w:t xml:space="preserve"> aangemaakt want dit is nodig voor de release.</w:t>
+      </w:r>
+      <w:r>
+        <w:t xml:space="preserve"> Ze vroeg dan om </w:t>
+      </w:r>
+      <w:proofErr w:type="spellStart"/>
+      <w:r>
+        <w:t>developer</w:t>
+      </w:r>
+      <w:proofErr w:type="spellEnd"/>
+      <w:r>
+        <w:t xml:space="preserve"> account aan te maken waarbij ik 1 keer 25 euro moest betalen. Daarbij was ik effe gestopt want mijn ouders waren niet thuis voor een mastercard te gebruiken.</w:t>
       </w:r>
     </w:p>
     <w:p>
@@ -3230,7 +4816,15 @@
     </w:p>
     <w:p>
       <w:r>
-        <w:t>In de avond heb ik dan mijn developer account aangemaakt.</w:t>
+        <w:t xml:space="preserve">In de avond heb ik dan mijn </w:t>
+      </w:r>
+      <w:proofErr w:type="spellStart"/>
+      <w:r>
+        <w:t>developer</w:t>
+      </w:r>
+      <w:proofErr w:type="spellEnd"/>
+      <w:r>
+        <w:t xml:space="preserve"> account aangemaakt.</w:t>
       </w:r>
     </w:p>
     <w:p/>
@@ -3254,7 +4848,23 @@
         <w:t>Vandaag ben ik effe kort begonnen met het beter beveiligen van het wachtwoord om te registeren en in te loggen</w:t>
       </w:r>
       <w:r>
-        <w:t xml:space="preserve">. Hierbij vraag ik dus dat het wachtwoord een kleine letter, grote letter, geen spaties, 1 nummer en een lengte van 8 tekens heeft. Dit wordt weergegeven als een error onder de wachtwoord textbox. Het email wordt dankzij firebase al gevalideerd dat het correct is, dus ik moet zelf geen error toevoegen. </w:t>
+        <w:t xml:space="preserve">. Hierbij vraag ik dus dat het wachtwoord een kleine letter, grote letter, geen spaties, 1 nummer en een lengte van 8 tekens heeft. Dit wordt weergegeven als een error onder de wachtwoord </w:t>
+      </w:r>
+      <w:proofErr w:type="spellStart"/>
+      <w:r>
+        <w:t>textbox</w:t>
+      </w:r>
+      <w:proofErr w:type="spellEnd"/>
+      <w:r>
+        <w:t xml:space="preserve">. Het email wordt dankzij </w:t>
+      </w:r>
+      <w:proofErr w:type="spellStart"/>
+      <w:r>
+        <w:t>firebase</w:t>
+      </w:r>
+      <w:proofErr w:type="spellEnd"/>
+      <w:r>
+        <w:t xml:space="preserve"> al gevalideerd dat het correct is, dus ik moet zelf geen error toevoegen. </w:t>
       </w:r>
       <w:r>
         <w:t>Maar er wordt wel een toast bericht voor de zekerheid weergegeven vanonder als de registratie mislukt</w:t>
@@ -3265,13 +4875,45 @@
     </w:p>
     <w:p>
       <w:r>
-        <w:t xml:space="preserve">Daarna heb ik de app bundle </w:t>
+        <w:t xml:space="preserve">Daarna heb ik de app </w:t>
+      </w:r>
+      <w:proofErr w:type="spellStart"/>
+      <w:r>
+        <w:t>bundle</w:t>
+      </w:r>
+      <w:proofErr w:type="spellEnd"/>
+      <w:r>
+        <w:t xml:space="preserve"> </w:t>
       </w:r>
       <w:r>
         <w:t>geüpdatet</w:t>
       </w:r>
       <w:r>
-        <w:t xml:space="preserve"> naar de volgende versie, omdat er aanpassingen waren. Deze release heb ik dan op google play console geüpload, hierbij moest ik nog in de dashboard veel taken afleggen. De belangrijksten waren bijvoorbeeld een test account meegeven zodat google dit kan gebruiken om mijn app te controleren, een privacybeleid toevoegen hi</w:t>
+        <w:t xml:space="preserve"> naar de volgende versie, omdat er aanpassingen waren. Deze release heb ik dan op google </w:t>
+      </w:r>
+      <w:proofErr w:type="spellStart"/>
+      <w:r>
+        <w:t>play</w:t>
+      </w:r>
+      <w:proofErr w:type="spellEnd"/>
+      <w:r>
+        <w:t xml:space="preserve"> console geüpload, hierbij moest ik nog in </w:t>
+      </w:r>
+      <w:proofErr w:type="gramStart"/>
+      <w:r>
+        <w:t>de dashboard</w:t>
+      </w:r>
+      <w:proofErr w:type="gramEnd"/>
+      <w:r>
+        <w:t xml:space="preserve"> veel taken afleggen. De belangrijksten waren bijvoorbeeld een test account meegeven zodat google dit kan gebruiken om mijn app te controleren, een </w:t>
+      </w:r>
+      <w:proofErr w:type="spellStart"/>
+      <w:r>
+        <w:t>privacybeleid</w:t>
+      </w:r>
+      <w:proofErr w:type="spellEnd"/>
+      <w:r>
+        <w:t xml:space="preserve"> toevoegen hi</w:t>
       </w:r>
       <w:r>
         <w:t>er</w:t>
@@ -3323,13 +4965,77 @@
     </w:p>
     <w:p>
       <w:r>
-        <w:t xml:space="preserve">Hierbij had vooral deze youtube video nodig omdat ik de uri van de image die ik aan klik moest doorsturen naar het een fragment waar je de img in het groot kan bekijken. </w:t>
-      </w:r>
-      <w:r>
-        <w:t>Ik maakte toen een keer grote fout door een nieuwe imageDetailsFragment te openen als ik eigenlijk een bundle (waar de uri wordt opgeslagen)</w:t>
-      </w:r>
-      <w:r>
-        <w:t xml:space="preserve"> had toegevoegd aan een ImageDetailsFragment als arguments. Ik navigeerde eigenlijk naar een fragment zonder argumenten die hard nodig had. Dit heb ik natuurlijk opgelost</w:t>
+        <w:t xml:space="preserve">Hierbij had vooral deze </w:t>
+      </w:r>
+      <w:proofErr w:type="spellStart"/>
+      <w:r>
+        <w:t>youtube</w:t>
+      </w:r>
+      <w:proofErr w:type="spellEnd"/>
+      <w:r>
+        <w:t xml:space="preserve"> video nodig omdat ik de </w:t>
+      </w:r>
+      <w:proofErr w:type="spellStart"/>
+      <w:r>
+        <w:t>uri</w:t>
+      </w:r>
+      <w:proofErr w:type="spellEnd"/>
+      <w:r>
+        <w:t xml:space="preserve"> van de image die ik aan klik moest doorsturen naar het een fragment waar je de </w:t>
+      </w:r>
+      <w:proofErr w:type="spellStart"/>
+      <w:r>
+        <w:t>img</w:t>
+      </w:r>
+      <w:proofErr w:type="spellEnd"/>
+      <w:r>
+        <w:t xml:space="preserve"> in het groot kan bekijken. </w:t>
+      </w:r>
+      <w:r>
+        <w:t xml:space="preserve">Ik maakte toen een keer grote fout door een nieuwe </w:t>
+      </w:r>
+      <w:proofErr w:type="spellStart"/>
+      <w:r>
+        <w:t>imageDetailsFragment</w:t>
+      </w:r>
+      <w:proofErr w:type="spellEnd"/>
+      <w:r>
+        <w:t xml:space="preserve"> te openen als ik eigenlijk een </w:t>
+      </w:r>
+      <w:proofErr w:type="spellStart"/>
+      <w:r>
+        <w:t>bundle</w:t>
+      </w:r>
+      <w:proofErr w:type="spellEnd"/>
+      <w:r>
+        <w:t xml:space="preserve"> (waar de </w:t>
+      </w:r>
+      <w:proofErr w:type="spellStart"/>
+      <w:r>
+        <w:t>uri</w:t>
+      </w:r>
+      <w:proofErr w:type="spellEnd"/>
+      <w:r>
+        <w:t xml:space="preserve"> wordt opgeslagen)</w:t>
+      </w:r>
+      <w:r>
+        <w:t xml:space="preserve"> had toegevoegd aan een </w:t>
+      </w:r>
+      <w:proofErr w:type="spellStart"/>
+      <w:r>
+        <w:t>ImageDetailsFragment</w:t>
+      </w:r>
+      <w:proofErr w:type="spellEnd"/>
+      <w:r>
+        <w:t xml:space="preserve"> als </w:t>
+      </w:r>
+      <w:proofErr w:type="spellStart"/>
+      <w:r>
+        <w:t>arguments</w:t>
+      </w:r>
+      <w:proofErr w:type="spellEnd"/>
+      <w:r>
+        <w:t>. Ik navigeerde eigenlijk naar een fragment zonder argumenten die hard nodig had. Dit heb ik natuurlijk opgelost</w:t>
       </w:r>
       <w:r>
         <w:t xml:space="preserve"> zie onderstaande </w:t>
@@ -3343,7 +5049,15 @@
     </w:p>
     <w:p>
       <w:r>
-        <w:t>Het enige probleempje dat er nog is, is dat sommige afbeeldingen die vergroot worden onscherm kunnen uitzien.</w:t>
+        <w:t xml:space="preserve">Het enige probleempje dat er nog is, is dat sommige afbeeldingen die vergroot worden </w:t>
+      </w:r>
+      <w:proofErr w:type="spellStart"/>
+      <w:r>
+        <w:t>onscherm</w:t>
+      </w:r>
+      <w:proofErr w:type="spellEnd"/>
+      <w:r>
+        <w:t xml:space="preserve"> kunnen uitzien.</w:t>
       </w:r>
       <w:r>
         <w:t xml:space="preserve"> </w:t>
@@ -3402,6 +5116,144 @@
         </w:drawing>
       </w:r>
     </w:p>
+    <w:p/>
+    <w:p/>
+    <w:p>
+      <w:pPr>
+        <w:rPr>
+          <w:b/>
+          <w:bCs/>
+        </w:rPr>
+      </w:pPr>
+      <w:r>
+        <w:rPr>
+          <w:b/>
+          <w:bCs/>
+        </w:rPr>
+        <w:t>28/11/2021:</w:t>
+      </w:r>
+    </w:p>
+    <w:p>
+      <w:r>
+        <w:t xml:space="preserve">Vandaag heb ik een </w:t>
+      </w:r>
+      <w:proofErr w:type="spellStart"/>
+      <w:r>
+        <w:t>realtime</w:t>
+      </w:r>
+      <w:proofErr w:type="spellEnd"/>
+      <w:r>
+        <w:t xml:space="preserve"> database aangemaakt om een chat functionaliteiten toe te voegen.</w:t>
+      </w:r>
+      <w:r>
+        <w:t xml:space="preserve"> Hierbij ga ik de volgende video’s gebruiken:</w:t>
+      </w:r>
+    </w:p>
+    <w:p>
+      <w:hyperlink r:id="rId62" w:history="1">
+        <w:r>
+          <w:rPr>
+            <w:rStyle w:val="Hyperlink"/>
+          </w:rPr>
+          <w:t>https://www.youtube.com/watch?v=eizfx5lRE4M&amp;list=PLxefhmF0pcPmtdoud8f64EpgapkclCllj&amp;index=12</w:t>
+        </w:r>
+      </w:hyperlink>
+    </w:p>
+    <w:p>
+      <w:r>
+        <w:t>Ik heb dan geprobeerd om een account aan toe te voegen, maar dit wil nog niet helemaal werken.</w:t>
+      </w:r>
+    </w:p>
+    <w:p>
+      <w:r>
+        <w:rPr>
+          <w:noProof/>
+        </w:rPr>
+        <w:drawing>
+          <wp:inline distT="0" distB="0" distL="0" distR="0" wp14:anchorId="4ABFF557" wp14:editId="30E95893">
+            <wp:extent cx="5760720" cy="3079750"/>
+            <wp:effectExtent l="0" t="0" r="0" b="6350"/>
+            <wp:docPr id="29" name="Afbeelding 29"/>
+            <wp:cNvGraphicFramePr>
+              <a:graphicFrameLocks xmlns:a="http://schemas.openxmlformats.org/drawingml/2006/main" noChangeAspect="1"/>
+            </wp:cNvGraphicFramePr>
+            <a:graphic xmlns:a="http://schemas.openxmlformats.org/drawingml/2006/main">
+              <a:graphicData uri="http://schemas.openxmlformats.org/drawingml/2006/picture">
+                <pic:pic xmlns:pic="http://schemas.openxmlformats.org/drawingml/2006/picture">
+                  <pic:nvPicPr>
+                    <pic:cNvPr id="1" name=""/>
+                    <pic:cNvPicPr/>
+                  </pic:nvPicPr>
+                  <pic:blipFill>
+                    <a:blip r:embed="rId63"/>
+                    <a:stretch>
+                      <a:fillRect/>
+                    </a:stretch>
+                  </pic:blipFill>
+                  <pic:spPr>
+                    <a:xfrm>
+                      <a:off x="0" y="0"/>
+                      <a:ext cx="5760720" cy="3079750"/>
+                    </a:xfrm>
+                    <a:prstGeom prst="rect">
+                      <a:avLst/>
+                    </a:prstGeom>
+                  </pic:spPr>
+                </pic:pic>
+              </a:graphicData>
+            </a:graphic>
+          </wp:inline>
+        </w:drawing>
+      </w:r>
+    </w:p>
+    <w:p/>
+    <w:p>
+      <w:pPr>
+        <w:pStyle w:val="Kop2"/>
+      </w:pPr>
+      <w:r>
+        <w:t>Week 9</w:t>
+      </w:r>
+    </w:p>
+    <w:p>
+      <w:pPr>
+        <w:pStyle w:val="Kop3"/>
+      </w:pPr>
+      <w:r>
+        <w:t>Wat ik wil realiseren deze week:</w:t>
+      </w:r>
+    </w:p>
+    <w:p>
+      <w:pPr>
+        <w:pStyle w:val="Lijstalinea"/>
+        <w:numPr>
+          <w:ilvl w:val="0"/>
+          <w:numId w:val="2"/>
+        </w:numPr>
+      </w:pPr>
+      <w:proofErr w:type="spellStart"/>
+      <w:r>
+        <w:t>Offfline</w:t>
+      </w:r>
+      <w:proofErr w:type="spellEnd"/>
+      <w:r>
+        <w:t xml:space="preserve"> functionaliteiten toevoegen?</w:t>
+      </w:r>
+    </w:p>
+    <w:p>
+      <w:pPr>
+        <w:pStyle w:val="Lijstalinea"/>
+        <w:numPr>
+          <w:ilvl w:val="0"/>
+          <w:numId w:val="2"/>
+        </w:numPr>
+      </w:pPr>
+      <w:r>
+        <w:t>Beginnen aan Mijn groepen pagina en chat functionaliteiten.</w:t>
+      </w:r>
+    </w:p>
+    <w:p/>
+    <w:p/>
     <w:p/>
     <w:p/>
     <w:p/>

</xml_diff>

<commit_message>
Updated logboek and working on adding data to realtime database
</commit_message>
<xml_diff>
--- a/Logboek_Dries_Fierens.docx
+++ b/Logboek_Dries_Fierens.docx
@@ -46,47 +46,7 @@
         <w:t>applicatie</w:t>
       </w:r>
       <w:r>
-        <w:t xml:space="preserve"> die je kan maken en welke technologieën je kan gebruiken. Ik heb voor native gekozen want dat past het best bij mijn aftakking “Software </w:t>
-      </w:r>
-      <w:proofErr w:type="spellStart"/>
-      <w:r>
-        <w:t>developer</w:t>
-      </w:r>
-      <w:proofErr w:type="spellEnd"/>
-      <w:r>
-        <w:t xml:space="preserve">” sinds het </w:t>
-      </w:r>
-      <w:proofErr w:type="spellStart"/>
-      <w:r>
-        <w:t>java</w:t>
-      </w:r>
-      <w:proofErr w:type="spellEnd"/>
-      <w:r>
-        <w:t xml:space="preserve"> inhoudt. De anderen zijn </w:t>
-      </w:r>
-      <w:proofErr w:type="spellStart"/>
-      <w:r>
-        <w:t>hybrid</w:t>
-      </w:r>
-      <w:proofErr w:type="spellEnd"/>
-      <w:r>
-        <w:t xml:space="preserve"> en </w:t>
-      </w:r>
-      <w:proofErr w:type="spellStart"/>
-      <w:r>
-        <w:t>progressive</w:t>
-      </w:r>
-      <w:proofErr w:type="spellEnd"/>
-      <w:r>
-        <w:t xml:space="preserve"> web app dat dus meer te maken hebben met web &amp; mobile dus vooral HTML &amp; CSS. We moesten dan ook nog kiezen voor een project idee, waarbij ik koos voor een scanner + </w:t>
-      </w:r>
-      <w:proofErr w:type="gramStart"/>
-      <w:r>
-        <w:t>pdf converter</w:t>
-      </w:r>
-      <w:proofErr w:type="gramEnd"/>
-      <w:r>
-        <w:t xml:space="preserve"> app</w:t>
+        <w:t xml:space="preserve"> die je kan maken en welke technologieën je kan gebruiken. Ik heb voor native gekozen want dat past het best bij mijn aftakking “Software developer” sinds het java inhoudt. De anderen zijn hybrid en progressive web app dat dus meer te maken hebben met web &amp; mobile dus vooral HTML &amp; CSS. We moesten dan ook nog kiezen voor een project idee, waarbij ik koos voor een scanner + pdf converter app</w:t>
       </w:r>
       <w:r>
         <w:t xml:space="preserve"> waarbij het vooral bedoelt is o</w:t>
@@ -107,106 +67,26 @@
         <w:t>.</w:t>
       </w:r>
       <w:r>
-        <w:t xml:space="preserve"> Het was verplicht om 1 </w:t>
-      </w:r>
-      <w:proofErr w:type="gramStart"/>
-      <w:r>
-        <w:t>hardware component</w:t>
-      </w:r>
-      <w:proofErr w:type="gramEnd"/>
-      <w:r>
-        <w:t xml:space="preserve"> van de gsm te gebruiken dus koos ik natuurlijk voor de camera.</w:t>
+        <w:t xml:space="preserve"> Het was verplicht om 1 hardware component van de gsm te gebruiken dus koos ik natuurlijk voor de camera.</w:t>
       </w:r>
       <w:r>
         <w:t xml:space="preserve"> </w:t>
       </w:r>
       <w:r>
-        <w:t xml:space="preserve">Als </w:t>
-      </w:r>
-      <w:proofErr w:type="spellStart"/>
-      <w:r>
-        <w:t>back-end</w:t>
-      </w:r>
-      <w:proofErr w:type="spellEnd"/>
-      <w:r>
-        <w:t xml:space="preserve"> koos ik </w:t>
-      </w:r>
-      <w:proofErr w:type="spellStart"/>
-      <w:r>
-        <w:t>Firebase</w:t>
-      </w:r>
-      <w:proofErr w:type="spellEnd"/>
-      <w:r>
-        <w:t xml:space="preserve"> en als technologie koos ik in </w:t>
-      </w:r>
-      <w:proofErr w:type="spellStart"/>
-      <w:r>
-        <w:t>java</w:t>
-      </w:r>
-      <w:proofErr w:type="spellEnd"/>
-      <w:r>
-        <w:t xml:space="preserve"> te werken om een </w:t>
-      </w:r>
-      <w:proofErr w:type="spellStart"/>
-      <w:r>
-        <w:t>android</w:t>
-      </w:r>
-      <w:proofErr w:type="spellEnd"/>
-      <w:r>
-        <w:t xml:space="preserve"> app te maken in plaats van een IOS app.</w:t>
-      </w:r>
-      <w:r>
-        <w:t xml:space="preserve"> Want ik heb een </w:t>
-      </w:r>
-      <w:proofErr w:type="spellStart"/>
-      <w:r>
-        <w:t>huawei</w:t>
-      </w:r>
-      <w:proofErr w:type="spellEnd"/>
-      <w:r>
-        <w:t>.</w:t>
-      </w:r>
-    </w:p>
-    <w:p>
-      <w:r>
-        <w:t xml:space="preserve">Ik heb dit allemaal grondiger beschreven in mijn “app </w:t>
-      </w:r>
-      <w:proofErr w:type="spellStart"/>
-      <w:r>
-        <w:t>idee”.pdf</w:t>
-      </w:r>
-      <w:proofErr w:type="spellEnd"/>
-      <w:r>
-        <w:t xml:space="preserve">. Dit staat ondertussen op de </w:t>
-      </w:r>
-      <w:proofErr w:type="spellStart"/>
-      <w:r>
-        <w:t>repository</w:t>
-      </w:r>
-      <w:proofErr w:type="spellEnd"/>
-      <w:r>
-        <w:t xml:space="preserve"> die we moesten maken.</w:t>
-      </w:r>
-    </w:p>
-    <w:p>
-      <w:r>
-        <w:t xml:space="preserve">Om af te sluiten had ik al ondertussen een goede naam gevonden gebaseerd op de applicatie genaamd </w:t>
-      </w:r>
-      <w:proofErr w:type="spellStart"/>
-      <w:r>
-        <w:t>Scannable</w:t>
-      </w:r>
-      <w:proofErr w:type="spellEnd"/>
-      <w:r>
-        <w:t xml:space="preserve">. Ik heb dus besloten om mijn applicatie </w:t>
-      </w:r>
-      <w:proofErr w:type="spellStart"/>
-      <w:r>
-        <w:t>Notable</w:t>
-      </w:r>
-      <w:proofErr w:type="spellEnd"/>
-      <w:r>
-        <w:t xml:space="preserve"> te noemen.</w:t>
+        <w:t>Als back-end koos ik Firebase en als technologie koos ik in java te werken om een android app te maken in plaats van een IOS app.</w:t>
+      </w:r>
+      <w:r>
+        <w:t xml:space="preserve"> Want ik heb een huawei.</w:t>
+      </w:r>
+    </w:p>
+    <w:p>
+      <w:r>
+        <w:t>Ik heb dit allemaal grondiger beschreven in mijn “app idee”.pdf. Dit staat ondertussen op de repository die we moesten maken.</w:t>
+      </w:r>
+    </w:p>
+    <w:p>
+      <w:r>
+        <w:t>Om af te sluiten had ik al ondertussen een goede naam gevonden gebaseerd op de applicatie genaamd Scannable. Ik heb dus besloten om mijn applicatie Notable te noemen.</w:t>
       </w:r>
     </w:p>
     <w:p>
@@ -229,15 +109,7 @@
         <w:t xml:space="preserve">Mijn app idee werd niet goedgekeurd, want de leerkracht raadde het af door problemen die ervan kunnen komen. Ik moest dan vandaag een nieuw idee opstellen. </w:t>
       </w:r>
       <w:r>
-        <w:t xml:space="preserve">De scanner + </w:t>
-      </w:r>
-      <w:proofErr w:type="gramStart"/>
-      <w:r>
-        <w:t>pdf converter</w:t>
-      </w:r>
-      <w:proofErr w:type="gramEnd"/>
-      <w:r>
-        <w:t xml:space="preserve"> was duidelijk te moeilijk, maar ik besloot om het idee verder te zetten van een app die notities kan delen. Dus nu moet het gewoon foto’s trekken van de notities. Om nog toe te voegen kan ik ook opmerkingswolkjes toevoegen aan de foto voor bijvoorbeeld een fout</w:t>
+        <w:t>De scanner + pdf converter was duidelijk te moeilijk, maar ik besloot om het idee verder te zetten van een app die notities kan delen. Dus nu moet het gewoon foto’s trekken van de notities. Om nog toe te voegen kan ik ook opmerkingswolkjes toevoegen aan de foto voor bijvoorbeeld een fout</w:t>
       </w:r>
       <w:r>
         <w:t xml:space="preserve"> aan te duiden</w:t>
@@ -248,15 +120,7 @@
     </w:p>
     <w:p>
       <w:r>
-        <w:t xml:space="preserve">Daarna moest ik gewoon begin aan een UI/UX design voor mijn applicatie, waarbij nog niet veel had gedaan omdat les niet meer lang duurde. Ik moest toen ook tegelijkertijd zoeken naar </w:t>
-      </w:r>
-      <w:proofErr w:type="spellStart"/>
-      <w:r>
-        <w:t>tutorials</w:t>
-      </w:r>
-      <w:proofErr w:type="spellEnd"/>
-      <w:r>
-        <w:t xml:space="preserve"> dus </w:t>
+        <w:t xml:space="preserve">Daarna moest ik gewoon begin aan een UI/UX design voor mijn applicatie, waarbij nog niet veel had gedaan omdat les niet meer lang duurde. Ik moest toen ook tegelijkertijd zoeken naar tutorials dus </w:t>
       </w:r>
       <w:r>
         <w:t>duurde dat ook kort.</w:t>
@@ -279,26 +143,13 @@
     </w:p>
     <w:p>
       <w:r>
-        <w:t>Vandaag in de namiddag begonnen we met de co-</w:t>
-      </w:r>
-      <w:proofErr w:type="spellStart"/>
-      <w:r>
-        <w:t>working</w:t>
-      </w:r>
-      <w:proofErr w:type="spellEnd"/>
-      <w:r>
-        <w:t xml:space="preserve"> les waarbij we dus informatie kunnen delen met medeleerlingen. Al was het de eerste les dus kwam daar niet veel van. Ik begon gewoon verder aan mijn </w:t>
-      </w:r>
-      <w:proofErr w:type="spellStart"/>
+        <w:t xml:space="preserve">Vandaag in de namiddag begonnen we met de co-working les waarbij we dus informatie kunnen delen met medeleerlingen. Al was het de eerste les dus kwam daar niet veel van. Ik begon gewoon verder aan mijn </w:t>
+      </w:r>
       <w:r>
         <w:t>F</w:t>
       </w:r>
       <w:r>
-        <w:t>igma</w:t>
-      </w:r>
-      <w:proofErr w:type="spellEnd"/>
-      <w:r>
-        <w:t xml:space="preserve"> design.</w:t>
+        <w:t>igma design.</w:t>
       </w:r>
     </w:p>
     <w:p>
@@ -309,15 +160,7 @@
         <w:t>te veel</w:t>
       </w:r>
       <w:r>
-        <w:t xml:space="preserve"> naar voor moest leunen en dus </w:t>
-      </w:r>
-      <w:proofErr w:type="gramStart"/>
-      <w:r>
-        <w:t>nek pijn</w:t>
-      </w:r>
-      <w:proofErr w:type="gramEnd"/>
-      <w:r>
-        <w:t xml:space="preserve"> kreeg en er waren precies geen ramen om te openen. </w:t>
+        <w:t xml:space="preserve"> naar voor moest leunen en dus nek pijn kreeg en er waren precies geen ramen om te openen. </w:t>
       </w:r>
       <w:r>
         <w:t>Gelukkig kunnen we naar buiten wanneer we het willen.</w:t>
@@ -357,23 +200,7 @@
     </w:p>
     <w:p>
       <w:r>
-        <w:t xml:space="preserve">Vandaag heb ik verder gewerkt aan mijn </w:t>
-      </w:r>
-      <w:proofErr w:type="spellStart"/>
-      <w:r>
-        <w:t>Figma</w:t>
-      </w:r>
-      <w:proofErr w:type="spellEnd"/>
-      <w:r>
-        <w:t xml:space="preserve"> design en het ging redelijk vlot vooruit. Ik wou absoluut dat het vandaag af was zodat ik morgen kan werken aan een ander vak. Tijdens het maken van het design heb ik vooral ook zitten op zoeken dat sommige concepten wel haalbaar zijn om te programmeren. Dit is allemaal wel mogelijk, maar zal wel een </w:t>
-      </w:r>
-      <w:proofErr w:type="spellStart"/>
-      <w:r>
-        <w:t>challenge</w:t>
-      </w:r>
-      <w:proofErr w:type="spellEnd"/>
-      <w:r>
-        <w:t xml:space="preserve"> zijn zoals de opmerkingen plaatsen</w:t>
+        <w:t>Vandaag heb ik verder gewerkt aan mijn Figma design en het ging redelijk vlot vooruit. Ik wou absoluut dat het vandaag af was zodat ik morgen kan werken aan een ander vak. Tijdens het maken van het design heb ik vooral ook zitten op zoeken dat sommige concepten wel haalbaar zijn om te programmeren. Dit is allemaal wel mogelijk, maar zal wel een challenge zijn zoals de opmerkingen plaatsen</w:t>
       </w:r>
       <w:r>
         <w:t>. M</w:t>
@@ -485,48 +312,11 @@
     </w:p>
     <w:p>
       <w:r>
-        <w:t xml:space="preserve">Vandaag werd mijn </w:t>
-      </w:r>
-      <w:proofErr w:type="spellStart"/>
-      <w:r>
-        <w:t>figma</w:t>
-      </w:r>
-      <w:proofErr w:type="spellEnd"/>
-      <w:r>
-        <w:t xml:space="preserve"> prototype gecontroleerd waarbij ik moest opnieuw uitleggen wat mijn app doet door middel van accurate presentatie. Ik legde dit vrij duidelijk uit en alles ging goed vooruit. Meneer </w:t>
-      </w:r>
-      <w:proofErr w:type="spellStart"/>
-      <w:r>
-        <w:t>Blancquaert</w:t>
-      </w:r>
-      <w:proofErr w:type="spellEnd"/>
-      <w:r>
-        <w:t xml:space="preserve"> heeft me dan ook nog een </w:t>
-      </w:r>
-      <w:proofErr w:type="spellStart"/>
-      <w:r>
-        <w:t>library</w:t>
-      </w:r>
-      <w:proofErr w:type="spellEnd"/>
-      <w:r>
-        <w:t xml:space="preserve"> genaamd “</w:t>
-      </w:r>
-      <w:proofErr w:type="spellStart"/>
-      <w:r>
-        <w:t>Material</w:t>
-      </w:r>
-      <w:proofErr w:type="spellEnd"/>
-      <w:r>
-        <w:t xml:space="preserve"> design” aangeraden om mijn applicatie te ontwerpen. </w:t>
-      </w:r>
-      <w:r>
-        <w:t xml:space="preserve">Blijkbaar Google gebruikt deze </w:t>
-      </w:r>
-      <w:proofErr w:type="spellStart"/>
-      <w:r>
-        <w:t>library</w:t>
-      </w:r>
-      <w:proofErr w:type="spellEnd"/>
+        <w:t xml:space="preserve">Vandaag werd mijn figma prototype gecontroleerd waarbij ik moest opnieuw uitleggen wat mijn app doet door middel van accurate presentatie. Ik legde dit vrij duidelijk uit en alles ging goed vooruit. Meneer Blancquaert heeft me dan ook nog een library genaamd “Material design” aangeraden om mijn applicatie te ontwerpen. </w:t>
+      </w:r>
+      <w:r>
+        <w:t>Blijkbaar Google gebruikt deze library</w:t>
+      </w:r>
       <w:r>
         <w:t xml:space="preserve"> om hun apps te maken.</w:t>
       </w:r>
@@ -564,23 +354,7 @@
         <w:t xml:space="preserve">kunt maken </w:t>
       </w:r>
       <w:r>
-        <w:t xml:space="preserve">om je app te testen. Als je </w:t>
-      </w:r>
-      <w:proofErr w:type="spellStart"/>
-      <w:r>
-        <w:t>developer</w:t>
-      </w:r>
-      <w:proofErr w:type="spellEnd"/>
-      <w:r>
-        <w:t xml:space="preserve"> modus in de </w:t>
-      </w:r>
-      <w:proofErr w:type="spellStart"/>
-      <w:r>
-        <w:t>settings</w:t>
-      </w:r>
-      <w:proofErr w:type="spellEnd"/>
-      <w:r>
-        <w:t xml:space="preserve"> van je gsm</w:t>
+        <w:t>om je app te testen. Als je developer modus in de settings van je gsm</w:t>
       </w:r>
       <w:r>
         <w:t xml:space="preserve"> aanzet, kan je je gsm verbinden met de pc en dus je applicatie daarop testen.</w:t>
@@ -598,23 +372,7 @@
     </w:p>
     <w:p>
       <w:r>
-        <w:t xml:space="preserve">Tijdens lange downloads heb ik ook mijn </w:t>
-      </w:r>
-      <w:proofErr w:type="gramStart"/>
-      <w:r>
-        <w:t>google account</w:t>
-      </w:r>
-      <w:proofErr w:type="gramEnd"/>
-      <w:r>
-        <w:t xml:space="preserve"> toegevoegd op </w:t>
-      </w:r>
-      <w:proofErr w:type="spellStart"/>
-      <w:r>
-        <w:t>Firebase</w:t>
-      </w:r>
-      <w:proofErr w:type="spellEnd"/>
-      <w:r>
-        <w:t>. Volgens de presentatie die we kregen van een medestudent.</w:t>
+        <w:t>Tijdens lange downloads heb ik ook mijn google account toegevoegd op Firebase. Volgens de presentatie die we kregen van een medestudent.</w:t>
       </w:r>
     </w:p>
     <w:p>
@@ -665,23 +423,7 @@
         <w:t>mijn</w:t>
       </w:r>
       <w:r>
-        <w:t xml:space="preserve"> </w:t>
-      </w:r>
-      <w:proofErr w:type="spellStart"/>
-      <w:r>
-        <w:t>figma</w:t>
-      </w:r>
-      <w:proofErr w:type="spellEnd"/>
-      <w:r>
-        <w:t xml:space="preserve"> design delen met meneer </w:t>
-      </w:r>
-      <w:proofErr w:type="spellStart"/>
-      <w:r>
-        <w:t>Blancquaert</w:t>
-      </w:r>
-      <w:proofErr w:type="spellEnd"/>
-      <w:r>
-        <w:t>, toen hij vroeg dat mijn design klaar was</w:t>
+        <w:t xml:space="preserve"> figma design delen met meneer Blancquaert, toen hij vroeg dat mijn design klaar was</w:t>
       </w:r>
       <w:r>
         <w:t xml:space="preserve"> of niet</w:t>
@@ -695,54 +437,14 @@
         <w:t>Ik heb daarna gewoon verder begonnen aan de tutorial die ik vorige week gebruikt had.</w:t>
       </w:r>
       <w:r>
-        <w:t xml:space="preserve"> Hierbij leerde ik meer over hoe ik </w:t>
-      </w:r>
-      <w:proofErr w:type="gramStart"/>
-      <w:r>
-        <w:t>Android studio</w:t>
-      </w:r>
-      <w:proofErr w:type="gramEnd"/>
-      <w:r>
-        <w:t xml:space="preserve"> beter kon gebruiken om mijn app te </w:t>
-      </w:r>
-      <w:proofErr w:type="spellStart"/>
-      <w:r>
-        <w:t>designen</w:t>
-      </w:r>
-      <w:proofErr w:type="spellEnd"/>
-      <w:r>
-        <w:t xml:space="preserve"> zoals hoe je </w:t>
+        <w:t xml:space="preserve"> Hierbij leerde ik meer over hoe ik Android studio beter kon gebruiken om mijn app te designen zoals hoe je </w:t>
       </w:r>
       <w:r>
         <w:lastRenderedPageBreak/>
-        <w:t xml:space="preserve">attributen kunt aanpassen (bv. </w:t>
-      </w:r>
-      <w:proofErr w:type="spellStart"/>
-      <w:r>
-        <w:t>color</w:t>
-      </w:r>
-      <w:proofErr w:type="spellEnd"/>
-      <w:r>
-        <w:t>)</w:t>
-      </w:r>
-      <w:r>
-        <w:t xml:space="preserve">. </w:t>
-      </w:r>
-      <w:proofErr w:type="gramStart"/>
-      <w:r>
-        <w:t>Android studio</w:t>
-      </w:r>
-      <w:proofErr w:type="gramEnd"/>
-      <w:r>
-        <w:t xml:space="preserve"> is zeer gelijkaardig als bijvoorbeeld </w:t>
-      </w:r>
-      <w:proofErr w:type="spellStart"/>
-      <w:r>
-        <w:t>Webstorm</w:t>
-      </w:r>
-      <w:proofErr w:type="spellEnd"/>
-      <w:r>
-        <w:t xml:space="preserve">, maar bij het design van een mobile app is het zeer </w:t>
+        <w:t>attributen kunt aanpassen (bv. color)</w:t>
+      </w:r>
+      <w:r>
+        <w:t xml:space="preserve">. Android studio is zeer gelijkaardig als bijvoorbeeld Webstorm, maar bij het design van een mobile app is het zeer </w:t>
       </w:r>
       <w:r>
         <w:t>verschillend</w:t>
@@ -751,27 +453,14 @@
         <w:t>.</w:t>
       </w:r>
       <w:r>
-        <w:t xml:space="preserve"> Bij </w:t>
-      </w:r>
-      <w:proofErr w:type="spellStart"/>
-      <w:r>
-        <w:t>Webstorm</w:t>
-      </w:r>
-      <w:proofErr w:type="spellEnd"/>
-      <w:r>
-        <w:t xml:space="preserve"> kan je je website </w:t>
+        <w:t xml:space="preserve"> Bij Webstorm kan je je website </w:t>
       </w:r>
       <w:r>
         <w:t>bekijken</w:t>
       </w:r>
       <w:r>
-        <w:t xml:space="preserve"> in een gekozen browser, maar je kan in </w:t>
-      </w:r>
-      <w:proofErr w:type="gramStart"/>
-      <w:r>
-        <w:t>Android studio</w:t>
-      </w:r>
-      <w:proofErr w:type="gramEnd"/>
+        <w:t xml:space="preserve"> in een gekozen browser, maar je kan in Android studio</w:t>
+      </w:r>
       <w:r>
         <w:t xml:space="preserve"> je app</w:t>
       </w:r>
@@ -791,15 +480,7 @@
         <w:t>.</w:t>
       </w:r>
       <w:r>
-        <w:t xml:space="preserve"> Als ik de </w:t>
-      </w:r>
-      <w:proofErr w:type="spellStart"/>
-      <w:r>
-        <w:t>Jetbrains</w:t>
-      </w:r>
-      <w:proofErr w:type="spellEnd"/>
-      <w:r>
-        <w:t xml:space="preserve"> applicaties vergelijk met Visual studio 2019, </w:t>
+        <w:t xml:space="preserve"> Als ik de Jetbrains applicaties vergelijk met Visual studio 2019, </w:t>
       </w:r>
       <w:r>
         <w:t>heb ik er altijd moeite mee om de lay</w:t>
@@ -879,23 +560,7 @@
     </w:p>
     <w:p>
       <w:r>
-        <w:t xml:space="preserve">Ik heb dan ondertussen de tutorial van </w:t>
-      </w:r>
-      <w:proofErr w:type="spellStart"/>
-      <w:r>
-        <w:t>Material</w:t>
-      </w:r>
-      <w:proofErr w:type="spellEnd"/>
-      <w:r>
-        <w:t xml:space="preserve"> design gevolgd in plaats van die van </w:t>
-      </w:r>
-      <w:proofErr w:type="gramStart"/>
-      <w:r>
-        <w:t>Android studio</w:t>
-      </w:r>
-      <w:proofErr w:type="gramEnd"/>
-      <w:r>
-        <w:t>. Ze leerde me dan hoe ik er mee kon werken maar niet hoe een hele nieuwe app kon maken. Ik kreeg een voorbeeld app om erin te kunnen werken voor de tutorial.</w:t>
+        <w:t>Ik heb dan ondertussen de tutorial van Material design gevolgd in plaats van die van Android studio. Ze leerde me dan hoe ik er mee kon werken maar niet hoe een hele nieuwe app kon maken. Ik kreeg een voorbeeld app om erin te kunnen werken voor de tutorial.</w:t>
       </w:r>
     </w:p>
     <w:p>
@@ -938,34 +603,10 @@
     </w:p>
     <w:p>
       <w:r>
-        <w:t xml:space="preserve">Vandaag heb ik de usertests afgelegd met Louis </w:t>
-      </w:r>
-      <w:proofErr w:type="spellStart"/>
-      <w:r>
-        <w:t>D’hondt</w:t>
-      </w:r>
-      <w:proofErr w:type="spellEnd"/>
-      <w:r>
-        <w:t xml:space="preserve"> en Jasper Wauters. Dit ging heel gemakkelijk en duurde niet lang. Ik had niet echt serieuze opmerkingen, behalve dat ik geen persoonlijke info pagina gemaakt had.</w:t>
-      </w:r>
-      <w:r>
-        <w:t xml:space="preserve"> Daarna heb ik onmiddellijk die opmerkingen van mijn </w:t>
-      </w:r>
-      <w:proofErr w:type="spellStart"/>
-      <w:r>
-        <w:t>figma</w:t>
-      </w:r>
-      <w:proofErr w:type="spellEnd"/>
-      <w:r>
-        <w:t xml:space="preserve"> design verbetert en op mijn </w:t>
-      </w:r>
-      <w:proofErr w:type="spellStart"/>
-      <w:r>
-        <w:t>repository</w:t>
-      </w:r>
-      <w:proofErr w:type="spellEnd"/>
-      <w:r>
-        <w:t xml:space="preserve"> gezet.</w:t>
+        <w:t>Vandaag heb ik de usertests afgelegd met Louis D’hondt en Jasper Wauters. Dit ging heel gemakkelijk en duurde niet lang. Ik had niet echt serieuze opmerkingen, behalve dat ik geen persoonlijke info pagina gemaakt had.</w:t>
+      </w:r>
+      <w:r>
+        <w:t xml:space="preserve"> Daarna heb ik onmiddellijk die opmerkingen van mijn figma design verbetert en op mijn repository gezet.</w:t>
       </w:r>
     </w:p>
     <w:p/>
@@ -988,47 +629,7 @@
     </w:p>
     <w:p>
       <w:r>
-        <w:t xml:space="preserve">Vandaag begon ik eindelijk met </w:t>
-      </w:r>
-      <w:proofErr w:type="spellStart"/>
-      <w:r>
-        <w:t>Material</w:t>
-      </w:r>
-      <w:proofErr w:type="spellEnd"/>
-      <w:r>
-        <w:t xml:space="preserve"> Design. Ik besloot mijn oude app te verwijderen en te vervangen met een empty </w:t>
-      </w:r>
-      <w:proofErr w:type="spellStart"/>
-      <w:r>
-        <w:t>activity</w:t>
-      </w:r>
-      <w:proofErr w:type="spellEnd"/>
-      <w:r>
-        <w:t xml:space="preserve"> zodat ik echt van scratch begin. Zo kan ik alles beter begrijpen. Ik had dan ontdekt dat </w:t>
-      </w:r>
-      <w:proofErr w:type="spellStart"/>
-      <w:r>
-        <w:t>android</w:t>
-      </w:r>
-      <w:proofErr w:type="spellEnd"/>
-      <w:r>
-        <w:t xml:space="preserve"> studio al automatisch </w:t>
-      </w:r>
-      <w:proofErr w:type="spellStart"/>
-      <w:r>
-        <w:t>Material</w:t>
-      </w:r>
-      <w:proofErr w:type="spellEnd"/>
-      <w:r>
-        <w:t xml:space="preserve"> Design van Google had toegevoegd bij de </w:t>
-      </w:r>
-      <w:proofErr w:type="spellStart"/>
-      <w:r>
-        <w:t>dependencies</w:t>
-      </w:r>
-      <w:proofErr w:type="spellEnd"/>
-      <w:r>
-        <w:t xml:space="preserve">, dus eigenlijk ben ik </w:t>
+        <w:t xml:space="preserve">Vandaag begon ik eindelijk met Material Design. Ik besloot mijn oude app te verwijderen en te vervangen met een empty activity zodat ik echt van scratch begin. Zo kan ik alles beter begrijpen. Ik had dan ontdekt dat android studio al automatisch Material Design van Google had toegevoegd bij de dependencies, dus eigenlijk ben ik </w:t>
       </w:r>
       <w:r>
         <w:t>onmiddellijk</w:t>
@@ -1172,50 +773,18 @@
     </w:p>
     <w:p>
       <w:r>
-        <w:t xml:space="preserve">Eerst had ik geprobeerd om gewoon een heel nieuw project te maken die bestond uit een login </w:t>
-      </w:r>
-      <w:proofErr w:type="spellStart"/>
-      <w:r>
-        <w:t>activity</w:t>
-      </w:r>
-      <w:proofErr w:type="spellEnd"/>
-      <w:r>
-        <w:t xml:space="preserve">. Deze </w:t>
-      </w:r>
-      <w:proofErr w:type="spellStart"/>
-      <w:r>
-        <w:t>activity</w:t>
-      </w:r>
-      <w:proofErr w:type="spellEnd"/>
-      <w:r>
-        <w:t xml:space="preserve"> heb ik dan gewoon aangepast naar mijn wens. Maar dit wou ook niet echt werken, want blijkbaar is het best dat je van een </w:t>
-      </w:r>
-      <w:proofErr w:type="spellStart"/>
-      <w:r>
-        <w:t>main</w:t>
+        <w:t>Eerst had ik geprobeerd om gewoon een heel nieuw project te maken die bestond uit een login activity. Deze activity heb ik dan gewoon aangepast naar mijn wens. Maar dit wou ook niet echt werken, want blijkbaar is het best dat je van een main</w:t>
       </w:r>
       <w:r>
         <w:t>_</w:t>
       </w:r>
       <w:r>
-        <w:t>activity</w:t>
-      </w:r>
-      <w:proofErr w:type="spellEnd"/>
-      <w:r>
-        <w:t xml:space="preserve"> start en dan de login page daarmee opent.</w:t>
-      </w:r>
-    </w:p>
-    <w:p>
-      <w:r>
-        <w:t xml:space="preserve">Ik ben dan gewoon terug begonnen aan het oude project en heb dan de error op stack overflow gezocht en daar had ik de oplossing gevonden. Ik moest gewoon mijn “device” zijn data </w:t>
-      </w:r>
-      <w:proofErr w:type="spellStart"/>
-      <w:r>
-        <w:t>wipen</w:t>
-      </w:r>
-      <w:proofErr w:type="spellEnd"/>
-      <w:r>
-        <w:t xml:space="preserve"> en dan kon het opnieuw installeren want mijn oude projecten stond er nog op.</w:t>
+        <w:t>activity start en dan de login page daarmee opent.</w:t>
+      </w:r>
+    </w:p>
+    <w:p>
+      <w:r>
+        <w:t>Ik ben dan gewoon terug begonnen aan het oude project en heb dan de error op stack overflow gezocht en daar had ik de oplossing gevonden. Ik moest gewoon mijn “device” zijn data wipen en dan kon het opnieuw installeren want mijn oude projecten stond er nog op.</w:t>
       </w:r>
     </w:p>
     <w:p>
@@ -1259,23 +828,7 @@
         <w:t>Vandaag wou de wifi niet werken op de campus dus had ik niet veel vooruitgang geboekt.</w:t>
       </w:r>
       <w:r>
-        <w:t xml:space="preserve"> Ik was ook gisteren vergeten om de registratie pagina te </w:t>
-      </w:r>
-      <w:proofErr w:type="spellStart"/>
-      <w:r>
-        <w:t>committen</w:t>
-      </w:r>
-      <w:proofErr w:type="spellEnd"/>
-      <w:r>
-        <w:t xml:space="preserve">, dus da had ik alleszins gedaan door met mijn </w:t>
-      </w:r>
-      <w:proofErr w:type="spellStart"/>
-      <w:r>
-        <w:t>hotspot</w:t>
-      </w:r>
-      <w:proofErr w:type="spellEnd"/>
-      <w:r>
-        <w:t xml:space="preserve"> van mijn gsm te verbinden en de 4G aan te zetten.</w:t>
+        <w:t xml:space="preserve"> Ik was ook gisteren vergeten om de registratie pagina te committen, dus da had ik alleszins gedaan door met mijn hotspot van mijn gsm te verbinden en de 4G aan te zetten.</w:t>
       </w:r>
     </w:p>
     <w:p>
@@ -1307,21 +860,11 @@
         <w:t>Vandaag wou de wifi op school nog steeds niet zo goed werken</w:t>
       </w:r>
       <w:r>
-        <w:t xml:space="preserve">, maar dankzij de wifi </w:t>
-      </w:r>
-      <w:proofErr w:type="spellStart"/>
-      <w:r>
-        <w:t>hotspot</w:t>
-      </w:r>
-      <w:proofErr w:type="spellEnd"/>
-      <w:r>
-        <w:t xml:space="preserve"> heb ik toch nog de navigatie van login naar registratie kunnen </w:t>
-      </w:r>
-      <w:proofErr w:type="spellStart"/>
+        <w:t xml:space="preserve">, maar dankzij de wifi hotspot heb ik toch nog de navigatie van login naar registratie kunnen </w:t>
+      </w:r>
       <w:r>
         <w:t>commiten</w:t>
       </w:r>
-      <w:proofErr w:type="spellEnd"/>
       <w:r>
         <w:t>.</w:t>
       </w:r>
@@ -1331,15 +874,7 @@
     </w:p>
     <w:p>
       <w:r>
-        <w:t xml:space="preserve">De wifi wou uiteindelijk werken dus kon eindelijk heel vlot vooruitgaan. Ik heb daarbij de navigatie tussen de login en registratie kunnen afwerken. Daarna heb ik ook de startpagina bijna afgewerkt, maar de </w:t>
-      </w:r>
-      <w:proofErr w:type="spellStart"/>
-      <w:r>
-        <w:t>bottom</w:t>
-      </w:r>
-      <w:proofErr w:type="spellEnd"/>
-      <w:r>
-        <w:t xml:space="preserve"> bar wou niet helemaal meewerken dus dat laat ik voor later.</w:t>
+        <w:t>De wifi wou uiteindelijk werken dus kon eindelijk heel vlot vooruitgaan. Ik heb daarbij de navigatie tussen de login en registratie kunnen afwerken. Daarna heb ik ook de startpagina bijna afgewerkt, maar de bottom bar wou niet helemaal meewerken dus dat laat ik voor later.</w:t>
       </w:r>
     </w:p>
     <w:p/>
@@ -1360,31 +895,7 @@
     </w:p>
     <w:p>
       <w:r>
-        <w:t xml:space="preserve">Vandaag heb ik de bodem navigatie afgewerkt waarbij je dan naar je groepen kunt gaan oftewel naar je notities die je hebt gefotografeerd. Dit was eerste wel een </w:t>
-      </w:r>
-      <w:proofErr w:type="spellStart"/>
-      <w:r>
-        <w:t>challenge</w:t>
-      </w:r>
-      <w:proofErr w:type="spellEnd"/>
-      <w:r>
-        <w:t xml:space="preserve"> zoals de </w:t>
-      </w:r>
-      <w:proofErr w:type="spellStart"/>
-      <w:r>
-        <w:t>active</w:t>
-      </w:r>
-      <w:proofErr w:type="spellEnd"/>
-      <w:r>
-        <w:t xml:space="preserve"> pagina weergegeven of de juiste </w:t>
-      </w:r>
-      <w:proofErr w:type="spellStart"/>
-      <w:r>
-        <w:t>eventlistener</w:t>
-      </w:r>
-      <w:proofErr w:type="spellEnd"/>
-      <w:r>
-        <w:t xml:space="preserve"> gebruiken om te kunnen navigeren. Maar deze links hebben daarbij geholpen:</w:t>
+        <w:t>Vandaag heb ik de bodem navigatie afgewerkt waarbij je dan naar je groepen kunt gaan oftewel naar je notities die je hebt gefotografeerd. Dit was eerste wel een challenge zoals de active pagina weergegeven of de juiste eventlistener gebruiken om te kunnen navigeren. Maar deze links hebben daarbij geholpen:</w:t>
       </w:r>
     </w:p>
     <w:p>
@@ -1430,29 +941,13 @@
     </w:p>
     <w:p>
       <w:r>
-        <w:t xml:space="preserve">Ik heb dan ook nog voor gezorgd dat mijn </w:t>
-      </w:r>
-      <w:proofErr w:type="spellStart"/>
-      <w:r>
-        <w:t>firebase</w:t>
-      </w:r>
-      <w:proofErr w:type="spellEnd"/>
-      <w:r>
-        <w:t xml:space="preserve"> account verbonden is met</w:t>
+        <w:t>Ik heb dan ook nog voor gezorgd dat mijn firebase account verbonden is met</w:t>
       </w:r>
       <w:r>
         <w:t xml:space="preserve"> mijn</w:t>
       </w:r>
       <w:r>
-        <w:t xml:space="preserve"> </w:t>
-      </w:r>
-      <w:proofErr w:type="spellStart"/>
-      <w:r>
-        <w:t>android</w:t>
-      </w:r>
-      <w:proofErr w:type="spellEnd"/>
-      <w:r>
-        <w:t xml:space="preserve"> studio app.</w:t>
+        <w:t xml:space="preserve"> android studio app.</w:t>
       </w:r>
     </w:p>
     <w:p>
@@ -1609,13 +1104,8 @@
           <w:numId w:val="1"/>
         </w:numPr>
       </w:pPr>
-      <w:proofErr w:type="spellStart"/>
-      <w:r>
-        <w:t>Firebase</w:t>
-      </w:r>
-      <w:proofErr w:type="spellEnd"/>
-      <w:r>
-        <w:t xml:space="preserve"> implementeren</w:t>
+      <w:r>
+        <w:t>Firebase implementeren</w:t>
       </w:r>
     </w:p>
     <w:p>
@@ -1627,13 +1117,8 @@
         </w:numPr>
       </w:pPr>
       <w:r>
-        <w:t xml:space="preserve">Login en registratie mogelijk maken via </w:t>
-      </w:r>
-      <w:proofErr w:type="spellStart"/>
-      <w:r>
-        <w:t>firebase</w:t>
-      </w:r>
-      <w:proofErr w:type="spellEnd"/>
+        <w:t>Login en registratie mogelijk maken via firebase</w:t>
+      </w:r>
     </w:p>
     <w:p>
       <w:pPr>
@@ -1644,11 +1129,7 @@
         </w:numPr>
       </w:pPr>
       <w:r>
-        <w:t xml:space="preserve">Camera functionaliteit bekijken voor </w:t>
-      </w:r>
-      <w:proofErr w:type="spellStart"/>
-      <w:r>
-        <w:t>andr</w:t>
+        <w:t>Camera functionaliteit bekijken voor andr</w:t>
       </w:r>
       <w:r>
         <w:t>oi</w:t>
@@ -1656,7 +1137,6 @@
       <w:r>
         <w:t>d</w:t>
       </w:r>
-      <w:proofErr w:type="spellEnd"/>
     </w:p>
     <w:p/>
     <w:p>
@@ -1676,66 +1156,10 @@
     </w:p>
     <w:p>
       <w:r>
-        <w:t xml:space="preserve">Hier kan je ondertussen zien dat mijn app verbonden is met </w:t>
-      </w:r>
-      <w:proofErr w:type="spellStart"/>
-      <w:r>
-        <w:t>Firebase</w:t>
-      </w:r>
-      <w:proofErr w:type="spellEnd"/>
-      <w:r>
-        <w:t xml:space="preserve">. Nu vragen ze voor google </w:t>
-      </w:r>
-      <w:proofErr w:type="spellStart"/>
-      <w:r>
-        <w:t>sign</w:t>
-      </w:r>
-      <w:proofErr w:type="spellEnd"/>
-      <w:r>
-        <w:t xml:space="preserve">-in om een sha-1 </w:t>
-      </w:r>
-      <w:proofErr w:type="spellStart"/>
-      <w:r>
-        <w:t>fingerprint</w:t>
-      </w:r>
-      <w:proofErr w:type="spellEnd"/>
-      <w:r>
-        <w:t xml:space="preserve"> toe te voegen.</w:t>
-      </w:r>
-      <w:r>
-        <w:t xml:space="preserve"> Ik wou dan google </w:t>
-      </w:r>
-      <w:proofErr w:type="spellStart"/>
-      <w:r>
-        <w:t>play</w:t>
-      </w:r>
-      <w:proofErr w:type="spellEnd"/>
-      <w:r>
-        <w:t xml:space="preserve"> </w:t>
-      </w:r>
-      <w:proofErr w:type="spellStart"/>
-      <w:r>
-        <w:t>signing</w:t>
-      </w:r>
-      <w:proofErr w:type="spellEnd"/>
-      <w:r>
-        <w:t xml:space="preserve"> pakken om het te genereren </w:t>
-      </w:r>
-      <w:proofErr w:type="spellStart"/>
-      <w:r>
-        <w:t>ipv</w:t>
-      </w:r>
-      <w:proofErr w:type="spellEnd"/>
-      <w:r>
-        <w:t xml:space="preserve"> </w:t>
-      </w:r>
-      <w:proofErr w:type="spellStart"/>
-      <w:r>
-        <w:t>self-signing</w:t>
-      </w:r>
-      <w:proofErr w:type="spellEnd"/>
-      <w:r>
-        <w:t xml:space="preserve">, maar ik moet dan 25 euro eerst betalen voor een </w:t>
+        <w:t>Hier kan je ondertussen zien dat mijn app verbonden is met Firebase. Nu vragen ze voor google sign-in om een sha-1 fingerprint toe te voegen.</w:t>
+      </w:r>
+      <w:r>
+        <w:t xml:space="preserve"> Ik wou dan google play signing pakken om het te genereren ipv self-signing, maar ik moet dan 25 euro eerst betalen voor een </w:t>
       </w:r>
       <w:r>
         <w:t>ontwikkelaar</w:t>
@@ -1806,75 +1230,14 @@
       <w:r>
         <w:t>Als ik wat meer naar onderging bij de “</w:t>
       </w:r>
-      <w:proofErr w:type="spellStart"/>
-      <w:r>
-        <w:t>Authenticating</w:t>
-      </w:r>
-      <w:proofErr w:type="spellEnd"/>
-      <w:r>
-        <w:t xml:space="preserve"> </w:t>
-      </w:r>
-      <w:proofErr w:type="spellStart"/>
-      <w:r>
-        <w:t>Your</w:t>
-      </w:r>
-      <w:proofErr w:type="spellEnd"/>
-      <w:r>
-        <w:t xml:space="preserve"> Client</w:t>
-      </w:r>
-      <w:r>
-        <w:t xml:space="preserve">” pagina (zie link) kan je ook via de terminal van </w:t>
-      </w:r>
-      <w:proofErr w:type="spellStart"/>
-      <w:r>
-        <w:t>android</w:t>
-      </w:r>
-      <w:proofErr w:type="spellEnd"/>
-      <w:r>
-        <w:t xml:space="preserve"> studio een </w:t>
-      </w:r>
-      <w:proofErr w:type="spellStart"/>
-      <w:r>
-        <w:t>command</w:t>
-      </w:r>
-      <w:proofErr w:type="spellEnd"/>
-      <w:r>
-        <w:t xml:space="preserve"> invoeren om de sha-1 </w:t>
-      </w:r>
-      <w:proofErr w:type="spellStart"/>
-      <w:r>
-        <w:t>fingerprint</w:t>
-      </w:r>
-      <w:proofErr w:type="spellEnd"/>
-      <w:r>
-        <w:t xml:space="preserve"> te krijgen. Hierbij moest je “</w:t>
-      </w:r>
-      <w:proofErr w:type="spellStart"/>
-      <w:r>
-        <w:t>gradle</w:t>
-      </w:r>
-      <w:proofErr w:type="spellEnd"/>
-      <w:r>
-        <w:t xml:space="preserve"> </w:t>
-      </w:r>
-      <w:proofErr w:type="spellStart"/>
-      <w:r>
-        <w:t>sigingReport</w:t>
-      </w:r>
-      <w:proofErr w:type="spellEnd"/>
-      <w:r>
-        <w:t>” invoeren en dan ctrl + enter invoeren!!</w:t>
-      </w:r>
-      <w:r>
-        <w:t xml:space="preserve"> Deze heb ik dan toegevoegd aan </w:t>
-      </w:r>
-      <w:proofErr w:type="spellStart"/>
-      <w:r>
-        <w:t>Firebase</w:t>
-      </w:r>
-      <w:proofErr w:type="spellEnd"/>
-      <w:r>
-        <w:t>.</w:t>
+      <w:r>
+        <w:t>Authenticating Your Client</w:t>
+      </w:r>
+      <w:r>
+        <w:t>” pagina (zie link) kan je ook via de terminal van android studio een command invoeren om de sha-1 fingerprint te krijgen. Hierbij moest je “gradle sigingReport” invoeren en dan ctrl + enter invoeren!!</w:t>
+      </w:r>
+      <w:r>
+        <w:t xml:space="preserve"> Deze heb ik dan toegevoegd aan Firebase.</w:t>
       </w:r>
     </w:p>
     <w:p>
@@ -1922,15 +1285,7 @@
     </w:p>
     <w:p>
       <w:r>
-        <w:t xml:space="preserve">Daarna moest ik een </w:t>
-      </w:r>
-      <w:proofErr w:type="spellStart"/>
-      <w:r>
-        <w:t>Oauth</w:t>
-      </w:r>
-      <w:proofErr w:type="spellEnd"/>
-      <w:r>
-        <w:t xml:space="preserve"> 2.0 client ID toevoegen voor het inloggen. Hierbij moest ik een hele configuratie begaan.</w:t>
+        <w:t>Daarna moest ik een Oauth 2.0 client ID toevoegen voor het inloggen. Hierbij moest ik een hele configuratie begaan.</w:t>
       </w:r>
       <w:r>
         <w:t xml:space="preserve"> Ik heb hierbij het meest niet ingevuld zoals een privacy policy, enzoverder.</w:t>
@@ -2111,31 +1466,7 @@
     </w:p>
     <w:p>
       <w:r>
-        <w:t xml:space="preserve">Vandaag had ik tijdens les (in de morgen van 8u15-11u15) verder gewerkt aan de </w:t>
-      </w:r>
-      <w:proofErr w:type="spellStart"/>
-      <w:r>
-        <w:t>back-end</w:t>
-      </w:r>
-      <w:proofErr w:type="spellEnd"/>
-      <w:r>
-        <w:t xml:space="preserve"> van mijn app. Ik was gisteren bezig met google </w:t>
-      </w:r>
-      <w:proofErr w:type="spellStart"/>
-      <w:r>
-        <w:t>sign</w:t>
-      </w:r>
-      <w:proofErr w:type="spellEnd"/>
-      <w:r>
-        <w:t xml:space="preserve">-in, maar ik besloot om eerst normale email/password </w:t>
-      </w:r>
-      <w:proofErr w:type="spellStart"/>
-      <w:r>
-        <w:t>authentication</w:t>
-      </w:r>
-      <w:proofErr w:type="spellEnd"/>
-      <w:r>
-        <w:t xml:space="preserve"> toe te voegen. Dit ging vrij vlot vooruit maar toen ik de button klikt sloot de app af, dus dat moet ik nog oplossen. </w:t>
+        <w:t xml:space="preserve">Vandaag had ik tijdens les (in de morgen van 8u15-11u15) verder gewerkt aan de back-end van mijn app. Ik was gisteren bezig met google sign-in, maar ik besloot om eerst normale email/password authentication toe te voegen. Dit ging vrij vlot vooruit maar toen ik de button klikt sloot de app af, dus dat moet ik nog oplossen. </w:t>
       </w:r>
       <w:r>
         <w:t>Er werd</w:t>
@@ -2181,34 +1512,10 @@
         <w:t>Vandaag heb ik eindelijk de login en registratie kunnen afwerken. Dit had veel moeite gekost.</w:t>
       </w:r>
       <w:r>
-        <w:t xml:space="preserve"> Het probleem was dus dat mijn app bleef crashen als ik probeerde te registeren. Ik had veel op stackoverflow gezocht maar ik kon eerst niks vinden, maar toen zag ik dat de wifi van de device emulator op </w:t>
-      </w:r>
-      <w:proofErr w:type="gramStart"/>
-      <w:r>
-        <w:t>Android studio</w:t>
-      </w:r>
-      <w:proofErr w:type="gramEnd"/>
-      <w:r>
-        <w:t xml:space="preserve"> geen wifi had. Ik dacht eerst dat dit normaal was, maar begon toen twijfels te krijgen. Ik had dan eerst de info op stackoverflow pagina proberen gebruiken, maar dat was niet juist. Uiteindelijk gewoon mijn gsm </w:t>
-      </w:r>
-      <w:proofErr w:type="spellStart"/>
-      <w:r>
-        <w:t>hotspot</w:t>
-      </w:r>
-      <w:proofErr w:type="spellEnd"/>
-      <w:r>
-        <w:t xml:space="preserve"> 4G gebruiken werkte wel.</w:t>
-      </w:r>
-      <w:r>
-        <w:t xml:space="preserve"> Mijn app crasht dan nog steeds bij registratie maar ik kon wel inloggen door een test account aan te maken op </w:t>
-      </w:r>
-      <w:proofErr w:type="spellStart"/>
-      <w:r>
-        <w:t>Firebase</w:t>
-      </w:r>
-      <w:proofErr w:type="spellEnd"/>
-      <w:r>
-        <w:t>. Dus mijn code werkte, maar toen ik zag dat ik niet gekeken had naar de error van die verscheen na de crash en dat maakte alles duidelijk</w:t>
+        <w:t xml:space="preserve"> Het probleem was dus dat mijn app bleef crashen als ik probeerde te registeren. Ik had veel op stackoverflow gezocht maar ik kon eerst niks vinden, maar toen zag ik dat de wifi van de device emulator op Android studio geen wifi had. Ik dacht eerst dat dit normaal was, maar begon toen twijfels te krijgen. Ik had dan eerst de info op stackoverflow pagina proberen gebruiken, maar dat was niet juist. Uiteindelijk gewoon mijn gsm hotspot 4G gebruiken werkte wel.</w:t>
+      </w:r>
+      <w:r>
+        <w:t xml:space="preserve"> Mijn app crasht dan nog steeds bij registratie maar ik kon wel inloggen door een test account aan te maken op Firebase. Dus mijn code werkte, maar toen ik zag dat ik niet gekeken had naar de error van die verscheen na de crash en dat maakte alles duidelijk</w:t>
       </w:r>
       <w:r>
         <w:t xml:space="preserve"> voor mij</w:t>
@@ -2370,161 +1677,56 @@
           <w:rFonts w:eastAsia="Times New Roman" w:cstheme="minorHAnsi"/>
           <w:lang w:eastAsia="nl-BE"/>
         </w:rPr>
-        <w:t xml:space="preserve">Vandaag heb ik geprobeerd om google </w:t>
-      </w:r>
-      <w:proofErr w:type="spellStart"/>
+        <w:t>Vandaag heb ik geprobeerd om google sign-in te laten werken. Dit ging zeer goed, maar het enige probleem is dat de google account niet wordt toegevoegd aan Firebase en het wil daarna niet naar de volgende pagina gaan als ik de google sign</w:t>
+      </w:r>
       <w:r>
         <w:rPr>
           <w:rFonts w:eastAsia="Times New Roman" w:cstheme="minorHAnsi"/>
           <w:lang w:eastAsia="nl-BE"/>
         </w:rPr>
-        <w:t>sign</w:t>
-      </w:r>
-      <w:proofErr w:type="spellEnd"/>
+        <w:t>-</w:t>
+      </w:r>
       <w:r>
         <w:rPr>
           <w:rFonts w:eastAsia="Times New Roman" w:cstheme="minorHAnsi"/>
           <w:lang w:eastAsia="nl-BE"/>
         </w:rPr>
-        <w:t xml:space="preserve">-in te laten werken. Dit ging zeer goed, maar het enige probleem is dat de </w:t>
-      </w:r>
-      <w:proofErr w:type="gramStart"/>
+        <w:t>in button klik. Het sign-in scherm verschijnt wel en hebben geen errors, maar daarna gebeurt er niks. Ik heb de methode toegevoegd die iemand van teams zei dat die het probleem</w:t>
+      </w:r>
       <w:r>
         <w:rPr>
           <w:rFonts w:eastAsia="Times New Roman" w:cstheme="minorHAnsi"/>
           <w:lang w:eastAsia="nl-BE"/>
         </w:rPr>
-        <w:t>google account</w:t>
-      </w:r>
-      <w:proofErr w:type="gramEnd"/>
+        <w:t xml:space="preserve"> zou</w:t>
+      </w:r>
       <w:r>
         <w:rPr>
           <w:rFonts w:eastAsia="Times New Roman" w:cstheme="minorHAnsi"/>
           <w:lang w:eastAsia="nl-BE"/>
         </w:rPr>
-        <w:t xml:space="preserve"> niet wordt toegevoegd aan </w:t>
-      </w:r>
-      <w:proofErr w:type="spellStart"/>
+        <w:t xml:space="preserve"> oplos</w:t>
+      </w:r>
       <w:r>
         <w:rPr>
           <w:rFonts w:eastAsia="Times New Roman" w:cstheme="minorHAnsi"/>
           <w:lang w:eastAsia="nl-BE"/>
         </w:rPr>
-        <w:t>Firebase</w:t>
-      </w:r>
-      <w:proofErr w:type="spellEnd"/>
+        <w:t>sen</w:t>
+      </w:r>
       <w:r>
         <w:rPr>
           <w:rFonts w:eastAsia="Times New Roman" w:cstheme="minorHAnsi"/>
           <w:lang w:eastAsia="nl-BE"/>
         </w:rPr>
-        <w:t xml:space="preserve"> en het wil daarna niet naar de volgende pagina gaan als ik de google </w:t>
-      </w:r>
-      <w:proofErr w:type="spellStart"/>
+        <w:t xml:space="preserve"> maar er zal nog ergens een fout zitten.</w:t>
+      </w:r>
       <w:r>
         <w:rPr>
           <w:rFonts w:eastAsia="Times New Roman" w:cstheme="minorHAnsi"/>
           <w:lang w:eastAsia="nl-BE"/>
         </w:rPr>
-        <w:t>sign</w:t>
-      </w:r>
-      <w:proofErr w:type="spellEnd"/>
-      <w:r>
-        <w:rPr>
-          <w:rFonts w:eastAsia="Times New Roman" w:cstheme="minorHAnsi"/>
-          <w:lang w:eastAsia="nl-BE"/>
-        </w:rPr>
-        <w:t>-</w:t>
-      </w:r>
-      <w:r>
-        <w:rPr>
-          <w:rFonts w:eastAsia="Times New Roman" w:cstheme="minorHAnsi"/>
-          <w:lang w:eastAsia="nl-BE"/>
-        </w:rPr>
-        <w:t xml:space="preserve">in button klik. Het </w:t>
-      </w:r>
-      <w:proofErr w:type="spellStart"/>
-      <w:r>
-        <w:rPr>
-          <w:rFonts w:eastAsia="Times New Roman" w:cstheme="minorHAnsi"/>
-          <w:lang w:eastAsia="nl-BE"/>
-        </w:rPr>
-        <w:t>sign</w:t>
-      </w:r>
-      <w:proofErr w:type="spellEnd"/>
-      <w:r>
-        <w:rPr>
-          <w:rFonts w:eastAsia="Times New Roman" w:cstheme="minorHAnsi"/>
-          <w:lang w:eastAsia="nl-BE"/>
-        </w:rPr>
-        <w:t xml:space="preserve">-in scherm verschijnt wel en hebben geen </w:t>
-      </w:r>
-      <w:proofErr w:type="spellStart"/>
-      <w:r>
-        <w:rPr>
-          <w:rFonts w:eastAsia="Times New Roman" w:cstheme="minorHAnsi"/>
-          <w:lang w:eastAsia="nl-BE"/>
-        </w:rPr>
-        <w:t>errors</w:t>
-      </w:r>
-      <w:proofErr w:type="spellEnd"/>
-      <w:r>
-        <w:rPr>
-          <w:rFonts w:eastAsia="Times New Roman" w:cstheme="minorHAnsi"/>
-          <w:lang w:eastAsia="nl-BE"/>
-        </w:rPr>
-        <w:t>, maar daarna gebeurt er niks. Ik heb de methode toegevoegd die iemand van teams zei dat die het probleem</w:t>
-      </w:r>
-      <w:r>
-        <w:rPr>
-          <w:rFonts w:eastAsia="Times New Roman" w:cstheme="minorHAnsi"/>
-          <w:lang w:eastAsia="nl-BE"/>
-        </w:rPr>
-        <w:t xml:space="preserve"> zou</w:t>
-      </w:r>
-      <w:r>
-        <w:rPr>
-          <w:rFonts w:eastAsia="Times New Roman" w:cstheme="minorHAnsi"/>
-          <w:lang w:eastAsia="nl-BE"/>
-        </w:rPr>
-        <w:t xml:space="preserve"> oplos</w:t>
-      </w:r>
-      <w:r>
-        <w:rPr>
-          <w:rFonts w:eastAsia="Times New Roman" w:cstheme="minorHAnsi"/>
-          <w:lang w:eastAsia="nl-BE"/>
-        </w:rPr>
-        <w:t>sen</w:t>
-      </w:r>
-      <w:r>
-        <w:rPr>
-          <w:rFonts w:eastAsia="Times New Roman" w:cstheme="minorHAnsi"/>
-          <w:lang w:eastAsia="nl-BE"/>
-        </w:rPr>
-        <w:t xml:space="preserve"> maar er zal nog ergens een fout zitten.</w:t>
-      </w:r>
-      <w:r>
-        <w:rPr>
-          <w:rFonts w:eastAsia="Times New Roman" w:cstheme="minorHAnsi"/>
-          <w:lang w:eastAsia="nl-BE"/>
-        </w:rPr>
-        <w:t xml:space="preserve"> 1 van de methodes was wel </w:t>
-      </w:r>
-      <w:proofErr w:type="spellStart"/>
-      <w:r>
-        <w:rPr>
-          <w:rFonts w:eastAsia="Times New Roman" w:cstheme="minorHAnsi"/>
-          <w:lang w:eastAsia="nl-BE"/>
-        </w:rPr>
-        <w:t>deprecated</w:t>
-      </w:r>
-      <w:proofErr w:type="spellEnd"/>
-      <w:r>
-        <w:rPr>
-          <w:rFonts w:eastAsia="Times New Roman" w:cstheme="minorHAnsi"/>
-          <w:lang w:eastAsia="nl-BE"/>
-        </w:rPr>
-        <w:t xml:space="preserve">, maar die had </w:t>
+        <w:t xml:space="preserve"> 1 van de methodes was wel deprecated, maar die had </w:t>
       </w:r>
       <w:r>
         <w:rPr>
@@ -2689,192 +1891,14 @@
           <w:rFonts w:eastAsia="Times New Roman" w:cstheme="minorHAnsi"/>
           <w:lang w:eastAsia="nl-BE"/>
         </w:rPr>
-        <w:t xml:space="preserve">Vandaag is het me gelukt om de google </w:t>
-      </w:r>
-      <w:proofErr w:type="spellStart"/>
+        <w:t>Vandaag is het me gelukt om de google sign-in te laten werken. Ik had veel opzoek werk gedaan op google maar kon niks duidelijk vinden. Ik had mijn code ook gedebugd, maar geen duidelijk error werd weergegeven. Uiteindelijk besloot ik opzoek te gaan naar een tutorial die recent was in 2021. Deze tutorial heb ik dan gebruikt om mijn project strict te controleren en toen realiseerde ik dat de SHA-1 niet op de juiste plaats stond. Ik had op google cloud een Oauth 2.0 client id moeten aanmaken toen ik de android studio firebase tutorial volgde, maar dat bleek dus helemaal fout te zijn, want de echte client_id was eigenlijk al klaar in een google-services.json file. Ik moest toen ook mijn SHA-1 fingerprint verwijderen bij de onderstaande afbeelding, maar dat mocht daar eigenlijk blijven staan.</w:t>
+      </w:r>
       <w:r>
         <w:rPr>
           <w:rFonts w:eastAsia="Times New Roman" w:cstheme="minorHAnsi"/>
           <w:lang w:eastAsia="nl-BE"/>
         </w:rPr>
-        <w:t>sign</w:t>
-      </w:r>
-      <w:proofErr w:type="spellEnd"/>
-      <w:r>
-        <w:rPr>
-          <w:rFonts w:eastAsia="Times New Roman" w:cstheme="minorHAnsi"/>
-          <w:lang w:eastAsia="nl-BE"/>
-        </w:rPr>
-        <w:t xml:space="preserve">-in te laten werken. Ik had veel opzoek werk gedaan op google maar kon niks duidelijk vinden. Ik had mijn code ook gedebugd, maar geen duidelijk error werd weergegeven. Uiteindelijk besloot ik opzoek te gaan naar een tutorial die recent was in 2021. Deze tutorial heb ik dan gebruikt om mijn project </w:t>
-      </w:r>
-      <w:proofErr w:type="spellStart"/>
-      <w:r>
-        <w:rPr>
-          <w:rFonts w:eastAsia="Times New Roman" w:cstheme="minorHAnsi"/>
-          <w:lang w:eastAsia="nl-BE"/>
-        </w:rPr>
-        <w:t>strict</w:t>
-      </w:r>
-      <w:proofErr w:type="spellEnd"/>
-      <w:r>
-        <w:rPr>
-          <w:rFonts w:eastAsia="Times New Roman" w:cstheme="minorHAnsi"/>
-          <w:lang w:eastAsia="nl-BE"/>
-        </w:rPr>
-        <w:t xml:space="preserve"> te controleren en toen realiseerde ik dat de SHA-1 niet op de juiste plaats stond. Ik had op google </w:t>
-      </w:r>
-      <w:proofErr w:type="spellStart"/>
-      <w:r>
-        <w:rPr>
-          <w:rFonts w:eastAsia="Times New Roman" w:cstheme="minorHAnsi"/>
-          <w:lang w:eastAsia="nl-BE"/>
-        </w:rPr>
-        <w:t>cloud</w:t>
-      </w:r>
-      <w:proofErr w:type="spellEnd"/>
-      <w:r>
-        <w:rPr>
-          <w:rFonts w:eastAsia="Times New Roman" w:cstheme="minorHAnsi"/>
-          <w:lang w:eastAsia="nl-BE"/>
-        </w:rPr>
-        <w:t xml:space="preserve"> een </w:t>
-      </w:r>
-      <w:proofErr w:type="spellStart"/>
-      <w:r>
-        <w:rPr>
-          <w:rFonts w:eastAsia="Times New Roman" w:cstheme="minorHAnsi"/>
-          <w:lang w:eastAsia="nl-BE"/>
-        </w:rPr>
-        <w:t>Oauth</w:t>
-      </w:r>
-      <w:proofErr w:type="spellEnd"/>
-      <w:r>
-        <w:rPr>
-          <w:rFonts w:eastAsia="Times New Roman" w:cstheme="minorHAnsi"/>
-          <w:lang w:eastAsia="nl-BE"/>
-        </w:rPr>
-        <w:t xml:space="preserve"> 2.0 client </w:t>
-      </w:r>
-      <w:proofErr w:type="spellStart"/>
-      <w:r>
-        <w:rPr>
-          <w:rFonts w:eastAsia="Times New Roman" w:cstheme="minorHAnsi"/>
-          <w:lang w:eastAsia="nl-BE"/>
-        </w:rPr>
-        <w:t>id</w:t>
-      </w:r>
-      <w:proofErr w:type="spellEnd"/>
-      <w:r>
-        <w:rPr>
-          <w:rFonts w:eastAsia="Times New Roman" w:cstheme="minorHAnsi"/>
-          <w:lang w:eastAsia="nl-BE"/>
-        </w:rPr>
-        <w:t xml:space="preserve"> moeten aanmaken toen ik de </w:t>
-      </w:r>
-      <w:proofErr w:type="spellStart"/>
-      <w:r>
-        <w:rPr>
-          <w:rFonts w:eastAsia="Times New Roman" w:cstheme="minorHAnsi"/>
-          <w:lang w:eastAsia="nl-BE"/>
-        </w:rPr>
-        <w:t>android</w:t>
-      </w:r>
-      <w:proofErr w:type="spellEnd"/>
-      <w:r>
-        <w:rPr>
-          <w:rFonts w:eastAsia="Times New Roman" w:cstheme="minorHAnsi"/>
-          <w:lang w:eastAsia="nl-BE"/>
-        </w:rPr>
-        <w:t xml:space="preserve"> studio </w:t>
-      </w:r>
-      <w:proofErr w:type="spellStart"/>
-      <w:r>
-        <w:rPr>
-          <w:rFonts w:eastAsia="Times New Roman" w:cstheme="minorHAnsi"/>
-          <w:lang w:eastAsia="nl-BE"/>
-        </w:rPr>
-        <w:t>firebase</w:t>
-      </w:r>
-      <w:proofErr w:type="spellEnd"/>
-      <w:r>
-        <w:rPr>
-          <w:rFonts w:eastAsia="Times New Roman" w:cstheme="minorHAnsi"/>
-          <w:lang w:eastAsia="nl-BE"/>
-        </w:rPr>
-        <w:t xml:space="preserve"> tutorial volgde, maar dat bleek dus helemaal fout te zijn, want de echte </w:t>
-      </w:r>
-      <w:proofErr w:type="spellStart"/>
-      <w:r>
-        <w:rPr>
-          <w:rFonts w:eastAsia="Times New Roman" w:cstheme="minorHAnsi"/>
-          <w:lang w:eastAsia="nl-BE"/>
-        </w:rPr>
-        <w:t>client_id</w:t>
-      </w:r>
-      <w:proofErr w:type="spellEnd"/>
-      <w:r>
-        <w:rPr>
-          <w:rFonts w:eastAsia="Times New Roman" w:cstheme="minorHAnsi"/>
-          <w:lang w:eastAsia="nl-BE"/>
-        </w:rPr>
-        <w:t xml:space="preserve"> was eigenlijk al klaar in een google-</w:t>
-      </w:r>
-      <w:proofErr w:type="spellStart"/>
-      <w:proofErr w:type="gramStart"/>
-      <w:r>
-        <w:rPr>
-          <w:rFonts w:eastAsia="Times New Roman" w:cstheme="minorHAnsi"/>
-          <w:lang w:eastAsia="nl-BE"/>
-        </w:rPr>
-        <w:t>services.json</w:t>
-      </w:r>
-      <w:proofErr w:type="spellEnd"/>
-      <w:proofErr w:type="gramEnd"/>
-      <w:r>
-        <w:rPr>
-          <w:rFonts w:eastAsia="Times New Roman" w:cstheme="minorHAnsi"/>
-          <w:lang w:eastAsia="nl-BE"/>
-        </w:rPr>
-        <w:t xml:space="preserve"> file. Ik moest toen ook mijn SHA-1 </w:t>
-      </w:r>
-      <w:proofErr w:type="spellStart"/>
-      <w:r>
-        <w:rPr>
-          <w:rFonts w:eastAsia="Times New Roman" w:cstheme="minorHAnsi"/>
-          <w:lang w:eastAsia="nl-BE"/>
-        </w:rPr>
-        <w:t>fingerprint</w:t>
-      </w:r>
-      <w:proofErr w:type="spellEnd"/>
-      <w:r>
-        <w:rPr>
-          <w:rFonts w:eastAsia="Times New Roman" w:cstheme="minorHAnsi"/>
-          <w:lang w:eastAsia="nl-BE"/>
-        </w:rPr>
-        <w:t xml:space="preserve"> verwijderen bij de onderstaande afbeelding, maar dat mocht daar eigenlijk blijven staan.</w:t>
-      </w:r>
-      <w:r>
-        <w:rPr>
-          <w:rFonts w:eastAsia="Times New Roman" w:cstheme="minorHAnsi"/>
-          <w:lang w:eastAsia="nl-BE"/>
-        </w:rPr>
-        <w:t xml:space="preserve"> Nu kunnen </w:t>
-      </w:r>
-      <w:proofErr w:type="gramStart"/>
-      <w:r>
-        <w:rPr>
-          <w:rFonts w:eastAsia="Times New Roman" w:cstheme="minorHAnsi"/>
-          <w:lang w:eastAsia="nl-BE"/>
-        </w:rPr>
-        <w:t>google accounts</w:t>
-      </w:r>
-      <w:proofErr w:type="gramEnd"/>
-      <w:r>
-        <w:rPr>
-          <w:rFonts w:eastAsia="Times New Roman" w:cstheme="minorHAnsi"/>
-          <w:lang w:eastAsia="nl-BE"/>
-        </w:rPr>
-        <w:t xml:space="preserve"> succesvol worden toegevoegd.</w:t>
+        <w:t xml:space="preserve"> Nu kunnen google accounts succesvol worden toegevoegd.</w:t>
       </w:r>
       <w:r>
         <w:rPr>
@@ -3086,13 +2110,8 @@
           <w:numId w:val="2"/>
         </w:numPr>
       </w:pPr>
-      <w:proofErr w:type="spellStart"/>
-      <w:r>
-        <w:t>Firebase</w:t>
-      </w:r>
-      <w:proofErr w:type="spellEnd"/>
-      <w:r>
-        <w:t xml:space="preserve"> </w:t>
+      <w:r>
+        <w:t xml:space="preserve">Firebase </w:t>
       </w:r>
       <w:r>
         <w:t>storage</w:t>
@@ -3134,43 +2153,19 @@
     </w:p>
     <w:p>
       <w:r>
-        <w:t xml:space="preserve">Vandaag ben ik begonnen met aanmaken van de </w:t>
-      </w:r>
-      <w:proofErr w:type="spellStart"/>
-      <w:r>
-        <w:t>Firebase</w:t>
-      </w:r>
-      <w:proofErr w:type="spellEnd"/>
-      <w:r>
-        <w:t xml:space="preserve"> storage voor het opslaan van afbeeldingen.</w:t>
+        <w:t>Vandaag ben ik begonnen met aanmaken van de Firebase storage voor het opslaan van afbeeldingen.</w:t>
       </w:r>
       <w:r>
         <w:t xml:space="preserve"> </w:t>
       </w:r>
       <w:r>
-        <w:t xml:space="preserve">Ik heb dan de </w:t>
-      </w:r>
-      <w:proofErr w:type="spellStart"/>
-      <w:r>
-        <w:t>dependencies</w:t>
-      </w:r>
-      <w:proofErr w:type="spellEnd"/>
-      <w:r>
-        <w:t xml:space="preserve"> toegevoegd en dan moest ik een Cloud storage bucket aanmaken. Hierbij werd er gevraagd om een locatie te kiezen waarbij Europe-west 1 (= Belgische regio) niet tussen stond, maar gelukkig is er Eur3 die eigenlijk Belgische en Nederlandse regio voorstelt. Dat werd uitgelegd </w:t>
-      </w:r>
-      <w:r>
-        <w:t xml:space="preserve">op deze </w:t>
-      </w:r>
-      <w:proofErr w:type="gramStart"/>
-      <w:r>
-        <w:t>webpagina</w:t>
-      </w:r>
-      <w:r>
-        <w:t>‘</w:t>
-      </w:r>
-      <w:proofErr w:type="gramEnd"/>
-      <w:r>
-        <w:t>s</w:t>
+        <w:t xml:space="preserve">Ik heb dan de dependencies toegevoegd en dan moest ik een Cloud storage bucket aanmaken. Hierbij werd er gevraagd om een locatie te kiezen waarbij Europe-west 1 (= Belgische regio) niet tussen stond, maar gelukkig is er Eur3 die eigenlijk Belgische en Nederlandse regio voorstelt. Dat werd uitgelegd </w:t>
+      </w:r>
+      <w:r>
+        <w:t>op deze webpagina</w:t>
+      </w:r>
+      <w:r>
+        <w:t>‘s</w:t>
       </w:r>
       <w:r>
         <w:t>:</w:t>
@@ -3277,52 +2272,12 @@
     </w:p>
     <w:p>
       <w:r>
-        <w:t xml:space="preserve">Vandaag heb ik de </w:t>
-      </w:r>
-      <w:proofErr w:type="spellStart"/>
-      <w:r>
-        <w:t>java</w:t>
-      </w:r>
-      <w:proofErr w:type="spellEnd"/>
-      <w:r>
-        <w:t xml:space="preserve"> code moet schrijven voor de camera te kunnen gebruiken. Eerst heb ik code toegevoegd dat ervoor zorgt dat de permissies worden aangevraagd om de camera te kunnen gebruiken. Daarna als ik </w:t>
-      </w:r>
-      <w:proofErr w:type="spellStart"/>
-      <w:r>
-        <w:t>allow</w:t>
-      </w:r>
-      <w:proofErr w:type="spellEnd"/>
-      <w:r>
-        <w:t xml:space="preserve"> klik dan opent een test camera zicht van de emulator. </w:t>
-      </w:r>
-    </w:p>
-    <w:p>
-      <w:r>
-        <w:t xml:space="preserve">Hierbij werden gelijkaardig methoden gebruikt zoals de </w:t>
-      </w:r>
-      <w:proofErr w:type="spellStart"/>
-      <w:r>
-        <w:t>firebase</w:t>
-      </w:r>
-      <w:proofErr w:type="spellEnd"/>
-      <w:r>
-        <w:t xml:space="preserve"> </w:t>
-      </w:r>
-      <w:proofErr w:type="spellStart"/>
-      <w:r>
-        <w:t>authentication</w:t>
-      </w:r>
-      <w:proofErr w:type="spellEnd"/>
-      <w:r>
-        <w:t xml:space="preserve">, maar waren ook </w:t>
-      </w:r>
-      <w:proofErr w:type="spellStart"/>
-      <w:r>
-        <w:t>deprecated</w:t>
-      </w:r>
-      <w:proofErr w:type="spellEnd"/>
-      <w:r>
-        <w:t>. Dit heb natuurlijk makkelijk opgelost.</w:t>
+        <w:t xml:space="preserve">Vandaag heb ik de java code moet schrijven voor de camera te kunnen gebruiken. Eerst heb ik code toegevoegd dat ervoor zorgt dat de permissies worden aangevraagd om de camera te kunnen gebruiken. Daarna als ik allow klik dan opent een test camera zicht van de emulator. </w:t>
+      </w:r>
+    </w:p>
+    <w:p>
+      <w:r>
+        <w:t>Hierbij werden gelijkaardig methoden gebruikt zoals de firebase authentication, maar waren ook deprecated. Dit heb natuurlijk makkelijk opgelost.</w:t>
       </w:r>
     </w:p>
     <w:p>
@@ -3396,15 +2351,7 @@
     </w:p>
     <w:p>
       <w:r>
-        <w:t xml:space="preserve">Vandaag heb ik geprobeerd om de image die getrokken wordt op te slaan in </w:t>
-      </w:r>
-      <w:proofErr w:type="spellStart"/>
-      <w:r>
-        <w:t>firebase</w:t>
-      </w:r>
-      <w:proofErr w:type="spellEnd"/>
-      <w:r>
-        <w:t xml:space="preserve"> storage</w:t>
+        <w:t>Vandaag heb ik geprobeerd om de image die getrokken wordt op te slaan in firebase storage</w:t>
       </w:r>
       <w:r>
         <w:t>. Dit is op het einde van de les gelukt.</w:t>
@@ -3458,90 +2405,10 @@
     <w:p>
       <w:r>
         <w:lastRenderedPageBreak/>
-        <w:t xml:space="preserve">Hierbij had ik vooral problemen met de </w:t>
-      </w:r>
-      <w:proofErr w:type="spellStart"/>
-      <w:r>
-        <w:t>uri</w:t>
-      </w:r>
-      <w:proofErr w:type="spellEnd"/>
-      <w:r>
-        <w:t xml:space="preserve"> </w:t>
-      </w:r>
-      <w:proofErr w:type="spellStart"/>
-      <w:r>
-        <w:t>oftewl</w:t>
-      </w:r>
-      <w:proofErr w:type="spellEnd"/>
-      <w:r>
-        <w:t xml:space="preserve"> URL omdat </w:t>
-      </w:r>
-      <w:proofErr w:type="spellStart"/>
-      <w:r>
-        <w:t>firebase</w:t>
-      </w:r>
-      <w:proofErr w:type="spellEnd"/>
-      <w:r>
-        <w:t xml:space="preserve"> die nodig had om te kunnen uploaden. Als je naar de eerste rode streep kijkt is er een methode voor </w:t>
-      </w:r>
-      <w:r>
-        <w:t xml:space="preserve">de </w:t>
-      </w:r>
-      <w:proofErr w:type="spellStart"/>
-      <w:r>
-        <w:t>bitmap</w:t>
-      </w:r>
-      <w:proofErr w:type="spellEnd"/>
-      <w:r>
-        <w:t xml:space="preserve"> die je krijgt van de camera te gebruiken om de </w:t>
-      </w:r>
-      <w:proofErr w:type="spellStart"/>
-      <w:r>
-        <w:t>uri</w:t>
-      </w:r>
-      <w:proofErr w:type="spellEnd"/>
-      <w:r>
-        <w:t xml:space="preserve"> te bepalen. De volgende is voor de bestandextensie te krijgen om een </w:t>
-      </w:r>
-      <w:proofErr w:type="spellStart"/>
-      <w:r>
-        <w:t>filename</w:t>
-      </w:r>
-      <w:proofErr w:type="spellEnd"/>
-      <w:r>
-        <w:t xml:space="preserve"> op te stellen in de </w:t>
-      </w:r>
-      <w:proofErr w:type="spellStart"/>
-      <w:r>
-        <w:t>firebase</w:t>
-      </w:r>
-      <w:proofErr w:type="spellEnd"/>
-      <w:r>
-        <w:t xml:space="preserve"> storage. Hierbij pak ik gewoon het tijdstip met de bestandextensie, maar ik ben misschien van plan om de </w:t>
-      </w:r>
-      <w:proofErr w:type="spellStart"/>
-      <w:r>
-        <w:t>filename</w:t>
-      </w:r>
-      <w:proofErr w:type="spellEnd"/>
-      <w:r>
-        <w:t xml:space="preserve"> te kunnen aanpassen door de gebruiker. De laatste streep zijn twee </w:t>
-      </w:r>
-      <w:proofErr w:type="spellStart"/>
-      <w:r>
-        <w:t>child</w:t>
-      </w:r>
-      <w:proofErr w:type="spellEnd"/>
-      <w:r>
-        <w:t xml:space="preserve"> </w:t>
-      </w:r>
-      <w:proofErr w:type="spellStart"/>
-      <w:r>
-        <w:t>methods</w:t>
-      </w:r>
-      <w:proofErr w:type="spellEnd"/>
-      <w:r>
-        <w:t xml:space="preserve"> waarbij dus de eerste de map voorstelt waar dan de 2</w:t>
+        <w:t xml:space="preserve">Hierbij had ik vooral problemen met de uri oftewl URL omdat firebase die nodig had om te kunnen uploaden. Als je naar de eerste rode streep kijkt is er een methode voor </w:t>
+      </w:r>
+      <w:r>
+        <w:t>de bitmap die je krijgt van de camera te gebruiken om de uri te bepalen. De volgende is voor de bestandextensie te krijgen om een filename op te stellen in de firebase storage. Hierbij pak ik gewoon het tijdstip met de bestandextensie, maar ik ben misschien van plan om de filename te kunnen aanpassen door de gebruiker. De laatste streep zijn twee child methods waarbij dus de eerste de map voorstelt waar dan de 2</w:t>
       </w:r>
       <w:r>
         <w:rPr>
@@ -3550,23 +2417,7 @@
         <w:t>de</w:t>
       </w:r>
       <w:r>
-        <w:t xml:space="preserve"> </w:t>
-      </w:r>
-      <w:proofErr w:type="spellStart"/>
-      <w:r>
-        <w:t>child</w:t>
-      </w:r>
-      <w:proofErr w:type="spellEnd"/>
-      <w:r>
-        <w:t xml:space="preserve"> oftewel de image inkomt. De map geef </w:t>
-      </w:r>
-      <w:proofErr w:type="gramStart"/>
-      <w:r>
-        <w:t>ik  het</w:t>
-      </w:r>
-      <w:proofErr w:type="gramEnd"/>
-      <w:r>
-        <w:t xml:space="preserve"> email adres van de gebruiker als naam.</w:t>
+        <w:t xml:space="preserve"> child oftewel de image inkomt. De map geef ik  het email adres van de gebruiker als naam.</w:t>
       </w:r>
     </w:p>
     <w:p>
@@ -3706,15 +2557,7 @@
         <w:t>je gsm</w:t>
       </w:r>
       <w:r>
-        <w:t xml:space="preserve"> </w:t>
-      </w:r>
-      <w:proofErr w:type="spellStart"/>
-      <w:r>
-        <w:t>gallery</w:t>
-      </w:r>
-      <w:proofErr w:type="spellEnd"/>
-      <w:r>
-        <w:t xml:space="preserve"> gebruiken)</w:t>
+        <w:t xml:space="preserve"> gallery gebruiken)</w:t>
       </w:r>
     </w:p>
     <w:p/>
@@ -3735,23 +2578,7 @@
     </w:p>
     <w:p>
       <w:r>
-        <w:t xml:space="preserve">Vandaag heb ik geprobeerd om een </w:t>
-      </w:r>
-      <w:proofErr w:type="spellStart"/>
-      <w:r>
-        <w:t>gridview</w:t>
-      </w:r>
-      <w:proofErr w:type="spellEnd"/>
-      <w:r>
-        <w:t xml:space="preserve"> toe te voegen die images bevat dat dus lijkt op een image </w:t>
-      </w:r>
-      <w:proofErr w:type="spellStart"/>
-      <w:r>
-        <w:t>gallery</w:t>
-      </w:r>
-      <w:proofErr w:type="spellEnd"/>
-      <w:r>
-        <w:t xml:space="preserve"> zoals uw “foto’s” app. Hierbij heb ik de </w:t>
+        <w:t xml:space="preserve">Vandaag heb ik geprobeerd om een gridview toe te voegen die images bevat dat dus lijkt op een image gallery zoals uw “foto’s” app. Hierbij heb ik de </w:t>
       </w:r>
       <w:r>
         <w:t>volgende</w:t>
@@ -3796,15 +2623,7 @@
     </w:p>
     <w:p>
       <w:r>
-        <w:t xml:space="preserve">Dit heeft nog niet direct resultaat gegeven, maar de </w:t>
-      </w:r>
-      <w:proofErr w:type="spellStart"/>
-      <w:r>
-        <w:t>GridAdapter</w:t>
-      </w:r>
-      <w:proofErr w:type="spellEnd"/>
-      <w:r>
-        <w:t xml:space="preserve"> class geeft een gevoel dat ik wel op de goeie weg zit.</w:t>
+        <w:t>Dit heeft nog niet direct resultaat gegeven, maar de GridAdapter class geeft een gevoel dat ik wel op de goeie weg zit.</w:t>
       </w:r>
     </w:p>
     <w:p/>
@@ -3825,31 +2644,7 @@
     </w:p>
     <w:p>
       <w:r>
-        <w:t xml:space="preserve">Na de </w:t>
-      </w:r>
-      <w:proofErr w:type="spellStart"/>
-      <w:r>
-        <w:t>GridAdapter</w:t>
-      </w:r>
-      <w:proofErr w:type="spellEnd"/>
-      <w:r>
-        <w:t xml:space="preserve"> klasse te controleren ontdekte ik dat ik gewoon het verkeerd image </w:t>
-      </w:r>
-      <w:proofErr w:type="spellStart"/>
-      <w:r>
-        <w:t>Id</w:t>
-      </w:r>
-      <w:proofErr w:type="spellEnd"/>
-      <w:r>
-        <w:t xml:space="preserve"> doorgegeven heb. Dit heeft het probleem onmiddellijk </w:t>
-      </w:r>
-      <w:proofErr w:type="spellStart"/>
-      <w:r>
-        <w:t>gefixed</w:t>
-      </w:r>
-      <w:proofErr w:type="spellEnd"/>
-      <w:r>
-        <w:t xml:space="preserve"> als zijn de voorbeeld images niet echt mooi gepositioneerd.</w:t>
+        <w:t>Na de GridAdapter klasse te controleren ontdekte ik dat ik gewoon het verkeerd image Id doorgegeven heb. Dit heeft het probleem onmiddellijk gefixed als zijn de voorbeeld images niet echt mooi gepositioneerd.</w:t>
       </w:r>
     </w:p>
     <w:p>
@@ -3903,15 +2698,7 @@
         <w:t>gedetailleerd</w:t>
       </w:r>
       <w:r>
-        <w:t xml:space="preserve"> tutorial gevolgd hoe je met een </w:t>
-      </w:r>
-      <w:proofErr w:type="spellStart"/>
-      <w:r>
-        <w:t>gridview</w:t>
-      </w:r>
-      <w:proofErr w:type="spellEnd"/>
-      <w:r>
-        <w:t xml:space="preserve"> kan werken:</w:t>
+        <w:t xml:space="preserve"> tutorial gevolgd hoe je met een gridview kan werken:</w:t>
       </w:r>
     </w:p>
     <w:p>
@@ -3926,63 +2713,10 @@
     </w:p>
     <w:p>
       <w:r>
-        <w:t xml:space="preserve">Daarna heb ik er nog voor gezorgd dat de </w:t>
-      </w:r>
-      <w:proofErr w:type="spellStart"/>
-      <w:r>
-        <w:t>margin</w:t>
-      </w:r>
-      <w:proofErr w:type="spellEnd"/>
-      <w:r>
-        <w:t xml:space="preserve"> top en </w:t>
-      </w:r>
-      <w:proofErr w:type="spellStart"/>
-      <w:r>
-        <w:t>bottom</w:t>
-      </w:r>
-      <w:proofErr w:type="spellEnd"/>
-      <w:r>
-        <w:t xml:space="preserve"> via </w:t>
-      </w:r>
-      <w:proofErr w:type="spellStart"/>
-      <w:r>
-        <w:t>java</w:t>
-      </w:r>
-      <w:proofErr w:type="spellEnd"/>
-      <w:r>
-        <w:t xml:space="preserve"> code worden aangepast afhankelijk van de </w:t>
-      </w:r>
-      <w:r>
-        <w:t xml:space="preserve">hoogte van de header en </w:t>
-      </w:r>
-      <w:proofErr w:type="spellStart"/>
-      <w:r>
-        <w:t>footer</w:t>
-      </w:r>
-      <w:proofErr w:type="spellEnd"/>
-      <w:r>
-        <w:t xml:space="preserve">. Dit </w:t>
-      </w:r>
-      <w:proofErr w:type="spellStart"/>
-      <w:r>
-        <w:t>werdt</w:t>
-      </w:r>
-      <w:proofErr w:type="spellEnd"/>
-      <w:r>
-        <w:t xml:space="preserve"> gedaan in </w:t>
-      </w:r>
-      <w:proofErr w:type="spellStart"/>
-      <w:proofErr w:type="gramStart"/>
-      <w:r>
-        <w:t>OnCreateView</w:t>
-      </w:r>
-      <w:proofErr w:type="spellEnd"/>
-      <w:r>
-        <w:t>(</w:t>
-      </w:r>
-      <w:proofErr w:type="gramEnd"/>
-      <w:r>
-        <w:t>):</w:t>
+        <w:t xml:space="preserve">Daarna heb ik er nog voor gezorgd dat de margin top en bottom via java code worden aangepast afhankelijk van de </w:t>
+      </w:r>
+      <w:r>
+        <w:t>hoogte van de header en footer. Dit werdt gedaan in OnCreateView():</w:t>
       </w:r>
     </w:p>
     <w:p>
@@ -4030,66 +2764,13 @@
     </w:p>
     <w:p>
       <w:r>
-        <w:t xml:space="preserve">Ik heb dan de elementen een witte achtergrond gegeven en dan een border rond gedaan dat eigenlijk vrij moeilijk en inefficiënt moet worden opgeroepen in </w:t>
-      </w:r>
-      <w:proofErr w:type="spellStart"/>
-      <w:r>
-        <w:t>android</w:t>
-      </w:r>
-      <w:proofErr w:type="spellEnd"/>
-      <w:r>
-        <w:t xml:space="preserve"> studio door middel van een &lt;</w:t>
-      </w:r>
-      <w:proofErr w:type="spellStart"/>
-      <w:r>
-        <w:t>shape</w:t>
-      </w:r>
-      <w:proofErr w:type="spellEnd"/>
-      <w:r>
-        <w:t xml:space="preserve">&gt; </w:t>
-      </w:r>
-      <w:proofErr w:type="spellStart"/>
-      <w:r>
-        <w:t>xml</w:t>
-      </w:r>
-      <w:proofErr w:type="spellEnd"/>
-      <w:r>
-        <w:t xml:space="preserve"> file te maken in de </w:t>
-      </w:r>
-      <w:proofErr w:type="spellStart"/>
-      <w:r>
-        <w:t>res</w:t>
-      </w:r>
-      <w:proofErr w:type="spellEnd"/>
-      <w:r>
-        <w:t>/</w:t>
-      </w:r>
-      <w:proofErr w:type="spellStart"/>
-      <w:r>
-        <w:t>drawable</w:t>
-      </w:r>
-      <w:proofErr w:type="spellEnd"/>
-      <w:r>
-        <w:t xml:space="preserve"> folder en die een </w:t>
-      </w:r>
-      <w:proofErr w:type="spellStart"/>
-      <w:r>
-        <w:t>stroke</w:t>
-      </w:r>
-      <w:proofErr w:type="spellEnd"/>
+        <w:t>Ik heb dan de elementen een witte achtergrond gegeven en dan een border rond gedaan dat eigenlijk vrij moeilijk en inefficiënt moet worden opgeroepen in android studio door middel van een &lt;shape&gt; xml file te maken in de res/drawable folder en die een stroke</w:t>
+      </w:r>
       <w:r>
         <w:t>, enzoverder</w:t>
       </w:r>
       <w:r>
-        <w:t xml:space="preserve"> te geven. Dan wordt deze </w:t>
-      </w:r>
-      <w:proofErr w:type="spellStart"/>
-      <w:r>
-        <w:t>drawable</w:t>
-      </w:r>
-      <w:proofErr w:type="spellEnd"/>
-      <w:r>
-        <w:t xml:space="preserve"> als achtergrond geplaatst van de imageview.</w:t>
+        <w:t xml:space="preserve"> te geven. Dan wordt deze drawable als achtergrond geplaatst van de imageview.</w:t>
       </w:r>
       <w:r>
         <w:t xml:space="preserve"> De lege elementen zijn gewoon witte icoontjes die dus niet zichtbaar zijn door de witte achtergrond.</w:t>
@@ -4140,23 +2821,7 @@
     <w:p/>
     <w:p>
       <w:r>
-        <w:t xml:space="preserve">Om te eindigen, moest ik nog de images van </w:t>
-      </w:r>
-      <w:proofErr w:type="spellStart"/>
-      <w:r>
-        <w:t>firebase</w:t>
-      </w:r>
-      <w:proofErr w:type="spellEnd"/>
-      <w:r>
-        <w:t xml:space="preserve"> toevoegen hierbij heb ik vooral code van stackoverflow gebruikt om mijn oude klassen en </w:t>
-      </w:r>
-      <w:proofErr w:type="spellStart"/>
-      <w:r>
-        <w:t>methods</w:t>
-      </w:r>
-      <w:proofErr w:type="spellEnd"/>
-      <w:r>
-        <w:t xml:space="preserve"> te verbeteren.</w:t>
+        <w:t>Om te eindigen, moest ik nog de images van firebase toevoegen hierbij heb ik vooral code van stackoverflow gebruikt om mijn oude klassen en methods te verbeteren.</w:t>
       </w:r>
     </w:p>
     <w:p>
@@ -4253,83 +2918,14 @@
     </w:p>
     <w:p>
       <w:r>
-        <w:t xml:space="preserve">Ik had een image asset toegevoegd dat dus </w:t>
-      </w:r>
-      <w:proofErr w:type="gramStart"/>
-      <w:r>
-        <w:t>er voor</w:t>
-      </w:r>
-      <w:proofErr w:type="gramEnd"/>
-      <w:r>
-        <w:t xml:space="preserve"> zorgde dat de oude logo files worden vervangen. Hierbij heb een logo afbeelding als </w:t>
-      </w:r>
-      <w:proofErr w:type="spellStart"/>
-      <w:r>
-        <w:t>foreground</w:t>
-      </w:r>
-      <w:proofErr w:type="spellEnd"/>
-      <w:r>
-        <w:t xml:space="preserve"> en een transparant afbeelding als background. Maar dit wou niet helemaal werken door </w:t>
-      </w:r>
-      <w:proofErr w:type="spellStart"/>
-      <w:r>
-        <w:t>adaptive</w:t>
-      </w:r>
-      <w:proofErr w:type="spellEnd"/>
-      <w:r>
-        <w:t xml:space="preserve"> icon en </w:t>
-      </w:r>
-      <w:proofErr w:type="spellStart"/>
-      <w:r>
-        <w:t>legacy</w:t>
-      </w:r>
-      <w:proofErr w:type="spellEnd"/>
-      <w:r>
-        <w:t xml:space="preserve"> optie. De app als het om mijn emulator </w:t>
+        <w:t xml:space="preserve">Ik had een image asset toegevoegd dat dus er voor zorgde dat de oude logo files worden vervangen. Hierbij heb een logo afbeelding als foreground en een transparant afbeelding als background. Maar dit wou niet helemaal werken door adaptive icon en legacy optie. De app als het om mijn emulator </w:t>
       </w:r>
       <w:r>
         <w:lastRenderedPageBreak/>
-        <w:t xml:space="preserve">staat kreeg een zwarte achtergrond omdat transparant niet bestaat bij </w:t>
-      </w:r>
-      <w:proofErr w:type="spellStart"/>
-      <w:r>
-        <w:t>adaptive</w:t>
-      </w:r>
-      <w:proofErr w:type="spellEnd"/>
-      <w:r>
-        <w:t xml:space="preserve"> </w:t>
-      </w:r>
-      <w:proofErr w:type="spellStart"/>
-      <w:r>
-        <w:t>icons</w:t>
-      </w:r>
-      <w:proofErr w:type="spellEnd"/>
-      <w:r>
-        <w:t xml:space="preserve">. Dus wat ik gedaan had was het gewoon op </w:t>
-      </w:r>
-      <w:proofErr w:type="spellStart"/>
-      <w:r>
-        <w:t>legacy</w:t>
-      </w:r>
-      <w:proofErr w:type="spellEnd"/>
-      <w:r>
-        <w:t xml:space="preserve"> </w:t>
-      </w:r>
-      <w:proofErr w:type="spellStart"/>
-      <w:r>
-        <w:t>only</w:t>
-      </w:r>
-      <w:proofErr w:type="spellEnd"/>
-      <w:r>
-        <w:t xml:space="preserve"> optie zetten waar ik gewoon eigenlijk de background kan weghalen door de </w:t>
-      </w:r>
-      <w:proofErr w:type="spellStart"/>
-      <w:r>
-        <w:t>shape</w:t>
-      </w:r>
-      <w:proofErr w:type="spellEnd"/>
-      <w:r>
-        <w:t xml:space="preserve"> als cirkel aan te duiden</w:t>
+        <w:t>staat kreeg een zwarte achtergrond omdat transparant niet bestaat bij adaptive icons. Dus wat ik gedaan had was het gewoon op legacy only</w:t>
+      </w:r>
+      <w:r>
+        <w:t xml:space="preserve"> optie zetten waar ik gewoon eigenlijk de background kan weghalen door de shape als cirkel aan te duiden</w:t>
       </w:r>
       <w:r>
         <w:t>.</w:t>
@@ -4395,31 +2991,7 @@
     </w:p>
     <w:p>
       <w:r>
-        <w:t xml:space="preserve">Vandaag heb ik ervoor gezorgd dat ik image van uw gsm </w:t>
-      </w:r>
-      <w:proofErr w:type="spellStart"/>
-      <w:r>
-        <w:t>gallery</w:t>
-      </w:r>
-      <w:proofErr w:type="spellEnd"/>
-      <w:r>
-        <w:t xml:space="preserve"> kan uploaden. Hierbij dacht ik eerst dat automatisch de </w:t>
-      </w:r>
-      <w:proofErr w:type="spellStart"/>
-      <w:r>
-        <w:t>gallery</w:t>
-      </w:r>
-      <w:proofErr w:type="spellEnd"/>
-      <w:r>
-        <w:t xml:space="preserve"> die klaarstaat in de camera app kon gebruiken zoals bij facebook </w:t>
-      </w:r>
-      <w:proofErr w:type="spellStart"/>
-      <w:r>
-        <w:t>messenger</w:t>
-      </w:r>
-      <w:proofErr w:type="spellEnd"/>
-      <w:r>
-        <w:t>, maar bestaat niet echt blijkbaar. Ik heb hiervoor zelfs een vraag gesteld op stackoverflow.</w:t>
+        <w:t>Vandaag heb ik ervoor gezorgd dat ik image van uw gsm gallery kan uploaden. Hierbij dacht ik eerst dat automatisch de gallery die klaarstaat in de camera app kon gebruiken zoals bij facebook messenger, maar bestaat niet echt blijkbaar. Ik heb hiervoor zelfs een vraag gesteld op stackoverflow.</w:t>
       </w:r>
     </w:p>
     <w:p>
@@ -4434,39 +3006,7 @@
     </w:p>
     <w:p>
       <w:r>
-        <w:t xml:space="preserve">Uiteindelijk heb ik gewoon besloten om de camera en </w:t>
-      </w:r>
-      <w:proofErr w:type="spellStart"/>
-      <w:r>
-        <w:t>gallery</w:t>
-      </w:r>
-      <w:proofErr w:type="spellEnd"/>
-      <w:r>
-        <w:t xml:space="preserve"> op te splitsen en te kunnen openen in </w:t>
-      </w:r>
-      <w:proofErr w:type="spellStart"/>
-      <w:r>
-        <w:t>popup</w:t>
-      </w:r>
-      <w:proofErr w:type="spellEnd"/>
-      <w:r>
-        <w:t xml:space="preserve"> </w:t>
-      </w:r>
-      <w:proofErr w:type="gramStart"/>
-      <w:r>
-        <w:t>keuze menu</w:t>
-      </w:r>
-      <w:proofErr w:type="gramEnd"/>
-      <w:r>
-        <w:t xml:space="preserve">. De code voor de </w:t>
-      </w:r>
-      <w:proofErr w:type="spellStart"/>
-      <w:r>
-        <w:t>gallery</w:t>
-      </w:r>
-      <w:proofErr w:type="spellEnd"/>
-      <w:r>
-        <w:t xml:space="preserve"> functionaliteiten </w:t>
+        <w:t xml:space="preserve">Uiteindelijk heb ik gewoon besloten om de camera en gallery op te splitsen en te kunnen openen in popup keuze menu. De code voor de gallery functionaliteiten </w:t>
       </w:r>
       <w:r>
         <w:t>is</w:t>
@@ -4565,23 +3105,7 @@
         </w:numPr>
       </w:pPr>
       <w:r>
-        <w:t xml:space="preserve">Vragen dat het ok is om je image te </w:t>
-      </w:r>
-      <w:proofErr w:type="spellStart"/>
-      <w:r>
-        <w:t>compressen</w:t>
-      </w:r>
-      <w:proofErr w:type="spellEnd"/>
-      <w:r>
-        <w:t xml:space="preserve"> (</w:t>
-      </w:r>
-      <w:proofErr w:type="spellStart"/>
-      <w:r>
-        <w:t>quality</w:t>
-      </w:r>
-      <w:proofErr w:type="spellEnd"/>
-      <w:r>
-        <w:t xml:space="preserve"> verlies?)</w:t>
+        <w:t>Vragen dat het ok is om je image te compressen (quality verlies?)</w:t>
       </w:r>
     </w:p>
     <w:p>
@@ -4593,21 +3117,8 @@
         </w:numPr>
       </w:pPr>
       <w:r>
-        <w:t xml:space="preserve">Image van de </w:t>
-      </w:r>
-      <w:proofErr w:type="spellStart"/>
-      <w:r>
-        <w:t>gridview</w:t>
-      </w:r>
-      <w:proofErr w:type="spellEnd"/>
-      <w:r>
-        <w:t xml:space="preserve"> kunnen openen in full </w:t>
-      </w:r>
-      <w:proofErr w:type="spellStart"/>
-      <w:r>
-        <w:t>size</w:t>
-      </w:r>
-      <w:proofErr w:type="spellEnd"/>
+        <w:t>Image van de gridview kunnen openen in full size</w:t>
+      </w:r>
     </w:p>
     <w:p>
       <w:pPr>
@@ -4618,15 +3129,7 @@
         </w:numPr>
       </w:pPr>
       <w:r>
-        <w:t xml:space="preserve">App op google </w:t>
-      </w:r>
-      <w:proofErr w:type="spellStart"/>
-      <w:r>
-        <w:t>playstore</w:t>
-      </w:r>
-      <w:proofErr w:type="spellEnd"/>
-      <w:r>
-        <w:t xml:space="preserve"> plaatsen!!</w:t>
+        <w:t>App op google playstore plaatsen!!</w:t>
       </w:r>
     </w:p>
     <w:p>
@@ -4637,13 +3140,8 @@
           <w:numId w:val="2"/>
         </w:numPr>
       </w:pPr>
-      <w:proofErr w:type="spellStart"/>
-      <w:r>
-        <w:t>Offfline</w:t>
-      </w:r>
-      <w:proofErr w:type="spellEnd"/>
-      <w:r>
-        <w:t xml:space="preserve"> functionaliteiten toevoegen?</w:t>
+      <w:r>
+        <w:t>Offfline functionaliteiten toevoegen?</w:t>
       </w:r>
     </w:p>
     <w:p/>
@@ -4664,82 +3162,16 @@
     </w:p>
     <w:p>
       <w:r>
-        <w:t xml:space="preserve">Vandaag wou ik beginnen met het uploaden van mijn app op google </w:t>
-      </w:r>
-      <w:proofErr w:type="spellStart"/>
-      <w:r>
-        <w:t>play</w:t>
-      </w:r>
-      <w:proofErr w:type="spellEnd"/>
-      <w:r>
-        <w:t xml:space="preserve"> maar toen ik tutorial volgde moest ik eerst mijn app package name veranderen want </w:t>
-      </w:r>
-      <w:proofErr w:type="spellStart"/>
-      <w:r>
-        <w:t>com.example</w:t>
-      </w:r>
-      <w:proofErr w:type="spellEnd"/>
-      <w:r>
-        <w:t xml:space="preserve"> is niet correct. Toen ik dat veranderen </w:t>
-      </w:r>
-      <w:r>
-        <w:t xml:space="preserve">werkte de google services niet meer want de package name was </w:t>
-      </w:r>
-      <w:proofErr w:type="spellStart"/>
-      <w:r>
-        <w:t>com.example</w:t>
-      </w:r>
-      <w:proofErr w:type="spellEnd"/>
-      <w:r>
-        <w:t xml:space="preserve"> in de google-</w:t>
-      </w:r>
-      <w:proofErr w:type="spellStart"/>
-      <w:proofErr w:type="gramStart"/>
-      <w:r>
-        <w:t>services.json</w:t>
-      </w:r>
-      <w:proofErr w:type="spellEnd"/>
-      <w:proofErr w:type="gramEnd"/>
-      <w:r>
-        <w:t xml:space="preserve"> file. Dus ik moest mijn app in </w:t>
-      </w:r>
-      <w:proofErr w:type="spellStart"/>
-      <w:r>
-        <w:t>firebase</w:t>
-      </w:r>
-      <w:proofErr w:type="spellEnd"/>
-      <w:r>
-        <w:t xml:space="preserve"> opnieuw maken dat niet echt moeilijk was.</w:t>
-      </w:r>
-      <w:r>
-        <w:t xml:space="preserve"> Daarna heb ik een </w:t>
-      </w:r>
-      <w:proofErr w:type="spellStart"/>
-      <w:r>
-        <w:t>android</w:t>
-      </w:r>
-      <w:proofErr w:type="spellEnd"/>
-      <w:r>
-        <w:t xml:space="preserve"> app </w:t>
-      </w:r>
-      <w:proofErr w:type="spellStart"/>
-      <w:r>
-        <w:t>bundle</w:t>
-      </w:r>
-      <w:proofErr w:type="spellEnd"/>
-      <w:r>
-        <w:t xml:space="preserve"> aangemaakt want dit is nodig voor de release.</w:t>
-      </w:r>
-      <w:r>
-        <w:t xml:space="preserve"> Ze vroeg dan om </w:t>
-      </w:r>
-      <w:proofErr w:type="spellStart"/>
-      <w:r>
-        <w:t>developer</w:t>
-      </w:r>
-      <w:proofErr w:type="spellEnd"/>
-      <w:r>
-        <w:t xml:space="preserve"> account aan te maken waarbij ik 1 keer 25 euro moest betalen. Daarbij was ik effe gestopt want mijn ouders waren niet thuis voor een mastercard te gebruiken.</w:t>
+        <w:t xml:space="preserve">Vandaag wou ik beginnen met het uploaden van mijn app op google play maar toen ik tutorial volgde moest ik eerst mijn app package name veranderen want com.example is niet correct. Toen ik dat veranderen </w:t>
+      </w:r>
+      <w:r>
+        <w:t>werkte de google services niet meer want de package name was com.example in de google-services.json file. Dus ik moest mijn app in firebase opnieuw maken dat niet echt moeilijk was.</w:t>
+      </w:r>
+      <w:r>
+        <w:t xml:space="preserve"> Daarna heb ik een android app bundle aangemaakt want dit is nodig voor de release.</w:t>
+      </w:r>
+      <w:r>
+        <w:t xml:space="preserve"> Ze vroeg dan om developer account aan te maken waarbij ik 1 keer 25 euro moest betalen. Daarbij was ik effe gestopt want mijn ouders waren niet thuis voor een mastercard te gebruiken.</w:t>
       </w:r>
     </w:p>
     <w:p>
@@ -4816,15 +3248,7 @@
     </w:p>
     <w:p>
       <w:r>
-        <w:t xml:space="preserve">In de avond heb ik dan mijn </w:t>
-      </w:r>
-      <w:proofErr w:type="spellStart"/>
-      <w:r>
-        <w:t>developer</w:t>
-      </w:r>
-      <w:proofErr w:type="spellEnd"/>
-      <w:r>
-        <w:t xml:space="preserve"> account aangemaakt.</w:t>
+        <w:t>In de avond heb ik dan mijn developer account aangemaakt.</w:t>
       </w:r>
     </w:p>
     <w:p/>
@@ -4848,23 +3272,7 @@
         <w:t>Vandaag ben ik effe kort begonnen met het beter beveiligen van het wachtwoord om te registeren en in te loggen</w:t>
       </w:r>
       <w:r>
-        <w:t xml:space="preserve">. Hierbij vraag ik dus dat het wachtwoord een kleine letter, grote letter, geen spaties, 1 nummer en een lengte van 8 tekens heeft. Dit wordt weergegeven als een error onder de wachtwoord </w:t>
-      </w:r>
-      <w:proofErr w:type="spellStart"/>
-      <w:r>
-        <w:t>textbox</w:t>
-      </w:r>
-      <w:proofErr w:type="spellEnd"/>
-      <w:r>
-        <w:t xml:space="preserve">. Het email wordt dankzij </w:t>
-      </w:r>
-      <w:proofErr w:type="spellStart"/>
-      <w:r>
-        <w:t>firebase</w:t>
-      </w:r>
-      <w:proofErr w:type="spellEnd"/>
-      <w:r>
-        <w:t xml:space="preserve"> al gevalideerd dat het correct is, dus ik moet zelf geen error toevoegen. </w:t>
+        <w:t xml:space="preserve">. Hierbij vraag ik dus dat het wachtwoord een kleine letter, grote letter, geen spaties, 1 nummer en een lengte van 8 tekens heeft. Dit wordt weergegeven als een error onder de wachtwoord textbox. Het email wordt dankzij firebase al gevalideerd dat het correct is, dus ik moet zelf geen error toevoegen. </w:t>
       </w:r>
       <w:r>
         <w:t>Maar er wordt wel een toast bericht voor de zekerheid weergegeven vanonder als de registratie mislukt</w:t>
@@ -4875,45 +3283,13 @@
     </w:p>
     <w:p>
       <w:r>
-        <w:t xml:space="preserve">Daarna heb ik de app </w:t>
-      </w:r>
-      <w:proofErr w:type="spellStart"/>
-      <w:r>
-        <w:t>bundle</w:t>
-      </w:r>
-      <w:proofErr w:type="spellEnd"/>
-      <w:r>
-        <w:t xml:space="preserve"> </w:t>
+        <w:t xml:space="preserve">Daarna heb ik de app bundle </w:t>
       </w:r>
       <w:r>
         <w:t>geüpdatet</w:t>
       </w:r>
       <w:r>
-        <w:t xml:space="preserve"> naar de volgende versie, omdat er aanpassingen waren. Deze release heb ik dan op google </w:t>
-      </w:r>
-      <w:proofErr w:type="spellStart"/>
-      <w:r>
-        <w:t>play</w:t>
-      </w:r>
-      <w:proofErr w:type="spellEnd"/>
-      <w:r>
-        <w:t xml:space="preserve"> console geüpload, hierbij moest ik nog in </w:t>
-      </w:r>
-      <w:proofErr w:type="gramStart"/>
-      <w:r>
-        <w:t>de dashboard</w:t>
-      </w:r>
-      <w:proofErr w:type="gramEnd"/>
-      <w:r>
-        <w:t xml:space="preserve"> veel taken afleggen. De belangrijksten waren bijvoorbeeld een test account meegeven zodat google dit kan gebruiken om mijn app te controleren, een </w:t>
-      </w:r>
-      <w:proofErr w:type="spellStart"/>
-      <w:r>
-        <w:t>privacybeleid</w:t>
-      </w:r>
-      <w:proofErr w:type="spellEnd"/>
-      <w:r>
-        <w:t xml:space="preserve"> toevoegen hi</w:t>
+        <w:t xml:space="preserve"> naar de volgende versie, omdat er aanpassingen waren. Deze release heb ik dan op google play console geüpload, hierbij moest ik nog in de dashboard veel taken afleggen. De belangrijksten waren bijvoorbeeld een test account meegeven zodat google dit kan gebruiken om mijn app te controleren, een privacybeleid toevoegen hi</w:t>
       </w:r>
       <w:r>
         <w:t>er</w:t>
@@ -4965,77 +3341,13 @@
     </w:p>
     <w:p>
       <w:r>
-        <w:t xml:space="preserve">Hierbij had vooral deze </w:t>
-      </w:r>
-      <w:proofErr w:type="spellStart"/>
-      <w:r>
-        <w:t>youtube</w:t>
-      </w:r>
-      <w:proofErr w:type="spellEnd"/>
-      <w:r>
-        <w:t xml:space="preserve"> video nodig omdat ik de </w:t>
-      </w:r>
-      <w:proofErr w:type="spellStart"/>
-      <w:r>
-        <w:t>uri</w:t>
-      </w:r>
-      <w:proofErr w:type="spellEnd"/>
-      <w:r>
-        <w:t xml:space="preserve"> van de image die ik aan klik moest doorsturen naar het een fragment waar je de </w:t>
-      </w:r>
-      <w:proofErr w:type="spellStart"/>
-      <w:r>
-        <w:t>img</w:t>
-      </w:r>
-      <w:proofErr w:type="spellEnd"/>
-      <w:r>
-        <w:t xml:space="preserve"> in het groot kan bekijken. </w:t>
-      </w:r>
-      <w:r>
-        <w:t xml:space="preserve">Ik maakte toen een keer grote fout door een nieuwe </w:t>
-      </w:r>
-      <w:proofErr w:type="spellStart"/>
-      <w:r>
-        <w:t>imageDetailsFragment</w:t>
-      </w:r>
-      <w:proofErr w:type="spellEnd"/>
-      <w:r>
-        <w:t xml:space="preserve"> te openen als ik eigenlijk een </w:t>
-      </w:r>
-      <w:proofErr w:type="spellStart"/>
-      <w:r>
-        <w:t>bundle</w:t>
-      </w:r>
-      <w:proofErr w:type="spellEnd"/>
-      <w:r>
-        <w:t xml:space="preserve"> (waar de </w:t>
-      </w:r>
-      <w:proofErr w:type="spellStart"/>
-      <w:r>
-        <w:t>uri</w:t>
-      </w:r>
-      <w:proofErr w:type="spellEnd"/>
-      <w:r>
-        <w:t xml:space="preserve"> wordt opgeslagen)</w:t>
-      </w:r>
-      <w:r>
-        <w:t xml:space="preserve"> had toegevoegd aan een </w:t>
-      </w:r>
-      <w:proofErr w:type="spellStart"/>
-      <w:r>
-        <w:t>ImageDetailsFragment</w:t>
-      </w:r>
-      <w:proofErr w:type="spellEnd"/>
-      <w:r>
-        <w:t xml:space="preserve"> als </w:t>
-      </w:r>
-      <w:proofErr w:type="spellStart"/>
-      <w:r>
-        <w:t>arguments</w:t>
-      </w:r>
-      <w:proofErr w:type="spellEnd"/>
-      <w:r>
-        <w:t>. Ik navigeerde eigenlijk naar een fragment zonder argumenten die hard nodig had. Dit heb ik natuurlijk opgelost</w:t>
+        <w:t xml:space="preserve">Hierbij had vooral deze youtube video nodig omdat ik de uri van de image die ik aan klik moest doorsturen naar het een fragment waar je de img in het groot kan bekijken. </w:t>
+      </w:r>
+      <w:r>
+        <w:t>Ik maakte toen een keer grote fout door een nieuwe imageDetailsFragment te openen als ik eigenlijk een bundle (waar de uri wordt opgeslagen)</w:t>
+      </w:r>
+      <w:r>
+        <w:t xml:space="preserve"> had toegevoegd aan een ImageDetailsFragment als arguments. Ik navigeerde eigenlijk naar een fragment zonder argumenten die hard nodig had. Dit heb ik natuurlijk opgelost</w:t>
       </w:r>
       <w:r>
         <w:t xml:space="preserve"> zie onderstaande </w:t>
@@ -5049,15 +3361,7 @@
     </w:p>
     <w:p>
       <w:r>
-        <w:t xml:space="preserve">Het enige probleempje dat er nog is, is dat sommige afbeeldingen die vergroot worden </w:t>
-      </w:r>
-      <w:proofErr w:type="spellStart"/>
-      <w:r>
-        <w:t>onscherm</w:t>
-      </w:r>
-      <w:proofErr w:type="spellEnd"/>
-      <w:r>
-        <w:t xml:space="preserve"> kunnen uitzien.</w:t>
+        <w:t>Het enige probleempje dat er nog is, is dat sommige afbeeldingen die vergroot worden onscherm kunnen uitzien.</w:t>
       </w:r>
       <w:r>
         <w:t xml:space="preserve"> </w:t>
@@ -5135,15 +3439,7 @@
     </w:p>
     <w:p>
       <w:r>
-        <w:t xml:space="preserve">Vandaag heb ik een </w:t>
-      </w:r>
-      <w:proofErr w:type="spellStart"/>
-      <w:r>
-        <w:t>realtime</w:t>
-      </w:r>
-      <w:proofErr w:type="spellEnd"/>
-      <w:r>
-        <w:t xml:space="preserve"> database aangemaakt om een chat functionaliteiten toe te voegen.</w:t>
+        <w:t>Vandaag heb ik een realtime database aangemaakt om een chat functionaliteiten toe te voegen.</w:t>
       </w:r>
       <w:r>
         <w:t xml:space="preserve"> Hierbij ga ik de volgende video’s gebruiken:</w:t>
@@ -5231,13 +3527,8 @@
           <w:numId w:val="2"/>
         </w:numPr>
       </w:pPr>
-      <w:proofErr w:type="spellStart"/>
-      <w:r>
-        <w:t>Offfline</w:t>
-      </w:r>
-      <w:proofErr w:type="spellEnd"/>
-      <w:r>
-        <w:t xml:space="preserve"> functionaliteiten toevoegen?</w:t>
+      <w:r>
+        <w:t>Offfline functionaliteiten toevoegen?</w:t>
       </w:r>
     </w:p>
     <w:p>
@@ -5254,6 +3545,88 @@
     </w:p>
     <w:p/>
     <w:p/>
+    <w:p>
+      <w:pPr>
+        <w:rPr>
+          <w:b/>
+          <w:bCs/>
+        </w:rPr>
+      </w:pPr>
+      <w:r>
+        <w:rPr>
+          <w:b/>
+          <w:bCs/>
+        </w:rPr>
+        <w:lastRenderedPageBreak/>
+        <w:t>30/11/2021:</w:t>
+      </w:r>
+    </w:p>
+    <w:p>
+      <w:r>
+        <w:t>Vandaag is mijn app beschikbaar op google play die je via deze link kan downloaden.</w:t>
+      </w:r>
+    </w:p>
+    <w:p>
+      <w:hyperlink r:id="rId64" w:history="1">
+        <w:r>
+          <w:rPr>
+            <w:rStyle w:val="Hyperlink"/>
+          </w:rPr>
+          <w:t>https://play.google.com/store/apps/details?id=com.notesdf.notable</w:t>
+        </w:r>
+      </w:hyperlink>
+    </w:p>
+    <w:p>
+      <w:r>
+        <w:t>Toen ik het had gedownload merkte ik dat google login niet wou werken. Dit heb ik dan onmiddellijk opgezocht en ik moest gewoon een extra SHA1 fingerp</w:t>
+      </w:r>
+      <w:r>
+        <w:t>r</w:t>
+      </w:r>
+      <w:r>
+        <w:t>int van google play nog toevoegen aan mijn app. Dus nu werkt hij perfect.</w:t>
+      </w:r>
+    </w:p>
+    <w:p>
+      <w:pPr>
+        <w:rPr>
+          <w:rStyle w:val="Hyperlink"/>
+        </w:rPr>
+      </w:pPr>
+      <w:hyperlink r:id="rId65" w:history="1">
+        <w:r>
+          <w:rPr>
+            <w:rStyle w:val="Hyperlink"/>
+          </w:rPr>
+          <w:t>https://stackoverflow.com/questions/39318370/google-sign-in-not-working-after-publishing-in-play-store</w:t>
+        </w:r>
+      </w:hyperlink>
+    </w:p>
+    <w:p>
+      <w:r>
+        <w:t xml:space="preserve">Ik heb dan </w:t>
+      </w:r>
+      <w:r>
+        <w:t>geprobeerd om data toe te voegen aan mijn realtime database maar nog geen succes. Ik moest nu stoppen omdat ik een online gesprek ga hebben voor mijn stage tijdens het 2</w:t>
+      </w:r>
+      <w:r>
+        <w:rPr>
+          <w:vertAlign w:val="superscript"/>
+        </w:rPr>
+        <w:t>de</w:t>
+      </w:r>
+      <w:r>
+        <w:t xml:space="preserve"> semester.</w:t>
+      </w:r>
+    </w:p>
+    <w:p>
+      <w:pPr>
+        <w:rPr>
+          <w:color w:val="0563C1" w:themeColor="hyperlink"/>
+          <w:u w:val="single"/>
+        </w:rPr>
+      </w:pPr>
+    </w:p>
     <w:p/>
     <w:p/>
     <w:p/>

</xml_diff>

<commit_message>
Added a little bit of offline support and added a progress circle for the notes and groups pages
</commit_message>
<xml_diff>
--- a/Logboek_Dries_Fierens.docx
+++ b/Logboek_Dries_Fierens.docx
@@ -3604,10 +3604,7 @@
     </w:p>
     <w:p>
       <w:r>
-        <w:t xml:space="preserve">Ik heb dan </w:t>
-      </w:r>
-      <w:r>
-        <w:t>geprobeerd om data toe te voegen aan mijn realtime database maar nog geen succes. Ik moest nu stoppen omdat ik een online gesprek ga hebben voor mijn stage tijdens het 2</w:t>
+        <w:t>Ik heb dan geprobeerd om data toe te voegen aan mijn realtime database maar nog geen succes. Ik moest nu stoppen omdat ik een online gesprek ga hebben voor mijn stage tijdens het 2</w:t>
       </w:r>
       <w:r>
         <w:rPr>
@@ -3619,18 +3616,208 @@
         <w:t xml:space="preserve"> semester.</w:t>
       </w:r>
     </w:p>
-    <w:p>
-      <w:pPr>
-        <w:rPr>
-          <w:color w:val="0563C1" w:themeColor="hyperlink"/>
-          <w:u w:val="single"/>
-        </w:rPr>
-      </w:pPr>
+    <w:p/>
+    <w:p>
+      <w:pPr>
+        <w:rPr>
+          <w:b/>
+          <w:bCs/>
+        </w:rPr>
+      </w:pPr>
+      <w:r>
+        <w:rPr>
+          <w:b/>
+          <w:bCs/>
+        </w:rPr>
+        <w:t>1/12/2021:</w:t>
+      </w:r>
+    </w:p>
+    <w:p>
+      <w:r>
+        <w:t>Firebase Realtime database wou geen data toevoegen en</w:t>
+      </w:r>
+      <w:r>
+        <w:t xml:space="preserve"> ik had alles geprobeerd. Ik realiseerde toen dat realtime firebase alleen mogelijk was voor de regio van België europe-west1. Ik besloot dan naar firestore te gaan want daar hebben ze wel europe-west3 dat Nederland en België bevat. </w:t>
+      </w:r>
+      <w:r>
+        <w:t>Dit heeft het probleem onmiddellijk opgelost.</w:t>
+      </w:r>
+    </w:p>
+    <w:p>
+      <w:r>
+        <w:t>Nu als je inlogt zal je gebruikersgegevens op firestore geplaatst worden. Nu kan ik eindelijk vlot beginnen met de chat functionaliteiten.</w:t>
+      </w:r>
+    </w:p>
+    <w:p>
+      <w:r>
+        <w:rPr>
+          <w:noProof/>
+        </w:rPr>
+        <w:drawing>
+          <wp:inline distT="0" distB="0" distL="0" distR="0" wp14:anchorId="57A01881" wp14:editId="4C95BA5F">
+            <wp:extent cx="5760720" cy="3189605"/>
+            <wp:effectExtent l="0" t="0" r="0" b="0"/>
+            <wp:docPr id="30" name="Afbeelding 30"/>
+            <wp:cNvGraphicFramePr>
+              <a:graphicFrameLocks xmlns:a="http://schemas.openxmlformats.org/drawingml/2006/main" noChangeAspect="1"/>
+            </wp:cNvGraphicFramePr>
+            <a:graphic xmlns:a="http://schemas.openxmlformats.org/drawingml/2006/main">
+              <a:graphicData uri="http://schemas.openxmlformats.org/drawingml/2006/picture">
+                <pic:pic xmlns:pic="http://schemas.openxmlformats.org/drawingml/2006/picture">
+                  <pic:nvPicPr>
+                    <pic:cNvPr id="1" name=""/>
+                    <pic:cNvPicPr/>
+                  </pic:nvPicPr>
+                  <pic:blipFill>
+                    <a:blip r:embed="rId66"/>
+                    <a:stretch>
+                      <a:fillRect/>
+                    </a:stretch>
+                  </pic:blipFill>
+                  <pic:spPr>
+                    <a:xfrm>
+                      <a:off x="0" y="0"/>
+                      <a:ext cx="5760720" cy="3189605"/>
+                    </a:xfrm>
+                    <a:prstGeom prst="rect">
+                      <a:avLst/>
+                    </a:prstGeom>
+                  </pic:spPr>
+                </pic:pic>
+              </a:graphicData>
+            </a:graphic>
+          </wp:inline>
+        </w:drawing>
+      </w:r>
+    </w:p>
+    <w:p>
+      <w:r>
+        <w:t>Ik ben van plan om nu deze tutorial te volgen voor chatgroepen aan te maken.</w:t>
+      </w:r>
+    </w:p>
+    <w:p>
+      <w:hyperlink r:id="rId67" w:history="1">
+        <w:r>
+          <w:rPr>
+            <w:rStyle w:val="Hyperlink"/>
+          </w:rPr>
+          <w:t>https://medium.com/@mendhie/building-real-time-android-chatroom-with-firebase-99a5b51cb4f7</w:t>
+        </w:r>
+      </w:hyperlink>
     </w:p>
     <w:p/>
     <w:p/>
+    <w:p>
+      <w:pPr>
+        <w:rPr>
+          <w:b/>
+          <w:bCs/>
+        </w:rPr>
+      </w:pPr>
+      <w:r>
+        <w:rPr>
+          <w:b/>
+          <w:bCs/>
+        </w:rPr>
+        <w:lastRenderedPageBreak/>
+        <w:t>4/12/2021:</w:t>
+      </w:r>
+    </w:p>
+    <w:p>
+      <w:r>
+        <w:t>Vandaag probeerde ik offline support toe te voegen. Voor firestore was dat niet zo moeilijk want alles kon ik vinden op deze link, maar ik heb dit nog niet echt kunnen uittesten. Voor firebase storage lukte dit niet echt, want er was geen duidelijk documentatie. Ik wou vooral proberen om de images op firebase in de cache te steken, zodat de meeste recente images verschijnen op de startpagina.</w:t>
+      </w:r>
+      <w:r>
+        <w:t xml:space="preserve"> Mijn conclusie is eigenlijk dat het niet mogelijk is afhankelijk van het totale zoekwerk.</w:t>
+      </w:r>
+    </w:p>
+    <w:p>
+      <w:hyperlink r:id="rId68" w:anchor="java" w:history="1">
+        <w:r>
+          <w:rPr>
+            <w:rStyle w:val="Hyperlink"/>
+          </w:rPr>
+          <w:t>https://firebase.google.com/docs/firestore/manage-data/enable-offline#java</w:t>
+        </w:r>
+      </w:hyperlink>
+    </w:p>
+    <w:p>
+      <w:r>
+        <w:t>Ik heb dan ondertussen een progress bar toegevoegd die zal</w:t>
+      </w:r>
+      <w:r>
+        <w:t xml:space="preserve"> </w:t>
+      </w:r>
+      <w:r>
+        <w:t>verdwijnen als de images inladen.</w:t>
+      </w:r>
+      <w:r>
+        <w:t xml:space="preserve"> Dit komt ook bij de groepchats pagina.</w:t>
+      </w:r>
+    </w:p>
     <w:p/>
-    <w:p/>
+    <w:p>
+      <w:pPr>
+        <w:rPr>
+          <w:b/>
+          <w:bCs/>
+        </w:rPr>
+      </w:pPr>
+      <w:r>
+        <w:rPr>
+          <w:b/>
+          <w:bCs/>
+        </w:rPr>
+        <w:t>LATER</w:t>
+      </w:r>
+    </w:p>
+    <w:p>
+      <w:r>
+        <w:t>zie mail</w:t>
+      </w:r>
+    </w:p>
+    <w:p>
+      <w:r>
+        <w:rPr>
+          <w:noProof/>
+        </w:rPr>
+        <w:drawing>
+          <wp:inline distT="0" distB="0" distL="0" distR="0" wp14:anchorId="5C8CC2ED" wp14:editId="1F1ED4B8">
+            <wp:extent cx="5657850" cy="1143000"/>
+            <wp:effectExtent l="0" t="0" r="0" b="0"/>
+            <wp:docPr id="31" name="Afbeelding 31"/>
+            <wp:cNvGraphicFramePr>
+              <a:graphicFrameLocks xmlns:a="http://schemas.openxmlformats.org/drawingml/2006/main" noChangeAspect="1"/>
+            </wp:cNvGraphicFramePr>
+            <a:graphic xmlns:a="http://schemas.openxmlformats.org/drawingml/2006/main">
+              <a:graphicData uri="http://schemas.openxmlformats.org/drawingml/2006/picture">
+                <pic:pic xmlns:pic="http://schemas.openxmlformats.org/drawingml/2006/picture">
+                  <pic:nvPicPr>
+                    <pic:cNvPr id="1" name=""/>
+                    <pic:cNvPicPr/>
+                  </pic:nvPicPr>
+                  <pic:blipFill>
+                    <a:blip r:embed="rId69"/>
+                    <a:stretch>
+                      <a:fillRect/>
+                    </a:stretch>
+                  </pic:blipFill>
+                  <pic:spPr>
+                    <a:xfrm>
+                      <a:off x="0" y="0"/>
+                      <a:ext cx="5657850" cy="1143000"/>
+                    </a:xfrm>
+                    <a:prstGeom prst="rect">
+                      <a:avLst/>
+                    </a:prstGeom>
+                  </pic:spPr>
+                </pic:pic>
+              </a:graphicData>
+            </a:graphic>
+          </wp:inline>
+        </w:drawing>
+      </w:r>
+    </w:p>
     <w:p/>
     <w:p/>
     <w:sectPr>

</xml_diff>

<commit_message>
Fixed offline support error
</commit_message>
<xml_diff>
--- a/Logboek_Dries_Fierens.docx
+++ b/Logboek_Dries_Fierens.docx
@@ -46,7 +46,39 @@
         <w:t>applicatie</w:t>
       </w:r>
       <w:r>
-        <w:t xml:space="preserve"> die je kan maken en welke technologieën je kan gebruiken. Ik heb voor native gekozen want dat past het best bij mijn aftakking “Software developer” sinds het java inhoudt. De anderen zijn hybrid en progressive web app dat dus meer te maken hebben met web &amp; mobile dus vooral HTML &amp; CSS. We moesten dan ook nog kiezen voor een project idee, waarbij ik koos voor een scanner + pdf converter app</w:t>
+        <w:t xml:space="preserve"> die je kan maken en welke technologieën je kan gebruiken. Ik heb voor native gekozen want dat past het best bij mijn aftakking “Software </w:t>
+      </w:r>
+      <w:proofErr w:type="spellStart"/>
+      <w:r>
+        <w:t>developer</w:t>
+      </w:r>
+      <w:proofErr w:type="spellEnd"/>
+      <w:r>
+        <w:t xml:space="preserve">” sinds het </w:t>
+      </w:r>
+      <w:proofErr w:type="spellStart"/>
+      <w:r>
+        <w:t>java</w:t>
+      </w:r>
+      <w:proofErr w:type="spellEnd"/>
+      <w:r>
+        <w:t xml:space="preserve"> inhoudt. De anderen zijn </w:t>
+      </w:r>
+      <w:proofErr w:type="spellStart"/>
+      <w:r>
+        <w:t>hybrid</w:t>
+      </w:r>
+      <w:proofErr w:type="spellEnd"/>
+      <w:r>
+        <w:t xml:space="preserve"> en </w:t>
+      </w:r>
+      <w:proofErr w:type="spellStart"/>
+      <w:r>
+        <w:t>progressive</w:t>
+      </w:r>
+      <w:proofErr w:type="spellEnd"/>
+      <w:r>
+        <w:t xml:space="preserve"> web app dat dus meer te maken hebben met web &amp; mobile dus vooral HTML &amp; CSS. We moesten dan ook nog kiezen voor een project idee, waarbij ik koos voor een scanner + pdf converter app</w:t>
       </w:r>
       <w:r>
         <w:t xml:space="preserve"> waarbij het vooral bedoelt is o</w:t>
@@ -73,20 +105,92 @@
         <w:t xml:space="preserve"> </w:t>
       </w:r>
       <w:r>
-        <w:t>Als back-end koos ik Firebase en als technologie koos ik in java te werken om een android app te maken in plaats van een IOS app.</w:t>
-      </w:r>
-      <w:r>
-        <w:t xml:space="preserve"> Want ik heb een huawei.</w:t>
-      </w:r>
-    </w:p>
-    <w:p>
-      <w:r>
-        <w:t>Ik heb dit allemaal grondiger beschreven in mijn “app idee”.pdf. Dit staat ondertussen op de repository die we moesten maken.</w:t>
-      </w:r>
-    </w:p>
-    <w:p>
-      <w:r>
-        <w:t>Om af te sluiten had ik al ondertussen een goede naam gevonden gebaseerd op de applicatie genaamd Scannable. Ik heb dus besloten om mijn applicatie Notable te noemen.</w:t>
+        <w:t xml:space="preserve">Als </w:t>
+      </w:r>
+      <w:proofErr w:type="spellStart"/>
+      <w:r>
+        <w:t>back-end</w:t>
+      </w:r>
+      <w:proofErr w:type="spellEnd"/>
+      <w:r>
+        <w:t xml:space="preserve"> koos ik </w:t>
+      </w:r>
+      <w:proofErr w:type="spellStart"/>
+      <w:r>
+        <w:t>Firebase</w:t>
+      </w:r>
+      <w:proofErr w:type="spellEnd"/>
+      <w:r>
+        <w:t xml:space="preserve"> en als technologie koos ik in </w:t>
+      </w:r>
+      <w:proofErr w:type="spellStart"/>
+      <w:r>
+        <w:t>java</w:t>
+      </w:r>
+      <w:proofErr w:type="spellEnd"/>
+      <w:r>
+        <w:t xml:space="preserve"> te werken om een </w:t>
+      </w:r>
+      <w:proofErr w:type="spellStart"/>
+      <w:r>
+        <w:t>android</w:t>
+      </w:r>
+      <w:proofErr w:type="spellEnd"/>
+      <w:r>
+        <w:t xml:space="preserve"> app te maken in plaats van een IOS app.</w:t>
+      </w:r>
+      <w:r>
+        <w:t xml:space="preserve"> Want ik heb een </w:t>
+      </w:r>
+      <w:proofErr w:type="spellStart"/>
+      <w:r>
+        <w:t>huawei</w:t>
+      </w:r>
+      <w:proofErr w:type="spellEnd"/>
+      <w:r>
+        <w:t>.</w:t>
+      </w:r>
+    </w:p>
+    <w:p>
+      <w:r>
+        <w:t xml:space="preserve">Ik heb dit allemaal grondiger beschreven in mijn “app </w:t>
+      </w:r>
+      <w:proofErr w:type="spellStart"/>
+      <w:r>
+        <w:t>idee”.pdf</w:t>
+      </w:r>
+      <w:proofErr w:type="spellEnd"/>
+      <w:r>
+        <w:t xml:space="preserve">. Dit staat ondertussen op de </w:t>
+      </w:r>
+      <w:proofErr w:type="spellStart"/>
+      <w:r>
+        <w:t>repository</w:t>
+      </w:r>
+      <w:proofErr w:type="spellEnd"/>
+      <w:r>
+        <w:t xml:space="preserve"> die we moesten maken.</w:t>
+      </w:r>
+    </w:p>
+    <w:p>
+      <w:r>
+        <w:t xml:space="preserve">Om af te sluiten had ik al ondertussen een goede naam gevonden gebaseerd op de applicatie genaamd </w:t>
+      </w:r>
+      <w:proofErr w:type="spellStart"/>
+      <w:r>
+        <w:t>Scannable</w:t>
+      </w:r>
+      <w:proofErr w:type="spellEnd"/>
+      <w:r>
+        <w:t xml:space="preserve">. Ik heb dus besloten om mijn applicatie </w:t>
+      </w:r>
+      <w:proofErr w:type="spellStart"/>
+      <w:r>
+        <w:t>Notable</w:t>
+      </w:r>
+      <w:proofErr w:type="spellEnd"/>
+      <w:r>
+        <w:t xml:space="preserve"> te noemen.</w:t>
       </w:r>
     </w:p>
     <w:p>
@@ -120,7 +224,15 @@
     </w:p>
     <w:p>
       <w:r>
-        <w:t xml:space="preserve">Daarna moest ik gewoon begin aan een UI/UX design voor mijn applicatie, waarbij nog niet veel had gedaan omdat les niet meer lang duurde. Ik moest toen ook tegelijkertijd zoeken naar tutorials dus </w:t>
+        <w:t xml:space="preserve">Daarna moest ik gewoon begin aan een UI/UX design voor mijn applicatie, waarbij nog niet veel had gedaan omdat les niet meer lang duurde. Ik moest toen ook tegelijkertijd zoeken naar </w:t>
+      </w:r>
+      <w:proofErr w:type="spellStart"/>
+      <w:r>
+        <w:t>tutorials</w:t>
+      </w:r>
+      <w:proofErr w:type="spellEnd"/>
+      <w:r>
+        <w:t xml:space="preserve"> dus </w:t>
       </w:r>
       <w:r>
         <w:t>duurde dat ook kort.</w:t>
@@ -143,13 +255,26 @@
     </w:p>
     <w:p>
       <w:r>
-        <w:t xml:space="preserve">Vandaag in de namiddag begonnen we met de co-working les waarbij we dus informatie kunnen delen met medeleerlingen. Al was het de eerste les dus kwam daar niet veel van. Ik begon gewoon verder aan mijn </w:t>
-      </w:r>
+        <w:t>Vandaag in de namiddag begonnen we met de co-</w:t>
+      </w:r>
+      <w:proofErr w:type="spellStart"/>
+      <w:r>
+        <w:t>working</w:t>
+      </w:r>
+      <w:proofErr w:type="spellEnd"/>
+      <w:r>
+        <w:t xml:space="preserve"> les waarbij we dus informatie kunnen delen met medeleerlingen. Al was het de eerste les dus kwam daar niet veel van. Ik begon gewoon verder aan mijn </w:t>
+      </w:r>
+      <w:proofErr w:type="spellStart"/>
       <w:r>
         <w:t>F</w:t>
       </w:r>
       <w:r>
-        <w:t>igma design.</w:t>
+        <w:t>igma</w:t>
+      </w:r>
+      <w:proofErr w:type="spellEnd"/>
+      <w:r>
+        <w:t xml:space="preserve"> design.</w:t>
       </w:r>
     </w:p>
     <w:p>
@@ -200,7 +325,23 @@
     </w:p>
     <w:p>
       <w:r>
-        <w:t>Vandaag heb ik verder gewerkt aan mijn Figma design en het ging redelijk vlot vooruit. Ik wou absoluut dat het vandaag af was zodat ik morgen kan werken aan een ander vak. Tijdens het maken van het design heb ik vooral ook zitten op zoeken dat sommige concepten wel haalbaar zijn om te programmeren. Dit is allemaal wel mogelijk, maar zal wel een challenge zijn zoals de opmerkingen plaatsen</w:t>
+        <w:t xml:space="preserve">Vandaag heb ik verder gewerkt aan mijn </w:t>
+      </w:r>
+      <w:proofErr w:type="spellStart"/>
+      <w:r>
+        <w:t>Figma</w:t>
+      </w:r>
+      <w:proofErr w:type="spellEnd"/>
+      <w:r>
+        <w:t xml:space="preserve"> design en het ging redelijk vlot vooruit. Ik wou absoluut dat het vandaag af was zodat ik morgen kan werken aan een ander vak. Tijdens het maken van het design heb ik vooral ook zitten op zoeken dat sommige concepten wel haalbaar zijn om te programmeren. Dit is allemaal wel mogelijk, maar zal wel een </w:t>
+      </w:r>
+      <w:proofErr w:type="spellStart"/>
+      <w:r>
+        <w:t>challenge</w:t>
+      </w:r>
+      <w:proofErr w:type="spellEnd"/>
+      <w:r>
+        <w:t xml:space="preserve"> zijn zoals de opmerkingen plaatsen</w:t>
       </w:r>
       <w:r>
         <w:t>. M</w:t>
@@ -312,11 +453,48 @@
     </w:p>
     <w:p>
       <w:r>
-        <w:t xml:space="preserve">Vandaag werd mijn figma prototype gecontroleerd waarbij ik moest opnieuw uitleggen wat mijn app doet door middel van accurate presentatie. Ik legde dit vrij duidelijk uit en alles ging goed vooruit. Meneer Blancquaert heeft me dan ook nog een library genaamd “Material design” aangeraden om mijn applicatie te ontwerpen. </w:t>
-      </w:r>
-      <w:r>
-        <w:t>Blijkbaar Google gebruikt deze library</w:t>
-      </w:r>
+        <w:t xml:space="preserve">Vandaag werd mijn </w:t>
+      </w:r>
+      <w:proofErr w:type="spellStart"/>
+      <w:r>
+        <w:t>figma</w:t>
+      </w:r>
+      <w:proofErr w:type="spellEnd"/>
+      <w:r>
+        <w:t xml:space="preserve"> prototype gecontroleerd waarbij ik moest opnieuw uitleggen wat mijn app doet door middel van accurate presentatie. Ik legde dit vrij duidelijk uit en alles ging goed vooruit. Meneer </w:t>
+      </w:r>
+      <w:proofErr w:type="spellStart"/>
+      <w:r>
+        <w:t>Blancquaert</w:t>
+      </w:r>
+      <w:proofErr w:type="spellEnd"/>
+      <w:r>
+        <w:t xml:space="preserve"> heeft me dan ook nog een </w:t>
+      </w:r>
+      <w:proofErr w:type="spellStart"/>
+      <w:r>
+        <w:t>library</w:t>
+      </w:r>
+      <w:proofErr w:type="spellEnd"/>
+      <w:r>
+        <w:t xml:space="preserve"> genaamd “</w:t>
+      </w:r>
+      <w:proofErr w:type="spellStart"/>
+      <w:r>
+        <w:t>Material</w:t>
+      </w:r>
+      <w:proofErr w:type="spellEnd"/>
+      <w:r>
+        <w:t xml:space="preserve"> design” aangeraden om mijn applicatie te ontwerpen. </w:t>
+      </w:r>
+      <w:r>
+        <w:t xml:space="preserve">Blijkbaar Google gebruikt deze </w:t>
+      </w:r>
+      <w:proofErr w:type="spellStart"/>
+      <w:r>
+        <w:t>library</w:t>
+      </w:r>
+      <w:proofErr w:type="spellEnd"/>
       <w:r>
         <w:t xml:space="preserve"> om hun apps te maken.</w:t>
       </w:r>
@@ -354,7 +532,23 @@
         <w:t xml:space="preserve">kunt maken </w:t>
       </w:r>
       <w:r>
-        <w:t>om je app te testen. Als je developer modus in de settings van je gsm</w:t>
+        <w:t xml:space="preserve">om je app te testen. Als je </w:t>
+      </w:r>
+      <w:proofErr w:type="spellStart"/>
+      <w:r>
+        <w:t>developer</w:t>
+      </w:r>
+      <w:proofErr w:type="spellEnd"/>
+      <w:r>
+        <w:t xml:space="preserve"> modus in de </w:t>
+      </w:r>
+      <w:proofErr w:type="spellStart"/>
+      <w:r>
+        <w:t>settings</w:t>
+      </w:r>
+      <w:proofErr w:type="spellEnd"/>
+      <w:r>
+        <w:t xml:space="preserve"> van je gsm</w:t>
       </w:r>
       <w:r>
         <w:t xml:space="preserve"> aanzet, kan je je gsm verbinden met de pc en dus je applicatie daarop testen.</w:t>
@@ -372,7 +566,15 @@
     </w:p>
     <w:p>
       <w:r>
-        <w:t>Tijdens lange downloads heb ik ook mijn google account toegevoegd op Firebase. Volgens de presentatie die we kregen van een medestudent.</w:t>
+        <w:t xml:space="preserve">Tijdens lange downloads heb ik ook mijn google account toegevoegd op </w:t>
+      </w:r>
+      <w:proofErr w:type="spellStart"/>
+      <w:r>
+        <w:t>Firebase</w:t>
+      </w:r>
+      <w:proofErr w:type="spellEnd"/>
+      <w:r>
+        <w:t>. Volgens de presentatie die we kregen van een medestudent.</w:t>
       </w:r>
     </w:p>
     <w:p>
@@ -423,7 +625,23 @@
         <w:t>mijn</w:t>
       </w:r>
       <w:r>
-        <w:t xml:space="preserve"> figma design delen met meneer Blancquaert, toen hij vroeg dat mijn design klaar was</w:t>
+        <w:t xml:space="preserve"> </w:t>
+      </w:r>
+      <w:proofErr w:type="spellStart"/>
+      <w:r>
+        <w:t>figma</w:t>
+      </w:r>
+      <w:proofErr w:type="spellEnd"/>
+      <w:r>
+        <w:t xml:space="preserve"> design delen met meneer </w:t>
+      </w:r>
+      <w:proofErr w:type="spellStart"/>
+      <w:r>
+        <w:t>Blancquaert</w:t>
+      </w:r>
+      <w:proofErr w:type="spellEnd"/>
+      <w:r>
+        <w:t>, toen hij vroeg dat mijn design klaar was</w:t>
       </w:r>
       <w:r>
         <w:t xml:space="preserve"> of niet</w:t>
@@ -437,14 +655,38 @@
         <w:t>Ik heb daarna gewoon verder begonnen aan de tutorial die ik vorige week gebruikt had.</w:t>
       </w:r>
       <w:r>
-        <w:t xml:space="preserve"> Hierbij leerde ik meer over hoe ik Android studio beter kon gebruiken om mijn app te designen zoals hoe je </w:t>
+        <w:t xml:space="preserve"> Hierbij leerde ik meer over hoe ik Android studio beter kon gebruiken om mijn app te </w:t>
+      </w:r>
+      <w:proofErr w:type="spellStart"/>
+      <w:r>
+        <w:t>designen</w:t>
+      </w:r>
+      <w:proofErr w:type="spellEnd"/>
+      <w:r>
+        <w:t xml:space="preserve"> zoals hoe je </w:t>
       </w:r>
       <w:r>
         <w:lastRenderedPageBreak/>
-        <w:t>attributen kunt aanpassen (bv. color)</w:t>
-      </w:r>
-      <w:r>
-        <w:t xml:space="preserve">. Android studio is zeer gelijkaardig als bijvoorbeeld Webstorm, maar bij het design van een mobile app is het zeer </w:t>
+        <w:t xml:space="preserve">attributen kunt aanpassen (bv. </w:t>
+      </w:r>
+      <w:proofErr w:type="spellStart"/>
+      <w:r>
+        <w:t>color</w:t>
+      </w:r>
+      <w:proofErr w:type="spellEnd"/>
+      <w:r>
+        <w:t>)</w:t>
+      </w:r>
+      <w:r>
+        <w:t xml:space="preserve">. Android studio is zeer gelijkaardig als bijvoorbeeld </w:t>
+      </w:r>
+      <w:proofErr w:type="spellStart"/>
+      <w:r>
+        <w:t>Webstorm</w:t>
+      </w:r>
+      <w:proofErr w:type="spellEnd"/>
+      <w:r>
+        <w:t xml:space="preserve">, maar bij het design van een mobile app is het zeer </w:t>
       </w:r>
       <w:r>
         <w:t>verschillend</w:t>
@@ -453,7 +695,15 @@
         <w:t>.</w:t>
       </w:r>
       <w:r>
-        <w:t xml:space="preserve"> Bij Webstorm kan je je website </w:t>
+        <w:t xml:space="preserve"> Bij </w:t>
+      </w:r>
+      <w:proofErr w:type="spellStart"/>
+      <w:r>
+        <w:t>Webstorm</w:t>
+      </w:r>
+      <w:proofErr w:type="spellEnd"/>
+      <w:r>
+        <w:t xml:space="preserve"> kan je je website </w:t>
       </w:r>
       <w:r>
         <w:t>bekijken</w:t>
@@ -480,7 +730,15 @@
         <w:t>.</w:t>
       </w:r>
       <w:r>
-        <w:t xml:space="preserve"> Als ik de Jetbrains applicaties vergelijk met Visual studio 2019, </w:t>
+        <w:t xml:space="preserve"> Als ik de </w:t>
+      </w:r>
+      <w:proofErr w:type="spellStart"/>
+      <w:r>
+        <w:t>Jetbrains</w:t>
+      </w:r>
+      <w:proofErr w:type="spellEnd"/>
+      <w:r>
+        <w:t xml:space="preserve"> applicaties vergelijk met Visual studio 2019, </w:t>
       </w:r>
       <w:r>
         <w:t>heb ik er altijd moeite mee om de lay</w:t>
@@ -560,7 +818,15 @@
     </w:p>
     <w:p>
       <w:r>
-        <w:t>Ik heb dan ondertussen de tutorial van Material design gevolgd in plaats van die van Android studio. Ze leerde me dan hoe ik er mee kon werken maar niet hoe een hele nieuwe app kon maken. Ik kreeg een voorbeeld app om erin te kunnen werken voor de tutorial.</w:t>
+        <w:t xml:space="preserve">Ik heb dan ondertussen de tutorial van </w:t>
+      </w:r>
+      <w:proofErr w:type="spellStart"/>
+      <w:r>
+        <w:t>Material</w:t>
+      </w:r>
+      <w:proofErr w:type="spellEnd"/>
+      <w:r>
+        <w:t xml:space="preserve"> design gevolgd in plaats van die van Android studio. Ze leerde me dan hoe ik er mee kon werken maar niet hoe een hele nieuwe app kon maken. Ik kreeg een voorbeeld app om erin te kunnen werken voor de tutorial.</w:t>
       </w:r>
     </w:p>
     <w:p>
@@ -603,10 +869,34 @@
     </w:p>
     <w:p>
       <w:r>
-        <w:t>Vandaag heb ik de usertests afgelegd met Louis D’hondt en Jasper Wauters. Dit ging heel gemakkelijk en duurde niet lang. Ik had niet echt serieuze opmerkingen, behalve dat ik geen persoonlijke info pagina gemaakt had.</w:t>
-      </w:r>
-      <w:r>
-        <w:t xml:space="preserve"> Daarna heb ik onmiddellijk die opmerkingen van mijn figma design verbetert en op mijn repository gezet.</w:t>
+        <w:t xml:space="preserve">Vandaag heb ik de usertests afgelegd met Louis </w:t>
+      </w:r>
+      <w:proofErr w:type="spellStart"/>
+      <w:r>
+        <w:t>D’hondt</w:t>
+      </w:r>
+      <w:proofErr w:type="spellEnd"/>
+      <w:r>
+        <w:t xml:space="preserve"> en Jasper Wauters. Dit ging heel gemakkelijk en duurde niet lang. Ik had niet echt serieuze opmerkingen, behalve dat ik geen persoonlijke info pagina gemaakt had.</w:t>
+      </w:r>
+      <w:r>
+        <w:t xml:space="preserve"> Daarna heb ik onmiddellijk die opmerkingen van mijn </w:t>
+      </w:r>
+      <w:proofErr w:type="spellStart"/>
+      <w:r>
+        <w:t>figma</w:t>
+      </w:r>
+      <w:proofErr w:type="spellEnd"/>
+      <w:r>
+        <w:t xml:space="preserve"> design verbetert en op mijn </w:t>
+      </w:r>
+      <w:proofErr w:type="spellStart"/>
+      <w:r>
+        <w:t>repository</w:t>
+      </w:r>
+      <w:proofErr w:type="spellEnd"/>
+      <w:r>
+        <w:t xml:space="preserve"> gezet.</w:t>
       </w:r>
     </w:p>
     <w:p/>
@@ -629,7 +919,47 @@
     </w:p>
     <w:p>
       <w:r>
-        <w:t xml:space="preserve">Vandaag begon ik eindelijk met Material Design. Ik besloot mijn oude app te verwijderen en te vervangen met een empty activity zodat ik echt van scratch begin. Zo kan ik alles beter begrijpen. Ik had dan ontdekt dat android studio al automatisch Material Design van Google had toegevoegd bij de dependencies, dus eigenlijk ben ik </w:t>
+        <w:t xml:space="preserve">Vandaag begon ik eindelijk met </w:t>
+      </w:r>
+      <w:proofErr w:type="spellStart"/>
+      <w:r>
+        <w:t>Material</w:t>
+      </w:r>
+      <w:proofErr w:type="spellEnd"/>
+      <w:r>
+        <w:t xml:space="preserve"> Design. Ik besloot mijn oude app te verwijderen en te vervangen met een empty </w:t>
+      </w:r>
+      <w:proofErr w:type="spellStart"/>
+      <w:r>
+        <w:t>activity</w:t>
+      </w:r>
+      <w:proofErr w:type="spellEnd"/>
+      <w:r>
+        <w:t xml:space="preserve"> zodat ik echt van scratch begin. Zo kan ik alles beter begrijpen. Ik had dan ontdekt dat </w:t>
+      </w:r>
+      <w:proofErr w:type="spellStart"/>
+      <w:r>
+        <w:t>android</w:t>
+      </w:r>
+      <w:proofErr w:type="spellEnd"/>
+      <w:r>
+        <w:t xml:space="preserve"> studio al automatisch </w:t>
+      </w:r>
+      <w:proofErr w:type="spellStart"/>
+      <w:r>
+        <w:t>Material</w:t>
+      </w:r>
+      <w:proofErr w:type="spellEnd"/>
+      <w:r>
+        <w:t xml:space="preserve"> Design van Google had toegevoegd bij de </w:t>
+      </w:r>
+      <w:proofErr w:type="spellStart"/>
+      <w:r>
+        <w:t>dependencies</w:t>
+      </w:r>
+      <w:proofErr w:type="spellEnd"/>
+      <w:r>
+        <w:t xml:space="preserve">, dus eigenlijk ben ik </w:t>
       </w:r>
       <w:r>
         <w:t>onmiddellijk</w:t>
@@ -773,18 +1103,50 @@
     </w:p>
     <w:p>
       <w:r>
-        <w:t>Eerst had ik geprobeerd om gewoon een heel nieuw project te maken die bestond uit een login activity. Deze activity heb ik dan gewoon aangepast naar mijn wens. Maar dit wou ook niet echt werken, want blijkbaar is het best dat je van een main</w:t>
+        <w:t xml:space="preserve">Eerst had ik geprobeerd om gewoon een heel nieuw project te maken die bestond uit een login </w:t>
+      </w:r>
+      <w:proofErr w:type="spellStart"/>
+      <w:r>
+        <w:t>activity</w:t>
+      </w:r>
+      <w:proofErr w:type="spellEnd"/>
+      <w:r>
+        <w:t xml:space="preserve">. Deze </w:t>
+      </w:r>
+      <w:proofErr w:type="spellStart"/>
+      <w:r>
+        <w:t>activity</w:t>
+      </w:r>
+      <w:proofErr w:type="spellEnd"/>
+      <w:r>
+        <w:t xml:space="preserve"> heb ik dan gewoon aangepast naar mijn wens. Maar dit wou ook niet echt werken, want blijkbaar is het best dat je van een </w:t>
+      </w:r>
+      <w:proofErr w:type="spellStart"/>
+      <w:r>
+        <w:t>main</w:t>
       </w:r>
       <w:r>
         <w:t>_</w:t>
       </w:r>
       <w:r>
-        <w:t>activity start en dan de login page daarmee opent.</w:t>
-      </w:r>
-    </w:p>
-    <w:p>
-      <w:r>
-        <w:t>Ik ben dan gewoon terug begonnen aan het oude project en heb dan de error op stack overflow gezocht en daar had ik de oplossing gevonden. Ik moest gewoon mijn “device” zijn data wipen en dan kon het opnieuw installeren want mijn oude projecten stond er nog op.</w:t>
+        <w:t>activity</w:t>
+      </w:r>
+      <w:proofErr w:type="spellEnd"/>
+      <w:r>
+        <w:t xml:space="preserve"> start en dan de login page daarmee opent.</w:t>
+      </w:r>
+    </w:p>
+    <w:p>
+      <w:r>
+        <w:t xml:space="preserve">Ik ben dan gewoon terug begonnen aan het oude project en heb dan de error op stack overflow gezocht en daar had ik de oplossing gevonden. Ik moest gewoon mijn “device” zijn data </w:t>
+      </w:r>
+      <w:proofErr w:type="spellStart"/>
+      <w:r>
+        <w:t>wipen</w:t>
+      </w:r>
+      <w:proofErr w:type="spellEnd"/>
+      <w:r>
+        <w:t xml:space="preserve"> en dan kon het opnieuw installeren want mijn oude projecten stond er nog op.</w:t>
       </w:r>
     </w:p>
     <w:p>
@@ -828,7 +1190,23 @@
         <w:t>Vandaag wou de wifi niet werken op de campus dus had ik niet veel vooruitgang geboekt.</w:t>
       </w:r>
       <w:r>
-        <w:t xml:space="preserve"> Ik was ook gisteren vergeten om de registratie pagina te committen, dus da had ik alleszins gedaan door met mijn hotspot van mijn gsm te verbinden en de 4G aan te zetten.</w:t>
+        <w:t xml:space="preserve"> Ik was ook gisteren vergeten om de registratie pagina te </w:t>
+      </w:r>
+      <w:proofErr w:type="spellStart"/>
+      <w:r>
+        <w:t>committen</w:t>
+      </w:r>
+      <w:proofErr w:type="spellEnd"/>
+      <w:r>
+        <w:t xml:space="preserve">, dus da had ik alleszins gedaan door met mijn </w:t>
+      </w:r>
+      <w:proofErr w:type="spellStart"/>
+      <w:r>
+        <w:t>hotspot</w:t>
+      </w:r>
+      <w:proofErr w:type="spellEnd"/>
+      <w:r>
+        <w:t xml:space="preserve"> van mijn gsm te verbinden en de 4G aan te zetten.</w:t>
       </w:r>
     </w:p>
     <w:p>
@@ -860,11 +1238,21 @@
         <w:t>Vandaag wou de wifi op school nog steeds niet zo goed werken</w:t>
       </w:r>
       <w:r>
-        <w:t xml:space="preserve">, maar dankzij de wifi hotspot heb ik toch nog de navigatie van login naar registratie kunnen </w:t>
-      </w:r>
+        <w:t xml:space="preserve">, maar dankzij de wifi </w:t>
+      </w:r>
+      <w:proofErr w:type="spellStart"/>
+      <w:r>
+        <w:t>hotspot</w:t>
+      </w:r>
+      <w:proofErr w:type="spellEnd"/>
+      <w:r>
+        <w:t xml:space="preserve"> heb ik toch nog de navigatie van login naar registratie kunnen </w:t>
+      </w:r>
+      <w:proofErr w:type="spellStart"/>
       <w:r>
         <w:t>commiten</w:t>
       </w:r>
+      <w:proofErr w:type="spellEnd"/>
       <w:r>
         <w:t>.</w:t>
       </w:r>
@@ -874,7 +1262,15 @@
     </w:p>
     <w:p>
       <w:r>
-        <w:t>De wifi wou uiteindelijk werken dus kon eindelijk heel vlot vooruitgaan. Ik heb daarbij de navigatie tussen de login en registratie kunnen afwerken. Daarna heb ik ook de startpagina bijna afgewerkt, maar de bottom bar wou niet helemaal meewerken dus dat laat ik voor later.</w:t>
+        <w:t xml:space="preserve">De wifi wou uiteindelijk werken dus kon eindelijk heel vlot vooruitgaan. Ik heb daarbij de navigatie tussen de login en registratie kunnen afwerken. Daarna heb ik ook de startpagina bijna afgewerkt, maar de </w:t>
+      </w:r>
+      <w:proofErr w:type="spellStart"/>
+      <w:r>
+        <w:t>bottom</w:t>
+      </w:r>
+      <w:proofErr w:type="spellEnd"/>
+      <w:r>
+        <w:t xml:space="preserve"> bar wou niet helemaal meewerken dus dat laat ik voor later.</w:t>
       </w:r>
     </w:p>
     <w:p/>
@@ -895,7 +1291,31 @@
     </w:p>
     <w:p>
       <w:r>
-        <w:t>Vandaag heb ik de bodem navigatie afgewerkt waarbij je dan naar je groepen kunt gaan oftewel naar je notities die je hebt gefotografeerd. Dit was eerste wel een challenge zoals de active pagina weergegeven of de juiste eventlistener gebruiken om te kunnen navigeren. Maar deze links hebben daarbij geholpen:</w:t>
+        <w:t xml:space="preserve">Vandaag heb ik de bodem navigatie afgewerkt waarbij je dan naar je groepen kunt gaan oftewel naar je notities die je hebt gefotografeerd. Dit was eerste wel een </w:t>
+      </w:r>
+      <w:proofErr w:type="spellStart"/>
+      <w:r>
+        <w:t>challenge</w:t>
+      </w:r>
+      <w:proofErr w:type="spellEnd"/>
+      <w:r>
+        <w:t xml:space="preserve"> zoals de </w:t>
+      </w:r>
+      <w:proofErr w:type="spellStart"/>
+      <w:r>
+        <w:t>active</w:t>
+      </w:r>
+      <w:proofErr w:type="spellEnd"/>
+      <w:r>
+        <w:t xml:space="preserve"> pagina weergegeven of de juiste </w:t>
+      </w:r>
+      <w:proofErr w:type="spellStart"/>
+      <w:r>
+        <w:t>eventlistener</w:t>
+      </w:r>
+      <w:proofErr w:type="spellEnd"/>
+      <w:r>
+        <w:t xml:space="preserve"> gebruiken om te kunnen navigeren. Maar deze links hebben daarbij geholpen:</w:t>
       </w:r>
     </w:p>
     <w:p>
@@ -941,13 +1361,29 @@
     </w:p>
     <w:p>
       <w:r>
-        <w:t>Ik heb dan ook nog voor gezorgd dat mijn firebase account verbonden is met</w:t>
+        <w:t xml:space="preserve">Ik heb dan ook nog voor gezorgd dat mijn </w:t>
+      </w:r>
+      <w:proofErr w:type="spellStart"/>
+      <w:r>
+        <w:t>firebase</w:t>
+      </w:r>
+      <w:proofErr w:type="spellEnd"/>
+      <w:r>
+        <w:t xml:space="preserve"> account verbonden is met</w:t>
       </w:r>
       <w:r>
         <w:t xml:space="preserve"> mijn</w:t>
       </w:r>
       <w:r>
-        <w:t xml:space="preserve"> android studio app.</w:t>
+        <w:t xml:space="preserve"> </w:t>
+      </w:r>
+      <w:proofErr w:type="spellStart"/>
+      <w:r>
+        <w:t>android</w:t>
+      </w:r>
+      <w:proofErr w:type="spellEnd"/>
+      <w:r>
+        <w:t xml:space="preserve"> studio app.</w:t>
       </w:r>
     </w:p>
     <w:p>
@@ -1104,8 +1540,13 @@
           <w:numId w:val="1"/>
         </w:numPr>
       </w:pPr>
-      <w:r>
-        <w:t>Firebase implementeren</w:t>
+      <w:proofErr w:type="spellStart"/>
+      <w:r>
+        <w:t>Firebase</w:t>
+      </w:r>
+      <w:proofErr w:type="spellEnd"/>
+      <w:r>
+        <w:t xml:space="preserve"> implementeren</w:t>
       </w:r>
     </w:p>
     <w:p>
@@ -1117,8 +1558,13 @@
         </w:numPr>
       </w:pPr>
       <w:r>
-        <w:t>Login en registratie mogelijk maken via firebase</w:t>
-      </w:r>
+        <w:t xml:space="preserve">Login en registratie mogelijk maken via </w:t>
+      </w:r>
+      <w:proofErr w:type="spellStart"/>
+      <w:r>
+        <w:t>firebase</w:t>
+      </w:r>
+      <w:proofErr w:type="spellEnd"/>
     </w:p>
     <w:p>
       <w:pPr>
@@ -1129,7 +1575,11 @@
         </w:numPr>
       </w:pPr>
       <w:r>
-        <w:t>Camera functionaliteit bekijken voor andr</w:t>
+        <w:t xml:space="preserve">Camera functionaliteit bekijken voor </w:t>
+      </w:r>
+      <w:proofErr w:type="spellStart"/>
+      <w:r>
+        <w:t>andr</w:t>
       </w:r>
       <w:r>
         <w:t>oi</w:t>
@@ -1137,6 +1587,7 @@
       <w:r>
         <w:t>d</w:t>
       </w:r>
+      <w:proofErr w:type="spellEnd"/>
     </w:p>
     <w:p/>
     <w:p>
@@ -1156,10 +1607,66 @@
     </w:p>
     <w:p>
       <w:r>
-        <w:t>Hier kan je ondertussen zien dat mijn app verbonden is met Firebase. Nu vragen ze voor google sign-in om een sha-1 fingerprint toe te voegen.</w:t>
-      </w:r>
-      <w:r>
-        <w:t xml:space="preserve"> Ik wou dan google play signing pakken om het te genereren ipv self-signing, maar ik moet dan 25 euro eerst betalen voor een </w:t>
+        <w:t xml:space="preserve">Hier kan je ondertussen zien dat mijn app verbonden is met </w:t>
+      </w:r>
+      <w:proofErr w:type="spellStart"/>
+      <w:r>
+        <w:t>Firebase</w:t>
+      </w:r>
+      <w:proofErr w:type="spellEnd"/>
+      <w:r>
+        <w:t xml:space="preserve">. Nu vragen ze voor google </w:t>
+      </w:r>
+      <w:proofErr w:type="spellStart"/>
+      <w:r>
+        <w:t>sign</w:t>
+      </w:r>
+      <w:proofErr w:type="spellEnd"/>
+      <w:r>
+        <w:t xml:space="preserve">-in om een sha-1 </w:t>
+      </w:r>
+      <w:proofErr w:type="spellStart"/>
+      <w:r>
+        <w:t>fingerprint</w:t>
+      </w:r>
+      <w:proofErr w:type="spellEnd"/>
+      <w:r>
+        <w:t xml:space="preserve"> toe te voegen.</w:t>
+      </w:r>
+      <w:r>
+        <w:t xml:space="preserve"> Ik wou dan google </w:t>
+      </w:r>
+      <w:proofErr w:type="spellStart"/>
+      <w:r>
+        <w:t>play</w:t>
+      </w:r>
+      <w:proofErr w:type="spellEnd"/>
+      <w:r>
+        <w:t xml:space="preserve"> </w:t>
+      </w:r>
+      <w:proofErr w:type="spellStart"/>
+      <w:r>
+        <w:t>signing</w:t>
+      </w:r>
+      <w:proofErr w:type="spellEnd"/>
+      <w:r>
+        <w:t xml:space="preserve"> pakken om het te genereren </w:t>
+      </w:r>
+      <w:proofErr w:type="spellStart"/>
+      <w:r>
+        <w:t>ipv</w:t>
+      </w:r>
+      <w:proofErr w:type="spellEnd"/>
+      <w:r>
+        <w:t xml:space="preserve"> </w:t>
+      </w:r>
+      <w:proofErr w:type="spellStart"/>
+      <w:r>
+        <w:t>self-signing</w:t>
+      </w:r>
+      <w:proofErr w:type="spellEnd"/>
+      <w:r>
+        <w:t xml:space="preserve">, maar ik moet dan 25 euro eerst betalen voor een </w:t>
       </w:r>
       <w:r>
         <w:t>ontwikkelaar</w:t>
@@ -1230,14 +1737,75 @@
       <w:r>
         <w:t>Als ik wat meer naar onderging bij de “</w:t>
       </w:r>
-      <w:r>
-        <w:t>Authenticating Your Client</w:t>
-      </w:r>
-      <w:r>
-        <w:t>” pagina (zie link) kan je ook via de terminal van android studio een command invoeren om de sha-1 fingerprint te krijgen. Hierbij moest je “gradle sigingReport” invoeren en dan ctrl + enter invoeren!!</w:t>
-      </w:r>
-      <w:r>
-        <w:t xml:space="preserve"> Deze heb ik dan toegevoegd aan Firebase.</w:t>
+      <w:proofErr w:type="spellStart"/>
+      <w:r>
+        <w:t>Authenticating</w:t>
+      </w:r>
+      <w:proofErr w:type="spellEnd"/>
+      <w:r>
+        <w:t xml:space="preserve"> </w:t>
+      </w:r>
+      <w:proofErr w:type="spellStart"/>
+      <w:r>
+        <w:t>Your</w:t>
+      </w:r>
+      <w:proofErr w:type="spellEnd"/>
+      <w:r>
+        <w:t xml:space="preserve"> Client</w:t>
+      </w:r>
+      <w:r>
+        <w:t xml:space="preserve">” pagina (zie link) kan je ook via de terminal van </w:t>
+      </w:r>
+      <w:proofErr w:type="spellStart"/>
+      <w:r>
+        <w:t>android</w:t>
+      </w:r>
+      <w:proofErr w:type="spellEnd"/>
+      <w:r>
+        <w:t xml:space="preserve"> studio een </w:t>
+      </w:r>
+      <w:proofErr w:type="spellStart"/>
+      <w:r>
+        <w:t>command</w:t>
+      </w:r>
+      <w:proofErr w:type="spellEnd"/>
+      <w:r>
+        <w:t xml:space="preserve"> invoeren om de sha-1 </w:t>
+      </w:r>
+      <w:proofErr w:type="spellStart"/>
+      <w:r>
+        <w:t>fingerprint</w:t>
+      </w:r>
+      <w:proofErr w:type="spellEnd"/>
+      <w:r>
+        <w:t xml:space="preserve"> te krijgen. Hierbij moest je “</w:t>
+      </w:r>
+      <w:proofErr w:type="spellStart"/>
+      <w:r>
+        <w:t>gradle</w:t>
+      </w:r>
+      <w:proofErr w:type="spellEnd"/>
+      <w:r>
+        <w:t xml:space="preserve"> </w:t>
+      </w:r>
+      <w:proofErr w:type="spellStart"/>
+      <w:r>
+        <w:t>sigingReport</w:t>
+      </w:r>
+      <w:proofErr w:type="spellEnd"/>
+      <w:r>
+        <w:t>” invoeren en dan ctrl + enter invoeren!!</w:t>
+      </w:r>
+      <w:r>
+        <w:t xml:space="preserve"> Deze heb ik dan toegevoegd aan </w:t>
+      </w:r>
+      <w:proofErr w:type="spellStart"/>
+      <w:r>
+        <w:t>Firebase</w:t>
+      </w:r>
+      <w:proofErr w:type="spellEnd"/>
+      <w:r>
+        <w:t>.</w:t>
       </w:r>
     </w:p>
     <w:p>
@@ -1285,7 +1853,15 @@
     </w:p>
     <w:p>
       <w:r>
-        <w:t>Daarna moest ik een Oauth 2.0 client ID toevoegen voor het inloggen. Hierbij moest ik een hele configuratie begaan.</w:t>
+        <w:t xml:space="preserve">Daarna moest ik een </w:t>
+      </w:r>
+      <w:proofErr w:type="spellStart"/>
+      <w:r>
+        <w:t>Oauth</w:t>
+      </w:r>
+      <w:proofErr w:type="spellEnd"/>
+      <w:r>
+        <w:t xml:space="preserve"> 2.0 client ID toevoegen voor het inloggen. Hierbij moest ik een hele configuratie begaan.</w:t>
       </w:r>
       <w:r>
         <w:t xml:space="preserve"> Ik heb hierbij het meest niet ingevuld zoals een privacy policy, enzoverder.</w:t>
@@ -1466,7 +2042,31 @@
     </w:p>
     <w:p>
       <w:r>
-        <w:t xml:space="preserve">Vandaag had ik tijdens les (in de morgen van 8u15-11u15) verder gewerkt aan de back-end van mijn app. Ik was gisteren bezig met google sign-in, maar ik besloot om eerst normale email/password authentication toe te voegen. Dit ging vrij vlot vooruit maar toen ik de button klikt sloot de app af, dus dat moet ik nog oplossen. </w:t>
+        <w:t xml:space="preserve">Vandaag had ik tijdens les (in de morgen van 8u15-11u15) verder gewerkt aan de </w:t>
+      </w:r>
+      <w:proofErr w:type="spellStart"/>
+      <w:r>
+        <w:t>back-end</w:t>
+      </w:r>
+      <w:proofErr w:type="spellEnd"/>
+      <w:r>
+        <w:t xml:space="preserve"> van mijn app. Ik was gisteren bezig met google </w:t>
+      </w:r>
+      <w:proofErr w:type="spellStart"/>
+      <w:r>
+        <w:t>sign</w:t>
+      </w:r>
+      <w:proofErr w:type="spellEnd"/>
+      <w:r>
+        <w:t xml:space="preserve">-in, maar ik besloot om eerst normale email/password </w:t>
+      </w:r>
+      <w:proofErr w:type="spellStart"/>
+      <w:r>
+        <w:t>authentication</w:t>
+      </w:r>
+      <w:proofErr w:type="spellEnd"/>
+      <w:r>
+        <w:t xml:space="preserve"> toe te voegen. Dit ging vrij vlot vooruit maar toen ik de button klikt sloot de app af, dus dat moet ik nog oplossen. </w:t>
       </w:r>
       <w:r>
         <w:t>Er werd</w:t>
@@ -1512,10 +2112,26 @@
         <w:t>Vandaag heb ik eindelijk de login en registratie kunnen afwerken. Dit had veel moeite gekost.</w:t>
       </w:r>
       <w:r>
-        <w:t xml:space="preserve"> Het probleem was dus dat mijn app bleef crashen als ik probeerde te registeren. Ik had veel op stackoverflow gezocht maar ik kon eerst niks vinden, maar toen zag ik dat de wifi van de device emulator op Android studio geen wifi had. Ik dacht eerst dat dit normaal was, maar begon toen twijfels te krijgen. Ik had dan eerst de info op stackoverflow pagina proberen gebruiken, maar dat was niet juist. Uiteindelijk gewoon mijn gsm hotspot 4G gebruiken werkte wel.</w:t>
-      </w:r>
-      <w:r>
-        <w:t xml:space="preserve"> Mijn app crasht dan nog steeds bij registratie maar ik kon wel inloggen door een test account aan te maken op Firebase. Dus mijn code werkte, maar toen ik zag dat ik niet gekeken had naar de error van die verscheen na de crash en dat maakte alles duidelijk</w:t>
+        <w:t xml:space="preserve"> Het probleem was dus dat mijn app bleef crashen als ik probeerde te registeren. Ik had veel op stackoverflow gezocht maar ik kon eerst niks vinden, maar toen zag ik dat de wifi van de device emulator op Android studio geen wifi had. Ik dacht eerst dat dit normaal was, maar begon toen twijfels te krijgen. Ik had dan eerst de info op stackoverflow pagina proberen gebruiken, maar dat was niet juist. Uiteindelijk gewoon mijn gsm </w:t>
+      </w:r>
+      <w:proofErr w:type="spellStart"/>
+      <w:r>
+        <w:t>hotspot</w:t>
+      </w:r>
+      <w:proofErr w:type="spellEnd"/>
+      <w:r>
+        <w:t xml:space="preserve"> 4G gebruiken werkte wel.</w:t>
+      </w:r>
+      <w:r>
+        <w:t xml:space="preserve"> Mijn app crasht dan nog steeds bij registratie maar ik kon wel inloggen door een test account aan te maken op </w:t>
+      </w:r>
+      <w:proofErr w:type="spellStart"/>
+      <w:r>
+        <w:t>Firebase</w:t>
+      </w:r>
+      <w:proofErr w:type="spellEnd"/>
+      <w:r>
+        <w:t>. Dus mijn code werkte, maar toen ik zag dat ik niet gekeken had naar de error van die verscheen na de crash en dat maakte alles duidelijk</w:t>
       </w:r>
       <w:r>
         <w:t xml:space="preserve"> voor mij</w:t>
@@ -1677,13 +2293,54 @@
           <w:rFonts w:eastAsia="Times New Roman" w:cstheme="minorHAnsi"/>
           <w:lang w:eastAsia="nl-BE"/>
         </w:rPr>
-        <w:t>Vandaag heb ik geprobeerd om google sign-in te laten werken. Dit ging zeer goed, maar het enige probleem is dat de google account niet wordt toegevoegd aan Firebase en het wil daarna niet naar de volgende pagina gaan als ik de google sign</w:t>
-      </w:r>
+        <w:t xml:space="preserve">Vandaag heb ik geprobeerd om google </w:t>
+      </w:r>
+      <w:proofErr w:type="spellStart"/>
       <w:r>
         <w:rPr>
           <w:rFonts w:eastAsia="Times New Roman" w:cstheme="minorHAnsi"/>
           <w:lang w:eastAsia="nl-BE"/>
         </w:rPr>
+        <w:t>sign</w:t>
+      </w:r>
+      <w:proofErr w:type="spellEnd"/>
+      <w:r>
+        <w:rPr>
+          <w:rFonts w:eastAsia="Times New Roman" w:cstheme="minorHAnsi"/>
+          <w:lang w:eastAsia="nl-BE"/>
+        </w:rPr>
+        <w:t xml:space="preserve">-in te laten werken. Dit ging zeer goed, maar het enige probleem is dat de google account niet wordt toegevoegd aan </w:t>
+      </w:r>
+      <w:proofErr w:type="spellStart"/>
+      <w:r>
+        <w:rPr>
+          <w:rFonts w:eastAsia="Times New Roman" w:cstheme="minorHAnsi"/>
+          <w:lang w:eastAsia="nl-BE"/>
+        </w:rPr>
+        <w:t>Firebase</w:t>
+      </w:r>
+      <w:proofErr w:type="spellEnd"/>
+      <w:r>
+        <w:rPr>
+          <w:rFonts w:eastAsia="Times New Roman" w:cstheme="minorHAnsi"/>
+          <w:lang w:eastAsia="nl-BE"/>
+        </w:rPr>
+        <w:t xml:space="preserve"> en het wil daarna niet naar de volgende pagina gaan als ik de google </w:t>
+      </w:r>
+      <w:proofErr w:type="spellStart"/>
+      <w:r>
+        <w:rPr>
+          <w:rFonts w:eastAsia="Times New Roman" w:cstheme="minorHAnsi"/>
+          <w:lang w:eastAsia="nl-BE"/>
+        </w:rPr>
+        <w:t>sign</w:t>
+      </w:r>
+      <w:proofErr w:type="spellEnd"/>
+      <w:r>
+        <w:rPr>
+          <w:rFonts w:eastAsia="Times New Roman" w:cstheme="minorHAnsi"/>
+          <w:lang w:eastAsia="nl-BE"/>
+        </w:rPr>
         <w:t>-</w:t>
       </w:r>
       <w:r>
@@ -1691,13 +2348,45 @@
           <w:rFonts w:eastAsia="Times New Roman" w:cstheme="minorHAnsi"/>
           <w:lang w:eastAsia="nl-BE"/>
         </w:rPr>
-        <w:t>in button klik. Het sign-in scherm verschijnt wel en hebben geen errors, maar daarna gebeurt er niks. Ik heb de methode toegevoegd die iemand van teams zei dat die het probleem</w:t>
-      </w:r>
+        <w:t xml:space="preserve">in button klik. Het </w:t>
+      </w:r>
+      <w:proofErr w:type="spellStart"/>
       <w:r>
         <w:rPr>
           <w:rFonts w:eastAsia="Times New Roman" w:cstheme="minorHAnsi"/>
           <w:lang w:eastAsia="nl-BE"/>
         </w:rPr>
+        <w:t>sign</w:t>
+      </w:r>
+      <w:proofErr w:type="spellEnd"/>
+      <w:r>
+        <w:rPr>
+          <w:rFonts w:eastAsia="Times New Roman" w:cstheme="minorHAnsi"/>
+          <w:lang w:eastAsia="nl-BE"/>
+        </w:rPr>
+        <w:t xml:space="preserve">-in scherm verschijnt wel en hebben geen </w:t>
+      </w:r>
+      <w:proofErr w:type="spellStart"/>
+      <w:r>
+        <w:rPr>
+          <w:rFonts w:eastAsia="Times New Roman" w:cstheme="minorHAnsi"/>
+          <w:lang w:eastAsia="nl-BE"/>
+        </w:rPr>
+        <w:t>errors</w:t>
+      </w:r>
+      <w:proofErr w:type="spellEnd"/>
+      <w:r>
+        <w:rPr>
+          <w:rFonts w:eastAsia="Times New Roman" w:cstheme="minorHAnsi"/>
+          <w:lang w:eastAsia="nl-BE"/>
+        </w:rPr>
+        <w:t>, maar daarna gebeurt er niks. Ik heb de methode toegevoegd die iemand van teams zei dat die het probleem</w:t>
+      </w:r>
+      <w:r>
+        <w:rPr>
+          <w:rFonts w:eastAsia="Times New Roman" w:cstheme="minorHAnsi"/>
+          <w:lang w:eastAsia="nl-BE"/>
+        </w:rPr>
         <w:t xml:space="preserve"> zou</w:t>
       </w:r>
       <w:r>
@@ -1726,7 +2415,23 @@
           <w:rFonts w:eastAsia="Times New Roman" w:cstheme="minorHAnsi"/>
           <w:lang w:eastAsia="nl-BE"/>
         </w:rPr>
-        <w:t xml:space="preserve"> 1 van de methodes was wel deprecated, maar die had </w:t>
+        <w:t xml:space="preserve"> 1 van de methodes was wel </w:t>
+      </w:r>
+      <w:proofErr w:type="spellStart"/>
+      <w:r>
+        <w:rPr>
+          <w:rFonts w:eastAsia="Times New Roman" w:cstheme="minorHAnsi"/>
+          <w:lang w:eastAsia="nl-BE"/>
+        </w:rPr>
+        <w:t>deprecated</w:t>
+      </w:r>
+      <w:proofErr w:type="spellEnd"/>
+      <w:r>
+        <w:rPr>
+          <w:rFonts w:eastAsia="Times New Roman" w:cstheme="minorHAnsi"/>
+          <w:lang w:eastAsia="nl-BE"/>
+        </w:rPr>
+        <w:t xml:space="preserve">, maar die had </w:t>
       </w:r>
       <w:r>
         <w:rPr>
@@ -1891,7 +2596,167 @@
           <w:rFonts w:eastAsia="Times New Roman" w:cstheme="minorHAnsi"/>
           <w:lang w:eastAsia="nl-BE"/>
         </w:rPr>
-        <w:t>Vandaag is het me gelukt om de google sign-in te laten werken. Ik had veel opzoek werk gedaan op google maar kon niks duidelijk vinden. Ik had mijn code ook gedebugd, maar geen duidelijk error werd weergegeven. Uiteindelijk besloot ik opzoek te gaan naar een tutorial die recent was in 2021. Deze tutorial heb ik dan gebruikt om mijn project strict te controleren en toen realiseerde ik dat de SHA-1 niet op de juiste plaats stond. Ik had op google cloud een Oauth 2.0 client id moeten aanmaken toen ik de android studio firebase tutorial volgde, maar dat bleek dus helemaal fout te zijn, want de echte client_id was eigenlijk al klaar in een google-services.json file. Ik moest toen ook mijn SHA-1 fingerprint verwijderen bij de onderstaande afbeelding, maar dat mocht daar eigenlijk blijven staan.</w:t>
+        <w:t xml:space="preserve">Vandaag is het me gelukt om de google </w:t>
+      </w:r>
+      <w:proofErr w:type="spellStart"/>
+      <w:r>
+        <w:rPr>
+          <w:rFonts w:eastAsia="Times New Roman" w:cstheme="minorHAnsi"/>
+          <w:lang w:eastAsia="nl-BE"/>
+        </w:rPr>
+        <w:t>sign</w:t>
+      </w:r>
+      <w:proofErr w:type="spellEnd"/>
+      <w:r>
+        <w:rPr>
+          <w:rFonts w:eastAsia="Times New Roman" w:cstheme="minorHAnsi"/>
+          <w:lang w:eastAsia="nl-BE"/>
+        </w:rPr>
+        <w:t xml:space="preserve">-in te laten werken. Ik had veel opzoek werk gedaan op google maar kon niks duidelijk vinden. Ik had mijn code ook gedebugd, maar geen duidelijk error werd weergegeven. Uiteindelijk besloot ik opzoek te gaan naar een tutorial die recent was in 2021. Deze tutorial heb ik dan gebruikt om mijn project </w:t>
+      </w:r>
+      <w:proofErr w:type="spellStart"/>
+      <w:r>
+        <w:rPr>
+          <w:rFonts w:eastAsia="Times New Roman" w:cstheme="minorHAnsi"/>
+          <w:lang w:eastAsia="nl-BE"/>
+        </w:rPr>
+        <w:t>strict</w:t>
+      </w:r>
+      <w:proofErr w:type="spellEnd"/>
+      <w:r>
+        <w:rPr>
+          <w:rFonts w:eastAsia="Times New Roman" w:cstheme="minorHAnsi"/>
+          <w:lang w:eastAsia="nl-BE"/>
+        </w:rPr>
+        <w:t xml:space="preserve"> te controleren en toen realiseerde ik dat de SHA-1 niet op de juiste plaats stond. Ik had op google </w:t>
+      </w:r>
+      <w:proofErr w:type="spellStart"/>
+      <w:r>
+        <w:rPr>
+          <w:rFonts w:eastAsia="Times New Roman" w:cstheme="minorHAnsi"/>
+          <w:lang w:eastAsia="nl-BE"/>
+        </w:rPr>
+        <w:t>cloud</w:t>
+      </w:r>
+      <w:proofErr w:type="spellEnd"/>
+      <w:r>
+        <w:rPr>
+          <w:rFonts w:eastAsia="Times New Roman" w:cstheme="minorHAnsi"/>
+          <w:lang w:eastAsia="nl-BE"/>
+        </w:rPr>
+        <w:t xml:space="preserve"> een </w:t>
+      </w:r>
+      <w:proofErr w:type="spellStart"/>
+      <w:r>
+        <w:rPr>
+          <w:rFonts w:eastAsia="Times New Roman" w:cstheme="minorHAnsi"/>
+          <w:lang w:eastAsia="nl-BE"/>
+        </w:rPr>
+        <w:t>Oauth</w:t>
+      </w:r>
+      <w:proofErr w:type="spellEnd"/>
+      <w:r>
+        <w:rPr>
+          <w:rFonts w:eastAsia="Times New Roman" w:cstheme="minorHAnsi"/>
+          <w:lang w:eastAsia="nl-BE"/>
+        </w:rPr>
+        <w:t xml:space="preserve"> 2.0 client </w:t>
+      </w:r>
+      <w:proofErr w:type="spellStart"/>
+      <w:r>
+        <w:rPr>
+          <w:rFonts w:eastAsia="Times New Roman" w:cstheme="minorHAnsi"/>
+          <w:lang w:eastAsia="nl-BE"/>
+        </w:rPr>
+        <w:t>id</w:t>
+      </w:r>
+      <w:proofErr w:type="spellEnd"/>
+      <w:r>
+        <w:rPr>
+          <w:rFonts w:eastAsia="Times New Roman" w:cstheme="minorHAnsi"/>
+          <w:lang w:eastAsia="nl-BE"/>
+        </w:rPr>
+        <w:t xml:space="preserve"> moeten aanmaken toen ik de </w:t>
+      </w:r>
+      <w:proofErr w:type="spellStart"/>
+      <w:r>
+        <w:rPr>
+          <w:rFonts w:eastAsia="Times New Roman" w:cstheme="minorHAnsi"/>
+          <w:lang w:eastAsia="nl-BE"/>
+        </w:rPr>
+        <w:t>android</w:t>
+      </w:r>
+      <w:proofErr w:type="spellEnd"/>
+      <w:r>
+        <w:rPr>
+          <w:rFonts w:eastAsia="Times New Roman" w:cstheme="minorHAnsi"/>
+          <w:lang w:eastAsia="nl-BE"/>
+        </w:rPr>
+        <w:t xml:space="preserve"> studio </w:t>
+      </w:r>
+      <w:proofErr w:type="spellStart"/>
+      <w:r>
+        <w:rPr>
+          <w:rFonts w:eastAsia="Times New Roman" w:cstheme="minorHAnsi"/>
+          <w:lang w:eastAsia="nl-BE"/>
+        </w:rPr>
+        <w:t>firebase</w:t>
+      </w:r>
+      <w:proofErr w:type="spellEnd"/>
+      <w:r>
+        <w:rPr>
+          <w:rFonts w:eastAsia="Times New Roman" w:cstheme="minorHAnsi"/>
+          <w:lang w:eastAsia="nl-BE"/>
+        </w:rPr>
+        <w:t xml:space="preserve"> tutorial volgde, maar dat bleek dus helemaal fout te zijn, want de echte </w:t>
+      </w:r>
+      <w:proofErr w:type="spellStart"/>
+      <w:r>
+        <w:rPr>
+          <w:rFonts w:eastAsia="Times New Roman" w:cstheme="minorHAnsi"/>
+          <w:lang w:eastAsia="nl-BE"/>
+        </w:rPr>
+        <w:t>client_id</w:t>
+      </w:r>
+      <w:proofErr w:type="spellEnd"/>
+      <w:r>
+        <w:rPr>
+          <w:rFonts w:eastAsia="Times New Roman" w:cstheme="minorHAnsi"/>
+          <w:lang w:eastAsia="nl-BE"/>
+        </w:rPr>
+        <w:t xml:space="preserve"> was eigenlijk al klaar in een google-</w:t>
+      </w:r>
+      <w:proofErr w:type="spellStart"/>
+      <w:r>
+        <w:rPr>
+          <w:rFonts w:eastAsia="Times New Roman" w:cstheme="minorHAnsi"/>
+          <w:lang w:eastAsia="nl-BE"/>
+        </w:rPr>
+        <w:t>services.json</w:t>
+      </w:r>
+      <w:proofErr w:type="spellEnd"/>
+      <w:r>
+        <w:rPr>
+          <w:rFonts w:eastAsia="Times New Roman" w:cstheme="minorHAnsi"/>
+          <w:lang w:eastAsia="nl-BE"/>
+        </w:rPr>
+        <w:t xml:space="preserve"> file. Ik moest toen ook mijn SHA-1 </w:t>
+      </w:r>
+      <w:proofErr w:type="spellStart"/>
+      <w:r>
+        <w:rPr>
+          <w:rFonts w:eastAsia="Times New Roman" w:cstheme="minorHAnsi"/>
+          <w:lang w:eastAsia="nl-BE"/>
+        </w:rPr>
+        <w:t>fingerprint</w:t>
+      </w:r>
+      <w:proofErr w:type="spellEnd"/>
+      <w:r>
+        <w:rPr>
+          <w:rFonts w:eastAsia="Times New Roman" w:cstheme="minorHAnsi"/>
+          <w:lang w:eastAsia="nl-BE"/>
+        </w:rPr>
+        <w:t xml:space="preserve"> verwijderen bij de onderstaande afbeelding, maar dat mocht daar eigenlijk blijven staan.</w:t>
       </w:r>
       <w:r>
         <w:rPr>
@@ -2110,8 +2975,13 @@
           <w:numId w:val="2"/>
         </w:numPr>
       </w:pPr>
-      <w:r>
-        <w:t xml:space="preserve">Firebase </w:t>
+      <w:proofErr w:type="spellStart"/>
+      <w:r>
+        <w:t>Firebase</w:t>
+      </w:r>
+      <w:proofErr w:type="spellEnd"/>
+      <w:r>
+        <w:t xml:space="preserve"> </w:t>
       </w:r>
       <w:r>
         <w:t>storage</w:t>
@@ -2153,13 +3023,29 @@
     </w:p>
     <w:p>
       <w:r>
-        <w:t>Vandaag ben ik begonnen met aanmaken van de Firebase storage voor het opslaan van afbeeldingen.</w:t>
+        <w:t xml:space="preserve">Vandaag ben ik begonnen met aanmaken van de </w:t>
+      </w:r>
+      <w:proofErr w:type="spellStart"/>
+      <w:r>
+        <w:t>Firebase</w:t>
+      </w:r>
+      <w:proofErr w:type="spellEnd"/>
+      <w:r>
+        <w:t xml:space="preserve"> storage voor het opslaan van afbeeldingen.</w:t>
       </w:r>
       <w:r>
         <w:t xml:space="preserve"> </w:t>
       </w:r>
       <w:r>
-        <w:t xml:space="preserve">Ik heb dan de dependencies toegevoegd en dan moest ik een Cloud storage bucket aanmaken. Hierbij werd er gevraagd om een locatie te kiezen waarbij Europe-west 1 (= Belgische regio) niet tussen stond, maar gelukkig is er Eur3 die eigenlijk Belgische en Nederlandse regio voorstelt. Dat werd uitgelegd </w:t>
+        <w:t xml:space="preserve">Ik heb dan de </w:t>
+      </w:r>
+      <w:proofErr w:type="spellStart"/>
+      <w:r>
+        <w:t>dependencies</w:t>
+      </w:r>
+      <w:proofErr w:type="spellEnd"/>
+      <w:r>
+        <w:t xml:space="preserve"> toegevoegd en dan moest ik een Cloud storage bucket aanmaken. Hierbij werd er gevraagd om een locatie te kiezen waarbij Europe-west 1 (= Belgische regio) niet tussen stond, maar gelukkig is er Eur3 die eigenlijk Belgische en Nederlandse regio voorstelt. Dat werd uitgelegd </w:t>
       </w:r>
       <w:r>
         <w:t>op deze webpagina</w:t>
@@ -2272,12 +3158,52 @@
     </w:p>
     <w:p>
       <w:r>
-        <w:t xml:space="preserve">Vandaag heb ik de java code moet schrijven voor de camera te kunnen gebruiken. Eerst heb ik code toegevoegd dat ervoor zorgt dat de permissies worden aangevraagd om de camera te kunnen gebruiken. Daarna als ik allow klik dan opent een test camera zicht van de emulator. </w:t>
-      </w:r>
-    </w:p>
-    <w:p>
-      <w:r>
-        <w:t>Hierbij werden gelijkaardig methoden gebruikt zoals de firebase authentication, maar waren ook deprecated. Dit heb natuurlijk makkelijk opgelost.</w:t>
+        <w:t xml:space="preserve">Vandaag heb ik de </w:t>
+      </w:r>
+      <w:proofErr w:type="spellStart"/>
+      <w:r>
+        <w:t>java</w:t>
+      </w:r>
+      <w:proofErr w:type="spellEnd"/>
+      <w:r>
+        <w:t xml:space="preserve"> code moet schrijven voor de camera te kunnen gebruiken. Eerst heb ik code toegevoegd dat ervoor zorgt dat de permissies worden aangevraagd om de camera te kunnen gebruiken. Daarna als ik </w:t>
+      </w:r>
+      <w:proofErr w:type="spellStart"/>
+      <w:r>
+        <w:t>allow</w:t>
+      </w:r>
+      <w:proofErr w:type="spellEnd"/>
+      <w:r>
+        <w:t xml:space="preserve"> klik dan opent een test camera zicht van de emulator. </w:t>
+      </w:r>
+    </w:p>
+    <w:p>
+      <w:r>
+        <w:t xml:space="preserve">Hierbij werden gelijkaardig methoden gebruikt zoals de </w:t>
+      </w:r>
+      <w:proofErr w:type="spellStart"/>
+      <w:r>
+        <w:t>firebase</w:t>
+      </w:r>
+      <w:proofErr w:type="spellEnd"/>
+      <w:r>
+        <w:t xml:space="preserve"> </w:t>
+      </w:r>
+      <w:proofErr w:type="spellStart"/>
+      <w:r>
+        <w:t>authentication</w:t>
+      </w:r>
+      <w:proofErr w:type="spellEnd"/>
+      <w:r>
+        <w:t xml:space="preserve">, maar waren ook </w:t>
+      </w:r>
+      <w:proofErr w:type="spellStart"/>
+      <w:r>
+        <w:t>deprecated</w:t>
+      </w:r>
+      <w:proofErr w:type="spellEnd"/>
+      <w:r>
+        <w:t>. Dit heb natuurlijk makkelijk opgelost.</w:t>
       </w:r>
     </w:p>
     <w:p>
@@ -2351,7 +3277,15 @@
     </w:p>
     <w:p>
       <w:r>
-        <w:t>Vandaag heb ik geprobeerd om de image die getrokken wordt op te slaan in firebase storage</w:t>
+        <w:t xml:space="preserve">Vandaag heb ik geprobeerd om de image die getrokken wordt op te slaan in </w:t>
+      </w:r>
+      <w:proofErr w:type="spellStart"/>
+      <w:r>
+        <w:t>firebase</w:t>
+      </w:r>
+      <w:proofErr w:type="spellEnd"/>
+      <w:r>
+        <w:t xml:space="preserve"> storage</w:t>
       </w:r>
       <w:r>
         <w:t>. Dit is op het einde van de les gelukt.</w:t>
@@ -2405,10 +3339,90 @@
     <w:p>
       <w:r>
         <w:lastRenderedPageBreak/>
-        <w:t xml:space="preserve">Hierbij had ik vooral problemen met de uri oftewl URL omdat firebase die nodig had om te kunnen uploaden. Als je naar de eerste rode streep kijkt is er een methode voor </w:t>
-      </w:r>
-      <w:r>
-        <w:t>de bitmap die je krijgt van de camera te gebruiken om de uri te bepalen. De volgende is voor de bestandextensie te krijgen om een filename op te stellen in de firebase storage. Hierbij pak ik gewoon het tijdstip met de bestandextensie, maar ik ben misschien van plan om de filename te kunnen aanpassen door de gebruiker. De laatste streep zijn twee child methods waarbij dus de eerste de map voorstelt waar dan de 2</w:t>
+        <w:t xml:space="preserve">Hierbij had ik vooral problemen met de </w:t>
+      </w:r>
+      <w:proofErr w:type="spellStart"/>
+      <w:r>
+        <w:t>uri</w:t>
+      </w:r>
+      <w:proofErr w:type="spellEnd"/>
+      <w:r>
+        <w:t xml:space="preserve"> </w:t>
+      </w:r>
+      <w:proofErr w:type="spellStart"/>
+      <w:r>
+        <w:t>oftewl</w:t>
+      </w:r>
+      <w:proofErr w:type="spellEnd"/>
+      <w:r>
+        <w:t xml:space="preserve"> URL omdat </w:t>
+      </w:r>
+      <w:proofErr w:type="spellStart"/>
+      <w:r>
+        <w:t>firebase</w:t>
+      </w:r>
+      <w:proofErr w:type="spellEnd"/>
+      <w:r>
+        <w:t xml:space="preserve"> die nodig had om te kunnen uploaden. Als je naar de eerste rode streep kijkt is er een methode voor </w:t>
+      </w:r>
+      <w:r>
+        <w:t xml:space="preserve">de </w:t>
+      </w:r>
+      <w:proofErr w:type="spellStart"/>
+      <w:r>
+        <w:t>bitmap</w:t>
+      </w:r>
+      <w:proofErr w:type="spellEnd"/>
+      <w:r>
+        <w:t xml:space="preserve"> die je krijgt van de camera te gebruiken om de </w:t>
+      </w:r>
+      <w:proofErr w:type="spellStart"/>
+      <w:r>
+        <w:t>uri</w:t>
+      </w:r>
+      <w:proofErr w:type="spellEnd"/>
+      <w:r>
+        <w:t xml:space="preserve"> te bepalen. De volgende is voor de bestandextensie te krijgen om een </w:t>
+      </w:r>
+      <w:proofErr w:type="spellStart"/>
+      <w:r>
+        <w:t>filename</w:t>
+      </w:r>
+      <w:proofErr w:type="spellEnd"/>
+      <w:r>
+        <w:t xml:space="preserve"> op te stellen in de </w:t>
+      </w:r>
+      <w:proofErr w:type="spellStart"/>
+      <w:r>
+        <w:t>firebase</w:t>
+      </w:r>
+      <w:proofErr w:type="spellEnd"/>
+      <w:r>
+        <w:t xml:space="preserve"> storage. Hierbij pak ik gewoon het tijdstip met de bestandextensie, maar ik ben misschien van plan om de </w:t>
+      </w:r>
+      <w:proofErr w:type="spellStart"/>
+      <w:r>
+        <w:t>filename</w:t>
+      </w:r>
+      <w:proofErr w:type="spellEnd"/>
+      <w:r>
+        <w:t xml:space="preserve"> te kunnen aanpassen door de gebruiker. De laatste streep zijn twee </w:t>
+      </w:r>
+      <w:proofErr w:type="spellStart"/>
+      <w:r>
+        <w:t>child</w:t>
+      </w:r>
+      <w:proofErr w:type="spellEnd"/>
+      <w:r>
+        <w:t xml:space="preserve"> </w:t>
+      </w:r>
+      <w:proofErr w:type="spellStart"/>
+      <w:r>
+        <w:t>methods</w:t>
+      </w:r>
+      <w:proofErr w:type="spellEnd"/>
+      <w:r>
+        <w:t xml:space="preserve"> waarbij dus de eerste de map voorstelt waar dan de 2</w:t>
       </w:r>
       <w:r>
         <w:rPr>
@@ -2417,7 +3431,15 @@
         <w:t>de</w:t>
       </w:r>
       <w:r>
-        <w:t xml:space="preserve"> child oftewel de image inkomt. De map geef ik  het email adres van de gebruiker als naam.</w:t>
+        <w:t xml:space="preserve"> </w:t>
+      </w:r>
+      <w:proofErr w:type="spellStart"/>
+      <w:r>
+        <w:t>child</w:t>
+      </w:r>
+      <w:proofErr w:type="spellEnd"/>
+      <w:r>
+        <w:t xml:space="preserve"> oftewel de image inkomt. De map geef ik  het email adres van de gebruiker als naam.</w:t>
       </w:r>
     </w:p>
     <w:p>
@@ -2557,7 +3579,15 @@
         <w:t>je gsm</w:t>
       </w:r>
       <w:r>
-        <w:t xml:space="preserve"> gallery gebruiken)</w:t>
+        <w:t xml:space="preserve"> </w:t>
+      </w:r>
+      <w:proofErr w:type="spellStart"/>
+      <w:r>
+        <w:t>gallery</w:t>
+      </w:r>
+      <w:proofErr w:type="spellEnd"/>
+      <w:r>
+        <w:t xml:space="preserve"> gebruiken)</w:t>
       </w:r>
     </w:p>
     <w:p/>
@@ -2578,7 +3608,23 @@
     </w:p>
     <w:p>
       <w:r>
-        <w:t xml:space="preserve">Vandaag heb ik geprobeerd om een gridview toe te voegen die images bevat dat dus lijkt op een image gallery zoals uw “foto’s” app. Hierbij heb ik de </w:t>
+        <w:t xml:space="preserve">Vandaag heb ik geprobeerd om een </w:t>
+      </w:r>
+      <w:proofErr w:type="spellStart"/>
+      <w:r>
+        <w:t>gridview</w:t>
+      </w:r>
+      <w:proofErr w:type="spellEnd"/>
+      <w:r>
+        <w:t xml:space="preserve"> toe te voegen die images bevat dat dus lijkt op een image </w:t>
+      </w:r>
+      <w:proofErr w:type="spellStart"/>
+      <w:r>
+        <w:t>gallery</w:t>
+      </w:r>
+      <w:proofErr w:type="spellEnd"/>
+      <w:r>
+        <w:t xml:space="preserve"> zoals uw “foto’s” app. Hierbij heb ik de </w:t>
       </w:r>
       <w:r>
         <w:t>volgende</w:t>
@@ -2623,7 +3669,15 @@
     </w:p>
     <w:p>
       <w:r>
-        <w:t>Dit heeft nog niet direct resultaat gegeven, maar de GridAdapter class geeft een gevoel dat ik wel op de goeie weg zit.</w:t>
+        <w:t xml:space="preserve">Dit heeft nog niet direct resultaat gegeven, maar de </w:t>
+      </w:r>
+      <w:proofErr w:type="spellStart"/>
+      <w:r>
+        <w:t>GridAdapter</w:t>
+      </w:r>
+      <w:proofErr w:type="spellEnd"/>
+      <w:r>
+        <w:t xml:space="preserve"> class geeft een gevoel dat ik wel op de goeie weg zit.</w:t>
       </w:r>
     </w:p>
     <w:p/>
@@ -2644,7 +3698,31 @@
     </w:p>
     <w:p>
       <w:r>
-        <w:t>Na de GridAdapter klasse te controleren ontdekte ik dat ik gewoon het verkeerd image Id doorgegeven heb. Dit heeft het probleem onmiddellijk gefixed als zijn de voorbeeld images niet echt mooi gepositioneerd.</w:t>
+        <w:t xml:space="preserve">Na de </w:t>
+      </w:r>
+      <w:proofErr w:type="spellStart"/>
+      <w:r>
+        <w:t>GridAdapter</w:t>
+      </w:r>
+      <w:proofErr w:type="spellEnd"/>
+      <w:r>
+        <w:t xml:space="preserve"> klasse te controleren ontdekte ik dat ik gewoon het verkeerd image </w:t>
+      </w:r>
+      <w:proofErr w:type="spellStart"/>
+      <w:r>
+        <w:t>Id</w:t>
+      </w:r>
+      <w:proofErr w:type="spellEnd"/>
+      <w:r>
+        <w:t xml:space="preserve"> doorgegeven heb. Dit heeft het probleem onmiddellijk </w:t>
+      </w:r>
+      <w:proofErr w:type="spellStart"/>
+      <w:r>
+        <w:t>gefixed</w:t>
+      </w:r>
+      <w:proofErr w:type="spellEnd"/>
+      <w:r>
+        <w:t xml:space="preserve"> als zijn de voorbeeld images niet echt mooi gepositioneerd.</w:t>
       </w:r>
     </w:p>
     <w:p>
@@ -2698,7 +3776,15 @@
         <w:t>gedetailleerd</w:t>
       </w:r>
       <w:r>
-        <w:t xml:space="preserve"> tutorial gevolgd hoe je met een gridview kan werken:</w:t>
+        <w:t xml:space="preserve"> tutorial gevolgd hoe je met een </w:t>
+      </w:r>
+      <w:proofErr w:type="spellStart"/>
+      <w:r>
+        <w:t>gridview</w:t>
+      </w:r>
+      <w:proofErr w:type="spellEnd"/>
+      <w:r>
+        <w:t xml:space="preserve"> kan werken:</w:t>
       </w:r>
     </w:p>
     <w:p>
@@ -2713,10 +3799,58 @@
     </w:p>
     <w:p>
       <w:r>
-        <w:t xml:space="preserve">Daarna heb ik er nog voor gezorgd dat de margin top en bottom via java code worden aangepast afhankelijk van de </w:t>
-      </w:r>
-      <w:r>
-        <w:t>hoogte van de header en footer. Dit werdt gedaan in OnCreateView():</w:t>
+        <w:t xml:space="preserve">Daarna heb ik er nog voor gezorgd dat de </w:t>
+      </w:r>
+      <w:proofErr w:type="spellStart"/>
+      <w:r>
+        <w:t>margin</w:t>
+      </w:r>
+      <w:proofErr w:type="spellEnd"/>
+      <w:r>
+        <w:t xml:space="preserve"> top en </w:t>
+      </w:r>
+      <w:proofErr w:type="spellStart"/>
+      <w:r>
+        <w:t>bottom</w:t>
+      </w:r>
+      <w:proofErr w:type="spellEnd"/>
+      <w:r>
+        <w:t xml:space="preserve"> via </w:t>
+      </w:r>
+      <w:proofErr w:type="spellStart"/>
+      <w:r>
+        <w:t>java</w:t>
+      </w:r>
+      <w:proofErr w:type="spellEnd"/>
+      <w:r>
+        <w:t xml:space="preserve"> code worden aangepast afhankelijk van de </w:t>
+      </w:r>
+      <w:r>
+        <w:t xml:space="preserve">hoogte van de header en </w:t>
+      </w:r>
+      <w:proofErr w:type="spellStart"/>
+      <w:r>
+        <w:t>footer</w:t>
+      </w:r>
+      <w:proofErr w:type="spellEnd"/>
+      <w:r>
+        <w:t xml:space="preserve">. Dit </w:t>
+      </w:r>
+      <w:proofErr w:type="spellStart"/>
+      <w:r>
+        <w:t>werdt</w:t>
+      </w:r>
+      <w:proofErr w:type="spellEnd"/>
+      <w:r>
+        <w:t xml:space="preserve"> gedaan in </w:t>
+      </w:r>
+      <w:proofErr w:type="spellStart"/>
+      <w:r>
+        <w:t>OnCreateView</w:t>
+      </w:r>
+      <w:proofErr w:type="spellEnd"/>
+      <w:r>
+        <w:t>():</w:t>
       </w:r>
     </w:p>
     <w:p>
@@ -2764,13 +3898,66 @@
     </w:p>
     <w:p>
       <w:r>
-        <w:t>Ik heb dan de elementen een witte achtergrond gegeven en dan een border rond gedaan dat eigenlijk vrij moeilijk en inefficiënt moet worden opgeroepen in android studio door middel van een &lt;shape&gt; xml file te maken in de res/drawable folder en die een stroke</w:t>
-      </w:r>
+        <w:t xml:space="preserve">Ik heb dan de elementen een witte achtergrond gegeven en dan een border rond gedaan dat eigenlijk vrij moeilijk en inefficiënt moet worden opgeroepen in </w:t>
+      </w:r>
+      <w:proofErr w:type="spellStart"/>
+      <w:r>
+        <w:t>android</w:t>
+      </w:r>
+      <w:proofErr w:type="spellEnd"/>
+      <w:r>
+        <w:t xml:space="preserve"> studio door middel van een &lt;</w:t>
+      </w:r>
+      <w:proofErr w:type="spellStart"/>
+      <w:r>
+        <w:t>shape</w:t>
+      </w:r>
+      <w:proofErr w:type="spellEnd"/>
+      <w:r>
+        <w:t xml:space="preserve">&gt; </w:t>
+      </w:r>
+      <w:proofErr w:type="spellStart"/>
+      <w:r>
+        <w:t>xml</w:t>
+      </w:r>
+      <w:proofErr w:type="spellEnd"/>
+      <w:r>
+        <w:t xml:space="preserve"> file te maken in de </w:t>
+      </w:r>
+      <w:proofErr w:type="spellStart"/>
+      <w:r>
+        <w:t>res</w:t>
+      </w:r>
+      <w:proofErr w:type="spellEnd"/>
+      <w:r>
+        <w:t>/</w:t>
+      </w:r>
+      <w:proofErr w:type="spellStart"/>
+      <w:r>
+        <w:t>drawable</w:t>
+      </w:r>
+      <w:proofErr w:type="spellEnd"/>
+      <w:r>
+        <w:t xml:space="preserve"> folder en die een </w:t>
+      </w:r>
+      <w:proofErr w:type="spellStart"/>
+      <w:r>
+        <w:t>stroke</w:t>
+      </w:r>
+      <w:proofErr w:type="spellEnd"/>
       <w:r>
         <w:t>, enzoverder</w:t>
       </w:r>
       <w:r>
-        <w:t xml:space="preserve"> te geven. Dan wordt deze drawable als achtergrond geplaatst van de imageview.</w:t>
+        <w:t xml:space="preserve"> te geven. Dan wordt deze </w:t>
+      </w:r>
+      <w:proofErr w:type="spellStart"/>
+      <w:r>
+        <w:t>drawable</w:t>
+      </w:r>
+      <w:proofErr w:type="spellEnd"/>
+      <w:r>
+        <w:t xml:space="preserve"> als achtergrond geplaatst van de imageview.</w:t>
       </w:r>
       <w:r>
         <w:t xml:space="preserve"> De lege elementen zijn gewoon witte icoontjes die dus niet zichtbaar zijn door de witte achtergrond.</w:t>
@@ -2821,7 +4008,23 @@
     <w:p/>
     <w:p>
       <w:r>
-        <w:t>Om te eindigen, moest ik nog de images van firebase toevoegen hierbij heb ik vooral code van stackoverflow gebruikt om mijn oude klassen en methods te verbeteren.</w:t>
+        <w:t xml:space="preserve">Om te eindigen, moest ik nog de images van </w:t>
+      </w:r>
+      <w:proofErr w:type="spellStart"/>
+      <w:r>
+        <w:t>firebase</w:t>
+      </w:r>
+      <w:proofErr w:type="spellEnd"/>
+      <w:r>
+        <w:t xml:space="preserve"> toevoegen hierbij heb ik vooral code van stackoverflow gebruikt om mijn oude klassen en </w:t>
+      </w:r>
+      <w:proofErr w:type="spellStart"/>
+      <w:r>
+        <w:t>methods</w:t>
+      </w:r>
+      <w:proofErr w:type="spellEnd"/>
+      <w:r>
+        <w:t xml:space="preserve"> te verbeteren.</w:t>
       </w:r>
     </w:p>
     <w:p>
@@ -2918,14 +4121,75 @@
     </w:p>
     <w:p>
       <w:r>
-        <w:t xml:space="preserve">Ik had een image asset toegevoegd dat dus er voor zorgde dat de oude logo files worden vervangen. Hierbij heb een logo afbeelding als foreground en een transparant afbeelding als background. Maar dit wou niet helemaal werken door adaptive icon en legacy optie. De app als het om mijn emulator </w:t>
+        <w:t xml:space="preserve">Ik had een image asset toegevoegd dat dus er voor zorgde dat de oude logo files worden vervangen. Hierbij heb een logo afbeelding als </w:t>
+      </w:r>
+      <w:proofErr w:type="spellStart"/>
+      <w:r>
+        <w:t>foreground</w:t>
+      </w:r>
+      <w:proofErr w:type="spellEnd"/>
+      <w:r>
+        <w:t xml:space="preserve"> en een transparant afbeelding als background. Maar dit wou niet helemaal werken door </w:t>
+      </w:r>
+      <w:proofErr w:type="spellStart"/>
+      <w:r>
+        <w:t>adaptive</w:t>
+      </w:r>
+      <w:proofErr w:type="spellEnd"/>
+      <w:r>
+        <w:t xml:space="preserve"> icon en </w:t>
+      </w:r>
+      <w:proofErr w:type="spellStart"/>
+      <w:r>
+        <w:t>legacy</w:t>
+      </w:r>
+      <w:proofErr w:type="spellEnd"/>
+      <w:r>
+        <w:t xml:space="preserve"> optie. De app als het om mijn emulator </w:t>
       </w:r>
       <w:r>
         <w:lastRenderedPageBreak/>
-        <w:t>staat kreeg een zwarte achtergrond omdat transparant niet bestaat bij adaptive icons. Dus wat ik gedaan had was het gewoon op legacy only</w:t>
-      </w:r>
-      <w:r>
-        <w:t xml:space="preserve"> optie zetten waar ik gewoon eigenlijk de background kan weghalen door de shape als cirkel aan te duiden</w:t>
+        <w:t xml:space="preserve">staat kreeg een zwarte achtergrond omdat transparant niet bestaat bij </w:t>
+      </w:r>
+      <w:proofErr w:type="spellStart"/>
+      <w:r>
+        <w:t>adaptive</w:t>
+      </w:r>
+      <w:proofErr w:type="spellEnd"/>
+      <w:r>
+        <w:t xml:space="preserve"> </w:t>
+      </w:r>
+      <w:proofErr w:type="spellStart"/>
+      <w:r>
+        <w:t>icons</w:t>
+      </w:r>
+      <w:proofErr w:type="spellEnd"/>
+      <w:r>
+        <w:t xml:space="preserve">. Dus wat ik gedaan had was het gewoon op </w:t>
+      </w:r>
+      <w:proofErr w:type="spellStart"/>
+      <w:r>
+        <w:t>legacy</w:t>
+      </w:r>
+      <w:proofErr w:type="spellEnd"/>
+      <w:r>
+        <w:t xml:space="preserve"> </w:t>
+      </w:r>
+      <w:proofErr w:type="spellStart"/>
+      <w:r>
+        <w:t>only</w:t>
+      </w:r>
+      <w:proofErr w:type="spellEnd"/>
+      <w:r>
+        <w:t xml:space="preserve"> optie zetten waar ik gewoon eigenlijk de background kan weghalen door de </w:t>
+      </w:r>
+      <w:proofErr w:type="spellStart"/>
+      <w:r>
+        <w:t>shape</w:t>
+      </w:r>
+      <w:proofErr w:type="spellEnd"/>
+      <w:r>
+        <w:t xml:space="preserve"> als cirkel aan te duiden</w:t>
       </w:r>
       <w:r>
         <w:t>.</w:t>
@@ -2991,7 +4255,31 @@
     </w:p>
     <w:p>
       <w:r>
-        <w:t>Vandaag heb ik ervoor gezorgd dat ik image van uw gsm gallery kan uploaden. Hierbij dacht ik eerst dat automatisch de gallery die klaarstaat in de camera app kon gebruiken zoals bij facebook messenger, maar bestaat niet echt blijkbaar. Ik heb hiervoor zelfs een vraag gesteld op stackoverflow.</w:t>
+        <w:t xml:space="preserve">Vandaag heb ik ervoor gezorgd dat ik image van uw gsm </w:t>
+      </w:r>
+      <w:proofErr w:type="spellStart"/>
+      <w:r>
+        <w:t>gallery</w:t>
+      </w:r>
+      <w:proofErr w:type="spellEnd"/>
+      <w:r>
+        <w:t xml:space="preserve"> kan uploaden. Hierbij dacht ik eerst dat automatisch de </w:t>
+      </w:r>
+      <w:proofErr w:type="spellStart"/>
+      <w:r>
+        <w:t>gallery</w:t>
+      </w:r>
+      <w:proofErr w:type="spellEnd"/>
+      <w:r>
+        <w:t xml:space="preserve"> die klaarstaat in de camera app kon gebruiken zoals bij facebook </w:t>
+      </w:r>
+      <w:proofErr w:type="spellStart"/>
+      <w:r>
+        <w:t>messenger</w:t>
+      </w:r>
+      <w:proofErr w:type="spellEnd"/>
+      <w:r>
+        <w:t>, maar bestaat niet echt blijkbaar. Ik heb hiervoor zelfs een vraag gesteld op stackoverflow.</w:t>
       </w:r>
     </w:p>
     <w:p>
@@ -3006,7 +4294,31 @@
     </w:p>
     <w:p>
       <w:r>
-        <w:t xml:space="preserve">Uiteindelijk heb ik gewoon besloten om de camera en gallery op te splitsen en te kunnen openen in popup keuze menu. De code voor de gallery functionaliteiten </w:t>
+        <w:t xml:space="preserve">Uiteindelijk heb ik gewoon besloten om de camera en </w:t>
+      </w:r>
+      <w:proofErr w:type="spellStart"/>
+      <w:r>
+        <w:t>gallery</w:t>
+      </w:r>
+      <w:proofErr w:type="spellEnd"/>
+      <w:r>
+        <w:t xml:space="preserve"> op te splitsen en te kunnen openen in </w:t>
+      </w:r>
+      <w:proofErr w:type="spellStart"/>
+      <w:r>
+        <w:t>popup</w:t>
+      </w:r>
+      <w:proofErr w:type="spellEnd"/>
+      <w:r>
+        <w:t xml:space="preserve"> keuze menu. De code voor de </w:t>
+      </w:r>
+      <w:proofErr w:type="spellStart"/>
+      <w:r>
+        <w:t>gallery</w:t>
+      </w:r>
+      <w:proofErr w:type="spellEnd"/>
+      <w:r>
+        <w:t xml:space="preserve"> functionaliteiten </w:t>
       </w:r>
       <w:r>
         <w:t>is</w:t>
@@ -3105,7 +4417,23 @@
         </w:numPr>
       </w:pPr>
       <w:r>
-        <w:t>Vragen dat het ok is om je image te compressen (quality verlies?)</w:t>
+        <w:t xml:space="preserve">Vragen dat het ok is om je image te </w:t>
+      </w:r>
+      <w:proofErr w:type="spellStart"/>
+      <w:r>
+        <w:t>compressen</w:t>
+      </w:r>
+      <w:proofErr w:type="spellEnd"/>
+      <w:r>
+        <w:t xml:space="preserve"> (</w:t>
+      </w:r>
+      <w:proofErr w:type="spellStart"/>
+      <w:r>
+        <w:t>quality</w:t>
+      </w:r>
+      <w:proofErr w:type="spellEnd"/>
+      <w:r>
+        <w:t xml:space="preserve"> verlies?)</w:t>
       </w:r>
     </w:p>
     <w:p>
@@ -3117,8 +4445,21 @@
         </w:numPr>
       </w:pPr>
       <w:r>
-        <w:t>Image van de gridview kunnen openen in full size</w:t>
-      </w:r>
+        <w:t xml:space="preserve">Image van de </w:t>
+      </w:r>
+      <w:proofErr w:type="spellStart"/>
+      <w:r>
+        <w:t>gridview</w:t>
+      </w:r>
+      <w:proofErr w:type="spellEnd"/>
+      <w:r>
+        <w:t xml:space="preserve"> kunnen openen in full </w:t>
+      </w:r>
+      <w:proofErr w:type="spellStart"/>
+      <w:r>
+        <w:t>size</w:t>
+      </w:r>
+      <w:proofErr w:type="spellEnd"/>
     </w:p>
     <w:p>
       <w:pPr>
@@ -3129,7 +4470,15 @@
         </w:numPr>
       </w:pPr>
       <w:r>
-        <w:t>App op google playstore plaatsen!!</w:t>
+        <w:t xml:space="preserve">App op google </w:t>
+      </w:r>
+      <w:proofErr w:type="spellStart"/>
+      <w:r>
+        <w:t>playstore</w:t>
+      </w:r>
+      <w:proofErr w:type="spellEnd"/>
+      <w:r>
+        <w:t xml:space="preserve"> plaatsen!!</w:t>
       </w:r>
     </w:p>
     <w:p>
@@ -3140,8 +4489,13 @@
           <w:numId w:val="2"/>
         </w:numPr>
       </w:pPr>
-      <w:r>
-        <w:t>Offfline functionaliteiten toevoegen?</w:t>
+      <w:proofErr w:type="spellStart"/>
+      <w:r>
+        <w:t>Offfline</w:t>
+      </w:r>
+      <w:proofErr w:type="spellEnd"/>
+      <w:r>
+        <w:t xml:space="preserve"> functionaliteiten toevoegen?</w:t>
       </w:r>
     </w:p>
     <w:p/>
@@ -3162,16 +4516,80 @@
     </w:p>
     <w:p>
       <w:r>
-        <w:t xml:space="preserve">Vandaag wou ik beginnen met het uploaden van mijn app op google play maar toen ik tutorial volgde moest ik eerst mijn app package name veranderen want com.example is niet correct. Toen ik dat veranderen </w:t>
-      </w:r>
-      <w:r>
-        <w:t>werkte de google services niet meer want de package name was com.example in de google-services.json file. Dus ik moest mijn app in firebase opnieuw maken dat niet echt moeilijk was.</w:t>
-      </w:r>
-      <w:r>
-        <w:t xml:space="preserve"> Daarna heb ik een android app bundle aangemaakt want dit is nodig voor de release.</w:t>
-      </w:r>
-      <w:r>
-        <w:t xml:space="preserve"> Ze vroeg dan om developer account aan te maken waarbij ik 1 keer 25 euro moest betalen. Daarbij was ik effe gestopt want mijn ouders waren niet thuis voor een mastercard te gebruiken.</w:t>
+        <w:t xml:space="preserve">Vandaag wou ik beginnen met het uploaden van mijn app op google </w:t>
+      </w:r>
+      <w:proofErr w:type="spellStart"/>
+      <w:r>
+        <w:t>play</w:t>
+      </w:r>
+      <w:proofErr w:type="spellEnd"/>
+      <w:r>
+        <w:t xml:space="preserve"> maar toen ik tutorial volgde moest ik eerst mijn app package name veranderen want </w:t>
+      </w:r>
+      <w:proofErr w:type="spellStart"/>
+      <w:r>
+        <w:t>com.example</w:t>
+      </w:r>
+      <w:proofErr w:type="spellEnd"/>
+      <w:r>
+        <w:t xml:space="preserve"> is niet correct. Toen ik dat veranderen </w:t>
+      </w:r>
+      <w:r>
+        <w:t xml:space="preserve">werkte de google services niet meer want de package name was </w:t>
+      </w:r>
+      <w:proofErr w:type="spellStart"/>
+      <w:r>
+        <w:t>com.example</w:t>
+      </w:r>
+      <w:proofErr w:type="spellEnd"/>
+      <w:r>
+        <w:t xml:space="preserve"> in de google-</w:t>
+      </w:r>
+      <w:proofErr w:type="spellStart"/>
+      <w:r>
+        <w:t>services.json</w:t>
+      </w:r>
+      <w:proofErr w:type="spellEnd"/>
+      <w:r>
+        <w:t xml:space="preserve"> file. Dus ik moest mijn app in </w:t>
+      </w:r>
+      <w:proofErr w:type="spellStart"/>
+      <w:r>
+        <w:t>firebase</w:t>
+      </w:r>
+      <w:proofErr w:type="spellEnd"/>
+      <w:r>
+        <w:t xml:space="preserve"> opnieuw maken dat niet echt moeilijk was.</w:t>
+      </w:r>
+      <w:r>
+        <w:t xml:space="preserve"> Daarna heb ik een </w:t>
+      </w:r>
+      <w:proofErr w:type="spellStart"/>
+      <w:r>
+        <w:t>android</w:t>
+      </w:r>
+      <w:proofErr w:type="spellEnd"/>
+      <w:r>
+        <w:t xml:space="preserve"> app </w:t>
+      </w:r>
+      <w:proofErr w:type="spellStart"/>
+      <w:r>
+        <w:t>bundle</w:t>
+      </w:r>
+      <w:proofErr w:type="spellEnd"/>
+      <w:r>
+        <w:t xml:space="preserve"> aangemaakt want dit is nodig voor de release.</w:t>
+      </w:r>
+      <w:r>
+        <w:t xml:space="preserve"> Ze vroeg dan om </w:t>
+      </w:r>
+      <w:proofErr w:type="spellStart"/>
+      <w:r>
+        <w:t>developer</w:t>
+      </w:r>
+      <w:proofErr w:type="spellEnd"/>
+      <w:r>
+        <w:t xml:space="preserve"> account aan te maken waarbij ik 1 keer 25 euro moest betalen. Daarbij was ik effe gestopt want mijn ouders waren niet thuis voor een mastercard te gebruiken.</w:t>
       </w:r>
     </w:p>
     <w:p>
@@ -3248,7 +4666,15 @@
     </w:p>
     <w:p>
       <w:r>
-        <w:t>In de avond heb ik dan mijn developer account aangemaakt.</w:t>
+        <w:t xml:space="preserve">In de avond heb ik dan mijn </w:t>
+      </w:r>
+      <w:proofErr w:type="spellStart"/>
+      <w:r>
+        <w:t>developer</w:t>
+      </w:r>
+      <w:proofErr w:type="spellEnd"/>
+      <w:r>
+        <w:t xml:space="preserve"> account aangemaakt.</w:t>
       </w:r>
     </w:p>
     <w:p/>
@@ -3272,7 +4698,23 @@
         <w:t>Vandaag ben ik effe kort begonnen met het beter beveiligen van het wachtwoord om te registeren en in te loggen</w:t>
       </w:r>
       <w:r>
-        <w:t xml:space="preserve">. Hierbij vraag ik dus dat het wachtwoord een kleine letter, grote letter, geen spaties, 1 nummer en een lengte van 8 tekens heeft. Dit wordt weergegeven als een error onder de wachtwoord textbox. Het email wordt dankzij firebase al gevalideerd dat het correct is, dus ik moet zelf geen error toevoegen. </w:t>
+        <w:t xml:space="preserve">. Hierbij vraag ik dus dat het wachtwoord een kleine letter, grote letter, geen spaties, 1 nummer en een lengte van 8 tekens heeft. Dit wordt weergegeven als een error onder de wachtwoord </w:t>
+      </w:r>
+      <w:proofErr w:type="spellStart"/>
+      <w:r>
+        <w:t>textbox</w:t>
+      </w:r>
+      <w:proofErr w:type="spellEnd"/>
+      <w:r>
+        <w:t xml:space="preserve">. Het email wordt dankzij </w:t>
+      </w:r>
+      <w:proofErr w:type="spellStart"/>
+      <w:r>
+        <w:t>firebase</w:t>
+      </w:r>
+      <w:proofErr w:type="spellEnd"/>
+      <w:r>
+        <w:t xml:space="preserve"> al gevalideerd dat het correct is, dus ik moet zelf geen error toevoegen. </w:t>
       </w:r>
       <w:r>
         <w:t>Maar er wordt wel een toast bericht voor de zekerheid weergegeven vanonder als de registratie mislukt</w:t>
@@ -3283,13 +4725,37 @@
     </w:p>
     <w:p>
       <w:r>
-        <w:t xml:space="preserve">Daarna heb ik de app bundle </w:t>
+        <w:t xml:space="preserve">Daarna heb ik de app </w:t>
+      </w:r>
+      <w:proofErr w:type="spellStart"/>
+      <w:r>
+        <w:t>bundle</w:t>
+      </w:r>
+      <w:proofErr w:type="spellEnd"/>
+      <w:r>
+        <w:t xml:space="preserve"> </w:t>
       </w:r>
       <w:r>
         <w:t>geüpdatet</w:t>
       </w:r>
       <w:r>
-        <w:t xml:space="preserve"> naar de volgende versie, omdat er aanpassingen waren. Deze release heb ik dan op google play console geüpload, hierbij moest ik nog in de dashboard veel taken afleggen. De belangrijksten waren bijvoorbeeld een test account meegeven zodat google dit kan gebruiken om mijn app te controleren, een privacybeleid toevoegen hi</w:t>
+        <w:t xml:space="preserve"> naar de volgende versie, omdat er aanpassingen waren. Deze release heb ik dan op google </w:t>
+      </w:r>
+      <w:proofErr w:type="spellStart"/>
+      <w:r>
+        <w:t>play</w:t>
+      </w:r>
+      <w:proofErr w:type="spellEnd"/>
+      <w:r>
+        <w:t xml:space="preserve"> console geüpload, hierbij moest ik nog in de dashboard veel taken afleggen. De belangrijksten waren bijvoorbeeld een test account meegeven zodat google dit kan gebruiken om mijn app te controleren, een </w:t>
+      </w:r>
+      <w:proofErr w:type="spellStart"/>
+      <w:r>
+        <w:t>privacybeleid</w:t>
+      </w:r>
+      <w:proofErr w:type="spellEnd"/>
+      <w:r>
+        <w:t xml:space="preserve"> toevoegen hi</w:t>
       </w:r>
       <w:r>
         <w:t>er</w:t>
@@ -3341,13 +4807,77 @@
     </w:p>
     <w:p>
       <w:r>
-        <w:t xml:space="preserve">Hierbij had vooral deze youtube video nodig omdat ik de uri van de image die ik aan klik moest doorsturen naar het een fragment waar je de img in het groot kan bekijken. </w:t>
-      </w:r>
-      <w:r>
-        <w:t>Ik maakte toen een keer grote fout door een nieuwe imageDetailsFragment te openen als ik eigenlijk een bundle (waar de uri wordt opgeslagen)</w:t>
-      </w:r>
-      <w:r>
-        <w:t xml:space="preserve"> had toegevoegd aan een ImageDetailsFragment als arguments. Ik navigeerde eigenlijk naar een fragment zonder argumenten die hard nodig had. Dit heb ik natuurlijk opgelost</w:t>
+        <w:t xml:space="preserve">Hierbij had vooral deze </w:t>
+      </w:r>
+      <w:proofErr w:type="spellStart"/>
+      <w:r>
+        <w:t>youtube</w:t>
+      </w:r>
+      <w:proofErr w:type="spellEnd"/>
+      <w:r>
+        <w:t xml:space="preserve"> video nodig omdat ik de </w:t>
+      </w:r>
+      <w:proofErr w:type="spellStart"/>
+      <w:r>
+        <w:t>uri</w:t>
+      </w:r>
+      <w:proofErr w:type="spellEnd"/>
+      <w:r>
+        <w:t xml:space="preserve"> van de image die ik aan klik moest doorsturen naar het een fragment waar je de </w:t>
+      </w:r>
+      <w:proofErr w:type="spellStart"/>
+      <w:r>
+        <w:t>img</w:t>
+      </w:r>
+      <w:proofErr w:type="spellEnd"/>
+      <w:r>
+        <w:t xml:space="preserve"> in het groot kan bekijken. </w:t>
+      </w:r>
+      <w:r>
+        <w:t xml:space="preserve">Ik maakte toen een keer grote fout door een nieuwe </w:t>
+      </w:r>
+      <w:proofErr w:type="spellStart"/>
+      <w:r>
+        <w:t>imageDetailsFragment</w:t>
+      </w:r>
+      <w:proofErr w:type="spellEnd"/>
+      <w:r>
+        <w:t xml:space="preserve"> te openen als ik eigenlijk een </w:t>
+      </w:r>
+      <w:proofErr w:type="spellStart"/>
+      <w:r>
+        <w:t>bundle</w:t>
+      </w:r>
+      <w:proofErr w:type="spellEnd"/>
+      <w:r>
+        <w:t xml:space="preserve"> (waar de </w:t>
+      </w:r>
+      <w:proofErr w:type="spellStart"/>
+      <w:r>
+        <w:t>uri</w:t>
+      </w:r>
+      <w:proofErr w:type="spellEnd"/>
+      <w:r>
+        <w:t xml:space="preserve"> wordt opgeslagen)</w:t>
+      </w:r>
+      <w:r>
+        <w:t xml:space="preserve"> had toegevoegd aan een </w:t>
+      </w:r>
+      <w:proofErr w:type="spellStart"/>
+      <w:r>
+        <w:t>ImageDetailsFragment</w:t>
+      </w:r>
+      <w:proofErr w:type="spellEnd"/>
+      <w:r>
+        <w:t xml:space="preserve"> als </w:t>
+      </w:r>
+      <w:proofErr w:type="spellStart"/>
+      <w:r>
+        <w:t>arguments</w:t>
+      </w:r>
+      <w:proofErr w:type="spellEnd"/>
+      <w:r>
+        <w:t>. Ik navigeerde eigenlijk naar een fragment zonder argumenten die hard nodig had. Dit heb ik natuurlijk opgelost</w:t>
       </w:r>
       <w:r>
         <w:t xml:space="preserve"> zie onderstaande </w:t>
@@ -3361,7 +4891,15 @@
     </w:p>
     <w:p>
       <w:r>
-        <w:t>Het enige probleempje dat er nog is, is dat sommige afbeeldingen die vergroot worden onscherm kunnen uitzien.</w:t>
+        <w:t xml:space="preserve">Het enige probleempje dat er nog is, is dat sommige afbeeldingen die vergroot worden </w:t>
+      </w:r>
+      <w:proofErr w:type="spellStart"/>
+      <w:r>
+        <w:t>onscherm</w:t>
+      </w:r>
+      <w:proofErr w:type="spellEnd"/>
+      <w:r>
+        <w:t xml:space="preserve"> kunnen uitzien.</w:t>
       </w:r>
       <w:r>
         <w:t xml:space="preserve"> </w:t>
@@ -3439,7 +4977,15 @@
     </w:p>
     <w:p>
       <w:r>
-        <w:t>Vandaag heb ik een realtime database aangemaakt om een chat functionaliteiten toe te voegen.</w:t>
+        <w:t xml:space="preserve">Vandaag heb ik een </w:t>
+      </w:r>
+      <w:proofErr w:type="spellStart"/>
+      <w:r>
+        <w:t>realtime</w:t>
+      </w:r>
+      <w:proofErr w:type="spellEnd"/>
+      <w:r>
+        <w:t xml:space="preserve"> database aangemaakt om een chat functionaliteiten toe te voegen.</w:t>
       </w:r>
       <w:r>
         <w:t xml:space="preserve"> Hierbij ga ik de volgende video’s gebruiken:</w:t>
@@ -3527,8 +5073,13 @@
           <w:numId w:val="2"/>
         </w:numPr>
       </w:pPr>
-      <w:r>
-        <w:t>Offfline functionaliteiten toevoegen?</w:t>
+      <w:proofErr w:type="spellStart"/>
+      <w:r>
+        <w:t>Offfline</w:t>
+      </w:r>
+      <w:proofErr w:type="spellEnd"/>
+      <w:r>
+        <w:t xml:space="preserve"> functionaliteiten toevoegen?</w:t>
       </w:r>
     </w:p>
     <w:p>
@@ -3563,7 +5114,15 @@
     </w:p>
     <w:p>
       <w:r>
-        <w:t>Vandaag is mijn app beschikbaar op google play die je via deze link kan downloaden.</w:t>
+        <w:t xml:space="preserve">Vandaag is mijn app beschikbaar op google </w:t>
+      </w:r>
+      <w:proofErr w:type="spellStart"/>
+      <w:r>
+        <w:t>play</w:t>
+      </w:r>
+      <w:proofErr w:type="spellEnd"/>
+      <w:r>
+        <w:t xml:space="preserve"> die je via deze link kan downloaden.</w:t>
       </w:r>
     </w:p>
     <w:p>
@@ -3578,13 +5137,29 @@
     </w:p>
     <w:p>
       <w:r>
-        <w:t>Toen ik het had gedownload merkte ik dat google login niet wou werken. Dit heb ik dan onmiddellijk opgezocht en ik moest gewoon een extra SHA1 fingerp</w:t>
+        <w:t xml:space="preserve">Toen ik het had gedownload merkte ik dat google login niet wou werken. Dit heb ik dan onmiddellijk opgezocht en ik moest gewoon een extra SHA1 </w:t>
+      </w:r>
+      <w:proofErr w:type="spellStart"/>
+      <w:r>
+        <w:t>fingerp</w:t>
       </w:r>
       <w:r>
         <w:t>r</w:t>
       </w:r>
       <w:r>
-        <w:t>int van google play nog toevoegen aan mijn app. Dus nu werkt hij perfect.</w:t>
+        <w:t>int</w:t>
+      </w:r>
+      <w:proofErr w:type="spellEnd"/>
+      <w:r>
+        <w:t xml:space="preserve"> van google </w:t>
+      </w:r>
+      <w:proofErr w:type="spellStart"/>
+      <w:r>
+        <w:t>play</w:t>
+      </w:r>
+      <w:proofErr w:type="spellEnd"/>
+      <w:r>
+        <w:t xml:space="preserve"> nog toevoegen aan mijn app. Dus nu werkt hij perfect.</w:t>
       </w:r>
     </w:p>
     <w:p>
@@ -3604,7 +5179,15 @@
     </w:p>
     <w:p>
       <w:r>
-        <w:t>Ik heb dan geprobeerd om data toe te voegen aan mijn realtime database maar nog geen succes. Ik moest nu stoppen omdat ik een online gesprek ga hebben voor mijn stage tijdens het 2</w:t>
+        <w:t xml:space="preserve">Ik heb dan geprobeerd om data toe te voegen aan mijn </w:t>
+      </w:r>
+      <w:proofErr w:type="spellStart"/>
+      <w:r>
+        <w:t>realtime</w:t>
+      </w:r>
+      <w:proofErr w:type="spellEnd"/>
+      <w:r>
+        <w:t xml:space="preserve"> database maar nog geen succes. Ik moest nu stoppen omdat ik een online gesprek ga hebben voor mijn stage tijdens het 2</w:t>
       </w:r>
       <w:r>
         <w:rPr>
@@ -3640,11 +5223,48 @@
       </w:r>
     </w:p>
     <w:p>
-      <w:r>
-        <w:t>Firebase Realtime database wou geen data toevoegen en</w:t>
-      </w:r>
-      <w:r>
-        <w:t xml:space="preserve"> ik had alles geprobeerd. Ik realiseerde toen dat realtime firebase alleen mogelijk was voor de regio van België europe-west1. Ik besloot dan naar firestore te gaan want daar hebben ze wel europe-west3 dat Nederland en België bevat. </w:t>
+      <w:proofErr w:type="spellStart"/>
+      <w:r>
+        <w:t>Firebase</w:t>
+      </w:r>
+      <w:proofErr w:type="spellEnd"/>
+      <w:r>
+        <w:t xml:space="preserve"> </w:t>
+      </w:r>
+      <w:proofErr w:type="spellStart"/>
+      <w:r>
+        <w:t>Realtime</w:t>
+      </w:r>
+      <w:proofErr w:type="spellEnd"/>
+      <w:r>
+        <w:t xml:space="preserve"> database wou geen data toevoegen en</w:t>
+      </w:r>
+      <w:r>
+        <w:t xml:space="preserve"> ik had alles geprobeerd. Ik realiseerde toen dat </w:t>
+      </w:r>
+      <w:proofErr w:type="spellStart"/>
+      <w:r>
+        <w:t>realtime</w:t>
+      </w:r>
+      <w:proofErr w:type="spellEnd"/>
+      <w:r>
+        <w:t xml:space="preserve"> </w:t>
+      </w:r>
+      <w:proofErr w:type="spellStart"/>
+      <w:r>
+        <w:t>firebase</w:t>
+      </w:r>
+      <w:proofErr w:type="spellEnd"/>
+      <w:r>
+        <w:t xml:space="preserve"> alleen mogelijk was voor de regio van België europe-west1. Ik besloot dan naar </w:t>
+      </w:r>
+      <w:proofErr w:type="spellStart"/>
+      <w:r>
+        <w:t>firestore</w:t>
+      </w:r>
+      <w:proofErr w:type="spellEnd"/>
+      <w:r>
+        <w:t xml:space="preserve"> te gaan want daar hebben ze wel europe-west3 dat Nederland en België bevat. </w:t>
       </w:r>
       <w:r>
         <w:t>Dit heeft het probleem onmiddellijk opgelost.</w:t>
@@ -3652,7 +5272,15 @@
     </w:p>
     <w:p>
       <w:r>
-        <w:t>Nu als je inlogt zal je gebruikersgegevens op firestore geplaatst worden. Nu kan ik eindelijk vlot beginnen met de chat functionaliteiten.</w:t>
+        <w:t xml:space="preserve">Nu als je inlogt zal je gebruikersgegevens op </w:t>
+      </w:r>
+      <w:proofErr w:type="spellStart"/>
+      <w:r>
+        <w:t>firestore</w:t>
+      </w:r>
+      <w:proofErr w:type="spellEnd"/>
+      <w:r>
+        <w:t xml:space="preserve"> geplaatst worden. Nu kan ik eindelijk vlot beginnen met de chat functionaliteiten.</w:t>
       </w:r>
     </w:p>
     <w:p>
@@ -3739,7 +5367,31 @@
     </w:p>
     <w:p>
       <w:r>
-        <w:t>Vandaag probeerde ik offline support toe te voegen. Voor firestore was dat niet zo moeilijk want alles kon ik vinden op deze link, maar ik heb dit nog niet echt kunnen uittesten. Voor firebase storage lukte dit niet echt, want er was geen duidelijk documentatie. Ik wou vooral proberen om de images op firebase in de cache te steken, zodat de meeste recente images verschijnen op de startpagina.</w:t>
+        <w:t xml:space="preserve">Vandaag probeerde ik offline support toe te voegen. Voor </w:t>
+      </w:r>
+      <w:proofErr w:type="spellStart"/>
+      <w:r>
+        <w:t>firestore</w:t>
+      </w:r>
+      <w:proofErr w:type="spellEnd"/>
+      <w:r>
+        <w:t xml:space="preserve"> was dat niet zo moeilijk want alles kon ik vinden op deze link, maar ik heb dit nog niet echt kunnen uittesten. Voor </w:t>
+      </w:r>
+      <w:proofErr w:type="spellStart"/>
+      <w:r>
+        <w:t>firebase</w:t>
+      </w:r>
+      <w:proofErr w:type="spellEnd"/>
+      <w:r>
+        <w:t xml:space="preserve"> storage lukte dit niet echt, want er was geen duidelijk documentatie. Ik wou vooral proberen om de images op </w:t>
+      </w:r>
+      <w:proofErr w:type="spellStart"/>
+      <w:r>
+        <w:t>firebase</w:t>
+      </w:r>
+      <w:proofErr w:type="spellEnd"/>
+      <w:r>
+        <w:t xml:space="preserve"> in de cache te steken, zodat de meeste recente images verschijnen op de startpagina.</w:t>
       </w:r>
       <w:r>
         <w:t xml:space="preserve"> Mijn conclusie is eigenlijk dat het niet mogelijk is afhankelijk van het totale zoekwerk.</w:t>
@@ -3757,7 +5409,15 @@
     </w:p>
     <w:p>
       <w:r>
-        <w:t>Ik heb dan ondertussen een progress bar toegevoegd die zal</w:t>
+        <w:t xml:space="preserve">Ik heb dan ondertussen een </w:t>
+      </w:r>
+      <w:proofErr w:type="spellStart"/>
+      <w:r>
+        <w:t>progress</w:t>
+      </w:r>
+      <w:proofErr w:type="spellEnd"/>
+      <w:r>
+        <w:t xml:space="preserve"> bar toegevoegd die zal</w:t>
       </w:r>
       <w:r>
         <w:t xml:space="preserve"> </w:t>
@@ -3766,7 +5426,15 @@
         <w:t>verdwijnen als de images inladen.</w:t>
       </w:r>
       <w:r>
-        <w:t xml:space="preserve"> Dit komt ook bij de groepchats pagina.</w:t>
+        <w:t xml:space="preserve"> Dit komt ook bij de </w:t>
+      </w:r>
+      <w:proofErr w:type="spellStart"/>
+      <w:r>
+        <w:t>groepchats</w:t>
+      </w:r>
+      <w:proofErr w:type="spellEnd"/>
+      <w:r>
+        <w:t xml:space="preserve"> pagina.</w:t>
       </w:r>
     </w:p>
     <w:p/>
@@ -3787,13 +5455,58 @@
     </w:p>
     <w:p>
       <w:r>
-        <w:t>Vandaag heb ik verder gewerkt aan de chat functionaliteiten. Ik had in het begin een beetje moeilijkheden met het maken van de layout van de chat room en chat messages. Hierbij heeft de</w:t>
-      </w:r>
-      <w:r>
-        <w:t>ze link geholpen want de youtube tutorials chat layout was zeer lelijk.</w:t>
-      </w:r>
-    </w:p>
-    <w:p>
+        <w:t xml:space="preserve">Vandaag heb ik verder gewerkt aan de chat functionaliteiten. Ik had in het begin een beetje moeilijkheden met het maken van de </w:t>
+      </w:r>
+      <w:proofErr w:type="spellStart"/>
+      <w:r>
+        <w:t>layout</w:t>
+      </w:r>
+      <w:proofErr w:type="spellEnd"/>
+      <w:r>
+        <w:t xml:space="preserve"> van de chat room en chat </w:t>
+      </w:r>
+      <w:proofErr w:type="spellStart"/>
+      <w:r>
+        <w:t>messages</w:t>
+      </w:r>
+      <w:proofErr w:type="spellEnd"/>
+      <w:r>
+        <w:t>. Hierbij heeft de</w:t>
+      </w:r>
+      <w:r>
+        <w:t xml:space="preserve">ze link geholpen want de </w:t>
+      </w:r>
+      <w:proofErr w:type="spellStart"/>
+      <w:r>
+        <w:t>youtube</w:t>
+      </w:r>
+      <w:proofErr w:type="spellEnd"/>
+      <w:r>
+        <w:t xml:space="preserve"> </w:t>
+      </w:r>
+      <w:proofErr w:type="spellStart"/>
+      <w:r>
+        <w:t>tutorials</w:t>
+      </w:r>
+      <w:proofErr w:type="spellEnd"/>
+      <w:r>
+        <w:t xml:space="preserve"> chat </w:t>
+      </w:r>
+      <w:proofErr w:type="spellStart"/>
+      <w:r>
+        <w:t>layout</w:t>
+      </w:r>
+      <w:proofErr w:type="spellEnd"/>
+      <w:r>
+        <w:t xml:space="preserve"> was zeer lelijk.</w:t>
+      </w:r>
+    </w:p>
+    <w:p>
+      <w:pPr>
+        <w:rPr>
+          <w:rStyle w:val="Hyperlink"/>
+        </w:rPr>
+      </w:pPr>
       <w:hyperlink r:id="rId69" w:history="1">
         <w:r>
           <w:rPr>
@@ -3806,6 +5519,58 @@
     <w:p/>
     <w:p>
       <w:pPr>
+        <w:pStyle w:val="Kop2"/>
+      </w:pPr>
+      <w:r>
+        <w:t xml:space="preserve">Week </w:t>
+      </w:r>
+      <w:r>
+        <w:t>10</w:t>
+      </w:r>
+    </w:p>
+    <w:p>
+      <w:pPr>
+        <w:pStyle w:val="Kop3"/>
+      </w:pPr>
+      <w:r>
+        <w:t>Wat ik wil realiseren deze week:</w:t>
+      </w:r>
+    </w:p>
+    <w:p>
+      <w:pPr>
+        <w:pStyle w:val="Lijstalinea"/>
+        <w:numPr>
+          <w:ilvl w:val="0"/>
+          <w:numId w:val="2"/>
+        </w:numPr>
+      </w:pPr>
+      <w:proofErr w:type="spellStart"/>
+      <w:r>
+        <w:t>Offfline</w:t>
+      </w:r>
+      <w:proofErr w:type="spellEnd"/>
+      <w:r>
+        <w:t xml:space="preserve"> functionaliteiten toevoegen?</w:t>
+      </w:r>
+    </w:p>
+    <w:p>
+      <w:pPr>
+        <w:pStyle w:val="Lijstalinea"/>
+        <w:numPr>
+          <w:ilvl w:val="0"/>
+          <w:numId w:val="2"/>
+        </w:numPr>
+      </w:pPr>
+      <w:r>
+        <w:t>Afwerken</w:t>
+      </w:r>
+      <w:r>
+        <w:t xml:space="preserve"> Mijn groepen pagina en chat functionaliteiten.</w:t>
+      </w:r>
+    </w:p>
+    <w:p/>
+    <w:p>
+      <w:pPr>
         <w:rPr>
           <w:b/>
           <w:bCs/>
@@ -3821,7 +5586,15 @@
     </w:p>
     <w:p>
       <w:r>
-        <w:t>Vandaag heb ik de groepen chatrooms toegevoegd in een gridview waarmee de chat</w:t>
+        <w:t xml:space="preserve">Vandaag heb ik de groepen chatrooms toegevoegd in een </w:t>
+      </w:r>
+      <w:proofErr w:type="spellStart"/>
+      <w:r>
+        <w:t>gridview</w:t>
+      </w:r>
+      <w:proofErr w:type="spellEnd"/>
+      <w:r>
+        <w:t xml:space="preserve"> waarmee de chat</w:t>
       </w:r>
       <w:r>
         <w:t>s</w:t>
@@ -3830,10 +5603,50 @@
         <w:t xml:space="preserve"> zullen geopend worden. </w:t>
       </w:r>
       <w:r>
-        <w:t>Hierbij kreeg ik serieuze error die me compleet had verward en op stackoverflow had gesteld. Ik had dus per ongeluk de gridview het verkeerde ID gegeven waardoor er een NullPointerException ontstond, maar ik dacht dat de adapter null werd omdat het me niet lukte om de gegevens van firestore te halen.</w:t>
-      </w:r>
-      <w:r>
-        <w:t xml:space="preserve"> In de comments en antwoord wordt alles nog beter uitgelegd.</w:t>
+        <w:t xml:space="preserve">Hierbij kreeg ik serieuze error die me compleet had verward en op stackoverflow had gesteld. Ik had dus per ongeluk de </w:t>
+      </w:r>
+      <w:proofErr w:type="spellStart"/>
+      <w:r>
+        <w:t>gridview</w:t>
+      </w:r>
+      <w:proofErr w:type="spellEnd"/>
+      <w:r>
+        <w:t xml:space="preserve"> het verkeerde ID gegeven waardoor er een </w:t>
+      </w:r>
+      <w:proofErr w:type="spellStart"/>
+      <w:r>
+        <w:t>NullPointerException</w:t>
+      </w:r>
+      <w:proofErr w:type="spellEnd"/>
+      <w:r>
+        <w:t xml:space="preserve"> ontstond, maar ik dacht dat de adapter </w:t>
+      </w:r>
+      <w:proofErr w:type="spellStart"/>
+      <w:r>
+        <w:t>null</w:t>
+      </w:r>
+      <w:proofErr w:type="spellEnd"/>
+      <w:r>
+        <w:t xml:space="preserve"> werd omdat het me niet lukte om de gegevens van </w:t>
+      </w:r>
+      <w:proofErr w:type="spellStart"/>
+      <w:r>
+        <w:t>firestore</w:t>
+      </w:r>
+      <w:proofErr w:type="spellEnd"/>
+      <w:r>
+        <w:t xml:space="preserve"> te halen.</w:t>
+      </w:r>
+      <w:r>
+        <w:t xml:space="preserve"> In de </w:t>
+      </w:r>
+      <w:proofErr w:type="spellStart"/>
+      <w:r>
+        <w:t>comments</w:t>
+      </w:r>
+      <w:proofErr w:type="spellEnd"/>
+      <w:r>
+        <w:t xml:space="preserve"> en antwoord wordt alles nog beter uitgelegd.</w:t>
       </w:r>
     </w:p>
     <w:p>
@@ -3873,6 +5686,7 @@
         <w:rPr>
           <w:noProof/>
         </w:rPr>
+        <w:lastRenderedPageBreak/>
         <w:drawing>
           <wp:inline distT="0" distB="0" distL="0" distR="0" wp14:anchorId="5C8CC2ED" wp14:editId="1F1ED4B8">
             <wp:extent cx="5657850" cy="1143000"/>

</xml_diff>

<commit_message>
Chat rooms can now be opened.
</commit_message>
<xml_diff>
--- a/Logboek_Dries_Fierens.docx
+++ b/Logboek_Dries_Fierens.docx
@@ -46,39 +46,15 @@
         <w:t>applicatie</w:t>
       </w:r>
       <w:r>
-        <w:t xml:space="preserve"> die je kan maken en welke technologieën je kan gebruiken. Ik heb voor native gekozen want dat past het best bij mijn aftakking “Software </w:t>
-      </w:r>
-      <w:proofErr w:type="spellStart"/>
-      <w:r>
-        <w:t>developer</w:t>
-      </w:r>
-      <w:proofErr w:type="spellEnd"/>
-      <w:r>
-        <w:t xml:space="preserve">” sinds het </w:t>
-      </w:r>
-      <w:proofErr w:type="spellStart"/>
-      <w:r>
-        <w:t>java</w:t>
-      </w:r>
-      <w:proofErr w:type="spellEnd"/>
-      <w:r>
-        <w:t xml:space="preserve"> inhoudt. De anderen zijn </w:t>
-      </w:r>
-      <w:proofErr w:type="spellStart"/>
-      <w:r>
-        <w:t>hybrid</w:t>
-      </w:r>
-      <w:proofErr w:type="spellEnd"/>
-      <w:r>
-        <w:t xml:space="preserve"> en </w:t>
-      </w:r>
-      <w:proofErr w:type="spellStart"/>
-      <w:r>
-        <w:t>progressive</w:t>
-      </w:r>
-      <w:proofErr w:type="spellEnd"/>
-      <w:r>
-        <w:t xml:space="preserve"> web app dat dus meer te maken hebben met web &amp; mobile dus vooral HTML &amp; CSS. We moesten dan ook nog kiezen voor een project idee, waarbij ik koos voor een scanner + pdf converter app</w:t>
+        <w:t xml:space="preserve"> die je kan maken en welke technologieën je kan gebruiken. Ik heb voor native gekozen want dat past het best bij mijn aftakking “Software developer” sinds het java inhoudt. De anderen zijn hybrid en progressive web app dat dus meer te maken hebben met web &amp; mobile dus vooral HTML &amp; CSS. We moesten dan ook nog kiezen voor een project idee, waarbij ik koos voor een scanner + </w:t>
+      </w:r>
+      <w:proofErr w:type="gramStart"/>
+      <w:r>
+        <w:t>pdf converter</w:t>
+      </w:r>
+      <w:proofErr w:type="gramEnd"/>
+      <w:r>
+        <w:t xml:space="preserve"> app</w:t>
       </w:r>
       <w:r>
         <w:t xml:space="preserve"> waarbij het vooral bedoelt is o</w:t>
@@ -99,98 +75,34 @@
         <w:t>.</w:t>
       </w:r>
       <w:r>
-        <w:t xml:space="preserve"> Het was verplicht om 1 hardware component van de gsm te gebruiken dus koos ik natuurlijk voor de camera.</w:t>
+        <w:t xml:space="preserve"> Het was verplicht om 1 </w:t>
+      </w:r>
+      <w:proofErr w:type="gramStart"/>
+      <w:r>
+        <w:t>hardware component</w:t>
+      </w:r>
+      <w:proofErr w:type="gramEnd"/>
+      <w:r>
+        <w:t xml:space="preserve"> van de gsm te gebruiken dus koos ik natuurlijk voor de camera.</w:t>
       </w:r>
       <w:r>
         <w:t xml:space="preserve"> </w:t>
       </w:r>
       <w:r>
-        <w:t xml:space="preserve">Als </w:t>
-      </w:r>
-      <w:proofErr w:type="spellStart"/>
-      <w:r>
-        <w:t>back-end</w:t>
-      </w:r>
-      <w:proofErr w:type="spellEnd"/>
-      <w:r>
-        <w:t xml:space="preserve"> koos ik </w:t>
-      </w:r>
-      <w:proofErr w:type="spellStart"/>
-      <w:r>
-        <w:t>Firebase</w:t>
-      </w:r>
-      <w:proofErr w:type="spellEnd"/>
-      <w:r>
-        <w:t xml:space="preserve"> en als technologie koos ik in </w:t>
-      </w:r>
-      <w:proofErr w:type="spellStart"/>
-      <w:r>
-        <w:t>java</w:t>
-      </w:r>
-      <w:proofErr w:type="spellEnd"/>
-      <w:r>
-        <w:t xml:space="preserve"> te werken om een </w:t>
-      </w:r>
-      <w:proofErr w:type="spellStart"/>
-      <w:r>
-        <w:t>android</w:t>
-      </w:r>
-      <w:proofErr w:type="spellEnd"/>
-      <w:r>
-        <w:t xml:space="preserve"> app te maken in plaats van een IOS app.</w:t>
-      </w:r>
-      <w:r>
-        <w:t xml:space="preserve"> Want ik heb een </w:t>
-      </w:r>
-      <w:proofErr w:type="spellStart"/>
-      <w:r>
-        <w:t>huawei</w:t>
-      </w:r>
-      <w:proofErr w:type="spellEnd"/>
-      <w:r>
-        <w:t>.</w:t>
-      </w:r>
-    </w:p>
-    <w:p>
-      <w:r>
-        <w:t xml:space="preserve">Ik heb dit allemaal grondiger beschreven in mijn “app </w:t>
-      </w:r>
-      <w:proofErr w:type="spellStart"/>
-      <w:r>
-        <w:t>idee”.pdf</w:t>
-      </w:r>
-      <w:proofErr w:type="spellEnd"/>
-      <w:r>
-        <w:t xml:space="preserve">. Dit staat ondertussen op de </w:t>
-      </w:r>
-      <w:proofErr w:type="spellStart"/>
-      <w:r>
-        <w:t>repository</w:t>
-      </w:r>
-      <w:proofErr w:type="spellEnd"/>
-      <w:r>
-        <w:t xml:space="preserve"> die we moesten maken.</w:t>
-      </w:r>
-    </w:p>
-    <w:p>
-      <w:r>
-        <w:t xml:space="preserve">Om af te sluiten had ik al ondertussen een goede naam gevonden gebaseerd op de applicatie genaamd </w:t>
-      </w:r>
-      <w:proofErr w:type="spellStart"/>
-      <w:r>
-        <w:t>Scannable</w:t>
-      </w:r>
-      <w:proofErr w:type="spellEnd"/>
-      <w:r>
-        <w:t xml:space="preserve">. Ik heb dus besloten om mijn applicatie </w:t>
-      </w:r>
-      <w:proofErr w:type="spellStart"/>
-      <w:r>
-        <w:t>Notable</w:t>
-      </w:r>
-      <w:proofErr w:type="spellEnd"/>
-      <w:r>
-        <w:t xml:space="preserve"> te noemen.</w:t>
+        <w:t>Als back-end koos ik Firebase en als technologie koos ik in java te werken om een android app te maken in plaats van een IOS app.</w:t>
+      </w:r>
+      <w:r>
+        <w:t xml:space="preserve"> Want ik heb een huawei.</w:t>
+      </w:r>
+    </w:p>
+    <w:p>
+      <w:r>
+        <w:t>Ik heb dit allemaal grondiger beschreven in mijn “app idee”.pdf. Dit staat ondertussen op de repository die we moesten maken.</w:t>
+      </w:r>
+    </w:p>
+    <w:p>
+      <w:r>
+        <w:t>Om af te sluiten had ik al ondertussen een goede naam gevonden gebaseerd op de applicatie genaamd Scannable. Ik heb dus besloten om mijn applicatie Notable te noemen.</w:t>
       </w:r>
     </w:p>
     <w:p>
@@ -213,7 +125,15 @@
         <w:t xml:space="preserve">Mijn app idee werd niet goedgekeurd, want de leerkracht raadde het af door problemen die ervan kunnen komen. Ik moest dan vandaag een nieuw idee opstellen. </w:t>
       </w:r>
       <w:r>
-        <w:t>De scanner + pdf converter was duidelijk te moeilijk, maar ik besloot om het idee verder te zetten van een app die notities kan delen. Dus nu moet het gewoon foto’s trekken van de notities. Om nog toe te voegen kan ik ook opmerkingswolkjes toevoegen aan de foto voor bijvoorbeeld een fout</w:t>
+        <w:t xml:space="preserve">De scanner + </w:t>
+      </w:r>
+      <w:proofErr w:type="gramStart"/>
+      <w:r>
+        <w:t>pdf converter</w:t>
+      </w:r>
+      <w:proofErr w:type="gramEnd"/>
+      <w:r>
+        <w:t xml:space="preserve"> was duidelijk te moeilijk, maar ik besloot om het idee verder te zetten van een app die notities kan delen. Dus nu moet het gewoon foto’s trekken van de notities. Om nog toe te voegen kan ik ook opmerkingswolkjes toevoegen aan de foto voor bijvoorbeeld een fout</w:t>
       </w:r>
       <w:r>
         <w:t xml:space="preserve"> aan te duiden</w:t>
@@ -224,15 +144,7 @@
     </w:p>
     <w:p>
       <w:r>
-        <w:t xml:space="preserve">Daarna moest ik gewoon begin aan een UI/UX design voor mijn applicatie, waarbij nog niet veel had gedaan omdat les niet meer lang duurde. Ik moest toen ook tegelijkertijd zoeken naar </w:t>
-      </w:r>
-      <w:proofErr w:type="spellStart"/>
-      <w:r>
-        <w:t>tutorials</w:t>
-      </w:r>
-      <w:proofErr w:type="spellEnd"/>
-      <w:r>
-        <w:t xml:space="preserve"> dus </w:t>
+        <w:t xml:space="preserve">Daarna moest ik gewoon begin aan een UI/UX design voor mijn applicatie, waarbij nog niet veel had gedaan omdat les niet meer lang duurde. Ik moest toen ook tegelijkertijd zoeken naar tutorials dus </w:t>
       </w:r>
       <w:r>
         <w:t>duurde dat ook kort.</w:t>
@@ -255,26 +167,13 @@
     </w:p>
     <w:p>
       <w:r>
-        <w:t>Vandaag in de namiddag begonnen we met de co-</w:t>
-      </w:r>
-      <w:proofErr w:type="spellStart"/>
-      <w:r>
-        <w:t>working</w:t>
-      </w:r>
-      <w:proofErr w:type="spellEnd"/>
-      <w:r>
-        <w:t xml:space="preserve"> les waarbij we dus informatie kunnen delen met medeleerlingen. Al was het de eerste les dus kwam daar niet veel van. Ik begon gewoon verder aan mijn </w:t>
-      </w:r>
-      <w:proofErr w:type="spellStart"/>
+        <w:t xml:space="preserve">Vandaag in de namiddag begonnen we met de co-working les waarbij we dus informatie kunnen delen met medeleerlingen. Al was het de eerste les dus kwam daar niet veel van. Ik begon gewoon verder aan mijn </w:t>
+      </w:r>
       <w:r>
         <w:t>F</w:t>
       </w:r>
       <w:r>
-        <w:t>igma</w:t>
-      </w:r>
-      <w:proofErr w:type="spellEnd"/>
-      <w:r>
-        <w:t xml:space="preserve"> design.</w:t>
+        <w:t>igma design.</w:t>
       </w:r>
     </w:p>
     <w:p>
@@ -285,7 +184,15 @@
         <w:t>te veel</w:t>
       </w:r>
       <w:r>
-        <w:t xml:space="preserve"> naar voor moest leunen en dus nek pijn kreeg en er waren precies geen ramen om te openen. </w:t>
+        <w:t xml:space="preserve"> naar voor moest leunen en dus </w:t>
+      </w:r>
+      <w:proofErr w:type="gramStart"/>
+      <w:r>
+        <w:t>nek pijn</w:t>
+      </w:r>
+      <w:proofErr w:type="gramEnd"/>
+      <w:r>
+        <w:t xml:space="preserve"> kreeg en er waren precies geen ramen om te openen. </w:t>
       </w:r>
       <w:r>
         <w:t>Gelukkig kunnen we naar buiten wanneer we het willen.</w:t>
@@ -325,23 +232,7 @@
     </w:p>
     <w:p>
       <w:r>
-        <w:t xml:space="preserve">Vandaag heb ik verder gewerkt aan mijn </w:t>
-      </w:r>
-      <w:proofErr w:type="spellStart"/>
-      <w:r>
-        <w:t>Figma</w:t>
-      </w:r>
-      <w:proofErr w:type="spellEnd"/>
-      <w:r>
-        <w:t xml:space="preserve"> design en het ging redelijk vlot vooruit. Ik wou absoluut dat het vandaag af was zodat ik morgen kan werken aan een ander vak. Tijdens het maken van het design heb ik vooral ook zitten op zoeken dat sommige concepten wel haalbaar zijn om te programmeren. Dit is allemaal wel mogelijk, maar zal wel een </w:t>
-      </w:r>
-      <w:proofErr w:type="spellStart"/>
-      <w:r>
-        <w:t>challenge</w:t>
-      </w:r>
-      <w:proofErr w:type="spellEnd"/>
-      <w:r>
-        <w:t xml:space="preserve"> zijn zoals de opmerkingen plaatsen</w:t>
+        <w:t>Vandaag heb ik verder gewerkt aan mijn Figma design en het ging redelijk vlot vooruit. Ik wou absoluut dat het vandaag af was zodat ik morgen kan werken aan een ander vak. Tijdens het maken van het design heb ik vooral ook zitten op zoeken dat sommige concepten wel haalbaar zijn om te programmeren. Dit is allemaal wel mogelijk, maar zal wel een challenge zijn zoals de opmerkingen plaatsen</w:t>
       </w:r>
       <w:r>
         <w:t>. M</w:t>
@@ -453,48 +344,11 @@
     </w:p>
     <w:p>
       <w:r>
-        <w:t xml:space="preserve">Vandaag werd mijn </w:t>
-      </w:r>
-      <w:proofErr w:type="spellStart"/>
-      <w:r>
-        <w:t>figma</w:t>
-      </w:r>
-      <w:proofErr w:type="spellEnd"/>
-      <w:r>
-        <w:t xml:space="preserve"> prototype gecontroleerd waarbij ik moest opnieuw uitleggen wat mijn app doet door middel van accurate presentatie. Ik legde dit vrij duidelijk uit en alles ging goed vooruit. Meneer </w:t>
-      </w:r>
-      <w:proofErr w:type="spellStart"/>
-      <w:r>
-        <w:t>Blancquaert</w:t>
-      </w:r>
-      <w:proofErr w:type="spellEnd"/>
-      <w:r>
-        <w:t xml:space="preserve"> heeft me dan ook nog een </w:t>
-      </w:r>
-      <w:proofErr w:type="spellStart"/>
-      <w:r>
-        <w:t>library</w:t>
-      </w:r>
-      <w:proofErr w:type="spellEnd"/>
-      <w:r>
-        <w:t xml:space="preserve"> genaamd “</w:t>
-      </w:r>
-      <w:proofErr w:type="spellStart"/>
-      <w:r>
-        <w:t>Material</w:t>
-      </w:r>
-      <w:proofErr w:type="spellEnd"/>
-      <w:r>
-        <w:t xml:space="preserve"> design” aangeraden om mijn applicatie te ontwerpen. </w:t>
-      </w:r>
-      <w:r>
-        <w:t xml:space="preserve">Blijkbaar Google gebruikt deze </w:t>
-      </w:r>
-      <w:proofErr w:type="spellStart"/>
-      <w:r>
-        <w:t>library</w:t>
-      </w:r>
-      <w:proofErr w:type="spellEnd"/>
+        <w:t xml:space="preserve">Vandaag werd mijn figma prototype gecontroleerd waarbij ik moest opnieuw uitleggen wat mijn app doet door middel van accurate presentatie. Ik legde dit vrij duidelijk uit en alles ging goed vooruit. Meneer Blancquaert heeft me dan ook nog een library genaamd “Material design” aangeraden om mijn applicatie te ontwerpen. </w:t>
+      </w:r>
+      <w:r>
+        <w:t>Blijkbaar Google gebruikt deze library</w:t>
+      </w:r>
       <w:r>
         <w:t xml:space="preserve"> om hun apps te maken.</w:t>
       </w:r>
@@ -532,23 +386,7 @@
         <w:t xml:space="preserve">kunt maken </w:t>
       </w:r>
       <w:r>
-        <w:t xml:space="preserve">om je app te testen. Als je </w:t>
-      </w:r>
-      <w:proofErr w:type="spellStart"/>
-      <w:r>
-        <w:t>developer</w:t>
-      </w:r>
-      <w:proofErr w:type="spellEnd"/>
-      <w:r>
-        <w:t xml:space="preserve"> modus in de </w:t>
-      </w:r>
-      <w:proofErr w:type="spellStart"/>
-      <w:r>
-        <w:t>settings</w:t>
-      </w:r>
-      <w:proofErr w:type="spellEnd"/>
-      <w:r>
-        <w:t xml:space="preserve"> van je gsm</w:t>
+        <w:t>om je app te testen. Als je developer modus in de settings van je gsm</w:t>
       </w:r>
       <w:r>
         <w:t xml:space="preserve"> aanzet, kan je je gsm verbinden met de pc en dus je applicatie daarop testen.</w:t>
@@ -566,15 +404,15 @@
     </w:p>
     <w:p>
       <w:r>
-        <w:t xml:space="preserve">Tijdens lange downloads heb ik ook mijn google account toegevoegd op </w:t>
-      </w:r>
-      <w:proofErr w:type="spellStart"/>
-      <w:r>
-        <w:t>Firebase</w:t>
-      </w:r>
-      <w:proofErr w:type="spellEnd"/>
-      <w:r>
-        <w:t>. Volgens de presentatie die we kregen van een medestudent.</w:t>
+        <w:t xml:space="preserve">Tijdens lange downloads heb ik ook mijn </w:t>
+      </w:r>
+      <w:proofErr w:type="gramStart"/>
+      <w:r>
+        <w:t>google account</w:t>
+      </w:r>
+      <w:proofErr w:type="gramEnd"/>
+      <w:r>
+        <w:t xml:space="preserve"> toegevoegd op Firebase. Volgens de presentatie die we kregen van een medestudent.</w:t>
       </w:r>
     </w:p>
     <w:p>
@@ -625,23 +463,7 @@
         <w:t>mijn</w:t>
       </w:r>
       <w:r>
-        <w:t xml:space="preserve"> </w:t>
-      </w:r>
-      <w:proofErr w:type="spellStart"/>
-      <w:r>
-        <w:t>figma</w:t>
-      </w:r>
-      <w:proofErr w:type="spellEnd"/>
-      <w:r>
-        <w:t xml:space="preserve"> design delen met meneer </w:t>
-      </w:r>
-      <w:proofErr w:type="spellStart"/>
-      <w:r>
-        <w:t>Blancquaert</w:t>
-      </w:r>
-      <w:proofErr w:type="spellEnd"/>
-      <w:r>
-        <w:t>, toen hij vroeg dat mijn design klaar was</w:t>
+        <w:t xml:space="preserve"> figma design delen met meneer Blancquaert, toen hij vroeg dat mijn design klaar was</w:t>
       </w:r>
       <w:r>
         <w:t xml:space="preserve"> of niet</w:t>
@@ -655,38 +477,30 @@
         <w:t>Ik heb daarna gewoon verder begonnen aan de tutorial die ik vorige week gebruikt had.</w:t>
       </w:r>
       <w:r>
-        <w:t xml:space="preserve"> Hierbij leerde ik meer over hoe ik Android studio beter kon gebruiken om mijn app te </w:t>
-      </w:r>
-      <w:proofErr w:type="spellStart"/>
-      <w:r>
-        <w:t>designen</w:t>
-      </w:r>
-      <w:proofErr w:type="spellEnd"/>
-      <w:r>
-        <w:t xml:space="preserve"> zoals hoe je </w:t>
+        <w:t xml:space="preserve"> Hierbij leerde ik meer over hoe ik </w:t>
+      </w:r>
+      <w:proofErr w:type="gramStart"/>
+      <w:r>
+        <w:t>Android studio</w:t>
+      </w:r>
+      <w:proofErr w:type="gramEnd"/>
+      <w:r>
+        <w:t xml:space="preserve"> beter kon gebruiken om mijn app te designen zoals hoe je </w:t>
       </w:r>
       <w:r>
         <w:lastRenderedPageBreak/>
-        <w:t xml:space="preserve">attributen kunt aanpassen (bv. </w:t>
-      </w:r>
-      <w:proofErr w:type="spellStart"/>
-      <w:r>
-        <w:t>color</w:t>
-      </w:r>
-      <w:proofErr w:type="spellEnd"/>
-      <w:r>
-        <w:t>)</w:t>
-      </w:r>
-      <w:r>
-        <w:t xml:space="preserve">. Android studio is zeer gelijkaardig als bijvoorbeeld </w:t>
-      </w:r>
-      <w:proofErr w:type="spellStart"/>
-      <w:r>
-        <w:t>Webstorm</w:t>
-      </w:r>
-      <w:proofErr w:type="spellEnd"/>
-      <w:r>
-        <w:t xml:space="preserve">, maar bij het design van een mobile app is het zeer </w:t>
+        <w:t>attributen kunt aanpassen (bv. color)</w:t>
+      </w:r>
+      <w:r>
+        <w:t xml:space="preserve">. </w:t>
+      </w:r>
+      <w:proofErr w:type="gramStart"/>
+      <w:r>
+        <w:t>Android studio</w:t>
+      </w:r>
+      <w:proofErr w:type="gramEnd"/>
+      <w:r>
+        <w:t xml:space="preserve"> is zeer gelijkaardig als bijvoorbeeld Webstorm, maar bij het design van een mobile app is het zeer </w:t>
       </w:r>
       <w:r>
         <w:t>verschillend</w:t>
@@ -695,22 +509,19 @@
         <w:t>.</w:t>
       </w:r>
       <w:r>
-        <w:t xml:space="preserve"> Bij </w:t>
-      </w:r>
-      <w:proofErr w:type="spellStart"/>
-      <w:r>
-        <w:t>Webstorm</w:t>
-      </w:r>
-      <w:proofErr w:type="spellEnd"/>
-      <w:r>
-        <w:t xml:space="preserve"> kan je je website </w:t>
+        <w:t xml:space="preserve"> Bij Webstorm kan je je website </w:t>
       </w:r>
       <w:r>
         <w:t>bekijken</w:t>
       </w:r>
       <w:r>
-        <w:t xml:space="preserve"> in een gekozen browser, maar je kan in Android studio</w:t>
-      </w:r>
+        <w:t xml:space="preserve"> in een gekozen browser, maar je kan in </w:t>
+      </w:r>
+      <w:proofErr w:type="gramStart"/>
+      <w:r>
+        <w:t>Android studio</w:t>
+      </w:r>
+      <w:proofErr w:type="gramEnd"/>
       <w:r>
         <w:t xml:space="preserve"> je app</w:t>
       </w:r>
@@ -730,15 +541,7 @@
         <w:t>.</w:t>
       </w:r>
       <w:r>
-        <w:t xml:space="preserve"> Als ik de </w:t>
-      </w:r>
-      <w:proofErr w:type="spellStart"/>
-      <w:r>
-        <w:t>Jetbrains</w:t>
-      </w:r>
-      <w:proofErr w:type="spellEnd"/>
-      <w:r>
-        <w:t xml:space="preserve"> applicaties vergelijk met Visual studio 2019, </w:t>
+        <w:t xml:space="preserve"> Als ik de Jetbrains applicaties vergelijk met Visual studio 2019, </w:t>
       </w:r>
       <w:r>
         <w:t>heb ik er altijd moeite mee om de lay</w:t>
@@ -818,15 +621,15 @@
     </w:p>
     <w:p>
       <w:r>
-        <w:t xml:space="preserve">Ik heb dan ondertussen de tutorial van </w:t>
-      </w:r>
-      <w:proofErr w:type="spellStart"/>
-      <w:r>
-        <w:t>Material</w:t>
-      </w:r>
-      <w:proofErr w:type="spellEnd"/>
-      <w:r>
-        <w:t xml:space="preserve"> design gevolgd in plaats van die van Android studio. Ze leerde me dan hoe ik er mee kon werken maar niet hoe een hele nieuwe app kon maken. Ik kreeg een voorbeeld app om erin te kunnen werken voor de tutorial.</w:t>
+        <w:t xml:space="preserve">Ik heb dan ondertussen de tutorial van Material design gevolgd in plaats van die van </w:t>
+      </w:r>
+      <w:proofErr w:type="gramStart"/>
+      <w:r>
+        <w:t>Android studio</w:t>
+      </w:r>
+      <w:proofErr w:type="gramEnd"/>
+      <w:r>
+        <w:t>. Ze leerde me dan hoe ik er mee kon werken maar niet hoe een hele nieuwe app kon maken. Ik kreeg een voorbeeld app om erin te kunnen werken voor de tutorial.</w:t>
       </w:r>
     </w:p>
     <w:p>
@@ -869,34 +672,10 @@
     </w:p>
     <w:p>
       <w:r>
-        <w:t xml:space="preserve">Vandaag heb ik de usertests afgelegd met Louis </w:t>
-      </w:r>
-      <w:proofErr w:type="spellStart"/>
-      <w:r>
-        <w:t>D’hondt</w:t>
-      </w:r>
-      <w:proofErr w:type="spellEnd"/>
-      <w:r>
-        <w:t xml:space="preserve"> en Jasper Wauters. Dit ging heel gemakkelijk en duurde niet lang. Ik had niet echt serieuze opmerkingen, behalve dat ik geen persoonlijke info pagina gemaakt had.</w:t>
-      </w:r>
-      <w:r>
-        <w:t xml:space="preserve"> Daarna heb ik onmiddellijk die opmerkingen van mijn </w:t>
-      </w:r>
-      <w:proofErr w:type="spellStart"/>
-      <w:r>
-        <w:t>figma</w:t>
-      </w:r>
-      <w:proofErr w:type="spellEnd"/>
-      <w:r>
-        <w:t xml:space="preserve"> design verbetert en op mijn </w:t>
-      </w:r>
-      <w:proofErr w:type="spellStart"/>
-      <w:r>
-        <w:t>repository</w:t>
-      </w:r>
-      <w:proofErr w:type="spellEnd"/>
-      <w:r>
-        <w:t xml:space="preserve"> gezet.</w:t>
+        <w:t>Vandaag heb ik de usertests afgelegd met Louis D’hondt en Jasper Wauters. Dit ging heel gemakkelijk en duurde niet lang. Ik had niet echt serieuze opmerkingen, behalve dat ik geen persoonlijke info pagina gemaakt had.</w:t>
+      </w:r>
+      <w:r>
+        <w:t xml:space="preserve"> Daarna heb ik onmiddellijk die opmerkingen van mijn figma design verbetert en op mijn repository gezet.</w:t>
       </w:r>
     </w:p>
     <w:p/>
@@ -919,47 +698,7 @@
     </w:p>
     <w:p>
       <w:r>
-        <w:t xml:space="preserve">Vandaag begon ik eindelijk met </w:t>
-      </w:r>
-      <w:proofErr w:type="spellStart"/>
-      <w:r>
-        <w:t>Material</w:t>
-      </w:r>
-      <w:proofErr w:type="spellEnd"/>
-      <w:r>
-        <w:t xml:space="preserve"> Design. Ik besloot mijn oude app te verwijderen en te vervangen met een empty </w:t>
-      </w:r>
-      <w:proofErr w:type="spellStart"/>
-      <w:r>
-        <w:t>activity</w:t>
-      </w:r>
-      <w:proofErr w:type="spellEnd"/>
-      <w:r>
-        <w:t xml:space="preserve"> zodat ik echt van scratch begin. Zo kan ik alles beter begrijpen. Ik had dan ontdekt dat </w:t>
-      </w:r>
-      <w:proofErr w:type="spellStart"/>
-      <w:r>
-        <w:t>android</w:t>
-      </w:r>
-      <w:proofErr w:type="spellEnd"/>
-      <w:r>
-        <w:t xml:space="preserve"> studio al automatisch </w:t>
-      </w:r>
-      <w:proofErr w:type="spellStart"/>
-      <w:r>
-        <w:t>Material</w:t>
-      </w:r>
-      <w:proofErr w:type="spellEnd"/>
-      <w:r>
-        <w:t xml:space="preserve"> Design van Google had toegevoegd bij de </w:t>
-      </w:r>
-      <w:proofErr w:type="spellStart"/>
-      <w:r>
-        <w:t>dependencies</w:t>
-      </w:r>
-      <w:proofErr w:type="spellEnd"/>
-      <w:r>
-        <w:t xml:space="preserve">, dus eigenlijk ben ik </w:t>
+        <w:t xml:space="preserve">Vandaag begon ik eindelijk met Material Design. Ik besloot mijn oude app te verwijderen en te vervangen met een empty activity zodat ik echt van scratch begin. Zo kan ik alles beter begrijpen. Ik had dan ontdekt dat android studio al automatisch Material Design van Google had toegevoegd bij de dependencies, dus eigenlijk ben ik </w:t>
       </w:r>
       <w:r>
         <w:t>onmiddellijk</w:t>
@@ -1103,50 +842,18 @@
     </w:p>
     <w:p>
       <w:r>
-        <w:t xml:space="preserve">Eerst had ik geprobeerd om gewoon een heel nieuw project te maken die bestond uit een login </w:t>
-      </w:r>
-      <w:proofErr w:type="spellStart"/>
-      <w:r>
-        <w:t>activity</w:t>
-      </w:r>
-      <w:proofErr w:type="spellEnd"/>
-      <w:r>
-        <w:t xml:space="preserve">. Deze </w:t>
-      </w:r>
-      <w:proofErr w:type="spellStart"/>
-      <w:r>
-        <w:t>activity</w:t>
-      </w:r>
-      <w:proofErr w:type="spellEnd"/>
-      <w:r>
-        <w:t xml:space="preserve"> heb ik dan gewoon aangepast naar mijn wens. Maar dit wou ook niet echt werken, want blijkbaar is het best dat je van een </w:t>
-      </w:r>
-      <w:proofErr w:type="spellStart"/>
-      <w:r>
-        <w:t>main</w:t>
+        <w:t>Eerst had ik geprobeerd om gewoon een heel nieuw project te maken die bestond uit een login activity. Deze activity heb ik dan gewoon aangepast naar mijn wens. Maar dit wou ook niet echt werken, want blijkbaar is het best dat je van een main</w:t>
       </w:r>
       <w:r>
         <w:t>_</w:t>
       </w:r>
       <w:r>
-        <w:t>activity</w:t>
-      </w:r>
-      <w:proofErr w:type="spellEnd"/>
-      <w:r>
-        <w:t xml:space="preserve"> start en dan de login page daarmee opent.</w:t>
-      </w:r>
-    </w:p>
-    <w:p>
-      <w:r>
-        <w:t xml:space="preserve">Ik ben dan gewoon terug begonnen aan het oude project en heb dan de error op stack overflow gezocht en daar had ik de oplossing gevonden. Ik moest gewoon mijn “device” zijn data </w:t>
-      </w:r>
-      <w:proofErr w:type="spellStart"/>
-      <w:r>
-        <w:t>wipen</w:t>
-      </w:r>
-      <w:proofErr w:type="spellEnd"/>
-      <w:r>
-        <w:t xml:space="preserve"> en dan kon het opnieuw installeren want mijn oude projecten stond er nog op.</w:t>
+        <w:t>activity start en dan de login page daarmee opent.</w:t>
+      </w:r>
+    </w:p>
+    <w:p>
+      <w:r>
+        <w:t>Ik ben dan gewoon terug begonnen aan het oude project en heb dan de error op stack overflow gezocht en daar had ik de oplossing gevonden. Ik moest gewoon mijn “device” zijn data wipen en dan kon het opnieuw installeren want mijn oude projecten stond er nog op.</w:t>
       </w:r>
     </w:p>
     <w:p>
@@ -1190,23 +897,7 @@
         <w:t>Vandaag wou de wifi niet werken op de campus dus had ik niet veel vooruitgang geboekt.</w:t>
       </w:r>
       <w:r>
-        <w:t xml:space="preserve"> Ik was ook gisteren vergeten om de registratie pagina te </w:t>
-      </w:r>
-      <w:proofErr w:type="spellStart"/>
-      <w:r>
-        <w:t>committen</w:t>
-      </w:r>
-      <w:proofErr w:type="spellEnd"/>
-      <w:r>
-        <w:t xml:space="preserve">, dus da had ik alleszins gedaan door met mijn </w:t>
-      </w:r>
-      <w:proofErr w:type="spellStart"/>
-      <w:r>
-        <w:t>hotspot</w:t>
-      </w:r>
-      <w:proofErr w:type="spellEnd"/>
-      <w:r>
-        <w:t xml:space="preserve"> van mijn gsm te verbinden en de 4G aan te zetten.</w:t>
+        <w:t xml:space="preserve"> Ik was ook gisteren vergeten om de registratie pagina te committen, dus da had ik alleszins gedaan door met mijn hotspot van mijn gsm te verbinden en de 4G aan te zetten.</w:t>
       </w:r>
     </w:p>
     <w:p>
@@ -1238,21 +929,11 @@
         <w:t>Vandaag wou de wifi op school nog steeds niet zo goed werken</w:t>
       </w:r>
       <w:r>
-        <w:t xml:space="preserve">, maar dankzij de wifi </w:t>
-      </w:r>
-      <w:proofErr w:type="spellStart"/>
-      <w:r>
-        <w:t>hotspot</w:t>
-      </w:r>
-      <w:proofErr w:type="spellEnd"/>
-      <w:r>
-        <w:t xml:space="preserve"> heb ik toch nog de navigatie van login naar registratie kunnen </w:t>
-      </w:r>
-      <w:proofErr w:type="spellStart"/>
+        <w:t xml:space="preserve">, maar dankzij de wifi hotspot heb ik toch nog de navigatie van login naar registratie kunnen </w:t>
+      </w:r>
       <w:r>
         <w:t>commiten</w:t>
       </w:r>
-      <w:proofErr w:type="spellEnd"/>
       <w:r>
         <w:t>.</w:t>
       </w:r>
@@ -1262,15 +943,7 @@
     </w:p>
     <w:p>
       <w:r>
-        <w:t xml:space="preserve">De wifi wou uiteindelijk werken dus kon eindelijk heel vlot vooruitgaan. Ik heb daarbij de navigatie tussen de login en registratie kunnen afwerken. Daarna heb ik ook de startpagina bijna afgewerkt, maar de </w:t>
-      </w:r>
-      <w:proofErr w:type="spellStart"/>
-      <w:r>
-        <w:t>bottom</w:t>
-      </w:r>
-      <w:proofErr w:type="spellEnd"/>
-      <w:r>
-        <w:t xml:space="preserve"> bar wou niet helemaal meewerken dus dat laat ik voor later.</w:t>
+        <w:t>De wifi wou uiteindelijk werken dus kon eindelijk heel vlot vooruitgaan. Ik heb daarbij de navigatie tussen de login en registratie kunnen afwerken. Daarna heb ik ook de startpagina bijna afgewerkt, maar de bottom bar wou niet helemaal meewerken dus dat laat ik voor later.</w:t>
       </w:r>
     </w:p>
     <w:p/>
@@ -1291,31 +964,7 @@
     </w:p>
     <w:p>
       <w:r>
-        <w:t xml:space="preserve">Vandaag heb ik de bodem navigatie afgewerkt waarbij je dan naar je groepen kunt gaan oftewel naar je notities die je hebt gefotografeerd. Dit was eerste wel een </w:t>
-      </w:r>
-      <w:proofErr w:type="spellStart"/>
-      <w:r>
-        <w:t>challenge</w:t>
-      </w:r>
-      <w:proofErr w:type="spellEnd"/>
-      <w:r>
-        <w:t xml:space="preserve"> zoals de </w:t>
-      </w:r>
-      <w:proofErr w:type="spellStart"/>
-      <w:r>
-        <w:t>active</w:t>
-      </w:r>
-      <w:proofErr w:type="spellEnd"/>
-      <w:r>
-        <w:t xml:space="preserve"> pagina weergegeven of de juiste </w:t>
-      </w:r>
-      <w:proofErr w:type="spellStart"/>
-      <w:r>
-        <w:t>eventlistener</w:t>
-      </w:r>
-      <w:proofErr w:type="spellEnd"/>
-      <w:r>
-        <w:t xml:space="preserve"> gebruiken om te kunnen navigeren. Maar deze links hebben daarbij geholpen:</w:t>
+        <w:t>Vandaag heb ik de bodem navigatie afgewerkt waarbij je dan naar je groepen kunt gaan oftewel naar je notities die je hebt gefotografeerd. Dit was eerste wel een challenge zoals de active pagina weergegeven of de juiste eventlistener gebruiken om te kunnen navigeren. Maar deze links hebben daarbij geholpen:</w:t>
       </w:r>
     </w:p>
     <w:p>
@@ -1361,29 +1010,13 @@
     </w:p>
     <w:p>
       <w:r>
-        <w:t xml:space="preserve">Ik heb dan ook nog voor gezorgd dat mijn </w:t>
-      </w:r>
-      <w:proofErr w:type="spellStart"/>
-      <w:r>
-        <w:t>firebase</w:t>
-      </w:r>
-      <w:proofErr w:type="spellEnd"/>
-      <w:r>
-        <w:t xml:space="preserve"> account verbonden is met</w:t>
+        <w:t>Ik heb dan ook nog voor gezorgd dat mijn firebase account verbonden is met</w:t>
       </w:r>
       <w:r>
         <w:t xml:space="preserve"> mijn</w:t>
       </w:r>
       <w:r>
-        <w:t xml:space="preserve"> </w:t>
-      </w:r>
-      <w:proofErr w:type="spellStart"/>
-      <w:r>
-        <w:t>android</w:t>
-      </w:r>
-      <w:proofErr w:type="spellEnd"/>
-      <w:r>
-        <w:t xml:space="preserve"> studio app.</w:t>
+        <w:t xml:space="preserve"> android studio app.</w:t>
       </w:r>
     </w:p>
     <w:p>
@@ -1540,13 +1173,8 @@
           <w:numId w:val="1"/>
         </w:numPr>
       </w:pPr>
-      <w:proofErr w:type="spellStart"/>
-      <w:r>
-        <w:t>Firebase</w:t>
-      </w:r>
-      <w:proofErr w:type="spellEnd"/>
-      <w:r>
-        <w:t xml:space="preserve"> implementeren</w:t>
+      <w:r>
+        <w:t>Firebase implementeren</w:t>
       </w:r>
     </w:p>
     <w:p>
@@ -1558,13 +1186,8 @@
         </w:numPr>
       </w:pPr>
       <w:r>
-        <w:t xml:space="preserve">Login en registratie mogelijk maken via </w:t>
-      </w:r>
-      <w:proofErr w:type="spellStart"/>
-      <w:r>
-        <w:t>firebase</w:t>
-      </w:r>
-      <w:proofErr w:type="spellEnd"/>
+        <w:t>Login en registratie mogelijk maken via firebase</w:t>
+      </w:r>
     </w:p>
     <w:p>
       <w:pPr>
@@ -1575,11 +1198,7 @@
         </w:numPr>
       </w:pPr>
       <w:r>
-        <w:t xml:space="preserve">Camera functionaliteit bekijken voor </w:t>
-      </w:r>
-      <w:proofErr w:type="spellStart"/>
-      <w:r>
-        <w:t>andr</w:t>
+        <w:t>Camera functionaliteit bekijken voor andr</w:t>
       </w:r>
       <w:r>
         <w:t>oi</w:t>
@@ -1587,7 +1206,6 @@
       <w:r>
         <w:t>d</w:t>
       </w:r>
-      <w:proofErr w:type="spellEnd"/>
     </w:p>
     <w:p/>
     <w:p>
@@ -1607,66 +1225,10 @@
     </w:p>
     <w:p>
       <w:r>
-        <w:t xml:space="preserve">Hier kan je ondertussen zien dat mijn app verbonden is met </w:t>
-      </w:r>
-      <w:proofErr w:type="spellStart"/>
-      <w:r>
-        <w:t>Firebase</w:t>
-      </w:r>
-      <w:proofErr w:type="spellEnd"/>
-      <w:r>
-        <w:t xml:space="preserve">. Nu vragen ze voor google </w:t>
-      </w:r>
-      <w:proofErr w:type="spellStart"/>
-      <w:r>
-        <w:t>sign</w:t>
-      </w:r>
-      <w:proofErr w:type="spellEnd"/>
-      <w:r>
-        <w:t xml:space="preserve">-in om een sha-1 </w:t>
-      </w:r>
-      <w:proofErr w:type="spellStart"/>
-      <w:r>
-        <w:t>fingerprint</w:t>
-      </w:r>
-      <w:proofErr w:type="spellEnd"/>
-      <w:r>
-        <w:t xml:space="preserve"> toe te voegen.</w:t>
-      </w:r>
-      <w:r>
-        <w:t xml:space="preserve"> Ik wou dan google </w:t>
-      </w:r>
-      <w:proofErr w:type="spellStart"/>
-      <w:r>
-        <w:t>play</w:t>
-      </w:r>
-      <w:proofErr w:type="spellEnd"/>
-      <w:r>
-        <w:t xml:space="preserve"> </w:t>
-      </w:r>
-      <w:proofErr w:type="spellStart"/>
-      <w:r>
-        <w:t>signing</w:t>
-      </w:r>
-      <w:proofErr w:type="spellEnd"/>
-      <w:r>
-        <w:t xml:space="preserve"> pakken om het te genereren </w:t>
-      </w:r>
-      <w:proofErr w:type="spellStart"/>
-      <w:r>
-        <w:t>ipv</w:t>
-      </w:r>
-      <w:proofErr w:type="spellEnd"/>
-      <w:r>
-        <w:t xml:space="preserve"> </w:t>
-      </w:r>
-      <w:proofErr w:type="spellStart"/>
-      <w:r>
-        <w:t>self-signing</w:t>
-      </w:r>
-      <w:proofErr w:type="spellEnd"/>
-      <w:r>
-        <w:t xml:space="preserve">, maar ik moet dan 25 euro eerst betalen voor een </w:t>
+        <w:t>Hier kan je ondertussen zien dat mijn app verbonden is met Firebase. Nu vragen ze voor google sign-in om een sha-1 fingerprint toe te voegen.</w:t>
+      </w:r>
+      <w:r>
+        <w:t xml:space="preserve"> Ik wou dan google play signing pakken om het te genereren ipv self-signing, maar ik moet dan 25 euro eerst betalen voor een </w:t>
       </w:r>
       <w:r>
         <w:t>ontwikkelaar</w:t>
@@ -1737,75 +1299,14 @@
       <w:r>
         <w:t>Als ik wat meer naar onderging bij de “</w:t>
       </w:r>
-      <w:proofErr w:type="spellStart"/>
-      <w:r>
-        <w:t>Authenticating</w:t>
-      </w:r>
-      <w:proofErr w:type="spellEnd"/>
-      <w:r>
-        <w:t xml:space="preserve"> </w:t>
-      </w:r>
-      <w:proofErr w:type="spellStart"/>
-      <w:r>
-        <w:t>Your</w:t>
-      </w:r>
-      <w:proofErr w:type="spellEnd"/>
-      <w:r>
-        <w:t xml:space="preserve"> Client</w:t>
-      </w:r>
-      <w:r>
-        <w:t xml:space="preserve">” pagina (zie link) kan je ook via de terminal van </w:t>
-      </w:r>
-      <w:proofErr w:type="spellStart"/>
-      <w:r>
-        <w:t>android</w:t>
-      </w:r>
-      <w:proofErr w:type="spellEnd"/>
-      <w:r>
-        <w:t xml:space="preserve"> studio een </w:t>
-      </w:r>
-      <w:proofErr w:type="spellStart"/>
-      <w:r>
-        <w:t>command</w:t>
-      </w:r>
-      <w:proofErr w:type="spellEnd"/>
-      <w:r>
-        <w:t xml:space="preserve"> invoeren om de sha-1 </w:t>
-      </w:r>
-      <w:proofErr w:type="spellStart"/>
-      <w:r>
-        <w:t>fingerprint</w:t>
-      </w:r>
-      <w:proofErr w:type="spellEnd"/>
-      <w:r>
-        <w:t xml:space="preserve"> te krijgen. Hierbij moest je “</w:t>
-      </w:r>
-      <w:proofErr w:type="spellStart"/>
-      <w:r>
-        <w:t>gradle</w:t>
-      </w:r>
-      <w:proofErr w:type="spellEnd"/>
-      <w:r>
-        <w:t xml:space="preserve"> </w:t>
-      </w:r>
-      <w:proofErr w:type="spellStart"/>
-      <w:r>
-        <w:t>sigingReport</w:t>
-      </w:r>
-      <w:proofErr w:type="spellEnd"/>
-      <w:r>
-        <w:t>” invoeren en dan ctrl + enter invoeren!!</w:t>
-      </w:r>
-      <w:r>
-        <w:t xml:space="preserve"> Deze heb ik dan toegevoegd aan </w:t>
-      </w:r>
-      <w:proofErr w:type="spellStart"/>
-      <w:r>
-        <w:t>Firebase</w:t>
-      </w:r>
-      <w:proofErr w:type="spellEnd"/>
-      <w:r>
-        <w:t>.</w:t>
+      <w:r>
+        <w:t>Authenticating Your Client</w:t>
+      </w:r>
+      <w:r>
+        <w:t>” pagina (zie link) kan je ook via de terminal van android studio een command invoeren om de sha-1 fingerprint te krijgen. Hierbij moest je “gradle sigingReport” invoeren en dan ctrl + enter invoeren!!</w:t>
+      </w:r>
+      <w:r>
+        <w:t xml:space="preserve"> Deze heb ik dan toegevoegd aan Firebase.</w:t>
       </w:r>
     </w:p>
     <w:p>
@@ -1853,15 +1354,7 @@
     </w:p>
     <w:p>
       <w:r>
-        <w:t xml:space="preserve">Daarna moest ik een </w:t>
-      </w:r>
-      <w:proofErr w:type="spellStart"/>
-      <w:r>
-        <w:t>Oauth</w:t>
-      </w:r>
-      <w:proofErr w:type="spellEnd"/>
-      <w:r>
-        <w:t xml:space="preserve"> 2.0 client ID toevoegen voor het inloggen. Hierbij moest ik een hele configuratie begaan.</w:t>
+        <w:t>Daarna moest ik een Oauth 2.0 client ID toevoegen voor het inloggen. Hierbij moest ik een hele configuratie begaan.</w:t>
       </w:r>
       <w:r>
         <w:t xml:space="preserve"> Ik heb hierbij het meest niet ingevuld zoals een privacy policy, enzoverder.</w:t>
@@ -2042,31 +1535,7 @@
     </w:p>
     <w:p>
       <w:r>
-        <w:t xml:space="preserve">Vandaag had ik tijdens les (in de morgen van 8u15-11u15) verder gewerkt aan de </w:t>
-      </w:r>
-      <w:proofErr w:type="spellStart"/>
-      <w:r>
-        <w:t>back-end</w:t>
-      </w:r>
-      <w:proofErr w:type="spellEnd"/>
-      <w:r>
-        <w:t xml:space="preserve"> van mijn app. Ik was gisteren bezig met google </w:t>
-      </w:r>
-      <w:proofErr w:type="spellStart"/>
-      <w:r>
-        <w:t>sign</w:t>
-      </w:r>
-      <w:proofErr w:type="spellEnd"/>
-      <w:r>
-        <w:t xml:space="preserve">-in, maar ik besloot om eerst normale email/password </w:t>
-      </w:r>
-      <w:proofErr w:type="spellStart"/>
-      <w:r>
-        <w:t>authentication</w:t>
-      </w:r>
-      <w:proofErr w:type="spellEnd"/>
-      <w:r>
-        <w:t xml:space="preserve"> toe te voegen. Dit ging vrij vlot vooruit maar toen ik de button klikt sloot de app af, dus dat moet ik nog oplossen. </w:t>
+        <w:t xml:space="preserve">Vandaag had ik tijdens les (in de morgen van 8u15-11u15) verder gewerkt aan de back-end van mijn app. Ik was gisteren bezig met google sign-in, maar ik besloot om eerst normale email/password authentication toe te voegen. Dit ging vrij vlot vooruit maar toen ik de button klikt sloot de app af, dus dat moet ik nog oplossen. </w:t>
       </w:r>
       <w:r>
         <w:t>Er werd</w:t>
@@ -2112,26 +1581,18 @@
         <w:t>Vandaag heb ik eindelijk de login en registratie kunnen afwerken. Dit had veel moeite gekost.</w:t>
       </w:r>
       <w:r>
-        <w:t xml:space="preserve"> Het probleem was dus dat mijn app bleef crashen als ik probeerde te registeren. Ik had veel op stackoverflow gezocht maar ik kon eerst niks vinden, maar toen zag ik dat de wifi van de device emulator op Android studio geen wifi had. Ik dacht eerst dat dit normaal was, maar begon toen twijfels te krijgen. Ik had dan eerst de info op stackoverflow pagina proberen gebruiken, maar dat was niet juist. Uiteindelijk gewoon mijn gsm </w:t>
-      </w:r>
-      <w:proofErr w:type="spellStart"/>
-      <w:r>
-        <w:t>hotspot</w:t>
-      </w:r>
-      <w:proofErr w:type="spellEnd"/>
-      <w:r>
-        <w:t xml:space="preserve"> 4G gebruiken werkte wel.</w:t>
-      </w:r>
-      <w:r>
-        <w:t xml:space="preserve"> Mijn app crasht dan nog steeds bij registratie maar ik kon wel inloggen door een test account aan te maken op </w:t>
-      </w:r>
-      <w:proofErr w:type="spellStart"/>
-      <w:r>
-        <w:t>Firebase</w:t>
-      </w:r>
-      <w:proofErr w:type="spellEnd"/>
-      <w:r>
-        <w:t>. Dus mijn code werkte, maar toen ik zag dat ik niet gekeken had naar de error van die verscheen na de crash en dat maakte alles duidelijk</w:t>
+        <w:t xml:space="preserve"> Het probleem was dus dat mijn app bleef crashen als ik probeerde te registeren. Ik had veel op stackoverflow gezocht maar ik kon eerst niks vinden, maar toen zag ik dat de wifi van de device emulator op </w:t>
+      </w:r>
+      <w:proofErr w:type="gramStart"/>
+      <w:r>
+        <w:t>Android studio</w:t>
+      </w:r>
+      <w:proofErr w:type="gramEnd"/>
+      <w:r>
+        <w:t xml:space="preserve"> geen wifi had. Ik dacht eerst dat dit normaal was, maar begon toen twijfels te krijgen. Ik had dan eerst de info op stackoverflow pagina proberen gebruiken, maar dat was niet juist. Uiteindelijk gewoon mijn gsm hotspot 4G gebruiken werkte wel.</w:t>
+      </w:r>
+      <w:r>
+        <w:t xml:space="preserve"> Mijn app crasht dan nog steeds bij registratie maar ik kon wel inloggen door een test account aan te maken op Firebase. Dus mijn code werkte, maar toen ik zag dat ik niet gekeken had naar de error van die verscheen na de crash en dat maakte alles duidelijk</w:t>
       </w:r>
       <w:r>
         <w:t xml:space="preserve"> voor mij</w:t>
@@ -2293,145 +1754,72 @@
           <w:rFonts w:eastAsia="Times New Roman" w:cstheme="minorHAnsi"/>
           <w:lang w:eastAsia="nl-BE"/>
         </w:rPr>
-        <w:t xml:space="preserve">Vandaag heb ik geprobeerd om google </w:t>
-      </w:r>
-      <w:proofErr w:type="spellStart"/>
+        <w:t xml:space="preserve">Vandaag heb ik geprobeerd om google sign-in te laten werken. Dit ging zeer goed, maar het enige probleem is dat de </w:t>
+      </w:r>
+      <w:proofErr w:type="gramStart"/>
       <w:r>
         <w:rPr>
           <w:rFonts w:eastAsia="Times New Roman" w:cstheme="minorHAnsi"/>
           <w:lang w:eastAsia="nl-BE"/>
         </w:rPr>
-        <w:t>sign</w:t>
-      </w:r>
-      <w:proofErr w:type="spellEnd"/>
+        <w:t>google account</w:t>
+      </w:r>
+      <w:proofErr w:type="gramEnd"/>
       <w:r>
         <w:rPr>
           <w:rFonts w:eastAsia="Times New Roman" w:cstheme="minorHAnsi"/>
           <w:lang w:eastAsia="nl-BE"/>
         </w:rPr>
-        <w:t xml:space="preserve">-in te laten werken. Dit ging zeer goed, maar het enige probleem is dat de google account niet wordt toegevoegd aan </w:t>
-      </w:r>
-      <w:proofErr w:type="spellStart"/>
+        <w:t xml:space="preserve"> niet wordt toegevoegd aan Firebase en het wil daarna niet naar de volgende pagina gaan als ik de google sign</w:t>
+      </w:r>
       <w:r>
         <w:rPr>
           <w:rFonts w:eastAsia="Times New Roman" w:cstheme="minorHAnsi"/>
           <w:lang w:eastAsia="nl-BE"/>
         </w:rPr>
-        <w:t>Firebase</w:t>
-      </w:r>
-      <w:proofErr w:type="spellEnd"/>
+        <w:t>-</w:t>
+      </w:r>
       <w:r>
         <w:rPr>
           <w:rFonts w:eastAsia="Times New Roman" w:cstheme="minorHAnsi"/>
           <w:lang w:eastAsia="nl-BE"/>
         </w:rPr>
-        <w:t xml:space="preserve"> en het wil daarna niet naar de volgende pagina gaan als ik de google </w:t>
-      </w:r>
-      <w:proofErr w:type="spellStart"/>
+        <w:t>in button klik. Het sign-in scherm verschijnt wel en hebben geen errors, maar daarna gebeurt er niks. Ik heb de methode toegevoegd die iemand van teams zei dat die het probleem</w:t>
+      </w:r>
       <w:r>
         <w:rPr>
           <w:rFonts w:eastAsia="Times New Roman" w:cstheme="minorHAnsi"/>
           <w:lang w:eastAsia="nl-BE"/>
         </w:rPr>
-        <w:t>sign</w:t>
-      </w:r>
-      <w:proofErr w:type="spellEnd"/>
+        <w:t xml:space="preserve"> zou</w:t>
+      </w:r>
       <w:r>
         <w:rPr>
           <w:rFonts w:eastAsia="Times New Roman" w:cstheme="minorHAnsi"/>
           <w:lang w:eastAsia="nl-BE"/>
         </w:rPr>
-        <w:t>-</w:t>
+        <w:t xml:space="preserve"> oplos</w:t>
       </w:r>
       <w:r>
         <w:rPr>
           <w:rFonts w:eastAsia="Times New Roman" w:cstheme="minorHAnsi"/>
           <w:lang w:eastAsia="nl-BE"/>
         </w:rPr>
-        <w:t xml:space="preserve">in button klik. Het </w:t>
-      </w:r>
-      <w:proofErr w:type="spellStart"/>
+        <w:t>sen</w:t>
+      </w:r>
       <w:r>
         <w:rPr>
           <w:rFonts w:eastAsia="Times New Roman" w:cstheme="minorHAnsi"/>
           <w:lang w:eastAsia="nl-BE"/>
         </w:rPr>
-        <w:t>sign</w:t>
-      </w:r>
-      <w:proofErr w:type="spellEnd"/>
+        <w:t xml:space="preserve"> maar er zal nog ergens een fout zitten.</w:t>
+      </w:r>
       <w:r>
         <w:rPr>
           <w:rFonts w:eastAsia="Times New Roman" w:cstheme="minorHAnsi"/>
           <w:lang w:eastAsia="nl-BE"/>
         </w:rPr>
-        <w:t xml:space="preserve">-in scherm verschijnt wel en hebben geen </w:t>
-      </w:r>
-      <w:proofErr w:type="spellStart"/>
-      <w:r>
-        <w:rPr>
-          <w:rFonts w:eastAsia="Times New Roman" w:cstheme="minorHAnsi"/>
-          <w:lang w:eastAsia="nl-BE"/>
-        </w:rPr>
-        <w:t>errors</w:t>
-      </w:r>
-      <w:proofErr w:type="spellEnd"/>
-      <w:r>
-        <w:rPr>
-          <w:rFonts w:eastAsia="Times New Roman" w:cstheme="minorHAnsi"/>
-          <w:lang w:eastAsia="nl-BE"/>
-        </w:rPr>
-        <w:t>, maar daarna gebeurt er niks. Ik heb de methode toegevoegd die iemand van teams zei dat die het probleem</w:t>
-      </w:r>
-      <w:r>
-        <w:rPr>
-          <w:rFonts w:eastAsia="Times New Roman" w:cstheme="minorHAnsi"/>
-          <w:lang w:eastAsia="nl-BE"/>
-        </w:rPr>
-        <w:t xml:space="preserve"> zou</w:t>
-      </w:r>
-      <w:r>
-        <w:rPr>
-          <w:rFonts w:eastAsia="Times New Roman" w:cstheme="minorHAnsi"/>
-          <w:lang w:eastAsia="nl-BE"/>
-        </w:rPr>
-        <w:t xml:space="preserve"> oplos</w:t>
-      </w:r>
-      <w:r>
-        <w:rPr>
-          <w:rFonts w:eastAsia="Times New Roman" w:cstheme="minorHAnsi"/>
-          <w:lang w:eastAsia="nl-BE"/>
-        </w:rPr>
-        <w:t>sen</w:t>
-      </w:r>
-      <w:r>
-        <w:rPr>
-          <w:rFonts w:eastAsia="Times New Roman" w:cstheme="minorHAnsi"/>
-          <w:lang w:eastAsia="nl-BE"/>
-        </w:rPr>
-        <w:t xml:space="preserve"> maar er zal nog ergens een fout zitten.</w:t>
-      </w:r>
-      <w:r>
-        <w:rPr>
-          <w:rFonts w:eastAsia="Times New Roman" w:cstheme="minorHAnsi"/>
-          <w:lang w:eastAsia="nl-BE"/>
-        </w:rPr>
-        <w:t xml:space="preserve"> 1 van de methodes was wel </w:t>
-      </w:r>
-      <w:proofErr w:type="spellStart"/>
-      <w:r>
-        <w:rPr>
-          <w:rFonts w:eastAsia="Times New Roman" w:cstheme="minorHAnsi"/>
-          <w:lang w:eastAsia="nl-BE"/>
-        </w:rPr>
-        <w:t>deprecated</w:t>
-      </w:r>
-      <w:proofErr w:type="spellEnd"/>
-      <w:r>
-        <w:rPr>
-          <w:rFonts w:eastAsia="Times New Roman" w:cstheme="minorHAnsi"/>
-          <w:lang w:eastAsia="nl-BE"/>
-        </w:rPr>
-        <w:t xml:space="preserve">, maar die had </w:t>
+        <w:t xml:space="preserve"> 1 van de methodes was wel deprecated, maar die had </w:t>
       </w:r>
       <w:r>
         <w:rPr>
@@ -2596,174 +1984,46 @@
           <w:rFonts w:eastAsia="Times New Roman" w:cstheme="minorHAnsi"/>
           <w:lang w:eastAsia="nl-BE"/>
         </w:rPr>
-        <w:t xml:space="preserve">Vandaag is het me gelukt om de google </w:t>
-      </w:r>
-      <w:proofErr w:type="spellStart"/>
+        <w:t>Vandaag is het me gelukt om de google sign-in te laten werken. Ik had veel opzoek werk gedaan op google maar kon niks duidelijk vinden. Ik had mijn code ook gedebugd, maar geen duidelijk error werd weergegeven. Uiteindelijk besloot ik opzoek te gaan naar een tutorial die recent was in 2021. Deze tutorial heb ik dan gebruikt om mijn project strict te controleren en toen realiseerde ik dat de SHA-1 niet op de juiste plaats stond. Ik had op google cloud een Oauth 2.0 client id moeten aanmaken toen ik de android studio firebase tutorial volgde, maar dat bleek dus helemaal fout te zijn, want de echte client_id was eigenlijk al klaar in een google-</w:t>
+      </w:r>
+      <w:proofErr w:type="gramStart"/>
       <w:r>
         <w:rPr>
           <w:rFonts w:eastAsia="Times New Roman" w:cstheme="minorHAnsi"/>
           <w:lang w:eastAsia="nl-BE"/>
         </w:rPr>
-        <w:t>sign</w:t>
-      </w:r>
-      <w:proofErr w:type="spellEnd"/>
+        <w:t>services.json</w:t>
+      </w:r>
+      <w:proofErr w:type="gramEnd"/>
       <w:r>
         <w:rPr>
           <w:rFonts w:eastAsia="Times New Roman" w:cstheme="minorHAnsi"/>
           <w:lang w:eastAsia="nl-BE"/>
         </w:rPr>
-        <w:t xml:space="preserve">-in te laten werken. Ik had veel opzoek werk gedaan op google maar kon niks duidelijk vinden. Ik had mijn code ook gedebugd, maar geen duidelijk error werd weergegeven. Uiteindelijk besloot ik opzoek te gaan naar een tutorial die recent was in 2021. Deze tutorial heb ik dan gebruikt om mijn project </w:t>
-      </w:r>
-      <w:proofErr w:type="spellStart"/>
+        <w:t xml:space="preserve"> file. Ik moest toen ook mijn SHA-1 fingerprint verwijderen bij de onderstaande afbeelding, maar dat mocht daar eigenlijk blijven staan.</w:t>
+      </w:r>
       <w:r>
         <w:rPr>
           <w:rFonts w:eastAsia="Times New Roman" w:cstheme="minorHAnsi"/>
           <w:lang w:eastAsia="nl-BE"/>
         </w:rPr>
-        <w:t>strict</w:t>
-      </w:r>
-      <w:proofErr w:type="spellEnd"/>
+        <w:t xml:space="preserve"> Nu kunnen </w:t>
+      </w:r>
+      <w:proofErr w:type="gramStart"/>
       <w:r>
         <w:rPr>
           <w:rFonts w:eastAsia="Times New Roman" w:cstheme="minorHAnsi"/>
           <w:lang w:eastAsia="nl-BE"/>
         </w:rPr>
-        <w:t xml:space="preserve"> te controleren en toen realiseerde ik dat de SHA-1 niet op de juiste plaats stond. Ik had op google </w:t>
-      </w:r>
-      <w:proofErr w:type="spellStart"/>
+        <w:t>google accounts</w:t>
+      </w:r>
+      <w:proofErr w:type="gramEnd"/>
       <w:r>
         <w:rPr>
           <w:rFonts w:eastAsia="Times New Roman" w:cstheme="minorHAnsi"/>
           <w:lang w:eastAsia="nl-BE"/>
         </w:rPr>
-        <w:t>cloud</w:t>
-      </w:r>
-      <w:proofErr w:type="spellEnd"/>
-      <w:r>
-        <w:rPr>
-          <w:rFonts w:eastAsia="Times New Roman" w:cstheme="minorHAnsi"/>
-          <w:lang w:eastAsia="nl-BE"/>
-        </w:rPr>
-        <w:t xml:space="preserve"> een </w:t>
-      </w:r>
-      <w:proofErr w:type="spellStart"/>
-      <w:r>
-        <w:rPr>
-          <w:rFonts w:eastAsia="Times New Roman" w:cstheme="minorHAnsi"/>
-          <w:lang w:eastAsia="nl-BE"/>
-        </w:rPr>
-        <w:t>Oauth</w:t>
-      </w:r>
-      <w:proofErr w:type="spellEnd"/>
-      <w:r>
-        <w:rPr>
-          <w:rFonts w:eastAsia="Times New Roman" w:cstheme="minorHAnsi"/>
-          <w:lang w:eastAsia="nl-BE"/>
-        </w:rPr>
-        <w:t xml:space="preserve"> 2.0 client </w:t>
-      </w:r>
-      <w:proofErr w:type="spellStart"/>
-      <w:r>
-        <w:rPr>
-          <w:rFonts w:eastAsia="Times New Roman" w:cstheme="minorHAnsi"/>
-          <w:lang w:eastAsia="nl-BE"/>
-        </w:rPr>
-        <w:t>id</w:t>
-      </w:r>
-      <w:proofErr w:type="spellEnd"/>
-      <w:r>
-        <w:rPr>
-          <w:rFonts w:eastAsia="Times New Roman" w:cstheme="minorHAnsi"/>
-          <w:lang w:eastAsia="nl-BE"/>
-        </w:rPr>
-        <w:t xml:space="preserve"> moeten aanmaken toen ik de </w:t>
-      </w:r>
-      <w:proofErr w:type="spellStart"/>
-      <w:r>
-        <w:rPr>
-          <w:rFonts w:eastAsia="Times New Roman" w:cstheme="minorHAnsi"/>
-          <w:lang w:eastAsia="nl-BE"/>
-        </w:rPr>
-        <w:t>android</w:t>
-      </w:r>
-      <w:proofErr w:type="spellEnd"/>
-      <w:r>
-        <w:rPr>
-          <w:rFonts w:eastAsia="Times New Roman" w:cstheme="minorHAnsi"/>
-          <w:lang w:eastAsia="nl-BE"/>
-        </w:rPr>
-        <w:t xml:space="preserve"> studio </w:t>
-      </w:r>
-      <w:proofErr w:type="spellStart"/>
-      <w:r>
-        <w:rPr>
-          <w:rFonts w:eastAsia="Times New Roman" w:cstheme="minorHAnsi"/>
-          <w:lang w:eastAsia="nl-BE"/>
-        </w:rPr>
-        <w:t>firebase</w:t>
-      </w:r>
-      <w:proofErr w:type="spellEnd"/>
-      <w:r>
-        <w:rPr>
-          <w:rFonts w:eastAsia="Times New Roman" w:cstheme="minorHAnsi"/>
-          <w:lang w:eastAsia="nl-BE"/>
-        </w:rPr>
-        <w:t xml:space="preserve"> tutorial volgde, maar dat bleek dus helemaal fout te zijn, want de echte </w:t>
-      </w:r>
-      <w:proofErr w:type="spellStart"/>
-      <w:r>
-        <w:rPr>
-          <w:rFonts w:eastAsia="Times New Roman" w:cstheme="minorHAnsi"/>
-          <w:lang w:eastAsia="nl-BE"/>
-        </w:rPr>
-        <w:t>client_id</w:t>
-      </w:r>
-      <w:proofErr w:type="spellEnd"/>
-      <w:r>
-        <w:rPr>
-          <w:rFonts w:eastAsia="Times New Roman" w:cstheme="minorHAnsi"/>
-          <w:lang w:eastAsia="nl-BE"/>
-        </w:rPr>
-        <w:t xml:space="preserve"> was eigenlijk al klaar in een google-</w:t>
-      </w:r>
-      <w:proofErr w:type="spellStart"/>
-      <w:r>
-        <w:rPr>
-          <w:rFonts w:eastAsia="Times New Roman" w:cstheme="minorHAnsi"/>
-          <w:lang w:eastAsia="nl-BE"/>
-        </w:rPr>
-        <w:t>services.json</w:t>
-      </w:r>
-      <w:proofErr w:type="spellEnd"/>
-      <w:r>
-        <w:rPr>
-          <w:rFonts w:eastAsia="Times New Roman" w:cstheme="minorHAnsi"/>
-          <w:lang w:eastAsia="nl-BE"/>
-        </w:rPr>
-        <w:t xml:space="preserve"> file. Ik moest toen ook mijn SHA-1 </w:t>
-      </w:r>
-      <w:proofErr w:type="spellStart"/>
-      <w:r>
-        <w:rPr>
-          <w:rFonts w:eastAsia="Times New Roman" w:cstheme="minorHAnsi"/>
-          <w:lang w:eastAsia="nl-BE"/>
-        </w:rPr>
-        <w:t>fingerprint</w:t>
-      </w:r>
-      <w:proofErr w:type="spellEnd"/>
-      <w:r>
-        <w:rPr>
-          <w:rFonts w:eastAsia="Times New Roman" w:cstheme="minorHAnsi"/>
-          <w:lang w:eastAsia="nl-BE"/>
-        </w:rPr>
-        <w:t xml:space="preserve"> verwijderen bij de onderstaande afbeelding, maar dat mocht daar eigenlijk blijven staan.</w:t>
-      </w:r>
-      <w:r>
-        <w:rPr>
-          <w:rFonts w:eastAsia="Times New Roman" w:cstheme="minorHAnsi"/>
-          <w:lang w:eastAsia="nl-BE"/>
-        </w:rPr>
-        <w:t xml:space="preserve"> Nu kunnen google accounts succesvol worden toegevoegd.</w:t>
+        <w:t xml:space="preserve"> succesvol worden toegevoegd.</w:t>
       </w:r>
       <w:r>
         <w:rPr>
@@ -2975,13 +2235,8 @@
           <w:numId w:val="2"/>
         </w:numPr>
       </w:pPr>
-      <w:proofErr w:type="spellStart"/>
-      <w:r>
-        <w:t>Firebase</w:t>
-      </w:r>
-      <w:proofErr w:type="spellEnd"/>
-      <w:r>
-        <w:t xml:space="preserve"> </w:t>
+      <w:r>
+        <w:t xml:space="preserve">Firebase </w:t>
       </w:r>
       <w:r>
         <w:t>storage</w:t>
@@ -3023,35 +2278,27 @@
     </w:p>
     <w:p>
       <w:r>
-        <w:t xml:space="preserve">Vandaag ben ik begonnen met aanmaken van de </w:t>
-      </w:r>
-      <w:proofErr w:type="spellStart"/>
-      <w:r>
-        <w:t>Firebase</w:t>
-      </w:r>
-      <w:proofErr w:type="spellEnd"/>
-      <w:r>
-        <w:t xml:space="preserve"> storage voor het opslaan van afbeeldingen.</w:t>
+        <w:t>Vandaag ben ik begonnen met aanmaken van de Firebase storage voor het opslaan van afbeeldingen.</w:t>
       </w:r>
       <w:r>
         <w:t xml:space="preserve"> </w:t>
       </w:r>
       <w:r>
-        <w:t xml:space="preserve">Ik heb dan de </w:t>
-      </w:r>
-      <w:proofErr w:type="spellStart"/>
-      <w:r>
-        <w:t>dependencies</w:t>
-      </w:r>
-      <w:proofErr w:type="spellEnd"/>
-      <w:r>
-        <w:t xml:space="preserve"> toegevoegd en dan moest ik een Cloud storage bucket aanmaken. Hierbij werd er gevraagd om een locatie te kiezen waarbij Europe-west 1 (= Belgische regio) niet tussen stond, maar gelukkig is er Eur3 die eigenlijk Belgische en Nederlandse regio voorstelt. Dat werd uitgelegd </w:t>
-      </w:r>
-      <w:r>
-        <w:t>op deze webpagina</w:t>
-      </w:r>
-      <w:r>
-        <w:t>‘s</w:t>
+        <w:t xml:space="preserve">Ik heb dan de dependencies toegevoegd en dan moest ik een Cloud storage bucket aanmaken. Hierbij werd er gevraagd om een locatie te kiezen waarbij Europe-west 1 (= Belgische regio) niet tussen stond, maar gelukkig is er Eur3 die eigenlijk Belgische en Nederlandse regio voorstelt. Dat werd uitgelegd </w:t>
+      </w:r>
+      <w:r>
+        <w:t xml:space="preserve">op deze </w:t>
+      </w:r>
+      <w:proofErr w:type="gramStart"/>
+      <w:r>
+        <w:t>webpagina</w:t>
+      </w:r>
+      <w:r>
+        <w:t>‘</w:t>
+      </w:r>
+      <w:proofErr w:type="gramEnd"/>
+      <w:r>
+        <w:t>s</w:t>
       </w:r>
       <w:r>
         <w:t>:</w:t>
@@ -3158,52 +2405,12 @@
     </w:p>
     <w:p>
       <w:r>
-        <w:t xml:space="preserve">Vandaag heb ik de </w:t>
-      </w:r>
-      <w:proofErr w:type="spellStart"/>
-      <w:r>
-        <w:t>java</w:t>
-      </w:r>
-      <w:proofErr w:type="spellEnd"/>
-      <w:r>
-        <w:t xml:space="preserve"> code moet schrijven voor de camera te kunnen gebruiken. Eerst heb ik code toegevoegd dat ervoor zorgt dat de permissies worden aangevraagd om de camera te kunnen gebruiken. Daarna als ik </w:t>
-      </w:r>
-      <w:proofErr w:type="spellStart"/>
-      <w:r>
-        <w:t>allow</w:t>
-      </w:r>
-      <w:proofErr w:type="spellEnd"/>
-      <w:r>
-        <w:t xml:space="preserve"> klik dan opent een test camera zicht van de emulator. </w:t>
-      </w:r>
-    </w:p>
-    <w:p>
-      <w:r>
-        <w:t xml:space="preserve">Hierbij werden gelijkaardig methoden gebruikt zoals de </w:t>
-      </w:r>
-      <w:proofErr w:type="spellStart"/>
-      <w:r>
-        <w:t>firebase</w:t>
-      </w:r>
-      <w:proofErr w:type="spellEnd"/>
-      <w:r>
-        <w:t xml:space="preserve"> </w:t>
-      </w:r>
-      <w:proofErr w:type="spellStart"/>
-      <w:r>
-        <w:t>authentication</w:t>
-      </w:r>
-      <w:proofErr w:type="spellEnd"/>
-      <w:r>
-        <w:t xml:space="preserve">, maar waren ook </w:t>
-      </w:r>
-      <w:proofErr w:type="spellStart"/>
-      <w:r>
-        <w:t>deprecated</w:t>
-      </w:r>
-      <w:proofErr w:type="spellEnd"/>
-      <w:r>
-        <w:t>. Dit heb natuurlijk makkelijk opgelost.</w:t>
+        <w:t xml:space="preserve">Vandaag heb ik de java code moet schrijven voor de camera te kunnen gebruiken. Eerst heb ik code toegevoegd dat ervoor zorgt dat de permissies worden aangevraagd om de camera te kunnen gebruiken. Daarna als ik allow klik dan opent een test camera zicht van de emulator. </w:t>
+      </w:r>
+    </w:p>
+    <w:p>
+      <w:r>
+        <w:t>Hierbij werden gelijkaardig methoden gebruikt zoals de firebase authentication, maar waren ook deprecated. Dit heb natuurlijk makkelijk opgelost.</w:t>
       </w:r>
     </w:p>
     <w:p>
@@ -3277,15 +2484,7 @@
     </w:p>
     <w:p>
       <w:r>
-        <w:t xml:space="preserve">Vandaag heb ik geprobeerd om de image die getrokken wordt op te slaan in </w:t>
-      </w:r>
-      <w:proofErr w:type="spellStart"/>
-      <w:r>
-        <w:t>firebase</w:t>
-      </w:r>
-      <w:proofErr w:type="spellEnd"/>
-      <w:r>
-        <w:t xml:space="preserve"> storage</w:t>
+        <w:t>Vandaag heb ik geprobeerd om de image die getrokken wordt op te slaan in firebase storage</w:t>
       </w:r>
       <w:r>
         <w:t>. Dit is op het einde van de les gelukt.</w:t>
@@ -3339,90 +2538,10 @@
     <w:p>
       <w:r>
         <w:lastRenderedPageBreak/>
-        <w:t xml:space="preserve">Hierbij had ik vooral problemen met de </w:t>
-      </w:r>
-      <w:proofErr w:type="spellStart"/>
-      <w:r>
-        <w:t>uri</w:t>
-      </w:r>
-      <w:proofErr w:type="spellEnd"/>
-      <w:r>
-        <w:t xml:space="preserve"> </w:t>
-      </w:r>
-      <w:proofErr w:type="spellStart"/>
-      <w:r>
-        <w:t>oftewl</w:t>
-      </w:r>
-      <w:proofErr w:type="spellEnd"/>
-      <w:r>
-        <w:t xml:space="preserve"> URL omdat </w:t>
-      </w:r>
-      <w:proofErr w:type="spellStart"/>
-      <w:r>
-        <w:t>firebase</w:t>
-      </w:r>
-      <w:proofErr w:type="spellEnd"/>
-      <w:r>
-        <w:t xml:space="preserve"> die nodig had om te kunnen uploaden. Als je naar de eerste rode streep kijkt is er een methode voor </w:t>
-      </w:r>
-      <w:r>
-        <w:t xml:space="preserve">de </w:t>
-      </w:r>
-      <w:proofErr w:type="spellStart"/>
-      <w:r>
-        <w:t>bitmap</w:t>
-      </w:r>
-      <w:proofErr w:type="spellEnd"/>
-      <w:r>
-        <w:t xml:space="preserve"> die je krijgt van de camera te gebruiken om de </w:t>
-      </w:r>
-      <w:proofErr w:type="spellStart"/>
-      <w:r>
-        <w:t>uri</w:t>
-      </w:r>
-      <w:proofErr w:type="spellEnd"/>
-      <w:r>
-        <w:t xml:space="preserve"> te bepalen. De volgende is voor de bestandextensie te krijgen om een </w:t>
-      </w:r>
-      <w:proofErr w:type="spellStart"/>
-      <w:r>
-        <w:t>filename</w:t>
-      </w:r>
-      <w:proofErr w:type="spellEnd"/>
-      <w:r>
-        <w:t xml:space="preserve"> op te stellen in de </w:t>
-      </w:r>
-      <w:proofErr w:type="spellStart"/>
-      <w:r>
-        <w:t>firebase</w:t>
-      </w:r>
-      <w:proofErr w:type="spellEnd"/>
-      <w:r>
-        <w:t xml:space="preserve"> storage. Hierbij pak ik gewoon het tijdstip met de bestandextensie, maar ik ben misschien van plan om de </w:t>
-      </w:r>
-      <w:proofErr w:type="spellStart"/>
-      <w:r>
-        <w:t>filename</w:t>
-      </w:r>
-      <w:proofErr w:type="spellEnd"/>
-      <w:r>
-        <w:t xml:space="preserve"> te kunnen aanpassen door de gebruiker. De laatste streep zijn twee </w:t>
-      </w:r>
-      <w:proofErr w:type="spellStart"/>
-      <w:r>
-        <w:t>child</w:t>
-      </w:r>
-      <w:proofErr w:type="spellEnd"/>
-      <w:r>
-        <w:t xml:space="preserve"> </w:t>
-      </w:r>
-      <w:proofErr w:type="spellStart"/>
-      <w:r>
-        <w:t>methods</w:t>
-      </w:r>
-      <w:proofErr w:type="spellEnd"/>
-      <w:r>
-        <w:t xml:space="preserve"> waarbij dus de eerste de map voorstelt waar dan de 2</w:t>
+        <w:t xml:space="preserve">Hierbij had ik vooral problemen met de uri oftewl URL omdat firebase die nodig had om te kunnen uploaden. Als je naar de eerste rode streep kijkt is er een methode voor </w:t>
+      </w:r>
+      <w:r>
+        <w:t>de bitmap die je krijgt van de camera te gebruiken om de uri te bepalen. De volgende is voor de bestandextensie te krijgen om een filename op te stellen in de firebase storage. Hierbij pak ik gewoon het tijdstip met de bestandextensie, maar ik ben misschien van plan om de filename te kunnen aanpassen door de gebruiker. De laatste streep zijn twee child methods waarbij dus de eerste de map voorstelt waar dan de 2</w:t>
       </w:r>
       <w:r>
         <w:rPr>
@@ -3431,15 +2550,15 @@
         <w:t>de</w:t>
       </w:r>
       <w:r>
-        <w:t xml:space="preserve"> </w:t>
-      </w:r>
-      <w:proofErr w:type="spellStart"/>
-      <w:r>
-        <w:t>child</w:t>
-      </w:r>
-      <w:proofErr w:type="spellEnd"/>
-      <w:r>
-        <w:t xml:space="preserve"> oftewel de image inkomt. De map geef ik  het email adres van de gebruiker als naam.</w:t>
+        <w:t xml:space="preserve"> child oftewel de image inkomt. De map geef </w:t>
+      </w:r>
+      <w:proofErr w:type="gramStart"/>
+      <w:r>
+        <w:t>ik  het</w:t>
+      </w:r>
+      <w:proofErr w:type="gramEnd"/>
+      <w:r>
+        <w:t xml:space="preserve"> email adres van de gebruiker als naam.</w:t>
       </w:r>
     </w:p>
     <w:p>
@@ -3579,15 +2698,7 @@
         <w:t>je gsm</w:t>
       </w:r>
       <w:r>
-        <w:t xml:space="preserve"> </w:t>
-      </w:r>
-      <w:proofErr w:type="spellStart"/>
-      <w:r>
-        <w:t>gallery</w:t>
-      </w:r>
-      <w:proofErr w:type="spellEnd"/>
-      <w:r>
-        <w:t xml:space="preserve"> gebruiken)</w:t>
+        <w:t xml:space="preserve"> gallery gebruiken)</w:t>
       </w:r>
     </w:p>
     <w:p/>
@@ -3608,23 +2719,7 @@
     </w:p>
     <w:p>
       <w:r>
-        <w:t xml:space="preserve">Vandaag heb ik geprobeerd om een </w:t>
-      </w:r>
-      <w:proofErr w:type="spellStart"/>
-      <w:r>
-        <w:t>gridview</w:t>
-      </w:r>
-      <w:proofErr w:type="spellEnd"/>
-      <w:r>
-        <w:t xml:space="preserve"> toe te voegen die images bevat dat dus lijkt op een image </w:t>
-      </w:r>
-      <w:proofErr w:type="spellStart"/>
-      <w:r>
-        <w:t>gallery</w:t>
-      </w:r>
-      <w:proofErr w:type="spellEnd"/>
-      <w:r>
-        <w:t xml:space="preserve"> zoals uw “foto’s” app. Hierbij heb ik de </w:t>
+        <w:t xml:space="preserve">Vandaag heb ik geprobeerd om een gridview toe te voegen die images bevat dat dus lijkt op een image gallery zoals uw “foto’s” app. Hierbij heb ik de </w:t>
       </w:r>
       <w:r>
         <w:t>volgende</w:t>
@@ -3669,15 +2764,7 @@
     </w:p>
     <w:p>
       <w:r>
-        <w:t xml:space="preserve">Dit heeft nog niet direct resultaat gegeven, maar de </w:t>
-      </w:r>
-      <w:proofErr w:type="spellStart"/>
-      <w:r>
-        <w:t>GridAdapter</w:t>
-      </w:r>
-      <w:proofErr w:type="spellEnd"/>
-      <w:r>
-        <w:t xml:space="preserve"> class geeft een gevoel dat ik wel op de goeie weg zit.</w:t>
+        <w:t>Dit heeft nog niet direct resultaat gegeven, maar de GridAdapter class geeft een gevoel dat ik wel op de goeie weg zit.</w:t>
       </w:r>
     </w:p>
     <w:p/>
@@ -3698,31 +2785,7 @@
     </w:p>
     <w:p>
       <w:r>
-        <w:t xml:space="preserve">Na de </w:t>
-      </w:r>
-      <w:proofErr w:type="spellStart"/>
-      <w:r>
-        <w:t>GridAdapter</w:t>
-      </w:r>
-      <w:proofErr w:type="spellEnd"/>
-      <w:r>
-        <w:t xml:space="preserve"> klasse te controleren ontdekte ik dat ik gewoon het verkeerd image </w:t>
-      </w:r>
-      <w:proofErr w:type="spellStart"/>
-      <w:r>
-        <w:t>Id</w:t>
-      </w:r>
-      <w:proofErr w:type="spellEnd"/>
-      <w:r>
-        <w:t xml:space="preserve"> doorgegeven heb. Dit heeft het probleem onmiddellijk </w:t>
-      </w:r>
-      <w:proofErr w:type="spellStart"/>
-      <w:r>
-        <w:t>gefixed</w:t>
-      </w:r>
-      <w:proofErr w:type="spellEnd"/>
-      <w:r>
-        <w:t xml:space="preserve"> als zijn de voorbeeld images niet echt mooi gepositioneerd.</w:t>
+        <w:t>Na de GridAdapter klasse te controleren ontdekte ik dat ik gewoon het verkeerd image Id doorgegeven heb. Dit heeft het probleem onmiddellijk gefixed als zijn de voorbeeld images niet echt mooi gepositioneerd.</w:t>
       </w:r>
     </w:p>
     <w:p>
@@ -3776,15 +2839,7 @@
         <w:t>gedetailleerd</w:t>
       </w:r>
       <w:r>
-        <w:t xml:space="preserve"> tutorial gevolgd hoe je met een </w:t>
-      </w:r>
-      <w:proofErr w:type="spellStart"/>
-      <w:r>
-        <w:t>gridview</w:t>
-      </w:r>
-      <w:proofErr w:type="spellEnd"/>
-      <w:r>
-        <w:t xml:space="preserve"> kan werken:</w:t>
+        <w:t xml:space="preserve"> tutorial gevolgd hoe je met een gridview kan werken:</w:t>
       </w:r>
     </w:p>
     <w:p>
@@ -3799,58 +2854,18 @@
     </w:p>
     <w:p>
       <w:r>
-        <w:t xml:space="preserve">Daarna heb ik er nog voor gezorgd dat de </w:t>
-      </w:r>
-      <w:proofErr w:type="spellStart"/>
-      <w:r>
-        <w:t>margin</w:t>
-      </w:r>
-      <w:proofErr w:type="spellEnd"/>
-      <w:r>
-        <w:t xml:space="preserve"> top en </w:t>
-      </w:r>
-      <w:proofErr w:type="spellStart"/>
-      <w:r>
-        <w:t>bottom</w:t>
-      </w:r>
-      <w:proofErr w:type="spellEnd"/>
-      <w:r>
-        <w:t xml:space="preserve"> via </w:t>
-      </w:r>
-      <w:proofErr w:type="spellStart"/>
-      <w:r>
-        <w:t>java</w:t>
-      </w:r>
-      <w:proofErr w:type="spellEnd"/>
-      <w:r>
-        <w:t xml:space="preserve"> code worden aangepast afhankelijk van de </w:t>
-      </w:r>
-      <w:r>
-        <w:t xml:space="preserve">hoogte van de header en </w:t>
-      </w:r>
-      <w:proofErr w:type="spellStart"/>
-      <w:r>
-        <w:t>footer</w:t>
-      </w:r>
-      <w:proofErr w:type="spellEnd"/>
-      <w:r>
-        <w:t xml:space="preserve">. Dit </w:t>
-      </w:r>
-      <w:proofErr w:type="spellStart"/>
-      <w:r>
-        <w:t>werdt</w:t>
-      </w:r>
-      <w:proofErr w:type="spellEnd"/>
-      <w:r>
-        <w:t xml:space="preserve"> gedaan in </w:t>
-      </w:r>
-      <w:proofErr w:type="spellStart"/>
-      <w:r>
-        <w:t>OnCreateView</w:t>
-      </w:r>
-      <w:proofErr w:type="spellEnd"/>
-      <w:r>
-        <w:t>():</w:t>
+        <w:t xml:space="preserve">Daarna heb ik er nog voor gezorgd dat de margin top en bottom via java code worden aangepast afhankelijk van de </w:t>
+      </w:r>
+      <w:r>
+        <w:t xml:space="preserve">hoogte van de header en footer. Dit werdt gedaan in </w:t>
+      </w:r>
+      <w:proofErr w:type="gramStart"/>
+      <w:r>
+        <w:t>OnCreateView(</w:t>
+      </w:r>
+      <w:proofErr w:type="gramEnd"/>
+      <w:r>
+        <w:t>):</w:t>
       </w:r>
     </w:p>
     <w:p>
@@ -3898,66 +2913,13 @@
     </w:p>
     <w:p>
       <w:r>
-        <w:t xml:space="preserve">Ik heb dan de elementen een witte achtergrond gegeven en dan een border rond gedaan dat eigenlijk vrij moeilijk en inefficiënt moet worden opgeroepen in </w:t>
-      </w:r>
-      <w:proofErr w:type="spellStart"/>
-      <w:r>
-        <w:t>android</w:t>
-      </w:r>
-      <w:proofErr w:type="spellEnd"/>
-      <w:r>
-        <w:t xml:space="preserve"> studio door middel van een &lt;</w:t>
-      </w:r>
-      <w:proofErr w:type="spellStart"/>
-      <w:r>
-        <w:t>shape</w:t>
-      </w:r>
-      <w:proofErr w:type="spellEnd"/>
-      <w:r>
-        <w:t xml:space="preserve">&gt; </w:t>
-      </w:r>
-      <w:proofErr w:type="spellStart"/>
-      <w:r>
-        <w:t>xml</w:t>
-      </w:r>
-      <w:proofErr w:type="spellEnd"/>
-      <w:r>
-        <w:t xml:space="preserve"> file te maken in de </w:t>
-      </w:r>
-      <w:proofErr w:type="spellStart"/>
-      <w:r>
-        <w:t>res</w:t>
-      </w:r>
-      <w:proofErr w:type="spellEnd"/>
-      <w:r>
-        <w:t>/</w:t>
-      </w:r>
-      <w:proofErr w:type="spellStart"/>
-      <w:r>
-        <w:t>drawable</w:t>
-      </w:r>
-      <w:proofErr w:type="spellEnd"/>
-      <w:r>
-        <w:t xml:space="preserve"> folder en die een </w:t>
-      </w:r>
-      <w:proofErr w:type="spellStart"/>
-      <w:r>
-        <w:t>stroke</w:t>
-      </w:r>
-      <w:proofErr w:type="spellEnd"/>
+        <w:t>Ik heb dan de elementen een witte achtergrond gegeven en dan een border rond gedaan dat eigenlijk vrij moeilijk en inefficiënt moet worden opgeroepen in android studio door middel van een &lt;shape&gt; xml file te maken in de res/drawable folder en die een stroke</w:t>
+      </w:r>
       <w:r>
         <w:t>, enzoverder</w:t>
       </w:r>
       <w:r>
-        <w:t xml:space="preserve"> te geven. Dan wordt deze </w:t>
-      </w:r>
-      <w:proofErr w:type="spellStart"/>
-      <w:r>
-        <w:t>drawable</w:t>
-      </w:r>
-      <w:proofErr w:type="spellEnd"/>
-      <w:r>
-        <w:t xml:space="preserve"> als achtergrond geplaatst van de imageview.</w:t>
+        <w:t xml:space="preserve"> te geven. Dan wordt deze drawable als achtergrond geplaatst van de imageview.</w:t>
       </w:r>
       <w:r>
         <w:t xml:space="preserve"> De lege elementen zijn gewoon witte icoontjes die dus niet zichtbaar zijn door de witte achtergrond.</w:t>
@@ -4008,23 +2970,7 @@
     <w:p/>
     <w:p>
       <w:r>
-        <w:t xml:space="preserve">Om te eindigen, moest ik nog de images van </w:t>
-      </w:r>
-      <w:proofErr w:type="spellStart"/>
-      <w:r>
-        <w:t>firebase</w:t>
-      </w:r>
-      <w:proofErr w:type="spellEnd"/>
-      <w:r>
-        <w:t xml:space="preserve"> toevoegen hierbij heb ik vooral code van stackoverflow gebruikt om mijn oude klassen en </w:t>
-      </w:r>
-      <w:proofErr w:type="spellStart"/>
-      <w:r>
-        <w:t>methods</w:t>
-      </w:r>
-      <w:proofErr w:type="spellEnd"/>
-      <w:r>
-        <w:t xml:space="preserve"> te verbeteren.</w:t>
+        <w:t>Om te eindigen, moest ik nog de images van firebase toevoegen hierbij heb ik vooral code van stackoverflow gebruikt om mijn oude klassen en methods te verbeteren.</w:t>
       </w:r>
     </w:p>
     <w:p>
@@ -4121,75 +3067,22 @@
     </w:p>
     <w:p>
       <w:r>
-        <w:t xml:space="preserve">Ik had een image asset toegevoegd dat dus er voor zorgde dat de oude logo files worden vervangen. Hierbij heb een logo afbeelding als </w:t>
-      </w:r>
-      <w:proofErr w:type="spellStart"/>
-      <w:r>
-        <w:t>foreground</w:t>
-      </w:r>
-      <w:proofErr w:type="spellEnd"/>
-      <w:r>
-        <w:t xml:space="preserve"> en een transparant afbeelding als background. Maar dit wou niet helemaal werken door </w:t>
-      </w:r>
-      <w:proofErr w:type="spellStart"/>
-      <w:r>
-        <w:t>adaptive</w:t>
-      </w:r>
-      <w:proofErr w:type="spellEnd"/>
-      <w:r>
-        <w:t xml:space="preserve"> icon en </w:t>
-      </w:r>
-      <w:proofErr w:type="spellStart"/>
-      <w:r>
-        <w:t>legacy</w:t>
-      </w:r>
-      <w:proofErr w:type="spellEnd"/>
-      <w:r>
-        <w:t xml:space="preserve"> optie. De app als het om mijn emulator </w:t>
+        <w:t xml:space="preserve">Ik had een image asset toegevoegd dat dus </w:t>
+      </w:r>
+      <w:proofErr w:type="gramStart"/>
+      <w:r>
+        <w:t>er voor</w:t>
+      </w:r>
+      <w:proofErr w:type="gramEnd"/>
+      <w:r>
+        <w:t xml:space="preserve"> zorgde dat de oude logo files worden vervangen. Hierbij heb een logo afbeelding als foreground en een transparant afbeelding als background. Maar dit wou niet helemaal werken door adaptive icon en legacy optie. De app als het om mijn emulator </w:t>
       </w:r>
       <w:r>
         <w:lastRenderedPageBreak/>
-        <w:t xml:space="preserve">staat kreeg een zwarte achtergrond omdat transparant niet bestaat bij </w:t>
-      </w:r>
-      <w:proofErr w:type="spellStart"/>
-      <w:r>
-        <w:t>adaptive</w:t>
-      </w:r>
-      <w:proofErr w:type="spellEnd"/>
-      <w:r>
-        <w:t xml:space="preserve"> </w:t>
-      </w:r>
-      <w:proofErr w:type="spellStart"/>
-      <w:r>
-        <w:t>icons</w:t>
-      </w:r>
-      <w:proofErr w:type="spellEnd"/>
-      <w:r>
-        <w:t xml:space="preserve">. Dus wat ik gedaan had was het gewoon op </w:t>
-      </w:r>
-      <w:proofErr w:type="spellStart"/>
-      <w:r>
-        <w:t>legacy</w:t>
-      </w:r>
-      <w:proofErr w:type="spellEnd"/>
-      <w:r>
-        <w:t xml:space="preserve"> </w:t>
-      </w:r>
-      <w:proofErr w:type="spellStart"/>
-      <w:r>
-        <w:t>only</w:t>
-      </w:r>
-      <w:proofErr w:type="spellEnd"/>
-      <w:r>
-        <w:t xml:space="preserve"> optie zetten waar ik gewoon eigenlijk de background kan weghalen door de </w:t>
-      </w:r>
-      <w:proofErr w:type="spellStart"/>
-      <w:r>
-        <w:t>shape</w:t>
-      </w:r>
-      <w:proofErr w:type="spellEnd"/>
-      <w:r>
-        <w:t xml:space="preserve"> als cirkel aan te duiden</w:t>
+        <w:t>staat kreeg een zwarte achtergrond omdat transparant niet bestaat bij adaptive icons. Dus wat ik gedaan had was het gewoon op legacy only</w:t>
+      </w:r>
+      <w:r>
+        <w:t xml:space="preserve"> optie zetten waar ik gewoon eigenlijk de background kan weghalen door de shape als cirkel aan te duiden</w:t>
       </w:r>
       <w:r>
         <w:t>.</w:t>
@@ -4255,31 +3148,7 @@
     </w:p>
     <w:p>
       <w:r>
-        <w:t xml:space="preserve">Vandaag heb ik ervoor gezorgd dat ik image van uw gsm </w:t>
-      </w:r>
-      <w:proofErr w:type="spellStart"/>
-      <w:r>
-        <w:t>gallery</w:t>
-      </w:r>
-      <w:proofErr w:type="spellEnd"/>
-      <w:r>
-        <w:t xml:space="preserve"> kan uploaden. Hierbij dacht ik eerst dat automatisch de </w:t>
-      </w:r>
-      <w:proofErr w:type="spellStart"/>
-      <w:r>
-        <w:t>gallery</w:t>
-      </w:r>
-      <w:proofErr w:type="spellEnd"/>
-      <w:r>
-        <w:t xml:space="preserve"> die klaarstaat in de camera app kon gebruiken zoals bij facebook </w:t>
-      </w:r>
-      <w:proofErr w:type="spellStart"/>
-      <w:r>
-        <w:t>messenger</w:t>
-      </w:r>
-      <w:proofErr w:type="spellEnd"/>
-      <w:r>
-        <w:t>, maar bestaat niet echt blijkbaar. Ik heb hiervoor zelfs een vraag gesteld op stackoverflow.</w:t>
+        <w:t>Vandaag heb ik ervoor gezorgd dat ik image van uw gsm gallery kan uploaden. Hierbij dacht ik eerst dat automatisch de gallery die klaarstaat in de camera app kon gebruiken zoals bij facebook messenger, maar bestaat niet echt blijkbaar. Ik heb hiervoor zelfs een vraag gesteld op stackoverflow.</w:t>
       </w:r>
     </w:p>
     <w:p>
@@ -4294,31 +3163,15 @@
     </w:p>
     <w:p>
       <w:r>
-        <w:t xml:space="preserve">Uiteindelijk heb ik gewoon besloten om de camera en </w:t>
-      </w:r>
-      <w:proofErr w:type="spellStart"/>
-      <w:r>
-        <w:t>gallery</w:t>
-      </w:r>
-      <w:proofErr w:type="spellEnd"/>
-      <w:r>
-        <w:t xml:space="preserve"> op te splitsen en te kunnen openen in </w:t>
-      </w:r>
-      <w:proofErr w:type="spellStart"/>
-      <w:r>
-        <w:t>popup</w:t>
-      </w:r>
-      <w:proofErr w:type="spellEnd"/>
-      <w:r>
-        <w:t xml:space="preserve"> keuze menu. De code voor de </w:t>
-      </w:r>
-      <w:proofErr w:type="spellStart"/>
-      <w:r>
-        <w:t>gallery</w:t>
-      </w:r>
-      <w:proofErr w:type="spellEnd"/>
-      <w:r>
-        <w:t xml:space="preserve"> functionaliteiten </w:t>
+        <w:t xml:space="preserve">Uiteindelijk heb ik gewoon besloten om de camera en gallery op te splitsen en te kunnen openen in popup </w:t>
+      </w:r>
+      <w:proofErr w:type="gramStart"/>
+      <w:r>
+        <w:t>keuze menu</w:t>
+      </w:r>
+      <w:proofErr w:type="gramEnd"/>
+      <w:r>
+        <w:t xml:space="preserve">. De code voor de gallery functionaliteiten </w:t>
       </w:r>
       <w:r>
         <w:t>is</w:t>
@@ -4417,23 +3270,7 @@
         </w:numPr>
       </w:pPr>
       <w:r>
-        <w:t xml:space="preserve">Vragen dat het ok is om je image te </w:t>
-      </w:r>
-      <w:proofErr w:type="spellStart"/>
-      <w:r>
-        <w:t>compressen</w:t>
-      </w:r>
-      <w:proofErr w:type="spellEnd"/>
-      <w:r>
-        <w:t xml:space="preserve"> (</w:t>
-      </w:r>
-      <w:proofErr w:type="spellStart"/>
-      <w:r>
-        <w:t>quality</w:t>
-      </w:r>
-      <w:proofErr w:type="spellEnd"/>
-      <w:r>
-        <w:t xml:space="preserve"> verlies?)</w:t>
+        <w:t>Vragen dat het ok is om je image te compressen (quality verlies?)</w:t>
       </w:r>
     </w:p>
     <w:p>
@@ -4445,21 +3282,8 @@
         </w:numPr>
       </w:pPr>
       <w:r>
-        <w:t xml:space="preserve">Image van de </w:t>
-      </w:r>
-      <w:proofErr w:type="spellStart"/>
-      <w:r>
-        <w:t>gridview</w:t>
-      </w:r>
-      <w:proofErr w:type="spellEnd"/>
-      <w:r>
-        <w:t xml:space="preserve"> kunnen openen in full </w:t>
-      </w:r>
-      <w:proofErr w:type="spellStart"/>
-      <w:r>
-        <w:t>size</w:t>
-      </w:r>
-      <w:proofErr w:type="spellEnd"/>
+        <w:t>Image van de gridview kunnen openen in full size</w:t>
+      </w:r>
     </w:p>
     <w:p>
       <w:pPr>
@@ -4470,15 +3294,7 @@
         </w:numPr>
       </w:pPr>
       <w:r>
-        <w:t xml:space="preserve">App op google </w:t>
-      </w:r>
-      <w:proofErr w:type="spellStart"/>
-      <w:r>
-        <w:t>playstore</w:t>
-      </w:r>
-      <w:proofErr w:type="spellEnd"/>
-      <w:r>
-        <w:t xml:space="preserve"> plaatsen!!</w:t>
+        <w:t>App op google playstore plaatsen!!</w:t>
       </w:r>
     </w:p>
     <w:p>
@@ -4489,13 +3305,8 @@
           <w:numId w:val="2"/>
         </w:numPr>
       </w:pPr>
-      <w:proofErr w:type="spellStart"/>
-      <w:r>
-        <w:t>Offfline</w:t>
-      </w:r>
-      <w:proofErr w:type="spellEnd"/>
-      <w:r>
-        <w:t xml:space="preserve"> functionaliteiten toevoegen?</w:t>
+      <w:r>
+        <w:t>Offfline functionaliteiten toevoegen?</w:t>
       </w:r>
     </w:p>
     <w:p/>
@@ -4516,80 +3327,24 @@
     </w:p>
     <w:p>
       <w:r>
-        <w:t xml:space="preserve">Vandaag wou ik beginnen met het uploaden van mijn app op google </w:t>
-      </w:r>
-      <w:proofErr w:type="spellStart"/>
-      <w:r>
-        <w:t>play</w:t>
-      </w:r>
-      <w:proofErr w:type="spellEnd"/>
-      <w:r>
-        <w:t xml:space="preserve"> maar toen ik tutorial volgde moest ik eerst mijn app package name veranderen want </w:t>
-      </w:r>
-      <w:proofErr w:type="spellStart"/>
-      <w:r>
-        <w:t>com.example</w:t>
-      </w:r>
-      <w:proofErr w:type="spellEnd"/>
-      <w:r>
-        <w:t xml:space="preserve"> is niet correct. Toen ik dat veranderen </w:t>
-      </w:r>
-      <w:r>
-        <w:t xml:space="preserve">werkte de google services niet meer want de package name was </w:t>
-      </w:r>
-      <w:proofErr w:type="spellStart"/>
-      <w:r>
-        <w:t>com.example</w:t>
-      </w:r>
-      <w:proofErr w:type="spellEnd"/>
-      <w:r>
-        <w:t xml:space="preserve"> in de google-</w:t>
-      </w:r>
-      <w:proofErr w:type="spellStart"/>
+        <w:t xml:space="preserve">Vandaag wou ik beginnen met het uploaden van mijn app op google play maar toen ik tutorial volgde moest ik eerst mijn app package name veranderen want com.example is niet correct. Toen ik dat veranderen </w:t>
+      </w:r>
+      <w:r>
+        <w:t>werkte de google services niet meer want de package name was com.example in de google-</w:t>
+      </w:r>
+      <w:proofErr w:type="gramStart"/>
       <w:r>
         <w:t>services.json</w:t>
       </w:r>
-      <w:proofErr w:type="spellEnd"/>
-      <w:r>
-        <w:t xml:space="preserve"> file. Dus ik moest mijn app in </w:t>
-      </w:r>
-      <w:proofErr w:type="spellStart"/>
-      <w:r>
-        <w:t>firebase</w:t>
-      </w:r>
-      <w:proofErr w:type="spellEnd"/>
-      <w:r>
-        <w:t xml:space="preserve"> opnieuw maken dat niet echt moeilijk was.</w:t>
-      </w:r>
-      <w:r>
-        <w:t xml:space="preserve"> Daarna heb ik een </w:t>
-      </w:r>
-      <w:proofErr w:type="spellStart"/>
-      <w:r>
-        <w:t>android</w:t>
-      </w:r>
-      <w:proofErr w:type="spellEnd"/>
-      <w:r>
-        <w:t xml:space="preserve"> app </w:t>
-      </w:r>
-      <w:proofErr w:type="spellStart"/>
-      <w:r>
-        <w:t>bundle</w:t>
-      </w:r>
-      <w:proofErr w:type="spellEnd"/>
-      <w:r>
-        <w:t xml:space="preserve"> aangemaakt want dit is nodig voor de release.</w:t>
-      </w:r>
-      <w:r>
-        <w:t xml:space="preserve"> Ze vroeg dan om </w:t>
-      </w:r>
-      <w:proofErr w:type="spellStart"/>
-      <w:r>
-        <w:t>developer</w:t>
-      </w:r>
-      <w:proofErr w:type="spellEnd"/>
-      <w:r>
-        <w:t xml:space="preserve"> account aan te maken waarbij ik 1 keer 25 euro moest betalen. Daarbij was ik effe gestopt want mijn ouders waren niet thuis voor een mastercard te gebruiken.</w:t>
+      <w:proofErr w:type="gramEnd"/>
+      <w:r>
+        <w:t xml:space="preserve"> file. Dus ik moest mijn app in firebase opnieuw maken dat niet echt moeilijk was.</w:t>
+      </w:r>
+      <w:r>
+        <w:t xml:space="preserve"> Daarna heb ik een android app bundle aangemaakt want dit is nodig voor de release.</w:t>
+      </w:r>
+      <w:r>
+        <w:t xml:space="preserve"> Ze vroeg dan om developer account aan te maken waarbij ik 1 keer 25 euro moest betalen. Daarbij was ik effe gestopt want mijn ouders waren niet thuis voor een mastercard te gebruiken.</w:t>
       </w:r>
     </w:p>
     <w:p>
@@ -4666,15 +3421,7 @@
     </w:p>
     <w:p>
       <w:r>
-        <w:t xml:space="preserve">In de avond heb ik dan mijn </w:t>
-      </w:r>
-      <w:proofErr w:type="spellStart"/>
-      <w:r>
-        <w:t>developer</w:t>
-      </w:r>
-      <w:proofErr w:type="spellEnd"/>
-      <w:r>
-        <w:t xml:space="preserve"> account aangemaakt.</w:t>
+        <w:t>In de avond heb ik dan mijn developer account aangemaakt.</w:t>
       </w:r>
     </w:p>
     <w:p/>
@@ -4698,23 +3445,7 @@
         <w:t>Vandaag ben ik effe kort begonnen met het beter beveiligen van het wachtwoord om te registeren en in te loggen</w:t>
       </w:r>
       <w:r>
-        <w:t xml:space="preserve">. Hierbij vraag ik dus dat het wachtwoord een kleine letter, grote letter, geen spaties, 1 nummer en een lengte van 8 tekens heeft. Dit wordt weergegeven als een error onder de wachtwoord </w:t>
-      </w:r>
-      <w:proofErr w:type="spellStart"/>
-      <w:r>
-        <w:t>textbox</w:t>
-      </w:r>
-      <w:proofErr w:type="spellEnd"/>
-      <w:r>
-        <w:t xml:space="preserve">. Het email wordt dankzij </w:t>
-      </w:r>
-      <w:proofErr w:type="spellStart"/>
-      <w:r>
-        <w:t>firebase</w:t>
-      </w:r>
-      <w:proofErr w:type="spellEnd"/>
-      <w:r>
-        <w:t xml:space="preserve"> al gevalideerd dat het correct is, dus ik moet zelf geen error toevoegen. </w:t>
+        <w:t xml:space="preserve">. Hierbij vraag ik dus dat het wachtwoord een kleine letter, grote letter, geen spaties, 1 nummer en een lengte van 8 tekens heeft. Dit wordt weergegeven als een error onder de wachtwoord textbox. Het email wordt dankzij firebase al gevalideerd dat het correct is, dus ik moet zelf geen error toevoegen. </w:t>
       </w:r>
       <w:r>
         <w:t>Maar er wordt wel een toast bericht voor de zekerheid weergegeven vanonder als de registratie mislukt</w:t>
@@ -4725,37 +3456,21 @@
     </w:p>
     <w:p>
       <w:r>
-        <w:t xml:space="preserve">Daarna heb ik de app </w:t>
-      </w:r>
-      <w:proofErr w:type="spellStart"/>
-      <w:r>
-        <w:t>bundle</w:t>
-      </w:r>
-      <w:proofErr w:type="spellEnd"/>
-      <w:r>
-        <w:t xml:space="preserve"> </w:t>
+        <w:t xml:space="preserve">Daarna heb ik de app bundle </w:t>
       </w:r>
       <w:r>
         <w:t>geüpdatet</w:t>
       </w:r>
       <w:r>
-        <w:t xml:space="preserve"> naar de volgende versie, omdat er aanpassingen waren. Deze release heb ik dan op google </w:t>
-      </w:r>
-      <w:proofErr w:type="spellStart"/>
-      <w:r>
-        <w:t>play</w:t>
-      </w:r>
-      <w:proofErr w:type="spellEnd"/>
-      <w:r>
-        <w:t xml:space="preserve"> console geüpload, hierbij moest ik nog in de dashboard veel taken afleggen. De belangrijksten waren bijvoorbeeld een test account meegeven zodat google dit kan gebruiken om mijn app te controleren, een </w:t>
-      </w:r>
-      <w:proofErr w:type="spellStart"/>
-      <w:r>
-        <w:t>privacybeleid</w:t>
-      </w:r>
-      <w:proofErr w:type="spellEnd"/>
-      <w:r>
-        <w:t xml:space="preserve"> toevoegen hi</w:t>
+        <w:t xml:space="preserve"> naar de volgende versie, omdat er aanpassingen waren. Deze release heb ik dan op google play console geüpload, hierbij moest ik nog in </w:t>
+      </w:r>
+      <w:proofErr w:type="gramStart"/>
+      <w:r>
+        <w:t>de dashboard</w:t>
+      </w:r>
+      <w:proofErr w:type="gramEnd"/>
+      <w:r>
+        <w:t xml:space="preserve"> veel taken afleggen. De belangrijksten waren bijvoorbeeld een test account meegeven zodat google dit kan gebruiken om mijn app te controleren, een privacybeleid toevoegen hi</w:t>
       </w:r>
       <w:r>
         <w:t>er</w:t>
@@ -4807,77 +3522,13 @@
     </w:p>
     <w:p>
       <w:r>
-        <w:t xml:space="preserve">Hierbij had vooral deze </w:t>
-      </w:r>
-      <w:proofErr w:type="spellStart"/>
-      <w:r>
-        <w:t>youtube</w:t>
-      </w:r>
-      <w:proofErr w:type="spellEnd"/>
-      <w:r>
-        <w:t xml:space="preserve"> video nodig omdat ik de </w:t>
-      </w:r>
-      <w:proofErr w:type="spellStart"/>
-      <w:r>
-        <w:t>uri</w:t>
-      </w:r>
-      <w:proofErr w:type="spellEnd"/>
-      <w:r>
-        <w:t xml:space="preserve"> van de image die ik aan klik moest doorsturen naar het een fragment waar je de </w:t>
-      </w:r>
-      <w:proofErr w:type="spellStart"/>
-      <w:r>
-        <w:t>img</w:t>
-      </w:r>
-      <w:proofErr w:type="spellEnd"/>
-      <w:r>
-        <w:t xml:space="preserve"> in het groot kan bekijken. </w:t>
-      </w:r>
-      <w:r>
-        <w:t xml:space="preserve">Ik maakte toen een keer grote fout door een nieuwe </w:t>
-      </w:r>
-      <w:proofErr w:type="spellStart"/>
-      <w:r>
-        <w:t>imageDetailsFragment</w:t>
-      </w:r>
-      <w:proofErr w:type="spellEnd"/>
-      <w:r>
-        <w:t xml:space="preserve"> te openen als ik eigenlijk een </w:t>
-      </w:r>
-      <w:proofErr w:type="spellStart"/>
-      <w:r>
-        <w:t>bundle</w:t>
-      </w:r>
-      <w:proofErr w:type="spellEnd"/>
-      <w:r>
-        <w:t xml:space="preserve"> (waar de </w:t>
-      </w:r>
-      <w:proofErr w:type="spellStart"/>
-      <w:r>
-        <w:t>uri</w:t>
-      </w:r>
-      <w:proofErr w:type="spellEnd"/>
-      <w:r>
-        <w:t xml:space="preserve"> wordt opgeslagen)</w:t>
-      </w:r>
-      <w:r>
-        <w:t xml:space="preserve"> had toegevoegd aan een </w:t>
-      </w:r>
-      <w:proofErr w:type="spellStart"/>
-      <w:r>
-        <w:t>ImageDetailsFragment</w:t>
-      </w:r>
-      <w:proofErr w:type="spellEnd"/>
-      <w:r>
-        <w:t xml:space="preserve"> als </w:t>
-      </w:r>
-      <w:proofErr w:type="spellStart"/>
-      <w:r>
-        <w:t>arguments</w:t>
-      </w:r>
-      <w:proofErr w:type="spellEnd"/>
-      <w:r>
-        <w:t>. Ik navigeerde eigenlijk naar een fragment zonder argumenten die hard nodig had. Dit heb ik natuurlijk opgelost</w:t>
+        <w:t xml:space="preserve">Hierbij had vooral deze youtube video nodig omdat ik de uri van de image die ik aan klik moest doorsturen naar het een fragment waar je de img in het groot kan bekijken. </w:t>
+      </w:r>
+      <w:r>
+        <w:t>Ik maakte toen een keer grote fout door een nieuwe imageDetailsFragment te openen als ik eigenlijk een bundle (waar de uri wordt opgeslagen)</w:t>
+      </w:r>
+      <w:r>
+        <w:t xml:space="preserve"> had toegevoegd aan een ImageDetailsFragment als arguments. Ik navigeerde eigenlijk naar een fragment zonder argumenten die hard nodig had. Dit heb ik natuurlijk opgelost</w:t>
       </w:r>
       <w:r>
         <w:t xml:space="preserve"> zie onderstaande </w:t>
@@ -4891,15 +3542,7 @@
     </w:p>
     <w:p>
       <w:r>
-        <w:t xml:space="preserve">Het enige probleempje dat er nog is, is dat sommige afbeeldingen die vergroot worden </w:t>
-      </w:r>
-      <w:proofErr w:type="spellStart"/>
-      <w:r>
-        <w:t>onscherm</w:t>
-      </w:r>
-      <w:proofErr w:type="spellEnd"/>
-      <w:r>
-        <w:t xml:space="preserve"> kunnen uitzien.</w:t>
+        <w:t>Het enige probleempje dat er nog is, is dat sommige afbeeldingen die vergroot worden onscherm kunnen uitzien.</w:t>
       </w:r>
       <w:r>
         <w:t xml:space="preserve"> </w:t>
@@ -4977,15 +3620,7 @@
     </w:p>
     <w:p>
       <w:r>
-        <w:t xml:space="preserve">Vandaag heb ik een </w:t>
-      </w:r>
-      <w:proofErr w:type="spellStart"/>
-      <w:r>
-        <w:t>realtime</w:t>
-      </w:r>
-      <w:proofErr w:type="spellEnd"/>
-      <w:r>
-        <w:t xml:space="preserve"> database aangemaakt om een chat functionaliteiten toe te voegen.</w:t>
+        <w:t>Vandaag heb ik een realtime database aangemaakt om een chat functionaliteiten toe te voegen.</w:t>
       </w:r>
       <w:r>
         <w:t xml:space="preserve"> Hierbij ga ik de volgende video’s gebruiken:</w:t>
@@ -5073,13 +3708,8 @@
           <w:numId w:val="2"/>
         </w:numPr>
       </w:pPr>
-      <w:proofErr w:type="spellStart"/>
-      <w:r>
-        <w:t>Offfline</w:t>
-      </w:r>
-      <w:proofErr w:type="spellEnd"/>
-      <w:r>
-        <w:t xml:space="preserve"> functionaliteiten toevoegen?</w:t>
+      <w:r>
+        <w:t>Offfline functionaliteiten toevoegen?</w:t>
       </w:r>
     </w:p>
     <w:p>
@@ -5114,15 +3744,7 @@
     </w:p>
     <w:p>
       <w:r>
-        <w:t xml:space="preserve">Vandaag is mijn app beschikbaar op google </w:t>
-      </w:r>
-      <w:proofErr w:type="spellStart"/>
-      <w:r>
-        <w:t>play</w:t>
-      </w:r>
-      <w:proofErr w:type="spellEnd"/>
-      <w:r>
-        <w:t xml:space="preserve"> die je via deze link kan downloaden.</w:t>
+        <w:t>Vandaag is mijn app beschikbaar op google play die je via deze link kan downloaden.</w:t>
       </w:r>
     </w:p>
     <w:p>
@@ -5137,29 +3759,13 @@
     </w:p>
     <w:p>
       <w:r>
-        <w:t xml:space="preserve">Toen ik het had gedownload merkte ik dat google login niet wou werken. Dit heb ik dan onmiddellijk opgezocht en ik moest gewoon een extra SHA1 </w:t>
-      </w:r>
-      <w:proofErr w:type="spellStart"/>
-      <w:r>
-        <w:t>fingerp</w:t>
+        <w:t>Toen ik het had gedownload merkte ik dat google login niet wou werken. Dit heb ik dan onmiddellijk opgezocht en ik moest gewoon een extra SHA1 fingerp</w:t>
       </w:r>
       <w:r>
         <w:t>r</w:t>
       </w:r>
       <w:r>
-        <w:t>int</w:t>
-      </w:r>
-      <w:proofErr w:type="spellEnd"/>
-      <w:r>
-        <w:t xml:space="preserve"> van google </w:t>
-      </w:r>
-      <w:proofErr w:type="spellStart"/>
-      <w:r>
-        <w:t>play</w:t>
-      </w:r>
-      <w:proofErr w:type="spellEnd"/>
-      <w:r>
-        <w:t xml:space="preserve"> nog toevoegen aan mijn app. Dus nu werkt hij perfect.</w:t>
+        <w:t>int van google play nog toevoegen aan mijn app. Dus nu werkt hij perfect.</w:t>
       </w:r>
     </w:p>
     <w:p>
@@ -5179,15 +3785,15 @@
     </w:p>
     <w:p>
       <w:r>
-        <w:t xml:space="preserve">Ik heb dan geprobeerd om data toe te voegen aan mijn </w:t>
-      </w:r>
-      <w:proofErr w:type="spellStart"/>
-      <w:r>
-        <w:t>realtime</w:t>
-      </w:r>
-      <w:proofErr w:type="spellEnd"/>
-      <w:r>
-        <w:t xml:space="preserve"> database maar nog geen succes. Ik moest nu stoppen omdat ik een online gesprek ga hebben voor mijn stage tijdens het 2</w:t>
+        <w:t xml:space="preserve">Ik heb dan geprobeerd om data toe te voegen aan mijn realtime database maar nog geen succes. Ik moest nu stoppen omdat ik een </w:t>
+      </w:r>
+      <w:proofErr w:type="gramStart"/>
+      <w:r>
+        <w:t>online gesprek</w:t>
+      </w:r>
+      <w:proofErr w:type="gramEnd"/>
+      <w:r>
+        <w:t xml:space="preserve"> ga hebben voor mijn stage tijdens het 2</w:t>
       </w:r>
       <w:r>
         <w:rPr>
@@ -5223,48 +3829,11 @@
       </w:r>
     </w:p>
     <w:p>
-      <w:proofErr w:type="spellStart"/>
-      <w:r>
-        <w:t>Firebase</w:t>
-      </w:r>
-      <w:proofErr w:type="spellEnd"/>
-      <w:r>
-        <w:t xml:space="preserve"> </w:t>
-      </w:r>
-      <w:proofErr w:type="spellStart"/>
-      <w:r>
-        <w:t>Realtime</w:t>
-      </w:r>
-      <w:proofErr w:type="spellEnd"/>
-      <w:r>
-        <w:t xml:space="preserve"> database wou geen data toevoegen en</w:t>
-      </w:r>
-      <w:r>
-        <w:t xml:space="preserve"> ik had alles geprobeerd. Ik realiseerde toen dat </w:t>
-      </w:r>
-      <w:proofErr w:type="spellStart"/>
-      <w:r>
-        <w:t>realtime</w:t>
-      </w:r>
-      <w:proofErr w:type="spellEnd"/>
-      <w:r>
-        <w:t xml:space="preserve"> </w:t>
-      </w:r>
-      <w:proofErr w:type="spellStart"/>
-      <w:r>
-        <w:t>firebase</w:t>
-      </w:r>
-      <w:proofErr w:type="spellEnd"/>
-      <w:r>
-        <w:t xml:space="preserve"> alleen mogelijk was voor de regio van België europe-west1. Ik besloot dan naar </w:t>
-      </w:r>
-      <w:proofErr w:type="spellStart"/>
-      <w:r>
-        <w:t>firestore</w:t>
-      </w:r>
-      <w:proofErr w:type="spellEnd"/>
-      <w:r>
-        <w:t xml:space="preserve"> te gaan want daar hebben ze wel europe-west3 dat Nederland en België bevat. </w:t>
+      <w:r>
+        <w:t>Firebase Realtime database wou geen data toevoegen en</w:t>
+      </w:r>
+      <w:r>
+        <w:t xml:space="preserve"> ik had alles geprobeerd. Ik realiseerde toen dat realtime firebase alleen mogelijk was voor de regio van België europe-west1. Ik besloot dan naar firestore te gaan want daar hebben ze wel europe-west3 dat Nederland en België bevat. </w:t>
       </w:r>
       <w:r>
         <w:t>Dit heeft het probleem onmiddellijk opgelost.</w:t>
@@ -5272,15 +3841,7 @@
     </w:p>
     <w:p>
       <w:r>
-        <w:t xml:space="preserve">Nu als je inlogt zal je gebruikersgegevens op </w:t>
-      </w:r>
-      <w:proofErr w:type="spellStart"/>
-      <w:r>
-        <w:t>firestore</w:t>
-      </w:r>
-      <w:proofErr w:type="spellEnd"/>
-      <w:r>
-        <w:t xml:space="preserve"> geplaatst worden. Nu kan ik eindelijk vlot beginnen met de chat functionaliteiten.</w:t>
+        <w:t>Nu als je inlogt zal je gebruikersgegevens op firestore geplaatst worden. Nu kan ik eindelijk vlot beginnen met de chat functionaliteiten.</w:t>
       </w:r>
     </w:p>
     <w:p>
@@ -5367,31 +3928,15 @@
     </w:p>
     <w:p>
       <w:r>
-        <w:t xml:space="preserve">Vandaag probeerde ik offline support toe te voegen. Voor </w:t>
-      </w:r>
-      <w:proofErr w:type="spellStart"/>
-      <w:r>
-        <w:t>firestore</w:t>
-      </w:r>
-      <w:proofErr w:type="spellEnd"/>
-      <w:r>
-        <w:t xml:space="preserve"> was dat niet zo moeilijk want alles kon ik vinden op deze link, maar ik heb dit nog niet echt kunnen uittesten. Voor </w:t>
-      </w:r>
-      <w:proofErr w:type="spellStart"/>
-      <w:r>
-        <w:t>firebase</w:t>
-      </w:r>
-      <w:proofErr w:type="spellEnd"/>
-      <w:r>
-        <w:t xml:space="preserve"> storage lukte dit niet echt, want er was geen duidelijk documentatie. Ik wou vooral proberen om de images op </w:t>
-      </w:r>
-      <w:proofErr w:type="spellStart"/>
-      <w:r>
-        <w:t>firebase</w:t>
-      </w:r>
-      <w:proofErr w:type="spellEnd"/>
-      <w:r>
-        <w:t xml:space="preserve"> in de cache te steken, zodat de meeste recente images verschijnen op de startpagina.</w:t>
+        <w:t xml:space="preserve">Vandaag probeerde ik </w:t>
+      </w:r>
+      <w:proofErr w:type="gramStart"/>
+      <w:r>
+        <w:t>offline support</w:t>
+      </w:r>
+      <w:proofErr w:type="gramEnd"/>
+      <w:r>
+        <w:t xml:space="preserve"> toe te voegen. Voor firestore was dat niet zo moeilijk want alles kon ik vinden op deze link, maar ik heb dit nog niet echt kunnen uittesten. Voor firebase storage lukte dit niet echt, want er was geen duidelijk documentatie. Ik wou vooral proberen om de images op firebase in de cache te steken, zodat de meeste recente images verschijnen op de startpagina.</w:t>
       </w:r>
       <w:r>
         <w:t xml:space="preserve"> Mijn conclusie is eigenlijk dat het niet mogelijk is afhankelijk van het totale zoekwerk.</w:t>
@@ -5409,15 +3954,7 @@
     </w:p>
     <w:p>
       <w:r>
-        <w:t xml:space="preserve">Ik heb dan ondertussen een </w:t>
-      </w:r>
-      <w:proofErr w:type="spellStart"/>
-      <w:r>
-        <w:t>progress</w:t>
-      </w:r>
-      <w:proofErr w:type="spellEnd"/>
-      <w:r>
-        <w:t xml:space="preserve"> bar toegevoegd die zal</w:t>
+        <w:t>Ik heb dan ondertussen een progress bar toegevoegd die zal</w:t>
       </w:r>
       <w:r>
         <w:t xml:space="preserve"> </w:t>
@@ -5426,15 +3963,7 @@
         <w:t>verdwijnen als de images inladen.</w:t>
       </w:r>
       <w:r>
-        <w:t xml:space="preserve"> Dit komt ook bij de </w:t>
-      </w:r>
-      <w:proofErr w:type="spellStart"/>
-      <w:r>
-        <w:t>groepchats</w:t>
-      </w:r>
-      <w:proofErr w:type="spellEnd"/>
-      <w:r>
-        <w:t xml:space="preserve"> pagina.</w:t>
+        <w:t xml:space="preserve"> Dit komt ook bij de groepchats pagina.</w:t>
       </w:r>
     </w:p>
     <w:p/>
@@ -5455,50 +3984,10 @@
     </w:p>
     <w:p>
       <w:r>
-        <w:t xml:space="preserve">Vandaag heb ik verder gewerkt aan de chat functionaliteiten. Ik had in het begin een beetje moeilijkheden met het maken van de </w:t>
-      </w:r>
-      <w:proofErr w:type="spellStart"/>
-      <w:r>
-        <w:t>layout</w:t>
-      </w:r>
-      <w:proofErr w:type="spellEnd"/>
-      <w:r>
-        <w:t xml:space="preserve"> van de chat room en chat </w:t>
-      </w:r>
-      <w:proofErr w:type="spellStart"/>
-      <w:r>
-        <w:t>messages</w:t>
-      </w:r>
-      <w:proofErr w:type="spellEnd"/>
-      <w:r>
-        <w:t>. Hierbij heeft de</w:t>
-      </w:r>
-      <w:r>
-        <w:t xml:space="preserve">ze link geholpen want de </w:t>
-      </w:r>
-      <w:proofErr w:type="spellStart"/>
-      <w:r>
-        <w:t>youtube</w:t>
-      </w:r>
-      <w:proofErr w:type="spellEnd"/>
-      <w:r>
-        <w:t xml:space="preserve"> </w:t>
-      </w:r>
-      <w:proofErr w:type="spellStart"/>
-      <w:r>
-        <w:t>tutorials</w:t>
-      </w:r>
-      <w:proofErr w:type="spellEnd"/>
-      <w:r>
-        <w:t xml:space="preserve"> chat </w:t>
-      </w:r>
-      <w:proofErr w:type="spellStart"/>
-      <w:r>
-        <w:t>layout</w:t>
-      </w:r>
-      <w:proofErr w:type="spellEnd"/>
-      <w:r>
-        <w:t xml:space="preserve"> was zeer lelijk.</w:t>
+        <w:t>Vandaag heb ik verder gewerkt aan de chat functionaliteiten. Ik had in het begin een beetje moeilijkheden met het maken van de layout van de chat room en chat messages. Hierbij heeft de</w:t>
+      </w:r>
+      <w:r>
+        <w:t>ze link geholpen want de youtube tutorials chat layout was zeer lelijk.</w:t>
       </w:r>
     </w:p>
     <w:p>
@@ -5522,10 +4011,7 @@
         <w:pStyle w:val="Kop2"/>
       </w:pPr>
       <w:r>
-        <w:t xml:space="preserve">Week </w:t>
-      </w:r>
-      <w:r>
-        <w:t>10</w:t>
+        <w:t>Week 10</w:t>
       </w:r>
     </w:p>
     <w:p>
@@ -5544,13 +4030,8 @@
           <w:numId w:val="2"/>
         </w:numPr>
       </w:pPr>
-      <w:proofErr w:type="spellStart"/>
-      <w:r>
-        <w:t>Offfline</w:t>
-      </w:r>
-      <w:proofErr w:type="spellEnd"/>
-      <w:r>
-        <w:t xml:space="preserve"> functionaliteiten toevoegen?</w:t>
+      <w:r>
+        <w:t>Offfline functionaliteiten toevoegen?</w:t>
       </w:r>
     </w:p>
     <w:p>
@@ -5562,10 +4043,7 @@
         </w:numPr>
       </w:pPr>
       <w:r>
-        <w:t>Afwerken</w:t>
-      </w:r>
-      <w:r>
-        <w:t xml:space="preserve"> Mijn groepen pagina en chat functionaliteiten.</w:t>
+        <w:t>Afwerken Mijn groepen pagina en chat functionaliteiten.</w:t>
       </w:r>
     </w:p>
     <w:p/>
@@ -5586,15 +4064,7 @@
     </w:p>
     <w:p>
       <w:r>
-        <w:t xml:space="preserve">Vandaag heb ik de groepen chatrooms toegevoegd in een </w:t>
-      </w:r>
-      <w:proofErr w:type="spellStart"/>
-      <w:r>
-        <w:t>gridview</w:t>
-      </w:r>
-      <w:proofErr w:type="spellEnd"/>
-      <w:r>
-        <w:t xml:space="preserve"> waarmee de chat</w:t>
+        <w:t>Vandaag heb ik de groepen chatrooms toegevoegd in een gridview waarmee de chat</w:t>
       </w:r>
       <w:r>
         <w:t>s</w:t>
@@ -5603,53 +4073,19 @@
         <w:t xml:space="preserve"> zullen geopend worden. </w:t>
       </w:r>
       <w:r>
-        <w:t xml:space="preserve">Hierbij kreeg ik serieuze error die me compleet had verward en op stackoverflow had gesteld. Ik had dus per ongeluk de </w:t>
-      </w:r>
-      <w:proofErr w:type="spellStart"/>
-      <w:r>
-        <w:t>gridview</w:t>
-      </w:r>
-      <w:proofErr w:type="spellEnd"/>
-      <w:r>
-        <w:t xml:space="preserve"> het verkeerde ID gegeven waardoor er een </w:t>
-      </w:r>
-      <w:proofErr w:type="spellStart"/>
-      <w:r>
-        <w:t>NullPointerException</w:t>
-      </w:r>
-      <w:proofErr w:type="spellEnd"/>
-      <w:r>
-        <w:t xml:space="preserve"> ontstond, maar ik dacht dat de adapter </w:t>
-      </w:r>
-      <w:proofErr w:type="spellStart"/>
-      <w:r>
-        <w:t>null</w:t>
-      </w:r>
-      <w:proofErr w:type="spellEnd"/>
-      <w:r>
-        <w:t xml:space="preserve"> werd omdat het me niet lukte om de gegevens van </w:t>
-      </w:r>
-      <w:proofErr w:type="spellStart"/>
-      <w:r>
-        <w:t>firestore</w:t>
-      </w:r>
-      <w:proofErr w:type="spellEnd"/>
-      <w:r>
-        <w:t xml:space="preserve"> te halen.</w:t>
-      </w:r>
-      <w:r>
-        <w:t xml:space="preserve"> In de </w:t>
-      </w:r>
-      <w:proofErr w:type="spellStart"/>
-      <w:r>
-        <w:t>comments</w:t>
-      </w:r>
-      <w:proofErr w:type="spellEnd"/>
-      <w:r>
-        <w:t xml:space="preserve"> en antwoord wordt alles nog beter uitgelegd.</w:t>
-      </w:r>
-    </w:p>
-    <w:p>
+        <w:t>Hierbij kreeg ik serieuze error die me compleet had verward en op stackoverflow had gesteld. Ik had dus per ongeluk de gridview het verkeerde ID gegeven waardoor er een NullPointerException ontstond, maar ik dacht dat de adapter null werd omdat het me niet lukte om de gegevens van firestore te halen.</w:t>
+      </w:r>
+      <w:r>
+        <w:t xml:space="preserve"> In de comments en antwoord wordt alles nog beter uitgelegd.</w:t>
+      </w:r>
+    </w:p>
+    <w:p>
+      <w:pPr>
+        <w:rPr>
+          <w:color w:val="0563C1" w:themeColor="hyperlink"/>
+          <w:u w:val="single"/>
+        </w:rPr>
+      </w:pPr>
       <w:hyperlink r:id="rId70" w:history="1">
         <w:r>
           <w:rPr>
@@ -5660,7 +4096,111 @@
       </w:hyperlink>
     </w:p>
     <w:p/>
+    <w:p>
+      <w:pPr>
+        <w:rPr>
+          <w:b/>
+          <w:bCs/>
+        </w:rPr>
+      </w:pPr>
+      <w:r>
+        <w:rPr>
+          <w:b/>
+          <w:bCs/>
+        </w:rPr>
+        <w:t>08/12/2021:</w:t>
+      </w:r>
+    </w:p>
+    <w:p>
+      <w:r>
+        <w:t xml:space="preserve">Vandaag heb ik ervoor kunnen zorgen dat er pagina wordt geopend als je op een chatroom klikt. Dit duurde langer dan verwacht, want blijkbaar is het niet zo makkelijk om button click events te activeren in een gridview. Om dit op te lossen moest ik een </w:t>
+      </w:r>
+      <w:r>
+        <w:t>V</w:t>
+      </w:r>
+      <w:r>
+        <w:t>iewHolder</w:t>
+      </w:r>
+      <w:r>
+        <w:t xml:space="preserve"> static</w:t>
+      </w:r>
+      <w:r>
+        <w:t xml:space="preserve"> class toevoegen in de </w:t>
+      </w:r>
+      <w:r>
+        <w:t xml:space="preserve">Adapter class. Deze klasse zorgt ervoor dat de rendering van items in de gridview sneller is. In deze viewholder wordt de button opgeslagen die je kan oproepen en waarop je een onclickevent kan </w:t>
+      </w:r>
+      <w:r>
+        <w:t>activeren</w:t>
+      </w:r>
+      <w:r>
+        <w:t>.</w:t>
+      </w:r>
+      <w:r>
+        <w:t xml:space="preserve"> Dan open het de chat pagina corresponderend met de naam van de button. De naam van de button is eigenlijk de naam van de chat.</w:t>
+      </w:r>
+      <w:r>
+        <w:t xml:space="preserve"> Hierbij gebruik ik Bundle om de naam van de button door te geven naar de corresponderende chatroom pagina</w:t>
+      </w:r>
+      <w:r>
+        <w:t>.</w:t>
+      </w:r>
+    </w:p>
+    <w:p>
+      <w:hyperlink r:id="rId71" w:history="1">
+        <w:r>
+          <w:rPr>
+            <w:rStyle w:val="Hyperlink"/>
+          </w:rPr>
+          <w:t>http://www.migapro.com/click-events-listview-gridview/</w:t>
+        </w:r>
+      </w:hyperlink>
+    </w:p>
+    <w:p>
+      <w:r>
+        <w:rPr>
+          <w:noProof/>
+        </w:rPr>
+        <w:drawing>
+          <wp:inline distT="0" distB="0" distL="0" distR="0" wp14:anchorId="09A63AD4" wp14:editId="32975E67">
+            <wp:extent cx="5760720" cy="3706495"/>
+            <wp:effectExtent l="0" t="0" r="0" b="8255"/>
+            <wp:docPr id="32" name="Afbeelding 32"/>
+            <wp:cNvGraphicFramePr>
+              <a:graphicFrameLocks xmlns:a="http://schemas.openxmlformats.org/drawingml/2006/main" noChangeAspect="1"/>
+            </wp:cNvGraphicFramePr>
+            <a:graphic xmlns:a="http://schemas.openxmlformats.org/drawingml/2006/main">
+              <a:graphicData uri="http://schemas.openxmlformats.org/drawingml/2006/picture">
+                <pic:pic xmlns:pic="http://schemas.openxmlformats.org/drawingml/2006/picture">
+                  <pic:nvPicPr>
+                    <pic:cNvPr id="1" name=""/>
+                    <pic:cNvPicPr/>
+                  </pic:nvPicPr>
+                  <pic:blipFill>
+                    <a:blip r:embed="rId72"/>
+                    <a:stretch>
+                      <a:fillRect/>
+                    </a:stretch>
+                  </pic:blipFill>
+                  <pic:spPr>
+                    <a:xfrm>
+                      <a:off x="0" y="0"/>
+                      <a:ext cx="5760720" cy="3706495"/>
+                    </a:xfrm>
+                    <a:prstGeom prst="rect">
+                      <a:avLst/>
+                    </a:prstGeom>
+                  </pic:spPr>
+                </pic:pic>
+              </a:graphicData>
+            </a:graphic>
+          </wp:inline>
+        </w:drawing>
+      </w:r>
+    </w:p>
     <w:p/>
+    <w:p/>
+    <w:p/>
     <w:p>
       <w:pPr>
         <w:rPr>
@@ -5677,8 +4217,13 @@
       </w:r>
     </w:p>
     <w:p>
-      <w:r>
-        <w:t>zie mail</w:t>
+      <w:proofErr w:type="gramStart"/>
+      <w:r>
+        <w:t>zie</w:t>
+      </w:r>
+      <w:proofErr w:type="gramEnd"/>
+      <w:r>
+        <w:t xml:space="preserve"> mail</w:t>
       </w:r>
     </w:p>
     <w:p>
@@ -5686,7 +4231,6 @@
         <w:rPr>
           <w:noProof/>
         </w:rPr>
-        <w:lastRenderedPageBreak/>
         <w:drawing>
           <wp:inline distT="0" distB="0" distL="0" distR="0" wp14:anchorId="5C8CC2ED" wp14:editId="1F1ED4B8">
             <wp:extent cx="5657850" cy="1143000"/>
@@ -5703,7 +4247,7 @@
                     <pic:cNvPicPr/>
                   </pic:nvPicPr>
                   <pic:blipFill>
-                    <a:blip r:embed="rId71"/>
+                    <a:blip r:embed="rId73"/>
                     <a:stretch>
                       <a:fillRect/>
                     </a:stretch>

</xml_diff>

<commit_message>
Succesfully able to add messages to firebase but not display them!
</commit_message>
<xml_diff>
--- a/Logboek_Dries_Fierens.docx
+++ b/Logboek_Dries_Fierens.docx
@@ -46,7 +46,39 @@
         <w:t>applicatie</w:t>
       </w:r>
       <w:r>
-        <w:t xml:space="preserve"> die je kan maken en welke technologieën je kan gebruiken. Ik heb voor native gekozen want dat past het best bij mijn aftakking “Software developer” sinds het java inhoudt. De anderen zijn hybrid en progressive web app dat dus meer te maken hebben met web &amp; mobile dus vooral HTML &amp; CSS. We moesten dan ook nog kiezen voor een project idee, waarbij ik koos voor een scanner + </w:t>
+        <w:t xml:space="preserve"> die je kan maken en welke technologieën je kan gebruiken. Ik heb voor native gekozen want dat past het best bij mijn aftakking “Software </w:t>
+      </w:r>
+      <w:proofErr w:type="spellStart"/>
+      <w:r>
+        <w:t>developer</w:t>
+      </w:r>
+      <w:proofErr w:type="spellEnd"/>
+      <w:r>
+        <w:t xml:space="preserve">” sinds het </w:t>
+      </w:r>
+      <w:proofErr w:type="spellStart"/>
+      <w:r>
+        <w:t>java</w:t>
+      </w:r>
+      <w:proofErr w:type="spellEnd"/>
+      <w:r>
+        <w:t xml:space="preserve"> inhoudt. De anderen zijn </w:t>
+      </w:r>
+      <w:proofErr w:type="spellStart"/>
+      <w:r>
+        <w:t>hybrid</w:t>
+      </w:r>
+      <w:proofErr w:type="spellEnd"/>
+      <w:r>
+        <w:t xml:space="preserve"> en </w:t>
+      </w:r>
+      <w:proofErr w:type="spellStart"/>
+      <w:r>
+        <w:t>progressive</w:t>
+      </w:r>
+      <w:proofErr w:type="spellEnd"/>
+      <w:r>
+        <w:t xml:space="preserve"> web app dat dus meer te maken hebben met web &amp; mobile dus vooral HTML &amp; CSS. We moesten dan ook nog kiezen voor een project idee, waarbij ik koos voor een scanner + </w:t>
       </w:r>
       <w:proofErr w:type="gramStart"/>
       <w:r>
@@ -89,20 +121,92 @@
         <w:t xml:space="preserve"> </w:t>
       </w:r>
       <w:r>
-        <w:t>Als back-end koos ik Firebase en als technologie koos ik in java te werken om een android app te maken in plaats van een IOS app.</w:t>
-      </w:r>
-      <w:r>
-        <w:t xml:space="preserve"> Want ik heb een huawei.</w:t>
-      </w:r>
-    </w:p>
-    <w:p>
-      <w:r>
-        <w:t>Ik heb dit allemaal grondiger beschreven in mijn “app idee”.pdf. Dit staat ondertussen op de repository die we moesten maken.</w:t>
-      </w:r>
-    </w:p>
-    <w:p>
-      <w:r>
-        <w:t>Om af te sluiten had ik al ondertussen een goede naam gevonden gebaseerd op de applicatie genaamd Scannable. Ik heb dus besloten om mijn applicatie Notable te noemen.</w:t>
+        <w:t xml:space="preserve">Als </w:t>
+      </w:r>
+      <w:proofErr w:type="spellStart"/>
+      <w:r>
+        <w:t>back-end</w:t>
+      </w:r>
+      <w:proofErr w:type="spellEnd"/>
+      <w:r>
+        <w:t xml:space="preserve"> koos ik </w:t>
+      </w:r>
+      <w:proofErr w:type="spellStart"/>
+      <w:r>
+        <w:t>Firebase</w:t>
+      </w:r>
+      <w:proofErr w:type="spellEnd"/>
+      <w:r>
+        <w:t xml:space="preserve"> en als technologie koos ik in </w:t>
+      </w:r>
+      <w:proofErr w:type="spellStart"/>
+      <w:r>
+        <w:t>java</w:t>
+      </w:r>
+      <w:proofErr w:type="spellEnd"/>
+      <w:r>
+        <w:t xml:space="preserve"> te werken om een </w:t>
+      </w:r>
+      <w:proofErr w:type="spellStart"/>
+      <w:r>
+        <w:t>android</w:t>
+      </w:r>
+      <w:proofErr w:type="spellEnd"/>
+      <w:r>
+        <w:t xml:space="preserve"> app te maken in plaats van een IOS app.</w:t>
+      </w:r>
+      <w:r>
+        <w:t xml:space="preserve"> Want ik heb een </w:t>
+      </w:r>
+      <w:proofErr w:type="spellStart"/>
+      <w:r>
+        <w:t>huawei</w:t>
+      </w:r>
+      <w:proofErr w:type="spellEnd"/>
+      <w:r>
+        <w:t>.</w:t>
+      </w:r>
+    </w:p>
+    <w:p>
+      <w:r>
+        <w:t xml:space="preserve">Ik heb dit allemaal grondiger beschreven in mijn “app </w:t>
+      </w:r>
+      <w:proofErr w:type="spellStart"/>
+      <w:r>
+        <w:t>idee”.pdf</w:t>
+      </w:r>
+      <w:proofErr w:type="spellEnd"/>
+      <w:r>
+        <w:t xml:space="preserve">. Dit staat ondertussen op de </w:t>
+      </w:r>
+      <w:proofErr w:type="spellStart"/>
+      <w:r>
+        <w:t>repository</w:t>
+      </w:r>
+      <w:proofErr w:type="spellEnd"/>
+      <w:r>
+        <w:t xml:space="preserve"> die we moesten maken.</w:t>
+      </w:r>
+    </w:p>
+    <w:p>
+      <w:r>
+        <w:t xml:space="preserve">Om af te sluiten had ik al ondertussen een goede naam gevonden gebaseerd op de applicatie genaamd </w:t>
+      </w:r>
+      <w:proofErr w:type="spellStart"/>
+      <w:r>
+        <w:t>Scannable</w:t>
+      </w:r>
+      <w:proofErr w:type="spellEnd"/>
+      <w:r>
+        <w:t xml:space="preserve">. Ik heb dus besloten om mijn applicatie </w:t>
+      </w:r>
+      <w:proofErr w:type="spellStart"/>
+      <w:r>
+        <w:t>Notable</w:t>
+      </w:r>
+      <w:proofErr w:type="spellEnd"/>
+      <w:r>
+        <w:t xml:space="preserve"> te noemen.</w:t>
       </w:r>
     </w:p>
     <w:p>
@@ -144,7 +248,15 @@
     </w:p>
     <w:p>
       <w:r>
-        <w:t xml:space="preserve">Daarna moest ik gewoon begin aan een UI/UX design voor mijn applicatie, waarbij nog niet veel had gedaan omdat les niet meer lang duurde. Ik moest toen ook tegelijkertijd zoeken naar tutorials dus </w:t>
+        <w:t xml:space="preserve">Daarna moest ik gewoon begin aan een UI/UX design voor mijn applicatie, waarbij nog niet veel had gedaan omdat les niet meer lang duurde. Ik moest toen ook tegelijkertijd zoeken naar </w:t>
+      </w:r>
+      <w:proofErr w:type="spellStart"/>
+      <w:r>
+        <w:t>tutorials</w:t>
+      </w:r>
+      <w:proofErr w:type="spellEnd"/>
+      <w:r>
+        <w:t xml:space="preserve"> dus </w:t>
       </w:r>
       <w:r>
         <w:t>duurde dat ook kort.</w:t>
@@ -167,13 +279,26 @@
     </w:p>
     <w:p>
       <w:r>
-        <w:t xml:space="preserve">Vandaag in de namiddag begonnen we met de co-working les waarbij we dus informatie kunnen delen met medeleerlingen. Al was het de eerste les dus kwam daar niet veel van. Ik begon gewoon verder aan mijn </w:t>
-      </w:r>
+        <w:t>Vandaag in de namiddag begonnen we met de co-</w:t>
+      </w:r>
+      <w:proofErr w:type="spellStart"/>
+      <w:r>
+        <w:t>working</w:t>
+      </w:r>
+      <w:proofErr w:type="spellEnd"/>
+      <w:r>
+        <w:t xml:space="preserve"> les waarbij we dus informatie kunnen delen met medeleerlingen. Al was het de eerste les dus kwam daar niet veel van. Ik begon gewoon verder aan mijn </w:t>
+      </w:r>
+      <w:proofErr w:type="spellStart"/>
       <w:r>
         <w:t>F</w:t>
       </w:r>
       <w:r>
-        <w:t>igma design.</w:t>
+        <w:t>igma</w:t>
+      </w:r>
+      <w:proofErr w:type="spellEnd"/>
+      <w:r>
+        <w:t xml:space="preserve"> design.</w:t>
       </w:r>
     </w:p>
     <w:p>
@@ -232,7 +357,23 @@
     </w:p>
     <w:p>
       <w:r>
-        <w:t>Vandaag heb ik verder gewerkt aan mijn Figma design en het ging redelijk vlot vooruit. Ik wou absoluut dat het vandaag af was zodat ik morgen kan werken aan een ander vak. Tijdens het maken van het design heb ik vooral ook zitten op zoeken dat sommige concepten wel haalbaar zijn om te programmeren. Dit is allemaal wel mogelijk, maar zal wel een challenge zijn zoals de opmerkingen plaatsen</w:t>
+        <w:t xml:space="preserve">Vandaag heb ik verder gewerkt aan mijn </w:t>
+      </w:r>
+      <w:proofErr w:type="spellStart"/>
+      <w:r>
+        <w:t>Figma</w:t>
+      </w:r>
+      <w:proofErr w:type="spellEnd"/>
+      <w:r>
+        <w:t xml:space="preserve"> design en het ging redelijk vlot vooruit. Ik wou absoluut dat het vandaag af was zodat ik morgen kan werken aan een ander vak. Tijdens het maken van het design heb ik vooral ook zitten op zoeken dat sommige concepten wel haalbaar zijn om te programmeren. Dit is allemaal wel mogelijk, maar zal wel een </w:t>
+      </w:r>
+      <w:proofErr w:type="spellStart"/>
+      <w:r>
+        <w:t>challenge</w:t>
+      </w:r>
+      <w:proofErr w:type="spellEnd"/>
+      <w:r>
+        <w:t xml:space="preserve"> zijn zoals de opmerkingen plaatsen</w:t>
       </w:r>
       <w:r>
         <w:t>. M</w:t>
@@ -344,11 +485,48 @@
     </w:p>
     <w:p>
       <w:r>
-        <w:t xml:space="preserve">Vandaag werd mijn figma prototype gecontroleerd waarbij ik moest opnieuw uitleggen wat mijn app doet door middel van accurate presentatie. Ik legde dit vrij duidelijk uit en alles ging goed vooruit. Meneer Blancquaert heeft me dan ook nog een library genaamd “Material design” aangeraden om mijn applicatie te ontwerpen. </w:t>
-      </w:r>
-      <w:r>
-        <w:t>Blijkbaar Google gebruikt deze library</w:t>
-      </w:r>
+        <w:t xml:space="preserve">Vandaag werd mijn </w:t>
+      </w:r>
+      <w:proofErr w:type="spellStart"/>
+      <w:r>
+        <w:t>figma</w:t>
+      </w:r>
+      <w:proofErr w:type="spellEnd"/>
+      <w:r>
+        <w:t xml:space="preserve"> prototype gecontroleerd waarbij ik moest opnieuw uitleggen wat mijn app doet door middel van accurate presentatie. Ik legde dit vrij duidelijk uit en alles ging goed vooruit. Meneer </w:t>
+      </w:r>
+      <w:proofErr w:type="spellStart"/>
+      <w:r>
+        <w:t>Blancquaert</w:t>
+      </w:r>
+      <w:proofErr w:type="spellEnd"/>
+      <w:r>
+        <w:t xml:space="preserve"> heeft me dan ook nog een </w:t>
+      </w:r>
+      <w:proofErr w:type="spellStart"/>
+      <w:r>
+        <w:t>library</w:t>
+      </w:r>
+      <w:proofErr w:type="spellEnd"/>
+      <w:r>
+        <w:t xml:space="preserve"> genaamd “</w:t>
+      </w:r>
+      <w:proofErr w:type="spellStart"/>
+      <w:r>
+        <w:t>Material</w:t>
+      </w:r>
+      <w:proofErr w:type="spellEnd"/>
+      <w:r>
+        <w:t xml:space="preserve"> design” aangeraden om mijn applicatie te ontwerpen. </w:t>
+      </w:r>
+      <w:r>
+        <w:t xml:space="preserve">Blijkbaar Google gebruikt deze </w:t>
+      </w:r>
+      <w:proofErr w:type="spellStart"/>
+      <w:r>
+        <w:t>library</w:t>
+      </w:r>
+      <w:proofErr w:type="spellEnd"/>
       <w:r>
         <w:t xml:space="preserve"> om hun apps te maken.</w:t>
       </w:r>
@@ -386,7 +564,23 @@
         <w:t xml:space="preserve">kunt maken </w:t>
       </w:r>
       <w:r>
-        <w:t>om je app te testen. Als je developer modus in de settings van je gsm</w:t>
+        <w:t xml:space="preserve">om je app te testen. Als je </w:t>
+      </w:r>
+      <w:proofErr w:type="spellStart"/>
+      <w:r>
+        <w:t>developer</w:t>
+      </w:r>
+      <w:proofErr w:type="spellEnd"/>
+      <w:r>
+        <w:t xml:space="preserve"> modus in de </w:t>
+      </w:r>
+      <w:proofErr w:type="spellStart"/>
+      <w:r>
+        <w:t>settings</w:t>
+      </w:r>
+      <w:proofErr w:type="spellEnd"/>
+      <w:r>
+        <w:t xml:space="preserve"> van je gsm</w:t>
       </w:r>
       <w:r>
         <w:t xml:space="preserve"> aanzet, kan je je gsm verbinden met de pc en dus je applicatie daarop testen.</w:t>
@@ -412,7 +606,15 @@
       </w:r>
       <w:proofErr w:type="gramEnd"/>
       <w:r>
-        <w:t xml:space="preserve"> toegevoegd op Firebase. Volgens de presentatie die we kregen van een medestudent.</w:t>
+        <w:t xml:space="preserve"> toegevoegd op </w:t>
+      </w:r>
+      <w:proofErr w:type="spellStart"/>
+      <w:r>
+        <w:t>Firebase</w:t>
+      </w:r>
+      <w:proofErr w:type="spellEnd"/>
+      <w:r>
+        <w:t>. Volgens de presentatie die we kregen van een medestudent.</w:t>
       </w:r>
     </w:p>
     <w:p>
@@ -463,7 +665,23 @@
         <w:t>mijn</w:t>
       </w:r>
       <w:r>
-        <w:t xml:space="preserve"> figma design delen met meneer Blancquaert, toen hij vroeg dat mijn design klaar was</w:t>
+        <w:t xml:space="preserve"> </w:t>
+      </w:r>
+      <w:proofErr w:type="spellStart"/>
+      <w:r>
+        <w:t>figma</w:t>
+      </w:r>
+      <w:proofErr w:type="spellEnd"/>
+      <w:r>
+        <w:t xml:space="preserve"> design delen met meneer </w:t>
+      </w:r>
+      <w:proofErr w:type="spellStart"/>
+      <w:r>
+        <w:t>Blancquaert</w:t>
+      </w:r>
+      <w:proofErr w:type="spellEnd"/>
+      <w:r>
+        <w:t>, toen hij vroeg dat mijn design klaar was</w:t>
       </w:r>
       <w:r>
         <w:t xml:space="preserve"> of niet</w:t>
@@ -485,11 +703,27 @@
       </w:r>
       <w:proofErr w:type="gramEnd"/>
       <w:r>
-        <w:t xml:space="preserve"> beter kon gebruiken om mijn app te designen zoals hoe je </w:t>
+        <w:t xml:space="preserve"> beter kon gebruiken om mijn app te </w:t>
+      </w:r>
+      <w:proofErr w:type="spellStart"/>
+      <w:r>
+        <w:t>designen</w:t>
+      </w:r>
+      <w:proofErr w:type="spellEnd"/>
+      <w:r>
+        <w:t xml:space="preserve"> zoals hoe je </w:t>
       </w:r>
       <w:r>
         <w:lastRenderedPageBreak/>
-        <w:t>attributen kunt aanpassen (bv. color)</w:t>
+        <w:t xml:space="preserve">attributen kunt aanpassen (bv. </w:t>
+      </w:r>
+      <w:proofErr w:type="spellStart"/>
+      <w:r>
+        <w:t>color</w:t>
+      </w:r>
+      <w:proofErr w:type="spellEnd"/>
+      <w:r>
+        <w:t>)</w:t>
       </w:r>
       <w:r>
         <w:t xml:space="preserve">. </w:t>
@@ -500,7 +734,15 @@
       </w:r>
       <w:proofErr w:type="gramEnd"/>
       <w:r>
-        <w:t xml:space="preserve"> is zeer gelijkaardig als bijvoorbeeld Webstorm, maar bij het design van een mobile app is het zeer </w:t>
+        <w:t xml:space="preserve"> is zeer gelijkaardig als bijvoorbeeld </w:t>
+      </w:r>
+      <w:proofErr w:type="spellStart"/>
+      <w:r>
+        <w:t>Webstorm</w:t>
+      </w:r>
+      <w:proofErr w:type="spellEnd"/>
+      <w:r>
+        <w:t xml:space="preserve">, maar bij het design van een mobile app is het zeer </w:t>
       </w:r>
       <w:r>
         <w:t>verschillend</w:t>
@@ -509,7 +751,15 @@
         <w:t>.</w:t>
       </w:r>
       <w:r>
-        <w:t xml:space="preserve"> Bij Webstorm kan je je website </w:t>
+        <w:t xml:space="preserve"> Bij </w:t>
+      </w:r>
+      <w:proofErr w:type="spellStart"/>
+      <w:r>
+        <w:t>Webstorm</w:t>
+      </w:r>
+      <w:proofErr w:type="spellEnd"/>
+      <w:r>
+        <w:t xml:space="preserve"> kan je je website </w:t>
       </w:r>
       <w:r>
         <w:t>bekijken</w:t>
@@ -541,7 +791,15 @@
         <w:t>.</w:t>
       </w:r>
       <w:r>
-        <w:t xml:space="preserve"> Als ik de Jetbrains applicaties vergelijk met Visual studio 2019, </w:t>
+        <w:t xml:space="preserve"> Als ik de </w:t>
+      </w:r>
+      <w:proofErr w:type="spellStart"/>
+      <w:r>
+        <w:t>Jetbrains</w:t>
+      </w:r>
+      <w:proofErr w:type="spellEnd"/>
+      <w:r>
+        <w:t xml:space="preserve"> applicaties vergelijk met Visual studio 2019, </w:t>
       </w:r>
       <w:r>
         <w:t>heb ik er altijd moeite mee om de lay</w:t>
@@ -621,7 +879,15 @@
     </w:p>
     <w:p>
       <w:r>
-        <w:t xml:space="preserve">Ik heb dan ondertussen de tutorial van Material design gevolgd in plaats van die van </w:t>
+        <w:t xml:space="preserve">Ik heb dan ondertussen de tutorial van </w:t>
+      </w:r>
+      <w:proofErr w:type="spellStart"/>
+      <w:r>
+        <w:t>Material</w:t>
+      </w:r>
+      <w:proofErr w:type="spellEnd"/>
+      <w:r>
+        <w:t xml:space="preserve"> design gevolgd in plaats van die van </w:t>
       </w:r>
       <w:proofErr w:type="gramStart"/>
       <w:r>
@@ -672,10 +938,34 @@
     </w:p>
     <w:p>
       <w:r>
-        <w:t>Vandaag heb ik de usertests afgelegd met Louis D’hondt en Jasper Wauters. Dit ging heel gemakkelijk en duurde niet lang. Ik had niet echt serieuze opmerkingen, behalve dat ik geen persoonlijke info pagina gemaakt had.</w:t>
-      </w:r>
-      <w:r>
-        <w:t xml:space="preserve"> Daarna heb ik onmiddellijk die opmerkingen van mijn figma design verbetert en op mijn repository gezet.</w:t>
+        <w:t xml:space="preserve">Vandaag heb ik de usertests afgelegd met Louis </w:t>
+      </w:r>
+      <w:proofErr w:type="spellStart"/>
+      <w:r>
+        <w:t>D’hondt</w:t>
+      </w:r>
+      <w:proofErr w:type="spellEnd"/>
+      <w:r>
+        <w:t xml:space="preserve"> en Jasper Wauters. Dit ging heel gemakkelijk en duurde niet lang. Ik had niet echt serieuze opmerkingen, behalve dat ik geen persoonlijke info pagina gemaakt had.</w:t>
+      </w:r>
+      <w:r>
+        <w:t xml:space="preserve"> Daarna heb ik onmiddellijk die opmerkingen van mijn </w:t>
+      </w:r>
+      <w:proofErr w:type="spellStart"/>
+      <w:r>
+        <w:t>figma</w:t>
+      </w:r>
+      <w:proofErr w:type="spellEnd"/>
+      <w:r>
+        <w:t xml:space="preserve"> design verbetert en op mijn </w:t>
+      </w:r>
+      <w:proofErr w:type="spellStart"/>
+      <w:r>
+        <w:t>repository</w:t>
+      </w:r>
+      <w:proofErr w:type="spellEnd"/>
+      <w:r>
+        <w:t xml:space="preserve"> gezet.</w:t>
       </w:r>
     </w:p>
     <w:p/>
@@ -698,7 +988,47 @@
     </w:p>
     <w:p>
       <w:r>
-        <w:t xml:space="preserve">Vandaag begon ik eindelijk met Material Design. Ik besloot mijn oude app te verwijderen en te vervangen met een empty activity zodat ik echt van scratch begin. Zo kan ik alles beter begrijpen. Ik had dan ontdekt dat android studio al automatisch Material Design van Google had toegevoegd bij de dependencies, dus eigenlijk ben ik </w:t>
+        <w:t xml:space="preserve">Vandaag begon ik eindelijk met </w:t>
+      </w:r>
+      <w:proofErr w:type="spellStart"/>
+      <w:r>
+        <w:t>Material</w:t>
+      </w:r>
+      <w:proofErr w:type="spellEnd"/>
+      <w:r>
+        <w:t xml:space="preserve"> Design. Ik besloot mijn oude app te verwijderen en te vervangen met een empty </w:t>
+      </w:r>
+      <w:proofErr w:type="spellStart"/>
+      <w:r>
+        <w:t>activity</w:t>
+      </w:r>
+      <w:proofErr w:type="spellEnd"/>
+      <w:r>
+        <w:t xml:space="preserve"> zodat ik echt van scratch begin. Zo kan ik alles beter begrijpen. Ik had dan ontdekt dat </w:t>
+      </w:r>
+      <w:proofErr w:type="spellStart"/>
+      <w:r>
+        <w:t>android</w:t>
+      </w:r>
+      <w:proofErr w:type="spellEnd"/>
+      <w:r>
+        <w:t xml:space="preserve"> studio al automatisch </w:t>
+      </w:r>
+      <w:proofErr w:type="spellStart"/>
+      <w:r>
+        <w:t>Material</w:t>
+      </w:r>
+      <w:proofErr w:type="spellEnd"/>
+      <w:r>
+        <w:t xml:space="preserve"> Design van Google had toegevoegd bij de </w:t>
+      </w:r>
+      <w:proofErr w:type="spellStart"/>
+      <w:r>
+        <w:t>dependencies</w:t>
+      </w:r>
+      <w:proofErr w:type="spellEnd"/>
+      <w:r>
+        <w:t xml:space="preserve">, dus eigenlijk ben ik </w:t>
       </w:r>
       <w:r>
         <w:t>onmiddellijk</w:t>
@@ -842,18 +1172,50 @@
     </w:p>
     <w:p>
       <w:r>
-        <w:t>Eerst had ik geprobeerd om gewoon een heel nieuw project te maken die bestond uit een login activity. Deze activity heb ik dan gewoon aangepast naar mijn wens. Maar dit wou ook niet echt werken, want blijkbaar is het best dat je van een main</w:t>
+        <w:t xml:space="preserve">Eerst had ik geprobeerd om gewoon een heel nieuw project te maken die bestond uit een login </w:t>
+      </w:r>
+      <w:proofErr w:type="spellStart"/>
+      <w:r>
+        <w:t>activity</w:t>
+      </w:r>
+      <w:proofErr w:type="spellEnd"/>
+      <w:r>
+        <w:t xml:space="preserve">. Deze </w:t>
+      </w:r>
+      <w:proofErr w:type="spellStart"/>
+      <w:r>
+        <w:t>activity</w:t>
+      </w:r>
+      <w:proofErr w:type="spellEnd"/>
+      <w:r>
+        <w:t xml:space="preserve"> heb ik dan gewoon aangepast naar mijn wens. Maar dit wou ook niet echt werken, want blijkbaar is het best dat je van een </w:t>
+      </w:r>
+      <w:proofErr w:type="spellStart"/>
+      <w:r>
+        <w:t>main</w:t>
       </w:r>
       <w:r>
         <w:t>_</w:t>
       </w:r>
       <w:r>
-        <w:t>activity start en dan de login page daarmee opent.</w:t>
-      </w:r>
-    </w:p>
-    <w:p>
-      <w:r>
-        <w:t>Ik ben dan gewoon terug begonnen aan het oude project en heb dan de error op stack overflow gezocht en daar had ik de oplossing gevonden. Ik moest gewoon mijn “device” zijn data wipen en dan kon het opnieuw installeren want mijn oude projecten stond er nog op.</w:t>
+        <w:t>activity</w:t>
+      </w:r>
+      <w:proofErr w:type="spellEnd"/>
+      <w:r>
+        <w:t xml:space="preserve"> start en dan de login page daarmee opent.</w:t>
+      </w:r>
+    </w:p>
+    <w:p>
+      <w:r>
+        <w:t xml:space="preserve">Ik ben dan gewoon terug begonnen aan het oude project en heb dan de error op stack overflow gezocht en daar had ik de oplossing gevonden. Ik moest gewoon mijn “device” zijn data </w:t>
+      </w:r>
+      <w:proofErr w:type="spellStart"/>
+      <w:r>
+        <w:t>wipen</w:t>
+      </w:r>
+      <w:proofErr w:type="spellEnd"/>
+      <w:r>
+        <w:t xml:space="preserve"> en dan kon het opnieuw installeren want mijn oude projecten stond er nog op.</w:t>
       </w:r>
     </w:p>
     <w:p>
@@ -897,7 +1259,23 @@
         <w:t>Vandaag wou de wifi niet werken op de campus dus had ik niet veel vooruitgang geboekt.</w:t>
       </w:r>
       <w:r>
-        <w:t xml:space="preserve"> Ik was ook gisteren vergeten om de registratie pagina te committen, dus da had ik alleszins gedaan door met mijn hotspot van mijn gsm te verbinden en de 4G aan te zetten.</w:t>
+        <w:t xml:space="preserve"> Ik was ook gisteren vergeten om de registratie pagina te </w:t>
+      </w:r>
+      <w:proofErr w:type="spellStart"/>
+      <w:r>
+        <w:t>committen</w:t>
+      </w:r>
+      <w:proofErr w:type="spellEnd"/>
+      <w:r>
+        <w:t xml:space="preserve">, dus da had ik alleszins gedaan door met mijn </w:t>
+      </w:r>
+      <w:proofErr w:type="spellStart"/>
+      <w:r>
+        <w:t>hotspot</w:t>
+      </w:r>
+      <w:proofErr w:type="spellEnd"/>
+      <w:r>
+        <w:t xml:space="preserve"> van mijn gsm te verbinden en de 4G aan te zetten.</w:t>
       </w:r>
     </w:p>
     <w:p>
@@ -929,11 +1307,21 @@
         <w:t>Vandaag wou de wifi op school nog steeds niet zo goed werken</w:t>
       </w:r>
       <w:r>
-        <w:t xml:space="preserve">, maar dankzij de wifi hotspot heb ik toch nog de navigatie van login naar registratie kunnen </w:t>
-      </w:r>
+        <w:t xml:space="preserve">, maar dankzij de wifi </w:t>
+      </w:r>
+      <w:proofErr w:type="spellStart"/>
+      <w:r>
+        <w:t>hotspot</w:t>
+      </w:r>
+      <w:proofErr w:type="spellEnd"/>
+      <w:r>
+        <w:t xml:space="preserve"> heb ik toch nog de navigatie van login naar registratie kunnen </w:t>
+      </w:r>
+      <w:proofErr w:type="spellStart"/>
       <w:r>
         <w:t>commiten</w:t>
       </w:r>
+      <w:proofErr w:type="spellEnd"/>
       <w:r>
         <w:t>.</w:t>
       </w:r>
@@ -943,7 +1331,15 @@
     </w:p>
     <w:p>
       <w:r>
-        <w:t>De wifi wou uiteindelijk werken dus kon eindelijk heel vlot vooruitgaan. Ik heb daarbij de navigatie tussen de login en registratie kunnen afwerken. Daarna heb ik ook de startpagina bijna afgewerkt, maar de bottom bar wou niet helemaal meewerken dus dat laat ik voor later.</w:t>
+        <w:t xml:space="preserve">De wifi wou uiteindelijk werken dus kon eindelijk heel vlot vooruitgaan. Ik heb daarbij de navigatie tussen de login en registratie kunnen afwerken. Daarna heb ik ook de startpagina bijna afgewerkt, maar de </w:t>
+      </w:r>
+      <w:proofErr w:type="spellStart"/>
+      <w:r>
+        <w:t>bottom</w:t>
+      </w:r>
+      <w:proofErr w:type="spellEnd"/>
+      <w:r>
+        <w:t xml:space="preserve"> bar wou niet helemaal meewerken dus dat laat ik voor later.</w:t>
       </w:r>
     </w:p>
     <w:p/>
@@ -964,7 +1360,31 @@
     </w:p>
     <w:p>
       <w:r>
-        <w:t>Vandaag heb ik de bodem navigatie afgewerkt waarbij je dan naar je groepen kunt gaan oftewel naar je notities die je hebt gefotografeerd. Dit was eerste wel een challenge zoals de active pagina weergegeven of de juiste eventlistener gebruiken om te kunnen navigeren. Maar deze links hebben daarbij geholpen:</w:t>
+        <w:t xml:space="preserve">Vandaag heb ik de bodem navigatie afgewerkt waarbij je dan naar je groepen kunt gaan oftewel naar je notities die je hebt gefotografeerd. Dit was eerste wel een </w:t>
+      </w:r>
+      <w:proofErr w:type="spellStart"/>
+      <w:r>
+        <w:t>challenge</w:t>
+      </w:r>
+      <w:proofErr w:type="spellEnd"/>
+      <w:r>
+        <w:t xml:space="preserve"> zoals de </w:t>
+      </w:r>
+      <w:proofErr w:type="spellStart"/>
+      <w:r>
+        <w:t>active</w:t>
+      </w:r>
+      <w:proofErr w:type="spellEnd"/>
+      <w:r>
+        <w:t xml:space="preserve"> pagina weergegeven of de juiste </w:t>
+      </w:r>
+      <w:proofErr w:type="spellStart"/>
+      <w:r>
+        <w:t>eventlistener</w:t>
+      </w:r>
+      <w:proofErr w:type="spellEnd"/>
+      <w:r>
+        <w:t xml:space="preserve"> gebruiken om te kunnen navigeren. Maar deze links hebben daarbij geholpen:</w:t>
       </w:r>
     </w:p>
     <w:p>
@@ -1010,13 +1430,29 @@
     </w:p>
     <w:p>
       <w:r>
-        <w:t>Ik heb dan ook nog voor gezorgd dat mijn firebase account verbonden is met</w:t>
+        <w:t xml:space="preserve">Ik heb dan ook nog voor gezorgd dat mijn </w:t>
+      </w:r>
+      <w:proofErr w:type="spellStart"/>
+      <w:r>
+        <w:t>firebase</w:t>
+      </w:r>
+      <w:proofErr w:type="spellEnd"/>
+      <w:r>
+        <w:t xml:space="preserve"> account verbonden is met</w:t>
       </w:r>
       <w:r>
         <w:t xml:space="preserve"> mijn</w:t>
       </w:r>
       <w:r>
-        <w:t xml:space="preserve"> android studio app.</w:t>
+        <w:t xml:space="preserve"> </w:t>
+      </w:r>
+      <w:proofErr w:type="spellStart"/>
+      <w:r>
+        <w:t>android</w:t>
+      </w:r>
+      <w:proofErr w:type="spellEnd"/>
+      <w:r>
+        <w:t xml:space="preserve"> studio app.</w:t>
       </w:r>
     </w:p>
     <w:p>
@@ -1173,8 +1609,13 @@
           <w:numId w:val="1"/>
         </w:numPr>
       </w:pPr>
-      <w:r>
-        <w:t>Firebase implementeren</w:t>
+      <w:proofErr w:type="spellStart"/>
+      <w:r>
+        <w:t>Firebase</w:t>
+      </w:r>
+      <w:proofErr w:type="spellEnd"/>
+      <w:r>
+        <w:t xml:space="preserve"> implementeren</w:t>
       </w:r>
     </w:p>
     <w:p>
@@ -1186,8 +1627,13 @@
         </w:numPr>
       </w:pPr>
       <w:r>
-        <w:t>Login en registratie mogelijk maken via firebase</w:t>
-      </w:r>
+        <w:t xml:space="preserve">Login en registratie mogelijk maken via </w:t>
+      </w:r>
+      <w:proofErr w:type="spellStart"/>
+      <w:r>
+        <w:t>firebase</w:t>
+      </w:r>
+      <w:proofErr w:type="spellEnd"/>
     </w:p>
     <w:p>
       <w:pPr>
@@ -1198,7 +1644,11 @@
         </w:numPr>
       </w:pPr>
       <w:r>
-        <w:t>Camera functionaliteit bekijken voor andr</w:t>
+        <w:t xml:space="preserve">Camera functionaliteit bekijken voor </w:t>
+      </w:r>
+      <w:proofErr w:type="spellStart"/>
+      <w:r>
+        <w:t>andr</w:t>
       </w:r>
       <w:r>
         <w:t>oi</w:t>
@@ -1206,6 +1656,7 @@
       <w:r>
         <w:t>d</w:t>
       </w:r>
+      <w:proofErr w:type="spellEnd"/>
     </w:p>
     <w:p/>
     <w:p>
@@ -1225,10 +1676,66 @@
     </w:p>
     <w:p>
       <w:r>
-        <w:t>Hier kan je ondertussen zien dat mijn app verbonden is met Firebase. Nu vragen ze voor google sign-in om een sha-1 fingerprint toe te voegen.</w:t>
-      </w:r>
-      <w:r>
-        <w:t xml:space="preserve"> Ik wou dan google play signing pakken om het te genereren ipv self-signing, maar ik moet dan 25 euro eerst betalen voor een </w:t>
+        <w:t xml:space="preserve">Hier kan je ondertussen zien dat mijn app verbonden is met </w:t>
+      </w:r>
+      <w:proofErr w:type="spellStart"/>
+      <w:r>
+        <w:t>Firebase</w:t>
+      </w:r>
+      <w:proofErr w:type="spellEnd"/>
+      <w:r>
+        <w:t xml:space="preserve">. Nu vragen ze voor google </w:t>
+      </w:r>
+      <w:proofErr w:type="spellStart"/>
+      <w:r>
+        <w:t>sign</w:t>
+      </w:r>
+      <w:proofErr w:type="spellEnd"/>
+      <w:r>
+        <w:t xml:space="preserve">-in om een sha-1 </w:t>
+      </w:r>
+      <w:proofErr w:type="spellStart"/>
+      <w:r>
+        <w:t>fingerprint</w:t>
+      </w:r>
+      <w:proofErr w:type="spellEnd"/>
+      <w:r>
+        <w:t xml:space="preserve"> toe te voegen.</w:t>
+      </w:r>
+      <w:r>
+        <w:t xml:space="preserve"> Ik wou dan google </w:t>
+      </w:r>
+      <w:proofErr w:type="spellStart"/>
+      <w:r>
+        <w:t>play</w:t>
+      </w:r>
+      <w:proofErr w:type="spellEnd"/>
+      <w:r>
+        <w:t xml:space="preserve"> </w:t>
+      </w:r>
+      <w:proofErr w:type="spellStart"/>
+      <w:r>
+        <w:t>signing</w:t>
+      </w:r>
+      <w:proofErr w:type="spellEnd"/>
+      <w:r>
+        <w:t xml:space="preserve"> pakken om het te genereren </w:t>
+      </w:r>
+      <w:proofErr w:type="spellStart"/>
+      <w:r>
+        <w:t>ipv</w:t>
+      </w:r>
+      <w:proofErr w:type="spellEnd"/>
+      <w:r>
+        <w:t xml:space="preserve"> </w:t>
+      </w:r>
+      <w:proofErr w:type="spellStart"/>
+      <w:r>
+        <w:t>self-signing</w:t>
+      </w:r>
+      <w:proofErr w:type="spellEnd"/>
+      <w:r>
+        <w:t xml:space="preserve">, maar ik moet dan 25 euro eerst betalen voor een </w:t>
       </w:r>
       <w:r>
         <w:t>ontwikkelaar</w:t>
@@ -1299,14 +1806,75 @@
       <w:r>
         <w:t>Als ik wat meer naar onderging bij de “</w:t>
       </w:r>
-      <w:r>
-        <w:t>Authenticating Your Client</w:t>
-      </w:r>
-      <w:r>
-        <w:t>” pagina (zie link) kan je ook via de terminal van android studio een command invoeren om de sha-1 fingerprint te krijgen. Hierbij moest je “gradle sigingReport” invoeren en dan ctrl + enter invoeren!!</w:t>
-      </w:r>
-      <w:r>
-        <w:t xml:space="preserve"> Deze heb ik dan toegevoegd aan Firebase.</w:t>
+      <w:proofErr w:type="spellStart"/>
+      <w:r>
+        <w:t>Authenticating</w:t>
+      </w:r>
+      <w:proofErr w:type="spellEnd"/>
+      <w:r>
+        <w:t xml:space="preserve"> </w:t>
+      </w:r>
+      <w:proofErr w:type="spellStart"/>
+      <w:r>
+        <w:t>Your</w:t>
+      </w:r>
+      <w:proofErr w:type="spellEnd"/>
+      <w:r>
+        <w:t xml:space="preserve"> Client</w:t>
+      </w:r>
+      <w:r>
+        <w:t xml:space="preserve">” pagina (zie link) kan je ook via de terminal van </w:t>
+      </w:r>
+      <w:proofErr w:type="spellStart"/>
+      <w:r>
+        <w:t>android</w:t>
+      </w:r>
+      <w:proofErr w:type="spellEnd"/>
+      <w:r>
+        <w:t xml:space="preserve"> studio een </w:t>
+      </w:r>
+      <w:proofErr w:type="spellStart"/>
+      <w:r>
+        <w:t>command</w:t>
+      </w:r>
+      <w:proofErr w:type="spellEnd"/>
+      <w:r>
+        <w:t xml:space="preserve"> invoeren om de sha-1 </w:t>
+      </w:r>
+      <w:proofErr w:type="spellStart"/>
+      <w:r>
+        <w:t>fingerprint</w:t>
+      </w:r>
+      <w:proofErr w:type="spellEnd"/>
+      <w:r>
+        <w:t xml:space="preserve"> te krijgen. Hierbij moest je “</w:t>
+      </w:r>
+      <w:proofErr w:type="spellStart"/>
+      <w:r>
+        <w:t>gradle</w:t>
+      </w:r>
+      <w:proofErr w:type="spellEnd"/>
+      <w:r>
+        <w:t xml:space="preserve"> </w:t>
+      </w:r>
+      <w:proofErr w:type="spellStart"/>
+      <w:r>
+        <w:t>sigingReport</w:t>
+      </w:r>
+      <w:proofErr w:type="spellEnd"/>
+      <w:r>
+        <w:t>” invoeren en dan ctrl + enter invoeren!!</w:t>
+      </w:r>
+      <w:r>
+        <w:t xml:space="preserve"> Deze heb ik dan toegevoegd aan </w:t>
+      </w:r>
+      <w:proofErr w:type="spellStart"/>
+      <w:r>
+        <w:t>Firebase</w:t>
+      </w:r>
+      <w:proofErr w:type="spellEnd"/>
+      <w:r>
+        <w:t>.</w:t>
       </w:r>
     </w:p>
     <w:p>
@@ -1354,7 +1922,15 @@
     </w:p>
     <w:p>
       <w:r>
-        <w:t>Daarna moest ik een Oauth 2.0 client ID toevoegen voor het inloggen. Hierbij moest ik een hele configuratie begaan.</w:t>
+        <w:t xml:space="preserve">Daarna moest ik een </w:t>
+      </w:r>
+      <w:proofErr w:type="spellStart"/>
+      <w:r>
+        <w:t>Oauth</w:t>
+      </w:r>
+      <w:proofErr w:type="spellEnd"/>
+      <w:r>
+        <w:t xml:space="preserve"> 2.0 client ID toevoegen voor het inloggen. Hierbij moest ik een hele configuratie begaan.</w:t>
       </w:r>
       <w:r>
         <w:t xml:space="preserve"> Ik heb hierbij het meest niet ingevuld zoals een privacy policy, enzoverder.</w:t>
@@ -1535,7 +2111,31 @@
     </w:p>
     <w:p>
       <w:r>
-        <w:t xml:space="preserve">Vandaag had ik tijdens les (in de morgen van 8u15-11u15) verder gewerkt aan de back-end van mijn app. Ik was gisteren bezig met google sign-in, maar ik besloot om eerst normale email/password authentication toe te voegen. Dit ging vrij vlot vooruit maar toen ik de button klikt sloot de app af, dus dat moet ik nog oplossen. </w:t>
+        <w:t xml:space="preserve">Vandaag had ik tijdens les (in de morgen van 8u15-11u15) verder gewerkt aan de </w:t>
+      </w:r>
+      <w:proofErr w:type="spellStart"/>
+      <w:r>
+        <w:t>back-end</w:t>
+      </w:r>
+      <w:proofErr w:type="spellEnd"/>
+      <w:r>
+        <w:t xml:space="preserve"> van mijn app. Ik was gisteren bezig met google </w:t>
+      </w:r>
+      <w:proofErr w:type="spellStart"/>
+      <w:r>
+        <w:t>sign</w:t>
+      </w:r>
+      <w:proofErr w:type="spellEnd"/>
+      <w:r>
+        <w:t xml:space="preserve">-in, maar ik besloot om eerst normale email/password </w:t>
+      </w:r>
+      <w:proofErr w:type="spellStart"/>
+      <w:r>
+        <w:t>authentication</w:t>
+      </w:r>
+      <w:proofErr w:type="spellEnd"/>
+      <w:r>
+        <w:t xml:space="preserve"> toe te voegen. Dit ging vrij vlot vooruit maar toen ik de button klikt sloot de app af, dus dat moet ik nog oplossen. </w:t>
       </w:r>
       <w:r>
         <w:t>Er werd</w:t>
@@ -1589,10 +2189,26 @@
       </w:r>
       <w:proofErr w:type="gramEnd"/>
       <w:r>
-        <w:t xml:space="preserve"> geen wifi had. Ik dacht eerst dat dit normaal was, maar begon toen twijfels te krijgen. Ik had dan eerst de info op stackoverflow pagina proberen gebruiken, maar dat was niet juist. Uiteindelijk gewoon mijn gsm hotspot 4G gebruiken werkte wel.</w:t>
-      </w:r>
-      <w:r>
-        <w:t xml:space="preserve"> Mijn app crasht dan nog steeds bij registratie maar ik kon wel inloggen door een test account aan te maken op Firebase. Dus mijn code werkte, maar toen ik zag dat ik niet gekeken had naar de error van die verscheen na de crash en dat maakte alles duidelijk</w:t>
+        <w:t xml:space="preserve"> geen wifi had. Ik dacht eerst dat dit normaal was, maar begon toen twijfels te krijgen. Ik had dan eerst de info op stackoverflow pagina proberen gebruiken, maar dat was niet juist. Uiteindelijk gewoon mijn gsm </w:t>
+      </w:r>
+      <w:proofErr w:type="spellStart"/>
+      <w:r>
+        <w:t>hotspot</w:t>
+      </w:r>
+      <w:proofErr w:type="spellEnd"/>
+      <w:r>
+        <w:t xml:space="preserve"> 4G gebruiken werkte wel.</w:t>
+      </w:r>
+      <w:r>
+        <w:t xml:space="preserve"> Mijn app crasht dan nog steeds bij registratie maar ik kon wel inloggen door een test account aan te maken op </w:t>
+      </w:r>
+      <w:proofErr w:type="spellStart"/>
+      <w:r>
+        <w:t>Firebase</w:t>
+      </w:r>
+      <w:proofErr w:type="spellEnd"/>
+      <w:r>
+        <w:t>. Dus mijn code werkte, maar toen ik zag dat ik niet gekeken had naar de error van die verscheen na de crash en dat maakte alles duidelijk</w:t>
       </w:r>
       <w:r>
         <w:t xml:space="preserve"> voor mij</w:t>
@@ -1754,72 +2370,161 @@
           <w:rFonts w:eastAsia="Times New Roman" w:cstheme="minorHAnsi"/>
           <w:lang w:eastAsia="nl-BE"/>
         </w:rPr>
-        <w:t xml:space="preserve">Vandaag heb ik geprobeerd om google sign-in te laten werken. Dit ging zeer goed, maar het enige probleem is dat de </w:t>
-      </w:r>
-      <w:proofErr w:type="gramStart"/>
+        <w:t xml:space="preserve">Vandaag heb ik geprobeerd om google </w:t>
+      </w:r>
+      <w:proofErr w:type="spellStart"/>
       <w:r>
         <w:rPr>
           <w:rFonts w:eastAsia="Times New Roman" w:cstheme="minorHAnsi"/>
           <w:lang w:eastAsia="nl-BE"/>
         </w:rPr>
-        <w:t>google account</w:t>
-      </w:r>
-      <w:proofErr w:type="gramEnd"/>
+        <w:t>sign</w:t>
+      </w:r>
+      <w:proofErr w:type="spellEnd"/>
       <w:r>
         <w:rPr>
           <w:rFonts w:eastAsia="Times New Roman" w:cstheme="minorHAnsi"/>
           <w:lang w:eastAsia="nl-BE"/>
         </w:rPr>
-        <w:t xml:space="preserve"> niet wordt toegevoegd aan Firebase en het wil daarna niet naar de volgende pagina gaan als ik de google sign</w:t>
-      </w:r>
+        <w:t xml:space="preserve">-in te laten werken. Dit ging zeer goed, maar het enige probleem is dat de </w:t>
+      </w:r>
+      <w:proofErr w:type="gramStart"/>
       <w:r>
         <w:rPr>
           <w:rFonts w:eastAsia="Times New Roman" w:cstheme="minorHAnsi"/>
           <w:lang w:eastAsia="nl-BE"/>
         </w:rPr>
-        <w:t>-</w:t>
-      </w:r>
+        <w:t>google account</w:t>
+      </w:r>
+      <w:proofErr w:type="gramEnd"/>
       <w:r>
         <w:rPr>
           <w:rFonts w:eastAsia="Times New Roman" w:cstheme="minorHAnsi"/>
           <w:lang w:eastAsia="nl-BE"/>
         </w:rPr>
-        <w:t>in button klik. Het sign-in scherm verschijnt wel en hebben geen errors, maar daarna gebeurt er niks. Ik heb de methode toegevoegd die iemand van teams zei dat die het probleem</w:t>
-      </w:r>
+        <w:t xml:space="preserve"> niet wordt toegevoegd aan </w:t>
+      </w:r>
+      <w:proofErr w:type="spellStart"/>
       <w:r>
         <w:rPr>
           <w:rFonts w:eastAsia="Times New Roman" w:cstheme="minorHAnsi"/>
           <w:lang w:eastAsia="nl-BE"/>
         </w:rPr>
-        <w:t xml:space="preserve"> zou</w:t>
-      </w:r>
+        <w:t>Firebase</w:t>
+      </w:r>
+      <w:proofErr w:type="spellEnd"/>
       <w:r>
         <w:rPr>
           <w:rFonts w:eastAsia="Times New Roman" w:cstheme="minorHAnsi"/>
           <w:lang w:eastAsia="nl-BE"/>
         </w:rPr>
-        <w:t xml:space="preserve"> oplos</w:t>
-      </w:r>
+        <w:t xml:space="preserve"> en het wil daarna niet naar de volgende pagina gaan als ik de google </w:t>
+      </w:r>
+      <w:proofErr w:type="spellStart"/>
       <w:r>
         <w:rPr>
           <w:rFonts w:eastAsia="Times New Roman" w:cstheme="minorHAnsi"/>
           <w:lang w:eastAsia="nl-BE"/>
         </w:rPr>
-        <w:t>sen</w:t>
-      </w:r>
+        <w:t>sign</w:t>
+      </w:r>
+      <w:proofErr w:type="spellEnd"/>
       <w:r>
         <w:rPr>
           <w:rFonts w:eastAsia="Times New Roman" w:cstheme="minorHAnsi"/>
           <w:lang w:eastAsia="nl-BE"/>
         </w:rPr>
-        <w:t xml:space="preserve"> maar er zal nog ergens een fout zitten.</w:t>
+        <w:t>-</w:t>
       </w:r>
       <w:r>
         <w:rPr>
           <w:rFonts w:eastAsia="Times New Roman" w:cstheme="minorHAnsi"/>
           <w:lang w:eastAsia="nl-BE"/>
         </w:rPr>
-        <w:t xml:space="preserve"> 1 van de methodes was wel deprecated, maar die had </w:t>
+        <w:t xml:space="preserve">in button klik. Het </w:t>
+      </w:r>
+      <w:proofErr w:type="spellStart"/>
+      <w:r>
+        <w:rPr>
+          <w:rFonts w:eastAsia="Times New Roman" w:cstheme="minorHAnsi"/>
+          <w:lang w:eastAsia="nl-BE"/>
+        </w:rPr>
+        <w:t>sign</w:t>
+      </w:r>
+      <w:proofErr w:type="spellEnd"/>
+      <w:r>
+        <w:rPr>
+          <w:rFonts w:eastAsia="Times New Roman" w:cstheme="minorHAnsi"/>
+          <w:lang w:eastAsia="nl-BE"/>
+        </w:rPr>
+        <w:t xml:space="preserve">-in scherm verschijnt wel en hebben geen </w:t>
+      </w:r>
+      <w:proofErr w:type="spellStart"/>
+      <w:r>
+        <w:rPr>
+          <w:rFonts w:eastAsia="Times New Roman" w:cstheme="minorHAnsi"/>
+          <w:lang w:eastAsia="nl-BE"/>
+        </w:rPr>
+        <w:t>errors</w:t>
+      </w:r>
+      <w:proofErr w:type="spellEnd"/>
+      <w:r>
+        <w:rPr>
+          <w:rFonts w:eastAsia="Times New Roman" w:cstheme="minorHAnsi"/>
+          <w:lang w:eastAsia="nl-BE"/>
+        </w:rPr>
+        <w:t>, maar daarna gebeurt er niks. Ik heb de methode toegevoegd die iemand van teams zei dat die het probleem</w:t>
+      </w:r>
+      <w:r>
+        <w:rPr>
+          <w:rFonts w:eastAsia="Times New Roman" w:cstheme="minorHAnsi"/>
+          <w:lang w:eastAsia="nl-BE"/>
+        </w:rPr>
+        <w:t xml:space="preserve"> zou</w:t>
+      </w:r>
+      <w:r>
+        <w:rPr>
+          <w:rFonts w:eastAsia="Times New Roman" w:cstheme="minorHAnsi"/>
+          <w:lang w:eastAsia="nl-BE"/>
+        </w:rPr>
+        <w:t xml:space="preserve"> oplos</w:t>
+      </w:r>
+      <w:r>
+        <w:rPr>
+          <w:rFonts w:eastAsia="Times New Roman" w:cstheme="minorHAnsi"/>
+          <w:lang w:eastAsia="nl-BE"/>
+        </w:rPr>
+        <w:t>sen</w:t>
+      </w:r>
+      <w:r>
+        <w:rPr>
+          <w:rFonts w:eastAsia="Times New Roman" w:cstheme="minorHAnsi"/>
+          <w:lang w:eastAsia="nl-BE"/>
+        </w:rPr>
+        <w:t xml:space="preserve"> maar er zal nog ergens een fout zitten.</w:t>
+      </w:r>
+      <w:r>
+        <w:rPr>
+          <w:rFonts w:eastAsia="Times New Roman" w:cstheme="minorHAnsi"/>
+          <w:lang w:eastAsia="nl-BE"/>
+        </w:rPr>
+        <w:t xml:space="preserve"> 1 van de methodes was wel </w:t>
+      </w:r>
+      <w:proofErr w:type="spellStart"/>
+      <w:r>
+        <w:rPr>
+          <w:rFonts w:eastAsia="Times New Roman" w:cstheme="minorHAnsi"/>
+          <w:lang w:eastAsia="nl-BE"/>
+        </w:rPr>
+        <w:t>deprecated</w:t>
+      </w:r>
+      <w:proofErr w:type="spellEnd"/>
+      <w:r>
+        <w:rPr>
+          <w:rFonts w:eastAsia="Times New Roman" w:cstheme="minorHAnsi"/>
+          <w:lang w:eastAsia="nl-BE"/>
+        </w:rPr>
+        <w:t xml:space="preserve">, maar die had </w:t>
       </w:r>
       <w:r>
         <w:rPr>
@@ -1984,23 +2689,169 @@
           <w:rFonts w:eastAsia="Times New Roman" w:cstheme="minorHAnsi"/>
           <w:lang w:eastAsia="nl-BE"/>
         </w:rPr>
-        <w:t>Vandaag is het me gelukt om de google sign-in te laten werken. Ik had veel opzoek werk gedaan op google maar kon niks duidelijk vinden. Ik had mijn code ook gedebugd, maar geen duidelijk error werd weergegeven. Uiteindelijk besloot ik opzoek te gaan naar een tutorial die recent was in 2021. Deze tutorial heb ik dan gebruikt om mijn project strict te controleren en toen realiseerde ik dat de SHA-1 niet op de juiste plaats stond. Ik had op google cloud een Oauth 2.0 client id moeten aanmaken toen ik de android studio firebase tutorial volgde, maar dat bleek dus helemaal fout te zijn, want de echte client_id was eigenlijk al klaar in een google-</w:t>
-      </w:r>
-      <w:proofErr w:type="gramStart"/>
+        <w:t xml:space="preserve">Vandaag is het me gelukt om de google </w:t>
+      </w:r>
+      <w:proofErr w:type="spellStart"/>
       <w:r>
         <w:rPr>
           <w:rFonts w:eastAsia="Times New Roman" w:cstheme="minorHAnsi"/>
           <w:lang w:eastAsia="nl-BE"/>
         </w:rPr>
-        <w:t>services.json</w:t>
-      </w:r>
-      <w:proofErr w:type="gramEnd"/>
+        <w:t>sign</w:t>
+      </w:r>
+      <w:proofErr w:type="spellEnd"/>
       <w:r>
         <w:rPr>
           <w:rFonts w:eastAsia="Times New Roman" w:cstheme="minorHAnsi"/>
           <w:lang w:eastAsia="nl-BE"/>
         </w:rPr>
-        <w:t xml:space="preserve"> file. Ik moest toen ook mijn SHA-1 fingerprint verwijderen bij de onderstaande afbeelding, maar dat mocht daar eigenlijk blijven staan.</w:t>
+        <w:t xml:space="preserve">-in te laten werken. Ik had veel opzoek werk gedaan op google maar kon niks duidelijk vinden. Ik had mijn code ook gedebugd, maar geen duidelijk error werd weergegeven. Uiteindelijk besloot ik opzoek te gaan naar een tutorial die recent was in 2021. Deze tutorial heb ik dan gebruikt om mijn project </w:t>
+      </w:r>
+      <w:proofErr w:type="spellStart"/>
+      <w:r>
+        <w:rPr>
+          <w:rFonts w:eastAsia="Times New Roman" w:cstheme="minorHAnsi"/>
+          <w:lang w:eastAsia="nl-BE"/>
+        </w:rPr>
+        <w:t>strict</w:t>
+      </w:r>
+      <w:proofErr w:type="spellEnd"/>
+      <w:r>
+        <w:rPr>
+          <w:rFonts w:eastAsia="Times New Roman" w:cstheme="minorHAnsi"/>
+          <w:lang w:eastAsia="nl-BE"/>
+        </w:rPr>
+        <w:t xml:space="preserve"> te controleren en toen realiseerde ik dat de SHA-1 niet op de juiste plaats stond. Ik had op google </w:t>
+      </w:r>
+      <w:proofErr w:type="spellStart"/>
+      <w:r>
+        <w:rPr>
+          <w:rFonts w:eastAsia="Times New Roman" w:cstheme="minorHAnsi"/>
+          <w:lang w:eastAsia="nl-BE"/>
+        </w:rPr>
+        <w:t>cloud</w:t>
+      </w:r>
+      <w:proofErr w:type="spellEnd"/>
+      <w:r>
+        <w:rPr>
+          <w:rFonts w:eastAsia="Times New Roman" w:cstheme="minorHAnsi"/>
+          <w:lang w:eastAsia="nl-BE"/>
+        </w:rPr>
+        <w:t xml:space="preserve"> een </w:t>
+      </w:r>
+      <w:proofErr w:type="spellStart"/>
+      <w:r>
+        <w:rPr>
+          <w:rFonts w:eastAsia="Times New Roman" w:cstheme="minorHAnsi"/>
+          <w:lang w:eastAsia="nl-BE"/>
+        </w:rPr>
+        <w:t>Oauth</w:t>
+      </w:r>
+      <w:proofErr w:type="spellEnd"/>
+      <w:r>
+        <w:rPr>
+          <w:rFonts w:eastAsia="Times New Roman" w:cstheme="minorHAnsi"/>
+          <w:lang w:eastAsia="nl-BE"/>
+        </w:rPr>
+        <w:t xml:space="preserve"> 2.0 client </w:t>
+      </w:r>
+      <w:proofErr w:type="spellStart"/>
+      <w:r>
+        <w:rPr>
+          <w:rFonts w:eastAsia="Times New Roman" w:cstheme="minorHAnsi"/>
+          <w:lang w:eastAsia="nl-BE"/>
+        </w:rPr>
+        <w:t>id</w:t>
+      </w:r>
+      <w:proofErr w:type="spellEnd"/>
+      <w:r>
+        <w:rPr>
+          <w:rFonts w:eastAsia="Times New Roman" w:cstheme="minorHAnsi"/>
+          <w:lang w:eastAsia="nl-BE"/>
+        </w:rPr>
+        <w:t xml:space="preserve"> moeten aanmaken toen ik de </w:t>
+      </w:r>
+      <w:proofErr w:type="spellStart"/>
+      <w:r>
+        <w:rPr>
+          <w:rFonts w:eastAsia="Times New Roman" w:cstheme="minorHAnsi"/>
+          <w:lang w:eastAsia="nl-BE"/>
+        </w:rPr>
+        <w:t>android</w:t>
+      </w:r>
+      <w:proofErr w:type="spellEnd"/>
+      <w:r>
+        <w:rPr>
+          <w:rFonts w:eastAsia="Times New Roman" w:cstheme="minorHAnsi"/>
+          <w:lang w:eastAsia="nl-BE"/>
+        </w:rPr>
+        <w:t xml:space="preserve"> studio </w:t>
+      </w:r>
+      <w:proofErr w:type="spellStart"/>
+      <w:r>
+        <w:rPr>
+          <w:rFonts w:eastAsia="Times New Roman" w:cstheme="minorHAnsi"/>
+          <w:lang w:eastAsia="nl-BE"/>
+        </w:rPr>
+        <w:t>firebase</w:t>
+      </w:r>
+      <w:proofErr w:type="spellEnd"/>
+      <w:r>
+        <w:rPr>
+          <w:rFonts w:eastAsia="Times New Roman" w:cstheme="minorHAnsi"/>
+          <w:lang w:eastAsia="nl-BE"/>
+        </w:rPr>
+        <w:t xml:space="preserve"> tutorial volgde, maar dat bleek dus helemaal fout te zijn, want de echte </w:t>
+      </w:r>
+      <w:proofErr w:type="spellStart"/>
+      <w:r>
+        <w:rPr>
+          <w:rFonts w:eastAsia="Times New Roman" w:cstheme="minorHAnsi"/>
+          <w:lang w:eastAsia="nl-BE"/>
+        </w:rPr>
+        <w:t>client_id</w:t>
+      </w:r>
+      <w:proofErr w:type="spellEnd"/>
+      <w:r>
+        <w:rPr>
+          <w:rFonts w:eastAsia="Times New Roman" w:cstheme="minorHAnsi"/>
+          <w:lang w:eastAsia="nl-BE"/>
+        </w:rPr>
+        <w:t xml:space="preserve"> was eigenlijk al klaar in een google-</w:t>
+      </w:r>
+      <w:proofErr w:type="spellStart"/>
+      <w:proofErr w:type="gramStart"/>
+      <w:r>
+        <w:rPr>
+          <w:rFonts w:eastAsia="Times New Roman" w:cstheme="minorHAnsi"/>
+          <w:lang w:eastAsia="nl-BE"/>
+        </w:rPr>
+        <w:t>services.json</w:t>
+      </w:r>
+      <w:proofErr w:type="spellEnd"/>
+      <w:proofErr w:type="gramEnd"/>
+      <w:r>
+        <w:rPr>
+          <w:rFonts w:eastAsia="Times New Roman" w:cstheme="minorHAnsi"/>
+          <w:lang w:eastAsia="nl-BE"/>
+        </w:rPr>
+        <w:t xml:space="preserve"> file. Ik moest toen ook mijn SHA-1 </w:t>
+      </w:r>
+      <w:proofErr w:type="spellStart"/>
+      <w:r>
+        <w:rPr>
+          <w:rFonts w:eastAsia="Times New Roman" w:cstheme="minorHAnsi"/>
+          <w:lang w:eastAsia="nl-BE"/>
+        </w:rPr>
+        <w:t>fingerprint</w:t>
+      </w:r>
+      <w:proofErr w:type="spellEnd"/>
+      <w:r>
+        <w:rPr>
+          <w:rFonts w:eastAsia="Times New Roman" w:cstheme="minorHAnsi"/>
+          <w:lang w:eastAsia="nl-BE"/>
+        </w:rPr>
+        <w:t xml:space="preserve"> verwijderen bij de onderstaande afbeelding, maar dat mocht daar eigenlijk blijven staan.</w:t>
       </w:r>
       <w:r>
         <w:rPr>
@@ -2235,8 +3086,13 @@
           <w:numId w:val="2"/>
         </w:numPr>
       </w:pPr>
-      <w:r>
-        <w:t xml:space="preserve">Firebase </w:t>
+      <w:proofErr w:type="spellStart"/>
+      <w:r>
+        <w:t>Firebase</w:t>
+      </w:r>
+      <w:proofErr w:type="spellEnd"/>
+      <w:r>
+        <w:t xml:space="preserve"> </w:t>
       </w:r>
       <w:r>
         <w:t>storage</w:t>
@@ -2278,13 +3134,29 @@
     </w:p>
     <w:p>
       <w:r>
-        <w:t>Vandaag ben ik begonnen met aanmaken van de Firebase storage voor het opslaan van afbeeldingen.</w:t>
+        <w:t xml:space="preserve">Vandaag ben ik begonnen met aanmaken van de </w:t>
+      </w:r>
+      <w:proofErr w:type="spellStart"/>
+      <w:r>
+        <w:t>Firebase</w:t>
+      </w:r>
+      <w:proofErr w:type="spellEnd"/>
+      <w:r>
+        <w:t xml:space="preserve"> storage voor het opslaan van afbeeldingen.</w:t>
       </w:r>
       <w:r>
         <w:t xml:space="preserve"> </w:t>
       </w:r>
       <w:r>
-        <w:t xml:space="preserve">Ik heb dan de dependencies toegevoegd en dan moest ik een Cloud storage bucket aanmaken. Hierbij werd er gevraagd om een locatie te kiezen waarbij Europe-west 1 (= Belgische regio) niet tussen stond, maar gelukkig is er Eur3 die eigenlijk Belgische en Nederlandse regio voorstelt. Dat werd uitgelegd </w:t>
+        <w:t xml:space="preserve">Ik heb dan de </w:t>
+      </w:r>
+      <w:proofErr w:type="spellStart"/>
+      <w:r>
+        <w:t>dependencies</w:t>
+      </w:r>
+      <w:proofErr w:type="spellEnd"/>
+      <w:r>
+        <w:t xml:space="preserve"> toegevoegd en dan moest ik een Cloud storage bucket aanmaken. Hierbij werd er gevraagd om een locatie te kiezen waarbij Europe-west 1 (= Belgische regio) niet tussen stond, maar gelukkig is er Eur3 die eigenlijk Belgische en Nederlandse regio voorstelt. Dat werd uitgelegd </w:t>
       </w:r>
       <w:r>
         <w:t xml:space="preserve">op deze </w:t>
@@ -2405,12 +3277,52 @@
     </w:p>
     <w:p>
       <w:r>
-        <w:t xml:space="preserve">Vandaag heb ik de java code moet schrijven voor de camera te kunnen gebruiken. Eerst heb ik code toegevoegd dat ervoor zorgt dat de permissies worden aangevraagd om de camera te kunnen gebruiken. Daarna als ik allow klik dan opent een test camera zicht van de emulator. </w:t>
-      </w:r>
-    </w:p>
-    <w:p>
-      <w:r>
-        <w:t>Hierbij werden gelijkaardig methoden gebruikt zoals de firebase authentication, maar waren ook deprecated. Dit heb natuurlijk makkelijk opgelost.</w:t>
+        <w:t xml:space="preserve">Vandaag heb ik de </w:t>
+      </w:r>
+      <w:proofErr w:type="spellStart"/>
+      <w:r>
+        <w:t>java</w:t>
+      </w:r>
+      <w:proofErr w:type="spellEnd"/>
+      <w:r>
+        <w:t xml:space="preserve"> code moet schrijven voor de camera te kunnen gebruiken. Eerst heb ik code toegevoegd dat ervoor zorgt dat de permissies worden aangevraagd om de camera te kunnen gebruiken. Daarna als ik </w:t>
+      </w:r>
+      <w:proofErr w:type="spellStart"/>
+      <w:r>
+        <w:t>allow</w:t>
+      </w:r>
+      <w:proofErr w:type="spellEnd"/>
+      <w:r>
+        <w:t xml:space="preserve"> klik dan opent een test camera zicht van de emulator. </w:t>
+      </w:r>
+    </w:p>
+    <w:p>
+      <w:r>
+        <w:t xml:space="preserve">Hierbij werden gelijkaardig methoden gebruikt zoals de </w:t>
+      </w:r>
+      <w:proofErr w:type="spellStart"/>
+      <w:r>
+        <w:t>firebase</w:t>
+      </w:r>
+      <w:proofErr w:type="spellEnd"/>
+      <w:r>
+        <w:t xml:space="preserve"> </w:t>
+      </w:r>
+      <w:proofErr w:type="spellStart"/>
+      <w:r>
+        <w:t>authentication</w:t>
+      </w:r>
+      <w:proofErr w:type="spellEnd"/>
+      <w:r>
+        <w:t xml:space="preserve">, maar waren ook </w:t>
+      </w:r>
+      <w:proofErr w:type="spellStart"/>
+      <w:r>
+        <w:t>deprecated</w:t>
+      </w:r>
+      <w:proofErr w:type="spellEnd"/>
+      <w:r>
+        <w:t>. Dit heb natuurlijk makkelijk opgelost.</w:t>
       </w:r>
     </w:p>
     <w:p>
@@ -2484,7 +3396,15 @@
     </w:p>
     <w:p>
       <w:r>
-        <w:t>Vandaag heb ik geprobeerd om de image die getrokken wordt op te slaan in firebase storage</w:t>
+        <w:t xml:space="preserve">Vandaag heb ik geprobeerd om de image die getrokken wordt op te slaan in </w:t>
+      </w:r>
+      <w:proofErr w:type="spellStart"/>
+      <w:r>
+        <w:t>firebase</w:t>
+      </w:r>
+      <w:proofErr w:type="spellEnd"/>
+      <w:r>
+        <w:t xml:space="preserve"> storage</w:t>
       </w:r>
       <w:r>
         <w:t>. Dit is op het einde van de les gelukt.</w:t>
@@ -2538,10 +3458,90 @@
     <w:p>
       <w:r>
         <w:lastRenderedPageBreak/>
-        <w:t xml:space="preserve">Hierbij had ik vooral problemen met de uri oftewl URL omdat firebase die nodig had om te kunnen uploaden. Als je naar de eerste rode streep kijkt is er een methode voor </w:t>
-      </w:r>
-      <w:r>
-        <w:t>de bitmap die je krijgt van de camera te gebruiken om de uri te bepalen. De volgende is voor de bestandextensie te krijgen om een filename op te stellen in de firebase storage. Hierbij pak ik gewoon het tijdstip met de bestandextensie, maar ik ben misschien van plan om de filename te kunnen aanpassen door de gebruiker. De laatste streep zijn twee child methods waarbij dus de eerste de map voorstelt waar dan de 2</w:t>
+        <w:t xml:space="preserve">Hierbij had ik vooral problemen met de </w:t>
+      </w:r>
+      <w:proofErr w:type="spellStart"/>
+      <w:r>
+        <w:t>uri</w:t>
+      </w:r>
+      <w:proofErr w:type="spellEnd"/>
+      <w:r>
+        <w:t xml:space="preserve"> </w:t>
+      </w:r>
+      <w:proofErr w:type="spellStart"/>
+      <w:r>
+        <w:t>oftewl</w:t>
+      </w:r>
+      <w:proofErr w:type="spellEnd"/>
+      <w:r>
+        <w:t xml:space="preserve"> URL omdat </w:t>
+      </w:r>
+      <w:proofErr w:type="spellStart"/>
+      <w:r>
+        <w:t>firebase</w:t>
+      </w:r>
+      <w:proofErr w:type="spellEnd"/>
+      <w:r>
+        <w:t xml:space="preserve"> die nodig had om te kunnen uploaden. Als je naar de eerste rode streep kijkt is er een methode voor </w:t>
+      </w:r>
+      <w:r>
+        <w:t xml:space="preserve">de </w:t>
+      </w:r>
+      <w:proofErr w:type="spellStart"/>
+      <w:r>
+        <w:t>bitmap</w:t>
+      </w:r>
+      <w:proofErr w:type="spellEnd"/>
+      <w:r>
+        <w:t xml:space="preserve"> die je krijgt van de camera te gebruiken om de </w:t>
+      </w:r>
+      <w:proofErr w:type="spellStart"/>
+      <w:r>
+        <w:t>uri</w:t>
+      </w:r>
+      <w:proofErr w:type="spellEnd"/>
+      <w:r>
+        <w:t xml:space="preserve"> te bepalen. De volgende is voor de bestandextensie te krijgen om een </w:t>
+      </w:r>
+      <w:proofErr w:type="spellStart"/>
+      <w:r>
+        <w:t>filename</w:t>
+      </w:r>
+      <w:proofErr w:type="spellEnd"/>
+      <w:r>
+        <w:t xml:space="preserve"> op te stellen in de </w:t>
+      </w:r>
+      <w:proofErr w:type="spellStart"/>
+      <w:r>
+        <w:t>firebase</w:t>
+      </w:r>
+      <w:proofErr w:type="spellEnd"/>
+      <w:r>
+        <w:t xml:space="preserve"> storage. Hierbij pak ik gewoon het tijdstip met de bestandextensie, maar ik ben misschien van plan om de </w:t>
+      </w:r>
+      <w:proofErr w:type="spellStart"/>
+      <w:r>
+        <w:t>filename</w:t>
+      </w:r>
+      <w:proofErr w:type="spellEnd"/>
+      <w:r>
+        <w:t xml:space="preserve"> te kunnen aanpassen door de gebruiker. De laatste streep zijn twee </w:t>
+      </w:r>
+      <w:proofErr w:type="spellStart"/>
+      <w:r>
+        <w:t>child</w:t>
+      </w:r>
+      <w:proofErr w:type="spellEnd"/>
+      <w:r>
+        <w:t xml:space="preserve"> </w:t>
+      </w:r>
+      <w:proofErr w:type="spellStart"/>
+      <w:r>
+        <w:t>methods</w:t>
+      </w:r>
+      <w:proofErr w:type="spellEnd"/>
+      <w:r>
+        <w:t xml:space="preserve"> waarbij dus de eerste de map voorstelt waar dan de 2</w:t>
       </w:r>
       <w:r>
         <w:rPr>
@@ -2550,7 +3550,15 @@
         <w:t>de</w:t>
       </w:r>
       <w:r>
-        <w:t xml:space="preserve"> child oftewel de image inkomt. De map geef </w:t>
+        <w:t xml:space="preserve"> </w:t>
+      </w:r>
+      <w:proofErr w:type="spellStart"/>
+      <w:r>
+        <w:t>child</w:t>
+      </w:r>
+      <w:proofErr w:type="spellEnd"/>
+      <w:r>
+        <w:t xml:space="preserve"> oftewel de image inkomt. De map geef </w:t>
       </w:r>
       <w:proofErr w:type="gramStart"/>
       <w:r>
@@ -2698,7 +3706,15 @@
         <w:t>je gsm</w:t>
       </w:r>
       <w:r>
-        <w:t xml:space="preserve"> gallery gebruiken)</w:t>
+        <w:t xml:space="preserve"> </w:t>
+      </w:r>
+      <w:proofErr w:type="spellStart"/>
+      <w:r>
+        <w:t>gallery</w:t>
+      </w:r>
+      <w:proofErr w:type="spellEnd"/>
+      <w:r>
+        <w:t xml:space="preserve"> gebruiken)</w:t>
       </w:r>
     </w:p>
     <w:p/>
@@ -2719,7 +3735,23 @@
     </w:p>
     <w:p>
       <w:r>
-        <w:t xml:space="preserve">Vandaag heb ik geprobeerd om een gridview toe te voegen die images bevat dat dus lijkt op een image gallery zoals uw “foto’s” app. Hierbij heb ik de </w:t>
+        <w:t xml:space="preserve">Vandaag heb ik geprobeerd om een </w:t>
+      </w:r>
+      <w:proofErr w:type="spellStart"/>
+      <w:r>
+        <w:t>gridview</w:t>
+      </w:r>
+      <w:proofErr w:type="spellEnd"/>
+      <w:r>
+        <w:t xml:space="preserve"> toe te voegen die images bevat dat dus lijkt op een image </w:t>
+      </w:r>
+      <w:proofErr w:type="spellStart"/>
+      <w:r>
+        <w:t>gallery</w:t>
+      </w:r>
+      <w:proofErr w:type="spellEnd"/>
+      <w:r>
+        <w:t xml:space="preserve"> zoals uw “foto’s” app. Hierbij heb ik de </w:t>
       </w:r>
       <w:r>
         <w:t>volgende</w:t>
@@ -2764,7 +3796,15 @@
     </w:p>
     <w:p>
       <w:r>
-        <w:t>Dit heeft nog niet direct resultaat gegeven, maar de GridAdapter class geeft een gevoel dat ik wel op de goeie weg zit.</w:t>
+        <w:t xml:space="preserve">Dit heeft nog niet direct resultaat gegeven, maar de </w:t>
+      </w:r>
+      <w:proofErr w:type="spellStart"/>
+      <w:r>
+        <w:t>GridAdapter</w:t>
+      </w:r>
+      <w:proofErr w:type="spellEnd"/>
+      <w:r>
+        <w:t xml:space="preserve"> class geeft een gevoel dat ik wel op de goeie weg zit.</w:t>
       </w:r>
     </w:p>
     <w:p/>
@@ -2785,7 +3825,31 @@
     </w:p>
     <w:p>
       <w:r>
-        <w:t>Na de GridAdapter klasse te controleren ontdekte ik dat ik gewoon het verkeerd image Id doorgegeven heb. Dit heeft het probleem onmiddellijk gefixed als zijn de voorbeeld images niet echt mooi gepositioneerd.</w:t>
+        <w:t xml:space="preserve">Na de </w:t>
+      </w:r>
+      <w:proofErr w:type="spellStart"/>
+      <w:r>
+        <w:t>GridAdapter</w:t>
+      </w:r>
+      <w:proofErr w:type="spellEnd"/>
+      <w:r>
+        <w:t xml:space="preserve"> klasse te controleren ontdekte ik dat ik gewoon het verkeerd image </w:t>
+      </w:r>
+      <w:proofErr w:type="spellStart"/>
+      <w:r>
+        <w:t>Id</w:t>
+      </w:r>
+      <w:proofErr w:type="spellEnd"/>
+      <w:r>
+        <w:t xml:space="preserve"> doorgegeven heb. Dit heeft het probleem onmiddellijk </w:t>
+      </w:r>
+      <w:proofErr w:type="spellStart"/>
+      <w:r>
+        <w:t>gefixed</w:t>
+      </w:r>
+      <w:proofErr w:type="spellEnd"/>
+      <w:r>
+        <w:t xml:space="preserve"> als zijn de voorbeeld images niet echt mooi gepositioneerd.</w:t>
       </w:r>
     </w:p>
     <w:p>
@@ -2839,7 +3903,15 @@
         <w:t>gedetailleerd</w:t>
       </w:r>
       <w:r>
-        <w:t xml:space="preserve"> tutorial gevolgd hoe je met een gridview kan werken:</w:t>
+        <w:t xml:space="preserve"> tutorial gevolgd hoe je met een </w:t>
+      </w:r>
+      <w:proofErr w:type="spellStart"/>
+      <w:r>
+        <w:t>gridview</w:t>
+      </w:r>
+      <w:proofErr w:type="spellEnd"/>
+      <w:r>
+        <w:t xml:space="preserve"> kan werken:</w:t>
       </w:r>
     </w:p>
     <w:p>
@@ -2854,14 +3926,59 @@
     </w:p>
     <w:p>
       <w:r>
-        <w:t xml:space="preserve">Daarna heb ik er nog voor gezorgd dat de margin top en bottom via java code worden aangepast afhankelijk van de </w:t>
-      </w:r>
-      <w:r>
-        <w:t xml:space="preserve">hoogte van de header en footer. Dit werdt gedaan in </w:t>
-      </w:r>
+        <w:t xml:space="preserve">Daarna heb ik er nog voor gezorgd dat de </w:t>
+      </w:r>
+      <w:proofErr w:type="spellStart"/>
+      <w:r>
+        <w:t>margin</w:t>
+      </w:r>
+      <w:proofErr w:type="spellEnd"/>
+      <w:r>
+        <w:t xml:space="preserve"> top en </w:t>
+      </w:r>
+      <w:proofErr w:type="spellStart"/>
+      <w:r>
+        <w:t>bottom</w:t>
+      </w:r>
+      <w:proofErr w:type="spellEnd"/>
+      <w:r>
+        <w:t xml:space="preserve"> via </w:t>
+      </w:r>
+      <w:proofErr w:type="spellStart"/>
+      <w:r>
+        <w:t>java</w:t>
+      </w:r>
+      <w:proofErr w:type="spellEnd"/>
+      <w:r>
+        <w:t xml:space="preserve"> code worden aangepast afhankelijk van de </w:t>
+      </w:r>
+      <w:r>
+        <w:t xml:space="preserve">hoogte van de header en </w:t>
+      </w:r>
+      <w:proofErr w:type="spellStart"/>
+      <w:r>
+        <w:t>footer</w:t>
+      </w:r>
+      <w:proofErr w:type="spellEnd"/>
+      <w:r>
+        <w:t xml:space="preserve">. Dit </w:t>
+      </w:r>
+      <w:proofErr w:type="spellStart"/>
+      <w:r>
+        <w:t>werdt</w:t>
+      </w:r>
+      <w:proofErr w:type="spellEnd"/>
+      <w:r>
+        <w:t xml:space="preserve"> gedaan in </w:t>
+      </w:r>
+      <w:proofErr w:type="spellStart"/>
       <w:proofErr w:type="gramStart"/>
       <w:r>
-        <w:t>OnCreateView(</w:t>
+        <w:t>OnCreateView</w:t>
+      </w:r>
+      <w:proofErr w:type="spellEnd"/>
+      <w:r>
+        <w:t>(</w:t>
       </w:r>
       <w:proofErr w:type="gramEnd"/>
       <w:r>
@@ -2913,13 +4030,66 @@
     </w:p>
     <w:p>
       <w:r>
-        <w:t>Ik heb dan de elementen een witte achtergrond gegeven en dan een border rond gedaan dat eigenlijk vrij moeilijk en inefficiënt moet worden opgeroepen in android studio door middel van een &lt;shape&gt; xml file te maken in de res/drawable folder en die een stroke</w:t>
-      </w:r>
+        <w:t xml:space="preserve">Ik heb dan de elementen een witte achtergrond gegeven en dan een border rond gedaan dat eigenlijk vrij moeilijk en inefficiënt moet worden opgeroepen in </w:t>
+      </w:r>
+      <w:proofErr w:type="spellStart"/>
+      <w:r>
+        <w:t>android</w:t>
+      </w:r>
+      <w:proofErr w:type="spellEnd"/>
+      <w:r>
+        <w:t xml:space="preserve"> studio door middel van een &lt;</w:t>
+      </w:r>
+      <w:proofErr w:type="spellStart"/>
+      <w:r>
+        <w:t>shape</w:t>
+      </w:r>
+      <w:proofErr w:type="spellEnd"/>
+      <w:r>
+        <w:t xml:space="preserve">&gt; </w:t>
+      </w:r>
+      <w:proofErr w:type="spellStart"/>
+      <w:r>
+        <w:t>xml</w:t>
+      </w:r>
+      <w:proofErr w:type="spellEnd"/>
+      <w:r>
+        <w:t xml:space="preserve"> file te maken in de </w:t>
+      </w:r>
+      <w:proofErr w:type="spellStart"/>
+      <w:r>
+        <w:t>res</w:t>
+      </w:r>
+      <w:proofErr w:type="spellEnd"/>
+      <w:r>
+        <w:t>/</w:t>
+      </w:r>
+      <w:proofErr w:type="spellStart"/>
+      <w:r>
+        <w:t>drawable</w:t>
+      </w:r>
+      <w:proofErr w:type="spellEnd"/>
+      <w:r>
+        <w:t xml:space="preserve"> folder en die een </w:t>
+      </w:r>
+      <w:proofErr w:type="spellStart"/>
+      <w:r>
+        <w:t>stroke</w:t>
+      </w:r>
+      <w:proofErr w:type="spellEnd"/>
       <w:r>
         <w:t>, enzoverder</w:t>
       </w:r>
       <w:r>
-        <w:t xml:space="preserve"> te geven. Dan wordt deze drawable als achtergrond geplaatst van de imageview.</w:t>
+        <w:t xml:space="preserve"> te geven. Dan wordt deze </w:t>
+      </w:r>
+      <w:proofErr w:type="spellStart"/>
+      <w:r>
+        <w:t>drawable</w:t>
+      </w:r>
+      <w:proofErr w:type="spellEnd"/>
+      <w:r>
+        <w:t xml:space="preserve"> als achtergrond geplaatst van de imageview.</w:t>
       </w:r>
       <w:r>
         <w:t xml:space="preserve"> De lege elementen zijn gewoon witte icoontjes die dus niet zichtbaar zijn door de witte achtergrond.</w:t>
@@ -2970,7 +4140,23 @@
     <w:p/>
     <w:p>
       <w:r>
-        <w:t>Om te eindigen, moest ik nog de images van firebase toevoegen hierbij heb ik vooral code van stackoverflow gebruikt om mijn oude klassen en methods te verbeteren.</w:t>
+        <w:t xml:space="preserve">Om te eindigen, moest ik nog de images van </w:t>
+      </w:r>
+      <w:proofErr w:type="spellStart"/>
+      <w:r>
+        <w:t>firebase</w:t>
+      </w:r>
+      <w:proofErr w:type="spellEnd"/>
+      <w:r>
+        <w:t xml:space="preserve"> toevoegen hierbij heb ik vooral code van stackoverflow gebruikt om mijn oude klassen en </w:t>
+      </w:r>
+      <w:proofErr w:type="spellStart"/>
+      <w:r>
+        <w:t>methods</w:t>
+      </w:r>
+      <w:proofErr w:type="spellEnd"/>
+      <w:r>
+        <w:t xml:space="preserve"> te verbeteren.</w:t>
       </w:r>
     </w:p>
     <w:p>
@@ -3075,14 +4261,75 @@
       </w:r>
       <w:proofErr w:type="gramEnd"/>
       <w:r>
-        <w:t xml:space="preserve"> zorgde dat de oude logo files worden vervangen. Hierbij heb een logo afbeelding als foreground en een transparant afbeelding als background. Maar dit wou niet helemaal werken door adaptive icon en legacy optie. De app als het om mijn emulator </w:t>
+        <w:t xml:space="preserve"> zorgde dat de oude logo files worden vervangen. Hierbij heb een logo afbeelding als </w:t>
+      </w:r>
+      <w:proofErr w:type="spellStart"/>
+      <w:r>
+        <w:t>foreground</w:t>
+      </w:r>
+      <w:proofErr w:type="spellEnd"/>
+      <w:r>
+        <w:t xml:space="preserve"> en een transparant afbeelding als background. Maar dit wou niet helemaal werken door </w:t>
+      </w:r>
+      <w:proofErr w:type="spellStart"/>
+      <w:r>
+        <w:t>adaptive</w:t>
+      </w:r>
+      <w:proofErr w:type="spellEnd"/>
+      <w:r>
+        <w:t xml:space="preserve"> icon en </w:t>
+      </w:r>
+      <w:proofErr w:type="spellStart"/>
+      <w:r>
+        <w:t>legacy</w:t>
+      </w:r>
+      <w:proofErr w:type="spellEnd"/>
+      <w:r>
+        <w:t xml:space="preserve"> optie. De app als het om mijn emulator </w:t>
       </w:r>
       <w:r>
         <w:lastRenderedPageBreak/>
-        <w:t>staat kreeg een zwarte achtergrond omdat transparant niet bestaat bij adaptive icons. Dus wat ik gedaan had was het gewoon op legacy only</w:t>
-      </w:r>
-      <w:r>
-        <w:t xml:space="preserve"> optie zetten waar ik gewoon eigenlijk de background kan weghalen door de shape als cirkel aan te duiden</w:t>
+        <w:t xml:space="preserve">staat kreeg een zwarte achtergrond omdat transparant niet bestaat bij </w:t>
+      </w:r>
+      <w:proofErr w:type="spellStart"/>
+      <w:r>
+        <w:t>adaptive</w:t>
+      </w:r>
+      <w:proofErr w:type="spellEnd"/>
+      <w:r>
+        <w:t xml:space="preserve"> </w:t>
+      </w:r>
+      <w:proofErr w:type="spellStart"/>
+      <w:r>
+        <w:t>icons</w:t>
+      </w:r>
+      <w:proofErr w:type="spellEnd"/>
+      <w:r>
+        <w:t xml:space="preserve">. Dus wat ik gedaan had was het gewoon op </w:t>
+      </w:r>
+      <w:proofErr w:type="spellStart"/>
+      <w:r>
+        <w:t>legacy</w:t>
+      </w:r>
+      <w:proofErr w:type="spellEnd"/>
+      <w:r>
+        <w:t xml:space="preserve"> </w:t>
+      </w:r>
+      <w:proofErr w:type="spellStart"/>
+      <w:r>
+        <w:t>only</w:t>
+      </w:r>
+      <w:proofErr w:type="spellEnd"/>
+      <w:r>
+        <w:t xml:space="preserve"> optie zetten waar ik gewoon eigenlijk de background kan weghalen door de </w:t>
+      </w:r>
+      <w:proofErr w:type="spellStart"/>
+      <w:r>
+        <w:t>shape</w:t>
+      </w:r>
+      <w:proofErr w:type="spellEnd"/>
+      <w:r>
+        <w:t xml:space="preserve"> als cirkel aan te duiden</w:t>
       </w:r>
       <w:r>
         <w:t>.</w:t>
@@ -3148,7 +4395,31 @@
     </w:p>
     <w:p>
       <w:r>
-        <w:t>Vandaag heb ik ervoor gezorgd dat ik image van uw gsm gallery kan uploaden. Hierbij dacht ik eerst dat automatisch de gallery die klaarstaat in de camera app kon gebruiken zoals bij facebook messenger, maar bestaat niet echt blijkbaar. Ik heb hiervoor zelfs een vraag gesteld op stackoverflow.</w:t>
+        <w:t xml:space="preserve">Vandaag heb ik ervoor gezorgd dat ik image van uw gsm </w:t>
+      </w:r>
+      <w:proofErr w:type="spellStart"/>
+      <w:r>
+        <w:t>gallery</w:t>
+      </w:r>
+      <w:proofErr w:type="spellEnd"/>
+      <w:r>
+        <w:t xml:space="preserve"> kan uploaden. Hierbij dacht ik eerst dat automatisch de </w:t>
+      </w:r>
+      <w:proofErr w:type="spellStart"/>
+      <w:r>
+        <w:t>gallery</w:t>
+      </w:r>
+      <w:proofErr w:type="spellEnd"/>
+      <w:r>
+        <w:t xml:space="preserve"> die klaarstaat in de camera app kon gebruiken zoals bij facebook </w:t>
+      </w:r>
+      <w:proofErr w:type="spellStart"/>
+      <w:r>
+        <w:t>messenger</w:t>
+      </w:r>
+      <w:proofErr w:type="spellEnd"/>
+      <w:r>
+        <w:t>, maar bestaat niet echt blijkbaar. Ik heb hiervoor zelfs een vraag gesteld op stackoverflow.</w:t>
       </w:r>
     </w:p>
     <w:p>
@@ -3163,7 +4434,23 @@
     </w:p>
     <w:p>
       <w:r>
-        <w:t xml:space="preserve">Uiteindelijk heb ik gewoon besloten om de camera en gallery op te splitsen en te kunnen openen in popup </w:t>
+        <w:t xml:space="preserve">Uiteindelijk heb ik gewoon besloten om de camera en </w:t>
+      </w:r>
+      <w:proofErr w:type="spellStart"/>
+      <w:r>
+        <w:t>gallery</w:t>
+      </w:r>
+      <w:proofErr w:type="spellEnd"/>
+      <w:r>
+        <w:t xml:space="preserve"> op te splitsen en te kunnen openen in </w:t>
+      </w:r>
+      <w:proofErr w:type="spellStart"/>
+      <w:r>
+        <w:t>popup</w:t>
+      </w:r>
+      <w:proofErr w:type="spellEnd"/>
+      <w:r>
+        <w:t xml:space="preserve"> </w:t>
       </w:r>
       <w:proofErr w:type="gramStart"/>
       <w:r>
@@ -3171,7 +4458,15 @@
       </w:r>
       <w:proofErr w:type="gramEnd"/>
       <w:r>
-        <w:t xml:space="preserve">. De code voor de gallery functionaliteiten </w:t>
+        <w:t xml:space="preserve">. De code voor de </w:t>
+      </w:r>
+      <w:proofErr w:type="spellStart"/>
+      <w:r>
+        <w:t>gallery</w:t>
+      </w:r>
+      <w:proofErr w:type="spellEnd"/>
+      <w:r>
+        <w:t xml:space="preserve"> functionaliteiten </w:t>
       </w:r>
       <w:r>
         <w:t>is</w:t>
@@ -3270,7 +4565,23 @@
         </w:numPr>
       </w:pPr>
       <w:r>
-        <w:t>Vragen dat het ok is om je image te compressen (quality verlies?)</w:t>
+        <w:t xml:space="preserve">Vragen dat het ok is om je image te </w:t>
+      </w:r>
+      <w:proofErr w:type="spellStart"/>
+      <w:r>
+        <w:t>compressen</w:t>
+      </w:r>
+      <w:proofErr w:type="spellEnd"/>
+      <w:r>
+        <w:t xml:space="preserve"> (</w:t>
+      </w:r>
+      <w:proofErr w:type="spellStart"/>
+      <w:r>
+        <w:t>quality</w:t>
+      </w:r>
+      <w:proofErr w:type="spellEnd"/>
+      <w:r>
+        <w:t xml:space="preserve"> verlies?)</w:t>
       </w:r>
     </w:p>
     <w:p>
@@ -3282,8 +4593,21 @@
         </w:numPr>
       </w:pPr>
       <w:r>
-        <w:t>Image van de gridview kunnen openen in full size</w:t>
-      </w:r>
+        <w:t xml:space="preserve">Image van de </w:t>
+      </w:r>
+      <w:proofErr w:type="spellStart"/>
+      <w:r>
+        <w:t>gridview</w:t>
+      </w:r>
+      <w:proofErr w:type="spellEnd"/>
+      <w:r>
+        <w:t xml:space="preserve"> kunnen openen in full </w:t>
+      </w:r>
+      <w:proofErr w:type="spellStart"/>
+      <w:r>
+        <w:t>size</w:t>
+      </w:r>
+      <w:proofErr w:type="spellEnd"/>
     </w:p>
     <w:p>
       <w:pPr>
@@ -3294,7 +4618,15 @@
         </w:numPr>
       </w:pPr>
       <w:r>
-        <w:t>App op google playstore plaatsen!!</w:t>
+        <w:t xml:space="preserve">App op google </w:t>
+      </w:r>
+      <w:proofErr w:type="spellStart"/>
+      <w:r>
+        <w:t>playstore</w:t>
+      </w:r>
+      <w:proofErr w:type="spellEnd"/>
+      <w:r>
+        <w:t xml:space="preserve"> plaatsen!!</w:t>
       </w:r>
     </w:p>
     <w:p>
@@ -3305,8 +4637,13 @@
           <w:numId w:val="2"/>
         </w:numPr>
       </w:pPr>
-      <w:r>
-        <w:t>Offfline functionaliteiten toevoegen?</w:t>
+      <w:proofErr w:type="spellStart"/>
+      <w:r>
+        <w:t>Offfline</w:t>
+      </w:r>
+      <w:proofErr w:type="spellEnd"/>
+      <w:r>
+        <w:t xml:space="preserve"> functionaliteiten toevoegen?</w:t>
       </w:r>
     </w:p>
     <w:p/>
@@ -3327,24 +4664,82 @@
     </w:p>
     <w:p>
       <w:r>
-        <w:t xml:space="preserve">Vandaag wou ik beginnen met het uploaden van mijn app op google play maar toen ik tutorial volgde moest ik eerst mijn app package name veranderen want com.example is niet correct. Toen ik dat veranderen </w:t>
-      </w:r>
-      <w:r>
-        <w:t>werkte de google services niet meer want de package name was com.example in de google-</w:t>
-      </w:r>
+        <w:t xml:space="preserve">Vandaag wou ik beginnen met het uploaden van mijn app op google </w:t>
+      </w:r>
+      <w:proofErr w:type="spellStart"/>
+      <w:r>
+        <w:t>play</w:t>
+      </w:r>
+      <w:proofErr w:type="spellEnd"/>
+      <w:r>
+        <w:t xml:space="preserve"> maar toen ik tutorial volgde moest ik eerst mijn app package name veranderen want </w:t>
+      </w:r>
+      <w:proofErr w:type="spellStart"/>
+      <w:r>
+        <w:t>com.example</w:t>
+      </w:r>
+      <w:proofErr w:type="spellEnd"/>
+      <w:r>
+        <w:t xml:space="preserve"> is niet correct. Toen ik dat veranderen </w:t>
+      </w:r>
+      <w:r>
+        <w:t xml:space="preserve">werkte de google services niet meer want de package name was </w:t>
+      </w:r>
+      <w:proofErr w:type="spellStart"/>
+      <w:r>
+        <w:t>com.example</w:t>
+      </w:r>
+      <w:proofErr w:type="spellEnd"/>
+      <w:r>
+        <w:t xml:space="preserve"> in de google-</w:t>
+      </w:r>
+      <w:proofErr w:type="spellStart"/>
       <w:proofErr w:type="gramStart"/>
       <w:r>
         <w:t>services.json</w:t>
       </w:r>
+      <w:proofErr w:type="spellEnd"/>
       <w:proofErr w:type="gramEnd"/>
       <w:r>
-        <w:t xml:space="preserve"> file. Dus ik moest mijn app in firebase opnieuw maken dat niet echt moeilijk was.</w:t>
-      </w:r>
-      <w:r>
-        <w:t xml:space="preserve"> Daarna heb ik een android app bundle aangemaakt want dit is nodig voor de release.</w:t>
-      </w:r>
-      <w:r>
-        <w:t xml:space="preserve"> Ze vroeg dan om developer account aan te maken waarbij ik 1 keer 25 euro moest betalen. Daarbij was ik effe gestopt want mijn ouders waren niet thuis voor een mastercard te gebruiken.</w:t>
+        <w:t xml:space="preserve"> file. Dus ik moest mijn app in </w:t>
+      </w:r>
+      <w:proofErr w:type="spellStart"/>
+      <w:r>
+        <w:t>firebase</w:t>
+      </w:r>
+      <w:proofErr w:type="spellEnd"/>
+      <w:r>
+        <w:t xml:space="preserve"> opnieuw maken dat niet echt moeilijk was.</w:t>
+      </w:r>
+      <w:r>
+        <w:t xml:space="preserve"> Daarna heb ik een </w:t>
+      </w:r>
+      <w:proofErr w:type="spellStart"/>
+      <w:r>
+        <w:t>android</w:t>
+      </w:r>
+      <w:proofErr w:type="spellEnd"/>
+      <w:r>
+        <w:t xml:space="preserve"> app </w:t>
+      </w:r>
+      <w:proofErr w:type="spellStart"/>
+      <w:r>
+        <w:t>bundle</w:t>
+      </w:r>
+      <w:proofErr w:type="spellEnd"/>
+      <w:r>
+        <w:t xml:space="preserve"> aangemaakt want dit is nodig voor de release.</w:t>
+      </w:r>
+      <w:r>
+        <w:t xml:space="preserve"> Ze vroeg dan om </w:t>
+      </w:r>
+      <w:proofErr w:type="spellStart"/>
+      <w:r>
+        <w:t>developer</w:t>
+      </w:r>
+      <w:proofErr w:type="spellEnd"/>
+      <w:r>
+        <w:t xml:space="preserve"> account aan te maken waarbij ik 1 keer 25 euro moest betalen. Daarbij was ik effe gestopt want mijn ouders waren niet thuis voor een mastercard te gebruiken.</w:t>
       </w:r>
     </w:p>
     <w:p>
@@ -3421,7 +4816,15 @@
     </w:p>
     <w:p>
       <w:r>
-        <w:t>In de avond heb ik dan mijn developer account aangemaakt.</w:t>
+        <w:t xml:space="preserve">In de avond heb ik dan mijn </w:t>
+      </w:r>
+      <w:proofErr w:type="spellStart"/>
+      <w:r>
+        <w:t>developer</w:t>
+      </w:r>
+      <w:proofErr w:type="spellEnd"/>
+      <w:r>
+        <w:t xml:space="preserve"> account aangemaakt.</w:t>
       </w:r>
     </w:p>
     <w:p/>
@@ -3445,7 +4848,23 @@
         <w:t>Vandaag ben ik effe kort begonnen met het beter beveiligen van het wachtwoord om te registeren en in te loggen</w:t>
       </w:r>
       <w:r>
-        <w:t xml:space="preserve">. Hierbij vraag ik dus dat het wachtwoord een kleine letter, grote letter, geen spaties, 1 nummer en een lengte van 8 tekens heeft. Dit wordt weergegeven als een error onder de wachtwoord textbox. Het email wordt dankzij firebase al gevalideerd dat het correct is, dus ik moet zelf geen error toevoegen. </w:t>
+        <w:t xml:space="preserve">. Hierbij vraag ik dus dat het wachtwoord een kleine letter, grote letter, geen spaties, 1 nummer en een lengte van 8 tekens heeft. Dit wordt weergegeven als een error onder de wachtwoord </w:t>
+      </w:r>
+      <w:proofErr w:type="spellStart"/>
+      <w:r>
+        <w:t>textbox</w:t>
+      </w:r>
+      <w:proofErr w:type="spellEnd"/>
+      <w:r>
+        <w:t xml:space="preserve">. Het email wordt dankzij </w:t>
+      </w:r>
+      <w:proofErr w:type="spellStart"/>
+      <w:r>
+        <w:t>firebase</w:t>
+      </w:r>
+      <w:proofErr w:type="spellEnd"/>
+      <w:r>
+        <w:t xml:space="preserve"> al gevalideerd dat het correct is, dus ik moet zelf geen error toevoegen. </w:t>
       </w:r>
       <w:r>
         <w:t>Maar er wordt wel een toast bericht voor de zekerheid weergegeven vanonder als de registratie mislukt</w:t>
@@ -3456,13 +4875,29 @@
     </w:p>
     <w:p>
       <w:r>
-        <w:t xml:space="preserve">Daarna heb ik de app bundle </w:t>
+        <w:t xml:space="preserve">Daarna heb ik de app </w:t>
+      </w:r>
+      <w:proofErr w:type="spellStart"/>
+      <w:r>
+        <w:t>bundle</w:t>
+      </w:r>
+      <w:proofErr w:type="spellEnd"/>
+      <w:r>
+        <w:t xml:space="preserve"> </w:t>
       </w:r>
       <w:r>
         <w:t>geüpdatet</w:t>
       </w:r>
       <w:r>
-        <w:t xml:space="preserve"> naar de volgende versie, omdat er aanpassingen waren. Deze release heb ik dan op google play console geüpload, hierbij moest ik nog in </w:t>
+        <w:t xml:space="preserve"> naar de volgende versie, omdat er aanpassingen waren. Deze release heb ik dan op google </w:t>
+      </w:r>
+      <w:proofErr w:type="spellStart"/>
+      <w:r>
+        <w:t>play</w:t>
+      </w:r>
+      <w:proofErr w:type="spellEnd"/>
+      <w:r>
+        <w:t xml:space="preserve"> console geüpload, hierbij moest ik nog in </w:t>
       </w:r>
       <w:proofErr w:type="gramStart"/>
       <w:r>
@@ -3470,7 +4905,15 @@
       </w:r>
       <w:proofErr w:type="gramEnd"/>
       <w:r>
-        <w:t xml:space="preserve"> veel taken afleggen. De belangrijksten waren bijvoorbeeld een test account meegeven zodat google dit kan gebruiken om mijn app te controleren, een privacybeleid toevoegen hi</w:t>
+        <w:t xml:space="preserve"> veel taken afleggen. De belangrijksten waren bijvoorbeeld een test account meegeven zodat google dit kan gebruiken om mijn app te controleren, een </w:t>
+      </w:r>
+      <w:proofErr w:type="spellStart"/>
+      <w:r>
+        <w:t>privacybeleid</w:t>
+      </w:r>
+      <w:proofErr w:type="spellEnd"/>
+      <w:r>
+        <w:t xml:space="preserve"> toevoegen hi</w:t>
       </w:r>
       <w:r>
         <w:t>er</w:t>
@@ -3522,13 +4965,77 @@
     </w:p>
     <w:p>
       <w:r>
-        <w:t xml:space="preserve">Hierbij had vooral deze youtube video nodig omdat ik de uri van de image die ik aan klik moest doorsturen naar het een fragment waar je de img in het groot kan bekijken. </w:t>
-      </w:r>
-      <w:r>
-        <w:t>Ik maakte toen een keer grote fout door een nieuwe imageDetailsFragment te openen als ik eigenlijk een bundle (waar de uri wordt opgeslagen)</w:t>
-      </w:r>
-      <w:r>
-        <w:t xml:space="preserve"> had toegevoegd aan een ImageDetailsFragment als arguments. Ik navigeerde eigenlijk naar een fragment zonder argumenten die hard nodig had. Dit heb ik natuurlijk opgelost</w:t>
+        <w:t xml:space="preserve">Hierbij had vooral deze </w:t>
+      </w:r>
+      <w:proofErr w:type="spellStart"/>
+      <w:r>
+        <w:t>youtube</w:t>
+      </w:r>
+      <w:proofErr w:type="spellEnd"/>
+      <w:r>
+        <w:t xml:space="preserve"> video nodig omdat ik de </w:t>
+      </w:r>
+      <w:proofErr w:type="spellStart"/>
+      <w:r>
+        <w:t>uri</w:t>
+      </w:r>
+      <w:proofErr w:type="spellEnd"/>
+      <w:r>
+        <w:t xml:space="preserve"> van de image die ik aan klik moest doorsturen naar het een fragment waar je de </w:t>
+      </w:r>
+      <w:proofErr w:type="spellStart"/>
+      <w:r>
+        <w:t>img</w:t>
+      </w:r>
+      <w:proofErr w:type="spellEnd"/>
+      <w:r>
+        <w:t xml:space="preserve"> in het groot kan bekijken. </w:t>
+      </w:r>
+      <w:r>
+        <w:t xml:space="preserve">Ik maakte toen een keer grote fout door een nieuwe </w:t>
+      </w:r>
+      <w:proofErr w:type="spellStart"/>
+      <w:r>
+        <w:t>imageDetailsFragment</w:t>
+      </w:r>
+      <w:proofErr w:type="spellEnd"/>
+      <w:r>
+        <w:t xml:space="preserve"> te openen als ik eigenlijk een </w:t>
+      </w:r>
+      <w:proofErr w:type="spellStart"/>
+      <w:r>
+        <w:t>bundle</w:t>
+      </w:r>
+      <w:proofErr w:type="spellEnd"/>
+      <w:r>
+        <w:t xml:space="preserve"> (waar de </w:t>
+      </w:r>
+      <w:proofErr w:type="spellStart"/>
+      <w:r>
+        <w:t>uri</w:t>
+      </w:r>
+      <w:proofErr w:type="spellEnd"/>
+      <w:r>
+        <w:t xml:space="preserve"> wordt opgeslagen)</w:t>
+      </w:r>
+      <w:r>
+        <w:t xml:space="preserve"> had toegevoegd aan een </w:t>
+      </w:r>
+      <w:proofErr w:type="spellStart"/>
+      <w:r>
+        <w:t>ImageDetailsFragment</w:t>
+      </w:r>
+      <w:proofErr w:type="spellEnd"/>
+      <w:r>
+        <w:t xml:space="preserve"> als </w:t>
+      </w:r>
+      <w:proofErr w:type="spellStart"/>
+      <w:r>
+        <w:t>arguments</w:t>
+      </w:r>
+      <w:proofErr w:type="spellEnd"/>
+      <w:r>
+        <w:t>. Ik navigeerde eigenlijk naar een fragment zonder argumenten die hard nodig had. Dit heb ik natuurlijk opgelost</w:t>
       </w:r>
       <w:r>
         <w:t xml:space="preserve"> zie onderstaande </w:t>
@@ -3542,7 +5049,15 @@
     </w:p>
     <w:p>
       <w:r>
-        <w:t>Het enige probleempje dat er nog is, is dat sommige afbeeldingen die vergroot worden onscherm kunnen uitzien.</w:t>
+        <w:t xml:space="preserve">Het enige probleempje dat er nog is, is dat sommige afbeeldingen die vergroot worden </w:t>
+      </w:r>
+      <w:proofErr w:type="spellStart"/>
+      <w:r>
+        <w:t>onscherm</w:t>
+      </w:r>
+      <w:proofErr w:type="spellEnd"/>
+      <w:r>
+        <w:t xml:space="preserve"> kunnen uitzien.</w:t>
       </w:r>
       <w:r>
         <w:t xml:space="preserve"> </w:t>
@@ -3620,7 +5135,15 @@
     </w:p>
     <w:p>
       <w:r>
-        <w:t>Vandaag heb ik een realtime database aangemaakt om een chat functionaliteiten toe te voegen.</w:t>
+        <w:t xml:space="preserve">Vandaag heb ik een </w:t>
+      </w:r>
+      <w:proofErr w:type="spellStart"/>
+      <w:r>
+        <w:t>realtime</w:t>
+      </w:r>
+      <w:proofErr w:type="spellEnd"/>
+      <w:r>
+        <w:t xml:space="preserve"> database aangemaakt om een chat functionaliteiten toe te voegen.</w:t>
       </w:r>
       <w:r>
         <w:t xml:space="preserve"> Hierbij ga ik de volgende video’s gebruiken:</w:t>
@@ -3708,8 +5231,13 @@
           <w:numId w:val="2"/>
         </w:numPr>
       </w:pPr>
-      <w:r>
-        <w:t>Offfline functionaliteiten toevoegen?</w:t>
+      <w:proofErr w:type="spellStart"/>
+      <w:r>
+        <w:t>Offfline</w:t>
+      </w:r>
+      <w:proofErr w:type="spellEnd"/>
+      <w:r>
+        <w:t xml:space="preserve"> functionaliteiten toevoegen?</w:t>
       </w:r>
     </w:p>
     <w:p>
@@ -3744,7 +5272,15 @@
     </w:p>
     <w:p>
       <w:r>
-        <w:t>Vandaag is mijn app beschikbaar op google play die je via deze link kan downloaden.</w:t>
+        <w:t xml:space="preserve">Vandaag is mijn app beschikbaar op google </w:t>
+      </w:r>
+      <w:proofErr w:type="spellStart"/>
+      <w:r>
+        <w:t>play</w:t>
+      </w:r>
+      <w:proofErr w:type="spellEnd"/>
+      <w:r>
+        <w:t xml:space="preserve"> die je via deze link kan downloaden.</w:t>
       </w:r>
     </w:p>
     <w:p>
@@ -3759,13 +5295,29 @@
     </w:p>
     <w:p>
       <w:r>
-        <w:t>Toen ik het had gedownload merkte ik dat google login niet wou werken. Dit heb ik dan onmiddellijk opgezocht en ik moest gewoon een extra SHA1 fingerp</w:t>
+        <w:t xml:space="preserve">Toen ik het had gedownload merkte ik dat google login niet wou werken. Dit heb ik dan onmiddellijk opgezocht en ik moest gewoon een extra SHA1 </w:t>
+      </w:r>
+      <w:proofErr w:type="spellStart"/>
+      <w:r>
+        <w:t>fingerp</w:t>
       </w:r>
       <w:r>
         <w:t>r</w:t>
       </w:r>
       <w:r>
-        <w:t>int van google play nog toevoegen aan mijn app. Dus nu werkt hij perfect.</w:t>
+        <w:t>int</w:t>
+      </w:r>
+      <w:proofErr w:type="spellEnd"/>
+      <w:r>
+        <w:t xml:space="preserve"> van google </w:t>
+      </w:r>
+      <w:proofErr w:type="spellStart"/>
+      <w:r>
+        <w:t>play</w:t>
+      </w:r>
+      <w:proofErr w:type="spellEnd"/>
+      <w:r>
+        <w:t xml:space="preserve"> nog toevoegen aan mijn app. Dus nu werkt hij perfect.</w:t>
       </w:r>
     </w:p>
     <w:p>
@@ -3785,7 +5337,15 @@
     </w:p>
     <w:p>
       <w:r>
-        <w:t xml:space="preserve">Ik heb dan geprobeerd om data toe te voegen aan mijn realtime database maar nog geen succes. Ik moest nu stoppen omdat ik een </w:t>
+        <w:t xml:space="preserve">Ik heb dan geprobeerd om data toe te voegen aan mijn </w:t>
+      </w:r>
+      <w:proofErr w:type="spellStart"/>
+      <w:r>
+        <w:t>realtime</w:t>
+      </w:r>
+      <w:proofErr w:type="spellEnd"/>
+      <w:r>
+        <w:t xml:space="preserve"> database maar nog geen succes. Ik moest nu stoppen omdat ik een </w:t>
       </w:r>
       <w:proofErr w:type="gramStart"/>
       <w:r>
@@ -3829,11 +5389,48 @@
       </w:r>
     </w:p>
     <w:p>
-      <w:r>
-        <w:t>Firebase Realtime database wou geen data toevoegen en</w:t>
-      </w:r>
-      <w:r>
-        <w:t xml:space="preserve"> ik had alles geprobeerd. Ik realiseerde toen dat realtime firebase alleen mogelijk was voor de regio van België europe-west1. Ik besloot dan naar firestore te gaan want daar hebben ze wel europe-west3 dat Nederland en België bevat. </w:t>
+      <w:proofErr w:type="spellStart"/>
+      <w:r>
+        <w:t>Firebase</w:t>
+      </w:r>
+      <w:proofErr w:type="spellEnd"/>
+      <w:r>
+        <w:t xml:space="preserve"> </w:t>
+      </w:r>
+      <w:proofErr w:type="spellStart"/>
+      <w:r>
+        <w:t>Realtime</w:t>
+      </w:r>
+      <w:proofErr w:type="spellEnd"/>
+      <w:r>
+        <w:t xml:space="preserve"> database wou geen data toevoegen en</w:t>
+      </w:r>
+      <w:r>
+        <w:t xml:space="preserve"> ik had alles geprobeerd. Ik realiseerde toen dat </w:t>
+      </w:r>
+      <w:proofErr w:type="spellStart"/>
+      <w:r>
+        <w:t>realtime</w:t>
+      </w:r>
+      <w:proofErr w:type="spellEnd"/>
+      <w:r>
+        <w:t xml:space="preserve"> </w:t>
+      </w:r>
+      <w:proofErr w:type="spellStart"/>
+      <w:r>
+        <w:t>firebase</w:t>
+      </w:r>
+      <w:proofErr w:type="spellEnd"/>
+      <w:r>
+        <w:t xml:space="preserve"> alleen mogelijk was voor de regio van België europe-west1. Ik besloot dan naar </w:t>
+      </w:r>
+      <w:proofErr w:type="spellStart"/>
+      <w:r>
+        <w:t>firestore</w:t>
+      </w:r>
+      <w:proofErr w:type="spellEnd"/>
+      <w:r>
+        <w:t xml:space="preserve"> te gaan want daar hebben ze wel europe-west3 dat Nederland en België bevat. </w:t>
       </w:r>
       <w:r>
         <w:t>Dit heeft het probleem onmiddellijk opgelost.</w:t>
@@ -3841,7 +5438,15 @@
     </w:p>
     <w:p>
       <w:r>
-        <w:t>Nu als je inlogt zal je gebruikersgegevens op firestore geplaatst worden. Nu kan ik eindelijk vlot beginnen met de chat functionaliteiten.</w:t>
+        <w:t xml:space="preserve">Nu als je inlogt zal je gebruikersgegevens op </w:t>
+      </w:r>
+      <w:proofErr w:type="spellStart"/>
+      <w:r>
+        <w:t>firestore</w:t>
+      </w:r>
+      <w:proofErr w:type="spellEnd"/>
+      <w:r>
+        <w:t xml:space="preserve"> geplaatst worden. Nu kan ik eindelijk vlot beginnen met de chat functionaliteiten.</w:t>
       </w:r>
     </w:p>
     <w:p>
@@ -3936,7 +5541,31 @@
       </w:r>
       <w:proofErr w:type="gramEnd"/>
       <w:r>
-        <w:t xml:space="preserve"> toe te voegen. Voor firestore was dat niet zo moeilijk want alles kon ik vinden op deze link, maar ik heb dit nog niet echt kunnen uittesten. Voor firebase storage lukte dit niet echt, want er was geen duidelijk documentatie. Ik wou vooral proberen om de images op firebase in de cache te steken, zodat de meeste recente images verschijnen op de startpagina.</w:t>
+        <w:t xml:space="preserve"> toe te voegen. Voor </w:t>
+      </w:r>
+      <w:proofErr w:type="spellStart"/>
+      <w:r>
+        <w:t>firestore</w:t>
+      </w:r>
+      <w:proofErr w:type="spellEnd"/>
+      <w:r>
+        <w:t xml:space="preserve"> was dat niet zo moeilijk want alles kon ik vinden op deze link, maar ik heb dit nog niet echt kunnen uittesten. Voor </w:t>
+      </w:r>
+      <w:proofErr w:type="spellStart"/>
+      <w:r>
+        <w:t>firebase</w:t>
+      </w:r>
+      <w:proofErr w:type="spellEnd"/>
+      <w:r>
+        <w:t xml:space="preserve"> storage lukte dit niet echt, want er was geen duidelijk documentatie. Ik wou vooral proberen om de images op </w:t>
+      </w:r>
+      <w:proofErr w:type="spellStart"/>
+      <w:r>
+        <w:t>firebase</w:t>
+      </w:r>
+      <w:proofErr w:type="spellEnd"/>
+      <w:r>
+        <w:t xml:space="preserve"> in de cache te steken, zodat de meeste recente images verschijnen op de startpagina.</w:t>
       </w:r>
       <w:r>
         <w:t xml:space="preserve"> Mijn conclusie is eigenlijk dat het niet mogelijk is afhankelijk van het totale zoekwerk.</w:t>
@@ -3954,7 +5583,15 @@
     </w:p>
     <w:p>
       <w:r>
-        <w:t>Ik heb dan ondertussen een progress bar toegevoegd die zal</w:t>
+        <w:t xml:space="preserve">Ik heb dan ondertussen een </w:t>
+      </w:r>
+      <w:proofErr w:type="spellStart"/>
+      <w:r>
+        <w:t>progress</w:t>
+      </w:r>
+      <w:proofErr w:type="spellEnd"/>
+      <w:r>
+        <w:t xml:space="preserve"> bar toegevoegd die zal</w:t>
       </w:r>
       <w:r>
         <w:t xml:space="preserve"> </w:t>
@@ -3963,7 +5600,15 @@
         <w:t>verdwijnen als de images inladen.</w:t>
       </w:r>
       <w:r>
-        <w:t xml:space="preserve"> Dit komt ook bij de groepchats pagina.</w:t>
+        <w:t xml:space="preserve"> Dit komt ook bij de </w:t>
+      </w:r>
+      <w:proofErr w:type="spellStart"/>
+      <w:r>
+        <w:t>groepchats</w:t>
+      </w:r>
+      <w:proofErr w:type="spellEnd"/>
+      <w:r>
+        <w:t xml:space="preserve"> pagina.</w:t>
       </w:r>
     </w:p>
     <w:p/>
@@ -3984,10 +5629,50 @@
     </w:p>
     <w:p>
       <w:r>
-        <w:t>Vandaag heb ik verder gewerkt aan de chat functionaliteiten. Ik had in het begin een beetje moeilijkheden met het maken van de layout van de chat room en chat messages. Hierbij heeft de</w:t>
-      </w:r>
-      <w:r>
-        <w:t>ze link geholpen want de youtube tutorials chat layout was zeer lelijk.</w:t>
+        <w:t xml:space="preserve">Vandaag heb ik verder gewerkt aan de chat functionaliteiten. Ik had in het begin een beetje moeilijkheden met het maken van de </w:t>
+      </w:r>
+      <w:proofErr w:type="spellStart"/>
+      <w:r>
+        <w:t>layout</w:t>
+      </w:r>
+      <w:proofErr w:type="spellEnd"/>
+      <w:r>
+        <w:t xml:space="preserve"> van de chat room en chat </w:t>
+      </w:r>
+      <w:proofErr w:type="spellStart"/>
+      <w:r>
+        <w:t>messages</w:t>
+      </w:r>
+      <w:proofErr w:type="spellEnd"/>
+      <w:r>
+        <w:t>. Hierbij heeft de</w:t>
+      </w:r>
+      <w:r>
+        <w:t xml:space="preserve">ze link geholpen want de </w:t>
+      </w:r>
+      <w:proofErr w:type="spellStart"/>
+      <w:r>
+        <w:t>youtube</w:t>
+      </w:r>
+      <w:proofErr w:type="spellEnd"/>
+      <w:r>
+        <w:t xml:space="preserve"> </w:t>
+      </w:r>
+      <w:proofErr w:type="spellStart"/>
+      <w:r>
+        <w:t>tutorials</w:t>
+      </w:r>
+      <w:proofErr w:type="spellEnd"/>
+      <w:r>
+        <w:t xml:space="preserve"> chat </w:t>
+      </w:r>
+      <w:proofErr w:type="spellStart"/>
+      <w:r>
+        <w:t>layout</w:t>
+      </w:r>
+      <w:proofErr w:type="spellEnd"/>
+      <w:r>
+        <w:t xml:space="preserve"> was zeer lelijk.</w:t>
       </w:r>
     </w:p>
     <w:p>
@@ -4030,8 +5715,13 @@
           <w:numId w:val="2"/>
         </w:numPr>
       </w:pPr>
-      <w:r>
-        <w:t>Offfline functionaliteiten toevoegen?</w:t>
+      <w:proofErr w:type="spellStart"/>
+      <w:r>
+        <w:t>Offfline</w:t>
+      </w:r>
+      <w:proofErr w:type="spellEnd"/>
+      <w:r>
+        <w:t xml:space="preserve"> functionaliteiten toevoegen?</w:t>
       </w:r>
     </w:p>
     <w:p>
@@ -4064,7 +5754,15 @@
     </w:p>
     <w:p>
       <w:r>
-        <w:t>Vandaag heb ik de groepen chatrooms toegevoegd in een gridview waarmee de chat</w:t>
+        <w:t xml:space="preserve">Vandaag heb ik de groepen chatrooms toegevoegd in een </w:t>
+      </w:r>
+      <w:proofErr w:type="spellStart"/>
+      <w:r>
+        <w:t>gridview</w:t>
+      </w:r>
+      <w:proofErr w:type="spellEnd"/>
+      <w:r>
+        <w:t xml:space="preserve"> waarmee de chat</w:t>
       </w:r>
       <w:r>
         <w:t>s</w:t>
@@ -4073,10 +5771,50 @@
         <w:t xml:space="preserve"> zullen geopend worden. </w:t>
       </w:r>
       <w:r>
-        <w:t>Hierbij kreeg ik serieuze error die me compleet had verward en op stackoverflow had gesteld. Ik had dus per ongeluk de gridview het verkeerde ID gegeven waardoor er een NullPointerException ontstond, maar ik dacht dat de adapter null werd omdat het me niet lukte om de gegevens van firestore te halen.</w:t>
-      </w:r>
-      <w:r>
-        <w:t xml:space="preserve"> In de comments en antwoord wordt alles nog beter uitgelegd.</w:t>
+        <w:t xml:space="preserve">Hierbij kreeg ik serieuze error die me compleet had verward en op stackoverflow had gesteld. Ik had dus per ongeluk de </w:t>
+      </w:r>
+      <w:proofErr w:type="spellStart"/>
+      <w:r>
+        <w:t>gridview</w:t>
+      </w:r>
+      <w:proofErr w:type="spellEnd"/>
+      <w:r>
+        <w:t xml:space="preserve"> het verkeerde ID gegeven waardoor er een </w:t>
+      </w:r>
+      <w:proofErr w:type="spellStart"/>
+      <w:r>
+        <w:t>NullPointerException</w:t>
+      </w:r>
+      <w:proofErr w:type="spellEnd"/>
+      <w:r>
+        <w:t xml:space="preserve"> ontstond, maar ik dacht dat de adapter </w:t>
+      </w:r>
+      <w:proofErr w:type="spellStart"/>
+      <w:r>
+        <w:t>null</w:t>
+      </w:r>
+      <w:proofErr w:type="spellEnd"/>
+      <w:r>
+        <w:t xml:space="preserve"> werd omdat het me niet lukte om de gegevens van </w:t>
+      </w:r>
+      <w:proofErr w:type="spellStart"/>
+      <w:r>
+        <w:t>firestore</w:t>
+      </w:r>
+      <w:proofErr w:type="spellEnd"/>
+      <w:r>
+        <w:t xml:space="preserve"> te halen.</w:t>
+      </w:r>
+      <w:r>
+        <w:t xml:space="preserve"> In de </w:t>
+      </w:r>
+      <w:proofErr w:type="spellStart"/>
+      <w:r>
+        <w:t>comments</w:t>
+      </w:r>
+      <w:proofErr w:type="spellEnd"/>
+      <w:r>
+        <w:t xml:space="preserve"> en antwoord wordt alles nog beter uitgelegd.</w:t>
       </w:r>
     </w:p>
     <w:p>
@@ -4113,22 +5851,69 @@
     </w:p>
     <w:p>
       <w:r>
-        <w:t xml:space="preserve">Vandaag heb ik ervoor kunnen zorgen dat er pagina wordt geopend als je op een chatroom klikt. Dit duurde langer dan verwacht, want blijkbaar is het niet zo makkelijk om button click events te activeren in een gridview. Om dit op te lossen moest ik een </w:t>
-      </w:r>
+        <w:t xml:space="preserve">Vandaag heb ik ervoor kunnen zorgen dat er pagina wordt geopend als je op een chatroom klikt. Dit duurde langer dan verwacht, want blijkbaar is het niet zo makkelijk om button click events te activeren in een </w:t>
+      </w:r>
+      <w:proofErr w:type="spellStart"/>
+      <w:r>
+        <w:t>gridview</w:t>
+      </w:r>
+      <w:proofErr w:type="spellEnd"/>
+      <w:r>
+        <w:t xml:space="preserve">. Om dit op te lossen moest ik een </w:t>
+      </w:r>
+      <w:proofErr w:type="spellStart"/>
       <w:r>
         <w:t>V</w:t>
       </w:r>
       <w:r>
         <w:t>iewHolder</w:t>
       </w:r>
-      <w:r>
-        <w:t xml:space="preserve"> static</w:t>
-      </w:r>
+      <w:proofErr w:type="spellEnd"/>
+      <w:r>
+        <w:t xml:space="preserve"> </w:t>
+      </w:r>
+      <w:proofErr w:type="spellStart"/>
+      <w:r>
+        <w:t>static</w:t>
+      </w:r>
+      <w:proofErr w:type="spellEnd"/>
       <w:r>
         <w:t xml:space="preserve"> class toevoegen in de </w:t>
       </w:r>
       <w:r>
-        <w:t xml:space="preserve">Adapter class. Deze klasse zorgt ervoor dat de rendering van items in de gridview sneller is. In deze viewholder wordt de button opgeslagen die je kan oproepen en waarop je een onclickevent kan </w:t>
+        <w:t xml:space="preserve">Adapter class. Deze klasse zorgt ervoor dat de </w:t>
+      </w:r>
+      <w:proofErr w:type="spellStart"/>
+      <w:r>
+        <w:t>rendering</w:t>
+      </w:r>
+      <w:proofErr w:type="spellEnd"/>
+      <w:r>
+        <w:t xml:space="preserve"> van items in de </w:t>
+      </w:r>
+      <w:proofErr w:type="spellStart"/>
+      <w:r>
+        <w:t>gridview</w:t>
+      </w:r>
+      <w:proofErr w:type="spellEnd"/>
+      <w:r>
+        <w:t xml:space="preserve"> sneller is. In deze </w:t>
+      </w:r>
+      <w:proofErr w:type="spellStart"/>
+      <w:r>
+        <w:t>viewholder</w:t>
+      </w:r>
+      <w:proofErr w:type="spellEnd"/>
+      <w:r>
+        <w:t xml:space="preserve"> wordt de button opgeslagen die je kan oproepen en waarop je een </w:t>
+      </w:r>
+      <w:proofErr w:type="spellStart"/>
+      <w:r>
+        <w:t>onclickevent</w:t>
+      </w:r>
+      <w:proofErr w:type="spellEnd"/>
+      <w:r>
+        <w:t xml:space="preserve"> kan </w:t>
       </w:r>
       <w:r>
         <w:t>activeren</w:t>
@@ -4199,6 +5984,179 @@
       </w:r>
     </w:p>
     <w:p/>
+    <w:p>
+      <w:pPr>
+        <w:rPr>
+          <w:b/>
+          <w:bCs/>
+        </w:rPr>
+      </w:pPr>
+      <w:r>
+        <w:rPr>
+          <w:b/>
+          <w:bCs/>
+        </w:rPr>
+        <w:t>12/12/2021:</w:t>
+      </w:r>
+    </w:p>
+    <w:p>
+      <w:r>
+        <w:t xml:space="preserve">Sinds vandaag kan ik </w:t>
+      </w:r>
+      <w:proofErr w:type="spellStart"/>
+      <w:r>
+        <w:t>chatmessages</w:t>
+      </w:r>
+      <w:proofErr w:type="spellEnd"/>
+      <w:r>
+        <w:t xml:space="preserve"> naar mijn </w:t>
+      </w:r>
+      <w:proofErr w:type="spellStart"/>
+      <w:r>
+        <w:t>firestore</w:t>
+      </w:r>
+      <w:proofErr w:type="spellEnd"/>
+      <w:r>
+        <w:t xml:space="preserve"> database </w:t>
+      </w:r>
+      <w:proofErr w:type="gramStart"/>
+      <w:r>
+        <w:t xml:space="preserve">sturen </w:t>
+      </w:r>
+      <w:r>
+        <w:t>,</w:t>
+      </w:r>
+      <w:proofErr w:type="gramEnd"/>
+      <w:r>
+        <w:t xml:space="preserve"> maar </w:t>
+      </w:r>
+      <w:proofErr w:type="spellStart"/>
+      <w:r>
+        <w:t>messages</w:t>
+      </w:r>
+      <w:proofErr w:type="spellEnd"/>
+      <w:r>
+        <w:t xml:space="preserve"> tonen is iets moeilijker door recyclerview en zijn adapter.</w:t>
+      </w:r>
+    </w:p>
+    <w:p>
+      <w:r>
+        <w:rPr>
+          <w:noProof/>
+        </w:rPr>
+        <w:drawing>
+          <wp:inline distT="0" distB="0" distL="0" distR="0" wp14:anchorId="58526889" wp14:editId="5D72A0A9">
+            <wp:extent cx="5760720" cy="1600835"/>
+            <wp:effectExtent l="0" t="0" r="0" b="0"/>
+            <wp:docPr id="33" name="Afbeelding 33"/>
+            <wp:cNvGraphicFramePr>
+              <a:graphicFrameLocks xmlns:a="http://schemas.openxmlformats.org/drawingml/2006/main" noChangeAspect="1"/>
+            </wp:cNvGraphicFramePr>
+            <a:graphic xmlns:a="http://schemas.openxmlformats.org/drawingml/2006/main">
+              <a:graphicData uri="http://schemas.openxmlformats.org/drawingml/2006/picture">
+                <pic:pic xmlns:pic="http://schemas.openxmlformats.org/drawingml/2006/picture">
+                  <pic:nvPicPr>
+                    <pic:cNvPr id="1" name=""/>
+                    <pic:cNvPicPr/>
+                  </pic:nvPicPr>
+                  <pic:blipFill>
+                    <a:blip r:embed="rId73"/>
+                    <a:stretch>
+                      <a:fillRect/>
+                    </a:stretch>
+                  </pic:blipFill>
+                  <pic:spPr>
+                    <a:xfrm>
+                      <a:off x="0" y="0"/>
+                      <a:ext cx="5760720" cy="1600835"/>
+                    </a:xfrm>
+                    <a:prstGeom prst="rect">
+                      <a:avLst/>
+                    </a:prstGeom>
+                  </pic:spPr>
+                </pic:pic>
+              </a:graphicData>
+            </a:graphic>
+          </wp:inline>
+        </w:drawing>
+      </w:r>
+    </w:p>
+    <w:p/>
+    <w:p>
+      <w:pPr>
+        <w:pStyle w:val="Kop2"/>
+      </w:pPr>
+      <w:r>
+        <w:t>Week 1</w:t>
+      </w:r>
+      <w:r>
+        <w:t>1</w:t>
+      </w:r>
+    </w:p>
+    <w:p>
+      <w:pPr>
+        <w:pStyle w:val="Kop3"/>
+      </w:pPr>
+      <w:r>
+        <w:t>Wat ik wil realiseren deze week:</w:t>
+      </w:r>
+    </w:p>
+    <w:p>
+      <w:pPr>
+        <w:pStyle w:val="Lijstalinea"/>
+        <w:numPr>
+          <w:ilvl w:val="0"/>
+          <w:numId w:val="2"/>
+        </w:numPr>
+      </w:pPr>
+      <w:r>
+        <w:t>Afwerken chat functionaliteiten.</w:t>
+      </w:r>
+    </w:p>
+    <w:p>
+      <w:pPr>
+        <w:pStyle w:val="Lijstalinea"/>
+        <w:numPr>
+          <w:ilvl w:val="0"/>
+          <w:numId w:val="2"/>
+        </w:numPr>
+      </w:pPr>
+      <w:r>
+        <w:t xml:space="preserve">Contact </w:t>
+      </w:r>
+      <w:proofErr w:type="spellStart"/>
+      <w:r>
+        <w:t>us</w:t>
+      </w:r>
+      <w:proofErr w:type="spellEnd"/>
+      <w:r>
+        <w:t xml:space="preserve"> en profile pagina </w:t>
+      </w:r>
+      <w:r>
+        <w:t>toevoegen</w:t>
+      </w:r>
+      <w:r>
+        <w:t>.</w:t>
+      </w:r>
+    </w:p>
+    <w:p>
+      <w:pPr>
+        <w:pStyle w:val="Lijstalinea"/>
+        <w:numPr>
+          <w:ilvl w:val="0"/>
+          <w:numId w:val="2"/>
+        </w:numPr>
+      </w:pPr>
+      <w:r>
+        <w:t xml:space="preserve">Puntenverdeling opdrachten afwerken zoals </w:t>
+      </w:r>
+      <w:proofErr w:type="gramStart"/>
+      <w:r>
+        <w:t>offline support</w:t>
+      </w:r>
+      <w:proofErr w:type="gramEnd"/>
+    </w:p>
+    <w:p/>
     <w:p/>
     <w:p/>
     <w:p>
@@ -4247,7 +6205,7 @@
                     <pic:cNvPicPr/>
                   </pic:nvPicPr>
                   <pic:blipFill>
-                    <a:blip r:embed="rId73"/>
+                    <a:blip r:embed="rId74"/>
                     <a:stretch>
                       <a:fillRect/>
                     </a:stretch>

</xml_diff>

<commit_message>
Finished group chat testing
</commit_message>
<xml_diff>
--- a/Logboek_Dries_Fierens.docx
+++ b/Logboek_Dries_Fierens.docx
@@ -78,15 +78,7 @@
       </w:r>
       <w:proofErr w:type="spellEnd"/>
       <w:r>
-        <w:t xml:space="preserve"> web app dat dus meer te maken hebben met web &amp; mobile dus vooral HTML &amp; CSS. We moesten dan ook nog kiezen voor een project idee, waarbij ik koos voor een scanner + </w:t>
-      </w:r>
-      <w:proofErr w:type="gramStart"/>
-      <w:r>
-        <w:t>pdf converter</w:t>
-      </w:r>
-      <w:proofErr w:type="gramEnd"/>
-      <w:r>
-        <w:t xml:space="preserve"> app</w:t>
+        <w:t xml:space="preserve"> web app dat dus meer te maken hebben met web &amp; mobile dus vooral HTML &amp; CSS. We moesten dan ook nog kiezen voor een project idee, waarbij ik koos voor een scanner + pdf converter app</w:t>
       </w:r>
       <w:r>
         <w:t xml:space="preserve"> waarbij het vooral bedoelt is o</w:t>
@@ -107,15 +99,7 @@
         <w:t>.</w:t>
       </w:r>
       <w:r>
-        <w:t xml:space="preserve"> Het was verplicht om 1 </w:t>
-      </w:r>
-      <w:proofErr w:type="gramStart"/>
-      <w:r>
-        <w:t>hardware component</w:t>
-      </w:r>
-      <w:proofErr w:type="gramEnd"/>
-      <w:r>
-        <w:t xml:space="preserve"> van de gsm te gebruiken dus koos ik natuurlijk voor de camera.</w:t>
+        <w:t xml:space="preserve"> Het was verplicht om 1 hardware component van de gsm te gebruiken dus koos ik natuurlijk voor de camera.</w:t>
       </w:r>
       <w:r>
         <w:t xml:space="preserve"> </w:t>
@@ -229,15 +213,7 @@
         <w:t xml:space="preserve">Mijn app idee werd niet goedgekeurd, want de leerkracht raadde het af door problemen die ervan kunnen komen. Ik moest dan vandaag een nieuw idee opstellen. </w:t>
       </w:r>
       <w:r>
-        <w:t xml:space="preserve">De scanner + </w:t>
-      </w:r>
-      <w:proofErr w:type="gramStart"/>
-      <w:r>
-        <w:t>pdf converter</w:t>
-      </w:r>
-      <w:proofErr w:type="gramEnd"/>
-      <w:r>
-        <w:t xml:space="preserve"> was duidelijk te moeilijk, maar ik besloot om het idee verder te zetten van een app die notities kan delen. Dus nu moet het gewoon foto’s trekken van de notities. Om nog toe te voegen kan ik ook opmerkingswolkjes toevoegen aan de foto voor bijvoorbeeld een fout</w:t>
+        <w:t>De scanner + pdf converter was duidelijk te moeilijk, maar ik besloot om het idee verder te zetten van een app die notities kan delen. Dus nu moet het gewoon foto’s trekken van de notities. Om nog toe te voegen kan ik ook opmerkingswolkjes toevoegen aan de foto voor bijvoorbeeld een fout</w:t>
       </w:r>
       <w:r>
         <w:t xml:space="preserve"> aan te duiden</w:t>
@@ -309,15 +285,7 @@
         <w:t>te veel</w:t>
       </w:r>
       <w:r>
-        <w:t xml:space="preserve"> naar voor moest leunen en dus </w:t>
-      </w:r>
-      <w:proofErr w:type="gramStart"/>
-      <w:r>
-        <w:t>nek pijn</w:t>
-      </w:r>
-      <w:proofErr w:type="gramEnd"/>
-      <w:r>
-        <w:t xml:space="preserve"> kreeg en er waren precies geen ramen om te openen. </w:t>
+        <w:t xml:space="preserve"> naar voor moest leunen en dus nek pijn kreeg en er waren precies geen ramen om te openen. </w:t>
       </w:r>
       <w:r>
         <w:t>Gelukkig kunnen we naar buiten wanneer we het willen.</w:t>
@@ -598,15 +566,7 @@
     </w:p>
     <w:p>
       <w:r>
-        <w:t xml:space="preserve">Tijdens lange downloads heb ik ook mijn </w:t>
-      </w:r>
-      <w:proofErr w:type="gramStart"/>
-      <w:r>
-        <w:t>google account</w:t>
-      </w:r>
-      <w:proofErr w:type="gramEnd"/>
-      <w:r>
-        <w:t xml:space="preserve"> toegevoegd op </w:t>
+        <w:t xml:space="preserve">Tijdens lange downloads heb ik ook mijn google account toegevoegd op </w:t>
       </w:r>
       <w:proofErr w:type="spellStart"/>
       <w:r>
@@ -695,15 +655,7 @@
         <w:t>Ik heb daarna gewoon verder begonnen aan de tutorial die ik vorige week gebruikt had.</w:t>
       </w:r>
       <w:r>
-        <w:t xml:space="preserve"> Hierbij leerde ik meer over hoe ik </w:t>
-      </w:r>
-      <w:proofErr w:type="gramStart"/>
-      <w:r>
-        <w:t>Android studio</w:t>
-      </w:r>
-      <w:proofErr w:type="gramEnd"/>
-      <w:r>
-        <w:t xml:space="preserve"> beter kon gebruiken om mijn app te </w:t>
+        <w:t xml:space="preserve"> Hierbij leerde ik meer over hoe ik Android studio beter kon gebruiken om mijn app te </w:t>
       </w:r>
       <w:proofErr w:type="spellStart"/>
       <w:r>
@@ -726,15 +678,7 @@
         <w:t>)</w:t>
       </w:r>
       <w:r>
-        <w:t xml:space="preserve">. </w:t>
-      </w:r>
-      <w:proofErr w:type="gramStart"/>
-      <w:r>
-        <w:t>Android studio</w:t>
-      </w:r>
-      <w:proofErr w:type="gramEnd"/>
-      <w:r>
-        <w:t xml:space="preserve"> is zeer gelijkaardig als bijvoorbeeld </w:t>
+        <w:t xml:space="preserve">. Android studio is zeer gelijkaardig als bijvoorbeeld </w:t>
       </w:r>
       <w:proofErr w:type="spellStart"/>
       <w:r>
@@ -765,13 +709,8 @@
         <w:t>bekijken</w:t>
       </w:r>
       <w:r>
-        <w:t xml:space="preserve"> in een gekozen browser, maar je kan in </w:t>
-      </w:r>
-      <w:proofErr w:type="gramStart"/>
-      <w:r>
-        <w:t>Android studio</w:t>
-      </w:r>
-      <w:proofErr w:type="gramEnd"/>
+        <w:t xml:space="preserve"> in een gekozen browser, maar je kan in Android studio</w:t>
+      </w:r>
       <w:r>
         <w:t xml:space="preserve"> je app</w:t>
       </w:r>
@@ -887,15 +826,7 @@
       </w:r>
       <w:proofErr w:type="spellEnd"/>
       <w:r>
-        <w:t xml:space="preserve"> design gevolgd in plaats van die van </w:t>
-      </w:r>
-      <w:proofErr w:type="gramStart"/>
-      <w:r>
-        <w:t>Android studio</w:t>
-      </w:r>
-      <w:proofErr w:type="gramEnd"/>
-      <w:r>
-        <w:t>. Ze leerde me dan hoe ik er mee kon werken maar niet hoe een hele nieuwe app kon maken. Ik kreeg een voorbeeld app om erin te kunnen werken voor de tutorial.</w:t>
+        <w:t xml:space="preserve"> design gevolgd in plaats van die van Android studio. Ze leerde me dan hoe ik er mee kon werken maar niet hoe een hele nieuwe app kon maken. Ik kreeg een voorbeeld app om erin te kunnen werken voor de tutorial.</w:t>
       </w:r>
     </w:p>
     <w:p>
@@ -2181,15 +2112,7 @@
         <w:t>Vandaag heb ik eindelijk de login en registratie kunnen afwerken. Dit had veel moeite gekost.</w:t>
       </w:r>
       <w:r>
-        <w:t xml:space="preserve"> Het probleem was dus dat mijn app bleef crashen als ik probeerde te registeren. Ik had veel op stackoverflow gezocht maar ik kon eerst niks vinden, maar toen zag ik dat de wifi van de device emulator op </w:t>
-      </w:r>
-      <w:proofErr w:type="gramStart"/>
-      <w:r>
-        <w:t>Android studio</w:t>
-      </w:r>
-      <w:proofErr w:type="gramEnd"/>
-      <w:r>
-        <w:t xml:space="preserve"> geen wifi had. Ik dacht eerst dat dit normaal was, maar begon toen twijfels te krijgen. Ik had dan eerst de info op stackoverflow pagina proberen gebruiken, maar dat was niet juist. Uiteindelijk gewoon mijn gsm </w:t>
+        <w:t xml:space="preserve"> Het probleem was dus dat mijn app bleef crashen als ik probeerde te registeren. Ik had veel op stackoverflow gezocht maar ik kon eerst niks vinden, maar toen zag ik dat de wifi van de device emulator op Android studio geen wifi had. Ik dacht eerst dat dit normaal was, maar begon toen twijfels te krijgen. Ik had dan eerst de info op stackoverflow pagina proberen gebruiken, maar dat was niet juist. Uiteindelijk gewoon mijn gsm </w:t>
       </w:r>
       <w:proofErr w:type="spellStart"/>
       <w:r>
@@ -2386,23 +2309,7 @@
           <w:rFonts w:eastAsia="Times New Roman" w:cstheme="minorHAnsi"/>
           <w:lang w:eastAsia="nl-BE"/>
         </w:rPr>
-        <w:t xml:space="preserve">-in te laten werken. Dit ging zeer goed, maar het enige probleem is dat de </w:t>
-      </w:r>
-      <w:proofErr w:type="gramStart"/>
-      <w:r>
-        <w:rPr>
-          <w:rFonts w:eastAsia="Times New Roman" w:cstheme="minorHAnsi"/>
-          <w:lang w:eastAsia="nl-BE"/>
-        </w:rPr>
-        <w:t>google account</w:t>
-      </w:r>
-      <w:proofErr w:type="gramEnd"/>
-      <w:r>
-        <w:rPr>
-          <w:rFonts w:eastAsia="Times New Roman" w:cstheme="minorHAnsi"/>
-          <w:lang w:eastAsia="nl-BE"/>
-        </w:rPr>
-        <w:t xml:space="preserve"> niet wordt toegevoegd aan </w:t>
+        <w:t xml:space="preserve">-in te laten werken. Dit ging zeer goed, maar het enige probleem is dat de google account niet wordt toegevoegd aan </w:t>
       </w:r>
       <w:proofErr w:type="spellStart"/>
       <w:r>
@@ -2820,7 +2727,6 @@
         <w:t xml:space="preserve"> was eigenlijk al klaar in een google-</w:t>
       </w:r>
       <w:proofErr w:type="spellStart"/>
-      <w:proofErr w:type="gramStart"/>
       <w:r>
         <w:rPr>
           <w:rFonts w:eastAsia="Times New Roman" w:cstheme="minorHAnsi"/>
@@ -2829,7 +2735,6 @@
         <w:t>services.json</w:t>
       </w:r>
       <w:proofErr w:type="spellEnd"/>
-      <w:proofErr w:type="gramEnd"/>
       <w:r>
         <w:rPr>
           <w:rFonts w:eastAsia="Times New Roman" w:cstheme="minorHAnsi"/>
@@ -2858,23 +2763,7 @@
           <w:rFonts w:eastAsia="Times New Roman" w:cstheme="minorHAnsi"/>
           <w:lang w:eastAsia="nl-BE"/>
         </w:rPr>
-        <w:t xml:space="preserve"> Nu kunnen </w:t>
-      </w:r>
-      <w:proofErr w:type="gramStart"/>
-      <w:r>
-        <w:rPr>
-          <w:rFonts w:eastAsia="Times New Roman" w:cstheme="minorHAnsi"/>
-          <w:lang w:eastAsia="nl-BE"/>
-        </w:rPr>
-        <w:t>google accounts</w:t>
-      </w:r>
-      <w:proofErr w:type="gramEnd"/>
-      <w:r>
-        <w:rPr>
-          <w:rFonts w:eastAsia="Times New Roman" w:cstheme="minorHAnsi"/>
-          <w:lang w:eastAsia="nl-BE"/>
-        </w:rPr>
-        <w:t xml:space="preserve"> succesvol worden toegevoegd.</w:t>
+        <w:t xml:space="preserve"> Nu kunnen google accounts succesvol worden toegevoegd.</w:t>
       </w:r>
       <w:r>
         <w:rPr>
@@ -3159,18 +3048,10 @@
         <w:t xml:space="preserve"> toegevoegd en dan moest ik een Cloud storage bucket aanmaken. Hierbij werd er gevraagd om een locatie te kiezen waarbij Europe-west 1 (= Belgische regio) niet tussen stond, maar gelukkig is er Eur3 die eigenlijk Belgische en Nederlandse regio voorstelt. Dat werd uitgelegd </w:t>
       </w:r>
       <w:r>
-        <w:t xml:space="preserve">op deze </w:t>
-      </w:r>
-      <w:proofErr w:type="gramStart"/>
-      <w:r>
-        <w:t>webpagina</w:t>
-      </w:r>
-      <w:r>
-        <w:t>‘</w:t>
-      </w:r>
-      <w:proofErr w:type="gramEnd"/>
-      <w:r>
-        <w:t>s</w:t>
+        <w:t>op deze webpagina</w:t>
+      </w:r>
+      <w:r>
+        <w:t>‘s</w:t>
       </w:r>
       <w:r>
         <w:t>:</w:t>
@@ -3558,15 +3439,7 @@
       </w:r>
       <w:proofErr w:type="spellEnd"/>
       <w:r>
-        <w:t xml:space="preserve"> oftewel de image inkomt. De map geef </w:t>
-      </w:r>
-      <w:proofErr w:type="gramStart"/>
-      <w:r>
-        <w:t>ik  het</w:t>
-      </w:r>
-      <w:proofErr w:type="gramEnd"/>
-      <w:r>
-        <w:t xml:space="preserve"> email adres van de gebruiker als naam.</w:t>
+        <w:t xml:space="preserve"> oftewel de image inkomt. De map geef ik  het email adres van de gebruiker als naam.</w:t>
       </w:r>
     </w:p>
     <w:p>
@@ -3972,17 +3845,12 @@
         <w:t xml:space="preserve"> gedaan in </w:t>
       </w:r>
       <w:proofErr w:type="spellStart"/>
-      <w:proofErr w:type="gramStart"/>
       <w:r>
         <w:t>OnCreateView</w:t>
       </w:r>
       <w:proofErr w:type="spellEnd"/>
       <w:r>
-        <w:t>(</w:t>
-      </w:r>
-      <w:proofErr w:type="gramEnd"/>
-      <w:r>
-        <w:t>):</w:t>
+        <w:t>():</w:t>
       </w:r>
     </w:p>
     <w:p>
@@ -4253,15 +4121,7 @@
     </w:p>
     <w:p>
       <w:r>
-        <w:t xml:space="preserve">Ik had een image asset toegevoegd dat dus </w:t>
-      </w:r>
-      <w:proofErr w:type="gramStart"/>
-      <w:r>
-        <w:t>er voor</w:t>
-      </w:r>
-      <w:proofErr w:type="gramEnd"/>
-      <w:r>
-        <w:t xml:space="preserve"> zorgde dat de oude logo files worden vervangen. Hierbij heb een logo afbeelding als </w:t>
+        <w:t xml:space="preserve">Ik had een image asset toegevoegd dat dus er voor zorgde dat de oude logo files worden vervangen. Hierbij heb een logo afbeelding als </w:t>
       </w:r>
       <w:proofErr w:type="spellStart"/>
       <w:r>
@@ -4450,15 +4310,7 @@
       </w:r>
       <w:proofErr w:type="spellEnd"/>
       <w:r>
-        <w:t xml:space="preserve"> </w:t>
-      </w:r>
-      <w:proofErr w:type="gramStart"/>
-      <w:r>
-        <w:t>keuze menu</w:t>
-      </w:r>
-      <w:proofErr w:type="gramEnd"/>
-      <w:r>
-        <w:t xml:space="preserve">. De code voor de </w:t>
+        <w:t xml:space="preserve"> keuze menu. De code voor de </w:t>
       </w:r>
       <w:proofErr w:type="spellStart"/>
       <w:r>
@@ -4694,12 +4546,10 @@
         <w:t xml:space="preserve"> in de google-</w:t>
       </w:r>
       <w:proofErr w:type="spellStart"/>
-      <w:proofErr w:type="gramStart"/>
       <w:r>
         <w:t>services.json</w:t>
       </w:r>
       <w:proofErr w:type="spellEnd"/>
-      <w:proofErr w:type="gramEnd"/>
       <w:r>
         <w:t xml:space="preserve"> file. Dus ik moest mijn app in </w:t>
       </w:r>
@@ -4897,15 +4747,7 @@
       </w:r>
       <w:proofErr w:type="spellEnd"/>
       <w:r>
-        <w:t xml:space="preserve"> console geüpload, hierbij moest ik nog in </w:t>
-      </w:r>
-      <w:proofErr w:type="gramStart"/>
-      <w:r>
-        <w:t>de dashboard</w:t>
-      </w:r>
-      <w:proofErr w:type="gramEnd"/>
-      <w:r>
-        <w:t xml:space="preserve"> veel taken afleggen. De belangrijksten waren bijvoorbeeld een test account meegeven zodat google dit kan gebruiken om mijn app te controleren, een </w:t>
+        <w:t xml:space="preserve"> console geüpload, hierbij moest ik nog in de dashboard veel taken afleggen. De belangrijksten waren bijvoorbeeld een test account meegeven zodat google dit kan gebruiken om mijn app te controleren, een </w:t>
       </w:r>
       <w:proofErr w:type="spellStart"/>
       <w:r>
@@ -5345,15 +5187,7 @@
       </w:r>
       <w:proofErr w:type="spellEnd"/>
       <w:r>
-        <w:t xml:space="preserve"> database maar nog geen succes. Ik moest nu stoppen omdat ik een </w:t>
-      </w:r>
-      <w:proofErr w:type="gramStart"/>
-      <w:r>
-        <w:t>online gesprek</w:t>
-      </w:r>
-      <w:proofErr w:type="gramEnd"/>
-      <w:r>
-        <w:t xml:space="preserve"> ga hebben voor mijn stage tijdens het 2</w:t>
+        <w:t xml:space="preserve"> database maar nog geen succes. Ik moest nu stoppen omdat ik een online gesprek ga hebben voor mijn stage tijdens het 2</w:t>
       </w:r>
       <w:r>
         <w:rPr>
@@ -5533,15 +5367,7 @@
     </w:p>
     <w:p>
       <w:r>
-        <w:t xml:space="preserve">Vandaag probeerde ik </w:t>
-      </w:r>
-      <w:proofErr w:type="gramStart"/>
-      <w:r>
-        <w:t>offline support</w:t>
-      </w:r>
-      <w:proofErr w:type="gramEnd"/>
-      <w:r>
-        <w:t xml:space="preserve"> toe te voegen. Voor </w:t>
+        <w:t xml:space="preserve">Vandaag probeerde ik offline support toe te voegen. Voor </w:t>
       </w:r>
       <w:proofErr w:type="spellStart"/>
       <w:r>
@@ -6017,18 +5843,10 @@
       </w:r>
       <w:proofErr w:type="spellEnd"/>
       <w:r>
-        <w:t xml:space="preserve"> database </w:t>
-      </w:r>
-      <w:proofErr w:type="gramStart"/>
-      <w:r>
-        <w:t xml:space="preserve">sturen </w:t>
-      </w:r>
-      <w:r>
-        <w:t>,</w:t>
-      </w:r>
-      <w:proofErr w:type="gramEnd"/>
-      <w:r>
-        <w:t xml:space="preserve"> maar </w:t>
+        <w:t xml:space="preserve"> database sturen </w:t>
+      </w:r>
+      <w:r>
+        <w:t xml:space="preserve">, maar </w:t>
       </w:r>
       <w:proofErr w:type="spellStart"/>
       <w:r>
@@ -6087,10 +5905,7 @@
         <w:pStyle w:val="Kop2"/>
       </w:pPr>
       <w:r>
-        <w:t>Week 1</w:t>
-      </w:r>
-      <w:r>
-        <w:t>1</w:t>
+        <w:t>Week 11</w:t>
       </w:r>
     </w:p>
     <w:p>
@@ -6148,17 +5963,140 @@
         </w:numPr>
       </w:pPr>
       <w:r>
-        <w:t xml:space="preserve">Puntenverdeling opdrachten afwerken zoals </w:t>
-      </w:r>
-      <w:proofErr w:type="gramStart"/>
-      <w:r>
-        <w:t>offline support</w:t>
-      </w:r>
-      <w:proofErr w:type="gramEnd"/>
+        <w:t>Puntenverdeling opdrachten afwerken zoals offline support</w:t>
+      </w:r>
     </w:p>
     <w:p/>
     <w:p/>
+    <w:p>
+      <w:pPr>
+        <w:rPr>
+          <w:b/>
+          <w:bCs/>
+        </w:rPr>
+      </w:pPr>
+      <w:r>
+        <w:rPr>
+          <w:b/>
+          <w:bCs/>
+        </w:rPr>
+        <w:lastRenderedPageBreak/>
+        <w:t>14/12/2021:</w:t>
+      </w:r>
+    </w:p>
+    <w:p>
+      <w:r>
+        <w:t xml:space="preserve">Vandaag heb ik de </w:t>
+      </w:r>
+      <w:proofErr w:type="spellStart"/>
+      <w:r>
+        <w:t>MessageAdapter</w:t>
+      </w:r>
+      <w:proofErr w:type="spellEnd"/>
+      <w:r>
+        <w:t xml:space="preserve"> waarmee de users kunnen chatten in chatgroepen verbetert want ik had </w:t>
+      </w:r>
+      <w:proofErr w:type="spellStart"/>
+      <w:r>
+        <w:t>tutorials</w:t>
+      </w:r>
+      <w:proofErr w:type="spellEnd"/>
+      <w:r>
+        <w:t xml:space="preserve"> door elkaar gehaald. Ik had vooral </w:t>
+      </w:r>
+      <w:proofErr w:type="spellStart"/>
+      <w:r>
+        <w:t>Id’s</w:t>
+      </w:r>
+      <w:proofErr w:type="spellEnd"/>
+      <w:r>
+        <w:t xml:space="preserve"> nodig van de</w:t>
+      </w:r>
+      <w:r>
+        <w:t xml:space="preserve"> </w:t>
+      </w:r>
+      <w:proofErr w:type="spellStart"/>
+      <w:r>
+        <w:t>messages</w:t>
+      </w:r>
+      <w:proofErr w:type="spellEnd"/>
+      <w:r>
+        <w:t xml:space="preserve"> </w:t>
+      </w:r>
+      <w:proofErr w:type="spellStart"/>
+      <w:r>
+        <w:t>layouts</w:t>
+      </w:r>
+      <w:proofErr w:type="spellEnd"/>
+      <w:r>
+        <w:t xml:space="preserve"> want d</w:t>
+      </w:r>
+      <w:r>
+        <w:t>eze</w:t>
+      </w:r>
+      <w:r>
+        <w:t xml:space="preserve"> waren beter dan de</w:t>
+      </w:r>
+      <w:r>
+        <w:t xml:space="preserve"> 1</w:t>
+      </w:r>
+      <w:r>
+        <w:rPr>
+          <w:vertAlign w:val="superscript"/>
+        </w:rPr>
+        <w:t>ste</w:t>
+      </w:r>
+      <w:r>
+        <w:t xml:space="preserve"> </w:t>
+      </w:r>
+      <w:r>
+        <w:t xml:space="preserve"> tutorial</w:t>
+      </w:r>
+      <w:r>
+        <w:t xml:space="preserve"> hieronder. Daarna ging alles vlot, maar ik heb alleen moeilijkheden met het beveiligen van </w:t>
+      </w:r>
+      <w:proofErr w:type="spellStart"/>
+      <w:r>
+        <w:t>groupchats</w:t>
+      </w:r>
+      <w:proofErr w:type="spellEnd"/>
+      <w:r>
+        <w:t xml:space="preserve">. Hoe gaan dus </w:t>
+      </w:r>
+      <w:r>
+        <w:t xml:space="preserve">user worden toegevoegd aan een </w:t>
+      </w:r>
+      <w:proofErr w:type="spellStart"/>
+      <w:r>
+        <w:t>groepchat</w:t>
+      </w:r>
+      <w:proofErr w:type="spellEnd"/>
+      <w:r>
+        <w:t>, enz.</w:t>
+      </w:r>
+    </w:p>
+    <w:p>
+      <w:hyperlink r:id="rId74" w:history="1">
+        <w:r>
+          <w:rPr>
+            <w:rStyle w:val="Hyperlink"/>
+          </w:rPr>
+          <w:t>https://medium.com/@mendhie/building-real-time-android-chatroom-with-firebase-99a5b51cb4f7</w:t>
+        </w:r>
+      </w:hyperlink>
+    </w:p>
+    <w:p>
+      <w:hyperlink r:id="rId75" w:history="1">
+        <w:r>
+          <w:rPr>
+            <w:rStyle w:val="Hyperlink"/>
+          </w:rPr>
+          <w:t>https://sendbird.com/developer/tutorials/android-chat-tutorial-building-a-messaging-ui</w:t>
+        </w:r>
+      </w:hyperlink>
+    </w:p>
     <w:p/>
+    <w:p/>
     <w:p>
       <w:pPr>
         <w:rPr>
@@ -6175,13 +6113,8 @@
       </w:r>
     </w:p>
     <w:p>
-      <w:proofErr w:type="gramStart"/>
-      <w:r>
-        <w:t>zie</w:t>
-      </w:r>
-      <w:proofErr w:type="gramEnd"/>
-      <w:r>
-        <w:t xml:space="preserve"> mail</w:t>
+      <w:r>
+        <w:t>zie mail</w:t>
       </w:r>
     </w:p>
     <w:p>
@@ -6205,7 +6138,7 @@
                     <pic:cNvPicPr/>
                   </pic:nvPicPr>
                   <pic:blipFill>
-                    <a:blip r:embed="rId74"/>
+                    <a:blip r:embed="rId76"/>
                     <a:stretch>
                       <a:fillRect/>
                     </a:stretch>

</xml_diff>

<commit_message>
Fixed timezones of chat messages
</commit_message>
<xml_diff>
--- a/Logboek_Dries_Fierens.docx
+++ b/Logboek_Dries_Fierens.docx
@@ -78,7 +78,15 @@
       </w:r>
       <w:proofErr w:type="spellEnd"/>
       <w:r>
-        <w:t xml:space="preserve"> web app dat dus meer te maken hebben met web &amp; mobile dus vooral HTML &amp; CSS. We moesten dan ook nog kiezen voor een project idee, waarbij ik koos voor een scanner + pdf converter app</w:t>
+        <w:t xml:space="preserve"> web app dat dus meer te maken hebben met web &amp; mobile dus vooral HTML &amp; CSS. We moesten dan ook nog kiezen voor een project idee, waarbij ik koos voor een scanner + </w:t>
+      </w:r>
+      <w:proofErr w:type="gramStart"/>
+      <w:r>
+        <w:t>pdf converter</w:t>
+      </w:r>
+      <w:proofErr w:type="gramEnd"/>
+      <w:r>
+        <w:t xml:space="preserve"> app</w:t>
       </w:r>
       <w:r>
         <w:t xml:space="preserve"> waarbij het vooral bedoelt is o</w:t>
@@ -99,7 +107,15 @@
         <w:t>.</w:t>
       </w:r>
       <w:r>
-        <w:t xml:space="preserve"> Het was verplicht om 1 hardware component van de gsm te gebruiken dus koos ik natuurlijk voor de camera.</w:t>
+        <w:t xml:space="preserve"> Het was verplicht om 1 </w:t>
+      </w:r>
+      <w:proofErr w:type="gramStart"/>
+      <w:r>
+        <w:t>hardware component</w:t>
+      </w:r>
+      <w:proofErr w:type="gramEnd"/>
+      <w:r>
+        <w:t xml:space="preserve"> van de gsm te gebruiken dus koos ik natuurlijk voor de camera.</w:t>
       </w:r>
       <w:r>
         <w:t xml:space="preserve"> </w:t>
@@ -213,7 +229,15 @@
         <w:t xml:space="preserve">Mijn app idee werd niet goedgekeurd, want de leerkracht raadde het af door problemen die ervan kunnen komen. Ik moest dan vandaag een nieuw idee opstellen. </w:t>
       </w:r>
       <w:r>
-        <w:t>De scanner + pdf converter was duidelijk te moeilijk, maar ik besloot om het idee verder te zetten van een app die notities kan delen. Dus nu moet het gewoon foto’s trekken van de notities. Om nog toe te voegen kan ik ook opmerkingswolkjes toevoegen aan de foto voor bijvoorbeeld een fout</w:t>
+        <w:t xml:space="preserve">De scanner + </w:t>
+      </w:r>
+      <w:proofErr w:type="gramStart"/>
+      <w:r>
+        <w:t>pdf converter</w:t>
+      </w:r>
+      <w:proofErr w:type="gramEnd"/>
+      <w:r>
+        <w:t xml:space="preserve"> was duidelijk te moeilijk, maar ik besloot om het idee verder te zetten van een app die notities kan delen. Dus nu moet het gewoon foto’s trekken van de notities. Om nog toe te voegen kan ik ook opmerkingswolkjes toevoegen aan de foto voor bijvoorbeeld een fout</w:t>
       </w:r>
       <w:r>
         <w:t xml:space="preserve"> aan te duiden</w:t>
@@ -285,7 +309,15 @@
         <w:t>te veel</w:t>
       </w:r>
       <w:r>
-        <w:t xml:space="preserve"> naar voor moest leunen en dus nek pijn kreeg en er waren precies geen ramen om te openen. </w:t>
+        <w:t xml:space="preserve"> naar voor moest leunen en dus </w:t>
+      </w:r>
+      <w:proofErr w:type="gramStart"/>
+      <w:r>
+        <w:t>nek pijn</w:t>
+      </w:r>
+      <w:proofErr w:type="gramEnd"/>
+      <w:r>
+        <w:t xml:space="preserve"> kreeg en er waren precies geen ramen om te openen. </w:t>
       </w:r>
       <w:r>
         <w:t>Gelukkig kunnen we naar buiten wanneer we het willen.</w:t>
@@ -566,7 +598,15 @@
     </w:p>
     <w:p>
       <w:r>
-        <w:t xml:space="preserve">Tijdens lange downloads heb ik ook mijn google account toegevoegd op </w:t>
+        <w:t xml:space="preserve">Tijdens lange downloads heb ik ook mijn </w:t>
+      </w:r>
+      <w:proofErr w:type="gramStart"/>
+      <w:r>
+        <w:t>google account</w:t>
+      </w:r>
+      <w:proofErr w:type="gramEnd"/>
+      <w:r>
+        <w:t xml:space="preserve"> toegevoegd op </w:t>
       </w:r>
       <w:proofErr w:type="spellStart"/>
       <w:r>
@@ -574,7 +614,15 @@
       </w:r>
       <w:proofErr w:type="spellEnd"/>
       <w:r>
-        <w:t>. Volgens de presentatie die we kregen van een medestudent.</w:t>
+        <w:t xml:space="preserve">. Volgens de </w:t>
+      </w:r>
+      <w:proofErr w:type="gramStart"/>
+      <w:r>
+        <w:t>presentatie</w:t>
+      </w:r>
+      <w:proofErr w:type="gramEnd"/>
+      <w:r>
+        <w:t xml:space="preserve"> die we kregen van een medestudent.</w:t>
       </w:r>
     </w:p>
     <w:p>
@@ -655,7 +703,15 @@
         <w:t>Ik heb daarna gewoon verder begonnen aan de tutorial die ik vorige week gebruikt had.</w:t>
       </w:r>
       <w:r>
-        <w:t xml:space="preserve"> Hierbij leerde ik meer over hoe ik Android studio beter kon gebruiken om mijn app te </w:t>
+        <w:t xml:space="preserve"> Hierbij leerde ik meer over hoe ik </w:t>
+      </w:r>
+      <w:proofErr w:type="gramStart"/>
+      <w:r>
+        <w:t>Android studio</w:t>
+      </w:r>
+      <w:proofErr w:type="gramEnd"/>
+      <w:r>
+        <w:t xml:space="preserve"> beter kon gebruiken om mijn app te </w:t>
       </w:r>
       <w:proofErr w:type="spellStart"/>
       <w:r>
@@ -678,7 +734,15 @@
         <w:t>)</w:t>
       </w:r>
       <w:r>
-        <w:t xml:space="preserve">. Android studio is zeer gelijkaardig als bijvoorbeeld </w:t>
+        <w:t xml:space="preserve">. </w:t>
+      </w:r>
+      <w:proofErr w:type="gramStart"/>
+      <w:r>
+        <w:t>Android studio</w:t>
+      </w:r>
+      <w:proofErr w:type="gramEnd"/>
+      <w:r>
+        <w:t xml:space="preserve"> is zeer gelijkaardig als bijvoorbeeld </w:t>
       </w:r>
       <w:proofErr w:type="spellStart"/>
       <w:r>
@@ -709,8 +773,13 @@
         <w:t>bekijken</w:t>
       </w:r>
       <w:r>
-        <w:t xml:space="preserve"> in een gekozen browser, maar je kan in Android studio</w:t>
-      </w:r>
+        <w:t xml:space="preserve"> in een gekozen browser, maar je kan in </w:t>
+      </w:r>
+      <w:proofErr w:type="gramStart"/>
+      <w:r>
+        <w:t>Android studio</w:t>
+      </w:r>
+      <w:proofErr w:type="gramEnd"/>
       <w:r>
         <w:t xml:space="preserve"> je app</w:t>
       </w:r>
@@ -826,7 +895,15 @@
       </w:r>
       <w:proofErr w:type="spellEnd"/>
       <w:r>
-        <w:t xml:space="preserve"> design gevolgd in plaats van die van Android studio. Ze leerde me dan hoe ik er mee kon werken maar niet hoe een hele nieuwe app kon maken. Ik kreeg een voorbeeld app om erin te kunnen werken voor de tutorial.</w:t>
+        <w:t xml:space="preserve"> design gevolgd in plaats van die van </w:t>
+      </w:r>
+      <w:proofErr w:type="gramStart"/>
+      <w:r>
+        <w:t>Android studio</w:t>
+      </w:r>
+      <w:proofErr w:type="gramEnd"/>
+      <w:r>
+        <w:t>. Ze leerde me dan hoe ik er mee kon werken maar niet hoe een hele nieuwe app kon maken. Ik kreeg een voorbeeld app om erin te kunnen werken voor de tutorial.</w:t>
       </w:r>
     </w:p>
     <w:p>
@@ -2112,7 +2189,15 @@
         <w:t>Vandaag heb ik eindelijk de login en registratie kunnen afwerken. Dit had veel moeite gekost.</w:t>
       </w:r>
       <w:r>
-        <w:t xml:space="preserve"> Het probleem was dus dat mijn app bleef crashen als ik probeerde te registeren. Ik had veel op stackoverflow gezocht maar ik kon eerst niks vinden, maar toen zag ik dat de wifi van de device emulator op Android studio geen wifi had. Ik dacht eerst dat dit normaal was, maar begon toen twijfels te krijgen. Ik had dan eerst de info op stackoverflow pagina proberen gebruiken, maar dat was niet juist. Uiteindelijk gewoon mijn gsm </w:t>
+        <w:t xml:space="preserve"> Het probleem was dus dat mijn app bleef crashen als ik probeerde te registeren. Ik had veel op stackoverflow gezocht maar ik kon eerst niks vinden, maar toen zag ik dat de wifi van de device emulator op </w:t>
+      </w:r>
+      <w:proofErr w:type="gramStart"/>
+      <w:r>
+        <w:t>Android studio</w:t>
+      </w:r>
+      <w:proofErr w:type="gramEnd"/>
+      <w:r>
+        <w:t xml:space="preserve"> geen wifi had. Ik dacht eerst dat dit normaal was, maar begon toen twijfels te krijgen. Ik had dan eerst de info op stackoverflow pagina proberen gebruiken, maar dat was niet juist. Uiteindelijk gewoon mijn gsm </w:t>
       </w:r>
       <w:proofErr w:type="spellStart"/>
       <w:r>
@@ -2309,7 +2394,23 @@
           <w:rFonts w:eastAsia="Times New Roman" w:cstheme="minorHAnsi"/>
           <w:lang w:eastAsia="nl-BE"/>
         </w:rPr>
-        <w:t xml:space="preserve">-in te laten werken. Dit ging zeer goed, maar het enige probleem is dat de google account niet wordt toegevoegd aan </w:t>
+        <w:t xml:space="preserve">-in te laten werken. Dit ging zeer goed, maar het enige probleem is dat de </w:t>
+      </w:r>
+      <w:proofErr w:type="gramStart"/>
+      <w:r>
+        <w:rPr>
+          <w:rFonts w:eastAsia="Times New Roman" w:cstheme="minorHAnsi"/>
+          <w:lang w:eastAsia="nl-BE"/>
+        </w:rPr>
+        <w:t>google account</w:t>
+      </w:r>
+      <w:proofErr w:type="gramEnd"/>
+      <w:r>
+        <w:rPr>
+          <w:rFonts w:eastAsia="Times New Roman" w:cstheme="minorHAnsi"/>
+          <w:lang w:eastAsia="nl-BE"/>
+        </w:rPr>
+        <w:t xml:space="preserve"> niet wordt toegevoegd aan </w:t>
       </w:r>
       <w:proofErr w:type="spellStart"/>
       <w:r>
@@ -2727,6 +2828,7 @@
         <w:t xml:space="preserve"> was eigenlijk al klaar in een google-</w:t>
       </w:r>
       <w:proofErr w:type="spellStart"/>
+      <w:proofErr w:type="gramStart"/>
       <w:r>
         <w:rPr>
           <w:rFonts w:eastAsia="Times New Roman" w:cstheme="minorHAnsi"/>
@@ -2735,6 +2837,7 @@
         <w:t>services.json</w:t>
       </w:r>
       <w:proofErr w:type="spellEnd"/>
+      <w:proofErr w:type="gramEnd"/>
       <w:r>
         <w:rPr>
           <w:rFonts w:eastAsia="Times New Roman" w:cstheme="minorHAnsi"/>
@@ -2763,7 +2866,23 @@
           <w:rFonts w:eastAsia="Times New Roman" w:cstheme="minorHAnsi"/>
           <w:lang w:eastAsia="nl-BE"/>
         </w:rPr>
-        <w:t xml:space="preserve"> Nu kunnen google accounts succesvol worden toegevoegd.</w:t>
+        <w:t xml:space="preserve"> Nu kunnen </w:t>
+      </w:r>
+      <w:proofErr w:type="gramStart"/>
+      <w:r>
+        <w:rPr>
+          <w:rFonts w:eastAsia="Times New Roman" w:cstheme="minorHAnsi"/>
+          <w:lang w:eastAsia="nl-BE"/>
+        </w:rPr>
+        <w:t>google accounts</w:t>
+      </w:r>
+      <w:proofErr w:type="gramEnd"/>
+      <w:r>
+        <w:rPr>
+          <w:rFonts w:eastAsia="Times New Roman" w:cstheme="minorHAnsi"/>
+          <w:lang w:eastAsia="nl-BE"/>
+        </w:rPr>
+        <w:t xml:space="preserve"> succesvol worden toegevoegd.</w:t>
       </w:r>
       <w:r>
         <w:rPr>
@@ -3048,10 +3167,18 @@
         <w:t xml:space="preserve"> toegevoegd en dan moest ik een Cloud storage bucket aanmaken. Hierbij werd er gevraagd om een locatie te kiezen waarbij Europe-west 1 (= Belgische regio) niet tussen stond, maar gelukkig is er Eur3 die eigenlijk Belgische en Nederlandse regio voorstelt. Dat werd uitgelegd </w:t>
       </w:r>
       <w:r>
-        <w:t>op deze webpagina</w:t>
-      </w:r>
-      <w:r>
-        <w:t>‘s</w:t>
+        <w:t xml:space="preserve">op deze </w:t>
+      </w:r>
+      <w:proofErr w:type="gramStart"/>
+      <w:r>
+        <w:t>webpagina</w:t>
+      </w:r>
+      <w:r>
+        <w:t>‘</w:t>
+      </w:r>
+      <w:proofErr w:type="gramEnd"/>
+      <w:r>
+        <w:t>s</w:t>
       </w:r>
       <w:r>
         <w:t>:</w:t>
@@ -3439,7 +3566,15 @@
       </w:r>
       <w:proofErr w:type="spellEnd"/>
       <w:r>
-        <w:t xml:space="preserve"> oftewel de image inkomt. De map geef ik  het email adres van de gebruiker als naam.</w:t>
+        <w:t xml:space="preserve"> oftewel de image inkomt. De map geef </w:t>
+      </w:r>
+      <w:proofErr w:type="gramStart"/>
+      <w:r>
+        <w:t>ik  het</w:t>
+      </w:r>
+      <w:proofErr w:type="gramEnd"/>
+      <w:r>
+        <w:t xml:space="preserve"> email adres van de gebruiker als naam.</w:t>
       </w:r>
     </w:p>
     <w:p>
@@ -3845,12 +3980,17 @@
         <w:t xml:space="preserve"> gedaan in </w:t>
       </w:r>
       <w:proofErr w:type="spellStart"/>
+      <w:proofErr w:type="gramStart"/>
       <w:r>
         <w:t>OnCreateView</w:t>
       </w:r>
       <w:proofErr w:type="spellEnd"/>
       <w:r>
-        <w:t>():</w:t>
+        <w:t>(</w:t>
+      </w:r>
+      <w:proofErr w:type="gramEnd"/>
+      <w:r>
+        <w:t>):</w:t>
       </w:r>
     </w:p>
     <w:p>
@@ -4121,7 +4261,15 @@
     </w:p>
     <w:p>
       <w:r>
-        <w:t xml:space="preserve">Ik had een image asset toegevoegd dat dus er voor zorgde dat de oude logo files worden vervangen. Hierbij heb een logo afbeelding als </w:t>
+        <w:t xml:space="preserve">Ik had een image asset toegevoegd dat dus </w:t>
+      </w:r>
+      <w:proofErr w:type="gramStart"/>
+      <w:r>
+        <w:t>er voor</w:t>
+      </w:r>
+      <w:proofErr w:type="gramEnd"/>
+      <w:r>
+        <w:t xml:space="preserve"> zorgde dat de oude logo files worden vervangen. Hierbij heb een logo afbeelding als </w:t>
       </w:r>
       <w:proofErr w:type="spellStart"/>
       <w:r>
@@ -4310,7 +4458,15 @@
       </w:r>
       <w:proofErr w:type="spellEnd"/>
       <w:r>
-        <w:t xml:space="preserve"> keuze menu. De code voor de </w:t>
+        <w:t xml:space="preserve"> </w:t>
+      </w:r>
+      <w:proofErr w:type="gramStart"/>
+      <w:r>
+        <w:t>keuze menu</w:t>
+      </w:r>
+      <w:proofErr w:type="gramEnd"/>
+      <w:r>
+        <w:t xml:space="preserve">. De code voor de </w:t>
       </w:r>
       <w:proofErr w:type="spellStart"/>
       <w:r>
@@ -4546,10 +4702,12 @@
         <w:t xml:space="preserve"> in de google-</w:t>
       </w:r>
       <w:proofErr w:type="spellStart"/>
+      <w:proofErr w:type="gramStart"/>
       <w:r>
         <w:t>services.json</w:t>
       </w:r>
       <w:proofErr w:type="spellEnd"/>
+      <w:proofErr w:type="gramEnd"/>
       <w:r>
         <w:t xml:space="preserve"> file. Dus ik moest mijn app in </w:t>
       </w:r>
@@ -4747,7 +4905,15 @@
       </w:r>
       <w:proofErr w:type="spellEnd"/>
       <w:r>
-        <w:t xml:space="preserve"> console geüpload, hierbij moest ik nog in de dashboard veel taken afleggen. De belangrijksten waren bijvoorbeeld een test account meegeven zodat google dit kan gebruiken om mijn app te controleren, een </w:t>
+        <w:t xml:space="preserve"> console geüpload, hierbij moest ik nog in </w:t>
+      </w:r>
+      <w:proofErr w:type="gramStart"/>
+      <w:r>
+        <w:t>de dashboard</w:t>
+      </w:r>
+      <w:proofErr w:type="gramEnd"/>
+      <w:r>
+        <w:t xml:space="preserve"> veel taken afleggen. De belangrijksten waren bijvoorbeeld een test account meegeven zodat google dit kan gebruiken om mijn app te controleren, een </w:t>
       </w:r>
       <w:proofErr w:type="spellStart"/>
       <w:r>
@@ -5187,7 +5353,15 @@
       </w:r>
       <w:proofErr w:type="spellEnd"/>
       <w:r>
-        <w:t xml:space="preserve"> database maar nog geen succes. Ik moest nu stoppen omdat ik een online gesprek ga hebben voor mijn stage tijdens het 2</w:t>
+        <w:t xml:space="preserve"> database maar nog geen succes. Ik moest nu stoppen omdat ik een </w:t>
+      </w:r>
+      <w:proofErr w:type="gramStart"/>
+      <w:r>
+        <w:t>online gesprek</w:t>
+      </w:r>
+      <w:proofErr w:type="gramEnd"/>
+      <w:r>
+        <w:t xml:space="preserve"> ga hebben voor mijn stage tijdens het 2</w:t>
       </w:r>
       <w:r>
         <w:rPr>
@@ -5367,7 +5541,15 @@
     </w:p>
     <w:p>
       <w:r>
-        <w:t xml:space="preserve">Vandaag probeerde ik offline support toe te voegen. Voor </w:t>
+        <w:t xml:space="preserve">Vandaag probeerde ik </w:t>
+      </w:r>
+      <w:proofErr w:type="gramStart"/>
+      <w:r>
+        <w:t>offline support</w:t>
+      </w:r>
+      <w:proofErr w:type="gramEnd"/>
+      <w:r>
+        <w:t xml:space="preserve"> toe te voegen. Voor </w:t>
       </w:r>
       <w:proofErr w:type="spellStart"/>
       <w:r>
@@ -5843,10 +6025,18 @@
       </w:r>
       <w:proofErr w:type="spellEnd"/>
       <w:r>
-        <w:t xml:space="preserve"> database sturen </w:t>
-      </w:r>
-      <w:r>
-        <w:t xml:space="preserve">, maar </w:t>
+        <w:t xml:space="preserve"> database </w:t>
+      </w:r>
+      <w:proofErr w:type="gramStart"/>
+      <w:r>
+        <w:t xml:space="preserve">sturen </w:t>
+      </w:r>
+      <w:r>
+        <w:t>,</w:t>
+      </w:r>
+      <w:proofErr w:type="gramEnd"/>
+      <w:r>
+        <w:t xml:space="preserve"> maar </w:t>
       </w:r>
       <w:proofErr w:type="spellStart"/>
       <w:r>
@@ -5945,7 +6135,7 @@
       </w:r>
       <w:proofErr w:type="spellEnd"/>
       <w:r>
-        <w:t xml:space="preserve"> en profile pagina </w:t>
+        <w:t xml:space="preserve"> </w:t>
       </w:r>
       <w:r>
         <w:t>toevoegen</w:t>
@@ -5963,8 +6153,13 @@
         </w:numPr>
       </w:pPr>
       <w:r>
-        <w:t>Puntenverdeling opdrachten afwerken zoals offline support</w:t>
-      </w:r>
+        <w:t xml:space="preserve">Puntenverdeling opdrachten afwerken zoals </w:t>
+      </w:r>
+      <w:proofErr w:type="gramStart"/>
+      <w:r>
+        <w:t>offline support</w:t>
+      </w:r>
+      <w:proofErr w:type="gramEnd"/>
     </w:p>
     <w:p/>
     <w:p/>
@@ -6040,6 +6235,7 @@
       <w:r>
         <w:t xml:space="preserve"> 1</w:t>
       </w:r>
+      <w:proofErr w:type="gramStart"/>
       <w:r>
         <w:rPr>
           <w:vertAlign w:val="superscript"/>
@@ -6052,6 +6248,7 @@
       <w:r>
         <w:t xml:space="preserve"> tutorial</w:t>
       </w:r>
+      <w:proofErr w:type="gramEnd"/>
       <w:r>
         <w:t xml:space="preserve"> hieronder. Daarna ging alles vlot, maar ik heb alleen moeilijkheden met het beveiligen van </w:t>
       </w:r>
@@ -6096,69 +6293,151 @@
       </w:hyperlink>
     </w:p>
     <w:p/>
+    <w:p>
+      <w:pPr>
+        <w:rPr>
+          <w:b/>
+          <w:bCs/>
+        </w:rPr>
+      </w:pPr>
+      <w:r>
+        <w:rPr>
+          <w:b/>
+          <w:bCs/>
+        </w:rPr>
+        <w:t>15/12/2021:</w:t>
+      </w:r>
+    </w:p>
+    <w:p>
+      <w:r>
+        <w:t xml:space="preserve">Vandaag heb ik kort overlopen met Yves </w:t>
+      </w:r>
+      <w:proofErr w:type="spellStart"/>
+      <w:r>
+        <w:t>Blancquaert</w:t>
+      </w:r>
+      <w:proofErr w:type="spellEnd"/>
+      <w:r>
+        <w:t xml:space="preserve"> hoe de stand van zaken zijn. Hierbij heb ik vooral op de conclusie gekomen dat ik de volgende dingen nog moet doen:</w:t>
+      </w:r>
+    </w:p>
+    <w:p>
+      <w:pPr>
+        <w:pStyle w:val="Lijstalinea"/>
+        <w:numPr>
+          <w:ilvl w:val="0"/>
+          <w:numId w:val="2"/>
+        </w:numPr>
+      </w:pPr>
+      <w:proofErr w:type="spellStart"/>
+      <w:r>
+        <w:t>Chatgroup</w:t>
+      </w:r>
+      <w:proofErr w:type="spellEnd"/>
+      <w:r>
+        <w:t xml:space="preserve"> afwerken en meerdere users kunnen toevoegen</w:t>
+      </w:r>
+    </w:p>
+    <w:p>
+      <w:pPr>
+        <w:pStyle w:val="Lijstalinea"/>
+        <w:numPr>
+          <w:ilvl w:val="0"/>
+          <w:numId w:val="2"/>
+        </w:numPr>
+      </w:pPr>
+      <w:r>
+        <w:t xml:space="preserve">Contact </w:t>
+      </w:r>
+      <w:proofErr w:type="spellStart"/>
+      <w:r>
+        <w:t>us</w:t>
+      </w:r>
+      <w:proofErr w:type="spellEnd"/>
+      <w:r>
+        <w:t xml:space="preserve"> pagina nog toevoe</w:t>
+      </w:r>
+      <w:r>
+        <w:t>gen voor extra</w:t>
+      </w:r>
+    </w:p>
+    <w:p>
+      <w:pPr>
+        <w:pStyle w:val="Lijstalinea"/>
+        <w:numPr>
+          <w:ilvl w:val="0"/>
+          <w:numId w:val="2"/>
+        </w:numPr>
+      </w:pPr>
+      <w:r>
+        <w:t xml:space="preserve">Notificaties toevoegen voor </w:t>
+      </w:r>
+      <w:proofErr w:type="spellStart"/>
+      <w:r>
+        <w:t>messages</w:t>
+      </w:r>
+      <w:proofErr w:type="spellEnd"/>
+    </w:p>
+    <w:p>
+      <w:pPr>
+        <w:pStyle w:val="Lijstalinea"/>
+        <w:numPr>
+          <w:ilvl w:val="0"/>
+          <w:numId w:val="2"/>
+        </w:numPr>
+        <w:rPr>
+          <w:b/>
+          <w:bCs/>
+          <w:u w:val="single"/>
+        </w:rPr>
+      </w:pPr>
+      <w:r>
+        <w:rPr>
+          <w:b/>
+          <w:bCs/>
+          <w:u w:val="single"/>
+        </w:rPr>
+        <w:t xml:space="preserve">Image in chat toevoegen en </w:t>
+      </w:r>
+      <w:proofErr w:type="spellStart"/>
+      <w:r>
+        <w:rPr>
+          <w:b/>
+          <w:bCs/>
+          <w:u w:val="single"/>
+        </w:rPr>
+        <w:t>comments</w:t>
+      </w:r>
+      <w:proofErr w:type="spellEnd"/>
+      <w:r>
+        <w:rPr>
+          <w:b/>
+          <w:bCs/>
+          <w:u w:val="single"/>
+        </w:rPr>
+        <w:t xml:space="preserve"> erop kunnen plaatsen!!!!!!</w:t>
+      </w:r>
+    </w:p>
+    <w:p>
+      <w:r>
+        <w:t xml:space="preserve">Vandaag heb ik dan snel de contact </w:t>
+      </w:r>
+      <w:proofErr w:type="spellStart"/>
+      <w:r>
+        <w:t>us</w:t>
+      </w:r>
+      <w:proofErr w:type="spellEnd"/>
+      <w:r>
+        <w:t xml:space="preserve"> pagina afgewerkt zodat </w:t>
+      </w:r>
+      <w:r>
+        <w:t>da al af is en zo vlot kan beginnen aan de chat groepen</w:t>
+      </w:r>
+      <w:r>
+        <w:t>.</w:t>
+      </w:r>
+    </w:p>
     <w:p/>
-    <w:p>
-      <w:pPr>
-        <w:rPr>
-          <w:b/>
-          <w:bCs/>
-        </w:rPr>
-      </w:pPr>
-      <w:r>
-        <w:rPr>
-          <w:b/>
-          <w:bCs/>
-        </w:rPr>
-        <w:t>LATER</w:t>
-      </w:r>
-    </w:p>
-    <w:p>
-      <w:r>
-        <w:t>zie mail</w:t>
-      </w:r>
-    </w:p>
-    <w:p>
-      <w:r>
-        <w:rPr>
-          <w:noProof/>
-        </w:rPr>
-        <w:drawing>
-          <wp:inline distT="0" distB="0" distL="0" distR="0" wp14:anchorId="5C8CC2ED" wp14:editId="1F1ED4B8">
-            <wp:extent cx="5657850" cy="1143000"/>
-            <wp:effectExtent l="0" t="0" r="0" b="0"/>
-            <wp:docPr id="31" name="Afbeelding 31"/>
-            <wp:cNvGraphicFramePr>
-              <a:graphicFrameLocks xmlns:a="http://schemas.openxmlformats.org/drawingml/2006/main" noChangeAspect="1"/>
-            </wp:cNvGraphicFramePr>
-            <a:graphic xmlns:a="http://schemas.openxmlformats.org/drawingml/2006/main">
-              <a:graphicData uri="http://schemas.openxmlformats.org/drawingml/2006/picture">
-                <pic:pic xmlns:pic="http://schemas.openxmlformats.org/drawingml/2006/picture">
-                  <pic:nvPicPr>
-                    <pic:cNvPr id="1" name=""/>
-                    <pic:cNvPicPr/>
-                  </pic:nvPicPr>
-                  <pic:blipFill>
-                    <a:blip r:embed="rId76"/>
-                    <a:stretch>
-                      <a:fillRect/>
-                    </a:stretch>
-                  </pic:blipFill>
-                  <pic:spPr>
-                    <a:xfrm>
-                      <a:off x="0" y="0"/>
-                      <a:ext cx="5657850" cy="1143000"/>
-                    </a:xfrm>
-                    <a:prstGeom prst="rect">
-                      <a:avLst/>
-                    </a:prstGeom>
-                  </pic:spPr>
-                </pic:pic>
-              </a:graphicData>
-            </a:graphic>
-          </wp:inline>
-        </w:drawing>
-      </w:r>
-    </w:p>
     <w:p/>
     <w:p/>
     <w:sectPr>

</xml_diff>

<commit_message>
Fixed chat errors like time and smooth scrolling to newly added message
</commit_message>
<xml_diff>
--- a/Logboek_Dries_Fierens.docx
+++ b/Logboek_Dries_Fierens.docx
@@ -6582,7 +6582,12 @@
       </w:r>
     </w:p>
     <w:p>
-      <w:hyperlink r:id="rId76" w:history="1">
+      <w:pPr>
+        <w:rPr>
+          <w:rStyle w:val="Hyperlink"/>
+        </w:rPr>
+      </w:pPr>
+      <w:hyperlink r:id="rId76" w:anchor="70406459" w:history="1">
         <w:r>
           <w:rPr>
             <w:rStyle w:val="Hyperlink"/>
@@ -6591,7 +6596,150 @@
         </w:r>
       </w:hyperlink>
     </w:p>
+    <w:p>
+      <w:r>
+        <w:rPr>
+          <w:noProof/>
+        </w:rPr>
+        <w:drawing>
+          <wp:inline distT="0" distB="0" distL="0" distR="0" wp14:anchorId="657A9FBA" wp14:editId="4D3E6106">
+            <wp:extent cx="6076950" cy="1647850"/>
+            <wp:effectExtent l="0" t="0" r="0" b="9525"/>
+            <wp:docPr id="31" name="Afbeelding 31"/>
+            <wp:cNvGraphicFramePr>
+              <a:graphicFrameLocks xmlns:a="http://schemas.openxmlformats.org/drawingml/2006/main" noChangeAspect="1"/>
+            </wp:cNvGraphicFramePr>
+            <a:graphic xmlns:a="http://schemas.openxmlformats.org/drawingml/2006/main">
+              <a:graphicData uri="http://schemas.openxmlformats.org/drawingml/2006/picture">
+                <pic:pic xmlns:pic="http://schemas.openxmlformats.org/drawingml/2006/picture">
+                  <pic:nvPicPr>
+                    <pic:cNvPr id="1" name=""/>
+                    <pic:cNvPicPr/>
+                  </pic:nvPicPr>
+                  <pic:blipFill>
+                    <a:blip r:embed="rId77"/>
+                    <a:stretch>
+                      <a:fillRect/>
+                    </a:stretch>
+                  </pic:blipFill>
+                  <pic:spPr>
+                    <a:xfrm>
+                      <a:off x="0" y="0"/>
+                      <a:ext cx="6078532" cy="1648279"/>
+                    </a:xfrm>
+                    <a:prstGeom prst="rect">
+                      <a:avLst/>
+                    </a:prstGeom>
+                  </pic:spPr>
+                </pic:pic>
+              </a:graphicData>
+            </a:graphic>
+          </wp:inline>
+        </w:drawing>
+      </w:r>
+    </w:p>
     <w:p/>
+    <w:p>
+      <w:pPr>
+        <w:rPr>
+          <w:b/>
+          <w:bCs/>
+        </w:rPr>
+      </w:pPr>
+      <w:r>
+        <w:rPr>
+          <w:b/>
+          <w:bCs/>
+        </w:rPr>
+        <w:lastRenderedPageBreak/>
+        <w:t>19/12/2021:</w:t>
+      </w:r>
+    </w:p>
+    <w:p/>
+    <w:p/>
+    <w:p>
+      <w:pPr>
+        <w:pStyle w:val="Kop2"/>
+      </w:pPr>
+      <w:r>
+        <w:t>Week 1</w:t>
+      </w:r>
+      <w:r>
+        <w:t>2</w:t>
+      </w:r>
+    </w:p>
+    <w:p>
+      <w:pPr>
+        <w:pStyle w:val="Kop3"/>
+      </w:pPr>
+      <w:r>
+        <w:t>Wat ik wil realiseren deze week:</w:t>
+      </w:r>
+    </w:p>
+    <w:p>
+      <w:pPr>
+        <w:pStyle w:val="Lijstalinea"/>
+        <w:numPr>
+          <w:ilvl w:val="0"/>
+          <w:numId w:val="2"/>
+        </w:numPr>
+      </w:pPr>
+      <w:r>
+        <w:t>Afwerken chat functionaliteiten.</w:t>
+      </w:r>
+    </w:p>
+    <w:p>
+      <w:pPr>
+        <w:pStyle w:val="Lijstalinea"/>
+        <w:numPr>
+          <w:ilvl w:val="0"/>
+          <w:numId w:val="2"/>
+        </w:numPr>
+      </w:pPr>
+      <w:r>
+        <w:t xml:space="preserve">Notificaties voor </w:t>
+      </w:r>
+      <w:r>
+        <w:t>nieuwe berichten</w:t>
+      </w:r>
+    </w:p>
+    <w:p>
+      <w:pPr>
+        <w:pStyle w:val="Lijstalinea"/>
+        <w:numPr>
+          <w:ilvl w:val="0"/>
+          <w:numId w:val="2"/>
+        </w:numPr>
+      </w:pPr>
+      <w:r>
+        <w:t xml:space="preserve">Afbeeldingen kunnen doorsturen via chat en </w:t>
+      </w:r>
+      <w:proofErr w:type="spellStart"/>
+      <w:r>
+        <w:t>comments</w:t>
+      </w:r>
+      <w:proofErr w:type="spellEnd"/>
+      <w:r>
+        <w:t xml:space="preserve"> eraan kunnen toevoegen.</w:t>
+      </w:r>
+    </w:p>
+    <w:p>
+      <w:pPr>
+        <w:pStyle w:val="Lijstalinea"/>
+        <w:numPr>
+          <w:ilvl w:val="0"/>
+          <w:numId w:val="2"/>
+        </w:numPr>
+      </w:pPr>
+      <w:r>
+        <w:t xml:space="preserve">Puntenverdeling opdrachten afwerken zoals </w:t>
+      </w:r>
+      <w:proofErr w:type="gramStart"/>
+      <w:r>
+        <w:t>offline support</w:t>
+      </w:r>
+      <w:proofErr w:type="gramEnd"/>
+    </w:p>
     <w:p/>
     <w:p/>
     <w:p/>

</xml_diff>

<commit_message>
Updated logboek and prepared for next time
</commit_message>
<xml_diff>
--- a/Logboek_Dries_Fierens.docx
+++ b/Logboek_Dries_Fierens.docx
@@ -46,47 +46,7 @@
         <w:t>applicatie</w:t>
       </w:r>
       <w:r>
-        <w:t xml:space="preserve"> die je kan maken en welke technologieën je kan gebruiken. Ik heb voor native gekozen want dat past het best bij mijn aftakking “Software </w:t>
-      </w:r>
-      <w:proofErr w:type="spellStart"/>
-      <w:r>
-        <w:t>developer</w:t>
-      </w:r>
-      <w:proofErr w:type="spellEnd"/>
-      <w:r>
-        <w:t xml:space="preserve">” sinds het </w:t>
-      </w:r>
-      <w:proofErr w:type="spellStart"/>
-      <w:r>
-        <w:t>java</w:t>
-      </w:r>
-      <w:proofErr w:type="spellEnd"/>
-      <w:r>
-        <w:t xml:space="preserve"> inhoudt. De anderen zijn </w:t>
-      </w:r>
-      <w:proofErr w:type="spellStart"/>
-      <w:r>
-        <w:t>hybrid</w:t>
-      </w:r>
-      <w:proofErr w:type="spellEnd"/>
-      <w:r>
-        <w:t xml:space="preserve"> en </w:t>
-      </w:r>
-      <w:proofErr w:type="spellStart"/>
-      <w:r>
-        <w:t>progressive</w:t>
-      </w:r>
-      <w:proofErr w:type="spellEnd"/>
-      <w:r>
-        <w:t xml:space="preserve"> web app dat dus meer te maken hebben met web &amp; mobile dus vooral HTML &amp; CSS. We moesten dan ook nog kiezen voor een project idee, waarbij ik koos voor een scanner + </w:t>
-      </w:r>
-      <w:proofErr w:type="gramStart"/>
-      <w:r>
-        <w:t>pdf converter</w:t>
-      </w:r>
-      <w:proofErr w:type="gramEnd"/>
-      <w:r>
-        <w:t xml:space="preserve"> app</w:t>
+        <w:t xml:space="preserve"> die je kan maken en welke technologieën je kan gebruiken. Ik heb voor native gekozen want dat past het best bij mijn aftakking “Software developer” sinds het java inhoudt. De anderen zijn hybrid en progressive web app dat dus meer te maken hebben met web &amp; mobile dus vooral HTML &amp; CSS. We moesten dan ook nog kiezen voor een project idee, waarbij ik koos voor een scanner + pdf converter app</w:t>
       </w:r>
       <w:r>
         <w:t xml:space="preserve"> waarbij het vooral bedoelt is o</w:t>
@@ -107,106 +67,26 @@
         <w:t>.</w:t>
       </w:r>
       <w:r>
-        <w:t xml:space="preserve"> Het was verplicht om 1 </w:t>
-      </w:r>
-      <w:proofErr w:type="gramStart"/>
-      <w:r>
-        <w:t>hardware component</w:t>
-      </w:r>
-      <w:proofErr w:type="gramEnd"/>
-      <w:r>
-        <w:t xml:space="preserve"> van de gsm te gebruiken dus koos ik natuurlijk voor de camera.</w:t>
+        <w:t xml:space="preserve"> Het was verplicht om 1 hardware component van de gsm te gebruiken dus koos ik natuurlijk voor de camera.</w:t>
       </w:r>
       <w:r>
         <w:t xml:space="preserve"> </w:t>
       </w:r>
       <w:r>
-        <w:t xml:space="preserve">Als </w:t>
-      </w:r>
-      <w:proofErr w:type="spellStart"/>
-      <w:r>
-        <w:t>back-end</w:t>
-      </w:r>
-      <w:proofErr w:type="spellEnd"/>
-      <w:r>
-        <w:t xml:space="preserve"> koos ik </w:t>
-      </w:r>
-      <w:proofErr w:type="spellStart"/>
-      <w:r>
-        <w:t>Firebase</w:t>
-      </w:r>
-      <w:proofErr w:type="spellEnd"/>
-      <w:r>
-        <w:t xml:space="preserve"> en als technologie koos ik in </w:t>
-      </w:r>
-      <w:proofErr w:type="spellStart"/>
-      <w:r>
-        <w:t>java</w:t>
-      </w:r>
-      <w:proofErr w:type="spellEnd"/>
-      <w:r>
-        <w:t xml:space="preserve"> te werken om een </w:t>
-      </w:r>
-      <w:proofErr w:type="spellStart"/>
-      <w:r>
-        <w:t>android</w:t>
-      </w:r>
-      <w:proofErr w:type="spellEnd"/>
-      <w:r>
-        <w:t xml:space="preserve"> app te maken in plaats van een IOS app.</w:t>
-      </w:r>
-      <w:r>
-        <w:t xml:space="preserve"> Want ik heb een </w:t>
-      </w:r>
-      <w:proofErr w:type="spellStart"/>
-      <w:r>
-        <w:t>huawei</w:t>
-      </w:r>
-      <w:proofErr w:type="spellEnd"/>
-      <w:r>
-        <w:t>.</w:t>
-      </w:r>
-    </w:p>
-    <w:p>
-      <w:r>
-        <w:t xml:space="preserve">Ik heb dit allemaal grondiger beschreven in mijn “app </w:t>
-      </w:r>
-      <w:proofErr w:type="spellStart"/>
-      <w:r>
-        <w:t>idee”.pdf</w:t>
-      </w:r>
-      <w:proofErr w:type="spellEnd"/>
-      <w:r>
-        <w:t xml:space="preserve">. Dit staat ondertussen op de </w:t>
-      </w:r>
-      <w:proofErr w:type="spellStart"/>
-      <w:r>
-        <w:t>repository</w:t>
-      </w:r>
-      <w:proofErr w:type="spellEnd"/>
-      <w:r>
-        <w:t xml:space="preserve"> die we moesten maken.</w:t>
-      </w:r>
-    </w:p>
-    <w:p>
-      <w:r>
-        <w:t xml:space="preserve">Om af te sluiten had ik al ondertussen een goede naam gevonden gebaseerd op de applicatie genaamd </w:t>
-      </w:r>
-      <w:proofErr w:type="spellStart"/>
-      <w:r>
-        <w:t>Scannable</w:t>
-      </w:r>
-      <w:proofErr w:type="spellEnd"/>
-      <w:r>
-        <w:t xml:space="preserve">. Ik heb dus besloten om mijn applicatie </w:t>
-      </w:r>
-      <w:proofErr w:type="spellStart"/>
-      <w:r>
-        <w:t>Notable</w:t>
-      </w:r>
-      <w:proofErr w:type="spellEnd"/>
-      <w:r>
-        <w:t xml:space="preserve"> te noemen.</w:t>
+        <w:t>Als back-end koos ik Firebase en als technologie koos ik in java te werken om een android app te maken in plaats van een IOS app.</w:t>
+      </w:r>
+      <w:r>
+        <w:t xml:space="preserve"> Want ik heb een huawei.</w:t>
+      </w:r>
+    </w:p>
+    <w:p>
+      <w:r>
+        <w:t>Ik heb dit allemaal grondiger beschreven in mijn “app idee”.pdf. Dit staat ondertussen op de repository die we moesten maken.</w:t>
+      </w:r>
+    </w:p>
+    <w:p>
+      <w:r>
+        <w:t>Om af te sluiten had ik al ondertussen een goede naam gevonden gebaseerd op de applicatie genaamd Scannable. Ik heb dus besloten om mijn applicatie Notable te noemen.</w:t>
       </w:r>
     </w:p>
     <w:p>
@@ -229,15 +109,7 @@
         <w:t xml:space="preserve">Mijn app idee werd niet goedgekeurd, want de leerkracht raadde het af door problemen die ervan kunnen komen. Ik moest dan vandaag een nieuw idee opstellen. </w:t>
       </w:r>
       <w:r>
-        <w:t xml:space="preserve">De scanner + </w:t>
-      </w:r>
-      <w:proofErr w:type="gramStart"/>
-      <w:r>
-        <w:t>pdf converter</w:t>
-      </w:r>
-      <w:proofErr w:type="gramEnd"/>
-      <w:r>
-        <w:t xml:space="preserve"> was duidelijk te moeilijk, maar ik besloot om het idee verder te zetten van een app die notities kan delen. Dus nu moet het gewoon foto’s trekken van de notities. Om nog toe te voegen kan ik ook opmerkingswolkjes toevoegen aan de foto voor bijvoorbeeld een fout</w:t>
+        <w:t>De scanner + pdf converter was duidelijk te moeilijk, maar ik besloot om het idee verder te zetten van een app die notities kan delen. Dus nu moet het gewoon foto’s trekken van de notities. Om nog toe te voegen kan ik ook opmerkingswolkjes toevoegen aan de foto voor bijvoorbeeld een fout</w:t>
       </w:r>
       <w:r>
         <w:t xml:space="preserve"> aan te duiden</w:t>
@@ -248,15 +120,7 @@
     </w:p>
     <w:p>
       <w:r>
-        <w:t xml:space="preserve">Daarna moest ik gewoon begin aan een UI/UX design voor mijn applicatie, waarbij nog niet veel had gedaan omdat les niet meer lang duurde. Ik moest toen ook tegelijkertijd zoeken naar </w:t>
-      </w:r>
-      <w:proofErr w:type="spellStart"/>
-      <w:r>
-        <w:t>tutorials</w:t>
-      </w:r>
-      <w:proofErr w:type="spellEnd"/>
-      <w:r>
-        <w:t xml:space="preserve"> dus </w:t>
+        <w:t xml:space="preserve">Daarna moest ik gewoon begin aan een UI/UX design voor mijn applicatie, waarbij nog niet veel had gedaan omdat les niet meer lang duurde. Ik moest toen ook tegelijkertijd zoeken naar tutorials dus </w:t>
       </w:r>
       <w:r>
         <w:t>duurde dat ook kort.</w:t>
@@ -279,26 +143,13 @@
     </w:p>
     <w:p>
       <w:r>
-        <w:t>Vandaag in de namiddag begonnen we met de co-</w:t>
-      </w:r>
-      <w:proofErr w:type="spellStart"/>
-      <w:r>
-        <w:t>working</w:t>
-      </w:r>
-      <w:proofErr w:type="spellEnd"/>
-      <w:r>
-        <w:t xml:space="preserve"> les waarbij we dus informatie kunnen delen met medeleerlingen. Al was het de eerste les dus kwam daar niet veel van. Ik begon gewoon verder aan mijn </w:t>
-      </w:r>
-      <w:proofErr w:type="spellStart"/>
+        <w:t xml:space="preserve">Vandaag in de namiddag begonnen we met de co-working les waarbij we dus informatie kunnen delen met medeleerlingen. Al was het de eerste les dus kwam daar niet veel van. Ik begon gewoon verder aan mijn </w:t>
+      </w:r>
       <w:r>
         <w:t>F</w:t>
       </w:r>
       <w:r>
-        <w:t>igma</w:t>
-      </w:r>
-      <w:proofErr w:type="spellEnd"/>
-      <w:r>
-        <w:t xml:space="preserve"> design.</w:t>
+        <w:t>igma design.</w:t>
       </w:r>
     </w:p>
     <w:p>
@@ -309,15 +160,7 @@
         <w:t>te veel</w:t>
       </w:r>
       <w:r>
-        <w:t xml:space="preserve"> naar voor moest leunen en dus </w:t>
-      </w:r>
-      <w:proofErr w:type="gramStart"/>
-      <w:r>
-        <w:t>nek pijn</w:t>
-      </w:r>
-      <w:proofErr w:type="gramEnd"/>
-      <w:r>
-        <w:t xml:space="preserve"> kreeg en er waren precies geen ramen om te openen. </w:t>
+        <w:t xml:space="preserve"> naar voor moest leunen en dus nek pijn kreeg en er waren precies geen ramen om te openen. </w:t>
       </w:r>
       <w:r>
         <w:t>Gelukkig kunnen we naar buiten wanneer we het willen.</w:t>
@@ -357,23 +200,7 @@
     </w:p>
     <w:p>
       <w:r>
-        <w:t xml:space="preserve">Vandaag heb ik verder gewerkt aan mijn </w:t>
-      </w:r>
-      <w:proofErr w:type="spellStart"/>
-      <w:r>
-        <w:t>Figma</w:t>
-      </w:r>
-      <w:proofErr w:type="spellEnd"/>
-      <w:r>
-        <w:t xml:space="preserve"> design en het ging redelijk vlot vooruit. Ik wou absoluut dat het vandaag af was zodat ik morgen kan werken aan een ander vak. Tijdens het maken van het design heb ik vooral ook zitten op zoeken dat sommige concepten wel haalbaar zijn om te programmeren. Dit is allemaal wel mogelijk, maar zal wel een </w:t>
-      </w:r>
-      <w:proofErr w:type="spellStart"/>
-      <w:r>
-        <w:t>challenge</w:t>
-      </w:r>
-      <w:proofErr w:type="spellEnd"/>
-      <w:r>
-        <w:t xml:space="preserve"> zijn zoals de opmerkingen plaatsen</w:t>
+        <w:t>Vandaag heb ik verder gewerkt aan mijn Figma design en het ging redelijk vlot vooruit. Ik wou absoluut dat het vandaag af was zodat ik morgen kan werken aan een ander vak. Tijdens het maken van het design heb ik vooral ook zitten op zoeken dat sommige concepten wel haalbaar zijn om te programmeren. Dit is allemaal wel mogelijk, maar zal wel een challenge zijn zoals de opmerkingen plaatsen</w:t>
       </w:r>
       <w:r>
         <w:t>. M</w:t>
@@ -485,48 +312,11 @@
     </w:p>
     <w:p>
       <w:r>
-        <w:t xml:space="preserve">Vandaag werd mijn </w:t>
-      </w:r>
-      <w:proofErr w:type="spellStart"/>
-      <w:r>
-        <w:t>figma</w:t>
-      </w:r>
-      <w:proofErr w:type="spellEnd"/>
-      <w:r>
-        <w:t xml:space="preserve"> prototype gecontroleerd waarbij ik moest opnieuw uitleggen wat mijn app doet door middel van accurate presentatie. Ik legde dit vrij duidelijk uit en alles ging goed vooruit. Meneer </w:t>
-      </w:r>
-      <w:proofErr w:type="spellStart"/>
-      <w:r>
-        <w:t>Blancquaert</w:t>
-      </w:r>
-      <w:proofErr w:type="spellEnd"/>
-      <w:r>
-        <w:t xml:space="preserve"> heeft me dan ook nog een </w:t>
-      </w:r>
-      <w:proofErr w:type="spellStart"/>
-      <w:r>
-        <w:t>library</w:t>
-      </w:r>
-      <w:proofErr w:type="spellEnd"/>
-      <w:r>
-        <w:t xml:space="preserve"> genaamd “</w:t>
-      </w:r>
-      <w:proofErr w:type="spellStart"/>
-      <w:r>
-        <w:t>Material</w:t>
-      </w:r>
-      <w:proofErr w:type="spellEnd"/>
-      <w:r>
-        <w:t xml:space="preserve"> design” aangeraden om mijn applicatie te ontwerpen. </w:t>
-      </w:r>
-      <w:r>
-        <w:t xml:space="preserve">Blijkbaar Google gebruikt deze </w:t>
-      </w:r>
-      <w:proofErr w:type="spellStart"/>
-      <w:r>
-        <w:t>library</w:t>
-      </w:r>
-      <w:proofErr w:type="spellEnd"/>
+        <w:t xml:space="preserve">Vandaag werd mijn figma prototype gecontroleerd waarbij ik moest opnieuw uitleggen wat mijn app doet door middel van accurate presentatie. Ik legde dit vrij duidelijk uit en alles ging goed vooruit. Meneer Blancquaert heeft me dan ook nog een library genaamd “Material design” aangeraden om mijn applicatie te ontwerpen. </w:t>
+      </w:r>
+      <w:r>
+        <w:t>Blijkbaar Google gebruikt deze library</w:t>
+      </w:r>
       <w:r>
         <w:t xml:space="preserve"> om hun apps te maken.</w:t>
       </w:r>
@@ -564,23 +354,7 @@
         <w:t xml:space="preserve">kunt maken </w:t>
       </w:r>
       <w:r>
-        <w:t xml:space="preserve">om je app te testen. Als je </w:t>
-      </w:r>
-      <w:proofErr w:type="spellStart"/>
-      <w:r>
-        <w:t>developer</w:t>
-      </w:r>
-      <w:proofErr w:type="spellEnd"/>
-      <w:r>
-        <w:t xml:space="preserve"> modus in de </w:t>
-      </w:r>
-      <w:proofErr w:type="spellStart"/>
-      <w:r>
-        <w:t>settings</w:t>
-      </w:r>
-      <w:proofErr w:type="spellEnd"/>
-      <w:r>
-        <w:t xml:space="preserve"> van je gsm</w:t>
+        <w:t>om je app te testen. Als je developer modus in de settings van je gsm</w:t>
       </w:r>
       <w:r>
         <w:t xml:space="preserve"> aanzet, kan je je gsm verbinden met de pc en dus je applicatie daarop testen.</w:t>
@@ -598,31 +372,7 @@
     </w:p>
     <w:p>
       <w:r>
-        <w:t xml:space="preserve">Tijdens lange downloads heb ik ook mijn </w:t>
-      </w:r>
-      <w:proofErr w:type="gramStart"/>
-      <w:r>
-        <w:t>google account</w:t>
-      </w:r>
-      <w:proofErr w:type="gramEnd"/>
-      <w:r>
-        <w:t xml:space="preserve"> toegevoegd op </w:t>
-      </w:r>
-      <w:proofErr w:type="spellStart"/>
-      <w:r>
-        <w:t>Firebase</w:t>
-      </w:r>
-      <w:proofErr w:type="spellEnd"/>
-      <w:r>
-        <w:t xml:space="preserve">. Volgens de </w:t>
-      </w:r>
-      <w:proofErr w:type="gramStart"/>
-      <w:r>
-        <w:t>presentatie</w:t>
-      </w:r>
-      <w:proofErr w:type="gramEnd"/>
-      <w:r>
-        <w:t xml:space="preserve"> die we kregen van een medestudent.</w:t>
+        <w:t>Tijdens lange downloads heb ik ook mijn google account toegevoegd op Firebase. Volgens de presentatie die we kregen van een medestudent.</w:t>
       </w:r>
     </w:p>
     <w:p>
@@ -673,23 +423,7 @@
         <w:t>mijn</w:t>
       </w:r>
       <w:r>
-        <w:t xml:space="preserve"> </w:t>
-      </w:r>
-      <w:proofErr w:type="spellStart"/>
-      <w:r>
-        <w:t>figma</w:t>
-      </w:r>
-      <w:proofErr w:type="spellEnd"/>
-      <w:r>
-        <w:t xml:space="preserve"> design delen met meneer </w:t>
-      </w:r>
-      <w:proofErr w:type="spellStart"/>
-      <w:r>
-        <w:t>Blancquaert</w:t>
-      </w:r>
-      <w:proofErr w:type="spellEnd"/>
-      <w:r>
-        <w:t>, toen hij vroeg dat mijn design klaar was</w:t>
+        <w:t xml:space="preserve"> figma design delen met meneer Blancquaert, toen hij vroeg dat mijn design klaar was</w:t>
       </w:r>
       <w:r>
         <w:t xml:space="preserve"> of niet</w:t>
@@ -703,54 +437,14 @@
         <w:t>Ik heb daarna gewoon verder begonnen aan de tutorial die ik vorige week gebruikt had.</w:t>
       </w:r>
       <w:r>
-        <w:t xml:space="preserve"> Hierbij leerde ik meer over hoe ik </w:t>
-      </w:r>
-      <w:proofErr w:type="gramStart"/>
-      <w:r>
-        <w:t>Android studio</w:t>
-      </w:r>
-      <w:proofErr w:type="gramEnd"/>
-      <w:r>
-        <w:t xml:space="preserve"> beter kon gebruiken om mijn app te </w:t>
-      </w:r>
-      <w:proofErr w:type="spellStart"/>
-      <w:r>
-        <w:t>designen</w:t>
-      </w:r>
-      <w:proofErr w:type="spellEnd"/>
-      <w:r>
-        <w:t xml:space="preserve"> zoals hoe je </w:t>
+        <w:t xml:space="preserve"> Hierbij leerde ik meer over hoe ik Android studio beter kon gebruiken om mijn app te designen zoals hoe je </w:t>
       </w:r>
       <w:r>
         <w:lastRenderedPageBreak/>
-        <w:t xml:space="preserve">attributen kunt aanpassen (bv. </w:t>
-      </w:r>
-      <w:proofErr w:type="spellStart"/>
-      <w:r>
-        <w:t>color</w:t>
-      </w:r>
-      <w:proofErr w:type="spellEnd"/>
-      <w:r>
-        <w:t>)</w:t>
-      </w:r>
-      <w:r>
-        <w:t xml:space="preserve">. </w:t>
-      </w:r>
-      <w:proofErr w:type="gramStart"/>
-      <w:r>
-        <w:t>Android studio</w:t>
-      </w:r>
-      <w:proofErr w:type="gramEnd"/>
-      <w:r>
-        <w:t xml:space="preserve"> is zeer gelijkaardig als bijvoorbeeld </w:t>
-      </w:r>
-      <w:proofErr w:type="spellStart"/>
-      <w:r>
-        <w:t>Webstorm</w:t>
-      </w:r>
-      <w:proofErr w:type="spellEnd"/>
-      <w:r>
-        <w:t xml:space="preserve">, maar bij het design van een mobile app is het zeer </w:t>
+        <w:t>attributen kunt aanpassen (bv. color)</w:t>
+      </w:r>
+      <w:r>
+        <w:t xml:space="preserve">. Android studio is zeer gelijkaardig als bijvoorbeeld Webstorm, maar bij het design van een mobile app is het zeer </w:t>
       </w:r>
       <w:r>
         <w:t>verschillend</w:t>
@@ -759,27 +453,14 @@
         <w:t>.</w:t>
       </w:r>
       <w:r>
-        <w:t xml:space="preserve"> Bij </w:t>
-      </w:r>
-      <w:proofErr w:type="spellStart"/>
-      <w:r>
-        <w:t>Webstorm</w:t>
-      </w:r>
-      <w:proofErr w:type="spellEnd"/>
-      <w:r>
-        <w:t xml:space="preserve"> kan je je website </w:t>
+        <w:t xml:space="preserve"> Bij Webstorm kan je je website </w:t>
       </w:r>
       <w:r>
         <w:t>bekijken</w:t>
       </w:r>
       <w:r>
-        <w:t xml:space="preserve"> in een gekozen browser, maar je kan in </w:t>
-      </w:r>
-      <w:proofErr w:type="gramStart"/>
-      <w:r>
-        <w:t>Android studio</w:t>
-      </w:r>
-      <w:proofErr w:type="gramEnd"/>
+        <w:t xml:space="preserve"> in een gekozen browser, maar je kan in Android studio</w:t>
+      </w:r>
       <w:r>
         <w:t xml:space="preserve"> je app</w:t>
       </w:r>
@@ -799,15 +480,7 @@
         <w:t>.</w:t>
       </w:r>
       <w:r>
-        <w:t xml:space="preserve"> Als ik de </w:t>
-      </w:r>
-      <w:proofErr w:type="spellStart"/>
-      <w:r>
-        <w:t>Jetbrains</w:t>
-      </w:r>
-      <w:proofErr w:type="spellEnd"/>
-      <w:r>
-        <w:t xml:space="preserve"> applicaties vergelijk met Visual studio 2019, </w:t>
+        <w:t xml:space="preserve"> Als ik de Jetbrains applicaties vergelijk met Visual studio 2019, </w:t>
       </w:r>
       <w:r>
         <w:t>heb ik er altijd moeite mee om de lay</w:t>
@@ -887,23 +560,7 @@
     </w:p>
     <w:p>
       <w:r>
-        <w:t xml:space="preserve">Ik heb dan ondertussen de tutorial van </w:t>
-      </w:r>
-      <w:proofErr w:type="spellStart"/>
-      <w:r>
-        <w:t>Material</w:t>
-      </w:r>
-      <w:proofErr w:type="spellEnd"/>
-      <w:r>
-        <w:t xml:space="preserve"> design gevolgd in plaats van die van </w:t>
-      </w:r>
-      <w:proofErr w:type="gramStart"/>
-      <w:r>
-        <w:t>Android studio</w:t>
-      </w:r>
-      <w:proofErr w:type="gramEnd"/>
-      <w:r>
-        <w:t>. Ze leerde me dan hoe ik er mee kon werken maar niet hoe een hele nieuwe app kon maken. Ik kreeg een voorbeeld app om erin te kunnen werken voor de tutorial.</w:t>
+        <w:t>Ik heb dan ondertussen de tutorial van Material design gevolgd in plaats van die van Android studio. Ze leerde me dan hoe ik er mee kon werken maar niet hoe een hele nieuwe app kon maken. Ik kreeg een voorbeeld app om erin te kunnen werken voor de tutorial.</w:t>
       </w:r>
     </w:p>
     <w:p>
@@ -946,34 +603,10 @@
     </w:p>
     <w:p>
       <w:r>
-        <w:t xml:space="preserve">Vandaag heb ik de usertests afgelegd met Louis </w:t>
-      </w:r>
-      <w:proofErr w:type="spellStart"/>
-      <w:r>
-        <w:t>D’hondt</w:t>
-      </w:r>
-      <w:proofErr w:type="spellEnd"/>
-      <w:r>
-        <w:t xml:space="preserve"> en Jasper Wauters. Dit ging heel gemakkelijk en duurde niet lang. Ik had niet echt serieuze opmerkingen, behalve dat ik geen persoonlijke info pagina gemaakt had.</w:t>
-      </w:r>
-      <w:r>
-        <w:t xml:space="preserve"> Daarna heb ik onmiddellijk die opmerkingen van mijn </w:t>
-      </w:r>
-      <w:proofErr w:type="spellStart"/>
-      <w:r>
-        <w:t>figma</w:t>
-      </w:r>
-      <w:proofErr w:type="spellEnd"/>
-      <w:r>
-        <w:t xml:space="preserve"> design verbetert en op mijn </w:t>
-      </w:r>
-      <w:proofErr w:type="spellStart"/>
-      <w:r>
-        <w:t>repository</w:t>
-      </w:r>
-      <w:proofErr w:type="spellEnd"/>
-      <w:r>
-        <w:t xml:space="preserve"> gezet.</w:t>
+        <w:t>Vandaag heb ik de usertests afgelegd met Louis D’hondt en Jasper Wauters. Dit ging heel gemakkelijk en duurde niet lang. Ik had niet echt serieuze opmerkingen, behalve dat ik geen persoonlijke info pagina gemaakt had.</w:t>
+      </w:r>
+      <w:r>
+        <w:t xml:space="preserve"> Daarna heb ik onmiddellijk die opmerkingen van mijn figma design verbetert en op mijn repository gezet.</w:t>
       </w:r>
     </w:p>
     <w:p/>
@@ -996,47 +629,7 @@
     </w:p>
     <w:p>
       <w:r>
-        <w:t xml:space="preserve">Vandaag begon ik eindelijk met </w:t>
-      </w:r>
-      <w:proofErr w:type="spellStart"/>
-      <w:r>
-        <w:t>Material</w:t>
-      </w:r>
-      <w:proofErr w:type="spellEnd"/>
-      <w:r>
-        <w:t xml:space="preserve"> Design. Ik besloot mijn oude app te verwijderen en te vervangen met een empty </w:t>
-      </w:r>
-      <w:proofErr w:type="spellStart"/>
-      <w:r>
-        <w:t>activity</w:t>
-      </w:r>
-      <w:proofErr w:type="spellEnd"/>
-      <w:r>
-        <w:t xml:space="preserve"> zodat ik echt van scratch begin. Zo kan ik alles beter begrijpen. Ik had dan ontdekt dat </w:t>
-      </w:r>
-      <w:proofErr w:type="spellStart"/>
-      <w:r>
-        <w:t>android</w:t>
-      </w:r>
-      <w:proofErr w:type="spellEnd"/>
-      <w:r>
-        <w:t xml:space="preserve"> studio al automatisch </w:t>
-      </w:r>
-      <w:proofErr w:type="spellStart"/>
-      <w:r>
-        <w:t>Material</w:t>
-      </w:r>
-      <w:proofErr w:type="spellEnd"/>
-      <w:r>
-        <w:t xml:space="preserve"> Design van Google had toegevoegd bij de </w:t>
-      </w:r>
-      <w:proofErr w:type="spellStart"/>
-      <w:r>
-        <w:t>dependencies</w:t>
-      </w:r>
-      <w:proofErr w:type="spellEnd"/>
-      <w:r>
-        <w:t xml:space="preserve">, dus eigenlijk ben ik </w:t>
+        <w:t xml:space="preserve">Vandaag begon ik eindelijk met Material Design. Ik besloot mijn oude app te verwijderen en te vervangen met een empty activity zodat ik echt van scratch begin. Zo kan ik alles beter begrijpen. Ik had dan ontdekt dat android studio al automatisch Material Design van Google had toegevoegd bij de dependencies, dus eigenlijk ben ik </w:t>
       </w:r>
       <w:r>
         <w:t>onmiddellijk</w:t>
@@ -1180,50 +773,18 @@
     </w:p>
     <w:p>
       <w:r>
-        <w:t xml:space="preserve">Eerst had ik geprobeerd om gewoon een heel nieuw project te maken die bestond uit een login </w:t>
-      </w:r>
-      <w:proofErr w:type="spellStart"/>
-      <w:r>
-        <w:t>activity</w:t>
-      </w:r>
-      <w:proofErr w:type="spellEnd"/>
-      <w:r>
-        <w:t xml:space="preserve">. Deze </w:t>
-      </w:r>
-      <w:proofErr w:type="spellStart"/>
-      <w:r>
-        <w:t>activity</w:t>
-      </w:r>
-      <w:proofErr w:type="spellEnd"/>
-      <w:r>
-        <w:t xml:space="preserve"> heb ik dan gewoon aangepast naar mijn wens. Maar dit wou ook niet echt werken, want blijkbaar is het best dat je van een </w:t>
-      </w:r>
-      <w:proofErr w:type="spellStart"/>
-      <w:r>
-        <w:t>main</w:t>
+        <w:t>Eerst had ik geprobeerd om gewoon een heel nieuw project te maken die bestond uit een login activity. Deze activity heb ik dan gewoon aangepast naar mijn wens. Maar dit wou ook niet echt werken, want blijkbaar is het best dat je van een main</w:t>
       </w:r>
       <w:r>
         <w:t>_</w:t>
       </w:r>
       <w:r>
-        <w:t>activity</w:t>
-      </w:r>
-      <w:proofErr w:type="spellEnd"/>
-      <w:r>
-        <w:t xml:space="preserve"> start en dan de login page daarmee opent.</w:t>
-      </w:r>
-    </w:p>
-    <w:p>
-      <w:r>
-        <w:t xml:space="preserve">Ik ben dan gewoon terug begonnen aan het oude project en heb dan de error op stack overflow gezocht en daar had ik de oplossing gevonden. Ik moest gewoon mijn “device” zijn data </w:t>
-      </w:r>
-      <w:proofErr w:type="spellStart"/>
-      <w:r>
-        <w:t>wipen</w:t>
-      </w:r>
-      <w:proofErr w:type="spellEnd"/>
-      <w:r>
-        <w:t xml:space="preserve"> en dan kon het opnieuw installeren want mijn oude projecten stond er nog op.</w:t>
+        <w:t>activity start en dan de login page daarmee opent.</w:t>
+      </w:r>
+    </w:p>
+    <w:p>
+      <w:r>
+        <w:t>Ik ben dan gewoon terug begonnen aan het oude project en heb dan de error op stack overflow gezocht en daar had ik de oplossing gevonden. Ik moest gewoon mijn “device” zijn data wipen en dan kon het opnieuw installeren want mijn oude projecten stond er nog op.</w:t>
       </w:r>
     </w:p>
     <w:p>
@@ -1267,23 +828,7 @@
         <w:t>Vandaag wou de wifi niet werken op de campus dus had ik niet veel vooruitgang geboekt.</w:t>
       </w:r>
       <w:r>
-        <w:t xml:space="preserve"> Ik was ook gisteren vergeten om de registratie pagina te </w:t>
-      </w:r>
-      <w:proofErr w:type="spellStart"/>
-      <w:r>
-        <w:t>committen</w:t>
-      </w:r>
-      <w:proofErr w:type="spellEnd"/>
-      <w:r>
-        <w:t xml:space="preserve">, dus da had ik alleszins gedaan door met mijn </w:t>
-      </w:r>
-      <w:proofErr w:type="spellStart"/>
-      <w:r>
-        <w:t>hotspot</w:t>
-      </w:r>
-      <w:proofErr w:type="spellEnd"/>
-      <w:r>
-        <w:t xml:space="preserve"> van mijn gsm te verbinden en de 4G aan te zetten.</w:t>
+        <w:t xml:space="preserve"> Ik was ook gisteren vergeten om de registratie pagina te committen, dus da had ik alleszins gedaan door met mijn hotspot van mijn gsm te verbinden en de 4G aan te zetten.</w:t>
       </w:r>
     </w:p>
     <w:p>
@@ -1315,21 +860,11 @@
         <w:t>Vandaag wou de wifi op school nog steeds niet zo goed werken</w:t>
       </w:r>
       <w:r>
-        <w:t xml:space="preserve">, maar dankzij de wifi </w:t>
-      </w:r>
-      <w:proofErr w:type="spellStart"/>
-      <w:r>
-        <w:t>hotspot</w:t>
-      </w:r>
-      <w:proofErr w:type="spellEnd"/>
-      <w:r>
-        <w:t xml:space="preserve"> heb ik toch nog de navigatie van login naar registratie kunnen </w:t>
-      </w:r>
-      <w:proofErr w:type="spellStart"/>
+        <w:t xml:space="preserve">, maar dankzij de wifi hotspot heb ik toch nog de navigatie van login naar registratie kunnen </w:t>
+      </w:r>
       <w:r>
         <w:t>commiten</w:t>
       </w:r>
-      <w:proofErr w:type="spellEnd"/>
       <w:r>
         <w:t>.</w:t>
       </w:r>
@@ -1339,15 +874,7 @@
     </w:p>
     <w:p>
       <w:r>
-        <w:t xml:space="preserve">De wifi wou uiteindelijk werken dus kon eindelijk heel vlot vooruitgaan. Ik heb daarbij de navigatie tussen de login en registratie kunnen afwerken. Daarna heb ik ook de startpagina bijna afgewerkt, maar de </w:t>
-      </w:r>
-      <w:proofErr w:type="spellStart"/>
-      <w:r>
-        <w:t>bottom</w:t>
-      </w:r>
-      <w:proofErr w:type="spellEnd"/>
-      <w:r>
-        <w:t xml:space="preserve"> bar wou niet helemaal meewerken dus dat laat ik voor later.</w:t>
+        <w:t>De wifi wou uiteindelijk werken dus kon eindelijk heel vlot vooruitgaan. Ik heb daarbij de navigatie tussen de login en registratie kunnen afwerken. Daarna heb ik ook de startpagina bijna afgewerkt, maar de bottom bar wou niet helemaal meewerken dus dat laat ik voor later.</w:t>
       </w:r>
     </w:p>
     <w:p/>
@@ -1368,31 +895,7 @@
     </w:p>
     <w:p>
       <w:r>
-        <w:t xml:space="preserve">Vandaag heb ik de bodem navigatie afgewerkt waarbij je dan naar je groepen kunt gaan oftewel naar je notities die je hebt gefotografeerd. Dit was eerste wel een </w:t>
-      </w:r>
-      <w:proofErr w:type="spellStart"/>
-      <w:r>
-        <w:t>challenge</w:t>
-      </w:r>
-      <w:proofErr w:type="spellEnd"/>
-      <w:r>
-        <w:t xml:space="preserve"> zoals de </w:t>
-      </w:r>
-      <w:proofErr w:type="spellStart"/>
-      <w:r>
-        <w:t>active</w:t>
-      </w:r>
-      <w:proofErr w:type="spellEnd"/>
-      <w:r>
-        <w:t xml:space="preserve"> pagina weergegeven of de juiste </w:t>
-      </w:r>
-      <w:proofErr w:type="spellStart"/>
-      <w:r>
-        <w:t>eventlistener</w:t>
-      </w:r>
-      <w:proofErr w:type="spellEnd"/>
-      <w:r>
-        <w:t xml:space="preserve"> gebruiken om te kunnen navigeren. Maar deze links hebben daarbij geholpen:</w:t>
+        <w:t>Vandaag heb ik de bodem navigatie afgewerkt waarbij je dan naar je groepen kunt gaan oftewel naar je notities die je hebt gefotografeerd. Dit was eerste wel een challenge zoals de active pagina weergegeven of de juiste eventlistener gebruiken om te kunnen navigeren. Maar deze links hebben daarbij geholpen:</w:t>
       </w:r>
     </w:p>
     <w:p>
@@ -1438,29 +941,13 @@
     </w:p>
     <w:p>
       <w:r>
-        <w:t xml:space="preserve">Ik heb dan ook nog voor gezorgd dat mijn </w:t>
-      </w:r>
-      <w:proofErr w:type="spellStart"/>
-      <w:r>
-        <w:t>firebase</w:t>
-      </w:r>
-      <w:proofErr w:type="spellEnd"/>
-      <w:r>
-        <w:t xml:space="preserve"> account verbonden is met</w:t>
+        <w:t>Ik heb dan ook nog voor gezorgd dat mijn firebase account verbonden is met</w:t>
       </w:r>
       <w:r>
         <w:t xml:space="preserve"> mijn</w:t>
       </w:r>
       <w:r>
-        <w:t xml:space="preserve"> </w:t>
-      </w:r>
-      <w:proofErr w:type="spellStart"/>
-      <w:r>
-        <w:t>android</w:t>
-      </w:r>
-      <w:proofErr w:type="spellEnd"/>
-      <w:r>
-        <w:t xml:space="preserve"> studio app.</w:t>
+        <w:t xml:space="preserve"> android studio app.</w:t>
       </w:r>
     </w:p>
     <w:p>
@@ -1617,13 +1104,8 @@
           <w:numId w:val="1"/>
         </w:numPr>
       </w:pPr>
-      <w:proofErr w:type="spellStart"/>
-      <w:r>
-        <w:t>Firebase</w:t>
-      </w:r>
-      <w:proofErr w:type="spellEnd"/>
-      <w:r>
-        <w:t xml:space="preserve"> implementeren</w:t>
+      <w:r>
+        <w:t>Firebase implementeren</w:t>
       </w:r>
     </w:p>
     <w:p>
@@ -1635,13 +1117,8 @@
         </w:numPr>
       </w:pPr>
       <w:r>
-        <w:t xml:space="preserve">Login en registratie mogelijk maken via </w:t>
-      </w:r>
-      <w:proofErr w:type="spellStart"/>
-      <w:r>
-        <w:t>firebase</w:t>
-      </w:r>
-      <w:proofErr w:type="spellEnd"/>
+        <w:t>Login en registratie mogelijk maken via firebase</w:t>
+      </w:r>
     </w:p>
     <w:p>
       <w:pPr>
@@ -1652,11 +1129,7 @@
         </w:numPr>
       </w:pPr>
       <w:r>
-        <w:t xml:space="preserve">Camera functionaliteit bekijken voor </w:t>
-      </w:r>
-      <w:proofErr w:type="spellStart"/>
-      <w:r>
-        <w:t>andr</w:t>
+        <w:t>Camera functionaliteit bekijken voor andr</w:t>
       </w:r>
       <w:r>
         <w:t>oi</w:t>
@@ -1664,7 +1137,6 @@
       <w:r>
         <w:t>d</w:t>
       </w:r>
-      <w:proofErr w:type="spellEnd"/>
     </w:p>
     <w:p/>
     <w:p>
@@ -1684,66 +1156,10 @@
     </w:p>
     <w:p>
       <w:r>
-        <w:t xml:space="preserve">Hier kan je ondertussen zien dat mijn app verbonden is met </w:t>
-      </w:r>
-      <w:proofErr w:type="spellStart"/>
-      <w:r>
-        <w:t>Firebase</w:t>
-      </w:r>
-      <w:proofErr w:type="spellEnd"/>
-      <w:r>
-        <w:t xml:space="preserve">. Nu vragen ze voor google </w:t>
-      </w:r>
-      <w:proofErr w:type="spellStart"/>
-      <w:r>
-        <w:t>sign</w:t>
-      </w:r>
-      <w:proofErr w:type="spellEnd"/>
-      <w:r>
-        <w:t xml:space="preserve">-in om een sha-1 </w:t>
-      </w:r>
-      <w:proofErr w:type="spellStart"/>
-      <w:r>
-        <w:t>fingerprint</w:t>
-      </w:r>
-      <w:proofErr w:type="spellEnd"/>
-      <w:r>
-        <w:t xml:space="preserve"> toe te voegen.</w:t>
-      </w:r>
-      <w:r>
-        <w:t xml:space="preserve"> Ik wou dan google </w:t>
-      </w:r>
-      <w:proofErr w:type="spellStart"/>
-      <w:r>
-        <w:t>play</w:t>
-      </w:r>
-      <w:proofErr w:type="spellEnd"/>
-      <w:r>
-        <w:t xml:space="preserve"> </w:t>
-      </w:r>
-      <w:proofErr w:type="spellStart"/>
-      <w:r>
-        <w:t>signing</w:t>
-      </w:r>
-      <w:proofErr w:type="spellEnd"/>
-      <w:r>
-        <w:t xml:space="preserve"> pakken om het te genereren </w:t>
-      </w:r>
-      <w:proofErr w:type="spellStart"/>
-      <w:r>
-        <w:t>ipv</w:t>
-      </w:r>
-      <w:proofErr w:type="spellEnd"/>
-      <w:r>
-        <w:t xml:space="preserve"> </w:t>
-      </w:r>
-      <w:proofErr w:type="spellStart"/>
-      <w:r>
-        <w:t>self-signing</w:t>
-      </w:r>
-      <w:proofErr w:type="spellEnd"/>
-      <w:r>
-        <w:t xml:space="preserve">, maar ik moet dan 25 euro eerst betalen voor een </w:t>
+        <w:t>Hier kan je ondertussen zien dat mijn app verbonden is met Firebase. Nu vragen ze voor google sign-in om een sha-1 fingerprint toe te voegen.</w:t>
+      </w:r>
+      <w:r>
+        <w:t xml:space="preserve"> Ik wou dan google play signing pakken om het te genereren ipv self-signing, maar ik moet dan 25 euro eerst betalen voor een </w:t>
       </w:r>
       <w:r>
         <w:t>ontwikkelaar</w:t>
@@ -1814,75 +1230,14 @@
       <w:r>
         <w:t>Als ik wat meer naar onderging bij de “</w:t>
       </w:r>
-      <w:proofErr w:type="spellStart"/>
-      <w:r>
-        <w:t>Authenticating</w:t>
-      </w:r>
-      <w:proofErr w:type="spellEnd"/>
-      <w:r>
-        <w:t xml:space="preserve"> </w:t>
-      </w:r>
-      <w:proofErr w:type="spellStart"/>
-      <w:r>
-        <w:t>Your</w:t>
-      </w:r>
-      <w:proofErr w:type="spellEnd"/>
-      <w:r>
-        <w:t xml:space="preserve"> Client</w:t>
-      </w:r>
-      <w:r>
-        <w:t xml:space="preserve">” pagina (zie link) kan je ook via de terminal van </w:t>
-      </w:r>
-      <w:proofErr w:type="spellStart"/>
-      <w:r>
-        <w:t>android</w:t>
-      </w:r>
-      <w:proofErr w:type="spellEnd"/>
-      <w:r>
-        <w:t xml:space="preserve"> studio een </w:t>
-      </w:r>
-      <w:proofErr w:type="spellStart"/>
-      <w:r>
-        <w:t>command</w:t>
-      </w:r>
-      <w:proofErr w:type="spellEnd"/>
-      <w:r>
-        <w:t xml:space="preserve"> invoeren om de sha-1 </w:t>
-      </w:r>
-      <w:proofErr w:type="spellStart"/>
-      <w:r>
-        <w:t>fingerprint</w:t>
-      </w:r>
-      <w:proofErr w:type="spellEnd"/>
-      <w:r>
-        <w:t xml:space="preserve"> te krijgen. Hierbij moest je “</w:t>
-      </w:r>
-      <w:proofErr w:type="spellStart"/>
-      <w:r>
-        <w:t>gradle</w:t>
-      </w:r>
-      <w:proofErr w:type="spellEnd"/>
-      <w:r>
-        <w:t xml:space="preserve"> </w:t>
-      </w:r>
-      <w:proofErr w:type="spellStart"/>
-      <w:r>
-        <w:t>sigingReport</w:t>
-      </w:r>
-      <w:proofErr w:type="spellEnd"/>
-      <w:r>
-        <w:t>” invoeren en dan ctrl + enter invoeren!!</w:t>
-      </w:r>
-      <w:r>
-        <w:t xml:space="preserve"> Deze heb ik dan toegevoegd aan </w:t>
-      </w:r>
-      <w:proofErr w:type="spellStart"/>
-      <w:r>
-        <w:t>Firebase</w:t>
-      </w:r>
-      <w:proofErr w:type="spellEnd"/>
-      <w:r>
-        <w:t>.</w:t>
+      <w:r>
+        <w:t>Authenticating Your Client</w:t>
+      </w:r>
+      <w:r>
+        <w:t>” pagina (zie link) kan je ook via de terminal van android studio een command invoeren om de sha-1 fingerprint te krijgen. Hierbij moest je “gradle sigingReport” invoeren en dan ctrl + enter invoeren!!</w:t>
+      </w:r>
+      <w:r>
+        <w:t xml:space="preserve"> Deze heb ik dan toegevoegd aan Firebase.</w:t>
       </w:r>
     </w:p>
     <w:p>
@@ -1930,15 +1285,7 @@
     </w:p>
     <w:p>
       <w:r>
-        <w:t xml:space="preserve">Daarna moest ik een </w:t>
-      </w:r>
-      <w:proofErr w:type="spellStart"/>
-      <w:r>
-        <w:t>Oauth</w:t>
-      </w:r>
-      <w:proofErr w:type="spellEnd"/>
-      <w:r>
-        <w:t xml:space="preserve"> 2.0 client ID toevoegen voor het inloggen. Hierbij moest ik een hele configuratie begaan.</w:t>
+        <w:t>Daarna moest ik een Oauth 2.0 client ID toevoegen voor het inloggen. Hierbij moest ik een hele configuratie begaan.</w:t>
       </w:r>
       <w:r>
         <w:t xml:space="preserve"> Ik heb hierbij het meest niet ingevuld zoals een privacy policy, enzoverder.</w:t>
@@ -2119,31 +1466,7 @@
     </w:p>
     <w:p>
       <w:r>
-        <w:t xml:space="preserve">Vandaag had ik tijdens les (in de morgen van 8u15-11u15) verder gewerkt aan de </w:t>
-      </w:r>
-      <w:proofErr w:type="spellStart"/>
-      <w:r>
-        <w:t>back-end</w:t>
-      </w:r>
-      <w:proofErr w:type="spellEnd"/>
-      <w:r>
-        <w:t xml:space="preserve"> van mijn app. Ik was gisteren bezig met google </w:t>
-      </w:r>
-      <w:proofErr w:type="spellStart"/>
-      <w:r>
-        <w:t>sign</w:t>
-      </w:r>
-      <w:proofErr w:type="spellEnd"/>
-      <w:r>
-        <w:t xml:space="preserve">-in, maar ik besloot om eerst normale email/password </w:t>
-      </w:r>
-      <w:proofErr w:type="spellStart"/>
-      <w:r>
-        <w:t>authentication</w:t>
-      </w:r>
-      <w:proofErr w:type="spellEnd"/>
-      <w:r>
-        <w:t xml:space="preserve"> toe te voegen. Dit ging vrij vlot vooruit maar toen ik de button klikt sloot de app af, dus dat moet ik nog oplossen. </w:t>
+        <w:t xml:space="preserve">Vandaag had ik tijdens les (in de morgen van 8u15-11u15) verder gewerkt aan de back-end van mijn app. Ik was gisteren bezig met google sign-in, maar ik besloot om eerst normale email/password authentication toe te voegen. Dit ging vrij vlot vooruit maar toen ik de button klikt sloot de app af, dus dat moet ik nog oplossen. </w:t>
       </w:r>
       <w:r>
         <w:t>Er werd</w:t>
@@ -2189,34 +1512,10 @@
         <w:t>Vandaag heb ik eindelijk de login en registratie kunnen afwerken. Dit had veel moeite gekost.</w:t>
       </w:r>
       <w:r>
-        <w:t xml:space="preserve"> Het probleem was dus dat mijn app bleef crashen als ik probeerde te registeren. Ik had veel op stackoverflow gezocht maar ik kon eerst niks vinden, maar toen zag ik dat de wifi van de device emulator op </w:t>
-      </w:r>
-      <w:proofErr w:type="gramStart"/>
-      <w:r>
-        <w:t>Android studio</w:t>
-      </w:r>
-      <w:proofErr w:type="gramEnd"/>
-      <w:r>
-        <w:t xml:space="preserve"> geen wifi had. Ik dacht eerst dat dit normaal was, maar begon toen twijfels te krijgen. Ik had dan eerst de info op stackoverflow pagina proberen gebruiken, maar dat was niet juist. Uiteindelijk gewoon mijn gsm </w:t>
-      </w:r>
-      <w:proofErr w:type="spellStart"/>
-      <w:r>
-        <w:t>hotspot</w:t>
-      </w:r>
-      <w:proofErr w:type="spellEnd"/>
-      <w:r>
-        <w:t xml:space="preserve"> 4G gebruiken werkte wel.</w:t>
-      </w:r>
-      <w:r>
-        <w:t xml:space="preserve"> Mijn app crasht dan nog steeds bij registratie maar ik kon wel inloggen door een test account aan te maken op </w:t>
-      </w:r>
-      <w:proofErr w:type="spellStart"/>
-      <w:r>
-        <w:t>Firebase</w:t>
-      </w:r>
-      <w:proofErr w:type="spellEnd"/>
-      <w:r>
-        <w:t>. Dus mijn code werkte, maar toen ik zag dat ik niet gekeken had naar de error van die verscheen na de crash en dat maakte alles duidelijk</w:t>
+        <w:t xml:space="preserve"> Het probleem was dus dat mijn app bleef crashen als ik probeerde te registeren. Ik had veel op stackoverflow gezocht maar ik kon eerst niks vinden, maar toen zag ik dat de wifi van de device emulator op Android studio geen wifi had. Ik dacht eerst dat dit normaal was, maar begon toen twijfels te krijgen. Ik had dan eerst de info op stackoverflow pagina proberen gebruiken, maar dat was niet juist. Uiteindelijk gewoon mijn gsm hotspot 4G gebruiken werkte wel.</w:t>
+      </w:r>
+      <w:r>
+        <w:t xml:space="preserve"> Mijn app crasht dan nog steeds bij registratie maar ik kon wel inloggen door een test account aan te maken op Firebase. Dus mijn code werkte, maar toen ik zag dat ik niet gekeken had naar de error van die verscheen na de crash en dat maakte alles duidelijk</w:t>
       </w:r>
       <w:r>
         <w:t xml:space="preserve"> voor mij</w:t>
@@ -2378,161 +1677,56 @@
           <w:rFonts w:eastAsia="Times New Roman" w:cstheme="minorHAnsi"/>
           <w:lang w:eastAsia="nl-BE"/>
         </w:rPr>
-        <w:t xml:space="preserve">Vandaag heb ik geprobeerd om google </w:t>
-      </w:r>
-      <w:proofErr w:type="spellStart"/>
+        <w:t>Vandaag heb ik geprobeerd om google sign-in te laten werken. Dit ging zeer goed, maar het enige probleem is dat de google account niet wordt toegevoegd aan Firebase en het wil daarna niet naar de volgende pagina gaan als ik de google sign</w:t>
+      </w:r>
       <w:r>
         <w:rPr>
           <w:rFonts w:eastAsia="Times New Roman" w:cstheme="minorHAnsi"/>
           <w:lang w:eastAsia="nl-BE"/>
         </w:rPr>
-        <w:t>sign</w:t>
-      </w:r>
-      <w:proofErr w:type="spellEnd"/>
+        <w:t>-</w:t>
+      </w:r>
       <w:r>
         <w:rPr>
           <w:rFonts w:eastAsia="Times New Roman" w:cstheme="minorHAnsi"/>
           <w:lang w:eastAsia="nl-BE"/>
         </w:rPr>
-        <w:t xml:space="preserve">-in te laten werken. Dit ging zeer goed, maar het enige probleem is dat de </w:t>
-      </w:r>
-      <w:proofErr w:type="gramStart"/>
+        <w:t>in button klik. Het sign-in scherm verschijnt wel en hebben geen errors, maar daarna gebeurt er niks. Ik heb de methode toegevoegd die iemand van teams zei dat die het probleem</w:t>
+      </w:r>
       <w:r>
         <w:rPr>
           <w:rFonts w:eastAsia="Times New Roman" w:cstheme="minorHAnsi"/>
           <w:lang w:eastAsia="nl-BE"/>
         </w:rPr>
-        <w:t>google account</w:t>
-      </w:r>
-      <w:proofErr w:type="gramEnd"/>
+        <w:t xml:space="preserve"> zou</w:t>
+      </w:r>
       <w:r>
         <w:rPr>
           <w:rFonts w:eastAsia="Times New Roman" w:cstheme="minorHAnsi"/>
           <w:lang w:eastAsia="nl-BE"/>
         </w:rPr>
-        <w:t xml:space="preserve"> niet wordt toegevoegd aan </w:t>
-      </w:r>
-      <w:proofErr w:type="spellStart"/>
+        <w:t xml:space="preserve"> oplos</w:t>
+      </w:r>
       <w:r>
         <w:rPr>
           <w:rFonts w:eastAsia="Times New Roman" w:cstheme="minorHAnsi"/>
           <w:lang w:eastAsia="nl-BE"/>
         </w:rPr>
-        <w:t>Firebase</w:t>
-      </w:r>
-      <w:proofErr w:type="spellEnd"/>
+        <w:t>sen</w:t>
+      </w:r>
       <w:r>
         <w:rPr>
           <w:rFonts w:eastAsia="Times New Roman" w:cstheme="minorHAnsi"/>
           <w:lang w:eastAsia="nl-BE"/>
         </w:rPr>
-        <w:t xml:space="preserve"> en het wil daarna niet naar de volgende pagina gaan als ik de google </w:t>
-      </w:r>
-      <w:proofErr w:type="spellStart"/>
+        <w:t xml:space="preserve"> maar er zal nog ergens een fout zitten.</w:t>
+      </w:r>
       <w:r>
         <w:rPr>
           <w:rFonts w:eastAsia="Times New Roman" w:cstheme="minorHAnsi"/>
           <w:lang w:eastAsia="nl-BE"/>
         </w:rPr>
-        <w:t>sign</w:t>
-      </w:r>
-      <w:proofErr w:type="spellEnd"/>
-      <w:r>
-        <w:rPr>
-          <w:rFonts w:eastAsia="Times New Roman" w:cstheme="minorHAnsi"/>
-          <w:lang w:eastAsia="nl-BE"/>
-        </w:rPr>
-        <w:t>-</w:t>
-      </w:r>
-      <w:r>
-        <w:rPr>
-          <w:rFonts w:eastAsia="Times New Roman" w:cstheme="minorHAnsi"/>
-          <w:lang w:eastAsia="nl-BE"/>
-        </w:rPr>
-        <w:t xml:space="preserve">in button klik. Het </w:t>
-      </w:r>
-      <w:proofErr w:type="spellStart"/>
-      <w:r>
-        <w:rPr>
-          <w:rFonts w:eastAsia="Times New Roman" w:cstheme="minorHAnsi"/>
-          <w:lang w:eastAsia="nl-BE"/>
-        </w:rPr>
-        <w:t>sign</w:t>
-      </w:r>
-      <w:proofErr w:type="spellEnd"/>
-      <w:r>
-        <w:rPr>
-          <w:rFonts w:eastAsia="Times New Roman" w:cstheme="minorHAnsi"/>
-          <w:lang w:eastAsia="nl-BE"/>
-        </w:rPr>
-        <w:t xml:space="preserve">-in scherm verschijnt wel en hebben geen </w:t>
-      </w:r>
-      <w:proofErr w:type="spellStart"/>
-      <w:r>
-        <w:rPr>
-          <w:rFonts w:eastAsia="Times New Roman" w:cstheme="minorHAnsi"/>
-          <w:lang w:eastAsia="nl-BE"/>
-        </w:rPr>
-        <w:t>errors</w:t>
-      </w:r>
-      <w:proofErr w:type="spellEnd"/>
-      <w:r>
-        <w:rPr>
-          <w:rFonts w:eastAsia="Times New Roman" w:cstheme="minorHAnsi"/>
-          <w:lang w:eastAsia="nl-BE"/>
-        </w:rPr>
-        <w:t>, maar daarna gebeurt er niks. Ik heb de methode toegevoegd die iemand van teams zei dat die het probleem</w:t>
-      </w:r>
-      <w:r>
-        <w:rPr>
-          <w:rFonts w:eastAsia="Times New Roman" w:cstheme="minorHAnsi"/>
-          <w:lang w:eastAsia="nl-BE"/>
-        </w:rPr>
-        <w:t xml:space="preserve"> zou</w:t>
-      </w:r>
-      <w:r>
-        <w:rPr>
-          <w:rFonts w:eastAsia="Times New Roman" w:cstheme="minorHAnsi"/>
-          <w:lang w:eastAsia="nl-BE"/>
-        </w:rPr>
-        <w:t xml:space="preserve"> oplos</w:t>
-      </w:r>
-      <w:r>
-        <w:rPr>
-          <w:rFonts w:eastAsia="Times New Roman" w:cstheme="minorHAnsi"/>
-          <w:lang w:eastAsia="nl-BE"/>
-        </w:rPr>
-        <w:t>sen</w:t>
-      </w:r>
-      <w:r>
-        <w:rPr>
-          <w:rFonts w:eastAsia="Times New Roman" w:cstheme="minorHAnsi"/>
-          <w:lang w:eastAsia="nl-BE"/>
-        </w:rPr>
-        <w:t xml:space="preserve"> maar er zal nog ergens een fout zitten.</w:t>
-      </w:r>
-      <w:r>
-        <w:rPr>
-          <w:rFonts w:eastAsia="Times New Roman" w:cstheme="minorHAnsi"/>
-          <w:lang w:eastAsia="nl-BE"/>
-        </w:rPr>
-        <w:t xml:space="preserve"> 1 van de methodes was wel </w:t>
-      </w:r>
-      <w:proofErr w:type="spellStart"/>
-      <w:r>
-        <w:rPr>
-          <w:rFonts w:eastAsia="Times New Roman" w:cstheme="minorHAnsi"/>
-          <w:lang w:eastAsia="nl-BE"/>
-        </w:rPr>
-        <w:t>deprecated</w:t>
-      </w:r>
-      <w:proofErr w:type="spellEnd"/>
-      <w:r>
-        <w:rPr>
-          <w:rFonts w:eastAsia="Times New Roman" w:cstheme="minorHAnsi"/>
-          <w:lang w:eastAsia="nl-BE"/>
-        </w:rPr>
-        <w:t xml:space="preserve">, maar die had </w:t>
+        <w:t xml:space="preserve"> 1 van de methodes was wel deprecated, maar die had </w:t>
       </w:r>
       <w:r>
         <w:rPr>
@@ -2697,192 +1891,14 @@
           <w:rFonts w:eastAsia="Times New Roman" w:cstheme="minorHAnsi"/>
           <w:lang w:eastAsia="nl-BE"/>
         </w:rPr>
-        <w:t xml:space="preserve">Vandaag is het me gelukt om de google </w:t>
-      </w:r>
-      <w:proofErr w:type="spellStart"/>
+        <w:t>Vandaag is het me gelukt om de google sign-in te laten werken. Ik had veel opzoek werk gedaan op google maar kon niks duidelijk vinden. Ik had mijn code ook gedebugd, maar geen duidelijk error werd weergegeven. Uiteindelijk besloot ik opzoek te gaan naar een tutorial die recent was in 2021. Deze tutorial heb ik dan gebruikt om mijn project strict te controleren en toen realiseerde ik dat de SHA-1 niet op de juiste plaats stond. Ik had op google cloud een Oauth 2.0 client id moeten aanmaken toen ik de android studio firebase tutorial volgde, maar dat bleek dus helemaal fout te zijn, want de echte client_id was eigenlijk al klaar in een google-services.json file. Ik moest toen ook mijn SHA-1 fingerprint verwijderen bij de onderstaande afbeelding, maar dat mocht daar eigenlijk blijven staan.</w:t>
+      </w:r>
       <w:r>
         <w:rPr>
           <w:rFonts w:eastAsia="Times New Roman" w:cstheme="minorHAnsi"/>
           <w:lang w:eastAsia="nl-BE"/>
         </w:rPr>
-        <w:t>sign</w:t>
-      </w:r>
-      <w:proofErr w:type="spellEnd"/>
-      <w:r>
-        <w:rPr>
-          <w:rFonts w:eastAsia="Times New Roman" w:cstheme="minorHAnsi"/>
-          <w:lang w:eastAsia="nl-BE"/>
-        </w:rPr>
-        <w:t xml:space="preserve">-in te laten werken. Ik had veel opzoek werk gedaan op google maar kon niks duidelijk vinden. Ik had mijn code ook gedebugd, maar geen duidelijk error werd weergegeven. Uiteindelijk besloot ik opzoek te gaan naar een tutorial die recent was in 2021. Deze tutorial heb ik dan gebruikt om mijn project </w:t>
-      </w:r>
-      <w:proofErr w:type="spellStart"/>
-      <w:r>
-        <w:rPr>
-          <w:rFonts w:eastAsia="Times New Roman" w:cstheme="minorHAnsi"/>
-          <w:lang w:eastAsia="nl-BE"/>
-        </w:rPr>
-        <w:t>strict</w:t>
-      </w:r>
-      <w:proofErr w:type="spellEnd"/>
-      <w:r>
-        <w:rPr>
-          <w:rFonts w:eastAsia="Times New Roman" w:cstheme="minorHAnsi"/>
-          <w:lang w:eastAsia="nl-BE"/>
-        </w:rPr>
-        <w:t xml:space="preserve"> te controleren en toen realiseerde ik dat de SHA-1 niet op de juiste plaats stond. Ik had op google </w:t>
-      </w:r>
-      <w:proofErr w:type="spellStart"/>
-      <w:r>
-        <w:rPr>
-          <w:rFonts w:eastAsia="Times New Roman" w:cstheme="minorHAnsi"/>
-          <w:lang w:eastAsia="nl-BE"/>
-        </w:rPr>
-        <w:t>cloud</w:t>
-      </w:r>
-      <w:proofErr w:type="spellEnd"/>
-      <w:r>
-        <w:rPr>
-          <w:rFonts w:eastAsia="Times New Roman" w:cstheme="minorHAnsi"/>
-          <w:lang w:eastAsia="nl-BE"/>
-        </w:rPr>
-        <w:t xml:space="preserve"> een </w:t>
-      </w:r>
-      <w:proofErr w:type="spellStart"/>
-      <w:r>
-        <w:rPr>
-          <w:rFonts w:eastAsia="Times New Roman" w:cstheme="minorHAnsi"/>
-          <w:lang w:eastAsia="nl-BE"/>
-        </w:rPr>
-        <w:t>Oauth</w:t>
-      </w:r>
-      <w:proofErr w:type="spellEnd"/>
-      <w:r>
-        <w:rPr>
-          <w:rFonts w:eastAsia="Times New Roman" w:cstheme="minorHAnsi"/>
-          <w:lang w:eastAsia="nl-BE"/>
-        </w:rPr>
-        <w:t xml:space="preserve"> 2.0 client </w:t>
-      </w:r>
-      <w:proofErr w:type="spellStart"/>
-      <w:r>
-        <w:rPr>
-          <w:rFonts w:eastAsia="Times New Roman" w:cstheme="minorHAnsi"/>
-          <w:lang w:eastAsia="nl-BE"/>
-        </w:rPr>
-        <w:t>id</w:t>
-      </w:r>
-      <w:proofErr w:type="spellEnd"/>
-      <w:r>
-        <w:rPr>
-          <w:rFonts w:eastAsia="Times New Roman" w:cstheme="minorHAnsi"/>
-          <w:lang w:eastAsia="nl-BE"/>
-        </w:rPr>
-        <w:t xml:space="preserve"> moeten aanmaken toen ik de </w:t>
-      </w:r>
-      <w:proofErr w:type="spellStart"/>
-      <w:r>
-        <w:rPr>
-          <w:rFonts w:eastAsia="Times New Roman" w:cstheme="minorHAnsi"/>
-          <w:lang w:eastAsia="nl-BE"/>
-        </w:rPr>
-        <w:t>android</w:t>
-      </w:r>
-      <w:proofErr w:type="spellEnd"/>
-      <w:r>
-        <w:rPr>
-          <w:rFonts w:eastAsia="Times New Roman" w:cstheme="minorHAnsi"/>
-          <w:lang w:eastAsia="nl-BE"/>
-        </w:rPr>
-        <w:t xml:space="preserve"> studio </w:t>
-      </w:r>
-      <w:proofErr w:type="spellStart"/>
-      <w:r>
-        <w:rPr>
-          <w:rFonts w:eastAsia="Times New Roman" w:cstheme="minorHAnsi"/>
-          <w:lang w:eastAsia="nl-BE"/>
-        </w:rPr>
-        <w:t>firebase</w:t>
-      </w:r>
-      <w:proofErr w:type="spellEnd"/>
-      <w:r>
-        <w:rPr>
-          <w:rFonts w:eastAsia="Times New Roman" w:cstheme="minorHAnsi"/>
-          <w:lang w:eastAsia="nl-BE"/>
-        </w:rPr>
-        <w:t xml:space="preserve"> tutorial volgde, maar dat bleek dus helemaal fout te zijn, want de echte </w:t>
-      </w:r>
-      <w:proofErr w:type="spellStart"/>
-      <w:r>
-        <w:rPr>
-          <w:rFonts w:eastAsia="Times New Roman" w:cstheme="minorHAnsi"/>
-          <w:lang w:eastAsia="nl-BE"/>
-        </w:rPr>
-        <w:t>client_id</w:t>
-      </w:r>
-      <w:proofErr w:type="spellEnd"/>
-      <w:r>
-        <w:rPr>
-          <w:rFonts w:eastAsia="Times New Roman" w:cstheme="minorHAnsi"/>
-          <w:lang w:eastAsia="nl-BE"/>
-        </w:rPr>
-        <w:t xml:space="preserve"> was eigenlijk al klaar in een google-</w:t>
-      </w:r>
-      <w:proofErr w:type="spellStart"/>
-      <w:proofErr w:type="gramStart"/>
-      <w:r>
-        <w:rPr>
-          <w:rFonts w:eastAsia="Times New Roman" w:cstheme="minorHAnsi"/>
-          <w:lang w:eastAsia="nl-BE"/>
-        </w:rPr>
-        <w:t>services.json</w:t>
-      </w:r>
-      <w:proofErr w:type="spellEnd"/>
-      <w:proofErr w:type="gramEnd"/>
-      <w:r>
-        <w:rPr>
-          <w:rFonts w:eastAsia="Times New Roman" w:cstheme="minorHAnsi"/>
-          <w:lang w:eastAsia="nl-BE"/>
-        </w:rPr>
-        <w:t xml:space="preserve"> file. Ik moest toen ook mijn SHA-1 </w:t>
-      </w:r>
-      <w:proofErr w:type="spellStart"/>
-      <w:r>
-        <w:rPr>
-          <w:rFonts w:eastAsia="Times New Roman" w:cstheme="minorHAnsi"/>
-          <w:lang w:eastAsia="nl-BE"/>
-        </w:rPr>
-        <w:t>fingerprint</w:t>
-      </w:r>
-      <w:proofErr w:type="spellEnd"/>
-      <w:r>
-        <w:rPr>
-          <w:rFonts w:eastAsia="Times New Roman" w:cstheme="minorHAnsi"/>
-          <w:lang w:eastAsia="nl-BE"/>
-        </w:rPr>
-        <w:t xml:space="preserve"> verwijderen bij de onderstaande afbeelding, maar dat mocht daar eigenlijk blijven staan.</w:t>
-      </w:r>
-      <w:r>
-        <w:rPr>
-          <w:rFonts w:eastAsia="Times New Roman" w:cstheme="minorHAnsi"/>
-          <w:lang w:eastAsia="nl-BE"/>
-        </w:rPr>
-        <w:t xml:space="preserve"> Nu kunnen </w:t>
-      </w:r>
-      <w:proofErr w:type="gramStart"/>
-      <w:r>
-        <w:rPr>
-          <w:rFonts w:eastAsia="Times New Roman" w:cstheme="minorHAnsi"/>
-          <w:lang w:eastAsia="nl-BE"/>
-        </w:rPr>
-        <w:t>google accounts</w:t>
-      </w:r>
-      <w:proofErr w:type="gramEnd"/>
-      <w:r>
-        <w:rPr>
-          <w:rFonts w:eastAsia="Times New Roman" w:cstheme="minorHAnsi"/>
-          <w:lang w:eastAsia="nl-BE"/>
-        </w:rPr>
-        <w:t xml:space="preserve"> succesvol worden toegevoegd.</w:t>
+        <w:t xml:space="preserve"> Nu kunnen google accounts succesvol worden toegevoegd.</w:t>
       </w:r>
       <w:r>
         <w:rPr>
@@ -3094,13 +2110,8 @@
           <w:numId w:val="2"/>
         </w:numPr>
       </w:pPr>
-      <w:proofErr w:type="spellStart"/>
-      <w:r>
-        <w:t>Firebase</w:t>
-      </w:r>
-      <w:proofErr w:type="spellEnd"/>
-      <w:r>
-        <w:t xml:space="preserve"> </w:t>
+      <w:r>
+        <w:t xml:space="preserve">Firebase </w:t>
       </w:r>
       <w:r>
         <w:t>storage</w:t>
@@ -3142,43 +2153,19 @@
     </w:p>
     <w:p>
       <w:r>
-        <w:t xml:space="preserve">Vandaag ben ik begonnen met aanmaken van de </w:t>
-      </w:r>
-      <w:proofErr w:type="spellStart"/>
-      <w:r>
-        <w:t>Firebase</w:t>
-      </w:r>
-      <w:proofErr w:type="spellEnd"/>
-      <w:r>
-        <w:t xml:space="preserve"> storage voor het opslaan van afbeeldingen.</w:t>
+        <w:t>Vandaag ben ik begonnen met aanmaken van de Firebase storage voor het opslaan van afbeeldingen.</w:t>
       </w:r>
       <w:r>
         <w:t xml:space="preserve"> </w:t>
       </w:r>
       <w:r>
-        <w:t xml:space="preserve">Ik heb dan de </w:t>
-      </w:r>
-      <w:proofErr w:type="spellStart"/>
-      <w:r>
-        <w:t>dependencies</w:t>
-      </w:r>
-      <w:proofErr w:type="spellEnd"/>
-      <w:r>
-        <w:t xml:space="preserve"> toegevoegd en dan moest ik een Cloud storage bucket aanmaken. Hierbij werd er gevraagd om een locatie te kiezen waarbij Europe-west 1 (= Belgische regio) niet tussen stond, maar gelukkig is er Eur3 die eigenlijk Belgische en Nederlandse regio voorstelt. Dat werd uitgelegd </w:t>
-      </w:r>
-      <w:r>
-        <w:t xml:space="preserve">op deze </w:t>
-      </w:r>
-      <w:proofErr w:type="gramStart"/>
-      <w:r>
-        <w:t>webpagina</w:t>
-      </w:r>
-      <w:r>
-        <w:t>‘</w:t>
-      </w:r>
-      <w:proofErr w:type="gramEnd"/>
-      <w:r>
-        <w:t>s</w:t>
+        <w:t xml:space="preserve">Ik heb dan de dependencies toegevoegd en dan moest ik een Cloud storage bucket aanmaken. Hierbij werd er gevraagd om een locatie te kiezen waarbij Europe-west 1 (= Belgische regio) niet tussen stond, maar gelukkig is er Eur3 die eigenlijk Belgische en Nederlandse regio voorstelt. Dat werd uitgelegd </w:t>
+      </w:r>
+      <w:r>
+        <w:t>op deze webpagina</w:t>
+      </w:r>
+      <w:r>
+        <w:t>‘s</w:t>
       </w:r>
       <w:r>
         <w:t>:</w:t>
@@ -3285,52 +2272,12 @@
     </w:p>
     <w:p>
       <w:r>
-        <w:t xml:space="preserve">Vandaag heb ik de </w:t>
-      </w:r>
-      <w:proofErr w:type="spellStart"/>
-      <w:r>
-        <w:t>java</w:t>
-      </w:r>
-      <w:proofErr w:type="spellEnd"/>
-      <w:r>
-        <w:t xml:space="preserve"> code moet schrijven voor de camera te kunnen gebruiken. Eerst heb ik code toegevoegd dat ervoor zorgt dat de permissies worden aangevraagd om de camera te kunnen gebruiken. Daarna als ik </w:t>
-      </w:r>
-      <w:proofErr w:type="spellStart"/>
-      <w:r>
-        <w:t>allow</w:t>
-      </w:r>
-      <w:proofErr w:type="spellEnd"/>
-      <w:r>
-        <w:t xml:space="preserve"> klik dan opent een test camera zicht van de emulator. </w:t>
-      </w:r>
-    </w:p>
-    <w:p>
-      <w:r>
-        <w:t xml:space="preserve">Hierbij werden gelijkaardig methoden gebruikt zoals de </w:t>
-      </w:r>
-      <w:proofErr w:type="spellStart"/>
-      <w:r>
-        <w:t>firebase</w:t>
-      </w:r>
-      <w:proofErr w:type="spellEnd"/>
-      <w:r>
-        <w:t xml:space="preserve"> </w:t>
-      </w:r>
-      <w:proofErr w:type="spellStart"/>
-      <w:r>
-        <w:t>authentication</w:t>
-      </w:r>
-      <w:proofErr w:type="spellEnd"/>
-      <w:r>
-        <w:t xml:space="preserve">, maar waren ook </w:t>
-      </w:r>
-      <w:proofErr w:type="spellStart"/>
-      <w:r>
-        <w:t>deprecated</w:t>
-      </w:r>
-      <w:proofErr w:type="spellEnd"/>
-      <w:r>
-        <w:t>. Dit heb natuurlijk makkelijk opgelost.</w:t>
+        <w:t xml:space="preserve">Vandaag heb ik de java code moet schrijven voor de camera te kunnen gebruiken. Eerst heb ik code toegevoegd dat ervoor zorgt dat de permissies worden aangevraagd om de camera te kunnen gebruiken. Daarna als ik allow klik dan opent een test camera zicht van de emulator. </w:t>
+      </w:r>
+    </w:p>
+    <w:p>
+      <w:r>
+        <w:t>Hierbij werden gelijkaardig methoden gebruikt zoals de firebase authentication, maar waren ook deprecated. Dit heb natuurlijk makkelijk opgelost.</w:t>
       </w:r>
     </w:p>
     <w:p>
@@ -3404,15 +2351,7 @@
     </w:p>
     <w:p>
       <w:r>
-        <w:t xml:space="preserve">Vandaag heb ik geprobeerd om de image die getrokken wordt op te slaan in </w:t>
-      </w:r>
-      <w:proofErr w:type="spellStart"/>
-      <w:r>
-        <w:t>firebase</w:t>
-      </w:r>
-      <w:proofErr w:type="spellEnd"/>
-      <w:r>
-        <w:t xml:space="preserve"> storage</w:t>
+        <w:t>Vandaag heb ik geprobeerd om de image die getrokken wordt op te slaan in firebase storage</w:t>
       </w:r>
       <w:r>
         <w:t>. Dit is op het einde van de les gelukt.</w:t>
@@ -3466,90 +2405,10 @@
     <w:p>
       <w:r>
         <w:lastRenderedPageBreak/>
-        <w:t xml:space="preserve">Hierbij had ik vooral problemen met de </w:t>
-      </w:r>
-      <w:proofErr w:type="spellStart"/>
-      <w:r>
-        <w:t>uri</w:t>
-      </w:r>
-      <w:proofErr w:type="spellEnd"/>
-      <w:r>
-        <w:t xml:space="preserve"> </w:t>
-      </w:r>
-      <w:proofErr w:type="spellStart"/>
-      <w:r>
-        <w:t>oftewl</w:t>
-      </w:r>
-      <w:proofErr w:type="spellEnd"/>
-      <w:r>
-        <w:t xml:space="preserve"> URL omdat </w:t>
-      </w:r>
-      <w:proofErr w:type="spellStart"/>
-      <w:r>
-        <w:t>firebase</w:t>
-      </w:r>
-      <w:proofErr w:type="spellEnd"/>
-      <w:r>
-        <w:t xml:space="preserve"> die nodig had om te kunnen uploaden. Als je naar de eerste rode streep kijkt is er een methode voor </w:t>
-      </w:r>
-      <w:r>
-        <w:t xml:space="preserve">de </w:t>
-      </w:r>
-      <w:proofErr w:type="spellStart"/>
-      <w:r>
-        <w:t>bitmap</w:t>
-      </w:r>
-      <w:proofErr w:type="spellEnd"/>
-      <w:r>
-        <w:t xml:space="preserve"> die je krijgt van de camera te gebruiken om de </w:t>
-      </w:r>
-      <w:proofErr w:type="spellStart"/>
-      <w:r>
-        <w:t>uri</w:t>
-      </w:r>
-      <w:proofErr w:type="spellEnd"/>
-      <w:r>
-        <w:t xml:space="preserve"> te bepalen. De volgende is voor de bestandextensie te krijgen om een </w:t>
-      </w:r>
-      <w:proofErr w:type="spellStart"/>
-      <w:r>
-        <w:t>filename</w:t>
-      </w:r>
-      <w:proofErr w:type="spellEnd"/>
-      <w:r>
-        <w:t xml:space="preserve"> op te stellen in de </w:t>
-      </w:r>
-      <w:proofErr w:type="spellStart"/>
-      <w:r>
-        <w:t>firebase</w:t>
-      </w:r>
-      <w:proofErr w:type="spellEnd"/>
-      <w:r>
-        <w:t xml:space="preserve"> storage. Hierbij pak ik gewoon het tijdstip met de bestandextensie, maar ik ben misschien van plan om de </w:t>
-      </w:r>
-      <w:proofErr w:type="spellStart"/>
-      <w:r>
-        <w:t>filename</w:t>
-      </w:r>
-      <w:proofErr w:type="spellEnd"/>
-      <w:r>
-        <w:t xml:space="preserve"> te kunnen aanpassen door de gebruiker. De laatste streep zijn twee </w:t>
-      </w:r>
-      <w:proofErr w:type="spellStart"/>
-      <w:r>
-        <w:t>child</w:t>
-      </w:r>
-      <w:proofErr w:type="spellEnd"/>
-      <w:r>
-        <w:t xml:space="preserve"> </w:t>
-      </w:r>
-      <w:proofErr w:type="spellStart"/>
-      <w:r>
-        <w:t>methods</w:t>
-      </w:r>
-      <w:proofErr w:type="spellEnd"/>
-      <w:r>
-        <w:t xml:space="preserve"> waarbij dus de eerste de map voorstelt waar dan de 2</w:t>
+        <w:t xml:space="preserve">Hierbij had ik vooral problemen met de uri oftewl URL omdat firebase die nodig had om te kunnen uploaden. Als je naar de eerste rode streep kijkt is er een methode voor </w:t>
+      </w:r>
+      <w:r>
+        <w:t>de bitmap die je krijgt van de camera te gebruiken om de uri te bepalen. De volgende is voor de bestandextensie te krijgen om een filename op te stellen in de firebase storage. Hierbij pak ik gewoon het tijdstip met de bestandextensie, maar ik ben misschien van plan om de filename te kunnen aanpassen door de gebruiker. De laatste streep zijn twee child methods waarbij dus de eerste de map voorstelt waar dan de 2</w:t>
       </w:r>
       <w:r>
         <w:rPr>
@@ -3558,23 +2417,7 @@
         <w:t>de</w:t>
       </w:r>
       <w:r>
-        <w:t xml:space="preserve"> </w:t>
-      </w:r>
-      <w:proofErr w:type="spellStart"/>
-      <w:r>
-        <w:t>child</w:t>
-      </w:r>
-      <w:proofErr w:type="spellEnd"/>
-      <w:r>
-        <w:t xml:space="preserve"> oftewel de image inkomt. De map geef </w:t>
-      </w:r>
-      <w:proofErr w:type="gramStart"/>
-      <w:r>
-        <w:t>ik  het</w:t>
-      </w:r>
-      <w:proofErr w:type="gramEnd"/>
-      <w:r>
-        <w:t xml:space="preserve"> email adres van de gebruiker als naam.</w:t>
+        <w:t xml:space="preserve"> child oftewel de image inkomt. De map geef ik  het email adres van de gebruiker als naam.</w:t>
       </w:r>
     </w:p>
     <w:p>
@@ -3714,15 +2557,7 @@
         <w:t>je gsm</w:t>
       </w:r>
       <w:r>
-        <w:t xml:space="preserve"> </w:t>
-      </w:r>
-      <w:proofErr w:type="spellStart"/>
-      <w:r>
-        <w:t>gallery</w:t>
-      </w:r>
-      <w:proofErr w:type="spellEnd"/>
-      <w:r>
-        <w:t xml:space="preserve"> gebruiken)</w:t>
+        <w:t xml:space="preserve"> gallery gebruiken)</w:t>
       </w:r>
     </w:p>
     <w:p/>
@@ -3743,23 +2578,7 @@
     </w:p>
     <w:p>
       <w:r>
-        <w:t xml:space="preserve">Vandaag heb ik geprobeerd om een </w:t>
-      </w:r>
-      <w:proofErr w:type="spellStart"/>
-      <w:r>
-        <w:t>gridview</w:t>
-      </w:r>
-      <w:proofErr w:type="spellEnd"/>
-      <w:r>
-        <w:t xml:space="preserve"> toe te voegen die images bevat dat dus lijkt op een image </w:t>
-      </w:r>
-      <w:proofErr w:type="spellStart"/>
-      <w:r>
-        <w:t>gallery</w:t>
-      </w:r>
-      <w:proofErr w:type="spellEnd"/>
-      <w:r>
-        <w:t xml:space="preserve"> zoals uw “foto’s” app. Hierbij heb ik de </w:t>
+        <w:t xml:space="preserve">Vandaag heb ik geprobeerd om een gridview toe te voegen die images bevat dat dus lijkt op een image gallery zoals uw “foto’s” app. Hierbij heb ik de </w:t>
       </w:r>
       <w:r>
         <w:t>volgende</w:t>
@@ -3804,15 +2623,7 @@
     </w:p>
     <w:p>
       <w:r>
-        <w:t xml:space="preserve">Dit heeft nog niet direct resultaat gegeven, maar de </w:t>
-      </w:r>
-      <w:proofErr w:type="spellStart"/>
-      <w:r>
-        <w:t>GridAdapter</w:t>
-      </w:r>
-      <w:proofErr w:type="spellEnd"/>
-      <w:r>
-        <w:t xml:space="preserve"> class geeft een gevoel dat ik wel op de goeie weg zit.</w:t>
+        <w:t>Dit heeft nog niet direct resultaat gegeven, maar de GridAdapter class geeft een gevoel dat ik wel op de goeie weg zit.</w:t>
       </w:r>
     </w:p>
     <w:p/>
@@ -3833,31 +2644,7 @@
     </w:p>
     <w:p>
       <w:r>
-        <w:t xml:space="preserve">Na de </w:t>
-      </w:r>
-      <w:proofErr w:type="spellStart"/>
-      <w:r>
-        <w:t>GridAdapter</w:t>
-      </w:r>
-      <w:proofErr w:type="spellEnd"/>
-      <w:r>
-        <w:t xml:space="preserve"> klasse te controleren ontdekte ik dat ik gewoon het verkeerd image </w:t>
-      </w:r>
-      <w:proofErr w:type="spellStart"/>
-      <w:r>
-        <w:t>Id</w:t>
-      </w:r>
-      <w:proofErr w:type="spellEnd"/>
-      <w:r>
-        <w:t xml:space="preserve"> doorgegeven heb. Dit heeft het probleem onmiddellijk </w:t>
-      </w:r>
-      <w:proofErr w:type="spellStart"/>
-      <w:r>
-        <w:t>gefixed</w:t>
-      </w:r>
-      <w:proofErr w:type="spellEnd"/>
-      <w:r>
-        <w:t xml:space="preserve"> als zijn de voorbeeld images niet echt mooi gepositioneerd.</w:t>
+        <w:t>Na de GridAdapter klasse te controleren ontdekte ik dat ik gewoon het verkeerd image Id doorgegeven heb. Dit heeft het probleem onmiddellijk gefixed als zijn de voorbeeld images niet echt mooi gepositioneerd.</w:t>
       </w:r>
     </w:p>
     <w:p>
@@ -3911,15 +2698,7 @@
         <w:t>gedetailleerd</w:t>
       </w:r>
       <w:r>
-        <w:t xml:space="preserve"> tutorial gevolgd hoe je met een </w:t>
-      </w:r>
-      <w:proofErr w:type="spellStart"/>
-      <w:r>
-        <w:t>gridview</w:t>
-      </w:r>
-      <w:proofErr w:type="spellEnd"/>
-      <w:r>
-        <w:t xml:space="preserve"> kan werken:</w:t>
+        <w:t xml:space="preserve"> tutorial gevolgd hoe je met een gridview kan werken:</w:t>
       </w:r>
     </w:p>
     <w:p>
@@ -3934,63 +2713,10 @@
     </w:p>
     <w:p>
       <w:r>
-        <w:t xml:space="preserve">Daarna heb ik er nog voor gezorgd dat de </w:t>
-      </w:r>
-      <w:proofErr w:type="spellStart"/>
-      <w:r>
-        <w:t>margin</w:t>
-      </w:r>
-      <w:proofErr w:type="spellEnd"/>
-      <w:r>
-        <w:t xml:space="preserve"> top en </w:t>
-      </w:r>
-      <w:proofErr w:type="spellStart"/>
-      <w:r>
-        <w:t>bottom</w:t>
-      </w:r>
-      <w:proofErr w:type="spellEnd"/>
-      <w:r>
-        <w:t xml:space="preserve"> via </w:t>
-      </w:r>
-      <w:proofErr w:type="spellStart"/>
-      <w:r>
-        <w:t>java</w:t>
-      </w:r>
-      <w:proofErr w:type="spellEnd"/>
-      <w:r>
-        <w:t xml:space="preserve"> code worden aangepast afhankelijk van de </w:t>
-      </w:r>
-      <w:r>
-        <w:t xml:space="preserve">hoogte van de header en </w:t>
-      </w:r>
-      <w:proofErr w:type="spellStart"/>
-      <w:r>
-        <w:t>footer</w:t>
-      </w:r>
-      <w:proofErr w:type="spellEnd"/>
-      <w:r>
-        <w:t xml:space="preserve">. Dit </w:t>
-      </w:r>
-      <w:proofErr w:type="spellStart"/>
-      <w:r>
-        <w:t>werdt</w:t>
-      </w:r>
-      <w:proofErr w:type="spellEnd"/>
-      <w:r>
-        <w:t xml:space="preserve"> gedaan in </w:t>
-      </w:r>
-      <w:proofErr w:type="spellStart"/>
-      <w:proofErr w:type="gramStart"/>
-      <w:r>
-        <w:t>OnCreateView</w:t>
-      </w:r>
-      <w:proofErr w:type="spellEnd"/>
-      <w:r>
-        <w:t>(</w:t>
-      </w:r>
-      <w:proofErr w:type="gramEnd"/>
-      <w:r>
-        <w:t>):</w:t>
+        <w:t xml:space="preserve">Daarna heb ik er nog voor gezorgd dat de margin top en bottom via java code worden aangepast afhankelijk van de </w:t>
+      </w:r>
+      <w:r>
+        <w:t>hoogte van de header en footer. Dit werdt gedaan in OnCreateView():</w:t>
       </w:r>
     </w:p>
     <w:p>
@@ -4038,66 +2764,13 @@
     </w:p>
     <w:p>
       <w:r>
-        <w:t xml:space="preserve">Ik heb dan de elementen een witte achtergrond gegeven en dan een border rond gedaan dat eigenlijk vrij moeilijk en inefficiënt moet worden opgeroepen in </w:t>
-      </w:r>
-      <w:proofErr w:type="spellStart"/>
-      <w:r>
-        <w:t>android</w:t>
-      </w:r>
-      <w:proofErr w:type="spellEnd"/>
-      <w:r>
-        <w:t xml:space="preserve"> studio door middel van een &lt;</w:t>
-      </w:r>
-      <w:proofErr w:type="spellStart"/>
-      <w:r>
-        <w:t>shape</w:t>
-      </w:r>
-      <w:proofErr w:type="spellEnd"/>
-      <w:r>
-        <w:t xml:space="preserve">&gt; </w:t>
-      </w:r>
-      <w:proofErr w:type="spellStart"/>
-      <w:r>
-        <w:t>xml</w:t>
-      </w:r>
-      <w:proofErr w:type="spellEnd"/>
-      <w:r>
-        <w:t xml:space="preserve"> file te maken in de </w:t>
-      </w:r>
-      <w:proofErr w:type="spellStart"/>
-      <w:r>
-        <w:t>res</w:t>
-      </w:r>
-      <w:proofErr w:type="spellEnd"/>
-      <w:r>
-        <w:t>/</w:t>
-      </w:r>
-      <w:proofErr w:type="spellStart"/>
-      <w:r>
-        <w:t>drawable</w:t>
-      </w:r>
-      <w:proofErr w:type="spellEnd"/>
-      <w:r>
-        <w:t xml:space="preserve"> folder en die een </w:t>
-      </w:r>
-      <w:proofErr w:type="spellStart"/>
-      <w:r>
-        <w:t>stroke</w:t>
-      </w:r>
-      <w:proofErr w:type="spellEnd"/>
+        <w:t>Ik heb dan de elementen een witte achtergrond gegeven en dan een border rond gedaan dat eigenlijk vrij moeilijk en inefficiënt moet worden opgeroepen in android studio door middel van een &lt;shape&gt; xml file te maken in de res/drawable folder en die een stroke</w:t>
+      </w:r>
       <w:r>
         <w:t>, enzoverder</w:t>
       </w:r>
       <w:r>
-        <w:t xml:space="preserve"> te geven. Dan wordt deze </w:t>
-      </w:r>
-      <w:proofErr w:type="spellStart"/>
-      <w:r>
-        <w:t>drawable</w:t>
-      </w:r>
-      <w:proofErr w:type="spellEnd"/>
-      <w:r>
-        <w:t xml:space="preserve"> als achtergrond geplaatst van de imageview.</w:t>
+        <w:t xml:space="preserve"> te geven. Dan wordt deze drawable als achtergrond geplaatst van de imageview.</w:t>
       </w:r>
       <w:r>
         <w:t xml:space="preserve"> De lege elementen zijn gewoon witte icoontjes die dus niet zichtbaar zijn door de witte achtergrond.</w:t>
@@ -4148,23 +2821,7 @@
     <w:p/>
     <w:p>
       <w:r>
-        <w:t xml:space="preserve">Om te eindigen, moest ik nog de images van </w:t>
-      </w:r>
-      <w:proofErr w:type="spellStart"/>
-      <w:r>
-        <w:t>firebase</w:t>
-      </w:r>
-      <w:proofErr w:type="spellEnd"/>
-      <w:r>
-        <w:t xml:space="preserve"> toevoegen hierbij heb ik vooral code van stackoverflow gebruikt om mijn oude klassen en </w:t>
-      </w:r>
-      <w:proofErr w:type="spellStart"/>
-      <w:r>
-        <w:t>methods</w:t>
-      </w:r>
-      <w:proofErr w:type="spellEnd"/>
-      <w:r>
-        <w:t xml:space="preserve"> te verbeteren.</w:t>
+        <w:t>Om te eindigen, moest ik nog de images van firebase toevoegen hierbij heb ik vooral code van stackoverflow gebruikt om mijn oude klassen en methods te verbeteren.</w:t>
       </w:r>
     </w:p>
     <w:p>
@@ -4261,83 +2918,14 @@
     </w:p>
     <w:p>
       <w:r>
-        <w:t xml:space="preserve">Ik had een image asset toegevoegd dat dus </w:t>
-      </w:r>
-      <w:proofErr w:type="gramStart"/>
-      <w:r>
-        <w:t>er voor</w:t>
-      </w:r>
-      <w:proofErr w:type="gramEnd"/>
-      <w:r>
-        <w:t xml:space="preserve"> zorgde dat de oude logo files worden vervangen. Hierbij heb een logo afbeelding als </w:t>
-      </w:r>
-      <w:proofErr w:type="spellStart"/>
-      <w:r>
-        <w:t>foreground</w:t>
-      </w:r>
-      <w:proofErr w:type="spellEnd"/>
-      <w:r>
-        <w:t xml:space="preserve"> en een transparant afbeelding als background. Maar dit wou niet helemaal werken door </w:t>
-      </w:r>
-      <w:proofErr w:type="spellStart"/>
-      <w:r>
-        <w:t>adaptive</w:t>
-      </w:r>
-      <w:proofErr w:type="spellEnd"/>
-      <w:r>
-        <w:t xml:space="preserve"> icon en </w:t>
-      </w:r>
-      <w:proofErr w:type="spellStart"/>
-      <w:r>
-        <w:t>legacy</w:t>
-      </w:r>
-      <w:proofErr w:type="spellEnd"/>
-      <w:r>
-        <w:t xml:space="preserve"> optie. De app als het om mijn emulator </w:t>
+        <w:t xml:space="preserve">Ik had een image asset toegevoegd dat dus er voor zorgde dat de oude logo files worden vervangen. Hierbij heb een logo afbeelding als foreground en een transparant afbeelding als background. Maar dit wou niet helemaal werken door adaptive icon en legacy optie. De app als het om mijn emulator </w:t>
       </w:r>
       <w:r>
         <w:lastRenderedPageBreak/>
-        <w:t xml:space="preserve">staat kreeg een zwarte achtergrond omdat transparant niet bestaat bij </w:t>
-      </w:r>
-      <w:proofErr w:type="spellStart"/>
-      <w:r>
-        <w:t>adaptive</w:t>
-      </w:r>
-      <w:proofErr w:type="spellEnd"/>
-      <w:r>
-        <w:t xml:space="preserve"> </w:t>
-      </w:r>
-      <w:proofErr w:type="spellStart"/>
-      <w:r>
-        <w:t>icons</w:t>
-      </w:r>
-      <w:proofErr w:type="spellEnd"/>
-      <w:r>
-        <w:t xml:space="preserve">. Dus wat ik gedaan had was het gewoon op </w:t>
-      </w:r>
-      <w:proofErr w:type="spellStart"/>
-      <w:r>
-        <w:t>legacy</w:t>
-      </w:r>
-      <w:proofErr w:type="spellEnd"/>
-      <w:r>
-        <w:t xml:space="preserve"> </w:t>
-      </w:r>
-      <w:proofErr w:type="spellStart"/>
-      <w:r>
-        <w:t>only</w:t>
-      </w:r>
-      <w:proofErr w:type="spellEnd"/>
-      <w:r>
-        <w:t xml:space="preserve"> optie zetten waar ik gewoon eigenlijk de background kan weghalen door de </w:t>
-      </w:r>
-      <w:proofErr w:type="spellStart"/>
-      <w:r>
-        <w:t>shape</w:t>
-      </w:r>
-      <w:proofErr w:type="spellEnd"/>
-      <w:r>
-        <w:t xml:space="preserve"> als cirkel aan te duiden</w:t>
+        <w:t>staat kreeg een zwarte achtergrond omdat transparant niet bestaat bij adaptive icons. Dus wat ik gedaan had was het gewoon op legacy only</w:t>
+      </w:r>
+      <w:r>
+        <w:t xml:space="preserve"> optie zetten waar ik gewoon eigenlijk de background kan weghalen door de shape als cirkel aan te duiden</w:t>
       </w:r>
       <w:r>
         <w:t>.</w:t>
@@ -4403,31 +2991,7 @@
     </w:p>
     <w:p>
       <w:r>
-        <w:t xml:space="preserve">Vandaag heb ik ervoor gezorgd dat ik image van uw gsm </w:t>
-      </w:r>
-      <w:proofErr w:type="spellStart"/>
-      <w:r>
-        <w:t>gallery</w:t>
-      </w:r>
-      <w:proofErr w:type="spellEnd"/>
-      <w:r>
-        <w:t xml:space="preserve"> kan uploaden. Hierbij dacht ik eerst dat automatisch de </w:t>
-      </w:r>
-      <w:proofErr w:type="spellStart"/>
-      <w:r>
-        <w:t>gallery</w:t>
-      </w:r>
-      <w:proofErr w:type="spellEnd"/>
-      <w:r>
-        <w:t xml:space="preserve"> die klaarstaat in de camera app kon gebruiken zoals bij facebook </w:t>
-      </w:r>
-      <w:proofErr w:type="spellStart"/>
-      <w:r>
-        <w:t>messenger</w:t>
-      </w:r>
-      <w:proofErr w:type="spellEnd"/>
-      <w:r>
-        <w:t>, maar bestaat niet echt blijkbaar. Ik heb hiervoor zelfs een vraag gesteld op stackoverflow.</w:t>
+        <w:t>Vandaag heb ik ervoor gezorgd dat ik image van uw gsm gallery kan uploaden. Hierbij dacht ik eerst dat automatisch de gallery die klaarstaat in de camera app kon gebruiken zoals bij facebook messenger, maar bestaat niet echt blijkbaar. Ik heb hiervoor zelfs een vraag gesteld op stackoverflow.</w:t>
       </w:r>
     </w:p>
     <w:p>
@@ -4442,39 +3006,7 @@
     </w:p>
     <w:p>
       <w:r>
-        <w:t xml:space="preserve">Uiteindelijk heb ik gewoon besloten om de camera en </w:t>
-      </w:r>
-      <w:proofErr w:type="spellStart"/>
-      <w:r>
-        <w:t>gallery</w:t>
-      </w:r>
-      <w:proofErr w:type="spellEnd"/>
-      <w:r>
-        <w:t xml:space="preserve"> op te splitsen en te kunnen openen in </w:t>
-      </w:r>
-      <w:proofErr w:type="spellStart"/>
-      <w:r>
-        <w:t>popup</w:t>
-      </w:r>
-      <w:proofErr w:type="spellEnd"/>
-      <w:r>
-        <w:t xml:space="preserve"> </w:t>
-      </w:r>
-      <w:proofErr w:type="gramStart"/>
-      <w:r>
-        <w:t>keuze menu</w:t>
-      </w:r>
-      <w:proofErr w:type="gramEnd"/>
-      <w:r>
-        <w:t xml:space="preserve">. De code voor de </w:t>
-      </w:r>
-      <w:proofErr w:type="spellStart"/>
-      <w:r>
-        <w:t>gallery</w:t>
-      </w:r>
-      <w:proofErr w:type="spellEnd"/>
-      <w:r>
-        <w:t xml:space="preserve"> functionaliteiten </w:t>
+        <w:t xml:space="preserve">Uiteindelijk heb ik gewoon besloten om de camera en gallery op te splitsen en te kunnen openen in popup keuze menu. De code voor de gallery functionaliteiten </w:t>
       </w:r>
       <w:r>
         <w:t>is</w:t>
@@ -4573,23 +3105,7 @@
         </w:numPr>
       </w:pPr>
       <w:r>
-        <w:t xml:space="preserve">Vragen dat het ok is om je image te </w:t>
-      </w:r>
-      <w:proofErr w:type="spellStart"/>
-      <w:r>
-        <w:t>compressen</w:t>
-      </w:r>
-      <w:proofErr w:type="spellEnd"/>
-      <w:r>
-        <w:t xml:space="preserve"> (</w:t>
-      </w:r>
-      <w:proofErr w:type="spellStart"/>
-      <w:r>
-        <w:t>quality</w:t>
-      </w:r>
-      <w:proofErr w:type="spellEnd"/>
-      <w:r>
-        <w:t xml:space="preserve"> verlies?)</w:t>
+        <w:t>Vragen dat het ok is om je image te compressen (quality verlies?)</w:t>
       </w:r>
     </w:p>
     <w:p>
@@ -4601,21 +3117,8 @@
         </w:numPr>
       </w:pPr>
       <w:r>
-        <w:t xml:space="preserve">Image van de </w:t>
-      </w:r>
-      <w:proofErr w:type="spellStart"/>
-      <w:r>
-        <w:t>gridview</w:t>
-      </w:r>
-      <w:proofErr w:type="spellEnd"/>
-      <w:r>
-        <w:t xml:space="preserve"> kunnen openen in full </w:t>
-      </w:r>
-      <w:proofErr w:type="spellStart"/>
-      <w:r>
-        <w:t>size</w:t>
-      </w:r>
-      <w:proofErr w:type="spellEnd"/>
+        <w:t>Image van de gridview kunnen openen in full size</w:t>
+      </w:r>
     </w:p>
     <w:p>
       <w:pPr>
@@ -4626,15 +3129,7 @@
         </w:numPr>
       </w:pPr>
       <w:r>
-        <w:t xml:space="preserve">App op google </w:t>
-      </w:r>
-      <w:proofErr w:type="spellStart"/>
-      <w:r>
-        <w:t>playstore</w:t>
-      </w:r>
-      <w:proofErr w:type="spellEnd"/>
-      <w:r>
-        <w:t xml:space="preserve"> plaatsen!!</w:t>
+        <w:t>App op google playstore plaatsen!!</w:t>
       </w:r>
     </w:p>
     <w:p>
@@ -4645,13 +3140,8 @@
           <w:numId w:val="2"/>
         </w:numPr>
       </w:pPr>
-      <w:proofErr w:type="spellStart"/>
-      <w:r>
-        <w:t>Offfline</w:t>
-      </w:r>
-      <w:proofErr w:type="spellEnd"/>
-      <w:r>
-        <w:t xml:space="preserve"> functionaliteiten toevoegen?</w:t>
+      <w:r>
+        <w:t>Offfline functionaliteiten toevoegen?</w:t>
       </w:r>
     </w:p>
     <w:p/>
@@ -4672,82 +3162,16 @@
     </w:p>
     <w:p>
       <w:r>
-        <w:t xml:space="preserve">Vandaag wou ik beginnen met het uploaden van mijn app op google </w:t>
-      </w:r>
-      <w:proofErr w:type="spellStart"/>
-      <w:r>
-        <w:t>play</w:t>
-      </w:r>
-      <w:proofErr w:type="spellEnd"/>
-      <w:r>
-        <w:t xml:space="preserve"> maar toen ik tutorial volgde moest ik eerst mijn app package name veranderen want </w:t>
-      </w:r>
-      <w:proofErr w:type="spellStart"/>
-      <w:r>
-        <w:t>com.example</w:t>
-      </w:r>
-      <w:proofErr w:type="spellEnd"/>
-      <w:r>
-        <w:t xml:space="preserve"> is niet correct. Toen ik dat veranderen </w:t>
-      </w:r>
-      <w:r>
-        <w:t xml:space="preserve">werkte de google services niet meer want de package name was </w:t>
-      </w:r>
-      <w:proofErr w:type="spellStart"/>
-      <w:r>
-        <w:t>com.example</w:t>
-      </w:r>
-      <w:proofErr w:type="spellEnd"/>
-      <w:r>
-        <w:t xml:space="preserve"> in de google-</w:t>
-      </w:r>
-      <w:proofErr w:type="spellStart"/>
-      <w:proofErr w:type="gramStart"/>
-      <w:r>
-        <w:t>services.json</w:t>
-      </w:r>
-      <w:proofErr w:type="spellEnd"/>
-      <w:proofErr w:type="gramEnd"/>
-      <w:r>
-        <w:t xml:space="preserve"> file. Dus ik moest mijn app in </w:t>
-      </w:r>
-      <w:proofErr w:type="spellStart"/>
-      <w:r>
-        <w:t>firebase</w:t>
-      </w:r>
-      <w:proofErr w:type="spellEnd"/>
-      <w:r>
-        <w:t xml:space="preserve"> opnieuw maken dat niet echt moeilijk was.</w:t>
-      </w:r>
-      <w:r>
-        <w:t xml:space="preserve"> Daarna heb ik een </w:t>
-      </w:r>
-      <w:proofErr w:type="spellStart"/>
-      <w:r>
-        <w:t>android</w:t>
-      </w:r>
-      <w:proofErr w:type="spellEnd"/>
-      <w:r>
-        <w:t xml:space="preserve"> app </w:t>
-      </w:r>
-      <w:proofErr w:type="spellStart"/>
-      <w:r>
-        <w:t>bundle</w:t>
-      </w:r>
-      <w:proofErr w:type="spellEnd"/>
-      <w:r>
-        <w:t xml:space="preserve"> aangemaakt want dit is nodig voor de release.</w:t>
-      </w:r>
-      <w:r>
-        <w:t xml:space="preserve"> Ze vroeg dan om </w:t>
-      </w:r>
-      <w:proofErr w:type="spellStart"/>
-      <w:r>
-        <w:t>developer</w:t>
-      </w:r>
-      <w:proofErr w:type="spellEnd"/>
-      <w:r>
-        <w:t xml:space="preserve"> account aan te maken waarbij ik 1 keer 25 euro moest betalen. Daarbij was ik effe gestopt want mijn ouders waren niet thuis voor een mastercard te gebruiken.</w:t>
+        <w:t xml:space="preserve">Vandaag wou ik beginnen met het uploaden van mijn app op google play maar toen ik tutorial volgde moest ik eerst mijn app package name veranderen want com.example is niet correct. Toen ik dat veranderen </w:t>
+      </w:r>
+      <w:r>
+        <w:t>werkte de google services niet meer want de package name was com.example in de google-services.json file. Dus ik moest mijn app in firebase opnieuw maken dat niet echt moeilijk was.</w:t>
+      </w:r>
+      <w:r>
+        <w:t xml:space="preserve"> Daarna heb ik een android app bundle aangemaakt want dit is nodig voor de release.</w:t>
+      </w:r>
+      <w:r>
+        <w:t xml:space="preserve"> Ze vroeg dan om developer account aan te maken waarbij ik 1 keer 25 euro moest betalen. Daarbij was ik effe gestopt want mijn ouders waren niet thuis voor een mastercard te gebruiken.</w:t>
       </w:r>
     </w:p>
     <w:p>
@@ -4824,15 +3248,7 @@
     </w:p>
     <w:p>
       <w:r>
-        <w:t xml:space="preserve">In de avond heb ik dan mijn </w:t>
-      </w:r>
-      <w:proofErr w:type="spellStart"/>
-      <w:r>
-        <w:t>developer</w:t>
-      </w:r>
-      <w:proofErr w:type="spellEnd"/>
-      <w:r>
-        <w:t xml:space="preserve"> account aangemaakt.</w:t>
+        <w:t>In de avond heb ik dan mijn developer account aangemaakt.</w:t>
       </w:r>
     </w:p>
     <w:p/>
@@ -4856,23 +3272,7 @@
         <w:t>Vandaag ben ik effe kort begonnen met het beter beveiligen van het wachtwoord om te registeren en in te loggen</w:t>
       </w:r>
       <w:r>
-        <w:t xml:space="preserve">. Hierbij vraag ik dus dat het wachtwoord een kleine letter, grote letter, geen spaties, 1 nummer en een lengte van 8 tekens heeft. Dit wordt weergegeven als een error onder de wachtwoord </w:t>
-      </w:r>
-      <w:proofErr w:type="spellStart"/>
-      <w:r>
-        <w:t>textbox</w:t>
-      </w:r>
-      <w:proofErr w:type="spellEnd"/>
-      <w:r>
-        <w:t xml:space="preserve">. Het email wordt dankzij </w:t>
-      </w:r>
-      <w:proofErr w:type="spellStart"/>
-      <w:r>
-        <w:t>firebase</w:t>
-      </w:r>
-      <w:proofErr w:type="spellEnd"/>
-      <w:r>
-        <w:t xml:space="preserve"> al gevalideerd dat het correct is, dus ik moet zelf geen error toevoegen. </w:t>
+        <w:t xml:space="preserve">. Hierbij vraag ik dus dat het wachtwoord een kleine letter, grote letter, geen spaties, 1 nummer en een lengte van 8 tekens heeft. Dit wordt weergegeven als een error onder de wachtwoord textbox. Het email wordt dankzij firebase al gevalideerd dat het correct is, dus ik moet zelf geen error toevoegen. </w:t>
       </w:r>
       <w:r>
         <w:t>Maar er wordt wel een toast bericht voor de zekerheid weergegeven vanonder als de registratie mislukt</w:t>
@@ -4883,45 +3283,13 @@
     </w:p>
     <w:p>
       <w:r>
-        <w:t xml:space="preserve">Daarna heb ik de app </w:t>
-      </w:r>
-      <w:proofErr w:type="spellStart"/>
-      <w:r>
-        <w:t>bundle</w:t>
-      </w:r>
-      <w:proofErr w:type="spellEnd"/>
-      <w:r>
-        <w:t xml:space="preserve"> </w:t>
+        <w:t xml:space="preserve">Daarna heb ik de app bundle </w:t>
       </w:r>
       <w:r>
         <w:t>geüpdatet</w:t>
       </w:r>
       <w:r>
-        <w:t xml:space="preserve"> naar de volgende versie, omdat er aanpassingen waren. Deze release heb ik dan op google </w:t>
-      </w:r>
-      <w:proofErr w:type="spellStart"/>
-      <w:r>
-        <w:t>play</w:t>
-      </w:r>
-      <w:proofErr w:type="spellEnd"/>
-      <w:r>
-        <w:t xml:space="preserve"> console geüpload, hierbij moest ik nog in </w:t>
-      </w:r>
-      <w:proofErr w:type="gramStart"/>
-      <w:r>
-        <w:t>de dashboard</w:t>
-      </w:r>
-      <w:proofErr w:type="gramEnd"/>
-      <w:r>
-        <w:t xml:space="preserve"> veel taken afleggen. De belangrijksten waren bijvoorbeeld een test account meegeven zodat google dit kan gebruiken om mijn app te controleren, een </w:t>
-      </w:r>
-      <w:proofErr w:type="spellStart"/>
-      <w:r>
-        <w:t>privacybeleid</w:t>
-      </w:r>
-      <w:proofErr w:type="spellEnd"/>
-      <w:r>
-        <w:t xml:space="preserve"> toevoegen hi</w:t>
+        <w:t xml:space="preserve"> naar de volgende versie, omdat er aanpassingen waren. Deze release heb ik dan op google play console geüpload, hierbij moest ik nog in de dashboard veel taken afleggen. De belangrijksten waren bijvoorbeeld een test account meegeven zodat google dit kan gebruiken om mijn app te controleren, een privacybeleid toevoegen hi</w:t>
       </w:r>
       <w:r>
         <w:t>er</w:t>
@@ -4973,77 +3341,13 @@
     </w:p>
     <w:p>
       <w:r>
-        <w:t xml:space="preserve">Hierbij had vooral deze </w:t>
-      </w:r>
-      <w:proofErr w:type="spellStart"/>
-      <w:r>
-        <w:t>youtube</w:t>
-      </w:r>
-      <w:proofErr w:type="spellEnd"/>
-      <w:r>
-        <w:t xml:space="preserve"> video nodig omdat ik de </w:t>
-      </w:r>
-      <w:proofErr w:type="spellStart"/>
-      <w:r>
-        <w:t>uri</w:t>
-      </w:r>
-      <w:proofErr w:type="spellEnd"/>
-      <w:r>
-        <w:t xml:space="preserve"> van de image die ik aan klik moest doorsturen naar het een fragment waar je de </w:t>
-      </w:r>
-      <w:proofErr w:type="spellStart"/>
-      <w:r>
-        <w:t>img</w:t>
-      </w:r>
-      <w:proofErr w:type="spellEnd"/>
-      <w:r>
-        <w:t xml:space="preserve"> in het groot kan bekijken. </w:t>
-      </w:r>
-      <w:r>
-        <w:t xml:space="preserve">Ik maakte toen een keer grote fout door een nieuwe </w:t>
-      </w:r>
-      <w:proofErr w:type="spellStart"/>
-      <w:r>
-        <w:t>imageDetailsFragment</w:t>
-      </w:r>
-      <w:proofErr w:type="spellEnd"/>
-      <w:r>
-        <w:t xml:space="preserve"> te openen als ik eigenlijk een </w:t>
-      </w:r>
-      <w:proofErr w:type="spellStart"/>
-      <w:r>
-        <w:t>bundle</w:t>
-      </w:r>
-      <w:proofErr w:type="spellEnd"/>
-      <w:r>
-        <w:t xml:space="preserve"> (waar de </w:t>
-      </w:r>
-      <w:proofErr w:type="spellStart"/>
-      <w:r>
-        <w:t>uri</w:t>
-      </w:r>
-      <w:proofErr w:type="spellEnd"/>
-      <w:r>
-        <w:t xml:space="preserve"> wordt opgeslagen)</w:t>
-      </w:r>
-      <w:r>
-        <w:t xml:space="preserve"> had toegevoegd aan een </w:t>
-      </w:r>
-      <w:proofErr w:type="spellStart"/>
-      <w:r>
-        <w:t>ImageDetailsFragment</w:t>
-      </w:r>
-      <w:proofErr w:type="spellEnd"/>
-      <w:r>
-        <w:t xml:space="preserve"> als </w:t>
-      </w:r>
-      <w:proofErr w:type="spellStart"/>
-      <w:r>
-        <w:t>arguments</w:t>
-      </w:r>
-      <w:proofErr w:type="spellEnd"/>
-      <w:r>
-        <w:t>. Ik navigeerde eigenlijk naar een fragment zonder argumenten die hard nodig had. Dit heb ik natuurlijk opgelost</w:t>
+        <w:t xml:space="preserve">Hierbij had vooral deze youtube video nodig omdat ik de uri van de image die ik aan klik moest doorsturen naar het een fragment waar je de img in het groot kan bekijken. </w:t>
+      </w:r>
+      <w:r>
+        <w:t>Ik maakte toen een keer grote fout door een nieuwe imageDetailsFragment te openen als ik eigenlijk een bundle (waar de uri wordt opgeslagen)</w:t>
+      </w:r>
+      <w:r>
+        <w:t xml:space="preserve"> had toegevoegd aan een ImageDetailsFragment als arguments. Ik navigeerde eigenlijk naar een fragment zonder argumenten die hard nodig had. Dit heb ik natuurlijk opgelost</w:t>
       </w:r>
       <w:r>
         <w:t xml:space="preserve"> zie onderstaande </w:t>
@@ -5057,15 +3361,7 @@
     </w:p>
     <w:p>
       <w:r>
-        <w:t xml:space="preserve">Het enige probleempje dat er nog is, is dat sommige afbeeldingen die vergroot worden </w:t>
-      </w:r>
-      <w:proofErr w:type="spellStart"/>
-      <w:r>
-        <w:t>onscherm</w:t>
-      </w:r>
-      <w:proofErr w:type="spellEnd"/>
-      <w:r>
-        <w:t xml:space="preserve"> kunnen uitzien.</w:t>
+        <w:t>Het enige probleempje dat er nog is, is dat sommige afbeeldingen die vergroot worden onscherm kunnen uitzien.</w:t>
       </w:r>
       <w:r>
         <w:t xml:space="preserve"> </w:t>
@@ -5143,15 +3439,7 @@
     </w:p>
     <w:p>
       <w:r>
-        <w:t xml:space="preserve">Vandaag heb ik een </w:t>
-      </w:r>
-      <w:proofErr w:type="spellStart"/>
-      <w:r>
-        <w:t>realtime</w:t>
-      </w:r>
-      <w:proofErr w:type="spellEnd"/>
-      <w:r>
-        <w:t xml:space="preserve"> database aangemaakt om een chat functionaliteiten toe te voegen.</w:t>
+        <w:t>Vandaag heb ik een realtime database aangemaakt om een chat functionaliteiten toe te voegen.</w:t>
       </w:r>
       <w:r>
         <w:t xml:space="preserve"> Hierbij ga ik de volgende video’s gebruiken:</w:t>
@@ -5239,13 +3527,8 @@
           <w:numId w:val="2"/>
         </w:numPr>
       </w:pPr>
-      <w:proofErr w:type="spellStart"/>
-      <w:r>
-        <w:t>Offfline</w:t>
-      </w:r>
-      <w:proofErr w:type="spellEnd"/>
-      <w:r>
-        <w:t xml:space="preserve"> functionaliteiten toevoegen?</w:t>
+      <w:r>
+        <w:t>Offfline functionaliteiten toevoegen?</w:t>
       </w:r>
     </w:p>
     <w:p>
@@ -5280,15 +3563,7 @@
     </w:p>
     <w:p>
       <w:r>
-        <w:t xml:space="preserve">Vandaag is mijn app beschikbaar op google </w:t>
-      </w:r>
-      <w:proofErr w:type="spellStart"/>
-      <w:r>
-        <w:t>play</w:t>
-      </w:r>
-      <w:proofErr w:type="spellEnd"/>
-      <w:r>
-        <w:t xml:space="preserve"> die je via deze link kan downloaden.</w:t>
+        <w:t>Vandaag is mijn app beschikbaar op google play die je via deze link kan downloaden.</w:t>
       </w:r>
     </w:p>
     <w:p>
@@ -5303,29 +3578,13 @@
     </w:p>
     <w:p>
       <w:r>
-        <w:t xml:space="preserve">Toen ik het had gedownload merkte ik dat google login niet wou werken. Dit heb ik dan onmiddellijk opgezocht en ik moest gewoon een extra SHA1 </w:t>
-      </w:r>
-      <w:proofErr w:type="spellStart"/>
-      <w:r>
-        <w:t>fingerp</w:t>
+        <w:t>Toen ik het had gedownload merkte ik dat google login niet wou werken. Dit heb ik dan onmiddellijk opgezocht en ik moest gewoon een extra SHA1 fingerp</w:t>
       </w:r>
       <w:r>
         <w:t>r</w:t>
       </w:r>
       <w:r>
-        <w:t>int</w:t>
-      </w:r>
-      <w:proofErr w:type="spellEnd"/>
-      <w:r>
-        <w:t xml:space="preserve"> van google </w:t>
-      </w:r>
-      <w:proofErr w:type="spellStart"/>
-      <w:r>
-        <w:t>play</w:t>
-      </w:r>
-      <w:proofErr w:type="spellEnd"/>
-      <w:r>
-        <w:t xml:space="preserve"> nog toevoegen aan mijn app. Dus nu werkt hij perfect.</w:t>
+        <w:t>int van google play nog toevoegen aan mijn app. Dus nu werkt hij perfect.</w:t>
       </w:r>
     </w:p>
     <w:p>
@@ -5345,23 +3604,7 @@
     </w:p>
     <w:p>
       <w:r>
-        <w:t xml:space="preserve">Ik heb dan geprobeerd om data toe te voegen aan mijn </w:t>
-      </w:r>
-      <w:proofErr w:type="spellStart"/>
-      <w:r>
-        <w:t>realtime</w:t>
-      </w:r>
-      <w:proofErr w:type="spellEnd"/>
-      <w:r>
-        <w:t xml:space="preserve"> database maar nog geen succes. Ik moest nu stoppen omdat ik een </w:t>
-      </w:r>
-      <w:proofErr w:type="gramStart"/>
-      <w:r>
-        <w:t>online gesprek</w:t>
-      </w:r>
-      <w:proofErr w:type="gramEnd"/>
-      <w:r>
-        <w:t xml:space="preserve"> ga hebben voor mijn stage tijdens het 2</w:t>
+        <w:t>Ik heb dan geprobeerd om data toe te voegen aan mijn realtime database maar nog geen succes. Ik moest nu stoppen omdat ik een online gesprek ga hebben voor mijn stage tijdens het 2</w:t>
       </w:r>
       <w:r>
         <w:rPr>
@@ -5397,48 +3640,11 @@
       </w:r>
     </w:p>
     <w:p>
-      <w:proofErr w:type="spellStart"/>
-      <w:r>
-        <w:t>Firebase</w:t>
-      </w:r>
-      <w:proofErr w:type="spellEnd"/>
-      <w:r>
-        <w:t xml:space="preserve"> </w:t>
-      </w:r>
-      <w:proofErr w:type="spellStart"/>
-      <w:r>
-        <w:t>Realtime</w:t>
-      </w:r>
-      <w:proofErr w:type="spellEnd"/>
-      <w:r>
-        <w:t xml:space="preserve"> database wou geen data toevoegen en</w:t>
-      </w:r>
-      <w:r>
-        <w:t xml:space="preserve"> ik had alles geprobeerd. Ik realiseerde toen dat </w:t>
-      </w:r>
-      <w:proofErr w:type="spellStart"/>
-      <w:r>
-        <w:t>realtime</w:t>
-      </w:r>
-      <w:proofErr w:type="spellEnd"/>
-      <w:r>
-        <w:t xml:space="preserve"> </w:t>
-      </w:r>
-      <w:proofErr w:type="spellStart"/>
-      <w:r>
-        <w:t>firebase</w:t>
-      </w:r>
-      <w:proofErr w:type="spellEnd"/>
-      <w:r>
-        <w:t xml:space="preserve"> alleen mogelijk was voor de regio van België europe-west1. Ik besloot dan naar </w:t>
-      </w:r>
-      <w:proofErr w:type="spellStart"/>
-      <w:r>
-        <w:t>firestore</w:t>
-      </w:r>
-      <w:proofErr w:type="spellEnd"/>
-      <w:r>
-        <w:t xml:space="preserve"> te gaan want daar hebben ze wel europe-west3 dat Nederland en België bevat. </w:t>
+      <w:r>
+        <w:t>Firebase Realtime database wou geen data toevoegen en</w:t>
+      </w:r>
+      <w:r>
+        <w:t xml:space="preserve"> ik had alles geprobeerd. Ik realiseerde toen dat realtime firebase alleen mogelijk was voor de regio van België europe-west1. Ik besloot dan naar firestore te gaan want daar hebben ze wel europe-west3 dat Nederland en België bevat. </w:t>
       </w:r>
       <w:r>
         <w:t>Dit heeft het probleem onmiddellijk opgelost.</w:t>
@@ -5446,15 +3652,7 @@
     </w:p>
     <w:p>
       <w:r>
-        <w:t xml:space="preserve">Nu als je inlogt zal je gebruikersgegevens op </w:t>
-      </w:r>
-      <w:proofErr w:type="spellStart"/>
-      <w:r>
-        <w:t>firestore</w:t>
-      </w:r>
-      <w:proofErr w:type="spellEnd"/>
-      <w:r>
-        <w:t xml:space="preserve"> geplaatst worden. Nu kan ik eindelijk vlot beginnen met de chat functionaliteiten.</w:t>
+        <w:t>Nu als je inlogt zal je gebruikersgegevens op firestore geplaatst worden. Nu kan ik eindelijk vlot beginnen met de chat functionaliteiten.</w:t>
       </w:r>
     </w:p>
     <w:p>
@@ -5541,39 +3739,7 @@
     </w:p>
     <w:p>
       <w:r>
-        <w:t xml:space="preserve">Vandaag probeerde ik </w:t>
-      </w:r>
-      <w:proofErr w:type="gramStart"/>
-      <w:r>
-        <w:t>offline support</w:t>
-      </w:r>
-      <w:proofErr w:type="gramEnd"/>
-      <w:r>
-        <w:t xml:space="preserve"> toe te voegen. Voor </w:t>
-      </w:r>
-      <w:proofErr w:type="spellStart"/>
-      <w:r>
-        <w:t>firestore</w:t>
-      </w:r>
-      <w:proofErr w:type="spellEnd"/>
-      <w:r>
-        <w:t xml:space="preserve"> was dat niet zo moeilijk want alles kon ik vinden op deze link, maar ik heb dit nog niet echt kunnen uittesten. Voor </w:t>
-      </w:r>
-      <w:proofErr w:type="spellStart"/>
-      <w:r>
-        <w:t>firebase</w:t>
-      </w:r>
-      <w:proofErr w:type="spellEnd"/>
-      <w:r>
-        <w:t xml:space="preserve"> storage lukte dit niet echt, want er was geen duidelijk documentatie. Ik wou vooral proberen om de images op </w:t>
-      </w:r>
-      <w:proofErr w:type="spellStart"/>
-      <w:r>
-        <w:t>firebase</w:t>
-      </w:r>
-      <w:proofErr w:type="spellEnd"/>
-      <w:r>
-        <w:t xml:space="preserve"> in de cache te steken, zodat de meeste recente images verschijnen op de startpagina.</w:t>
+        <w:t>Vandaag probeerde ik offline support toe te voegen. Voor firestore was dat niet zo moeilijk want alles kon ik vinden op deze link, maar ik heb dit nog niet echt kunnen uittesten. Voor firebase storage lukte dit niet echt, want er was geen duidelijk documentatie. Ik wou vooral proberen om de images op firebase in de cache te steken, zodat de meeste recente images verschijnen op de startpagina.</w:t>
       </w:r>
       <w:r>
         <w:t xml:space="preserve"> Mijn conclusie is eigenlijk dat het niet mogelijk is afhankelijk van het totale zoekwerk.</w:t>
@@ -5591,15 +3757,7 @@
     </w:p>
     <w:p>
       <w:r>
-        <w:t xml:space="preserve">Ik heb dan ondertussen een </w:t>
-      </w:r>
-      <w:proofErr w:type="spellStart"/>
-      <w:r>
-        <w:t>progress</w:t>
-      </w:r>
-      <w:proofErr w:type="spellEnd"/>
-      <w:r>
-        <w:t xml:space="preserve"> bar toegevoegd die zal</w:t>
+        <w:t>Ik heb dan ondertussen een progress bar toegevoegd die zal</w:t>
       </w:r>
       <w:r>
         <w:t xml:space="preserve"> </w:t>
@@ -5608,15 +3766,7 @@
         <w:t>verdwijnen als de images inladen.</w:t>
       </w:r>
       <w:r>
-        <w:t xml:space="preserve"> Dit komt ook bij de </w:t>
-      </w:r>
-      <w:proofErr w:type="spellStart"/>
-      <w:r>
-        <w:t>groepchats</w:t>
-      </w:r>
-      <w:proofErr w:type="spellEnd"/>
-      <w:r>
-        <w:t xml:space="preserve"> pagina.</w:t>
+        <w:t xml:space="preserve"> Dit komt ook bij de groepchats pagina.</w:t>
       </w:r>
     </w:p>
     <w:p/>
@@ -5637,50 +3787,10 @@
     </w:p>
     <w:p>
       <w:r>
-        <w:t xml:space="preserve">Vandaag heb ik verder gewerkt aan de chat functionaliteiten. Ik had in het begin een beetje moeilijkheden met het maken van de </w:t>
-      </w:r>
-      <w:proofErr w:type="spellStart"/>
-      <w:r>
-        <w:t>layout</w:t>
-      </w:r>
-      <w:proofErr w:type="spellEnd"/>
-      <w:r>
-        <w:t xml:space="preserve"> van de chat room en chat </w:t>
-      </w:r>
-      <w:proofErr w:type="spellStart"/>
-      <w:r>
-        <w:t>messages</w:t>
-      </w:r>
-      <w:proofErr w:type="spellEnd"/>
-      <w:r>
-        <w:t>. Hierbij heeft de</w:t>
-      </w:r>
-      <w:r>
-        <w:t xml:space="preserve">ze link geholpen want de </w:t>
-      </w:r>
-      <w:proofErr w:type="spellStart"/>
-      <w:r>
-        <w:t>youtube</w:t>
-      </w:r>
-      <w:proofErr w:type="spellEnd"/>
-      <w:r>
-        <w:t xml:space="preserve"> </w:t>
-      </w:r>
-      <w:proofErr w:type="spellStart"/>
-      <w:r>
-        <w:t>tutorials</w:t>
-      </w:r>
-      <w:proofErr w:type="spellEnd"/>
-      <w:r>
-        <w:t xml:space="preserve"> chat </w:t>
-      </w:r>
-      <w:proofErr w:type="spellStart"/>
-      <w:r>
-        <w:t>layout</w:t>
-      </w:r>
-      <w:proofErr w:type="spellEnd"/>
-      <w:r>
-        <w:t xml:space="preserve"> was zeer lelijk.</w:t>
+        <w:t>Vandaag heb ik verder gewerkt aan de chat functionaliteiten. Ik had in het begin een beetje moeilijkheden met het maken van de layout van de chat room en chat messages. Hierbij heeft de</w:t>
+      </w:r>
+      <w:r>
+        <w:t>ze link geholpen want de youtube tutorials chat layout was zeer lelijk.</w:t>
       </w:r>
     </w:p>
     <w:p>
@@ -5723,13 +3833,8 @@
           <w:numId w:val="2"/>
         </w:numPr>
       </w:pPr>
-      <w:proofErr w:type="spellStart"/>
-      <w:r>
-        <w:t>Offfline</w:t>
-      </w:r>
-      <w:proofErr w:type="spellEnd"/>
-      <w:r>
-        <w:t xml:space="preserve"> functionaliteiten toevoegen?</w:t>
+      <w:r>
+        <w:t>Offfline functionaliteiten toevoegen?</w:t>
       </w:r>
     </w:p>
     <w:p>
@@ -5762,15 +3867,7 @@
     </w:p>
     <w:p>
       <w:r>
-        <w:t xml:space="preserve">Vandaag heb ik de groepen chatrooms toegevoegd in een </w:t>
-      </w:r>
-      <w:proofErr w:type="spellStart"/>
-      <w:r>
-        <w:t>gridview</w:t>
-      </w:r>
-      <w:proofErr w:type="spellEnd"/>
-      <w:r>
-        <w:t xml:space="preserve"> waarmee de chat</w:t>
+        <w:t>Vandaag heb ik de groepen chatrooms toegevoegd in een gridview waarmee de chat</w:t>
       </w:r>
       <w:r>
         <w:t>s</w:t>
@@ -5779,50 +3876,10 @@
         <w:t xml:space="preserve"> zullen geopend worden. </w:t>
       </w:r>
       <w:r>
-        <w:t xml:space="preserve">Hierbij kreeg ik serieuze error die me compleet had verward en op stackoverflow had gesteld. Ik had dus per ongeluk de </w:t>
-      </w:r>
-      <w:proofErr w:type="spellStart"/>
-      <w:r>
-        <w:t>gridview</w:t>
-      </w:r>
-      <w:proofErr w:type="spellEnd"/>
-      <w:r>
-        <w:t xml:space="preserve"> het verkeerde ID gegeven waardoor er een </w:t>
-      </w:r>
-      <w:proofErr w:type="spellStart"/>
-      <w:r>
-        <w:t>NullPointerException</w:t>
-      </w:r>
-      <w:proofErr w:type="spellEnd"/>
-      <w:r>
-        <w:t xml:space="preserve"> ontstond, maar ik dacht dat de adapter </w:t>
-      </w:r>
-      <w:proofErr w:type="spellStart"/>
-      <w:r>
-        <w:t>null</w:t>
-      </w:r>
-      <w:proofErr w:type="spellEnd"/>
-      <w:r>
-        <w:t xml:space="preserve"> werd omdat het me niet lukte om de gegevens van </w:t>
-      </w:r>
-      <w:proofErr w:type="spellStart"/>
-      <w:r>
-        <w:t>firestore</w:t>
-      </w:r>
-      <w:proofErr w:type="spellEnd"/>
-      <w:r>
-        <w:t xml:space="preserve"> te halen.</w:t>
-      </w:r>
-      <w:r>
-        <w:t xml:space="preserve"> In de </w:t>
-      </w:r>
-      <w:proofErr w:type="spellStart"/>
-      <w:r>
-        <w:t>comments</w:t>
-      </w:r>
-      <w:proofErr w:type="spellEnd"/>
-      <w:r>
-        <w:t xml:space="preserve"> en antwoord wordt alles nog beter uitgelegd.</w:t>
+        <w:t>Hierbij kreeg ik serieuze error die me compleet had verward en op stackoverflow had gesteld. Ik had dus per ongeluk de gridview het verkeerde ID gegeven waardoor er een NullPointerException ontstond, maar ik dacht dat de adapter null werd omdat het me niet lukte om de gegevens van firestore te halen.</w:t>
+      </w:r>
+      <w:r>
+        <w:t xml:space="preserve"> In de comments en antwoord wordt alles nog beter uitgelegd.</w:t>
       </w:r>
     </w:p>
     <w:p>
@@ -5859,69 +3916,22 @@
     </w:p>
     <w:p>
       <w:r>
-        <w:t xml:space="preserve">Vandaag heb ik ervoor kunnen zorgen dat er pagina wordt geopend als je op een chatroom klikt. Dit duurde langer dan verwacht, want blijkbaar is het niet zo makkelijk om button click events te activeren in een </w:t>
-      </w:r>
-      <w:proofErr w:type="spellStart"/>
-      <w:r>
-        <w:t>gridview</w:t>
-      </w:r>
-      <w:proofErr w:type="spellEnd"/>
-      <w:r>
-        <w:t xml:space="preserve">. Om dit op te lossen moest ik een </w:t>
-      </w:r>
-      <w:proofErr w:type="spellStart"/>
+        <w:t xml:space="preserve">Vandaag heb ik ervoor kunnen zorgen dat er pagina wordt geopend als je op een chatroom klikt. Dit duurde langer dan verwacht, want blijkbaar is het niet zo makkelijk om button click events te activeren in een gridview. Om dit op te lossen moest ik een </w:t>
+      </w:r>
       <w:r>
         <w:t>V</w:t>
       </w:r>
       <w:r>
         <w:t>iewHolder</w:t>
       </w:r>
-      <w:proofErr w:type="spellEnd"/>
-      <w:r>
-        <w:t xml:space="preserve"> </w:t>
-      </w:r>
-      <w:proofErr w:type="spellStart"/>
-      <w:r>
-        <w:t>static</w:t>
-      </w:r>
-      <w:proofErr w:type="spellEnd"/>
+      <w:r>
+        <w:t xml:space="preserve"> static</w:t>
+      </w:r>
       <w:r>
         <w:t xml:space="preserve"> class toevoegen in de </w:t>
       </w:r>
       <w:r>
-        <w:t xml:space="preserve">Adapter class. Deze klasse zorgt ervoor dat de </w:t>
-      </w:r>
-      <w:proofErr w:type="spellStart"/>
-      <w:r>
-        <w:t>rendering</w:t>
-      </w:r>
-      <w:proofErr w:type="spellEnd"/>
-      <w:r>
-        <w:t xml:space="preserve"> van items in de </w:t>
-      </w:r>
-      <w:proofErr w:type="spellStart"/>
-      <w:r>
-        <w:t>gridview</w:t>
-      </w:r>
-      <w:proofErr w:type="spellEnd"/>
-      <w:r>
-        <w:t xml:space="preserve"> sneller is. In deze </w:t>
-      </w:r>
-      <w:proofErr w:type="spellStart"/>
-      <w:r>
-        <w:t>viewholder</w:t>
-      </w:r>
-      <w:proofErr w:type="spellEnd"/>
-      <w:r>
-        <w:t xml:space="preserve"> wordt de button opgeslagen die je kan oproepen en waarop je een </w:t>
-      </w:r>
-      <w:proofErr w:type="spellStart"/>
-      <w:r>
-        <w:t>onclickevent</w:t>
-      </w:r>
-      <w:proofErr w:type="spellEnd"/>
-      <w:r>
-        <w:t xml:space="preserve"> kan </w:t>
+        <w:t xml:space="preserve">Adapter class. Deze klasse zorgt ervoor dat de rendering van items in de gridview sneller is. In deze viewholder wordt de button opgeslagen die je kan oproepen en waarop je een onclickevent kan </w:t>
       </w:r>
       <w:r>
         <w:t>activeren</w:t>
@@ -6009,42 +4019,10 @@
     </w:p>
     <w:p>
       <w:r>
-        <w:t xml:space="preserve">Sinds vandaag kan ik </w:t>
-      </w:r>
-      <w:proofErr w:type="spellStart"/>
-      <w:r>
-        <w:t>chatmessages</w:t>
-      </w:r>
-      <w:proofErr w:type="spellEnd"/>
-      <w:r>
-        <w:t xml:space="preserve"> naar mijn </w:t>
-      </w:r>
-      <w:proofErr w:type="spellStart"/>
-      <w:r>
-        <w:t>firestore</w:t>
-      </w:r>
-      <w:proofErr w:type="spellEnd"/>
-      <w:r>
-        <w:t xml:space="preserve"> database </w:t>
-      </w:r>
-      <w:proofErr w:type="gramStart"/>
-      <w:r>
-        <w:t xml:space="preserve">sturen </w:t>
-      </w:r>
-      <w:r>
-        <w:t>,</w:t>
-      </w:r>
-      <w:proofErr w:type="gramEnd"/>
-      <w:r>
-        <w:t xml:space="preserve"> maar </w:t>
-      </w:r>
-      <w:proofErr w:type="spellStart"/>
-      <w:r>
-        <w:t>messages</w:t>
-      </w:r>
-      <w:proofErr w:type="spellEnd"/>
-      <w:r>
-        <w:t xml:space="preserve"> tonen is iets moeilijker door recyclerview en zijn adapter.</w:t>
+        <w:t xml:space="preserve">Sinds vandaag kan ik chatmessages naar mijn firestore database sturen </w:t>
+      </w:r>
+      <w:r>
+        <w:t>, maar messages tonen is iets moeilijker door recyclerview en zijn adapter.</w:t>
       </w:r>
     </w:p>
     <w:p>
@@ -6127,15 +4105,7 @@
         </w:numPr>
       </w:pPr>
       <w:r>
-        <w:t xml:space="preserve">Contact </w:t>
-      </w:r>
-      <w:proofErr w:type="spellStart"/>
-      <w:r>
-        <w:t>us</w:t>
-      </w:r>
-      <w:proofErr w:type="spellEnd"/>
-      <w:r>
-        <w:t xml:space="preserve"> </w:t>
+        <w:t xml:space="preserve">Contact us </w:t>
       </w:r>
       <w:r>
         <w:t>toevoegen</w:t>
@@ -6153,13 +4123,8 @@
         </w:numPr>
       </w:pPr>
       <w:r>
-        <w:t xml:space="preserve">Puntenverdeling opdrachten afwerken zoals </w:t>
-      </w:r>
-      <w:proofErr w:type="gramStart"/>
-      <w:r>
-        <w:t>offline support</w:t>
-      </w:r>
-      <w:proofErr w:type="gramEnd"/>
+        <w:t>Puntenverdeling opdrachten afwerken zoals offline support</w:t>
+      </w:r>
     </w:p>
     <w:p/>
     <w:p/>
@@ -6181,95 +4146,43 @@
     </w:p>
     <w:p>
       <w:r>
-        <w:t xml:space="preserve">Vandaag heb ik de </w:t>
-      </w:r>
-      <w:proofErr w:type="spellStart"/>
-      <w:r>
-        <w:t>MessageAdapter</w:t>
-      </w:r>
-      <w:proofErr w:type="spellEnd"/>
-      <w:r>
-        <w:t xml:space="preserve"> waarmee de users kunnen chatten in chatgroepen verbetert want ik had </w:t>
-      </w:r>
-      <w:proofErr w:type="spellStart"/>
-      <w:r>
-        <w:t>tutorials</w:t>
-      </w:r>
-      <w:proofErr w:type="spellEnd"/>
-      <w:r>
-        <w:t xml:space="preserve"> door elkaar gehaald. Ik had vooral </w:t>
-      </w:r>
-      <w:proofErr w:type="spellStart"/>
-      <w:r>
-        <w:t>Id’s</w:t>
-      </w:r>
-      <w:proofErr w:type="spellEnd"/>
-      <w:r>
-        <w:t xml:space="preserve"> nodig van de</w:t>
+        <w:t>Vandaag heb ik de MessageAdapter waarmee de users kunnen chatten in chatgroepen verbetert want ik had tutorials door elkaar gehaald. Ik had vooral Id’s nodig van de</w:t>
+      </w:r>
+      <w:r>
+        <w:t xml:space="preserve"> messages</w:t>
+      </w:r>
+      <w:r>
+        <w:t xml:space="preserve"> layouts want d</w:t>
+      </w:r>
+      <w:r>
+        <w:t>eze</w:t>
+      </w:r>
+      <w:r>
+        <w:t xml:space="preserve"> waren beter dan de</w:t>
+      </w:r>
+      <w:r>
+        <w:t xml:space="preserve"> 1</w:t>
+      </w:r>
+      <w:r>
+        <w:rPr>
+          <w:vertAlign w:val="superscript"/>
+        </w:rPr>
+        <w:t>ste</w:t>
       </w:r>
       <w:r>
         <w:t xml:space="preserve"> </w:t>
       </w:r>
-      <w:proofErr w:type="spellStart"/>
-      <w:r>
-        <w:t>messages</w:t>
-      </w:r>
-      <w:proofErr w:type="spellEnd"/>
-      <w:r>
-        <w:t xml:space="preserve"> </w:t>
-      </w:r>
-      <w:proofErr w:type="spellStart"/>
-      <w:r>
-        <w:t>layouts</w:t>
-      </w:r>
-      <w:proofErr w:type="spellEnd"/>
-      <w:r>
-        <w:t xml:space="preserve"> want d</w:t>
-      </w:r>
-      <w:r>
-        <w:t>eze</w:t>
-      </w:r>
-      <w:r>
-        <w:t xml:space="preserve"> waren beter dan de</w:t>
-      </w:r>
-      <w:r>
-        <w:t xml:space="preserve"> 1</w:t>
-      </w:r>
-      <w:proofErr w:type="gramStart"/>
-      <w:r>
-        <w:rPr>
-          <w:vertAlign w:val="superscript"/>
-        </w:rPr>
-        <w:t>ste</w:t>
-      </w:r>
-      <w:r>
-        <w:t xml:space="preserve"> </w:t>
-      </w:r>
       <w:r>
         <w:t xml:space="preserve"> tutorial</w:t>
       </w:r>
-      <w:proofErr w:type="gramEnd"/>
-      <w:r>
-        <w:t xml:space="preserve"> hieronder. Daarna ging alles vlot, maar ik heb alleen moeilijkheden met het beveiligen van </w:t>
-      </w:r>
-      <w:proofErr w:type="spellStart"/>
-      <w:r>
-        <w:t>groupchats</w:t>
-      </w:r>
-      <w:proofErr w:type="spellEnd"/>
+      <w:r>
+        <w:t xml:space="preserve"> hieronder. Daarna ging alles vlot, maar ik heb alleen moeilijkheden met het beveiligen van groupchats</w:t>
+      </w:r>
       <w:r>
         <w:t xml:space="preserve">. Hoe gaan dus </w:t>
       </w:r>
       <w:r>
-        <w:t xml:space="preserve">user worden toegevoegd aan een </w:t>
-      </w:r>
-      <w:proofErr w:type="spellStart"/>
-      <w:r>
-        <w:t>groepchat</w:t>
-      </w:r>
-      <w:proofErr w:type="spellEnd"/>
-      <w:r>
-        <w:t>, enz.</w:t>
+        <w:t>user worden toegevoegd aan een groepchat, enz.</w:t>
       </w:r>
     </w:p>
     <w:p>
@@ -6310,15 +4223,7 @@
     </w:p>
     <w:p>
       <w:r>
-        <w:t xml:space="preserve">Vandaag heb ik kort overlopen met Yves </w:t>
-      </w:r>
-      <w:proofErr w:type="spellStart"/>
-      <w:r>
-        <w:t>Blancquaert</w:t>
-      </w:r>
-      <w:proofErr w:type="spellEnd"/>
-      <w:r>
-        <w:t xml:space="preserve"> hoe de stand van zaken zijn. Hierbij heb ik vooral op de conclusie gekomen dat ik de volgende dingen nog moet doen:</w:t>
+        <w:t>Vandaag heb ik kort overlopen met Yves Blancquaert hoe de stand van zaken zijn. Hierbij heb ik vooral op de conclusie gekomen dat ik de volgende dingen nog moet doen:</w:t>
       </w:r>
     </w:p>
     <w:p>
@@ -6329,13 +4234,8 @@
           <w:numId w:val="2"/>
         </w:numPr>
       </w:pPr>
-      <w:proofErr w:type="spellStart"/>
-      <w:r>
-        <w:t>Chatgroup</w:t>
-      </w:r>
-      <w:proofErr w:type="spellEnd"/>
-      <w:r>
-        <w:t xml:space="preserve"> afwerken en meerdere users kunnen toevoegen</w:t>
+      <w:r>
+        <w:t>Chatgroup afwerken en meerdere users kunnen toevoegen</w:t>
       </w:r>
     </w:p>
     <w:p>
@@ -6347,15 +4247,7 @@
         </w:numPr>
       </w:pPr>
       <w:r>
-        <w:t xml:space="preserve">Contact </w:t>
-      </w:r>
-      <w:proofErr w:type="spellStart"/>
-      <w:r>
-        <w:t>us</w:t>
-      </w:r>
-      <w:proofErr w:type="spellEnd"/>
-      <w:r>
-        <w:t xml:space="preserve"> pagina nog toevoe</w:t>
+        <w:t>Contact us pagina nog toevoe</w:t>
       </w:r>
       <w:r>
         <w:t>gen voor extra</w:t>
@@ -6370,13 +4262,8 @@
         </w:numPr>
       </w:pPr>
       <w:r>
-        <w:t xml:space="preserve">Notificaties toevoegen voor </w:t>
-      </w:r>
-      <w:proofErr w:type="spellStart"/>
-      <w:r>
-        <w:t>messages</w:t>
-      </w:r>
-      <w:proofErr w:type="spellEnd"/>
+        <w:t>Notificaties toevoegen voor messages</w:t>
+      </w:r>
     </w:p>
     <w:p>
       <w:pPr>
@@ -6397,38 +4284,12 @@
           <w:bCs/>
           <w:u w:val="single"/>
         </w:rPr>
-        <w:t xml:space="preserve">Image in chat toevoegen en </w:t>
-      </w:r>
-      <w:proofErr w:type="spellStart"/>
-      <w:r>
-        <w:rPr>
-          <w:b/>
-          <w:bCs/>
-          <w:u w:val="single"/>
-        </w:rPr>
-        <w:t>comments</w:t>
-      </w:r>
-      <w:proofErr w:type="spellEnd"/>
-      <w:r>
-        <w:rPr>
-          <w:b/>
-          <w:bCs/>
-          <w:u w:val="single"/>
-        </w:rPr>
-        <w:t xml:space="preserve"> erop kunnen plaatsen!!!!!!</w:t>
-      </w:r>
-    </w:p>
-    <w:p>
-      <w:r>
-        <w:t xml:space="preserve">Vandaag heb ik dan snel de contact </w:t>
-      </w:r>
-      <w:proofErr w:type="spellStart"/>
-      <w:r>
-        <w:t>us</w:t>
-      </w:r>
-      <w:proofErr w:type="spellEnd"/>
-      <w:r>
-        <w:t xml:space="preserve"> pagina afgewerkt zodat </w:t>
+        <w:t>Image in chat toevoegen en comments erop kunnen plaatsen!!!!!!</w:t>
+      </w:r>
+    </w:p>
+    <w:p>
+      <w:r>
+        <w:t xml:space="preserve">Vandaag heb ik dan snel de contact us pagina afgewerkt zodat </w:t>
       </w:r>
       <w:r>
         <w:t>da al af is en zo vlot kan beginnen aan de chat groepen</w:t>
@@ -6469,116 +4330,20 @@
     </w:p>
     <w:p>
       <w:r>
-        <w:t xml:space="preserve">Vandaag heb ik de recyclerview </w:t>
-      </w:r>
-      <w:proofErr w:type="spellStart"/>
-      <w:r>
-        <w:t>gefixed</w:t>
-      </w:r>
-      <w:proofErr w:type="spellEnd"/>
-      <w:r>
-        <w:t xml:space="preserve">, want er waren nog een paar fouten. </w:t>
-      </w:r>
-    </w:p>
-    <w:p>
-      <w:r>
-        <w:t xml:space="preserve">Ten eerste begon de chat </w:t>
-      </w:r>
-      <w:proofErr w:type="spellStart"/>
-      <w:r>
-        <w:t>messages</w:t>
-      </w:r>
-      <w:proofErr w:type="spellEnd"/>
-      <w:r>
-        <w:t xml:space="preserve"> niet vanonder dus dat heb ik </w:t>
-      </w:r>
-      <w:proofErr w:type="spellStart"/>
-      <w:r>
-        <w:t>gefixed</w:t>
-      </w:r>
-      <w:proofErr w:type="spellEnd"/>
-      <w:r>
-        <w:t xml:space="preserve"> met </w:t>
-      </w:r>
-      <w:proofErr w:type="spellStart"/>
-      <w:r>
-        <w:t>SetHasFixedSize</w:t>
-      </w:r>
-      <w:proofErr w:type="spellEnd"/>
-      <w:r>
-        <w:t xml:space="preserve"> en </w:t>
-      </w:r>
-      <w:proofErr w:type="spellStart"/>
-      <w:r>
-        <w:t>SetStackFromEnd</w:t>
-      </w:r>
-      <w:proofErr w:type="spellEnd"/>
-      <w:r>
-        <w:t xml:space="preserve"> </w:t>
-      </w:r>
-      <w:proofErr w:type="spellStart"/>
-      <w:r>
-        <w:t>true</w:t>
-      </w:r>
-      <w:proofErr w:type="spellEnd"/>
-      <w:r>
-        <w:t xml:space="preserve"> te zetten.</w:t>
-      </w:r>
-    </w:p>
-    <w:p>
-      <w:r>
-        <w:t xml:space="preserve">Ten tweede wou de recyclerview niet updaten als ik een nieuwe </w:t>
-      </w:r>
-      <w:proofErr w:type="spellStart"/>
-      <w:r>
-        <w:t>message</w:t>
-      </w:r>
-      <w:proofErr w:type="spellEnd"/>
-      <w:r>
-        <w:t xml:space="preserve"> uploadde. Dit kwam omdat </w:t>
-      </w:r>
-      <w:proofErr w:type="spellStart"/>
-      <w:r>
-        <w:t>firestore</w:t>
-      </w:r>
-      <w:proofErr w:type="spellEnd"/>
-      <w:r>
-        <w:t xml:space="preserve"> niet wou </w:t>
-      </w:r>
-      <w:proofErr w:type="spellStart"/>
-      <w:r>
-        <w:t>realtime</w:t>
-      </w:r>
-      <w:proofErr w:type="spellEnd"/>
-      <w:r>
-        <w:t xml:space="preserve"> updaten. Dit voornaamste rede daarvan was blijkbaar </w:t>
-      </w:r>
-      <w:r>
-        <w:t xml:space="preserve">dat ik een index moest toevoegen voor de query die de gegevens moest ophalen. Dit werd niet vermeld in </w:t>
-      </w:r>
-      <w:proofErr w:type="spellStart"/>
-      <w:r>
-        <w:t>tutorials</w:t>
-      </w:r>
-      <w:proofErr w:type="spellEnd"/>
-      <w:r>
-        <w:t xml:space="preserve"> en documentaties van </w:t>
-      </w:r>
-      <w:proofErr w:type="spellStart"/>
-      <w:r>
-        <w:t>firestore</w:t>
-      </w:r>
-      <w:proofErr w:type="spellEnd"/>
-      <w:r>
-        <w:t xml:space="preserve">. </w:t>
-      </w:r>
-      <w:proofErr w:type="spellStart"/>
-      <w:r>
-        <w:t>Firestore</w:t>
-      </w:r>
-      <w:proofErr w:type="spellEnd"/>
-      <w:r>
-        <w:t xml:space="preserve"> stuur dit als error naar mij zie mijn stackoverflow vraag:</w:t>
+        <w:t xml:space="preserve">Vandaag heb ik de recyclerview gefixed, want er waren nog een paar fouten. </w:t>
+      </w:r>
+    </w:p>
+    <w:p>
+      <w:r>
+        <w:t>Ten eerste begon de chat messages niet vanonder dus dat heb ik gefixed met SetHasFixedSize en SetStackFromEnd true te zetten.</w:t>
+      </w:r>
+    </w:p>
+    <w:p>
+      <w:r>
+        <w:t xml:space="preserve">Ten tweede wou de recyclerview niet updaten als ik een nieuwe message uploadde. Dit kwam omdat firestore niet wou realtime updaten. Dit voornaamste rede daarvan was blijkbaar </w:t>
+      </w:r>
+      <w:r>
+        <w:t>dat ik een index moest toevoegen voor de query die de gegevens moest ophalen. Dit werd niet vermeld in tutorials en documentaties van firestore. Firestore stuur dit als error naar mij zie mijn stackoverflow vraag:</w:t>
       </w:r>
     </w:p>
     <w:p>
@@ -6655,6 +4420,110 @@
         <w:t>19/12/2021:</w:t>
       </w:r>
     </w:p>
+    <w:p>
+      <w:r>
+        <w:t xml:space="preserve">Vandaag heb ik nog wat chat foutjes opgelost zoals </w:t>
+      </w:r>
+      <w:r>
+        <w:t xml:space="preserve">het tijdstip van de message was in het </w:t>
+      </w:r>
+      <w:r>
+        <w:t xml:space="preserve">Engelse </w:t>
+      </w:r>
+      <w:r>
+        <w:t xml:space="preserve">tijd </w:t>
+      </w:r>
+      <w:r>
+        <w:t xml:space="preserve">(AM-PM) dus dat heb ik omgezet naar digitale tijdstip. Dit kon door in de DateFormat “hh-…” te vervangen met “kk-…”. Ook nieuwe berichten werden niet automatisch naar toe gescrold daarom moest ik </w:t>
+      </w:r>
+      <w:r>
+        <w:rPr>
+          <w:i/>
+          <w:iCs/>
+          <w:u w:val="single"/>
+        </w:rPr>
+        <w:t>smooth</w:t>
+      </w:r>
+      <w:r>
+        <w:rPr>
+          <w:i/>
+          <w:iCs/>
+        </w:rPr>
+        <w:t xml:space="preserve"> </w:t>
+      </w:r>
+      <w:r>
+        <w:t>scrolling to aanzetten i</w:t>
+      </w:r>
+      <w:r>
+        <w:t xml:space="preserve">n </w:t>
+      </w:r>
+      <w:r>
+        <w:t>p</w:t>
+      </w:r>
+      <w:r>
+        <w:t xml:space="preserve">laats </w:t>
+      </w:r>
+      <w:r>
+        <w:t>v</w:t>
+      </w:r>
+      <w:r>
+        <w:t>an</w:t>
+      </w:r>
+      <w:r>
+        <w:t xml:space="preserve"> gewoon scrolling to.</w:t>
+      </w:r>
+    </w:p>
+    <w:p>
+      <w:r>
+        <w:t xml:space="preserve">Dan heb ik vooral opgezocht </w:t>
+      </w:r>
+      <w:r>
+        <w:t>hoe ik andere users kan toevoegen aan een chat group waarvan deze link me het meest belovend uitziet.</w:t>
+      </w:r>
+      <w:r>
+        <w:t xml:space="preserve"> Admin roles lijken me het makkelijkst</w:t>
+      </w:r>
+      <w:r>
+        <w:t xml:space="preserve">. Als dit niet lukt ga ik gewoon proberen </w:t>
+      </w:r>
+      <w:r>
+        <w:t>om de admin users te laten toevoegen via email</w:t>
+      </w:r>
+      <w:r>
+        <w:t xml:space="preserve"> via </w:t>
+      </w:r>
+      <w:r>
+        <w:t>de</w:t>
+      </w:r>
+      <w:r>
+        <w:t xml:space="preserve"> </w:t>
+      </w:r>
+      <w:r>
+        <w:t>menu</w:t>
+      </w:r>
+      <w:r>
+        <w:t xml:space="preserve"> </w:t>
+      </w:r>
+      <w:r>
+        <w:t>van</w:t>
+      </w:r>
+      <w:r>
+        <w:t xml:space="preserve"> de chatroom</w:t>
+      </w:r>
+      <w:r>
+        <w:t>.</w:t>
+      </w:r>
+    </w:p>
+    <w:p>
+      <w:hyperlink r:id="rId78" w:history="1">
+        <w:r>
+          <w:rPr>
+            <w:rStyle w:val="Hyperlink"/>
+          </w:rPr>
+          <w:t>https://www.ericthecoder.com/2018/12/17/firebase-in-use-1-dynamic-admin-user-roles-with-authentication/</w:t>
+        </w:r>
+      </w:hyperlink>
+    </w:p>
     <w:p/>
     <w:p/>
     <w:p>
@@ -6662,10 +4531,7 @@
         <w:pStyle w:val="Kop2"/>
       </w:pPr>
       <w:r>
-        <w:t>Week 1</w:t>
-      </w:r>
-      <w:r>
-        <w:t>2</w:t>
+        <w:t>Week 12</w:t>
       </w:r>
     </w:p>
     <w:p>
@@ -6673,7 +4539,19 @@
         <w:pStyle w:val="Kop3"/>
       </w:pPr>
       <w:r>
-        <w:t>Wat ik wil realiseren deze week:</w:t>
+        <w:t xml:space="preserve">Wat ik wil realiseren </w:t>
+      </w:r>
+      <w:r>
+        <w:t xml:space="preserve">tijdens de volgende </w:t>
+      </w:r>
+      <w:r>
+        <w:t>wek</w:t>
+      </w:r>
+      <w:r>
+        <w:t>en</w:t>
+      </w:r>
+      <w:r>
+        <w:t>:</w:t>
       </w:r>
     </w:p>
     <w:p>
@@ -6712,15 +4590,7 @@
         </w:numPr>
       </w:pPr>
       <w:r>
-        <w:t xml:space="preserve">Afbeeldingen kunnen doorsturen via chat en </w:t>
-      </w:r>
-      <w:proofErr w:type="spellStart"/>
-      <w:r>
-        <w:t>comments</w:t>
-      </w:r>
-      <w:proofErr w:type="spellEnd"/>
-      <w:r>
-        <w:t xml:space="preserve"> eraan kunnen toevoegen.</w:t>
+        <w:t>CRUD toevoegen zoals groepen verwijderen</w:t>
       </w:r>
     </w:p>
     <w:p>
@@ -6732,13 +4602,20 @@
         </w:numPr>
       </w:pPr>
       <w:r>
-        <w:t xml:space="preserve">Puntenverdeling opdrachten afwerken zoals </w:t>
-      </w:r>
-      <w:proofErr w:type="gramStart"/>
-      <w:r>
-        <w:t>offline support</w:t>
-      </w:r>
-      <w:proofErr w:type="gramEnd"/>
+        <w:t>Afbeeldingen kunnen doorsturen via chat en comments eraan kunnen toevoegen.</w:t>
+      </w:r>
+    </w:p>
+    <w:p>
+      <w:pPr>
+        <w:pStyle w:val="Lijstalinea"/>
+        <w:numPr>
+          <w:ilvl w:val="0"/>
+          <w:numId w:val="2"/>
+        </w:numPr>
+      </w:pPr>
+      <w:r>
+        <w:t>Puntenverdeling opdrachten afwerken zoals offline support</w:t>
+      </w:r>
     </w:p>
     <w:p/>
     <w:p/>

</xml_diff>

<commit_message>
Starting with adding admin-users roles
</commit_message>
<xml_diff>
--- a/Logboek_Dries_Fierens.docx
+++ b/Logboek_Dries_Fierens.docx
@@ -46,7 +46,47 @@
         <w:t>applicatie</w:t>
       </w:r>
       <w:r>
-        <w:t xml:space="preserve"> die je kan maken en welke technologieën je kan gebruiken. Ik heb voor native gekozen want dat past het best bij mijn aftakking “Software developer” sinds het java inhoudt. De anderen zijn hybrid en progressive web app dat dus meer te maken hebben met web &amp; mobile dus vooral HTML &amp; CSS. We moesten dan ook nog kiezen voor een project idee, waarbij ik koos voor een scanner + pdf converter app</w:t>
+        <w:t xml:space="preserve"> die je kan maken en welke technologieën je kan gebruiken. Ik heb voor native gekozen want dat past het best bij mijn aftakking “Software </w:t>
+      </w:r>
+      <w:proofErr w:type="spellStart"/>
+      <w:r>
+        <w:t>developer</w:t>
+      </w:r>
+      <w:proofErr w:type="spellEnd"/>
+      <w:r>
+        <w:t xml:space="preserve">” sinds het </w:t>
+      </w:r>
+      <w:proofErr w:type="spellStart"/>
+      <w:r>
+        <w:t>java</w:t>
+      </w:r>
+      <w:proofErr w:type="spellEnd"/>
+      <w:r>
+        <w:t xml:space="preserve"> inhoudt. De anderen zijn </w:t>
+      </w:r>
+      <w:proofErr w:type="spellStart"/>
+      <w:r>
+        <w:t>hybrid</w:t>
+      </w:r>
+      <w:proofErr w:type="spellEnd"/>
+      <w:r>
+        <w:t xml:space="preserve"> en </w:t>
+      </w:r>
+      <w:proofErr w:type="spellStart"/>
+      <w:r>
+        <w:t>progressive</w:t>
+      </w:r>
+      <w:proofErr w:type="spellEnd"/>
+      <w:r>
+        <w:t xml:space="preserve"> web app dat dus meer te maken hebben met web &amp; mobile dus vooral HTML &amp; CSS. We moesten dan ook nog kiezen voor een project idee, waarbij ik koos voor een scanner + </w:t>
+      </w:r>
+      <w:proofErr w:type="gramStart"/>
+      <w:r>
+        <w:t>pdf converter</w:t>
+      </w:r>
+      <w:proofErr w:type="gramEnd"/>
+      <w:r>
+        <w:t xml:space="preserve"> app</w:t>
       </w:r>
       <w:r>
         <w:t xml:space="preserve"> waarbij het vooral bedoelt is o</w:t>
@@ -67,26 +107,106 @@
         <w:t>.</w:t>
       </w:r>
       <w:r>
-        <w:t xml:space="preserve"> Het was verplicht om 1 hardware component van de gsm te gebruiken dus koos ik natuurlijk voor de camera.</w:t>
+        <w:t xml:space="preserve"> Het was verplicht om 1 </w:t>
+      </w:r>
+      <w:proofErr w:type="gramStart"/>
+      <w:r>
+        <w:t>hardware component</w:t>
+      </w:r>
+      <w:proofErr w:type="gramEnd"/>
+      <w:r>
+        <w:t xml:space="preserve"> van de gsm te gebruiken dus koos ik natuurlijk voor de camera.</w:t>
       </w:r>
       <w:r>
         <w:t xml:space="preserve"> </w:t>
       </w:r>
       <w:r>
-        <w:t>Als back-end koos ik Firebase en als technologie koos ik in java te werken om een android app te maken in plaats van een IOS app.</w:t>
-      </w:r>
-      <w:r>
-        <w:t xml:space="preserve"> Want ik heb een huawei.</w:t>
-      </w:r>
-    </w:p>
-    <w:p>
-      <w:r>
-        <w:t>Ik heb dit allemaal grondiger beschreven in mijn “app idee”.pdf. Dit staat ondertussen op de repository die we moesten maken.</w:t>
-      </w:r>
-    </w:p>
-    <w:p>
-      <w:r>
-        <w:t>Om af te sluiten had ik al ondertussen een goede naam gevonden gebaseerd op de applicatie genaamd Scannable. Ik heb dus besloten om mijn applicatie Notable te noemen.</w:t>
+        <w:t xml:space="preserve">Als </w:t>
+      </w:r>
+      <w:proofErr w:type="spellStart"/>
+      <w:r>
+        <w:t>back-end</w:t>
+      </w:r>
+      <w:proofErr w:type="spellEnd"/>
+      <w:r>
+        <w:t xml:space="preserve"> koos ik </w:t>
+      </w:r>
+      <w:proofErr w:type="spellStart"/>
+      <w:r>
+        <w:t>Firebase</w:t>
+      </w:r>
+      <w:proofErr w:type="spellEnd"/>
+      <w:r>
+        <w:t xml:space="preserve"> en als technologie koos ik in </w:t>
+      </w:r>
+      <w:proofErr w:type="spellStart"/>
+      <w:r>
+        <w:t>java</w:t>
+      </w:r>
+      <w:proofErr w:type="spellEnd"/>
+      <w:r>
+        <w:t xml:space="preserve"> te werken om een </w:t>
+      </w:r>
+      <w:proofErr w:type="spellStart"/>
+      <w:r>
+        <w:t>android</w:t>
+      </w:r>
+      <w:proofErr w:type="spellEnd"/>
+      <w:r>
+        <w:t xml:space="preserve"> app te maken in plaats van een IOS app.</w:t>
+      </w:r>
+      <w:r>
+        <w:t xml:space="preserve"> Want ik heb een </w:t>
+      </w:r>
+      <w:proofErr w:type="spellStart"/>
+      <w:r>
+        <w:t>huawei</w:t>
+      </w:r>
+      <w:proofErr w:type="spellEnd"/>
+      <w:r>
+        <w:t>.</w:t>
+      </w:r>
+    </w:p>
+    <w:p>
+      <w:r>
+        <w:t xml:space="preserve">Ik heb dit allemaal grondiger beschreven in mijn “app </w:t>
+      </w:r>
+      <w:proofErr w:type="spellStart"/>
+      <w:r>
+        <w:t>idee”.pdf</w:t>
+      </w:r>
+      <w:proofErr w:type="spellEnd"/>
+      <w:r>
+        <w:t xml:space="preserve">. Dit staat ondertussen op de </w:t>
+      </w:r>
+      <w:proofErr w:type="spellStart"/>
+      <w:r>
+        <w:t>repository</w:t>
+      </w:r>
+      <w:proofErr w:type="spellEnd"/>
+      <w:r>
+        <w:t xml:space="preserve"> die we moesten maken.</w:t>
+      </w:r>
+    </w:p>
+    <w:p>
+      <w:r>
+        <w:t xml:space="preserve">Om af te sluiten had ik al ondertussen een goede naam gevonden gebaseerd op de applicatie genaamd </w:t>
+      </w:r>
+      <w:proofErr w:type="spellStart"/>
+      <w:r>
+        <w:t>Scannable</w:t>
+      </w:r>
+      <w:proofErr w:type="spellEnd"/>
+      <w:r>
+        <w:t xml:space="preserve">. Ik heb dus besloten om mijn applicatie </w:t>
+      </w:r>
+      <w:proofErr w:type="spellStart"/>
+      <w:r>
+        <w:t>Notable</w:t>
+      </w:r>
+      <w:proofErr w:type="spellEnd"/>
+      <w:r>
+        <w:t xml:space="preserve"> te noemen.</w:t>
       </w:r>
     </w:p>
     <w:p>
@@ -109,7 +229,15 @@
         <w:t xml:space="preserve">Mijn app idee werd niet goedgekeurd, want de leerkracht raadde het af door problemen die ervan kunnen komen. Ik moest dan vandaag een nieuw idee opstellen. </w:t>
       </w:r>
       <w:r>
-        <w:t>De scanner + pdf converter was duidelijk te moeilijk, maar ik besloot om het idee verder te zetten van een app die notities kan delen. Dus nu moet het gewoon foto’s trekken van de notities. Om nog toe te voegen kan ik ook opmerkingswolkjes toevoegen aan de foto voor bijvoorbeeld een fout</w:t>
+        <w:t xml:space="preserve">De scanner + </w:t>
+      </w:r>
+      <w:proofErr w:type="gramStart"/>
+      <w:r>
+        <w:t>pdf converter</w:t>
+      </w:r>
+      <w:proofErr w:type="gramEnd"/>
+      <w:r>
+        <w:t xml:space="preserve"> was duidelijk te moeilijk, maar ik besloot om het idee verder te zetten van een app die notities kan delen. Dus nu moet het gewoon foto’s trekken van de notities. Om nog toe te voegen kan ik ook opmerkingswolkjes toevoegen aan de foto voor bijvoorbeeld een fout</w:t>
       </w:r>
       <w:r>
         <w:t xml:space="preserve"> aan te duiden</w:t>
@@ -120,7 +248,15 @@
     </w:p>
     <w:p>
       <w:r>
-        <w:t xml:space="preserve">Daarna moest ik gewoon begin aan een UI/UX design voor mijn applicatie, waarbij nog niet veel had gedaan omdat les niet meer lang duurde. Ik moest toen ook tegelijkertijd zoeken naar tutorials dus </w:t>
+        <w:t xml:space="preserve">Daarna moest ik gewoon begin aan een UI/UX design voor mijn applicatie, waarbij nog niet veel had gedaan omdat les niet meer lang duurde. Ik moest toen ook tegelijkertijd zoeken naar </w:t>
+      </w:r>
+      <w:proofErr w:type="spellStart"/>
+      <w:r>
+        <w:t>tutorials</w:t>
+      </w:r>
+      <w:proofErr w:type="spellEnd"/>
+      <w:r>
+        <w:t xml:space="preserve"> dus </w:t>
       </w:r>
       <w:r>
         <w:t>duurde dat ook kort.</w:t>
@@ -143,13 +279,26 @@
     </w:p>
     <w:p>
       <w:r>
-        <w:t xml:space="preserve">Vandaag in de namiddag begonnen we met de co-working les waarbij we dus informatie kunnen delen met medeleerlingen. Al was het de eerste les dus kwam daar niet veel van. Ik begon gewoon verder aan mijn </w:t>
-      </w:r>
+        <w:t>Vandaag in de namiddag begonnen we met de co-</w:t>
+      </w:r>
+      <w:proofErr w:type="spellStart"/>
+      <w:r>
+        <w:t>working</w:t>
+      </w:r>
+      <w:proofErr w:type="spellEnd"/>
+      <w:r>
+        <w:t xml:space="preserve"> les waarbij we dus informatie kunnen delen met medeleerlingen. Al was het de eerste les dus kwam daar niet veel van. Ik begon gewoon verder aan mijn </w:t>
+      </w:r>
+      <w:proofErr w:type="spellStart"/>
       <w:r>
         <w:t>F</w:t>
       </w:r>
       <w:r>
-        <w:t>igma design.</w:t>
+        <w:t>igma</w:t>
+      </w:r>
+      <w:proofErr w:type="spellEnd"/>
+      <w:r>
+        <w:t xml:space="preserve"> design.</w:t>
       </w:r>
     </w:p>
     <w:p>
@@ -160,7 +309,15 @@
         <w:t>te veel</w:t>
       </w:r>
       <w:r>
-        <w:t xml:space="preserve"> naar voor moest leunen en dus nek pijn kreeg en er waren precies geen ramen om te openen. </w:t>
+        <w:t xml:space="preserve"> naar voor moest leunen en dus </w:t>
+      </w:r>
+      <w:proofErr w:type="gramStart"/>
+      <w:r>
+        <w:t>nek pijn</w:t>
+      </w:r>
+      <w:proofErr w:type="gramEnd"/>
+      <w:r>
+        <w:t xml:space="preserve"> kreeg en er waren precies geen ramen om te openen. </w:t>
       </w:r>
       <w:r>
         <w:t>Gelukkig kunnen we naar buiten wanneer we het willen.</w:t>
@@ -200,7 +357,23 @@
     </w:p>
     <w:p>
       <w:r>
-        <w:t>Vandaag heb ik verder gewerkt aan mijn Figma design en het ging redelijk vlot vooruit. Ik wou absoluut dat het vandaag af was zodat ik morgen kan werken aan een ander vak. Tijdens het maken van het design heb ik vooral ook zitten op zoeken dat sommige concepten wel haalbaar zijn om te programmeren. Dit is allemaal wel mogelijk, maar zal wel een challenge zijn zoals de opmerkingen plaatsen</w:t>
+        <w:t xml:space="preserve">Vandaag heb ik verder gewerkt aan mijn </w:t>
+      </w:r>
+      <w:proofErr w:type="spellStart"/>
+      <w:r>
+        <w:t>Figma</w:t>
+      </w:r>
+      <w:proofErr w:type="spellEnd"/>
+      <w:r>
+        <w:t xml:space="preserve"> design en het ging redelijk vlot vooruit. Ik wou absoluut dat het vandaag af was zodat ik morgen kan werken aan een ander vak. Tijdens het maken van het design heb ik vooral ook zitten op zoeken dat sommige concepten wel haalbaar zijn om te programmeren. Dit is allemaal wel mogelijk, maar zal wel een </w:t>
+      </w:r>
+      <w:proofErr w:type="spellStart"/>
+      <w:r>
+        <w:t>challenge</w:t>
+      </w:r>
+      <w:proofErr w:type="spellEnd"/>
+      <w:r>
+        <w:t xml:space="preserve"> zijn zoals de opmerkingen plaatsen</w:t>
       </w:r>
       <w:r>
         <w:t>. M</w:t>
@@ -312,11 +485,48 @@
     </w:p>
     <w:p>
       <w:r>
-        <w:t xml:space="preserve">Vandaag werd mijn figma prototype gecontroleerd waarbij ik moest opnieuw uitleggen wat mijn app doet door middel van accurate presentatie. Ik legde dit vrij duidelijk uit en alles ging goed vooruit. Meneer Blancquaert heeft me dan ook nog een library genaamd “Material design” aangeraden om mijn applicatie te ontwerpen. </w:t>
-      </w:r>
-      <w:r>
-        <w:t>Blijkbaar Google gebruikt deze library</w:t>
-      </w:r>
+        <w:t xml:space="preserve">Vandaag werd mijn </w:t>
+      </w:r>
+      <w:proofErr w:type="spellStart"/>
+      <w:r>
+        <w:t>figma</w:t>
+      </w:r>
+      <w:proofErr w:type="spellEnd"/>
+      <w:r>
+        <w:t xml:space="preserve"> prototype gecontroleerd waarbij ik moest opnieuw uitleggen wat mijn app doet door middel van accurate presentatie. Ik legde dit vrij duidelijk uit en alles ging goed vooruit. Meneer </w:t>
+      </w:r>
+      <w:proofErr w:type="spellStart"/>
+      <w:r>
+        <w:t>Blancquaert</w:t>
+      </w:r>
+      <w:proofErr w:type="spellEnd"/>
+      <w:r>
+        <w:t xml:space="preserve"> heeft me dan ook nog een </w:t>
+      </w:r>
+      <w:proofErr w:type="spellStart"/>
+      <w:r>
+        <w:t>library</w:t>
+      </w:r>
+      <w:proofErr w:type="spellEnd"/>
+      <w:r>
+        <w:t xml:space="preserve"> genaamd “</w:t>
+      </w:r>
+      <w:proofErr w:type="spellStart"/>
+      <w:r>
+        <w:t>Material</w:t>
+      </w:r>
+      <w:proofErr w:type="spellEnd"/>
+      <w:r>
+        <w:t xml:space="preserve"> design” aangeraden om mijn applicatie te ontwerpen. </w:t>
+      </w:r>
+      <w:r>
+        <w:t xml:space="preserve">Blijkbaar Google gebruikt deze </w:t>
+      </w:r>
+      <w:proofErr w:type="spellStart"/>
+      <w:r>
+        <w:t>library</w:t>
+      </w:r>
+      <w:proofErr w:type="spellEnd"/>
       <w:r>
         <w:t xml:space="preserve"> om hun apps te maken.</w:t>
       </w:r>
@@ -354,7 +564,23 @@
         <w:t xml:space="preserve">kunt maken </w:t>
       </w:r>
       <w:r>
-        <w:t>om je app te testen. Als je developer modus in de settings van je gsm</w:t>
+        <w:t xml:space="preserve">om je app te testen. Als je </w:t>
+      </w:r>
+      <w:proofErr w:type="spellStart"/>
+      <w:r>
+        <w:t>developer</w:t>
+      </w:r>
+      <w:proofErr w:type="spellEnd"/>
+      <w:r>
+        <w:t xml:space="preserve"> modus in de </w:t>
+      </w:r>
+      <w:proofErr w:type="spellStart"/>
+      <w:r>
+        <w:t>settings</w:t>
+      </w:r>
+      <w:proofErr w:type="spellEnd"/>
+      <w:r>
+        <w:t xml:space="preserve"> van je gsm</w:t>
       </w:r>
       <w:r>
         <w:t xml:space="preserve"> aanzet, kan je je gsm verbinden met de pc en dus je applicatie daarop testen.</w:t>
@@ -372,7 +598,23 @@
     </w:p>
     <w:p>
       <w:r>
-        <w:t>Tijdens lange downloads heb ik ook mijn google account toegevoegd op Firebase. Volgens de presentatie die we kregen van een medestudent.</w:t>
+        <w:t xml:space="preserve">Tijdens lange downloads heb ik ook mijn </w:t>
+      </w:r>
+      <w:proofErr w:type="gramStart"/>
+      <w:r>
+        <w:t>google account</w:t>
+      </w:r>
+      <w:proofErr w:type="gramEnd"/>
+      <w:r>
+        <w:t xml:space="preserve"> toegevoegd op </w:t>
+      </w:r>
+      <w:proofErr w:type="spellStart"/>
+      <w:r>
+        <w:t>Firebase</w:t>
+      </w:r>
+      <w:proofErr w:type="spellEnd"/>
+      <w:r>
+        <w:t>. Volgens de presentatie die we kregen van een medestudent.</w:t>
       </w:r>
     </w:p>
     <w:p>
@@ -423,7 +665,23 @@
         <w:t>mijn</w:t>
       </w:r>
       <w:r>
-        <w:t xml:space="preserve"> figma design delen met meneer Blancquaert, toen hij vroeg dat mijn design klaar was</w:t>
+        <w:t xml:space="preserve"> </w:t>
+      </w:r>
+      <w:proofErr w:type="spellStart"/>
+      <w:r>
+        <w:t>figma</w:t>
+      </w:r>
+      <w:proofErr w:type="spellEnd"/>
+      <w:r>
+        <w:t xml:space="preserve"> design delen met meneer </w:t>
+      </w:r>
+      <w:proofErr w:type="spellStart"/>
+      <w:r>
+        <w:t>Blancquaert</w:t>
+      </w:r>
+      <w:proofErr w:type="spellEnd"/>
+      <w:r>
+        <w:t>, toen hij vroeg dat mijn design klaar was</w:t>
       </w:r>
       <w:r>
         <w:t xml:space="preserve"> of niet</w:t>
@@ -437,14 +695,54 @@
         <w:t>Ik heb daarna gewoon verder begonnen aan de tutorial die ik vorige week gebruikt had.</w:t>
       </w:r>
       <w:r>
-        <w:t xml:space="preserve"> Hierbij leerde ik meer over hoe ik Android studio beter kon gebruiken om mijn app te designen zoals hoe je </w:t>
+        <w:t xml:space="preserve"> Hierbij leerde ik meer over hoe ik </w:t>
+      </w:r>
+      <w:proofErr w:type="gramStart"/>
+      <w:r>
+        <w:t>Android studio</w:t>
+      </w:r>
+      <w:proofErr w:type="gramEnd"/>
+      <w:r>
+        <w:t xml:space="preserve"> beter kon gebruiken om mijn app te </w:t>
+      </w:r>
+      <w:proofErr w:type="spellStart"/>
+      <w:r>
+        <w:t>designen</w:t>
+      </w:r>
+      <w:proofErr w:type="spellEnd"/>
+      <w:r>
+        <w:t xml:space="preserve"> zoals hoe je </w:t>
       </w:r>
       <w:r>
         <w:lastRenderedPageBreak/>
-        <w:t>attributen kunt aanpassen (bv. color)</w:t>
-      </w:r>
-      <w:r>
-        <w:t xml:space="preserve">. Android studio is zeer gelijkaardig als bijvoorbeeld Webstorm, maar bij het design van een mobile app is het zeer </w:t>
+        <w:t xml:space="preserve">attributen kunt aanpassen (bv. </w:t>
+      </w:r>
+      <w:proofErr w:type="spellStart"/>
+      <w:r>
+        <w:t>color</w:t>
+      </w:r>
+      <w:proofErr w:type="spellEnd"/>
+      <w:r>
+        <w:t>)</w:t>
+      </w:r>
+      <w:r>
+        <w:t xml:space="preserve">. </w:t>
+      </w:r>
+      <w:proofErr w:type="gramStart"/>
+      <w:r>
+        <w:t>Android studio</w:t>
+      </w:r>
+      <w:proofErr w:type="gramEnd"/>
+      <w:r>
+        <w:t xml:space="preserve"> is zeer gelijkaardig als bijvoorbeeld </w:t>
+      </w:r>
+      <w:proofErr w:type="spellStart"/>
+      <w:r>
+        <w:t>Webstorm</w:t>
+      </w:r>
+      <w:proofErr w:type="spellEnd"/>
+      <w:r>
+        <w:t xml:space="preserve">, maar bij het design van een mobile app is het zeer </w:t>
       </w:r>
       <w:r>
         <w:t>verschillend</w:t>
@@ -453,14 +751,27 @@
         <w:t>.</w:t>
       </w:r>
       <w:r>
-        <w:t xml:space="preserve"> Bij Webstorm kan je je website </w:t>
+        <w:t xml:space="preserve"> Bij </w:t>
+      </w:r>
+      <w:proofErr w:type="spellStart"/>
+      <w:r>
+        <w:t>Webstorm</w:t>
+      </w:r>
+      <w:proofErr w:type="spellEnd"/>
+      <w:r>
+        <w:t xml:space="preserve"> kan je je website </w:t>
       </w:r>
       <w:r>
         <w:t>bekijken</w:t>
       </w:r>
       <w:r>
-        <w:t xml:space="preserve"> in een gekozen browser, maar je kan in Android studio</w:t>
-      </w:r>
+        <w:t xml:space="preserve"> in een gekozen browser, maar je kan in </w:t>
+      </w:r>
+      <w:proofErr w:type="gramStart"/>
+      <w:r>
+        <w:t>Android studio</w:t>
+      </w:r>
+      <w:proofErr w:type="gramEnd"/>
       <w:r>
         <w:t xml:space="preserve"> je app</w:t>
       </w:r>
@@ -480,7 +791,15 @@
         <w:t>.</w:t>
       </w:r>
       <w:r>
-        <w:t xml:space="preserve"> Als ik de Jetbrains applicaties vergelijk met Visual studio 2019, </w:t>
+        <w:t xml:space="preserve"> Als ik de </w:t>
+      </w:r>
+      <w:proofErr w:type="spellStart"/>
+      <w:r>
+        <w:t>Jetbrains</w:t>
+      </w:r>
+      <w:proofErr w:type="spellEnd"/>
+      <w:r>
+        <w:t xml:space="preserve"> applicaties vergelijk met Visual studio 2019, </w:t>
       </w:r>
       <w:r>
         <w:t>heb ik er altijd moeite mee om de lay</w:t>
@@ -560,7 +879,23 @@
     </w:p>
     <w:p>
       <w:r>
-        <w:t>Ik heb dan ondertussen de tutorial van Material design gevolgd in plaats van die van Android studio. Ze leerde me dan hoe ik er mee kon werken maar niet hoe een hele nieuwe app kon maken. Ik kreeg een voorbeeld app om erin te kunnen werken voor de tutorial.</w:t>
+        <w:t xml:space="preserve">Ik heb dan ondertussen de tutorial van </w:t>
+      </w:r>
+      <w:proofErr w:type="spellStart"/>
+      <w:r>
+        <w:t>Material</w:t>
+      </w:r>
+      <w:proofErr w:type="spellEnd"/>
+      <w:r>
+        <w:t xml:space="preserve"> design gevolgd in plaats van die van </w:t>
+      </w:r>
+      <w:proofErr w:type="gramStart"/>
+      <w:r>
+        <w:t>Android studio</w:t>
+      </w:r>
+      <w:proofErr w:type="gramEnd"/>
+      <w:r>
+        <w:t>. Ze leerde me dan hoe ik er mee kon werken maar niet hoe een hele nieuwe app kon maken. Ik kreeg een voorbeeld app om erin te kunnen werken voor de tutorial.</w:t>
       </w:r>
     </w:p>
     <w:p>
@@ -603,10 +938,34 @@
     </w:p>
     <w:p>
       <w:r>
-        <w:t>Vandaag heb ik de usertests afgelegd met Louis D’hondt en Jasper Wauters. Dit ging heel gemakkelijk en duurde niet lang. Ik had niet echt serieuze opmerkingen, behalve dat ik geen persoonlijke info pagina gemaakt had.</w:t>
-      </w:r>
-      <w:r>
-        <w:t xml:space="preserve"> Daarna heb ik onmiddellijk die opmerkingen van mijn figma design verbetert en op mijn repository gezet.</w:t>
+        <w:t xml:space="preserve">Vandaag heb ik de usertests afgelegd met Louis </w:t>
+      </w:r>
+      <w:proofErr w:type="spellStart"/>
+      <w:r>
+        <w:t>D’hondt</w:t>
+      </w:r>
+      <w:proofErr w:type="spellEnd"/>
+      <w:r>
+        <w:t xml:space="preserve"> en Jasper Wauters. Dit ging heel gemakkelijk en duurde niet lang. Ik had niet echt serieuze opmerkingen, behalve dat ik geen persoonlijke info pagina gemaakt had.</w:t>
+      </w:r>
+      <w:r>
+        <w:t xml:space="preserve"> Daarna heb ik onmiddellijk die opmerkingen van mijn </w:t>
+      </w:r>
+      <w:proofErr w:type="spellStart"/>
+      <w:r>
+        <w:t>figma</w:t>
+      </w:r>
+      <w:proofErr w:type="spellEnd"/>
+      <w:r>
+        <w:t xml:space="preserve"> design verbetert en op mijn </w:t>
+      </w:r>
+      <w:proofErr w:type="spellStart"/>
+      <w:r>
+        <w:t>repository</w:t>
+      </w:r>
+      <w:proofErr w:type="spellEnd"/>
+      <w:r>
+        <w:t xml:space="preserve"> gezet.</w:t>
       </w:r>
     </w:p>
     <w:p/>
@@ -629,7 +988,47 @@
     </w:p>
     <w:p>
       <w:r>
-        <w:t xml:space="preserve">Vandaag begon ik eindelijk met Material Design. Ik besloot mijn oude app te verwijderen en te vervangen met een empty activity zodat ik echt van scratch begin. Zo kan ik alles beter begrijpen. Ik had dan ontdekt dat android studio al automatisch Material Design van Google had toegevoegd bij de dependencies, dus eigenlijk ben ik </w:t>
+        <w:t xml:space="preserve">Vandaag begon ik eindelijk met </w:t>
+      </w:r>
+      <w:proofErr w:type="spellStart"/>
+      <w:r>
+        <w:t>Material</w:t>
+      </w:r>
+      <w:proofErr w:type="spellEnd"/>
+      <w:r>
+        <w:t xml:space="preserve"> Design. Ik besloot mijn oude app te verwijderen en te vervangen met een empty </w:t>
+      </w:r>
+      <w:proofErr w:type="spellStart"/>
+      <w:r>
+        <w:t>activity</w:t>
+      </w:r>
+      <w:proofErr w:type="spellEnd"/>
+      <w:r>
+        <w:t xml:space="preserve"> zodat ik echt van scratch begin. Zo kan ik alles beter begrijpen. Ik had dan ontdekt dat </w:t>
+      </w:r>
+      <w:proofErr w:type="spellStart"/>
+      <w:r>
+        <w:t>android</w:t>
+      </w:r>
+      <w:proofErr w:type="spellEnd"/>
+      <w:r>
+        <w:t xml:space="preserve"> studio al automatisch </w:t>
+      </w:r>
+      <w:proofErr w:type="spellStart"/>
+      <w:r>
+        <w:t>Material</w:t>
+      </w:r>
+      <w:proofErr w:type="spellEnd"/>
+      <w:r>
+        <w:t xml:space="preserve"> Design van Google had toegevoegd bij de </w:t>
+      </w:r>
+      <w:proofErr w:type="spellStart"/>
+      <w:r>
+        <w:t>dependencies</w:t>
+      </w:r>
+      <w:proofErr w:type="spellEnd"/>
+      <w:r>
+        <w:t xml:space="preserve">, dus eigenlijk ben ik </w:t>
       </w:r>
       <w:r>
         <w:t>onmiddellijk</w:t>
@@ -773,18 +1172,50 @@
     </w:p>
     <w:p>
       <w:r>
-        <w:t>Eerst had ik geprobeerd om gewoon een heel nieuw project te maken die bestond uit een login activity. Deze activity heb ik dan gewoon aangepast naar mijn wens. Maar dit wou ook niet echt werken, want blijkbaar is het best dat je van een main</w:t>
+        <w:t xml:space="preserve">Eerst had ik geprobeerd om gewoon een heel nieuw project te maken die bestond uit een login </w:t>
+      </w:r>
+      <w:proofErr w:type="spellStart"/>
+      <w:r>
+        <w:t>activity</w:t>
+      </w:r>
+      <w:proofErr w:type="spellEnd"/>
+      <w:r>
+        <w:t xml:space="preserve">. Deze </w:t>
+      </w:r>
+      <w:proofErr w:type="spellStart"/>
+      <w:r>
+        <w:t>activity</w:t>
+      </w:r>
+      <w:proofErr w:type="spellEnd"/>
+      <w:r>
+        <w:t xml:space="preserve"> heb ik dan gewoon aangepast naar mijn wens. Maar dit wou ook niet echt werken, want blijkbaar is het best dat je van een </w:t>
+      </w:r>
+      <w:proofErr w:type="spellStart"/>
+      <w:r>
+        <w:t>main</w:t>
       </w:r>
       <w:r>
         <w:t>_</w:t>
       </w:r>
       <w:r>
-        <w:t>activity start en dan de login page daarmee opent.</w:t>
-      </w:r>
-    </w:p>
-    <w:p>
-      <w:r>
-        <w:t>Ik ben dan gewoon terug begonnen aan het oude project en heb dan de error op stack overflow gezocht en daar had ik de oplossing gevonden. Ik moest gewoon mijn “device” zijn data wipen en dan kon het opnieuw installeren want mijn oude projecten stond er nog op.</w:t>
+        <w:t>activity</w:t>
+      </w:r>
+      <w:proofErr w:type="spellEnd"/>
+      <w:r>
+        <w:t xml:space="preserve"> start en dan de login page daarmee opent.</w:t>
+      </w:r>
+    </w:p>
+    <w:p>
+      <w:r>
+        <w:t xml:space="preserve">Ik ben dan gewoon terug begonnen aan het oude project en heb dan de error op stack overflow gezocht en daar had ik de oplossing gevonden. Ik moest gewoon mijn “device” zijn data </w:t>
+      </w:r>
+      <w:proofErr w:type="spellStart"/>
+      <w:r>
+        <w:t>wipen</w:t>
+      </w:r>
+      <w:proofErr w:type="spellEnd"/>
+      <w:r>
+        <w:t xml:space="preserve"> en dan kon het opnieuw installeren want mijn oude projecten stond er nog op.</w:t>
       </w:r>
     </w:p>
     <w:p>
@@ -828,7 +1259,23 @@
         <w:t>Vandaag wou de wifi niet werken op de campus dus had ik niet veel vooruitgang geboekt.</w:t>
       </w:r>
       <w:r>
-        <w:t xml:space="preserve"> Ik was ook gisteren vergeten om de registratie pagina te committen, dus da had ik alleszins gedaan door met mijn hotspot van mijn gsm te verbinden en de 4G aan te zetten.</w:t>
+        <w:t xml:space="preserve"> Ik was ook gisteren vergeten om de registratie pagina te </w:t>
+      </w:r>
+      <w:proofErr w:type="spellStart"/>
+      <w:r>
+        <w:t>committen</w:t>
+      </w:r>
+      <w:proofErr w:type="spellEnd"/>
+      <w:r>
+        <w:t xml:space="preserve">, dus da had ik alleszins gedaan door met mijn </w:t>
+      </w:r>
+      <w:proofErr w:type="spellStart"/>
+      <w:r>
+        <w:t>hotspot</w:t>
+      </w:r>
+      <w:proofErr w:type="spellEnd"/>
+      <w:r>
+        <w:t xml:space="preserve"> van mijn gsm te verbinden en de 4G aan te zetten.</w:t>
       </w:r>
     </w:p>
     <w:p>
@@ -860,11 +1307,21 @@
         <w:t>Vandaag wou de wifi op school nog steeds niet zo goed werken</w:t>
       </w:r>
       <w:r>
-        <w:t xml:space="preserve">, maar dankzij de wifi hotspot heb ik toch nog de navigatie van login naar registratie kunnen </w:t>
-      </w:r>
+        <w:t xml:space="preserve">, maar dankzij de wifi </w:t>
+      </w:r>
+      <w:proofErr w:type="spellStart"/>
+      <w:r>
+        <w:t>hotspot</w:t>
+      </w:r>
+      <w:proofErr w:type="spellEnd"/>
+      <w:r>
+        <w:t xml:space="preserve"> heb ik toch nog de navigatie van login naar registratie kunnen </w:t>
+      </w:r>
+      <w:proofErr w:type="spellStart"/>
       <w:r>
         <w:t>commiten</w:t>
       </w:r>
+      <w:proofErr w:type="spellEnd"/>
       <w:r>
         <w:t>.</w:t>
       </w:r>
@@ -874,7 +1331,15 @@
     </w:p>
     <w:p>
       <w:r>
-        <w:t>De wifi wou uiteindelijk werken dus kon eindelijk heel vlot vooruitgaan. Ik heb daarbij de navigatie tussen de login en registratie kunnen afwerken. Daarna heb ik ook de startpagina bijna afgewerkt, maar de bottom bar wou niet helemaal meewerken dus dat laat ik voor later.</w:t>
+        <w:t xml:space="preserve">De wifi wou uiteindelijk werken dus kon eindelijk heel vlot vooruitgaan. Ik heb daarbij de navigatie tussen de login en registratie kunnen afwerken. Daarna heb ik ook de startpagina bijna afgewerkt, maar de </w:t>
+      </w:r>
+      <w:proofErr w:type="spellStart"/>
+      <w:r>
+        <w:t>bottom</w:t>
+      </w:r>
+      <w:proofErr w:type="spellEnd"/>
+      <w:r>
+        <w:t xml:space="preserve"> bar wou niet helemaal meewerken dus dat laat ik voor later.</w:t>
       </w:r>
     </w:p>
     <w:p/>
@@ -895,7 +1360,31 @@
     </w:p>
     <w:p>
       <w:r>
-        <w:t>Vandaag heb ik de bodem navigatie afgewerkt waarbij je dan naar je groepen kunt gaan oftewel naar je notities die je hebt gefotografeerd. Dit was eerste wel een challenge zoals de active pagina weergegeven of de juiste eventlistener gebruiken om te kunnen navigeren. Maar deze links hebben daarbij geholpen:</w:t>
+        <w:t xml:space="preserve">Vandaag heb ik de bodem navigatie afgewerkt waarbij je dan naar je groepen kunt gaan oftewel naar je notities die je hebt gefotografeerd. Dit was eerste wel een </w:t>
+      </w:r>
+      <w:proofErr w:type="spellStart"/>
+      <w:r>
+        <w:t>challenge</w:t>
+      </w:r>
+      <w:proofErr w:type="spellEnd"/>
+      <w:r>
+        <w:t xml:space="preserve"> zoals de </w:t>
+      </w:r>
+      <w:proofErr w:type="spellStart"/>
+      <w:r>
+        <w:t>active</w:t>
+      </w:r>
+      <w:proofErr w:type="spellEnd"/>
+      <w:r>
+        <w:t xml:space="preserve"> pagina weergegeven of de juiste </w:t>
+      </w:r>
+      <w:proofErr w:type="spellStart"/>
+      <w:r>
+        <w:t>eventlistener</w:t>
+      </w:r>
+      <w:proofErr w:type="spellEnd"/>
+      <w:r>
+        <w:t xml:space="preserve"> gebruiken om te kunnen navigeren. Maar deze links hebben daarbij geholpen:</w:t>
       </w:r>
     </w:p>
     <w:p>
@@ -941,13 +1430,29 @@
     </w:p>
     <w:p>
       <w:r>
-        <w:t>Ik heb dan ook nog voor gezorgd dat mijn firebase account verbonden is met</w:t>
+        <w:t xml:space="preserve">Ik heb dan ook nog voor gezorgd dat mijn </w:t>
+      </w:r>
+      <w:proofErr w:type="spellStart"/>
+      <w:r>
+        <w:t>firebase</w:t>
+      </w:r>
+      <w:proofErr w:type="spellEnd"/>
+      <w:r>
+        <w:t xml:space="preserve"> account verbonden is met</w:t>
       </w:r>
       <w:r>
         <w:t xml:space="preserve"> mijn</w:t>
       </w:r>
       <w:r>
-        <w:t xml:space="preserve"> android studio app.</w:t>
+        <w:t xml:space="preserve"> </w:t>
+      </w:r>
+      <w:proofErr w:type="spellStart"/>
+      <w:r>
+        <w:t>android</w:t>
+      </w:r>
+      <w:proofErr w:type="spellEnd"/>
+      <w:r>
+        <w:t xml:space="preserve"> studio app.</w:t>
       </w:r>
     </w:p>
     <w:p>
@@ -1104,8 +1609,13 @@
           <w:numId w:val="1"/>
         </w:numPr>
       </w:pPr>
-      <w:r>
-        <w:t>Firebase implementeren</w:t>
+      <w:proofErr w:type="spellStart"/>
+      <w:r>
+        <w:t>Firebase</w:t>
+      </w:r>
+      <w:proofErr w:type="spellEnd"/>
+      <w:r>
+        <w:t xml:space="preserve"> implementeren</w:t>
       </w:r>
     </w:p>
     <w:p>
@@ -1117,8 +1627,13 @@
         </w:numPr>
       </w:pPr>
       <w:r>
-        <w:t>Login en registratie mogelijk maken via firebase</w:t>
-      </w:r>
+        <w:t xml:space="preserve">Login en registratie mogelijk maken via </w:t>
+      </w:r>
+      <w:proofErr w:type="spellStart"/>
+      <w:r>
+        <w:t>firebase</w:t>
+      </w:r>
+      <w:proofErr w:type="spellEnd"/>
     </w:p>
     <w:p>
       <w:pPr>
@@ -1129,7 +1644,11 @@
         </w:numPr>
       </w:pPr>
       <w:r>
-        <w:t>Camera functionaliteit bekijken voor andr</w:t>
+        <w:t xml:space="preserve">Camera functionaliteit bekijken voor </w:t>
+      </w:r>
+      <w:proofErr w:type="spellStart"/>
+      <w:r>
+        <w:t>andr</w:t>
       </w:r>
       <w:r>
         <w:t>oi</w:t>
@@ -1137,6 +1656,7 @@
       <w:r>
         <w:t>d</w:t>
       </w:r>
+      <w:proofErr w:type="spellEnd"/>
     </w:p>
     <w:p/>
     <w:p>
@@ -1156,10 +1676,66 @@
     </w:p>
     <w:p>
       <w:r>
-        <w:t>Hier kan je ondertussen zien dat mijn app verbonden is met Firebase. Nu vragen ze voor google sign-in om een sha-1 fingerprint toe te voegen.</w:t>
-      </w:r>
-      <w:r>
-        <w:t xml:space="preserve"> Ik wou dan google play signing pakken om het te genereren ipv self-signing, maar ik moet dan 25 euro eerst betalen voor een </w:t>
+        <w:t xml:space="preserve">Hier kan je ondertussen zien dat mijn app verbonden is met </w:t>
+      </w:r>
+      <w:proofErr w:type="spellStart"/>
+      <w:r>
+        <w:t>Firebase</w:t>
+      </w:r>
+      <w:proofErr w:type="spellEnd"/>
+      <w:r>
+        <w:t xml:space="preserve">. Nu vragen ze voor google </w:t>
+      </w:r>
+      <w:proofErr w:type="spellStart"/>
+      <w:r>
+        <w:t>sign</w:t>
+      </w:r>
+      <w:proofErr w:type="spellEnd"/>
+      <w:r>
+        <w:t xml:space="preserve">-in om een sha-1 </w:t>
+      </w:r>
+      <w:proofErr w:type="spellStart"/>
+      <w:r>
+        <w:t>fingerprint</w:t>
+      </w:r>
+      <w:proofErr w:type="spellEnd"/>
+      <w:r>
+        <w:t xml:space="preserve"> toe te voegen.</w:t>
+      </w:r>
+      <w:r>
+        <w:t xml:space="preserve"> Ik wou dan google </w:t>
+      </w:r>
+      <w:proofErr w:type="spellStart"/>
+      <w:r>
+        <w:t>play</w:t>
+      </w:r>
+      <w:proofErr w:type="spellEnd"/>
+      <w:r>
+        <w:t xml:space="preserve"> </w:t>
+      </w:r>
+      <w:proofErr w:type="spellStart"/>
+      <w:r>
+        <w:t>signing</w:t>
+      </w:r>
+      <w:proofErr w:type="spellEnd"/>
+      <w:r>
+        <w:t xml:space="preserve"> pakken om het te genereren </w:t>
+      </w:r>
+      <w:proofErr w:type="spellStart"/>
+      <w:r>
+        <w:t>ipv</w:t>
+      </w:r>
+      <w:proofErr w:type="spellEnd"/>
+      <w:r>
+        <w:t xml:space="preserve"> </w:t>
+      </w:r>
+      <w:proofErr w:type="spellStart"/>
+      <w:r>
+        <w:t>self-signing</w:t>
+      </w:r>
+      <w:proofErr w:type="spellEnd"/>
+      <w:r>
+        <w:t xml:space="preserve">, maar ik moet dan 25 euro eerst betalen voor een </w:t>
       </w:r>
       <w:r>
         <w:t>ontwikkelaar</w:t>
@@ -1230,14 +1806,75 @@
       <w:r>
         <w:t>Als ik wat meer naar onderging bij de “</w:t>
       </w:r>
-      <w:r>
-        <w:t>Authenticating Your Client</w:t>
-      </w:r>
-      <w:r>
-        <w:t>” pagina (zie link) kan je ook via de terminal van android studio een command invoeren om de sha-1 fingerprint te krijgen. Hierbij moest je “gradle sigingReport” invoeren en dan ctrl + enter invoeren!!</w:t>
-      </w:r>
-      <w:r>
-        <w:t xml:space="preserve"> Deze heb ik dan toegevoegd aan Firebase.</w:t>
+      <w:proofErr w:type="spellStart"/>
+      <w:r>
+        <w:t>Authenticating</w:t>
+      </w:r>
+      <w:proofErr w:type="spellEnd"/>
+      <w:r>
+        <w:t xml:space="preserve"> </w:t>
+      </w:r>
+      <w:proofErr w:type="spellStart"/>
+      <w:r>
+        <w:t>Your</w:t>
+      </w:r>
+      <w:proofErr w:type="spellEnd"/>
+      <w:r>
+        <w:t xml:space="preserve"> Client</w:t>
+      </w:r>
+      <w:r>
+        <w:t xml:space="preserve">” pagina (zie link) kan je ook via de terminal van </w:t>
+      </w:r>
+      <w:proofErr w:type="spellStart"/>
+      <w:r>
+        <w:t>android</w:t>
+      </w:r>
+      <w:proofErr w:type="spellEnd"/>
+      <w:r>
+        <w:t xml:space="preserve"> studio een </w:t>
+      </w:r>
+      <w:proofErr w:type="spellStart"/>
+      <w:r>
+        <w:t>command</w:t>
+      </w:r>
+      <w:proofErr w:type="spellEnd"/>
+      <w:r>
+        <w:t xml:space="preserve"> invoeren om de sha-1 </w:t>
+      </w:r>
+      <w:proofErr w:type="spellStart"/>
+      <w:r>
+        <w:t>fingerprint</w:t>
+      </w:r>
+      <w:proofErr w:type="spellEnd"/>
+      <w:r>
+        <w:t xml:space="preserve"> te krijgen. Hierbij moest je “</w:t>
+      </w:r>
+      <w:proofErr w:type="spellStart"/>
+      <w:r>
+        <w:t>gradle</w:t>
+      </w:r>
+      <w:proofErr w:type="spellEnd"/>
+      <w:r>
+        <w:t xml:space="preserve"> </w:t>
+      </w:r>
+      <w:proofErr w:type="spellStart"/>
+      <w:r>
+        <w:t>sigingReport</w:t>
+      </w:r>
+      <w:proofErr w:type="spellEnd"/>
+      <w:r>
+        <w:t>” invoeren en dan ctrl + enter invoeren!!</w:t>
+      </w:r>
+      <w:r>
+        <w:t xml:space="preserve"> Deze heb ik dan toegevoegd aan </w:t>
+      </w:r>
+      <w:proofErr w:type="spellStart"/>
+      <w:r>
+        <w:t>Firebase</w:t>
+      </w:r>
+      <w:proofErr w:type="spellEnd"/>
+      <w:r>
+        <w:t>.</w:t>
       </w:r>
     </w:p>
     <w:p>
@@ -1285,7 +1922,15 @@
     </w:p>
     <w:p>
       <w:r>
-        <w:t>Daarna moest ik een Oauth 2.0 client ID toevoegen voor het inloggen. Hierbij moest ik een hele configuratie begaan.</w:t>
+        <w:t xml:space="preserve">Daarna moest ik een </w:t>
+      </w:r>
+      <w:proofErr w:type="spellStart"/>
+      <w:r>
+        <w:t>Oauth</w:t>
+      </w:r>
+      <w:proofErr w:type="spellEnd"/>
+      <w:r>
+        <w:t xml:space="preserve"> 2.0 client ID toevoegen voor het inloggen. Hierbij moest ik een hele configuratie begaan.</w:t>
       </w:r>
       <w:r>
         <w:t xml:space="preserve"> Ik heb hierbij het meest niet ingevuld zoals een privacy policy, enzoverder.</w:t>
@@ -1466,7 +2111,31 @@
     </w:p>
     <w:p>
       <w:r>
-        <w:t xml:space="preserve">Vandaag had ik tijdens les (in de morgen van 8u15-11u15) verder gewerkt aan de back-end van mijn app. Ik was gisteren bezig met google sign-in, maar ik besloot om eerst normale email/password authentication toe te voegen. Dit ging vrij vlot vooruit maar toen ik de button klikt sloot de app af, dus dat moet ik nog oplossen. </w:t>
+        <w:t xml:space="preserve">Vandaag had ik tijdens les (in de morgen van 8u15-11u15) verder gewerkt aan de </w:t>
+      </w:r>
+      <w:proofErr w:type="spellStart"/>
+      <w:r>
+        <w:t>back-end</w:t>
+      </w:r>
+      <w:proofErr w:type="spellEnd"/>
+      <w:r>
+        <w:t xml:space="preserve"> van mijn app. Ik was gisteren bezig met google </w:t>
+      </w:r>
+      <w:proofErr w:type="spellStart"/>
+      <w:r>
+        <w:t>sign</w:t>
+      </w:r>
+      <w:proofErr w:type="spellEnd"/>
+      <w:r>
+        <w:t xml:space="preserve">-in, maar ik besloot om eerst normale email/password </w:t>
+      </w:r>
+      <w:proofErr w:type="spellStart"/>
+      <w:r>
+        <w:t>authentication</w:t>
+      </w:r>
+      <w:proofErr w:type="spellEnd"/>
+      <w:r>
+        <w:t xml:space="preserve"> toe te voegen. Dit ging vrij vlot vooruit maar toen ik de button klikt sloot de app af, dus dat moet ik nog oplossen. </w:t>
       </w:r>
       <w:r>
         <w:t>Er werd</w:t>
@@ -1512,10 +2181,34 @@
         <w:t>Vandaag heb ik eindelijk de login en registratie kunnen afwerken. Dit had veel moeite gekost.</w:t>
       </w:r>
       <w:r>
-        <w:t xml:space="preserve"> Het probleem was dus dat mijn app bleef crashen als ik probeerde te registeren. Ik had veel op stackoverflow gezocht maar ik kon eerst niks vinden, maar toen zag ik dat de wifi van de device emulator op Android studio geen wifi had. Ik dacht eerst dat dit normaal was, maar begon toen twijfels te krijgen. Ik had dan eerst de info op stackoverflow pagina proberen gebruiken, maar dat was niet juist. Uiteindelijk gewoon mijn gsm hotspot 4G gebruiken werkte wel.</w:t>
-      </w:r>
-      <w:r>
-        <w:t xml:space="preserve"> Mijn app crasht dan nog steeds bij registratie maar ik kon wel inloggen door een test account aan te maken op Firebase. Dus mijn code werkte, maar toen ik zag dat ik niet gekeken had naar de error van die verscheen na de crash en dat maakte alles duidelijk</w:t>
+        <w:t xml:space="preserve"> Het probleem was dus dat mijn app bleef crashen als ik probeerde te registeren. Ik had veel op stackoverflow gezocht maar ik kon eerst niks vinden, maar toen zag ik dat de wifi van de device emulator op </w:t>
+      </w:r>
+      <w:proofErr w:type="gramStart"/>
+      <w:r>
+        <w:t>Android studio</w:t>
+      </w:r>
+      <w:proofErr w:type="gramEnd"/>
+      <w:r>
+        <w:t xml:space="preserve"> geen wifi had. Ik dacht eerst dat dit normaal was, maar begon toen twijfels te krijgen. Ik had dan eerst de info op stackoverflow pagina proberen gebruiken, maar dat was niet juist. Uiteindelijk gewoon mijn gsm </w:t>
+      </w:r>
+      <w:proofErr w:type="spellStart"/>
+      <w:r>
+        <w:t>hotspot</w:t>
+      </w:r>
+      <w:proofErr w:type="spellEnd"/>
+      <w:r>
+        <w:t xml:space="preserve"> 4G gebruiken werkte wel.</w:t>
+      </w:r>
+      <w:r>
+        <w:t xml:space="preserve"> Mijn app crasht dan nog steeds bij registratie maar ik kon wel inloggen door een test account aan te maken op </w:t>
+      </w:r>
+      <w:proofErr w:type="spellStart"/>
+      <w:r>
+        <w:t>Firebase</w:t>
+      </w:r>
+      <w:proofErr w:type="spellEnd"/>
+      <w:r>
+        <w:t>. Dus mijn code werkte, maar toen ik zag dat ik niet gekeken had naar de error van die verscheen na de crash en dat maakte alles duidelijk</w:t>
       </w:r>
       <w:r>
         <w:t xml:space="preserve"> voor mij</w:t>
@@ -1677,56 +2370,161 @@
           <w:rFonts w:eastAsia="Times New Roman" w:cstheme="minorHAnsi"/>
           <w:lang w:eastAsia="nl-BE"/>
         </w:rPr>
-        <w:t>Vandaag heb ik geprobeerd om google sign-in te laten werken. Dit ging zeer goed, maar het enige probleem is dat de google account niet wordt toegevoegd aan Firebase en het wil daarna niet naar de volgende pagina gaan als ik de google sign</w:t>
-      </w:r>
+        <w:t xml:space="preserve">Vandaag heb ik geprobeerd om google </w:t>
+      </w:r>
+      <w:proofErr w:type="spellStart"/>
       <w:r>
         <w:rPr>
           <w:rFonts w:eastAsia="Times New Roman" w:cstheme="minorHAnsi"/>
           <w:lang w:eastAsia="nl-BE"/>
         </w:rPr>
-        <w:t>-</w:t>
-      </w:r>
+        <w:t>sign</w:t>
+      </w:r>
+      <w:proofErr w:type="spellEnd"/>
       <w:r>
         <w:rPr>
           <w:rFonts w:eastAsia="Times New Roman" w:cstheme="minorHAnsi"/>
           <w:lang w:eastAsia="nl-BE"/>
         </w:rPr>
-        <w:t>in button klik. Het sign-in scherm verschijnt wel en hebben geen errors, maar daarna gebeurt er niks. Ik heb de methode toegevoegd die iemand van teams zei dat die het probleem</w:t>
-      </w:r>
+        <w:t xml:space="preserve">-in te laten werken. Dit ging zeer goed, maar het enige probleem is dat de </w:t>
+      </w:r>
+      <w:proofErr w:type="gramStart"/>
       <w:r>
         <w:rPr>
           <w:rFonts w:eastAsia="Times New Roman" w:cstheme="minorHAnsi"/>
           <w:lang w:eastAsia="nl-BE"/>
         </w:rPr>
-        <w:t xml:space="preserve"> zou</w:t>
-      </w:r>
+        <w:t>google account</w:t>
+      </w:r>
+      <w:proofErr w:type="gramEnd"/>
       <w:r>
         <w:rPr>
           <w:rFonts w:eastAsia="Times New Roman" w:cstheme="minorHAnsi"/>
           <w:lang w:eastAsia="nl-BE"/>
         </w:rPr>
-        <w:t xml:space="preserve"> oplos</w:t>
-      </w:r>
+        <w:t xml:space="preserve"> niet wordt toegevoegd aan </w:t>
+      </w:r>
+      <w:proofErr w:type="spellStart"/>
       <w:r>
         <w:rPr>
           <w:rFonts w:eastAsia="Times New Roman" w:cstheme="minorHAnsi"/>
           <w:lang w:eastAsia="nl-BE"/>
         </w:rPr>
-        <w:t>sen</w:t>
-      </w:r>
+        <w:t>Firebase</w:t>
+      </w:r>
+      <w:proofErr w:type="spellEnd"/>
       <w:r>
         <w:rPr>
           <w:rFonts w:eastAsia="Times New Roman" w:cstheme="minorHAnsi"/>
           <w:lang w:eastAsia="nl-BE"/>
         </w:rPr>
-        <w:t xml:space="preserve"> maar er zal nog ergens een fout zitten.</w:t>
-      </w:r>
+        <w:t xml:space="preserve"> en het wil daarna niet naar de volgende pagina gaan als ik de google </w:t>
+      </w:r>
+      <w:proofErr w:type="spellStart"/>
       <w:r>
         <w:rPr>
           <w:rFonts w:eastAsia="Times New Roman" w:cstheme="minorHAnsi"/>
           <w:lang w:eastAsia="nl-BE"/>
         </w:rPr>
-        <w:t xml:space="preserve"> 1 van de methodes was wel deprecated, maar die had </w:t>
+        <w:t>sign</w:t>
+      </w:r>
+      <w:proofErr w:type="spellEnd"/>
+      <w:r>
+        <w:rPr>
+          <w:rFonts w:eastAsia="Times New Roman" w:cstheme="minorHAnsi"/>
+          <w:lang w:eastAsia="nl-BE"/>
+        </w:rPr>
+        <w:t>-</w:t>
+      </w:r>
+      <w:r>
+        <w:rPr>
+          <w:rFonts w:eastAsia="Times New Roman" w:cstheme="minorHAnsi"/>
+          <w:lang w:eastAsia="nl-BE"/>
+        </w:rPr>
+        <w:t xml:space="preserve">in button klik. Het </w:t>
+      </w:r>
+      <w:proofErr w:type="spellStart"/>
+      <w:r>
+        <w:rPr>
+          <w:rFonts w:eastAsia="Times New Roman" w:cstheme="minorHAnsi"/>
+          <w:lang w:eastAsia="nl-BE"/>
+        </w:rPr>
+        <w:t>sign</w:t>
+      </w:r>
+      <w:proofErr w:type="spellEnd"/>
+      <w:r>
+        <w:rPr>
+          <w:rFonts w:eastAsia="Times New Roman" w:cstheme="minorHAnsi"/>
+          <w:lang w:eastAsia="nl-BE"/>
+        </w:rPr>
+        <w:t xml:space="preserve">-in scherm verschijnt wel en hebben geen </w:t>
+      </w:r>
+      <w:proofErr w:type="spellStart"/>
+      <w:r>
+        <w:rPr>
+          <w:rFonts w:eastAsia="Times New Roman" w:cstheme="minorHAnsi"/>
+          <w:lang w:eastAsia="nl-BE"/>
+        </w:rPr>
+        <w:t>errors</w:t>
+      </w:r>
+      <w:proofErr w:type="spellEnd"/>
+      <w:r>
+        <w:rPr>
+          <w:rFonts w:eastAsia="Times New Roman" w:cstheme="minorHAnsi"/>
+          <w:lang w:eastAsia="nl-BE"/>
+        </w:rPr>
+        <w:t>, maar daarna gebeurt er niks. Ik heb de methode toegevoegd die iemand van teams zei dat die het probleem</w:t>
+      </w:r>
+      <w:r>
+        <w:rPr>
+          <w:rFonts w:eastAsia="Times New Roman" w:cstheme="minorHAnsi"/>
+          <w:lang w:eastAsia="nl-BE"/>
+        </w:rPr>
+        <w:t xml:space="preserve"> zou</w:t>
+      </w:r>
+      <w:r>
+        <w:rPr>
+          <w:rFonts w:eastAsia="Times New Roman" w:cstheme="minorHAnsi"/>
+          <w:lang w:eastAsia="nl-BE"/>
+        </w:rPr>
+        <w:t xml:space="preserve"> oplos</w:t>
+      </w:r>
+      <w:r>
+        <w:rPr>
+          <w:rFonts w:eastAsia="Times New Roman" w:cstheme="minorHAnsi"/>
+          <w:lang w:eastAsia="nl-BE"/>
+        </w:rPr>
+        <w:t>sen</w:t>
+      </w:r>
+      <w:r>
+        <w:rPr>
+          <w:rFonts w:eastAsia="Times New Roman" w:cstheme="minorHAnsi"/>
+          <w:lang w:eastAsia="nl-BE"/>
+        </w:rPr>
+        <w:t xml:space="preserve"> maar er zal nog ergens een fout zitten.</w:t>
+      </w:r>
+      <w:r>
+        <w:rPr>
+          <w:rFonts w:eastAsia="Times New Roman" w:cstheme="minorHAnsi"/>
+          <w:lang w:eastAsia="nl-BE"/>
+        </w:rPr>
+        <w:t xml:space="preserve"> 1 van de methodes was wel </w:t>
+      </w:r>
+      <w:proofErr w:type="spellStart"/>
+      <w:r>
+        <w:rPr>
+          <w:rFonts w:eastAsia="Times New Roman" w:cstheme="minorHAnsi"/>
+          <w:lang w:eastAsia="nl-BE"/>
+        </w:rPr>
+        <w:t>deprecated</w:t>
+      </w:r>
+      <w:proofErr w:type="spellEnd"/>
+      <w:r>
+        <w:rPr>
+          <w:rFonts w:eastAsia="Times New Roman" w:cstheme="minorHAnsi"/>
+          <w:lang w:eastAsia="nl-BE"/>
+        </w:rPr>
+        <w:t xml:space="preserve">, maar die had </w:t>
       </w:r>
       <w:r>
         <w:rPr>
@@ -1891,14 +2689,192 @@
           <w:rFonts w:eastAsia="Times New Roman" w:cstheme="minorHAnsi"/>
           <w:lang w:eastAsia="nl-BE"/>
         </w:rPr>
-        <w:t>Vandaag is het me gelukt om de google sign-in te laten werken. Ik had veel opzoek werk gedaan op google maar kon niks duidelijk vinden. Ik had mijn code ook gedebugd, maar geen duidelijk error werd weergegeven. Uiteindelijk besloot ik opzoek te gaan naar een tutorial die recent was in 2021. Deze tutorial heb ik dan gebruikt om mijn project strict te controleren en toen realiseerde ik dat de SHA-1 niet op de juiste plaats stond. Ik had op google cloud een Oauth 2.0 client id moeten aanmaken toen ik de android studio firebase tutorial volgde, maar dat bleek dus helemaal fout te zijn, want de echte client_id was eigenlijk al klaar in een google-services.json file. Ik moest toen ook mijn SHA-1 fingerprint verwijderen bij de onderstaande afbeelding, maar dat mocht daar eigenlijk blijven staan.</w:t>
-      </w:r>
+        <w:t xml:space="preserve">Vandaag is het me gelukt om de google </w:t>
+      </w:r>
+      <w:proofErr w:type="spellStart"/>
       <w:r>
         <w:rPr>
           <w:rFonts w:eastAsia="Times New Roman" w:cstheme="minorHAnsi"/>
           <w:lang w:eastAsia="nl-BE"/>
         </w:rPr>
-        <w:t xml:space="preserve"> Nu kunnen google accounts succesvol worden toegevoegd.</w:t>
+        <w:t>sign</w:t>
+      </w:r>
+      <w:proofErr w:type="spellEnd"/>
+      <w:r>
+        <w:rPr>
+          <w:rFonts w:eastAsia="Times New Roman" w:cstheme="minorHAnsi"/>
+          <w:lang w:eastAsia="nl-BE"/>
+        </w:rPr>
+        <w:t xml:space="preserve">-in te laten werken. Ik had veel opzoek werk gedaan op google maar kon niks duidelijk vinden. Ik had mijn code ook gedebugd, maar geen duidelijk error werd weergegeven. Uiteindelijk besloot ik opzoek te gaan naar een tutorial die recent was in 2021. Deze tutorial heb ik dan gebruikt om mijn project </w:t>
+      </w:r>
+      <w:proofErr w:type="spellStart"/>
+      <w:r>
+        <w:rPr>
+          <w:rFonts w:eastAsia="Times New Roman" w:cstheme="minorHAnsi"/>
+          <w:lang w:eastAsia="nl-BE"/>
+        </w:rPr>
+        <w:t>strict</w:t>
+      </w:r>
+      <w:proofErr w:type="spellEnd"/>
+      <w:r>
+        <w:rPr>
+          <w:rFonts w:eastAsia="Times New Roman" w:cstheme="minorHAnsi"/>
+          <w:lang w:eastAsia="nl-BE"/>
+        </w:rPr>
+        <w:t xml:space="preserve"> te controleren en toen realiseerde ik dat de SHA-1 niet op de juiste plaats stond. Ik had op google </w:t>
+      </w:r>
+      <w:proofErr w:type="spellStart"/>
+      <w:r>
+        <w:rPr>
+          <w:rFonts w:eastAsia="Times New Roman" w:cstheme="minorHAnsi"/>
+          <w:lang w:eastAsia="nl-BE"/>
+        </w:rPr>
+        <w:t>cloud</w:t>
+      </w:r>
+      <w:proofErr w:type="spellEnd"/>
+      <w:r>
+        <w:rPr>
+          <w:rFonts w:eastAsia="Times New Roman" w:cstheme="minorHAnsi"/>
+          <w:lang w:eastAsia="nl-BE"/>
+        </w:rPr>
+        <w:t xml:space="preserve"> een </w:t>
+      </w:r>
+      <w:proofErr w:type="spellStart"/>
+      <w:r>
+        <w:rPr>
+          <w:rFonts w:eastAsia="Times New Roman" w:cstheme="minorHAnsi"/>
+          <w:lang w:eastAsia="nl-BE"/>
+        </w:rPr>
+        <w:t>Oauth</w:t>
+      </w:r>
+      <w:proofErr w:type="spellEnd"/>
+      <w:r>
+        <w:rPr>
+          <w:rFonts w:eastAsia="Times New Roman" w:cstheme="minorHAnsi"/>
+          <w:lang w:eastAsia="nl-BE"/>
+        </w:rPr>
+        <w:t xml:space="preserve"> 2.0 client </w:t>
+      </w:r>
+      <w:proofErr w:type="spellStart"/>
+      <w:r>
+        <w:rPr>
+          <w:rFonts w:eastAsia="Times New Roman" w:cstheme="minorHAnsi"/>
+          <w:lang w:eastAsia="nl-BE"/>
+        </w:rPr>
+        <w:t>id</w:t>
+      </w:r>
+      <w:proofErr w:type="spellEnd"/>
+      <w:r>
+        <w:rPr>
+          <w:rFonts w:eastAsia="Times New Roman" w:cstheme="minorHAnsi"/>
+          <w:lang w:eastAsia="nl-BE"/>
+        </w:rPr>
+        <w:t xml:space="preserve"> moeten aanmaken toen ik de </w:t>
+      </w:r>
+      <w:proofErr w:type="spellStart"/>
+      <w:r>
+        <w:rPr>
+          <w:rFonts w:eastAsia="Times New Roman" w:cstheme="minorHAnsi"/>
+          <w:lang w:eastAsia="nl-BE"/>
+        </w:rPr>
+        <w:t>android</w:t>
+      </w:r>
+      <w:proofErr w:type="spellEnd"/>
+      <w:r>
+        <w:rPr>
+          <w:rFonts w:eastAsia="Times New Roman" w:cstheme="minorHAnsi"/>
+          <w:lang w:eastAsia="nl-BE"/>
+        </w:rPr>
+        <w:t xml:space="preserve"> studio </w:t>
+      </w:r>
+      <w:proofErr w:type="spellStart"/>
+      <w:r>
+        <w:rPr>
+          <w:rFonts w:eastAsia="Times New Roman" w:cstheme="minorHAnsi"/>
+          <w:lang w:eastAsia="nl-BE"/>
+        </w:rPr>
+        <w:t>firebase</w:t>
+      </w:r>
+      <w:proofErr w:type="spellEnd"/>
+      <w:r>
+        <w:rPr>
+          <w:rFonts w:eastAsia="Times New Roman" w:cstheme="minorHAnsi"/>
+          <w:lang w:eastAsia="nl-BE"/>
+        </w:rPr>
+        <w:t xml:space="preserve"> tutorial volgde, maar dat bleek dus helemaal fout te zijn, want de echte </w:t>
+      </w:r>
+      <w:proofErr w:type="spellStart"/>
+      <w:r>
+        <w:rPr>
+          <w:rFonts w:eastAsia="Times New Roman" w:cstheme="minorHAnsi"/>
+          <w:lang w:eastAsia="nl-BE"/>
+        </w:rPr>
+        <w:t>client_id</w:t>
+      </w:r>
+      <w:proofErr w:type="spellEnd"/>
+      <w:r>
+        <w:rPr>
+          <w:rFonts w:eastAsia="Times New Roman" w:cstheme="minorHAnsi"/>
+          <w:lang w:eastAsia="nl-BE"/>
+        </w:rPr>
+        <w:t xml:space="preserve"> was eigenlijk al klaar in een google-</w:t>
+      </w:r>
+      <w:proofErr w:type="spellStart"/>
+      <w:proofErr w:type="gramStart"/>
+      <w:r>
+        <w:rPr>
+          <w:rFonts w:eastAsia="Times New Roman" w:cstheme="minorHAnsi"/>
+          <w:lang w:eastAsia="nl-BE"/>
+        </w:rPr>
+        <w:t>services.json</w:t>
+      </w:r>
+      <w:proofErr w:type="spellEnd"/>
+      <w:proofErr w:type="gramEnd"/>
+      <w:r>
+        <w:rPr>
+          <w:rFonts w:eastAsia="Times New Roman" w:cstheme="minorHAnsi"/>
+          <w:lang w:eastAsia="nl-BE"/>
+        </w:rPr>
+        <w:t xml:space="preserve"> file. Ik moest toen ook mijn SHA-1 </w:t>
+      </w:r>
+      <w:proofErr w:type="spellStart"/>
+      <w:r>
+        <w:rPr>
+          <w:rFonts w:eastAsia="Times New Roman" w:cstheme="minorHAnsi"/>
+          <w:lang w:eastAsia="nl-BE"/>
+        </w:rPr>
+        <w:t>fingerprint</w:t>
+      </w:r>
+      <w:proofErr w:type="spellEnd"/>
+      <w:r>
+        <w:rPr>
+          <w:rFonts w:eastAsia="Times New Roman" w:cstheme="minorHAnsi"/>
+          <w:lang w:eastAsia="nl-BE"/>
+        </w:rPr>
+        <w:t xml:space="preserve"> verwijderen bij de onderstaande afbeelding, maar dat mocht daar eigenlijk blijven staan.</w:t>
+      </w:r>
+      <w:r>
+        <w:rPr>
+          <w:rFonts w:eastAsia="Times New Roman" w:cstheme="minorHAnsi"/>
+          <w:lang w:eastAsia="nl-BE"/>
+        </w:rPr>
+        <w:t xml:space="preserve"> Nu kunnen </w:t>
+      </w:r>
+      <w:proofErr w:type="gramStart"/>
+      <w:r>
+        <w:rPr>
+          <w:rFonts w:eastAsia="Times New Roman" w:cstheme="minorHAnsi"/>
+          <w:lang w:eastAsia="nl-BE"/>
+        </w:rPr>
+        <w:t>google accounts</w:t>
+      </w:r>
+      <w:proofErr w:type="gramEnd"/>
+      <w:r>
+        <w:rPr>
+          <w:rFonts w:eastAsia="Times New Roman" w:cstheme="minorHAnsi"/>
+          <w:lang w:eastAsia="nl-BE"/>
+        </w:rPr>
+        <w:t xml:space="preserve"> succesvol worden toegevoegd.</w:t>
       </w:r>
       <w:r>
         <w:rPr>
@@ -2110,8 +3086,13 @@
           <w:numId w:val="2"/>
         </w:numPr>
       </w:pPr>
-      <w:r>
-        <w:t xml:space="preserve">Firebase </w:t>
+      <w:proofErr w:type="spellStart"/>
+      <w:r>
+        <w:t>Firebase</w:t>
+      </w:r>
+      <w:proofErr w:type="spellEnd"/>
+      <w:r>
+        <w:t xml:space="preserve"> </w:t>
       </w:r>
       <w:r>
         <w:t>storage</w:t>
@@ -2153,19 +3134,43 @@
     </w:p>
     <w:p>
       <w:r>
-        <w:t>Vandaag ben ik begonnen met aanmaken van de Firebase storage voor het opslaan van afbeeldingen.</w:t>
+        <w:t xml:space="preserve">Vandaag ben ik begonnen met aanmaken van de </w:t>
+      </w:r>
+      <w:proofErr w:type="spellStart"/>
+      <w:r>
+        <w:t>Firebase</w:t>
+      </w:r>
+      <w:proofErr w:type="spellEnd"/>
+      <w:r>
+        <w:t xml:space="preserve"> storage voor het opslaan van afbeeldingen.</w:t>
       </w:r>
       <w:r>
         <w:t xml:space="preserve"> </w:t>
       </w:r>
       <w:r>
-        <w:t xml:space="preserve">Ik heb dan de dependencies toegevoegd en dan moest ik een Cloud storage bucket aanmaken. Hierbij werd er gevraagd om een locatie te kiezen waarbij Europe-west 1 (= Belgische regio) niet tussen stond, maar gelukkig is er Eur3 die eigenlijk Belgische en Nederlandse regio voorstelt. Dat werd uitgelegd </w:t>
-      </w:r>
-      <w:r>
-        <w:t>op deze webpagina</w:t>
-      </w:r>
-      <w:r>
-        <w:t>‘s</w:t>
+        <w:t xml:space="preserve">Ik heb dan de </w:t>
+      </w:r>
+      <w:proofErr w:type="spellStart"/>
+      <w:r>
+        <w:t>dependencies</w:t>
+      </w:r>
+      <w:proofErr w:type="spellEnd"/>
+      <w:r>
+        <w:t xml:space="preserve"> toegevoegd en dan moest ik een Cloud storage bucket aanmaken. Hierbij werd er gevraagd om een locatie te kiezen waarbij Europe-west 1 (= Belgische regio) niet tussen stond, maar gelukkig is er Eur3 die eigenlijk Belgische en Nederlandse regio voorstelt. Dat werd uitgelegd </w:t>
+      </w:r>
+      <w:r>
+        <w:t xml:space="preserve">op deze </w:t>
+      </w:r>
+      <w:proofErr w:type="gramStart"/>
+      <w:r>
+        <w:t>webpagina</w:t>
+      </w:r>
+      <w:r>
+        <w:t>‘</w:t>
+      </w:r>
+      <w:proofErr w:type="gramEnd"/>
+      <w:r>
+        <w:t>s</w:t>
       </w:r>
       <w:r>
         <w:t>:</w:t>
@@ -2272,12 +3277,52 @@
     </w:p>
     <w:p>
       <w:r>
-        <w:t xml:space="preserve">Vandaag heb ik de java code moet schrijven voor de camera te kunnen gebruiken. Eerst heb ik code toegevoegd dat ervoor zorgt dat de permissies worden aangevraagd om de camera te kunnen gebruiken. Daarna als ik allow klik dan opent een test camera zicht van de emulator. </w:t>
-      </w:r>
-    </w:p>
-    <w:p>
-      <w:r>
-        <w:t>Hierbij werden gelijkaardig methoden gebruikt zoals de firebase authentication, maar waren ook deprecated. Dit heb natuurlijk makkelijk opgelost.</w:t>
+        <w:t xml:space="preserve">Vandaag heb ik de </w:t>
+      </w:r>
+      <w:proofErr w:type="spellStart"/>
+      <w:r>
+        <w:t>java</w:t>
+      </w:r>
+      <w:proofErr w:type="spellEnd"/>
+      <w:r>
+        <w:t xml:space="preserve"> code moet schrijven voor de camera te kunnen gebruiken. Eerst heb ik code toegevoegd dat ervoor zorgt dat de permissies worden aangevraagd om de camera te kunnen gebruiken. Daarna als ik </w:t>
+      </w:r>
+      <w:proofErr w:type="spellStart"/>
+      <w:r>
+        <w:t>allow</w:t>
+      </w:r>
+      <w:proofErr w:type="spellEnd"/>
+      <w:r>
+        <w:t xml:space="preserve"> klik dan opent een test camera zicht van de emulator. </w:t>
+      </w:r>
+    </w:p>
+    <w:p>
+      <w:r>
+        <w:t xml:space="preserve">Hierbij werden gelijkaardig methoden gebruikt zoals de </w:t>
+      </w:r>
+      <w:proofErr w:type="spellStart"/>
+      <w:r>
+        <w:t>firebase</w:t>
+      </w:r>
+      <w:proofErr w:type="spellEnd"/>
+      <w:r>
+        <w:t xml:space="preserve"> </w:t>
+      </w:r>
+      <w:proofErr w:type="spellStart"/>
+      <w:r>
+        <w:t>authentication</w:t>
+      </w:r>
+      <w:proofErr w:type="spellEnd"/>
+      <w:r>
+        <w:t xml:space="preserve">, maar waren ook </w:t>
+      </w:r>
+      <w:proofErr w:type="spellStart"/>
+      <w:r>
+        <w:t>deprecated</w:t>
+      </w:r>
+      <w:proofErr w:type="spellEnd"/>
+      <w:r>
+        <w:t>. Dit heb natuurlijk makkelijk opgelost.</w:t>
       </w:r>
     </w:p>
     <w:p>
@@ -2351,7 +3396,15 @@
     </w:p>
     <w:p>
       <w:r>
-        <w:t>Vandaag heb ik geprobeerd om de image die getrokken wordt op te slaan in firebase storage</w:t>
+        <w:t xml:space="preserve">Vandaag heb ik geprobeerd om de image die getrokken wordt op te slaan in </w:t>
+      </w:r>
+      <w:proofErr w:type="spellStart"/>
+      <w:r>
+        <w:t>firebase</w:t>
+      </w:r>
+      <w:proofErr w:type="spellEnd"/>
+      <w:r>
+        <w:t xml:space="preserve"> storage</w:t>
       </w:r>
       <w:r>
         <w:t>. Dit is op het einde van de les gelukt.</w:t>
@@ -2405,10 +3458,90 @@
     <w:p>
       <w:r>
         <w:lastRenderedPageBreak/>
-        <w:t xml:space="preserve">Hierbij had ik vooral problemen met de uri oftewl URL omdat firebase die nodig had om te kunnen uploaden. Als je naar de eerste rode streep kijkt is er een methode voor </w:t>
-      </w:r>
-      <w:r>
-        <w:t>de bitmap die je krijgt van de camera te gebruiken om de uri te bepalen. De volgende is voor de bestandextensie te krijgen om een filename op te stellen in de firebase storage. Hierbij pak ik gewoon het tijdstip met de bestandextensie, maar ik ben misschien van plan om de filename te kunnen aanpassen door de gebruiker. De laatste streep zijn twee child methods waarbij dus de eerste de map voorstelt waar dan de 2</w:t>
+        <w:t xml:space="preserve">Hierbij had ik vooral problemen met de </w:t>
+      </w:r>
+      <w:proofErr w:type="spellStart"/>
+      <w:r>
+        <w:t>uri</w:t>
+      </w:r>
+      <w:proofErr w:type="spellEnd"/>
+      <w:r>
+        <w:t xml:space="preserve"> </w:t>
+      </w:r>
+      <w:proofErr w:type="spellStart"/>
+      <w:r>
+        <w:t>oftewl</w:t>
+      </w:r>
+      <w:proofErr w:type="spellEnd"/>
+      <w:r>
+        <w:t xml:space="preserve"> URL omdat </w:t>
+      </w:r>
+      <w:proofErr w:type="spellStart"/>
+      <w:r>
+        <w:t>firebase</w:t>
+      </w:r>
+      <w:proofErr w:type="spellEnd"/>
+      <w:r>
+        <w:t xml:space="preserve"> die nodig had om te kunnen uploaden. Als je naar de eerste rode streep kijkt is er een methode voor </w:t>
+      </w:r>
+      <w:r>
+        <w:t xml:space="preserve">de </w:t>
+      </w:r>
+      <w:proofErr w:type="spellStart"/>
+      <w:r>
+        <w:t>bitmap</w:t>
+      </w:r>
+      <w:proofErr w:type="spellEnd"/>
+      <w:r>
+        <w:t xml:space="preserve"> die je krijgt van de camera te gebruiken om de </w:t>
+      </w:r>
+      <w:proofErr w:type="spellStart"/>
+      <w:r>
+        <w:t>uri</w:t>
+      </w:r>
+      <w:proofErr w:type="spellEnd"/>
+      <w:r>
+        <w:t xml:space="preserve"> te bepalen. De volgende is voor de bestandextensie te krijgen om een </w:t>
+      </w:r>
+      <w:proofErr w:type="spellStart"/>
+      <w:r>
+        <w:t>filename</w:t>
+      </w:r>
+      <w:proofErr w:type="spellEnd"/>
+      <w:r>
+        <w:t xml:space="preserve"> op te stellen in de </w:t>
+      </w:r>
+      <w:proofErr w:type="spellStart"/>
+      <w:r>
+        <w:t>firebase</w:t>
+      </w:r>
+      <w:proofErr w:type="spellEnd"/>
+      <w:r>
+        <w:t xml:space="preserve"> storage. Hierbij pak ik gewoon het tijdstip met de bestandextensie, maar ik ben misschien van plan om de </w:t>
+      </w:r>
+      <w:proofErr w:type="spellStart"/>
+      <w:r>
+        <w:t>filename</w:t>
+      </w:r>
+      <w:proofErr w:type="spellEnd"/>
+      <w:r>
+        <w:t xml:space="preserve"> te kunnen aanpassen door de gebruiker. De laatste streep zijn twee </w:t>
+      </w:r>
+      <w:proofErr w:type="spellStart"/>
+      <w:r>
+        <w:t>child</w:t>
+      </w:r>
+      <w:proofErr w:type="spellEnd"/>
+      <w:r>
+        <w:t xml:space="preserve"> </w:t>
+      </w:r>
+      <w:proofErr w:type="spellStart"/>
+      <w:r>
+        <w:t>methods</w:t>
+      </w:r>
+      <w:proofErr w:type="spellEnd"/>
+      <w:r>
+        <w:t xml:space="preserve"> waarbij dus de eerste de map voorstelt waar dan de 2</w:t>
       </w:r>
       <w:r>
         <w:rPr>
@@ -2417,7 +3550,23 @@
         <w:t>de</w:t>
       </w:r>
       <w:r>
-        <w:t xml:space="preserve"> child oftewel de image inkomt. De map geef ik  het email adres van de gebruiker als naam.</w:t>
+        <w:t xml:space="preserve"> </w:t>
+      </w:r>
+      <w:proofErr w:type="spellStart"/>
+      <w:r>
+        <w:t>child</w:t>
+      </w:r>
+      <w:proofErr w:type="spellEnd"/>
+      <w:r>
+        <w:t xml:space="preserve"> oftewel de image inkomt. De map geef </w:t>
+      </w:r>
+      <w:proofErr w:type="gramStart"/>
+      <w:r>
+        <w:t>ik  het</w:t>
+      </w:r>
+      <w:proofErr w:type="gramEnd"/>
+      <w:r>
+        <w:t xml:space="preserve"> email adres van de gebruiker als naam.</w:t>
       </w:r>
     </w:p>
     <w:p>
@@ -2557,7 +3706,15 @@
         <w:t>je gsm</w:t>
       </w:r>
       <w:r>
-        <w:t xml:space="preserve"> gallery gebruiken)</w:t>
+        <w:t xml:space="preserve"> </w:t>
+      </w:r>
+      <w:proofErr w:type="spellStart"/>
+      <w:r>
+        <w:t>gallery</w:t>
+      </w:r>
+      <w:proofErr w:type="spellEnd"/>
+      <w:r>
+        <w:t xml:space="preserve"> gebruiken)</w:t>
       </w:r>
     </w:p>
     <w:p/>
@@ -2578,7 +3735,23 @@
     </w:p>
     <w:p>
       <w:r>
-        <w:t xml:space="preserve">Vandaag heb ik geprobeerd om een gridview toe te voegen die images bevat dat dus lijkt op een image gallery zoals uw “foto’s” app. Hierbij heb ik de </w:t>
+        <w:t xml:space="preserve">Vandaag heb ik geprobeerd om een </w:t>
+      </w:r>
+      <w:proofErr w:type="spellStart"/>
+      <w:r>
+        <w:t>gridview</w:t>
+      </w:r>
+      <w:proofErr w:type="spellEnd"/>
+      <w:r>
+        <w:t xml:space="preserve"> toe te voegen die images bevat dat dus lijkt op een image </w:t>
+      </w:r>
+      <w:proofErr w:type="spellStart"/>
+      <w:r>
+        <w:t>gallery</w:t>
+      </w:r>
+      <w:proofErr w:type="spellEnd"/>
+      <w:r>
+        <w:t xml:space="preserve"> zoals uw “foto’s” app. Hierbij heb ik de </w:t>
       </w:r>
       <w:r>
         <w:t>volgende</w:t>
@@ -2623,7 +3796,15 @@
     </w:p>
     <w:p>
       <w:r>
-        <w:t>Dit heeft nog niet direct resultaat gegeven, maar de GridAdapter class geeft een gevoel dat ik wel op de goeie weg zit.</w:t>
+        <w:t xml:space="preserve">Dit heeft nog niet direct resultaat gegeven, maar de </w:t>
+      </w:r>
+      <w:proofErr w:type="spellStart"/>
+      <w:r>
+        <w:t>GridAdapter</w:t>
+      </w:r>
+      <w:proofErr w:type="spellEnd"/>
+      <w:r>
+        <w:t xml:space="preserve"> class geeft een gevoel dat ik wel op de goeie weg zit.</w:t>
       </w:r>
     </w:p>
     <w:p/>
@@ -2644,7 +3825,31 @@
     </w:p>
     <w:p>
       <w:r>
-        <w:t>Na de GridAdapter klasse te controleren ontdekte ik dat ik gewoon het verkeerd image Id doorgegeven heb. Dit heeft het probleem onmiddellijk gefixed als zijn de voorbeeld images niet echt mooi gepositioneerd.</w:t>
+        <w:t xml:space="preserve">Na de </w:t>
+      </w:r>
+      <w:proofErr w:type="spellStart"/>
+      <w:r>
+        <w:t>GridAdapter</w:t>
+      </w:r>
+      <w:proofErr w:type="spellEnd"/>
+      <w:r>
+        <w:t xml:space="preserve"> klasse te controleren ontdekte ik dat ik gewoon het verkeerd image </w:t>
+      </w:r>
+      <w:proofErr w:type="spellStart"/>
+      <w:r>
+        <w:t>Id</w:t>
+      </w:r>
+      <w:proofErr w:type="spellEnd"/>
+      <w:r>
+        <w:t xml:space="preserve"> doorgegeven heb. Dit heeft het probleem onmiddellijk </w:t>
+      </w:r>
+      <w:proofErr w:type="spellStart"/>
+      <w:r>
+        <w:t>gefixed</w:t>
+      </w:r>
+      <w:proofErr w:type="spellEnd"/>
+      <w:r>
+        <w:t xml:space="preserve"> als zijn de voorbeeld images niet echt mooi gepositioneerd.</w:t>
       </w:r>
     </w:p>
     <w:p>
@@ -2698,7 +3903,15 @@
         <w:t>gedetailleerd</w:t>
       </w:r>
       <w:r>
-        <w:t xml:space="preserve"> tutorial gevolgd hoe je met een gridview kan werken:</w:t>
+        <w:t xml:space="preserve"> tutorial gevolgd hoe je met een </w:t>
+      </w:r>
+      <w:proofErr w:type="spellStart"/>
+      <w:r>
+        <w:t>gridview</w:t>
+      </w:r>
+      <w:proofErr w:type="spellEnd"/>
+      <w:r>
+        <w:t xml:space="preserve"> kan werken:</w:t>
       </w:r>
     </w:p>
     <w:p>
@@ -2713,10 +3926,63 @@
     </w:p>
     <w:p>
       <w:r>
-        <w:t xml:space="preserve">Daarna heb ik er nog voor gezorgd dat de margin top en bottom via java code worden aangepast afhankelijk van de </w:t>
-      </w:r>
-      <w:r>
-        <w:t>hoogte van de header en footer. Dit werdt gedaan in OnCreateView():</w:t>
+        <w:t xml:space="preserve">Daarna heb ik er nog voor gezorgd dat de </w:t>
+      </w:r>
+      <w:proofErr w:type="spellStart"/>
+      <w:r>
+        <w:t>margin</w:t>
+      </w:r>
+      <w:proofErr w:type="spellEnd"/>
+      <w:r>
+        <w:t xml:space="preserve"> top en </w:t>
+      </w:r>
+      <w:proofErr w:type="spellStart"/>
+      <w:r>
+        <w:t>bottom</w:t>
+      </w:r>
+      <w:proofErr w:type="spellEnd"/>
+      <w:r>
+        <w:t xml:space="preserve"> via </w:t>
+      </w:r>
+      <w:proofErr w:type="spellStart"/>
+      <w:r>
+        <w:t>java</w:t>
+      </w:r>
+      <w:proofErr w:type="spellEnd"/>
+      <w:r>
+        <w:t xml:space="preserve"> code worden aangepast afhankelijk van de </w:t>
+      </w:r>
+      <w:r>
+        <w:t xml:space="preserve">hoogte van de header en </w:t>
+      </w:r>
+      <w:proofErr w:type="spellStart"/>
+      <w:r>
+        <w:t>footer</w:t>
+      </w:r>
+      <w:proofErr w:type="spellEnd"/>
+      <w:r>
+        <w:t xml:space="preserve">. Dit </w:t>
+      </w:r>
+      <w:proofErr w:type="spellStart"/>
+      <w:r>
+        <w:t>werdt</w:t>
+      </w:r>
+      <w:proofErr w:type="spellEnd"/>
+      <w:r>
+        <w:t xml:space="preserve"> gedaan in </w:t>
+      </w:r>
+      <w:proofErr w:type="spellStart"/>
+      <w:proofErr w:type="gramStart"/>
+      <w:r>
+        <w:t>OnCreateView</w:t>
+      </w:r>
+      <w:proofErr w:type="spellEnd"/>
+      <w:r>
+        <w:t>(</w:t>
+      </w:r>
+      <w:proofErr w:type="gramEnd"/>
+      <w:r>
+        <w:t>):</w:t>
       </w:r>
     </w:p>
     <w:p>
@@ -2764,13 +4030,66 @@
     </w:p>
     <w:p>
       <w:r>
-        <w:t>Ik heb dan de elementen een witte achtergrond gegeven en dan een border rond gedaan dat eigenlijk vrij moeilijk en inefficiënt moet worden opgeroepen in android studio door middel van een &lt;shape&gt; xml file te maken in de res/drawable folder en die een stroke</w:t>
-      </w:r>
+        <w:t xml:space="preserve">Ik heb dan de elementen een witte achtergrond gegeven en dan een border rond gedaan dat eigenlijk vrij moeilijk en inefficiënt moet worden opgeroepen in </w:t>
+      </w:r>
+      <w:proofErr w:type="spellStart"/>
+      <w:r>
+        <w:t>android</w:t>
+      </w:r>
+      <w:proofErr w:type="spellEnd"/>
+      <w:r>
+        <w:t xml:space="preserve"> studio door middel van een &lt;</w:t>
+      </w:r>
+      <w:proofErr w:type="spellStart"/>
+      <w:r>
+        <w:t>shape</w:t>
+      </w:r>
+      <w:proofErr w:type="spellEnd"/>
+      <w:r>
+        <w:t xml:space="preserve">&gt; </w:t>
+      </w:r>
+      <w:proofErr w:type="spellStart"/>
+      <w:r>
+        <w:t>xml</w:t>
+      </w:r>
+      <w:proofErr w:type="spellEnd"/>
+      <w:r>
+        <w:t xml:space="preserve"> file te maken in de </w:t>
+      </w:r>
+      <w:proofErr w:type="spellStart"/>
+      <w:r>
+        <w:t>res</w:t>
+      </w:r>
+      <w:proofErr w:type="spellEnd"/>
+      <w:r>
+        <w:t>/</w:t>
+      </w:r>
+      <w:proofErr w:type="spellStart"/>
+      <w:r>
+        <w:t>drawable</w:t>
+      </w:r>
+      <w:proofErr w:type="spellEnd"/>
+      <w:r>
+        <w:t xml:space="preserve"> folder en die een </w:t>
+      </w:r>
+      <w:proofErr w:type="spellStart"/>
+      <w:r>
+        <w:t>stroke</w:t>
+      </w:r>
+      <w:proofErr w:type="spellEnd"/>
       <w:r>
         <w:t>, enzoverder</w:t>
       </w:r>
       <w:r>
-        <w:t xml:space="preserve"> te geven. Dan wordt deze drawable als achtergrond geplaatst van de imageview.</w:t>
+        <w:t xml:space="preserve"> te geven. Dan wordt deze </w:t>
+      </w:r>
+      <w:proofErr w:type="spellStart"/>
+      <w:r>
+        <w:t>drawable</w:t>
+      </w:r>
+      <w:proofErr w:type="spellEnd"/>
+      <w:r>
+        <w:t xml:space="preserve"> als achtergrond geplaatst van de imageview.</w:t>
       </w:r>
       <w:r>
         <w:t xml:space="preserve"> De lege elementen zijn gewoon witte icoontjes die dus niet zichtbaar zijn door de witte achtergrond.</w:t>
@@ -2821,7 +4140,23 @@
     <w:p/>
     <w:p>
       <w:r>
-        <w:t>Om te eindigen, moest ik nog de images van firebase toevoegen hierbij heb ik vooral code van stackoverflow gebruikt om mijn oude klassen en methods te verbeteren.</w:t>
+        <w:t xml:space="preserve">Om te eindigen, moest ik nog de images van </w:t>
+      </w:r>
+      <w:proofErr w:type="spellStart"/>
+      <w:r>
+        <w:t>firebase</w:t>
+      </w:r>
+      <w:proofErr w:type="spellEnd"/>
+      <w:r>
+        <w:t xml:space="preserve"> toevoegen hierbij heb ik vooral code van stackoverflow gebruikt om mijn oude klassen en </w:t>
+      </w:r>
+      <w:proofErr w:type="spellStart"/>
+      <w:r>
+        <w:t>methods</w:t>
+      </w:r>
+      <w:proofErr w:type="spellEnd"/>
+      <w:r>
+        <w:t xml:space="preserve"> te verbeteren.</w:t>
       </w:r>
     </w:p>
     <w:p>
@@ -2918,14 +4253,83 @@
     </w:p>
     <w:p>
       <w:r>
-        <w:t xml:space="preserve">Ik had een image asset toegevoegd dat dus er voor zorgde dat de oude logo files worden vervangen. Hierbij heb een logo afbeelding als foreground en een transparant afbeelding als background. Maar dit wou niet helemaal werken door adaptive icon en legacy optie. De app als het om mijn emulator </w:t>
+        <w:t xml:space="preserve">Ik had een image asset toegevoegd dat dus </w:t>
+      </w:r>
+      <w:proofErr w:type="gramStart"/>
+      <w:r>
+        <w:t>er voor</w:t>
+      </w:r>
+      <w:proofErr w:type="gramEnd"/>
+      <w:r>
+        <w:t xml:space="preserve"> zorgde dat de oude logo files worden vervangen. Hierbij heb een logo afbeelding als </w:t>
+      </w:r>
+      <w:proofErr w:type="spellStart"/>
+      <w:r>
+        <w:t>foreground</w:t>
+      </w:r>
+      <w:proofErr w:type="spellEnd"/>
+      <w:r>
+        <w:t xml:space="preserve"> en een transparant afbeelding als background. Maar dit wou niet helemaal werken door </w:t>
+      </w:r>
+      <w:proofErr w:type="spellStart"/>
+      <w:r>
+        <w:t>adaptive</w:t>
+      </w:r>
+      <w:proofErr w:type="spellEnd"/>
+      <w:r>
+        <w:t xml:space="preserve"> icon en </w:t>
+      </w:r>
+      <w:proofErr w:type="spellStart"/>
+      <w:r>
+        <w:t>legacy</w:t>
+      </w:r>
+      <w:proofErr w:type="spellEnd"/>
+      <w:r>
+        <w:t xml:space="preserve"> optie. De app als het om mijn emulator </w:t>
       </w:r>
       <w:r>
         <w:lastRenderedPageBreak/>
-        <w:t>staat kreeg een zwarte achtergrond omdat transparant niet bestaat bij adaptive icons. Dus wat ik gedaan had was het gewoon op legacy only</w:t>
-      </w:r>
-      <w:r>
-        <w:t xml:space="preserve"> optie zetten waar ik gewoon eigenlijk de background kan weghalen door de shape als cirkel aan te duiden</w:t>
+        <w:t xml:space="preserve">staat kreeg een zwarte achtergrond omdat transparant niet bestaat bij </w:t>
+      </w:r>
+      <w:proofErr w:type="spellStart"/>
+      <w:r>
+        <w:t>adaptive</w:t>
+      </w:r>
+      <w:proofErr w:type="spellEnd"/>
+      <w:r>
+        <w:t xml:space="preserve"> </w:t>
+      </w:r>
+      <w:proofErr w:type="spellStart"/>
+      <w:r>
+        <w:t>icons</w:t>
+      </w:r>
+      <w:proofErr w:type="spellEnd"/>
+      <w:r>
+        <w:t xml:space="preserve">. Dus wat ik gedaan had was het gewoon op </w:t>
+      </w:r>
+      <w:proofErr w:type="spellStart"/>
+      <w:r>
+        <w:t>legacy</w:t>
+      </w:r>
+      <w:proofErr w:type="spellEnd"/>
+      <w:r>
+        <w:t xml:space="preserve"> </w:t>
+      </w:r>
+      <w:proofErr w:type="spellStart"/>
+      <w:r>
+        <w:t>only</w:t>
+      </w:r>
+      <w:proofErr w:type="spellEnd"/>
+      <w:r>
+        <w:t xml:space="preserve"> optie zetten waar ik gewoon eigenlijk de background kan weghalen door de </w:t>
+      </w:r>
+      <w:proofErr w:type="spellStart"/>
+      <w:r>
+        <w:t>shape</w:t>
+      </w:r>
+      <w:proofErr w:type="spellEnd"/>
+      <w:r>
+        <w:t xml:space="preserve"> als cirkel aan te duiden</w:t>
       </w:r>
       <w:r>
         <w:t>.</w:t>
@@ -2991,7 +4395,31 @@
     </w:p>
     <w:p>
       <w:r>
-        <w:t>Vandaag heb ik ervoor gezorgd dat ik image van uw gsm gallery kan uploaden. Hierbij dacht ik eerst dat automatisch de gallery die klaarstaat in de camera app kon gebruiken zoals bij facebook messenger, maar bestaat niet echt blijkbaar. Ik heb hiervoor zelfs een vraag gesteld op stackoverflow.</w:t>
+        <w:t xml:space="preserve">Vandaag heb ik ervoor gezorgd dat ik image van uw gsm </w:t>
+      </w:r>
+      <w:proofErr w:type="spellStart"/>
+      <w:r>
+        <w:t>gallery</w:t>
+      </w:r>
+      <w:proofErr w:type="spellEnd"/>
+      <w:r>
+        <w:t xml:space="preserve"> kan uploaden. Hierbij dacht ik eerst dat automatisch de </w:t>
+      </w:r>
+      <w:proofErr w:type="spellStart"/>
+      <w:r>
+        <w:t>gallery</w:t>
+      </w:r>
+      <w:proofErr w:type="spellEnd"/>
+      <w:r>
+        <w:t xml:space="preserve"> die klaarstaat in de camera app kon gebruiken zoals bij facebook </w:t>
+      </w:r>
+      <w:proofErr w:type="spellStart"/>
+      <w:r>
+        <w:t>messenger</w:t>
+      </w:r>
+      <w:proofErr w:type="spellEnd"/>
+      <w:r>
+        <w:t>, maar bestaat niet echt blijkbaar. Ik heb hiervoor zelfs een vraag gesteld op stackoverflow.</w:t>
       </w:r>
     </w:p>
     <w:p>
@@ -3006,7 +4434,39 @@
     </w:p>
     <w:p>
       <w:r>
-        <w:t xml:space="preserve">Uiteindelijk heb ik gewoon besloten om de camera en gallery op te splitsen en te kunnen openen in popup keuze menu. De code voor de gallery functionaliteiten </w:t>
+        <w:t xml:space="preserve">Uiteindelijk heb ik gewoon besloten om de camera en </w:t>
+      </w:r>
+      <w:proofErr w:type="spellStart"/>
+      <w:r>
+        <w:t>gallery</w:t>
+      </w:r>
+      <w:proofErr w:type="spellEnd"/>
+      <w:r>
+        <w:t xml:space="preserve"> op te splitsen en te kunnen openen in </w:t>
+      </w:r>
+      <w:proofErr w:type="spellStart"/>
+      <w:r>
+        <w:t>popup</w:t>
+      </w:r>
+      <w:proofErr w:type="spellEnd"/>
+      <w:r>
+        <w:t xml:space="preserve"> </w:t>
+      </w:r>
+      <w:proofErr w:type="gramStart"/>
+      <w:r>
+        <w:t>keuze menu</w:t>
+      </w:r>
+      <w:proofErr w:type="gramEnd"/>
+      <w:r>
+        <w:t xml:space="preserve">. De code voor de </w:t>
+      </w:r>
+      <w:proofErr w:type="spellStart"/>
+      <w:r>
+        <w:t>gallery</w:t>
+      </w:r>
+      <w:proofErr w:type="spellEnd"/>
+      <w:r>
+        <w:t xml:space="preserve"> functionaliteiten </w:t>
       </w:r>
       <w:r>
         <w:t>is</w:t>
@@ -3105,7 +4565,23 @@
         </w:numPr>
       </w:pPr>
       <w:r>
-        <w:t>Vragen dat het ok is om je image te compressen (quality verlies?)</w:t>
+        <w:t xml:space="preserve">Vragen dat het ok is om je image te </w:t>
+      </w:r>
+      <w:proofErr w:type="spellStart"/>
+      <w:r>
+        <w:t>compressen</w:t>
+      </w:r>
+      <w:proofErr w:type="spellEnd"/>
+      <w:r>
+        <w:t xml:space="preserve"> (</w:t>
+      </w:r>
+      <w:proofErr w:type="spellStart"/>
+      <w:r>
+        <w:t>quality</w:t>
+      </w:r>
+      <w:proofErr w:type="spellEnd"/>
+      <w:r>
+        <w:t xml:space="preserve"> verlies?)</w:t>
       </w:r>
     </w:p>
     <w:p>
@@ -3117,8 +4593,21 @@
         </w:numPr>
       </w:pPr>
       <w:r>
-        <w:t>Image van de gridview kunnen openen in full size</w:t>
-      </w:r>
+        <w:t xml:space="preserve">Image van de </w:t>
+      </w:r>
+      <w:proofErr w:type="spellStart"/>
+      <w:r>
+        <w:t>gridview</w:t>
+      </w:r>
+      <w:proofErr w:type="spellEnd"/>
+      <w:r>
+        <w:t xml:space="preserve"> kunnen openen in full </w:t>
+      </w:r>
+      <w:proofErr w:type="spellStart"/>
+      <w:r>
+        <w:t>size</w:t>
+      </w:r>
+      <w:proofErr w:type="spellEnd"/>
     </w:p>
     <w:p>
       <w:pPr>
@@ -3129,7 +4618,15 @@
         </w:numPr>
       </w:pPr>
       <w:r>
-        <w:t>App op google playstore plaatsen!!</w:t>
+        <w:t xml:space="preserve">App op google </w:t>
+      </w:r>
+      <w:proofErr w:type="spellStart"/>
+      <w:r>
+        <w:t>playstore</w:t>
+      </w:r>
+      <w:proofErr w:type="spellEnd"/>
+      <w:r>
+        <w:t xml:space="preserve"> plaatsen!!</w:t>
       </w:r>
     </w:p>
     <w:p>
@@ -3140,8 +4637,13 @@
           <w:numId w:val="2"/>
         </w:numPr>
       </w:pPr>
-      <w:r>
-        <w:t>Offfline functionaliteiten toevoegen?</w:t>
+      <w:proofErr w:type="spellStart"/>
+      <w:r>
+        <w:t>Offfline</w:t>
+      </w:r>
+      <w:proofErr w:type="spellEnd"/>
+      <w:r>
+        <w:t xml:space="preserve"> functionaliteiten toevoegen?</w:t>
       </w:r>
     </w:p>
     <w:p/>
@@ -3162,16 +4664,82 @@
     </w:p>
     <w:p>
       <w:r>
-        <w:t xml:space="preserve">Vandaag wou ik beginnen met het uploaden van mijn app op google play maar toen ik tutorial volgde moest ik eerst mijn app package name veranderen want com.example is niet correct. Toen ik dat veranderen </w:t>
-      </w:r>
-      <w:r>
-        <w:t>werkte de google services niet meer want de package name was com.example in de google-services.json file. Dus ik moest mijn app in firebase opnieuw maken dat niet echt moeilijk was.</w:t>
-      </w:r>
-      <w:r>
-        <w:t xml:space="preserve"> Daarna heb ik een android app bundle aangemaakt want dit is nodig voor de release.</w:t>
-      </w:r>
-      <w:r>
-        <w:t xml:space="preserve"> Ze vroeg dan om developer account aan te maken waarbij ik 1 keer 25 euro moest betalen. Daarbij was ik effe gestopt want mijn ouders waren niet thuis voor een mastercard te gebruiken.</w:t>
+        <w:t xml:space="preserve">Vandaag wou ik beginnen met het uploaden van mijn app op google </w:t>
+      </w:r>
+      <w:proofErr w:type="spellStart"/>
+      <w:r>
+        <w:t>play</w:t>
+      </w:r>
+      <w:proofErr w:type="spellEnd"/>
+      <w:r>
+        <w:t xml:space="preserve"> maar toen ik tutorial volgde moest ik eerst mijn app package name veranderen want </w:t>
+      </w:r>
+      <w:proofErr w:type="spellStart"/>
+      <w:r>
+        <w:t>com.example</w:t>
+      </w:r>
+      <w:proofErr w:type="spellEnd"/>
+      <w:r>
+        <w:t xml:space="preserve"> is niet correct. Toen ik dat veranderen </w:t>
+      </w:r>
+      <w:r>
+        <w:t xml:space="preserve">werkte de google services niet meer want de package name was </w:t>
+      </w:r>
+      <w:proofErr w:type="spellStart"/>
+      <w:r>
+        <w:t>com.example</w:t>
+      </w:r>
+      <w:proofErr w:type="spellEnd"/>
+      <w:r>
+        <w:t xml:space="preserve"> in de google-</w:t>
+      </w:r>
+      <w:proofErr w:type="spellStart"/>
+      <w:proofErr w:type="gramStart"/>
+      <w:r>
+        <w:t>services.json</w:t>
+      </w:r>
+      <w:proofErr w:type="spellEnd"/>
+      <w:proofErr w:type="gramEnd"/>
+      <w:r>
+        <w:t xml:space="preserve"> file. Dus ik moest mijn app in </w:t>
+      </w:r>
+      <w:proofErr w:type="spellStart"/>
+      <w:r>
+        <w:t>firebase</w:t>
+      </w:r>
+      <w:proofErr w:type="spellEnd"/>
+      <w:r>
+        <w:t xml:space="preserve"> opnieuw maken dat niet echt moeilijk was.</w:t>
+      </w:r>
+      <w:r>
+        <w:t xml:space="preserve"> Daarna heb ik een </w:t>
+      </w:r>
+      <w:proofErr w:type="spellStart"/>
+      <w:r>
+        <w:t>android</w:t>
+      </w:r>
+      <w:proofErr w:type="spellEnd"/>
+      <w:r>
+        <w:t xml:space="preserve"> app </w:t>
+      </w:r>
+      <w:proofErr w:type="spellStart"/>
+      <w:r>
+        <w:t>bundle</w:t>
+      </w:r>
+      <w:proofErr w:type="spellEnd"/>
+      <w:r>
+        <w:t xml:space="preserve"> aangemaakt want dit is nodig voor de release.</w:t>
+      </w:r>
+      <w:r>
+        <w:t xml:space="preserve"> Ze vroeg dan om </w:t>
+      </w:r>
+      <w:proofErr w:type="spellStart"/>
+      <w:r>
+        <w:t>developer</w:t>
+      </w:r>
+      <w:proofErr w:type="spellEnd"/>
+      <w:r>
+        <w:t xml:space="preserve"> account aan te maken waarbij ik 1 keer 25 euro moest betalen. Daarbij was ik effe gestopt want mijn ouders waren niet thuis voor een mastercard te gebruiken.</w:t>
       </w:r>
     </w:p>
     <w:p>
@@ -3248,7 +4816,15 @@
     </w:p>
     <w:p>
       <w:r>
-        <w:t>In de avond heb ik dan mijn developer account aangemaakt.</w:t>
+        <w:t xml:space="preserve">In de avond heb ik dan mijn </w:t>
+      </w:r>
+      <w:proofErr w:type="spellStart"/>
+      <w:r>
+        <w:t>developer</w:t>
+      </w:r>
+      <w:proofErr w:type="spellEnd"/>
+      <w:r>
+        <w:t xml:space="preserve"> account aangemaakt.</w:t>
       </w:r>
     </w:p>
     <w:p/>
@@ -3272,7 +4848,23 @@
         <w:t>Vandaag ben ik effe kort begonnen met het beter beveiligen van het wachtwoord om te registeren en in te loggen</w:t>
       </w:r>
       <w:r>
-        <w:t xml:space="preserve">. Hierbij vraag ik dus dat het wachtwoord een kleine letter, grote letter, geen spaties, 1 nummer en een lengte van 8 tekens heeft. Dit wordt weergegeven als een error onder de wachtwoord textbox. Het email wordt dankzij firebase al gevalideerd dat het correct is, dus ik moet zelf geen error toevoegen. </w:t>
+        <w:t xml:space="preserve">. Hierbij vraag ik dus dat het wachtwoord een kleine letter, grote letter, geen spaties, 1 nummer en een lengte van 8 tekens heeft. Dit wordt weergegeven als een error onder de wachtwoord </w:t>
+      </w:r>
+      <w:proofErr w:type="spellStart"/>
+      <w:r>
+        <w:t>textbox</w:t>
+      </w:r>
+      <w:proofErr w:type="spellEnd"/>
+      <w:r>
+        <w:t xml:space="preserve">. Het email wordt dankzij </w:t>
+      </w:r>
+      <w:proofErr w:type="spellStart"/>
+      <w:r>
+        <w:t>firebase</w:t>
+      </w:r>
+      <w:proofErr w:type="spellEnd"/>
+      <w:r>
+        <w:t xml:space="preserve"> al gevalideerd dat het correct is, dus ik moet zelf geen error toevoegen. </w:t>
       </w:r>
       <w:r>
         <w:t>Maar er wordt wel een toast bericht voor de zekerheid weergegeven vanonder als de registratie mislukt</w:t>
@@ -3283,13 +4875,45 @@
     </w:p>
     <w:p>
       <w:r>
-        <w:t xml:space="preserve">Daarna heb ik de app bundle </w:t>
+        <w:t xml:space="preserve">Daarna heb ik de app </w:t>
+      </w:r>
+      <w:proofErr w:type="spellStart"/>
+      <w:r>
+        <w:t>bundle</w:t>
+      </w:r>
+      <w:proofErr w:type="spellEnd"/>
+      <w:r>
+        <w:t xml:space="preserve"> </w:t>
       </w:r>
       <w:r>
         <w:t>geüpdatet</w:t>
       </w:r>
       <w:r>
-        <w:t xml:space="preserve"> naar de volgende versie, omdat er aanpassingen waren. Deze release heb ik dan op google play console geüpload, hierbij moest ik nog in de dashboard veel taken afleggen. De belangrijksten waren bijvoorbeeld een test account meegeven zodat google dit kan gebruiken om mijn app te controleren, een privacybeleid toevoegen hi</w:t>
+        <w:t xml:space="preserve"> naar de volgende versie, omdat er aanpassingen waren. Deze release heb ik dan op google </w:t>
+      </w:r>
+      <w:proofErr w:type="spellStart"/>
+      <w:r>
+        <w:t>play</w:t>
+      </w:r>
+      <w:proofErr w:type="spellEnd"/>
+      <w:r>
+        <w:t xml:space="preserve"> console geüpload, hierbij moest ik nog in </w:t>
+      </w:r>
+      <w:proofErr w:type="gramStart"/>
+      <w:r>
+        <w:t>de dashboard</w:t>
+      </w:r>
+      <w:proofErr w:type="gramEnd"/>
+      <w:r>
+        <w:t xml:space="preserve"> veel taken afleggen. De belangrijksten waren bijvoorbeeld een test account meegeven zodat google dit kan gebruiken om mijn app te controleren, een </w:t>
+      </w:r>
+      <w:proofErr w:type="spellStart"/>
+      <w:r>
+        <w:t>privacybeleid</w:t>
+      </w:r>
+      <w:proofErr w:type="spellEnd"/>
+      <w:r>
+        <w:t xml:space="preserve"> toevoegen hi</w:t>
       </w:r>
       <w:r>
         <w:t>er</w:t>
@@ -3341,13 +4965,77 @@
     </w:p>
     <w:p>
       <w:r>
-        <w:t xml:space="preserve">Hierbij had vooral deze youtube video nodig omdat ik de uri van de image die ik aan klik moest doorsturen naar het een fragment waar je de img in het groot kan bekijken. </w:t>
-      </w:r>
-      <w:r>
-        <w:t>Ik maakte toen een keer grote fout door een nieuwe imageDetailsFragment te openen als ik eigenlijk een bundle (waar de uri wordt opgeslagen)</w:t>
-      </w:r>
-      <w:r>
-        <w:t xml:space="preserve"> had toegevoegd aan een ImageDetailsFragment als arguments. Ik navigeerde eigenlijk naar een fragment zonder argumenten die hard nodig had. Dit heb ik natuurlijk opgelost</w:t>
+        <w:t xml:space="preserve">Hierbij had vooral deze </w:t>
+      </w:r>
+      <w:proofErr w:type="spellStart"/>
+      <w:r>
+        <w:t>youtube</w:t>
+      </w:r>
+      <w:proofErr w:type="spellEnd"/>
+      <w:r>
+        <w:t xml:space="preserve"> video nodig omdat ik de </w:t>
+      </w:r>
+      <w:proofErr w:type="spellStart"/>
+      <w:r>
+        <w:t>uri</w:t>
+      </w:r>
+      <w:proofErr w:type="spellEnd"/>
+      <w:r>
+        <w:t xml:space="preserve"> van de image die ik aan klik moest doorsturen naar het een fragment waar je de </w:t>
+      </w:r>
+      <w:proofErr w:type="spellStart"/>
+      <w:r>
+        <w:t>img</w:t>
+      </w:r>
+      <w:proofErr w:type="spellEnd"/>
+      <w:r>
+        <w:t xml:space="preserve"> in het groot kan bekijken. </w:t>
+      </w:r>
+      <w:r>
+        <w:t xml:space="preserve">Ik maakte toen een keer grote fout door een nieuwe </w:t>
+      </w:r>
+      <w:proofErr w:type="spellStart"/>
+      <w:r>
+        <w:t>imageDetailsFragment</w:t>
+      </w:r>
+      <w:proofErr w:type="spellEnd"/>
+      <w:r>
+        <w:t xml:space="preserve"> te openen als ik eigenlijk een </w:t>
+      </w:r>
+      <w:proofErr w:type="spellStart"/>
+      <w:r>
+        <w:t>bundle</w:t>
+      </w:r>
+      <w:proofErr w:type="spellEnd"/>
+      <w:r>
+        <w:t xml:space="preserve"> (waar de </w:t>
+      </w:r>
+      <w:proofErr w:type="spellStart"/>
+      <w:r>
+        <w:t>uri</w:t>
+      </w:r>
+      <w:proofErr w:type="spellEnd"/>
+      <w:r>
+        <w:t xml:space="preserve"> wordt opgeslagen)</w:t>
+      </w:r>
+      <w:r>
+        <w:t xml:space="preserve"> had toegevoegd aan een </w:t>
+      </w:r>
+      <w:proofErr w:type="spellStart"/>
+      <w:r>
+        <w:t>ImageDetailsFragment</w:t>
+      </w:r>
+      <w:proofErr w:type="spellEnd"/>
+      <w:r>
+        <w:t xml:space="preserve"> als </w:t>
+      </w:r>
+      <w:proofErr w:type="spellStart"/>
+      <w:r>
+        <w:t>arguments</w:t>
+      </w:r>
+      <w:proofErr w:type="spellEnd"/>
+      <w:r>
+        <w:t>. Ik navigeerde eigenlijk naar een fragment zonder argumenten die hard nodig had. Dit heb ik natuurlijk opgelost</w:t>
       </w:r>
       <w:r>
         <w:t xml:space="preserve"> zie onderstaande </w:t>
@@ -3361,7 +5049,15 @@
     </w:p>
     <w:p>
       <w:r>
-        <w:t>Het enige probleempje dat er nog is, is dat sommige afbeeldingen die vergroot worden onscherm kunnen uitzien.</w:t>
+        <w:t xml:space="preserve">Het enige probleempje dat er nog is, is dat sommige afbeeldingen die vergroot worden </w:t>
+      </w:r>
+      <w:proofErr w:type="spellStart"/>
+      <w:r>
+        <w:t>onscherm</w:t>
+      </w:r>
+      <w:proofErr w:type="spellEnd"/>
+      <w:r>
+        <w:t xml:space="preserve"> kunnen uitzien.</w:t>
       </w:r>
       <w:r>
         <w:t xml:space="preserve"> </w:t>
@@ -3439,7 +5135,15 @@
     </w:p>
     <w:p>
       <w:r>
-        <w:t>Vandaag heb ik een realtime database aangemaakt om een chat functionaliteiten toe te voegen.</w:t>
+        <w:t xml:space="preserve">Vandaag heb ik een </w:t>
+      </w:r>
+      <w:proofErr w:type="spellStart"/>
+      <w:r>
+        <w:t>realtime</w:t>
+      </w:r>
+      <w:proofErr w:type="spellEnd"/>
+      <w:r>
+        <w:t xml:space="preserve"> database aangemaakt om een chat functionaliteiten toe te voegen.</w:t>
       </w:r>
       <w:r>
         <w:t xml:space="preserve"> Hierbij ga ik de volgende video’s gebruiken:</w:t>
@@ -3527,8 +5231,13 @@
           <w:numId w:val="2"/>
         </w:numPr>
       </w:pPr>
-      <w:r>
-        <w:t>Offfline functionaliteiten toevoegen?</w:t>
+      <w:proofErr w:type="spellStart"/>
+      <w:r>
+        <w:t>Offfline</w:t>
+      </w:r>
+      <w:proofErr w:type="spellEnd"/>
+      <w:r>
+        <w:t xml:space="preserve"> functionaliteiten toevoegen?</w:t>
       </w:r>
     </w:p>
     <w:p>
@@ -3563,7 +5272,15 @@
     </w:p>
     <w:p>
       <w:r>
-        <w:t>Vandaag is mijn app beschikbaar op google play die je via deze link kan downloaden.</w:t>
+        <w:t xml:space="preserve">Vandaag is mijn app beschikbaar op google </w:t>
+      </w:r>
+      <w:proofErr w:type="spellStart"/>
+      <w:r>
+        <w:t>play</w:t>
+      </w:r>
+      <w:proofErr w:type="spellEnd"/>
+      <w:r>
+        <w:t xml:space="preserve"> die je via deze link kan downloaden.</w:t>
       </w:r>
     </w:p>
     <w:p>
@@ -3578,13 +5295,29 @@
     </w:p>
     <w:p>
       <w:r>
-        <w:t>Toen ik het had gedownload merkte ik dat google login niet wou werken. Dit heb ik dan onmiddellijk opgezocht en ik moest gewoon een extra SHA1 fingerp</w:t>
+        <w:t xml:space="preserve">Toen ik het had gedownload merkte ik dat google login niet wou werken. Dit heb ik dan onmiddellijk opgezocht en ik moest gewoon een extra SHA1 </w:t>
+      </w:r>
+      <w:proofErr w:type="spellStart"/>
+      <w:r>
+        <w:t>fingerp</w:t>
       </w:r>
       <w:r>
         <w:t>r</w:t>
       </w:r>
       <w:r>
-        <w:t>int van google play nog toevoegen aan mijn app. Dus nu werkt hij perfect.</w:t>
+        <w:t>int</w:t>
+      </w:r>
+      <w:proofErr w:type="spellEnd"/>
+      <w:r>
+        <w:t xml:space="preserve"> van google </w:t>
+      </w:r>
+      <w:proofErr w:type="spellStart"/>
+      <w:r>
+        <w:t>play</w:t>
+      </w:r>
+      <w:proofErr w:type="spellEnd"/>
+      <w:r>
+        <w:t xml:space="preserve"> nog toevoegen aan mijn app. Dus nu werkt hij perfect.</w:t>
       </w:r>
     </w:p>
     <w:p>
@@ -3604,7 +5337,23 @@
     </w:p>
     <w:p>
       <w:r>
-        <w:t>Ik heb dan geprobeerd om data toe te voegen aan mijn realtime database maar nog geen succes. Ik moest nu stoppen omdat ik een online gesprek ga hebben voor mijn stage tijdens het 2</w:t>
+        <w:t xml:space="preserve">Ik heb dan geprobeerd om data toe te voegen aan mijn </w:t>
+      </w:r>
+      <w:proofErr w:type="spellStart"/>
+      <w:r>
+        <w:t>realtime</w:t>
+      </w:r>
+      <w:proofErr w:type="spellEnd"/>
+      <w:r>
+        <w:t xml:space="preserve"> database maar nog geen succes. Ik moest nu stoppen omdat ik een </w:t>
+      </w:r>
+      <w:proofErr w:type="gramStart"/>
+      <w:r>
+        <w:t>online gesprek</w:t>
+      </w:r>
+      <w:proofErr w:type="gramEnd"/>
+      <w:r>
+        <w:t xml:space="preserve"> ga hebben voor mijn stage tijdens het 2</w:t>
       </w:r>
       <w:r>
         <w:rPr>
@@ -3640,11 +5389,48 @@
       </w:r>
     </w:p>
     <w:p>
-      <w:r>
-        <w:t>Firebase Realtime database wou geen data toevoegen en</w:t>
-      </w:r>
-      <w:r>
-        <w:t xml:space="preserve"> ik had alles geprobeerd. Ik realiseerde toen dat realtime firebase alleen mogelijk was voor de regio van België europe-west1. Ik besloot dan naar firestore te gaan want daar hebben ze wel europe-west3 dat Nederland en België bevat. </w:t>
+      <w:proofErr w:type="spellStart"/>
+      <w:r>
+        <w:t>Firebase</w:t>
+      </w:r>
+      <w:proofErr w:type="spellEnd"/>
+      <w:r>
+        <w:t xml:space="preserve"> </w:t>
+      </w:r>
+      <w:proofErr w:type="spellStart"/>
+      <w:r>
+        <w:t>Realtime</w:t>
+      </w:r>
+      <w:proofErr w:type="spellEnd"/>
+      <w:r>
+        <w:t xml:space="preserve"> database wou geen data toevoegen en</w:t>
+      </w:r>
+      <w:r>
+        <w:t xml:space="preserve"> ik had alles geprobeerd. Ik realiseerde toen dat </w:t>
+      </w:r>
+      <w:proofErr w:type="spellStart"/>
+      <w:r>
+        <w:t>realtime</w:t>
+      </w:r>
+      <w:proofErr w:type="spellEnd"/>
+      <w:r>
+        <w:t xml:space="preserve"> </w:t>
+      </w:r>
+      <w:proofErr w:type="spellStart"/>
+      <w:r>
+        <w:t>firebase</w:t>
+      </w:r>
+      <w:proofErr w:type="spellEnd"/>
+      <w:r>
+        <w:t xml:space="preserve"> alleen mogelijk was voor de regio van België europe-west1. Ik besloot dan naar </w:t>
+      </w:r>
+      <w:proofErr w:type="spellStart"/>
+      <w:r>
+        <w:t>firestore</w:t>
+      </w:r>
+      <w:proofErr w:type="spellEnd"/>
+      <w:r>
+        <w:t xml:space="preserve"> te gaan want daar hebben ze wel europe-west3 dat Nederland en België bevat. </w:t>
       </w:r>
       <w:r>
         <w:t>Dit heeft het probleem onmiddellijk opgelost.</w:t>
@@ -3652,7 +5438,15 @@
     </w:p>
     <w:p>
       <w:r>
-        <w:t>Nu als je inlogt zal je gebruikersgegevens op firestore geplaatst worden. Nu kan ik eindelijk vlot beginnen met de chat functionaliteiten.</w:t>
+        <w:t xml:space="preserve">Nu als je inlogt zal je gebruikersgegevens op </w:t>
+      </w:r>
+      <w:proofErr w:type="spellStart"/>
+      <w:r>
+        <w:t>firestore</w:t>
+      </w:r>
+      <w:proofErr w:type="spellEnd"/>
+      <w:r>
+        <w:t xml:space="preserve"> geplaatst worden. Nu kan ik eindelijk vlot beginnen met de chat functionaliteiten.</w:t>
       </w:r>
     </w:p>
     <w:p>
@@ -3739,7 +5533,39 @@
     </w:p>
     <w:p>
       <w:r>
-        <w:t>Vandaag probeerde ik offline support toe te voegen. Voor firestore was dat niet zo moeilijk want alles kon ik vinden op deze link, maar ik heb dit nog niet echt kunnen uittesten. Voor firebase storage lukte dit niet echt, want er was geen duidelijk documentatie. Ik wou vooral proberen om de images op firebase in de cache te steken, zodat de meeste recente images verschijnen op de startpagina.</w:t>
+        <w:t xml:space="preserve">Vandaag probeerde ik </w:t>
+      </w:r>
+      <w:proofErr w:type="gramStart"/>
+      <w:r>
+        <w:t>offline support</w:t>
+      </w:r>
+      <w:proofErr w:type="gramEnd"/>
+      <w:r>
+        <w:t xml:space="preserve"> toe te voegen. Voor </w:t>
+      </w:r>
+      <w:proofErr w:type="spellStart"/>
+      <w:r>
+        <w:t>firestore</w:t>
+      </w:r>
+      <w:proofErr w:type="spellEnd"/>
+      <w:r>
+        <w:t xml:space="preserve"> was dat niet zo moeilijk want alles kon ik vinden op deze link, maar ik heb dit nog niet echt kunnen uittesten. Voor </w:t>
+      </w:r>
+      <w:proofErr w:type="spellStart"/>
+      <w:r>
+        <w:t>firebase</w:t>
+      </w:r>
+      <w:proofErr w:type="spellEnd"/>
+      <w:r>
+        <w:t xml:space="preserve"> storage lukte dit niet echt, want er was geen duidelijk documentatie. Ik wou vooral proberen om de images op </w:t>
+      </w:r>
+      <w:proofErr w:type="spellStart"/>
+      <w:r>
+        <w:t>firebase</w:t>
+      </w:r>
+      <w:proofErr w:type="spellEnd"/>
+      <w:r>
+        <w:t xml:space="preserve"> in de cache te steken, zodat de meeste recente images verschijnen op de startpagina.</w:t>
       </w:r>
       <w:r>
         <w:t xml:space="preserve"> Mijn conclusie is eigenlijk dat het niet mogelijk is afhankelijk van het totale zoekwerk.</w:t>
@@ -3757,7 +5583,15 @@
     </w:p>
     <w:p>
       <w:r>
-        <w:t>Ik heb dan ondertussen een progress bar toegevoegd die zal</w:t>
+        <w:t xml:space="preserve">Ik heb dan ondertussen een </w:t>
+      </w:r>
+      <w:proofErr w:type="spellStart"/>
+      <w:r>
+        <w:t>progress</w:t>
+      </w:r>
+      <w:proofErr w:type="spellEnd"/>
+      <w:r>
+        <w:t xml:space="preserve"> bar toegevoegd die zal</w:t>
       </w:r>
       <w:r>
         <w:t xml:space="preserve"> </w:t>
@@ -3766,7 +5600,15 @@
         <w:t>verdwijnen als de images inladen.</w:t>
       </w:r>
       <w:r>
-        <w:t xml:space="preserve"> Dit komt ook bij de groepchats pagina.</w:t>
+        <w:t xml:space="preserve"> Dit komt ook bij de </w:t>
+      </w:r>
+      <w:proofErr w:type="spellStart"/>
+      <w:r>
+        <w:t>groepchats</w:t>
+      </w:r>
+      <w:proofErr w:type="spellEnd"/>
+      <w:r>
+        <w:t xml:space="preserve"> pagina.</w:t>
       </w:r>
     </w:p>
     <w:p/>
@@ -3787,10 +5629,50 @@
     </w:p>
     <w:p>
       <w:r>
-        <w:t>Vandaag heb ik verder gewerkt aan de chat functionaliteiten. Ik had in het begin een beetje moeilijkheden met het maken van de layout van de chat room en chat messages. Hierbij heeft de</w:t>
-      </w:r>
-      <w:r>
-        <w:t>ze link geholpen want de youtube tutorials chat layout was zeer lelijk.</w:t>
+        <w:t xml:space="preserve">Vandaag heb ik verder gewerkt aan de chat functionaliteiten. Ik had in het begin een beetje moeilijkheden met het maken van de </w:t>
+      </w:r>
+      <w:proofErr w:type="spellStart"/>
+      <w:r>
+        <w:t>layout</w:t>
+      </w:r>
+      <w:proofErr w:type="spellEnd"/>
+      <w:r>
+        <w:t xml:space="preserve"> van de chat room en chat </w:t>
+      </w:r>
+      <w:proofErr w:type="spellStart"/>
+      <w:r>
+        <w:t>messages</w:t>
+      </w:r>
+      <w:proofErr w:type="spellEnd"/>
+      <w:r>
+        <w:t>. Hierbij heeft de</w:t>
+      </w:r>
+      <w:r>
+        <w:t xml:space="preserve">ze link geholpen want de </w:t>
+      </w:r>
+      <w:proofErr w:type="spellStart"/>
+      <w:r>
+        <w:t>youtube</w:t>
+      </w:r>
+      <w:proofErr w:type="spellEnd"/>
+      <w:r>
+        <w:t xml:space="preserve"> </w:t>
+      </w:r>
+      <w:proofErr w:type="spellStart"/>
+      <w:r>
+        <w:t>tutorials</w:t>
+      </w:r>
+      <w:proofErr w:type="spellEnd"/>
+      <w:r>
+        <w:t xml:space="preserve"> chat </w:t>
+      </w:r>
+      <w:proofErr w:type="spellStart"/>
+      <w:r>
+        <w:t>layout</w:t>
+      </w:r>
+      <w:proofErr w:type="spellEnd"/>
+      <w:r>
+        <w:t xml:space="preserve"> was zeer lelijk.</w:t>
       </w:r>
     </w:p>
     <w:p>
@@ -3833,8 +5715,13 @@
           <w:numId w:val="2"/>
         </w:numPr>
       </w:pPr>
-      <w:r>
-        <w:t>Offfline functionaliteiten toevoegen?</w:t>
+      <w:proofErr w:type="spellStart"/>
+      <w:r>
+        <w:t>Offfline</w:t>
+      </w:r>
+      <w:proofErr w:type="spellEnd"/>
+      <w:r>
+        <w:t xml:space="preserve"> functionaliteiten toevoegen?</w:t>
       </w:r>
     </w:p>
     <w:p>
@@ -3867,7 +5754,15 @@
     </w:p>
     <w:p>
       <w:r>
-        <w:t>Vandaag heb ik de groepen chatrooms toegevoegd in een gridview waarmee de chat</w:t>
+        <w:t xml:space="preserve">Vandaag heb ik de groepen chatrooms toegevoegd in een </w:t>
+      </w:r>
+      <w:proofErr w:type="spellStart"/>
+      <w:r>
+        <w:t>gridview</w:t>
+      </w:r>
+      <w:proofErr w:type="spellEnd"/>
+      <w:r>
+        <w:t xml:space="preserve"> waarmee de chat</w:t>
       </w:r>
       <w:r>
         <w:t>s</w:t>
@@ -3876,10 +5771,50 @@
         <w:t xml:space="preserve"> zullen geopend worden. </w:t>
       </w:r>
       <w:r>
-        <w:t>Hierbij kreeg ik serieuze error die me compleet had verward en op stackoverflow had gesteld. Ik had dus per ongeluk de gridview het verkeerde ID gegeven waardoor er een NullPointerException ontstond, maar ik dacht dat de adapter null werd omdat het me niet lukte om de gegevens van firestore te halen.</w:t>
-      </w:r>
-      <w:r>
-        <w:t xml:space="preserve"> In de comments en antwoord wordt alles nog beter uitgelegd.</w:t>
+        <w:t xml:space="preserve">Hierbij kreeg ik serieuze error die me compleet had verward en op stackoverflow had gesteld. Ik had dus per ongeluk de </w:t>
+      </w:r>
+      <w:proofErr w:type="spellStart"/>
+      <w:r>
+        <w:t>gridview</w:t>
+      </w:r>
+      <w:proofErr w:type="spellEnd"/>
+      <w:r>
+        <w:t xml:space="preserve"> het verkeerde ID gegeven waardoor er een </w:t>
+      </w:r>
+      <w:proofErr w:type="spellStart"/>
+      <w:r>
+        <w:t>NullPointerException</w:t>
+      </w:r>
+      <w:proofErr w:type="spellEnd"/>
+      <w:r>
+        <w:t xml:space="preserve"> ontstond, maar ik dacht dat de adapter </w:t>
+      </w:r>
+      <w:proofErr w:type="spellStart"/>
+      <w:r>
+        <w:t>null</w:t>
+      </w:r>
+      <w:proofErr w:type="spellEnd"/>
+      <w:r>
+        <w:t xml:space="preserve"> werd omdat het me niet lukte om de gegevens van </w:t>
+      </w:r>
+      <w:proofErr w:type="spellStart"/>
+      <w:r>
+        <w:t>firestore</w:t>
+      </w:r>
+      <w:proofErr w:type="spellEnd"/>
+      <w:r>
+        <w:t xml:space="preserve"> te halen.</w:t>
+      </w:r>
+      <w:r>
+        <w:t xml:space="preserve"> In de </w:t>
+      </w:r>
+      <w:proofErr w:type="spellStart"/>
+      <w:r>
+        <w:t>comments</w:t>
+      </w:r>
+      <w:proofErr w:type="spellEnd"/>
+      <w:r>
+        <w:t xml:space="preserve"> en antwoord wordt alles nog beter uitgelegd.</w:t>
       </w:r>
     </w:p>
     <w:p>
@@ -3916,22 +5851,69 @@
     </w:p>
     <w:p>
       <w:r>
-        <w:t xml:space="preserve">Vandaag heb ik ervoor kunnen zorgen dat er pagina wordt geopend als je op een chatroom klikt. Dit duurde langer dan verwacht, want blijkbaar is het niet zo makkelijk om button click events te activeren in een gridview. Om dit op te lossen moest ik een </w:t>
-      </w:r>
+        <w:t xml:space="preserve">Vandaag heb ik ervoor kunnen zorgen dat er pagina wordt geopend als je op een chatroom klikt. Dit duurde langer dan verwacht, want blijkbaar is het niet zo makkelijk om button click events te activeren in een </w:t>
+      </w:r>
+      <w:proofErr w:type="spellStart"/>
+      <w:r>
+        <w:t>gridview</w:t>
+      </w:r>
+      <w:proofErr w:type="spellEnd"/>
+      <w:r>
+        <w:t xml:space="preserve">. Om dit op te lossen moest ik een </w:t>
+      </w:r>
+      <w:proofErr w:type="spellStart"/>
       <w:r>
         <w:t>V</w:t>
       </w:r>
       <w:r>
         <w:t>iewHolder</w:t>
       </w:r>
-      <w:r>
-        <w:t xml:space="preserve"> static</w:t>
-      </w:r>
+      <w:proofErr w:type="spellEnd"/>
+      <w:r>
+        <w:t xml:space="preserve"> </w:t>
+      </w:r>
+      <w:proofErr w:type="spellStart"/>
+      <w:r>
+        <w:t>static</w:t>
+      </w:r>
+      <w:proofErr w:type="spellEnd"/>
       <w:r>
         <w:t xml:space="preserve"> class toevoegen in de </w:t>
       </w:r>
       <w:r>
-        <w:t xml:space="preserve">Adapter class. Deze klasse zorgt ervoor dat de rendering van items in de gridview sneller is. In deze viewholder wordt de button opgeslagen die je kan oproepen en waarop je een onclickevent kan </w:t>
+        <w:t xml:space="preserve">Adapter class. Deze klasse zorgt ervoor dat de </w:t>
+      </w:r>
+      <w:proofErr w:type="spellStart"/>
+      <w:r>
+        <w:t>rendering</w:t>
+      </w:r>
+      <w:proofErr w:type="spellEnd"/>
+      <w:r>
+        <w:t xml:space="preserve"> van items in de </w:t>
+      </w:r>
+      <w:proofErr w:type="spellStart"/>
+      <w:r>
+        <w:t>gridview</w:t>
+      </w:r>
+      <w:proofErr w:type="spellEnd"/>
+      <w:r>
+        <w:t xml:space="preserve"> sneller is. In deze </w:t>
+      </w:r>
+      <w:proofErr w:type="spellStart"/>
+      <w:r>
+        <w:t>viewholder</w:t>
+      </w:r>
+      <w:proofErr w:type="spellEnd"/>
+      <w:r>
+        <w:t xml:space="preserve"> wordt de button opgeslagen die je kan oproepen en waarop je een </w:t>
+      </w:r>
+      <w:proofErr w:type="spellStart"/>
+      <w:r>
+        <w:t>onclickevent</w:t>
+      </w:r>
+      <w:proofErr w:type="spellEnd"/>
+      <w:r>
+        <w:t xml:space="preserve"> kan </w:t>
       </w:r>
       <w:r>
         <w:t>activeren</w:t>
@@ -4019,10 +6001,42 @@
     </w:p>
     <w:p>
       <w:r>
-        <w:t xml:space="preserve">Sinds vandaag kan ik chatmessages naar mijn firestore database sturen </w:t>
-      </w:r>
-      <w:r>
-        <w:t>, maar messages tonen is iets moeilijker door recyclerview en zijn adapter.</w:t>
+        <w:t xml:space="preserve">Sinds vandaag kan ik </w:t>
+      </w:r>
+      <w:proofErr w:type="spellStart"/>
+      <w:r>
+        <w:t>chatmessages</w:t>
+      </w:r>
+      <w:proofErr w:type="spellEnd"/>
+      <w:r>
+        <w:t xml:space="preserve"> naar mijn </w:t>
+      </w:r>
+      <w:proofErr w:type="spellStart"/>
+      <w:r>
+        <w:t>firestore</w:t>
+      </w:r>
+      <w:proofErr w:type="spellEnd"/>
+      <w:r>
+        <w:t xml:space="preserve"> database </w:t>
+      </w:r>
+      <w:proofErr w:type="gramStart"/>
+      <w:r>
+        <w:t xml:space="preserve">sturen </w:t>
+      </w:r>
+      <w:r>
+        <w:t>,</w:t>
+      </w:r>
+      <w:proofErr w:type="gramEnd"/>
+      <w:r>
+        <w:t xml:space="preserve"> maar </w:t>
+      </w:r>
+      <w:proofErr w:type="spellStart"/>
+      <w:r>
+        <w:t>messages</w:t>
+      </w:r>
+      <w:proofErr w:type="spellEnd"/>
+      <w:r>
+        <w:t xml:space="preserve"> tonen is iets moeilijker door recyclerview en zijn adapter.</w:t>
       </w:r>
     </w:p>
     <w:p>
@@ -4105,7 +6119,15 @@
         </w:numPr>
       </w:pPr>
       <w:r>
-        <w:t xml:space="preserve">Contact us </w:t>
+        <w:t xml:space="preserve">Contact </w:t>
+      </w:r>
+      <w:proofErr w:type="spellStart"/>
+      <w:r>
+        <w:t>us</w:t>
+      </w:r>
+      <w:proofErr w:type="spellEnd"/>
+      <w:r>
+        <w:t xml:space="preserve"> </w:t>
       </w:r>
       <w:r>
         <w:t>toevoegen</w:t>
@@ -4123,8 +6145,13 @@
         </w:numPr>
       </w:pPr>
       <w:r>
-        <w:t>Puntenverdeling opdrachten afwerken zoals offline support</w:t>
-      </w:r>
+        <w:t xml:space="preserve">Puntenverdeling opdrachten afwerken zoals </w:t>
+      </w:r>
+      <w:proofErr w:type="gramStart"/>
+      <w:r>
+        <w:t>offline support</w:t>
+      </w:r>
+      <w:proofErr w:type="gramEnd"/>
     </w:p>
     <w:p/>
     <w:p/>
@@ -4146,13 +6173,50 @@
     </w:p>
     <w:p>
       <w:r>
-        <w:t>Vandaag heb ik de MessageAdapter waarmee de users kunnen chatten in chatgroepen verbetert want ik had tutorials door elkaar gehaald. Ik had vooral Id’s nodig van de</w:t>
-      </w:r>
-      <w:r>
-        <w:t xml:space="preserve"> messages</w:t>
-      </w:r>
-      <w:r>
-        <w:t xml:space="preserve"> layouts want d</w:t>
+        <w:t xml:space="preserve">Vandaag heb ik de </w:t>
+      </w:r>
+      <w:proofErr w:type="spellStart"/>
+      <w:r>
+        <w:t>MessageAdapter</w:t>
+      </w:r>
+      <w:proofErr w:type="spellEnd"/>
+      <w:r>
+        <w:t xml:space="preserve"> waarmee de users kunnen chatten in chatgroepen verbetert want ik had </w:t>
+      </w:r>
+      <w:proofErr w:type="spellStart"/>
+      <w:r>
+        <w:t>tutorials</w:t>
+      </w:r>
+      <w:proofErr w:type="spellEnd"/>
+      <w:r>
+        <w:t xml:space="preserve"> door elkaar gehaald. Ik had vooral </w:t>
+      </w:r>
+      <w:proofErr w:type="spellStart"/>
+      <w:r>
+        <w:t>Id’s</w:t>
+      </w:r>
+      <w:proofErr w:type="spellEnd"/>
+      <w:r>
+        <w:t xml:space="preserve"> nodig van de</w:t>
+      </w:r>
+      <w:r>
+        <w:t xml:space="preserve"> </w:t>
+      </w:r>
+      <w:proofErr w:type="spellStart"/>
+      <w:r>
+        <w:t>messages</w:t>
+      </w:r>
+      <w:proofErr w:type="spellEnd"/>
+      <w:r>
+        <w:t xml:space="preserve"> </w:t>
+      </w:r>
+      <w:proofErr w:type="spellStart"/>
+      <w:r>
+        <w:t>layouts</w:t>
+      </w:r>
+      <w:proofErr w:type="spellEnd"/>
+      <w:r>
+        <w:t xml:space="preserve"> want d</w:t>
       </w:r>
       <w:r>
         <w:t>eze</w:t>
@@ -4163,6 +6227,7 @@
       <w:r>
         <w:t xml:space="preserve"> 1</w:t>
       </w:r>
+      <w:proofErr w:type="gramStart"/>
       <w:r>
         <w:rPr>
           <w:vertAlign w:val="superscript"/>
@@ -4175,14 +6240,28 @@
       <w:r>
         <w:t xml:space="preserve"> tutorial</w:t>
       </w:r>
-      <w:r>
-        <w:t xml:space="preserve"> hieronder. Daarna ging alles vlot, maar ik heb alleen moeilijkheden met het beveiligen van groupchats</w:t>
-      </w:r>
+      <w:proofErr w:type="gramEnd"/>
+      <w:r>
+        <w:t xml:space="preserve"> hieronder. Daarna ging alles vlot, maar ik heb alleen moeilijkheden met het beveiligen van </w:t>
+      </w:r>
+      <w:proofErr w:type="spellStart"/>
+      <w:r>
+        <w:t>groupchats</w:t>
+      </w:r>
+      <w:proofErr w:type="spellEnd"/>
       <w:r>
         <w:t xml:space="preserve">. Hoe gaan dus </w:t>
       </w:r>
       <w:r>
-        <w:t>user worden toegevoegd aan een groepchat, enz.</w:t>
+        <w:t xml:space="preserve">user worden toegevoegd aan een </w:t>
+      </w:r>
+      <w:proofErr w:type="spellStart"/>
+      <w:r>
+        <w:t>groepchat</w:t>
+      </w:r>
+      <w:proofErr w:type="spellEnd"/>
+      <w:r>
+        <w:t>, enz.</w:t>
       </w:r>
     </w:p>
     <w:p>
@@ -4223,7 +6302,15 @@
     </w:p>
     <w:p>
       <w:r>
-        <w:t>Vandaag heb ik kort overlopen met Yves Blancquaert hoe de stand van zaken zijn. Hierbij heb ik vooral op de conclusie gekomen dat ik de volgende dingen nog moet doen:</w:t>
+        <w:t xml:space="preserve">Vandaag heb ik kort overlopen met Yves </w:t>
+      </w:r>
+      <w:proofErr w:type="spellStart"/>
+      <w:r>
+        <w:t>Blancquaert</w:t>
+      </w:r>
+      <w:proofErr w:type="spellEnd"/>
+      <w:r>
+        <w:t xml:space="preserve"> hoe de stand van zaken zijn. Hierbij heb ik vooral op de conclusie gekomen dat ik de volgende dingen nog moet doen:</w:t>
       </w:r>
     </w:p>
     <w:p>
@@ -4234,8 +6321,13 @@
           <w:numId w:val="2"/>
         </w:numPr>
       </w:pPr>
-      <w:r>
-        <w:t>Chatgroup afwerken en meerdere users kunnen toevoegen</w:t>
+      <w:proofErr w:type="spellStart"/>
+      <w:r>
+        <w:t>Chatgroup</w:t>
+      </w:r>
+      <w:proofErr w:type="spellEnd"/>
+      <w:r>
+        <w:t xml:space="preserve"> afwerken en meerdere users kunnen toevoegen</w:t>
       </w:r>
     </w:p>
     <w:p>
@@ -4247,7 +6339,15 @@
         </w:numPr>
       </w:pPr>
       <w:r>
-        <w:t>Contact us pagina nog toevoe</w:t>
+        <w:t xml:space="preserve">Contact </w:t>
+      </w:r>
+      <w:proofErr w:type="spellStart"/>
+      <w:r>
+        <w:t>us</w:t>
+      </w:r>
+      <w:proofErr w:type="spellEnd"/>
+      <w:r>
+        <w:t xml:space="preserve"> pagina nog toevoe</w:t>
       </w:r>
       <w:r>
         <w:t>gen voor extra</w:t>
@@ -4262,8 +6362,13 @@
         </w:numPr>
       </w:pPr>
       <w:r>
-        <w:t>Notificaties toevoegen voor messages</w:t>
-      </w:r>
+        <w:t xml:space="preserve">Notificaties toevoegen voor </w:t>
+      </w:r>
+      <w:proofErr w:type="spellStart"/>
+      <w:r>
+        <w:t>messages</w:t>
+      </w:r>
+      <w:proofErr w:type="spellEnd"/>
     </w:p>
     <w:p>
       <w:pPr>
@@ -4284,12 +6389,38 @@
           <w:bCs/>
           <w:u w:val="single"/>
         </w:rPr>
-        <w:t>Image in chat toevoegen en comments erop kunnen plaatsen!!!!!!</w:t>
-      </w:r>
-    </w:p>
-    <w:p>
-      <w:r>
-        <w:t xml:space="preserve">Vandaag heb ik dan snel de contact us pagina afgewerkt zodat </w:t>
+        <w:t xml:space="preserve">Image in chat toevoegen en </w:t>
+      </w:r>
+      <w:proofErr w:type="spellStart"/>
+      <w:r>
+        <w:rPr>
+          <w:b/>
+          <w:bCs/>
+          <w:u w:val="single"/>
+        </w:rPr>
+        <w:t>comments</w:t>
+      </w:r>
+      <w:proofErr w:type="spellEnd"/>
+      <w:r>
+        <w:rPr>
+          <w:b/>
+          <w:bCs/>
+          <w:u w:val="single"/>
+        </w:rPr>
+        <w:t xml:space="preserve"> erop kunnen plaatsen!!!!!!</w:t>
+      </w:r>
+    </w:p>
+    <w:p>
+      <w:r>
+        <w:t xml:space="preserve">Vandaag heb ik dan snel de contact </w:t>
+      </w:r>
+      <w:proofErr w:type="spellStart"/>
+      <w:r>
+        <w:t>us</w:t>
+      </w:r>
+      <w:proofErr w:type="spellEnd"/>
+      <w:r>
+        <w:t xml:space="preserve"> pagina afgewerkt zodat </w:t>
       </w:r>
       <w:r>
         <w:t>da al af is en zo vlot kan beginnen aan de chat groepen</w:t>
@@ -4330,20 +6461,116 @@
     </w:p>
     <w:p>
       <w:r>
-        <w:t xml:space="preserve">Vandaag heb ik de recyclerview gefixed, want er waren nog een paar fouten. </w:t>
-      </w:r>
-    </w:p>
-    <w:p>
-      <w:r>
-        <w:t>Ten eerste begon de chat messages niet vanonder dus dat heb ik gefixed met SetHasFixedSize en SetStackFromEnd true te zetten.</w:t>
-      </w:r>
-    </w:p>
-    <w:p>
-      <w:r>
-        <w:t xml:space="preserve">Ten tweede wou de recyclerview niet updaten als ik een nieuwe message uploadde. Dit kwam omdat firestore niet wou realtime updaten. Dit voornaamste rede daarvan was blijkbaar </w:t>
-      </w:r>
-      <w:r>
-        <w:t>dat ik een index moest toevoegen voor de query die de gegevens moest ophalen. Dit werd niet vermeld in tutorials en documentaties van firestore. Firestore stuur dit als error naar mij zie mijn stackoverflow vraag:</w:t>
+        <w:t xml:space="preserve">Vandaag heb ik de recyclerview </w:t>
+      </w:r>
+      <w:proofErr w:type="spellStart"/>
+      <w:r>
+        <w:t>gefixed</w:t>
+      </w:r>
+      <w:proofErr w:type="spellEnd"/>
+      <w:r>
+        <w:t xml:space="preserve">, want er waren nog een paar fouten. </w:t>
+      </w:r>
+    </w:p>
+    <w:p>
+      <w:r>
+        <w:t xml:space="preserve">Ten eerste begon de chat </w:t>
+      </w:r>
+      <w:proofErr w:type="spellStart"/>
+      <w:r>
+        <w:t>messages</w:t>
+      </w:r>
+      <w:proofErr w:type="spellEnd"/>
+      <w:r>
+        <w:t xml:space="preserve"> niet vanonder dus dat heb ik </w:t>
+      </w:r>
+      <w:proofErr w:type="spellStart"/>
+      <w:r>
+        <w:t>gefixed</w:t>
+      </w:r>
+      <w:proofErr w:type="spellEnd"/>
+      <w:r>
+        <w:t xml:space="preserve"> met </w:t>
+      </w:r>
+      <w:proofErr w:type="spellStart"/>
+      <w:r>
+        <w:t>SetHasFixedSize</w:t>
+      </w:r>
+      <w:proofErr w:type="spellEnd"/>
+      <w:r>
+        <w:t xml:space="preserve"> en </w:t>
+      </w:r>
+      <w:proofErr w:type="spellStart"/>
+      <w:r>
+        <w:t>SetStackFromEnd</w:t>
+      </w:r>
+      <w:proofErr w:type="spellEnd"/>
+      <w:r>
+        <w:t xml:space="preserve"> </w:t>
+      </w:r>
+      <w:proofErr w:type="spellStart"/>
+      <w:r>
+        <w:t>true</w:t>
+      </w:r>
+      <w:proofErr w:type="spellEnd"/>
+      <w:r>
+        <w:t xml:space="preserve"> te zetten.</w:t>
+      </w:r>
+    </w:p>
+    <w:p>
+      <w:r>
+        <w:t xml:space="preserve">Ten tweede wou de recyclerview niet updaten als ik een nieuwe </w:t>
+      </w:r>
+      <w:proofErr w:type="spellStart"/>
+      <w:r>
+        <w:t>message</w:t>
+      </w:r>
+      <w:proofErr w:type="spellEnd"/>
+      <w:r>
+        <w:t xml:space="preserve"> uploadde. Dit kwam omdat </w:t>
+      </w:r>
+      <w:proofErr w:type="spellStart"/>
+      <w:r>
+        <w:t>firestore</w:t>
+      </w:r>
+      <w:proofErr w:type="spellEnd"/>
+      <w:r>
+        <w:t xml:space="preserve"> niet wou </w:t>
+      </w:r>
+      <w:proofErr w:type="spellStart"/>
+      <w:r>
+        <w:t>realtime</w:t>
+      </w:r>
+      <w:proofErr w:type="spellEnd"/>
+      <w:r>
+        <w:t xml:space="preserve"> updaten. Dit voornaamste rede daarvan was blijkbaar </w:t>
+      </w:r>
+      <w:r>
+        <w:t xml:space="preserve">dat ik een index moest toevoegen voor de query die de gegevens moest ophalen. Dit werd niet vermeld in </w:t>
+      </w:r>
+      <w:proofErr w:type="spellStart"/>
+      <w:r>
+        <w:t>tutorials</w:t>
+      </w:r>
+      <w:proofErr w:type="spellEnd"/>
+      <w:r>
+        <w:t xml:space="preserve"> en documentaties van </w:t>
+      </w:r>
+      <w:proofErr w:type="spellStart"/>
+      <w:r>
+        <w:t>firestore</w:t>
+      </w:r>
+      <w:proofErr w:type="spellEnd"/>
+      <w:r>
+        <w:t xml:space="preserve">. </w:t>
+      </w:r>
+      <w:proofErr w:type="spellStart"/>
+      <w:r>
+        <w:t>Firestore</w:t>
+      </w:r>
+      <w:proofErr w:type="spellEnd"/>
+      <w:r>
+        <w:t xml:space="preserve"> stuur dit als error naar mij zie mijn stackoverflow vraag:</w:t>
       </w:r>
     </w:p>
     <w:p>
@@ -4425,7 +6652,15 @@
         <w:t xml:space="preserve">Vandaag heb ik nog wat chat foutjes opgelost zoals </w:t>
       </w:r>
       <w:r>
-        <w:t xml:space="preserve">het tijdstip van de message was in het </w:t>
+        <w:t xml:space="preserve">het tijdstip van de </w:t>
+      </w:r>
+      <w:proofErr w:type="spellStart"/>
+      <w:r>
+        <w:t>message</w:t>
+      </w:r>
+      <w:proofErr w:type="spellEnd"/>
+      <w:r>
+        <w:t xml:space="preserve"> was in het </w:t>
       </w:r>
       <w:r>
         <w:t xml:space="preserve">Engelse </w:t>
@@ -4434,8 +6669,33 @@
         <w:t xml:space="preserve">tijd </w:t>
       </w:r>
       <w:r>
-        <w:t xml:space="preserve">(AM-PM) dus dat heb ik omgezet naar digitale tijdstip. Dit kon door in de DateFormat “hh-…” te vervangen met “kk-…”. Ook nieuwe berichten werden niet automatisch naar toe gescrold daarom moest ik </w:t>
-      </w:r>
+        <w:t xml:space="preserve">(AM-PM) dus dat heb ik omgezet naar digitale tijdstip. Dit kon door in de </w:t>
+      </w:r>
+      <w:proofErr w:type="spellStart"/>
+      <w:r>
+        <w:t>DateFormat</w:t>
+      </w:r>
+      <w:proofErr w:type="spellEnd"/>
+      <w:r>
+        <w:t xml:space="preserve"> “</w:t>
+      </w:r>
+      <w:proofErr w:type="spellStart"/>
+      <w:r>
+        <w:t>hh</w:t>
+      </w:r>
+      <w:proofErr w:type="spellEnd"/>
+      <w:r>
+        <w:t>-…” te vervangen met “</w:t>
+      </w:r>
+      <w:proofErr w:type="spellStart"/>
+      <w:r>
+        <w:t>kk</w:t>
+      </w:r>
+      <w:proofErr w:type="spellEnd"/>
+      <w:r>
+        <w:t xml:space="preserve">-…”. Ook nieuwe berichten werden niet automatisch naar toe gescrold daarom moest ik </w:t>
+      </w:r>
+      <w:proofErr w:type="spellStart"/>
       <w:r>
         <w:rPr>
           <w:i/>
@@ -4444,6 +6704,7 @@
         </w:rPr>
         <w:t>smooth</w:t>
       </w:r>
+      <w:proofErr w:type="spellEnd"/>
       <w:r>
         <w:rPr>
           <w:i/>
@@ -4451,8 +6712,21 @@
         </w:rPr>
         <w:t xml:space="preserve"> </w:t>
       </w:r>
-      <w:r>
-        <w:t>scrolling to aanzetten i</w:t>
+      <w:proofErr w:type="spellStart"/>
+      <w:r>
+        <w:t>scrolling</w:t>
+      </w:r>
+      <w:proofErr w:type="spellEnd"/>
+      <w:r>
+        <w:t xml:space="preserve"> </w:t>
+      </w:r>
+      <w:proofErr w:type="spellStart"/>
+      <w:r>
+        <w:t>to</w:t>
+      </w:r>
+      <w:proofErr w:type="spellEnd"/>
+      <w:r>
+        <w:t xml:space="preserve"> aanzetten i</w:t>
       </w:r>
       <w:r>
         <w:t xml:space="preserve">n </w:t>
@@ -4470,7 +6744,23 @@
         <w:t>an</w:t>
       </w:r>
       <w:r>
-        <w:t xml:space="preserve"> gewoon scrolling to.</w:t>
+        <w:t xml:space="preserve"> gewoon </w:t>
+      </w:r>
+      <w:proofErr w:type="spellStart"/>
+      <w:r>
+        <w:t>scrolling</w:t>
+      </w:r>
+      <w:proofErr w:type="spellEnd"/>
+      <w:r>
+        <w:t xml:space="preserve"> </w:t>
+      </w:r>
+      <w:proofErr w:type="spellStart"/>
+      <w:r>
+        <w:t>to</w:t>
+      </w:r>
+      <w:proofErr w:type="spellEnd"/>
+      <w:r>
+        <w:t>.</w:t>
       </w:r>
     </w:p>
     <w:p>
@@ -4478,16 +6768,48 @@
         <w:t xml:space="preserve">Dan heb ik vooral opgezocht </w:t>
       </w:r>
       <w:r>
-        <w:t>hoe ik andere users kan toevoegen aan een chat group waarvan deze link me het meest belovend uitziet.</w:t>
-      </w:r>
-      <w:r>
-        <w:t xml:space="preserve"> Admin roles lijken me het makkelijkst</w:t>
+        <w:t xml:space="preserve">hoe ik andere users kan toevoegen aan een chat </w:t>
+      </w:r>
+      <w:proofErr w:type="spellStart"/>
+      <w:r>
+        <w:t>group</w:t>
+      </w:r>
+      <w:proofErr w:type="spellEnd"/>
+      <w:r>
+        <w:t xml:space="preserve"> waarvan deze link me het meest belovend uitziet.</w:t>
+      </w:r>
+      <w:r>
+        <w:t xml:space="preserve"> </w:t>
+      </w:r>
+      <w:proofErr w:type="spellStart"/>
+      <w:r>
+        <w:t>Admin</w:t>
+      </w:r>
+      <w:proofErr w:type="spellEnd"/>
+      <w:r>
+        <w:t xml:space="preserve"> </w:t>
+      </w:r>
+      <w:proofErr w:type="spellStart"/>
+      <w:r>
+        <w:t>roles</w:t>
+      </w:r>
+      <w:proofErr w:type="spellEnd"/>
+      <w:r>
+        <w:t xml:space="preserve"> lijken me het makkelijkst</w:t>
       </w:r>
       <w:r>
         <w:t xml:space="preserve">. Als dit niet lukt ga ik gewoon proberen </w:t>
       </w:r>
       <w:r>
-        <w:t>om de admin users te laten toevoegen via email</w:t>
+        <w:t xml:space="preserve">om de </w:t>
+      </w:r>
+      <w:proofErr w:type="spellStart"/>
+      <w:r>
+        <w:t>admin</w:t>
+      </w:r>
+      <w:proofErr w:type="spellEnd"/>
+      <w:r>
+        <w:t xml:space="preserve"> users te laten toevoegen via email</w:t>
       </w:r>
       <w:r>
         <w:t xml:space="preserve"> via </w:t>
@@ -4602,7 +6924,15 @@
         </w:numPr>
       </w:pPr>
       <w:r>
-        <w:t>Afbeeldingen kunnen doorsturen via chat en comments eraan kunnen toevoegen.</w:t>
+        <w:t xml:space="preserve">Afbeeldingen kunnen doorsturen via chat en </w:t>
+      </w:r>
+      <w:proofErr w:type="spellStart"/>
+      <w:r>
+        <w:t>comments</w:t>
+      </w:r>
+      <w:proofErr w:type="spellEnd"/>
+      <w:r>
+        <w:t xml:space="preserve"> eraan kunnen toevoegen.</w:t>
       </w:r>
     </w:p>
     <w:p>
@@ -4614,12 +6944,169 @@
         </w:numPr>
       </w:pPr>
       <w:r>
-        <w:t>Puntenverdeling opdrachten afwerken zoals offline support</w:t>
-      </w:r>
+        <w:t xml:space="preserve">Puntenverdeling opdrachten afwerken zoals </w:t>
+      </w:r>
+      <w:proofErr w:type="gramStart"/>
+      <w:r>
+        <w:t>offline support</w:t>
+      </w:r>
+      <w:proofErr w:type="gramEnd"/>
     </w:p>
     <w:p/>
-    <w:p/>
-    <w:p/>
+    <w:p>
+      <w:pPr>
+        <w:rPr>
+          <w:b/>
+          <w:bCs/>
+        </w:rPr>
+      </w:pPr>
+      <w:r>
+        <w:rPr>
+          <w:b/>
+          <w:bCs/>
+        </w:rPr>
+        <w:t>22/12/2021:</w:t>
+      </w:r>
+    </w:p>
+    <w:p>
+      <w:r>
+        <w:t xml:space="preserve">Vandaag heb ik de chatrooms een beter menu gegeven bovenaan. Hierbij kan je terug keren naar de vorige pagina, een foto uploaden in chat (in </w:t>
+      </w:r>
+      <w:proofErr w:type="spellStart"/>
+      <w:r>
+        <w:t>progress</w:t>
+      </w:r>
+      <w:proofErr w:type="spellEnd"/>
+      <w:r>
+        <w:t xml:space="preserve">) en </w:t>
+      </w:r>
+      <w:proofErr w:type="spellStart"/>
+      <w:r>
+        <w:t>admin</w:t>
+      </w:r>
+      <w:proofErr w:type="spellEnd"/>
+      <w:r>
+        <w:t xml:space="preserve"> </w:t>
+      </w:r>
+      <w:proofErr w:type="spellStart"/>
+      <w:r>
+        <w:t>priviliges</w:t>
+      </w:r>
+      <w:proofErr w:type="spellEnd"/>
+      <w:r>
+        <w:t xml:space="preserve"> uitvoeren zoals user toevoegen en verwijderen (in </w:t>
+      </w:r>
+      <w:proofErr w:type="spellStart"/>
+      <w:r>
+        <w:t>progress</w:t>
+      </w:r>
+      <w:proofErr w:type="spellEnd"/>
+      <w:r>
+        <w:t>). Zoals gezegd in de vorige</w:t>
+      </w:r>
+      <w:r>
+        <w:t xml:space="preserve"> rapport ga </w:t>
+      </w:r>
+      <w:proofErr w:type="spellStart"/>
+      <w:r>
+        <w:t>admin</w:t>
+      </w:r>
+      <w:proofErr w:type="spellEnd"/>
+      <w:r>
+        <w:t xml:space="preserve"> </w:t>
+      </w:r>
+      <w:proofErr w:type="spellStart"/>
+      <w:r>
+        <w:t>roles</w:t>
+      </w:r>
+      <w:proofErr w:type="spellEnd"/>
+      <w:r>
+        <w:t xml:space="preserve"> toevoegen. Ik ben dus nu begonnen om dit te implementeren, waarbij ik als 1</w:t>
+      </w:r>
+      <w:r>
+        <w:rPr>
+          <w:vertAlign w:val="superscript"/>
+        </w:rPr>
+        <w:t>ste</w:t>
+      </w:r>
+      <w:r>
+        <w:t xml:space="preserve"> stap dus de </w:t>
+      </w:r>
+      <w:proofErr w:type="spellStart"/>
+      <w:r>
+        <w:t>firestore</w:t>
+      </w:r>
+      <w:proofErr w:type="spellEnd"/>
+      <w:r>
+        <w:t xml:space="preserve"> lay-out heb aangepast voor </w:t>
+      </w:r>
+      <w:proofErr w:type="spellStart"/>
+      <w:r>
+        <w:t>groups</w:t>
+      </w:r>
+      <w:proofErr w:type="spellEnd"/>
+      <w:r>
+        <w:t xml:space="preserve">. Nu bevinden </w:t>
+      </w:r>
+      <w:proofErr w:type="spellStart"/>
+      <w:r>
+        <w:t>groups</w:t>
+      </w:r>
+      <w:proofErr w:type="spellEnd"/>
+      <w:r>
+        <w:t xml:space="preserve"> zich bij de users (/</w:t>
+      </w:r>
+      <w:proofErr w:type="spellStart"/>
+      <w:r>
+        <w:t>admins</w:t>
+      </w:r>
+      <w:proofErr w:type="spellEnd"/>
+      <w:r>
+        <w:t>) die het gemaakt heeft.</w:t>
+      </w:r>
+    </w:p>
+    <w:p>
+      <w:r>
+        <w:rPr>
+          <w:noProof/>
+        </w:rPr>
+        <w:drawing>
+          <wp:inline distT="0" distB="0" distL="0" distR="0" wp14:anchorId="07511EBD" wp14:editId="13814156">
+            <wp:extent cx="5760720" cy="2355850"/>
+            <wp:effectExtent l="0" t="0" r="0" b="6350"/>
+            <wp:docPr id="34" name="Afbeelding 34"/>
+            <wp:cNvGraphicFramePr>
+              <a:graphicFrameLocks xmlns:a="http://schemas.openxmlformats.org/drawingml/2006/main" noChangeAspect="1"/>
+            </wp:cNvGraphicFramePr>
+            <a:graphic xmlns:a="http://schemas.openxmlformats.org/drawingml/2006/main">
+              <a:graphicData uri="http://schemas.openxmlformats.org/drawingml/2006/picture">
+                <pic:pic xmlns:pic="http://schemas.openxmlformats.org/drawingml/2006/picture">
+                  <pic:nvPicPr>
+                    <pic:cNvPr id="1" name=""/>
+                    <pic:cNvPicPr/>
+                  </pic:nvPicPr>
+                  <pic:blipFill>
+                    <a:blip r:embed="rId79"/>
+                    <a:stretch>
+                      <a:fillRect/>
+                    </a:stretch>
+                  </pic:blipFill>
+                  <pic:spPr>
+                    <a:xfrm>
+                      <a:off x="0" y="0"/>
+                      <a:ext cx="5760720" cy="2355850"/>
+                    </a:xfrm>
+                    <a:prstGeom prst="rect">
+                      <a:avLst/>
+                    </a:prstGeom>
+                  </pic:spPr>
+                </pic:pic>
+              </a:graphicData>
+            </a:graphic>
+          </wp:inline>
+        </w:drawing>
+      </w:r>
+    </w:p>
     <w:sectPr>
       <w:pgSz w:w="11906" w:h="16838"/>
       <w:pgMar w:top="1417" w:right="1417" w:bottom="1417" w:left="1417" w:header="708" w:footer="708" w:gutter="0"/>

</xml_diff>

<commit_message>
Changed "groups" structure in firestore
</commit_message>
<xml_diff>
--- a/Logboek_Dries_Fierens.docx
+++ b/Logboek_Dries_Fierens.docx
@@ -7095,6 +7095,116 @@
                     <a:xfrm>
                       <a:off x="0" y="0"/>
                       <a:ext cx="5760720" cy="2355850"/>
+                    </a:xfrm>
+                    <a:prstGeom prst="rect">
+                      <a:avLst/>
+                    </a:prstGeom>
+                  </pic:spPr>
+                </pic:pic>
+              </a:graphicData>
+            </a:graphic>
+          </wp:inline>
+        </w:drawing>
+      </w:r>
+    </w:p>
+    <w:p/>
+    <w:p>
+      <w:r>
+        <w:lastRenderedPageBreak/>
+        <w:t xml:space="preserve">Daarna was het effe een </w:t>
+      </w:r>
+      <w:proofErr w:type="spellStart"/>
+      <w:r>
+        <w:t>struggle</w:t>
+      </w:r>
+      <w:proofErr w:type="spellEnd"/>
+      <w:r>
+        <w:t xml:space="preserve"> om met groepen te werken, want ik was vooral met een list van groepen aan het werken. Dit zorgde voor nogal moeilijke design </w:t>
+      </w:r>
+      <w:r>
+        <w:t>voor</w:t>
+      </w:r>
+      <w:r>
+        <w:t xml:space="preserve"> users in een groep</w:t>
+      </w:r>
+      <w:r>
+        <w:t xml:space="preserve"> toe te voegen</w:t>
+      </w:r>
+      <w:r>
+        <w:t>. Dus dat had na veel moeite opgelost door gewoon apart met een object “Chatroom</w:t>
+      </w:r>
+      <w:proofErr w:type="gramStart"/>
+      <w:r>
+        <w:t>”  groepen</w:t>
+      </w:r>
+      <w:proofErr w:type="gramEnd"/>
+      <w:r>
+        <w:t xml:space="preserve"> toe te voegen</w:t>
+      </w:r>
+      <w:r>
+        <w:t xml:space="preserve"> </w:t>
+      </w:r>
+      <w:r>
+        <w:t xml:space="preserve">zodat die een </w:t>
+      </w:r>
+      <w:proofErr w:type="spellStart"/>
+      <w:r>
+        <w:t>admin</w:t>
+      </w:r>
+      <w:proofErr w:type="spellEnd"/>
+      <w:r>
+        <w:t xml:space="preserve"> </w:t>
+      </w:r>
+      <w:proofErr w:type="spellStart"/>
+      <w:r>
+        <w:t>id</w:t>
+      </w:r>
+      <w:proofErr w:type="spellEnd"/>
+      <w:r>
+        <w:t xml:space="preserve"> en de users (alleen de </w:t>
+      </w:r>
+      <w:proofErr w:type="spellStart"/>
+      <w:r>
+        <w:t>userI</w:t>
+      </w:r>
+      <w:r>
+        <w:t>ds</w:t>
+      </w:r>
+      <w:proofErr w:type="spellEnd"/>
+      <w:r>
+        <w:t>) inzitten.</w:t>
+      </w:r>
+    </w:p>
+    <w:p>
+      <w:r>
+        <w:rPr>
+          <w:noProof/>
+        </w:rPr>
+        <w:drawing>
+          <wp:inline distT="0" distB="0" distL="0" distR="0" wp14:anchorId="4D0A20E4" wp14:editId="64C2E1AB">
+            <wp:extent cx="5760720" cy="1791970"/>
+            <wp:effectExtent l="0" t="0" r="0" b="0"/>
+            <wp:docPr id="35" name="Afbeelding 35"/>
+            <wp:cNvGraphicFramePr>
+              <a:graphicFrameLocks xmlns:a="http://schemas.openxmlformats.org/drawingml/2006/main" noChangeAspect="1"/>
+            </wp:cNvGraphicFramePr>
+            <a:graphic xmlns:a="http://schemas.openxmlformats.org/drawingml/2006/main">
+              <a:graphicData uri="http://schemas.openxmlformats.org/drawingml/2006/picture">
+                <pic:pic xmlns:pic="http://schemas.openxmlformats.org/drawingml/2006/picture">
+                  <pic:nvPicPr>
+                    <pic:cNvPr id="1" name=""/>
+                    <pic:cNvPicPr/>
+                  </pic:nvPicPr>
+                  <pic:blipFill>
+                    <a:blip r:embed="rId80"/>
+                    <a:stretch>
+                      <a:fillRect/>
+                    </a:stretch>
+                  </pic:blipFill>
+                  <pic:spPr>
+                    <a:xfrm>
+                      <a:off x="0" y="0"/>
+                      <a:ext cx="5760720" cy="1791970"/>
                     </a:xfrm>
                     <a:prstGeom prst="rect">
                       <a:avLst/>

</xml_diff>

<commit_message>
Starting with user invites
</commit_message>
<xml_diff>
--- a/Logboek_Dries_Fierens.docx
+++ b/Logboek_Dries_Fierens.docx
@@ -78,15 +78,7 @@
       </w:r>
       <w:proofErr w:type="spellEnd"/>
       <w:r>
-        <w:t xml:space="preserve"> web app dat dus meer te maken hebben met web &amp; mobile dus vooral HTML &amp; CSS. We moesten dan ook nog kiezen voor een project idee, waarbij ik koos voor een scanner + </w:t>
-      </w:r>
-      <w:proofErr w:type="gramStart"/>
-      <w:r>
-        <w:t>pdf converter</w:t>
-      </w:r>
-      <w:proofErr w:type="gramEnd"/>
-      <w:r>
-        <w:t xml:space="preserve"> app</w:t>
+        <w:t xml:space="preserve"> web app dat dus meer te maken hebben met web &amp; mobile dus vooral HTML &amp; CSS. We moesten dan ook nog kiezen voor een project idee, waarbij ik koos voor een scanner + pdf converter app</w:t>
       </w:r>
       <w:r>
         <w:t xml:space="preserve"> waarbij het vooral bedoelt is o</w:t>
@@ -107,15 +99,7 @@
         <w:t>.</w:t>
       </w:r>
       <w:r>
-        <w:t xml:space="preserve"> Het was verplicht om 1 </w:t>
-      </w:r>
-      <w:proofErr w:type="gramStart"/>
-      <w:r>
-        <w:t>hardware component</w:t>
-      </w:r>
-      <w:proofErr w:type="gramEnd"/>
-      <w:r>
-        <w:t xml:space="preserve"> van de gsm te gebruiken dus koos ik natuurlijk voor de camera.</w:t>
+        <w:t xml:space="preserve"> Het was verplicht om 1 hardware component van de gsm te gebruiken dus koos ik natuurlijk voor de camera.</w:t>
       </w:r>
       <w:r>
         <w:t xml:space="preserve"> </w:t>
@@ -229,15 +213,7 @@
         <w:t xml:space="preserve">Mijn app idee werd niet goedgekeurd, want de leerkracht raadde het af door problemen die ervan kunnen komen. Ik moest dan vandaag een nieuw idee opstellen. </w:t>
       </w:r>
       <w:r>
-        <w:t xml:space="preserve">De scanner + </w:t>
-      </w:r>
-      <w:proofErr w:type="gramStart"/>
-      <w:r>
-        <w:t>pdf converter</w:t>
-      </w:r>
-      <w:proofErr w:type="gramEnd"/>
-      <w:r>
-        <w:t xml:space="preserve"> was duidelijk te moeilijk, maar ik besloot om het idee verder te zetten van een app die notities kan delen. Dus nu moet het gewoon foto’s trekken van de notities. Om nog toe te voegen kan ik ook opmerkingswolkjes toevoegen aan de foto voor bijvoorbeeld een fout</w:t>
+        <w:t>De scanner + pdf converter was duidelijk te moeilijk, maar ik besloot om het idee verder te zetten van een app die notities kan delen. Dus nu moet het gewoon foto’s trekken van de notities. Om nog toe te voegen kan ik ook opmerkingswolkjes toevoegen aan de foto voor bijvoorbeeld een fout</w:t>
       </w:r>
       <w:r>
         <w:t xml:space="preserve"> aan te duiden</w:t>
@@ -309,15 +285,7 @@
         <w:t>te veel</w:t>
       </w:r>
       <w:r>
-        <w:t xml:space="preserve"> naar voor moest leunen en dus </w:t>
-      </w:r>
-      <w:proofErr w:type="gramStart"/>
-      <w:r>
-        <w:t>nek pijn</w:t>
-      </w:r>
-      <w:proofErr w:type="gramEnd"/>
-      <w:r>
-        <w:t xml:space="preserve"> kreeg en er waren precies geen ramen om te openen. </w:t>
+        <w:t xml:space="preserve"> naar voor moest leunen en dus nek pijn kreeg en er waren precies geen ramen om te openen. </w:t>
       </w:r>
       <w:r>
         <w:t>Gelukkig kunnen we naar buiten wanneer we het willen.</w:t>
@@ -598,15 +566,7 @@
     </w:p>
     <w:p>
       <w:r>
-        <w:t xml:space="preserve">Tijdens lange downloads heb ik ook mijn </w:t>
-      </w:r>
-      <w:proofErr w:type="gramStart"/>
-      <w:r>
-        <w:t>google account</w:t>
-      </w:r>
-      <w:proofErr w:type="gramEnd"/>
-      <w:r>
-        <w:t xml:space="preserve"> toegevoegd op </w:t>
+        <w:t xml:space="preserve">Tijdens lange downloads heb ik ook mijn google account toegevoegd op </w:t>
       </w:r>
       <w:proofErr w:type="spellStart"/>
       <w:r>
@@ -695,15 +655,7 @@
         <w:t>Ik heb daarna gewoon verder begonnen aan de tutorial die ik vorige week gebruikt had.</w:t>
       </w:r>
       <w:r>
-        <w:t xml:space="preserve"> Hierbij leerde ik meer over hoe ik </w:t>
-      </w:r>
-      <w:proofErr w:type="gramStart"/>
-      <w:r>
-        <w:t>Android studio</w:t>
-      </w:r>
-      <w:proofErr w:type="gramEnd"/>
-      <w:r>
-        <w:t xml:space="preserve"> beter kon gebruiken om mijn app te </w:t>
+        <w:t xml:space="preserve"> Hierbij leerde ik meer over hoe ik Android studio beter kon gebruiken om mijn app te </w:t>
       </w:r>
       <w:proofErr w:type="spellStart"/>
       <w:r>
@@ -726,15 +678,7 @@
         <w:t>)</w:t>
       </w:r>
       <w:r>
-        <w:t xml:space="preserve">. </w:t>
-      </w:r>
-      <w:proofErr w:type="gramStart"/>
-      <w:r>
-        <w:t>Android studio</w:t>
-      </w:r>
-      <w:proofErr w:type="gramEnd"/>
-      <w:r>
-        <w:t xml:space="preserve"> is zeer gelijkaardig als bijvoorbeeld </w:t>
+        <w:t xml:space="preserve">. Android studio is zeer gelijkaardig als bijvoorbeeld </w:t>
       </w:r>
       <w:proofErr w:type="spellStart"/>
       <w:r>
@@ -765,13 +709,8 @@
         <w:t>bekijken</w:t>
       </w:r>
       <w:r>
-        <w:t xml:space="preserve"> in een gekozen browser, maar je kan in </w:t>
-      </w:r>
-      <w:proofErr w:type="gramStart"/>
-      <w:r>
-        <w:t>Android studio</w:t>
-      </w:r>
-      <w:proofErr w:type="gramEnd"/>
+        <w:t xml:space="preserve"> in een gekozen browser, maar je kan in Android studio</w:t>
+      </w:r>
       <w:r>
         <w:t xml:space="preserve"> je app</w:t>
       </w:r>
@@ -887,15 +826,7 @@
       </w:r>
       <w:proofErr w:type="spellEnd"/>
       <w:r>
-        <w:t xml:space="preserve"> design gevolgd in plaats van die van </w:t>
-      </w:r>
-      <w:proofErr w:type="gramStart"/>
-      <w:r>
-        <w:t>Android studio</w:t>
-      </w:r>
-      <w:proofErr w:type="gramEnd"/>
-      <w:r>
-        <w:t>. Ze leerde me dan hoe ik er mee kon werken maar niet hoe een hele nieuwe app kon maken. Ik kreeg een voorbeeld app om erin te kunnen werken voor de tutorial.</w:t>
+        <w:t xml:space="preserve"> design gevolgd in plaats van die van Android studio. Ze leerde me dan hoe ik er mee kon werken maar niet hoe een hele nieuwe app kon maken. Ik kreeg een voorbeeld app om erin te kunnen werken voor de tutorial.</w:t>
       </w:r>
     </w:p>
     <w:p>
@@ -2181,15 +2112,7 @@
         <w:t>Vandaag heb ik eindelijk de login en registratie kunnen afwerken. Dit had veel moeite gekost.</w:t>
       </w:r>
       <w:r>
-        <w:t xml:space="preserve"> Het probleem was dus dat mijn app bleef crashen als ik probeerde te registeren. Ik had veel op stackoverflow gezocht maar ik kon eerst niks vinden, maar toen zag ik dat de wifi van de device emulator op </w:t>
-      </w:r>
-      <w:proofErr w:type="gramStart"/>
-      <w:r>
-        <w:t>Android studio</w:t>
-      </w:r>
-      <w:proofErr w:type="gramEnd"/>
-      <w:r>
-        <w:t xml:space="preserve"> geen wifi had. Ik dacht eerst dat dit normaal was, maar begon toen twijfels te krijgen. Ik had dan eerst de info op stackoverflow pagina proberen gebruiken, maar dat was niet juist. Uiteindelijk gewoon mijn gsm </w:t>
+        <w:t xml:space="preserve"> Het probleem was dus dat mijn app bleef crashen als ik probeerde te registeren. Ik had veel op stackoverflow gezocht maar ik kon eerst niks vinden, maar toen zag ik dat de wifi van de device emulator op Android studio geen wifi had. Ik dacht eerst dat dit normaal was, maar begon toen twijfels te krijgen. Ik had dan eerst de info op stackoverflow pagina proberen gebruiken, maar dat was niet juist. Uiteindelijk gewoon mijn gsm </w:t>
       </w:r>
       <w:proofErr w:type="spellStart"/>
       <w:r>
@@ -2386,23 +2309,7 @@
           <w:rFonts w:eastAsia="Times New Roman" w:cstheme="minorHAnsi"/>
           <w:lang w:eastAsia="nl-BE"/>
         </w:rPr>
-        <w:t xml:space="preserve">-in te laten werken. Dit ging zeer goed, maar het enige probleem is dat de </w:t>
-      </w:r>
-      <w:proofErr w:type="gramStart"/>
-      <w:r>
-        <w:rPr>
-          <w:rFonts w:eastAsia="Times New Roman" w:cstheme="minorHAnsi"/>
-          <w:lang w:eastAsia="nl-BE"/>
-        </w:rPr>
-        <w:t>google account</w:t>
-      </w:r>
-      <w:proofErr w:type="gramEnd"/>
-      <w:r>
-        <w:rPr>
-          <w:rFonts w:eastAsia="Times New Roman" w:cstheme="minorHAnsi"/>
-          <w:lang w:eastAsia="nl-BE"/>
-        </w:rPr>
-        <w:t xml:space="preserve"> niet wordt toegevoegd aan </w:t>
+        <w:t xml:space="preserve">-in te laten werken. Dit ging zeer goed, maar het enige probleem is dat de google account niet wordt toegevoegd aan </w:t>
       </w:r>
       <w:proofErr w:type="spellStart"/>
       <w:r>
@@ -2820,7 +2727,6 @@
         <w:t xml:space="preserve"> was eigenlijk al klaar in een google-</w:t>
       </w:r>
       <w:proofErr w:type="spellStart"/>
-      <w:proofErr w:type="gramStart"/>
       <w:r>
         <w:rPr>
           <w:rFonts w:eastAsia="Times New Roman" w:cstheme="minorHAnsi"/>
@@ -2829,7 +2735,6 @@
         <w:t>services.json</w:t>
       </w:r>
       <w:proofErr w:type="spellEnd"/>
-      <w:proofErr w:type="gramEnd"/>
       <w:r>
         <w:rPr>
           <w:rFonts w:eastAsia="Times New Roman" w:cstheme="minorHAnsi"/>
@@ -2858,23 +2763,7 @@
           <w:rFonts w:eastAsia="Times New Roman" w:cstheme="minorHAnsi"/>
           <w:lang w:eastAsia="nl-BE"/>
         </w:rPr>
-        <w:t xml:space="preserve"> Nu kunnen </w:t>
-      </w:r>
-      <w:proofErr w:type="gramStart"/>
-      <w:r>
-        <w:rPr>
-          <w:rFonts w:eastAsia="Times New Roman" w:cstheme="minorHAnsi"/>
-          <w:lang w:eastAsia="nl-BE"/>
-        </w:rPr>
-        <w:t>google accounts</w:t>
-      </w:r>
-      <w:proofErr w:type="gramEnd"/>
-      <w:r>
-        <w:rPr>
-          <w:rFonts w:eastAsia="Times New Roman" w:cstheme="minorHAnsi"/>
-          <w:lang w:eastAsia="nl-BE"/>
-        </w:rPr>
-        <w:t xml:space="preserve"> succesvol worden toegevoegd.</w:t>
+        <w:t xml:space="preserve"> Nu kunnen google accounts succesvol worden toegevoegd.</w:t>
       </w:r>
       <w:r>
         <w:rPr>
@@ -3159,18 +3048,10 @@
         <w:t xml:space="preserve"> toegevoegd en dan moest ik een Cloud storage bucket aanmaken. Hierbij werd er gevraagd om een locatie te kiezen waarbij Europe-west 1 (= Belgische regio) niet tussen stond, maar gelukkig is er Eur3 die eigenlijk Belgische en Nederlandse regio voorstelt. Dat werd uitgelegd </w:t>
       </w:r>
       <w:r>
-        <w:t xml:space="preserve">op deze </w:t>
-      </w:r>
-      <w:proofErr w:type="gramStart"/>
-      <w:r>
-        <w:t>webpagina</w:t>
-      </w:r>
-      <w:r>
-        <w:t>‘</w:t>
-      </w:r>
-      <w:proofErr w:type="gramEnd"/>
-      <w:r>
-        <w:t>s</w:t>
+        <w:t>op deze webpagina</w:t>
+      </w:r>
+      <w:r>
+        <w:t>‘s</w:t>
       </w:r>
       <w:r>
         <w:t>:</w:t>
@@ -3558,15 +3439,7 @@
       </w:r>
       <w:proofErr w:type="spellEnd"/>
       <w:r>
-        <w:t xml:space="preserve"> oftewel de image inkomt. De map geef </w:t>
-      </w:r>
-      <w:proofErr w:type="gramStart"/>
-      <w:r>
-        <w:t>ik  het</w:t>
-      </w:r>
-      <w:proofErr w:type="gramEnd"/>
-      <w:r>
-        <w:t xml:space="preserve"> email adres van de gebruiker als naam.</w:t>
+        <w:t xml:space="preserve"> oftewel de image inkomt. De map geef ik  het email adres van de gebruiker als naam.</w:t>
       </w:r>
     </w:p>
     <w:p>
@@ -3972,17 +3845,12 @@
         <w:t xml:space="preserve"> gedaan in </w:t>
       </w:r>
       <w:proofErr w:type="spellStart"/>
-      <w:proofErr w:type="gramStart"/>
       <w:r>
         <w:t>OnCreateView</w:t>
       </w:r>
       <w:proofErr w:type="spellEnd"/>
       <w:r>
-        <w:t>(</w:t>
-      </w:r>
-      <w:proofErr w:type="gramEnd"/>
-      <w:r>
-        <w:t>):</w:t>
+        <w:t>():</w:t>
       </w:r>
     </w:p>
     <w:p>
@@ -4253,15 +4121,7 @@
     </w:p>
     <w:p>
       <w:r>
-        <w:t xml:space="preserve">Ik had een image asset toegevoegd dat dus </w:t>
-      </w:r>
-      <w:proofErr w:type="gramStart"/>
-      <w:r>
-        <w:t>er voor</w:t>
-      </w:r>
-      <w:proofErr w:type="gramEnd"/>
-      <w:r>
-        <w:t xml:space="preserve"> zorgde dat de oude logo files worden vervangen. Hierbij heb een logo afbeelding als </w:t>
+        <w:t xml:space="preserve">Ik had een image asset toegevoegd dat dus er voor zorgde dat de oude logo files worden vervangen. Hierbij heb een logo afbeelding als </w:t>
       </w:r>
       <w:proofErr w:type="spellStart"/>
       <w:r>
@@ -4450,15 +4310,7 @@
       </w:r>
       <w:proofErr w:type="spellEnd"/>
       <w:r>
-        <w:t xml:space="preserve"> </w:t>
-      </w:r>
-      <w:proofErr w:type="gramStart"/>
-      <w:r>
-        <w:t>keuze menu</w:t>
-      </w:r>
-      <w:proofErr w:type="gramEnd"/>
-      <w:r>
-        <w:t xml:space="preserve">. De code voor de </w:t>
+        <w:t xml:space="preserve"> keuze menu. De code voor de </w:t>
       </w:r>
       <w:proofErr w:type="spellStart"/>
       <w:r>
@@ -4694,12 +4546,10 @@
         <w:t xml:space="preserve"> in de google-</w:t>
       </w:r>
       <w:proofErr w:type="spellStart"/>
-      <w:proofErr w:type="gramStart"/>
       <w:r>
         <w:t>services.json</w:t>
       </w:r>
       <w:proofErr w:type="spellEnd"/>
-      <w:proofErr w:type="gramEnd"/>
       <w:r>
         <w:t xml:space="preserve"> file. Dus ik moest mijn app in </w:t>
       </w:r>
@@ -4897,15 +4747,7 @@
       </w:r>
       <w:proofErr w:type="spellEnd"/>
       <w:r>
-        <w:t xml:space="preserve"> console geüpload, hierbij moest ik nog in </w:t>
-      </w:r>
-      <w:proofErr w:type="gramStart"/>
-      <w:r>
-        <w:t>de dashboard</w:t>
-      </w:r>
-      <w:proofErr w:type="gramEnd"/>
-      <w:r>
-        <w:t xml:space="preserve"> veel taken afleggen. De belangrijksten waren bijvoorbeeld een test account meegeven zodat google dit kan gebruiken om mijn app te controleren, een </w:t>
+        <w:t xml:space="preserve"> console geüpload, hierbij moest ik nog in de dashboard veel taken afleggen. De belangrijksten waren bijvoorbeeld een test account meegeven zodat google dit kan gebruiken om mijn app te controleren, een </w:t>
       </w:r>
       <w:proofErr w:type="spellStart"/>
       <w:r>
@@ -5345,15 +5187,7 @@
       </w:r>
       <w:proofErr w:type="spellEnd"/>
       <w:r>
-        <w:t xml:space="preserve"> database maar nog geen succes. Ik moest nu stoppen omdat ik een </w:t>
-      </w:r>
-      <w:proofErr w:type="gramStart"/>
-      <w:r>
-        <w:t>online gesprek</w:t>
-      </w:r>
-      <w:proofErr w:type="gramEnd"/>
-      <w:r>
-        <w:t xml:space="preserve"> ga hebben voor mijn stage tijdens het 2</w:t>
+        <w:t xml:space="preserve"> database maar nog geen succes. Ik moest nu stoppen omdat ik een online gesprek ga hebben voor mijn stage tijdens het 2</w:t>
       </w:r>
       <w:r>
         <w:rPr>
@@ -5533,15 +5367,7 @@
     </w:p>
     <w:p>
       <w:r>
-        <w:t xml:space="preserve">Vandaag probeerde ik </w:t>
-      </w:r>
-      <w:proofErr w:type="gramStart"/>
-      <w:r>
-        <w:t>offline support</w:t>
-      </w:r>
-      <w:proofErr w:type="gramEnd"/>
-      <w:r>
-        <w:t xml:space="preserve"> toe te voegen. Voor </w:t>
+        <w:t xml:space="preserve">Vandaag probeerde ik offline support toe te voegen. Voor </w:t>
       </w:r>
       <w:proofErr w:type="spellStart"/>
       <w:r>
@@ -6017,18 +5843,10 @@
       </w:r>
       <w:proofErr w:type="spellEnd"/>
       <w:r>
-        <w:t xml:space="preserve"> database </w:t>
-      </w:r>
-      <w:proofErr w:type="gramStart"/>
-      <w:r>
-        <w:t xml:space="preserve">sturen </w:t>
-      </w:r>
-      <w:r>
-        <w:t>,</w:t>
-      </w:r>
-      <w:proofErr w:type="gramEnd"/>
-      <w:r>
-        <w:t xml:space="preserve"> maar </w:t>
+        <w:t xml:space="preserve"> database sturen </w:t>
+      </w:r>
+      <w:r>
+        <w:t xml:space="preserve">, maar </w:t>
       </w:r>
       <w:proofErr w:type="spellStart"/>
       <w:r>
@@ -6145,13 +5963,8 @@
         </w:numPr>
       </w:pPr>
       <w:r>
-        <w:t xml:space="preserve">Puntenverdeling opdrachten afwerken zoals </w:t>
-      </w:r>
-      <w:proofErr w:type="gramStart"/>
-      <w:r>
-        <w:t>offline support</w:t>
-      </w:r>
-      <w:proofErr w:type="gramEnd"/>
+        <w:t>Puntenverdeling opdrachten afwerken zoals offline support</w:t>
+      </w:r>
     </w:p>
     <w:p/>
     <w:p/>
@@ -6227,7 +6040,6 @@
       <w:r>
         <w:t xml:space="preserve"> 1</w:t>
       </w:r>
-      <w:proofErr w:type="gramStart"/>
       <w:r>
         <w:rPr>
           <w:vertAlign w:val="superscript"/>
@@ -6240,7 +6052,6 @@
       <w:r>
         <w:t xml:space="preserve"> tutorial</w:t>
       </w:r>
-      <w:proofErr w:type="gramEnd"/>
       <w:r>
         <w:t xml:space="preserve"> hieronder. Daarna ging alles vlot, maar ik heb alleen moeilijkheden met het beveiligen van </w:t>
       </w:r>
@@ -6944,13 +6755,8 @@
         </w:numPr>
       </w:pPr>
       <w:r>
-        <w:t xml:space="preserve">Puntenverdeling opdrachten afwerken zoals </w:t>
-      </w:r>
-      <w:proofErr w:type="gramStart"/>
-      <w:r>
-        <w:t>offline support</w:t>
-      </w:r>
-      <w:proofErr w:type="gramEnd"/>
+        <w:t>Puntenverdeling opdrachten afwerken zoals offline support</w:t>
+      </w:r>
     </w:p>
     <w:p/>
     <w:p>
@@ -7007,6 +6813,9 @@
       <w:r>
         <w:t xml:space="preserve"> rapport ga </w:t>
       </w:r>
+      <w:r>
+        <w:t xml:space="preserve">ik </w:t>
+      </w:r>
       <w:proofErr w:type="spellStart"/>
       <w:r>
         <w:t>admin</w:t>
@@ -7062,7 +6871,13 @@
       </w:r>
       <w:proofErr w:type="spellEnd"/>
       <w:r>
-        <w:t>) die het gemaakt heeft.</w:t>
+        <w:t xml:space="preserve">) die het gemaakt </w:t>
+      </w:r>
+      <w:r>
+        <w:t>hebben</w:t>
+      </w:r>
+      <w:r>
+        <w:t>.</w:t>
       </w:r>
     </w:p>
     <w:p>
@@ -7109,47 +6924,210 @@
     </w:p>
     <w:p/>
     <w:p>
+      <w:pPr>
+        <w:pStyle w:val="Kop2"/>
+      </w:pPr>
       <w:r>
         <w:lastRenderedPageBreak/>
-        <w:t xml:space="preserve">Daarna was het effe een </w:t>
-      </w:r>
-      <w:proofErr w:type="spellStart"/>
-      <w:r>
-        <w:t>struggle</w:t>
-      </w:r>
-      <w:proofErr w:type="spellEnd"/>
-      <w:r>
-        <w:t xml:space="preserve"> om met groepen te werken, want ik was vooral met een list van groepen aan het werken. Dit zorgde voor nogal moeilijke design </w:t>
-      </w:r>
-      <w:r>
-        <w:t>voor</w:t>
-      </w:r>
-      <w:r>
-        <w:t xml:space="preserve"> users in een groep</w:t>
-      </w:r>
-      <w:r>
-        <w:t xml:space="preserve"> toe te voegen</w:t>
-      </w:r>
-      <w:r>
-        <w:t>. Dus dat had na veel moeite opgelost door gewoon apart met een object “Chatroom</w:t>
-      </w:r>
-      <w:proofErr w:type="gramStart"/>
-      <w:r>
-        <w:t>”  groepen</w:t>
-      </w:r>
-      <w:proofErr w:type="gramEnd"/>
-      <w:r>
-        <w:t xml:space="preserve"> toe te voegen</w:t>
-      </w:r>
+        <w:t>Kerstvakantie</w:t>
+      </w:r>
+    </w:p>
+    <w:p>
+      <w:pPr>
+        <w:pStyle w:val="Kop3"/>
+      </w:pPr>
+      <w:r>
+        <w:t>Wat ik wil realiseren tijdens de volgende weken:</w:t>
+      </w:r>
+    </w:p>
+    <w:p>
+      <w:pPr>
+        <w:pStyle w:val="Lijstalinea"/>
+        <w:numPr>
+          <w:ilvl w:val="0"/>
+          <w:numId w:val="2"/>
+        </w:numPr>
+      </w:pPr>
+      <w:r>
+        <w:t>Afwerken chat functionaliteiten.</w:t>
+      </w:r>
+    </w:p>
+    <w:p>
+      <w:pPr>
+        <w:pStyle w:val="Lijstalinea"/>
+        <w:numPr>
+          <w:ilvl w:val="0"/>
+          <w:numId w:val="2"/>
+        </w:numPr>
+      </w:pPr>
+      <w:r>
+        <w:t>Notificaties voor nieuwe berichten</w:t>
+      </w:r>
+    </w:p>
+    <w:p>
+      <w:pPr>
+        <w:pStyle w:val="Lijstalinea"/>
+        <w:numPr>
+          <w:ilvl w:val="0"/>
+          <w:numId w:val="2"/>
+        </w:numPr>
+      </w:pPr>
+      <w:r>
+        <w:t>CRUD toevoegen zoals groepen verwijderen</w:t>
+      </w:r>
+    </w:p>
+    <w:p>
+      <w:pPr>
+        <w:pStyle w:val="Lijstalinea"/>
+        <w:numPr>
+          <w:ilvl w:val="0"/>
+          <w:numId w:val="2"/>
+        </w:numPr>
+      </w:pPr>
+      <w:r>
+        <w:t xml:space="preserve">Afbeeldingen kunnen doorsturen via chat en </w:t>
+      </w:r>
+      <w:proofErr w:type="spellStart"/>
+      <w:r>
+        <w:t>comments</w:t>
+      </w:r>
+      <w:proofErr w:type="spellEnd"/>
+      <w:r>
+        <w:t xml:space="preserve"> eraan kunnen toevoegen.</w:t>
+      </w:r>
+    </w:p>
+    <w:p>
+      <w:pPr>
+        <w:pStyle w:val="Lijstalinea"/>
+        <w:numPr>
+          <w:ilvl w:val="0"/>
+          <w:numId w:val="2"/>
+        </w:numPr>
+      </w:pPr>
+      <w:r>
+        <w:t>Puntenverdeling opdrachten afwerken zoals offline support</w:t>
+      </w:r>
+    </w:p>
+    <w:p/>
+    <w:p>
+      <w:pPr>
+        <w:rPr>
+          <w:b/>
+          <w:bCs/>
+        </w:rPr>
+      </w:pPr>
+      <w:r>
+        <w:rPr>
+          <w:b/>
+          <w:bCs/>
+        </w:rPr>
+        <w:t>3/01/2022:</w:t>
+      </w:r>
+    </w:p>
+    <w:p>
+      <w:r>
+        <w:t>Vandaag heb ik nagedacht hoe ik users kan uitnodigen aan een chatroom</w:t>
+      </w:r>
+      <w:r>
+        <w:t>,</w:t>
+      </w:r>
+      <w:r>
+        <w:t xml:space="preserve"> hierbij heb ik besloten om het volgende te doen:</w:t>
+      </w:r>
+    </w:p>
+    <w:p>
+      <w:pPr>
+        <w:pStyle w:val="Lijstalinea"/>
+        <w:numPr>
+          <w:ilvl w:val="0"/>
+          <w:numId w:val="3"/>
+        </w:numPr>
+      </w:pPr>
+      <w:r>
+        <w:t xml:space="preserve">In de chatroom kan de </w:t>
+      </w:r>
+      <w:proofErr w:type="spellStart"/>
+      <w:r>
+        <w:t>admin</w:t>
+      </w:r>
+      <w:proofErr w:type="spellEnd"/>
+      <w:r>
+        <w:t xml:space="preserve"> een invite sturen naar een user hierbij moet hij het email hebben van die user. De invite is een klasse die </w:t>
+      </w:r>
+      <w:r>
+        <w:t xml:space="preserve">het </w:t>
+      </w:r>
+      <w:proofErr w:type="spellStart"/>
+      <w:r>
+        <w:t>firebase</w:t>
+      </w:r>
+      <w:proofErr w:type="spellEnd"/>
+      <w:r>
+        <w:t xml:space="preserve"> document (met alle </w:t>
+      </w:r>
+      <w:proofErr w:type="spellStart"/>
+      <w:r>
+        <w:t>group</w:t>
+      </w:r>
+      <w:proofErr w:type="spellEnd"/>
+      <w:r>
+        <w:t xml:space="preserve"> gegevens), </w:t>
+      </w:r>
+      <w:proofErr w:type="spellStart"/>
+      <w:r>
+        <w:t>enz</w:t>
+      </w:r>
+      <w:proofErr w:type="spellEnd"/>
+      <w:r>
+        <w:t xml:space="preserve"> bevat.</w:t>
+      </w:r>
+    </w:p>
+    <w:p>
+      <w:pPr>
+        <w:pStyle w:val="Lijstalinea"/>
+        <w:numPr>
+          <w:ilvl w:val="0"/>
+          <w:numId w:val="3"/>
+        </w:numPr>
+      </w:pPr>
+      <w:r>
+        <w:t xml:space="preserve">De user krijgt bij de </w:t>
+      </w:r>
+      <w:proofErr w:type="spellStart"/>
+      <w:r>
+        <w:t>add</w:t>
+      </w:r>
+      <w:proofErr w:type="spellEnd"/>
       <w:r>
         <w:t xml:space="preserve"> </w:t>
       </w:r>
-      <w:r>
-        <w:t xml:space="preserve">zodat die een </w:t>
-      </w:r>
-      <w:proofErr w:type="spellStart"/>
-      <w:r>
-        <w:t>admin</w:t>
+      <w:proofErr w:type="spellStart"/>
+      <w:r>
+        <w:t>group</w:t>
+      </w:r>
+      <w:proofErr w:type="spellEnd"/>
+      <w:r>
+        <w:t xml:space="preserve"> icon die je kan aanklikken 2 opties: een eigen </w:t>
+      </w:r>
+      <w:proofErr w:type="spellStart"/>
+      <w:r>
+        <w:t>group</w:t>
+      </w:r>
+      <w:proofErr w:type="spellEnd"/>
+      <w:r>
+        <w:t xml:space="preserve"> maken of nieuwe </w:t>
+      </w:r>
+      <w:proofErr w:type="spellStart"/>
+      <w:r>
+        <w:t>joinen</w:t>
+      </w:r>
+      <w:proofErr w:type="spellEnd"/>
+      <w:r>
+        <w:t>. Als hij “</w:t>
+      </w:r>
+      <w:proofErr w:type="spellStart"/>
+      <w:r>
+        <w:t>join</w:t>
       </w:r>
       <w:proofErr w:type="spellEnd"/>
       <w:r>
@@ -7157,64 +7135,30 @@
       </w:r>
       <w:proofErr w:type="spellStart"/>
       <w:r>
-        <w:t>id</w:t>
-      </w:r>
-      <w:proofErr w:type="spellEnd"/>
-      <w:r>
-        <w:t xml:space="preserve"> en de users (alleen de </w:t>
-      </w:r>
-      <w:proofErr w:type="spellStart"/>
-      <w:r>
-        <w:t>userI</w:t>
-      </w:r>
-      <w:r>
-        <w:t>ds</w:t>
-      </w:r>
-      <w:proofErr w:type="spellEnd"/>
-      <w:r>
-        <w:t>) inzitten.</w:t>
-      </w:r>
-    </w:p>
-    <w:p>
-      <w:r>
-        <w:rPr>
-          <w:noProof/>
-        </w:rPr>
-        <w:drawing>
-          <wp:inline distT="0" distB="0" distL="0" distR="0" wp14:anchorId="4D0A20E4" wp14:editId="64C2E1AB">
-            <wp:extent cx="5760720" cy="1791970"/>
-            <wp:effectExtent l="0" t="0" r="0" b="0"/>
-            <wp:docPr id="35" name="Afbeelding 35"/>
-            <wp:cNvGraphicFramePr>
-              <a:graphicFrameLocks xmlns:a="http://schemas.openxmlformats.org/drawingml/2006/main" noChangeAspect="1"/>
-            </wp:cNvGraphicFramePr>
-            <a:graphic xmlns:a="http://schemas.openxmlformats.org/drawingml/2006/main">
-              <a:graphicData uri="http://schemas.openxmlformats.org/drawingml/2006/picture">
-                <pic:pic xmlns:pic="http://schemas.openxmlformats.org/drawingml/2006/picture">
-                  <pic:nvPicPr>
-                    <pic:cNvPr id="1" name=""/>
-                    <pic:cNvPicPr/>
-                  </pic:nvPicPr>
-                  <pic:blipFill>
-                    <a:blip r:embed="rId80"/>
-                    <a:stretch>
-                      <a:fillRect/>
-                    </a:stretch>
-                  </pic:blipFill>
-                  <pic:spPr>
-                    <a:xfrm>
-                      <a:off x="0" y="0"/>
-                      <a:ext cx="5760720" cy="1791970"/>
-                    </a:xfrm>
-                    <a:prstGeom prst="rect">
-                      <a:avLst/>
-                    </a:prstGeom>
-                  </pic:spPr>
-                </pic:pic>
-              </a:graphicData>
-            </a:graphic>
-          </wp:inline>
-        </w:drawing>
+        <w:t>group</w:t>
+      </w:r>
+      <w:proofErr w:type="spellEnd"/>
+      <w:r>
+        <w:t xml:space="preserve">” klikt zal er een </w:t>
+      </w:r>
+      <w:proofErr w:type="spellStart"/>
+      <w:r>
+        <w:t>dialog</w:t>
+      </w:r>
+      <w:proofErr w:type="spellEnd"/>
+      <w:r>
+        <w:t xml:space="preserve"> </w:t>
+      </w:r>
+      <w:r>
+        <w:t xml:space="preserve">venster staan met alle invites. Als je dan een invite aanklikt accepteert je dan om te </w:t>
+      </w:r>
+      <w:proofErr w:type="spellStart"/>
+      <w:r>
+        <w:t>joinen</w:t>
+      </w:r>
+      <w:proofErr w:type="spellEnd"/>
+      <w:r>
+        <w:t>.</w:t>
       </w:r>
     </w:p>
     <w:sectPr>
@@ -7230,6 +7174,95 @@
 <file path=word/numbering.xml><?xml version="1.0" encoding="utf-8"?>
 <w:numbering xmlns:wpc="http://schemas.microsoft.com/office/word/2010/wordprocessingCanvas" xmlns:cx="http://schemas.microsoft.com/office/drawing/2014/chartex" xmlns:cx1="http://schemas.microsoft.com/office/drawing/2015/9/8/chartex" xmlns:cx2="http://schemas.microsoft.com/office/drawing/2015/10/21/chartex" xmlns:cx3="http://schemas.microsoft.com/office/drawing/2016/5/9/chartex" xmlns:cx4="http://schemas.microsoft.com/office/drawing/2016/5/10/chartex" xmlns:cx5="http://schemas.microsoft.com/office/drawing/2016/5/11/chartex" xmlns:cx6="http://schemas.microsoft.com/office/drawing/2016/5/12/chartex" xmlns:cx7="http://schemas.microsoft.com/office/drawing/2016/5/13/chartex" xmlns:cx8="http://schemas.microsoft.com/office/drawing/2016/5/14/chartex" xmlns:mc="http://schemas.openxmlformats.org/markup-compatibility/2006" xmlns:aink="http://schemas.microsoft.com/office/drawing/2016/ink" xmlns:am3d="http://schemas.microsoft.com/office/drawing/2017/model3d" xmlns:o="urn:schemas-microsoft-com:office:office" xmlns:r="http://schemas.openxmlformats.org/officeDocument/2006/relationships" xmlns:m="http://schemas.openxmlformats.org/officeDocument/2006/math" xmlns:v="urn:schemas-microsoft-com:vml" xmlns:wp14="http://schemas.microsoft.com/office/word/2010/wordprocessingDrawing" xmlns:wp="http://schemas.openxmlformats.org/drawingml/2006/wordprocessingDrawing" xmlns:w10="urn:schemas-microsoft-com:office:word" xmlns:w="http://schemas.openxmlformats.org/wordprocessingml/2006/main" xmlns:w14="http://schemas.microsoft.com/office/word/2010/wordml" xmlns:w15="http://schemas.microsoft.com/office/word/2012/wordml" xmlns:w16cex="http://schemas.microsoft.com/office/word/2018/wordml/cex" xmlns:w16cid="http://schemas.microsoft.com/office/word/2016/wordml/cid" xmlns:w16="http://schemas.microsoft.com/office/word/2018/wordml" xmlns:w16sdtdh="http://schemas.microsoft.com/office/word/2020/wordml/sdtdatahash" xmlns:w16se="http://schemas.microsoft.com/office/word/2015/wordml/symex" xmlns:wpg="http://schemas.microsoft.com/office/word/2010/wordprocessingGroup" xmlns:wpi="http://schemas.microsoft.com/office/word/2010/wordprocessingInk" xmlns:wne="http://schemas.microsoft.com/office/word/2006/wordml" xmlns:wps="http://schemas.microsoft.com/office/word/2010/wordprocessingShape" mc:Ignorable="w14 w15 w16se w16cid w16 w16cex w16sdtdh wp14">
   <w:abstractNum w:abstractNumId="0" w15:restartNumberingAfterBreak="0">
+    <w:nsid w:val="16074A5A"/>
+    <w:multiLevelType w:val="hybridMultilevel"/>
+    <w:tmpl w:val="96825FCE"/>
+    <w:lvl w:ilvl="0" w:tplc="08130011">
+      <w:start w:val="1"/>
+      <w:numFmt w:val="decimal"/>
+      <w:lvlText w:val="%1)"/>
+      <w:lvlJc w:val="left"/>
+      <w:pPr>
+        <w:ind w:left="720" w:hanging="360"/>
+      </w:pPr>
+      <w:rPr>
+        <w:rFonts w:hint="default"/>
+      </w:rPr>
+    </w:lvl>
+    <w:lvl w:ilvl="1" w:tplc="08130019" w:tentative="1">
+      <w:start w:val="1"/>
+      <w:numFmt w:val="lowerLetter"/>
+      <w:lvlText w:val="%2."/>
+      <w:lvlJc w:val="left"/>
+      <w:pPr>
+        <w:ind w:left="1440" w:hanging="360"/>
+      </w:pPr>
+    </w:lvl>
+    <w:lvl w:ilvl="2" w:tplc="0813001B" w:tentative="1">
+      <w:start w:val="1"/>
+      <w:numFmt w:val="lowerRoman"/>
+      <w:lvlText w:val="%3."/>
+      <w:lvlJc w:val="right"/>
+      <w:pPr>
+        <w:ind w:left="2160" w:hanging="180"/>
+      </w:pPr>
+    </w:lvl>
+    <w:lvl w:ilvl="3" w:tplc="0813000F" w:tentative="1">
+      <w:start w:val="1"/>
+      <w:numFmt w:val="decimal"/>
+      <w:lvlText w:val="%4."/>
+      <w:lvlJc w:val="left"/>
+      <w:pPr>
+        <w:ind w:left="2880" w:hanging="360"/>
+      </w:pPr>
+    </w:lvl>
+    <w:lvl w:ilvl="4" w:tplc="08130019" w:tentative="1">
+      <w:start w:val="1"/>
+      <w:numFmt w:val="lowerLetter"/>
+      <w:lvlText w:val="%5."/>
+      <w:lvlJc w:val="left"/>
+      <w:pPr>
+        <w:ind w:left="3600" w:hanging="360"/>
+      </w:pPr>
+    </w:lvl>
+    <w:lvl w:ilvl="5" w:tplc="0813001B" w:tentative="1">
+      <w:start w:val="1"/>
+      <w:numFmt w:val="lowerRoman"/>
+      <w:lvlText w:val="%6."/>
+      <w:lvlJc w:val="right"/>
+      <w:pPr>
+        <w:ind w:left="4320" w:hanging="180"/>
+      </w:pPr>
+    </w:lvl>
+    <w:lvl w:ilvl="6" w:tplc="0813000F" w:tentative="1">
+      <w:start w:val="1"/>
+      <w:numFmt w:val="decimal"/>
+      <w:lvlText w:val="%7."/>
+      <w:lvlJc w:val="left"/>
+      <w:pPr>
+        <w:ind w:left="5040" w:hanging="360"/>
+      </w:pPr>
+    </w:lvl>
+    <w:lvl w:ilvl="7" w:tplc="08130019" w:tentative="1">
+      <w:start w:val="1"/>
+      <w:numFmt w:val="lowerLetter"/>
+      <w:lvlText w:val="%8."/>
+      <w:lvlJc w:val="left"/>
+      <w:pPr>
+        <w:ind w:left="5760" w:hanging="360"/>
+      </w:pPr>
+    </w:lvl>
+    <w:lvl w:ilvl="8" w:tplc="0813001B" w:tentative="1">
+      <w:start w:val="1"/>
+      <w:numFmt w:val="lowerRoman"/>
+      <w:lvlText w:val="%9."/>
+      <w:lvlJc w:val="right"/>
+      <w:pPr>
+        <w:ind w:left="6480" w:hanging="180"/>
+      </w:pPr>
+    </w:lvl>
+  </w:abstractNum>
+  <w:abstractNum w:abstractNumId="1" w15:restartNumberingAfterBreak="0">
     <w:nsid w:val="612B6B41"/>
     <w:multiLevelType w:val="hybridMultilevel"/>
     <w:tmpl w:val="68948BD6"/>
@@ -7341,7 +7374,7 @@
       </w:rPr>
     </w:lvl>
   </w:abstractNum>
-  <w:abstractNum w:abstractNumId="1" w15:restartNumberingAfterBreak="0">
+  <w:abstractNum w:abstractNumId="2" w15:restartNumberingAfterBreak="0">
     <w:nsid w:val="7F790B1D"/>
     <w:multiLevelType w:val="hybridMultilevel"/>
     <w:tmpl w:val="76A286F0"/>
@@ -7431,9 +7464,12 @@
     </w:lvl>
   </w:abstractNum>
   <w:num w:numId="1">
+    <w:abstractNumId w:val="2"/>
+  </w:num>
+  <w:num w:numId="2">
     <w:abstractNumId w:val="1"/>
   </w:num>
-  <w:num w:numId="2">
+  <w:num w:numId="3">
     <w:abstractNumId w:val="0"/>
   </w:num>
 </w:numbering>

</xml_diff>

<commit_message>
Finished phase 1 of the invite system + Logboek
</commit_message>
<xml_diff>
--- a/Logboek_Dries_Fierens.docx
+++ b/Logboek_Dries_Fierens.docx
@@ -7159,6 +7159,94 @@
       <w:proofErr w:type="spellEnd"/>
       <w:r>
         <w:t>.</w:t>
+      </w:r>
+    </w:p>
+    <w:p/>
+    <w:p>
+      <w:pPr>
+        <w:rPr>
+          <w:b/>
+          <w:bCs/>
+        </w:rPr>
+      </w:pPr>
+      <w:r>
+        <w:rPr>
+          <w:b/>
+          <w:bCs/>
+        </w:rPr>
+        <w:t>4/01/2021:</w:t>
+      </w:r>
+    </w:p>
+    <w:p>
+      <w:r>
+        <w:t>Vandaag heb ik de 1</w:t>
+      </w:r>
+      <w:r>
+        <w:rPr>
+          <w:vertAlign w:val="superscript"/>
+        </w:rPr>
+        <w:t>ste</w:t>
+      </w:r>
+      <w:r>
+        <w:t xml:space="preserve"> stap afgewerkt van de invite systeem. Hierbij heb ik dus als een </w:t>
+      </w:r>
+      <w:proofErr w:type="spellStart"/>
+      <w:r>
+        <w:t>admin</w:t>
+      </w:r>
+      <w:proofErr w:type="spellEnd"/>
+      <w:r>
+        <w:t xml:space="preserve"> van een chat een user uitnodigt krijgt die user een invite in </w:t>
+      </w:r>
+      <w:proofErr w:type="spellStart"/>
+      <w:r>
+        <w:t>firestore</w:t>
+      </w:r>
+      <w:proofErr w:type="spellEnd"/>
+      <w:r>
+        <w:t>.</w:t>
+      </w:r>
+    </w:p>
+    <w:p>
+      <w:r>
+        <w:rPr>
+          <w:noProof/>
+        </w:rPr>
+        <w:drawing>
+          <wp:inline distT="0" distB="0" distL="0" distR="0" wp14:anchorId="4CC99960" wp14:editId="52914D51">
+            <wp:extent cx="5760720" cy="3169920"/>
+            <wp:effectExtent l="0" t="0" r="0" b="0"/>
+            <wp:docPr id="35" name="Afbeelding 35"/>
+            <wp:cNvGraphicFramePr>
+              <a:graphicFrameLocks xmlns:a="http://schemas.openxmlformats.org/drawingml/2006/main" noChangeAspect="1"/>
+            </wp:cNvGraphicFramePr>
+            <a:graphic xmlns:a="http://schemas.openxmlformats.org/drawingml/2006/main">
+              <a:graphicData uri="http://schemas.openxmlformats.org/drawingml/2006/picture">
+                <pic:pic xmlns:pic="http://schemas.openxmlformats.org/drawingml/2006/picture">
+                  <pic:nvPicPr>
+                    <pic:cNvPr id="1" name=""/>
+                    <pic:cNvPicPr/>
+                  </pic:nvPicPr>
+                  <pic:blipFill>
+                    <a:blip r:embed="rId80"/>
+                    <a:stretch>
+                      <a:fillRect/>
+                    </a:stretch>
+                  </pic:blipFill>
+                  <pic:spPr>
+                    <a:xfrm>
+                      <a:off x="0" y="0"/>
+                      <a:ext cx="5760720" cy="3169920"/>
+                    </a:xfrm>
+                    <a:prstGeom prst="rect">
+                      <a:avLst/>
+                    </a:prstGeom>
+                  </pic:spPr>
+                </pic:pic>
+              </a:graphicData>
+            </a:graphic>
+          </wp:inline>
+        </w:drawing>
       </w:r>
     </w:p>
     <w:sectPr>

</xml_diff>

<commit_message>
Starting with comment system
</commit_message>
<xml_diff>
--- a/Logboek_Dries_Fierens.docx
+++ b/Logboek_Dries_Fierens.docx
@@ -7374,7 +7374,21 @@
           <w:b/>
           <w:bCs/>
         </w:rPr>
-        <w:t>4/01/2021:</w:t>
+        <w:t>4/01/202</w:t>
+      </w:r>
+      <w:r>
+        <w:rPr>
+          <w:b/>
+          <w:bCs/>
+        </w:rPr>
+        <w:t>2</w:t>
+      </w:r>
+      <w:r>
+        <w:rPr>
+          <w:b/>
+          <w:bCs/>
+        </w:rPr>
+        <w:t>:</w:t>
       </w:r>
     </w:p>
     <w:p>
@@ -7471,7 +7485,7 @@
           <w:b/>
           <w:bCs/>
         </w:rPr>
-        <w:t>1</w:t>
+        <w:t>2</w:t>
       </w:r>
       <w:r>
         <w:rPr>
@@ -7552,7 +7566,21 @@
           <w:b/>
           <w:bCs/>
         </w:rPr>
-        <w:t>6/01/2021:</w:t>
+        <w:t>6/01/202</w:t>
+      </w:r>
+      <w:r>
+        <w:rPr>
+          <w:b/>
+          <w:bCs/>
+        </w:rPr>
+        <w:t>2</w:t>
+      </w:r>
+      <w:r>
+        <w:rPr>
+          <w:b/>
+          <w:bCs/>
+        </w:rPr>
+        <w:t>:</w:t>
       </w:r>
     </w:p>
     <w:p>
@@ -7639,6 +7667,115 @@
         <w:t xml:space="preserve"> store.</w:t>
       </w:r>
     </w:p>
+    <w:p/>
+    <w:p>
+      <w:pPr>
+        <w:pStyle w:val="Kop2"/>
+      </w:pPr>
+      <w:r>
+        <w:t>Week 1</w:t>
+      </w:r>
+      <w:r>
+        <w:t>3</w:t>
+      </w:r>
+    </w:p>
+    <w:p>
+      <w:pPr>
+        <w:pStyle w:val="Kop3"/>
+      </w:pPr>
+      <w:r>
+        <w:t>Wat ik wil realiseren tijdens de volgende weken:</w:t>
+      </w:r>
+    </w:p>
+    <w:p>
+      <w:pPr>
+        <w:pStyle w:val="Lijstalinea"/>
+        <w:numPr>
+          <w:ilvl w:val="0"/>
+          <w:numId w:val="2"/>
+        </w:numPr>
+      </w:pPr>
+      <w:r>
+        <w:t xml:space="preserve">Afbeeldingen kunnen doorsturen via chat en </w:t>
+      </w:r>
+      <w:proofErr w:type="spellStart"/>
+      <w:r>
+        <w:t>comments</w:t>
+      </w:r>
+      <w:proofErr w:type="spellEnd"/>
+      <w:r>
+        <w:t xml:space="preserve"> eraan kunnen toevoegen.</w:t>
+      </w:r>
+    </w:p>
+    <w:p>
+      <w:pPr>
+        <w:pStyle w:val="Lijstalinea"/>
+        <w:numPr>
+          <w:ilvl w:val="0"/>
+          <w:numId w:val="2"/>
+        </w:numPr>
+      </w:pPr>
+      <w:r>
+        <w:t>(</w:t>
+      </w:r>
+      <w:r>
+        <w:t>Notificaties voor nieuwe berichten</w:t>
+      </w:r>
+      <w:r>
+        <w:t>)</w:t>
+      </w:r>
+    </w:p>
+    <w:p>
+      <w:pPr>
+        <w:pStyle w:val="Lijstalinea"/>
+        <w:numPr>
+          <w:ilvl w:val="0"/>
+          <w:numId w:val="2"/>
+        </w:numPr>
+      </w:pPr>
+      <w:r>
+        <w:t>(</w:t>
+      </w:r>
+      <w:r>
+        <w:t>CRUD toevoegen zoals groepen verwijderen</w:t>
+      </w:r>
+      <w:r>
+        <w:t>)</w:t>
+      </w:r>
+    </w:p>
+    <w:p/>
+    <w:p>
+      <w:pPr>
+        <w:rPr>
+          <w:b/>
+          <w:bCs/>
+        </w:rPr>
+      </w:pPr>
+      <w:r>
+        <w:rPr>
+          <w:b/>
+          <w:bCs/>
+        </w:rPr>
+        <w:t>11/01/2022:</w:t>
+      </w:r>
+    </w:p>
+    <w:p/>
+    <w:p>
+      <w:pPr>
+        <w:rPr>
+          <w:b/>
+          <w:bCs/>
+        </w:rPr>
+      </w:pPr>
+      <w:r>
+        <w:rPr>
+          <w:b/>
+          <w:bCs/>
+        </w:rPr>
+        <w:t>12/01/2022:</w:t>
+      </w:r>
+    </w:p>
+    <w:p/>
     <w:sectPr>
       <w:pgSz w:w="11906" w:h="16838"/>
       <w:pgMar w:top="1417" w:right="1417" w:bottom="1417" w:left="1417" w:header="708" w:footer="708" w:gutter="0"/>

</xml_diff>

<commit_message>
Updated comment system and logboek
</commit_message>
<xml_diff>
--- a/Logboek_Dries_Fierens.docx
+++ b/Logboek_Dries_Fierens.docx
@@ -78,15 +78,7 @@
       </w:r>
       <w:proofErr w:type="spellEnd"/>
       <w:r>
-        <w:t xml:space="preserve"> web app dat dus meer te maken hebben met web &amp; mobile dus vooral HTML &amp; CSS. We moesten dan ook nog kiezen voor een project idee, waarbij ik koos voor een scanner + </w:t>
-      </w:r>
-      <w:proofErr w:type="gramStart"/>
-      <w:r>
-        <w:t>pdf converter</w:t>
-      </w:r>
-      <w:proofErr w:type="gramEnd"/>
-      <w:r>
-        <w:t xml:space="preserve"> app</w:t>
+        <w:t xml:space="preserve"> web app dat dus meer te maken hebben met web &amp; mobile dus vooral HTML &amp; CSS. We moesten dan ook nog kiezen voor een project idee, waarbij ik koos voor een scanner + pdf converter app</w:t>
       </w:r>
       <w:r>
         <w:t xml:space="preserve"> waarbij het vooral bedoelt is o</w:t>
@@ -107,15 +99,7 @@
         <w:t>.</w:t>
       </w:r>
       <w:r>
-        <w:t xml:space="preserve"> Het was verplicht om 1 </w:t>
-      </w:r>
-      <w:proofErr w:type="gramStart"/>
-      <w:r>
-        <w:t>hardware component</w:t>
-      </w:r>
-      <w:proofErr w:type="gramEnd"/>
-      <w:r>
-        <w:t xml:space="preserve"> van de gsm te gebruiken dus koos ik natuurlijk voor de camera.</w:t>
+        <w:t xml:space="preserve"> Het was verplicht om 1 hardware component van de gsm te gebruiken dus koos ik natuurlijk voor de camera.</w:t>
       </w:r>
       <w:r>
         <w:t xml:space="preserve"> </w:t>
@@ -229,15 +213,7 @@
         <w:t xml:space="preserve">Mijn app idee werd niet goedgekeurd, want de leerkracht raadde het af door problemen die ervan kunnen komen. Ik moest dan vandaag een nieuw idee opstellen. </w:t>
       </w:r>
       <w:r>
-        <w:t xml:space="preserve">De scanner + </w:t>
-      </w:r>
-      <w:proofErr w:type="gramStart"/>
-      <w:r>
-        <w:t>pdf converter</w:t>
-      </w:r>
-      <w:proofErr w:type="gramEnd"/>
-      <w:r>
-        <w:t xml:space="preserve"> was duidelijk te moeilijk, maar ik besloot om het idee verder te zetten van een app die notities kan delen. Dus nu moet het gewoon foto’s trekken van de notities. Om nog toe te voegen kan ik ook opmerkingswolkjes toevoegen aan de foto voor bijvoorbeeld een fout</w:t>
+        <w:t>De scanner + pdf converter was duidelijk te moeilijk, maar ik besloot om het idee verder te zetten van een app die notities kan delen. Dus nu moet het gewoon foto’s trekken van de notities. Om nog toe te voegen kan ik ook opmerkingswolkjes toevoegen aan de foto voor bijvoorbeeld een fout</w:t>
       </w:r>
       <w:r>
         <w:t xml:space="preserve"> aan te duiden</w:t>
@@ -309,15 +285,7 @@
         <w:t>te veel</w:t>
       </w:r>
       <w:r>
-        <w:t xml:space="preserve"> naar voor moest leunen en dus </w:t>
-      </w:r>
-      <w:proofErr w:type="gramStart"/>
-      <w:r>
-        <w:t>nek pijn</w:t>
-      </w:r>
-      <w:proofErr w:type="gramEnd"/>
-      <w:r>
-        <w:t xml:space="preserve"> kreeg en er waren precies geen ramen om te openen. </w:t>
+        <w:t xml:space="preserve"> naar voor moest leunen en dus nek pijn kreeg en er waren precies geen ramen om te openen. </w:t>
       </w:r>
       <w:r>
         <w:t>Gelukkig kunnen we naar buiten wanneer we het willen.</w:t>
@@ -598,15 +566,7 @@
     </w:p>
     <w:p>
       <w:r>
-        <w:t xml:space="preserve">Tijdens lange downloads heb ik ook mijn </w:t>
-      </w:r>
-      <w:proofErr w:type="gramStart"/>
-      <w:r>
-        <w:t>google account</w:t>
-      </w:r>
-      <w:proofErr w:type="gramEnd"/>
-      <w:r>
-        <w:t xml:space="preserve"> toegevoegd op </w:t>
+        <w:t xml:space="preserve">Tijdens lange downloads heb ik ook mijn google account toegevoegd op </w:t>
       </w:r>
       <w:proofErr w:type="spellStart"/>
       <w:r>
@@ -695,15 +655,7 @@
         <w:t>Ik heb daarna gewoon verder begonnen aan de tutorial die ik vorige week gebruikt had.</w:t>
       </w:r>
       <w:r>
-        <w:t xml:space="preserve"> Hierbij leerde ik meer over hoe ik </w:t>
-      </w:r>
-      <w:proofErr w:type="gramStart"/>
-      <w:r>
-        <w:t>Android studio</w:t>
-      </w:r>
-      <w:proofErr w:type="gramEnd"/>
-      <w:r>
-        <w:t xml:space="preserve"> beter kon gebruiken om mijn app te </w:t>
+        <w:t xml:space="preserve"> Hierbij leerde ik meer over hoe ik Android studio beter kon gebruiken om mijn app te </w:t>
       </w:r>
       <w:proofErr w:type="spellStart"/>
       <w:r>
@@ -726,15 +678,7 @@
         <w:t>)</w:t>
       </w:r>
       <w:r>
-        <w:t xml:space="preserve">. </w:t>
-      </w:r>
-      <w:proofErr w:type="gramStart"/>
-      <w:r>
-        <w:t>Android studio</w:t>
-      </w:r>
-      <w:proofErr w:type="gramEnd"/>
-      <w:r>
-        <w:t xml:space="preserve"> is zeer gelijkaardig als bijvoorbeeld </w:t>
+        <w:t xml:space="preserve">. Android studio is zeer gelijkaardig als bijvoorbeeld </w:t>
       </w:r>
       <w:proofErr w:type="spellStart"/>
       <w:r>
@@ -765,13 +709,8 @@
         <w:t>bekijken</w:t>
       </w:r>
       <w:r>
-        <w:t xml:space="preserve"> in een gekozen browser, maar je kan in </w:t>
-      </w:r>
-      <w:proofErr w:type="gramStart"/>
-      <w:r>
-        <w:t>Android studio</w:t>
-      </w:r>
-      <w:proofErr w:type="gramEnd"/>
+        <w:t xml:space="preserve"> in een gekozen browser, maar je kan in Android studio</w:t>
+      </w:r>
       <w:r>
         <w:t xml:space="preserve"> je app</w:t>
       </w:r>
@@ -887,15 +826,7 @@
       </w:r>
       <w:proofErr w:type="spellEnd"/>
       <w:r>
-        <w:t xml:space="preserve"> design gevolgd in plaats van die van </w:t>
-      </w:r>
-      <w:proofErr w:type="gramStart"/>
-      <w:r>
-        <w:t>Android studio</w:t>
-      </w:r>
-      <w:proofErr w:type="gramEnd"/>
-      <w:r>
-        <w:t>. Ze leerde me dan hoe ik er mee kon werken maar niet hoe een hele nieuwe app kon maken. Ik kreeg een voorbeeld app om erin te kunnen werken voor de tutorial.</w:t>
+        <w:t xml:space="preserve"> design gevolgd in plaats van die van Android studio. Ze leerde me dan hoe ik er mee kon werken maar niet hoe een hele nieuwe app kon maken. Ik kreeg een voorbeeld app om erin te kunnen werken voor de tutorial.</w:t>
       </w:r>
     </w:p>
     <w:p>
@@ -2181,15 +2112,7 @@
         <w:t>Vandaag heb ik eindelijk de login en registratie kunnen afwerken. Dit had veel moeite gekost.</w:t>
       </w:r>
       <w:r>
-        <w:t xml:space="preserve"> Het probleem was dus dat mijn app bleef crashen als ik probeerde te registeren. Ik had veel op stackoverflow gezocht maar ik kon eerst niks vinden, maar toen zag ik dat de wifi van de device emulator op </w:t>
-      </w:r>
-      <w:proofErr w:type="gramStart"/>
-      <w:r>
-        <w:t>Android studio</w:t>
-      </w:r>
-      <w:proofErr w:type="gramEnd"/>
-      <w:r>
-        <w:t xml:space="preserve"> geen wifi had. Ik dacht eerst dat dit normaal was, maar begon toen twijfels te krijgen. Ik had dan eerst de info op stackoverflow pagina proberen gebruiken, maar dat was niet juist. Uiteindelijk gewoon mijn gsm </w:t>
+        <w:t xml:space="preserve"> Het probleem was dus dat mijn app bleef crashen als ik probeerde te registeren. Ik had veel op stackoverflow gezocht maar ik kon eerst niks vinden, maar toen zag ik dat de wifi van de device emulator op Android studio geen wifi had. Ik dacht eerst dat dit normaal was, maar begon toen twijfels te krijgen. Ik had dan eerst de info op stackoverflow pagina proberen gebruiken, maar dat was niet juist. Uiteindelijk gewoon mijn gsm </w:t>
       </w:r>
       <w:proofErr w:type="spellStart"/>
       <w:r>
@@ -2386,23 +2309,7 @@
           <w:rFonts w:eastAsia="Times New Roman" w:cstheme="minorHAnsi"/>
           <w:lang w:eastAsia="nl-BE"/>
         </w:rPr>
-        <w:t xml:space="preserve">-in te laten werken. Dit ging zeer goed, maar het enige probleem is dat de </w:t>
-      </w:r>
-      <w:proofErr w:type="gramStart"/>
-      <w:r>
-        <w:rPr>
-          <w:rFonts w:eastAsia="Times New Roman" w:cstheme="minorHAnsi"/>
-          <w:lang w:eastAsia="nl-BE"/>
-        </w:rPr>
-        <w:t>google account</w:t>
-      </w:r>
-      <w:proofErr w:type="gramEnd"/>
-      <w:r>
-        <w:rPr>
-          <w:rFonts w:eastAsia="Times New Roman" w:cstheme="minorHAnsi"/>
-          <w:lang w:eastAsia="nl-BE"/>
-        </w:rPr>
-        <w:t xml:space="preserve"> niet wordt toegevoegd aan </w:t>
+        <w:t xml:space="preserve">-in te laten werken. Dit ging zeer goed, maar het enige probleem is dat de google account niet wordt toegevoegd aan </w:t>
       </w:r>
       <w:proofErr w:type="spellStart"/>
       <w:r>
@@ -2820,7 +2727,6 @@
         <w:t xml:space="preserve"> was eigenlijk al klaar in een google-</w:t>
       </w:r>
       <w:proofErr w:type="spellStart"/>
-      <w:proofErr w:type="gramStart"/>
       <w:r>
         <w:rPr>
           <w:rFonts w:eastAsia="Times New Roman" w:cstheme="minorHAnsi"/>
@@ -2829,7 +2735,6 @@
         <w:t>services.json</w:t>
       </w:r>
       <w:proofErr w:type="spellEnd"/>
-      <w:proofErr w:type="gramEnd"/>
       <w:r>
         <w:rPr>
           <w:rFonts w:eastAsia="Times New Roman" w:cstheme="minorHAnsi"/>
@@ -2858,23 +2763,7 @@
           <w:rFonts w:eastAsia="Times New Roman" w:cstheme="minorHAnsi"/>
           <w:lang w:eastAsia="nl-BE"/>
         </w:rPr>
-        <w:t xml:space="preserve"> Nu kunnen </w:t>
-      </w:r>
-      <w:proofErr w:type="gramStart"/>
-      <w:r>
-        <w:rPr>
-          <w:rFonts w:eastAsia="Times New Roman" w:cstheme="minorHAnsi"/>
-          <w:lang w:eastAsia="nl-BE"/>
-        </w:rPr>
-        <w:t>google accounts</w:t>
-      </w:r>
-      <w:proofErr w:type="gramEnd"/>
-      <w:r>
-        <w:rPr>
-          <w:rFonts w:eastAsia="Times New Roman" w:cstheme="minorHAnsi"/>
-          <w:lang w:eastAsia="nl-BE"/>
-        </w:rPr>
-        <w:t xml:space="preserve"> succesvol worden toegevoegd.</w:t>
+        <w:t xml:space="preserve"> Nu kunnen google accounts succesvol worden toegevoegd.</w:t>
       </w:r>
       <w:r>
         <w:rPr>
@@ -3159,18 +3048,10 @@
         <w:t xml:space="preserve"> toegevoegd en dan moest ik een Cloud storage bucket aanmaken. Hierbij werd er gevraagd om een locatie te kiezen waarbij Europe-west 1 (= Belgische regio) niet tussen stond, maar gelukkig is er Eur3 die eigenlijk Belgische en Nederlandse regio voorstelt. Dat werd uitgelegd </w:t>
       </w:r>
       <w:r>
-        <w:t xml:space="preserve">op deze </w:t>
-      </w:r>
-      <w:proofErr w:type="gramStart"/>
-      <w:r>
-        <w:t>webpagina</w:t>
-      </w:r>
-      <w:r>
-        <w:t>‘</w:t>
-      </w:r>
-      <w:proofErr w:type="gramEnd"/>
-      <w:r>
-        <w:t>s</w:t>
+        <w:t>op deze webpagina</w:t>
+      </w:r>
+      <w:r>
+        <w:t>‘s</w:t>
       </w:r>
       <w:r>
         <w:t>:</w:t>
@@ -3558,15 +3439,7 @@
       </w:r>
       <w:proofErr w:type="spellEnd"/>
       <w:r>
-        <w:t xml:space="preserve"> oftewel de image inkomt. De map geef </w:t>
-      </w:r>
-      <w:proofErr w:type="gramStart"/>
-      <w:r>
-        <w:t>ik  het</w:t>
-      </w:r>
-      <w:proofErr w:type="gramEnd"/>
-      <w:r>
-        <w:t xml:space="preserve"> email adres van de gebruiker als naam.</w:t>
+        <w:t xml:space="preserve"> oftewel de image inkomt. De map geef ik  het email adres van de gebruiker als naam.</w:t>
       </w:r>
     </w:p>
     <w:p>
@@ -3972,17 +3845,12 @@
         <w:t xml:space="preserve"> gedaan in </w:t>
       </w:r>
       <w:proofErr w:type="spellStart"/>
-      <w:proofErr w:type="gramStart"/>
       <w:r>
         <w:t>OnCreateView</w:t>
       </w:r>
       <w:proofErr w:type="spellEnd"/>
       <w:r>
-        <w:t>(</w:t>
-      </w:r>
-      <w:proofErr w:type="gramEnd"/>
-      <w:r>
-        <w:t>):</w:t>
+        <w:t>():</w:t>
       </w:r>
     </w:p>
     <w:p>
@@ -4253,15 +4121,7 @@
     </w:p>
     <w:p>
       <w:r>
-        <w:t xml:space="preserve">Ik had een image asset toegevoegd dat dus </w:t>
-      </w:r>
-      <w:proofErr w:type="gramStart"/>
-      <w:r>
-        <w:t>er voor</w:t>
-      </w:r>
-      <w:proofErr w:type="gramEnd"/>
-      <w:r>
-        <w:t xml:space="preserve"> zorgde dat de oude logo files worden vervangen. Hierbij heb een logo afbeelding als </w:t>
+        <w:t xml:space="preserve">Ik had een image asset toegevoegd dat dus er voor zorgde dat de oude logo files worden vervangen. Hierbij heb een logo afbeelding als </w:t>
       </w:r>
       <w:proofErr w:type="spellStart"/>
       <w:r>
@@ -4450,15 +4310,7 @@
       </w:r>
       <w:proofErr w:type="spellEnd"/>
       <w:r>
-        <w:t xml:space="preserve"> </w:t>
-      </w:r>
-      <w:proofErr w:type="gramStart"/>
-      <w:r>
-        <w:t>keuze menu</w:t>
-      </w:r>
-      <w:proofErr w:type="gramEnd"/>
-      <w:r>
-        <w:t xml:space="preserve">. De code voor de </w:t>
+        <w:t xml:space="preserve"> keuze menu. De code voor de </w:t>
       </w:r>
       <w:proofErr w:type="spellStart"/>
       <w:r>
@@ -4694,12 +4546,10 @@
         <w:t xml:space="preserve"> in de google-</w:t>
       </w:r>
       <w:proofErr w:type="spellStart"/>
-      <w:proofErr w:type="gramStart"/>
       <w:r>
         <w:t>services.json</w:t>
       </w:r>
       <w:proofErr w:type="spellEnd"/>
-      <w:proofErr w:type="gramEnd"/>
       <w:r>
         <w:t xml:space="preserve"> file. Dus ik moest mijn app in </w:t>
       </w:r>
@@ -4897,15 +4747,7 @@
       </w:r>
       <w:proofErr w:type="spellEnd"/>
       <w:r>
-        <w:t xml:space="preserve"> console geüpload, hierbij moest ik nog in </w:t>
-      </w:r>
-      <w:proofErr w:type="gramStart"/>
-      <w:r>
-        <w:t>de dashboard</w:t>
-      </w:r>
-      <w:proofErr w:type="gramEnd"/>
-      <w:r>
-        <w:t xml:space="preserve"> veel taken afleggen. De belangrijksten waren bijvoorbeeld een test account meegeven zodat google dit kan gebruiken om mijn app te controleren, een </w:t>
+        <w:t xml:space="preserve"> console geüpload, hierbij moest ik nog in de dashboard veel taken afleggen. De belangrijksten waren bijvoorbeeld een test account meegeven zodat google dit kan gebruiken om mijn app te controleren, een </w:t>
       </w:r>
       <w:proofErr w:type="spellStart"/>
       <w:r>
@@ -5345,15 +5187,7 @@
       </w:r>
       <w:proofErr w:type="spellEnd"/>
       <w:r>
-        <w:t xml:space="preserve"> database maar nog geen succes. Ik moest nu stoppen omdat ik een </w:t>
-      </w:r>
-      <w:proofErr w:type="gramStart"/>
-      <w:r>
-        <w:t>online gesprek</w:t>
-      </w:r>
-      <w:proofErr w:type="gramEnd"/>
-      <w:r>
-        <w:t xml:space="preserve"> ga hebben voor mijn stage tijdens het 2</w:t>
+        <w:t xml:space="preserve"> database maar nog geen succes. Ik moest nu stoppen omdat ik een online gesprek ga hebben voor mijn stage tijdens het 2</w:t>
       </w:r>
       <w:r>
         <w:rPr>
@@ -5533,15 +5367,7 @@
     </w:p>
     <w:p>
       <w:r>
-        <w:t xml:space="preserve">Vandaag probeerde ik </w:t>
-      </w:r>
-      <w:proofErr w:type="gramStart"/>
-      <w:r>
-        <w:t>offline support</w:t>
-      </w:r>
-      <w:proofErr w:type="gramEnd"/>
-      <w:r>
-        <w:t xml:space="preserve"> toe te voegen. Voor </w:t>
+        <w:t xml:space="preserve">Vandaag probeerde ik offline support toe te voegen. Voor </w:t>
       </w:r>
       <w:proofErr w:type="spellStart"/>
       <w:r>
@@ -6017,18 +5843,10 @@
       </w:r>
       <w:proofErr w:type="spellEnd"/>
       <w:r>
-        <w:t xml:space="preserve"> database </w:t>
-      </w:r>
-      <w:proofErr w:type="gramStart"/>
-      <w:r>
-        <w:t xml:space="preserve">sturen </w:t>
-      </w:r>
-      <w:r>
-        <w:t>,</w:t>
-      </w:r>
-      <w:proofErr w:type="gramEnd"/>
-      <w:r>
-        <w:t xml:space="preserve"> maar </w:t>
+        <w:t xml:space="preserve"> database sturen </w:t>
+      </w:r>
+      <w:r>
+        <w:t xml:space="preserve">, maar </w:t>
       </w:r>
       <w:proofErr w:type="spellStart"/>
       <w:r>
@@ -6145,13 +5963,8 @@
         </w:numPr>
       </w:pPr>
       <w:r>
-        <w:t xml:space="preserve">Puntenverdeling opdrachten afwerken zoals </w:t>
-      </w:r>
-      <w:proofErr w:type="gramStart"/>
-      <w:r>
-        <w:t>offline support</w:t>
-      </w:r>
-      <w:proofErr w:type="gramEnd"/>
+        <w:t>Puntenverdeling opdrachten afwerken zoals offline support</w:t>
+      </w:r>
     </w:p>
     <w:p/>
     <w:p/>
@@ -6227,7 +6040,6 @@
       <w:r>
         <w:t xml:space="preserve"> 1</w:t>
       </w:r>
-      <w:proofErr w:type="gramStart"/>
       <w:r>
         <w:rPr>
           <w:vertAlign w:val="superscript"/>
@@ -6240,7 +6052,6 @@
       <w:r>
         <w:t xml:space="preserve"> tutorial</w:t>
       </w:r>
-      <w:proofErr w:type="gramEnd"/>
       <w:r>
         <w:t xml:space="preserve"> hieronder. Daarna ging alles vlot, maar ik heb alleen moeilijkheden met het beveiligen van </w:t>
       </w:r>
@@ -6944,13 +6755,8 @@
         </w:numPr>
       </w:pPr>
       <w:r>
-        <w:t xml:space="preserve">Puntenverdeling opdrachten afwerken zoals </w:t>
-      </w:r>
-      <w:proofErr w:type="gramStart"/>
-      <w:r>
-        <w:t>offline support</w:t>
-      </w:r>
-      <w:proofErr w:type="gramEnd"/>
+        <w:t>Puntenverdeling opdrachten afwerken zoals offline support</w:t>
+      </w:r>
     </w:p>
     <w:p/>
     <w:p>
@@ -7199,13 +7005,8 @@
         </w:numPr>
       </w:pPr>
       <w:r>
-        <w:t xml:space="preserve">Puntenverdeling opdrachten afwerken zoals </w:t>
-      </w:r>
-      <w:proofErr w:type="gramStart"/>
-      <w:r>
-        <w:t>offline support</w:t>
-      </w:r>
-      <w:proofErr w:type="gramEnd"/>
+        <w:t>Puntenverdeling opdrachten afwerken zoals offline support</w:t>
+      </w:r>
     </w:p>
     <w:p/>
     <w:p>
@@ -7673,10 +7474,7 @@
         <w:pStyle w:val="Kop2"/>
       </w:pPr>
       <w:r>
-        <w:t>Week 1</w:t>
-      </w:r>
-      <w:r>
-        <w:t>3</w:t>
+        <w:t>Week 13</w:t>
       </w:r>
     </w:p>
     <w:p>
@@ -7716,13 +7514,7 @@
         </w:numPr>
       </w:pPr>
       <w:r>
-        <w:t>(</w:t>
-      </w:r>
-      <w:r>
-        <w:t>Notificaties voor nieuwe berichten</w:t>
-      </w:r>
-      <w:r>
-        <w:t>)</w:t>
+        <w:t>(Notificaties voor nieuwe berichten)</w:t>
       </w:r>
     </w:p>
     <w:p>
@@ -7734,13 +7526,7 @@
         </w:numPr>
       </w:pPr>
       <w:r>
-        <w:t>(</w:t>
-      </w:r>
-      <w:r>
-        <w:t>CRUD toevoegen zoals groepen verwijderen</w:t>
-      </w:r>
-      <w:r>
-        <w:t>)</w:t>
+        <w:t>(CRUD toevoegen zoals groepen verwijderen)</w:t>
       </w:r>
     </w:p>
     <w:p/>
@@ -7759,6 +7545,104 @@
         <w:t>11/01/2022:</w:t>
       </w:r>
     </w:p>
+    <w:p>
+      <w:r>
+        <w:t xml:space="preserve">Vandaag had ik ontdekt dat de pagina </w:t>
+      </w:r>
+      <w:r>
+        <w:t xml:space="preserve">waar ik chat groepen kan openen, constant crasht als het in laadde. Dit kwam omdat </w:t>
+      </w:r>
+      <w:proofErr w:type="spellStart"/>
+      <w:r>
+        <w:t>Firestore</w:t>
+      </w:r>
+      <w:proofErr w:type="spellEnd"/>
+      <w:r>
+        <w:t xml:space="preserve"> niet wou werken in release mode. Om dit op te lossen heb ik 2 dingen gedaan. Eerst heb ik de release sha1 </w:t>
+      </w:r>
+      <w:proofErr w:type="spellStart"/>
+      <w:r>
+        <w:t>fingerprint</w:t>
+      </w:r>
+      <w:proofErr w:type="spellEnd"/>
+      <w:r>
+        <w:t xml:space="preserve"> toegevoegd aan </w:t>
+      </w:r>
+      <w:proofErr w:type="spellStart"/>
+      <w:r>
+        <w:t>firestore</w:t>
+      </w:r>
+      <w:proofErr w:type="spellEnd"/>
+      <w:r>
+        <w:t xml:space="preserve">. In een </w:t>
+      </w:r>
+      <w:proofErr w:type="spellStart"/>
+      <w:r>
+        <w:t>txt</w:t>
+      </w:r>
+      <w:proofErr w:type="spellEnd"/>
+      <w:r>
+        <w:t xml:space="preserve"> file heb ik daar tips over achtergelaten. Daarna moest ik ook </w:t>
+      </w:r>
+      <w:proofErr w:type="spellStart"/>
+      <w:r>
+        <w:t>minifyEnabled</w:t>
+      </w:r>
+      <w:proofErr w:type="spellEnd"/>
+      <w:r>
+        <w:t xml:space="preserve"> op </w:t>
+      </w:r>
+      <w:proofErr w:type="spellStart"/>
+      <w:r>
+        <w:t>false</w:t>
+      </w:r>
+      <w:proofErr w:type="spellEnd"/>
+      <w:r>
+        <w:t xml:space="preserve"> zetten, want in een stackoverflow artikel zei iemand dat dat het opgelost had voor hem.</w:t>
+      </w:r>
+    </w:p>
+    <w:p>
+      <w:r>
+        <w:rPr>
+          <w:noProof/>
+        </w:rPr>
+        <w:drawing>
+          <wp:inline distT="0" distB="0" distL="0" distR="0" wp14:anchorId="69FBA1C9" wp14:editId="1B809D6F">
+            <wp:extent cx="5760720" cy="956945"/>
+            <wp:effectExtent l="0" t="0" r="0" b="0"/>
+            <wp:docPr id="37" name="Afbeelding 37"/>
+            <wp:cNvGraphicFramePr>
+              <a:graphicFrameLocks xmlns:a="http://schemas.openxmlformats.org/drawingml/2006/main" noChangeAspect="1"/>
+            </wp:cNvGraphicFramePr>
+            <a:graphic xmlns:a="http://schemas.openxmlformats.org/drawingml/2006/main">
+              <a:graphicData uri="http://schemas.openxmlformats.org/drawingml/2006/picture">
+                <pic:pic xmlns:pic="http://schemas.openxmlformats.org/drawingml/2006/picture">
+                  <pic:nvPicPr>
+                    <pic:cNvPr id="1" name=""/>
+                    <pic:cNvPicPr/>
+                  </pic:nvPicPr>
+                  <pic:blipFill>
+                    <a:blip r:embed="rId82"/>
+                    <a:stretch>
+                      <a:fillRect/>
+                    </a:stretch>
+                  </pic:blipFill>
+                  <pic:spPr>
+                    <a:xfrm>
+                      <a:off x="0" y="0"/>
+                      <a:ext cx="5760720" cy="956945"/>
+                    </a:xfrm>
+                    <a:prstGeom prst="rect">
+                      <a:avLst/>
+                    </a:prstGeom>
+                  </pic:spPr>
+                </pic:pic>
+              </a:graphicData>
+            </a:graphic>
+          </wp:inline>
+        </w:drawing>
+      </w:r>
+    </w:p>
     <w:p/>
     <w:p>
       <w:pPr>
@@ -7772,7 +7656,264 @@
           <w:b/>
           <w:bCs/>
         </w:rPr>
+        <w:lastRenderedPageBreak/>
         <w:t>12/01/2022:</w:t>
+      </w:r>
+    </w:p>
+    <w:p>
+      <w:r>
+        <w:t xml:space="preserve">Vandaag ben ik begonnen aan de </w:t>
+      </w:r>
+      <w:proofErr w:type="spellStart"/>
+      <w:r>
+        <w:t>comment</w:t>
+      </w:r>
+      <w:proofErr w:type="spellEnd"/>
+      <w:r>
+        <w:t xml:space="preserve"> systeem die je kan toepassen op afbeeldingen in chat. Dit ging vrij goed, want ik kon de X en Y </w:t>
+      </w:r>
+      <w:proofErr w:type="spellStart"/>
+      <w:r>
+        <w:t>coordinaten</w:t>
+      </w:r>
+      <w:proofErr w:type="spellEnd"/>
+      <w:r>
+        <w:t xml:space="preserve"> van een click op het scherm op halen en op slaan in </w:t>
+      </w:r>
+      <w:proofErr w:type="spellStart"/>
+      <w:r>
+        <w:t>firestore</w:t>
+      </w:r>
+      <w:proofErr w:type="spellEnd"/>
+      <w:r>
+        <w:t xml:space="preserve">. Deze gegevens werden bewaard in een </w:t>
+      </w:r>
+      <w:proofErr w:type="spellStart"/>
+      <w:r>
+        <w:t>comment</w:t>
+      </w:r>
+      <w:proofErr w:type="spellEnd"/>
+      <w:r>
+        <w:t xml:space="preserve"> class object en </w:t>
+      </w:r>
+      <w:proofErr w:type="spellStart"/>
+      <w:r>
+        <w:t>konnen</w:t>
+      </w:r>
+      <w:proofErr w:type="spellEnd"/>
+      <w:r>
+        <w:t xml:space="preserve"> terug opgehaald worden afhankelijk van de image en </w:t>
+      </w:r>
+      <w:proofErr w:type="spellStart"/>
+      <w:r>
+        <w:t>adminId</w:t>
+      </w:r>
+      <w:proofErr w:type="spellEnd"/>
+      <w:r>
+        <w:t xml:space="preserve">. Als je ook op die plaats klikt kan je een </w:t>
+      </w:r>
+      <w:proofErr w:type="spellStart"/>
+      <w:r>
+        <w:t>comment</w:t>
+      </w:r>
+      <w:proofErr w:type="spellEnd"/>
+      <w:r>
+        <w:t xml:space="preserve"> indienen via een </w:t>
+      </w:r>
+      <w:proofErr w:type="spellStart"/>
+      <w:r>
+        <w:t>alertdialog</w:t>
+      </w:r>
+      <w:proofErr w:type="spellEnd"/>
+      <w:r>
+        <w:t xml:space="preserve">. Ik had ook natuurlijk mogelijk gemaakt om </w:t>
+      </w:r>
+      <w:proofErr w:type="spellStart"/>
+      <w:r>
+        <w:t>messages</w:t>
+      </w:r>
+      <w:proofErr w:type="spellEnd"/>
+      <w:r>
+        <w:t xml:space="preserve"> die beginnen met een </w:t>
+      </w:r>
+      <w:proofErr w:type="spellStart"/>
+      <w:r>
+        <w:t>firebase</w:t>
+      </w:r>
+      <w:proofErr w:type="spellEnd"/>
+      <w:r>
+        <w:t xml:space="preserve"> URI link te veranderen in een image zodat je natuurlijk </w:t>
+      </w:r>
+      <w:r>
+        <w:t xml:space="preserve">erna </w:t>
+      </w:r>
+      <w:proofErr w:type="spellStart"/>
+      <w:r>
+        <w:t>comments</w:t>
+      </w:r>
+      <w:proofErr w:type="spellEnd"/>
+      <w:r>
+        <w:t xml:space="preserve"> op kunt plaatsen.</w:t>
+      </w:r>
+    </w:p>
+    <w:p/>
+    <w:p>
+      <w:pPr>
+        <w:rPr>
+          <w:b/>
+          <w:bCs/>
+        </w:rPr>
+      </w:pPr>
+      <w:r>
+        <w:rPr>
+          <w:b/>
+          <w:bCs/>
+        </w:rPr>
+        <w:t>13/01/2022:</w:t>
+      </w:r>
+    </w:p>
+    <w:p>
+      <w:r>
+        <w:t xml:space="preserve">Vandaag heb ik dan het </w:t>
+      </w:r>
+      <w:proofErr w:type="spellStart"/>
+      <w:r>
+        <w:t>comment</w:t>
+      </w:r>
+      <w:proofErr w:type="spellEnd"/>
+      <w:r>
+        <w:t xml:space="preserve"> systeem afgewerkt. Ik had eerst ervoor gezorgd dat er een blauw bolletje, met een cijfer erin afhankelijk wanneer je het toegevoegd hebt, komt waar je klikt. Normaal was ik dan van plan om een menu van rechts te laten verschijnen met alle </w:t>
+      </w:r>
+      <w:proofErr w:type="spellStart"/>
+      <w:r>
+        <w:t>comments</w:t>
+      </w:r>
+      <w:proofErr w:type="spellEnd"/>
+      <w:r>
+        <w:t xml:space="preserve">, maar ik vond een idee op </w:t>
+      </w:r>
+      <w:proofErr w:type="spellStart"/>
+      <w:r>
+        <w:t>geeksforgeeks</w:t>
+      </w:r>
+      <w:proofErr w:type="spellEnd"/>
+      <w:r>
+        <w:t xml:space="preserve"> dat veel interessanter leek. Als je dus nu op een bolletje klikt, verschijnt er de overeenkomstige </w:t>
+      </w:r>
+      <w:proofErr w:type="spellStart"/>
+      <w:r>
+        <w:t>comment</w:t>
+      </w:r>
+      <w:proofErr w:type="spellEnd"/>
+      <w:r>
+        <w:t xml:space="preserve"> als </w:t>
+      </w:r>
+      <w:proofErr w:type="spellStart"/>
+      <w:r>
+        <w:t>popup</w:t>
+      </w:r>
+      <w:proofErr w:type="spellEnd"/>
+      <w:r>
+        <w:t xml:space="preserve">. Als je op deze </w:t>
+      </w:r>
+      <w:proofErr w:type="spellStart"/>
+      <w:r>
+        <w:t>popup</w:t>
+      </w:r>
+      <w:proofErr w:type="spellEnd"/>
+      <w:r>
+        <w:t xml:space="preserve"> klikt wordt het nog als Toast </w:t>
+      </w:r>
+      <w:proofErr w:type="spellStart"/>
+      <w:r>
+        <w:t>message</w:t>
+      </w:r>
+      <w:proofErr w:type="spellEnd"/>
+      <w:r>
+        <w:t xml:space="preserve"> getoond, dit is handig als het een te lange </w:t>
+      </w:r>
+      <w:proofErr w:type="spellStart"/>
+      <w:r>
+        <w:t>message</w:t>
+      </w:r>
+      <w:proofErr w:type="spellEnd"/>
+      <w:r>
+        <w:t xml:space="preserve"> is.</w:t>
+      </w:r>
+    </w:p>
+    <w:p>
+      <w:hyperlink r:id="rId83" w:history="1">
+        <w:r>
+          <w:rPr>
+            <w:rStyle w:val="Hyperlink"/>
+          </w:rPr>
+          <w:t>https://www.geeksforgeeks.org/popup-menu-in-android-with-example/</w:t>
+        </w:r>
+      </w:hyperlink>
+    </w:p>
+    <w:p>
+      <w:r>
+        <w:t>Daarna heb ik de</w:t>
+      </w:r>
+      <w:r>
+        <w:t>ze</w:t>
+      </w:r>
+      <w:r>
+        <w:t xml:space="preserve"> versie op google </w:t>
+      </w:r>
+      <w:proofErr w:type="spellStart"/>
+      <w:r>
+        <w:t>play</w:t>
+      </w:r>
+      <w:proofErr w:type="spellEnd"/>
+      <w:r>
+        <w:t xml:space="preserve"> geüpload.</w:t>
+      </w:r>
+    </w:p>
+    <w:p/>
+    <w:p>
+      <w:pPr>
+        <w:rPr>
+          <w:b/>
+          <w:bCs/>
+        </w:rPr>
+      </w:pPr>
+      <w:r>
+        <w:rPr>
+          <w:b/>
+          <w:bCs/>
+        </w:rPr>
+        <w:t>14/01/2021:</w:t>
+      </w:r>
+    </w:p>
+    <w:p>
+      <w:r>
+        <w:t xml:space="preserve">Vandaag had ik nog snel besloten om het mogelijk te maken om de </w:t>
+      </w:r>
+      <w:proofErr w:type="spellStart"/>
+      <w:r>
+        <w:t>comments</w:t>
+      </w:r>
+      <w:proofErr w:type="spellEnd"/>
+      <w:r>
+        <w:t xml:space="preserve"> te laten verdwijnen</w:t>
+      </w:r>
+      <w:r>
+        <w:t xml:space="preserve"> en </w:t>
+      </w:r>
+      <w:proofErr w:type="spellStart"/>
+      <w:r>
+        <w:t>herverschijnen</w:t>
+      </w:r>
+      <w:proofErr w:type="spellEnd"/>
+      <w:r>
+        <w:t xml:space="preserve"> als je op een knop drukt in </w:t>
+      </w:r>
+      <w:r>
+        <w:t xml:space="preserve">een </w:t>
+      </w:r>
+      <w:r>
+        <w:t>menu.</w:t>
       </w:r>
     </w:p>
     <w:p/>

</xml_diff>

<commit_message>
Updated comment system placement
</commit_message>
<xml_diff>
--- a/Logboek_Dries_Fierens.docx
+++ b/Logboek_Dries_Fierens.docx
@@ -46,39 +46,7 @@
         <w:t>applicatie</w:t>
       </w:r>
       <w:r>
-        <w:t xml:space="preserve"> die je kan maken en welke technologieën je kan gebruiken. Ik heb voor native gekozen want dat past het best bij mijn aftakking “Software </w:t>
-      </w:r>
-      <w:proofErr w:type="spellStart"/>
-      <w:r>
-        <w:t>developer</w:t>
-      </w:r>
-      <w:proofErr w:type="spellEnd"/>
-      <w:r>
-        <w:t xml:space="preserve">” sinds het </w:t>
-      </w:r>
-      <w:proofErr w:type="spellStart"/>
-      <w:r>
-        <w:t>java</w:t>
-      </w:r>
-      <w:proofErr w:type="spellEnd"/>
-      <w:r>
-        <w:t xml:space="preserve"> inhoudt. De anderen zijn </w:t>
-      </w:r>
-      <w:proofErr w:type="spellStart"/>
-      <w:r>
-        <w:t>hybrid</w:t>
-      </w:r>
-      <w:proofErr w:type="spellEnd"/>
-      <w:r>
-        <w:t xml:space="preserve"> en </w:t>
-      </w:r>
-      <w:proofErr w:type="spellStart"/>
-      <w:r>
-        <w:t>progressive</w:t>
-      </w:r>
-      <w:proofErr w:type="spellEnd"/>
-      <w:r>
-        <w:t xml:space="preserve"> web app dat dus meer te maken hebben met web &amp; mobile dus vooral HTML &amp; CSS. We moesten dan ook nog kiezen voor een project idee, waarbij ik koos voor een scanner + pdf converter app</w:t>
+        <w:t xml:space="preserve"> die je kan maken en welke technologieën je kan gebruiken. Ik heb voor native gekozen want dat past het best bij mijn aftakking “Software developer” sinds het java inhoudt. De anderen zijn hybrid en progressive web app dat dus meer te maken hebben met web &amp; mobile dus vooral HTML &amp; CSS. We moesten dan ook nog kiezen voor een project idee, waarbij ik koos voor een scanner + pdf converter app</w:t>
       </w:r>
       <w:r>
         <w:t xml:space="preserve"> waarbij het vooral bedoelt is o</w:t>
@@ -105,92 +73,20 @@
         <w:t xml:space="preserve"> </w:t>
       </w:r>
       <w:r>
-        <w:t xml:space="preserve">Als </w:t>
-      </w:r>
-      <w:proofErr w:type="spellStart"/>
-      <w:r>
-        <w:t>back-end</w:t>
-      </w:r>
-      <w:proofErr w:type="spellEnd"/>
-      <w:r>
-        <w:t xml:space="preserve"> koos ik </w:t>
-      </w:r>
-      <w:proofErr w:type="spellStart"/>
-      <w:r>
-        <w:t>Firebase</w:t>
-      </w:r>
-      <w:proofErr w:type="spellEnd"/>
-      <w:r>
-        <w:t xml:space="preserve"> en als technologie koos ik in </w:t>
-      </w:r>
-      <w:proofErr w:type="spellStart"/>
-      <w:r>
-        <w:t>java</w:t>
-      </w:r>
-      <w:proofErr w:type="spellEnd"/>
-      <w:r>
-        <w:t xml:space="preserve"> te werken om een </w:t>
-      </w:r>
-      <w:proofErr w:type="spellStart"/>
-      <w:r>
-        <w:t>android</w:t>
-      </w:r>
-      <w:proofErr w:type="spellEnd"/>
-      <w:r>
-        <w:t xml:space="preserve"> app te maken in plaats van een IOS app.</w:t>
-      </w:r>
-      <w:r>
-        <w:t xml:space="preserve"> Want ik heb een </w:t>
-      </w:r>
-      <w:proofErr w:type="spellStart"/>
-      <w:r>
-        <w:t>huawei</w:t>
-      </w:r>
-      <w:proofErr w:type="spellEnd"/>
-      <w:r>
-        <w:t>.</w:t>
-      </w:r>
-    </w:p>
-    <w:p>
-      <w:r>
-        <w:t xml:space="preserve">Ik heb dit allemaal grondiger beschreven in mijn “app </w:t>
-      </w:r>
-      <w:proofErr w:type="spellStart"/>
-      <w:r>
-        <w:t>idee”.pdf</w:t>
-      </w:r>
-      <w:proofErr w:type="spellEnd"/>
-      <w:r>
-        <w:t xml:space="preserve">. Dit staat ondertussen op de </w:t>
-      </w:r>
-      <w:proofErr w:type="spellStart"/>
-      <w:r>
-        <w:t>repository</w:t>
-      </w:r>
-      <w:proofErr w:type="spellEnd"/>
-      <w:r>
-        <w:t xml:space="preserve"> die we moesten maken.</w:t>
-      </w:r>
-    </w:p>
-    <w:p>
-      <w:r>
-        <w:t xml:space="preserve">Om af te sluiten had ik al ondertussen een goede naam gevonden gebaseerd op de applicatie genaamd </w:t>
-      </w:r>
-      <w:proofErr w:type="spellStart"/>
-      <w:r>
-        <w:t>Scannable</w:t>
-      </w:r>
-      <w:proofErr w:type="spellEnd"/>
-      <w:r>
-        <w:t xml:space="preserve">. Ik heb dus besloten om mijn applicatie </w:t>
-      </w:r>
-      <w:proofErr w:type="spellStart"/>
-      <w:r>
-        <w:t>Notable</w:t>
-      </w:r>
-      <w:proofErr w:type="spellEnd"/>
-      <w:r>
-        <w:t xml:space="preserve"> te noemen.</w:t>
+        <w:t>Als back-end koos ik Firebase en als technologie koos ik in java te werken om een android app te maken in plaats van een IOS app.</w:t>
+      </w:r>
+      <w:r>
+        <w:t xml:space="preserve"> Want ik heb een huawei.</w:t>
+      </w:r>
+    </w:p>
+    <w:p>
+      <w:r>
+        <w:t>Ik heb dit allemaal grondiger beschreven in mijn “app idee”.pdf. Dit staat ondertussen op de repository die we moesten maken.</w:t>
+      </w:r>
+    </w:p>
+    <w:p>
+      <w:r>
+        <w:t>Om af te sluiten had ik al ondertussen een goede naam gevonden gebaseerd op de applicatie genaamd Scannable. Ik heb dus besloten om mijn applicatie Notable te noemen.</w:t>
       </w:r>
     </w:p>
     <w:p>
@@ -224,15 +120,7 @@
     </w:p>
     <w:p>
       <w:r>
-        <w:t xml:space="preserve">Daarna moest ik gewoon begin aan een UI/UX design voor mijn applicatie, waarbij nog niet veel had gedaan omdat les niet meer lang duurde. Ik moest toen ook tegelijkertijd zoeken naar </w:t>
-      </w:r>
-      <w:proofErr w:type="spellStart"/>
-      <w:r>
-        <w:t>tutorials</w:t>
-      </w:r>
-      <w:proofErr w:type="spellEnd"/>
-      <w:r>
-        <w:t xml:space="preserve"> dus </w:t>
+        <w:t xml:space="preserve">Daarna moest ik gewoon begin aan een UI/UX design voor mijn applicatie, waarbij nog niet veel had gedaan omdat les niet meer lang duurde. Ik moest toen ook tegelijkertijd zoeken naar tutorials dus </w:t>
       </w:r>
       <w:r>
         <w:t>duurde dat ook kort.</w:t>
@@ -255,26 +143,13 @@
     </w:p>
     <w:p>
       <w:r>
-        <w:t>Vandaag in de namiddag begonnen we met de co-</w:t>
-      </w:r>
-      <w:proofErr w:type="spellStart"/>
-      <w:r>
-        <w:t>working</w:t>
-      </w:r>
-      <w:proofErr w:type="spellEnd"/>
-      <w:r>
-        <w:t xml:space="preserve"> les waarbij we dus informatie kunnen delen met medeleerlingen. Al was het de eerste les dus kwam daar niet veel van. Ik begon gewoon verder aan mijn </w:t>
-      </w:r>
-      <w:proofErr w:type="spellStart"/>
+        <w:t xml:space="preserve">Vandaag in de namiddag begonnen we met de co-working les waarbij we dus informatie kunnen delen met medeleerlingen. Al was het de eerste les dus kwam daar niet veel van. Ik begon gewoon verder aan mijn </w:t>
+      </w:r>
       <w:r>
         <w:t>F</w:t>
       </w:r>
       <w:r>
-        <w:t>igma</w:t>
-      </w:r>
-      <w:proofErr w:type="spellEnd"/>
-      <w:r>
-        <w:t xml:space="preserve"> design.</w:t>
+        <w:t>igma design.</w:t>
       </w:r>
     </w:p>
     <w:p>
@@ -325,23 +200,7 @@
     </w:p>
     <w:p>
       <w:r>
-        <w:t xml:space="preserve">Vandaag heb ik verder gewerkt aan mijn </w:t>
-      </w:r>
-      <w:proofErr w:type="spellStart"/>
-      <w:r>
-        <w:t>Figma</w:t>
-      </w:r>
-      <w:proofErr w:type="spellEnd"/>
-      <w:r>
-        <w:t xml:space="preserve"> design en het ging redelijk vlot vooruit. Ik wou absoluut dat het vandaag af was zodat ik morgen kan werken aan een ander vak. Tijdens het maken van het design heb ik vooral ook zitten op zoeken dat sommige concepten wel haalbaar zijn om te programmeren. Dit is allemaal wel mogelijk, maar zal wel een </w:t>
-      </w:r>
-      <w:proofErr w:type="spellStart"/>
-      <w:r>
-        <w:t>challenge</w:t>
-      </w:r>
-      <w:proofErr w:type="spellEnd"/>
-      <w:r>
-        <w:t xml:space="preserve"> zijn zoals de opmerkingen plaatsen</w:t>
+        <w:t>Vandaag heb ik verder gewerkt aan mijn Figma design en het ging redelijk vlot vooruit. Ik wou absoluut dat het vandaag af was zodat ik morgen kan werken aan een ander vak. Tijdens het maken van het design heb ik vooral ook zitten op zoeken dat sommige concepten wel haalbaar zijn om te programmeren. Dit is allemaal wel mogelijk, maar zal wel een challenge zijn zoals de opmerkingen plaatsen</w:t>
       </w:r>
       <w:r>
         <w:t>. M</w:t>
@@ -453,48 +312,11 @@
     </w:p>
     <w:p>
       <w:r>
-        <w:t xml:space="preserve">Vandaag werd mijn </w:t>
-      </w:r>
-      <w:proofErr w:type="spellStart"/>
-      <w:r>
-        <w:t>figma</w:t>
-      </w:r>
-      <w:proofErr w:type="spellEnd"/>
-      <w:r>
-        <w:t xml:space="preserve"> prototype gecontroleerd waarbij ik moest opnieuw uitleggen wat mijn app doet door middel van accurate presentatie. Ik legde dit vrij duidelijk uit en alles ging goed vooruit. Meneer </w:t>
-      </w:r>
-      <w:proofErr w:type="spellStart"/>
-      <w:r>
-        <w:t>Blancquaert</w:t>
-      </w:r>
-      <w:proofErr w:type="spellEnd"/>
-      <w:r>
-        <w:t xml:space="preserve"> heeft me dan ook nog een </w:t>
-      </w:r>
-      <w:proofErr w:type="spellStart"/>
-      <w:r>
-        <w:t>library</w:t>
-      </w:r>
-      <w:proofErr w:type="spellEnd"/>
-      <w:r>
-        <w:t xml:space="preserve"> genaamd “</w:t>
-      </w:r>
-      <w:proofErr w:type="spellStart"/>
-      <w:r>
-        <w:t>Material</w:t>
-      </w:r>
-      <w:proofErr w:type="spellEnd"/>
-      <w:r>
-        <w:t xml:space="preserve"> design” aangeraden om mijn applicatie te ontwerpen. </w:t>
-      </w:r>
-      <w:r>
-        <w:t xml:space="preserve">Blijkbaar Google gebruikt deze </w:t>
-      </w:r>
-      <w:proofErr w:type="spellStart"/>
-      <w:r>
-        <w:t>library</w:t>
-      </w:r>
-      <w:proofErr w:type="spellEnd"/>
+        <w:t xml:space="preserve">Vandaag werd mijn figma prototype gecontroleerd waarbij ik moest opnieuw uitleggen wat mijn app doet door middel van accurate presentatie. Ik legde dit vrij duidelijk uit en alles ging goed vooruit. Meneer Blancquaert heeft me dan ook nog een library genaamd “Material design” aangeraden om mijn applicatie te ontwerpen. </w:t>
+      </w:r>
+      <w:r>
+        <w:t>Blijkbaar Google gebruikt deze library</w:t>
+      </w:r>
       <w:r>
         <w:t xml:space="preserve"> om hun apps te maken.</w:t>
       </w:r>
@@ -532,23 +354,7 @@
         <w:t xml:space="preserve">kunt maken </w:t>
       </w:r>
       <w:r>
-        <w:t xml:space="preserve">om je app te testen. Als je </w:t>
-      </w:r>
-      <w:proofErr w:type="spellStart"/>
-      <w:r>
-        <w:t>developer</w:t>
-      </w:r>
-      <w:proofErr w:type="spellEnd"/>
-      <w:r>
-        <w:t xml:space="preserve"> modus in de </w:t>
-      </w:r>
-      <w:proofErr w:type="spellStart"/>
-      <w:r>
-        <w:t>settings</w:t>
-      </w:r>
-      <w:proofErr w:type="spellEnd"/>
-      <w:r>
-        <w:t xml:space="preserve"> van je gsm</w:t>
+        <w:t>om je app te testen. Als je developer modus in de settings van je gsm</w:t>
       </w:r>
       <w:r>
         <w:t xml:space="preserve"> aanzet, kan je je gsm verbinden met de pc en dus je applicatie daarop testen.</w:t>
@@ -566,15 +372,7 @@
     </w:p>
     <w:p>
       <w:r>
-        <w:t xml:space="preserve">Tijdens lange downloads heb ik ook mijn google account toegevoegd op </w:t>
-      </w:r>
-      <w:proofErr w:type="spellStart"/>
-      <w:r>
-        <w:t>Firebase</w:t>
-      </w:r>
-      <w:proofErr w:type="spellEnd"/>
-      <w:r>
-        <w:t>. Volgens de presentatie die we kregen van een medestudent.</w:t>
+        <w:t>Tijdens lange downloads heb ik ook mijn google account toegevoegd op Firebase. Volgens de presentatie die we kregen van een medestudent.</w:t>
       </w:r>
     </w:p>
     <w:p>
@@ -625,23 +423,7 @@
         <w:t>mijn</w:t>
       </w:r>
       <w:r>
-        <w:t xml:space="preserve"> </w:t>
-      </w:r>
-      <w:proofErr w:type="spellStart"/>
-      <w:r>
-        <w:t>figma</w:t>
-      </w:r>
-      <w:proofErr w:type="spellEnd"/>
-      <w:r>
-        <w:t xml:space="preserve"> design delen met meneer </w:t>
-      </w:r>
-      <w:proofErr w:type="spellStart"/>
-      <w:r>
-        <w:t>Blancquaert</w:t>
-      </w:r>
-      <w:proofErr w:type="spellEnd"/>
-      <w:r>
-        <w:t>, toen hij vroeg dat mijn design klaar was</w:t>
+        <w:t xml:space="preserve"> figma design delen met meneer Blancquaert, toen hij vroeg dat mijn design klaar was</w:t>
       </w:r>
       <w:r>
         <w:t xml:space="preserve"> of niet</w:t>
@@ -655,38 +437,14 @@
         <w:t>Ik heb daarna gewoon verder begonnen aan de tutorial die ik vorige week gebruikt had.</w:t>
       </w:r>
       <w:r>
-        <w:t xml:space="preserve"> Hierbij leerde ik meer over hoe ik Android studio beter kon gebruiken om mijn app te </w:t>
-      </w:r>
-      <w:proofErr w:type="spellStart"/>
-      <w:r>
-        <w:t>designen</w:t>
-      </w:r>
-      <w:proofErr w:type="spellEnd"/>
-      <w:r>
-        <w:t xml:space="preserve"> zoals hoe je </w:t>
+        <w:t xml:space="preserve"> Hierbij leerde ik meer over hoe ik Android studio beter kon gebruiken om mijn app te designen zoals hoe je </w:t>
       </w:r>
       <w:r>
         <w:lastRenderedPageBreak/>
-        <w:t xml:space="preserve">attributen kunt aanpassen (bv. </w:t>
-      </w:r>
-      <w:proofErr w:type="spellStart"/>
-      <w:r>
-        <w:t>color</w:t>
-      </w:r>
-      <w:proofErr w:type="spellEnd"/>
-      <w:r>
-        <w:t>)</w:t>
-      </w:r>
-      <w:r>
-        <w:t xml:space="preserve">. Android studio is zeer gelijkaardig als bijvoorbeeld </w:t>
-      </w:r>
-      <w:proofErr w:type="spellStart"/>
-      <w:r>
-        <w:t>Webstorm</w:t>
-      </w:r>
-      <w:proofErr w:type="spellEnd"/>
-      <w:r>
-        <w:t xml:space="preserve">, maar bij het design van een mobile app is het zeer </w:t>
+        <w:t>attributen kunt aanpassen (bv. color)</w:t>
+      </w:r>
+      <w:r>
+        <w:t xml:space="preserve">. Android studio is zeer gelijkaardig als bijvoorbeeld Webstorm, maar bij het design van een mobile app is het zeer </w:t>
       </w:r>
       <w:r>
         <w:t>verschillend</w:t>
@@ -695,15 +453,7 @@
         <w:t>.</w:t>
       </w:r>
       <w:r>
-        <w:t xml:space="preserve"> Bij </w:t>
-      </w:r>
-      <w:proofErr w:type="spellStart"/>
-      <w:r>
-        <w:t>Webstorm</w:t>
-      </w:r>
-      <w:proofErr w:type="spellEnd"/>
-      <w:r>
-        <w:t xml:space="preserve"> kan je je website </w:t>
+        <w:t xml:space="preserve"> Bij Webstorm kan je je website </w:t>
       </w:r>
       <w:r>
         <w:t>bekijken</w:t>
@@ -730,15 +480,7 @@
         <w:t>.</w:t>
       </w:r>
       <w:r>
-        <w:t xml:space="preserve"> Als ik de </w:t>
-      </w:r>
-      <w:proofErr w:type="spellStart"/>
-      <w:r>
-        <w:t>Jetbrains</w:t>
-      </w:r>
-      <w:proofErr w:type="spellEnd"/>
-      <w:r>
-        <w:t xml:space="preserve"> applicaties vergelijk met Visual studio 2019, </w:t>
+        <w:t xml:space="preserve"> Als ik de Jetbrains applicaties vergelijk met Visual studio 2019, </w:t>
       </w:r>
       <w:r>
         <w:t>heb ik er altijd moeite mee om de lay</w:t>
@@ -818,15 +560,7 @@
     </w:p>
     <w:p>
       <w:r>
-        <w:t xml:space="preserve">Ik heb dan ondertussen de tutorial van </w:t>
-      </w:r>
-      <w:proofErr w:type="spellStart"/>
-      <w:r>
-        <w:t>Material</w:t>
-      </w:r>
-      <w:proofErr w:type="spellEnd"/>
-      <w:r>
-        <w:t xml:space="preserve"> design gevolgd in plaats van die van Android studio. Ze leerde me dan hoe ik er mee kon werken maar niet hoe een hele nieuwe app kon maken. Ik kreeg een voorbeeld app om erin te kunnen werken voor de tutorial.</w:t>
+        <w:t>Ik heb dan ondertussen de tutorial van Material design gevolgd in plaats van die van Android studio. Ze leerde me dan hoe ik er mee kon werken maar niet hoe een hele nieuwe app kon maken. Ik kreeg een voorbeeld app om erin te kunnen werken voor de tutorial.</w:t>
       </w:r>
     </w:p>
     <w:p>
@@ -869,34 +603,10 @@
     </w:p>
     <w:p>
       <w:r>
-        <w:t xml:space="preserve">Vandaag heb ik de usertests afgelegd met Louis </w:t>
-      </w:r>
-      <w:proofErr w:type="spellStart"/>
-      <w:r>
-        <w:t>D’hondt</w:t>
-      </w:r>
-      <w:proofErr w:type="spellEnd"/>
-      <w:r>
-        <w:t xml:space="preserve"> en Jasper Wauters. Dit ging heel gemakkelijk en duurde niet lang. Ik had niet echt serieuze opmerkingen, behalve dat ik geen persoonlijke info pagina gemaakt had.</w:t>
-      </w:r>
-      <w:r>
-        <w:t xml:space="preserve"> Daarna heb ik onmiddellijk die opmerkingen van mijn </w:t>
-      </w:r>
-      <w:proofErr w:type="spellStart"/>
-      <w:r>
-        <w:t>figma</w:t>
-      </w:r>
-      <w:proofErr w:type="spellEnd"/>
-      <w:r>
-        <w:t xml:space="preserve"> design verbetert en op mijn </w:t>
-      </w:r>
-      <w:proofErr w:type="spellStart"/>
-      <w:r>
-        <w:t>repository</w:t>
-      </w:r>
-      <w:proofErr w:type="spellEnd"/>
-      <w:r>
-        <w:t xml:space="preserve"> gezet.</w:t>
+        <w:t>Vandaag heb ik de usertests afgelegd met Louis D’hondt en Jasper Wauters. Dit ging heel gemakkelijk en duurde niet lang. Ik had niet echt serieuze opmerkingen, behalve dat ik geen persoonlijke info pagina gemaakt had.</w:t>
+      </w:r>
+      <w:r>
+        <w:t xml:space="preserve"> Daarna heb ik onmiddellijk die opmerkingen van mijn figma design verbetert en op mijn repository gezet.</w:t>
       </w:r>
     </w:p>
     <w:p/>
@@ -919,47 +629,7 @@
     </w:p>
     <w:p>
       <w:r>
-        <w:t xml:space="preserve">Vandaag begon ik eindelijk met </w:t>
-      </w:r>
-      <w:proofErr w:type="spellStart"/>
-      <w:r>
-        <w:t>Material</w:t>
-      </w:r>
-      <w:proofErr w:type="spellEnd"/>
-      <w:r>
-        <w:t xml:space="preserve"> Design. Ik besloot mijn oude app te verwijderen en te vervangen met een empty </w:t>
-      </w:r>
-      <w:proofErr w:type="spellStart"/>
-      <w:r>
-        <w:t>activity</w:t>
-      </w:r>
-      <w:proofErr w:type="spellEnd"/>
-      <w:r>
-        <w:t xml:space="preserve"> zodat ik echt van scratch begin. Zo kan ik alles beter begrijpen. Ik had dan ontdekt dat </w:t>
-      </w:r>
-      <w:proofErr w:type="spellStart"/>
-      <w:r>
-        <w:t>android</w:t>
-      </w:r>
-      <w:proofErr w:type="spellEnd"/>
-      <w:r>
-        <w:t xml:space="preserve"> studio al automatisch </w:t>
-      </w:r>
-      <w:proofErr w:type="spellStart"/>
-      <w:r>
-        <w:t>Material</w:t>
-      </w:r>
-      <w:proofErr w:type="spellEnd"/>
-      <w:r>
-        <w:t xml:space="preserve"> Design van Google had toegevoegd bij de </w:t>
-      </w:r>
-      <w:proofErr w:type="spellStart"/>
-      <w:r>
-        <w:t>dependencies</w:t>
-      </w:r>
-      <w:proofErr w:type="spellEnd"/>
-      <w:r>
-        <w:t xml:space="preserve">, dus eigenlijk ben ik </w:t>
+        <w:t xml:space="preserve">Vandaag begon ik eindelijk met Material Design. Ik besloot mijn oude app te verwijderen en te vervangen met een empty activity zodat ik echt van scratch begin. Zo kan ik alles beter begrijpen. Ik had dan ontdekt dat android studio al automatisch Material Design van Google had toegevoegd bij de dependencies, dus eigenlijk ben ik </w:t>
       </w:r>
       <w:r>
         <w:t>onmiddellijk</w:t>
@@ -1103,50 +773,18 @@
     </w:p>
     <w:p>
       <w:r>
-        <w:t xml:space="preserve">Eerst had ik geprobeerd om gewoon een heel nieuw project te maken die bestond uit een login </w:t>
-      </w:r>
-      <w:proofErr w:type="spellStart"/>
-      <w:r>
-        <w:t>activity</w:t>
-      </w:r>
-      <w:proofErr w:type="spellEnd"/>
-      <w:r>
-        <w:t xml:space="preserve">. Deze </w:t>
-      </w:r>
-      <w:proofErr w:type="spellStart"/>
-      <w:r>
-        <w:t>activity</w:t>
-      </w:r>
-      <w:proofErr w:type="spellEnd"/>
-      <w:r>
-        <w:t xml:space="preserve"> heb ik dan gewoon aangepast naar mijn wens. Maar dit wou ook niet echt werken, want blijkbaar is het best dat je van een </w:t>
-      </w:r>
-      <w:proofErr w:type="spellStart"/>
-      <w:r>
-        <w:t>main</w:t>
+        <w:t>Eerst had ik geprobeerd om gewoon een heel nieuw project te maken die bestond uit een login activity. Deze activity heb ik dan gewoon aangepast naar mijn wens. Maar dit wou ook niet echt werken, want blijkbaar is het best dat je van een main</w:t>
       </w:r>
       <w:r>
         <w:t>_</w:t>
       </w:r>
       <w:r>
-        <w:t>activity</w:t>
-      </w:r>
-      <w:proofErr w:type="spellEnd"/>
-      <w:r>
-        <w:t xml:space="preserve"> start en dan de login page daarmee opent.</w:t>
-      </w:r>
-    </w:p>
-    <w:p>
-      <w:r>
-        <w:t xml:space="preserve">Ik ben dan gewoon terug begonnen aan het oude project en heb dan de error op stack overflow gezocht en daar had ik de oplossing gevonden. Ik moest gewoon mijn “device” zijn data </w:t>
-      </w:r>
-      <w:proofErr w:type="spellStart"/>
-      <w:r>
-        <w:t>wipen</w:t>
-      </w:r>
-      <w:proofErr w:type="spellEnd"/>
-      <w:r>
-        <w:t xml:space="preserve"> en dan kon het opnieuw installeren want mijn oude projecten stond er nog op.</w:t>
+        <w:t>activity start en dan de login page daarmee opent.</w:t>
+      </w:r>
+    </w:p>
+    <w:p>
+      <w:r>
+        <w:t>Ik ben dan gewoon terug begonnen aan het oude project en heb dan de error op stack overflow gezocht en daar had ik de oplossing gevonden. Ik moest gewoon mijn “device” zijn data wipen en dan kon het opnieuw installeren want mijn oude projecten stond er nog op.</w:t>
       </w:r>
     </w:p>
     <w:p>
@@ -1190,23 +828,7 @@
         <w:t>Vandaag wou de wifi niet werken op de campus dus had ik niet veel vooruitgang geboekt.</w:t>
       </w:r>
       <w:r>
-        <w:t xml:space="preserve"> Ik was ook gisteren vergeten om de registratie pagina te </w:t>
-      </w:r>
-      <w:proofErr w:type="spellStart"/>
-      <w:r>
-        <w:t>committen</w:t>
-      </w:r>
-      <w:proofErr w:type="spellEnd"/>
-      <w:r>
-        <w:t xml:space="preserve">, dus da had ik alleszins gedaan door met mijn </w:t>
-      </w:r>
-      <w:proofErr w:type="spellStart"/>
-      <w:r>
-        <w:t>hotspot</w:t>
-      </w:r>
-      <w:proofErr w:type="spellEnd"/>
-      <w:r>
-        <w:t xml:space="preserve"> van mijn gsm te verbinden en de 4G aan te zetten.</w:t>
+        <w:t xml:space="preserve"> Ik was ook gisteren vergeten om de registratie pagina te committen, dus da had ik alleszins gedaan door met mijn hotspot van mijn gsm te verbinden en de 4G aan te zetten.</w:t>
       </w:r>
     </w:p>
     <w:p>
@@ -1238,21 +860,11 @@
         <w:t>Vandaag wou de wifi op school nog steeds niet zo goed werken</w:t>
       </w:r>
       <w:r>
-        <w:t xml:space="preserve">, maar dankzij de wifi </w:t>
-      </w:r>
-      <w:proofErr w:type="spellStart"/>
-      <w:r>
-        <w:t>hotspot</w:t>
-      </w:r>
-      <w:proofErr w:type="spellEnd"/>
-      <w:r>
-        <w:t xml:space="preserve"> heb ik toch nog de navigatie van login naar registratie kunnen </w:t>
-      </w:r>
-      <w:proofErr w:type="spellStart"/>
+        <w:t xml:space="preserve">, maar dankzij de wifi hotspot heb ik toch nog de navigatie van login naar registratie kunnen </w:t>
+      </w:r>
       <w:r>
         <w:t>commiten</w:t>
       </w:r>
-      <w:proofErr w:type="spellEnd"/>
       <w:r>
         <w:t>.</w:t>
       </w:r>
@@ -1262,15 +874,7 @@
     </w:p>
     <w:p>
       <w:r>
-        <w:t xml:space="preserve">De wifi wou uiteindelijk werken dus kon eindelijk heel vlot vooruitgaan. Ik heb daarbij de navigatie tussen de login en registratie kunnen afwerken. Daarna heb ik ook de startpagina bijna afgewerkt, maar de </w:t>
-      </w:r>
-      <w:proofErr w:type="spellStart"/>
-      <w:r>
-        <w:t>bottom</w:t>
-      </w:r>
-      <w:proofErr w:type="spellEnd"/>
-      <w:r>
-        <w:t xml:space="preserve"> bar wou niet helemaal meewerken dus dat laat ik voor later.</w:t>
+        <w:t>De wifi wou uiteindelijk werken dus kon eindelijk heel vlot vooruitgaan. Ik heb daarbij de navigatie tussen de login en registratie kunnen afwerken. Daarna heb ik ook de startpagina bijna afgewerkt, maar de bottom bar wou niet helemaal meewerken dus dat laat ik voor later.</w:t>
       </w:r>
     </w:p>
     <w:p/>
@@ -1291,31 +895,7 @@
     </w:p>
     <w:p>
       <w:r>
-        <w:t xml:space="preserve">Vandaag heb ik de bodem navigatie afgewerkt waarbij je dan naar je groepen kunt gaan oftewel naar je notities die je hebt gefotografeerd. Dit was eerste wel een </w:t>
-      </w:r>
-      <w:proofErr w:type="spellStart"/>
-      <w:r>
-        <w:t>challenge</w:t>
-      </w:r>
-      <w:proofErr w:type="spellEnd"/>
-      <w:r>
-        <w:t xml:space="preserve"> zoals de </w:t>
-      </w:r>
-      <w:proofErr w:type="spellStart"/>
-      <w:r>
-        <w:t>active</w:t>
-      </w:r>
-      <w:proofErr w:type="spellEnd"/>
-      <w:r>
-        <w:t xml:space="preserve"> pagina weergegeven of de juiste </w:t>
-      </w:r>
-      <w:proofErr w:type="spellStart"/>
-      <w:r>
-        <w:t>eventlistener</w:t>
-      </w:r>
-      <w:proofErr w:type="spellEnd"/>
-      <w:r>
-        <w:t xml:space="preserve"> gebruiken om te kunnen navigeren. Maar deze links hebben daarbij geholpen:</w:t>
+        <w:t>Vandaag heb ik de bodem navigatie afgewerkt waarbij je dan naar je groepen kunt gaan oftewel naar je notities die je hebt gefotografeerd. Dit was eerste wel een challenge zoals de active pagina weergegeven of de juiste eventlistener gebruiken om te kunnen navigeren. Maar deze links hebben daarbij geholpen:</w:t>
       </w:r>
     </w:p>
     <w:p>
@@ -1361,29 +941,13 @@
     </w:p>
     <w:p>
       <w:r>
-        <w:t xml:space="preserve">Ik heb dan ook nog voor gezorgd dat mijn </w:t>
-      </w:r>
-      <w:proofErr w:type="spellStart"/>
-      <w:r>
-        <w:t>firebase</w:t>
-      </w:r>
-      <w:proofErr w:type="spellEnd"/>
-      <w:r>
-        <w:t xml:space="preserve"> account verbonden is met</w:t>
+        <w:t>Ik heb dan ook nog voor gezorgd dat mijn firebase account verbonden is met</w:t>
       </w:r>
       <w:r>
         <w:t xml:space="preserve"> mijn</w:t>
       </w:r>
       <w:r>
-        <w:t xml:space="preserve"> </w:t>
-      </w:r>
-      <w:proofErr w:type="spellStart"/>
-      <w:r>
-        <w:t>android</w:t>
-      </w:r>
-      <w:proofErr w:type="spellEnd"/>
-      <w:r>
-        <w:t xml:space="preserve"> studio app.</w:t>
+        <w:t xml:space="preserve"> android studio app.</w:t>
       </w:r>
     </w:p>
     <w:p>
@@ -1540,13 +1104,8 @@
           <w:numId w:val="1"/>
         </w:numPr>
       </w:pPr>
-      <w:proofErr w:type="spellStart"/>
-      <w:r>
-        <w:t>Firebase</w:t>
-      </w:r>
-      <w:proofErr w:type="spellEnd"/>
-      <w:r>
-        <w:t xml:space="preserve"> implementeren</w:t>
+      <w:r>
+        <w:t>Firebase implementeren</w:t>
       </w:r>
     </w:p>
     <w:p>
@@ -1558,13 +1117,8 @@
         </w:numPr>
       </w:pPr>
       <w:r>
-        <w:t xml:space="preserve">Login en registratie mogelijk maken via </w:t>
-      </w:r>
-      <w:proofErr w:type="spellStart"/>
-      <w:r>
-        <w:t>firebase</w:t>
-      </w:r>
-      <w:proofErr w:type="spellEnd"/>
+        <w:t>Login en registratie mogelijk maken via firebase</w:t>
+      </w:r>
     </w:p>
     <w:p>
       <w:pPr>
@@ -1575,11 +1129,7 @@
         </w:numPr>
       </w:pPr>
       <w:r>
-        <w:t xml:space="preserve">Camera functionaliteit bekijken voor </w:t>
-      </w:r>
-      <w:proofErr w:type="spellStart"/>
-      <w:r>
-        <w:t>andr</w:t>
+        <w:t>Camera functionaliteit bekijken voor andr</w:t>
       </w:r>
       <w:r>
         <w:t>oi</w:t>
@@ -1587,7 +1137,6 @@
       <w:r>
         <w:t>d</w:t>
       </w:r>
-      <w:proofErr w:type="spellEnd"/>
     </w:p>
     <w:p/>
     <w:p>
@@ -1607,66 +1156,10 @@
     </w:p>
     <w:p>
       <w:r>
-        <w:t xml:space="preserve">Hier kan je ondertussen zien dat mijn app verbonden is met </w:t>
-      </w:r>
-      <w:proofErr w:type="spellStart"/>
-      <w:r>
-        <w:t>Firebase</w:t>
-      </w:r>
-      <w:proofErr w:type="spellEnd"/>
-      <w:r>
-        <w:t xml:space="preserve">. Nu vragen ze voor google </w:t>
-      </w:r>
-      <w:proofErr w:type="spellStart"/>
-      <w:r>
-        <w:t>sign</w:t>
-      </w:r>
-      <w:proofErr w:type="spellEnd"/>
-      <w:r>
-        <w:t xml:space="preserve">-in om een sha-1 </w:t>
-      </w:r>
-      <w:proofErr w:type="spellStart"/>
-      <w:r>
-        <w:t>fingerprint</w:t>
-      </w:r>
-      <w:proofErr w:type="spellEnd"/>
-      <w:r>
-        <w:t xml:space="preserve"> toe te voegen.</w:t>
-      </w:r>
-      <w:r>
-        <w:t xml:space="preserve"> Ik wou dan google </w:t>
-      </w:r>
-      <w:proofErr w:type="spellStart"/>
-      <w:r>
-        <w:t>play</w:t>
-      </w:r>
-      <w:proofErr w:type="spellEnd"/>
-      <w:r>
-        <w:t xml:space="preserve"> </w:t>
-      </w:r>
-      <w:proofErr w:type="spellStart"/>
-      <w:r>
-        <w:t>signing</w:t>
-      </w:r>
-      <w:proofErr w:type="spellEnd"/>
-      <w:r>
-        <w:t xml:space="preserve"> pakken om het te genereren </w:t>
-      </w:r>
-      <w:proofErr w:type="spellStart"/>
-      <w:r>
-        <w:t>ipv</w:t>
-      </w:r>
-      <w:proofErr w:type="spellEnd"/>
-      <w:r>
-        <w:t xml:space="preserve"> </w:t>
-      </w:r>
-      <w:proofErr w:type="spellStart"/>
-      <w:r>
-        <w:t>self-signing</w:t>
-      </w:r>
-      <w:proofErr w:type="spellEnd"/>
-      <w:r>
-        <w:t xml:space="preserve">, maar ik moet dan 25 euro eerst betalen voor een </w:t>
+        <w:t>Hier kan je ondertussen zien dat mijn app verbonden is met Firebase. Nu vragen ze voor google sign-in om een sha-1 fingerprint toe te voegen.</w:t>
+      </w:r>
+      <w:r>
+        <w:t xml:space="preserve"> Ik wou dan google play signing pakken om het te genereren ipv self-signing, maar ik moet dan 25 euro eerst betalen voor een </w:t>
       </w:r>
       <w:r>
         <w:t>ontwikkelaar</w:t>
@@ -1737,75 +1230,14 @@
       <w:r>
         <w:t>Als ik wat meer naar onderging bij de “</w:t>
       </w:r>
-      <w:proofErr w:type="spellStart"/>
-      <w:r>
-        <w:t>Authenticating</w:t>
-      </w:r>
-      <w:proofErr w:type="spellEnd"/>
-      <w:r>
-        <w:t xml:space="preserve"> </w:t>
-      </w:r>
-      <w:proofErr w:type="spellStart"/>
-      <w:r>
-        <w:t>Your</w:t>
-      </w:r>
-      <w:proofErr w:type="spellEnd"/>
-      <w:r>
-        <w:t xml:space="preserve"> Client</w:t>
-      </w:r>
-      <w:r>
-        <w:t xml:space="preserve">” pagina (zie link) kan je ook via de terminal van </w:t>
-      </w:r>
-      <w:proofErr w:type="spellStart"/>
-      <w:r>
-        <w:t>android</w:t>
-      </w:r>
-      <w:proofErr w:type="spellEnd"/>
-      <w:r>
-        <w:t xml:space="preserve"> studio een </w:t>
-      </w:r>
-      <w:proofErr w:type="spellStart"/>
-      <w:r>
-        <w:t>command</w:t>
-      </w:r>
-      <w:proofErr w:type="spellEnd"/>
-      <w:r>
-        <w:t xml:space="preserve"> invoeren om de sha-1 </w:t>
-      </w:r>
-      <w:proofErr w:type="spellStart"/>
-      <w:r>
-        <w:t>fingerprint</w:t>
-      </w:r>
-      <w:proofErr w:type="spellEnd"/>
-      <w:r>
-        <w:t xml:space="preserve"> te krijgen. Hierbij moest je “</w:t>
-      </w:r>
-      <w:proofErr w:type="spellStart"/>
-      <w:r>
-        <w:t>gradle</w:t>
-      </w:r>
-      <w:proofErr w:type="spellEnd"/>
-      <w:r>
-        <w:t xml:space="preserve"> </w:t>
-      </w:r>
-      <w:proofErr w:type="spellStart"/>
-      <w:r>
-        <w:t>sigingReport</w:t>
-      </w:r>
-      <w:proofErr w:type="spellEnd"/>
-      <w:r>
-        <w:t>” invoeren en dan ctrl + enter invoeren!!</w:t>
-      </w:r>
-      <w:r>
-        <w:t xml:space="preserve"> Deze heb ik dan toegevoegd aan </w:t>
-      </w:r>
-      <w:proofErr w:type="spellStart"/>
-      <w:r>
-        <w:t>Firebase</w:t>
-      </w:r>
-      <w:proofErr w:type="spellEnd"/>
-      <w:r>
-        <w:t>.</w:t>
+      <w:r>
+        <w:t>Authenticating Your Client</w:t>
+      </w:r>
+      <w:r>
+        <w:t>” pagina (zie link) kan je ook via de terminal van android studio een command invoeren om de sha-1 fingerprint te krijgen. Hierbij moest je “gradle sigingReport” invoeren en dan ctrl + enter invoeren!!</w:t>
+      </w:r>
+      <w:r>
+        <w:t xml:space="preserve"> Deze heb ik dan toegevoegd aan Firebase.</w:t>
       </w:r>
     </w:p>
     <w:p>
@@ -1853,15 +1285,7 @@
     </w:p>
     <w:p>
       <w:r>
-        <w:t xml:space="preserve">Daarna moest ik een </w:t>
-      </w:r>
-      <w:proofErr w:type="spellStart"/>
-      <w:r>
-        <w:t>Oauth</w:t>
-      </w:r>
-      <w:proofErr w:type="spellEnd"/>
-      <w:r>
-        <w:t xml:space="preserve"> 2.0 client ID toevoegen voor het inloggen. Hierbij moest ik een hele configuratie begaan.</w:t>
+        <w:t>Daarna moest ik een Oauth 2.0 client ID toevoegen voor het inloggen. Hierbij moest ik een hele configuratie begaan.</w:t>
       </w:r>
       <w:r>
         <w:t xml:space="preserve"> Ik heb hierbij het meest niet ingevuld zoals een privacy policy, enzoverder.</w:t>
@@ -2042,31 +1466,7 @@
     </w:p>
     <w:p>
       <w:r>
-        <w:t xml:space="preserve">Vandaag had ik tijdens les (in de morgen van 8u15-11u15) verder gewerkt aan de </w:t>
-      </w:r>
-      <w:proofErr w:type="spellStart"/>
-      <w:r>
-        <w:t>back-end</w:t>
-      </w:r>
-      <w:proofErr w:type="spellEnd"/>
-      <w:r>
-        <w:t xml:space="preserve"> van mijn app. Ik was gisteren bezig met google </w:t>
-      </w:r>
-      <w:proofErr w:type="spellStart"/>
-      <w:r>
-        <w:t>sign</w:t>
-      </w:r>
-      <w:proofErr w:type="spellEnd"/>
-      <w:r>
-        <w:t xml:space="preserve">-in, maar ik besloot om eerst normale email/password </w:t>
-      </w:r>
-      <w:proofErr w:type="spellStart"/>
-      <w:r>
-        <w:t>authentication</w:t>
-      </w:r>
-      <w:proofErr w:type="spellEnd"/>
-      <w:r>
-        <w:t xml:space="preserve"> toe te voegen. Dit ging vrij vlot vooruit maar toen ik de button klikt sloot de app af, dus dat moet ik nog oplossen. </w:t>
+        <w:t xml:space="preserve">Vandaag had ik tijdens les (in de morgen van 8u15-11u15) verder gewerkt aan de back-end van mijn app. Ik was gisteren bezig met google sign-in, maar ik besloot om eerst normale email/password authentication toe te voegen. Dit ging vrij vlot vooruit maar toen ik de button klikt sloot de app af, dus dat moet ik nog oplossen. </w:t>
       </w:r>
       <w:r>
         <w:t>Er werd</w:t>
@@ -2112,26 +1512,10 @@
         <w:t>Vandaag heb ik eindelijk de login en registratie kunnen afwerken. Dit had veel moeite gekost.</w:t>
       </w:r>
       <w:r>
-        <w:t xml:space="preserve"> Het probleem was dus dat mijn app bleef crashen als ik probeerde te registeren. Ik had veel op stackoverflow gezocht maar ik kon eerst niks vinden, maar toen zag ik dat de wifi van de device emulator op Android studio geen wifi had. Ik dacht eerst dat dit normaal was, maar begon toen twijfels te krijgen. Ik had dan eerst de info op stackoverflow pagina proberen gebruiken, maar dat was niet juist. Uiteindelijk gewoon mijn gsm </w:t>
-      </w:r>
-      <w:proofErr w:type="spellStart"/>
-      <w:r>
-        <w:t>hotspot</w:t>
-      </w:r>
-      <w:proofErr w:type="spellEnd"/>
-      <w:r>
-        <w:t xml:space="preserve"> 4G gebruiken werkte wel.</w:t>
-      </w:r>
-      <w:r>
-        <w:t xml:space="preserve"> Mijn app crasht dan nog steeds bij registratie maar ik kon wel inloggen door een test account aan te maken op </w:t>
-      </w:r>
-      <w:proofErr w:type="spellStart"/>
-      <w:r>
-        <w:t>Firebase</w:t>
-      </w:r>
-      <w:proofErr w:type="spellEnd"/>
-      <w:r>
-        <w:t>. Dus mijn code werkte, maar toen ik zag dat ik niet gekeken had naar de error van die verscheen na de crash en dat maakte alles duidelijk</w:t>
+        <w:t xml:space="preserve"> Het probleem was dus dat mijn app bleef crashen als ik probeerde te registeren. Ik had veel op stackoverflow gezocht maar ik kon eerst niks vinden, maar toen zag ik dat de wifi van de device emulator op Android studio geen wifi had. Ik dacht eerst dat dit normaal was, maar begon toen twijfels te krijgen. Ik had dan eerst de info op stackoverflow pagina proberen gebruiken, maar dat was niet juist. Uiteindelijk gewoon mijn gsm hotspot 4G gebruiken werkte wel.</w:t>
+      </w:r>
+      <w:r>
+        <w:t xml:space="preserve"> Mijn app crasht dan nog steeds bij registratie maar ik kon wel inloggen door een test account aan te maken op Firebase. Dus mijn code werkte, maar toen ik zag dat ik niet gekeken had naar de error van die verscheen na de crash en dat maakte alles duidelijk</w:t>
       </w:r>
       <w:r>
         <w:t xml:space="preserve"> voor mij</w:t>
@@ -2293,145 +1677,56 @@
           <w:rFonts w:eastAsia="Times New Roman" w:cstheme="minorHAnsi"/>
           <w:lang w:eastAsia="nl-BE"/>
         </w:rPr>
-        <w:t xml:space="preserve">Vandaag heb ik geprobeerd om google </w:t>
-      </w:r>
-      <w:proofErr w:type="spellStart"/>
+        <w:t>Vandaag heb ik geprobeerd om google sign-in te laten werken. Dit ging zeer goed, maar het enige probleem is dat de google account niet wordt toegevoegd aan Firebase en het wil daarna niet naar de volgende pagina gaan als ik de google sign</w:t>
+      </w:r>
       <w:r>
         <w:rPr>
           <w:rFonts w:eastAsia="Times New Roman" w:cstheme="minorHAnsi"/>
           <w:lang w:eastAsia="nl-BE"/>
         </w:rPr>
-        <w:t>sign</w:t>
-      </w:r>
-      <w:proofErr w:type="spellEnd"/>
+        <w:t>-</w:t>
+      </w:r>
       <w:r>
         <w:rPr>
           <w:rFonts w:eastAsia="Times New Roman" w:cstheme="minorHAnsi"/>
           <w:lang w:eastAsia="nl-BE"/>
         </w:rPr>
-        <w:t xml:space="preserve">-in te laten werken. Dit ging zeer goed, maar het enige probleem is dat de google account niet wordt toegevoegd aan </w:t>
-      </w:r>
-      <w:proofErr w:type="spellStart"/>
+        <w:t>in button klik. Het sign-in scherm verschijnt wel en hebben geen errors, maar daarna gebeurt er niks. Ik heb de methode toegevoegd die iemand van teams zei dat die het probleem</w:t>
+      </w:r>
       <w:r>
         <w:rPr>
           <w:rFonts w:eastAsia="Times New Roman" w:cstheme="minorHAnsi"/>
           <w:lang w:eastAsia="nl-BE"/>
         </w:rPr>
-        <w:t>Firebase</w:t>
-      </w:r>
-      <w:proofErr w:type="spellEnd"/>
+        <w:t xml:space="preserve"> zou</w:t>
+      </w:r>
       <w:r>
         <w:rPr>
           <w:rFonts w:eastAsia="Times New Roman" w:cstheme="minorHAnsi"/>
           <w:lang w:eastAsia="nl-BE"/>
         </w:rPr>
-        <w:t xml:space="preserve"> en het wil daarna niet naar de volgende pagina gaan als ik de google </w:t>
-      </w:r>
-      <w:proofErr w:type="spellStart"/>
+        <w:t xml:space="preserve"> oplos</w:t>
+      </w:r>
       <w:r>
         <w:rPr>
           <w:rFonts w:eastAsia="Times New Roman" w:cstheme="minorHAnsi"/>
           <w:lang w:eastAsia="nl-BE"/>
         </w:rPr>
-        <w:t>sign</w:t>
-      </w:r>
-      <w:proofErr w:type="spellEnd"/>
+        <w:t>sen</w:t>
+      </w:r>
       <w:r>
         <w:rPr>
           <w:rFonts w:eastAsia="Times New Roman" w:cstheme="minorHAnsi"/>
           <w:lang w:eastAsia="nl-BE"/>
         </w:rPr>
-        <w:t>-</w:t>
+        <w:t xml:space="preserve"> maar er zal nog ergens een fout zitten.</w:t>
       </w:r>
       <w:r>
         <w:rPr>
           <w:rFonts w:eastAsia="Times New Roman" w:cstheme="minorHAnsi"/>
           <w:lang w:eastAsia="nl-BE"/>
         </w:rPr>
-        <w:t xml:space="preserve">in button klik. Het </w:t>
-      </w:r>
-      <w:proofErr w:type="spellStart"/>
-      <w:r>
-        <w:rPr>
-          <w:rFonts w:eastAsia="Times New Roman" w:cstheme="minorHAnsi"/>
-          <w:lang w:eastAsia="nl-BE"/>
-        </w:rPr>
-        <w:t>sign</w:t>
-      </w:r>
-      <w:proofErr w:type="spellEnd"/>
-      <w:r>
-        <w:rPr>
-          <w:rFonts w:eastAsia="Times New Roman" w:cstheme="minorHAnsi"/>
-          <w:lang w:eastAsia="nl-BE"/>
-        </w:rPr>
-        <w:t xml:space="preserve">-in scherm verschijnt wel en hebben geen </w:t>
-      </w:r>
-      <w:proofErr w:type="spellStart"/>
-      <w:r>
-        <w:rPr>
-          <w:rFonts w:eastAsia="Times New Roman" w:cstheme="minorHAnsi"/>
-          <w:lang w:eastAsia="nl-BE"/>
-        </w:rPr>
-        <w:t>errors</w:t>
-      </w:r>
-      <w:proofErr w:type="spellEnd"/>
-      <w:r>
-        <w:rPr>
-          <w:rFonts w:eastAsia="Times New Roman" w:cstheme="minorHAnsi"/>
-          <w:lang w:eastAsia="nl-BE"/>
-        </w:rPr>
-        <w:t>, maar daarna gebeurt er niks. Ik heb de methode toegevoegd die iemand van teams zei dat die het probleem</w:t>
-      </w:r>
-      <w:r>
-        <w:rPr>
-          <w:rFonts w:eastAsia="Times New Roman" w:cstheme="minorHAnsi"/>
-          <w:lang w:eastAsia="nl-BE"/>
-        </w:rPr>
-        <w:t xml:space="preserve"> zou</w:t>
-      </w:r>
-      <w:r>
-        <w:rPr>
-          <w:rFonts w:eastAsia="Times New Roman" w:cstheme="minorHAnsi"/>
-          <w:lang w:eastAsia="nl-BE"/>
-        </w:rPr>
-        <w:t xml:space="preserve"> oplos</w:t>
-      </w:r>
-      <w:r>
-        <w:rPr>
-          <w:rFonts w:eastAsia="Times New Roman" w:cstheme="minorHAnsi"/>
-          <w:lang w:eastAsia="nl-BE"/>
-        </w:rPr>
-        <w:t>sen</w:t>
-      </w:r>
-      <w:r>
-        <w:rPr>
-          <w:rFonts w:eastAsia="Times New Roman" w:cstheme="minorHAnsi"/>
-          <w:lang w:eastAsia="nl-BE"/>
-        </w:rPr>
-        <w:t xml:space="preserve"> maar er zal nog ergens een fout zitten.</w:t>
-      </w:r>
-      <w:r>
-        <w:rPr>
-          <w:rFonts w:eastAsia="Times New Roman" w:cstheme="minorHAnsi"/>
-          <w:lang w:eastAsia="nl-BE"/>
-        </w:rPr>
-        <w:t xml:space="preserve"> 1 van de methodes was wel </w:t>
-      </w:r>
-      <w:proofErr w:type="spellStart"/>
-      <w:r>
-        <w:rPr>
-          <w:rFonts w:eastAsia="Times New Roman" w:cstheme="minorHAnsi"/>
-          <w:lang w:eastAsia="nl-BE"/>
-        </w:rPr>
-        <w:t>deprecated</w:t>
-      </w:r>
-      <w:proofErr w:type="spellEnd"/>
-      <w:r>
-        <w:rPr>
-          <w:rFonts w:eastAsia="Times New Roman" w:cstheme="minorHAnsi"/>
-          <w:lang w:eastAsia="nl-BE"/>
-        </w:rPr>
-        <w:t xml:space="preserve">, maar die had </w:t>
+        <w:t xml:space="preserve"> 1 van de methodes was wel deprecated, maar die had </w:t>
       </w:r>
       <w:r>
         <w:rPr>
@@ -2596,167 +1891,7 @@
           <w:rFonts w:eastAsia="Times New Roman" w:cstheme="minorHAnsi"/>
           <w:lang w:eastAsia="nl-BE"/>
         </w:rPr>
-        <w:t xml:space="preserve">Vandaag is het me gelukt om de google </w:t>
-      </w:r>
-      <w:proofErr w:type="spellStart"/>
-      <w:r>
-        <w:rPr>
-          <w:rFonts w:eastAsia="Times New Roman" w:cstheme="minorHAnsi"/>
-          <w:lang w:eastAsia="nl-BE"/>
-        </w:rPr>
-        <w:t>sign</w:t>
-      </w:r>
-      <w:proofErr w:type="spellEnd"/>
-      <w:r>
-        <w:rPr>
-          <w:rFonts w:eastAsia="Times New Roman" w:cstheme="minorHAnsi"/>
-          <w:lang w:eastAsia="nl-BE"/>
-        </w:rPr>
-        <w:t xml:space="preserve">-in te laten werken. Ik had veel opzoek werk gedaan op google maar kon niks duidelijk vinden. Ik had mijn code ook gedebugd, maar geen duidelijk error werd weergegeven. Uiteindelijk besloot ik opzoek te gaan naar een tutorial die recent was in 2021. Deze tutorial heb ik dan gebruikt om mijn project </w:t>
-      </w:r>
-      <w:proofErr w:type="spellStart"/>
-      <w:r>
-        <w:rPr>
-          <w:rFonts w:eastAsia="Times New Roman" w:cstheme="minorHAnsi"/>
-          <w:lang w:eastAsia="nl-BE"/>
-        </w:rPr>
-        <w:t>strict</w:t>
-      </w:r>
-      <w:proofErr w:type="spellEnd"/>
-      <w:r>
-        <w:rPr>
-          <w:rFonts w:eastAsia="Times New Roman" w:cstheme="minorHAnsi"/>
-          <w:lang w:eastAsia="nl-BE"/>
-        </w:rPr>
-        <w:t xml:space="preserve"> te controleren en toen realiseerde ik dat de SHA-1 niet op de juiste plaats stond. Ik had op google </w:t>
-      </w:r>
-      <w:proofErr w:type="spellStart"/>
-      <w:r>
-        <w:rPr>
-          <w:rFonts w:eastAsia="Times New Roman" w:cstheme="minorHAnsi"/>
-          <w:lang w:eastAsia="nl-BE"/>
-        </w:rPr>
-        <w:t>cloud</w:t>
-      </w:r>
-      <w:proofErr w:type="spellEnd"/>
-      <w:r>
-        <w:rPr>
-          <w:rFonts w:eastAsia="Times New Roman" w:cstheme="minorHAnsi"/>
-          <w:lang w:eastAsia="nl-BE"/>
-        </w:rPr>
-        <w:t xml:space="preserve"> een </w:t>
-      </w:r>
-      <w:proofErr w:type="spellStart"/>
-      <w:r>
-        <w:rPr>
-          <w:rFonts w:eastAsia="Times New Roman" w:cstheme="minorHAnsi"/>
-          <w:lang w:eastAsia="nl-BE"/>
-        </w:rPr>
-        <w:t>Oauth</w:t>
-      </w:r>
-      <w:proofErr w:type="spellEnd"/>
-      <w:r>
-        <w:rPr>
-          <w:rFonts w:eastAsia="Times New Roman" w:cstheme="minorHAnsi"/>
-          <w:lang w:eastAsia="nl-BE"/>
-        </w:rPr>
-        <w:t xml:space="preserve"> 2.0 client </w:t>
-      </w:r>
-      <w:proofErr w:type="spellStart"/>
-      <w:r>
-        <w:rPr>
-          <w:rFonts w:eastAsia="Times New Roman" w:cstheme="minorHAnsi"/>
-          <w:lang w:eastAsia="nl-BE"/>
-        </w:rPr>
-        <w:t>id</w:t>
-      </w:r>
-      <w:proofErr w:type="spellEnd"/>
-      <w:r>
-        <w:rPr>
-          <w:rFonts w:eastAsia="Times New Roman" w:cstheme="minorHAnsi"/>
-          <w:lang w:eastAsia="nl-BE"/>
-        </w:rPr>
-        <w:t xml:space="preserve"> moeten aanmaken toen ik de </w:t>
-      </w:r>
-      <w:proofErr w:type="spellStart"/>
-      <w:r>
-        <w:rPr>
-          <w:rFonts w:eastAsia="Times New Roman" w:cstheme="minorHAnsi"/>
-          <w:lang w:eastAsia="nl-BE"/>
-        </w:rPr>
-        <w:t>android</w:t>
-      </w:r>
-      <w:proofErr w:type="spellEnd"/>
-      <w:r>
-        <w:rPr>
-          <w:rFonts w:eastAsia="Times New Roman" w:cstheme="minorHAnsi"/>
-          <w:lang w:eastAsia="nl-BE"/>
-        </w:rPr>
-        <w:t xml:space="preserve"> studio </w:t>
-      </w:r>
-      <w:proofErr w:type="spellStart"/>
-      <w:r>
-        <w:rPr>
-          <w:rFonts w:eastAsia="Times New Roman" w:cstheme="minorHAnsi"/>
-          <w:lang w:eastAsia="nl-BE"/>
-        </w:rPr>
-        <w:t>firebase</w:t>
-      </w:r>
-      <w:proofErr w:type="spellEnd"/>
-      <w:r>
-        <w:rPr>
-          <w:rFonts w:eastAsia="Times New Roman" w:cstheme="minorHAnsi"/>
-          <w:lang w:eastAsia="nl-BE"/>
-        </w:rPr>
-        <w:t xml:space="preserve"> tutorial volgde, maar dat bleek dus helemaal fout te zijn, want de echte </w:t>
-      </w:r>
-      <w:proofErr w:type="spellStart"/>
-      <w:r>
-        <w:rPr>
-          <w:rFonts w:eastAsia="Times New Roman" w:cstheme="minorHAnsi"/>
-          <w:lang w:eastAsia="nl-BE"/>
-        </w:rPr>
-        <w:t>client_id</w:t>
-      </w:r>
-      <w:proofErr w:type="spellEnd"/>
-      <w:r>
-        <w:rPr>
-          <w:rFonts w:eastAsia="Times New Roman" w:cstheme="minorHAnsi"/>
-          <w:lang w:eastAsia="nl-BE"/>
-        </w:rPr>
-        <w:t xml:space="preserve"> was eigenlijk al klaar in een google-</w:t>
-      </w:r>
-      <w:proofErr w:type="spellStart"/>
-      <w:r>
-        <w:rPr>
-          <w:rFonts w:eastAsia="Times New Roman" w:cstheme="minorHAnsi"/>
-          <w:lang w:eastAsia="nl-BE"/>
-        </w:rPr>
-        <w:t>services.json</w:t>
-      </w:r>
-      <w:proofErr w:type="spellEnd"/>
-      <w:r>
-        <w:rPr>
-          <w:rFonts w:eastAsia="Times New Roman" w:cstheme="minorHAnsi"/>
-          <w:lang w:eastAsia="nl-BE"/>
-        </w:rPr>
-        <w:t xml:space="preserve"> file. Ik moest toen ook mijn SHA-1 </w:t>
-      </w:r>
-      <w:proofErr w:type="spellStart"/>
-      <w:r>
-        <w:rPr>
-          <w:rFonts w:eastAsia="Times New Roman" w:cstheme="minorHAnsi"/>
-          <w:lang w:eastAsia="nl-BE"/>
-        </w:rPr>
-        <w:t>fingerprint</w:t>
-      </w:r>
-      <w:proofErr w:type="spellEnd"/>
-      <w:r>
-        <w:rPr>
-          <w:rFonts w:eastAsia="Times New Roman" w:cstheme="minorHAnsi"/>
-          <w:lang w:eastAsia="nl-BE"/>
-        </w:rPr>
-        <w:t xml:space="preserve"> verwijderen bij de onderstaande afbeelding, maar dat mocht daar eigenlijk blijven staan.</w:t>
+        <w:t>Vandaag is het me gelukt om de google sign-in te laten werken. Ik had veel opzoek werk gedaan op google maar kon niks duidelijk vinden. Ik had mijn code ook gedebugd, maar geen duidelijk error werd weergegeven. Uiteindelijk besloot ik opzoek te gaan naar een tutorial die recent was in 2021. Deze tutorial heb ik dan gebruikt om mijn project strict te controleren en toen realiseerde ik dat de SHA-1 niet op de juiste plaats stond. Ik had op google cloud een Oauth 2.0 client id moeten aanmaken toen ik de android studio firebase tutorial volgde, maar dat bleek dus helemaal fout te zijn, want de echte client_id was eigenlijk al klaar in een google-services.json file. Ik moest toen ook mijn SHA-1 fingerprint verwijderen bij de onderstaande afbeelding, maar dat mocht daar eigenlijk blijven staan.</w:t>
       </w:r>
       <w:r>
         <w:rPr>
@@ -2975,13 +2110,8 @@
           <w:numId w:val="2"/>
         </w:numPr>
       </w:pPr>
-      <w:proofErr w:type="spellStart"/>
-      <w:r>
-        <w:t>Firebase</w:t>
-      </w:r>
-      <w:proofErr w:type="spellEnd"/>
-      <w:r>
-        <w:t xml:space="preserve"> </w:t>
+      <w:r>
+        <w:t xml:space="preserve">Firebase </w:t>
       </w:r>
       <w:r>
         <w:t>storage</w:t>
@@ -3023,29 +2153,13 @@
     </w:p>
     <w:p>
       <w:r>
-        <w:t xml:space="preserve">Vandaag ben ik begonnen met aanmaken van de </w:t>
-      </w:r>
-      <w:proofErr w:type="spellStart"/>
-      <w:r>
-        <w:t>Firebase</w:t>
-      </w:r>
-      <w:proofErr w:type="spellEnd"/>
-      <w:r>
-        <w:t xml:space="preserve"> storage voor het opslaan van afbeeldingen.</w:t>
+        <w:t>Vandaag ben ik begonnen met aanmaken van de Firebase storage voor het opslaan van afbeeldingen.</w:t>
       </w:r>
       <w:r>
         <w:t xml:space="preserve"> </w:t>
       </w:r>
       <w:r>
-        <w:t xml:space="preserve">Ik heb dan de </w:t>
-      </w:r>
-      <w:proofErr w:type="spellStart"/>
-      <w:r>
-        <w:t>dependencies</w:t>
-      </w:r>
-      <w:proofErr w:type="spellEnd"/>
-      <w:r>
-        <w:t xml:space="preserve"> toegevoegd en dan moest ik een Cloud storage bucket aanmaken. Hierbij werd er gevraagd om een locatie te kiezen waarbij Europe-west 1 (= Belgische regio) niet tussen stond, maar gelukkig is er Eur3 die eigenlijk Belgische en Nederlandse regio voorstelt. Dat werd uitgelegd </w:t>
+        <w:t xml:space="preserve">Ik heb dan de dependencies toegevoegd en dan moest ik een Cloud storage bucket aanmaken. Hierbij werd er gevraagd om een locatie te kiezen waarbij Europe-west 1 (= Belgische regio) niet tussen stond, maar gelukkig is er Eur3 die eigenlijk Belgische en Nederlandse regio voorstelt. Dat werd uitgelegd </w:t>
       </w:r>
       <w:r>
         <w:t>op deze webpagina</w:t>
@@ -3158,52 +2272,12 @@
     </w:p>
     <w:p>
       <w:r>
-        <w:t xml:space="preserve">Vandaag heb ik de </w:t>
-      </w:r>
-      <w:proofErr w:type="spellStart"/>
-      <w:r>
-        <w:t>java</w:t>
-      </w:r>
-      <w:proofErr w:type="spellEnd"/>
-      <w:r>
-        <w:t xml:space="preserve"> code moet schrijven voor de camera te kunnen gebruiken. Eerst heb ik code toegevoegd dat ervoor zorgt dat de permissies worden aangevraagd om de camera te kunnen gebruiken. Daarna als ik </w:t>
-      </w:r>
-      <w:proofErr w:type="spellStart"/>
-      <w:r>
-        <w:t>allow</w:t>
-      </w:r>
-      <w:proofErr w:type="spellEnd"/>
-      <w:r>
-        <w:t xml:space="preserve"> klik dan opent een test camera zicht van de emulator. </w:t>
-      </w:r>
-    </w:p>
-    <w:p>
-      <w:r>
-        <w:t xml:space="preserve">Hierbij werden gelijkaardig methoden gebruikt zoals de </w:t>
-      </w:r>
-      <w:proofErr w:type="spellStart"/>
-      <w:r>
-        <w:t>firebase</w:t>
-      </w:r>
-      <w:proofErr w:type="spellEnd"/>
-      <w:r>
-        <w:t xml:space="preserve"> </w:t>
-      </w:r>
-      <w:proofErr w:type="spellStart"/>
-      <w:r>
-        <w:t>authentication</w:t>
-      </w:r>
-      <w:proofErr w:type="spellEnd"/>
-      <w:r>
-        <w:t xml:space="preserve">, maar waren ook </w:t>
-      </w:r>
-      <w:proofErr w:type="spellStart"/>
-      <w:r>
-        <w:t>deprecated</w:t>
-      </w:r>
-      <w:proofErr w:type="spellEnd"/>
-      <w:r>
-        <w:t>. Dit heb natuurlijk makkelijk opgelost.</w:t>
+        <w:t xml:space="preserve">Vandaag heb ik de java code moet schrijven voor de camera te kunnen gebruiken. Eerst heb ik code toegevoegd dat ervoor zorgt dat de permissies worden aangevraagd om de camera te kunnen gebruiken. Daarna als ik allow klik dan opent een test camera zicht van de emulator. </w:t>
+      </w:r>
+    </w:p>
+    <w:p>
+      <w:r>
+        <w:t>Hierbij werden gelijkaardig methoden gebruikt zoals de firebase authentication, maar waren ook deprecated. Dit heb natuurlijk makkelijk opgelost.</w:t>
       </w:r>
     </w:p>
     <w:p>
@@ -3277,15 +2351,7 @@
     </w:p>
     <w:p>
       <w:r>
-        <w:t xml:space="preserve">Vandaag heb ik geprobeerd om de image die getrokken wordt op te slaan in </w:t>
-      </w:r>
-      <w:proofErr w:type="spellStart"/>
-      <w:r>
-        <w:t>firebase</w:t>
-      </w:r>
-      <w:proofErr w:type="spellEnd"/>
-      <w:r>
-        <w:t xml:space="preserve"> storage</w:t>
+        <w:t>Vandaag heb ik geprobeerd om de image die getrokken wordt op te slaan in firebase storage</w:t>
       </w:r>
       <w:r>
         <w:t>. Dit is op het einde van de les gelukt.</w:t>
@@ -3339,90 +2405,10 @@
     <w:p>
       <w:r>
         <w:lastRenderedPageBreak/>
-        <w:t xml:space="preserve">Hierbij had ik vooral problemen met de </w:t>
-      </w:r>
-      <w:proofErr w:type="spellStart"/>
-      <w:r>
-        <w:t>uri</w:t>
-      </w:r>
-      <w:proofErr w:type="spellEnd"/>
-      <w:r>
-        <w:t xml:space="preserve"> </w:t>
-      </w:r>
-      <w:proofErr w:type="spellStart"/>
-      <w:r>
-        <w:t>oftewl</w:t>
-      </w:r>
-      <w:proofErr w:type="spellEnd"/>
-      <w:r>
-        <w:t xml:space="preserve"> URL omdat </w:t>
-      </w:r>
-      <w:proofErr w:type="spellStart"/>
-      <w:r>
-        <w:t>firebase</w:t>
-      </w:r>
-      <w:proofErr w:type="spellEnd"/>
-      <w:r>
-        <w:t xml:space="preserve"> die nodig had om te kunnen uploaden. Als je naar de eerste rode streep kijkt is er een methode voor </w:t>
-      </w:r>
-      <w:r>
-        <w:t xml:space="preserve">de </w:t>
-      </w:r>
-      <w:proofErr w:type="spellStart"/>
-      <w:r>
-        <w:t>bitmap</w:t>
-      </w:r>
-      <w:proofErr w:type="spellEnd"/>
-      <w:r>
-        <w:t xml:space="preserve"> die je krijgt van de camera te gebruiken om de </w:t>
-      </w:r>
-      <w:proofErr w:type="spellStart"/>
-      <w:r>
-        <w:t>uri</w:t>
-      </w:r>
-      <w:proofErr w:type="spellEnd"/>
-      <w:r>
-        <w:t xml:space="preserve"> te bepalen. De volgende is voor de bestandextensie te krijgen om een </w:t>
-      </w:r>
-      <w:proofErr w:type="spellStart"/>
-      <w:r>
-        <w:t>filename</w:t>
-      </w:r>
-      <w:proofErr w:type="spellEnd"/>
-      <w:r>
-        <w:t xml:space="preserve"> op te stellen in de </w:t>
-      </w:r>
-      <w:proofErr w:type="spellStart"/>
-      <w:r>
-        <w:t>firebase</w:t>
-      </w:r>
-      <w:proofErr w:type="spellEnd"/>
-      <w:r>
-        <w:t xml:space="preserve"> storage. Hierbij pak ik gewoon het tijdstip met de bestandextensie, maar ik ben misschien van plan om de </w:t>
-      </w:r>
-      <w:proofErr w:type="spellStart"/>
-      <w:r>
-        <w:t>filename</w:t>
-      </w:r>
-      <w:proofErr w:type="spellEnd"/>
-      <w:r>
-        <w:t xml:space="preserve"> te kunnen aanpassen door de gebruiker. De laatste streep zijn twee </w:t>
-      </w:r>
-      <w:proofErr w:type="spellStart"/>
-      <w:r>
-        <w:t>child</w:t>
-      </w:r>
-      <w:proofErr w:type="spellEnd"/>
-      <w:r>
-        <w:t xml:space="preserve"> </w:t>
-      </w:r>
-      <w:proofErr w:type="spellStart"/>
-      <w:r>
-        <w:t>methods</w:t>
-      </w:r>
-      <w:proofErr w:type="spellEnd"/>
-      <w:r>
-        <w:t xml:space="preserve"> waarbij dus de eerste de map voorstelt waar dan de 2</w:t>
+        <w:t xml:space="preserve">Hierbij had ik vooral problemen met de uri oftewl URL omdat firebase die nodig had om te kunnen uploaden. Als je naar de eerste rode streep kijkt is er een methode voor </w:t>
+      </w:r>
+      <w:r>
+        <w:t>de bitmap die je krijgt van de camera te gebruiken om de uri te bepalen. De volgende is voor de bestandextensie te krijgen om een filename op te stellen in de firebase storage. Hierbij pak ik gewoon het tijdstip met de bestandextensie, maar ik ben misschien van plan om de filename te kunnen aanpassen door de gebruiker. De laatste streep zijn twee child methods waarbij dus de eerste de map voorstelt waar dan de 2</w:t>
       </w:r>
       <w:r>
         <w:rPr>
@@ -3431,15 +2417,7 @@
         <w:t>de</w:t>
       </w:r>
       <w:r>
-        <w:t xml:space="preserve"> </w:t>
-      </w:r>
-      <w:proofErr w:type="spellStart"/>
-      <w:r>
-        <w:t>child</w:t>
-      </w:r>
-      <w:proofErr w:type="spellEnd"/>
-      <w:r>
-        <w:t xml:space="preserve"> oftewel de image inkomt. De map geef ik  het email adres van de gebruiker als naam.</w:t>
+        <w:t xml:space="preserve"> child oftewel de image inkomt. De map geef ik  het email adres van de gebruiker als naam.</w:t>
       </w:r>
     </w:p>
     <w:p>
@@ -3579,15 +2557,7 @@
         <w:t>je gsm</w:t>
       </w:r>
       <w:r>
-        <w:t xml:space="preserve"> </w:t>
-      </w:r>
-      <w:proofErr w:type="spellStart"/>
-      <w:r>
-        <w:t>gallery</w:t>
-      </w:r>
-      <w:proofErr w:type="spellEnd"/>
-      <w:r>
-        <w:t xml:space="preserve"> gebruiken)</w:t>
+        <w:t xml:space="preserve"> gallery gebruiken)</w:t>
       </w:r>
     </w:p>
     <w:p/>
@@ -3608,23 +2578,7 @@
     </w:p>
     <w:p>
       <w:r>
-        <w:t xml:space="preserve">Vandaag heb ik geprobeerd om een </w:t>
-      </w:r>
-      <w:proofErr w:type="spellStart"/>
-      <w:r>
-        <w:t>gridview</w:t>
-      </w:r>
-      <w:proofErr w:type="spellEnd"/>
-      <w:r>
-        <w:t xml:space="preserve"> toe te voegen die images bevat dat dus lijkt op een image </w:t>
-      </w:r>
-      <w:proofErr w:type="spellStart"/>
-      <w:r>
-        <w:t>gallery</w:t>
-      </w:r>
-      <w:proofErr w:type="spellEnd"/>
-      <w:r>
-        <w:t xml:space="preserve"> zoals uw “foto’s” app. Hierbij heb ik de </w:t>
+        <w:t xml:space="preserve">Vandaag heb ik geprobeerd om een gridview toe te voegen die images bevat dat dus lijkt op een image gallery zoals uw “foto’s” app. Hierbij heb ik de </w:t>
       </w:r>
       <w:r>
         <w:t>volgende</w:t>
@@ -3669,15 +2623,7 @@
     </w:p>
     <w:p>
       <w:r>
-        <w:t xml:space="preserve">Dit heeft nog niet direct resultaat gegeven, maar de </w:t>
-      </w:r>
-      <w:proofErr w:type="spellStart"/>
-      <w:r>
-        <w:t>GridAdapter</w:t>
-      </w:r>
-      <w:proofErr w:type="spellEnd"/>
-      <w:r>
-        <w:t xml:space="preserve"> class geeft een gevoel dat ik wel op de goeie weg zit.</w:t>
+        <w:t>Dit heeft nog niet direct resultaat gegeven, maar de GridAdapter class geeft een gevoel dat ik wel op de goeie weg zit.</w:t>
       </w:r>
     </w:p>
     <w:p/>
@@ -3698,31 +2644,7 @@
     </w:p>
     <w:p>
       <w:r>
-        <w:t xml:space="preserve">Na de </w:t>
-      </w:r>
-      <w:proofErr w:type="spellStart"/>
-      <w:r>
-        <w:t>GridAdapter</w:t>
-      </w:r>
-      <w:proofErr w:type="spellEnd"/>
-      <w:r>
-        <w:t xml:space="preserve"> klasse te controleren ontdekte ik dat ik gewoon het verkeerd image </w:t>
-      </w:r>
-      <w:proofErr w:type="spellStart"/>
-      <w:r>
-        <w:t>Id</w:t>
-      </w:r>
-      <w:proofErr w:type="spellEnd"/>
-      <w:r>
-        <w:t xml:space="preserve"> doorgegeven heb. Dit heeft het probleem onmiddellijk </w:t>
-      </w:r>
-      <w:proofErr w:type="spellStart"/>
-      <w:r>
-        <w:t>gefixed</w:t>
-      </w:r>
-      <w:proofErr w:type="spellEnd"/>
-      <w:r>
-        <w:t xml:space="preserve"> als zijn de voorbeeld images niet echt mooi gepositioneerd.</w:t>
+        <w:t>Na de GridAdapter klasse te controleren ontdekte ik dat ik gewoon het verkeerd image Id doorgegeven heb. Dit heeft het probleem onmiddellijk gefixed als zijn de voorbeeld images niet echt mooi gepositioneerd.</w:t>
       </w:r>
     </w:p>
     <w:p>
@@ -3776,15 +2698,7 @@
         <w:t>gedetailleerd</w:t>
       </w:r>
       <w:r>
-        <w:t xml:space="preserve"> tutorial gevolgd hoe je met een </w:t>
-      </w:r>
-      <w:proofErr w:type="spellStart"/>
-      <w:r>
-        <w:t>gridview</w:t>
-      </w:r>
-      <w:proofErr w:type="spellEnd"/>
-      <w:r>
-        <w:t xml:space="preserve"> kan werken:</w:t>
+        <w:t xml:space="preserve"> tutorial gevolgd hoe je met een gridview kan werken:</w:t>
       </w:r>
     </w:p>
     <w:p>
@@ -3799,58 +2713,10 @@
     </w:p>
     <w:p>
       <w:r>
-        <w:t xml:space="preserve">Daarna heb ik er nog voor gezorgd dat de </w:t>
-      </w:r>
-      <w:proofErr w:type="spellStart"/>
-      <w:r>
-        <w:t>margin</w:t>
-      </w:r>
-      <w:proofErr w:type="spellEnd"/>
-      <w:r>
-        <w:t xml:space="preserve"> top en </w:t>
-      </w:r>
-      <w:proofErr w:type="spellStart"/>
-      <w:r>
-        <w:t>bottom</w:t>
-      </w:r>
-      <w:proofErr w:type="spellEnd"/>
-      <w:r>
-        <w:t xml:space="preserve"> via </w:t>
-      </w:r>
-      <w:proofErr w:type="spellStart"/>
-      <w:r>
-        <w:t>java</w:t>
-      </w:r>
-      <w:proofErr w:type="spellEnd"/>
-      <w:r>
-        <w:t xml:space="preserve"> code worden aangepast afhankelijk van de </w:t>
-      </w:r>
-      <w:r>
-        <w:t xml:space="preserve">hoogte van de header en </w:t>
-      </w:r>
-      <w:proofErr w:type="spellStart"/>
-      <w:r>
-        <w:t>footer</w:t>
-      </w:r>
-      <w:proofErr w:type="spellEnd"/>
-      <w:r>
-        <w:t xml:space="preserve">. Dit </w:t>
-      </w:r>
-      <w:proofErr w:type="spellStart"/>
-      <w:r>
-        <w:t>werdt</w:t>
-      </w:r>
-      <w:proofErr w:type="spellEnd"/>
-      <w:r>
-        <w:t xml:space="preserve"> gedaan in </w:t>
-      </w:r>
-      <w:proofErr w:type="spellStart"/>
-      <w:r>
-        <w:t>OnCreateView</w:t>
-      </w:r>
-      <w:proofErr w:type="spellEnd"/>
-      <w:r>
-        <w:t>():</w:t>
+        <w:t xml:space="preserve">Daarna heb ik er nog voor gezorgd dat de margin top en bottom via java code worden aangepast afhankelijk van de </w:t>
+      </w:r>
+      <w:r>
+        <w:t>hoogte van de header en footer. Dit werdt gedaan in OnCreateView():</w:t>
       </w:r>
     </w:p>
     <w:p>
@@ -3898,66 +2764,13 @@
     </w:p>
     <w:p>
       <w:r>
-        <w:t xml:space="preserve">Ik heb dan de elementen een witte achtergrond gegeven en dan een border rond gedaan dat eigenlijk vrij moeilijk en inefficiënt moet worden opgeroepen in </w:t>
-      </w:r>
-      <w:proofErr w:type="spellStart"/>
-      <w:r>
-        <w:t>android</w:t>
-      </w:r>
-      <w:proofErr w:type="spellEnd"/>
-      <w:r>
-        <w:t xml:space="preserve"> studio door middel van een &lt;</w:t>
-      </w:r>
-      <w:proofErr w:type="spellStart"/>
-      <w:r>
-        <w:t>shape</w:t>
-      </w:r>
-      <w:proofErr w:type="spellEnd"/>
-      <w:r>
-        <w:t xml:space="preserve">&gt; </w:t>
-      </w:r>
-      <w:proofErr w:type="spellStart"/>
-      <w:r>
-        <w:t>xml</w:t>
-      </w:r>
-      <w:proofErr w:type="spellEnd"/>
-      <w:r>
-        <w:t xml:space="preserve"> file te maken in de </w:t>
-      </w:r>
-      <w:proofErr w:type="spellStart"/>
-      <w:r>
-        <w:t>res</w:t>
-      </w:r>
-      <w:proofErr w:type="spellEnd"/>
-      <w:r>
-        <w:t>/</w:t>
-      </w:r>
-      <w:proofErr w:type="spellStart"/>
-      <w:r>
-        <w:t>drawable</w:t>
-      </w:r>
-      <w:proofErr w:type="spellEnd"/>
-      <w:r>
-        <w:t xml:space="preserve"> folder en die een </w:t>
-      </w:r>
-      <w:proofErr w:type="spellStart"/>
-      <w:r>
-        <w:t>stroke</w:t>
-      </w:r>
-      <w:proofErr w:type="spellEnd"/>
+        <w:t>Ik heb dan de elementen een witte achtergrond gegeven en dan een border rond gedaan dat eigenlijk vrij moeilijk en inefficiënt moet worden opgeroepen in android studio door middel van een &lt;shape&gt; xml file te maken in de res/drawable folder en die een stroke</w:t>
+      </w:r>
       <w:r>
         <w:t>, enzoverder</w:t>
       </w:r>
       <w:r>
-        <w:t xml:space="preserve"> te geven. Dan wordt deze </w:t>
-      </w:r>
-      <w:proofErr w:type="spellStart"/>
-      <w:r>
-        <w:t>drawable</w:t>
-      </w:r>
-      <w:proofErr w:type="spellEnd"/>
-      <w:r>
-        <w:t xml:space="preserve"> als achtergrond geplaatst van de imageview.</w:t>
+        <w:t xml:space="preserve"> te geven. Dan wordt deze drawable als achtergrond geplaatst van de imageview.</w:t>
       </w:r>
       <w:r>
         <w:t xml:space="preserve"> De lege elementen zijn gewoon witte icoontjes die dus niet zichtbaar zijn door de witte achtergrond.</w:t>
@@ -4008,23 +2821,7 @@
     <w:p/>
     <w:p>
       <w:r>
-        <w:t xml:space="preserve">Om te eindigen, moest ik nog de images van </w:t>
-      </w:r>
-      <w:proofErr w:type="spellStart"/>
-      <w:r>
-        <w:t>firebase</w:t>
-      </w:r>
-      <w:proofErr w:type="spellEnd"/>
-      <w:r>
-        <w:t xml:space="preserve"> toevoegen hierbij heb ik vooral code van stackoverflow gebruikt om mijn oude klassen en </w:t>
-      </w:r>
-      <w:proofErr w:type="spellStart"/>
-      <w:r>
-        <w:t>methods</w:t>
-      </w:r>
-      <w:proofErr w:type="spellEnd"/>
-      <w:r>
-        <w:t xml:space="preserve"> te verbeteren.</w:t>
+        <w:t>Om te eindigen, moest ik nog de images van firebase toevoegen hierbij heb ik vooral code van stackoverflow gebruikt om mijn oude klassen en methods te verbeteren.</w:t>
       </w:r>
     </w:p>
     <w:p>
@@ -4121,75 +2918,14 @@
     </w:p>
     <w:p>
       <w:r>
-        <w:t xml:space="preserve">Ik had een image asset toegevoegd dat dus er voor zorgde dat de oude logo files worden vervangen. Hierbij heb een logo afbeelding als </w:t>
-      </w:r>
-      <w:proofErr w:type="spellStart"/>
-      <w:r>
-        <w:t>foreground</w:t>
-      </w:r>
-      <w:proofErr w:type="spellEnd"/>
-      <w:r>
-        <w:t xml:space="preserve"> en een transparant afbeelding als background. Maar dit wou niet helemaal werken door </w:t>
-      </w:r>
-      <w:proofErr w:type="spellStart"/>
-      <w:r>
-        <w:t>adaptive</w:t>
-      </w:r>
-      <w:proofErr w:type="spellEnd"/>
-      <w:r>
-        <w:t xml:space="preserve"> icon en </w:t>
-      </w:r>
-      <w:proofErr w:type="spellStart"/>
-      <w:r>
-        <w:t>legacy</w:t>
-      </w:r>
-      <w:proofErr w:type="spellEnd"/>
-      <w:r>
-        <w:t xml:space="preserve"> optie. De app als het om mijn emulator </w:t>
+        <w:t xml:space="preserve">Ik had een image asset toegevoegd dat dus er voor zorgde dat de oude logo files worden vervangen. Hierbij heb een logo afbeelding als foreground en een transparant afbeelding als background. Maar dit wou niet helemaal werken door adaptive icon en legacy optie. De app als het om mijn emulator </w:t>
       </w:r>
       <w:r>
         <w:lastRenderedPageBreak/>
-        <w:t xml:space="preserve">staat kreeg een zwarte achtergrond omdat transparant niet bestaat bij </w:t>
-      </w:r>
-      <w:proofErr w:type="spellStart"/>
-      <w:r>
-        <w:t>adaptive</w:t>
-      </w:r>
-      <w:proofErr w:type="spellEnd"/>
-      <w:r>
-        <w:t xml:space="preserve"> </w:t>
-      </w:r>
-      <w:proofErr w:type="spellStart"/>
-      <w:r>
-        <w:t>icons</w:t>
-      </w:r>
-      <w:proofErr w:type="spellEnd"/>
-      <w:r>
-        <w:t xml:space="preserve">. Dus wat ik gedaan had was het gewoon op </w:t>
-      </w:r>
-      <w:proofErr w:type="spellStart"/>
-      <w:r>
-        <w:t>legacy</w:t>
-      </w:r>
-      <w:proofErr w:type="spellEnd"/>
-      <w:r>
-        <w:t xml:space="preserve"> </w:t>
-      </w:r>
-      <w:proofErr w:type="spellStart"/>
-      <w:r>
-        <w:t>only</w:t>
-      </w:r>
-      <w:proofErr w:type="spellEnd"/>
-      <w:r>
-        <w:t xml:space="preserve"> optie zetten waar ik gewoon eigenlijk de background kan weghalen door de </w:t>
-      </w:r>
-      <w:proofErr w:type="spellStart"/>
-      <w:r>
-        <w:t>shape</w:t>
-      </w:r>
-      <w:proofErr w:type="spellEnd"/>
-      <w:r>
-        <w:t xml:space="preserve"> als cirkel aan te duiden</w:t>
+        <w:t>staat kreeg een zwarte achtergrond omdat transparant niet bestaat bij adaptive icons. Dus wat ik gedaan had was het gewoon op legacy only</w:t>
+      </w:r>
+      <w:r>
+        <w:t xml:space="preserve"> optie zetten waar ik gewoon eigenlijk de background kan weghalen door de shape als cirkel aan te duiden</w:t>
       </w:r>
       <w:r>
         <w:t>.</w:t>
@@ -4255,31 +2991,7 @@
     </w:p>
     <w:p>
       <w:r>
-        <w:t xml:space="preserve">Vandaag heb ik ervoor gezorgd dat ik image van uw gsm </w:t>
-      </w:r>
-      <w:proofErr w:type="spellStart"/>
-      <w:r>
-        <w:t>gallery</w:t>
-      </w:r>
-      <w:proofErr w:type="spellEnd"/>
-      <w:r>
-        <w:t xml:space="preserve"> kan uploaden. Hierbij dacht ik eerst dat automatisch de </w:t>
-      </w:r>
-      <w:proofErr w:type="spellStart"/>
-      <w:r>
-        <w:t>gallery</w:t>
-      </w:r>
-      <w:proofErr w:type="spellEnd"/>
-      <w:r>
-        <w:t xml:space="preserve"> die klaarstaat in de camera app kon gebruiken zoals bij facebook </w:t>
-      </w:r>
-      <w:proofErr w:type="spellStart"/>
-      <w:r>
-        <w:t>messenger</w:t>
-      </w:r>
-      <w:proofErr w:type="spellEnd"/>
-      <w:r>
-        <w:t>, maar bestaat niet echt blijkbaar. Ik heb hiervoor zelfs een vraag gesteld op stackoverflow.</w:t>
+        <w:t>Vandaag heb ik ervoor gezorgd dat ik image van uw gsm gallery kan uploaden. Hierbij dacht ik eerst dat automatisch de gallery die klaarstaat in de camera app kon gebruiken zoals bij facebook messenger, maar bestaat niet echt blijkbaar. Ik heb hiervoor zelfs een vraag gesteld op stackoverflow.</w:t>
       </w:r>
     </w:p>
     <w:p>
@@ -4294,31 +3006,7 @@
     </w:p>
     <w:p>
       <w:r>
-        <w:t xml:space="preserve">Uiteindelijk heb ik gewoon besloten om de camera en </w:t>
-      </w:r>
-      <w:proofErr w:type="spellStart"/>
-      <w:r>
-        <w:t>gallery</w:t>
-      </w:r>
-      <w:proofErr w:type="spellEnd"/>
-      <w:r>
-        <w:t xml:space="preserve"> op te splitsen en te kunnen openen in </w:t>
-      </w:r>
-      <w:proofErr w:type="spellStart"/>
-      <w:r>
-        <w:t>popup</w:t>
-      </w:r>
-      <w:proofErr w:type="spellEnd"/>
-      <w:r>
-        <w:t xml:space="preserve"> keuze menu. De code voor de </w:t>
-      </w:r>
-      <w:proofErr w:type="spellStart"/>
-      <w:r>
-        <w:t>gallery</w:t>
-      </w:r>
-      <w:proofErr w:type="spellEnd"/>
-      <w:r>
-        <w:t xml:space="preserve"> functionaliteiten </w:t>
+        <w:t xml:space="preserve">Uiteindelijk heb ik gewoon besloten om de camera en gallery op te splitsen en te kunnen openen in popup keuze menu. De code voor de gallery functionaliteiten </w:t>
       </w:r>
       <w:r>
         <w:t>is</w:t>
@@ -4417,23 +3105,7 @@
         </w:numPr>
       </w:pPr>
       <w:r>
-        <w:t xml:space="preserve">Vragen dat het ok is om je image te </w:t>
-      </w:r>
-      <w:proofErr w:type="spellStart"/>
-      <w:r>
-        <w:t>compressen</w:t>
-      </w:r>
-      <w:proofErr w:type="spellEnd"/>
-      <w:r>
-        <w:t xml:space="preserve"> (</w:t>
-      </w:r>
-      <w:proofErr w:type="spellStart"/>
-      <w:r>
-        <w:t>quality</w:t>
-      </w:r>
-      <w:proofErr w:type="spellEnd"/>
-      <w:r>
-        <w:t xml:space="preserve"> verlies?)</w:t>
+        <w:t>Vragen dat het ok is om je image te compressen (quality verlies?)</w:t>
       </w:r>
     </w:p>
     <w:p>
@@ -4445,21 +3117,8 @@
         </w:numPr>
       </w:pPr>
       <w:r>
-        <w:t xml:space="preserve">Image van de </w:t>
-      </w:r>
-      <w:proofErr w:type="spellStart"/>
-      <w:r>
-        <w:t>gridview</w:t>
-      </w:r>
-      <w:proofErr w:type="spellEnd"/>
-      <w:r>
-        <w:t xml:space="preserve"> kunnen openen in full </w:t>
-      </w:r>
-      <w:proofErr w:type="spellStart"/>
-      <w:r>
-        <w:t>size</w:t>
-      </w:r>
-      <w:proofErr w:type="spellEnd"/>
+        <w:t>Image van de gridview kunnen openen in full size</w:t>
+      </w:r>
     </w:p>
     <w:p>
       <w:pPr>
@@ -4470,15 +3129,7 @@
         </w:numPr>
       </w:pPr>
       <w:r>
-        <w:t xml:space="preserve">App op google </w:t>
-      </w:r>
-      <w:proofErr w:type="spellStart"/>
-      <w:r>
-        <w:t>playstore</w:t>
-      </w:r>
-      <w:proofErr w:type="spellEnd"/>
-      <w:r>
-        <w:t xml:space="preserve"> plaatsen!!</w:t>
+        <w:t>App op google playstore plaatsen!!</w:t>
       </w:r>
     </w:p>
     <w:p>
@@ -4489,13 +3140,8 @@
           <w:numId w:val="2"/>
         </w:numPr>
       </w:pPr>
-      <w:proofErr w:type="spellStart"/>
-      <w:r>
-        <w:t>Offfline</w:t>
-      </w:r>
-      <w:proofErr w:type="spellEnd"/>
-      <w:r>
-        <w:t xml:space="preserve"> functionaliteiten toevoegen?</w:t>
+      <w:r>
+        <w:t>Offfline functionaliteiten toevoegen?</w:t>
       </w:r>
     </w:p>
     <w:p/>
@@ -4516,80 +3162,16 @@
     </w:p>
     <w:p>
       <w:r>
-        <w:t xml:space="preserve">Vandaag wou ik beginnen met het uploaden van mijn app op google </w:t>
-      </w:r>
-      <w:proofErr w:type="spellStart"/>
-      <w:r>
-        <w:t>play</w:t>
-      </w:r>
-      <w:proofErr w:type="spellEnd"/>
-      <w:r>
-        <w:t xml:space="preserve"> maar toen ik tutorial volgde moest ik eerst mijn app package name veranderen want </w:t>
-      </w:r>
-      <w:proofErr w:type="spellStart"/>
-      <w:r>
-        <w:t>com.example</w:t>
-      </w:r>
-      <w:proofErr w:type="spellEnd"/>
-      <w:r>
-        <w:t xml:space="preserve"> is niet correct. Toen ik dat veranderen </w:t>
-      </w:r>
-      <w:r>
-        <w:t xml:space="preserve">werkte de google services niet meer want de package name was </w:t>
-      </w:r>
-      <w:proofErr w:type="spellStart"/>
-      <w:r>
-        <w:t>com.example</w:t>
-      </w:r>
-      <w:proofErr w:type="spellEnd"/>
-      <w:r>
-        <w:t xml:space="preserve"> in de google-</w:t>
-      </w:r>
-      <w:proofErr w:type="spellStart"/>
-      <w:r>
-        <w:t>services.json</w:t>
-      </w:r>
-      <w:proofErr w:type="spellEnd"/>
-      <w:r>
-        <w:t xml:space="preserve"> file. Dus ik moest mijn app in </w:t>
-      </w:r>
-      <w:proofErr w:type="spellStart"/>
-      <w:r>
-        <w:t>firebase</w:t>
-      </w:r>
-      <w:proofErr w:type="spellEnd"/>
-      <w:r>
-        <w:t xml:space="preserve"> opnieuw maken dat niet echt moeilijk was.</w:t>
-      </w:r>
-      <w:r>
-        <w:t xml:space="preserve"> Daarna heb ik een </w:t>
-      </w:r>
-      <w:proofErr w:type="spellStart"/>
-      <w:r>
-        <w:t>android</w:t>
-      </w:r>
-      <w:proofErr w:type="spellEnd"/>
-      <w:r>
-        <w:t xml:space="preserve"> app </w:t>
-      </w:r>
-      <w:proofErr w:type="spellStart"/>
-      <w:r>
-        <w:t>bundle</w:t>
-      </w:r>
-      <w:proofErr w:type="spellEnd"/>
-      <w:r>
-        <w:t xml:space="preserve"> aangemaakt want dit is nodig voor de release.</w:t>
-      </w:r>
-      <w:r>
-        <w:t xml:space="preserve"> Ze vroeg dan om </w:t>
-      </w:r>
-      <w:proofErr w:type="spellStart"/>
-      <w:r>
-        <w:t>developer</w:t>
-      </w:r>
-      <w:proofErr w:type="spellEnd"/>
-      <w:r>
-        <w:t xml:space="preserve"> account aan te maken waarbij ik 1 keer 25 euro moest betalen. Daarbij was ik effe gestopt want mijn ouders waren niet thuis voor een mastercard te gebruiken.</w:t>
+        <w:t xml:space="preserve">Vandaag wou ik beginnen met het uploaden van mijn app op google play maar toen ik tutorial volgde moest ik eerst mijn app package name veranderen want com.example is niet correct. Toen ik dat veranderen </w:t>
+      </w:r>
+      <w:r>
+        <w:t>werkte de google services niet meer want de package name was com.example in de google-services.json file. Dus ik moest mijn app in firebase opnieuw maken dat niet echt moeilijk was.</w:t>
+      </w:r>
+      <w:r>
+        <w:t xml:space="preserve"> Daarna heb ik een android app bundle aangemaakt want dit is nodig voor de release.</w:t>
+      </w:r>
+      <w:r>
+        <w:t xml:space="preserve"> Ze vroeg dan om developer account aan te maken waarbij ik 1 keer 25 euro moest betalen. Daarbij was ik effe gestopt want mijn ouders waren niet thuis voor een mastercard te gebruiken.</w:t>
       </w:r>
     </w:p>
     <w:p>
@@ -4666,15 +3248,7 @@
     </w:p>
     <w:p>
       <w:r>
-        <w:t xml:space="preserve">In de avond heb ik dan mijn </w:t>
-      </w:r>
-      <w:proofErr w:type="spellStart"/>
-      <w:r>
-        <w:t>developer</w:t>
-      </w:r>
-      <w:proofErr w:type="spellEnd"/>
-      <w:r>
-        <w:t xml:space="preserve"> account aangemaakt.</w:t>
+        <w:t>In de avond heb ik dan mijn developer account aangemaakt.</w:t>
       </w:r>
     </w:p>
     <w:p/>
@@ -4698,23 +3272,7 @@
         <w:t>Vandaag ben ik effe kort begonnen met het beter beveiligen van het wachtwoord om te registeren en in te loggen</w:t>
       </w:r>
       <w:r>
-        <w:t xml:space="preserve">. Hierbij vraag ik dus dat het wachtwoord een kleine letter, grote letter, geen spaties, 1 nummer en een lengte van 8 tekens heeft. Dit wordt weergegeven als een error onder de wachtwoord </w:t>
-      </w:r>
-      <w:proofErr w:type="spellStart"/>
-      <w:r>
-        <w:t>textbox</w:t>
-      </w:r>
-      <w:proofErr w:type="spellEnd"/>
-      <w:r>
-        <w:t xml:space="preserve">. Het email wordt dankzij </w:t>
-      </w:r>
-      <w:proofErr w:type="spellStart"/>
-      <w:r>
-        <w:t>firebase</w:t>
-      </w:r>
-      <w:proofErr w:type="spellEnd"/>
-      <w:r>
-        <w:t xml:space="preserve"> al gevalideerd dat het correct is, dus ik moet zelf geen error toevoegen. </w:t>
+        <w:t xml:space="preserve">. Hierbij vraag ik dus dat het wachtwoord een kleine letter, grote letter, geen spaties, 1 nummer en een lengte van 8 tekens heeft. Dit wordt weergegeven als een error onder de wachtwoord textbox. Het email wordt dankzij firebase al gevalideerd dat het correct is, dus ik moet zelf geen error toevoegen. </w:t>
       </w:r>
       <w:r>
         <w:t>Maar er wordt wel een toast bericht voor de zekerheid weergegeven vanonder als de registratie mislukt</w:t>
@@ -4725,37 +3283,13 @@
     </w:p>
     <w:p>
       <w:r>
-        <w:t xml:space="preserve">Daarna heb ik de app </w:t>
-      </w:r>
-      <w:proofErr w:type="spellStart"/>
-      <w:r>
-        <w:t>bundle</w:t>
-      </w:r>
-      <w:proofErr w:type="spellEnd"/>
-      <w:r>
-        <w:t xml:space="preserve"> </w:t>
+        <w:t xml:space="preserve">Daarna heb ik de app bundle </w:t>
       </w:r>
       <w:r>
         <w:t>geüpdatet</w:t>
       </w:r>
       <w:r>
-        <w:t xml:space="preserve"> naar de volgende versie, omdat er aanpassingen waren. Deze release heb ik dan op google </w:t>
-      </w:r>
-      <w:proofErr w:type="spellStart"/>
-      <w:r>
-        <w:t>play</w:t>
-      </w:r>
-      <w:proofErr w:type="spellEnd"/>
-      <w:r>
-        <w:t xml:space="preserve"> console geüpload, hierbij moest ik nog in de dashboard veel taken afleggen. De belangrijksten waren bijvoorbeeld een test account meegeven zodat google dit kan gebruiken om mijn app te controleren, een </w:t>
-      </w:r>
-      <w:proofErr w:type="spellStart"/>
-      <w:r>
-        <w:t>privacybeleid</w:t>
-      </w:r>
-      <w:proofErr w:type="spellEnd"/>
-      <w:r>
-        <w:t xml:space="preserve"> toevoegen hi</w:t>
+        <w:t xml:space="preserve"> naar de volgende versie, omdat er aanpassingen waren. Deze release heb ik dan op google play console geüpload, hierbij moest ik nog in de dashboard veel taken afleggen. De belangrijksten waren bijvoorbeeld een test account meegeven zodat google dit kan gebruiken om mijn app te controleren, een privacybeleid toevoegen hi</w:t>
       </w:r>
       <w:r>
         <w:t>er</w:t>
@@ -4807,77 +3341,13 @@
     </w:p>
     <w:p>
       <w:r>
-        <w:t xml:space="preserve">Hierbij had vooral deze </w:t>
-      </w:r>
-      <w:proofErr w:type="spellStart"/>
-      <w:r>
-        <w:t>youtube</w:t>
-      </w:r>
-      <w:proofErr w:type="spellEnd"/>
-      <w:r>
-        <w:t xml:space="preserve"> video nodig omdat ik de </w:t>
-      </w:r>
-      <w:proofErr w:type="spellStart"/>
-      <w:r>
-        <w:t>uri</w:t>
-      </w:r>
-      <w:proofErr w:type="spellEnd"/>
-      <w:r>
-        <w:t xml:space="preserve"> van de image die ik aan klik moest doorsturen naar het een fragment waar je de </w:t>
-      </w:r>
-      <w:proofErr w:type="spellStart"/>
-      <w:r>
-        <w:t>img</w:t>
-      </w:r>
-      <w:proofErr w:type="spellEnd"/>
-      <w:r>
-        <w:t xml:space="preserve"> in het groot kan bekijken. </w:t>
-      </w:r>
-      <w:r>
-        <w:t xml:space="preserve">Ik maakte toen een keer grote fout door een nieuwe </w:t>
-      </w:r>
-      <w:proofErr w:type="spellStart"/>
-      <w:r>
-        <w:t>imageDetailsFragment</w:t>
-      </w:r>
-      <w:proofErr w:type="spellEnd"/>
-      <w:r>
-        <w:t xml:space="preserve"> te openen als ik eigenlijk een </w:t>
-      </w:r>
-      <w:proofErr w:type="spellStart"/>
-      <w:r>
-        <w:t>bundle</w:t>
-      </w:r>
-      <w:proofErr w:type="spellEnd"/>
-      <w:r>
-        <w:t xml:space="preserve"> (waar de </w:t>
-      </w:r>
-      <w:proofErr w:type="spellStart"/>
-      <w:r>
-        <w:t>uri</w:t>
-      </w:r>
-      <w:proofErr w:type="spellEnd"/>
-      <w:r>
-        <w:t xml:space="preserve"> wordt opgeslagen)</w:t>
-      </w:r>
-      <w:r>
-        <w:t xml:space="preserve"> had toegevoegd aan een </w:t>
-      </w:r>
-      <w:proofErr w:type="spellStart"/>
-      <w:r>
-        <w:t>ImageDetailsFragment</w:t>
-      </w:r>
-      <w:proofErr w:type="spellEnd"/>
-      <w:r>
-        <w:t xml:space="preserve"> als </w:t>
-      </w:r>
-      <w:proofErr w:type="spellStart"/>
-      <w:r>
-        <w:t>arguments</w:t>
-      </w:r>
-      <w:proofErr w:type="spellEnd"/>
-      <w:r>
-        <w:t>. Ik navigeerde eigenlijk naar een fragment zonder argumenten die hard nodig had. Dit heb ik natuurlijk opgelost</w:t>
+        <w:t xml:space="preserve">Hierbij had vooral deze youtube video nodig omdat ik de uri van de image die ik aan klik moest doorsturen naar het een fragment waar je de img in het groot kan bekijken. </w:t>
+      </w:r>
+      <w:r>
+        <w:t>Ik maakte toen een keer grote fout door een nieuwe imageDetailsFragment te openen als ik eigenlijk een bundle (waar de uri wordt opgeslagen)</w:t>
+      </w:r>
+      <w:r>
+        <w:t xml:space="preserve"> had toegevoegd aan een ImageDetailsFragment als arguments. Ik navigeerde eigenlijk naar een fragment zonder argumenten die hard nodig had. Dit heb ik natuurlijk opgelost</w:t>
       </w:r>
       <w:r>
         <w:t xml:space="preserve"> zie onderstaande </w:t>
@@ -4891,15 +3361,7 @@
     </w:p>
     <w:p>
       <w:r>
-        <w:t xml:space="preserve">Het enige probleempje dat er nog is, is dat sommige afbeeldingen die vergroot worden </w:t>
-      </w:r>
-      <w:proofErr w:type="spellStart"/>
-      <w:r>
-        <w:t>onscherm</w:t>
-      </w:r>
-      <w:proofErr w:type="spellEnd"/>
-      <w:r>
-        <w:t xml:space="preserve"> kunnen uitzien.</w:t>
+        <w:t>Het enige probleempje dat er nog is, is dat sommige afbeeldingen die vergroot worden onscherm kunnen uitzien.</w:t>
       </w:r>
       <w:r>
         <w:t xml:space="preserve"> </w:t>
@@ -4977,15 +3439,7 @@
     </w:p>
     <w:p>
       <w:r>
-        <w:t xml:space="preserve">Vandaag heb ik een </w:t>
-      </w:r>
-      <w:proofErr w:type="spellStart"/>
-      <w:r>
-        <w:t>realtime</w:t>
-      </w:r>
-      <w:proofErr w:type="spellEnd"/>
-      <w:r>
-        <w:t xml:space="preserve"> database aangemaakt om een chat functionaliteiten toe te voegen.</w:t>
+        <w:t>Vandaag heb ik een realtime database aangemaakt om een chat functionaliteiten toe te voegen.</w:t>
       </w:r>
       <w:r>
         <w:t xml:space="preserve"> Hierbij ga ik de volgende video’s gebruiken:</w:t>
@@ -5073,13 +3527,8 @@
           <w:numId w:val="2"/>
         </w:numPr>
       </w:pPr>
-      <w:proofErr w:type="spellStart"/>
-      <w:r>
-        <w:t>Offfline</w:t>
-      </w:r>
-      <w:proofErr w:type="spellEnd"/>
-      <w:r>
-        <w:t xml:space="preserve"> functionaliteiten toevoegen?</w:t>
+      <w:r>
+        <w:t>Offfline functionaliteiten toevoegen?</w:t>
       </w:r>
     </w:p>
     <w:p>
@@ -5114,15 +3563,7 @@
     </w:p>
     <w:p>
       <w:r>
-        <w:t xml:space="preserve">Vandaag is mijn app beschikbaar op google </w:t>
-      </w:r>
-      <w:proofErr w:type="spellStart"/>
-      <w:r>
-        <w:t>play</w:t>
-      </w:r>
-      <w:proofErr w:type="spellEnd"/>
-      <w:r>
-        <w:t xml:space="preserve"> die je via deze link kan downloaden.</w:t>
+        <w:t>Vandaag is mijn app beschikbaar op google play die je via deze link kan downloaden.</w:t>
       </w:r>
     </w:p>
     <w:p>
@@ -5137,29 +3578,13 @@
     </w:p>
     <w:p>
       <w:r>
-        <w:t xml:space="preserve">Toen ik het had gedownload merkte ik dat google login niet wou werken. Dit heb ik dan onmiddellijk opgezocht en ik moest gewoon een extra SHA1 </w:t>
-      </w:r>
-      <w:proofErr w:type="spellStart"/>
-      <w:r>
-        <w:t>fingerp</w:t>
+        <w:t>Toen ik het had gedownload merkte ik dat google login niet wou werken. Dit heb ik dan onmiddellijk opgezocht en ik moest gewoon een extra SHA1 fingerp</w:t>
       </w:r>
       <w:r>
         <w:t>r</w:t>
       </w:r>
       <w:r>
-        <w:t>int</w:t>
-      </w:r>
-      <w:proofErr w:type="spellEnd"/>
-      <w:r>
-        <w:t xml:space="preserve"> van google </w:t>
-      </w:r>
-      <w:proofErr w:type="spellStart"/>
-      <w:r>
-        <w:t>play</w:t>
-      </w:r>
-      <w:proofErr w:type="spellEnd"/>
-      <w:r>
-        <w:t xml:space="preserve"> nog toevoegen aan mijn app. Dus nu werkt hij perfect.</w:t>
+        <w:t>int van google play nog toevoegen aan mijn app. Dus nu werkt hij perfect.</w:t>
       </w:r>
     </w:p>
     <w:p>
@@ -5179,15 +3604,7 @@
     </w:p>
     <w:p>
       <w:r>
-        <w:t xml:space="preserve">Ik heb dan geprobeerd om data toe te voegen aan mijn </w:t>
-      </w:r>
-      <w:proofErr w:type="spellStart"/>
-      <w:r>
-        <w:t>realtime</w:t>
-      </w:r>
-      <w:proofErr w:type="spellEnd"/>
-      <w:r>
-        <w:t xml:space="preserve"> database maar nog geen succes. Ik moest nu stoppen omdat ik een online gesprek ga hebben voor mijn stage tijdens het 2</w:t>
+        <w:t>Ik heb dan geprobeerd om data toe te voegen aan mijn realtime database maar nog geen succes. Ik moest nu stoppen omdat ik een online gesprek ga hebben voor mijn stage tijdens het 2</w:t>
       </w:r>
       <w:r>
         <w:rPr>
@@ -5223,48 +3640,11 @@
       </w:r>
     </w:p>
     <w:p>
-      <w:proofErr w:type="spellStart"/>
-      <w:r>
-        <w:t>Firebase</w:t>
-      </w:r>
-      <w:proofErr w:type="spellEnd"/>
-      <w:r>
-        <w:t xml:space="preserve"> </w:t>
-      </w:r>
-      <w:proofErr w:type="spellStart"/>
-      <w:r>
-        <w:t>Realtime</w:t>
-      </w:r>
-      <w:proofErr w:type="spellEnd"/>
-      <w:r>
-        <w:t xml:space="preserve"> database wou geen data toevoegen en</w:t>
-      </w:r>
-      <w:r>
-        <w:t xml:space="preserve"> ik had alles geprobeerd. Ik realiseerde toen dat </w:t>
-      </w:r>
-      <w:proofErr w:type="spellStart"/>
-      <w:r>
-        <w:t>realtime</w:t>
-      </w:r>
-      <w:proofErr w:type="spellEnd"/>
-      <w:r>
-        <w:t xml:space="preserve"> </w:t>
-      </w:r>
-      <w:proofErr w:type="spellStart"/>
-      <w:r>
-        <w:t>firebase</w:t>
-      </w:r>
-      <w:proofErr w:type="spellEnd"/>
-      <w:r>
-        <w:t xml:space="preserve"> alleen mogelijk was voor de regio van België europe-west1. Ik besloot dan naar </w:t>
-      </w:r>
-      <w:proofErr w:type="spellStart"/>
-      <w:r>
-        <w:t>firestore</w:t>
-      </w:r>
-      <w:proofErr w:type="spellEnd"/>
-      <w:r>
-        <w:t xml:space="preserve"> te gaan want daar hebben ze wel europe-west3 dat Nederland en België bevat. </w:t>
+      <w:r>
+        <w:t>Firebase Realtime database wou geen data toevoegen en</w:t>
+      </w:r>
+      <w:r>
+        <w:t xml:space="preserve"> ik had alles geprobeerd. Ik realiseerde toen dat realtime firebase alleen mogelijk was voor de regio van België europe-west1. Ik besloot dan naar firestore te gaan want daar hebben ze wel europe-west3 dat Nederland en België bevat. </w:t>
       </w:r>
       <w:r>
         <w:t>Dit heeft het probleem onmiddellijk opgelost.</w:t>
@@ -5272,15 +3652,7 @@
     </w:p>
     <w:p>
       <w:r>
-        <w:t xml:space="preserve">Nu als je inlogt zal je gebruikersgegevens op </w:t>
-      </w:r>
-      <w:proofErr w:type="spellStart"/>
-      <w:r>
-        <w:t>firestore</w:t>
-      </w:r>
-      <w:proofErr w:type="spellEnd"/>
-      <w:r>
-        <w:t xml:space="preserve"> geplaatst worden. Nu kan ik eindelijk vlot beginnen met de chat functionaliteiten.</w:t>
+        <w:t>Nu als je inlogt zal je gebruikersgegevens op firestore geplaatst worden. Nu kan ik eindelijk vlot beginnen met de chat functionaliteiten.</w:t>
       </w:r>
     </w:p>
     <w:p>
@@ -5367,31 +3739,7 @@
     </w:p>
     <w:p>
       <w:r>
-        <w:t xml:space="preserve">Vandaag probeerde ik offline support toe te voegen. Voor </w:t>
-      </w:r>
-      <w:proofErr w:type="spellStart"/>
-      <w:r>
-        <w:t>firestore</w:t>
-      </w:r>
-      <w:proofErr w:type="spellEnd"/>
-      <w:r>
-        <w:t xml:space="preserve"> was dat niet zo moeilijk want alles kon ik vinden op deze link, maar ik heb dit nog niet echt kunnen uittesten. Voor </w:t>
-      </w:r>
-      <w:proofErr w:type="spellStart"/>
-      <w:r>
-        <w:t>firebase</w:t>
-      </w:r>
-      <w:proofErr w:type="spellEnd"/>
-      <w:r>
-        <w:t xml:space="preserve"> storage lukte dit niet echt, want er was geen duidelijk documentatie. Ik wou vooral proberen om de images op </w:t>
-      </w:r>
-      <w:proofErr w:type="spellStart"/>
-      <w:r>
-        <w:t>firebase</w:t>
-      </w:r>
-      <w:proofErr w:type="spellEnd"/>
-      <w:r>
-        <w:t xml:space="preserve"> in de cache te steken, zodat de meeste recente images verschijnen op de startpagina.</w:t>
+        <w:t>Vandaag probeerde ik offline support toe te voegen. Voor firestore was dat niet zo moeilijk want alles kon ik vinden op deze link, maar ik heb dit nog niet echt kunnen uittesten. Voor firebase storage lukte dit niet echt, want er was geen duidelijk documentatie. Ik wou vooral proberen om de images op firebase in de cache te steken, zodat de meeste recente images verschijnen op de startpagina.</w:t>
       </w:r>
       <w:r>
         <w:t xml:space="preserve"> Mijn conclusie is eigenlijk dat het niet mogelijk is afhankelijk van het totale zoekwerk.</w:t>
@@ -5409,15 +3757,7 @@
     </w:p>
     <w:p>
       <w:r>
-        <w:t xml:space="preserve">Ik heb dan ondertussen een </w:t>
-      </w:r>
-      <w:proofErr w:type="spellStart"/>
-      <w:r>
-        <w:t>progress</w:t>
-      </w:r>
-      <w:proofErr w:type="spellEnd"/>
-      <w:r>
-        <w:t xml:space="preserve"> bar toegevoegd die zal</w:t>
+        <w:t>Ik heb dan ondertussen een progress bar toegevoegd die zal</w:t>
       </w:r>
       <w:r>
         <w:t xml:space="preserve"> </w:t>
@@ -5426,15 +3766,7 @@
         <w:t>verdwijnen als de images inladen.</w:t>
       </w:r>
       <w:r>
-        <w:t xml:space="preserve"> Dit komt ook bij de </w:t>
-      </w:r>
-      <w:proofErr w:type="spellStart"/>
-      <w:r>
-        <w:t>groepchats</w:t>
-      </w:r>
-      <w:proofErr w:type="spellEnd"/>
-      <w:r>
-        <w:t xml:space="preserve"> pagina.</w:t>
+        <w:t xml:space="preserve"> Dit komt ook bij de groepchats pagina.</w:t>
       </w:r>
     </w:p>
     <w:p/>
@@ -5455,50 +3787,10 @@
     </w:p>
     <w:p>
       <w:r>
-        <w:t xml:space="preserve">Vandaag heb ik verder gewerkt aan de chat functionaliteiten. Ik had in het begin een beetje moeilijkheden met het maken van de </w:t>
-      </w:r>
-      <w:proofErr w:type="spellStart"/>
-      <w:r>
-        <w:t>layout</w:t>
-      </w:r>
-      <w:proofErr w:type="spellEnd"/>
-      <w:r>
-        <w:t xml:space="preserve"> van de chat room en chat </w:t>
-      </w:r>
-      <w:proofErr w:type="spellStart"/>
-      <w:r>
-        <w:t>messages</w:t>
-      </w:r>
-      <w:proofErr w:type="spellEnd"/>
-      <w:r>
-        <w:t>. Hierbij heeft de</w:t>
-      </w:r>
-      <w:r>
-        <w:t xml:space="preserve">ze link geholpen want de </w:t>
-      </w:r>
-      <w:proofErr w:type="spellStart"/>
-      <w:r>
-        <w:t>youtube</w:t>
-      </w:r>
-      <w:proofErr w:type="spellEnd"/>
-      <w:r>
-        <w:t xml:space="preserve"> </w:t>
-      </w:r>
-      <w:proofErr w:type="spellStart"/>
-      <w:r>
-        <w:t>tutorials</w:t>
-      </w:r>
-      <w:proofErr w:type="spellEnd"/>
-      <w:r>
-        <w:t xml:space="preserve"> chat </w:t>
-      </w:r>
-      <w:proofErr w:type="spellStart"/>
-      <w:r>
-        <w:t>layout</w:t>
-      </w:r>
-      <w:proofErr w:type="spellEnd"/>
-      <w:r>
-        <w:t xml:space="preserve"> was zeer lelijk.</w:t>
+        <w:t>Vandaag heb ik verder gewerkt aan de chat functionaliteiten. Ik had in het begin een beetje moeilijkheden met het maken van de layout van de chat room en chat messages. Hierbij heeft de</w:t>
+      </w:r>
+      <w:r>
+        <w:t>ze link geholpen want de youtube tutorials chat layout was zeer lelijk.</w:t>
       </w:r>
     </w:p>
     <w:p>
@@ -5541,13 +3833,8 @@
           <w:numId w:val="2"/>
         </w:numPr>
       </w:pPr>
-      <w:proofErr w:type="spellStart"/>
-      <w:r>
-        <w:t>Offfline</w:t>
-      </w:r>
-      <w:proofErr w:type="spellEnd"/>
-      <w:r>
-        <w:t xml:space="preserve"> functionaliteiten toevoegen?</w:t>
+      <w:r>
+        <w:t>Offfline functionaliteiten toevoegen?</w:t>
       </w:r>
     </w:p>
     <w:p>
@@ -5580,15 +3867,7 @@
     </w:p>
     <w:p>
       <w:r>
-        <w:t xml:space="preserve">Vandaag heb ik de groepen chatrooms toegevoegd in een </w:t>
-      </w:r>
-      <w:proofErr w:type="spellStart"/>
-      <w:r>
-        <w:t>gridview</w:t>
-      </w:r>
-      <w:proofErr w:type="spellEnd"/>
-      <w:r>
-        <w:t xml:space="preserve"> waarmee de chat</w:t>
+        <w:t>Vandaag heb ik de groepen chatrooms toegevoegd in een gridview waarmee de chat</w:t>
       </w:r>
       <w:r>
         <w:t>s</w:t>
@@ -5597,50 +3876,10 @@
         <w:t xml:space="preserve"> zullen geopend worden. </w:t>
       </w:r>
       <w:r>
-        <w:t xml:space="preserve">Hierbij kreeg ik serieuze error die me compleet had verward en op stackoverflow had gesteld. Ik had dus per ongeluk de </w:t>
-      </w:r>
-      <w:proofErr w:type="spellStart"/>
-      <w:r>
-        <w:t>gridview</w:t>
-      </w:r>
-      <w:proofErr w:type="spellEnd"/>
-      <w:r>
-        <w:t xml:space="preserve"> het verkeerde ID gegeven waardoor er een </w:t>
-      </w:r>
-      <w:proofErr w:type="spellStart"/>
-      <w:r>
-        <w:t>NullPointerException</w:t>
-      </w:r>
-      <w:proofErr w:type="spellEnd"/>
-      <w:r>
-        <w:t xml:space="preserve"> ontstond, maar ik dacht dat de adapter </w:t>
-      </w:r>
-      <w:proofErr w:type="spellStart"/>
-      <w:r>
-        <w:t>null</w:t>
-      </w:r>
-      <w:proofErr w:type="spellEnd"/>
-      <w:r>
-        <w:t xml:space="preserve"> werd omdat het me niet lukte om de gegevens van </w:t>
-      </w:r>
-      <w:proofErr w:type="spellStart"/>
-      <w:r>
-        <w:t>firestore</w:t>
-      </w:r>
-      <w:proofErr w:type="spellEnd"/>
-      <w:r>
-        <w:t xml:space="preserve"> te halen.</w:t>
-      </w:r>
-      <w:r>
-        <w:t xml:space="preserve"> In de </w:t>
-      </w:r>
-      <w:proofErr w:type="spellStart"/>
-      <w:r>
-        <w:t>comments</w:t>
-      </w:r>
-      <w:proofErr w:type="spellEnd"/>
-      <w:r>
-        <w:t xml:space="preserve"> en antwoord wordt alles nog beter uitgelegd.</w:t>
+        <w:t>Hierbij kreeg ik serieuze error die me compleet had verward en op stackoverflow had gesteld. Ik had dus per ongeluk de gridview het verkeerde ID gegeven waardoor er een NullPointerException ontstond, maar ik dacht dat de adapter null werd omdat het me niet lukte om de gegevens van firestore te halen.</w:t>
+      </w:r>
+      <w:r>
+        <w:t xml:space="preserve"> In de comments en antwoord wordt alles nog beter uitgelegd.</w:t>
       </w:r>
     </w:p>
     <w:p>
@@ -5677,69 +3916,22 @@
     </w:p>
     <w:p>
       <w:r>
-        <w:t xml:space="preserve">Vandaag heb ik ervoor kunnen zorgen dat er pagina wordt geopend als je op een chatroom klikt. Dit duurde langer dan verwacht, want blijkbaar is het niet zo makkelijk om button click events te activeren in een </w:t>
-      </w:r>
-      <w:proofErr w:type="spellStart"/>
-      <w:r>
-        <w:t>gridview</w:t>
-      </w:r>
-      <w:proofErr w:type="spellEnd"/>
-      <w:r>
-        <w:t xml:space="preserve">. Om dit op te lossen moest ik een </w:t>
-      </w:r>
-      <w:proofErr w:type="spellStart"/>
+        <w:t xml:space="preserve">Vandaag heb ik ervoor kunnen zorgen dat er pagina wordt geopend als je op een chatroom klikt. Dit duurde langer dan verwacht, want blijkbaar is het niet zo makkelijk om button click events te activeren in een gridview. Om dit op te lossen moest ik een </w:t>
+      </w:r>
       <w:r>
         <w:t>V</w:t>
       </w:r>
       <w:r>
         <w:t>iewHolder</w:t>
       </w:r>
-      <w:proofErr w:type="spellEnd"/>
-      <w:r>
-        <w:t xml:space="preserve"> </w:t>
-      </w:r>
-      <w:proofErr w:type="spellStart"/>
-      <w:r>
-        <w:t>static</w:t>
-      </w:r>
-      <w:proofErr w:type="spellEnd"/>
+      <w:r>
+        <w:t xml:space="preserve"> static</w:t>
+      </w:r>
       <w:r>
         <w:t xml:space="preserve"> class toevoegen in de </w:t>
       </w:r>
       <w:r>
-        <w:t xml:space="preserve">Adapter class. Deze klasse zorgt ervoor dat de </w:t>
-      </w:r>
-      <w:proofErr w:type="spellStart"/>
-      <w:r>
-        <w:t>rendering</w:t>
-      </w:r>
-      <w:proofErr w:type="spellEnd"/>
-      <w:r>
-        <w:t xml:space="preserve"> van items in de </w:t>
-      </w:r>
-      <w:proofErr w:type="spellStart"/>
-      <w:r>
-        <w:t>gridview</w:t>
-      </w:r>
-      <w:proofErr w:type="spellEnd"/>
-      <w:r>
-        <w:t xml:space="preserve"> sneller is. In deze </w:t>
-      </w:r>
-      <w:proofErr w:type="spellStart"/>
-      <w:r>
-        <w:t>viewholder</w:t>
-      </w:r>
-      <w:proofErr w:type="spellEnd"/>
-      <w:r>
-        <w:t xml:space="preserve"> wordt de button opgeslagen die je kan oproepen en waarop je een </w:t>
-      </w:r>
-      <w:proofErr w:type="spellStart"/>
-      <w:r>
-        <w:t>onclickevent</w:t>
-      </w:r>
-      <w:proofErr w:type="spellEnd"/>
-      <w:r>
-        <w:t xml:space="preserve"> kan </w:t>
+        <w:t xml:space="preserve">Adapter class. Deze klasse zorgt ervoor dat de rendering van items in de gridview sneller is. In deze viewholder wordt de button opgeslagen die je kan oproepen en waarop je een onclickevent kan </w:t>
       </w:r>
       <w:r>
         <w:t>activeren</w:t>
@@ -5827,34 +4019,10 @@
     </w:p>
     <w:p>
       <w:r>
-        <w:t xml:space="preserve">Sinds vandaag kan ik </w:t>
-      </w:r>
-      <w:proofErr w:type="spellStart"/>
-      <w:r>
-        <w:t>chatmessages</w:t>
-      </w:r>
-      <w:proofErr w:type="spellEnd"/>
-      <w:r>
-        <w:t xml:space="preserve"> naar mijn </w:t>
-      </w:r>
-      <w:proofErr w:type="spellStart"/>
-      <w:r>
-        <w:t>firestore</w:t>
-      </w:r>
-      <w:proofErr w:type="spellEnd"/>
-      <w:r>
-        <w:t xml:space="preserve"> database sturen </w:t>
-      </w:r>
-      <w:r>
-        <w:t xml:space="preserve">, maar </w:t>
-      </w:r>
-      <w:proofErr w:type="spellStart"/>
-      <w:r>
-        <w:t>messages</w:t>
-      </w:r>
-      <w:proofErr w:type="spellEnd"/>
-      <w:r>
-        <w:t xml:space="preserve"> tonen is iets moeilijker door recyclerview en zijn adapter.</w:t>
+        <w:t xml:space="preserve">Sinds vandaag kan ik chatmessages naar mijn firestore database sturen </w:t>
+      </w:r>
+      <w:r>
+        <w:t>, maar messages tonen is iets moeilijker door recyclerview en zijn adapter.</w:t>
       </w:r>
     </w:p>
     <w:p>
@@ -5937,15 +4105,7 @@
         </w:numPr>
       </w:pPr>
       <w:r>
-        <w:t xml:space="preserve">Contact </w:t>
-      </w:r>
-      <w:proofErr w:type="spellStart"/>
-      <w:r>
-        <w:t>us</w:t>
-      </w:r>
-      <w:proofErr w:type="spellEnd"/>
-      <w:r>
-        <w:t xml:space="preserve"> </w:t>
+        <w:t xml:space="preserve">Contact us </w:t>
       </w:r>
       <w:r>
         <w:t>toevoegen</w:t>
@@ -5986,93 +4146,43 @@
     </w:p>
     <w:p>
       <w:r>
-        <w:t xml:space="preserve">Vandaag heb ik de </w:t>
-      </w:r>
-      <w:proofErr w:type="spellStart"/>
-      <w:r>
-        <w:t>MessageAdapter</w:t>
-      </w:r>
-      <w:proofErr w:type="spellEnd"/>
-      <w:r>
-        <w:t xml:space="preserve"> waarmee de users kunnen chatten in chatgroepen verbetert want ik had </w:t>
-      </w:r>
-      <w:proofErr w:type="spellStart"/>
-      <w:r>
-        <w:t>tutorials</w:t>
-      </w:r>
-      <w:proofErr w:type="spellEnd"/>
-      <w:r>
-        <w:t xml:space="preserve"> door elkaar gehaald. Ik had vooral </w:t>
-      </w:r>
-      <w:proofErr w:type="spellStart"/>
-      <w:r>
-        <w:t>Id’s</w:t>
-      </w:r>
-      <w:proofErr w:type="spellEnd"/>
-      <w:r>
-        <w:t xml:space="preserve"> nodig van de</w:t>
+        <w:t>Vandaag heb ik de MessageAdapter waarmee de users kunnen chatten in chatgroepen verbetert want ik had tutorials door elkaar gehaald. Ik had vooral Id’s nodig van de</w:t>
+      </w:r>
+      <w:r>
+        <w:t xml:space="preserve"> messages</w:t>
+      </w:r>
+      <w:r>
+        <w:t xml:space="preserve"> layouts want d</w:t>
+      </w:r>
+      <w:r>
+        <w:t>eze</w:t>
+      </w:r>
+      <w:r>
+        <w:t xml:space="preserve"> waren beter dan de</w:t>
+      </w:r>
+      <w:r>
+        <w:t xml:space="preserve"> 1</w:t>
+      </w:r>
+      <w:r>
+        <w:rPr>
+          <w:vertAlign w:val="superscript"/>
+        </w:rPr>
+        <w:t>ste</w:t>
       </w:r>
       <w:r>
         <w:t xml:space="preserve"> </w:t>
       </w:r>
-      <w:proofErr w:type="spellStart"/>
-      <w:r>
-        <w:t>messages</w:t>
-      </w:r>
-      <w:proofErr w:type="spellEnd"/>
-      <w:r>
-        <w:t xml:space="preserve"> </w:t>
-      </w:r>
-      <w:proofErr w:type="spellStart"/>
-      <w:r>
-        <w:t>layouts</w:t>
-      </w:r>
-      <w:proofErr w:type="spellEnd"/>
-      <w:r>
-        <w:t xml:space="preserve"> want d</w:t>
-      </w:r>
-      <w:r>
-        <w:t>eze</w:t>
-      </w:r>
-      <w:r>
-        <w:t xml:space="preserve"> waren beter dan de</w:t>
-      </w:r>
-      <w:r>
-        <w:t xml:space="preserve"> 1</w:t>
-      </w:r>
-      <w:r>
-        <w:rPr>
-          <w:vertAlign w:val="superscript"/>
-        </w:rPr>
-        <w:t>ste</w:t>
-      </w:r>
-      <w:r>
-        <w:t xml:space="preserve"> </w:t>
-      </w:r>
       <w:r>
         <w:t xml:space="preserve"> tutorial</w:t>
       </w:r>
       <w:r>
-        <w:t xml:space="preserve"> hieronder. Daarna ging alles vlot, maar ik heb alleen moeilijkheden met het beveiligen van </w:t>
-      </w:r>
-      <w:proofErr w:type="spellStart"/>
-      <w:r>
-        <w:t>groupchats</w:t>
-      </w:r>
-      <w:proofErr w:type="spellEnd"/>
+        <w:t xml:space="preserve"> hieronder. Daarna ging alles vlot, maar ik heb alleen moeilijkheden met het beveiligen van groupchats</w:t>
+      </w:r>
       <w:r>
         <w:t xml:space="preserve">. Hoe gaan dus </w:t>
       </w:r>
       <w:r>
-        <w:t xml:space="preserve">user worden toegevoegd aan een </w:t>
-      </w:r>
-      <w:proofErr w:type="spellStart"/>
-      <w:r>
-        <w:t>groepchat</w:t>
-      </w:r>
-      <w:proofErr w:type="spellEnd"/>
-      <w:r>
-        <w:t>, enz.</w:t>
+        <w:t>user worden toegevoegd aan een groepchat, enz.</w:t>
       </w:r>
     </w:p>
     <w:p>
@@ -6113,15 +4223,7 @@
     </w:p>
     <w:p>
       <w:r>
-        <w:t xml:space="preserve">Vandaag heb ik kort overlopen met Yves </w:t>
-      </w:r>
-      <w:proofErr w:type="spellStart"/>
-      <w:r>
-        <w:t>Blancquaert</w:t>
-      </w:r>
-      <w:proofErr w:type="spellEnd"/>
-      <w:r>
-        <w:t xml:space="preserve"> hoe de stand van zaken zijn. Hierbij heb ik vooral op de conclusie gekomen dat ik de volgende dingen nog moet doen:</w:t>
+        <w:t>Vandaag heb ik kort overlopen met Yves Blancquaert hoe de stand van zaken zijn. Hierbij heb ik vooral op de conclusie gekomen dat ik de volgende dingen nog moet doen:</w:t>
       </w:r>
     </w:p>
     <w:p>
@@ -6132,13 +4234,8 @@
           <w:numId w:val="2"/>
         </w:numPr>
       </w:pPr>
-      <w:proofErr w:type="spellStart"/>
-      <w:r>
-        <w:t>Chatgroup</w:t>
-      </w:r>
-      <w:proofErr w:type="spellEnd"/>
-      <w:r>
-        <w:t xml:space="preserve"> afwerken en meerdere users kunnen toevoegen</w:t>
+      <w:r>
+        <w:t>Chatgroup afwerken en meerdere users kunnen toevoegen</w:t>
       </w:r>
     </w:p>
     <w:p>
@@ -6150,15 +4247,7 @@
         </w:numPr>
       </w:pPr>
       <w:r>
-        <w:t xml:space="preserve">Contact </w:t>
-      </w:r>
-      <w:proofErr w:type="spellStart"/>
-      <w:r>
-        <w:t>us</w:t>
-      </w:r>
-      <w:proofErr w:type="spellEnd"/>
-      <w:r>
-        <w:t xml:space="preserve"> pagina nog toevoe</w:t>
+        <w:t>Contact us pagina nog toevoe</w:t>
       </w:r>
       <w:r>
         <w:t>gen voor extra</w:t>
@@ -6173,13 +4262,8 @@
         </w:numPr>
       </w:pPr>
       <w:r>
-        <w:t xml:space="preserve">Notificaties toevoegen voor </w:t>
-      </w:r>
-      <w:proofErr w:type="spellStart"/>
-      <w:r>
-        <w:t>messages</w:t>
-      </w:r>
-      <w:proofErr w:type="spellEnd"/>
+        <w:t>Notificaties toevoegen voor messages</w:t>
+      </w:r>
     </w:p>
     <w:p>
       <w:pPr>
@@ -6200,38 +4284,12 @@
           <w:bCs/>
           <w:u w:val="single"/>
         </w:rPr>
-        <w:t xml:space="preserve">Image in chat toevoegen en </w:t>
-      </w:r>
-      <w:proofErr w:type="spellStart"/>
-      <w:r>
-        <w:rPr>
-          <w:b/>
-          <w:bCs/>
-          <w:u w:val="single"/>
-        </w:rPr>
-        <w:t>comments</w:t>
-      </w:r>
-      <w:proofErr w:type="spellEnd"/>
-      <w:r>
-        <w:rPr>
-          <w:b/>
-          <w:bCs/>
-          <w:u w:val="single"/>
-        </w:rPr>
-        <w:t xml:space="preserve"> erop kunnen plaatsen!!!!!!</w:t>
-      </w:r>
-    </w:p>
-    <w:p>
-      <w:r>
-        <w:t xml:space="preserve">Vandaag heb ik dan snel de contact </w:t>
-      </w:r>
-      <w:proofErr w:type="spellStart"/>
-      <w:r>
-        <w:t>us</w:t>
-      </w:r>
-      <w:proofErr w:type="spellEnd"/>
-      <w:r>
-        <w:t xml:space="preserve"> pagina afgewerkt zodat </w:t>
+        <w:t>Image in chat toevoegen en comments erop kunnen plaatsen!!!!!!</w:t>
+      </w:r>
+    </w:p>
+    <w:p>
+      <w:r>
+        <w:t xml:space="preserve">Vandaag heb ik dan snel de contact us pagina afgewerkt zodat </w:t>
       </w:r>
       <w:r>
         <w:t>da al af is en zo vlot kan beginnen aan de chat groepen</w:t>
@@ -6272,116 +4330,20 @@
     </w:p>
     <w:p>
       <w:r>
-        <w:t xml:space="preserve">Vandaag heb ik de recyclerview </w:t>
-      </w:r>
-      <w:proofErr w:type="spellStart"/>
-      <w:r>
-        <w:t>gefixed</w:t>
-      </w:r>
-      <w:proofErr w:type="spellEnd"/>
-      <w:r>
-        <w:t xml:space="preserve">, want er waren nog een paar fouten. </w:t>
-      </w:r>
-    </w:p>
-    <w:p>
-      <w:r>
-        <w:t xml:space="preserve">Ten eerste begon de chat </w:t>
-      </w:r>
-      <w:proofErr w:type="spellStart"/>
-      <w:r>
-        <w:t>messages</w:t>
-      </w:r>
-      <w:proofErr w:type="spellEnd"/>
-      <w:r>
-        <w:t xml:space="preserve"> niet vanonder dus dat heb ik </w:t>
-      </w:r>
-      <w:proofErr w:type="spellStart"/>
-      <w:r>
-        <w:t>gefixed</w:t>
-      </w:r>
-      <w:proofErr w:type="spellEnd"/>
-      <w:r>
-        <w:t xml:space="preserve"> met </w:t>
-      </w:r>
-      <w:proofErr w:type="spellStart"/>
-      <w:r>
-        <w:t>SetHasFixedSize</w:t>
-      </w:r>
-      <w:proofErr w:type="spellEnd"/>
-      <w:r>
-        <w:t xml:space="preserve"> en </w:t>
-      </w:r>
-      <w:proofErr w:type="spellStart"/>
-      <w:r>
-        <w:t>SetStackFromEnd</w:t>
-      </w:r>
-      <w:proofErr w:type="spellEnd"/>
-      <w:r>
-        <w:t xml:space="preserve"> </w:t>
-      </w:r>
-      <w:proofErr w:type="spellStart"/>
-      <w:r>
-        <w:t>true</w:t>
-      </w:r>
-      <w:proofErr w:type="spellEnd"/>
-      <w:r>
-        <w:t xml:space="preserve"> te zetten.</w:t>
-      </w:r>
-    </w:p>
-    <w:p>
-      <w:r>
-        <w:t xml:space="preserve">Ten tweede wou de recyclerview niet updaten als ik een nieuwe </w:t>
-      </w:r>
-      <w:proofErr w:type="spellStart"/>
-      <w:r>
-        <w:t>message</w:t>
-      </w:r>
-      <w:proofErr w:type="spellEnd"/>
-      <w:r>
-        <w:t xml:space="preserve"> uploadde. Dit kwam omdat </w:t>
-      </w:r>
-      <w:proofErr w:type="spellStart"/>
-      <w:r>
-        <w:t>firestore</w:t>
-      </w:r>
-      <w:proofErr w:type="spellEnd"/>
-      <w:r>
-        <w:t xml:space="preserve"> niet wou </w:t>
-      </w:r>
-      <w:proofErr w:type="spellStart"/>
-      <w:r>
-        <w:t>realtime</w:t>
-      </w:r>
-      <w:proofErr w:type="spellEnd"/>
-      <w:r>
-        <w:t xml:space="preserve"> updaten. Dit voornaamste rede daarvan was blijkbaar </w:t>
-      </w:r>
-      <w:r>
-        <w:t xml:space="preserve">dat ik een index moest toevoegen voor de query die de gegevens moest ophalen. Dit werd niet vermeld in </w:t>
-      </w:r>
-      <w:proofErr w:type="spellStart"/>
-      <w:r>
-        <w:t>tutorials</w:t>
-      </w:r>
-      <w:proofErr w:type="spellEnd"/>
-      <w:r>
-        <w:t xml:space="preserve"> en documentaties van </w:t>
-      </w:r>
-      <w:proofErr w:type="spellStart"/>
-      <w:r>
-        <w:t>firestore</w:t>
-      </w:r>
-      <w:proofErr w:type="spellEnd"/>
-      <w:r>
-        <w:t xml:space="preserve">. </w:t>
-      </w:r>
-      <w:proofErr w:type="spellStart"/>
-      <w:r>
-        <w:t>Firestore</w:t>
-      </w:r>
-      <w:proofErr w:type="spellEnd"/>
-      <w:r>
-        <w:t xml:space="preserve"> stuur dit als error naar mij zie mijn stackoverflow vraag:</w:t>
+        <w:t xml:space="preserve">Vandaag heb ik de recyclerview gefixed, want er waren nog een paar fouten. </w:t>
+      </w:r>
+    </w:p>
+    <w:p>
+      <w:r>
+        <w:t>Ten eerste begon de chat messages niet vanonder dus dat heb ik gefixed met SetHasFixedSize en SetStackFromEnd true te zetten.</w:t>
+      </w:r>
+    </w:p>
+    <w:p>
+      <w:r>
+        <w:t xml:space="preserve">Ten tweede wou de recyclerview niet updaten als ik een nieuwe message uploadde. Dit kwam omdat firestore niet wou realtime updaten. Dit voornaamste rede daarvan was blijkbaar </w:t>
+      </w:r>
+      <w:r>
+        <w:t>dat ik een index moest toevoegen voor de query die de gegevens moest ophalen. Dit werd niet vermeld in tutorials en documentaties van firestore. Firestore stuur dit als error naar mij zie mijn stackoverflow vraag:</w:t>
       </w:r>
     </w:p>
     <w:p>
@@ -6463,15 +4425,7 @@
         <w:t xml:space="preserve">Vandaag heb ik nog wat chat foutjes opgelost zoals </w:t>
       </w:r>
       <w:r>
-        <w:t xml:space="preserve">het tijdstip van de </w:t>
-      </w:r>
-      <w:proofErr w:type="spellStart"/>
-      <w:r>
-        <w:t>message</w:t>
-      </w:r>
-      <w:proofErr w:type="spellEnd"/>
-      <w:r>
-        <w:t xml:space="preserve"> was in het </w:t>
+        <w:t xml:space="preserve">het tijdstip van de message was in het </w:t>
       </w:r>
       <w:r>
         <w:t xml:space="preserve">Engelse </w:t>
@@ -6480,33 +4434,8 @@
         <w:t xml:space="preserve">tijd </w:t>
       </w:r>
       <w:r>
-        <w:t xml:space="preserve">(AM-PM) dus dat heb ik omgezet naar digitale tijdstip. Dit kon door in de </w:t>
-      </w:r>
-      <w:proofErr w:type="spellStart"/>
-      <w:r>
-        <w:t>DateFormat</w:t>
-      </w:r>
-      <w:proofErr w:type="spellEnd"/>
-      <w:r>
-        <w:t xml:space="preserve"> “</w:t>
-      </w:r>
-      <w:proofErr w:type="spellStart"/>
-      <w:r>
-        <w:t>hh</w:t>
-      </w:r>
-      <w:proofErr w:type="spellEnd"/>
-      <w:r>
-        <w:t>-…” te vervangen met “</w:t>
-      </w:r>
-      <w:proofErr w:type="spellStart"/>
-      <w:r>
-        <w:t>kk</w:t>
-      </w:r>
-      <w:proofErr w:type="spellEnd"/>
-      <w:r>
-        <w:t xml:space="preserve">-…”. Ook nieuwe berichten werden niet automatisch naar toe gescrold daarom moest ik </w:t>
-      </w:r>
-      <w:proofErr w:type="spellStart"/>
+        <w:t xml:space="preserve">(AM-PM) dus dat heb ik omgezet naar digitale tijdstip. Dit kon door in de DateFormat “hh-…” te vervangen met “kk-…”. Ook nieuwe berichten werden niet automatisch naar toe gescrold daarom moest ik </w:t>
+      </w:r>
       <w:r>
         <w:rPr>
           <w:i/>
@@ -6515,7 +4444,6 @@
         </w:rPr>
         <w:t>smooth</w:t>
       </w:r>
-      <w:proofErr w:type="spellEnd"/>
       <w:r>
         <w:rPr>
           <w:i/>
@@ -6523,21 +4451,8 @@
         </w:rPr>
         <w:t xml:space="preserve"> </w:t>
       </w:r>
-      <w:proofErr w:type="spellStart"/>
-      <w:r>
-        <w:t>scrolling</w:t>
-      </w:r>
-      <w:proofErr w:type="spellEnd"/>
-      <w:r>
-        <w:t xml:space="preserve"> </w:t>
-      </w:r>
-      <w:proofErr w:type="spellStart"/>
-      <w:r>
-        <w:t>to</w:t>
-      </w:r>
-      <w:proofErr w:type="spellEnd"/>
-      <w:r>
-        <w:t xml:space="preserve"> aanzetten i</w:t>
+      <w:r>
+        <w:t>scrolling to aanzetten i</w:t>
       </w:r>
       <w:r>
         <w:t xml:space="preserve">n </w:t>
@@ -6555,23 +4470,7 @@
         <w:t>an</w:t>
       </w:r>
       <w:r>
-        <w:t xml:space="preserve"> gewoon </w:t>
-      </w:r>
-      <w:proofErr w:type="spellStart"/>
-      <w:r>
-        <w:t>scrolling</w:t>
-      </w:r>
-      <w:proofErr w:type="spellEnd"/>
-      <w:r>
-        <w:t xml:space="preserve"> </w:t>
-      </w:r>
-      <w:proofErr w:type="spellStart"/>
-      <w:r>
-        <w:t>to</w:t>
-      </w:r>
-      <w:proofErr w:type="spellEnd"/>
-      <w:r>
-        <w:t>.</w:t>
+        <w:t xml:space="preserve"> gewoon scrolling to.</w:t>
       </w:r>
     </w:p>
     <w:p>
@@ -6579,48 +4478,16 @@
         <w:t xml:space="preserve">Dan heb ik vooral opgezocht </w:t>
       </w:r>
       <w:r>
-        <w:t xml:space="preserve">hoe ik andere users kan toevoegen aan een chat </w:t>
-      </w:r>
-      <w:proofErr w:type="spellStart"/>
-      <w:r>
-        <w:t>group</w:t>
-      </w:r>
-      <w:proofErr w:type="spellEnd"/>
-      <w:r>
-        <w:t xml:space="preserve"> waarvan deze link me het meest belovend uitziet.</w:t>
-      </w:r>
-      <w:r>
-        <w:t xml:space="preserve"> </w:t>
-      </w:r>
-      <w:proofErr w:type="spellStart"/>
-      <w:r>
-        <w:t>Admin</w:t>
-      </w:r>
-      <w:proofErr w:type="spellEnd"/>
-      <w:r>
-        <w:t xml:space="preserve"> </w:t>
-      </w:r>
-      <w:proofErr w:type="spellStart"/>
-      <w:r>
-        <w:t>roles</w:t>
-      </w:r>
-      <w:proofErr w:type="spellEnd"/>
-      <w:r>
-        <w:t xml:space="preserve"> lijken me het makkelijkst</w:t>
+        <w:t>hoe ik andere users kan toevoegen aan een chat group waarvan deze link me het meest belovend uitziet.</w:t>
+      </w:r>
+      <w:r>
+        <w:t xml:space="preserve"> Admin roles lijken me het makkelijkst</w:t>
       </w:r>
       <w:r>
         <w:t xml:space="preserve">. Als dit niet lukt ga ik gewoon proberen </w:t>
       </w:r>
       <w:r>
-        <w:t xml:space="preserve">om de </w:t>
-      </w:r>
-      <w:proofErr w:type="spellStart"/>
-      <w:r>
-        <w:t>admin</w:t>
-      </w:r>
-      <w:proofErr w:type="spellEnd"/>
-      <w:r>
-        <w:t xml:space="preserve"> users te laten toevoegen via email</w:t>
+        <w:t>om de admin users te laten toevoegen via email</w:t>
       </w:r>
       <w:r>
         <w:t xml:space="preserve"> via </w:t>
@@ -6735,15 +4602,7 @@
         </w:numPr>
       </w:pPr>
       <w:r>
-        <w:t xml:space="preserve">Afbeeldingen kunnen doorsturen via chat en </w:t>
-      </w:r>
-      <w:proofErr w:type="spellStart"/>
-      <w:r>
-        <w:t>comments</w:t>
-      </w:r>
-      <w:proofErr w:type="spellEnd"/>
-      <w:r>
-        <w:t xml:space="preserve"> eraan kunnen toevoegen.</w:t>
+        <w:t>Afbeeldingen kunnen doorsturen via chat en comments eraan kunnen toevoegen.</w:t>
       </w:r>
     </w:p>
     <w:p>
@@ -6776,39 +4635,7 @@
     </w:p>
     <w:p>
       <w:r>
-        <w:t xml:space="preserve">Vandaag heb ik de chatrooms een beter menu gegeven bovenaan. Hierbij kan je terug keren naar de vorige pagina, een foto uploaden in chat (in </w:t>
-      </w:r>
-      <w:proofErr w:type="spellStart"/>
-      <w:r>
-        <w:t>progress</w:t>
-      </w:r>
-      <w:proofErr w:type="spellEnd"/>
-      <w:r>
-        <w:t xml:space="preserve">) en </w:t>
-      </w:r>
-      <w:proofErr w:type="spellStart"/>
-      <w:r>
-        <w:t>admin</w:t>
-      </w:r>
-      <w:proofErr w:type="spellEnd"/>
-      <w:r>
-        <w:t xml:space="preserve"> </w:t>
-      </w:r>
-      <w:proofErr w:type="spellStart"/>
-      <w:r>
-        <w:t>priviliges</w:t>
-      </w:r>
-      <w:proofErr w:type="spellEnd"/>
-      <w:r>
-        <w:t xml:space="preserve"> uitvoeren zoals user toevoegen en verwijderen (in </w:t>
-      </w:r>
-      <w:proofErr w:type="spellStart"/>
-      <w:r>
-        <w:t>progress</w:t>
-      </w:r>
-      <w:proofErr w:type="spellEnd"/>
-      <w:r>
-        <w:t>). Zoals gezegd in de vorige</w:t>
+        <w:t>Vandaag heb ik de chatrooms een beter menu gegeven bovenaan. Hierbij kan je terug keren naar de vorige pagina, een foto uploaden in chat (in progress) en admin priviliges uitvoeren zoals user toevoegen en verwijderen (in progress). Zoals gezegd in de vorige</w:t>
       </w:r>
       <w:r>
         <w:t xml:space="preserve"> rapport ga </w:t>
@@ -6816,21 +4643,8 @@
       <w:r>
         <w:t xml:space="preserve">ik </w:t>
       </w:r>
-      <w:proofErr w:type="spellStart"/>
-      <w:r>
-        <w:t>admin</w:t>
-      </w:r>
-      <w:proofErr w:type="spellEnd"/>
-      <w:r>
-        <w:t xml:space="preserve"> </w:t>
-      </w:r>
-      <w:proofErr w:type="spellStart"/>
-      <w:r>
-        <w:t>roles</w:t>
-      </w:r>
-      <w:proofErr w:type="spellEnd"/>
-      <w:r>
-        <w:t xml:space="preserve"> toevoegen. Ik ben dus nu begonnen om dit te implementeren, waarbij ik als 1</w:t>
+      <w:r>
+        <w:t>admin roles toevoegen. Ik ben dus nu begonnen om dit te implementeren, waarbij ik als 1</w:t>
       </w:r>
       <w:r>
         <w:rPr>
@@ -6839,39 +4653,7 @@
         <w:t>ste</w:t>
       </w:r>
       <w:r>
-        <w:t xml:space="preserve"> stap dus de </w:t>
-      </w:r>
-      <w:proofErr w:type="spellStart"/>
-      <w:r>
-        <w:t>firestore</w:t>
-      </w:r>
-      <w:proofErr w:type="spellEnd"/>
-      <w:r>
-        <w:t xml:space="preserve"> lay-out heb aangepast voor </w:t>
-      </w:r>
-      <w:proofErr w:type="spellStart"/>
-      <w:r>
-        <w:t>groups</w:t>
-      </w:r>
-      <w:proofErr w:type="spellEnd"/>
-      <w:r>
-        <w:t xml:space="preserve">. Nu bevinden </w:t>
-      </w:r>
-      <w:proofErr w:type="spellStart"/>
-      <w:r>
-        <w:t>groups</w:t>
-      </w:r>
-      <w:proofErr w:type="spellEnd"/>
-      <w:r>
-        <w:t xml:space="preserve"> zich bij de users (/</w:t>
-      </w:r>
-      <w:proofErr w:type="spellStart"/>
-      <w:r>
-        <w:t>admins</w:t>
-      </w:r>
-      <w:proofErr w:type="spellEnd"/>
-      <w:r>
-        <w:t xml:space="preserve">) die het gemaakt </w:t>
+        <w:t xml:space="preserve"> stap dus de firestore lay-out heb aangepast voor groups. Nu bevinden groups zich bij de users (/admins) die het gemaakt </w:t>
       </w:r>
       <w:r>
         <w:t>hebben</w:t>
@@ -6985,15 +4767,7 @@
         </w:numPr>
       </w:pPr>
       <w:r>
-        <w:t xml:space="preserve">Afbeeldingen kunnen doorsturen via chat en </w:t>
-      </w:r>
-      <w:proofErr w:type="spellStart"/>
-      <w:r>
-        <w:t>comments</w:t>
-      </w:r>
-      <w:proofErr w:type="spellEnd"/>
-      <w:r>
-        <w:t xml:space="preserve"> eraan kunnen toevoegen.</w:t>
+        <w:t>Afbeeldingen kunnen doorsturen via chat en comments eraan kunnen toevoegen.</w:t>
       </w:r>
     </w:p>
     <w:p>
@@ -7044,40 +4818,11 @@
         </w:numPr>
       </w:pPr>
       <w:r>
-        <w:t xml:space="preserve">In de chatroom kan de </w:t>
-      </w:r>
-      <w:proofErr w:type="spellStart"/>
-      <w:r>
-        <w:t>admin</w:t>
-      </w:r>
-      <w:proofErr w:type="spellEnd"/>
-      <w:r>
-        <w:t xml:space="preserve"> een invite sturen naar een user hierbij moet hij het email hebben van die user. De invite is een klasse die </w:t>
-      </w:r>
-      <w:r>
-        <w:t xml:space="preserve">het </w:t>
-      </w:r>
-      <w:proofErr w:type="spellStart"/>
-      <w:r>
-        <w:t>firebase</w:t>
-      </w:r>
-      <w:proofErr w:type="spellEnd"/>
-      <w:r>
-        <w:t xml:space="preserve"> document (met alle </w:t>
-      </w:r>
-      <w:proofErr w:type="spellStart"/>
-      <w:r>
-        <w:t>group</w:t>
-      </w:r>
-      <w:proofErr w:type="spellEnd"/>
-      <w:r>
-        <w:t xml:space="preserve"> gegevens), </w:t>
-      </w:r>
-      <w:proofErr w:type="spellStart"/>
-      <w:r>
-        <w:t>enz</w:t>
-      </w:r>
-      <w:proofErr w:type="spellEnd"/>
+        <w:t xml:space="preserve">In de chatroom kan de admin een invite sturen naar een user hierbij moet hij het email hebben van die user. De invite is een klasse die </w:t>
+      </w:r>
+      <w:r>
+        <w:t>het firebase document (met alle group gegevens), enz</w:t>
+      </w:r>
       <w:r>
         <w:t xml:space="preserve"> bevat.</w:t>
       </w:r>
@@ -7091,74 +4836,13 @@
         </w:numPr>
       </w:pPr>
       <w:r>
-        <w:t xml:space="preserve">De user krijgt bij de </w:t>
-      </w:r>
-      <w:proofErr w:type="spellStart"/>
-      <w:r>
-        <w:t>add</w:t>
-      </w:r>
-      <w:proofErr w:type="spellEnd"/>
+        <w:t>De user krijgt bij de add group icon die je kan aanklikken 2 opties: een eigen group maken of nieuwe joinen. Als hij “join group” klikt zal er een dialog</w:t>
+      </w:r>
       <w:r>
         <w:t xml:space="preserve"> </w:t>
       </w:r>
-      <w:proofErr w:type="spellStart"/>
-      <w:r>
-        <w:t>group</w:t>
-      </w:r>
-      <w:proofErr w:type="spellEnd"/>
-      <w:r>
-        <w:t xml:space="preserve"> icon die je kan aanklikken 2 opties: een eigen </w:t>
-      </w:r>
-      <w:proofErr w:type="spellStart"/>
-      <w:r>
-        <w:t>group</w:t>
-      </w:r>
-      <w:proofErr w:type="spellEnd"/>
-      <w:r>
-        <w:t xml:space="preserve"> maken of nieuwe </w:t>
-      </w:r>
-      <w:proofErr w:type="spellStart"/>
-      <w:r>
-        <w:t>joinen</w:t>
-      </w:r>
-      <w:proofErr w:type="spellEnd"/>
-      <w:r>
-        <w:t>. Als hij “</w:t>
-      </w:r>
-      <w:proofErr w:type="spellStart"/>
-      <w:r>
-        <w:t>join</w:t>
-      </w:r>
-      <w:proofErr w:type="spellEnd"/>
-      <w:r>
-        <w:t xml:space="preserve"> </w:t>
-      </w:r>
-      <w:proofErr w:type="spellStart"/>
-      <w:r>
-        <w:t>group</w:t>
-      </w:r>
-      <w:proofErr w:type="spellEnd"/>
-      <w:r>
-        <w:t xml:space="preserve">” klikt zal er een </w:t>
-      </w:r>
-      <w:proofErr w:type="spellStart"/>
-      <w:r>
-        <w:t>dialog</w:t>
-      </w:r>
-      <w:proofErr w:type="spellEnd"/>
-      <w:r>
-        <w:t xml:space="preserve"> </w:t>
-      </w:r>
-      <w:r>
-        <w:t xml:space="preserve">venster staan met alle invites. Als je dan een invite aanklikt accepteert je dan om te </w:t>
-      </w:r>
-      <w:proofErr w:type="spellStart"/>
-      <w:r>
-        <w:t>joinen</w:t>
-      </w:r>
-      <w:proofErr w:type="spellEnd"/>
-      <w:r>
-        <w:t>.</w:t>
+      <w:r>
+        <w:t>venster staan met alle invites. Als je dan een invite aanklikt accepteert je dan om te joinen.</w:t>
       </w:r>
     </w:p>
     <w:p/>
@@ -7203,23 +4887,7 @@
         <w:t>ste</w:t>
       </w:r>
       <w:r>
-        <w:t xml:space="preserve"> stap afgewerkt van de invite systeem. Hierbij heb ik dus als een </w:t>
-      </w:r>
-      <w:proofErr w:type="spellStart"/>
-      <w:r>
-        <w:t>admin</w:t>
-      </w:r>
-      <w:proofErr w:type="spellEnd"/>
-      <w:r>
-        <w:t xml:space="preserve"> van een chat een user uitnodigt krijgt die user een invite in </w:t>
-      </w:r>
-      <w:proofErr w:type="spellStart"/>
-      <w:r>
-        <w:t>firestore</w:t>
-      </w:r>
-      <w:proofErr w:type="spellEnd"/>
-      <w:r>
-        <w:t>.</w:t>
+        <w:t xml:space="preserve"> stap afgewerkt van de invite systeem. Hierbij heb ik dus als een admin van een chat een user uitnodigt krijgt die user een invite in firestore.</w:t>
       </w:r>
     </w:p>
     <w:p>
@@ -7298,15 +4966,7 @@
     </w:p>
     <w:p>
       <w:r>
-        <w:t xml:space="preserve">Vandaag heb ik de invite systeem afgewerkt. Nu kan je dus een invite sturen in de chatroom (alleen de </w:t>
-      </w:r>
-      <w:proofErr w:type="spellStart"/>
-      <w:r>
-        <w:t>admin</w:t>
-      </w:r>
-      <w:proofErr w:type="spellEnd"/>
-      <w:r>
-        <w:t xml:space="preserve"> kan dit)</w:t>
+        <w:t>Vandaag heb ik de invite systeem afgewerkt. Nu kan je dus een invite sturen in de chatroom (alleen de admin kan dit)</w:t>
       </w:r>
       <w:r>
         <w:t xml:space="preserve"> en de ontvanger kan dit accepteren bij zijn invites.</w:t>
@@ -7386,47 +5046,7 @@
     </w:p>
     <w:p>
       <w:r>
-        <w:t xml:space="preserve">Vandaag wou ik dat de </w:t>
-      </w:r>
-      <w:proofErr w:type="spellStart"/>
-      <w:r>
-        <w:t>messages</w:t>
-      </w:r>
-      <w:proofErr w:type="spellEnd"/>
-      <w:r>
-        <w:t xml:space="preserve"> in een chatroom alleen kunnen opgehaald worden via </w:t>
-      </w:r>
-      <w:proofErr w:type="spellStart"/>
-      <w:r>
-        <w:t>adminId</w:t>
-      </w:r>
-      <w:proofErr w:type="spellEnd"/>
-      <w:r>
-        <w:t xml:space="preserve"> en de naam. Dit zorgt er dan voor dat andere gebruikers niet zomaar kunnen </w:t>
-      </w:r>
-      <w:proofErr w:type="spellStart"/>
-      <w:r>
-        <w:t>joinen</w:t>
-      </w:r>
-      <w:proofErr w:type="spellEnd"/>
-      <w:r>
-        <w:t xml:space="preserve"> als ze de </w:t>
-      </w:r>
-      <w:proofErr w:type="spellStart"/>
-      <w:r>
-        <w:t>group</w:t>
-      </w:r>
-      <w:proofErr w:type="spellEnd"/>
-      <w:r>
-        <w:t xml:space="preserve"> met dezelfde naam aanmaken. Dit was vrij moeilijk, maar ik heb het uiteindelijk opgelost door een overeenkomstige chatroom object door te sturen als </w:t>
-      </w:r>
-      <w:proofErr w:type="spellStart"/>
-      <w:r>
-        <w:t>bundle</w:t>
-      </w:r>
-      <w:proofErr w:type="spellEnd"/>
-      <w:r>
-        <w:t xml:space="preserve"> als je de chatroom aanklikt. Het was eerst alleen de naam van de </w:t>
+        <w:t xml:space="preserve">Vandaag wou ik dat de messages in een chatroom alleen kunnen opgehaald worden via adminId en de naam. Dit zorgt er dan voor dat andere gebruikers niet zomaar kunnen joinen als ze de group met dezelfde naam aanmaken. Dit was vrij moeilijk, maar ik heb het uiteindelijk opgelost door een overeenkomstige chatroom object door te sturen als bundle als je de chatroom aanklikt. Het was eerst alleen de naam van de </w:t>
       </w:r>
       <w:r>
         <w:t>groep</w:t>
@@ -7435,15 +5055,7 @@
         <w:t>.</w:t>
       </w:r>
       <w:r>
-        <w:t xml:space="preserve"> Hiermee kon dan gemakkelijk een query maken om in de </w:t>
-      </w:r>
-      <w:proofErr w:type="spellStart"/>
-      <w:r>
-        <w:t>MessageAdapter</w:t>
-      </w:r>
-      <w:proofErr w:type="spellEnd"/>
-      <w:r>
-        <w:t xml:space="preserve"> te gebruiken.</w:t>
+        <w:t xml:space="preserve"> Hiermee kon dan gemakkelijk een query maken om in de MessageAdapter te gebruiken.</w:t>
       </w:r>
     </w:p>
     <w:p>
@@ -7457,15 +5069,7 @@
         <w:t>de</w:t>
       </w:r>
       <w:r>
-        <w:t xml:space="preserve"> versie van mijn app geüpload naar de </w:t>
-      </w:r>
-      <w:proofErr w:type="spellStart"/>
-      <w:r>
-        <w:t>play</w:t>
-      </w:r>
-      <w:proofErr w:type="spellEnd"/>
-      <w:r>
-        <w:t xml:space="preserve"> store.</w:t>
+        <w:t xml:space="preserve"> versie van mijn app geüpload naar de play store.</w:t>
       </w:r>
     </w:p>
     <w:p/>
@@ -7494,15 +5098,7 @@
         </w:numPr>
       </w:pPr>
       <w:r>
-        <w:t xml:space="preserve">Afbeeldingen kunnen doorsturen via chat en </w:t>
-      </w:r>
-      <w:proofErr w:type="spellStart"/>
-      <w:r>
-        <w:t>comments</w:t>
-      </w:r>
-      <w:proofErr w:type="spellEnd"/>
-      <w:r>
-        <w:t xml:space="preserve"> eraan kunnen toevoegen.</w:t>
+        <w:t>Afbeeldingen kunnen doorsturen via chat en comments eraan kunnen toevoegen.</w:t>
       </w:r>
     </w:p>
     <w:p>
@@ -7550,55 +5146,7 @@
         <w:t xml:space="preserve">Vandaag had ik ontdekt dat de pagina </w:t>
       </w:r>
       <w:r>
-        <w:t xml:space="preserve">waar ik chat groepen kan openen, constant crasht als het in laadde. Dit kwam omdat </w:t>
-      </w:r>
-      <w:proofErr w:type="spellStart"/>
-      <w:r>
-        <w:t>Firestore</w:t>
-      </w:r>
-      <w:proofErr w:type="spellEnd"/>
-      <w:r>
-        <w:t xml:space="preserve"> niet wou werken in release mode. Om dit op te lossen heb ik 2 dingen gedaan. Eerst heb ik de release sha1 </w:t>
-      </w:r>
-      <w:proofErr w:type="spellStart"/>
-      <w:r>
-        <w:t>fingerprint</w:t>
-      </w:r>
-      <w:proofErr w:type="spellEnd"/>
-      <w:r>
-        <w:t xml:space="preserve"> toegevoegd aan </w:t>
-      </w:r>
-      <w:proofErr w:type="spellStart"/>
-      <w:r>
-        <w:t>firestore</w:t>
-      </w:r>
-      <w:proofErr w:type="spellEnd"/>
-      <w:r>
-        <w:t xml:space="preserve">. In een </w:t>
-      </w:r>
-      <w:proofErr w:type="spellStart"/>
-      <w:r>
-        <w:t>txt</w:t>
-      </w:r>
-      <w:proofErr w:type="spellEnd"/>
-      <w:r>
-        <w:t xml:space="preserve"> file heb ik daar tips over achtergelaten. Daarna moest ik ook </w:t>
-      </w:r>
-      <w:proofErr w:type="spellStart"/>
-      <w:r>
-        <w:t>minifyEnabled</w:t>
-      </w:r>
-      <w:proofErr w:type="spellEnd"/>
-      <w:r>
-        <w:t xml:space="preserve"> op </w:t>
-      </w:r>
-      <w:proofErr w:type="spellStart"/>
-      <w:r>
-        <w:t>false</w:t>
-      </w:r>
-      <w:proofErr w:type="spellEnd"/>
-      <w:r>
-        <w:t xml:space="preserve"> zetten, want in een stackoverflow artikel zei iemand dat dat het opgelost had voor hem.</w:t>
+        <w:t>waar ik chat groepen kan openen, constant crasht als het in laadde. Dit kwam omdat Firestore niet wou werken in release mode. Om dit op te lossen heb ik 2 dingen gedaan. Eerst heb ik de release sha1 fingerprint toegevoegd aan firestore. In een txt file heb ik daar tips over achtergelaten. Daarna moest ik ook minifyEnabled op false zetten, want in een stackoverflow artikel zei iemand dat dat het opgelost had voor hem.</w:t>
       </w:r>
     </w:p>
     <w:p>
@@ -7664,96 +5212,11 @@
       <w:r>
         <w:t xml:space="preserve">Vandaag ben ik begonnen aan de </w:t>
       </w:r>
-      <w:proofErr w:type="spellStart"/>
-      <w:r>
-        <w:t>comment</w:t>
-      </w:r>
-      <w:proofErr w:type="spellEnd"/>
-      <w:r>
-        <w:t xml:space="preserve"> systeem die je kan toepassen op afbeeldingen in chat. Dit ging vrij goed, want ik kon de X en Y </w:t>
-      </w:r>
-      <w:proofErr w:type="spellStart"/>
-      <w:r>
-        <w:t>coordinaten</w:t>
-      </w:r>
-      <w:proofErr w:type="spellEnd"/>
-      <w:r>
-        <w:t xml:space="preserve"> van een click op het scherm op halen en op slaan in </w:t>
-      </w:r>
-      <w:proofErr w:type="spellStart"/>
-      <w:r>
-        <w:t>firestore</w:t>
-      </w:r>
-      <w:proofErr w:type="spellEnd"/>
-      <w:r>
-        <w:t xml:space="preserve">. Deze gegevens werden bewaard in een </w:t>
-      </w:r>
-      <w:proofErr w:type="spellStart"/>
-      <w:r>
-        <w:t>comment</w:t>
-      </w:r>
-      <w:proofErr w:type="spellEnd"/>
-      <w:r>
-        <w:t xml:space="preserve"> class object en </w:t>
-      </w:r>
-      <w:proofErr w:type="spellStart"/>
-      <w:r>
-        <w:t>konnen</w:t>
-      </w:r>
-      <w:proofErr w:type="spellEnd"/>
-      <w:r>
-        <w:t xml:space="preserve"> terug opgehaald worden afhankelijk van de image en </w:t>
-      </w:r>
-      <w:proofErr w:type="spellStart"/>
-      <w:r>
-        <w:t>adminId</w:t>
-      </w:r>
-      <w:proofErr w:type="spellEnd"/>
-      <w:r>
-        <w:t xml:space="preserve">. Als je ook op die plaats klikt kan je een </w:t>
-      </w:r>
-      <w:proofErr w:type="spellStart"/>
-      <w:r>
-        <w:t>comment</w:t>
-      </w:r>
-      <w:proofErr w:type="spellEnd"/>
-      <w:r>
-        <w:t xml:space="preserve"> indienen via een </w:t>
-      </w:r>
-      <w:proofErr w:type="spellStart"/>
-      <w:r>
-        <w:t>alertdialog</w:t>
-      </w:r>
-      <w:proofErr w:type="spellEnd"/>
-      <w:r>
-        <w:t xml:space="preserve">. Ik had ook natuurlijk mogelijk gemaakt om </w:t>
-      </w:r>
-      <w:proofErr w:type="spellStart"/>
-      <w:r>
-        <w:t>messages</w:t>
-      </w:r>
-      <w:proofErr w:type="spellEnd"/>
-      <w:r>
-        <w:t xml:space="preserve"> die beginnen met een </w:t>
-      </w:r>
-      <w:proofErr w:type="spellStart"/>
-      <w:r>
-        <w:t>firebase</w:t>
-      </w:r>
-      <w:proofErr w:type="spellEnd"/>
-      <w:r>
-        <w:t xml:space="preserve"> URI link te veranderen in een image zodat je natuurlijk </w:t>
-      </w:r>
-      <w:r>
-        <w:t xml:space="preserve">erna </w:t>
-      </w:r>
-      <w:proofErr w:type="spellStart"/>
-      <w:r>
-        <w:t>comments</w:t>
-      </w:r>
-      <w:proofErr w:type="spellEnd"/>
-      <w:r>
-        <w:t xml:space="preserve"> op kunt plaatsen.</w:t>
+      <w:r>
+        <w:t xml:space="preserve">comment systeem die je kan toepassen op afbeeldingen in chat. Dit ging vrij goed, want ik kon de X en Y coordinaten van een click op het scherm op halen en op slaan in firestore. Deze gegevens werden bewaard in een comment class object en konnen terug opgehaald worden afhankelijk van de image en adminId. Als je ook op die plaats klikt kan je een comment indienen via een alertdialog. Ik had ook natuurlijk mogelijk gemaakt om messages die beginnen met een firebase URI link te veranderen in een image zodat je natuurlijk </w:t>
+      </w:r>
+      <w:r>
+        <w:t>erna comments op kunt plaatsen.</w:t>
       </w:r>
     </w:p>
     <w:p/>
@@ -7774,71 +5237,10 @@
     </w:p>
     <w:p>
       <w:r>
-        <w:t xml:space="preserve">Vandaag heb ik dan het </w:t>
-      </w:r>
-      <w:proofErr w:type="spellStart"/>
-      <w:r>
-        <w:t>comment</w:t>
-      </w:r>
-      <w:proofErr w:type="spellEnd"/>
-      <w:r>
-        <w:t xml:space="preserve"> systeem afgewerkt. Ik had eerst ervoor gezorgd dat er een blauw bolletje, met een cijfer erin afhankelijk wanneer je het toegevoegd hebt, komt waar je klikt. Normaal was ik dan van plan om een menu van rechts te laten verschijnen met alle </w:t>
-      </w:r>
-      <w:proofErr w:type="spellStart"/>
-      <w:r>
-        <w:t>comments</w:t>
-      </w:r>
-      <w:proofErr w:type="spellEnd"/>
-      <w:r>
-        <w:t xml:space="preserve">, maar ik vond een idee op </w:t>
-      </w:r>
-      <w:proofErr w:type="spellStart"/>
-      <w:r>
-        <w:t>geeksforgeeks</w:t>
-      </w:r>
-      <w:proofErr w:type="spellEnd"/>
-      <w:r>
-        <w:t xml:space="preserve"> dat veel interessanter leek. Als je dus nu op een bolletje klikt, verschijnt er de overeenkomstige </w:t>
-      </w:r>
-      <w:proofErr w:type="spellStart"/>
-      <w:r>
-        <w:t>comment</w:t>
-      </w:r>
-      <w:proofErr w:type="spellEnd"/>
-      <w:r>
-        <w:t xml:space="preserve"> als </w:t>
-      </w:r>
-      <w:proofErr w:type="spellStart"/>
-      <w:r>
-        <w:t>popup</w:t>
-      </w:r>
-      <w:proofErr w:type="spellEnd"/>
-      <w:r>
-        <w:t xml:space="preserve">. Als je op deze </w:t>
-      </w:r>
-      <w:proofErr w:type="spellStart"/>
-      <w:r>
-        <w:t>popup</w:t>
-      </w:r>
-      <w:proofErr w:type="spellEnd"/>
-      <w:r>
-        <w:t xml:space="preserve"> klikt wordt het nog als Toast </w:t>
-      </w:r>
-      <w:proofErr w:type="spellStart"/>
-      <w:r>
-        <w:t>message</w:t>
-      </w:r>
-      <w:proofErr w:type="spellEnd"/>
-      <w:r>
-        <w:t xml:space="preserve"> getoond, dit is handig als het een te lange </w:t>
-      </w:r>
-      <w:proofErr w:type="spellStart"/>
-      <w:r>
-        <w:t>message</w:t>
-      </w:r>
-      <w:proofErr w:type="spellEnd"/>
-      <w:r>
-        <w:t xml:space="preserve"> is.</w:t>
+        <w:t>Vandaag heb ik dan het comment systeem afgewerkt. Ik had eerst ervoor gezorgd dat er een blauw bolletje, met een cijfer erin afhankelijk wanneer je het toegevoegd hebt, komt waar je klikt. Normaal was ik dan van plan om een menu van rechts te laten verschijnen met alle comments</w:t>
+      </w:r>
+      <w:r>
+        <w:t>, maar ik vond een idee op geeksforgeeks dat veel interessanter leek. Als je dus nu op een bolletje klikt, verschijnt er de overeenkomstige comment als popup. Als je op deze popup klikt wordt het nog als Toast message getoond, dit is handig als het een te lange message is.</w:t>
       </w:r>
     </w:p>
     <w:p>
@@ -7859,15 +5261,7 @@
         <w:t>ze</w:t>
       </w:r>
       <w:r>
-        <w:t xml:space="preserve"> versie op google </w:t>
-      </w:r>
-      <w:proofErr w:type="spellStart"/>
-      <w:r>
-        <w:t>play</w:t>
-      </w:r>
-      <w:proofErr w:type="spellEnd"/>
-      <w:r>
-        <w:t xml:space="preserve"> geüpload.</w:t>
+        <w:t xml:space="preserve"> versie op google play geüpload.</w:t>
       </w:r>
     </w:p>
     <w:p/>
@@ -7888,24 +5282,11 @@
     </w:p>
     <w:p>
       <w:r>
-        <w:t xml:space="preserve">Vandaag had ik nog snel besloten om het mogelijk te maken om de </w:t>
-      </w:r>
-      <w:proofErr w:type="spellStart"/>
-      <w:r>
-        <w:t>comments</w:t>
-      </w:r>
-      <w:proofErr w:type="spellEnd"/>
-      <w:r>
-        <w:t xml:space="preserve"> te laten verdwijnen</w:t>
-      </w:r>
-      <w:r>
-        <w:t xml:space="preserve"> en </w:t>
-      </w:r>
-      <w:proofErr w:type="spellStart"/>
-      <w:r>
-        <w:t>herverschijnen</w:t>
-      </w:r>
-      <w:proofErr w:type="spellEnd"/>
+        <w:t>Vandaag had ik nog snel besloten om het mogelijk te maken om de comments te laten verdwijnen</w:t>
+      </w:r>
+      <w:r>
+        <w:t xml:space="preserve"> en herverschijnen</w:t>
+      </w:r>
       <w:r>
         <w:t xml:space="preserve"> als je op een knop drukt in </w:t>
       </w:r>
@@ -7916,6 +5297,103 @@
         <w:t>menu.</w:t>
       </w:r>
     </w:p>
+    <w:p/>
+    <w:p>
+      <w:pPr>
+        <w:pStyle w:val="Kop2"/>
+      </w:pPr>
+      <w:r>
+        <w:t>Week 1</w:t>
+      </w:r>
+      <w:r>
+        <w:t>4</w:t>
+      </w:r>
+    </w:p>
+    <w:p>
+      <w:pPr>
+        <w:pStyle w:val="Kop3"/>
+      </w:pPr>
+      <w:r>
+        <w:t>Wat ik wil realiseren tijdens de volgende weken:</w:t>
+      </w:r>
+    </w:p>
+    <w:p>
+      <w:pPr>
+        <w:pStyle w:val="Lijstalinea"/>
+        <w:numPr>
+          <w:ilvl w:val="0"/>
+          <w:numId w:val="2"/>
+        </w:numPr>
+      </w:pPr>
+      <w:r>
+        <w:t>Afbeeldingen kunnen doorsturen via chat en comments eraan kunnen toevoegen.</w:t>
+      </w:r>
+    </w:p>
+    <w:p>
+      <w:pPr>
+        <w:pStyle w:val="Lijstalinea"/>
+        <w:numPr>
+          <w:ilvl w:val="0"/>
+          <w:numId w:val="2"/>
+        </w:numPr>
+      </w:pPr>
+      <w:r>
+        <w:t>(Notificaties voor nieuwe berichten)</w:t>
+      </w:r>
+    </w:p>
+    <w:p>
+      <w:pPr>
+        <w:pStyle w:val="Lijstalinea"/>
+        <w:numPr>
+          <w:ilvl w:val="0"/>
+          <w:numId w:val="2"/>
+        </w:numPr>
+      </w:pPr>
+      <w:r>
+        <w:t>(CRUD toevoegen zoals groepen verwijderen)</w:t>
+      </w:r>
+    </w:p>
+    <w:p/>
+    <w:p>
+      <w:pPr>
+        <w:rPr>
+          <w:b/>
+          <w:bCs/>
+        </w:rPr>
+      </w:pPr>
+      <w:r>
+        <w:rPr>
+          <w:b/>
+          <w:bCs/>
+        </w:rPr>
+        <w:t>19/01/2021:</w:t>
+      </w:r>
+    </w:p>
+    <w:p>
+      <w:r>
+        <w:t>Vandaag had ik nog snel een kleine aanpassing gemaakt aan de comments want op andere apparaten waarbij de schermen groter of kleiner zijn wou het niet op de juiste plaats blijven.</w:t>
+      </w:r>
+    </w:p>
+    <w:p>
+      <w:r>
+        <w:t>Dat heb ik ongeveer opgelost via de formule op deze pagina te gebruiken</w:t>
+      </w:r>
+      <w:r>
+        <w:t>, al is het niet perfect.</w:t>
+      </w:r>
+    </w:p>
+    <w:p>
+      <w:hyperlink r:id="rId84" w:history="1">
+        <w:r>
+          <w:rPr>
+            <w:rStyle w:val="Hyperlink"/>
+          </w:rPr>
+          <w:t>https://math.stackexchange.com/questions/419838/repositioning-and-resizing-when-i-change-the-size-of-my-frame</w:t>
+        </w:r>
+      </w:hyperlink>
+    </w:p>
+    <w:p/>
+    <w:p/>
     <w:p/>
     <w:sectPr>
       <w:pgSz w:w="11906" w:h="16838"/>

</xml_diff>